<commit_message>
Activate NRC VAD v1 phrase entries
</commit_message>
<xml_diff>
--- a/docs/VerseVAD_User_Manual.docx
+++ b/docs/VerseVAD_User_Manual.docx
@@ -71,7 +71,7 @@
           <w:color w:val="66727C"/>
           <w:sz w:val="21"/>
         </w:rPr>
-        <w:t xml:space="preserve"> July 22, 2026</w:t>
+        <w:t xml:space="preserve"> July 23, 2026</w:t>
       </w:r>
       <w:r>
         <w:rPr>
@@ -1941,7 +1941,7 @@
                 <w:rFonts w:ascii="Calibri" w:hAnsi="Calibri"/>
                 <w:sz w:val="18"/>
               </w:rPr>
-              <w:t>Valence, arousal, dominance</w:t>
+              <w:t>Valence, arousal, dominance; words and 132 activated whitespace entries</w:t>
             </w:r>
           </w:p>
         </w:tc>
@@ -2473,7 +2473,7 @@
           <w:rFonts w:ascii="Calibri" w:hAnsi="Calibri"/>
           <w:sz w:val="22"/>
         </w:rPr>
-        <w:t>NRC VAD v2.1 explicitly contains multiword expressions. VerseVAD also activates the 102 whitespace-containing rows in the local Warriner source as exact, auditable phrase candidates at the user's request. NRC VAD v1 remains word-level under its conservative default.</w:t>
+        <w:t>NRC VAD v2.1 explicitly contains multiword expressions. VerseVAD also activates the 102 whitespace-containing rows in the local Warriner source and the 132 whitespace-containing rows in NRC VAD v1 as exact, auditable phrase candidates at the user's request. This is a declared processing choice and does not claim that Warriner or NRC VAD v1 supplied a separate phrase-specific validation study.</w:t>
       </w:r>
     </w:p>
     <w:p>

</xml_diff>

<commit_message>
Complete Phase 5 review and language profiles
</commit_message>
<xml_diff>
--- a/docs/VerseVAD_User_Manual.docx
+++ b/docs/VerseVAD_User_Manual.docx
@@ -47,7 +47,7 @@
           <w:color w:val="66727C"/>
           <w:sz w:val="21"/>
         </w:rPr>
-        <w:t xml:space="preserve"> 0.5.0.dev0</w:t>
+        <w:t xml:space="preserve"> 0.6.0.dev0</w:t>
       </w:r>
       <w:r>
         <w:rPr>
@@ -95,7 +95,7 @@
           <w:color w:val="66727C"/>
           <w:sz w:val="21"/>
         </w:rPr>
-        <w:t xml:space="preserve"> A humanities scholar who does not need to be a programmer</w:t>
+        <w:t xml:space="preserve"> A first-time user who needs no programming, linguistics, or statistics background</w:t>
       </w:r>
     </w:p>
     <w:tbl>
@@ -329,7 +329,7 @@
           <w:rFonts w:ascii="Calibri" w:hAnsi="Calibri"/>
           <w:sz w:val="22"/>
         </w:rPr>
-        <w:t>One poem workspace</w:t>
+        <w:t>One Poem workspace</w:t>
       </w:r>
     </w:p>
     <w:p>
@@ -347,7 +347,7 @@
           <w:rFonts w:ascii="Calibri" w:hAnsi="Calibri"/>
           <w:sz w:val="22"/>
         </w:rPr>
-        <w:t>Projects &amp; corpus workspace</w:t>
+        <w:t>Projects &amp; Corpus workspace</w:t>
       </w:r>
     </w:p>
     <w:p>
@@ -528,7 +528,7 @@
                 <w:color w:val="193247"/>
                 <w:sz w:val="22"/>
               </w:rPr>
-              <w:t>VAD profile</w:t>
+              <w:t>VAD Profile</w:t>
             </w:r>
             <w:r>
               <w:rPr>
@@ -553,7 +553,23 @@
                 <w:color w:val="193247"/>
                 <w:sz w:val="22"/>
               </w:rPr>
-              <w:t>. Download the readable summary for ordinary review and the full audit bundle when you need reproducibility.</w:t>
+              <w:t xml:space="preserve">. Download the readable summary for ordinary review and the full audit bundle when you need reproducibility. If a term is unfamiliar, use the separate </w:t>
+            </w:r>
+            <w:r>
+              <w:rPr>
+                <w:rFonts w:ascii="Consolas" w:hAnsi="Consolas"/>
+                <w:color w:val="193247"/>
+                <w:sz w:val="19"/>
+              </w:rPr>
+              <w:t>VerseVAD_Values_and_Terminology_Guide.docx</w:t>
+            </w:r>
+            <w:r>
+              <w:rPr>
+                <w:rFonts w:ascii="Calibri" w:hAnsi="Calibri"/>
+                <w:color w:val="193247"/>
+                <w:sz w:val="22"/>
+              </w:rPr>
+              <w:t>, which includes plain-language definitions, formulas, worked examples, and reporting templates.</w:t>
             </w:r>
           </w:p>
         </w:tc>
@@ -689,7 +705,7 @@
           <w:rFonts w:ascii="Calibri" w:hAnsi="Calibri"/>
           <w:sz w:val="22"/>
         </w:rPr>
-        <w:t>all-matched and stopword-excluded VAD views;</w:t>
+        <w:t>part-of-speech counts and relative shares over all eligible lexical tokens;</w:t>
       </w:r>
     </w:p>
     <w:p>
@@ -707,7 +723,7 @@
           <w:rFonts w:ascii="Calibri" w:hAnsi="Calibri"/>
           <w:sz w:val="22"/>
         </w:rPr>
-        <w:t>coverage and unmatched vocabulary;</w:t>
+        <w:t>all-matched and stopword-excluded VAD views;</w:t>
       </w:r>
     </w:p>
     <w:p>
@@ -725,7 +741,7 @@
           <w:rFonts w:ascii="Calibri" w:hAnsi="Calibri"/>
           <w:sz w:val="22"/>
         </w:rPr>
-        <w:t>cumulative, length-sensitive normative lexical totals;</w:t>
+        <w:t>coverage and unmatched vocabulary;</w:t>
       </w:r>
     </w:p>
     <w:p>
@@ -743,7 +759,7 @@
           <w:rFonts w:ascii="Calibri" w:hAnsi="Calibri"/>
           <w:sz w:val="22"/>
         </w:rPr>
-        <w:t>the largest midpoint-centered lexical contributors;</w:t>
+        <w:t>cumulative, length-sensitive normative lexical totals;</w:t>
       </w:r>
     </w:p>
     <w:p>
@@ -761,7 +777,7 @@
           <w:rFonts w:ascii="Calibri" w:hAnsi="Calibri"/>
           <w:sz w:val="22"/>
         </w:rPr>
-        <w:t>work-level and collection-level corpus comparisons;</w:t>
+        <w:t>the largest midpoint-centered lexical contributors;</w:t>
       </w:r>
     </w:p>
     <w:p>
@@ -779,6 +795,42 @@
           <w:rFonts w:ascii="Calibri" w:hAnsi="Calibri"/>
           <w:sz w:val="22"/>
         </w:rPr>
+        <w:t>work-level and collection-level corpus comparisons;</w:t>
+      </w:r>
+    </w:p>
+    <w:p>
+      <w:pPr>
+        <w:widowControl/>
+        <w:numPr>
+          <w:ilvl w:val="0"/>
+          <w:numId w:val="10"/>
+        </w:numPr>
+        <w:spacing w:before="0" w:after="80" w:line="300" w:lineRule="auto"/>
+        <w:ind w:left="540" w:hanging="271"/>
+      </w:pPr>
+      <w:r>
+        <w:rPr>
+          <w:rFonts w:ascii="Calibri" w:hAnsi="Calibri"/>
+          <w:sz w:val="22"/>
+        </w:rPr>
+        <w:t>named, versioned review scenarios for flags, exclusions, and approved mappings;</w:t>
+      </w:r>
+    </w:p>
+    <w:p>
+      <w:pPr>
+        <w:widowControl/>
+        <w:numPr>
+          <w:ilvl w:val="0"/>
+          <w:numId w:val="10"/>
+        </w:numPr>
+        <w:spacing w:before="0" w:after="80" w:line="300" w:lineRule="auto"/>
+        <w:ind w:left="540" w:hanging="271"/>
+      </w:pPr>
+      <w:r>
+        <w:rPr>
+          <w:rFonts w:ascii="Calibri" w:hAnsi="Calibri"/>
+          <w:sz w:val="22"/>
+        </w:rPr>
         <w:t>source provenance and uncertainty fields in Lexicon Explorer.</w:t>
       </w:r>
     </w:p>
@@ -1190,7 +1242,7 @@
           <w:b/>
           <w:sz w:val="22"/>
         </w:rPr>
-        <w:t>One poem</w:t>
+        <w:t>One Poem</w:t>
       </w:r>
     </w:p>
     <w:p>
@@ -1209,7 +1261,7 @@
           <w:b/>
           <w:sz w:val="22"/>
         </w:rPr>
-        <w:t>Projects &amp; corpus</w:t>
+        <w:t>Projects &amp; Corpus</w:t>
       </w:r>
     </w:p>
     <w:p>
@@ -1291,7 +1343,7 @@
           <w:b/>
           <w:sz w:val="22"/>
         </w:rPr>
-        <w:t>One poem</w:t>
+        <w:t>One Poem</w:t>
       </w:r>
       <w:r>
         <w:rPr>
@@ -1477,7 +1529,7 @@
           <w:b/>
           <w:sz w:val="22"/>
         </w:rPr>
-        <w:t>VAD profile</w:t>
+        <w:t>VAD Profile</w:t>
       </w:r>
       <w:r>
         <w:rPr>
@@ -1485,6 +1537,39 @@
           <w:sz w:val="22"/>
         </w:rPr>
         <w:t>, compare all matched observations with stopwords excluded.</w:t>
+      </w:r>
+    </w:p>
+    <w:p>
+      <w:pPr>
+        <w:widowControl/>
+        <w:numPr>
+          <w:ilvl w:val="0"/>
+          <w:numId w:val="14"/>
+        </w:numPr>
+        <w:spacing w:before="0" w:after="80" w:line="300" w:lineRule="auto"/>
+        <w:ind w:left="540" w:hanging="271"/>
+      </w:pPr>
+      <w:r>
+        <w:rPr>
+          <w:rFonts w:ascii="Calibri" w:hAnsi="Calibri"/>
+          <w:sz w:val="22"/>
+        </w:rPr>
+        <w:t xml:space="preserve">In </w:t>
+      </w:r>
+      <w:r>
+        <w:rPr>
+          <w:rFonts w:ascii="Calibri" w:hAnsi="Calibri"/>
+          <w:b/>
+          <w:sz w:val="22"/>
+        </w:rPr>
+        <w:t>Language Profile</w:t>
+      </w:r>
+      <w:r>
+        <w:rPr>
+          <w:rFonts w:ascii="Calibri" w:hAnsi="Calibri"/>
+          <w:sz w:val="22"/>
+        </w:rPr>
+        <w:t>, inspect the independent grammatical profile when it is relevant to your question.</w:t>
       </w:r>
     </w:p>
     <w:p>
@@ -3687,6 +3772,85 @@
           <w:rFonts w:ascii="Calibri" w:hAnsi="Calibri"/>
           <w:sz w:val="22"/>
         </w:rPr>
+        <w:t>Part-of-speech profile</w:t>
+      </w:r>
+    </w:p>
+    <w:p>
+      <w:pPr>
+        <w:widowControl/>
+        <w:spacing w:before="0" w:after="120" w:line="300" w:lineRule="auto"/>
+      </w:pPr>
+      <w:r>
+        <w:rPr>
+          <w:rFonts w:ascii="Calibri" w:hAnsi="Calibri"/>
+          <w:sz w:val="22"/>
+        </w:rPr>
+        <w:t xml:space="preserve">The </w:t>
+      </w:r>
+      <w:r>
+        <w:rPr>
+          <w:rFonts w:ascii="Calibri" w:hAnsi="Calibri"/>
+          <w:b/>
+          <w:sz w:val="22"/>
+        </w:rPr>
+        <w:t>Language Profile</w:t>
+      </w:r>
+      <w:r>
+        <w:rPr>
+          <w:rFonts w:ascii="Calibri" w:hAnsi="Calibri"/>
+          <w:sz w:val="22"/>
+        </w:rPr>
+        <w:t xml:space="preserve"> is independent of affective-lexicon matching. It uses all eligible lexical token occurrences and reports the model-assigned universal part-of-speech category, token count, share of lexical tokens, unique normalized types, and example forms.</w:t>
+      </w:r>
+    </w:p>
+    <w:p>
+      <w:pPr>
+        <w:pStyle w:val="Formula"/>
+      </w:pPr>
+      <w:r>
+        <w:rPr>
+          <w:rFonts w:ascii="Consolas" w:hAnsi="Consolas"/>
+          <w:color w:val="1F4D78"/>
+          <w:sz w:val="19"/>
+        </w:rPr>
+        <w:t>POS share = token occurrences assigned to one POS / all eligible lexical token occurrences</w:t>
+      </w:r>
+    </w:p>
+    <w:p>
+      <w:pPr>
+        <w:widowControl/>
+        <w:spacing w:before="0" w:after="120" w:line="300" w:lineRule="auto"/>
+      </w:pPr>
+      <w:r>
+        <w:rPr>
+          <w:rFonts w:ascii="Calibri" w:hAnsi="Calibri"/>
+          <w:sz w:val="22"/>
+        </w:rPr>
+        <w:t>Counts answer “how many occurrences received this label?” Shares answer “what proportion of the text's eligible lexical tokens received this label?” The shares sum to 100 percent apart from display rounding.</w:t>
+      </w:r>
+    </w:p>
+    <w:p>
+      <w:pPr>
+        <w:widowControl/>
+        <w:spacing w:before="0" w:after="120" w:line="300" w:lineRule="auto"/>
+      </w:pPr>
+      <w:r>
+        <w:rPr>
+          <w:rFonts w:ascii="Calibri" w:hAnsi="Calibri"/>
+          <w:sz w:val="22"/>
+        </w:rPr>
+        <w:t>These labels are generated by the installed English linguistic model. Poetic syntax, fragments, archaisms, unusual capitalization, and deliberate ambiguity can produce uncertain assignments. Treat the profile as descriptive and inspect the token evidence when a grammatical distinction matters.</w:t>
+      </w:r>
+    </w:p>
+    <w:p>
+      <w:pPr>
+        <w:pStyle w:val="Heading2"/>
+      </w:pPr>
+      <w:r>
+        <w:rPr>
+          <w:rFonts w:ascii="Calibri" w:hAnsi="Calibri"/>
+          <w:sz w:val="22"/>
+        </w:rPr>
         <w:t>Coverage</w:t>
       </w:r>
     </w:p>
@@ -4217,7 +4381,7 @@
           <w:rFonts w:ascii="Calibri" w:hAnsi="Calibri"/>
           <w:sz w:val="22"/>
         </w:rPr>
-        <w:t>Emotion associations</w:t>
+        <w:t>Eight emotion associations</w:t>
       </w:r>
     </w:p>
     <w:p>
@@ -4230,7 +4394,7 @@
           <w:rFonts w:ascii="Calibri" w:hAnsi="Calibri"/>
           <w:sz w:val="22"/>
         </w:rPr>
-        <w:t>NRC Emotion values are binary, multi-label associations. An entry can be associated with several categories, so percentages do not need to total 100 percent. Read the labeled denominator. The categories are anger, anticipation, disgust, fear, joy, sadness, surprise, trust, negative, and positive.</w:t>
+        <w:t>NRC Emotion values are binary, multi-label associations. VerseVAD reports the eight emotions—anger, anticipation, disgust, fear, joy, sadness, surprise, and trust—in their own section. An entry can be associated with several categories, so percentages do not need to total 100 percent. Read the labeled denominator.</w:t>
       </w:r>
     </w:p>
     <w:p>
@@ -4244,6 +4408,31 @@
           <w:sz w:val="22"/>
         </w:rPr>
         <w:t>“Fear-associated vocabulary” is appropriate wording. “The poem is afraid” is not.</w:t>
+      </w:r>
+    </w:p>
+    <w:p>
+      <w:pPr>
+        <w:pStyle w:val="Heading2"/>
+      </w:pPr>
+      <w:r>
+        <w:rPr>
+          <w:rFonts w:ascii="Calibri" w:hAnsi="Calibri"/>
+          <w:sz w:val="22"/>
+        </w:rPr>
+        <w:t>Positive and negative sentiment associations</w:t>
+      </w:r>
+    </w:p>
+    <w:p>
+      <w:pPr>
+        <w:widowControl/>
+        <w:spacing w:before="0" w:after="120" w:line="300" w:lineRule="auto"/>
+      </w:pPr>
+      <w:r>
+        <w:rPr>
+          <w:rFonts w:ascii="Calibri" w:hAnsi="Calibri"/>
+          <w:sz w:val="22"/>
+        </w:rPr>
+        <w:t>Positive and negative are broad sentiment labels in NRC Emotion. VerseVAD analyzes them with the same documented occurrence-counting logic but reports them separately from the eight emotions. They are not endpoints of the VAD valence scale, and their rates need not sum to 100 percent.</w:t>
       </w:r>
     </w:p>
     <w:p>
@@ -4347,7 +4536,7 @@
           <w:rFonts w:ascii="Calibri" w:hAnsi="Calibri"/>
           <w:sz w:val="22"/>
         </w:rPr>
-        <w:t>8. One poem workspace</w:t>
+        <w:t>8. One Poem Workspace</w:t>
       </w:r>
     </w:p>
     <w:p>
@@ -4577,7 +4766,32 @@
           <w:rFonts w:ascii="Calibri" w:hAnsi="Calibri"/>
           <w:sz w:val="22"/>
         </w:rPr>
-        <w:t>VAD profile tab</w:t>
+        <w:t>Language Profile tab</w:t>
+      </w:r>
+    </w:p>
+    <w:p>
+      <w:pPr>
+        <w:widowControl/>
+        <w:spacing w:before="0" w:after="120" w:line="300" w:lineRule="auto"/>
+      </w:pPr>
+      <w:r>
+        <w:rPr>
+          <w:rFonts w:ascii="Calibri" w:hAnsi="Calibri"/>
+          <w:sz w:val="22"/>
+        </w:rPr>
+        <w:t>This tab reports part-of-speech counts and relative shares for all eligible lexical tokens, independently of lexicon coverage. It also shows unique normalized types and example forms. The denominator is displayed, and a caution explains that the labels are model-generated.</w:t>
+      </w:r>
+    </w:p>
+    <w:p>
+      <w:pPr>
+        <w:pStyle w:val="Heading2"/>
+      </w:pPr>
+      <w:r>
+        <w:rPr>
+          <w:rFonts w:ascii="Calibri" w:hAnsi="Calibri"/>
+          <w:sz w:val="22"/>
+        </w:rPr>
+        <w:t>VAD Profile tab</w:t>
       </w:r>
     </w:p>
     <w:p>
@@ -4764,7 +4978,7 @@
           <w:rFonts w:ascii="Calibri" w:hAnsi="Calibri"/>
           <w:sz w:val="22"/>
         </w:rPr>
-        <w:t>Emotion profile tab</w:t>
+        <w:t>Emotion Profile tab</w:t>
       </w:r>
     </w:p>
     <w:p>
@@ -4777,7 +4991,7 @@
           <w:rFonts w:ascii="Calibri" w:hAnsi="Calibri"/>
           <w:sz w:val="22"/>
         </w:rPr>
-        <w:t>Categorical emotion associations and numeric emotion intensities appear in separate sections. Do not compare their values as though they were alternate VAD scales.</w:t>
+        <w:t>The eight emotion associations, positive/negative sentiment associations, and numeric emotion intensities appear in three separate sections. Do not compare their values as though they were alternate VAD scales.</w:t>
       </w:r>
     </w:p>
     <w:p>
@@ -4919,7 +5133,7 @@
           <w:rFonts w:ascii="Calibri" w:hAnsi="Calibri"/>
           <w:sz w:val="22"/>
         </w:rPr>
-        <w:t>How to read tab</w:t>
+        <w:t>How to Read tab</w:t>
       </w:r>
     </w:p>
     <w:p>
@@ -4944,7 +5158,7 @@
           <w:rFonts w:ascii="Calibri" w:hAnsi="Calibri"/>
           <w:sz w:val="22"/>
         </w:rPr>
-        <w:t>9. Projects &amp; corpus workspace</w:t>
+        <w:t>9. Projects &amp; Corpus Workspace</w:t>
       </w:r>
     </w:p>
     <w:p>
@@ -4977,7 +5191,7 @@
           <w:b/>
           <w:sz w:val="22"/>
         </w:rPr>
-        <w:t>Projects &amp; corpus</w:t>
+        <w:t>Projects &amp; Corpus</w:t>
       </w:r>
       <w:r>
         <w:rPr>
@@ -5085,7 +5299,7 @@
           <w:b/>
           <w:sz w:val="22"/>
         </w:rPr>
-        <w:t>Works &amp; metadata</w:t>
+        <w:t>Works &amp; Metadata</w:t>
       </w:r>
       <w:r>
         <w:rPr>
@@ -5353,7 +5567,7 @@
           <w:b/>
           <w:sz w:val="22"/>
         </w:rPr>
-        <w:t>Analyze &amp; compare</w:t>
+        <w:t>Analyze &amp; Compare</w:t>
       </w:r>
       <w:r>
         <w:rPr>
@@ -5450,6 +5664,39 @@
           <w:rFonts w:ascii="Calibri" w:hAnsi="Calibri"/>
           <w:sz w:val="22"/>
         </w:rPr>
+        <w:t xml:space="preserve">Choose </w:t>
+      </w:r>
+      <w:r>
+        <w:rPr>
+          <w:rFonts w:ascii="Calibri" w:hAnsi="Calibri"/>
+          <w:b/>
+          <w:sz w:val="22"/>
+        </w:rPr>
+        <w:t>Unreviewed baseline</w:t>
+      </w:r>
+      <w:r>
+        <w:rPr>
+          <w:rFonts w:ascii="Calibri" w:hAnsi="Calibri"/>
+          <w:sz w:val="22"/>
+        </w:rPr>
+        <w:t xml:space="preserve"> or an exact named review-scenario version.</w:t>
+      </w:r>
+    </w:p>
+    <w:p>
+      <w:pPr>
+        <w:widowControl/>
+        <w:numPr>
+          <w:ilvl w:val="0"/>
+          <w:numId w:val="17"/>
+        </w:numPr>
+        <w:spacing w:before="0" w:after="80" w:line="300" w:lineRule="auto"/>
+        <w:ind w:left="540" w:hanging="271"/>
+      </w:pPr>
+      <w:r>
+        <w:rPr>
+          <w:rFonts w:ascii="Calibri" w:hAnsi="Calibri"/>
+          <w:sz w:val="22"/>
+        </w:rPr>
         <w:t xml:space="preserve">Click </w:t>
       </w:r>
       <w:r>
@@ -5630,7 +5877,7 @@
           <w:rFonts w:ascii="Calibri" w:hAnsi="Calibri"/>
           <w:sz w:val="22"/>
         </w:rPr>
-        <w:t>Unmatched quality-control notes</w:t>
+        <w:t>Corpus Language Profile</w:t>
       </w:r>
     </w:p>
     <w:p>
@@ -5643,7 +5890,7 @@
           <w:rFonts w:ascii="Calibri" w:hAnsi="Calibri"/>
           <w:sz w:val="22"/>
         </w:rPr>
-        <w:t xml:space="preserve">Under </w:t>
+        <w:t xml:space="preserve">The </w:t>
       </w:r>
       <w:r>
         <w:rPr>
@@ -5651,14 +5898,14 @@
           <w:b/>
           <w:sz w:val="22"/>
         </w:rPr>
-        <w:t>Unmatched QC</w:t>
-      </w:r>
-      <w:r>
-        <w:rPr>
-          <w:rFonts w:ascii="Calibri" w:hAnsi="Calibri"/>
-          <w:sz w:val="22"/>
-        </w:rPr>
-        <w:t>, select a work/lexicon/form observation and record:</w:t>
+        <w:t>Language Profile</w:t>
+      </w:r>
+      <w:r>
+        <w:rPr>
+          <w:rFonts w:ascii="Calibri" w:hAnsi="Calibri"/>
+          <w:sz w:val="22"/>
+        </w:rPr>
+        <w:t xml:space="preserve"> tab reports:</w:t>
       </w:r>
     </w:p>
     <w:p>
@@ -5674,9 +5921,17 @@
       <w:r>
         <w:rPr>
           <w:rFonts w:ascii="Calibri" w:hAnsi="Calibri"/>
-          <w:sz w:val="22"/>
-        </w:rPr>
-        <w:t>review status;</w:t>
+          <w:b/>
+          <w:sz w:val="22"/>
+        </w:rPr>
+        <w:t>All Works Combined:</w:t>
+      </w:r>
+      <w:r>
+        <w:rPr>
+          <w:rFonts w:ascii="Calibri" w:hAnsi="Calibri"/>
+          <w:sz w:val="22"/>
+        </w:rPr>
+        <w:t xml:space="preserve"> pooled POS token counts and shares, in which long works contribute more because they contain more tokens.</w:t>
       </w:r>
     </w:p>
     <w:p>
@@ -5692,9 +5947,83 @@
       <w:r>
         <w:rPr>
           <w:rFonts w:ascii="Calibri" w:hAnsi="Calibri"/>
-          <w:sz w:val="22"/>
-        </w:rPr>
-        <w:t>research note;</w:t>
+          <w:b/>
+          <w:sz w:val="22"/>
+        </w:rPr>
+        <w:t>Work-by-Work Comparison:</w:t>
+      </w:r>
+      <w:r>
+        <w:rPr>
+          <w:rFonts w:ascii="Calibri" w:hAnsi="Calibri"/>
+          <w:sz w:val="22"/>
+        </w:rPr>
+        <w:t xml:space="preserve"> each work's POS count, within-work share, unique normalized types, examples, and denominator.</w:t>
+      </w:r>
+    </w:p>
+    <w:p>
+      <w:pPr>
+        <w:widowControl/>
+        <w:spacing w:before="0" w:after="120" w:line="300" w:lineRule="auto"/>
+      </w:pPr>
+      <w:r>
+        <w:rPr>
+          <w:rFonts w:ascii="Calibri" w:hAnsi="Calibri"/>
+          <w:sz w:val="22"/>
+        </w:rPr>
+        <w:t>This profile is calculated from the current preserved version of every work and does not depend on which affective lexicon was selected. Use within-work shares when comparing works of different lengths; retain raw counts when quantity itself matters.</w:t>
+      </w:r>
+    </w:p>
+    <w:p>
+      <w:pPr>
+        <w:pStyle w:val="Heading2"/>
+      </w:pPr>
+      <w:r>
+        <w:rPr>
+          <w:rFonts w:ascii="Calibri" w:hAnsi="Calibri"/>
+          <w:sz w:val="22"/>
+        </w:rPr>
+        <w:t>Review decisions and named scenarios</w:t>
+      </w:r>
+    </w:p>
+    <w:p>
+      <w:pPr>
+        <w:widowControl/>
+        <w:spacing w:before="0" w:after="120" w:line="300" w:lineRule="auto"/>
+      </w:pPr>
+      <w:r>
+        <w:rPr>
+          <w:rFonts w:ascii="Calibri" w:hAnsi="Calibri"/>
+          <w:sz w:val="22"/>
+        </w:rPr>
+        <w:t xml:space="preserve">Phase 5 lets you test explicit scholarly decisions without rewriting an earlier result. Start with an unreviewed baseline, then open </w:t>
+      </w:r>
+      <w:r>
+        <w:rPr>
+          <w:rFonts w:ascii="Calibri" w:hAnsi="Calibri"/>
+          <w:b/>
+          <w:sz w:val="22"/>
+        </w:rPr>
+        <w:t>Review &amp; Scenarios</w:t>
+      </w:r>
+      <w:r>
+        <w:rPr>
+          <w:rFonts w:ascii="Calibri" w:hAnsi="Calibri"/>
+          <w:sz w:val="22"/>
+        </w:rPr>
+        <w:t xml:space="preserve"> and create a named scenario.</w:t>
+      </w:r>
+    </w:p>
+    <w:p>
+      <w:pPr>
+        <w:widowControl/>
+        <w:spacing w:before="0" w:after="120" w:line="300" w:lineRule="auto"/>
+      </w:pPr>
+      <w:r>
+        <w:rPr>
+          <w:rFonts w:ascii="Calibri" w:hAnsi="Calibri"/>
+          <w:sz w:val="22"/>
+        </w:rPr>
+        <w:t>The available actions are:</w:t>
       </w:r>
     </w:p>
     <w:p>
@@ -5710,9 +6039,84 @@
       <w:r>
         <w:rPr>
           <w:rFonts w:ascii="Calibri" w:hAnsi="Calibri"/>
-          <w:sz w:val="22"/>
-        </w:rPr>
-        <w:t>possible mapping.</w:t>
+          <w:b/>
+          <w:sz w:val="22"/>
+        </w:rPr>
+        <w:t>Flag:</w:t>
+      </w:r>
+      <w:r>
+        <w:rPr>
+          <w:rFonts w:ascii="Calibri" w:hAnsi="Calibri"/>
+          <w:sz w:val="22"/>
+        </w:rPr>
+        <w:t xml:space="preserve"> records a concern or interpretive note without changing a score.</w:t>
+      </w:r>
+    </w:p>
+    <w:p>
+      <w:pPr>
+        <w:widowControl/>
+        <w:numPr>
+          <w:ilvl w:val="0"/>
+          <w:numId w:val="10"/>
+        </w:numPr>
+        <w:spacing w:before="0" w:after="80" w:line="300" w:lineRule="auto"/>
+        <w:ind w:left="540" w:hanging="271"/>
+      </w:pPr>
+      <w:r>
+        <w:rPr>
+          <w:rFonts w:ascii="Calibri" w:hAnsi="Calibri"/>
+          <w:b/>
+          <w:sz w:val="22"/>
+        </w:rPr>
+        <w:t>Exclude:</w:t>
+      </w:r>
+      <w:r>
+        <w:rPr>
+          <w:rFonts w:ascii="Calibri" w:hAnsi="Calibri"/>
+          <w:sz w:val="22"/>
+        </w:rPr>
+        <w:t xml:space="preserve"> preserves the published candidate in the audit but omits it from that scenario's aggregates.</w:t>
+      </w:r>
+    </w:p>
+    <w:p>
+      <w:pPr>
+        <w:widowControl/>
+        <w:numPr>
+          <w:ilvl w:val="0"/>
+          <w:numId w:val="10"/>
+        </w:numPr>
+        <w:spacing w:before="0" w:after="80" w:line="300" w:lineRule="auto"/>
+        <w:ind w:left="540" w:hanging="271"/>
+      </w:pPr>
+      <w:r>
+        <w:rPr>
+          <w:rFonts w:ascii="Calibri" w:hAnsi="Calibri"/>
+          <w:b/>
+          <w:sz w:val="22"/>
+        </w:rPr>
+        <w:t>Map:</w:t>
+      </w:r>
+      <w:r>
+        <w:rPr>
+          <w:rFonts w:ascii="Calibri" w:hAnsi="Calibri"/>
+          <w:sz w:val="22"/>
+        </w:rPr>
+        <w:t xml:space="preserve"> after exact, possessive/apostrophe, and lemma candidates fail, maps a form to a verified exact entry in one selected lexicon. The method is labeled </w:t>
+      </w:r>
+      <w:r>
+        <w:rPr>
+          <w:rFonts w:ascii="Consolas" w:hAnsi="Consolas"/>
+          <w:color w:val="1F4D78"/>
+          <w:sz w:val="19"/>
+        </w:rPr>
+        <w:t>approved_user_mapping</w:t>
+      </w:r>
+      <w:r>
+        <w:rPr>
+          <w:rFonts w:ascii="Calibri" w:hAnsi="Calibri"/>
+          <w:sz w:val="22"/>
+        </w:rPr>
+        <w:t>.</w:t>
       </w:r>
     </w:p>
     <w:p>
@@ -5725,19 +6129,111 @@
           <w:rFonts w:ascii="Calibri" w:hAnsi="Calibri"/>
           <w:sz w:val="22"/>
         </w:rPr>
-        <w:t>These notes persist locally but do not alter completed analysis results. A proposed mapping is documentation only until a future scenario-controlled review system applies it explicitly.</w:t>
-      </w:r>
-    </w:p>
-    <w:p>
-      <w:pPr>
-        <w:pStyle w:val="Heading2"/>
-      </w:pPr>
-      <w:r>
-        <w:rPr>
-          <w:rFonts w:ascii="Calibri" w:hAnsi="Calibri"/>
-          <w:sz w:val="22"/>
-        </w:rPr>
-        <w:t>Excel export</w:t>
+        <w:t>Choose the narrowest defensible scope:</w:t>
+      </w:r>
+    </w:p>
+    <w:p>
+      <w:pPr>
+        <w:widowControl/>
+        <w:numPr>
+          <w:ilvl w:val="0"/>
+          <w:numId w:val="10"/>
+        </w:numPr>
+        <w:spacing w:before="0" w:after="80" w:line="300" w:lineRule="auto"/>
+        <w:ind w:left="540" w:hanging="271"/>
+      </w:pPr>
+      <w:r>
+        <w:rPr>
+          <w:rFonts w:ascii="Calibri" w:hAnsi="Calibri"/>
+          <w:b/>
+          <w:sz w:val="22"/>
+        </w:rPr>
+        <w:t>Occurrence:</w:t>
+      </w:r>
+      <w:r>
+        <w:rPr>
+          <w:rFonts w:ascii="Calibri" w:hAnsi="Calibri"/>
+          <w:sz w:val="22"/>
+        </w:rPr>
+        <w:t xml:space="preserve"> one token position in one preserved text version.</w:t>
+      </w:r>
+    </w:p>
+    <w:p>
+      <w:pPr>
+        <w:widowControl/>
+        <w:numPr>
+          <w:ilvl w:val="0"/>
+          <w:numId w:val="10"/>
+        </w:numPr>
+        <w:spacing w:before="0" w:after="80" w:line="300" w:lineRule="auto"/>
+        <w:ind w:left="540" w:hanging="271"/>
+      </w:pPr>
+      <w:r>
+        <w:rPr>
+          <w:rFonts w:ascii="Calibri" w:hAnsi="Calibri"/>
+          <w:b/>
+          <w:sz w:val="22"/>
+        </w:rPr>
+        <w:t>Work:</w:t>
+      </w:r>
+      <w:r>
+        <w:rPr>
+          <w:rFonts w:ascii="Calibri" w:hAnsi="Calibri"/>
+          <w:sz w:val="22"/>
+        </w:rPr>
+        <w:t xml:space="preserve"> eligible occurrences in one selected work.</w:t>
+      </w:r>
+    </w:p>
+    <w:p>
+      <w:pPr>
+        <w:widowControl/>
+        <w:numPr>
+          <w:ilvl w:val="0"/>
+          <w:numId w:val="10"/>
+        </w:numPr>
+        <w:spacing w:before="0" w:after="80" w:line="300" w:lineRule="auto"/>
+        <w:ind w:left="540" w:hanging="271"/>
+      </w:pPr>
+      <w:r>
+        <w:rPr>
+          <w:rFonts w:ascii="Calibri" w:hAnsi="Calibri"/>
+          <w:b/>
+          <w:sz w:val="22"/>
+        </w:rPr>
+        <w:t>Project:</w:t>
+      </w:r>
+      <w:r>
+        <w:rPr>
+          <w:rFonts w:ascii="Calibri" w:hAnsi="Calibri"/>
+          <w:sz w:val="22"/>
+        </w:rPr>
+        <w:t xml:space="preserve"> eligible occurrences across the project.</w:t>
+      </w:r>
+    </w:p>
+    <w:p>
+      <w:pPr>
+        <w:widowControl/>
+        <w:numPr>
+          <w:ilvl w:val="0"/>
+          <w:numId w:val="10"/>
+        </w:numPr>
+        <w:spacing w:before="0" w:after="80" w:line="300" w:lineRule="auto"/>
+        <w:ind w:left="540" w:hanging="271"/>
+      </w:pPr>
+      <w:r>
+        <w:rPr>
+          <w:rFonts w:ascii="Calibri" w:hAnsi="Calibri"/>
+          <w:b/>
+          <w:sz w:val="22"/>
+        </w:rPr>
+        <w:t>Global within scenario use:</w:t>
+      </w:r>
+      <w:r>
+        <w:rPr>
+          <w:rFonts w:ascii="Calibri" w:hAnsi="Calibri"/>
+          <w:sz w:val="22"/>
+        </w:rPr>
+        <w:t xml:space="preserve"> eligible occurrences wherever that scenario is evaluated.</w:t>
       </w:r>
     </w:p>
     <w:p>
@@ -5750,19 +6246,19 @@
           <w:rFonts w:ascii="Calibri" w:hAnsi="Calibri"/>
           <w:sz w:val="22"/>
         </w:rPr>
-        <w:t>After a complete batch, download the corpus workbook. It includes a reading guide, both collection weighting views, both stopword views, work-level data, cumulative totals, coverage/emotion data, unmatched notes, text/version provenance, and the stopword methodology.</w:t>
-      </w:r>
-    </w:p>
-    <w:p>
-      <w:pPr>
-        <w:pStyle w:val="Heading2"/>
-      </w:pPr>
-      <w:r>
-        <w:rPr>
-          <w:rFonts w:ascii="Calibri" w:hAnsi="Calibri"/>
-          <w:sz w:val="22"/>
-        </w:rPr>
-        <w:t>Delete a project</w:t>
+        <w:t>Every decision requires a rationale and becomes an append-only revision. Revoking, restoring, or restoring an older snapshot creates a new scenario version. Completed batches stay pinned to the exact scenario version and decision revisions used at calculation time.</w:t>
+      </w:r>
+    </w:p>
+    <w:p>
+      <w:pPr>
+        <w:pStyle w:val="Heading3"/>
+      </w:pPr>
+      <w:r>
+        <w:rPr>
+          <w:rFonts w:ascii="Calibri" w:hAnsi="Calibri"/>
+          <w:sz w:val="22"/>
+        </w:rPr>
+        <w:t>Beginner-safe review workflow</w:t>
       </w:r>
     </w:p>
     <w:p>
@@ -5780,7 +6276,7 @@
           <w:rFonts w:ascii="Calibri" w:hAnsi="Calibri"/>
           <w:sz w:val="22"/>
         </w:rPr>
-        <w:t>Select the project.</w:t>
+        <w:t>Run and retain an unreviewed baseline.</w:t>
       </w:r>
     </w:p>
     <w:p>
@@ -5798,22 +6294,7 @@
           <w:rFonts w:ascii="Calibri" w:hAnsi="Calibri"/>
           <w:sz w:val="22"/>
         </w:rPr>
-        <w:t xml:space="preserve">Open </w:t>
-      </w:r>
-      <w:r>
-        <w:rPr>
-          <w:rFonts w:ascii="Calibri" w:hAnsi="Calibri"/>
-          <w:b/>
-          <w:sz w:val="22"/>
-        </w:rPr>
-        <w:t>Project settings</w:t>
-      </w:r>
-      <w:r>
-        <w:rPr>
-          <w:rFonts w:ascii="Calibri" w:hAnsi="Calibri"/>
-          <w:sz w:val="22"/>
-        </w:rPr>
-        <w:t>.</w:t>
+        <w:t>Create a clearly named scenario.</w:t>
       </w:r>
     </w:p>
     <w:p>
@@ -5831,7 +6312,7 @@
           <w:rFonts w:ascii="Calibri" w:hAnsi="Calibri"/>
           <w:sz w:val="22"/>
         </w:rPr>
-        <w:t>Read the permanent-deletion warning.</w:t>
+        <w:t>Inspect one candidate's text context, lexicon, match method, and risk label.</w:t>
       </w:r>
     </w:p>
     <w:p>
@@ -5849,7 +6330,7 @@
           <w:rFonts w:ascii="Calibri" w:hAnsi="Calibri"/>
           <w:sz w:val="22"/>
         </w:rPr>
-        <w:t>Type the project title exactly, including capitalization.</w:t>
+        <w:t>Choose flag, exclude, or map.</w:t>
       </w:r>
     </w:p>
     <w:p>
@@ -5867,7 +6348,43 @@
           <w:rFonts w:ascii="Calibri" w:hAnsi="Calibri"/>
           <w:sz w:val="22"/>
         </w:rPr>
-        <w:t xml:space="preserve">Click </w:t>
+        <w:t>Select the narrowest scope that fits the evidence.</w:t>
+      </w:r>
+    </w:p>
+    <w:p>
+      <w:pPr>
+        <w:widowControl/>
+        <w:numPr>
+          <w:ilvl w:val="0"/>
+          <w:numId w:val="18"/>
+        </w:numPr>
+        <w:spacing w:before="0" w:after="80" w:line="300" w:lineRule="auto"/>
+        <w:ind w:left="540" w:hanging="271"/>
+      </w:pPr>
+      <w:r>
+        <w:rPr>
+          <w:rFonts w:ascii="Calibri" w:hAnsi="Calibri"/>
+          <w:sz w:val="22"/>
+        </w:rPr>
+        <w:t>Write a rationale another scholar could evaluate.</w:t>
+      </w:r>
+    </w:p>
+    <w:p>
+      <w:pPr>
+        <w:widowControl/>
+        <w:numPr>
+          <w:ilvl w:val="0"/>
+          <w:numId w:val="18"/>
+        </w:numPr>
+        <w:spacing w:before="0" w:after="80" w:line="300" w:lineRule="auto"/>
+        <w:ind w:left="540" w:hanging="271"/>
+      </w:pPr>
+      <w:r>
+        <w:rPr>
+          <w:rFonts w:ascii="Calibri" w:hAnsi="Calibri"/>
+          <w:sz w:val="22"/>
+        </w:rPr>
+        <w:t xml:space="preserve">Return to </w:t>
       </w:r>
       <w:r>
         <w:rPr>
@@ -5875,7 +6392,40 @@
           <w:b/>
           <w:sz w:val="22"/>
         </w:rPr>
-        <w:t>Delete this project</w:t>
+        <w:t>Analyze &amp; Compare</w:t>
+      </w:r>
+      <w:r>
+        <w:rPr>
+          <w:rFonts w:ascii="Calibri" w:hAnsi="Calibri"/>
+          <w:sz w:val="22"/>
+        </w:rPr>
+        <w:t>, select that scenario version, and rerun.</w:t>
+      </w:r>
+    </w:p>
+    <w:p>
+      <w:pPr>
+        <w:widowControl/>
+        <w:numPr>
+          <w:ilvl w:val="0"/>
+          <w:numId w:val="18"/>
+        </w:numPr>
+        <w:spacing w:before="0" w:after="80" w:line="300" w:lineRule="auto"/>
+        <w:ind w:left="540" w:hanging="271"/>
+      </w:pPr>
+      <w:r>
+        <w:rPr>
+          <w:rFonts w:ascii="Calibri" w:hAnsi="Calibri"/>
+          <w:sz w:val="22"/>
+        </w:rPr>
+        <w:t xml:space="preserve">Compare the reviewed batch with the baseline under </w:t>
+      </w:r>
+      <w:r>
+        <w:rPr>
+          <w:rFonts w:ascii="Calibri" w:hAnsi="Calibri"/>
+          <w:b/>
+          <w:sz w:val="22"/>
+        </w:rPr>
+        <w:t>Compare Two Immutable Analysis Batches</w:t>
       </w:r>
       <w:r>
         <w:rPr>
@@ -5883,6 +6433,57 @@
           <w:sz w:val="22"/>
         </w:rPr>
         <w:t>.</w:t>
+      </w:r>
+    </w:p>
+    <w:p>
+      <w:pPr>
+        <w:widowControl/>
+        <w:numPr>
+          <w:ilvl w:val="0"/>
+          <w:numId w:val="18"/>
+        </w:numPr>
+        <w:spacing w:before="0" w:after="80" w:line="300" w:lineRule="auto"/>
+        <w:ind w:left="540" w:hanging="271"/>
+      </w:pPr>
+      <w:r>
+        <w:rPr>
+          <w:rFonts w:ascii="Calibri" w:hAnsi="Calibri"/>
+          <w:sz w:val="22"/>
+        </w:rPr>
+        <w:t>Inspect coverage changes, VAD deltas, match evidence, and unmatched vocabulary.</w:t>
+      </w:r>
+    </w:p>
+    <w:p>
+      <w:pPr>
+        <w:widowControl/>
+        <w:numPr>
+          <w:ilvl w:val="0"/>
+          <w:numId w:val="18"/>
+        </w:numPr>
+        <w:spacing w:before="0" w:after="80" w:line="300" w:lineRule="auto"/>
+        <w:ind w:left="540" w:hanging="271"/>
+      </w:pPr>
+      <w:r>
+        <w:rPr>
+          <w:rFonts w:ascii="Calibri" w:hAnsi="Calibri"/>
+          <w:sz w:val="22"/>
+        </w:rPr>
+        <w:t xml:space="preserve">Export the workbook and preserve its methodology and </w:t>
+      </w:r>
+      <w:r>
+        <w:rPr>
+          <w:rFonts w:ascii="Calibri" w:hAnsi="Calibri"/>
+          <w:b/>
+          <w:sz w:val="22"/>
+        </w:rPr>
+        <w:t>Review Decisions</w:t>
+      </w:r>
+      <w:r>
+        <w:rPr>
+          <w:rFonts w:ascii="Calibri" w:hAnsi="Calibri"/>
+          <w:sz w:val="22"/>
+        </w:rPr>
+        <w:t xml:space="preserve"> sheet.</w:t>
       </w:r>
     </w:p>
     <w:p>
@@ -5895,19 +6496,7 @@
           <w:rFonts w:ascii="Calibri" w:hAnsi="Calibri"/>
           <w:sz w:val="22"/>
         </w:rPr>
-        <w:t>The button remains unavailable until the title matches exactly. Deletion removes only that project's local works, versions, batches, analyses, metrics, and notes. It does not affect other projects or source lexicons. This deletion is permanent unless you have a separate backup.</w:t>
-      </w:r>
-    </w:p>
-    <w:p>
-      <w:pPr>
-        <w:pStyle w:val="Heading1"/>
-      </w:pPr>
-      <w:r>
-        <w:rPr>
-          <w:rFonts w:ascii="Calibri" w:hAnsi="Calibri"/>
-          <w:sz w:val="22"/>
-        </w:rPr>
-        <w:t>10. Lexicon Explorer</w:t>
+        <w:t>Conflicting same-scope mappings are rejected. A mapping target must exist as an exact entry in the selected installed lexicon. A proposed mapping in the older unmatched-note form remains documentation only; it does not change a calculation unless converted into an active scenario decision.</w:t>
       </w:r>
     </w:p>
     <w:p>
@@ -5919,7 +6508,112 @@
           <w:rFonts w:ascii="Calibri" w:hAnsi="Calibri"/>
           <w:sz w:val="22"/>
         </w:rPr>
-        <w:t>Basic lookup</w:t>
+        <w:t>Unmatched quality-control notes</w:t>
+      </w:r>
+    </w:p>
+    <w:p>
+      <w:pPr>
+        <w:widowControl/>
+        <w:spacing w:before="0" w:after="120" w:line="300" w:lineRule="auto"/>
+      </w:pPr>
+      <w:r>
+        <w:rPr>
+          <w:rFonts w:ascii="Calibri" w:hAnsi="Calibri"/>
+          <w:sz w:val="22"/>
+        </w:rPr>
+        <w:t xml:space="preserve">The legacy unmatched-quality-control panel remains available beneath </w:t>
+      </w:r>
+      <w:r>
+        <w:rPr>
+          <w:rFonts w:ascii="Calibri" w:hAnsi="Calibri"/>
+          <w:b/>
+          <w:sz w:val="22"/>
+        </w:rPr>
+        <w:t>Review &amp; Scenarios</w:t>
+      </w:r>
+      <w:r>
+        <w:rPr>
+          <w:rFonts w:ascii="Calibri" w:hAnsi="Calibri"/>
+          <w:sz w:val="22"/>
+        </w:rPr>
+        <w:t>. It stores status, research note, and possible mapping text locally. These notes support research bookkeeping but do not alter completed or future analyses by themselves.</w:t>
+      </w:r>
+    </w:p>
+    <w:p>
+      <w:pPr>
+        <w:pStyle w:val="Heading2"/>
+      </w:pPr>
+      <w:r>
+        <w:rPr>
+          <w:rFonts w:ascii="Calibri" w:hAnsi="Calibri"/>
+          <w:sz w:val="22"/>
+        </w:rPr>
+        <w:t>Compare immutable batches</w:t>
+      </w:r>
+    </w:p>
+    <w:p>
+      <w:pPr>
+        <w:widowControl/>
+        <w:spacing w:before="0" w:after="120" w:line="300" w:lineRule="auto"/>
+      </w:pPr>
+      <w:r>
+        <w:rPr>
+          <w:rFonts w:ascii="Calibri" w:hAnsi="Calibri"/>
+          <w:sz w:val="22"/>
+        </w:rPr>
+        <w:t xml:space="preserve">Under </w:t>
+      </w:r>
+      <w:r>
+        <w:rPr>
+          <w:rFonts w:ascii="Calibri" w:hAnsi="Calibri"/>
+          <w:b/>
+          <w:sz w:val="22"/>
+        </w:rPr>
+        <w:t>Analyze &amp; Compare</w:t>
+      </w:r>
+      <w:r>
+        <w:rPr>
+          <w:rFonts w:ascii="Calibri" w:hAnsi="Calibri"/>
+          <w:sz w:val="22"/>
+        </w:rPr>
+        <w:t>, choose two completed batches to see like-for-like coverage and VAD deltas. Because each batch remains tied to its exact text versions, lexicons, recipe, stopword policy, software version, scenario version, and decision revisions, this comparison can show how an explicit review scenario changed the result without erasing the baseline.</w:t>
+      </w:r>
+    </w:p>
+    <w:p>
+      <w:pPr>
+        <w:pStyle w:val="Heading2"/>
+      </w:pPr>
+      <w:r>
+        <w:rPr>
+          <w:rFonts w:ascii="Calibri" w:hAnsi="Calibri"/>
+          <w:sz w:val="22"/>
+        </w:rPr>
+        <w:t>Excel Export</w:t>
+      </w:r>
+    </w:p>
+    <w:p>
+      <w:pPr>
+        <w:widowControl/>
+        <w:spacing w:before="0" w:after="120" w:line="300" w:lineRule="auto"/>
+      </w:pPr>
+      <w:r>
+        <w:rPr>
+          <w:rFonts w:ascii="Calibri" w:hAnsi="Calibri"/>
+          <w:sz w:val="22"/>
+        </w:rPr>
+        <w:t>After a complete batch, download the corpus workbook. It includes a reading guide, both collection weighting views, both stopword views, work-level data, cumulative totals, coverage, separately labeled emotion/sentiment/intensity constructs, unmatched notes, text/version provenance, review decisions when applicable, and the recorded methodology.</w:t>
+      </w:r>
+    </w:p>
+    <w:p>
+      <w:pPr>
+        <w:pStyle w:val="Heading2"/>
+      </w:pPr>
+      <w:r>
+        <w:rPr>
+          <w:rFonts w:ascii="Calibri" w:hAnsi="Calibri"/>
+          <w:sz w:val="22"/>
+        </w:rPr>
+        <w:t>Delete a project</w:t>
       </w:r>
     </w:p>
     <w:p>
@@ -5937,22 +6631,7 @@
           <w:rFonts w:ascii="Calibri" w:hAnsi="Calibri"/>
           <w:sz w:val="22"/>
         </w:rPr>
-        <w:t xml:space="preserve">Open </w:t>
-      </w:r>
-      <w:r>
-        <w:rPr>
-          <w:rFonts w:ascii="Calibri" w:hAnsi="Calibri"/>
-          <w:b/>
-          <w:sz w:val="22"/>
-        </w:rPr>
-        <w:t>Lexicon Explorer</w:t>
-      </w:r>
-      <w:r>
-        <w:rPr>
-          <w:rFonts w:ascii="Calibri" w:hAnsi="Calibri"/>
-          <w:sz w:val="22"/>
-        </w:rPr>
-        <w:t>.</w:t>
+        <w:t>Select the project.</w:t>
       </w:r>
     </w:p>
     <w:p>
@@ -5970,7 +6649,22 @@
           <w:rFonts w:ascii="Calibri" w:hAnsi="Calibri"/>
           <w:sz w:val="22"/>
         </w:rPr>
-        <w:t>Enter one word or phrase.</w:t>
+        <w:t xml:space="preserve">Open </w:t>
+      </w:r>
+      <w:r>
+        <w:rPr>
+          <w:rFonts w:ascii="Calibri" w:hAnsi="Calibri"/>
+          <w:b/>
+          <w:sz w:val="22"/>
+        </w:rPr>
+        <w:t>Project Settings</w:t>
+      </w:r>
+      <w:r>
+        <w:rPr>
+          <w:rFonts w:ascii="Calibri" w:hAnsi="Calibri"/>
+          <w:sz w:val="22"/>
+        </w:rPr>
+        <w:t>.</w:t>
       </w:r>
     </w:p>
     <w:p>
@@ -5988,7 +6682,7 @@
           <w:rFonts w:ascii="Calibri" w:hAnsi="Calibri"/>
           <w:sz w:val="22"/>
         </w:rPr>
-        <w:t>Optionally enter a user-supplied mapping.</w:t>
+        <w:t>Read the permanent-deletion warning.</w:t>
       </w:r>
     </w:p>
     <w:p>
@@ -5997,6 +6691,163 @@
         <w:numPr>
           <w:ilvl w:val="0"/>
           <w:numId w:val="19"/>
+        </w:numPr>
+        <w:spacing w:before="0" w:after="80" w:line="300" w:lineRule="auto"/>
+        <w:ind w:left="540" w:hanging="271"/>
+      </w:pPr>
+      <w:r>
+        <w:rPr>
+          <w:rFonts w:ascii="Calibri" w:hAnsi="Calibri"/>
+          <w:sz w:val="22"/>
+        </w:rPr>
+        <w:t>Type the project title exactly, including capitalization.</w:t>
+      </w:r>
+    </w:p>
+    <w:p>
+      <w:pPr>
+        <w:widowControl/>
+        <w:numPr>
+          <w:ilvl w:val="0"/>
+          <w:numId w:val="19"/>
+        </w:numPr>
+        <w:spacing w:before="0" w:after="80" w:line="300" w:lineRule="auto"/>
+        <w:ind w:left="540" w:hanging="271"/>
+      </w:pPr>
+      <w:r>
+        <w:rPr>
+          <w:rFonts w:ascii="Calibri" w:hAnsi="Calibri"/>
+          <w:sz w:val="22"/>
+        </w:rPr>
+        <w:t xml:space="preserve">Click </w:t>
+      </w:r>
+      <w:r>
+        <w:rPr>
+          <w:rFonts w:ascii="Calibri" w:hAnsi="Calibri"/>
+          <w:b/>
+          <w:sz w:val="22"/>
+        </w:rPr>
+        <w:t>Delete this project</w:t>
+      </w:r>
+      <w:r>
+        <w:rPr>
+          <w:rFonts w:ascii="Calibri" w:hAnsi="Calibri"/>
+          <w:sz w:val="22"/>
+        </w:rPr>
+        <w:t>.</w:t>
+      </w:r>
+    </w:p>
+    <w:p>
+      <w:pPr>
+        <w:widowControl/>
+        <w:spacing w:before="0" w:after="120" w:line="300" w:lineRule="auto"/>
+      </w:pPr>
+      <w:r>
+        <w:rPr>
+          <w:rFonts w:ascii="Calibri" w:hAnsi="Calibri"/>
+          <w:sz w:val="22"/>
+        </w:rPr>
+        <w:t>The button remains unavailable until the title matches exactly. Deletion removes only that project's local works, versions, batches, analyses, metrics, and notes. It does not affect other projects or source lexicons. This deletion is permanent unless you have a separate backup.</w:t>
+      </w:r>
+    </w:p>
+    <w:p>
+      <w:pPr>
+        <w:pStyle w:val="Heading1"/>
+      </w:pPr>
+      <w:r>
+        <w:rPr>
+          <w:rFonts w:ascii="Calibri" w:hAnsi="Calibri"/>
+          <w:sz w:val="22"/>
+        </w:rPr>
+        <w:t>10. Lexicon Explorer</w:t>
+      </w:r>
+    </w:p>
+    <w:p>
+      <w:pPr>
+        <w:pStyle w:val="Heading2"/>
+      </w:pPr>
+      <w:r>
+        <w:rPr>
+          <w:rFonts w:ascii="Calibri" w:hAnsi="Calibri"/>
+          <w:sz w:val="22"/>
+        </w:rPr>
+        <w:t>Basic lookup</w:t>
+      </w:r>
+    </w:p>
+    <w:p>
+      <w:pPr>
+        <w:widowControl/>
+        <w:numPr>
+          <w:ilvl w:val="0"/>
+          <w:numId w:val="20"/>
+        </w:numPr>
+        <w:spacing w:before="0" w:after="80" w:line="300" w:lineRule="auto"/>
+        <w:ind w:left="540" w:hanging="271"/>
+      </w:pPr>
+      <w:r>
+        <w:rPr>
+          <w:rFonts w:ascii="Calibri" w:hAnsi="Calibri"/>
+          <w:sz w:val="22"/>
+        </w:rPr>
+        <w:t xml:space="preserve">Open </w:t>
+      </w:r>
+      <w:r>
+        <w:rPr>
+          <w:rFonts w:ascii="Calibri" w:hAnsi="Calibri"/>
+          <w:b/>
+          <w:sz w:val="22"/>
+        </w:rPr>
+        <w:t>Lexicon Explorer</w:t>
+      </w:r>
+      <w:r>
+        <w:rPr>
+          <w:rFonts w:ascii="Calibri" w:hAnsi="Calibri"/>
+          <w:sz w:val="22"/>
+        </w:rPr>
+        <w:t>.</w:t>
+      </w:r>
+    </w:p>
+    <w:p>
+      <w:pPr>
+        <w:widowControl/>
+        <w:numPr>
+          <w:ilvl w:val="0"/>
+          <w:numId w:val="20"/>
+        </w:numPr>
+        <w:spacing w:before="0" w:after="80" w:line="300" w:lineRule="auto"/>
+        <w:ind w:left="540" w:hanging="271"/>
+      </w:pPr>
+      <w:r>
+        <w:rPr>
+          <w:rFonts w:ascii="Calibri" w:hAnsi="Calibri"/>
+          <w:sz w:val="22"/>
+        </w:rPr>
+        <w:t>Enter one word or phrase.</w:t>
+      </w:r>
+    </w:p>
+    <w:p>
+      <w:pPr>
+        <w:widowControl/>
+        <w:numPr>
+          <w:ilvl w:val="0"/>
+          <w:numId w:val="20"/>
+        </w:numPr>
+        <w:spacing w:before="0" w:after="80" w:line="300" w:lineRule="auto"/>
+        <w:ind w:left="540" w:hanging="271"/>
+      </w:pPr>
+      <w:r>
+        <w:rPr>
+          <w:rFonts w:ascii="Calibri" w:hAnsi="Calibri"/>
+          <w:sz w:val="22"/>
+        </w:rPr>
+        <w:t>Optionally enter a user-supplied mapping.</w:t>
+      </w:r>
+    </w:p>
+    <w:p>
+      <w:pPr>
+        <w:widowControl/>
+        <w:numPr>
+          <w:ilvl w:val="0"/>
+          <w:numId w:val="20"/>
         </w:numPr>
         <w:spacing w:before="0" w:after="80" w:line="300" w:lineRule="auto"/>
         <w:ind w:left="540" w:hanging="271"/>
@@ -6980,7 +7831,7 @@
                 <w:rFonts w:ascii="Calibri" w:hAnsi="Calibri"/>
                 <w:sz w:val="18"/>
               </w:rPr>
-              <w:t>Category counts, rates, denominators, and contributors</w:t>
+              <w:t>Eight-emotion and positive/negative source associations, retained as labeled categories for audit</w:t>
             </w:r>
           </w:p>
         </w:tc>
@@ -7408,7 +8259,7 @@
                 <w:rFonts w:ascii="Calibri" w:hAnsi="Calibri"/>
                 <w:sz w:val="18"/>
               </w:rPr>
-              <w:t>Corpus profiles</w:t>
+              <w:t>Corpus Profiles</w:t>
             </w:r>
           </w:p>
         </w:tc>
@@ -7516,7 +8367,7 @@
                 <w:rFonts w:ascii="Calibri" w:hAnsi="Calibri"/>
                 <w:sz w:val="18"/>
               </w:rPr>
-              <w:t>Cumulative load</w:t>
+              <w:t>Cumulative Load</w:t>
             </w:r>
           </w:p>
         </w:tc>
@@ -7570,7 +8421,7 @@
                 <w:rFonts w:ascii="Calibri" w:hAnsi="Calibri"/>
                 <w:sz w:val="18"/>
               </w:rPr>
-              <w:t>Coverage and emotion</w:t>
+              <w:t>Coverage and Emotion</w:t>
             </w:r>
           </w:p>
         </w:tc>
@@ -7596,7 +8447,76 @@
                 <w:rFonts w:ascii="Calibri" w:hAnsi="Calibri"/>
                 <w:sz w:val="18"/>
               </w:rPr>
-              <w:t>Coverage plus source-specific emotion metrics</w:t>
+              <w:t xml:space="preserve">Coverage plus a </w:t>
+            </w:r>
+            <w:r>
+              <w:rPr>
+                <w:rFonts w:ascii="Consolas" w:hAnsi="Consolas"/>
+                <w:color w:val="1F4D78"/>
+                <w:sz w:val="17"/>
+              </w:rPr>
+              <w:t>Construct</w:t>
+            </w:r>
+            <w:r>
+              <w:rPr>
+                <w:rFonts w:ascii="Calibri" w:hAnsi="Calibri"/>
+                <w:sz w:val="18"/>
+              </w:rPr>
+              <w:t xml:space="preserve"> field separating emotion associations, sentiment associations, and supplied emotion-intensity metrics</w:t>
+            </w:r>
+          </w:p>
+        </w:tc>
+      </w:tr>
+      <w:tr>
+        <w:tc>
+          <w:tcPr>
+            <w:tcW w:type="dxa" w:w="2700"/>
+            <w:vAlign w:val="center"/>
+            <w:tcMar>
+              <w:top w:w="80" w:type="dxa"/>
+              <w:bottom w:w="80" w:type="dxa"/>
+              <w:start w:w="120" w:type="dxa"/>
+              <w:end w:w="120" w:type="dxa"/>
+            </w:tcMar>
+          </w:tcPr>
+          <w:p>
+            <w:pPr>
+              <w:widowControl/>
+              <w:spacing w:before="0" w:after="0" w:line="252" w:lineRule="auto"/>
+            </w:pPr>
+            <w:r/>
+            <w:r>
+              <w:rPr>
+                <w:rFonts w:ascii="Calibri" w:hAnsi="Calibri"/>
+                <w:sz w:val="18"/>
+              </w:rPr>
+              <w:t>Part of Speech</w:t>
+            </w:r>
+          </w:p>
+        </w:tc>
+        <w:tc>
+          <w:tcPr>
+            <w:tcW w:type="dxa" w:w="6660"/>
+            <w:vAlign w:val="center"/>
+            <w:tcMar>
+              <w:top w:w="80" w:type="dxa"/>
+              <w:bottom w:w="80" w:type="dxa"/>
+              <w:start w:w="120" w:type="dxa"/>
+              <w:end w:w="120" w:type="dxa"/>
+            </w:tcMar>
+          </w:tcPr>
+          <w:p>
+            <w:pPr>
+              <w:widowControl/>
+              <w:spacing w:before="0" w:after="0" w:line="252" w:lineRule="auto"/>
+            </w:pPr>
+            <w:r/>
+            <w:r>
+              <w:rPr>
+                <w:rFonts w:ascii="Calibri" w:hAnsi="Calibri"/>
+                <w:sz w:val="18"/>
+              </w:rPr>
+              <w:t>Combined-project and work-level universal POS counts, lexical-token shares, unique types, examples, denominator, and model</w:t>
             </w:r>
           </w:p>
         </w:tc>
@@ -7678,7 +8598,61 @@
                 <w:rFonts w:ascii="Calibri" w:hAnsi="Calibri"/>
                 <w:sz w:val="18"/>
               </w:rPr>
-              <w:t>Text metadata</w:t>
+              <w:t>Review Decisions</w:t>
+            </w:r>
+          </w:p>
+        </w:tc>
+        <w:tc>
+          <w:tcPr>
+            <w:tcW w:type="dxa" w:w="6660"/>
+            <w:vAlign w:val="center"/>
+            <w:tcMar>
+              <w:top w:w="80" w:type="dxa"/>
+              <w:bottom w:w="80" w:type="dxa"/>
+              <w:start w:w="120" w:type="dxa"/>
+              <w:end w:w="120" w:type="dxa"/>
+            </w:tcMar>
+          </w:tcPr>
+          <w:p>
+            <w:pPr>
+              <w:widowControl/>
+              <w:spacing w:before="0" w:after="0" w:line="252" w:lineRule="auto"/>
+            </w:pPr>
+            <w:r/>
+            <w:r>
+              <w:rPr>
+                <w:rFonts w:ascii="Calibri" w:hAnsi="Calibri"/>
+                <w:sz w:val="18"/>
+              </w:rPr>
+              <w:t>Active decision revisions pinned to the exported scenario; present for reviewed runs</w:t>
+            </w:r>
+          </w:p>
+        </w:tc>
+      </w:tr>
+      <w:tr>
+        <w:tc>
+          <w:tcPr>
+            <w:tcW w:type="dxa" w:w="2700"/>
+            <w:vAlign w:val="center"/>
+            <w:tcMar>
+              <w:top w:w="80" w:type="dxa"/>
+              <w:bottom w:w="80" w:type="dxa"/>
+              <w:start w:w="120" w:type="dxa"/>
+              <w:end w:w="120" w:type="dxa"/>
+            </w:tcMar>
+          </w:tcPr>
+          <w:p>
+            <w:pPr>
+              <w:widowControl/>
+              <w:spacing w:before="0" w:after="0" w:line="252" w:lineRule="auto"/>
+            </w:pPr>
+            <w:r/>
+            <w:r>
+              <w:rPr>
+                <w:rFonts w:ascii="Calibri" w:hAnsi="Calibri"/>
+                <w:sz w:val="18"/>
+              </w:rPr>
+              <w:t>Text Metadata</w:t>
             </w:r>
           </w:p>
         </w:tc>
@@ -8400,7 +9374,7 @@
           <w:rFonts w:ascii="Calibri" w:hAnsi="Calibri"/>
           <w:sz w:val="22"/>
         </w:rPr>
-        <w:t>Stopword sensitivity</w:t>
+        <w:t>Part-of-speech share</w:t>
       </w:r>
     </w:p>
     <w:p>
@@ -8413,19 +9387,7 @@
           <w:color w:val="1F4D78"/>
           <w:sz w:val="19"/>
         </w:rPr>
-        <w:t>sensitivity = stopwords_excluded_value - all_matched_value</w:t>
-      </w:r>
-    </w:p>
-    <w:p>
-      <w:pPr>
-        <w:pStyle w:val="Heading2"/>
-      </w:pPr>
-      <w:r>
-        <w:rPr>
-          <w:rFonts w:ascii="Calibri" w:hAnsi="Calibri"/>
-          <w:sz w:val="22"/>
-        </w:rPr>
-        <w:t>Cumulative normalized totals</w:t>
+        <w:t>POS_share_c = token occurrences assigned to category c / all eligible lexical token occurrences</w:t>
       </w:r>
     </w:p>
     <w:p>
@@ -8436,10 +9398,21 @@
       <w:r>
         <w:rPr>
           <w:rFonts w:ascii="Calibri" w:hAnsi="Calibri"/>
-          <w:b/>
-          <w:sz w:val="22"/>
-        </w:rPr>
-        <w:t>Rating total</w:t>
+          <w:sz w:val="22"/>
+        </w:rPr>
+        <w:t>The combined corpus profile pools occurrences from all current works. A work-level profile uses only that work's denominator.</w:t>
+      </w:r>
+    </w:p>
+    <w:p>
+      <w:pPr>
+        <w:pStyle w:val="Heading2"/>
+      </w:pPr>
+      <w:r>
+        <w:rPr>
+          <w:rFonts w:ascii="Calibri" w:hAnsi="Calibri"/>
+          <w:sz w:val="22"/>
+        </w:rPr>
+        <w:t>Stopword sensitivity</w:t>
       </w:r>
     </w:p>
     <w:p>
@@ -8452,7 +9425,19 @@
           <w:color w:val="1F4D78"/>
           <w:sz w:val="19"/>
         </w:rPr>
-        <w:t>rating_total = sum(x_i)</w:t>
+        <w:t>sensitivity = stopwords_excluded_value - all_matched_value</w:t>
+      </w:r>
+    </w:p>
+    <w:p>
+      <w:pPr>
+        <w:pStyle w:val="Heading2"/>
+      </w:pPr>
+      <w:r>
+        <w:rPr>
+          <w:rFonts w:ascii="Calibri" w:hAnsi="Calibri"/>
+          <w:sz w:val="22"/>
+        </w:rPr>
+        <w:t>Cumulative normalized totals</w:t>
       </w:r>
     </w:p>
     <w:p>
@@ -8466,7 +9451,7 @@
           <w:b/>
           <w:sz w:val="22"/>
         </w:rPr>
-        <w:t>Above-midpoint load</w:t>
+        <w:t>Rating total</w:t>
       </w:r>
     </w:p>
     <w:p>
@@ -8479,7 +9464,7 @@
           <w:color w:val="1F4D78"/>
           <w:sz w:val="19"/>
         </w:rPr>
-        <w:t>above = sum(max(x_i - 0.5, 0))</w:t>
+        <w:t>rating_total = sum(x_i)</w:t>
       </w:r>
     </w:p>
     <w:p>
@@ -8493,7 +9478,7 @@
           <w:b/>
           <w:sz w:val="22"/>
         </w:rPr>
-        <w:t>Below-midpoint load</w:t>
+        <w:t>Above-midpoint load</w:t>
       </w:r>
     </w:p>
     <w:p>
@@ -8506,7 +9491,7 @@
           <w:color w:val="1F4D78"/>
           <w:sz w:val="19"/>
         </w:rPr>
-        <w:t>below = sum(max(0.5 - x_i, 0))</w:t>
+        <w:t>above = sum(max(x_i - 0.5, 0))</w:t>
       </w:r>
     </w:p>
     <w:p>
@@ -8520,7 +9505,7 @@
           <w:b/>
           <w:sz w:val="22"/>
         </w:rPr>
-        <w:t>Net midpoint load</w:t>
+        <w:t>Below-midpoint load</w:t>
       </w:r>
     </w:p>
     <w:p>
@@ -8533,7 +9518,7 @@
           <w:color w:val="1F4D78"/>
           <w:sz w:val="19"/>
         </w:rPr>
-        <w:t>net = above - below = sum(x_i - 0.5)</w:t>
+        <w:t>below = sum(max(0.5 - x_i, 0))</w:t>
       </w:r>
     </w:p>
     <w:p>
@@ -8547,7 +9532,7 @@
           <w:b/>
           <w:sz w:val="22"/>
         </w:rPr>
-        <w:t>Absolute midpoint load</w:t>
+        <w:t>Net midpoint load</w:t>
       </w:r>
     </w:p>
     <w:p>
@@ -8560,19 +9545,21 @@
           <w:color w:val="1F4D78"/>
           <w:sz w:val="19"/>
         </w:rPr>
-        <w:t>absolute = above + below = sum(abs(x_i - 0.5))</w:t>
-      </w:r>
-    </w:p>
-    <w:p>
-      <w:pPr>
-        <w:pStyle w:val="Heading2"/>
-      </w:pPr>
-      <w:r>
-        <w:rPr>
-          <w:rFonts w:ascii="Calibri" w:hAnsi="Calibri"/>
-          <w:sz w:val="22"/>
-        </w:rPr>
-        <w:t>Midpoint-centered contribution</w:t>
+        <w:t>net = above - below = sum(x_i - 0.5)</w:t>
+      </w:r>
+    </w:p>
+    <w:p>
+      <w:pPr>
+        <w:widowControl/>
+        <w:spacing w:before="0" w:after="120" w:line="300" w:lineRule="auto"/>
+      </w:pPr>
+      <w:r>
+        <w:rPr>
+          <w:rFonts w:ascii="Calibri" w:hAnsi="Calibri"/>
+          <w:b/>
+          <w:sz w:val="22"/>
+        </w:rPr>
+        <w:t>Absolute midpoint load</w:t>
       </w:r>
     </w:p>
     <w:p>
@@ -8585,20 +9572,19 @@
           <w:color w:val="1F4D78"/>
           <w:sz w:val="19"/>
         </w:rPr>
-        <w:t>contribution_t = f_t * (x_t - 0.5)</w:t>
-      </w:r>
-    </w:p>
-    <w:p>
-      <w:pPr>
-        <w:widowControl/>
-        <w:spacing w:before="0" w:after="120" w:line="300" w:lineRule="auto"/>
-      </w:pPr>
-      <w:r>
-        <w:rPr>
-          <w:rFonts w:ascii="Calibri" w:hAnsi="Calibri"/>
-          <w:sz w:val="22"/>
-        </w:rPr>
-        <w:t>The leave-one-type-out mean change retained in the audit is:</w:t>
+        <w:t>absolute = above + below = sum(abs(x_i - 0.5))</w:t>
+      </w:r>
+    </w:p>
+    <w:p>
+      <w:pPr>
+        <w:pStyle w:val="Heading2"/>
+      </w:pPr>
+      <w:r>
+        <w:rPr>
+          <w:rFonts w:ascii="Calibri" w:hAnsi="Calibri"/>
+          <w:sz w:val="22"/>
+        </w:rPr>
+        <w:t>Midpoint-centered contribution</w:t>
       </w:r>
     </w:p>
     <w:p>
@@ -8611,19 +9597,7 @@
           <w:color w:val="1F4D78"/>
           <w:sz w:val="19"/>
         </w:rPr>
-        <w:t>effect_t = mean_token - mean_token_without_all_occurrences_of_t</w:t>
-      </w:r>
-    </w:p>
-    <w:p>
-      <w:pPr>
-        <w:pStyle w:val="Heading2"/>
-      </w:pPr>
-      <w:r>
-        <w:rPr>
-          <w:rFonts w:ascii="Calibri" w:hAnsi="Calibri"/>
-          <w:sz w:val="22"/>
-        </w:rPr>
-        <w:t>Corpus weighting</w:t>
+        <w:t>contribution_t = f_t * (x_t - 0.5)</w:t>
       </w:r>
     </w:p>
     <w:p>
@@ -8636,22 +9610,45 @@
           <w:rFonts w:ascii="Calibri" w:hAnsi="Calibri"/>
           <w:sz w:val="22"/>
         </w:rPr>
-        <w:t xml:space="preserve">For eligible work </w:t>
-      </w:r>
+        <w:t>The leave-one-type-out mean change retained in the audit is:</w:t>
+      </w:r>
+    </w:p>
+    <w:p>
+      <w:pPr>
+        <w:pStyle w:val="Formula"/>
+      </w:pPr>
       <w:r>
         <w:rPr>
           <w:rFonts w:ascii="Consolas" w:hAnsi="Consolas"/>
           <w:color w:val="1F4D78"/>
           <w:sz w:val="19"/>
         </w:rPr>
-        <w:t>i</w:t>
-      </w:r>
-      <w:r>
-        <w:rPr>
-          <w:rFonts w:ascii="Calibri" w:hAnsi="Calibri"/>
-          <w:sz w:val="22"/>
-        </w:rPr>
-        <w:t xml:space="preserve">, let </w:t>
+        <w:t>effect_t = mean_token - mean_token_without_all_occurrences_of_t</w:t>
+      </w:r>
+    </w:p>
+    <w:p>
+      <w:pPr>
+        <w:pStyle w:val="Heading2"/>
+      </w:pPr>
+      <w:r>
+        <w:rPr>
+          <w:rFonts w:ascii="Calibri" w:hAnsi="Calibri"/>
+          <w:sz w:val="22"/>
+        </w:rPr>
+        <w:t>Corpus weighting</w:t>
+      </w:r>
+    </w:p>
+    <w:p>
+      <w:pPr>
+        <w:widowControl/>
+        <w:spacing w:before="0" w:after="120" w:line="300" w:lineRule="auto"/>
+      </w:pPr>
+      <w:r>
+        <w:rPr>
+          <w:rFonts w:ascii="Calibri" w:hAnsi="Calibri"/>
+          <w:sz w:val="22"/>
+        </w:rPr>
+        <w:t xml:space="preserve">For eligible work </w:t>
       </w:r>
       <w:r>
         <w:rPr>
@@ -8659,14 +9656,14 @@
           <w:color w:val="1F4D78"/>
           <w:sz w:val="19"/>
         </w:rPr>
-        <w:t>m_i</w:t>
-      </w:r>
-      <w:r>
-        <w:rPr>
-          <w:rFonts w:ascii="Calibri" w:hAnsi="Calibri"/>
-          <w:sz w:val="22"/>
-        </w:rPr>
-        <w:t xml:space="preserve"> be its token-weighted mean and </w:t>
+        <w:t>i</w:t>
+      </w:r>
+      <w:r>
+        <w:rPr>
+          <w:rFonts w:ascii="Calibri" w:hAnsi="Calibri"/>
+          <w:sz w:val="22"/>
+        </w:rPr>
+        <w:t xml:space="preserve">, let </w:t>
       </w:r>
       <w:r>
         <w:rPr>
@@ -8674,41 +9671,29 @@
           <w:color w:val="1F4D78"/>
           <w:sz w:val="19"/>
         </w:rPr>
-        <w:t>n_i</w:t>
-      </w:r>
-      <w:r>
-        <w:rPr>
-          <w:rFonts w:ascii="Calibri" w:hAnsi="Calibri"/>
-          <w:sz w:val="22"/>
-        </w:rPr>
-        <w:t xml:space="preserve"> its included matched-observation count.</w:t>
-      </w:r>
-    </w:p>
-    <w:p>
-      <w:pPr>
-        <w:widowControl/>
-        <w:spacing w:before="0" w:after="120" w:line="300" w:lineRule="auto"/>
-      </w:pPr>
-      <w:r>
-        <w:rPr>
-          <w:rFonts w:ascii="Calibri" w:hAnsi="Calibri"/>
-          <w:b/>
-          <w:sz w:val="22"/>
-        </w:rPr>
-        <w:t>Token-weighted volume profile</w:t>
-      </w:r>
-    </w:p>
-    <w:p>
-      <w:pPr>
-        <w:pStyle w:val="Formula"/>
-      </w:pPr>
+        <w:t>m_i</w:t>
+      </w:r>
+      <w:r>
+        <w:rPr>
+          <w:rFonts w:ascii="Calibri" w:hAnsi="Calibri"/>
+          <w:sz w:val="22"/>
+        </w:rPr>
+        <w:t xml:space="preserve"> be its token-weighted mean and </w:t>
+      </w:r>
       <w:r>
         <w:rPr>
           <w:rFonts w:ascii="Consolas" w:hAnsi="Consolas"/>
           <w:color w:val="1F4D78"/>
           <w:sz w:val="19"/>
         </w:rPr>
-        <w:t>mean_volume_token = sum(m_i * n_i) / sum(n_i)</w:t>
+        <w:t>n_i</w:t>
+      </w:r>
+      <w:r>
+        <w:rPr>
+          <w:rFonts w:ascii="Calibri" w:hAnsi="Calibri"/>
+          <w:sz w:val="22"/>
+        </w:rPr>
+        <w:t xml:space="preserve"> its included matched-observation count.</w:t>
       </w:r>
     </w:p>
     <w:p>
@@ -8722,7 +9707,7 @@
           <w:b/>
           <w:sz w:val="22"/>
         </w:rPr>
-        <w:t>Equal-work-weighted volume profile</w:t>
+        <w:t>Token-weighted volume profile</w:t>
       </w:r>
     </w:p>
     <w:p>
@@ -8735,7 +9720,7 @@
           <w:color w:val="1F4D78"/>
           <w:sz w:val="19"/>
         </w:rPr>
-        <w:t>mean_volume_work = sum(m_i) / K</w:t>
+        <w:t>mean_volume_token = sum(m_i * n_i) / sum(n_i)</w:t>
       </w:r>
     </w:p>
     <w:p>
@@ -8746,24 +9731,23 @@
       <w:r>
         <w:rPr>
           <w:rFonts w:ascii="Calibri" w:hAnsi="Calibri"/>
-          <w:sz w:val="22"/>
-        </w:rPr>
-        <w:t xml:space="preserve">where </w:t>
-      </w:r>
+          <w:b/>
+          <w:sz w:val="22"/>
+        </w:rPr>
+        <w:t>Equal-work-weighted volume profile</w:t>
+      </w:r>
+    </w:p>
+    <w:p>
+      <w:pPr>
+        <w:pStyle w:val="Formula"/>
+      </w:pPr>
       <w:r>
         <w:rPr>
           <w:rFonts w:ascii="Consolas" w:hAnsi="Consolas"/>
           <w:color w:val="1F4D78"/>
           <w:sz w:val="19"/>
         </w:rPr>
-        <w:t>K</w:t>
-      </w:r>
-      <w:r>
-        <w:rPr>
-          <w:rFonts w:ascii="Calibri" w:hAnsi="Calibri"/>
-          <w:sz w:val="22"/>
-        </w:rPr>
-        <w:t xml:space="preserve"> is the number of eligible works with a nonmissing score.</w:t>
+        <w:t>mean_volume_work = sum(m_i) / K</w:t>
       </w:r>
     </w:p>
     <w:p>
@@ -8774,23 +9758,24 @@
       <w:r>
         <w:rPr>
           <w:rFonts w:ascii="Calibri" w:hAnsi="Calibri"/>
-          <w:b/>
-          <w:sz w:val="22"/>
-        </w:rPr>
-        <w:t>Reported divergence</w:t>
-      </w:r>
-    </w:p>
-    <w:p>
-      <w:pPr>
-        <w:pStyle w:val="Formula"/>
-      </w:pPr>
+          <w:sz w:val="22"/>
+        </w:rPr>
+        <w:t xml:space="preserve">where </w:t>
+      </w:r>
       <w:r>
         <w:rPr>
           <w:rFonts w:ascii="Consolas" w:hAnsi="Consolas"/>
           <w:color w:val="1F4D78"/>
           <w:sz w:val="19"/>
         </w:rPr>
-        <w:t>divergence = mean_volume_work - mean_volume_token</w:t>
+        <w:t>K</w:t>
+      </w:r>
+      <w:r>
+        <w:rPr>
+          <w:rFonts w:ascii="Calibri" w:hAnsi="Calibri"/>
+          <w:sz w:val="22"/>
+        </w:rPr>
+        <w:t xml:space="preserve"> is the number of eligible works with a nonmissing score.</w:t>
       </w:r>
     </w:p>
     <w:p>
@@ -8801,34 +9786,10 @@
       <w:r>
         <w:rPr>
           <w:rFonts w:ascii="Calibri" w:hAnsi="Calibri"/>
-          <w:sz w:val="22"/>
-        </w:rPr>
-        <w:t>Works with no eligible score are omitted and counted; they are not assigned a neutral value.</w:t>
-      </w:r>
-    </w:p>
-    <w:p>
-      <w:pPr>
-        <w:pStyle w:val="Heading2"/>
-      </w:pPr>
-      <w:r>
-        <w:rPr>
-          <w:rFonts w:ascii="Calibri" w:hAnsi="Calibri"/>
-          <w:sz w:val="22"/>
-        </w:rPr>
-        <w:t>Emotion association rates</w:t>
-      </w:r>
-    </w:p>
-    <w:p>
-      <w:pPr>
-        <w:widowControl/>
-        <w:spacing w:before="0" w:after="120" w:line="300" w:lineRule="auto"/>
-      </w:pPr>
-      <w:r>
-        <w:rPr>
-          <w:rFonts w:ascii="Calibri" w:hAnsi="Calibri"/>
-          <w:sz w:val="22"/>
-        </w:rPr>
-        <w:t>For one category:</w:t>
+          <w:b/>
+          <w:sz w:val="22"/>
+        </w:rPr>
+        <w:t>Reported divergence</w:t>
       </w:r>
     </w:p>
     <w:p>
@@ -8841,7 +9802,45 @@
           <w:color w:val="1F4D78"/>
           <w:sz w:val="19"/>
         </w:rPr>
-        <w:t>rate_all_lexical = associated token occurrences / all eligible lexical tokens</w:t>
+        <w:t>divergence = mean_volume_work - mean_volume_token</w:t>
+      </w:r>
+    </w:p>
+    <w:p>
+      <w:pPr>
+        <w:widowControl/>
+        <w:spacing w:before="0" w:after="120" w:line="300" w:lineRule="auto"/>
+      </w:pPr>
+      <w:r>
+        <w:rPr>
+          <w:rFonts w:ascii="Calibri" w:hAnsi="Calibri"/>
+          <w:sz w:val="22"/>
+        </w:rPr>
+        <w:t>Works with no eligible score are omitted and counted; they are not assigned a neutral value.</w:t>
+      </w:r>
+    </w:p>
+    <w:p>
+      <w:pPr>
+        <w:pStyle w:val="Heading2"/>
+      </w:pPr>
+      <w:r>
+        <w:rPr>
+          <w:rFonts w:ascii="Calibri" w:hAnsi="Calibri"/>
+          <w:sz w:val="22"/>
+        </w:rPr>
+        <w:t>Emotion and sentiment association rates</w:t>
+      </w:r>
+    </w:p>
+    <w:p>
+      <w:pPr>
+        <w:widowControl/>
+        <w:spacing w:before="0" w:after="120" w:line="300" w:lineRule="auto"/>
+      </w:pPr>
+      <w:r>
+        <w:rPr>
+          <w:rFonts w:ascii="Calibri" w:hAnsi="Calibri"/>
+          <w:sz w:val="22"/>
+        </w:rPr>
+        <w:t>For one category:</w:t>
       </w:r>
     </w:p>
     <w:p>
@@ -8854,6 +9853,19 @@
           <w:color w:val="1F4D78"/>
           <w:sz w:val="19"/>
         </w:rPr>
+        <w:t>rate_all_lexical = associated token occurrences / all eligible lexical tokens</w:t>
+      </w:r>
+    </w:p>
+    <w:p>
+      <w:pPr>
+        <w:pStyle w:val="Formula"/>
+      </w:pPr>
+      <w:r>
+        <w:rPr>
+          <w:rFonts w:ascii="Consolas" w:hAnsi="Consolas"/>
+          <w:color w:val="1F4D78"/>
+          <w:sz w:val="19"/>
+        </w:rPr>
         <w:t>rate_bearing = associated token occurrences / tokens bearing at least one positive association</w:t>
       </w:r>
     </w:p>
@@ -8867,7 +9879,7 @@
           <w:rFonts w:ascii="Calibri" w:hAnsi="Calibri"/>
           <w:sz w:val="22"/>
         </w:rPr>
-        <w:t>Because one token can belong to several categories, category rates need not sum to 100 percent.</w:t>
+        <w:t>Because one token can belong to several categories, category rates need not sum to 100 percent. The eight emotions and positive/negative sentiment use the same formula but remain separately labeled constructs.</w:t>
       </w:r>
     </w:p>
     <w:p>
@@ -9430,6 +10442,60 @@
                 <w:rFonts w:ascii="Calibri" w:hAnsi="Calibri"/>
                 <w:sz w:val="18"/>
               </w:rPr>
+              <w:t>Approved user mapping</w:t>
+            </w:r>
+          </w:p>
+        </w:tc>
+        <w:tc>
+          <w:tcPr>
+            <w:tcW w:type="dxa" w:w="6660"/>
+            <w:vAlign w:val="center"/>
+            <w:tcMar>
+              <w:top w:w="80" w:type="dxa"/>
+              <w:bottom w:w="80" w:type="dxa"/>
+              <w:start w:w="120" w:type="dxa"/>
+              <w:end w:w="120" w:type="dxa"/>
+            </w:tcMar>
+          </w:tcPr>
+          <w:p>
+            <w:pPr>
+              <w:widowControl/>
+              <w:spacing w:before="0" w:after="0" w:line="252" w:lineRule="auto"/>
+            </w:pPr>
+            <w:r/>
+            <w:r>
+              <w:rPr>
+                <w:rFonts w:ascii="Calibri" w:hAnsi="Calibri"/>
+                <w:sz w:val="18"/>
+              </w:rPr>
+              <w:t>Scenario-pinned link from a form to a verified exact source entry, applied only after ordinary matching fails</w:t>
+            </w:r>
+          </w:p>
+        </w:tc>
+      </w:tr>
+      <w:tr>
+        <w:tc>
+          <w:tcPr>
+            <w:tcW w:type="dxa" w:w="2700"/>
+            <w:vAlign w:val="center"/>
+            <w:tcMar>
+              <w:top w:w="80" w:type="dxa"/>
+              <w:bottom w:w="80" w:type="dxa"/>
+              <w:start w:w="120" w:type="dxa"/>
+              <w:end w:w="120" w:type="dxa"/>
+            </w:tcMar>
+          </w:tcPr>
+          <w:p>
+            <w:pPr>
+              <w:widowControl/>
+              <w:spacing w:before="0" w:after="0" w:line="252" w:lineRule="auto"/>
+            </w:pPr>
+            <w:r/>
+            <w:r>
+              <w:rPr>
+                <w:rFonts w:ascii="Calibri" w:hAnsi="Calibri"/>
+                <w:sz w:val="18"/>
+              </w:rPr>
               <w:t>Coverage</w:t>
             </w:r>
           </w:p>
@@ -9673,6 +10739,114 @@
                 <w:sz w:val="18"/>
               </w:rPr>
               <w:t>Direct match from normalized surface form to a source entry</w:t>
+            </w:r>
+          </w:p>
+        </w:tc>
+      </w:tr>
+      <w:tr>
+        <w:tc>
+          <w:tcPr>
+            <w:tcW w:type="dxa" w:w="2700"/>
+            <w:vAlign w:val="center"/>
+            <w:tcMar>
+              <w:top w:w="80" w:type="dxa"/>
+              <w:bottom w:w="80" w:type="dxa"/>
+              <w:start w:w="120" w:type="dxa"/>
+              <w:end w:w="120" w:type="dxa"/>
+            </w:tcMar>
+          </w:tcPr>
+          <w:p>
+            <w:pPr>
+              <w:widowControl/>
+              <w:spacing w:before="0" w:after="0" w:line="252" w:lineRule="auto"/>
+            </w:pPr>
+            <w:r/>
+            <w:r>
+              <w:rPr>
+                <w:rFonts w:ascii="Calibri" w:hAnsi="Calibri"/>
+                <w:sz w:val="18"/>
+              </w:rPr>
+              <w:t>Exclude decision</w:t>
+            </w:r>
+          </w:p>
+        </w:tc>
+        <w:tc>
+          <w:tcPr>
+            <w:tcW w:type="dxa" w:w="6660"/>
+            <w:vAlign w:val="center"/>
+            <w:tcMar>
+              <w:top w:w="80" w:type="dxa"/>
+              <w:bottom w:w="80" w:type="dxa"/>
+              <w:start w:w="120" w:type="dxa"/>
+              <w:end w:w="120" w:type="dxa"/>
+            </w:tcMar>
+          </w:tcPr>
+          <w:p>
+            <w:pPr>
+              <w:widowControl/>
+              <w:spacing w:before="0" w:after="0" w:line="252" w:lineRule="auto"/>
+            </w:pPr>
+            <w:r/>
+            <w:r>
+              <w:rPr>
+                <w:rFonts w:ascii="Calibri" w:hAnsi="Calibri"/>
+                <w:sz w:val="18"/>
+              </w:rPr>
+              <w:t>Scenario decision that retains the candidate in the audit but omits it from that scenario's aggregates</w:t>
+            </w:r>
+          </w:p>
+        </w:tc>
+      </w:tr>
+      <w:tr>
+        <w:tc>
+          <w:tcPr>
+            <w:tcW w:type="dxa" w:w="2700"/>
+            <w:vAlign w:val="center"/>
+            <w:tcMar>
+              <w:top w:w="80" w:type="dxa"/>
+              <w:bottom w:w="80" w:type="dxa"/>
+              <w:start w:w="120" w:type="dxa"/>
+              <w:end w:w="120" w:type="dxa"/>
+            </w:tcMar>
+          </w:tcPr>
+          <w:p>
+            <w:pPr>
+              <w:widowControl/>
+              <w:spacing w:before="0" w:after="0" w:line="252" w:lineRule="auto"/>
+            </w:pPr>
+            <w:r/>
+            <w:r>
+              <w:rPr>
+                <w:rFonts w:ascii="Calibri" w:hAnsi="Calibri"/>
+                <w:sz w:val="18"/>
+              </w:rPr>
+              <w:t>Flag decision</w:t>
+            </w:r>
+          </w:p>
+        </w:tc>
+        <w:tc>
+          <w:tcPr>
+            <w:tcW w:type="dxa" w:w="6660"/>
+            <w:vAlign w:val="center"/>
+            <w:tcMar>
+              <w:top w:w="80" w:type="dxa"/>
+              <w:bottom w:w="80" w:type="dxa"/>
+              <w:start w:w="120" w:type="dxa"/>
+              <w:end w:w="120" w:type="dxa"/>
+            </w:tcMar>
+          </w:tcPr>
+          <w:p>
+            <w:pPr>
+              <w:widowControl/>
+              <w:spacing w:before="0" w:after="0" w:line="252" w:lineRule="auto"/>
+            </w:pPr>
+            <w:r/>
+            <w:r>
+              <w:rPr>
+                <w:rFonts w:ascii="Calibri" w:hAnsi="Calibri"/>
+                <w:sz w:val="18"/>
+              </w:rPr>
+              <w:t>Scenario decision that records concern without changing matching or scores</w:t>
             </w:r>
           </w:p>
         </w:tc>
@@ -10078,6 +11252,60 @@
                 <w:rFonts w:ascii="Calibri" w:hAnsi="Calibri"/>
                 <w:sz w:val="18"/>
               </w:rPr>
+              <w:t>Part-of-speech profile</w:t>
+            </w:r>
+          </w:p>
+        </w:tc>
+        <w:tc>
+          <w:tcPr>
+            <w:tcW w:type="dxa" w:w="6660"/>
+            <w:vAlign w:val="center"/>
+            <w:tcMar>
+              <w:top w:w="80" w:type="dxa"/>
+              <w:bottom w:w="80" w:type="dxa"/>
+              <w:start w:w="120" w:type="dxa"/>
+              <w:end w:w="120" w:type="dxa"/>
+            </w:tcMar>
+          </w:tcPr>
+          <w:p>
+            <w:pPr>
+              <w:widowControl/>
+              <w:spacing w:before="0" w:after="0" w:line="252" w:lineRule="auto"/>
+            </w:pPr>
+            <w:r/>
+            <w:r>
+              <w:rPr>
+                <w:rFonts w:ascii="Calibri" w:hAnsi="Calibri"/>
+                <w:sz w:val="18"/>
+              </w:rPr>
+              <w:t>Model-assigned grammatical counts and shares over all eligible lexical tokens, independent of lexicon coverage</w:t>
+            </w:r>
+          </w:p>
+        </w:tc>
+      </w:tr>
+      <w:tr>
+        <w:tc>
+          <w:tcPr>
+            <w:tcW w:type="dxa" w:w="2700"/>
+            <w:vAlign w:val="center"/>
+            <w:tcMar>
+              <w:top w:w="80" w:type="dxa"/>
+              <w:bottom w:w="80" w:type="dxa"/>
+              <w:start w:w="120" w:type="dxa"/>
+              <w:end w:w="120" w:type="dxa"/>
+            </w:tcMar>
+          </w:tcPr>
+          <w:p>
+            <w:pPr>
+              <w:widowControl/>
+              <w:spacing w:before="0" w:after="0" w:line="252" w:lineRule="auto"/>
+            </w:pPr>
+            <w:r/>
+            <w:r>
+              <w:rPr>
+                <w:rFonts w:ascii="Calibri" w:hAnsi="Calibri"/>
+                <w:sz w:val="18"/>
+              </w:rPr>
               <w:t>Population SD</w:t>
             </w:r>
           </w:p>
@@ -10213,6 +11441,114 @@
                 <w:sz w:val="18"/>
               </w:rPr>
               <w:t>The original value published by the lexicon</w:t>
+            </w:r>
+          </w:p>
+        </w:tc>
+      </w:tr>
+      <w:tr>
+        <w:tc>
+          <w:tcPr>
+            <w:tcW w:type="dxa" w:w="2700"/>
+            <w:vAlign w:val="center"/>
+            <w:tcMar>
+              <w:top w:w="80" w:type="dxa"/>
+              <w:bottom w:w="80" w:type="dxa"/>
+              <w:start w:w="120" w:type="dxa"/>
+              <w:end w:w="120" w:type="dxa"/>
+            </w:tcMar>
+          </w:tcPr>
+          <w:p>
+            <w:pPr>
+              <w:widowControl/>
+              <w:spacing w:before="0" w:after="0" w:line="252" w:lineRule="auto"/>
+            </w:pPr>
+            <w:r/>
+            <w:r>
+              <w:rPr>
+                <w:rFonts w:ascii="Calibri" w:hAnsi="Calibri"/>
+                <w:sz w:val="18"/>
+              </w:rPr>
+              <w:t>Review scenario</w:t>
+            </w:r>
+          </w:p>
+        </w:tc>
+        <w:tc>
+          <w:tcPr>
+            <w:tcW w:type="dxa" w:w="6660"/>
+            <w:vAlign w:val="center"/>
+            <w:tcMar>
+              <w:top w:w="80" w:type="dxa"/>
+              <w:bottom w:w="80" w:type="dxa"/>
+              <w:start w:w="120" w:type="dxa"/>
+              <w:end w:w="120" w:type="dxa"/>
+            </w:tcMar>
+          </w:tcPr>
+          <w:p>
+            <w:pPr>
+              <w:widowControl/>
+              <w:spacing w:before="0" w:after="0" w:line="252" w:lineRule="auto"/>
+            </w:pPr>
+            <w:r/>
+            <w:r>
+              <w:rPr>
+                <w:rFonts w:ascii="Calibri" w:hAnsi="Calibri"/>
+                <w:sz w:val="18"/>
+              </w:rPr>
+              <w:t>Named, versioned set of append-only decision revisions pinned to an analysis</w:t>
+            </w:r>
+          </w:p>
+        </w:tc>
+      </w:tr>
+      <w:tr>
+        <w:tc>
+          <w:tcPr>
+            <w:tcW w:type="dxa" w:w="2700"/>
+            <w:vAlign w:val="center"/>
+            <w:tcMar>
+              <w:top w:w="80" w:type="dxa"/>
+              <w:bottom w:w="80" w:type="dxa"/>
+              <w:start w:w="120" w:type="dxa"/>
+              <w:end w:w="120" w:type="dxa"/>
+            </w:tcMar>
+          </w:tcPr>
+          <w:p>
+            <w:pPr>
+              <w:widowControl/>
+              <w:spacing w:before="0" w:after="0" w:line="252" w:lineRule="auto"/>
+            </w:pPr>
+            <w:r/>
+            <w:r>
+              <w:rPr>
+                <w:rFonts w:ascii="Calibri" w:hAnsi="Calibri"/>
+                <w:sz w:val="18"/>
+              </w:rPr>
+              <w:t>Sentiment association</w:t>
+            </w:r>
+          </w:p>
+        </w:tc>
+        <w:tc>
+          <w:tcPr>
+            <w:tcW w:type="dxa" w:w="6660"/>
+            <w:vAlign w:val="center"/>
+            <w:tcMar>
+              <w:top w:w="80" w:type="dxa"/>
+              <w:bottom w:w="80" w:type="dxa"/>
+              <w:start w:w="120" w:type="dxa"/>
+              <w:end w:w="120" w:type="dxa"/>
+            </w:tcMar>
+          </w:tcPr>
+          <w:p>
+            <w:pPr>
+              <w:widowControl/>
+              <w:spacing w:before="0" w:after="0" w:line="252" w:lineRule="auto"/>
+            </w:pPr>
+            <w:r/>
+            <w:r>
+              <w:rPr>
+                <w:rFonts w:ascii="Calibri" w:hAnsi="Calibri"/>
+                <w:sz w:val="18"/>
+              </w:rPr>
+              <w:t>Broad positive or negative NRC Emotion label, reported separately from eight emotion categories</w:t>
             </w:r>
           </w:p>
         </w:tc>
@@ -10429,6 +11765,60 @@
                 <w:sz w:val="18"/>
               </w:rPr>
               <w:t>Every included occurrence contributes</w:t>
+            </w:r>
+          </w:p>
+        </w:tc>
+      </w:tr>
+      <w:tr>
+        <w:tc>
+          <w:tcPr>
+            <w:tcW w:type="dxa" w:w="2700"/>
+            <w:vAlign w:val="center"/>
+            <w:tcMar>
+              <w:top w:w="80" w:type="dxa"/>
+              <w:bottom w:w="80" w:type="dxa"/>
+              <w:start w:w="120" w:type="dxa"/>
+              <w:end w:w="120" w:type="dxa"/>
+            </w:tcMar>
+          </w:tcPr>
+          <w:p>
+            <w:pPr>
+              <w:widowControl/>
+              <w:spacing w:before="0" w:after="0" w:line="252" w:lineRule="auto"/>
+            </w:pPr>
+            <w:r/>
+            <w:r>
+              <w:rPr>
+                <w:rFonts w:ascii="Calibri" w:hAnsi="Calibri"/>
+                <w:sz w:val="18"/>
+              </w:rPr>
+              <w:t>Universal POS tag</w:t>
+            </w:r>
+          </w:p>
+        </w:tc>
+        <w:tc>
+          <w:tcPr>
+            <w:tcW w:type="dxa" w:w="6660"/>
+            <w:vAlign w:val="center"/>
+            <w:tcMar>
+              <w:top w:w="80" w:type="dxa"/>
+              <w:bottom w:w="80" w:type="dxa"/>
+              <w:start w:w="120" w:type="dxa"/>
+              <w:end w:w="120" w:type="dxa"/>
+            </w:tcMar>
+          </w:tcPr>
+          <w:p>
+            <w:pPr>
+              <w:widowControl/>
+              <w:spacing w:before="0" w:after="0" w:line="252" w:lineRule="auto"/>
+            </w:pPr>
+            <w:r/>
+            <w:r>
+              <w:rPr>
+                <w:rFonts w:ascii="Calibri" w:hAnsi="Calibri"/>
+                <w:sz w:val="18"/>
+              </w:rPr>
+              <w:t>Coarse grammatical label such as NOUN, VERB, ADJ, or ADV generated by the installed model</w:t>
             </w:r>
           </w:p>
         </w:tc>
@@ -10744,7 +12134,22 @@
           <w:rFonts w:ascii="Calibri" w:hAnsi="Calibri"/>
           <w:sz w:val="22"/>
         </w:rPr>
-        <w:t xml:space="preserve">Click </w:t>
+        <w:t xml:space="preserve">Under </w:t>
+      </w:r>
+      <w:r>
+        <w:rPr>
+          <w:rFonts w:ascii="Calibri" w:hAnsi="Calibri"/>
+          <w:b/>
+          <w:sz w:val="22"/>
+        </w:rPr>
+        <w:t>Installation Check</w:t>
+      </w:r>
+      <w:r>
+        <w:rPr>
+          <w:rFonts w:ascii="Calibri" w:hAnsi="Calibri"/>
+          <w:sz w:val="22"/>
+        </w:rPr>
+        <w:t xml:space="preserve">, click </w:t>
       </w:r>
       <w:r>
         <w:rPr>
@@ -11100,7 +12505,7 @@
           <w:rFonts w:ascii="Calibri" w:hAnsi="Calibri"/>
           <w:sz w:val="22"/>
         </w:rPr>
-        <w:t>Current corpus comparisons are descriptive and do not provide confidence intervals or hypothesis tests.</w:t>
+        <w:t>Part-of-speech labels are model-generated and may be uncertain for poetic or historical language.</w:t>
       </w:r>
     </w:p>
     <w:p>
@@ -11118,7 +12523,43 @@
           <w:rFonts w:ascii="Calibri" w:hAnsi="Calibri"/>
           <w:sz w:val="22"/>
         </w:rPr>
-        <w:t>Quality-control mapping notes do not yet alter future analyses.</w:t>
+        <w:t>Current corpus comparisons are descriptive and do not provide confidence intervals or hypothesis tests.</w:t>
+      </w:r>
+    </w:p>
+    <w:p>
+      <w:pPr>
+        <w:widowControl/>
+        <w:numPr>
+          <w:ilvl w:val="0"/>
+          <w:numId w:val="10"/>
+        </w:numPr>
+        <w:spacing w:before="0" w:after="80" w:line="300" w:lineRule="auto"/>
+        <w:ind w:left="540" w:hanging="271"/>
+      </w:pPr>
+      <w:r>
+        <w:rPr>
+          <w:rFonts w:ascii="Calibri" w:hAnsi="Calibri"/>
+          <w:sz w:val="22"/>
+        </w:rPr>
+        <w:t>Review mappings are scholar-authored scenario decisions, not source-published equivalences.</w:t>
+      </w:r>
+    </w:p>
+    <w:p>
+      <w:pPr>
+        <w:widowControl/>
+        <w:numPr>
+          <w:ilvl w:val="0"/>
+          <w:numId w:val="10"/>
+        </w:numPr>
+        <w:spacing w:before="0" w:after="80" w:line="300" w:lineRule="auto"/>
+        <w:ind w:left="540" w:hanging="271"/>
+      </w:pPr>
+      <w:r>
+        <w:rPr>
+          <w:rFonts w:ascii="Calibri" w:hAnsi="Calibri"/>
+          <w:sz w:val="22"/>
+        </w:rPr>
+        <w:t>Broad project or global review scopes require extra caution; prefer the narrowest defensible scope.</w:t>
       </w:r>
     </w:p>
     <w:p>
@@ -11144,6 +12585,58 @@
           <w:sz w:val="22"/>
         </w:rPr>
         <w:t>Every analysis should retain the active lexicon, source checksum, adapter version, software version, preprocessing recipe, phrase policy, stopword policy, scenario, and inclusion decisions. Completed corpus runs remain linked to preserved text versions.</w:t>
+      </w:r>
+    </w:p>
+    <w:p>
+      <w:pPr>
+        <w:widowControl/>
+        <w:spacing w:before="0" w:after="120" w:line="300" w:lineRule="auto"/>
+      </w:pPr>
+      <w:r>
+        <w:rPr>
+          <w:rFonts w:ascii="Calibri" w:hAnsi="Calibri"/>
+          <w:sz w:val="22"/>
+        </w:rPr>
+        <w:t>The companion definitions guide is maintained from:</w:t>
+      </w:r>
+    </w:p>
+    <w:p>
+      <w:pPr>
+        <w:pStyle w:val="Formula"/>
+      </w:pPr>
+      <w:r>
+        <w:rPr>
+          <w:rFonts w:ascii="Consolas" w:hAnsi="Consolas"/>
+          <w:color w:val="1F4D78"/>
+          <w:sz w:val="19"/>
+        </w:rPr>
+        <w:t>docs/VerseVAD_Values_and_Terminology_Guide_Source.md</w:t>
+      </w:r>
+    </w:p>
+    <w:p>
+      <w:pPr>
+        <w:widowControl/>
+        <w:spacing w:before="0" w:after="120" w:line="300" w:lineRule="auto"/>
+      </w:pPr>
+      <w:r>
+        <w:rPr>
+          <w:rFonts w:ascii="Calibri" w:hAnsi="Calibri"/>
+          <w:sz w:val="22"/>
+        </w:rPr>
+        <w:t>and generated as:</w:t>
+      </w:r>
+    </w:p>
+    <w:p>
+      <w:pPr>
+        <w:pStyle w:val="Formula"/>
+      </w:pPr>
+      <w:r>
+        <w:rPr>
+          <w:rFonts w:ascii="Consolas" w:hAnsi="Consolas"/>
+          <w:color w:val="1F4D78"/>
+          <w:sz w:val="19"/>
+        </w:rPr>
+        <w:t>docs/VerseVAD_Values_and_Terminology_Guide.docx</w:t>
       </w:r>
     </w:p>
     <w:p>
@@ -11358,7 +12851,7 @@
         <w:color w:val="66727C"/>
         <w:sz w:val="18"/>
       </w:rPr>
-      <w:t xml:space="preserve">  |  0.5.0.dev0</w:t>
+      <w:t xml:space="preserve">  |  0.6.0.dev0</w:t>
     </w:r>
   </w:p>
 </w:hdr>
@@ -11746,6 +13239,24 @@
   </w:abstractNum>
   <w:num w:numId="19">
     <w:abstractNumId w:val="18"/>
+  </w:num>
+  <w:abstractNum w:abstractNumId="19">
+    <w:multiLevelType w:val="singleLevel"/>
+    <w:lvl w:ilvl="0">
+      <w:start w:val="1"/>
+      <w:numFmt w:val="decimal"/>
+      <w:lvlText w:val="%1."/>
+      <w:lvlJc w:val="left"/>
+      <w:pPr>
+        <w:tabs>
+          <w:tab w:val="num" w:pos="540"/>
+        </w:tabs>
+        <w:ind w:left="540" w:hanging="270"/>
+      </w:pPr>
+    </w:lvl>
+  </w:abstractNum>
+  <w:num w:numId="20">
+    <w:abstractNumId w:val="19"/>
   </w:num>
 </w:numbering>
 </file>

</xml_diff>

<commit_message>
Refine defensible part-of-speech reporting
</commit_message>
<xml_diff>
--- a/docs/VerseVAD_User_Manual.docx
+++ b/docs/VerseVAD_User_Manual.docx
@@ -3805,6 +3805,225 @@
     </w:p>
     <w:p>
       <w:pPr>
+        <w:widowControl/>
+        <w:spacing w:before="0" w:after="120" w:line="300" w:lineRule="auto"/>
+      </w:pPr>
+      <w:r>
+        <w:rPr>
+          <w:rFonts w:ascii="Calibri" w:hAnsi="Calibri"/>
+          <w:sz w:val="22"/>
+        </w:rPr>
+        <w:t xml:space="preserve">It presents two levels over the same tokens. </w:t>
+      </w:r>
+      <w:r>
+        <w:rPr>
+          <w:rFonts w:ascii="Calibri" w:hAnsi="Calibri"/>
+          <w:b/>
+          <w:sz w:val="22"/>
+        </w:rPr>
+        <w:t>Broad Categories</w:t>
+      </w:r>
+      <w:r>
+        <w:rPr>
+          <w:rFonts w:ascii="Calibri" w:hAnsi="Calibri"/>
+          <w:sz w:val="22"/>
+        </w:rPr>
+        <w:t xml:space="preserve"> provide the main readable chart. </w:t>
+      </w:r>
+      <w:r>
+        <w:rPr>
+          <w:rFonts w:ascii="Calibri" w:hAnsi="Calibri"/>
+          <w:b/>
+          <w:sz w:val="22"/>
+        </w:rPr>
+        <w:t>Detailed Model-Tag Breakdown</w:t>
+      </w:r>
+      <w:r>
+        <w:rPr>
+          <w:rFonts w:ascii="Calibri" w:hAnsi="Calibri"/>
+          <w:sz w:val="22"/>
+        </w:rPr>
+        <w:t xml:space="preserve"> preserves each Universal Dependencies tag and its own count/share for audit and methodological defense. Each level separately sums to approximately 100 percent; do not add the two levels together.</w:t>
+      </w:r>
+    </w:p>
+    <w:p>
+      <w:pPr>
+        <w:widowControl/>
+        <w:spacing w:before="0" w:after="120" w:line="300" w:lineRule="auto"/>
+      </w:pPr>
+      <w:r>
+        <w:rPr>
+          <w:rFonts w:ascii="Calibri" w:hAnsi="Calibri"/>
+          <w:sz w:val="22"/>
+        </w:rPr>
+        <w:t xml:space="preserve">The displayed </w:t>
+      </w:r>
+      <w:r>
+        <w:rPr>
+          <w:rFonts w:ascii="Calibri" w:hAnsi="Calibri"/>
+          <w:b/>
+          <w:sz w:val="22"/>
+        </w:rPr>
+        <w:t>Noun</w:t>
+      </w:r>
+      <w:r>
+        <w:rPr>
+          <w:rFonts w:ascii="Calibri" w:hAnsi="Calibri"/>
+          <w:sz w:val="22"/>
+        </w:rPr>
+        <w:t xml:space="preserve"> category combines the model's </w:t>
+      </w:r>
+      <w:r>
+        <w:rPr>
+          <w:rFonts w:ascii="Consolas" w:hAnsi="Consolas"/>
+          <w:color w:val="1F4D78"/>
+          <w:sz w:val="19"/>
+        </w:rPr>
+        <w:t>NOUN</w:t>
+      </w:r>
+      <w:r>
+        <w:rPr>
+          <w:rFonts w:ascii="Calibri" w:hAnsi="Calibri"/>
+          <w:sz w:val="22"/>
+        </w:rPr>
+        <w:t xml:space="preserve"> and </w:t>
+      </w:r>
+      <w:r>
+        <w:rPr>
+          <w:rFonts w:ascii="Consolas" w:hAnsi="Consolas"/>
+          <w:color w:val="1F4D78"/>
+          <w:sz w:val="19"/>
+        </w:rPr>
+        <w:t>PROPN</w:t>
+      </w:r>
+      <w:r>
+        <w:rPr>
+          <w:rFonts w:ascii="Calibri" w:hAnsi="Calibri"/>
+          <w:sz w:val="22"/>
+        </w:rPr>
+        <w:t xml:space="preserve"> tags. This avoids making a fragile common-versus-proper distinction in poetry while retaining the original token-level tag in Evidence and audit data. The </w:t>
+      </w:r>
+      <w:r>
+        <w:rPr>
+          <w:rFonts w:ascii="Consolas" w:hAnsi="Consolas"/>
+          <w:color w:val="1F4D78"/>
+          <w:sz w:val="19"/>
+        </w:rPr>
+        <w:t>ADP</w:t>
+      </w:r>
+      <w:r>
+        <w:rPr>
+          <w:rFonts w:ascii="Calibri" w:hAnsi="Calibri"/>
+          <w:sz w:val="22"/>
+        </w:rPr>
+        <w:t xml:space="preserve"> source tag is displayed with the beginner-facing label </w:t>
+      </w:r>
+      <w:r>
+        <w:rPr>
+          <w:rFonts w:ascii="Calibri" w:hAnsi="Calibri"/>
+          <w:b/>
+          <w:sz w:val="22"/>
+        </w:rPr>
+        <w:t>Preposition</w:t>
+      </w:r>
+      <w:r>
+        <w:rPr>
+          <w:rFonts w:ascii="Calibri" w:hAnsi="Calibri"/>
+          <w:sz w:val="22"/>
+        </w:rPr>
+        <w:t>; it is not an adverb.</w:t>
+      </w:r>
+    </w:p>
+    <w:p>
+      <w:pPr>
+        <w:widowControl/>
+        <w:spacing w:before="0" w:after="120" w:line="300" w:lineRule="auto"/>
+      </w:pPr>
+      <w:r>
+        <w:rPr>
+          <w:rFonts w:ascii="Calibri" w:hAnsi="Calibri"/>
+          <w:sz w:val="22"/>
+        </w:rPr>
+        <w:t xml:space="preserve">The displayed </w:t>
+      </w:r>
+      <w:r>
+        <w:rPr>
+          <w:rFonts w:ascii="Calibri" w:hAnsi="Calibri"/>
+          <w:b/>
+          <w:sz w:val="22"/>
+        </w:rPr>
+        <w:t>Verb</w:t>
+      </w:r>
+      <w:r>
+        <w:rPr>
+          <w:rFonts w:ascii="Calibri" w:hAnsi="Calibri"/>
+          <w:sz w:val="22"/>
+        </w:rPr>
+        <w:t xml:space="preserve"> category combines </w:t>
+      </w:r>
+      <w:r>
+        <w:rPr>
+          <w:rFonts w:ascii="Consolas" w:hAnsi="Consolas"/>
+          <w:color w:val="1F4D78"/>
+          <w:sz w:val="19"/>
+        </w:rPr>
+        <w:t>VERB</w:t>
+      </w:r>
+      <w:r>
+        <w:rPr>
+          <w:rFonts w:ascii="Calibri" w:hAnsi="Calibri"/>
+          <w:sz w:val="22"/>
+        </w:rPr>
+        <w:t xml:space="preserve"> and </w:t>
+      </w:r>
+      <w:r>
+        <w:rPr>
+          <w:rFonts w:ascii="Consolas" w:hAnsi="Consolas"/>
+          <w:color w:val="1F4D78"/>
+          <w:sz w:val="19"/>
+        </w:rPr>
+        <w:t>AUX</w:t>
+      </w:r>
+      <w:r>
+        <w:rPr>
+          <w:rFonts w:ascii="Calibri" w:hAnsi="Calibri"/>
+          <w:sz w:val="22"/>
+        </w:rPr>
+        <w:t xml:space="preserve">. A form such as </w:t>
+      </w:r>
+      <w:r>
+        <w:rPr>
+          <w:rFonts w:ascii="Consolas" w:hAnsi="Consolas"/>
+          <w:color w:val="1F4D78"/>
+          <w:sz w:val="19"/>
+        </w:rPr>
+        <w:t>was</w:t>
+      </w:r>
+      <w:r>
+        <w:rPr>
+          <w:rFonts w:ascii="Calibri" w:hAnsi="Calibri"/>
+          <w:sz w:val="22"/>
+        </w:rPr>
+        <w:t xml:space="preserve"> may be tagged </w:t>
+      </w:r>
+      <w:r>
+        <w:rPr>
+          <w:rFonts w:ascii="Consolas" w:hAnsi="Consolas"/>
+          <w:color w:val="1F4D78"/>
+          <w:sz w:val="19"/>
+        </w:rPr>
+        <w:t>AUX</w:t>
+      </w:r>
+      <w:r>
+        <w:rPr>
+          <w:rFonts w:ascii="Calibri" w:hAnsi="Calibri"/>
+          <w:sz w:val="22"/>
+        </w:rPr>
+        <w:t xml:space="preserve"> in an auxiliary or copular construction, but it still counts under Verb in the simplified profile. The original tag remains available in Evidence and audit data.</w:t>
+      </w:r>
+    </w:p>
+    <w:p>
+      <w:pPr>
         <w:pStyle w:val="Formula"/>
       </w:pPr>
       <w:r>
@@ -8516,7 +8735,7 @@
                 <w:rFonts w:ascii="Calibri" w:hAnsi="Calibri"/>
                 <w:sz w:val="18"/>
               </w:rPr>
-              <w:t>Combined-project and work-level universal POS counts, lexical-token shares, unique types, examples, denominator, and model</w:t>
+              <w:t>Broad and detailed combined-project/work-level POS counts, lexical-token shares, unique types, examples, denominator, and model</w:t>
             </w:r>
           </w:p>
         </w:tc>
@@ -11792,7 +12011,7 @@
                 <w:rFonts w:ascii="Calibri" w:hAnsi="Calibri"/>
                 <w:sz w:val="18"/>
               </w:rPr>
-              <w:t>Universal POS tag</w:t>
+              <w:t>Source POS tag(s)</w:t>
             </w:r>
           </w:p>
         </w:tc>
@@ -11818,7 +12037,7 @@
                 <w:rFonts w:ascii="Calibri" w:hAnsi="Calibri"/>
                 <w:sz w:val="18"/>
               </w:rPr>
-              <w:t>Coarse grammatical label such as NOUN, VERB, ADJ, or ADV generated by the installed model</w:t>
+              <w:t>Model-generated tag; Noun merges NOUN/PROPN and Verb merges VERB/AUX</w:t>
             </w:r>
           </w:p>
         </w:tc>

</xml_diff>

<commit_message>
Complete Poetic Fingerprint expansion Stage 1
</commit_message>
<xml_diff>
--- a/docs/VerseVAD_User_Manual.docx
+++ b/docs/VerseVAD_User_Manual.docx
@@ -47,7 +47,7 @@
           <w:color w:val="66727C"/>
           <w:sz w:val="21"/>
         </w:rPr>
-        <w:t xml:space="preserve"> 0.6.0.dev0</w:t>
+        <w:t xml:space="preserve"> 0.7.0.dev0</w:t>
       </w:r>
       <w:r>
         <w:rPr>
@@ -519,7 +519,24 @@
                 <w:color w:val="193247"/>
                 <w:sz w:val="22"/>
               </w:rPr>
-              <w:t xml:space="preserve"> first, then </w:t>
+              <w:t xml:space="preserve"> first, inspect the shared record in </w:t>
+            </w:r>
+            <w:r>
+              <w:rPr>
+                <w:rFonts w:ascii="Calibri" w:hAnsi="Calibri"/>
+                <w:b/>
+                <w:color w:val="193247"/>
+                <w:sz w:val="22"/>
+              </w:rPr>
+              <w:t>Language Profile</w:t>
+            </w:r>
+            <w:r>
+              <w:rPr>
+                <w:rFonts w:ascii="Calibri" w:hAnsi="Calibri"/>
+                <w:color w:val="193247"/>
+                <w:sz w:val="22"/>
+              </w:rPr>
+              <w:t xml:space="preserve">, then read </w:t>
             </w:r>
             <w:r>
               <w:rPr>
@@ -536,7 +553,7 @@
                 <w:color w:val="193247"/>
                 <w:sz w:val="22"/>
               </w:rPr>
-              <w:t xml:space="preserve">, then inspect </w:t>
+              <w:t xml:space="preserve"> and </w:t>
             </w:r>
             <w:r>
               <w:rPr>
@@ -1731,6 +1748,7 @@
       </w:tblGrid>
       <w:tr>
         <w:trPr>
+          <w:cantSplit w:val="true"/>
           <w:tblHeader w:val="true"/>
         </w:trPr>
         <w:tc>
@@ -1747,6 +1765,7 @@
           </w:tcPr>
           <w:p>
             <w:pPr>
+              <w:keepNext/>
               <w:widowControl/>
               <w:spacing w:before="0" w:after="0" w:line="252" w:lineRule="auto"/>
             </w:pPr>
@@ -1781,6 +1800,7 @@
           </w:tcPr>
           <w:p>
             <w:pPr>
+              <w:keepNext/>
               <w:widowControl/>
               <w:spacing w:before="0" w:after="0" w:line="252" w:lineRule="auto"/>
             </w:pPr>
@@ -1815,6 +1835,7 @@
           </w:tcPr>
           <w:p>
             <w:pPr>
+              <w:keepNext/>
               <w:widowControl/>
               <w:spacing w:before="0" w:after="0" w:line="252" w:lineRule="auto"/>
             </w:pPr>
@@ -1849,6 +1870,7 @@
           </w:tcPr>
           <w:p>
             <w:pPr>
+              <w:keepNext/>
               <w:widowControl/>
               <w:spacing w:before="0" w:after="0" w:line="252" w:lineRule="auto"/>
             </w:pPr>
@@ -1871,6 +1893,9 @@
         </w:tc>
       </w:tr>
       <w:tr>
+        <w:trPr>
+          <w:cantSplit w:val="true"/>
+        </w:trPr>
         <w:tc>
           <w:tcPr>
             <w:tcW w:type="dxa" w:w="2100"/>
@@ -1978,6 +2003,9 @@
         </w:tc>
       </w:tr>
       <w:tr>
+        <w:trPr>
+          <w:cantSplit w:val="true"/>
+        </w:trPr>
         <w:tc>
           <w:tcPr>
             <w:tcW w:type="dxa" w:w="2100"/>
@@ -2085,6 +2113,9 @@
         </w:tc>
       </w:tr>
       <w:tr>
+        <w:trPr>
+          <w:cantSplit w:val="true"/>
+        </w:trPr>
         <w:tc>
           <w:tcPr>
             <w:tcW w:type="dxa" w:w="2100"/>
@@ -2192,6 +2223,9 @@
         </w:tc>
       </w:tr>
       <w:tr>
+        <w:trPr>
+          <w:cantSplit w:val="true"/>
+        </w:trPr>
         <w:tc>
           <w:tcPr>
             <w:tcW w:type="dxa" w:w="2100"/>
@@ -2298,6 +2332,9 @@
         </w:tc>
       </w:tr>
       <w:tr>
+        <w:trPr>
+          <w:cantSplit w:val="true"/>
+        </w:trPr>
         <w:tc>
           <w:tcPr>
             <w:tcW w:type="dxa" w:w="2100"/>
@@ -2607,6 +2644,201 @@
           <w:rFonts w:ascii="Calibri" w:hAnsi="Calibri"/>
           <w:sz w:val="22"/>
         </w:rPr>
+        <w:t>Shared poem document</w:t>
+      </w:r>
+    </w:p>
+    <w:p>
+      <w:pPr>
+        <w:widowControl/>
+        <w:spacing w:before="0" w:after="120" w:line="300" w:lineRule="auto"/>
+      </w:pPr>
+      <w:r>
+        <w:rPr>
+          <w:rFonts w:ascii="Calibri" w:hAnsi="Calibri"/>
+          <w:sz w:val="22"/>
+        </w:rPr>
+        <w:t>For one-poem analysis, VerseVAD creates one immutable shared document and reuses its exact token sequence for every selected lexicon. It contains:</w:t>
+      </w:r>
+    </w:p>
+    <w:p>
+      <w:pPr>
+        <w:widowControl/>
+        <w:numPr>
+          <w:ilvl w:val="0"/>
+          <w:numId w:val="10"/>
+        </w:numPr>
+        <w:spacing w:before="0" w:after="80" w:line="300" w:lineRule="auto"/>
+        <w:ind w:left="540" w:hanging="271"/>
+      </w:pPr>
+      <w:r>
+        <w:rPr>
+          <w:rFonts w:ascii="Calibri" w:hAnsi="Calibri"/>
+          <w:sz w:val="22"/>
+        </w:rPr>
+        <w:t>the exact original text;</w:t>
+      </w:r>
+    </w:p>
+    <w:p>
+      <w:pPr>
+        <w:widowControl/>
+        <w:numPr>
+          <w:ilvl w:val="0"/>
+          <w:numId w:val="10"/>
+        </w:numPr>
+        <w:spacing w:before="0" w:after="80" w:line="300" w:lineRule="auto"/>
+        <w:ind w:left="540" w:hanging="271"/>
+      </w:pPr>
+      <w:r>
+        <w:rPr>
+          <w:rFonts w:ascii="Calibri" w:hAnsi="Calibri"/>
+          <w:sz w:val="22"/>
+        </w:rPr>
+        <w:t>stanza and physical-line records, including blank separators and line endings;</w:t>
+      </w:r>
+    </w:p>
+    <w:p>
+      <w:pPr>
+        <w:widowControl/>
+        <w:numPr>
+          <w:ilvl w:val="0"/>
+          <w:numId w:val="10"/>
+        </w:numPr>
+        <w:spacing w:before="0" w:after="80" w:line="300" w:lineRule="auto"/>
+        <w:ind w:left="540" w:hanging="271"/>
+      </w:pPr>
+      <w:r>
+        <w:rPr>
+          <w:rFonts w:ascii="Calibri" w:hAnsi="Calibri"/>
+          <w:sz w:val="22"/>
+        </w:rPr>
+        <w:t>separate model sentence records, including line/stanza-crossing flags;</w:t>
+      </w:r>
+    </w:p>
+    <w:p>
+      <w:pPr>
+        <w:widowControl/>
+        <w:numPr>
+          <w:ilvl w:val="0"/>
+          <w:numId w:val="10"/>
+        </w:numPr>
+        <w:spacing w:before="0" w:after="80" w:line="300" w:lineRule="auto"/>
+        <w:ind w:left="540" w:hanging="271"/>
+      </w:pPr>
+      <w:r>
+        <w:rPr>
+          <w:rFonts w:ascii="Calibri" w:hAnsi="Calibri"/>
+          <w:sz w:val="22"/>
+        </w:rPr>
+        <w:t>surface, normalized, lemma, POS, morphology, and character-offset token fields;</w:t>
+      </w:r>
+    </w:p>
+    <w:p>
+      <w:pPr>
+        <w:widowControl/>
+        <w:numPr>
+          <w:ilvl w:val="0"/>
+          <w:numId w:val="10"/>
+        </w:numPr>
+        <w:spacing w:before="0" w:after="80" w:line="300" w:lineRule="auto"/>
+        <w:ind w:left="540" w:hanging="271"/>
+      </w:pPr>
+      <w:r>
+        <w:rPr>
+          <w:rFonts w:ascii="Calibri" w:hAnsi="Calibri"/>
+          <w:sz w:val="22"/>
+        </w:rPr>
+        <w:t>dependency records and optional named-entity records;</w:t>
+      </w:r>
+    </w:p>
+    <w:p>
+      <w:pPr>
+        <w:widowControl/>
+        <w:numPr>
+          <w:ilvl w:val="0"/>
+          <w:numId w:val="10"/>
+        </w:numPr>
+        <w:spacing w:before="0" w:after="80" w:line="300" w:lineRule="auto"/>
+        <w:ind w:left="540" w:hanging="271"/>
+      </w:pPr>
+      <w:r>
+        <w:rPr>
+          <w:rFonts w:ascii="Calibri" w:hAnsi="Calibri"/>
+          <w:sz w:val="22"/>
+        </w:rPr>
+        <w:t>exact spans for hyphenated expressions, contractions, and apostrophe forms;</w:t>
+      </w:r>
+    </w:p>
+    <w:p>
+      <w:pPr>
+        <w:widowControl/>
+        <w:numPr>
+          <w:ilvl w:val="0"/>
+          <w:numId w:val="10"/>
+        </w:numPr>
+        <w:spacing w:before="0" w:after="80" w:line="300" w:lineRule="auto"/>
+        <w:ind w:left="540" w:hanging="271"/>
+      </w:pPr>
+      <w:r>
+        <w:rPr>
+          <w:rFonts w:ascii="Calibri" w:hAnsi="Calibri"/>
+          <w:sz w:val="22"/>
+        </w:rPr>
+        <w:t>content/function/other/non-lexical classifications; and</w:t>
+      </w:r>
+    </w:p>
+    <w:p>
+      <w:pPr>
+        <w:widowControl/>
+        <w:numPr>
+          <w:ilvl w:val="0"/>
+          <w:numId w:val="10"/>
+        </w:numPr>
+        <w:spacing w:before="0" w:after="80" w:line="300" w:lineRule="auto"/>
+        <w:ind w:left="540" w:hanging="271"/>
+      </w:pPr>
+      <w:r>
+        <w:rPr>
+          <w:rFonts w:ascii="Calibri" w:hAnsi="Calibri"/>
+          <w:sz w:val="22"/>
+        </w:rPr>
+        <w:t>processing configuration, provenance, coverage, and warnings.</w:t>
+      </w:r>
+    </w:p>
+    <w:p>
+      <w:pPr>
+        <w:widowControl/>
+        <w:spacing w:before="0" w:after="120" w:line="300" w:lineRule="auto"/>
+      </w:pPr>
+      <w:r>
+        <w:rPr>
+          <w:rFonts w:ascii="Calibri" w:hAnsi="Calibri"/>
+          <w:sz w:val="22"/>
+        </w:rPr>
+        <w:t>Poetic lines/stanzas and model sentences are distinct layers. VerseVAD retains both when they disagree. Lemma, POS, morphology, sentence, dependency, and optional named-entity values are statistical-model output, not corrected literary facts.</w:t>
+      </w:r>
+    </w:p>
+    <w:p>
+      <w:pPr>
+        <w:widowControl/>
+        <w:spacing w:before="0" w:after="120" w:line="300" w:lineRule="auto"/>
+      </w:pPr>
+      <w:r>
+        <w:rPr>
+          <w:rFonts w:ascii="Calibri" w:hAnsi="Calibri"/>
+          <w:sz w:val="22"/>
+        </w:rPr>
+        <w:t>Named-entity recognition is disabled by default. The installed small English model has no usable vector vocabulary, so model out-of-vocabulary counts remain missing instead of becoming zero or classifying every lexical token as OOV. This model status is separate from affective-lexicon coverage and future SUBTLEX-US coverage.</w:t>
+      </w:r>
+    </w:p>
+    <w:p>
+      <w:pPr>
+        <w:pStyle w:val="Heading2"/>
+      </w:pPr>
+      <w:r>
+        <w:rPr>
+          <w:rFonts w:ascii="Calibri" w:hAnsi="Calibri"/>
+          <w:sz w:val="22"/>
+        </w:rPr>
         <w:t>Main matching order</w:t>
       </w:r>
     </w:p>
@@ -2803,6 +3035,7 @@
       </w:tblGrid>
       <w:tr>
         <w:trPr>
+          <w:cantSplit w:val="true"/>
           <w:tblHeader w:val="true"/>
         </w:trPr>
         <w:tc>
@@ -2819,6 +3052,7 @@
           </w:tcPr>
           <w:p>
             <w:pPr>
+              <w:keepNext/>
               <w:widowControl/>
               <w:spacing w:before="0" w:after="0" w:line="252" w:lineRule="auto"/>
             </w:pPr>
@@ -2853,6 +3087,7 @@
           </w:tcPr>
           <w:p>
             <w:pPr>
+              <w:keepNext/>
               <w:widowControl/>
               <w:spacing w:before="0" w:after="0" w:line="252" w:lineRule="auto"/>
             </w:pPr>
@@ -2887,6 +3122,7 @@
           </w:tcPr>
           <w:p>
             <w:pPr>
+              <w:keepNext/>
               <w:widowControl/>
               <w:spacing w:before="0" w:after="0" w:line="252" w:lineRule="auto"/>
             </w:pPr>
@@ -2909,6 +3145,9 @@
         </w:tc>
       </w:tr>
       <w:tr>
+        <w:trPr>
+          <w:cantSplit w:val="true"/>
+        </w:trPr>
         <w:tc>
           <w:tcPr>
             <w:tcW w:type="dxa" w:w="2250"/>
@@ -2989,6 +3228,9 @@
         </w:tc>
       </w:tr>
       <w:tr>
+        <w:trPr>
+          <w:cantSplit w:val="true"/>
+        </w:trPr>
         <w:tc>
           <w:tcPr>
             <w:tcW w:type="dxa" w:w="2250"/>
@@ -3069,6 +3311,9 @@
         </w:tc>
       </w:tr>
       <w:tr>
+        <w:trPr>
+          <w:cantSplit w:val="true"/>
+        </w:trPr>
         <w:tc>
           <w:tcPr>
             <w:tcW w:type="dxa" w:w="2250"/>
@@ -4998,7 +5243,35 @@
           <w:rFonts w:ascii="Calibri" w:hAnsi="Calibri"/>
           <w:sz w:val="22"/>
         </w:rPr>
-        <w:t>This tab reports part-of-speech counts and relative shares for all eligible lexical tokens, independently of lexicon coverage. It also shows unique normalized types and example forms. The denominator is displayed, and a caution explains that the labels are model-generated.</w:t>
+        <w:t xml:space="preserve">The </w:t>
+      </w:r>
+      <w:r>
+        <w:rPr>
+          <w:rFonts w:ascii="Calibri" w:hAnsi="Calibri"/>
+          <w:b/>
+          <w:sz w:val="22"/>
+        </w:rPr>
+        <w:t>Shared Processing Record</w:t>
+      </w:r>
+      <w:r>
+        <w:rPr>
+          <w:rFonts w:ascii="Calibri" w:hAnsi="Calibri"/>
+          <w:sz w:val="22"/>
+        </w:rPr>
+        <w:t xml:space="preserve"> first reports stanzas, physical lines, model sentences, total and lexical tokens, recipe/configuration IDs, model pipeline, dependency coverage, named-entity status, and processing cautions. It is the common local representation used by every selected lexicon.</w:t>
+      </w:r>
+    </w:p>
+    <w:p>
+      <w:pPr>
+        <w:widowControl/>
+        <w:spacing w:before="0" w:after="120" w:line="300" w:lineRule="auto"/>
+      </w:pPr>
+      <w:r>
+        <w:rPr>
+          <w:rFonts w:ascii="Calibri" w:hAnsi="Calibri"/>
+          <w:sz w:val="22"/>
+        </w:rPr>
+        <w:t>The tab then reports part-of-speech counts and relative shares for all eligible lexical tokens, independently of lexicon coverage. It also shows unique normalized types and example forms. The denominator is displayed, and a caution explains that the labels are model-generated.</w:t>
       </w:r>
     </w:p>
     <w:p>
@@ -7473,6 +7746,7 @@
       </w:tblGrid>
       <w:tr>
         <w:trPr>
+          <w:cantSplit w:val="true"/>
           <w:tblHeader w:val="true"/>
         </w:trPr>
         <w:tc>
@@ -7489,6 +7763,7 @@
           </w:tcPr>
           <w:p>
             <w:pPr>
+              <w:keepNext/>
               <w:widowControl/>
               <w:spacing w:before="0" w:after="0" w:line="252" w:lineRule="auto"/>
             </w:pPr>
@@ -7523,6 +7798,7 @@
           </w:tcPr>
           <w:p>
             <w:pPr>
+              <w:keepNext/>
               <w:widowControl/>
               <w:spacing w:before="0" w:after="0" w:line="252" w:lineRule="auto"/>
             </w:pPr>
@@ -7545,6 +7821,9 @@
         </w:tc>
       </w:tr>
       <w:tr>
+        <w:trPr>
+          <w:cantSplit w:val="true"/>
+        </w:trPr>
         <w:tc>
           <w:tcPr>
             <w:tcW w:type="dxa" w:w="2700"/>
@@ -7599,6 +7878,9 @@
         </w:tc>
       </w:tr>
       <w:tr>
+        <w:trPr>
+          <w:cantSplit w:val="true"/>
+        </w:trPr>
         <w:tc>
           <w:tcPr>
             <w:tcW w:type="dxa" w:w="2700"/>
@@ -7653,6 +7935,9 @@
         </w:tc>
       </w:tr>
       <w:tr>
+        <w:trPr>
+          <w:cantSplit w:val="true"/>
+        </w:trPr>
         <w:tc>
           <w:tcPr>
             <w:tcW w:type="dxa" w:w="2700"/>
@@ -7764,6 +8049,7 @@
       </w:tblGrid>
       <w:tr>
         <w:trPr>
+          <w:cantSplit w:val="true"/>
           <w:tblHeader w:val="true"/>
         </w:trPr>
         <w:tc>
@@ -7780,6 +8066,7 @@
           </w:tcPr>
           <w:p>
             <w:pPr>
+              <w:keepNext/>
               <w:widowControl/>
               <w:spacing w:before="0" w:after="0" w:line="252" w:lineRule="auto"/>
             </w:pPr>
@@ -7814,6 +8101,7 @@
           </w:tcPr>
           <w:p>
             <w:pPr>
+              <w:keepNext/>
               <w:widowControl/>
               <w:spacing w:before="0" w:after="0" w:line="252" w:lineRule="auto"/>
             </w:pPr>
@@ -7836,6 +8124,9 @@
         </w:tc>
       </w:tr>
       <w:tr>
+        <w:trPr>
+          <w:cantSplit w:val="true"/>
+        </w:trPr>
         <w:tc>
           <w:tcPr>
             <w:tcW w:type="dxa" w:w="3600"/>
@@ -7891,6 +8182,9 @@
         </w:tc>
       </w:tr>
       <w:tr>
+        <w:trPr>
+          <w:cantSplit w:val="true"/>
+        </w:trPr>
         <w:tc>
           <w:tcPr>
             <w:tcW w:type="dxa" w:w="3600"/>
@@ -7946,6 +8240,9 @@
         </w:tc>
       </w:tr>
       <w:tr>
+        <w:trPr>
+          <w:cantSplit w:val="true"/>
+        </w:trPr>
         <w:tc>
           <w:tcPr>
             <w:tcW w:type="dxa" w:w="3600"/>
@@ -8001,6 +8298,9 @@
         </w:tc>
       </w:tr>
       <w:tr>
+        <w:trPr>
+          <w:cantSplit w:val="true"/>
+        </w:trPr>
         <w:tc>
           <w:tcPr>
             <w:tcW w:type="dxa" w:w="3600"/>
@@ -8056,6 +8356,9 @@
         </w:tc>
       </w:tr>
       <w:tr>
+        <w:trPr>
+          <w:cantSplit w:val="true"/>
+        </w:trPr>
         <w:tc>
           <w:tcPr>
             <w:tcW w:type="dxa" w:w="3600"/>
@@ -8111,6 +8414,9 @@
         </w:tc>
       </w:tr>
       <w:tr>
+        <w:trPr>
+          <w:cantSplit w:val="true"/>
+        </w:trPr>
         <w:tc>
           <w:tcPr>
             <w:tcW w:type="dxa" w:w="3600"/>
@@ -8166,6 +8472,9 @@
         </w:tc>
       </w:tr>
       <w:tr>
+        <w:trPr>
+          <w:cantSplit w:val="true"/>
+        </w:trPr>
         <w:tc>
           <w:tcPr>
             <w:tcW w:type="dxa" w:w="3600"/>
@@ -8221,6 +8530,9 @@
         </w:tc>
       </w:tr>
       <w:tr>
+        <w:trPr>
+          <w:cantSplit w:val="true"/>
+        </w:trPr>
         <w:tc>
           <w:tcPr>
             <w:tcW w:type="dxa" w:w="3600"/>
@@ -8275,6 +8587,64 @@
           </w:p>
         </w:tc>
       </w:tr>
+      <w:tr>
+        <w:trPr>
+          <w:cantSplit w:val="true"/>
+        </w:trPr>
+        <w:tc>
+          <w:tcPr>
+            <w:tcW w:type="dxa" w:w="3600"/>
+            <w:vAlign w:val="center"/>
+            <w:tcMar>
+              <w:top w:w="80" w:type="dxa"/>
+              <w:bottom w:w="80" w:type="dxa"/>
+              <w:start w:w="120" w:type="dxa"/>
+              <w:end w:w="120" w:type="dxa"/>
+            </w:tcMar>
+          </w:tcPr>
+          <w:p>
+            <w:pPr>
+              <w:widowControl/>
+              <w:spacing w:before="0" w:after="0" w:line="252" w:lineRule="auto"/>
+            </w:pPr>
+            <w:r/>
+            <w:r>
+              <w:rPr>
+                <w:rFonts w:ascii="Consolas" w:hAnsi="Consolas"/>
+                <w:color w:val="1F4D78"/>
+                <w:sz w:val="17"/>
+              </w:rPr>
+              <w:t>poem_document.json</w:t>
+            </w:r>
+          </w:p>
+        </w:tc>
+        <w:tc>
+          <w:tcPr>
+            <w:tcW w:type="dxa" w:w="5760"/>
+            <w:vAlign w:val="center"/>
+            <w:tcMar>
+              <w:top w:w="80" w:type="dxa"/>
+              <w:bottom w:w="80" w:type="dxa"/>
+              <w:start w:w="120" w:type="dxa"/>
+              <w:end w:w="120" w:type="dxa"/>
+            </w:tcMar>
+          </w:tcPr>
+          <w:p>
+            <w:pPr>
+              <w:widowControl/>
+              <w:spacing w:before="0" w:after="0" w:line="252" w:lineRule="auto"/>
+            </w:pPr>
+            <w:r/>
+            <w:r>
+              <w:rPr>
+                <w:rFonts w:ascii="Calibri" w:hAnsi="Calibri"/>
+                <w:sz w:val="18"/>
+              </w:rPr>
+              <w:t>Exact original text, poetic/model structure, shared tokens and annotations, orthographic spans, processing configuration/provenance, coverage, and warnings</w:t>
+            </w:r>
+          </w:p>
+        </w:tc>
+      </w:tr>
     </w:tbl>
     <w:p>
       <w:pPr>
@@ -8292,7 +8662,37 @@
           <w:rFonts w:ascii="Calibri" w:hAnsi="Calibri"/>
           <w:sz w:val="22"/>
         </w:rPr>
-        <w:t>CSV files use UTF-8 with a byte-order mark for compatibility with current Excel versions. The JSON file is the most complete structured representation; the scholar summary is the easiest reading aid.</w:t>
+        <w:t xml:space="preserve">CSV files use UTF-8 with a byte-order mark for compatibility with current Excel versions. The two JSON files preserve complementary machine-readable records: </w:t>
+      </w:r>
+      <w:r>
+        <w:rPr>
+          <w:rFonts w:ascii="Consolas" w:hAnsi="Consolas"/>
+          <w:color w:val="1F4D78"/>
+          <w:sz w:val="19"/>
+        </w:rPr>
+        <w:t>phase2_results.json</w:t>
+      </w:r>
+      <w:r>
+        <w:rPr>
+          <w:rFonts w:ascii="Calibri" w:hAnsi="Calibri"/>
+          <w:sz w:val="22"/>
+        </w:rPr>
+        <w:t xml:space="preserve"> contains the complete affective analysis, while </w:t>
+      </w:r>
+      <w:r>
+        <w:rPr>
+          <w:rFonts w:ascii="Consolas" w:hAnsi="Consolas"/>
+          <w:color w:val="1F4D78"/>
+          <w:sz w:val="19"/>
+        </w:rPr>
+        <w:t>poem_document.json</w:t>
+      </w:r>
+      <w:r>
+        <w:rPr>
+          <w:rFonts w:ascii="Calibri" w:hAnsi="Calibri"/>
+          <w:sz w:val="22"/>
+        </w:rPr>
+        <w:t xml:space="preserve"> contains its shared processing representation. The latter includes the original text, so protect it as research material. The scholar summary is the easiest reading aid.</w:t>
       </w:r>
     </w:p>
     <w:p>
@@ -8330,6 +8730,7 @@
       </w:tblGrid>
       <w:tr>
         <w:trPr>
+          <w:cantSplit w:val="true"/>
           <w:tblHeader w:val="true"/>
         </w:trPr>
         <w:tc>
@@ -8346,6 +8747,7 @@
           </w:tcPr>
           <w:p>
             <w:pPr>
+              <w:keepNext/>
               <w:widowControl/>
               <w:spacing w:before="0" w:after="0" w:line="252" w:lineRule="auto"/>
             </w:pPr>
@@ -8380,6 +8782,7 @@
           </w:tcPr>
           <w:p>
             <w:pPr>
+              <w:keepNext/>
               <w:widowControl/>
               <w:spacing w:before="0" w:after="0" w:line="252" w:lineRule="auto"/>
             </w:pPr>
@@ -8402,6 +8805,9 @@
         </w:tc>
       </w:tr>
       <w:tr>
+        <w:trPr>
+          <w:cantSplit w:val="true"/>
+        </w:trPr>
         <w:tc>
           <w:tcPr>
             <w:tcW w:type="dxa" w:w="2700"/>
@@ -8456,6 +8862,9 @@
         </w:tc>
       </w:tr>
       <w:tr>
+        <w:trPr>
+          <w:cantSplit w:val="true"/>
+        </w:trPr>
         <w:tc>
           <w:tcPr>
             <w:tcW w:type="dxa" w:w="2700"/>
@@ -8510,6 +8919,9 @@
         </w:tc>
       </w:tr>
       <w:tr>
+        <w:trPr>
+          <w:cantSplit w:val="true"/>
+        </w:trPr>
         <w:tc>
           <w:tcPr>
             <w:tcW w:type="dxa" w:w="2700"/>
@@ -8564,6 +8976,9 @@
         </w:tc>
       </w:tr>
       <w:tr>
+        <w:trPr>
+          <w:cantSplit w:val="true"/>
+        </w:trPr>
         <w:tc>
           <w:tcPr>
             <w:tcW w:type="dxa" w:w="2700"/>
@@ -8618,6 +9033,9 @@
         </w:tc>
       </w:tr>
       <w:tr>
+        <w:trPr>
+          <w:cantSplit w:val="true"/>
+        </w:trPr>
         <w:tc>
           <w:tcPr>
             <w:tcW w:type="dxa" w:w="2700"/>
@@ -8687,6 +9105,9 @@
         </w:tc>
       </w:tr>
       <w:tr>
+        <w:trPr>
+          <w:cantSplit w:val="true"/>
+        </w:trPr>
         <w:tc>
           <w:tcPr>
             <w:tcW w:type="dxa" w:w="2700"/>
@@ -8741,6 +9162,9 @@
         </w:tc>
       </w:tr>
       <w:tr>
+        <w:trPr>
+          <w:cantSplit w:val="true"/>
+        </w:trPr>
         <w:tc>
           <w:tcPr>
             <w:tcW w:type="dxa" w:w="2700"/>
@@ -8795,6 +9219,9 @@
         </w:tc>
       </w:tr>
       <w:tr>
+        <w:trPr>
+          <w:cantSplit w:val="true"/>
+        </w:trPr>
         <w:tc>
           <w:tcPr>
             <w:tcW w:type="dxa" w:w="2700"/>
@@ -8849,6 +9276,9 @@
         </w:tc>
       </w:tr>
       <w:tr>
+        <w:trPr>
+          <w:cantSplit w:val="true"/>
+        </w:trPr>
         <w:tc>
           <w:tcPr>
             <w:tcW w:type="dxa" w:w="2700"/>
@@ -8903,6 +9333,9 @@
         </w:tc>
       </w:tr>
       <w:tr>
+        <w:trPr>
+          <w:cantSplit w:val="true"/>
+        </w:trPr>
         <w:tc>
           <w:tcPr>
             <w:tcW w:type="dxa" w:w="2700"/>
@@ -9156,6 +9589,7 @@
       </w:tblGrid>
       <w:tr>
         <w:trPr>
+          <w:cantSplit w:val="true"/>
           <w:tblHeader w:val="true"/>
         </w:trPr>
         <w:tc>
@@ -9172,6 +9606,7 @@
           </w:tcPr>
           <w:p>
             <w:pPr>
+              <w:keepNext/>
               <w:widowControl/>
               <w:spacing w:before="0" w:after="0" w:line="252" w:lineRule="auto"/>
             </w:pPr>
@@ -9206,6 +9641,7 @@
           </w:tcPr>
           <w:p>
             <w:pPr>
+              <w:keepNext/>
               <w:widowControl/>
               <w:spacing w:before="0" w:after="0" w:line="252" w:lineRule="auto"/>
             </w:pPr>
@@ -9228,6 +9664,9 @@
         </w:tc>
       </w:tr>
       <w:tr>
+        <w:trPr>
+          <w:cantSplit w:val="true"/>
+        </w:trPr>
         <w:tc>
           <w:tcPr>
             <w:tcW w:type="dxa" w:w="2700"/>
@@ -9283,6 +9722,9 @@
         </w:tc>
       </w:tr>
       <w:tr>
+        <w:trPr>
+          <w:cantSplit w:val="true"/>
+        </w:trPr>
         <w:tc>
           <w:tcPr>
             <w:tcW w:type="dxa" w:w="2700"/>
@@ -9338,6 +9780,9 @@
         </w:tc>
       </w:tr>
       <w:tr>
+        <w:trPr>
+          <w:cantSplit w:val="true"/>
+        </w:trPr>
         <w:tc>
           <w:tcPr>
             <w:tcW w:type="dxa" w:w="2700"/>
@@ -10281,6 +10726,7 @@
       </w:tblGrid>
       <w:tr>
         <w:trPr>
+          <w:cantSplit w:val="true"/>
           <w:tblHeader w:val="true"/>
         </w:trPr>
         <w:tc>
@@ -10297,6 +10743,7 @@
           </w:tcPr>
           <w:p>
             <w:pPr>
+              <w:keepNext/>
               <w:widowControl/>
               <w:spacing w:before="0" w:after="0" w:line="252" w:lineRule="auto"/>
             </w:pPr>
@@ -10331,6 +10778,7 @@
           </w:tcPr>
           <w:p>
             <w:pPr>
+              <w:keepNext/>
               <w:widowControl/>
               <w:spacing w:before="0" w:after="0" w:line="252" w:lineRule="auto"/>
             </w:pPr>
@@ -10353,6 +10801,9 @@
         </w:tc>
       </w:tr>
       <w:tr>
+        <w:trPr>
+          <w:cantSplit w:val="true"/>
+        </w:trPr>
         <w:tc>
           <w:tcPr>
             <w:tcW w:type="dxa" w:w="2700"/>
@@ -10407,6 +10858,9 @@
         </w:tc>
       </w:tr>
       <w:tr>
+        <w:trPr>
+          <w:cantSplit w:val="true"/>
+        </w:trPr>
         <w:tc>
           <w:tcPr>
             <w:tcW w:type="dxa" w:w="2700"/>
@@ -10461,6 +10915,9 @@
         </w:tc>
       </w:tr>
       <w:tr>
+        <w:trPr>
+          <w:cantSplit w:val="true"/>
+        </w:trPr>
         <w:tc>
           <w:tcPr>
             <w:tcW w:type="dxa" w:w="2700"/>
@@ -10531,6 +10988,9 @@
         </w:tc>
       </w:tr>
       <w:tr>
+        <w:trPr>
+          <w:cantSplit w:val="true"/>
+        </w:trPr>
         <w:tc>
           <w:tcPr>
             <w:tcW w:type="dxa" w:w="2700"/>
@@ -10585,6 +11045,9 @@
         </w:tc>
       </w:tr>
       <w:tr>
+        <w:trPr>
+          <w:cantSplit w:val="true"/>
+        </w:trPr>
         <w:tc>
           <w:tcPr>
             <w:tcW w:type="dxa" w:w="2700"/>
@@ -10639,6 +11102,9 @@
         </w:tc>
       </w:tr>
       <w:tr>
+        <w:trPr>
+          <w:cantSplit w:val="true"/>
+        </w:trPr>
         <w:tc>
           <w:tcPr>
             <w:tcW w:type="dxa" w:w="2700"/>
@@ -10693,6 +11159,9 @@
         </w:tc>
       </w:tr>
       <w:tr>
+        <w:trPr>
+          <w:cantSplit w:val="true"/>
+        </w:trPr>
         <w:tc>
           <w:tcPr>
             <w:tcW w:type="dxa" w:w="2700"/>
@@ -10747,6 +11216,9 @@
         </w:tc>
       </w:tr>
       <w:tr>
+        <w:trPr>
+          <w:cantSplit w:val="true"/>
+        </w:trPr>
         <w:tc>
           <w:tcPr>
             <w:tcW w:type="dxa" w:w="2700"/>
@@ -10801,6 +11273,9 @@
         </w:tc>
       </w:tr>
       <w:tr>
+        <w:trPr>
+          <w:cantSplit w:val="true"/>
+        </w:trPr>
         <w:tc>
           <w:tcPr>
             <w:tcW w:type="dxa" w:w="2700"/>
@@ -10855,6 +11330,9 @@
         </w:tc>
       </w:tr>
       <w:tr>
+        <w:trPr>
+          <w:cantSplit w:val="true"/>
+        </w:trPr>
         <w:tc>
           <w:tcPr>
             <w:tcW w:type="dxa" w:w="2700"/>
@@ -10909,6 +11387,9 @@
         </w:tc>
       </w:tr>
       <w:tr>
+        <w:trPr>
+          <w:cantSplit w:val="true"/>
+        </w:trPr>
         <w:tc>
           <w:tcPr>
             <w:tcW w:type="dxa" w:w="2700"/>
@@ -10963,6 +11444,9 @@
         </w:tc>
       </w:tr>
       <w:tr>
+        <w:trPr>
+          <w:cantSplit w:val="true"/>
+        </w:trPr>
         <w:tc>
           <w:tcPr>
             <w:tcW w:type="dxa" w:w="2700"/>
@@ -11017,6 +11501,9 @@
         </w:tc>
       </w:tr>
       <w:tr>
+        <w:trPr>
+          <w:cantSplit w:val="true"/>
+        </w:trPr>
         <w:tc>
           <w:tcPr>
             <w:tcW w:type="dxa" w:w="2700"/>
@@ -11071,6 +11558,9 @@
         </w:tc>
       </w:tr>
       <w:tr>
+        <w:trPr>
+          <w:cantSplit w:val="true"/>
+        </w:trPr>
         <w:tc>
           <w:tcPr>
             <w:tcW w:type="dxa" w:w="2700"/>
@@ -11125,6 +11615,9 @@
         </w:tc>
       </w:tr>
       <w:tr>
+        <w:trPr>
+          <w:cantSplit w:val="true"/>
+        </w:trPr>
         <w:tc>
           <w:tcPr>
             <w:tcW w:type="dxa" w:w="2700"/>
@@ -11179,6 +11672,9 @@
         </w:tc>
       </w:tr>
       <w:tr>
+        <w:trPr>
+          <w:cantSplit w:val="true"/>
+        </w:trPr>
         <w:tc>
           <w:tcPr>
             <w:tcW w:type="dxa" w:w="2700"/>
@@ -11233,6 +11729,9 @@
         </w:tc>
       </w:tr>
       <w:tr>
+        <w:trPr>
+          <w:cantSplit w:val="true"/>
+        </w:trPr>
         <w:tc>
           <w:tcPr>
             <w:tcW w:type="dxa" w:w="2700"/>
@@ -11287,6 +11786,9 @@
         </w:tc>
       </w:tr>
       <w:tr>
+        <w:trPr>
+          <w:cantSplit w:val="true"/>
+        </w:trPr>
         <w:tc>
           <w:tcPr>
             <w:tcW w:type="dxa" w:w="2700"/>
@@ -11341,6 +11843,9 @@
         </w:tc>
       </w:tr>
       <w:tr>
+        <w:trPr>
+          <w:cantSplit w:val="true"/>
+        </w:trPr>
         <w:tc>
           <w:tcPr>
             <w:tcW w:type="dxa" w:w="2700"/>
@@ -11395,6 +11900,9 @@
         </w:tc>
       </w:tr>
       <w:tr>
+        <w:trPr>
+          <w:cantSplit w:val="true"/>
+        </w:trPr>
         <w:tc>
           <w:tcPr>
             <w:tcW w:type="dxa" w:w="2700"/>
@@ -11449,6 +11957,9 @@
         </w:tc>
       </w:tr>
       <w:tr>
+        <w:trPr>
+          <w:cantSplit w:val="true"/>
+        </w:trPr>
         <w:tc>
           <w:tcPr>
             <w:tcW w:type="dxa" w:w="2700"/>
@@ -11503,6 +12014,9 @@
         </w:tc>
       </w:tr>
       <w:tr>
+        <w:trPr>
+          <w:cantSplit w:val="true"/>
+        </w:trPr>
         <w:tc>
           <w:tcPr>
             <w:tcW w:type="dxa" w:w="2700"/>
@@ -11557,6 +12071,9 @@
         </w:tc>
       </w:tr>
       <w:tr>
+        <w:trPr>
+          <w:cantSplit w:val="true"/>
+        </w:trPr>
         <w:tc>
           <w:tcPr>
             <w:tcW w:type="dxa" w:w="2700"/>
@@ -11611,6 +12128,9 @@
         </w:tc>
       </w:tr>
       <w:tr>
+        <w:trPr>
+          <w:cantSplit w:val="true"/>
+        </w:trPr>
         <w:tc>
           <w:tcPr>
             <w:tcW w:type="dxa" w:w="2700"/>
@@ -11665,6 +12185,9 @@
         </w:tc>
       </w:tr>
       <w:tr>
+        <w:trPr>
+          <w:cantSplit w:val="true"/>
+        </w:trPr>
         <w:tc>
           <w:tcPr>
             <w:tcW w:type="dxa" w:w="2700"/>
@@ -11719,6 +12242,9 @@
         </w:tc>
       </w:tr>
       <w:tr>
+        <w:trPr>
+          <w:cantSplit w:val="true"/>
+        </w:trPr>
         <w:tc>
           <w:tcPr>
             <w:tcW w:type="dxa" w:w="2700"/>
@@ -11773,6 +12299,9 @@
         </w:tc>
       </w:tr>
       <w:tr>
+        <w:trPr>
+          <w:cantSplit w:val="true"/>
+        </w:trPr>
         <w:tc>
           <w:tcPr>
             <w:tcW w:type="dxa" w:w="2700"/>
@@ -11827,6 +12356,9 @@
         </w:tc>
       </w:tr>
       <w:tr>
+        <w:trPr>
+          <w:cantSplit w:val="true"/>
+        </w:trPr>
         <w:tc>
           <w:tcPr>
             <w:tcW w:type="dxa" w:w="2700"/>
@@ -11881,6 +12413,9 @@
         </w:tc>
       </w:tr>
       <w:tr>
+        <w:trPr>
+          <w:cantSplit w:val="true"/>
+        </w:trPr>
         <w:tc>
           <w:tcPr>
             <w:tcW w:type="dxa" w:w="2700"/>
@@ -11935,6 +12470,9 @@
         </w:tc>
       </w:tr>
       <w:tr>
+        <w:trPr>
+          <w:cantSplit w:val="true"/>
+        </w:trPr>
         <w:tc>
           <w:tcPr>
             <w:tcW w:type="dxa" w:w="2700"/>
@@ -11989,6 +12527,9 @@
         </w:tc>
       </w:tr>
       <w:tr>
+        <w:trPr>
+          <w:cantSplit w:val="true"/>
+        </w:trPr>
         <w:tc>
           <w:tcPr>
             <w:tcW w:type="dxa" w:w="2700"/>
@@ -12043,6 +12584,9 @@
         </w:tc>
       </w:tr>
       <w:tr>
+        <w:trPr>
+          <w:cantSplit w:val="true"/>
+        </w:trPr>
         <w:tc>
           <w:tcPr>
             <w:tcW w:type="dxa" w:w="2700"/>
@@ -12097,6 +12641,9 @@
         </w:tc>
       </w:tr>
       <w:tr>
+        <w:trPr>
+          <w:cantSplit w:val="true"/>
+        </w:trPr>
         <w:tc>
           <w:tcPr>
             <w:tcW w:type="dxa" w:w="2700"/>
@@ -12151,6 +12698,9 @@
         </w:tc>
       </w:tr>
       <w:tr>
+        <w:trPr>
+          <w:cantSplit w:val="true"/>
+        </w:trPr>
         <w:tc>
           <w:tcPr>
             <w:tcW w:type="dxa" w:w="2700"/>
@@ -12205,6 +12755,9 @@
         </w:tc>
       </w:tr>
       <w:tr>
+        <w:trPr>
+          <w:cantSplit w:val="true"/>
+        </w:trPr>
         <w:tc>
           <w:tcPr>
             <w:tcW w:type="dxa" w:w="2700"/>
@@ -12259,6 +12812,9 @@
         </w:tc>
       </w:tr>
       <w:tr>
+        <w:trPr>
+          <w:cantSplit w:val="true"/>
+        </w:trPr>
         <w:tc>
           <w:tcPr>
             <w:tcW w:type="dxa" w:w="2700"/>
@@ -12742,7 +13298,7 @@
           <w:rFonts w:ascii="Calibri" w:hAnsi="Calibri"/>
           <w:sz w:val="22"/>
         </w:rPr>
-        <w:t>Current corpus comparisons are descriptive and do not provide confidence intervals or hypothesis tests.</w:t>
+        <w:t>Sentence boundaries, dependency labels, and optional named entities are model-generated and may cross or disagree with poetic lines and stanzas.</w:t>
       </w:r>
     </w:p>
     <w:p>
@@ -12760,7 +13316,7 @@
           <w:rFonts w:ascii="Calibri" w:hAnsi="Calibri"/>
           <w:sz w:val="22"/>
         </w:rPr>
-        <w:t>Review mappings are scholar-authored scenario decisions, not source-published equivalences.</w:t>
+        <w:t>Dependency confidence and small-model OOV rates remain missing when the installed model does not supply defensible values.</w:t>
       </w:r>
     </w:p>
     <w:p>
@@ -12778,6 +13334,42 @@
           <w:rFonts w:ascii="Calibri" w:hAnsi="Calibri"/>
           <w:sz w:val="22"/>
         </w:rPr>
+        <w:t>Current corpus comparisons are descriptive and do not provide confidence intervals or hypothesis tests.</w:t>
+      </w:r>
+    </w:p>
+    <w:p>
+      <w:pPr>
+        <w:widowControl/>
+        <w:numPr>
+          <w:ilvl w:val="0"/>
+          <w:numId w:val="10"/>
+        </w:numPr>
+        <w:spacing w:before="0" w:after="80" w:line="300" w:lineRule="auto"/>
+        <w:ind w:left="540" w:hanging="271"/>
+      </w:pPr>
+      <w:r>
+        <w:rPr>
+          <w:rFonts w:ascii="Calibri" w:hAnsi="Calibri"/>
+          <w:sz w:val="22"/>
+        </w:rPr>
+        <w:t>Review mappings are scholar-authored scenario decisions, not source-published equivalences.</w:t>
+      </w:r>
+    </w:p>
+    <w:p>
+      <w:pPr>
+        <w:widowControl/>
+        <w:numPr>
+          <w:ilvl w:val="0"/>
+          <w:numId w:val="10"/>
+        </w:numPr>
+        <w:spacing w:before="0" w:after="80" w:line="300" w:lineRule="auto"/>
+        <w:ind w:left="540" w:hanging="271"/>
+      </w:pPr>
+      <w:r>
+        <w:rPr>
+          <w:rFonts w:ascii="Calibri" w:hAnsi="Calibri"/>
+          <w:sz w:val="22"/>
+        </w:rPr>
         <w:t>Broad project or global review scopes require extra caution; prefer the narrowest defensible scope.</w:t>
       </w:r>
     </w:p>
@@ -12803,7 +13395,7 @@
           <w:rFonts w:ascii="Calibri" w:hAnsi="Calibri"/>
           <w:sz w:val="22"/>
         </w:rPr>
-        <w:t>Every analysis should retain the active lexicon, source checksum, adapter version, software version, preprocessing recipe, phrase policy, stopword policy, scenario, and inclusion decisions. Completed corpus runs remain linked to preserved text versions.</w:t>
+        <w:t>Every analysis should retain the active lexicon, source checksum, adapter version, software version, preprocessing recipe and configuration ID, phrase policy, stopword policy, scenario, and inclusion decisions. Completed corpus runs remain linked to preserved text versions.</w:t>
       </w:r>
     </w:p>
     <w:p>
@@ -13070,7 +13662,7 @@
         <w:color w:val="66727C"/>
         <w:sz w:val="18"/>
       </w:rPr>
-      <w:t xml:space="preserve">  |  0.6.0.dev0</w:t>
+      <w:t xml:space="preserve">  |  0.7.0.dev0</w:t>
     </w:r>
   </w:p>
 </w:hdr>

</xml_diff>

<commit_message>
Complete Poetic Fingerprint expansion Stage 2
</commit_message>
<xml_diff>
--- a/docs/VerseVAD_User_Manual.docx
+++ b/docs/VerseVAD_User_Manual.docx
@@ -23,7 +23,7 @@
           <w:rFonts w:ascii="Calibri" w:hAnsi="Calibri"/>
           <w:sz w:val="22"/>
         </w:rPr>
-        <w:t>Local, auditable affective-lexicon analysis for literary texts</w:t>
+        <w:t>Local, auditable lexical-evidence analysis for literary texts</w:t>
       </w:r>
     </w:p>
     <w:p>
@@ -47,7 +47,7 @@
           <w:color w:val="66727C"/>
           <w:sz w:val="21"/>
         </w:rPr>
-        <w:t xml:space="preserve"> 0.7.0.dev0</w:t>
+        <w:t xml:space="preserve"> 0.8.0.dev0</w:t>
       </w:r>
       <w:r>
         <w:rPr>
@@ -142,7 +142,7 @@
                 <w:color w:val="193247"/>
                 <w:sz w:val="22"/>
               </w:rPr>
-              <w:t xml:space="preserve">IMPORTANT: VerseVAD describes affective </w:t>
+              <w:t xml:space="preserve">IMPORTANT: VerseVAD describes </w:t>
             </w:r>
             <w:r>
               <w:rPr>
@@ -159,7 +159,7 @@
                 <w:color w:val="193247"/>
                 <w:sz w:val="22"/>
               </w:rPr>
-              <w:t>: normative ratings and associations attached to matched words and phrases. It does not determine the emotion of a poem, speaker, author, or reader, and it does not replace contextual close reading.</w:t>
+              <w:t>: normative ratings and associations attached to matched words and phrases. Its optional concreteness module remains a separate normative lexical construct. VerseVAD does not determine the emotion of a poem, speaker, author, or reader, and it does not replace contextual close reading.</w:t>
             </w:r>
           </w:p>
         </w:tc>
@@ -536,7 +536,7 @@
                 <w:color w:val="193247"/>
                 <w:sz w:val="22"/>
               </w:rPr>
-              <w:t xml:space="preserve">, then read </w:t>
+              <w:t xml:space="preserve">, then read the enabled evidence tabs, including </w:t>
             </w:r>
             <w:r>
               <w:rPr>
@@ -545,7 +545,7 @@
                 <w:color w:val="193247"/>
                 <w:sz w:val="22"/>
               </w:rPr>
-              <w:t>VAD Profile</w:t>
+              <w:t>Concreteness Profile</w:t>
             </w:r>
             <w:r>
               <w:rPr>
@@ -553,7 +553,7 @@
                 <w:color w:val="193247"/>
                 <w:sz w:val="22"/>
               </w:rPr>
-              <w:t xml:space="preserve"> and </w:t>
+              <w:t xml:space="preserve"> when selected, and inspect </w:t>
             </w:r>
             <w:r>
               <w:rPr>
@@ -853,6 +853,37 @@
     </w:p>
     <w:p>
       <w:pPr>
+        <w:widowControl/>
+        <w:numPr>
+          <w:ilvl w:val="0"/>
+          <w:numId w:val="10"/>
+        </w:numPr>
+        <w:spacing w:before="0" w:after="80" w:line="300" w:lineRule="auto"/>
+        <w:ind w:left="540" w:hanging="271"/>
+      </w:pPr>
+      <w:r>
+        <w:rPr>
+          <w:rFonts w:ascii="Calibri" w:hAnsi="Calibri"/>
+          <w:sz w:val="22"/>
+        </w:rPr>
+        <w:t>optional normative lexical concreteness statistics, coverage, structural</w:t>
+      </w:r>
+    </w:p>
+    <w:p>
+      <w:pPr>
+        <w:widowControl/>
+        <w:spacing w:before="0" w:after="120" w:line="300" w:lineRule="auto"/>
+      </w:pPr>
+      <w:r>
+        <w:rPr>
+          <w:rFonts w:ascii="Calibri" w:hAnsi="Calibri"/>
+          <w:sz w:val="22"/>
+        </w:rPr>
+        <w:t xml:space="preserve">  summaries, term rankings, and token audit from a local research workbook.</w:t>
+      </w:r>
+    </w:p>
+    <w:p>
+      <w:pPr>
         <w:pStyle w:val="Heading2"/>
       </w:pPr>
       <w:r>
@@ -942,6 +973,34 @@
           <w:sz w:val="22"/>
         </w:rPr>
         <w:t xml:space="preserve"> and must not be renamed, edited, merged, or redistributed. VerseVAD reads them in place, records SHA-256 checksums, and stores derived project data separately.</w:t>
+      </w:r>
+    </w:p>
+    <w:p>
+      <w:pPr>
+        <w:widowControl/>
+        <w:spacing w:before="0" w:after="120" w:line="300" w:lineRule="auto"/>
+      </w:pPr>
+      <w:r>
+        <w:rPr>
+          <w:rFonts w:ascii="Calibri" w:hAnsi="Calibri"/>
+          <w:sz w:val="22"/>
+        </w:rPr>
+        <w:t xml:space="preserve">Optional research resources under </w:t>
+      </w:r>
+      <w:r>
+        <w:rPr>
+          <w:rFonts w:ascii="Consolas" w:hAnsi="Consolas"/>
+          <w:color w:val="1F4D78"/>
+          <w:sz w:val="19"/>
+        </w:rPr>
+        <w:t>resources/</w:t>
+      </w:r>
+      <w:r>
+        <w:rPr>
+          <w:rFonts w:ascii="Calibri" w:hAnsi="Calibri"/>
+          <w:sz w:val="22"/>
+        </w:rPr>
+        <w:t xml:space="preserve"> are also local and excluded from source control. The Stage 2 concreteness workbook and paper must retain their exact filenames and checksums. VerseVAD reads the workbook in place and does not copy the full ratings source into an export.</w:t>
       </w:r>
     </w:p>
     <w:p>
@@ -1454,7 +1513,37 @@
           <w:rFonts w:ascii="Calibri" w:hAnsi="Calibri"/>
           <w:sz w:val="22"/>
         </w:rPr>
-        <w:t>Keep both reporting views enabled.</w:t>
+        <w:t xml:space="preserve">Optionally enable </w:t>
+      </w:r>
+      <w:r>
+        <w:rPr>
+          <w:rFonts w:ascii="Calibri" w:hAnsi="Calibri"/>
+          <w:b/>
+          <w:sz w:val="22"/>
+        </w:rPr>
+        <w:t>Normative lexical concreteness</w:t>
+      </w:r>
+      <w:r>
+        <w:rPr>
+          <w:rFonts w:ascii="Calibri" w:hAnsi="Calibri"/>
+          <w:sz w:val="22"/>
+        </w:rPr>
+        <w:t xml:space="preserve"> under </w:t>
+      </w:r>
+      <w:r>
+        <w:rPr>
+          <w:rFonts w:ascii="Calibri" w:hAnsi="Calibri"/>
+          <w:b/>
+          <w:sz w:val="22"/>
+        </w:rPr>
+        <w:t>Choose Evidence</w:t>
+      </w:r>
+      <w:r>
+        <w:rPr>
+          <w:rFonts w:ascii="Calibri" w:hAnsi="Calibri"/>
+          <w:sz w:val="22"/>
+        </w:rPr>
+        <w:t>.</w:t>
       </w:r>
     </w:p>
     <w:p>
@@ -1472,22 +1561,7 @@
           <w:rFonts w:ascii="Calibri" w:hAnsi="Calibri"/>
           <w:sz w:val="22"/>
         </w:rPr>
-        <w:t xml:space="preserve">Click </w:t>
-      </w:r>
-      <w:r>
-        <w:rPr>
-          <w:rFonts w:ascii="Calibri" w:hAnsi="Calibri"/>
-          <w:b/>
-          <w:sz w:val="22"/>
-        </w:rPr>
-        <w:t>Analyze this text</w:t>
-      </w:r>
-      <w:r>
-        <w:rPr>
-          <w:rFonts w:ascii="Calibri" w:hAnsi="Calibri"/>
-          <w:sz w:val="22"/>
-        </w:rPr>
-        <w:t>.</w:t>
+        <w:t>Keep both affective reporting views enabled.</w:t>
       </w:r>
     </w:p>
     <w:p>
@@ -1505,7 +1579,7 @@
           <w:rFonts w:ascii="Calibri" w:hAnsi="Calibri"/>
           <w:sz w:val="22"/>
         </w:rPr>
-        <w:t xml:space="preserve">In </w:t>
+        <w:t xml:space="preserve">Click </w:t>
       </w:r>
       <w:r>
         <w:rPr>
@@ -1513,14 +1587,14 @@
           <w:b/>
           <w:sz w:val="22"/>
         </w:rPr>
-        <w:t>Overview</w:t>
-      </w:r>
-      <w:r>
-        <w:rPr>
-          <w:rFonts w:ascii="Calibri" w:hAnsi="Calibri"/>
-          <w:sz w:val="22"/>
-        </w:rPr>
-        <w:t>, inspect coverage and warnings.</w:t>
+        <w:t>Analyze this text</w:t>
+      </w:r>
+      <w:r>
+        <w:rPr>
+          <w:rFonts w:ascii="Calibri" w:hAnsi="Calibri"/>
+          <w:sz w:val="22"/>
+        </w:rPr>
+        <w:t>.</w:t>
       </w:r>
     </w:p>
     <w:p>
@@ -1546,14 +1620,14 @@
           <w:b/>
           <w:sz w:val="22"/>
         </w:rPr>
-        <w:t>VAD Profile</w:t>
-      </w:r>
-      <w:r>
-        <w:rPr>
-          <w:rFonts w:ascii="Calibri" w:hAnsi="Calibri"/>
-          <w:sz w:val="22"/>
-        </w:rPr>
-        <w:t>, compare all matched observations with stopwords excluded.</w:t>
+        <w:t>Overview</w:t>
+      </w:r>
+      <w:r>
+        <w:rPr>
+          <w:rFonts w:ascii="Calibri" w:hAnsi="Calibri"/>
+          <w:sz w:val="22"/>
+        </w:rPr>
+        <w:t>, inspect coverage and warnings.</w:t>
       </w:r>
     </w:p>
     <w:p>
@@ -1579,6 +1653,39 @@
           <w:b/>
           <w:sz w:val="22"/>
         </w:rPr>
+        <w:t>VAD Profile</w:t>
+      </w:r>
+      <w:r>
+        <w:rPr>
+          <w:rFonts w:ascii="Calibri" w:hAnsi="Calibri"/>
+          <w:sz w:val="22"/>
+        </w:rPr>
+        <w:t>, compare all matched observations with stopwords excluded.</w:t>
+      </w:r>
+    </w:p>
+    <w:p>
+      <w:pPr>
+        <w:widowControl/>
+        <w:numPr>
+          <w:ilvl w:val="0"/>
+          <w:numId w:val="14"/>
+        </w:numPr>
+        <w:spacing w:before="0" w:after="80" w:line="300" w:lineRule="auto"/>
+        <w:ind w:left="540" w:hanging="271"/>
+      </w:pPr>
+      <w:r>
+        <w:rPr>
+          <w:rFonts w:ascii="Calibri" w:hAnsi="Calibri"/>
+          <w:sz w:val="22"/>
+        </w:rPr>
+        <w:t xml:space="preserve">In </w:t>
+      </w:r>
+      <w:r>
+        <w:rPr>
+          <w:rFonts w:ascii="Calibri" w:hAnsi="Calibri"/>
+          <w:b/>
+          <w:sz w:val="22"/>
+        </w:rPr>
         <w:t>Language Profile</w:t>
       </w:r>
       <w:r>
@@ -1587,6 +1694,39 @@
           <w:sz w:val="22"/>
         </w:rPr>
         <w:t>, inspect the independent grammatical profile when it is relevant to your question.</w:t>
+      </w:r>
+    </w:p>
+    <w:p>
+      <w:pPr>
+        <w:widowControl/>
+        <w:numPr>
+          <w:ilvl w:val="0"/>
+          <w:numId w:val="14"/>
+        </w:numPr>
+        <w:spacing w:before="0" w:after="80" w:line="300" w:lineRule="auto"/>
+        <w:ind w:left="540" w:hanging="271"/>
+      </w:pPr>
+      <w:r>
+        <w:rPr>
+          <w:rFonts w:ascii="Calibri" w:hAnsi="Calibri"/>
+          <w:sz w:val="22"/>
+        </w:rPr>
+        <w:t xml:space="preserve">If enabled, inspect the separate </w:t>
+      </w:r>
+      <w:r>
+        <w:rPr>
+          <w:rFonts w:ascii="Calibri" w:hAnsi="Calibri"/>
+          <w:b/>
+          <w:sz w:val="22"/>
+        </w:rPr>
+        <w:t>Concreteness Profile</w:t>
+      </w:r>
+      <w:r>
+        <w:rPr>
+          <w:rFonts w:ascii="Calibri" w:hAnsi="Calibri"/>
+          <w:sz w:val="22"/>
+        </w:rPr>
+        <w:t>.</w:t>
       </w:r>
     </w:p>
     <w:p>
@@ -2600,18 +2740,6 @@
     </w:p>
     <w:p>
       <w:pPr>
-        <w:pStyle w:val="Heading1"/>
-      </w:pPr>
-      <w:r>
-        <w:rPr>
-          <w:rFonts w:ascii="Calibri" w:hAnsi="Calibri"/>
-          <w:sz w:val="22"/>
-        </w:rPr>
-        <w:t>5. How text becomes auditable matches</w:t>
-      </w:r>
-    </w:p>
-    <w:p>
-      <w:pPr>
         <w:pStyle w:val="Heading2"/>
       </w:pPr>
       <w:r>
@@ -2619,7 +2747,7 @@
           <w:rFonts w:ascii="Calibri" w:hAnsi="Calibri"/>
           <w:sz w:val="22"/>
         </w:rPr>
-        <w:t>Preserved original and processing representation</w:t>
+        <w:t>Optional concreteness resource</w:t>
       </w:r>
     </w:p>
     <w:p>
@@ -2632,19 +2760,22 @@
           <w:rFonts w:ascii="Calibri" w:hAnsi="Calibri"/>
           <w:sz w:val="22"/>
         </w:rPr>
-        <w:t>VerseVAD preserves the supplied text exactly, including line and stanza breaks. Normalization happens in a separate processing representation. The original text is never silently rewritten.</w:t>
-      </w:r>
-    </w:p>
-    <w:p>
-      <w:pPr>
-        <w:pStyle w:val="Heading2"/>
-      </w:pPr>
-      <w:r>
-        <w:rPr>
-          <w:rFonts w:ascii="Calibri" w:hAnsi="Calibri"/>
-          <w:sz w:val="22"/>
-        </w:rPr>
-        <w:t>Shared poem document</w:t>
+        <w:t xml:space="preserve">The one-poem workspace can read the user-supplied Brysbaert, Warriner, and Kuperman (2014) supplementary workbook directly from </w:t>
+      </w:r>
+      <w:r>
+        <w:rPr>
+          <w:rFonts w:ascii="Consolas" w:hAnsi="Consolas"/>
+          <w:color w:val="1F4D78"/>
+          <w:sz w:val="19"/>
+        </w:rPr>
+        <w:t>resources/</w:t>
+      </w:r>
+      <w:r>
+        <w:rPr>
+          <w:rFonts w:ascii="Calibri" w:hAnsi="Calibri"/>
+          <w:sz w:val="22"/>
+        </w:rPr>
+        <w:t>. Its 39,954 rows contain 37,058 single words and 2,896 two-word expressions rated on an original 1-5 concreteness scale. The source paper describes the endpoints as very abstract or language-based and very concrete or experience-based.</w:t>
       </w:r>
     </w:p>
     <w:p>
@@ -2657,7 +2788,7 @@
           <w:rFonts w:ascii="Calibri" w:hAnsi="Calibri"/>
           <w:sz w:val="22"/>
         </w:rPr>
-        <w:t>For one-poem analysis, VerseVAD creates one immutable shared document and reuses its exact token sequence for every selected lexicon. It contains:</w:t>
+        <w:t>Keep these exact local files:</w:t>
       </w:r>
     </w:p>
     <w:p>
@@ -2672,10 +2803,11 @@
       </w:pPr>
       <w:r>
         <w:rPr>
-          <w:rFonts w:ascii="Calibri" w:hAnsi="Calibri"/>
-          <w:sz w:val="22"/>
-        </w:rPr>
-        <w:t>the exact original text;</w:t>
+          <w:rFonts w:ascii="Consolas" w:hAnsi="Consolas"/>
+          <w:color w:val="1F4D78"/>
+          <w:sz w:val="19"/>
+        </w:rPr>
+        <w:t>resources/brysbaert_warriner_kuperman_concreteness_DATA.xlsx</w:t>
       </w:r>
     </w:p>
     <w:p>
@@ -2690,10 +2822,116 @@
       </w:pPr>
       <w:r>
         <w:rPr>
-          <w:rFonts w:ascii="Calibri" w:hAnsi="Calibri"/>
-          <w:sz w:val="22"/>
-        </w:rPr>
-        <w:t>stanza and physical-line records, including blank separators and line endings;</w:t>
+          <w:rFonts w:ascii="Consolas" w:hAnsi="Consolas"/>
+          <w:color w:val="1F4D78"/>
+          <w:sz w:val="19"/>
+        </w:rPr>
+        <w:t>resources/brysbaert_warriner_kuperman_concreteness_PAPER.pdf</w:t>
+      </w:r>
+    </w:p>
+    <w:p>
+      <w:pPr>
+        <w:widowControl/>
+        <w:spacing w:before="0" w:after="120" w:line="300" w:lineRule="auto"/>
+      </w:pPr>
+      <w:r>
+        <w:rPr>
+          <w:rFonts w:ascii="Calibri" w:hAnsi="Calibri"/>
+          <w:sz w:val="22"/>
+        </w:rPr>
+        <w:t xml:space="preserve">The workbook's </w:t>
+      </w:r>
+      <w:r>
+        <w:rPr>
+          <w:rFonts w:ascii="Consolas" w:hAnsi="Consolas"/>
+          <w:color w:val="1F4D78"/>
+          <w:sz w:val="19"/>
+        </w:rPr>
+        <w:t>SUBTLEX</w:t>
+      </w:r>
+      <w:r>
+        <w:rPr>
+          <w:rFonts w:ascii="Calibri" w:hAnsi="Calibri"/>
+          <w:sz w:val="22"/>
+        </w:rPr>
+        <w:t xml:space="preserve"> field is retained as source-row provenance. It is not the planned VerseVAD lexical-frequency module; that later module will use a separately installed, versioned SUBTLEX-US resource and will not use </w:t>
+      </w:r>
+      <w:r>
+        <w:rPr>
+          <w:rFonts w:ascii="Consolas" w:hAnsi="Consolas"/>
+          <w:color w:val="1F4D78"/>
+          <w:sz w:val="19"/>
+        </w:rPr>
+        <w:t>wordfreq</w:t>
+      </w:r>
+      <w:r>
+        <w:rPr>
+          <w:rFonts w:ascii="Calibri" w:hAnsi="Calibri"/>
+          <w:sz w:val="22"/>
+        </w:rPr>
+        <w:t>.</w:t>
+      </w:r>
+    </w:p>
+    <w:p>
+      <w:pPr>
+        <w:pStyle w:val="Heading1"/>
+      </w:pPr>
+      <w:r>
+        <w:rPr>
+          <w:rFonts w:ascii="Calibri" w:hAnsi="Calibri"/>
+          <w:sz w:val="22"/>
+        </w:rPr>
+        <w:t>5. How text becomes auditable matches</w:t>
+      </w:r>
+    </w:p>
+    <w:p>
+      <w:pPr>
+        <w:pStyle w:val="Heading2"/>
+      </w:pPr>
+      <w:r>
+        <w:rPr>
+          <w:rFonts w:ascii="Calibri" w:hAnsi="Calibri"/>
+          <w:sz w:val="22"/>
+        </w:rPr>
+        <w:t>Preserved original and processing representation</w:t>
+      </w:r>
+    </w:p>
+    <w:p>
+      <w:pPr>
+        <w:widowControl/>
+        <w:spacing w:before="0" w:after="120" w:line="300" w:lineRule="auto"/>
+      </w:pPr>
+      <w:r>
+        <w:rPr>
+          <w:rFonts w:ascii="Calibri" w:hAnsi="Calibri"/>
+          <w:sz w:val="22"/>
+        </w:rPr>
+        <w:t>VerseVAD preserves the supplied text exactly, including line and stanza breaks. Normalization happens in a separate processing representation. The original text is never silently rewritten.</w:t>
+      </w:r>
+    </w:p>
+    <w:p>
+      <w:pPr>
+        <w:pStyle w:val="Heading2"/>
+      </w:pPr>
+      <w:r>
+        <w:rPr>
+          <w:rFonts w:ascii="Calibri" w:hAnsi="Calibri"/>
+          <w:sz w:val="22"/>
+        </w:rPr>
+        <w:t>Shared poem document</w:t>
+      </w:r>
+    </w:p>
+    <w:p>
+      <w:pPr>
+        <w:widowControl/>
+        <w:spacing w:before="0" w:after="120" w:line="300" w:lineRule="auto"/>
+      </w:pPr>
+      <w:r>
+        <w:rPr>
+          <w:rFonts w:ascii="Calibri" w:hAnsi="Calibri"/>
+          <w:sz w:val="22"/>
+        </w:rPr>
+        <w:t>For one-poem analysis, VerseVAD creates one immutable shared document and reuses its exact token sequence for every selected lexicon. It contains:</w:t>
       </w:r>
     </w:p>
     <w:p>
@@ -2711,7 +2949,7 @@
           <w:rFonts w:ascii="Calibri" w:hAnsi="Calibri"/>
           <w:sz w:val="22"/>
         </w:rPr>
-        <w:t>separate model sentence records, including line/stanza-crossing flags;</w:t>
+        <w:t>the exact original text;</w:t>
       </w:r>
     </w:p>
     <w:p>
@@ -2729,7 +2967,7 @@
           <w:rFonts w:ascii="Calibri" w:hAnsi="Calibri"/>
           <w:sz w:val="22"/>
         </w:rPr>
-        <w:t>surface, normalized, lemma, POS, morphology, and character-offset token fields;</w:t>
+        <w:t>stanza and physical-line records, including blank separators and line endings;</w:t>
       </w:r>
     </w:p>
     <w:p>
@@ -2747,7 +2985,7 @@
           <w:rFonts w:ascii="Calibri" w:hAnsi="Calibri"/>
           <w:sz w:val="22"/>
         </w:rPr>
-        <w:t>dependency records and optional named-entity records;</w:t>
+        <w:t>separate model sentence records, including line/stanza-crossing flags;</w:t>
       </w:r>
     </w:p>
     <w:p>
@@ -2765,7 +3003,7 @@
           <w:rFonts w:ascii="Calibri" w:hAnsi="Calibri"/>
           <w:sz w:val="22"/>
         </w:rPr>
-        <w:t>exact spans for hyphenated expressions, contractions, and apostrophe forms;</w:t>
+        <w:t>surface, normalized, lemma, POS, morphology, and character-offset token fields;</w:t>
       </w:r>
     </w:p>
     <w:p>
@@ -2783,7 +3021,7 @@
           <w:rFonts w:ascii="Calibri" w:hAnsi="Calibri"/>
           <w:sz w:val="22"/>
         </w:rPr>
-        <w:t>content/function/other/non-lexical classifications; and</w:t>
+        <w:t>dependency records and optional named-entity records;</w:t>
       </w:r>
     </w:p>
     <w:p>
@@ -2801,6 +3039,42 @@
           <w:rFonts w:ascii="Calibri" w:hAnsi="Calibri"/>
           <w:sz w:val="22"/>
         </w:rPr>
+        <w:t>exact spans for hyphenated expressions, contractions, and apostrophe forms;</w:t>
+      </w:r>
+    </w:p>
+    <w:p>
+      <w:pPr>
+        <w:widowControl/>
+        <w:numPr>
+          <w:ilvl w:val="0"/>
+          <w:numId w:val="10"/>
+        </w:numPr>
+        <w:spacing w:before="0" w:after="80" w:line="300" w:lineRule="auto"/>
+        <w:ind w:left="540" w:hanging="271"/>
+      </w:pPr>
+      <w:r>
+        <w:rPr>
+          <w:rFonts w:ascii="Calibri" w:hAnsi="Calibri"/>
+          <w:sz w:val="22"/>
+        </w:rPr>
+        <w:t>content/function/other/non-lexical classifications; and</w:t>
+      </w:r>
+    </w:p>
+    <w:p>
+      <w:pPr>
+        <w:widowControl/>
+        <w:numPr>
+          <w:ilvl w:val="0"/>
+          <w:numId w:val="10"/>
+        </w:numPr>
+        <w:spacing w:before="0" w:after="80" w:line="300" w:lineRule="auto"/>
+        <w:ind w:left="540" w:hanging="271"/>
+      </w:pPr>
+      <w:r>
+        <w:rPr>
+          <w:rFonts w:ascii="Calibri" w:hAnsi="Calibri"/>
+          <w:sz w:val="22"/>
+        </w:rPr>
         <w:t>processing configuration, provenance, coverage, and warnings.</w:t>
       </w:r>
     </w:p>
@@ -2997,6 +3271,19 @@
           <w:sz w:val="22"/>
         </w:rPr>
         <w:t>An exact surface match is never silently replaced by a lemma match. Lemma matching is explicitly labeled because model-proposed lemmas can be wrong for poetic, historical, or unusual language.</w:t>
+      </w:r>
+    </w:p>
+    <w:p>
+      <w:pPr>
+        <w:widowControl/>
+        <w:spacing w:before="0" w:after="120" w:line="300" w:lineRule="auto"/>
+      </w:pPr>
+      <w:r>
+        <w:rPr>
+          <w:rFonts w:ascii="Calibri" w:hAnsi="Calibri"/>
+          <w:sz w:val="22"/>
+        </w:rPr>
+        <w:t>The optional concreteness module has its own recorded sequence over the same tokens: longest exact source-supplied two-word expression within one physical line, exact normalized surface, lemma, then a documented conservative apostrophe or possessive fallback. Model-tagged proper nouns are excluded by default. Unmatched and ineligible tokens retain missing ratings.</w:t>
       </w:r>
     </w:p>
     <w:p>
@@ -4845,6 +5132,72 @@
           <w:rFonts w:ascii="Calibri" w:hAnsi="Calibri"/>
           <w:sz w:val="22"/>
         </w:rPr>
+        <w:t>Normative lexical concreteness</w:t>
+      </w:r>
+    </w:p>
+    <w:p>
+      <w:pPr>
+        <w:widowControl/>
+        <w:spacing w:before="0" w:after="120" w:line="300" w:lineRule="auto"/>
+      </w:pPr>
+      <w:r>
+        <w:rPr>
+          <w:rFonts w:ascii="Calibri" w:hAnsi="Calibri"/>
+          <w:sz w:val="22"/>
+        </w:rPr>
+        <w:t xml:space="preserve">When enabled, </w:t>
+      </w:r>
+      <w:r>
+        <w:rPr>
+          <w:rFonts w:ascii="Calibri" w:hAnsi="Calibri"/>
+          <w:b/>
+          <w:sz w:val="22"/>
+        </w:rPr>
+        <w:t>Concreteness Profile</w:t>
+      </w:r>
+      <w:r>
+        <w:rPr>
+          <w:rFonts w:ascii="Calibri" w:hAnsi="Calibri"/>
+          <w:sz w:val="22"/>
+        </w:rPr>
+        <w:t xml:space="preserve"> reports token-weighted mean, median, population SD, inclusive quartiles, and interquartile range among source-rated lexical tokens on the original 1-5 scale. It also reports token coverage and unique normalized-surface-type coverage, physical-line and stanza summaries, model-assigned POS summaries, most concrete and most abstract represented source terms, and a complete token audit.</w:t>
+      </w:r>
+    </w:p>
+    <w:p>
+      <w:pPr>
+        <w:widowControl/>
+        <w:spacing w:before="0" w:after="120" w:line="300" w:lineRule="auto"/>
+      </w:pPr>
+      <w:r>
+        <w:rPr>
+          <w:rFonts w:ascii="Calibri" w:hAnsi="Calibri"/>
+          <w:sz w:val="22"/>
+        </w:rPr>
+        <w:t>The default bands at or below 2.0 and at or above 4.0 are configurable VerseVAD orientation aids. They are not validated categories claimed by the paper. A matched two-word expression receives one match-group identity, while its source rating is assigned to both covered token positions for the declared token-weighted statistics. Repetition contributes repeatedly.</w:t>
+      </w:r>
+    </w:p>
+    <w:p>
+      <w:pPr>
+        <w:widowControl/>
+        <w:spacing w:before="0" w:after="120" w:line="300" w:lineRule="auto"/>
+      </w:pPr>
+      <w:r>
+        <w:rPr>
+          <w:rFonts w:ascii="Calibri" w:hAnsi="Calibri"/>
+          <w:sz w:val="22"/>
+        </w:rPr>
+        <w:t>Read the mean with coverage, dispersion, terms, and structural evidence. The result describes normative lexical concreteness evidence among represented vocabulary. It does not measure imagery quality, readability, cognition, literary value, or whether the poem itself is abstract or concrete.</w:t>
+      </w:r>
+    </w:p>
+    <w:p>
+      <w:pPr>
+        <w:pStyle w:val="Heading2"/>
+      </w:pPr>
+      <w:r>
+        <w:rPr>
+          <w:rFonts w:ascii="Calibri" w:hAnsi="Calibri"/>
+          <w:sz w:val="22"/>
+        </w:rPr>
         <w:t>Eight emotion associations</w:t>
       </w:r>
     </w:p>
@@ -5065,7 +5418,7 @@
           <w:rFonts w:ascii="Calibri" w:hAnsi="Calibri"/>
           <w:sz w:val="22"/>
         </w:rPr>
-        <w:t>Select one or more lexicons. VAD, categorical association, and intensity resources answer different questions and remain separate.</w:t>
+        <w:t>Select one or more affective lexicons and/or enable the optional normative lexical concreteness module. VAD, categorical association, intensity, and concreteness resources answer different questions and remain separate. A concreteness-only one-poem run is allowed when the exact workbook is available.</w:t>
       </w:r>
     </w:p>
     <w:p>
@@ -5165,138 +5518,7 @@
           <w:rFonts w:ascii="Calibri" w:hAnsi="Calibri"/>
           <w:sz w:val="22"/>
         </w:rPr>
-        <w:t>whether to display stopword-excluded results.</w:t>
-      </w:r>
-    </w:p>
-    <w:p>
-      <w:pPr>
-        <w:widowControl/>
-        <w:spacing w:before="0" w:after="120" w:line="300" w:lineRule="auto"/>
-      </w:pPr>
-      <w:r>
-        <w:rPr>
-          <w:rFonts w:ascii="Calibri" w:hAnsi="Calibri"/>
-          <w:sz w:val="22"/>
-        </w:rPr>
-        <w:t xml:space="preserve">Under </w:t>
-      </w:r>
-      <w:r>
-        <w:rPr>
-          <w:rFonts w:ascii="Calibri" w:hAnsi="Calibri"/>
-          <w:b/>
-          <w:sz w:val="22"/>
-        </w:rPr>
-        <w:t>Stopword settings</w:t>
-      </w:r>
-      <w:r>
-        <w:rPr>
-          <w:rFonts w:ascii="Calibri" w:hAnsi="Calibri"/>
-          <w:sz w:val="22"/>
-        </w:rPr>
-        <w:t>, inspect or change the secondary-view policy. The all-matched result is always preserved even when only one view is displayed.</w:t>
-      </w:r>
-    </w:p>
-    <w:p>
-      <w:pPr>
-        <w:pStyle w:val="Heading2"/>
-      </w:pPr>
-      <w:r>
-        <w:rPr>
-          <w:rFonts w:ascii="Calibri" w:hAnsi="Calibri"/>
-          <w:sz w:val="22"/>
-        </w:rPr>
-        <w:t>Overview tab</w:t>
-      </w:r>
-    </w:p>
-    <w:p>
-      <w:pPr>
-        <w:widowControl/>
-        <w:spacing w:before="0" w:after="120" w:line="300" w:lineRule="auto"/>
-      </w:pPr>
-      <w:r>
-        <w:rPr>
-          <w:rFonts w:ascii="Calibri" w:hAnsi="Calibri"/>
-          <w:sz w:val="22"/>
-        </w:rPr>
-        <w:t>Read coverage before means. The tab shows ordinary and content-focused coverage, matched counts, active methodology, excluded stopword counts, interpretive framing, and warnings.</w:t>
-      </w:r>
-    </w:p>
-    <w:p>
-      <w:pPr>
-        <w:pStyle w:val="Heading2"/>
-      </w:pPr>
-      <w:r>
-        <w:rPr>
-          <w:rFonts w:ascii="Calibri" w:hAnsi="Calibri"/>
-          <w:sz w:val="22"/>
-        </w:rPr>
-        <w:t>Language Profile tab</w:t>
-      </w:r>
-    </w:p>
-    <w:p>
-      <w:pPr>
-        <w:widowControl/>
-        <w:spacing w:before="0" w:after="120" w:line="300" w:lineRule="auto"/>
-      </w:pPr>
-      <w:r>
-        <w:rPr>
-          <w:rFonts w:ascii="Calibri" w:hAnsi="Calibri"/>
-          <w:sz w:val="22"/>
-        </w:rPr>
-        <w:t xml:space="preserve">The </w:t>
-      </w:r>
-      <w:r>
-        <w:rPr>
-          <w:rFonts w:ascii="Calibri" w:hAnsi="Calibri"/>
-          <w:b/>
-          <w:sz w:val="22"/>
-        </w:rPr>
-        <w:t>Shared Processing Record</w:t>
-      </w:r>
-      <w:r>
-        <w:rPr>
-          <w:rFonts w:ascii="Calibri" w:hAnsi="Calibri"/>
-          <w:sz w:val="22"/>
-        </w:rPr>
-        <w:t xml:space="preserve"> first reports stanzas, physical lines, model sentences, total and lexical tokens, recipe/configuration IDs, model pipeline, dependency coverage, named-entity status, and processing cautions. It is the common local representation used by every selected lexicon.</w:t>
-      </w:r>
-    </w:p>
-    <w:p>
-      <w:pPr>
-        <w:widowControl/>
-        <w:spacing w:before="0" w:after="120" w:line="300" w:lineRule="auto"/>
-      </w:pPr>
-      <w:r>
-        <w:rPr>
-          <w:rFonts w:ascii="Calibri" w:hAnsi="Calibri"/>
-          <w:sz w:val="22"/>
-        </w:rPr>
-        <w:t>The tab then reports part-of-speech counts and relative shares for all eligible lexical tokens, independently of lexicon coverage. It also shows unique normalized types and example forms. The denominator is displayed, and a caution explains that the labels are model-generated.</w:t>
-      </w:r>
-    </w:p>
-    <w:p>
-      <w:pPr>
-        <w:pStyle w:val="Heading2"/>
-      </w:pPr>
-      <w:r>
-        <w:rPr>
-          <w:rFonts w:ascii="Calibri" w:hAnsi="Calibri"/>
-          <w:sz w:val="22"/>
-        </w:rPr>
-        <w:t>VAD Profile tab</w:t>
-      </w:r>
-    </w:p>
-    <w:p>
-      <w:pPr>
-        <w:widowControl/>
-        <w:spacing w:before="0" w:after="120" w:line="300" w:lineRule="auto"/>
-      </w:pPr>
-      <w:r>
-        <w:rPr>
-          <w:rFonts w:ascii="Calibri" w:hAnsi="Calibri"/>
-          <w:sz w:val="22"/>
-        </w:rPr>
-        <w:t>This tab contains:</w:t>
+        <w:t>whether to display stopword-excluded results;</w:t>
       </w:r>
     </w:p>
     <w:p>
@@ -5314,7 +5536,7 @@
           <w:rFonts w:ascii="Calibri" w:hAnsi="Calibri"/>
           <w:sz w:val="22"/>
         </w:rPr>
-        <w:t>parallel normalized VAD charts;</w:t>
+        <w:t>concreteness lower and upper orientation thresholds;</w:t>
       </w:r>
     </w:p>
     <w:p>
@@ -5332,7 +5554,7 @@
           <w:rFonts w:ascii="Calibri" w:hAnsi="Calibri"/>
           <w:sz w:val="22"/>
         </w:rPr>
-        <w:t>definitions of valence, arousal, and dominance;</w:t>
+        <w:t>whether concreteness excludes model-tagged proper nouns;</w:t>
       </w:r>
     </w:p>
     <w:p>
@@ -5350,7 +5572,7 @@
           <w:rFonts w:ascii="Calibri" w:hAnsi="Calibri"/>
           <w:sz w:val="22"/>
         </w:rPr>
-        <w:t>token- and type-weighted values for each analysis view;</w:t>
+        <w:t>whether source-supplied concreteness phrases are activated; and</w:t>
       </w:r>
     </w:p>
     <w:p>
@@ -5368,7 +5590,138 @@
           <w:rFonts w:ascii="Calibri" w:hAnsi="Calibri"/>
           <w:sz w:val="22"/>
         </w:rPr>
-        <w:t>plain-language midpoint interpretations;</w:t>
+        <w:t>the concreteness low-coverage caution threshold.</w:t>
+      </w:r>
+    </w:p>
+    <w:p>
+      <w:pPr>
+        <w:widowControl/>
+        <w:spacing w:before="0" w:after="120" w:line="300" w:lineRule="auto"/>
+      </w:pPr>
+      <w:r>
+        <w:rPr>
+          <w:rFonts w:ascii="Calibri" w:hAnsi="Calibri"/>
+          <w:sz w:val="22"/>
+        </w:rPr>
+        <w:t xml:space="preserve">Under </w:t>
+      </w:r>
+      <w:r>
+        <w:rPr>
+          <w:rFonts w:ascii="Calibri" w:hAnsi="Calibri"/>
+          <w:b/>
+          <w:sz w:val="22"/>
+        </w:rPr>
+        <w:t>Stopword settings</w:t>
+      </w:r>
+      <w:r>
+        <w:rPr>
+          <w:rFonts w:ascii="Calibri" w:hAnsi="Calibri"/>
+          <w:sz w:val="22"/>
+        </w:rPr>
+        <w:t>, inspect or change the secondary-view policy. The all-matched result is always preserved even when only one view is displayed.</w:t>
+      </w:r>
+    </w:p>
+    <w:p>
+      <w:pPr>
+        <w:pStyle w:val="Heading2"/>
+      </w:pPr>
+      <w:r>
+        <w:rPr>
+          <w:rFonts w:ascii="Calibri" w:hAnsi="Calibri"/>
+          <w:sz w:val="22"/>
+        </w:rPr>
+        <w:t>Overview tab</w:t>
+      </w:r>
+    </w:p>
+    <w:p>
+      <w:pPr>
+        <w:widowControl/>
+        <w:spacing w:before="0" w:after="120" w:line="300" w:lineRule="auto"/>
+      </w:pPr>
+      <w:r>
+        <w:rPr>
+          <w:rFonts w:ascii="Calibri" w:hAnsi="Calibri"/>
+          <w:sz w:val="22"/>
+        </w:rPr>
+        <w:t>Read coverage before means. The tab shows ordinary and content-focused coverage, matched counts, active methodology, excluded stopword counts, interpretive framing, and warnings.</w:t>
+      </w:r>
+    </w:p>
+    <w:p>
+      <w:pPr>
+        <w:pStyle w:val="Heading2"/>
+      </w:pPr>
+      <w:r>
+        <w:rPr>
+          <w:rFonts w:ascii="Calibri" w:hAnsi="Calibri"/>
+          <w:sz w:val="22"/>
+        </w:rPr>
+        <w:t>Language Profile tab</w:t>
+      </w:r>
+    </w:p>
+    <w:p>
+      <w:pPr>
+        <w:widowControl/>
+        <w:spacing w:before="0" w:after="120" w:line="300" w:lineRule="auto"/>
+      </w:pPr>
+      <w:r>
+        <w:rPr>
+          <w:rFonts w:ascii="Calibri" w:hAnsi="Calibri"/>
+          <w:sz w:val="22"/>
+        </w:rPr>
+        <w:t xml:space="preserve">The </w:t>
+      </w:r>
+      <w:r>
+        <w:rPr>
+          <w:rFonts w:ascii="Calibri" w:hAnsi="Calibri"/>
+          <w:b/>
+          <w:sz w:val="22"/>
+        </w:rPr>
+        <w:t>Shared Processing Record</w:t>
+      </w:r>
+      <w:r>
+        <w:rPr>
+          <w:rFonts w:ascii="Calibri" w:hAnsi="Calibri"/>
+          <w:sz w:val="22"/>
+        </w:rPr>
+        <w:t xml:space="preserve"> first reports stanzas, physical lines, model sentences, total and lexical tokens, recipe/configuration IDs, model pipeline, dependency coverage, named-entity status, and processing cautions. It is the common local representation used by every selected lexicon.</w:t>
+      </w:r>
+    </w:p>
+    <w:p>
+      <w:pPr>
+        <w:widowControl/>
+        <w:spacing w:before="0" w:after="120" w:line="300" w:lineRule="auto"/>
+      </w:pPr>
+      <w:r>
+        <w:rPr>
+          <w:rFonts w:ascii="Calibri" w:hAnsi="Calibri"/>
+          <w:sz w:val="22"/>
+        </w:rPr>
+        <w:t>The tab then reports part-of-speech counts and relative shares for all eligible lexical tokens, independently of lexicon coverage. It also shows unique normalized types and example forms. The denominator is displayed, and a caution explains that the labels are model-generated.</w:t>
+      </w:r>
+    </w:p>
+    <w:p>
+      <w:pPr>
+        <w:pStyle w:val="Heading2"/>
+      </w:pPr>
+      <w:r>
+        <w:rPr>
+          <w:rFonts w:ascii="Calibri" w:hAnsi="Calibri"/>
+          <w:sz w:val="22"/>
+        </w:rPr>
+        <w:t>VAD Profile tab</w:t>
+      </w:r>
+    </w:p>
+    <w:p>
+      <w:pPr>
+        <w:widowControl/>
+        <w:spacing w:before="0" w:after="120" w:line="300" w:lineRule="auto"/>
+      </w:pPr>
+      <w:r>
+        <w:rPr>
+          <w:rFonts w:ascii="Calibri" w:hAnsi="Calibri"/>
+          <w:sz w:val="22"/>
+        </w:rPr>
+        <w:t>This tab contains:</w:t>
       </w:r>
     </w:p>
     <w:p>
@@ -5386,7 +5739,7 @@
           <w:rFonts w:ascii="Calibri" w:hAnsi="Calibri"/>
           <w:sz w:val="22"/>
         </w:rPr>
-        <w:t>population dispersion;</w:t>
+        <w:t>parallel normalized VAD charts;</w:t>
       </w:r>
     </w:p>
     <w:p>
@@ -5404,7 +5757,7 @@
           <w:rFonts w:ascii="Calibri" w:hAnsi="Calibri"/>
           <w:sz w:val="22"/>
         </w:rPr>
-        <w:t>stopword-sensitivity differences;</w:t>
+        <w:t>definitions of valence, arousal, and dominance;</w:t>
       </w:r>
     </w:p>
     <w:p>
@@ -5422,7 +5775,7 @@
           <w:rFonts w:ascii="Calibri" w:hAnsi="Calibri"/>
           <w:sz w:val="22"/>
         </w:rPr>
-        <w:t>cumulative normalized totals;</w:t>
+        <w:t>token- and type-weighted values for each analysis view;</w:t>
       </w:r>
     </w:p>
     <w:p>
@@ -5440,7 +5793,7 @@
           <w:rFonts w:ascii="Calibri" w:hAnsi="Calibri"/>
           <w:sz w:val="22"/>
         </w:rPr>
-        <w:t>top midpoint-centered contributors;</w:t>
+        <w:t>plain-language midpoint interpretations;</w:t>
       </w:r>
     </w:p>
     <w:p>
@@ -5458,6 +5811,78 @@
           <w:rFonts w:ascii="Calibri" w:hAnsi="Calibri"/>
           <w:sz w:val="22"/>
         </w:rPr>
+        <w:t>population dispersion;</w:t>
+      </w:r>
+    </w:p>
+    <w:p>
+      <w:pPr>
+        <w:widowControl/>
+        <w:numPr>
+          <w:ilvl w:val="0"/>
+          <w:numId w:val="10"/>
+        </w:numPr>
+        <w:spacing w:before="0" w:after="80" w:line="300" w:lineRule="auto"/>
+        <w:ind w:left="540" w:hanging="271"/>
+      </w:pPr>
+      <w:r>
+        <w:rPr>
+          <w:rFonts w:ascii="Calibri" w:hAnsi="Calibri"/>
+          <w:sz w:val="22"/>
+        </w:rPr>
+        <w:t>stopword-sensitivity differences;</w:t>
+      </w:r>
+    </w:p>
+    <w:p>
+      <w:pPr>
+        <w:widowControl/>
+        <w:numPr>
+          <w:ilvl w:val="0"/>
+          <w:numId w:val="10"/>
+        </w:numPr>
+        <w:spacing w:before="0" w:after="80" w:line="300" w:lineRule="auto"/>
+        <w:ind w:left="540" w:hanging="271"/>
+      </w:pPr>
+      <w:r>
+        <w:rPr>
+          <w:rFonts w:ascii="Calibri" w:hAnsi="Calibri"/>
+          <w:sz w:val="22"/>
+        </w:rPr>
+        <w:t>cumulative normalized totals;</w:t>
+      </w:r>
+    </w:p>
+    <w:p>
+      <w:pPr>
+        <w:widowControl/>
+        <w:numPr>
+          <w:ilvl w:val="0"/>
+          <w:numId w:val="10"/>
+        </w:numPr>
+        <w:spacing w:before="0" w:after="80" w:line="300" w:lineRule="auto"/>
+        <w:ind w:left="540" w:hanging="271"/>
+      </w:pPr>
+      <w:r>
+        <w:rPr>
+          <w:rFonts w:ascii="Calibri" w:hAnsi="Calibri"/>
+          <w:sz w:val="22"/>
+        </w:rPr>
+        <w:t>top midpoint-centered contributors;</w:t>
+      </w:r>
+    </w:p>
+    <w:p>
+      <w:pPr>
+        <w:widowControl/>
+        <w:numPr>
+          <w:ilvl w:val="0"/>
+          <w:numId w:val="10"/>
+        </w:numPr>
+        <w:spacing w:before="0" w:after="80" w:line="300" w:lineRule="auto"/>
+        <w:ind w:left="540" w:hanging="271"/>
+      </w:pPr>
+      <w:r>
+        <w:rPr>
+          <w:rFonts w:ascii="Calibri" w:hAnsi="Calibri"/>
+          <w:sz w:val="22"/>
+        </w:rPr>
         <w:t>original source scales and normalization formulas.</w:t>
       </w:r>
     </w:p>
@@ -5484,6 +5909,44 @@
           <w:sz w:val="22"/>
         </w:rPr>
         <w:t>The eight emotion associations, positive/negative sentiment associations, and numeric emotion intensities appear in three separate sections. Do not compare their values as though they were alternate VAD scales.</w:t>
+      </w:r>
+    </w:p>
+    <w:p>
+      <w:pPr>
+        <w:pStyle w:val="Heading2"/>
+      </w:pPr>
+      <w:r>
+        <w:rPr>
+          <w:rFonts w:ascii="Calibri" w:hAnsi="Calibri"/>
+          <w:sz w:val="22"/>
+        </w:rPr>
+        <w:t>Concreteness Profile tab</w:t>
+      </w:r>
+    </w:p>
+    <w:p>
+      <w:pPr>
+        <w:widowControl/>
+        <w:spacing w:before="0" w:after="120" w:line="300" w:lineRule="auto"/>
+      </w:pPr>
+      <w:r>
+        <w:rPr>
+          <w:rFonts w:ascii="Calibri" w:hAnsi="Calibri"/>
+          <w:sz w:val="22"/>
+        </w:rPr>
+        <w:t>This tab appears as the dedicated home for the optional result. It shows overall 1-5 source-scale statistics, token/type coverage, configured bands, warnings, line and stanza patterns, model-assigned POS groups, represented term extremes, a token audit, and source/configuration provenance. Exact surface, exact phrase, lemma, documented fallback, unmatched, and ineligible rows stay distinct.</w:t>
+      </w:r>
+    </w:p>
+    <w:p>
+      <w:pPr>
+        <w:widowControl/>
+        <w:spacing w:before="0" w:after="120" w:line="300" w:lineRule="auto"/>
+      </w:pPr>
+      <w:r>
+        <w:rPr>
+          <w:rFonts w:ascii="Calibri" w:hAnsi="Calibri"/>
+          <w:sz w:val="22"/>
+        </w:rPr>
+        <w:t>The source workbook is read-only. If it is missing, changed, malformed, or unsupported, the checkbox is unavailable and VerseVAD presents a plain-language status instead of partially activating the module.</w:t>
       </w:r>
     </w:p>
     <w:p>
@@ -8645,6 +9108,354 @@
           </w:p>
         </w:tc>
       </w:tr>
+      <w:tr>
+        <w:trPr>
+          <w:cantSplit w:val="true"/>
+        </w:trPr>
+        <w:tc>
+          <w:tcPr>
+            <w:tcW w:type="dxa" w:w="3600"/>
+            <w:vAlign w:val="center"/>
+            <w:tcMar>
+              <w:top w:w="80" w:type="dxa"/>
+              <w:bottom w:w="80" w:type="dxa"/>
+              <w:start w:w="120" w:type="dxa"/>
+              <w:end w:w="120" w:type="dxa"/>
+            </w:tcMar>
+          </w:tcPr>
+          <w:p>
+            <w:pPr>
+              <w:widowControl/>
+              <w:spacing w:before="0" w:after="0" w:line="252" w:lineRule="auto"/>
+            </w:pPr>
+            <w:r/>
+            <w:r>
+              <w:rPr>
+                <w:rFonts w:ascii="Consolas" w:hAnsi="Consolas"/>
+                <w:color w:val="1F4D78"/>
+                <w:sz w:val="17"/>
+              </w:rPr>
+              <w:t>concreteness_summary.csv</w:t>
+            </w:r>
+          </w:p>
+        </w:tc>
+        <w:tc>
+          <w:tcPr>
+            <w:tcW w:type="dxa" w:w="5760"/>
+            <w:vAlign w:val="center"/>
+            <w:tcMar>
+              <w:top w:w="80" w:type="dxa"/>
+              <w:bottom w:w="80" w:type="dxa"/>
+              <w:start w:w="120" w:type="dxa"/>
+              <w:end w:w="120" w:type="dxa"/>
+            </w:tcMar>
+          </w:tcPr>
+          <w:p>
+            <w:pPr>
+              <w:widowControl/>
+              <w:spacing w:before="0" w:after="0" w:line="252" w:lineRule="auto"/>
+            </w:pPr>
+            <w:r/>
+            <w:r>
+              <w:rPr>
+                <w:rFonts w:ascii="Calibri" w:hAnsi="Calibri"/>
+                <w:sz w:val="18"/>
+              </w:rPr>
+              <w:t>Overall source-scale statistics, thresholds, token/type coverage, and source identity when the module is enabled</w:t>
+            </w:r>
+          </w:p>
+        </w:tc>
+      </w:tr>
+      <w:tr>
+        <w:trPr>
+          <w:cantSplit w:val="true"/>
+        </w:trPr>
+        <w:tc>
+          <w:tcPr>
+            <w:tcW w:type="dxa" w:w="3600"/>
+            <w:vAlign w:val="center"/>
+            <w:tcMar>
+              <w:top w:w="80" w:type="dxa"/>
+              <w:bottom w:w="80" w:type="dxa"/>
+              <w:start w:w="120" w:type="dxa"/>
+              <w:end w:w="120" w:type="dxa"/>
+            </w:tcMar>
+          </w:tcPr>
+          <w:p>
+            <w:pPr>
+              <w:widowControl/>
+              <w:spacing w:before="0" w:after="0" w:line="252" w:lineRule="auto"/>
+            </w:pPr>
+            <w:r/>
+            <w:r>
+              <w:rPr>
+                <w:rFonts w:ascii="Consolas" w:hAnsi="Consolas"/>
+                <w:color w:val="1F4D78"/>
+                <w:sz w:val="17"/>
+              </w:rPr>
+              <w:t>concreteness_by_structure.csv</w:t>
+            </w:r>
+          </w:p>
+        </w:tc>
+        <w:tc>
+          <w:tcPr>
+            <w:tcW w:type="dxa" w:w="5760"/>
+            <w:vAlign w:val="center"/>
+            <w:tcMar>
+              <w:top w:w="80" w:type="dxa"/>
+              <w:bottom w:w="80" w:type="dxa"/>
+              <w:start w:w="120" w:type="dxa"/>
+              <w:end w:w="120" w:type="dxa"/>
+            </w:tcMar>
+          </w:tcPr>
+          <w:p>
+            <w:pPr>
+              <w:widowControl/>
+              <w:spacing w:before="0" w:after="0" w:line="252" w:lineRule="auto"/>
+            </w:pPr>
+            <w:r/>
+            <w:r>
+              <w:rPr>
+                <w:rFonts w:ascii="Calibri" w:hAnsi="Calibri"/>
+                <w:sz w:val="18"/>
+              </w:rPr>
+              <w:t>Physical-line and stanza summaries with eligible/rated counts and coverage</w:t>
+            </w:r>
+          </w:p>
+        </w:tc>
+      </w:tr>
+      <w:tr>
+        <w:trPr>
+          <w:cantSplit w:val="true"/>
+        </w:trPr>
+        <w:tc>
+          <w:tcPr>
+            <w:tcW w:type="dxa" w:w="3600"/>
+            <w:vAlign w:val="center"/>
+            <w:tcMar>
+              <w:top w:w="80" w:type="dxa"/>
+              <w:bottom w:w="80" w:type="dxa"/>
+              <w:start w:w="120" w:type="dxa"/>
+              <w:end w:w="120" w:type="dxa"/>
+            </w:tcMar>
+          </w:tcPr>
+          <w:p>
+            <w:pPr>
+              <w:widowControl/>
+              <w:spacing w:before="0" w:after="0" w:line="252" w:lineRule="auto"/>
+            </w:pPr>
+            <w:r/>
+            <w:r>
+              <w:rPr>
+                <w:rFonts w:ascii="Consolas" w:hAnsi="Consolas"/>
+                <w:color w:val="1F4D78"/>
+                <w:sz w:val="17"/>
+              </w:rPr>
+              <w:t>concreteness_by_pos.csv</w:t>
+            </w:r>
+          </w:p>
+        </w:tc>
+        <w:tc>
+          <w:tcPr>
+            <w:tcW w:type="dxa" w:w="5760"/>
+            <w:vAlign w:val="center"/>
+            <w:tcMar>
+              <w:top w:w="80" w:type="dxa"/>
+              <w:bottom w:w="80" w:type="dxa"/>
+              <w:start w:w="120" w:type="dxa"/>
+              <w:end w:w="120" w:type="dxa"/>
+            </w:tcMar>
+          </w:tcPr>
+          <w:p>
+            <w:pPr>
+              <w:widowControl/>
+              <w:spacing w:before="0" w:after="0" w:line="252" w:lineRule="auto"/>
+            </w:pPr>
+            <w:r/>
+            <w:r>
+              <w:rPr>
+                <w:rFonts w:ascii="Calibri" w:hAnsi="Calibri"/>
+                <w:sz w:val="18"/>
+              </w:rPr>
+              <w:t>Model-assigned part-of-speech summaries</w:t>
+            </w:r>
+          </w:p>
+        </w:tc>
+      </w:tr>
+      <w:tr>
+        <w:trPr>
+          <w:cantSplit w:val="true"/>
+        </w:trPr>
+        <w:tc>
+          <w:tcPr>
+            <w:tcW w:type="dxa" w:w="3600"/>
+            <w:vAlign w:val="center"/>
+            <w:tcMar>
+              <w:top w:w="80" w:type="dxa"/>
+              <w:bottom w:w="80" w:type="dxa"/>
+              <w:start w:w="120" w:type="dxa"/>
+              <w:end w:w="120" w:type="dxa"/>
+            </w:tcMar>
+          </w:tcPr>
+          <w:p>
+            <w:pPr>
+              <w:widowControl/>
+              <w:spacing w:before="0" w:after="0" w:line="252" w:lineRule="auto"/>
+            </w:pPr>
+            <w:r/>
+            <w:r>
+              <w:rPr>
+                <w:rFonts w:ascii="Consolas" w:hAnsi="Consolas"/>
+                <w:color w:val="1F4D78"/>
+                <w:sz w:val="17"/>
+              </w:rPr>
+              <w:t>concreteness_terms.csv</w:t>
+            </w:r>
+          </w:p>
+        </w:tc>
+        <w:tc>
+          <w:tcPr>
+            <w:tcW w:type="dxa" w:w="5760"/>
+            <w:vAlign w:val="center"/>
+            <w:tcMar>
+              <w:top w:w="80" w:type="dxa"/>
+              <w:bottom w:w="80" w:type="dxa"/>
+              <w:start w:w="120" w:type="dxa"/>
+              <w:end w:w="120" w:type="dxa"/>
+            </w:tcMar>
+          </w:tcPr>
+          <w:p>
+            <w:pPr>
+              <w:widowControl/>
+              <w:spacing w:before="0" w:after="0" w:line="252" w:lineRule="auto"/>
+            </w:pPr>
+            <w:r/>
+            <w:r>
+              <w:rPr>
+                <w:rFonts w:ascii="Calibri" w:hAnsi="Calibri"/>
+                <w:sz w:val="18"/>
+              </w:rPr>
+              <w:t>Represented source terms, ratings, repetition, ranks, and source-row fields</w:t>
+            </w:r>
+          </w:p>
+        </w:tc>
+      </w:tr>
+      <w:tr>
+        <w:trPr>
+          <w:cantSplit w:val="true"/>
+        </w:trPr>
+        <w:tc>
+          <w:tcPr>
+            <w:tcW w:type="dxa" w:w="3600"/>
+            <w:vAlign w:val="center"/>
+            <w:tcMar>
+              <w:top w:w="80" w:type="dxa"/>
+              <w:bottom w:w="80" w:type="dxa"/>
+              <w:start w:w="120" w:type="dxa"/>
+              <w:end w:w="120" w:type="dxa"/>
+            </w:tcMar>
+          </w:tcPr>
+          <w:p>
+            <w:pPr>
+              <w:widowControl/>
+              <w:spacing w:before="0" w:after="0" w:line="252" w:lineRule="auto"/>
+            </w:pPr>
+            <w:r/>
+            <w:r>
+              <w:rPr>
+                <w:rFonts w:ascii="Consolas" w:hAnsi="Consolas"/>
+                <w:color w:val="1F4D78"/>
+                <w:sz w:val="17"/>
+              </w:rPr>
+              <w:t>concreteness_token_audit.csv</w:t>
+            </w:r>
+          </w:p>
+        </w:tc>
+        <w:tc>
+          <w:tcPr>
+            <w:tcW w:type="dxa" w:w="5760"/>
+            <w:vAlign w:val="center"/>
+            <w:tcMar>
+              <w:top w:w="80" w:type="dxa"/>
+              <w:bottom w:w="80" w:type="dxa"/>
+              <w:start w:w="120" w:type="dxa"/>
+              <w:end w:w="120" w:type="dxa"/>
+            </w:tcMar>
+          </w:tcPr>
+          <w:p>
+            <w:pPr>
+              <w:widowControl/>
+              <w:spacing w:before="0" w:after="0" w:line="252" w:lineRule="auto"/>
+            </w:pPr>
+            <w:r/>
+            <w:r>
+              <w:rPr>
+                <w:rFonts w:ascii="Calibri" w:hAnsi="Calibri"/>
+                <w:sz w:val="18"/>
+              </w:rPr>
+              <w:t>Every token's eligibility, matching method, group, source row, rating or missing value, and reason</w:t>
+            </w:r>
+          </w:p>
+        </w:tc>
+      </w:tr>
+      <w:tr>
+        <w:trPr>
+          <w:cantSplit w:val="true"/>
+        </w:trPr>
+        <w:tc>
+          <w:tcPr>
+            <w:tcW w:type="dxa" w:w="3600"/>
+            <w:vAlign w:val="center"/>
+            <w:tcMar>
+              <w:top w:w="80" w:type="dxa"/>
+              <w:bottom w:w="80" w:type="dxa"/>
+              <w:start w:w="120" w:type="dxa"/>
+              <w:end w:w="120" w:type="dxa"/>
+            </w:tcMar>
+          </w:tcPr>
+          <w:p>
+            <w:pPr>
+              <w:widowControl/>
+              <w:spacing w:before="0" w:after="0" w:line="252" w:lineRule="auto"/>
+            </w:pPr>
+            <w:r/>
+            <w:r>
+              <w:rPr>
+                <w:rFonts w:ascii="Consolas" w:hAnsi="Consolas"/>
+                <w:color w:val="1F4D78"/>
+                <w:sz w:val="17"/>
+              </w:rPr>
+              <w:t>concreteness_result.json</w:t>
+            </w:r>
+          </w:p>
+        </w:tc>
+        <w:tc>
+          <w:tcPr>
+            <w:tcW w:type="dxa" w:w="5760"/>
+            <w:vAlign w:val="center"/>
+            <w:tcMar>
+              <w:top w:w="80" w:type="dxa"/>
+              <w:bottom w:w="80" w:type="dxa"/>
+              <w:start w:w="120" w:type="dxa"/>
+              <w:end w:w="120" w:type="dxa"/>
+            </w:tcMar>
+          </w:tcPr>
+          <w:p>
+            <w:pPr>
+              <w:widowControl/>
+              <w:spacing w:before="0" w:after="0" w:line="252" w:lineRule="auto"/>
+            </w:pPr>
+            <w:r/>
+            <w:r>
+              <w:rPr>
+                <w:rFonts w:ascii="Calibri" w:hAnsi="Calibri"/>
+                <w:sz w:val="18"/>
+              </w:rPr>
+              <w:t>Complete structured concreteness result, configuration, warnings, and provenance</w:t>
+            </w:r>
+          </w:p>
+        </w:tc>
+      </w:tr>
     </w:tbl>
     <w:p>
       <w:pPr>
@@ -8662,7 +9473,7 @@
           <w:rFonts w:ascii="Calibri" w:hAnsi="Calibri"/>
           <w:sz w:val="22"/>
         </w:rPr>
-        <w:t xml:space="preserve">CSV files use UTF-8 with a byte-order mark for compatibility with current Excel versions. The two JSON files preserve complementary machine-readable records: </w:t>
+        <w:t xml:space="preserve">CSV files use UTF-8 with a byte-order mark for compatibility with current Excel versions. The JSON files preserve complementary machine-readable records: </w:t>
       </w:r>
       <w:r>
         <w:rPr>
@@ -8677,7 +9488,7 @@
           <w:rFonts w:ascii="Calibri" w:hAnsi="Calibri"/>
           <w:sz w:val="22"/>
         </w:rPr>
-        <w:t xml:space="preserve"> contains the complete affective analysis, while </w:t>
+        <w:t xml:space="preserve"> contains the complete affective analysis, </w:t>
       </w:r>
       <w:r>
         <w:rPr>
@@ -8692,7 +9503,37 @@
           <w:rFonts w:ascii="Calibri" w:hAnsi="Calibri"/>
           <w:sz w:val="22"/>
         </w:rPr>
-        <w:t xml:space="preserve"> contains its shared processing representation. The latter includes the original text, so protect it as research material. The scholar summary is the easiest reading aid.</w:t>
+        <w:t xml:space="preserve"> contains its shared processing representation, and </w:t>
+      </w:r>
+      <w:r>
+        <w:rPr>
+          <w:rFonts w:ascii="Consolas" w:hAnsi="Consolas"/>
+          <w:color w:val="1F4D78"/>
+          <w:sz w:val="19"/>
+        </w:rPr>
+        <w:t>concreteness_result.json</w:t>
+      </w:r>
+      <w:r>
+        <w:rPr>
+          <w:rFonts w:ascii="Calibri" w:hAnsi="Calibri"/>
+          <w:sz w:val="22"/>
+        </w:rPr>
+        <w:t xml:space="preserve"> contains the optional normative lexical concreteness result. </w:t>
+      </w:r>
+      <w:r>
+        <w:rPr>
+          <w:rFonts w:ascii="Consolas" w:hAnsi="Consolas"/>
+          <w:color w:val="1F4D78"/>
+          <w:sz w:val="19"/>
+        </w:rPr>
+        <w:t>poem_document.json</w:t>
+      </w:r>
+      <w:r>
+        <w:rPr>
+          <w:rFonts w:ascii="Calibri" w:hAnsi="Calibri"/>
+          <w:sz w:val="22"/>
+        </w:rPr>
+        <w:t xml:space="preserve"> includes the original text, so protect it as research material. Concreteness exports retain source-row provenance but do not copy the 39,954-row ratings workbook. The scholar summary is the easiest reading aid.</w:t>
       </w:r>
     </w:p>
     <w:p>
@@ -10038,6 +10879,141 @@
           <w:rFonts w:ascii="Calibri" w:hAnsi="Calibri"/>
           <w:sz w:val="22"/>
         </w:rPr>
+        <w:t>Concreteness statistics and coverage</w:t>
+      </w:r>
+    </w:p>
+    <w:p>
+      <w:pPr>
+        <w:widowControl/>
+        <w:spacing w:before="0" w:after="120" w:line="300" w:lineRule="auto"/>
+      </w:pPr>
+      <w:r>
+        <w:rPr>
+          <w:rFonts w:ascii="Calibri" w:hAnsi="Calibri"/>
+          <w:sz w:val="22"/>
+        </w:rPr>
+        <w:t xml:space="preserve">Let </w:t>
+      </w:r>
+      <w:r>
+        <w:rPr>
+          <w:rFonts w:ascii="Consolas" w:hAnsi="Consolas"/>
+          <w:color w:val="1F4D78"/>
+          <w:sz w:val="19"/>
+        </w:rPr>
+        <w:t>c_i</w:t>
+      </w:r>
+      <w:r>
+        <w:rPr>
+          <w:rFonts w:ascii="Calibri" w:hAnsi="Calibri"/>
+          <w:sz w:val="22"/>
+        </w:rPr>
+        <w:t xml:space="preserve"> be the original 1-5 concreteness rating assigned to rated lexical-token position </w:t>
+      </w:r>
+      <w:r>
+        <w:rPr>
+          <w:rFonts w:ascii="Consolas" w:hAnsi="Consolas"/>
+          <w:color w:val="1F4D78"/>
+          <w:sz w:val="19"/>
+        </w:rPr>
+        <w:t>i</w:t>
+      </w:r>
+      <w:r>
+        <w:rPr>
+          <w:rFonts w:ascii="Calibri" w:hAnsi="Calibri"/>
+          <w:sz w:val="22"/>
+        </w:rPr>
+        <w:t xml:space="preserve">, and let </w:t>
+      </w:r>
+      <w:r>
+        <w:rPr>
+          <w:rFonts w:ascii="Consolas" w:hAnsi="Consolas"/>
+          <w:color w:val="1F4D78"/>
+          <w:sz w:val="19"/>
+        </w:rPr>
+        <w:t>R</w:t>
+      </w:r>
+      <w:r>
+        <w:rPr>
+          <w:rFonts w:ascii="Calibri" w:hAnsi="Calibri"/>
+          <w:sz w:val="22"/>
+        </w:rPr>
+        <w:t xml:space="preserve"> be the number of rated token positions.</w:t>
+      </w:r>
+    </w:p>
+    <w:p>
+      <w:pPr>
+        <w:pStyle w:val="Formula"/>
+      </w:pPr>
+      <w:r>
+        <w:rPr>
+          <w:rFonts w:ascii="Consolas" w:hAnsi="Consolas"/>
+          <w:color w:val="1F4D78"/>
+          <w:sz w:val="19"/>
+        </w:rPr>
+        <w:t>mean_concreteness = sum(c_i) / R</w:t>
+      </w:r>
+    </w:p>
+    <w:p>
+      <w:pPr>
+        <w:pStyle w:val="Formula"/>
+      </w:pPr>
+      <w:r>
+        <w:rPr>
+          <w:rFonts w:ascii="Consolas" w:hAnsi="Consolas"/>
+          <w:color w:val="1F4D78"/>
+          <w:sz w:val="19"/>
+        </w:rPr>
+        <w:t>SD_population = sqrt(sum((c_i - mean_concreteness)^2) / R)</w:t>
+      </w:r>
+    </w:p>
+    <w:p>
+      <w:pPr>
+        <w:pStyle w:val="Formula"/>
+      </w:pPr>
+      <w:r>
+        <w:rPr>
+          <w:rFonts w:ascii="Consolas" w:hAnsi="Consolas"/>
+          <w:color w:val="1F4D78"/>
+          <w:sz w:val="19"/>
+        </w:rPr>
+        <w:t>concreteness_token_coverage = rated eligible lexical-token positions / eligible lexical-token positions</w:t>
+      </w:r>
+    </w:p>
+    <w:p>
+      <w:pPr>
+        <w:pStyle w:val="Formula"/>
+      </w:pPr>
+      <w:r>
+        <w:rPr>
+          <w:rFonts w:ascii="Consolas" w:hAnsi="Consolas"/>
+          <w:color w:val="1F4D78"/>
+          <w:sz w:val="19"/>
+        </w:rPr>
+        <w:t>concreteness_type_coverage = rated unique normalized-surface types / eligible unique normalized-surface types</w:t>
+      </w:r>
+    </w:p>
+    <w:p>
+      <w:pPr>
+        <w:widowControl/>
+        <w:spacing w:before="0" w:after="120" w:line="300" w:lineRule="auto"/>
+      </w:pPr>
+      <w:r>
+        <w:rPr>
+          <w:rFonts w:ascii="Calibri" w:hAnsi="Calibri"/>
+          <w:sz w:val="22"/>
+        </w:rPr>
+        <w:t>The module also reports median, inclusive quartiles, and interquartile range. A source-supplied two-word expression assigns its rating to each of its two covered token positions for these token-weighted formulas; both audit rows retain one shared match-group ID. Empty denominators remain missing.</w:t>
+      </w:r>
+    </w:p>
+    <w:p>
+      <w:pPr>
+        <w:pStyle w:val="Heading2"/>
+      </w:pPr>
+      <w:r>
+        <w:rPr>
+          <w:rFonts w:ascii="Calibri" w:hAnsi="Calibri"/>
+          <w:sz w:val="22"/>
+        </w:rPr>
         <w:t>Part-of-speech share</w:t>
       </w:r>
     </w:p>
@@ -10721,8 +11697,8 @@
         </w:tblBorders>
       </w:tblPr>
       <w:tblGrid>
-        <w:gridCol w:w="2700"/>
-        <w:gridCol w:w="6660"/>
+        <w:gridCol w:w="3600"/>
+        <w:gridCol w:w="5760"/>
       </w:tblGrid>
       <w:tr>
         <w:trPr>
@@ -10731,7 +11707,7 @@
         </w:trPr>
         <w:tc>
           <w:tcPr>
-            <w:tcW w:type="dxa" w:w="2700"/>
+            <w:tcW w:type="dxa" w:w="3600"/>
             <w:vAlign w:val="center"/>
             <w:tcMar>
               <w:top w:w="80" w:type="dxa"/>
@@ -10766,7 +11742,7 @@
         </w:tc>
         <w:tc>
           <w:tcPr>
-            <w:tcW w:type="dxa" w:w="6660"/>
+            <w:tcW w:type="dxa" w:w="5760"/>
             <w:vAlign w:val="center"/>
             <w:tcMar>
               <w:top w:w="80" w:type="dxa"/>
@@ -10806,7 +11782,7 @@
         </w:trPr>
         <w:tc>
           <w:tcPr>
-            <w:tcW w:type="dxa" w:w="2700"/>
+            <w:tcW w:type="dxa" w:w="3600"/>
             <w:vAlign w:val="center"/>
             <w:tcMar>
               <w:top w:w="80" w:type="dxa"/>
@@ -10832,7 +11808,7 @@
         </w:tc>
         <w:tc>
           <w:tcPr>
-            <w:tcW w:type="dxa" w:w="6660"/>
+            <w:tcW w:type="dxa" w:w="5760"/>
             <w:vAlign w:val="center"/>
             <w:tcMar>
               <w:top w:w="80" w:type="dxa"/>
@@ -10863,7 +11839,7 @@
         </w:trPr>
         <w:tc>
           <w:tcPr>
-            <w:tcW w:type="dxa" w:w="2700"/>
+            <w:tcW w:type="dxa" w:w="3600"/>
             <w:vAlign w:val="center"/>
             <w:tcMar>
               <w:top w:w="80" w:type="dxa"/>
@@ -10889,7 +11865,7 @@
         </w:tc>
         <w:tc>
           <w:tcPr>
-            <w:tcW w:type="dxa" w:w="6660"/>
+            <w:tcW w:type="dxa" w:w="5760"/>
             <w:vAlign w:val="center"/>
             <w:tcMar>
               <w:top w:w="80" w:type="dxa"/>
@@ -10920,7 +11896,7 @@
         </w:trPr>
         <w:tc>
           <w:tcPr>
-            <w:tcW w:type="dxa" w:w="2700"/>
+            <w:tcW w:type="dxa" w:w="3600"/>
             <w:vAlign w:val="center"/>
             <w:tcMar>
               <w:top w:w="80" w:type="dxa"/>
@@ -10946,7 +11922,7 @@
         </w:tc>
         <w:tc>
           <w:tcPr>
-            <w:tcW w:type="dxa" w:w="6660"/>
+            <w:tcW w:type="dxa" w:w="5760"/>
             <w:vAlign w:val="center"/>
             <w:tcMar>
               <w:top w:w="80" w:type="dxa"/>
@@ -10993,7 +11969,7 @@
         </w:trPr>
         <w:tc>
           <w:tcPr>
-            <w:tcW w:type="dxa" w:w="2700"/>
+            <w:tcW w:type="dxa" w:w="3600"/>
             <w:vAlign w:val="center"/>
             <w:tcMar>
               <w:top w:w="80" w:type="dxa"/>
@@ -11019,7 +11995,7 @@
         </w:tc>
         <w:tc>
           <w:tcPr>
-            <w:tcW w:type="dxa" w:w="6660"/>
+            <w:tcW w:type="dxa" w:w="5760"/>
             <w:vAlign w:val="center"/>
             <w:tcMar>
               <w:top w:w="80" w:type="dxa"/>
@@ -11050,7 +12026,7 @@
         </w:trPr>
         <w:tc>
           <w:tcPr>
-            <w:tcW w:type="dxa" w:w="2700"/>
+            <w:tcW w:type="dxa" w:w="3600"/>
             <w:vAlign w:val="center"/>
             <w:tcMar>
               <w:top w:w="80" w:type="dxa"/>
@@ -11076,7 +12052,7 @@
         </w:tc>
         <w:tc>
           <w:tcPr>
-            <w:tcW w:type="dxa" w:w="6660"/>
+            <w:tcW w:type="dxa" w:w="5760"/>
             <w:vAlign w:val="center"/>
             <w:tcMar>
               <w:top w:w="80" w:type="dxa"/>
@@ -11107,7 +12083,7 @@
         </w:trPr>
         <w:tc>
           <w:tcPr>
-            <w:tcW w:type="dxa" w:w="2700"/>
+            <w:tcW w:type="dxa" w:w="3600"/>
             <w:vAlign w:val="center"/>
             <w:tcMar>
               <w:top w:w="80" w:type="dxa"/>
@@ -11133,7 +12109,7 @@
         </w:tc>
         <w:tc>
           <w:tcPr>
-            <w:tcW w:type="dxa" w:w="6660"/>
+            <w:tcW w:type="dxa" w:w="5760"/>
             <w:vAlign w:val="center"/>
             <w:tcMar>
               <w:top w:w="80" w:type="dxa"/>
@@ -11164,7 +12140,121 @@
         </w:trPr>
         <w:tc>
           <w:tcPr>
-            <w:tcW w:type="dxa" w:w="2700"/>
+            <w:tcW w:type="dxa" w:w="3600"/>
+            <w:vAlign w:val="center"/>
+            <w:tcMar>
+              <w:top w:w="80" w:type="dxa"/>
+              <w:bottom w:w="80" w:type="dxa"/>
+              <w:start w:w="120" w:type="dxa"/>
+              <w:end w:w="120" w:type="dxa"/>
+            </w:tcMar>
+          </w:tcPr>
+          <w:p>
+            <w:pPr>
+              <w:widowControl/>
+              <w:spacing w:before="0" w:after="0" w:line="252" w:lineRule="auto"/>
+            </w:pPr>
+            <w:r/>
+            <w:r>
+              <w:rPr>
+                <w:rFonts w:ascii="Calibri" w:hAnsi="Calibri"/>
+                <w:sz w:val="18"/>
+              </w:rPr>
+              <w:t>Concreteness rating</w:t>
+            </w:r>
+          </w:p>
+        </w:tc>
+        <w:tc>
+          <w:tcPr>
+            <w:tcW w:type="dxa" w:w="5760"/>
+            <w:vAlign w:val="center"/>
+            <w:tcMar>
+              <w:top w:w="80" w:type="dxa"/>
+              <w:bottom w:w="80" w:type="dxa"/>
+              <w:start w:w="120" w:type="dxa"/>
+              <w:end w:w="120" w:type="dxa"/>
+            </w:tcMar>
+          </w:tcPr>
+          <w:p>
+            <w:pPr>
+              <w:widowControl/>
+              <w:spacing w:before="0" w:after="0" w:line="252" w:lineRule="auto"/>
+            </w:pPr>
+            <w:r/>
+            <w:r>
+              <w:rPr>
+                <w:rFonts w:ascii="Calibri" w:hAnsi="Calibri"/>
+                <w:sz w:val="18"/>
+              </w:rPr>
+              <w:t>Source-supplied 1-5 normative rating for how abstract/language-based or concrete/experience-based a lexical item was judged</w:t>
+            </w:r>
+          </w:p>
+        </w:tc>
+      </w:tr>
+      <w:tr>
+        <w:trPr>
+          <w:cantSplit w:val="true"/>
+        </w:trPr>
+        <w:tc>
+          <w:tcPr>
+            <w:tcW w:type="dxa" w:w="3600"/>
+            <w:vAlign w:val="center"/>
+            <w:tcMar>
+              <w:top w:w="80" w:type="dxa"/>
+              <w:bottom w:w="80" w:type="dxa"/>
+              <w:start w:w="120" w:type="dxa"/>
+              <w:end w:w="120" w:type="dxa"/>
+            </w:tcMar>
+          </w:tcPr>
+          <w:p>
+            <w:pPr>
+              <w:widowControl/>
+              <w:spacing w:before="0" w:after="0" w:line="252" w:lineRule="auto"/>
+            </w:pPr>
+            <w:r/>
+            <w:r>
+              <w:rPr>
+                <w:rFonts w:ascii="Calibri" w:hAnsi="Calibri"/>
+                <w:sz w:val="18"/>
+              </w:rPr>
+              <w:t>Concreteness orientation band</w:t>
+            </w:r>
+          </w:p>
+        </w:tc>
+        <w:tc>
+          <w:tcPr>
+            <w:tcW w:type="dxa" w:w="5760"/>
+            <w:vAlign w:val="center"/>
+            <w:tcMar>
+              <w:top w:w="80" w:type="dxa"/>
+              <w:bottom w:w="80" w:type="dxa"/>
+              <w:start w:w="120" w:type="dxa"/>
+              <w:end w:w="120" w:type="dxa"/>
+            </w:tcMar>
+          </w:tcPr>
+          <w:p>
+            <w:pPr>
+              <w:widowControl/>
+              <w:spacing w:before="0" w:after="0" w:line="252" w:lineRule="auto"/>
+            </w:pPr>
+            <w:r/>
+            <w:r>
+              <w:rPr>
+                <w:rFonts w:ascii="Calibri" w:hAnsi="Calibri"/>
+                <w:sz w:val="18"/>
+              </w:rPr>
+              <w:t>Configurable VerseVAD display aid, not a validated source-paper category</w:t>
+            </w:r>
+          </w:p>
+        </w:tc>
+      </w:tr>
+      <w:tr>
+        <w:trPr>
+          <w:cantSplit w:val="true"/>
+        </w:trPr>
+        <w:tc>
+          <w:tcPr>
+            <w:tcW w:type="dxa" w:w="3600"/>
             <w:vAlign w:val="center"/>
             <w:tcMar>
               <w:top w:w="80" w:type="dxa"/>
@@ -11190,7 +12280,7 @@
         </w:tc>
         <w:tc>
           <w:tcPr>
-            <w:tcW w:type="dxa" w:w="6660"/>
+            <w:tcW w:type="dxa" w:w="5760"/>
             <w:vAlign w:val="center"/>
             <w:tcMar>
               <w:top w:w="80" w:type="dxa"/>
@@ -11221,7 +12311,7 @@
         </w:trPr>
         <w:tc>
           <w:tcPr>
-            <w:tcW w:type="dxa" w:w="2700"/>
+            <w:tcW w:type="dxa" w:w="3600"/>
             <w:vAlign w:val="center"/>
             <w:tcMar>
               <w:top w:w="80" w:type="dxa"/>
@@ -11247,7 +12337,7 @@
         </w:tc>
         <w:tc>
           <w:tcPr>
-            <w:tcW w:type="dxa" w:w="6660"/>
+            <w:tcW w:type="dxa" w:w="5760"/>
             <w:vAlign w:val="center"/>
             <w:tcMar>
               <w:top w:w="80" w:type="dxa"/>
@@ -11278,7 +12368,7 @@
         </w:trPr>
         <w:tc>
           <w:tcPr>
-            <w:tcW w:type="dxa" w:w="2700"/>
+            <w:tcW w:type="dxa" w:w="3600"/>
             <w:vAlign w:val="center"/>
             <w:tcMar>
               <w:top w:w="80" w:type="dxa"/>
@@ -11304,7 +12394,7 @@
         </w:tc>
         <w:tc>
           <w:tcPr>
-            <w:tcW w:type="dxa" w:w="6660"/>
+            <w:tcW w:type="dxa" w:w="5760"/>
             <w:vAlign w:val="center"/>
             <w:tcMar>
               <w:top w:w="80" w:type="dxa"/>
@@ -11335,7 +12425,7 @@
         </w:trPr>
         <w:tc>
           <w:tcPr>
-            <w:tcW w:type="dxa" w:w="2700"/>
+            <w:tcW w:type="dxa" w:w="3600"/>
             <w:vAlign w:val="center"/>
             <w:tcMar>
               <w:top w:w="80" w:type="dxa"/>
@@ -11361,7 +12451,7 @@
         </w:tc>
         <w:tc>
           <w:tcPr>
-            <w:tcW w:type="dxa" w:w="6660"/>
+            <w:tcW w:type="dxa" w:w="5760"/>
             <w:vAlign w:val="center"/>
             <w:tcMar>
               <w:top w:w="80" w:type="dxa"/>
@@ -11392,7 +12482,7 @@
         </w:trPr>
         <w:tc>
           <w:tcPr>
-            <w:tcW w:type="dxa" w:w="2700"/>
+            <w:tcW w:type="dxa" w:w="3600"/>
             <w:vAlign w:val="center"/>
             <w:tcMar>
               <w:top w:w="80" w:type="dxa"/>
@@ -11418,7 +12508,7 @@
         </w:tc>
         <w:tc>
           <w:tcPr>
-            <w:tcW w:type="dxa" w:w="6660"/>
+            <w:tcW w:type="dxa" w:w="5760"/>
             <w:vAlign w:val="center"/>
             <w:tcMar>
               <w:top w:w="80" w:type="dxa"/>
@@ -11449,7 +12539,7 @@
         </w:trPr>
         <w:tc>
           <w:tcPr>
-            <w:tcW w:type="dxa" w:w="2700"/>
+            <w:tcW w:type="dxa" w:w="3600"/>
             <w:vAlign w:val="center"/>
             <w:tcMar>
               <w:top w:w="80" w:type="dxa"/>
@@ -11475,7 +12565,7 @@
         </w:tc>
         <w:tc>
           <w:tcPr>
-            <w:tcW w:type="dxa" w:w="6660"/>
+            <w:tcW w:type="dxa" w:w="5760"/>
             <w:vAlign w:val="center"/>
             <w:tcMar>
               <w:top w:w="80" w:type="dxa"/>
@@ -11506,7 +12596,7 @@
         </w:trPr>
         <w:tc>
           <w:tcPr>
-            <w:tcW w:type="dxa" w:w="2700"/>
+            <w:tcW w:type="dxa" w:w="3600"/>
             <w:vAlign w:val="center"/>
             <w:tcMar>
               <w:top w:w="80" w:type="dxa"/>
@@ -11532,7 +12622,7 @@
         </w:tc>
         <w:tc>
           <w:tcPr>
-            <w:tcW w:type="dxa" w:w="6660"/>
+            <w:tcW w:type="dxa" w:w="5760"/>
             <w:vAlign w:val="center"/>
             <w:tcMar>
               <w:top w:w="80" w:type="dxa"/>
@@ -11563,7 +12653,7 @@
         </w:trPr>
         <w:tc>
           <w:tcPr>
-            <w:tcW w:type="dxa" w:w="2700"/>
+            <w:tcW w:type="dxa" w:w="3600"/>
             <w:vAlign w:val="center"/>
             <w:tcMar>
               <w:top w:w="80" w:type="dxa"/>
@@ -11589,7 +12679,7 @@
         </w:tc>
         <w:tc>
           <w:tcPr>
-            <w:tcW w:type="dxa" w:w="6660"/>
+            <w:tcW w:type="dxa" w:w="5760"/>
             <w:vAlign w:val="center"/>
             <w:tcMar>
               <w:top w:w="80" w:type="dxa"/>
@@ -11620,7 +12710,7 @@
         </w:trPr>
         <w:tc>
           <w:tcPr>
-            <w:tcW w:type="dxa" w:w="2700"/>
+            <w:tcW w:type="dxa" w:w="3600"/>
             <w:vAlign w:val="center"/>
             <w:tcMar>
               <w:top w:w="80" w:type="dxa"/>
@@ -11646,7 +12736,7 @@
         </w:tc>
         <w:tc>
           <w:tcPr>
-            <w:tcW w:type="dxa" w:w="6660"/>
+            <w:tcW w:type="dxa" w:w="5760"/>
             <w:vAlign w:val="center"/>
             <w:tcMar>
               <w:top w:w="80" w:type="dxa"/>
@@ -11677,7 +12767,7 @@
         </w:trPr>
         <w:tc>
           <w:tcPr>
-            <w:tcW w:type="dxa" w:w="2700"/>
+            <w:tcW w:type="dxa" w:w="3600"/>
             <w:vAlign w:val="center"/>
             <w:tcMar>
               <w:top w:w="80" w:type="dxa"/>
@@ -11703,7 +12793,7 @@
         </w:tc>
         <w:tc>
           <w:tcPr>
-            <w:tcW w:type="dxa" w:w="6660"/>
+            <w:tcW w:type="dxa" w:w="5760"/>
             <w:vAlign w:val="center"/>
             <w:tcMar>
               <w:top w:w="80" w:type="dxa"/>
@@ -11734,7 +12824,7 @@
         </w:trPr>
         <w:tc>
           <w:tcPr>
-            <w:tcW w:type="dxa" w:w="2700"/>
+            <w:tcW w:type="dxa" w:w="3600"/>
             <w:vAlign w:val="center"/>
             <w:tcMar>
               <w:top w:w="80" w:type="dxa"/>
@@ -11760,7 +12850,7 @@
         </w:tc>
         <w:tc>
           <w:tcPr>
-            <w:tcW w:type="dxa" w:w="6660"/>
+            <w:tcW w:type="dxa" w:w="5760"/>
             <w:vAlign w:val="center"/>
             <w:tcMar>
               <w:top w:w="80" w:type="dxa"/>
@@ -11791,7 +12881,7 @@
         </w:trPr>
         <w:tc>
           <w:tcPr>
-            <w:tcW w:type="dxa" w:w="2700"/>
+            <w:tcW w:type="dxa" w:w="3600"/>
             <w:vAlign w:val="center"/>
             <w:tcMar>
               <w:top w:w="80" w:type="dxa"/>
@@ -11817,7 +12907,7 @@
         </w:tc>
         <w:tc>
           <w:tcPr>
-            <w:tcW w:type="dxa" w:w="6660"/>
+            <w:tcW w:type="dxa" w:w="5760"/>
             <w:vAlign w:val="center"/>
             <w:tcMar>
               <w:top w:w="80" w:type="dxa"/>
@@ -11848,7 +12938,7 @@
         </w:trPr>
         <w:tc>
           <w:tcPr>
-            <w:tcW w:type="dxa" w:w="2700"/>
+            <w:tcW w:type="dxa" w:w="3600"/>
             <w:vAlign w:val="center"/>
             <w:tcMar>
               <w:top w:w="80" w:type="dxa"/>
@@ -11874,7 +12964,7 @@
         </w:tc>
         <w:tc>
           <w:tcPr>
-            <w:tcW w:type="dxa" w:w="6660"/>
+            <w:tcW w:type="dxa" w:w="5760"/>
             <w:vAlign w:val="center"/>
             <w:tcMar>
               <w:top w:w="80" w:type="dxa"/>
@@ -11905,7 +12995,7 @@
         </w:trPr>
         <w:tc>
           <w:tcPr>
-            <w:tcW w:type="dxa" w:w="2700"/>
+            <w:tcW w:type="dxa" w:w="3600"/>
             <w:vAlign w:val="center"/>
             <w:tcMar>
               <w:top w:w="80" w:type="dxa"/>
@@ -11931,7 +13021,7 @@
         </w:tc>
         <w:tc>
           <w:tcPr>
-            <w:tcW w:type="dxa" w:w="6660"/>
+            <w:tcW w:type="dxa" w:w="5760"/>
             <w:vAlign w:val="center"/>
             <w:tcMar>
               <w:top w:w="80" w:type="dxa"/>
@@ -11962,7 +13052,7 @@
         </w:trPr>
         <w:tc>
           <w:tcPr>
-            <w:tcW w:type="dxa" w:w="2700"/>
+            <w:tcW w:type="dxa" w:w="3600"/>
             <w:vAlign w:val="center"/>
             <w:tcMar>
               <w:top w:w="80" w:type="dxa"/>
@@ -11988,7 +13078,7 @@
         </w:tc>
         <w:tc>
           <w:tcPr>
-            <w:tcW w:type="dxa" w:w="6660"/>
+            <w:tcW w:type="dxa" w:w="5760"/>
             <w:vAlign w:val="center"/>
             <w:tcMar>
               <w:top w:w="80" w:type="dxa"/>
@@ -12019,7 +13109,7 @@
         </w:trPr>
         <w:tc>
           <w:tcPr>
-            <w:tcW w:type="dxa" w:w="2700"/>
+            <w:tcW w:type="dxa" w:w="3600"/>
             <w:vAlign w:val="center"/>
             <w:tcMar>
               <w:top w:w="80" w:type="dxa"/>
@@ -12045,7 +13135,7 @@
         </w:tc>
         <w:tc>
           <w:tcPr>
-            <w:tcW w:type="dxa" w:w="6660"/>
+            <w:tcW w:type="dxa" w:w="5760"/>
             <w:vAlign w:val="center"/>
             <w:tcMar>
               <w:top w:w="80" w:type="dxa"/>
@@ -12076,7 +13166,7 @@
         </w:trPr>
         <w:tc>
           <w:tcPr>
-            <w:tcW w:type="dxa" w:w="2700"/>
+            <w:tcW w:type="dxa" w:w="3600"/>
             <w:vAlign w:val="center"/>
             <w:tcMar>
               <w:top w:w="80" w:type="dxa"/>
@@ -12102,7 +13192,7 @@
         </w:tc>
         <w:tc>
           <w:tcPr>
-            <w:tcW w:type="dxa" w:w="6660"/>
+            <w:tcW w:type="dxa" w:w="5760"/>
             <w:vAlign w:val="center"/>
             <w:tcMar>
               <w:top w:w="80" w:type="dxa"/>
@@ -12133,7 +13223,7 @@
         </w:trPr>
         <w:tc>
           <w:tcPr>
-            <w:tcW w:type="dxa" w:w="2700"/>
+            <w:tcW w:type="dxa" w:w="3600"/>
             <w:vAlign w:val="center"/>
             <w:tcMar>
               <w:top w:w="80" w:type="dxa"/>
@@ -12159,7 +13249,7 @@
         </w:tc>
         <w:tc>
           <w:tcPr>
-            <w:tcW w:type="dxa" w:w="6660"/>
+            <w:tcW w:type="dxa" w:w="5760"/>
             <w:vAlign w:val="center"/>
             <w:tcMar>
               <w:top w:w="80" w:type="dxa"/>
@@ -12190,7 +13280,7 @@
         </w:trPr>
         <w:tc>
           <w:tcPr>
-            <w:tcW w:type="dxa" w:w="2700"/>
+            <w:tcW w:type="dxa" w:w="3600"/>
             <w:vAlign w:val="center"/>
             <w:tcMar>
               <w:top w:w="80" w:type="dxa"/>
@@ -12216,7 +13306,7 @@
         </w:tc>
         <w:tc>
           <w:tcPr>
-            <w:tcW w:type="dxa" w:w="6660"/>
+            <w:tcW w:type="dxa" w:w="5760"/>
             <w:vAlign w:val="center"/>
             <w:tcMar>
               <w:top w:w="80" w:type="dxa"/>
@@ -12247,7 +13337,7 @@
         </w:trPr>
         <w:tc>
           <w:tcPr>
-            <w:tcW w:type="dxa" w:w="2700"/>
+            <w:tcW w:type="dxa" w:w="3600"/>
             <w:vAlign w:val="center"/>
             <w:tcMar>
               <w:top w:w="80" w:type="dxa"/>
@@ -12273,7 +13363,7 @@
         </w:tc>
         <w:tc>
           <w:tcPr>
-            <w:tcW w:type="dxa" w:w="6660"/>
+            <w:tcW w:type="dxa" w:w="5760"/>
             <w:vAlign w:val="center"/>
             <w:tcMar>
               <w:top w:w="80" w:type="dxa"/>
@@ -12304,7 +13394,7 @@
         </w:trPr>
         <w:tc>
           <w:tcPr>
-            <w:tcW w:type="dxa" w:w="2700"/>
+            <w:tcW w:type="dxa" w:w="3600"/>
             <w:vAlign w:val="center"/>
             <w:tcMar>
               <w:top w:w="80" w:type="dxa"/>
@@ -12330,7 +13420,7 @@
         </w:tc>
         <w:tc>
           <w:tcPr>
-            <w:tcW w:type="dxa" w:w="6660"/>
+            <w:tcW w:type="dxa" w:w="5760"/>
             <w:vAlign w:val="center"/>
             <w:tcMar>
               <w:top w:w="80" w:type="dxa"/>
@@ -12361,7 +13451,7 @@
         </w:trPr>
         <w:tc>
           <w:tcPr>
-            <w:tcW w:type="dxa" w:w="2700"/>
+            <w:tcW w:type="dxa" w:w="3600"/>
             <w:vAlign w:val="center"/>
             <w:tcMar>
               <w:top w:w="80" w:type="dxa"/>
@@ -12387,7 +13477,7 @@
         </w:tc>
         <w:tc>
           <w:tcPr>
-            <w:tcW w:type="dxa" w:w="6660"/>
+            <w:tcW w:type="dxa" w:w="5760"/>
             <w:vAlign w:val="center"/>
             <w:tcMar>
               <w:top w:w="80" w:type="dxa"/>
@@ -12418,7 +13508,7 @@
         </w:trPr>
         <w:tc>
           <w:tcPr>
-            <w:tcW w:type="dxa" w:w="2700"/>
+            <w:tcW w:type="dxa" w:w="3600"/>
             <w:vAlign w:val="center"/>
             <w:tcMar>
               <w:top w:w="80" w:type="dxa"/>
@@ -12444,7 +13534,7 @@
         </w:tc>
         <w:tc>
           <w:tcPr>
-            <w:tcW w:type="dxa" w:w="6660"/>
+            <w:tcW w:type="dxa" w:w="5760"/>
             <w:vAlign w:val="center"/>
             <w:tcMar>
               <w:top w:w="80" w:type="dxa"/>
@@ -12475,7 +13565,7 @@
         </w:trPr>
         <w:tc>
           <w:tcPr>
-            <w:tcW w:type="dxa" w:w="2700"/>
+            <w:tcW w:type="dxa" w:w="3600"/>
             <w:vAlign w:val="center"/>
             <w:tcMar>
               <w:top w:w="80" w:type="dxa"/>
@@ -12501,7 +13591,7 @@
         </w:tc>
         <w:tc>
           <w:tcPr>
-            <w:tcW w:type="dxa" w:w="6660"/>
+            <w:tcW w:type="dxa" w:w="5760"/>
             <w:vAlign w:val="center"/>
             <w:tcMar>
               <w:top w:w="80" w:type="dxa"/>
@@ -12532,7 +13622,7 @@
         </w:trPr>
         <w:tc>
           <w:tcPr>
-            <w:tcW w:type="dxa" w:w="2700"/>
+            <w:tcW w:type="dxa" w:w="3600"/>
             <w:vAlign w:val="center"/>
             <w:tcMar>
               <w:top w:w="80" w:type="dxa"/>
@@ -12558,7 +13648,7 @@
         </w:tc>
         <w:tc>
           <w:tcPr>
-            <w:tcW w:type="dxa" w:w="6660"/>
+            <w:tcW w:type="dxa" w:w="5760"/>
             <w:vAlign w:val="center"/>
             <w:tcMar>
               <w:top w:w="80" w:type="dxa"/>
@@ -12589,7 +13679,7 @@
         </w:trPr>
         <w:tc>
           <w:tcPr>
-            <w:tcW w:type="dxa" w:w="2700"/>
+            <w:tcW w:type="dxa" w:w="3600"/>
             <w:vAlign w:val="center"/>
             <w:tcMar>
               <w:top w:w="80" w:type="dxa"/>
@@ -12615,7 +13705,7 @@
         </w:tc>
         <w:tc>
           <w:tcPr>
-            <w:tcW w:type="dxa" w:w="6660"/>
+            <w:tcW w:type="dxa" w:w="5760"/>
             <w:vAlign w:val="center"/>
             <w:tcMar>
               <w:top w:w="80" w:type="dxa"/>
@@ -12646,7 +13736,7 @@
         </w:trPr>
         <w:tc>
           <w:tcPr>
-            <w:tcW w:type="dxa" w:w="2700"/>
+            <w:tcW w:type="dxa" w:w="3600"/>
             <w:vAlign w:val="center"/>
             <w:tcMar>
               <w:top w:w="80" w:type="dxa"/>
@@ -12672,7 +13762,7 @@
         </w:tc>
         <w:tc>
           <w:tcPr>
-            <w:tcW w:type="dxa" w:w="6660"/>
+            <w:tcW w:type="dxa" w:w="5760"/>
             <w:vAlign w:val="center"/>
             <w:tcMar>
               <w:top w:w="80" w:type="dxa"/>
@@ -12703,7 +13793,7 @@
         </w:trPr>
         <w:tc>
           <w:tcPr>
-            <w:tcW w:type="dxa" w:w="2700"/>
+            <w:tcW w:type="dxa" w:w="3600"/>
             <w:vAlign w:val="center"/>
             <w:tcMar>
               <w:top w:w="80" w:type="dxa"/>
@@ -12729,7 +13819,7 @@
         </w:tc>
         <w:tc>
           <w:tcPr>
-            <w:tcW w:type="dxa" w:w="6660"/>
+            <w:tcW w:type="dxa" w:w="5760"/>
             <w:vAlign w:val="center"/>
             <w:tcMar>
               <w:top w:w="80" w:type="dxa"/>
@@ -12760,7 +13850,7 @@
         </w:trPr>
         <w:tc>
           <w:tcPr>
-            <w:tcW w:type="dxa" w:w="2700"/>
+            <w:tcW w:type="dxa" w:w="3600"/>
             <w:vAlign w:val="center"/>
             <w:tcMar>
               <w:top w:w="80" w:type="dxa"/>
@@ -12786,7 +13876,7 @@
         </w:tc>
         <w:tc>
           <w:tcPr>
-            <w:tcW w:type="dxa" w:w="6660"/>
+            <w:tcW w:type="dxa" w:w="5760"/>
             <w:vAlign w:val="center"/>
             <w:tcMar>
               <w:top w:w="80" w:type="dxa"/>
@@ -12817,7 +13907,7 @@
         </w:trPr>
         <w:tc>
           <w:tcPr>
-            <w:tcW w:type="dxa" w:w="2700"/>
+            <w:tcW w:type="dxa" w:w="3600"/>
             <w:vAlign w:val="center"/>
             <w:tcMar>
               <w:top w:w="80" w:type="dxa"/>
@@ -12843,7 +13933,7 @@
         </w:tc>
         <w:tc>
           <w:tcPr>
-            <w:tcW w:type="dxa" w:w="6660"/>
+            <w:tcW w:type="dxa" w:w="5760"/>
             <w:vAlign w:val="center"/>
             <w:tcMar>
               <w:top w:w="80" w:type="dxa"/>
@@ -13375,6 +14465,78 @@
     </w:p>
     <w:p>
       <w:pPr>
+        <w:widowControl/>
+        <w:numPr>
+          <w:ilvl w:val="0"/>
+          <w:numId w:val="10"/>
+        </w:numPr>
+        <w:spacing w:before="0" w:after="80" w:line="300" w:lineRule="auto"/>
+        <w:ind w:left="540" w:hanging="271"/>
+      </w:pPr>
+      <w:r>
+        <w:rPr>
+          <w:rFonts w:ascii="Calibri" w:hAnsi="Calibri"/>
+          <w:sz w:val="22"/>
+        </w:rPr>
+        <w:t>Concreteness ratings are decontextualized lexical norms and do not measure imagery quality, readability, cognition, or literary value.</w:t>
+      </w:r>
+    </w:p>
+    <w:p>
+      <w:pPr>
+        <w:widowControl/>
+        <w:numPr>
+          <w:ilvl w:val="0"/>
+          <w:numId w:val="10"/>
+        </w:numPr>
+        <w:spacing w:before="0" w:after="80" w:line="300" w:lineRule="auto"/>
+        <w:ind w:left="540" w:hanging="271"/>
+      </w:pPr>
+      <w:r>
+        <w:rPr>
+          <w:rFonts w:ascii="Calibri" w:hAnsi="Calibri"/>
+          <w:sz w:val="22"/>
+        </w:rPr>
+        <w:t>Concreteness orientation thresholds are VerseVAD aids rather than validated source categories.</w:t>
+      </w:r>
+    </w:p>
+    <w:p>
+      <w:pPr>
+        <w:widowControl/>
+        <w:numPr>
+          <w:ilvl w:val="0"/>
+          <w:numId w:val="10"/>
+        </w:numPr>
+        <w:spacing w:before="0" w:after="80" w:line="300" w:lineRule="auto"/>
+        <w:ind w:left="540" w:hanging="271"/>
+      </w:pPr>
+      <w:r>
+        <w:rPr>
+          <w:rFonts w:ascii="Calibri" w:hAnsi="Calibri"/>
+          <w:sz w:val="22"/>
+        </w:rPr>
+        <w:t>Default concreteness proper-name exclusion depends on a model tag that can be uncertain for poetic capitalization and syntax.</w:t>
+      </w:r>
+    </w:p>
+    <w:p>
+      <w:pPr>
+        <w:widowControl/>
+        <w:numPr>
+          <w:ilvl w:val="0"/>
+          <w:numId w:val="10"/>
+        </w:numPr>
+        <w:spacing w:before="0" w:after="80" w:line="300" w:lineRule="auto"/>
+        <w:ind w:left="540" w:hanging="271"/>
+      </w:pPr>
+      <w:r>
+        <w:rPr>
+          <w:rFonts w:ascii="Calibri" w:hAnsi="Calibri"/>
+          <w:sz w:val="22"/>
+        </w:rPr>
+        <w:t>Concreteness is currently an optional one-poem in-memory module; it is not yet persisted in corpus projects.</w:t>
+      </w:r>
+    </w:p>
+    <w:p>
+      <w:pPr>
         <w:pStyle w:val="Heading1"/>
       </w:pPr>
       <w:r>
@@ -13395,7 +14557,7 @@
           <w:rFonts w:ascii="Calibri" w:hAnsi="Calibri"/>
           <w:sz w:val="22"/>
         </w:rPr>
-        <w:t>Every analysis should retain the active lexicon, source checksum, adapter version, software version, preprocessing recipe and configuration ID, phrase policy, stopword policy, scenario, and inclusion decisions. Completed corpus runs remain linked to preserved text versions.</w:t>
+        <w:t>Every analysis should retain the active lexicon or optional research resource, source checksum, adapter version, software version, preprocessing recipe and configuration ID, phrase policy, stopword policy, scenario, and inclusion decisions. Completed corpus runs remain linked to preserved text versions. A concreteness result additionally retains its orientation thresholds, proper-name and phrase policies, low-coverage threshold, source-row matches, and exact workbook checksum.</w:t>
       </w:r>
     </w:p>
     <w:p>
@@ -13662,7 +14824,7 @@
         <w:color w:val="66727C"/>
         <w:sz w:val="18"/>
       </w:rPr>
-      <w:t xml:space="preserve">  |  0.7.0.dev0</w:t>
+      <w:t xml:space="preserve">  |  0.8.0.dev0</w:t>
     </w:r>
   </w:p>
 </w:hdr>
@@ -13839,6 +15001,174 @@
       <w:rPr>
         <w:rFonts w:ascii="Symbol" w:hAnsi="Symbol" w:hint="default"/>
       </w:rPr>
+    </w:lvl>
+  </w:abstractNum>
+  <w:abstractNum w:abstractNumId="9">
+    <w:multiLevelType w:val="singleLevel"/>
+    <w:lvl w:ilvl="0">
+      <w:start w:val="1"/>
+      <w:numFmt w:val="bullet"/>
+      <w:lvlText w:val="•"/>
+      <w:lvlJc w:val="left"/>
+      <w:pPr>
+        <w:tabs>
+          <w:tab w:val="num" w:pos="540"/>
+        </w:tabs>
+        <w:ind w:left="540" w:hanging="270"/>
+      </w:pPr>
+      <w:rPr>
+        <w:rFonts w:ascii="Calibri" w:hAnsi="Calibri"/>
+      </w:rPr>
+    </w:lvl>
+  </w:abstractNum>
+  <w:abstractNum w:abstractNumId="10">
+    <w:multiLevelType w:val="singleLevel"/>
+    <w:lvl w:ilvl="0">
+      <w:start w:val="1"/>
+      <w:numFmt w:val="decimal"/>
+      <w:lvlText w:val="%1."/>
+      <w:lvlJc w:val="left"/>
+      <w:pPr>
+        <w:tabs>
+          <w:tab w:val="num" w:pos="540"/>
+        </w:tabs>
+        <w:ind w:left="540" w:hanging="270"/>
+      </w:pPr>
+    </w:lvl>
+  </w:abstractNum>
+  <w:abstractNum w:abstractNumId="11">
+    <w:multiLevelType w:val="singleLevel"/>
+    <w:lvl w:ilvl="0">
+      <w:start w:val="1"/>
+      <w:numFmt w:val="decimal"/>
+      <w:lvlText w:val="%1."/>
+      <w:lvlJc w:val="left"/>
+      <w:pPr>
+        <w:tabs>
+          <w:tab w:val="num" w:pos="540"/>
+        </w:tabs>
+        <w:ind w:left="540" w:hanging="270"/>
+      </w:pPr>
+    </w:lvl>
+  </w:abstractNum>
+  <w:abstractNum w:abstractNumId="12">
+    <w:multiLevelType w:val="singleLevel"/>
+    <w:lvl w:ilvl="0">
+      <w:start w:val="1"/>
+      <w:numFmt w:val="decimal"/>
+      <w:lvlText w:val="%1."/>
+      <w:lvlJc w:val="left"/>
+      <w:pPr>
+        <w:tabs>
+          <w:tab w:val="num" w:pos="540"/>
+        </w:tabs>
+        <w:ind w:left="540" w:hanging="270"/>
+      </w:pPr>
+    </w:lvl>
+  </w:abstractNum>
+  <w:abstractNum w:abstractNumId="13">
+    <w:multiLevelType w:val="singleLevel"/>
+    <w:lvl w:ilvl="0">
+      <w:start w:val="1"/>
+      <w:numFmt w:val="decimal"/>
+      <w:lvlText w:val="%1."/>
+      <w:lvlJc w:val="left"/>
+      <w:pPr>
+        <w:tabs>
+          <w:tab w:val="num" w:pos="540"/>
+        </w:tabs>
+        <w:ind w:left="540" w:hanging="270"/>
+      </w:pPr>
+    </w:lvl>
+  </w:abstractNum>
+  <w:abstractNum w:abstractNumId="14">
+    <w:multiLevelType w:val="singleLevel"/>
+    <w:lvl w:ilvl="0">
+      <w:start w:val="1"/>
+      <w:numFmt w:val="decimal"/>
+      <w:lvlText w:val="%1."/>
+      <w:lvlJc w:val="left"/>
+      <w:pPr>
+        <w:tabs>
+          <w:tab w:val="num" w:pos="540"/>
+        </w:tabs>
+        <w:ind w:left="540" w:hanging="270"/>
+      </w:pPr>
+    </w:lvl>
+  </w:abstractNum>
+  <w:abstractNum w:abstractNumId="15">
+    <w:multiLevelType w:val="singleLevel"/>
+    <w:lvl w:ilvl="0">
+      <w:start w:val="1"/>
+      <w:numFmt w:val="decimal"/>
+      <w:lvlText w:val="%1."/>
+      <w:lvlJc w:val="left"/>
+      <w:pPr>
+        <w:tabs>
+          <w:tab w:val="num" w:pos="540"/>
+        </w:tabs>
+        <w:ind w:left="540" w:hanging="270"/>
+      </w:pPr>
+    </w:lvl>
+  </w:abstractNum>
+  <w:abstractNum w:abstractNumId="16">
+    <w:multiLevelType w:val="singleLevel"/>
+    <w:lvl w:ilvl="0">
+      <w:start w:val="1"/>
+      <w:numFmt w:val="decimal"/>
+      <w:lvlText w:val="%1."/>
+      <w:lvlJc w:val="left"/>
+      <w:pPr>
+        <w:tabs>
+          <w:tab w:val="num" w:pos="540"/>
+        </w:tabs>
+        <w:ind w:left="540" w:hanging="270"/>
+      </w:pPr>
+    </w:lvl>
+  </w:abstractNum>
+  <w:abstractNum w:abstractNumId="17">
+    <w:multiLevelType w:val="singleLevel"/>
+    <w:lvl w:ilvl="0">
+      <w:start w:val="1"/>
+      <w:numFmt w:val="decimal"/>
+      <w:lvlText w:val="%1."/>
+      <w:lvlJc w:val="left"/>
+      <w:pPr>
+        <w:tabs>
+          <w:tab w:val="num" w:pos="540"/>
+        </w:tabs>
+        <w:ind w:left="540" w:hanging="270"/>
+      </w:pPr>
+    </w:lvl>
+  </w:abstractNum>
+  <w:abstractNum w:abstractNumId="18">
+    <w:multiLevelType w:val="singleLevel"/>
+    <w:lvl w:ilvl="0">
+      <w:start w:val="1"/>
+      <w:numFmt w:val="decimal"/>
+      <w:lvlText w:val="%1."/>
+      <w:lvlJc w:val="left"/>
+      <w:pPr>
+        <w:tabs>
+          <w:tab w:val="num" w:pos="540"/>
+        </w:tabs>
+        <w:ind w:left="540" w:hanging="270"/>
+      </w:pPr>
+    </w:lvl>
+  </w:abstractNum>
+  <w:abstractNum w:abstractNumId="19">
+    <w:multiLevelType w:val="singleLevel"/>
+    <w:lvl w:ilvl="0">
+      <w:start w:val="1"/>
+      <w:numFmt w:val="decimal"/>
+      <w:lvlText w:val="%1."/>
+      <w:lvlJc w:val="left"/>
+      <w:pPr>
+        <w:tabs>
+          <w:tab w:val="num" w:pos="540"/>
+        </w:tabs>
+        <w:ind w:left="540" w:hanging="270"/>
+      </w:pPr>
     </w:lvl>
   </w:abstractNum>
   <w:num w:numId="1">
@@ -13868,206 +15198,68 @@
   <w:num w:numId="9">
     <w:abstractNumId w:val="0"/>
   </w:num>
-  <w:abstractNum w:abstractNumId="9">
-    <w:multiLevelType w:val="singleLevel"/>
-    <w:lvl w:ilvl="0">
-      <w:start w:val="1"/>
-      <w:numFmt w:val="bullet"/>
-      <w:lvlText w:val="•"/>
-      <w:lvlJc w:val="left"/>
-      <w:pPr>
-        <w:tabs>
-          <w:tab w:val="num" w:pos="540"/>
-        </w:tabs>
-        <w:ind w:left="540" w:hanging="270"/>
-      </w:pPr>
-      <w:rPr>
-        <w:rFonts w:ascii="Calibri" w:hAnsi="Calibri"/>
-      </w:rPr>
-    </w:lvl>
-  </w:abstractNum>
   <w:num w:numId="10">
     <w:abstractNumId w:val="9"/>
   </w:num>
-  <w:abstractNum w:abstractNumId="10">
-    <w:multiLevelType w:val="singleLevel"/>
-    <w:lvl w:ilvl="0">
-      <w:start w:val="1"/>
-      <w:numFmt w:val="decimal"/>
-      <w:lvlText w:val="%1."/>
-      <w:lvlJc w:val="left"/>
-      <w:pPr>
-        <w:tabs>
-          <w:tab w:val="num" w:pos="540"/>
-        </w:tabs>
-        <w:ind w:left="540" w:hanging="270"/>
-      </w:pPr>
-    </w:lvl>
-  </w:abstractNum>
   <w:num w:numId="11">
     <w:abstractNumId w:val="10"/>
+    <w:lvlOverride w:ilvl="0">
+      <w:startOverride w:val="1"/>
+    </w:lvlOverride>
   </w:num>
-  <w:abstractNum w:abstractNumId="11">
-    <w:multiLevelType w:val="singleLevel"/>
-    <w:lvl w:ilvl="0">
-      <w:start w:val="1"/>
-      <w:numFmt w:val="decimal"/>
-      <w:lvlText w:val="%1."/>
-      <w:lvlJc w:val="left"/>
-      <w:pPr>
-        <w:tabs>
-          <w:tab w:val="num" w:pos="540"/>
-        </w:tabs>
-        <w:ind w:left="540" w:hanging="270"/>
-      </w:pPr>
-    </w:lvl>
-  </w:abstractNum>
   <w:num w:numId="12">
     <w:abstractNumId w:val="11"/>
+    <w:lvlOverride w:ilvl="0">
+      <w:startOverride w:val="1"/>
+    </w:lvlOverride>
   </w:num>
-  <w:abstractNum w:abstractNumId="12">
-    <w:multiLevelType w:val="singleLevel"/>
-    <w:lvl w:ilvl="0">
-      <w:start w:val="1"/>
-      <w:numFmt w:val="decimal"/>
-      <w:lvlText w:val="%1."/>
-      <w:lvlJc w:val="left"/>
-      <w:pPr>
-        <w:tabs>
-          <w:tab w:val="num" w:pos="540"/>
-        </w:tabs>
-        <w:ind w:left="540" w:hanging="270"/>
-      </w:pPr>
-    </w:lvl>
-  </w:abstractNum>
   <w:num w:numId="13">
     <w:abstractNumId w:val="12"/>
+    <w:lvlOverride w:ilvl="0">
+      <w:startOverride w:val="1"/>
+    </w:lvlOverride>
   </w:num>
-  <w:abstractNum w:abstractNumId="13">
-    <w:multiLevelType w:val="singleLevel"/>
-    <w:lvl w:ilvl="0">
-      <w:start w:val="1"/>
-      <w:numFmt w:val="decimal"/>
-      <w:lvlText w:val="%1."/>
-      <w:lvlJc w:val="left"/>
-      <w:pPr>
-        <w:tabs>
-          <w:tab w:val="num" w:pos="540"/>
-        </w:tabs>
-        <w:ind w:left="540" w:hanging="270"/>
-      </w:pPr>
-    </w:lvl>
-  </w:abstractNum>
   <w:num w:numId="14">
     <w:abstractNumId w:val="13"/>
+    <w:lvlOverride w:ilvl="0">
+      <w:startOverride w:val="1"/>
+    </w:lvlOverride>
   </w:num>
-  <w:abstractNum w:abstractNumId="14">
-    <w:multiLevelType w:val="singleLevel"/>
-    <w:lvl w:ilvl="0">
-      <w:start w:val="1"/>
-      <w:numFmt w:val="decimal"/>
-      <w:lvlText w:val="%1."/>
-      <w:lvlJc w:val="left"/>
-      <w:pPr>
-        <w:tabs>
-          <w:tab w:val="num" w:pos="540"/>
-        </w:tabs>
-        <w:ind w:left="540" w:hanging="270"/>
-      </w:pPr>
-    </w:lvl>
-  </w:abstractNum>
   <w:num w:numId="15">
     <w:abstractNumId w:val="14"/>
+    <w:lvlOverride w:ilvl="0">
+      <w:startOverride w:val="1"/>
+    </w:lvlOverride>
   </w:num>
-  <w:abstractNum w:abstractNumId="15">
-    <w:multiLevelType w:val="singleLevel"/>
-    <w:lvl w:ilvl="0">
-      <w:start w:val="1"/>
-      <w:numFmt w:val="decimal"/>
-      <w:lvlText w:val="%1."/>
-      <w:lvlJc w:val="left"/>
-      <w:pPr>
-        <w:tabs>
-          <w:tab w:val="num" w:pos="540"/>
-        </w:tabs>
-        <w:ind w:left="540" w:hanging="270"/>
-      </w:pPr>
-    </w:lvl>
-  </w:abstractNum>
   <w:num w:numId="16">
     <w:abstractNumId w:val="15"/>
+    <w:lvlOverride w:ilvl="0">
+      <w:startOverride w:val="1"/>
+    </w:lvlOverride>
   </w:num>
-  <w:abstractNum w:abstractNumId="16">
-    <w:multiLevelType w:val="singleLevel"/>
-    <w:lvl w:ilvl="0">
-      <w:start w:val="1"/>
-      <w:numFmt w:val="decimal"/>
-      <w:lvlText w:val="%1."/>
-      <w:lvlJc w:val="left"/>
-      <w:pPr>
-        <w:tabs>
-          <w:tab w:val="num" w:pos="540"/>
-        </w:tabs>
-        <w:ind w:left="540" w:hanging="270"/>
-      </w:pPr>
-    </w:lvl>
-  </w:abstractNum>
   <w:num w:numId="17">
     <w:abstractNumId w:val="16"/>
+    <w:lvlOverride w:ilvl="0">
+      <w:startOverride w:val="1"/>
+    </w:lvlOverride>
   </w:num>
-  <w:abstractNum w:abstractNumId="17">
-    <w:multiLevelType w:val="singleLevel"/>
-    <w:lvl w:ilvl="0">
-      <w:start w:val="1"/>
-      <w:numFmt w:val="decimal"/>
-      <w:lvlText w:val="%1."/>
-      <w:lvlJc w:val="left"/>
-      <w:pPr>
-        <w:tabs>
-          <w:tab w:val="num" w:pos="540"/>
-        </w:tabs>
-        <w:ind w:left="540" w:hanging="270"/>
-      </w:pPr>
-    </w:lvl>
-  </w:abstractNum>
   <w:num w:numId="18">
     <w:abstractNumId w:val="17"/>
+    <w:lvlOverride w:ilvl="0">
+      <w:startOverride w:val="1"/>
+    </w:lvlOverride>
   </w:num>
-  <w:abstractNum w:abstractNumId="18">
-    <w:multiLevelType w:val="singleLevel"/>
-    <w:lvl w:ilvl="0">
-      <w:start w:val="1"/>
-      <w:numFmt w:val="decimal"/>
-      <w:lvlText w:val="%1."/>
-      <w:lvlJc w:val="left"/>
-      <w:pPr>
-        <w:tabs>
-          <w:tab w:val="num" w:pos="540"/>
-        </w:tabs>
-        <w:ind w:left="540" w:hanging="270"/>
-      </w:pPr>
-    </w:lvl>
-  </w:abstractNum>
   <w:num w:numId="19">
     <w:abstractNumId w:val="18"/>
+    <w:lvlOverride w:ilvl="0">
+      <w:startOverride w:val="1"/>
+    </w:lvlOverride>
   </w:num>
-  <w:abstractNum w:abstractNumId="19">
-    <w:multiLevelType w:val="singleLevel"/>
-    <w:lvl w:ilvl="0">
-      <w:start w:val="1"/>
-      <w:numFmt w:val="decimal"/>
-      <w:lvlText w:val="%1."/>
-      <w:lvlJc w:val="left"/>
-      <w:pPr>
-        <w:tabs>
-          <w:tab w:val="num" w:pos="540"/>
-        </w:tabs>
-        <w:ind w:left="540" w:hanging="270"/>
-      </w:pPr>
-    </w:lvl>
-  </w:abstractNum>
   <w:num w:numId="20">
     <w:abstractNumId w:val="19"/>
+    <w:lvlOverride w:ilvl="0">
+      <w:startOverride w:val="1"/>
+    </w:lvlOverride>
   </w:num>
 </w:numbering>
 </file>

</xml_diff>

<commit_message>
Complete Poetic Fingerprint expansion Stage 3
</commit_message>
<xml_diff>
--- a/docs/VerseVAD_User_Manual.docx
+++ b/docs/VerseVAD_User_Manual.docx
@@ -47,7 +47,7 @@
           <w:color w:val="66727C"/>
           <w:sz w:val="21"/>
         </w:rPr>
-        <w:t xml:space="preserve"> 0.8.0.dev0</w:t>
+        <w:t xml:space="preserve"> 0.9.0.dev0</w:t>
       </w:r>
       <w:r>
         <w:rPr>
@@ -159,7 +159,7 @@
                 <w:color w:val="193247"/>
                 <w:sz w:val="22"/>
               </w:rPr>
-              <w:t>: normative ratings and associations attached to matched words and phrases. Its optional concreteness module remains a separate normative lexical construct. VerseVAD does not determine the emotion of a poem, speaker, author, or reader, and it does not replace contextual close reading.</w:t>
+              <w:t>: normative ratings and associations attached to matched words and phrases. Its optional concreteness and corpus-relative frequency modules remain separate lexical constructs. VerseVAD does not determine the emotion of a poem, speaker, author, or reader, and it does not replace contextual close reading.</w:t>
             </w:r>
           </w:p>
         </w:tc>
@@ -553,6 +553,23 @@
                 <w:color w:val="193247"/>
                 <w:sz w:val="22"/>
               </w:rPr>
+              <w:t xml:space="preserve"> and </w:t>
+            </w:r>
+            <w:r>
+              <w:rPr>
+                <w:rFonts w:ascii="Calibri" w:hAnsi="Calibri"/>
+                <w:b/>
+                <w:color w:val="193247"/>
+                <w:sz w:val="22"/>
+              </w:rPr>
+              <w:t>Frequency &amp; Rarity</w:t>
+            </w:r>
+            <w:r>
+              <w:rPr>
+                <w:rFonts w:ascii="Calibri" w:hAnsi="Calibri"/>
+                <w:color w:val="193247"/>
+                <w:sz w:val="22"/>
+              </w:rPr>
               <w:t xml:space="preserve"> when selected, and inspect </w:t>
             </w:r>
             <w:r>
@@ -848,7 +865,7 @@
           <w:rFonts w:ascii="Calibri" w:hAnsi="Calibri"/>
           <w:sz w:val="22"/>
         </w:rPr>
-        <w:t>source provenance and uncertainty fields in Lexicon Explorer.</w:t>
+        <w:t>source provenance and uncertainty fields in Lexicon Explorer;</w:t>
       </w:r>
     </w:p>
     <w:p>
@@ -879,7 +896,38 @@
           <w:rFonts w:ascii="Calibri" w:hAnsi="Calibri"/>
           <w:sz w:val="22"/>
         </w:rPr>
-        <w:t xml:space="preserve">  summaries, term rankings, and token audit from a local research workbook.</w:t>
+        <w:t xml:space="preserve">  summaries, term rankings, and token audit from a local research workbook; and</w:t>
+      </w:r>
+    </w:p>
+    <w:p>
+      <w:pPr>
+        <w:widowControl/>
+        <w:numPr>
+          <w:ilvl w:val="0"/>
+          <w:numId w:val="10"/>
+        </w:numPr>
+        <w:spacing w:before="0" w:after="80" w:line="300" w:lineRule="auto"/>
+        <w:ind w:left="540" w:hanging="271"/>
+      </w:pPr>
+      <w:r>
+        <w:rPr>
+          <w:rFonts w:ascii="Calibri" w:hAnsi="Calibri"/>
+          <w:sz w:val="22"/>
+        </w:rPr>
+        <w:t>optional SUBTLEX-US Zipf frequency statistics, coverage, rarity bands,</w:t>
+      </w:r>
+    </w:p>
+    <w:p>
+      <w:pPr>
+        <w:widowControl/>
+        <w:spacing w:before="0" w:after="120" w:line="300" w:lineRule="auto"/>
+      </w:pPr>
+      <w:r>
+        <w:rPr>
+          <w:rFonts w:ascii="Calibri" w:hAnsi="Calibri"/>
+          <w:sz w:val="22"/>
+        </w:rPr>
+        <w:t xml:space="preserve">  structural summaries, term rankings, and token audit.</w:t>
       </w:r>
     </w:p>
     <w:p>
@@ -1000,7 +1048,7 @@
           <w:rFonts w:ascii="Calibri" w:hAnsi="Calibri"/>
           <w:sz w:val="22"/>
         </w:rPr>
-        <w:t xml:space="preserve"> are also local and excluded from source control. The Stage 2 concreteness workbook and paper must retain their exact filenames and checksums. VerseVAD reads the workbook in place and does not copy the full ratings source into an export.</w:t>
+        <w:t xml:space="preserve"> are also local and excluded from source control. The Stage 2 concreteness workbook and paper and the Stage 3 SUBTLEX-US workbook must retain their exact paths and checksums. VerseVAD reads the workbooks in place and does not copy either full source into an export.</w:t>
       </w:r>
     </w:p>
     <w:p>
@@ -1528,6 +1576,21 @@
           <w:rFonts w:ascii="Calibri" w:hAnsi="Calibri"/>
           <w:sz w:val="22"/>
         </w:rPr>
+        <w:t xml:space="preserve"> and/or </w:t>
+      </w:r>
+      <w:r>
+        <w:rPr>
+          <w:rFonts w:ascii="Calibri" w:hAnsi="Calibri"/>
+          <w:b/>
+          <w:sz w:val="22"/>
+        </w:rPr>
+        <w:t>Frequency &amp; rarity profile (SUBTLEX-US Zipf)</w:t>
+      </w:r>
+      <w:r>
+        <w:rPr>
+          <w:rFonts w:ascii="Calibri" w:hAnsi="Calibri"/>
+          <w:sz w:val="22"/>
+        </w:rPr>
         <w:t xml:space="preserve"> under </w:t>
       </w:r>
       <w:r>
@@ -1726,7 +1789,22 @@
           <w:rFonts w:ascii="Calibri" w:hAnsi="Calibri"/>
           <w:sz w:val="22"/>
         </w:rPr>
-        <w:t>.</w:t>
+        <w:t xml:space="preserve"> and </w:t>
+      </w:r>
+      <w:r>
+        <w:rPr>
+          <w:rFonts w:ascii="Calibri" w:hAnsi="Calibri"/>
+          <w:b/>
+          <w:sz w:val="22"/>
+        </w:rPr>
+        <w:t>Frequency &amp; Rarity</w:t>
+      </w:r>
+      <w:r>
+        <w:rPr>
+          <w:rFonts w:ascii="Calibri" w:hAnsi="Calibri"/>
+          <w:sz w:val="22"/>
+        </w:rPr>
+        <w:t xml:space="preserve"> tabs.</w:t>
       </w:r>
     </w:p>
     <w:p>
@@ -2854,14 +2932,93 @@
           <w:rFonts w:ascii="Calibri" w:hAnsi="Calibri"/>
           <w:sz w:val="22"/>
         </w:rPr>
-        <w:t xml:space="preserve"> field is retained as source-row provenance. It is not the planned VerseVAD lexical-frequency module; that later module will use a separately installed, versioned SUBTLEX-US resource and will not use </w:t>
-      </w:r>
+        <w:t xml:space="preserve"> field is retained as source-row provenance. It is not VerseVAD's lexical-frequency module.</w:t>
+      </w:r>
+    </w:p>
+    <w:p>
+      <w:pPr>
+        <w:pStyle w:val="Heading2"/>
+      </w:pPr>
+      <w:r>
+        <w:rPr>
+          <w:rFonts w:ascii="Calibri" w:hAnsi="Calibri"/>
+          <w:sz w:val="22"/>
+        </w:rPr>
+        <w:t>Optional SUBTLEX-US frequency resource</w:t>
+      </w:r>
+    </w:p>
+    <w:p>
+      <w:pPr>
+        <w:widowControl/>
+        <w:spacing w:before="0" w:after="120" w:line="300" w:lineRule="auto"/>
+      </w:pPr>
+      <w:r>
+        <w:rPr>
+          <w:rFonts w:ascii="Calibri" w:hAnsi="Calibri"/>
+          <w:sz w:val="22"/>
+        </w:rPr>
+        <w:t>The one-poem workspace can separately read the official SUBTLEX-US workbook at:</w:t>
+      </w:r>
+    </w:p>
+    <w:p>
+      <w:pPr>
+        <w:pStyle w:val="Formula"/>
+      </w:pPr>
       <w:r>
         <w:rPr>
           <w:rFonts w:ascii="Consolas" w:hAnsi="Consolas"/>
           <w:color w:val="1F4D78"/>
           <w:sz w:val="19"/>
         </w:rPr>
+        <w:t>resources/subtlex-us/SUBTLEX-US frequency list with PoS and Zipf information.xlsx</w:t>
+      </w:r>
+    </w:p>
+    <w:p>
+      <w:pPr>
+        <w:widowControl/>
+        <w:spacing w:before="0" w:after="120" w:line="300" w:lineRule="auto"/>
+      </w:pPr>
+      <w:r>
+        <w:rPr>
+          <w:rFonts w:ascii="Calibri" w:hAnsi="Calibri"/>
+          <w:sz w:val="22"/>
+        </w:rPr>
+        <w:t xml:space="preserve">Its 74,286 word-form rows include corpus frequency, contextual diversity, source POS provenance, and Zipf values. The expected workbook SHA-256 is </w:t>
+      </w:r>
+      <w:r>
+        <w:rPr>
+          <w:rFonts w:ascii="Consolas" w:hAnsi="Consolas"/>
+          <w:color w:val="1F4D78"/>
+          <w:sz w:val="19"/>
+        </w:rPr>
+        <w:t>3a8cb93a4e28988c2ce722a63f6b8d394acdc42ebe2ab6e1f0e484ee0d4167a7</w:t>
+      </w:r>
+      <w:r>
+        <w:rPr>
+          <w:rFonts w:ascii="Calibri" w:hAnsi="Calibri"/>
+          <w:sz w:val="22"/>
+        </w:rPr>
+        <w:t>.</w:t>
+      </w:r>
+    </w:p>
+    <w:p>
+      <w:pPr>
+        <w:widowControl/>
+        <w:spacing w:before="0" w:after="120" w:line="300" w:lineRule="auto"/>
+      </w:pPr>
+      <w:r>
+        <w:rPr>
+          <w:rFonts w:ascii="Calibri" w:hAnsi="Calibri"/>
+          <w:sz w:val="22"/>
+        </w:rPr>
+        <w:t xml:space="preserve">Zipf is a logarithmic, corpus-relative scale: approximately one point represents a tenfold frequency difference. The source is an American film and television subtitle corpus, not poetry. VerseVAD uses no </w:t>
+      </w:r>
+      <w:r>
+        <w:rPr>
+          <w:rFonts w:ascii="Consolas" w:hAnsi="Consolas"/>
+          <w:color w:val="1F4D78"/>
+          <w:sz w:val="19"/>
+        </w:rPr>
         <w:t>wordfreq</w:t>
       </w:r>
       <w:r>
@@ -2869,7 +3026,7 @@
           <w:rFonts w:ascii="Calibri" w:hAnsi="Calibri"/>
           <w:sz w:val="22"/>
         </w:rPr>
-        <w:t>.</w:t>
+        <w:t xml:space="preserve"> fallback, and unmatched forms remain missing.</w:t>
       </w:r>
     </w:p>
     <w:p>
@@ -3101,7 +3258,7 @@
           <w:rFonts w:ascii="Calibri" w:hAnsi="Calibri"/>
           <w:sz w:val="22"/>
         </w:rPr>
-        <w:t>Named-entity recognition is disabled by default. The installed small English model has no usable vector vocabulary, so model out-of-vocabulary counts remain missing instead of becoming zero or classifying every lexical token as OOV. This model status is separate from affective-lexicon coverage and future SUBTLEX-US coverage.</w:t>
+        <w:t>Named-entity recognition is disabled by default. The installed small English model has no usable vector vocabulary, so model out-of-vocabulary counts remain missing instead of becoming zero or classifying every lexical token as OOV. This model status is separate from affective-lexicon, concreteness, and SUBTLEX-US coverage.</w:t>
       </w:r>
     </w:p>
     <w:p>
@@ -3284,6 +3441,19 @@
           <w:sz w:val="22"/>
         </w:rPr>
         <w:t>The optional concreteness module has its own recorded sequence over the same tokens: longest exact source-supplied two-word expression within one physical line, exact normalized surface, lemma, then a documented conservative apostrophe or possessive fallback. Model-tagged proper nouns are excluded by default. Unmatched and ineligible tokens retain missing ratings.</w:t>
+      </w:r>
+    </w:p>
+    <w:p>
+      <w:pPr>
+        <w:widowControl/>
+        <w:spacing w:before="0" w:after="120" w:line="300" w:lineRule="auto"/>
+      </w:pPr>
+      <w:r>
+        <w:rPr>
+          <w:rFonts w:ascii="Calibri" w:hAnsi="Calibri"/>
+          <w:sz w:val="22"/>
+        </w:rPr>
+        <w:t>The optional frequency module likewise uses exact normalized observed word form before an enabled lemma fallback, followed only by documented conservative apostrophe or possessive fallbacks. This order preserves SUBTLEX-US word-form evidence. Model-tagged proper nouns are excluded by default, and unmatched or ineligible tokens retain missing Zipf values.</w:t>
       </w:r>
     </w:p>
     <w:p>
@@ -5198,6 +5368,282 @@
           <w:rFonts w:ascii="Calibri" w:hAnsi="Calibri"/>
           <w:sz w:val="22"/>
         </w:rPr>
+        <w:t>Corpus-relative lexical frequency and rarity</w:t>
+      </w:r>
+    </w:p>
+    <w:p>
+      <w:pPr>
+        <w:widowControl/>
+        <w:spacing w:before="0" w:after="120" w:line="300" w:lineRule="auto"/>
+      </w:pPr>
+      <w:r>
+        <w:rPr>
+          <w:rFonts w:ascii="Calibri" w:hAnsi="Calibri"/>
+          <w:sz w:val="22"/>
+        </w:rPr>
+        <w:t xml:space="preserve">When enabled, </w:t>
+      </w:r>
+      <w:r>
+        <w:rPr>
+          <w:rFonts w:ascii="Calibri" w:hAnsi="Calibri"/>
+          <w:b/>
+          <w:sz w:val="22"/>
+        </w:rPr>
+        <w:t>Frequency &amp; Rarity</w:t>
+      </w:r>
+      <w:r>
+        <w:rPr>
+          <w:rFonts w:ascii="Calibri" w:hAnsi="Calibri"/>
+          <w:sz w:val="22"/>
+        </w:rPr>
+        <w:t xml:space="preserve"> reports the token-weighted median SUBTLEX-US Zipf value as its primary summary. It also reports the mean, population SD, inclusive quartiles, IQR, range, token and unique observed-form-type coverage, configurable bands, physical-line/stanza/POS summaries, lowest/highest terms, a rare-word tail, and a complete token audit.</w:t>
+      </w:r>
+    </w:p>
+    <w:p>
+      <w:pPr>
+        <w:widowControl/>
+        <w:spacing w:before="0" w:after="120" w:line="300" w:lineRule="auto"/>
+      </w:pPr>
+      <w:r>
+        <w:rPr>
+          <w:rFonts w:ascii="Calibri" w:hAnsi="Calibri"/>
+          <w:sz w:val="22"/>
+        </w:rPr>
+        <w:t xml:space="preserve">The default scope considers all lexical tokens except model-tagged proper nouns. </w:t>
+      </w:r>
+      <w:r>
+        <w:rPr>
+          <w:rFonts w:ascii="Calibri" w:hAnsi="Calibri"/>
+          <w:b/>
+          <w:sz w:val="22"/>
+        </w:rPr>
+        <w:t>Content words only</w:t>
+      </w:r>
+      <w:r>
+        <w:rPr>
+          <w:rFonts w:ascii="Calibri" w:hAnsi="Calibri"/>
+          <w:sz w:val="22"/>
+        </w:rPr>
+        <w:t xml:space="preserve"> is an optional, non-default scope. It includes only exact model tags </w:t>
+      </w:r>
+      <w:r>
+        <w:rPr>
+          <w:rFonts w:ascii="Consolas" w:hAnsi="Consolas"/>
+          <w:color w:val="1F4D78"/>
+          <w:sz w:val="19"/>
+        </w:rPr>
+        <w:t>NOUN</w:t>
+      </w:r>
+      <w:r>
+        <w:rPr>
+          <w:rFonts w:ascii="Calibri" w:hAnsi="Calibri"/>
+          <w:sz w:val="22"/>
+        </w:rPr>
+        <w:t xml:space="preserve">, </w:t>
+      </w:r>
+      <w:r>
+        <w:rPr>
+          <w:rFonts w:ascii="Consolas" w:hAnsi="Consolas"/>
+          <w:color w:val="1F4D78"/>
+          <w:sz w:val="19"/>
+        </w:rPr>
+        <w:t>VERB</w:t>
+      </w:r>
+      <w:r>
+        <w:rPr>
+          <w:rFonts w:ascii="Calibri" w:hAnsi="Calibri"/>
+          <w:sz w:val="22"/>
+        </w:rPr>
+        <w:t xml:space="preserve">, </w:t>
+      </w:r>
+      <w:r>
+        <w:rPr>
+          <w:rFonts w:ascii="Consolas" w:hAnsi="Consolas"/>
+          <w:color w:val="1F4D78"/>
+          <w:sz w:val="19"/>
+        </w:rPr>
+        <w:t>ADJ</w:t>
+      </w:r>
+      <w:r>
+        <w:rPr>
+          <w:rFonts w:ascii="Calibri" w:hAnsi="Calibri"/>
+          <w:sz w:val="22"/>
+        </w:rPr>
+        <w:t xml:space="preserve">, and </w:t>
+      </w:r>
+      <w:r>
+        <w:rPr>
+          <w:rFonts w:ascii="Consolas" w:hAnsi="Consolas"/>
+          <w:color w:val="1F4D78"/>
+          <w:sz w:val="19"/>
+        </w:rPr>
+        <w:t>ADV</w:t>
+      </w:r>
+      <w:r>
+        <w:rPr>
+          <w:rFonts w:ascii="Calibri" w:hAnsi="Calibri"/>
+          <w:sz w:val="22"/>
+        </w:rPr>
+        <w:t>. It excludes determiners (</w:t>
+      </w:r>
+      <w:r>
+        <w:rPr>
+          <w:rFonts w:ascii="Consolas" w:hAnsi="Consolas"/>
+          <w:color w:val="1F4D78"/>
+          <w:sz w:val="19"/>
+        </w:rPr>
+        <w:t>DET</w:t>
+      </w:r>
+      <w:r>
+        <w:rPr>
+          <w:rFonts w:ascii="Calibri" w:hAnsi="Calibri"/>
+          <w:sz w:val="22"/>
+        </w:rPr>
+        <w:t>), prepositions/adpositions (</w:t>
+      </w:r>
+      <w:r>
+        <w:rPr>
+          <w:rFonts w:ascii="Consolas" w:hAnsi="Consolas"/>
+          <w:color w:val="1F4D78"/>
+          <w:sz w:val="19"/>
+        </w:rPr>
+        <w:t>ADP</w:t>
+      </w:r>
+      <w:r>
+        <w:rPr>
+          <w:rFonts w:ascii="Calibri" w:hAnsi="Calibri"/>
+          <w:sz w:val="22"/>
+        </w:rPr>
+        <w:t>), conjunctions (</w:t>
+      </w:r>
+      <w:r>
+        <w:rPr>
+          <w:rFonts w:ascii="Consolas" w:hAnsi="Consolas"/>
+          <w:color w:val="1F4D78"/>
+          <w:sz w:val="19"/>
+        </w:rPr>
+        <w:t>CCONJ</w:t>
+      </w:r>
+      <w:r>
+        <w:rPr>
+          <w:rFonts w:ascii="Calibri" w:hAnsi="Calibri"/>
+          <w:sz w:val="22"/>
+        </w:rPr>
+        <w:t xml:space="preserve">, </w:t>
+      </w:r>
+      <w:r>
+        <w:rPr>
+          <w:rFonts w:ascii="Consolas" w:hAnsi="Consolas"/>
+          <w:color w:val="1F4D78"/>
+          <w:sz w:val="19"/>
+        </w:rPr>
+        <w:t>SCONJ</w:t>
+      </w:r>
+      <w:r>
+        <w:rPr>
+          <w:rFonts w:ascii="Calibri" w:hAnsi="Calibri"/>
+          <w:sz w:val="22"/>
+        </w:rPr>
+        <w:t>), pronouns (</w:t>
+      </w:r>
+      <w:r>
+        <w:rPr>
+          <w:rFonts w:ascii="Consolas" w:hAnsi="Consolas"/>
+          <w:color w:val="1F4D78"/>
+          <w:sz w:val="19"/>
+        </w:rPr>
+        <w:t>PRON</w:t>
+      </w:r>
+      <w:r>
+        <w:rPr>
+          <w:rFonts w:ascii="Calibri" w:hAnsi="Calibri"/>
+          <w:sz w:val="22"/>
+        </w:rPr>
+        <w:t>), auxiliaries (</w:t>
+      </w:r>
+      <w:r>
+        <w:rPr>
+          <w:rFonts w:ascii="Consolas" w:hAnsi="Consolas"/>
+          <w:color w:val="1F4D78"/>
+          <w:sz w:val="19"/>
+        </w:rPr>
+        <w:t>AUX</w:t>
+      </w:r>
+      <w:r>
+        <w:rPr>
+          <w:rFonts w:ascii="Calibri" w:hAnsi="Calibri"/>
+          <w:sz w:val="22"/>
+        </w:rPr>
+        <w:t xml:space="preserve">), punctuation, and all other tags. This differs from the broad Language Profile, which groups </w:t>
+      </w:r>
+      <w:r>
+        <w:rPr>
+          <w:rFonts w:ascii="Consolas" w:hAnsi="Consolas"/>
+          <w:color w:val="1F4D78"/>
+          <w:sz w:val="19"/>
+        </w:rPr>
+        <w:t>VERB</w:t>
+      </w:r>
+      <w:r>
+        <w:rPr>
+          <w:rFonts w:ascii="Calibri" w:hAnsi="Calibri"/>
+          <w:sz w:val="22"/>
+        </w:rPr>
+        <w:t xml:space="preserve"> and </w:t>
+      </w:r>
+      <w:r>
+        <w:rPr>
+          <w:rFonts w:ascii="Consolas" w:hAnsi="Consolas"/>
+          <w:color w:val="1F4D78"/>
+          <w:sz w:val="19"/>
+        </w:rPr>
+        <w:t>AUX</w:t>
+      </w:r>
+      <w:r>
+        <w:rPr>
+          <w:rFonts w:ascii="Calibri" w:hAnsi="Calibri"/>
+          <w:sz w:val="22"/>
+        </w:rPr>
+        <w:t xml:space="preserve"> together under </w:t>
+      </w:r>
+      <w:r>
+        <w:rPr>
+          <w:rFonts w:ascii="Calibri" w:hAnsi="Calibri"/>
+          <w:b/>
+          <w:sz w:val="22"/>
+        </w:rPr>
+        <w:t>Verb</w:t>
+      </w:r>
+      <w:r>
+        <w:rPr>
+          <w:rFonts w:ascii="Calibri" w:hAnsi="Calibri"/>
+          <w:sz w:val="22"/>
+        </w:rPr>
+        <w:t>.</w:t>
+      </w:r>
+    </w:p>
+    <w:p>
+      <w:pPr>
+        <w:widowControl/>
+        <w:spacing w:before="0" w:after="120" w:line="300" w:lineRule="auto"/>
+      </w:pPr>
+      <w:r>
+        <w:rPr>
+          <w:rFonts w:ascii="Calibri" w:hAnsi="Calibri"/>
+          <w:sz w:val="22"/>
+        </w:rPr>
+        <w:t>The default rare-to-very-common bands are VerseVAD orientation aids, not diagnostic literary categories. Read the median with the distribution, coverage, scope, unmatched forms, structure, and audit. The result describes corpus-relative lexical frequency evidence from an American subtitle corpus. It does not measure difficulty, sophistication, accessibility, intelligence, literary quality, or reader response.</w:t>
+      </w:r>
+    </w:p>
+    <w:p>
+      <w:pPr>
+        <w:pStyle w:val="Heading2"/>
+      </w:pPr>
+      <w:r>
+        <w:rPr>
+          <w:rFonts w:ascii="Calibri" w:hAnsi="Calibri"/>
+          <w:sz w:val="22"/>
+        </w:rPr>
         <w:t>Eight emotion associations</w:t>
       </w:r>
     </w:p>
@@ -5418,7 +5864,7 @@
           <w:rFonts w:ascii="Calibri" w:hAnsi="Calibri"/>
           <w:sz w:val="22"/>
         </w:rPr>
-        <w:t>Select one or more affective lexicons and/or enable the optional normative lexical concreteness module. VAD, categorical association, intensity, and concreteness resources answer different questions and remain separate. A concreteness-only one-poem run is allowed when the exact workbook is available.</w:t>
+        <w:t>Select one or more affective lexicons and/or enable the optional normative lexical concreteness and SUBTLEX-US frequency modules. VAD, categorical association, intensity, concreteness, and corpus-relative frequency answer different questions and remain separate. A concreteness-only or frequency-only one-poem run is allowed when the exact local workbook is available.</w:t>
       </w:r>
     </w:p>
     <w:p>
@@ -5590,138 +6036,7 @@
           <w:rFonts w:ascii="Calibri" w:hAnsi="Calibri"/>
           <w:sz w:val="22"/>
         </w:rPr>
-        <w:t>the concreteness low-coverage caution threshold.</w:t>
-      </w:r>
-    </w:p>
-    <w:p>
-      <w:pPr>
-        <w:widowControl/>
-        <w:spacing w:before="0" w:after="120" w:line="300" w:lineRule="auto"/>
-      </w:pPr>
-      <w:r>
-        <w:rPr>
-          <w:rFonts w:ascii="Calibri" w:hAnsi="Calibri"/>
-          <w:sz w:val="22"/>
-        </w:rPr>
-        <w:t xml:space="preserve">Under </w:t>
-      </w:r>
-      <w:r>
-        <w:rPr>
-          <w:rFonts w:ascii="Calibri" w:hAnsi="Calibri"/>
-          <w:b/>
-          <w:sz w:val="22"/>
-        </w:rPr>
-        <w:t>Stopword settings</w:t>
-      </w:r>
-      <w:r>
-        <w:rPr>
-          <w:rFonts w:ascii="Calibri" w:hAnsi="Calibri"/>
-          <w:sz w:val="22"/>
-        </w:rPr>
-        <w:t>, inspect or change the secondary-view policy. The all-matched result is always preserved even when only one view is displayed.</w:t>
-      </w:r>
-    </w:p>
-    <w:p>
-      <w:pPr>
-        <w:pStyle w:val="Heading2"/>
-      </w:pPr>
-      <w:r>
-        <w:rPr>
-          <w:rFonts w:ascii="Calibri" w:hAnsi="Calibri"/>
-          <w:sz w:val="22"/>
-        </w:rPr>
-        <w:t>Overview tab</w:t>
-      </w:r>
-    </w:p>
-    <w:p>
-      <w:pPr>
-        <w:widowControl/>
-        <w:spacing w:before="0" w:after="120" w:line="300" w:lineRule="auto"/>
-      </w:pPr>
-      <w:r>
-        <w:rPr>
-          <w:rFonts w:ascii="Calibri" w:hAnsi="Calibri"/>
-          <w:sz w:val="22"/>
-        </w:rPr>
-        <w:t>Read coverage before means. The tab shows ordinary and content-focused coverage, matched counts, active methodology, excluded stopword counts, interpretive framing, and warnings.</w:t>
-      </w:r>
-    </w:p>
-    <w:p>
-      <w:pPr>
-        <w:pStyle w:val="Heading2"/>
-      </w:pPr>
-      <w:r>
-        <w:rPr>
-          <w:rFonts w:ascii="Calibri" w:hAnsi="Calibri"/>
-          <w:sz w:val="22"/>
-        </w:rPr>
-        <w:t>Language Profile tab</w:t>
-      </w:r>
-    </w:p>
-    <w:p>
-      <w:pPr>
-        <w:widowControl/>
-        <w:spacing w:before="0" w:after="120" w:line="300" w:lineRule="auto"/>
-      </w:pPr>
-      <w:r>
-        <w:rPr>
-          <w:rFonts w:ascii="Calibri" w:hAnsi="Calibri"/>
-          <w:sz w:val="22"/>
-        </w:rPr>
-        <w:t xml:space="preserve">The </w:t>
-      </w:r>
-      <w:r>
-        <w:rPr>
-          <w:rFonts w:ascii="Calibri" w:hAnsi="Calibri"/>
-          <w:b/>
-          <w:sz w:val="22"/>
-        </w:rPr>
-        <w:t>Shared Processing Record</w:t>
-      </w:r>
-      <w:r>
-        <w:rPr>
-          <w:rFonts w:ascii="Calibri" w:hAnsi="Calibri"/>
-          <w:sz w:val="22"/>
-        </w:rPr>
-        <w:t xml:space="preserve"> first reports stanzas, physical lines, model sentences, total and lexical tokens, recipe/configuration IDs, model pipeline, dependency coverage, named-entity status, and processing cautions. It is the common local representation used by every selected lexicon.</w:t>
-      </w:r>
-    </w:p>
-    <w:p>
-      <w:pPr>
-        <w:widowControl/>
-        <w:spacing w:before="0" w:after="120" w:line="300" w:lineRule="auto"/>
-      </w:pPr>
-      <w:r>
-        <w:rPr>
-          <w:rFonts w:ascii="Calibri" w:hAnsi="Calibri"/>
-          <w:sz w:val="22"/>
-        </w:rPr>
-        <w:t>The tab then reports part-of-speech counts and relative shares for all eligible lexical tokens, independently of lexicon coverage. It also shows unique normalized types and example forms. The denominator is displayed, and a caution explains that the labels are model-generated.</w:t>
-      </w:r>
-    </w:p>
-    <w:p>
-      <w:pPr>
-        <w:pStyle w:val="Heading2"/>
-      </w:pPr>
-      <w:r>
-        <w:rPr>
-          <w:rFonts w:ascii="Calibri" w:hAnsi="Calibri"/>
-          <w:sz w:val="22"/>
-        </w:rPr>
-        <w:t>VAD Profile tab</w:t>
-      </w:r>
-    </w:p>
-    <w:p>
-      <w:pPr>
-        <w:widowControl/>
-        <w:spacing w:before="0" w:after="120" w:line="300" w:lineRule="auto"/>
-      </w:pPr>
-      <w:r>
-        <w:rPr>
-          <w:rFonts w:ascii="Calibri" w:hAnsi="Calibri"/>
-          <w:sz w:val="22"/>
-        </w:rPr>
-        <w:t>This tab contains:</w:t>
+        <w:t>the concreteness low-coverage caution threshold;</w:t>
       </w:r>
     </w:p>
     <w:p>
@@ -5739,7 +6054,7 @@
           <w:rFonts w:ascii="Calibri" w:hAnsi="Calibri"/>
           <w:sz w:val="22"/>
         </w:rPr>
-        <w:t>parallel normalized VAD charts;</w:t>
+        <w:t>the four frequency orientation thresholds;</w:t>
       </w:r>
     </w:p>
     <w:p>
@@ -5757,7 +6072,7 @@
           <w:rFonts w:ascii="Calibri" w:hAnsi="Calibri"/>
           <w:sz w:val="22"/>
         </w:rPr>
-        <w:t>definitions of valence, arousal, and dominance;</w:t>
+        <w:t>whether frequency excludes model-tagged proper nouns;</w:t>
       </w:r>
     </w:p>
     <w:p>
@@ -5775,7 +6090,7 @@
           <w:rFonts w:ascii="Calibri" w:hAnsi="Calibri"/>
           <w:sz w:val="22"/>
         </w:rPr>
-        <w:t>token- and type-weighted values for each analysis view;</w:t>
+        <w:t>whether frequency permits lemma fallback;</w:t>
       </w:r>
     </w:p>
     <w:p>
@@ -5793,7 +6108,7 @@
           <w:rFonts w:ascii="Calibri" w:hAnsi="Calibri"/>
           <w:sz w:val="22"/>
         </w:rPr>
-        <w:t>plain-language midpoint interpretations;</w:t>
+        <w:t>the frequency low-coverage caution threshold; and</w:t>
       </w:r>
     </w:p>
     <w:p>
@@ -5811,7 +6126,153 @@
           <w:rFonts w:ascii="Calibri" w:hAnsi="Calibri"/>
           <w:sz w:val="22"/>
         </w:rPr>
-        <w:t>population dispersion;</w:t>
+        <w:t xml:space="preserve">whether frequency uses the non-default </w:t>
+      </w:r>
+      <w:r>
+        <w:rPr>
+          <w:rFonts w:ascii="Calibri" w:hAnsi="Calibri"/>
+          <w:b/>
+          <w:sz w:val="22"/>
+        </w:rPr>
+        <w:t>Content words only</w:t>
+      </w:r>
+      <w:r>
+        <w:rPr>
+          <w:rFonts w:ascii="Calibri" w:hAnsi="Calibri"/>
+          <w:sz w:val="22"/>
+        </w:rPr>
+        <w:t xml:space="preserve"> scope.</w:t>
+      </w:r>
+    </w:p>
+    <w:p>
+      <w:pPr>
+        <w:widowControl/>
+        <w:spacing w:before="0" w:after="120" w:line="300" w:lineRule="auto"/>
+      </w:pPr>
+      <w:r>
+        <w:rPr>
+          <w:rFonts w:ascii="Calibri" w:hAnsi="Calibri"/>
+          <w:sz w:val="22"/>
+        </w:rPr>
+        <w:t xml:space="preserve">Under </w:t>
+      </w:r>
+      <w:r>
+        <w:rPr>
+          <w:rFonts w:ascii="Calibri" w:hAnsi="Calibri"/>
+          <w:b/>
+          <w:sz w:val="22"/>
+        </w:rPr>
+        <w:t>Stopword settings</w:t>
+      </w:r>
+      <w:r>
+        <w:rPr>
+          <w:rFonts w:ascii="Calibri" w:hAnsi="Calibri"/>
+          <w:sz w:val="22"/>
+        </w:rPr>
+        <w:t>, inspect or change the secondary-view policy. The all-matched result is always preserved even when only one view is displayed.</w:t>
+      </w:r>
+    </w:p>
+    <w:p>
+      <w:pPr>
+        <w:pStyle w:val="Heading2"/>
+      </w:pPr>
+      <w:r>
+        <w:rPr>
+          <w:rFonts w:ascii="Calibri" w:hAnsi="Calibri"/>
+          <w:sz w:val="22"/>
+        </w:rPr>
+        <w:t>Overview tab</w:t>
+      </w:r>
+    </w:p>
+    <w:p>
+      <w:pPr>
+        <w:widowControl/>
+        <w:spacing w:before="0" w:after="120" w:line="300" w:lineRule="auto"/>
+      </w:pPr>
+      <w:r>
+        <w:rPr>
+          <w:rFonts w:ascii="Calibri" w:hAnsi="Calibri"/>
+          <w:sz w:val="22"/>
+        </w:rPr>
+        <w:t>Read coverage before means. The tab shows ordinary and content-focused coverage, matched counts, active methodology, excluded stopword counts, interpretive framing, and warnings.</w:t>
+      </w:r>
+    </w:p>
+    <w:p>
+      <w:pPr>
+        <w:pStyle w:val="Heading2"/>
+      </w:pPr>
+      <w:r>
+        <w:rPr>
+          <w:rFonts w:ascii="Calibri" w:hAnsi="Calibri"/>
+          <w:sz w:val="22"/>
+        </w:rPr>
+        <w:t>Language Profile tab</w:t>
+      </w:r>
+    </w:p>
+    <w:p>
+      <w:pPr>
+        <w:widowControl/>
+        <w:spacing w:before="0" w:after="120" w:line="300" w:lineRule="auto"/>
+      </w:pPr>
+      <w:r>
+        <w:rPr>
+          <w:rFonts w:ascii="Calibri" w:hAnsi="Calibri"/>
+          <w:sz w:val="22"/>
+        </w:rPr>
+        <w:t xml:space="preserve">The </w:t>
+      </w:r>
+      <w:r>
+        <w:rPr>
+          <w:rFonts w:ascii="Calibri" w:hAnsi="Calibri"/>
+          <w:b/>
+          <w:sz w:val="22"/>
+        </w:rPr>
+        <w:t>Shared Processing Record</w:t>
+      </w:r>
+      <w:r>
+        <w:rPr>
+          <w:rFonts w:ascii="Calibri" w:hAnsi="Calibri"/>
+          <w:sz w:val="22"/>
+        </w:rPr>
+        <w:t xml:space="preserve"> first reports stanzas, physical lines, model sentences, total and lexical tokens, recipe/configuration IDs, model pipeline, dependency coverage, named-entity status, and processing cautions. It is the common local representation used by every selected lexicon.</w:t>
+      </w:r>
+    </w:p>
+    <w:p>
+      <w:pPr>
+        <w:widowControl/>
+        <w:spacing w:before="0" w:after="120" w:line="300" w:lineRule="auto"/>
+      </w:pPr>
+      <w:r>
+        <w:rPr>
+          <w:rFonts w:ascii="Calibri" w:hAnsi="Calibri"/>
+          <w:sz w:val="22"/>
+        </w:rPr>
+        <w:t>The tab then reports part-of-speech counts and relative shares for all eligible lexical tokens, independently of lexicon coverage. It also shows unique normalized types and example forms. The denominator is displayed, and a caution explains that the labels are model-generated.</w:t>
+      </w:r>
+    </w:p>
+    <w:p>
+      <w:pPr>
+        <w:pStyle w:val="Heading2"/>
+      </w:pPr>
+      <w:r>
+        <w:rPr>
+          <w:rFonts w:ascii="Calibri" w:hAnsi="Calibri"/>
+          <w:sz w:val="22"/>
+        </w:rPr>
+        <w:t>VAD Profile tab</w:t>
+      </w:r>
+    </w:p>
+    <w:p>
+      <w:pPr>
+        <w:widowControl/>
+        <w:spacing w:before="0" w:after="120" w:line="300" w:lineRule="auto"/>
+      </w:pPr>
+      <w:r>
+        <w:rPr>
+          <w:rFonts w:ascii="Calibri" w:hAnsi="Calibri"/>
+          <w:sz w:val="22"/>
+        </w:rPr>
+        <w:t>This tab contains:</w:t>
       </w:r>
     </w:p>
     <w:p>
@@ -5829,7 +6290,7 @@
           <w:rFonts w:ascii="Calibri" w:hAnsi="Calibri"/>
           <w:sz w:val="22"/>
         </w:rPr>
-        <w:t>stopword-sensitivity differences;</w:t>
+        <w:t>parallel normalized VAD charts;</w:t>
       </w:r>
     </w:p>
     <w:p>
@@ -5847,7 +6308,7 @@
           <w:rFonts w:ascii="Calibri" w:hAnsi="Calibri"/>
           <w:sz w:val="22"/>
         </w:rPr>
-        <w:t>cumulative normalized totals;</w:t>
+        <w:t>definitions of valence, arousal, and dominance;</w:t>
       </w:r>
     </w:p>
     <w:p>
@@ -5865,7 +6326,7 @@
           <w:rFonts w:ascii="Calibri" w:hAnsi="Calibri"/>
           <w:sz w:val="22"/>
         </w:rPr>
-        <w:t>top midpoint-centered contributors;</w:t>
+        <w:t>token- and type-weighted values for each analysis view;</w:t>
       </w:r>
     </w:p>
     <w:p>
@@ -5883,6 +6344,96 @@
           <w:rFonts w:ascii="Calibri" w:hAnsi="Calibri"/>
           <w:sz w:val="22"/>
         </w:rPr>
+        <w:t>plain-language midpoint interpretations;</w:t>
+      </w:r>
+    </w:p>
+    <w:p>
+      <w:pPr>
+        <w:widowControl/>
+        <w:numPr>
+          <w:ilvl w:val="0"/>
+          <w:numId w:val="10"/>
+        </w:numPr>
+        <w:spacing w:before="0" w:after="80" w:line="300" w:lineRule="auto"/>
+        <w:ind w:left="540" w:hanging="271"/>
+      </w:pPr>
+      <w:r>
+        <w:rPr>
+          <w:rFonts w:ascii="Calibri" w:hAnsi="Calibri"/>
+          <w:sz w:val="22"/>
+        </w:rPr>
+        <w:t>population dispersion;</w:t>
+      </w:r>
+    </w:p>
+    <w:p>
+      <w:pPr>
+        <w:widowControl/>
+        <w:numPr>
+          <w:ilvl w:val="0"/>
+          <w:numId w:val="10"/>
+        </w:numPr>
+        <w:spacing w:before="0" w:after="80" w:line="300" w:lineRule="auto"/>
+        <w:ind w:left="540" w:hanging="271"/>
+      </w:pPr>
+      <w:r>
+        <w:rPr>
+          <w:rFonts w:ascii="Calibri" w:hAnsi="Calibri"/>
+          <w:sz w:val="22"/>
+        </w:rPr>
+        <w:t>stopword-sensitivity differences;</w:t>
+      </w:r>
+    </w:p>
+    <w:p>
+      <w:pPr>
+        <w:widowControl/>
+        <w:numPr>
+          <w:ilvl w:val="0"/>
+          <w:numId w:val="10"/>
+        </w:numPr>
+        <w:spacing w:before="0" w:after="80" w:line="300" w:lineRule="auto"/>
+        <w:ind w:left="540" w:hanging="271"/>
+      </w:pPr>
+      <w:r>
+        <w:rPr>
+          <w:rFonts w:ascii="Calibri" w:hAnsi="Calibri"/>
+          <w:sz w:val="22"/>
+        </w:rPr>
+        <w:t>cumulative normalized totals;</w:t>
+      </w:r>
+    </w:p>
+    <w:p>
+      <w:pPr>
+        <w:widowControl/>
+        <w:numPr>
+          <w:ilvl w:val="0"/>
+          <w:numId w:val="10"/>
+        </w:numPr>
+        <w:spacing w:before="0" w:after="80" w:line="300" w:lineRule="auto"/>
+        <w:ind w:left="540" w:hanging="271"/>
+      </w:pPr>
+      <w:r>
+        <w:rPr>
+          <w:rFonts w:ascii="Calibri" w:hAnsi="Calibri"/>
+          <w:sz w:val="22"/>
+        </w:rPr>
+        <w:t>top midpoint-centered contributors;</w:t>
+      </w:r>
+    </w:p>
+    <w:p>
+      <w:pPr>
+        <w:widowControl/>
+        <w:numPr>
+          <w:ilvl w:val="0"/>
+          <w:numId w:val="10"/>
+        </w:numPr>
+        <w:spacing w:before="0" w:after="80" w:line="300" w:lineRule="auto"/>
+        <w:ind w:left="540" w:hanging="271"/>
+      </w:pPr>
+      <w:r>
+        <w:rPr>
+          <w:rFonts w:ascii="Calibri" w:hAnsi="Calibri"/>
+          <w:sz w:val="22"/>
+        </w:rPr>
         <w:t>original source scales and normalization formulas.</w:t>
       </w:r>
     </w:p>
@@ -5947,6 +6498,104 @@
           <w:sz w:val="22"/>
         </w:rPr>
         <w:t>The source workbook is read-only. If it is missing, changed, malformed, or unsupported, the checkbox is unavailable and VerseVAD presents a plain-language status instead of partially activating the module.</w:t>
+      </w:r>
+    </w:p>
+    <w:p>
+      <w:pPr>
+        <w:pStyle w:val="Heading2"/>
+      </w:pPr>
+      <w:r>
+        <w:rPr>
+          <w:rFonts w:ascii="Calibri" w:hAnsi="Calibri"/>
+          <w:sz w:val="22"/>
+        </w:rPr>
+        <w:t>Frequency &amp; Rarity tab</w:t>
+      </w:r>
+    </w:p>
+    <w:p>
+      <w:pPr>
+        <w:widowControl/>
+        <w:spacing w:before="0" w:after="120" w:line="300" w:lineRule="auto"/>
+      </w:pPr>
+      <w:r>
+        <w:rPr>
+          <w:rFonts w:ascii="Calibri" w:hAnsi="Calibri"/>
+          <w:sz w:val="22"/>
+        </w:rPr>
+        <w:t>This tab appears when the optional SUBTLEX-US module is enabled. It emphasizes the token-weighted median Zipf value and shows the mean, IQR, token/type coverage, configured bands, warnings, line and stanza patterns, model-assigned POS groups, lowest/highest represented terms, rare tail, complete token audit, and source/configuration provenance.</w:t>
+      </w:r>
+    </w:p>
+    <w:p>
+      <w:pPr>
+        <w:widowControl/>
+        <w:spacing w:before="0" w:after="120" w:line="300" w:lineRule="auto"/>
+      </w:pPr>
+      <w:r>
+        <w:rPr>
+          <w:rFonts w:ascii="Calibri" w:hAnsi="Calibri"/>
+          <w:sz w:val="22"/>
+        </w:rPr>
+        <w:t xml:space="preserve">The page identifies whether the default all-lexical-token scope or the non-default </w:t>
+      </w:r>
+      <w:r>
+        <w:rPr>
+          <w:rFonts w:ascii="Consolas" w:hAnsi="Consolas"/>
+          <w:color w:val="1F4D78"/>
+          <w:sz w:val="19"/>
+        </w:rPr>
+        <w:t>NOUN</w:t>
+      </w:r>
+      <w:r>
+        <w:rPr>
+          <w:rFonts w:ascii="Calibri" w:hAnsi="Calibri"/>
+          <w:sz w:val="22"/>
+        </w:rPr>
+        <w:t>/</w:t>
+      </w:r>
+      <w:r>
+        <w:rPr>
+          <w:rFonts w:ascii="Consolas" w:hAnsi="Consolas"/>
+          <w:color w:val="1F4D78"/>
+          <w:sz w:val="19"/>
+        </w:rPr>
+        <w:t>VERB</w:t>
+      </w:r>
+      <w:r>
+        <w:rPr>
+          <w:rFonts w:ascii="Calibri" w:hAnsi="Calibri"/>
+          <w:sz w:val="22"/>
+        </w:rPr>
+        <w:t>/</w:t>
+      </w:r>
+      <w:r>
+        <w:rPr>
+          <w:rFonts w:ascii="Consolas" w:hAnsi="Consolas"/>
+          <w:color w:val="1F4D78"/>
+          <w:sz w:val="19"/>
+        </w:rPr>
+        <w:t>ADJ</w:t>
+      </w:r>
+      <w:r>
+        <w:rPr>
+          <w:rFonts w:ascii="Calibri" w:hAnsi="Calibri"/>
+          <w:sz w:val="22"/>
+        </w:rPr>
+        <w:t>/</w:t>
+      </w:r>
+      <w:r>
+        <w:rPr>
+          <w:rFonts w:ascii="Consolas" w:hAnsi="Consolas"/>
+          <w:color w:val="1F4D78"/>
+          <w:sz w:val="19"/>
+        </w:rPr>
+        <w:t>ADV</w:t>
+      </w:r>
+      <w:r>
+        <w:rPr>
+          <w:rFonts w:ascii="Calibri" w:hAnsi="Calibri"/>
+          <w:sz w:val="22"/>
+        </w:rPr>
+        <w:t xml:space="preserve"> scope was used. Exact observed form, lemma, documented fallback, unmatched, and ineligible decisions stay distinct. The source workbook is read-only; a missing, changed, malformed, or unsupported source prevents activation.</w:t>
       </w:r>
     </w:p>
     <w:p>
@@ -9456,6 +10105,412 @@
           </w:p>
         </w:tc>
       </w:tr>
+      <w:tr>
+        <w:trPr>
+          <w:cantSplit w:val="true"/>
+        </w:trPr>
+        <w:tc>
+          <w:tcPr>
+            <w:tcW w:type="dxa" w:w="3600"/>
+            <w:vAlign w:val="center"/>
+            <w:tcMar>
+              <w:top w:w="80" w:type="dxa"/>
+              <w:bottom w:w="80" w:type="dxa"/>
+              <w:start w:w="120" w:type="dxa"/>
+              <w:end w:w="120" w:type="dxa"/>
+            </w:tcMar>
+          </w:tcPr>
+          <w:p>
+            <w:pPr>
+              <w:widowControl/>
+              <w:spacing w:before="0" w:after="0" w:line="252" w:lineRule="auto"/>
+            </w:pPr>
+            <w:r/>
+            <w:r>
+              <w:rPr>
+                <w:rFonts w:ascii="Consolas" w:hAnsi="Consolas"/>
+                <w:color w:val="1F4D78"/>
+                <w:sz w:val="17"/>
+              </w:rPr>
+              <w:t>frequency_summary.csv</w:t>
+            </w:r>
+          </w:p>
+        </w:tc>
+        <w:tc>
+          <w:tcPr>
+            <w:tcW w:type="dxa" w:w="5760"/>
+            <w:vAlign w:val="center"/>
+            <w:tcMar>
+              <w:top w:w="80" w:type="dxa"/>
+              <w:bottom w:w="80" w:type="dxa"/>
+              <w:start w:w="120" w:type="dxa"/>
+              <w:end w:w="120" w:type="dxa"/>
+            </w:tcMar>
+          </w:tcPr>
+          <w:p>
+            <w:pPr>
+              <w:widowControl/>
+              <w:spacing w:before="0" w:after="0" w:line="252" w:lineRule="auto"/>
+            </w:pPr>
+            <w:r/>
+            <w:r>
+              <w:rPr>
+                <w:rFonts w:ascii="Calibri" w:hAnsi="Calibri"/>
+                <w:sz w:val="18"/>
+              </w:rPr>
+              <w:t>Median-first Zipf summary, dispersion, range, scope, bands, token/type coverage, and source identity</w:t>
+            </w:r>
+          </w:p>
+        </w:tc>
+      </w:tr>
+      <w:tr>
+        <w:trPr>
+          <w:cantSplit w:val="true"/>
+        </w:trPr>
+        <w:tc>
+          <w:tcPr>
+            <w:tcW w:type="dxa" w:w="3600"/>
+            <w:vAlign w:val="center"/>
+            <w:tcMar>
+              <w:top w:w="80" w:type="dxa"/>
+              <w:bottom w:w="80" w:type="dxa"/>
+              <w:start w:w="120" w:type="dxa"/>
+              <w:end w:w="120" w:type="dxa"/>
+            </w:tcMar>
+          </w:tcPr>
+          <w:p>
+            <w:pPr>
+              <w:widowControl/>
+              <w:spacing w:before="0" w:after="0" w:line="252" w:lineRule="auto"/>
+            </w:pPr>
+            <w:r/>
+            <w:r>
+              <w:rPr>
+                <w:rFonts w:ascii="Consolas" w:hAnsi="Consolas"/>
+                <w:color w:val="1F4D78"/>
+                <w:sz w:val="17"/>
+              </w:rPr>
+              <w:t>frequency_distribution.csv</w:t>
+            </w:r>
+          </w:p>
+        </w:tc>
+        <w:tc>
+          <w:tcPr>
+            <w:tcW w:type="dxa" w:w="5760"/>
+            <w:vAlign w:val="center"/>
+            <w:tcMar>
+              <w:top w:w="80" w:type="dxa"/>
+              <w:bottom w:w="80" w:type="dxa"/>
+              <w:start w:w="120" w:type="dxa"/>
+              <w:end w:w="120" w:type="dxa"/>
+            </w:tcMar>
+          </w:tcPr>
+          <w:p>
+            <w:pPr>
+              <w:widowControl/>
+              <w:spacing w:before="0" w:after="0" w:line="252" w:lineRule="auto"/>
+            </w:pPr>
+            <w:r/>
+            <w:r>
+              <w:rPr>
+                <w:rFonts w:ascii="Calibri" w:hAnsi="Calibri"/>
+                <w:sz w:val="18"/>
+              </w:rPr>
+              <w:t>Distribution-ready Zipf values and configured band counts/proportions</w:t>
+            </w:r>
+          </w:p>
+        </w:tc>
+      </w:tr>
+      <w:tr>
+        <w:trPr>
+          <w:cantSplit w:val="true"/>
+        </w:trPr>
+        <w:tc>
+          <w:tcPr>
+            <w:tcW w:type="dxa" w:w="3600"/>
+            <w:vAlign w:val="center"/>
+            <w:tcMar>
+              <w:top w:w="80" w:type="dxa"/>
+              <w:bottom w:w="80" w:type="dxa"/>
+              <w:start w:w="120" w:type="dxa"/>
+              <w:end w:w="120" w:type="dxa"/>
+            </w:tcMar>
+          </w:tcPr>
+          <w:p>
+            <w:pPr>
+              <w:widowControl/>
+              <w:spacing w:before="0" w:after="0" w:line="252" w:lineRule="auto"/>
+            </w:pPr>
+            <w:r/>
+            <w:r>
+              <w:rPr>
+                <w:rFonts w:ascii="Consolas" w:hAnsi="Consolas"/>
+                <w:color w:val="1F4D78"/>
+                <w:sz w:val="17"/>
+              </w:rPr>
+              <w:t>frequency_by_structure.csv</w:t>
+            </w:r>
+          </w:p>
+        </w:tc>
+        <w:tc>
+          <w:tcPr>
+            <w:tcW w:type="dxa" w:w="5760"/>
+            <w:vAlign w:val="center"/>
+            <w:tcMar>
+              <w:top w:w="80" w:type="dxa"/>
+              <w:bottom w:w="80" w:type="dxa"/>
+              <w:start w:w="120" w:type="dxa"/>
+              <w:end w:w="120" w:type="dxa"/>
+            </w:tcMar>
+          </w:tcPr>
+          <w:p>
+            <w:pPr>
+              <w:widowControl/>
+              <w:spacing w:before="0" w:after="0" w:line="252" w:lineRule="auto"/>
+            </w:pPr>
+            <w:r/>
+            <w:r>
+              <w:rPr>
+                <w:rFonts w:ascii="Calibri" w:hAnsi="Calibri"/>
+                <w:sz w:val="18"/>
+              </w:rPr>
+              <w:t>Physical-line and stanza summaries with eligible/matched counts and coverage</w:t>
+            </w:r>
+          </w:p>
+        </w:tc>
+      </w:tr>
+      <w:tr>
+        <w:trPr>
+          <w:cantSplit w:val="true"/>
+        </w:trPr>
+        <w:tc>
+          <w:tcPr>
+            <w:tcW w:type="dxa" w:w="3600"/>
+            <w:vAlign w:val="center"/>
+            <w:tcMar>
+              <w:top w:w="80" w:type="dxa"/>
+              <w:bottom w:w="80" w:type="dxa"/>
+              <w:start w:w="120" w:type="dxa"/>
+              <w:end w:w="120" w:type="dxa"/>
+            </w:tcMar>
+          </w:tcPr>
+          <w:p>
+            <w:pPr>
+              <w:widowControl/>
+              <w:spacing w:before="0" w:after="0" w:line="252" w:lineRule="auto"/>
+            </w:pPr>
+            <w:r/>
+            <w:r>
+              <w:rPr>
+                <w:rFonts w:ascii="Consolas" w:hAnsi="Consolas"/>
+                <w:color w:val="1F4D78"/>
+                <w:sz w:val="17"/>
+              </w:rPr>
+              <w:t>frequency_by_pos.csv</w:t>
+            </w:r>
+          </w:p>
+        </w:tc>
+        <w:tc>
+          <w:tcPr>
+            <w:tcW w:type="dxa" w:w="5760"/>
+            <w:vAlign w:val="center"/>
+            <w:tcMar>
+              <w:top w:w="80" w:type="dxa"/>
+              <w:bottom w:w="80" w:type="dxa"/>
+              <w:start w:w="120" w:type="dxa"/>
+              <w:end w:w="120" w:type="dxa"/>
+            </w:tcMar>
+          </w:tcPr>
+          <w:p>
+            <w:pPr>
+              <w:widowControl/>
+              <w:spacing w:before="0" w:after="0" w:line="252" w:lineRule="auto"/>
+            </w:pPr>
+            <w:r/>
+            <w:r>
+              <w:rPr>
+                <w:rFonts w:ascii="Calibri" w:hAnsi="Calibri"/>
+                <w:sz w:val="18"/>
+              </w:rPr>
+              <w:t>Model-assigned part-of-speech summaries</w:t>
+            </w:r>
+          </w:p>
+        </w:tc>
+      </w:tr>
+      <w:tr>
+        <w:trPr>
+          <w:cantSplit w:val="true"/>
+        </w:trPr>
+        <w:tc>
+          <w:tcPr>
+            <w:tcW w:type="dxa" w:w="3600"/>
+            <w:vAlign w:val="center"/>
+            <w:tcMar>
+              <w:top w:w="80" w:type="dxa"/>
+              <w:bottom w:w="80" w:type="dxa"/>
+              <w:start w:w="120" w:type="dxa"/>
+              <w:end w:w="120" w:type="dxa"/>
+            </w:tcMar>
+          </w:tcPr>
+          <w:p>
+            <w:pPr>
+              <w:widowControl/>
+              <w:spacing w:before="0" w:after="0" w:line="252" w:lineRule="auto"/>
+            </w:pPr>
+            <w:r/>
+            <w:r>
+              <w:rPr>
+                <w:rFonts w:ascii="Consolas" w:hAnsi="Consolas"/>
+                <w:color w:val="1F4D78"/>
+                <w:sz w:val="17"/>
+              </w:rPr>
+              <w:t>frequency_terms.csv</w:t>
+            </w:r>
+          </w:p>
+        </w:tc>
+        <w:tc>
+          <w:tcPr>
+            <w:tcW w:type="dxa" w:w="5760"/>
+            <w:vAlign w:val="center"/>
+            <w:tcMar>
+              <w:top w:w="80" w:type="dxa"/>
+              <w:bottom w:w="80" w:type="dxa"/>
+              <w:start w:w="120" w:type="dxa"/>
+              <w:end w:w="120" w:type="dxa"/>
+            </w:tcMar>
+          </w:tcPr>
+          <w:p>
+            <w:pPr>
+              <w:widowControl/>
+              <w:spacing w:before="0" w:after="0" w:line="252" w:lineRule="auto"/>
+            </w:pPr>
+            <w:r/>
+            <w:r>
+              <w:rPr>
+                <w:rFonts w:ascii="Calibri" w:hAnsi="Calibri"/>
+                <w:sz w:val="18"/>
+              </w:rPr>
+              <w:t>Represented source terms, Zipf values, corpus counts, repetition, ranks, and source-row fields</w:t>
+            </w:r>
+          </w:p>
+        </w:tc>
+      </w:tr>
+      <w:tr>
+        <w:trPr>
+          <w:cantSplit w:val="true"/>
+        </w:trPr>
+        <w:tc>
+          <w:tcPr>
+            <w:tcW w:type="dxa" w:w="3600"/>
+            <w:vAlign w:val="center"/>
+            <w:tcMar>
+              <w:top w:w="80" w:type="dxa"/>
+              <w:bottom w:w="80" w:type="dxa"/>
+              <w:start w:w="120" w:type="dxa"/>
+              <w:end w:w="120" w:type="dxa"/>
+            </w:tcMar>
+          </w:tcPr>
+          <w:p>
+            <w:pPr>
+              <w:widowControl/>
+              <w:spacing w:before="0" w:after="0" w:line="252" w:lineRule="auto"/>
+            </w:pPr>
+            <w:r/>
+            <w:r>
+              <w:rPr>
+                <w:rFonts w:ascii="Consolas" w:hAnsi="Consolas"/>
+                <w:color w:val="1F4D78"/>
+                <w:sz w:val="17"/>
+              </w:rPr>
+              <w:t>frequency_token_audit.csv</w:t>
+            </w:r>
+          </w:p>
+        </w:tc>
+        <w:tc>
+          <w:tcPr>
+            <w:tcW w:type="dxa" w:w="5760"/>
+            <w:vAlign w:val="center"/>
+            <w:tcMar>
+              <w:top w:w="80" w:type="dxa"/>
+              <w:bottom w:w="80" w:type="dxa"/>
+              <w:start w:w="120" w:type="dxa"/>
+              <w:end w:w="120" w:type="dxa"/>
+            </w:tcMar>
+          </w:tcPr>
+          <w:p>
+            <w:pPr>
+              <w:widowControl/>
+              <w:spacing w:before="0" w:after="0" w:line="252" w:lineRule="auto"/>
+            </w:pPr>
+            <w:r/>
+            <w:r>
+              <w:rPr>
+                <w:rFonts w:ascii="Calibri" w:hAnsi="Calibri"/>
+                <w:sz w:val="18"/>
+              </w:rPr>
+              <w:t>Every token's eligibility, POS, matching method, source row, Zipf value or missing value, and reason</w:t>
+            </w:r>
+          </w:p>
+        </w:tc>
+      </w:tr>
+      <w:tr>
+        <w:trPr>
+          <w:cantSplit w:val="true"/>
+        </w:trPr>
+        <w:tc>
+          <w:tcPr>
+            <w:tcW w:type="dxa" w:w="3600"/>
+            <w:vAlign w:val="center"/>
+            <w:tcMar>
+              <w:top w:w="80" w:type="dxa"/>
+              <w:bottom w:w="80" w:type="dxa"/>
+              <w:start w:w="120" w:type="dxa"/>
+              <w:end w:w="120" w:type="dxa"/>
+            </w:tcMar>
+          </w:tcPr>
+          <w:p>
+            <w:pPr>
+              <w:widowControl/>
+              <w:spacing w:before="0" w:after="0" w:line="252" w:lineRule="auto"/>
+            </w:pPr>
+            <w:r/>
+            <w:r>
+              <w:rPr>
+                <w:rFonts w:ascii="Consolas" w:hAnsi="Consolas"/>
+                <w:color w:val="1F4D78"/>
+                <w:sz w:val="17"/>
+              </w:rPr>
+              <w:t>frequency_result.json</w:t>
+            </w:r>
+          </w:p>
+        </w:tc>
+        <w:tc>
+          <w:tcPr>
+            <w:tcW w:type="dxa" w:w="5760"/>
+            <w:vAlign w:val="center"/>
+            <w:tcMar>
+              <w:top w:w="80" w:type="dxa"/>
+              <w:bottom w:w="80" w:type="dxa"/>
+              <w:start w:w="120" w:type="dxa"/>
+              <w:end w:w="120" w:type="dxa"/>
+            </w:tcMar>
+          </w:tcPr>
+          <w:p>
+            <w:pPr>
+              <w:widowControl/>
+              <w:spacing w:before="0" w:after="0" w:line="252" w:lineRule="auto"/>
+            </w:pPr>
+            <w:r/>
+            <w:r>
+              <w:rPr>
+                <w:rFonts w:ascii="Calibri" w:hAnsi="Calibri"/>
+                <w:sz w:val="18"/>
+              </w:rPr>
+              <w:t>Complete structured frequency result, configuration, warnings, and provenance</w:t>
+            </w:r>
+          </w:p>
+        </w:tc>
+      </w:tr>
     </w:tbl>
     <w:p>
       <w:pPr>
@@ -9503,7 +10558,7 @@
           <w:rFonts w:ascii="Calibri" w:hAnsi="Calibri"/>
           <w:sz w:val="22"/>
         </w:rPr>
-        <w:t xml:space="preserve"> contains its shared processing representation, and </w:t>
+        <w:t xml:space="preserve"> contains its shared processing representation, </w:t>
       </w:r>
       <w:r>
         <w:rPr>
@@ -9518,7 +10573,7 @@
           <w:rFonts w:ascii="Calibri" w:hAnsi="Calibri"/>
           <w:sz w:val="22"/>
         </w:rPr>
-        <w:t xml:space="preserve"> contains the optional normative lexical concreteness result. </w:t>
+        <w:t xml:space="preserve"> contains the optional normative lexical concreteness result, and </w:t>
       </w:r>
       <w:r>
         <w:rPr>
@@ -9526,6 +10581,21 @@
           <w:color w:val="1F4D78"/>
           <w:sz w:val="19"/>
         </w:rPr>
+        <w:t>frequency_result.json</w:t>
+      </w:r>
+      <w:r>
+        <w:rPr>
+          <w:rFonts w:ascii="Calibri" w:hAnsi="Calibri"/>
+          <w:sz w:val="22"/>
+        </w:rPr>
+        <w:t xml:space="preserve"> contains the optional SUBTLEX-US result. </w:t>
+      </w:r>
+      <w:r>
+        <w:rPr>
+          <w:rFonts w:ascii="Consolas" w:hAnsi="Consolas"/>
+          <w:color w:val="1F4D78"/>
+          <w:sz w:val="19"/>
+        </w:rPr>
         <w:t>poem_document.json</w:t>
       </w:r>
       <w:r>
@@ -9533,7 +10603,7 @@
           <w:rFonts w:ascii="Calibri" w:hAnsi="Calibri"/>
           <w:sz w:val="22"/>
         </w:rPr>
-        <w:t xml:space="preserve"> includes the original text, so protect it as research material. Concreteness exports retain source-row provenance but do not copy the 39,954-row ratings workbook. The scholar summary is the easiest reading aid.</w:t>
+        <w:t xml:space="preserve"> includes the original text, so protect it as research material. Concreteness and frequency exports retain source-row provenance but do not copy either full research workbook. The scholar summary is the easiest reading aid.</w:t>
       </w:r>
     </w:p>
     <w:p>
@@ -11007,6 +12077,73 @@
     </w:p>
     <w:p>
       <w:pPr>
+        <w:widowControl/>
+        <w:spacing w:before="0" w:after="120" w:line="300" w:lineRule="auto"/>
+      </w:pPr>
+      <w:r>
+        <w:rPr>
+          <w:rFonts w:ascii="Calibri" w:hAnsi="Calibri"/>
+          <w:b/>
+          <w:sz w:val="22"/>
+        </w:rPr>
+        <w:t>SUBTLEX-US token coverage</w:t>
+      </w:r>
+    </w:p>
+    <w:p>
+      <w:pPr>
+        <w:pStyle w:val="Formula"/>
+      </w:pPr>
+      <w:r>
+        <w:rPr>
+          <w:rFonts w:ascii="Consolas" w:hAnsi="Consolas"/>
+          <w:color w:val="1F4D78"/>
+          <w:sz w:val="19"/>
+        </w:rPr>
+        <w:t>frequency_token_coverage = matched eligible lexical-token positions / eligible lexical-token positions</w:t>
+      </w:r>
+    </w:p>
+    <w:p>
+      <w:pPr>
+        <w:widowControl/>
+        <w:spacing w:before="0" w:after="120" w:line="300" w:lineRule="auto"/>
+      </w:pPr>
+      <w:r>
+        <w:rPr>
+          <w:rFonts w:ascii="Calibri" w:hAnsi="Calibri"/>
+          <w:b/>
+          <w:sz w:val="22"/>
+        </w:rPr>
+        <w:t>SUBTLEX-US observed-form type coverage</w:t>
+      </w:r>
+    </w:p>
+    <w:p>
+      <w:pPr>
+        <w:pStyle w:val="Formula"/>
+      </w:pPr>
+      <w:r>
+        <w:rPr>
+          <w:rFonts w:ascii="Consolas" w:hAnsi="Consolas"/>
+          <w:color w:val="1F4D78"/>
+          <w:sz w:val="19"/>
+        </w:rPr>
+        <w:t>frequency_type_coverage = matched unique normalized observed forms / eligible unique normalized observed forms</w:t>
+      </w:r>
+    </w:p>
+    <w:p>
+      <w:pPr>
+        <w:widowControl/>
+        <w:spacing w:before="0" w:after="120" w:line="300" w:lineRule="auto"/>
+      </w:pPr>
+      <w:r>
+        <w:rPr>
+          <w:rFonts w:ascii="Calibri" w:hAnsi="Calibri"/>
+          <w:sz w:val="22"/>
+        </w:rPr>
+        <w:t>The frequency module uses the token-weighted median Zipf value as its primary summary. Empty eligible denominators remain missing; unmatched forms never receive zero.</w:t>
+      </w:r>
+    </w:p>
+    <w:p>
+      <w:pPr>
         <w:pStyle w:val="Heading2"/>
       </w:pPr>
       <w:r>
@@ -12274,6 +13411,63 @@
                 <w:rFonts w:ascii="Calibri" w:hAnsi="Calibri"/>
                 <w:sz w:val="18"/>
               </w:rPr>
+              <w:t>Content words only</w:t>
+            </w:r>
+          </w:p>
+        </w:tc>
+        <w:tc>
+          <w:tcPr>
+            <w:tcW w:type="dxa" w:w="5760"/>
+            <w:vAlign w:val="center"/>
+            <w:tcMar>
+              <w:top w:w="80" w:type="dxa"/>
+              <w:bottom w:w="80" w:type="dxa"/>
+              <w:start w:w="120" w:type="dxa"/>
+              <w:end w:w="120" w:type="dxa"/>
+            </w:tcMar>
+          </w:tcPr>
+          <w:p>
+            <w:pPr>
+              <w:widowControl/>
+              <w:spacing w:before="0" w:after="0" w:line="252" w:lineRule="auto"/>
+            </w:pPr>
+            <w:r/>
+            <w:r>
+              <w:rPr>
+                <w:rFonts w:ascii="Calibri" w:hAnsi="Calibri"/>
+                <w:sz w:val="18"/>
+              </w:rPr>
+              <w:t>Optional frequency scope limited to exact model tags NOUN, VERB, ADJ, and ADV; off by default</w:t>
+            </w:r>
+          </w:p>
+        </w:tc>
+      </w:tr>
+      <w:tr>
+        <w:trPr>
+          <w:cantSplit w:val="true"/>
+        </w:trPr>
+        <w:tc>
+          <w:tcPr>
+            <w:tcW w:type="dxa" w:w="3600"/>
+            <w:vAlign w:val="center"/>
+            <w:tcMar>
+              <w:top w:w="80" w:type="dxa"/>
+              <w:bottom w:w="80" w:type="dxa"/>
+              <w:start w:w="120" w:type="dxa"/>
+              <w:end w:w="120" w:type="dxa"/>
+            </w:tcMar>
+          </w:tcPr>
+          <w:p>
+            <w:pPr>
+              <w:widowControl/>
+              <w:spacing w:before="0" w:after="0" w:line="252" w:lineRule="auto"/>
+            </w:pPr>
+            <w:r/>
+            <w:r>
+              <w:rPr>
+                <w:rFonts w:ascii="Calibri" w:hAnsi="Calibri"/>
+                <w:sz w:val="18"/>
+              </w:rPr>
               <w:t>Coverage</w:t>
             </w:r>
           </w:p>
@@ -12301,6 +13495,63 @@
                 <w:sz w:val="18"/>
               </w:rPr>
               <w:t>Proportion of eligible token positions represented by included matches</w:t>
+            </w:r>
+          </w:p>
+        </w:tc>
+      </w:tr>
+      <w:tr>
+        <w:trPr>
+          <w:cantSplit w:val="true"/>
+        </w:trPr>
+        <w:tc>
+          <w:tcPr>
+            <w:tcW w:type="dxa" w:w="3600"/>
+            <w:vAlign w:val="center"/>
+            <w:tcMar>
+              <w:top w:w="80" w:type="dxa"/>
+              <w:bottom w:w="80" w:type="dxa"/>
+              <w:start w:w="120" w:type="dxa"/>
+              <w:end w:w="120" w:type="dxa"/>
+            </w:tcMar>
+          </w:tcPr>
+          <w:p>
+            <w:pPr>
+              <w:widowControl/>
+              <w:spacing w:before="0" w:after="0" w:line="252" w:lineRule="auto"/>
+            </w:pPr>
+            <w:r/>
+            <w:r>
+              <w:rPr>
+                <w:rFonts w:ascii="Calibri" w:hAnsi="Calibri"/>
+                <w:sz w:val="18"/>
+              </w:rPr>
+              <w:t>Corpus-relative frequency</w:t>
+            </w:r>
+          </w:p>
+        </w:tc>
+        <w:tc>
+          <w:tcPr>
+            <w:tcW w:type="dxa" w:w="5760"/>
+            <w:vAlign w:val="center"/>
+            <w:tcMar>
+              <w:top w:w="80" w:type="dxa"/>
+              <w:bottom w:w="80" w:type="dxa"/>
+              <w:start w:w="120" w:type="dxa"/>
+              <w:end w:w="120" w:type="dxa"/>
+            </w:tcMar>
+          </w:tcPr>
+          <w:p>
+            <w:pPr>
+              <w:widowControl/>
+              <w:spacing w:before="0" w:after="0" w:line="252" w:lineRule="auto"/>
+            </w:pPr>
+            <w:r/>
+            <w:r>
+              <w:rPr>
+                <w:rFonts w:ascii="Calibri" w:hAnsi="Calibri"/>
+                <w:sz w:val="18"/>
+              </w:rPr>
+              <w:t>Frequency evidence tied to a named source corpus rather than a context-free property of a word</w:t>
             </w:r>
           </w:p>
         </w:tc>
@@ -13958,6 +15209,63 @@
           </w:p>
         </w:tc>
       </w:tr>
+      <w:tr>
+        <w:trPr>
+          <w:cantSplit w:val="true"/>
+        </w:trPr>
+        <w:tc>
+          <w:tcPr>
+            <w:tcW w:type="dxa" w:w="3600"/>
+            <w:vAlign w:val="center"/>
+            <w:tcMar>
+              <w:top w:w="80" w:type="dxa"/>
+              <w:bottom w:w="80" w:type="dxa"/>
+              <w:start w:w="120" w:type="dxa"/>
+              <w:end w:w="120" w:type="dxa"/>
+            </w:tcMar>
+          </w:tcPr>
+          <w:p>
+            <w:pPr>
+              <w:widowControl/>
+              <w:spacing w:before="0" w:after="0" w:line="252" w:lineRule="auto"/>
+            </w:pPr>
+            <w:r/>
+            <w:r>
+              <w:rPr>
+                <w:rFonts w:ascii="Calibri" w:hAnsi="Calibri"/>
+                <w:sz w:val="18"/>
+              </w:rPr>
+              <w:t>Zipf value</w:t>
+            </w:r>
+          </w:p>
+        </w:tc>
+        <w:tc>
+          <w:tcPr>
+            <w:tcW w:type="dxa" w:w="5760"/>
+            <w:vAlign w:val="center"/>
+            <w:tcMar>
+              <w:top w:w="80" w:type="dxa"/>
+              <w:bottom w:w="80" w:type="dxa"/>
+              <w:start w:w="120" w:type="dxa"/>
+              <w:end w:w="120" w:type="dxa"/>
+            </w:tcMar>
+          </w:tcPr>
+          <w:p>
+            <w:pPr>
+              <w:widowControl/>
+              <w:spacing w:before="0" w:after="0" w:line="252" w:lineRule="auto"/>
+            </w:pPr>
+            <w:r/>
+            <w:r>
+              <w:rPr>
+                <w:rFonts w:ascii="Calibri" w:hAnsi="Calibri"/>
+                <w:sz w:val="18"/>
+              </w:rPr>
+              <w:t>Logarithmic SUBTLEX-US word-form frequency value; about one point represents a tenfold source-corpus frequency difference</w:t>
+            </w:r>
+          </w:p>
+        </w:tc>
+      </w:tr>
     </w:tbl>
     <w:p>
       <w:pPr>
@@ -14537,6 +15845,126 @@
     </w:p>
     <w:p>
       <w:pPr>
+        <w:widowControl/>
+        <w:numPr>
+          <w:ilvl w:val="0"/>
+          <w:numId w:val="10"/>
+        </w:numPr>
+        <w:spacing w:before="0" w:after="80" w:line="300" w:lineRule="auto"/>
+        <w:ind w:left="540" w:hanging="271"/>
+      </w:pPr>
+      <w:r>
+        <w:rPr>
+          <w:rFonts w:ascii="Calibri" w:hAnsi="Calibri"/>
+          <w:sz w:val="22"/>
+        </w:rPr>
+        <w:t>SUBTLEX-US describes American subtitle usage, not poetry, historical English, or a universal language.</w:t>
+      </w:r>
+    </w:p>
+    <w:p>
+      <w:pPr>
+        <w:widowControl/>
+        <w:numPr>
+          <w:ilvl w:val="0"/>
+          <w:numId w:val="10"/>
+        </w:numPr>
+        <w:spacing w:before="0" w:after="80" w:line="300" w:lineRule="auto"/>
+        <w:ind w:left="540" w:hanging="271"/>
+      </w:pPr>
+      <w:r>
+        <w:rPr>
+          <w:rFonts w:ascii="Calibri" w:hAnsi="Calibri"/>
+          <w:sz w:val="22"/>
+        </w:rPr>
+        <w:t>Zipf bands are VerseVAD orientation aids and do not measure difficulty, sophistication, accessibility, intelligence, or literary quality.</w:t>
+      </w:r>
+    </w:p>
+    <w:p>
+      <w:pPr>
+        <w:widowControl/>
+        <w:numPr>
+          <w:ilvl w:val="0"/>
+          <w:numId w:val="10"/>
+        </w:numPr>
+        <w:spacing w:before="0" w:after="80" w:line="300" w:lineRule="auto"/>
+        <w:ind w:left="540" w:hanging="271"/>
+      </w:pPr>
+      <w:r>
+        <w:rPr>
+          <w:rFonts w:ascii="Calibri" w:hAnsi="Calibri"/>
+          <w:sz w:val="22"/>
+        </w:rPr>
+        <w:t xml:space="preserve">Frequency POS scope and proper-name exclusion depend on model-generated tags; the non-default content-word scope excludes </w:t>
+      </w:r>
+      <w:r>
+        <w:rPr>
+          <w:rFonts w:ascii="Consolas" w:hAnsi="Consolas"/>
+          <w:color w:val="1F4D78"/>
+          <w:sz w:val="19"/>
+        </w:rPr>
+        <w:t>AUX</w:t>
+      </w:r>
+      <w:r>
+        <w:rPr>
+          <w:rFonts w:ascii="Calibri" w:hAnsi="Calibri"/>
+          <w:sz w:val="22"/>
+        </w:rPr>
+        <w:t>.</w:t>
+      </w:r>
+    </w:p>
+    <w:p>
+      <w:pPr>
+        <w:widowControl/>
+        <w:numPr>
+          <w:ilvl w:val="0"/>
+          <w:numId w:val="10"/>
+        </w:numPr>
+        <w:spacing w:before="0" w:after="80" w:line="300" w:lineRule="auto"/>
+        <w:ind w:left="540" w:hanging="271"/>
+      </w:pPr>
+      <w:r>
+        <w:rPr>
+          <w:rFonts w:ascii="Calibri" w:hAnsi="Calibri"/>
+          <w:sz w:val="22"/>
+        </w:rPr>
+        <w:t xml:space="preserve">An unmatched frequency form remains missing; VerseVAD does not substitute </w:t>
+      </w:r>
+      <w:r>
+        <w:rPr>
+          <w:rFonts w:ascii="Consolas" w:hAnsi="Consolas"/>
+          <w:color w:val="1F4D78"/>
+          <w:sz w:val="19"/>
+        </w:rPr>
+        <w:t>wordfreq</w:t>
+      </w:r>
+      <w:r>
+        <w:rPr>
+          <w:rFonts w:ascii="Calibri" w:hAnsi="Calibri"/>
+          <w:sz w:val="22"/>
+        </w:rPr>
+        <w:t>.</w:t>
+      </w:r>
+    </w:p>
+    <w:p>
+      <w:pPr>
+        <w:widowControl/>
+        <w:numPr>
+          <w:ilvl w:val="0"/>
+          <w:numId w:val="10"/>
+        </w:numPr>
+        <w:spacing w:before="0" w:after="80" w:line="300" w:lineRule="auto"/>
+        <w:ind w:left="540" w:hanging="271"/>
+      </w:pPr>
+      <w:r>
+        <w:rPr>
+          <w:rFonts w:ascii="Calibri" w:hAnsi="Calibri"/>
+          <w:sz w:val="22"/>
+        </w:rPr>
+        <w:t>Frequency is currently an optional one-poem in-memory module; it is not yet persisted in corpus projects.</w:t>
+      </w:r>
+    </w:p>
+    <w:p>
+      <w:pPr>
         <w:pStyle w:val="Heading1"/>
       </w:pPr>
       <w:r>
@@ -14557,7 +15985,7 @@
           <w:rFonts w:ascii="Calibri" w:hAnsi="Calibri"/>
           <w:sz w:val="22"/>
         </w:rPr>
-        <w:t>Every analysis should retain the active lexicon or optional research resource, source checksum, adapter version, software version, preprocessing recipe and configuration ID, phrase policy, stopword policy, scenario, and inclusion decisions. Completed corpus runs remain linked to preserved text versions. A concreteness result additionally retains its orientation thresholds, proper-name and phrase policies, low-coverage threshold, source-row matches, and exact workbook checksum.</w:t>
+        <w:t>Every analysis should retain the active lexicon or optional research resource, source checksum, adapter version, software version, preprocessing recipe and configuration ID, phrase policy, stopword policy, scenario, and inclusion decisions. Completed corpus runs remain linked to preserved text versions. A concreteness result additionally retains its orientation thresholds, proper-name and phrase policies, low-coverage threshold, source-row matches, and exact workbook checksum. A frequency result retains its Zipf-band thresholds, proper-name policy, exact-before-lemma rule, optional content-word scope, low-coverage threshold, source-row matches, and exact SUBTLEX-US workbook checksum.</w:t>
       </w:r>
     </w:p>
     <w:p>
@@ -14824,7 +16252,7 @@
         <w:color w:val="66727C"/>
         <w:sz w:val="18"/>
       </w:rPr>
-      <w:t xml:space="preserve">  |  0.8.0.dev0</w:t>
+      <w:t xml:space="preserve">  |  0.9.0.dev0</w:t>
     </w:r>
   </w:p>
 </w:hdr>

</xml_diff>

<commit_message>
Complete Poetic Fingerprint Stage 4 AoA
</commit_message>
<xml_diff>
--- a/docs/VerseVAD_User_Manual.docx
+++ b/docs/VerseVAD_User_Manual.docx
@@ -47,7 +47,7 @@
           <w:color w:val="66727C"/>
           <w:sz w:val="21"/>
         </w:rPr>
-        <w:t xml:space="preserve"> 0.9.0.dev0</w:t>
+        <w:t xml:space="preserve"> 0.10.0.dev0</w:t>
       </w:r>
       <w:r>
         <w:rPr>
@@ -159,7 +159,7 @@
                 <w:color w:val="193247"/>
                 <w:sz w:val="22"/>
               </w:rPr>
-              <w:t>: normative ratings and associations attached to matched words and phrases. Its optional concreteness and corpus-relative frequency modules remain separate lexical constructs. VerseVAD does not determine the emotion of a poem, speaker, author, or reader, and it does not replace contextual close reading.</w:t>
+              <w:t>: normative ratings and associations attached to matched words and phrases. Its optional concreteness, corpus-relative frequency, and retrospective Age of Acquisition modules remain separate lexical constructs. VerseVAD does not determine the emotion of a poem, speaker, author, or reader, diagnose cognition, or replace contextual close reading.</w:t>
             </w:r>
           </w:p>
         </w:tc>
@@ -553,7 +553,7 @@
                 <w:color w:val="193247"/>
                 <w:sz w:val="22"/>
               </w:rPr>
-              <w:t xml:space="preserve"> and </w:t>
+              <w:t xml:space="preserve">, </w:t>
             </w:r>
             <w:r>
               <w:rPr>
@@ -563,6 +563,23 @@
                 <w:sz w:val="22"/>
               </w:rPr>
               <w:t>Frequency &amp; Rarity</w:t>
+            </w:r>
+            <w:r>
+              <w:rPr>
+                <w:rFonts w:ascii="Calibri" w:hAnsi="Calibri"/>
+                <w:color w:val="193247"/>
+                <w:sz w:val="22"/>
+              </w:rPr>
+              <w:t xml:space="preserve">, and </w:t>
+            </w:r>
+            <w:r>
+              <w:rPr>
+                <w:rFonts w:ascii="Calibri" w:hAnsi="Calibri"/>
+                <w:b/>
+                <w:color w:val="193247"/>
+                <w:sz w:val="22"/>
+              </w:rPr>
+              <w:t>Age of Acquisition</w:t>
             </w:r>
             <w:r>
               <w:rPr>
@@ -927,7 +944,38 @@
           <w:rFonts w:ascii="Calibri" w:hAnsi="Calibri"/>
           <w:sz w:val="22"/>
         </w:rPr>
-        <w:t xml:space="preserve">  structural summaries, term rankings, and token audit.</w:t>
+        <w:t xml:space="preserve">  structural summaries, term rankings, and token audit; and</w:t>
+      </w:r>
+    </w:p>
+    <w:p>
+      <w:pPr>
+        <w:widowControl/>
+        <w:numPr>
+          <w:ilvl w:val="0"/>
+          <w:numId w:val="10"/>
+        </w:numPr>
+        <w:spacing w:before="0" w:after="80" w:line="300" w:lineRule="auto"/>
+        <w:ind w:left="540" w:hanging="271"/>
+      </w:pPr>
+      <w:r>
+        <w:rPr>
+          <w:rFonts w:ascii="Calibri" w:hAnsi="Calibri"/>
+          <w:sz w:val="22"/>
+        </w:rPr>
+        <w:t>optional Kuperman retrospective Age of Acquisition statistics, coverage,</w:t>
+      </w:r>
+    </w:p>
+    <w:p>
+      <w:pPr>
+        <w:widowControl/>
+        <w:spacing w:before="0" w:after="120" w:line="300" w:lineRule="auto"/>
+      </w:pPr>
+      <w:r>
+        <w:rPr>
+          <w:rFonts w:ascii="Calibri" w:hAnsi="Calibri"/>
+          <w:sz w:val="22"/>
+        </w:rPr>
+        <w:t xml:space="preserve">  source-response evidence, configurable orientation bands, structural   summaries, descriptive cross-module relationships, term rankings, and token   audit.</w:t>
       </w:r>
     </w:p>
     <w:p>
@@ -1048,7 +1096,7 @@
           <w:rFonts w:ascii="Calibri" w:hAnsi="Calibri"/>
           <w:sz w:val="22"/>
         </w:rPr>
-        <w:t xml:space="preserve"> are also local and excluded from source control. The Stage 2 concreteness workbook and paper and the Stage 3 SUBTLEX-US workbook must retain their exact paths and checksums. VerseVAD reads the workbooks in place and does not copy either full source into an export.</w:t>
+        <w:t xml:space="preserve"> are also local and excluded from source control. The Stage 2 concreteness workbook and paper, Stage 3 SUBTLEX-US workbook, and Stage 4 Kuperman Age of Acquisition workbook and paper must retain their exact paths and checksums. VerseVAD reads the workbooks in place and does not copy any complete research source into an export.</w:t>
       </w:r>
     </w:p>
     <w:p>
@@ -1576,7 +1624,7 @@
           <w:rFonts w:ascii="Calibri" w:hAnsi="Calibri"/>
           <w:sz w:val="22"/>
         </w:rPr>
-        <w:t xml:space="preserve"> and/or </w:t>
+        <w:t xml:space="preserve">, </w:t>
       </w:r>
       <w:r>
         <w:rPr>
@@ -1585,6 +1633,21 @@
           <w:sz w:val="22"/>
         </w:rPr>
         <w:t>Frequency &amp; rarity profile (SUBTLEX-US Zipf)</w:t>
+      </w:r>
+      <w:r>
+        <w:rPr>
+          <w:rFonts w:ascii="Calibri" w:hAnsi="Calibri"/>
+          <w:sz w:val="22"/>
+        </w:rPr>
+        <w:t xml:space="preserve">, and/or </w:t>
+      </w:r>
+      <w:r>
+        <w:rPr>
+          <w:rFonts w:ascii="Calibri" w:hAnsi="Calibri"/>
+          <w:b/>
+          <w:sz w:val="22"/>
+        </w:rPr>
+        <w:t>Age of Acquisition profile (Kuperman et al. ratings)</w:t>
       </w:r>
       <w:r>
         <w:rPr>
@@ -1789,7 +1852,7 @@
           <w:rFonts w:ascii="Calibri" w:hAnsi="Calibri"/>
           <w:sz w:val="22"/>
         </w:rPr>
-        <w:t xml:space="preserve"> and </w:t>
+        <w:t xml:space="preserve">, </w:t>
       </w:r>
       <w:r>
         <w:rPr>
@@ -1798,6 +1861,21 @@
           <w:sz w:val="22"/>
         </w:rPr>
         <w:t>Frequency &amp; Rarity</w:t>
+      </w:r>
+      <w:r>
+        <w:rPr>
+          <w:rFonts w:ascii="Calibri" w:hAnsi="Calibri"/>
+          <w:sz w:val="22"/>
+        </w:rPr>
+        <w:t xml:space="preserve">, and </w:t>
+      </w:r>
+      <w:r>
+        <w:rPr>
+          <w:rFonts w:ascii="Calibri" w:hAnsi="Calibri"/>
+          <w:b/>
+          <w:sz w:val="22"/>
+        </w:rPr>
+        <w:t>Age of Acquisition</w:t>
       </w:r>
       <w:r>
         <w:rPr>
@@ -3031,6 +3109,308 @@
     </w:p>
     <w:p>
       <w:pPr>
+        <w:pStyle w:val="Heading2"/>
+      </w:pPr>
+      <w:r>
+        <w:rPr>
+          <w:rFonts w:ascii="Calibri" w:hAnsi="Calibri"/>
+          <w:sz w:val="22"/>
+        </w:rPr>
+        <w:t>Optional Kuperman Age of Acquisition resource</w:t>
+      </w:r>
+    </w:p>
+    <w:p>
+      <w:pPr>
+        <w:widowControl/>
+        <w:spacing w:before="0" w:after="120" w:line="300" w:lineRule="auto"/>
+      </w:pPr>
+      <w:r>
+        <w:rPr>
+          <w:rFonts w:ascii="Calibri" w:hAnsi="Calibri"/>
+          <w:sz w:val="22"/>
+        </w:rPr>
+        <w:t>The one-poem workspace can separately read the official Springer erratum supplement at:</w:t>
+      </w:r>
+    </w:p>
+    <w:p>
+      <w:pPr>
+        <w:pStyle w:val="Formula"/>
+      </w:pPr>
+      <w:r>
+        <w:rPr>
+          <w:rFonts w:ascii="Consolas" w:hAnsi="Consolas"/>
+          <w:color w:val="1F4D78"/>
+          <w:sz w:val="19"/>
+        </w:rPr>
+        <w:t>resources/kuperman_2013_erratum_ESM1_official.xlsx</w:t>
+      </w:r>
+    </w:p>
+    <w:p>
+      <w:pPr>
+        <w:widowControl/>
+        <w:spacing w:before="0" w:after="120" w:line="300" w:lineRule="auto"/>
+      </w:pPr>
+      <w:r>
+        <w:rPr>
+          <w:rFonts w:ascii="Calibri" w:hAnsi="Calibri"/>
+          <w:sz w:val="22"/>
+        </w:rPr>
+        <w:t xml:space="preserve">Its </w:t>
+      </w:r>
+      <w:r>
+        <w:rPr>
+          <w:rFonts w:ascii="Consolas" w:hAnsi="Consolas"/>
+          <w:color w:val="1F4D78"/>
+          <w:sz w:val="19"/>
+        </w:rPr>
+        <w:t>Sheet1</w:t>
+      </w:r>
+      <w:r>
+        <w:rPr>
+          <w:rFonts w:ascii="Calibri" w:hAnsi="Calibri"/>
+          <w:sz w:val="22"/>
+        </w:rPr>
+        <w:t xml:space="preserve"> contains 31,124 unique nonblank word rows: 31,105 with numeric mean ages and 19 whose numeric mean is unavailable. The expected workbook SHA-256 is </w:t>
+      </w:r>
+      <w:r>
+        <w:rPr>
+          <w:rFonts w:ascii="Consolas" w:hAnsi="Consolas"/>
+          <w:color w:val="1F4D78"/>
+          <w:sz w:val="19"/>
+        </w:rPr>
+        <w:t>3f69a1332359de1cd4a7ccd3c4c3c2e39b388eeb171d6e90544709c3dc1a8a6e</w:t>
+      </w:r>
+      <w:r>
+        <w:rPr>
+          <w:rFonts w:ascii="Calibri" w:hAnsi="Calibri"/>
+          <w:sz w:val="22"/>
+        </w:rPr>
+        <w:t xml:space="preserve">. The local publisher paper is </w:t>
+      </w:r>
+      <w:r>
+        <w:rPr>
+          <w:rFonts w:ascii="Consolas" w:hAnsi="Consolas"/>
+          <w:color w:val="1F4D78"/>
+          <w:sz w:val="19"/>
+        </w:rPr>
+        <w:t>resources/kuperman_stadthagen_gonzalez_brysbaert_2012_aoa_PAPER.pdf</w:t>
+      </w:r>
+      <w:r>
+        <w:rPr>
+          <w:rFonts w:ascii="Calibri" w:hAnsi="Calibri"/>
+          <w:sz w:val="22"/>
+        </w:rPr>
+        <w:t xml:space="preserve">, with expected SHA-256 </w:t>
+      </w:r>
+      <w:r>
+        <w:rPr>
+          <w:rFonts w:ascii="Consolas" w:hAnsi="Consolas"/>
+          <w:color w:val="1F4D78"/>
+          <w:sz w:val="19"/>
+        </w:rPr>
+        <w:t>fa72b2dd7980707de710b4dcb346d0368d5e2c21d657824a935ea4b8b8b80e1a</w:t>
+      </w:r>
+      <w:r>
+        <w:rPr>
+          <w:rFonts w:ascii="Calibri" w:hAnsi="Calibri"/>
+          <w:sz w:val="22"/>
+        </w:rPr>
+        <w:t>.</w:t>
+      </w:r>
+    </w:p>
+    <w:p>
+      <w:pPr>
+        <w:widowControl/>
+        <w:spacing w:before="0" w:after="120" w:line="300" w:lineRule="auto"/>
+      </w:pPr>
+      <w:r>
+        <w:rPr>
+          <w:rFonts w:ascii="Calibri" w:hAnsi="Calibri"/>
+          <w:sz w:val="22"/>
+        </w:rPr>
+        <w:t xml:space="preserve">The numeric means are adult retrospective estimates of acquisition age in years. VerseVAD retains source mean/SD, total and numeric response counts, source frequency when available, and the source </w:t>
+      </w:r>
+      <w:r>
+        <w:rPr>
+          <w:rFonts w:ascii="Consolas" w:hAnsi="Consolas"/>
+          <w:color w:val="1F4D78"/>
+          <w:sz w:val="19"/>
+        </w:rPr>
+        <w:t>Dunno</w:t>
+      </w:r>
+      <w:r>
+        <w:rPr>
+          <w:rFonts w:ascii="Calibri" w:hAnsi="Calibri"/>
+          <w:sz w:val="22"/>
+        </w:rPr>
+        <w:t xml:space="preserve"> field. It separately labels </w:t>
+      </w:r>
+      <w:r>
+        <w:rPr>
+          <w:rFonts w:ascii="Consolas" w:hAnsi="Consolas"/>
+          <w:color w:val="1F4D78"/>
+          <w:sz w:val="19"/>
+        </w:rPr>
+        <w:t>OccurNum / OccurTotal</w:t>
+      </w:r>
+      <w:r>
+        <w:rPr>
+          <w:rFonts w:ascii="Calibri" w:hAnsi="Calibri"/>
+          <w:sz w:val="22"/>
+        </w:rPr>
+        <w:t xml:space="preserve"> as the numeric-response proportion.</w:t>
+      </w:r>
+    </w:p>
+    <w:p>
+      <w:pPr>
+        <w:widowControl/>
+        <w:spacing w:before="0" w:after="120" w:line="300" w:lineRule="auto"/>
+      </w:pPr>
+      <w:r>
+        <w:rPr>
+          <w:rFonts w:ascii="Calibri" w:hAnsi="Calibri"/>
+          <w:sz w:val="22"/>
+        </w:rPr>
+        <w:t xml:space="preserve">The paper describes target selection using base forms most frequently used as nouns, verbs, or adjectives. The official supplement nevertheless has ratings for polyfunctional spellings such as </w:t>
+      </w:r>
+      <w:r>
+        <w:rPr>
+          <w:rFonts w:ascii="Consolas" w:hAnsi="Consolas"/>
+          <w:color w:val="1F4D78"/>
+          <w:sz w:val="19"/>
+        </w:rPr>
+        <w:t>the</w:t>
+      </w:r>
+      <w:r>
+        <w:rPr>
+          <w:rFonts w:ascii="Calibri" w:hAnsi="Calibri"/>
+          <w:sz w:val="22"/>
+        </w:rPr>
+        <w:t xml:space="preserve">, </w:t>
+      </w:r>
+      <w:r>
+        <w:rPr>
+          <w:rFonts w:ascii="Consolas" w:hAnsi="Consolas"/>
+          <w:color w:val="1F4D78"/>
+          <w:sz w:val="19"/>
+        </w:rPr>
+        <w:t>and</w:t>
+      </w:r>
+      <w:r>
+        <w:rPr>
+          <w:rFonts w:ascii="Calibri" w:hAnsi="Calibri"/>
+          <w:sz w:val="22"/>
+        </w:rPr>
+        <w:t xml:space="preserve">, </w:t>
+      </w:r>
+      <w:r>
+        <w:rPr>
+          <w:rFonts w:ascii="Consolas" w:hAnsi="Consolas"/>
+          <w:color w:val="1F4D78"/>
+          <w:sz w:val="19"/>
+        </w:rPr>
+        <w:t>he</w:t>
+      </w:r>
+      <w:r>
+        <w:rPr>
+          <w:rFonts w:ascii="Calibri" w:hAnsi="Calibri"/>
+          <w:sz w:val="22"/>
+        </w:rPr>
+        <w:t xml:space="preserve">, </w:t>
+      </w:r>
+      <w:r>
+        <w:rPr>
+          <w:rFonts w:ascii="Consolas" w:hAnsi="Consolas"/>
+          <w:color w:val="1F4D78"/>
+          <w:sz w:val="19"/>
+        </w:rPr>
+        <w:t>of</w:t>
+      </w:r>
+      <w:r>
+        <w:rPr>
+          <w:rFonts w:ascii="Calibri" w:hAnsi="Calibri"/>
+          <w:sz w:val="22"/>
+        </w:rPr>
+        <w:t xml:space="preserve">, and </w:t>
+      </w:r>
+      <w:r>
+        <w:rPr>
+          <w:rFonts w:ascii="Consolas" w:hAnsi="Consolas"/>
+          <w:color w:val="1F4D78"/>
+          <w:sz w:val="19"/>
+        </w:rPr>
+        <w:t>to</w:t>
+      </w:r>
+      <w:r>
+        <w:rPr>
+          <w:rFonts w:ascii="Calibri" w:hAnsi="Calibri"/>
+          <w:sz w:val="22"/>
+        </w:rPr>
+        <w:t xml:space="preserve">. Source sampling and the contextual grammatical role of a poem occurrence are therefore separate. The optional contextual </w:t>
+      </w:r>
+      <w:r>
+        <w:rPr>
+          <w:rFonts w:ascii="Consolas" w:hAnsi="Consolas"/>
+          <w:color w:val="1F4D78"/>
+          <w:sz w:val="19"/>
+        </w:rPr>
+        <w:t>NOUN</w:t>
+      </w:r>
+      <w:r>
+        <w:rPr>
+          <w:rFonts w:ascii="Calibri" w:hAnsi="Calibri"/>
+          <w:sz w:val="22"/>
+        </w:rPr>
+        <w:t>/</w:t>
+      </w:r>
+      <w:r>
+        <w:rPr>
+          <w:rFonts w:ascii="Consolas" w:hAnsi="Consolas"/>
+          <w:color w:val="1F4D78"/>
+          <w:sz w:val="19"/>
+        </w:rPr>
+        <w:t>VERB</w:t>
+      </w:r>
+      <w:r>
+        <w:rPr>
+          <w:rFonts w:ascii="Calibri" w:hAnsi="Calibri"/>
+          <w:sz w:val="22"/>
+        </w:rPr>
+        <w:t>/</w:t>
+      </w:r>
+      <w:r>
+        <w:rPr>
+          <w:rFonts w:ascii="Consolas" w:hAnsi="Consolas"/>
+          <w:color w:val="1F4D78"/>
+          <w:sz w:val="19"/>
+        </w:rPr>
+        <w:t>ADJ</w:t>
+      </w:r>
+      <w:r>
+        <w:rPr>
+          <w:rFonts w:ascii="Calibri" w:hAnsi="Calibri"/>
+          <w:sz w:val="22"/>
+        </w:rPr>
+        <w:t>/</w:t>
+      </w:r>
+      <w:r>
+        <w:rPr>
+          <w:rFonts w:ascii="Consolas" w:hAnsi="Consolas"/>
+          <w:color w:val="1F4D78"/>
+          <w:sz w:val="19"/>
+        </w:rPr>
+        <w:t>ADV</w:t>
+      </w:r>
+      <w:r>
+        <w:rPr>
+          <w:rFonts w:ascii="Calibri" w:hAnsi="Calibri"/>
+          <w:sz w:val="22"/>
+        </w:rPr>
+        <w:t xml:space="preserve"> scope remains available and off by default.</w:t>
+      </w:r>
+    </w:p>
+    <w:p>
+      <w:pPr>
         <w:pStyle w:val="Heading1"/>
       </w:pPr>
       <w:r>
@@ -3454,6 +3834,49 @@
           <w:sz w:val="22"/>
         </w:rPr>
         <w:t>The optional frequency module likewise uses exact normalized observed word form before an enabled lemma fallback, followed only by documented conservative apostrophe or possessive fallbacks. This order preserves SUBTLEX-US word-form evidence. Model-tagged proper nouns are excluded by default, and unmatched or ineligible tokens retain missing Zipf values.</w:t>
+      </w:r>
+    </w:p>
+    <w:p>
+      <w:pPr>
+        <w:widowControl/>
+        <w:spacing w:before="0" w:after="120" w:line="300" w:lineRule="auto"/>
+      </w:pPr>
+      <w:r>
+        <w:rPr>
+          <w:rFonts w:ascii="Calibri" w:hAnsi="Calibri"/>
+          <w:sz w:val="22"/>
+        </w:rPr>
+        <w:t xml:space="preserve">The optional Age of Acquisition module uses exact normalized observed word form before an enabled lemma fallback, followed by documented conservative apostrophe or possessive fallbacks. A source row whose mean is </w:t>
+      </w:r>
+      <w:r>
+        <w:rPr>
+          <w:rFonts w:ascii="Consolas" w:hAnsi="Consolas"/>
+          <w:color w:val="1F4D78"/>
+          <w:sz w:val="19"/>
+        </w:rPr>
+        <w:t>NA</w:t>
+      </w:r>
+      <w:r>
+        <w:rPr>
+          <w:rFonts w:ascii="Calibri" w:hAnsi="Calibri"/>
+          <w:sz w:val="22"/>
+        </w:rPr>
+        <w:t xml:space="preserve"> remains visible as </w:t>
+      </w:r>
+      <w:r>
+        <w:rPr>
+          <w:rFonts w:ascii="Consolas" w:hAnsi="Consolas"/>
+          <w:color w:val="1F4D78"/>
+          <w:sz w:val="19"/>
+        </w:rPr>
+        <w:t>source_entry_without_numeric_rating</w:t>
+      </w:r>
+      <w:r>
+        <w:rPr>
+          <w:rFonts w:ascii="Calibri" w:hAnsi="Calibri"/>
+          <w:sz w:val="22"/>
+        </w:rPr>
+        <w:t xml:space="preserve"> but does not enter numeric summaries. Model-tagged proper nouns are excluded by default. Unmatched, ineligible, and source-unrated tokens retain missing ages rather than zero.</w:t>
       </w:r>
     </w:p>
     <w:p>
@@ -5644,6 +6067,188 @@
           <w:rFonts w:ascii="Calibri" w:hAnsi="Calibri"/>
           <w:sz w:val="22"/>
         </w:rPr>
+        <w:t>Retrospective normative lexical Age of Acquisition</w:t>
+      </w:r>
+    </w:p>
+    <w:p>
+      <w:pPr>
+        <w:widowControl/>
+        <w:spacing w:before="0" w:after="120" w:line="300" w:lineRule="auto"/>
+      </w:pPr>
+      <w:r>
+        <w:rPr>
+          <w:rFonts w:ascii="Calibri" w:hAnsi="Calibri"/>
+          <w:sz w:val="22"/>
+        </w:rPr>
+        <w:t xml:space="preserve">When enabled, </w:t>
+      </w:r>
+      <w:r>
+        <w:rPr>
+          <w:rFonts w:ascii="Calibri" w:hAnsi="Calibri"/>
+          <w:b/>
+          <w:sz w:val="22"/>
+        </w:rPr>
+        <w:t>Age of Acquisition</w:t>
+      </w:r>
+      <w:r>
+        <w:rPr>
+          <w:rFonts w:ascii="Calibri" w:hAnsi="Calibri"/>
+          <w:sz w:val="22"/>
+        </w:rPr>
+        <w:t xml:space="preserve"> reports token-weighted mean, median, population SD, inclusive quartiles, IQR, range, token and unique normalized observed-form-type coverage, configurable early/middle/later bands, physical-line/stanza/POS summaries, source-response evidence, earliest/latest represented terms, and a complete token audit.</w:t>
+      </w:r>
+    </w:p>
+    <w:p>
+      <w:pPr>
+        <w:widowControl/>
+        <w:spacing w:before="0" w:after="120" w:line="300" w:lineRule="auto"/>
+      </w:pPr>
+      <w:r>
+        <w:rPr>
+          <w:rFonts w:ascii="Calibri" w:hAnsi="Calibri"/>
+          <w:sz w:val="22"/>
+        </w:rPr>
+        <w:t>The numeric values are source mean ages in years, based on adult retrospective estimates of when respondents believed they had learned a word well enough to understand it. The default early-at-or-below-5 and later-at-or-above-12 bands are VerseVAD orientation aids, not categories validated by the paper. Repetition contributes repeatedly.</w:t>
+      </w:r>
+    </w:p>
+    <w:p>
+      <w:pPr>
+        <w:widowControl/>
+        <w:spacing w:before="0" w:after="120" w:line="300" w:lineRule="auto"/>
+      </w:pPr>
+      <w:r>
+        <w:rPr>
+          <w:rFonts w:ascii="Calibri" w:hAnsi="Calibri"/>
+          <w:sz w:val="22"/>
+        </w:rPr>
+        <w:t xml:space="preserve">The default scope considers all lexical tokens except model-tagged proper nouns. </w:t>
+      </w:r>
+      <w:r>
+        <w:rPr>
+          <w:rFonts w:ascii="Calibri" w:hAnsi="Calibri"/>
+          <w:b/>
+          <w:sz w:val="22"/>
+        </w:rPr>
+        <w:t>AoA content words only</w:t>
+      </w:r>
+      <w:r>
+        <w:rPr>
+          <w:rFonts w:ascii="Calibri" w:hAnsi="Calibri"/>
+          <w:sz w:val="22"/>
+        </w:rPr>
+        <w:t xml:space="preserve"> is an optional, non-default contextual scope using exact model tags </w:t>
+      </w:r>
+      <w:r>
+        <w:rPr>
+          <w:rFonts w:ascii="Consolas" w:hAnsi="Consolas"/>
+          <w:color w:val="1F4D78"/>
+          <w:sz w:val="19"/>
+        </w:rPr>
+        <w:t>NOUN</w:t>
+      </w:r>
+      <w:r>
+        <w:rPr>
+          <w:rFonts w:ascii="Calibri" w:hAnsi="Calibri"/>
+          <w:sz w:val="22"/>
+        </w:rPr>
+        <w:t xml:space="preserve">, </w:t>
+      </w:r>
+      <w:r>
+        <w:rPr>
+          <w:rFonts w:ascii="Consolas" w:hAnsi="Consolas"/>
+          <w:color w:val="1F4D78"/>
+          <w:sz w:val="19"/>
+        </w:rPr>
+        <w:t>VERB</w:t>
+      </w:r>
+      <w:r>
+        <w:rPr>
+          <w:rFonts w:ascii="Calibri" w:hAnsi="Calibri"/>
+          <w:sz w:val="22"/>
+        </w:rPr>
+        <w:t xml:space="preserve">, </w:t>
+      </w:r>
+      <w:r>
+        <w:rPr>
+          <w:rFonts w:ascii="Consolas" w:hAnsi="Consolas"/>
+          <w:color w:val="1F4D78"/>
+          <w:sz w:val="19"/>
+        </w:rPr>
+        <w:t>ADJ</w:t>
+      </w:r>
+      <w:r>
+        <w:rPr>
+          <w:rFonts w:ascii="Calibri" w:hAnsi="Calibri"/>
+          <w:sz w:val="22"/>
+        </w:rPr>
+        <w:t xml:space="preserve">, and </w:t>
+      </w:r>
+      <w:r>
+        <w:rPr>
+          <w:rFonts w:ascii="Consolas" w:hAnsi="Consolas"/>
+          <w:color w:val="1F4D78"/>
+          <w:sz w:val="19"/>
+        </w:rPr>
+        <w:t>ADV</w:t>
+      </w:r>
+      <w:r>
+        <w:rPr>
+          <w:rFonts w:ascii="Calibri" w:hAnsi="Calibri"/>
+          <w:sz w:val="22"/>
+        </w:rPr>
+        <w:t xml:space="preserve">; it excludes </w:t>
+      </w:r>
+      <w:r>
+        <w:rPr>
+          <w:rFonts w:ascii="Consolas" w:hAnsi="Consolas"/>
+          <w:color w:val="1F4D78"/>
+          <w:sz w:val="19"/>
+        </w:rPr>
+        <w:t>AUX</w:t>
+      </w:r>
+      <w:r>
+        <w:rPr>
+          <w:rFonts w:ascii="Calibri" w:hAnsi="Calibri"/>
+          <w:sz w:val="22"/>
+        </w:rPr>
+        <w:t xml:space="preserve"> and function-word tags. This remains methodologically useful even though the source paper describes content-word target selection, because the official supplement contains rated polyfunctional spellings and a poem occurrence has its own contextual role.</w:t>
+      </w:r>
+    </w:p>
+    <w:p>
+      <w:pPr>
+        <w:widowControl/>
+        <w:spacing w:before="0" w:after="120" w:line="300" w:lineRule="auto"/>
+      </w:pPr>
+      <w:r>
+        <w:rPr>
+          <w:rFonts w:ascii="Calibri" w:hAnsi="Calibri"/>
+          <w:sz w:val="22"/>
+        </w:rPr>
+        <w:t>If Frequency or Concreteness is enabled in the same run, VerseVAD may report a descriptive Spearman relationship using unique paired normalized surface types. At least three paired types are required, multiword concreteness assignments are excluded, and the coefficient does not establish causation, difficulty, or a reader effect.</w:t>
+      </w:r>
+    </w:p>
+    <w:p>
+      <w:pPr>
+        <w:widowControl/>
+        <w:spacing w:before="0" w:after="120" w:line="300" w:lineRule="auto"/>
+      </w:pPr>
+      <w:r>
+        <w:rPr>
+          <w:rFonts w:ascii="Calibri" w:hAnsi="Calibri"/>
+          <w:sz w:val="22"/>
+        </w:rPr>
+        <w:t>Read the mean and median with coverage, dispersion, response counts, source SDs, structure, represented terms, and the audit. The result describes retrospective normative lexical AoA evidence. It does not measure grade level, difficulty, familiarity, comprehension, intelligence, literary value, or reader response. Age-of-acquisition results are not diagnostic of cognitive impairment or decline.</w:t>
+      </w:r>
+    </w:p>
+    <w:p>
+      <w:pPr>
+        <w:pStyle w:val="Heading2"/>
+      </w:pPr>
+      <w:r>
+        <w:rPr>
+          <w:rFonts w:ascii="Calibri" w:hAnsi="Calibri"/>
+          <w:sz w:val="22"/>
+        </w:rPr>
         <w:t>Eight emotion associations</w:t>
       </w:r>
     </w:p>
@@ -5864,7 +6469,50 @@
           <w:rFonts w:ascii="Calibri" w:hAnsi="Calibri"/>
           <w:sz w:val="22"/>
         </w:rPr>
-        <w:t>Select one or more affective lexicons and/or enable the optional normative lexical concreteness and SUBTLEX-US frequency modules. VAD, categorical association, intensity, concreteness, and corpus-relative frequency answer different questions and remain separate. A concreteness-only or frequency-only one-poem run is allowed when the exact local workbook is available.</w:t>
+        <w:t>Select one or more affective lexicons and/or enable the optional normative lexical concreteness, SUBTLEX-US frequency, and Kuperman Age of Acquisition modules. VAD, categorical association, intensity, concreteness, corpus-relative frequency, and retrospective lexical AoA answer different questions and remain separate. Any optional module can run by itself when its exact local workbook is available.</w:t>
+      </w:r>
+    </w:p>
+    <w:p>
+      <w:pPr>
+        <w:widowControl/>
+        <w:spacing w:before="0" w:after="120" w:line="300" w:lineRule="auto"/>
+      </w:pPr>
+      <w:r>
+        <w:rPr>
+          <w:rFonts w:ascii="Calibri" w:hAnsi="Calibri"/>
+          <w:sz w:val="22"/>
+        </w:rPr>
+        <w:t xml:space="preserve">Concreteness, Frequency, and AoA are currently temporary </w:t>
+      </w:r>
+      <w:r>
+        <w:rPr>
+          <w:rFonts w:ascii="Calibri" w:hAnsi="Calibri"/>
+          <w:b/>
+          <w:sz w:val="22"/>
+        </w:rPr>
+        <w:t>One Poem</w:t>
+      </w:r>
+      <w:r>
+        <w:rPr>
+          <w:rFonts w:ascii="Calibri" w:hAnsi="Calibri"/>
+          <w:sz w:val="22"/>
+        </w:rPr>
+        <w:t xml:space="preserve"> modules. They are not yet batched, persisted, aggregated, or exported by </w:t>
+      </w:r>
+      <w:r>
+        <w:rPr>
+          <w:rFonts w:ascii="Calibri" w:hAnsi="Calibri"/>
+          <w:b/>
+          <w:sz w:val="22"/>
+        </w:rPr>
+        <w:t>Projects &amp; Corpus</w:t>
+      </w:r>
+      <w:r>
+        <w:rPr>
+          <w:rFonts w:ascii="Calibri" w:hAnsi="Calibri"/>
+          <w:sz w:val="22"/>
+        </w:rPr>
+        <w:t>.</w:t>
       </w:r>
     </w:p>
     <w:p>
@@ -6141,138 +6789,7 @@
           <w:rFonts w:ascii="Calibri" w:hAnsi="Calibri"/>
           <w:sz w:val="22"/>
         </w:rPr>
-        <w:t xml:space="preserve"> scope.</w:t>
-      </w:r>
-    </w:p>
-    <w:p>
-      <w:pPr>
-        <w:widowControl/>
-        <w:spacing w:before="0" w:after="120" w:line="300" w:lineRule="auto"/>
-      </w:pPr>
-      <w:r>
-        <w:rPr>
-          <w:rFonts w:ascii="Calibri" w:hAnsi="Calibri"/>
-          <w:sz w:val="22"/>
-        </w:rPr>
-        <w:t xml:space="preserve">Under </w:t>
-      </w:r>
-      <w:r>
-        <w:rPr>
-          <w:rFonts w:ascii="Calibri" w:hAnsi="Calibri"/>
-          <w:b/>
-          <w:sz w:val="22"/>
-        </w:rPr>
-        <w:t>Stopword settings</w:t>
-      </w:r>
-      <w:r>
-        <w:rPr>
-          <w:rFonts w:ascii="Calibri" w:hAnsi="Calibri"/>
-          <w:sz w:val="22"/>
-        </w:rPr>
-        <w:t>, inspect or change the secondary-view policy. The all-matched result is always preserved even when only one view is displayed.</w:t>
-      </w:r>
-    </w:p>
-    <w:p>
-      <w:pPr>
-        <w:pStyle w:val="Heading2"/>
-      </w:pPr>
-      <w:r>
-        <w:rPr>
-          <w:rFonts w:ascii="Calibri" w:hAnsi="Calibri"/>
-          <w:sz w:val="22"/>
-        </w:rPr>
-        <w:t>Overview tab</w:t>
-      </w:r>
-    </w:p>
-    <w:p>
-      <w:pPr>
-        <w:widowControl/>
-        <w:spacing w:before="0" w:after="120" w:line="300" w:lineRule="auto"/>
-      </w:pPr>
-      <w:r>
-        <w:rPr>
-          <w:rFonts w:ascii="Calibri" w:hAnsi="Calibri"/>
-          <w:sz w:val="22"/>
-        </w:rPr>
-        <w:t>Read coverage before means. The tab shows ordinary and content-focused coverage, matched counts, active methodology, excluded stopword counts, interpretive framing, and warnings.</w:t>
-      </w:r>
-    </w:p>
-    <w:p>
-      <w:pPr>
-        <w:pStyle w:val="Heading2"/>
-      </w:pPr>
-      <w:r>
-        <w:rPr>
-          <w:rFonts w:ascii="Calibri" w:hAnsi="Calibri"/>
-          <w:sz w:val="22"/>
-        </w:rPr>
-        <w:t>Language Profile tab</w:t>
-      </w:r>
-    </w:p>
-    <w:p>
-      <w:pPr>
-        <w:widowControl/>
-        <w:spacing w:before="0" w:after="120" w:line="300" w:lineRule="auto"/>
-      </w:pPr>
-      <w:r>
-        <w:rPr>
-          <w:rFonts w:ascii="Calibri" w:hAnsi="Calibri"/>
-          <w:sz w:val="22"/>
-        </w:rPr>
-        <w:t xml:space="preserve">The </w:t>
-      </w:r>
-      <w:r>
-        <w:rPr>
-          <w:rFonts w:ascii="Calibri" w:hAnsi="Calibri"/>
-          <w:b/>
-          <w:sz w:val="22"/>
-        </w:rPr>
-        <w:t>Shared Processing Record</w:t>
-      </w:r>
-      <w:r>
-        <w:rPr>
-          <w:rFonts w:ascii="Calibri" w:hAnsi="Calibri"/>
-          <w:sz w:val="22"/>
-        </w:rPr>
-        <w:t xml:space="preserve"> first reports stanzas, physical lines, model sentences, total and lexical tokens, recipe/configuration IDs, model pipeline, dependency coverage, named-entity status, and processing cautions. It is the common local representation used by every selected lexicon.</w:t>
-      </w:r>
-    </w:p>
-    <w:p>
-      <w:pPr>
-        <w:widowControl/>
-        <w:spacing w:before="0" w:after="120" w:line="300" w:lineRule="auto"/>
-      </w:pPr>
-      <w:r>
-        <w:rPr>
-          <w:rFonts w:ascii="Calibri" w:hAnsi="Calibri"/>
-          <w:sz w:val="22"/>
-        </w:rPr>
-        <w:t>The tab then reports part-of-speech counts and relative shares for all eligible lexical tokens, independently of lexicon coverage. It also shows unique normalized types and example forms. The denominator is displayed, and a caution explains that the labels are model-generated.</w:t>
-      </w:r>
-    </w:p>
-    <w:p>
-      <w:pPr>
-        <w:pStyle w:val="Heading2"/>
-      </w:pPr>
-      <w:r>
-        <w:rPr>
-          <w:rFonts w:ascii="Calibri" w:hAnsi="Calibri"/>
-          <w:sz w:val="22"/>
-        </w:rPr>
-        <w:t>VAD Profile tab</w:t>
-      </w:r>
-    </w:p>
-    <w:p>
-      <w:pPr>
-        <w:widowControl/>
-        <w:spacing w:before="0" w:after="120" w:line="300" w:lineRule="auto"/>
-      </w:pPr>
-      <w:r>
-        <w:rPr>
-          <w:rFonts w:ascii="Calibri" w:hAnsi="Calibri"/>
-          <w:sz w:val="22"/>
-        </w:rPr>
-        <w:t>This tab contains:</w:t>
+        <w:t xml:space="preserve"> scope;</w:t>
       </w:r>
     </w:p>
     <w:p>
@@ -6290,7 +6807,7 @@
           <w:rFonts w:ascii="Calibri" w:hAnsi="Calibri"/>
           <w:sz w:val="22"/>
         </w:rPr>
-        <w:t>parallel normalized VAD charts;</w:t>
+        <w:t>AoA early and later orientation thresholds;</w:t>
       </w:r>
     </w:p>
     <w:p>
@@ -6308,7 +6825,7 @@
           <w:rFonts w:ascii="Calibri" w:hAnsi="Calibri"/>
           <w:sz w:val="22"/>
         </w:rPr>
-        <w:t>definitions of valence, arousal, and dominance;</w:t>
+        <w:t>whether AoA excludes model-tagged proper nouns;</w:t>
       </w:r>
     </w:p>
     <w:p>
@@ -6326,7 +6843,7 @@
           <w:rFonts w:ascii="Calibri" w:hAnsi="Calibri"/>
           <w:sz w:val="22"/>
         </w:rPr>
-        <w:t>token- and type-weighted values for each analysis view;</w:t>
+        <w:t>whether AoA permits lemma fallback;</w:t>
       </w:r>
     </w:p>
     <w:p>
@@ -6344,7 +6861,7 @@
           <w:rFonts w:ascii="Calibri" w:hAnsi="Calibri"/>
           <w:sz w:val="22"/>
         </w:rPr>
-        <w:t>plain-language midpoint interpretations;</w:t>
+        <w:t>the AoA low-coverage caution threshold; and</w:t>
       </w:r>
     </w:p>
     <w:p>
@@ -6362,7 +6879,153 @@
           <w:rFonts w:ascii="Calibri" w:hAnsi="Calibri"/>
           <w:sz w:val="22"/>
         </w:rPr>
-        <w:t>population dispersion;</w:t>
+        <w:t xml:space="preserve">whether AoA uses the non-default contextual </w:t>
+      </w:r>
+      <w:r>
+        <w:rPr>
+          <w:rFonts w:ascii="Calibri" w:hAnsi="Calibri"/>
+          <w:b/>
+          <w:sz w:val="22"/>
+        </w:rPr>
+        <w:t>Content words only</w:t>
+      </w:r>
+      <w:r>
+        <w:rPr>
+          <w:rFonts w:ascii="Calibri" w:hAnsi="Calibri"/>
+          <w:sz w:val="22"/>
+        </w:rPr>
+        <w:t xml:space="preserve"> scope.</w:t>
+      </w:r>
+    </w:p>
+    <w:p>
+      <w:pPr>
+        <w:widowControl/>
+        <w:spacing w:before="0" w:after="120" w:line="300" w:lineRule="auto"/>
+      </w:pPr>
+      <w:r>
+        <w:rPr>
+          <w:rFonts w:ascii="Calibri" w:hAnsi="Calibri"/>
+          <w:sz w:val="22"/>
+        </w:rPr>
+        <w:t xml:space="preserve">Under </w:t>
+      </w:r>
+      <w:r>
+        <w:rPr>
+          <w:rFonts w:ascii="Calibri" w:hAnsi="Calibri"/>
+          <w:b/>
+          <w:sz w:val="22"/>
+        </w:rPr>
+        <w:t>Stopword settings</w:t>
+      </w:r>
+      <w:r>
+        <w:rPr>
+          <w:rFonts w:ascii="Calibri" w:hAnsi="Calibri"/>
+          <w:sz w:val="22"/>
+        </w:rPr>
+        <w:t>, inspect or change the secondary-view policy. The all-matched result is always preserved even when only one view is displayed.</w:t>
+      </w:r>
+    </w:p>
+    <w:p>
+      <w:pPr>
+        <w:pStyle w:val="Heading2"/>
+      </w:pPr>
+      <w:r>
+        <w:rPr>
+          <w:rFonts w:ascii="Calibri" w:hAnsi="Calibri"/>
+          <w:sz w:val="22"/>
+        </w:rPr>
+        <w:t>Overview tab</w:t>
+      </w:r>
+    </w:p>
+    <w:p>
+      <w:pPr>
+        <w:widowControl/>
+        <w:spacing w:before="0" w:after="120" w:line="300" w:lineRule="auto"/>
+      </w:pPr>
+      <w:r>
+        <w:rPr>
+          <w:rFonts w:ascii="Calibri" w:hAnsi="Calibri"/>
+          <w:sz w:val="22"/>
+        </w:rPr>
+        <w:t>Read coverage before means. The tab shows ordinary and content-focused coverage, matched counts, active methodology, excluded stopword counts, interpretive framing, and warnings.</w:t>
+      </w:r>
+    </w:p>
+    <w:p>
+      <w:pPr>
+        <w:pStyle w:val="Heading2"/>
+      </w:pPr>
+      <w:r>
+        <w:rPr>
+          <w:rFonts w:ascii="Calibri" w:hAnsi="Calibri"/>
+          <w:sz w:val="22"/>
+        </w:rPr>
+        <w:t>Language Profile tab</w:t>
+      </w:r>
+    </w:p>
+    <w:p>
+      <w:pPr>
+        <w:widowControl/>
+        <w:spacing w:before="0" w:after="120" w:line="300" w:lineRule="auto"/>
+      </w:pPr>
+      <w:r>
+        <w:rPr>
+          <w:rFonts w:ascii="Calibri" w:hAnsi="Calibri"/>
+          <w:sz w:val="22"/>
+        </w:rPr>
+        <w:t xml:space="preserve">The </w:t>
+      </w:r>
+      <w:r>
+        <w:rPr>
+          <w:rFonts w:ascii="Calibri" w:hAnsi="Calibri"/>
+          <w:b/>
+          <w:sz w:val="22"/>
+        </w:rPr>
+        <w:t>Shared Processing Record</w:t>
+      </w:r>
+      <w:r>
+        <w:rPr>
+          <w:rFonts w:ascii="Calibri" w:hAnsi="Calibri"/>
+          <w:sz w:val="22"/>
+        </w:rPr>
+        <w:t xml:space="preserve"> first reports stanzas, physical lines, model sentences, total and lexical tokens, recipe/configuration IDs, model pipeline, dependency coverage, named-entity status, and processing cautions. It is the common local representation used by every selected lexicon.</w:t>
+      </w:r>
+    </w:p>
+    <w:p>
+      <w:pPr>
+        <w:widowControl/>
+        <w:spacing w:before="0" w:after="120" w:line="300" w:lineRule="auto"/>
+      </w:pPr>
+      <w:r>
+        <w:rPr>
+          <w:rFonts w:ascii="Calibri" w:hAnsi="Calibri"/>
+          <w:sz w:val="22"/>
+        </w:rPr>
+        <w:t>The tab then reports part-of-speech counts and relative shares for all eligible lexical tokens, independently of lexicon coverage. It also shows unique normalized types and example forms. The denominator is displayed, and a caution explains that the labels are model-generated.</w:t>
+      </w:r>
+    </w:p>
+    <w:p>
+      <w:pPr>
+        <w:pStyle w:val="Heading2"/>
+      </w:pPr>
+      <w:r>
+        <w:rPr>
+          <w:rFonts w:ascii="Calibri" w:hAnsi="Calibri"/>
+          <w:sz w:val="22"/>
+        </w:rPr>
+        <w:t>VAD Profile tab</w:t>
+      </w:r>
+    </w:p>
+    <w:p>
+      <w:pPr>
+        <w:widowControl/>
+        <w:spacing w:before="0" w:after="120" w:line="300" w:lineRule="auto"/>
+      </w:pPr>
+      <w:r>
+        <w:rPr>
+          <w:rFonts w:ascii="Calibri" w:hAnsi="Calibri"/>
+          <w:sz w:val="22"/>
+        </w:rPr>
+        <w:t>This tab contains:</w:t>
       </w:r>
     </w:p>
     <w:p>
@@ -6380,7 +7043,7 @@
           <w:rFonts w:ascii="Calibri" w:hAnsi="Calibri"/>
           <w:sz w:val="22"/>
         </w:rPr>
-        <w:t>stopword-sensitivity differences;</w:t>
+        <w:t>parallel normalized VAD charts;</w:t>
       </w:r>
     </w:p>
     <w:p>
@@ -6398,7 +7061,7 @@
           <w:rFonts w:ascii="Calibri" w:hAnsi="Calibri"/>
           <w:sz w:val="22"/>
         </w:rPr>
-        <w:t>cumulative normalized totals;</w:t>
+        <w:t>definitions of valence, arousal, and dominance;</w:t>
       </w:r>
     </w:p>
     <w:p>
@@ -6416,7 +7079,7 @@
           <w:rFonts w:ascii="Calibri" w:hAnsi="Calibri"/>
           <w:sz w:val="22"/>
         </w:rPr>
-        <w:t>top midpoint-centered contributors;</w:t>
+        <w:t>token- and type-weighted values for each analysis view;</w:t>
       </w:r>
     </w:p>
     <w:p>
@@ -6434,6 +7097,96 @@
           <w:rFonts w:ascii="Calibri" w:hAnsi="Calibri"/>
           <w:sz w:val="22"/>
         </w:rPr>
+        <w:t>plain-language midpoint interpretations;</w:t>
+      </w:r>
+    </w:p>
+    <w:p>
+      <w:pPr>
+        <w:widowControl/>
+        <w:numPr>
+          <w:ilvl w:val="0"/>
+          <w:numId w:val="10"/>
+        </w:numPr>
+        <w:spacing w:before="0" w:after="80" w:line="300" w:lineRule="auto"/>
+        <w:ind w:left="540" w:hanging="271"/>
+      </w:pPr>
+      <w:r>
+        <w:rPr>
+          <w:rFonts w:ascii="Calibri" w:hAnsi="Calibri"/>
+          <w:sz w:val="22"/>
+        </w:rPr>
+        <w:t>population dispersion;</w:t>
+      </w:r>
+    </w:p>
+    <w:p>
+      <w:pPr>
+        <w:widowControl/>
+        <w:numPr>
+          <w:ilvl w:val="0"/>
+          <w:numId w:val="10"/>
+        </w:numPr>
+        <w:spacing w:before="0" w:after="80" w:line="300" w:lineRule="auto"/>
+        <w:ind w:left="540" w:hanging="271"/>
+      </w:pPr>
+      <w:r>
+        <w:rPr>
+          <w:rFonts w:ascii="Calibri" w:hAnsi="Calibri"/>
+          <w:sz w:val="22"/>
+        </w:rPr>
+        <w:t>stopword-sensitivity differences;</w:t>
+      </w:r>
+    </w:p>
+    <w:p>
+      <w:pPr>
+        <w:widowControl/>
+        <w:numPr>
+          <w:ilvl w:val="0"/>
+          <w:numId w:val="10"/>
+        </w:numPr>
+        <w:spacing w:before="0" w:after="80" w:line="300" w:lineRule="auto"/>
+        <w:ind w:left="540" w:hanging="271"/>
+      </w:pPr>
+      <w:r>
+        <w:rPr>
+          <w:rFonts w:ascii="Calibri" w:hAnsi="Calibri"/>
+          <w:sz w:val="22"/>
+        </w:rPr>
+        <w:t>cumulative normalized totals;</w:t>
+      </w:r>
+    </w:p>
+    <w:p>
+      <w:pPr>
+        <w:widowControl/>
+        <w:numPr>
+          <w:ilvl w:val="0"/>
+          <w:numId w:val="10"/>
+        </w:numPr>
+        <w:spacing w:before="0" w:after="80" w:line="300" w:lineRule="auto"/>
+        <w:ind w:left="540" w:hanging="271"/>
+      </w:pPr>
+      <w:r>
+        <w:rPr>
+          <w:rFonts w:ascii="Calibri" w:hAnsi="Calibri"/>
+          <w:sz w:val="22"/>
+        </w:rPr>
+        <w:t>top midpoint-centered contributors;</w:t>
+      </w:r>
+    </w:p>
+    <w:p>
+      <w:pPr>
+        <w:widowControl/>
+        <w:numPr>
+          <w:ilvl w:val="0"/>
+          <w:numId w:val="10"/>
+        </w:numPr>
+        <w:spacing w:before="0" w:after="80" w:line="300" w:lineRule="auto"/>
+        <w:ind w:left="540" w:hanging="271"/>
+      </w:pPr>
+      <w:r>
+        <w:rPr>
+          <w:rFonts w:ascii="Calibri" w:hAnsi="Calibri"/>
+          <w:sz w:val="22"/>
+        </w:rPr>
         <w:t>original source scales and normalization formulas.</w:t>
       </w:r>
     </w:p>
@@ -6596,6 +7349,104 @@
           <w:sz w:val="22"/>
         </w:rPr>
         <w:t xml:space="preserve"> scope was used. Exact observed form, lemma, documented fallback, unmatched, and ineligible decisions stay distinct. The source workbook is read-only; a missing, changed, malformed, or unsupported source prevents activation.</w:t>
+      </w:r>
+    </w:p>
+    <w:p>
+      <w:pPr>
+        <w:pStyle w:val="Heading2"/>
+      </w:pPr>
+      <w:r>
+        <w:rPr>
+          <w:rFonts w:ascii="Calibri" w:hAnsi="Calibri"/>
+          <w:sz w:val="22"/>
+        </w:rPr>
+        <w:t>Age of Acquisition tab</w:t>
+      </w:r>
+    </w:p>
+    <w:p>
+      <w:pPr>
+        <w:widowControl/>
+        <w:spacing w:before="0" w:after="120" w:line="300" w:lineRule="auto"/>
+      </w:pPr>
+      <w:r>
+        <w:rPr>
+          <w:rFonts w:ascii="Calibri" w:hAnsi="Calibri"/>
+          <w:sz w:val="22"/>
+        </w:rPr>
+        <w:t>This tab appears when the optional Kuperman module is enabled. It shows source-age mean, median, dispersion, range, token/type coverage, configured early/middle/later bands, source-response evidence, warnings, line and stanza patterns, model-assigned POS groups, earliest/latest represented terms, complete token audit, and source/configuration provenance. When corresponding modules are enabled, it also shows descriptive type-level relationships with Frequency and Concreteness.</w:t>
+      </w:r>
+    </w:p>
+    <w:p>
+      <w:pPr>
+        <w:widowControl/>
+        <w:spacing w:before="0" w:after="120" w:line="300" w:lineRule="auto"/>
+      </w:pPr>
+      <w:r>
+        <w:rPr>
+          <w:rFonts w:ascii="Calibri" w:hAnsi="Calibri"/>
+          <w:sz w:val="22"/>
+        </w:rPr>
+        <w:t xml:space="preserve">The page identifies whether the default all-lexical-token scope or the non-default contextual </w:t>
+      </w:r>
+      <w:r>
+        <w:rPr>
+          <w:rFonts w:ascii="Consolas" w:hAnsi="Consolas"/>
+          <w:color w:val="1F4D78"/>
+          <w:sz w:val="19"/>
+        </w:rPr>
+        <w:t>NOUN</w:t>
+      </w:r>
+      <w:r>
+        <w:rPr>
+          <w:rFonts w:ascii="Calibri" w:hAnsi="Calibri"/>
+          <w:sz w:val="22"/>
+        </w:rPr>
+        <w:t>/</w:t>
+      </w:r>
+      <w:r>
+        <w:rPr>
+          <w:rFonts w:ascii="Consolas" w:hAnsi="Consolas"/>
+          <w:color w:val="1F4D78"/>
+          <w:sz w:val="19"/>
+        </w:rPr>
+        <w:t>VERB</w:t>
+      </w:r>
+      <w:r>
+        <w:rPr>
+          <w:rFonts w:ascii="Calibri" w:hAnsi="Calibri"/>
+          <w:sz w:val="22"/>
+        </w:rPr>
+        <w:t>/</w:t>
+      </w:r>
+      <w:r>
+        <w:rPr>
+          <w:rFonts w:ascii="Consolas" w:hAnsi="Consolas"/>
+          <w:color w:val="1F4D78"/>
+          <w:sz w:val="19"/>
+        </w:rPr>
+        <w:t>ADJ</w:t>
+      </w:r>
+      <w:r>
+        <w:rPr>
+          <w:rFonts w:ascii="Calibri" w:hAnsi="Calibri"/>
+          <w:sz w:val="22"/>
+        </w:rPr>
+        <w:t>/</w:t>
+      </w:r>
+      <w:r>
+        <w:rPr>
+          <w:rFonts w:ascii="Consolas" w:hAnsi="Consolas"/>
+          <w:color w:val="1F4D78"/>
+          <w:sz w:val="19"/>
+        </w:rPr>
+        <w:t>ADV</w:t>
+      </w:r>
+      <w:r>
+        <w:rPr>
+          <w:rFonts w:ascii="Calibri" w:hAnsi="Calibri"/>
+          <w:sz w:val="22"/>
+        </w:rPr>
+        <w:t xml:space="preserve"> scope was used. Exact observed form, lemma, documented fallback, source-unrated, unmatched, and ineligible decisions stay distinct. It always displays the required non-diagnostic caution. The source workbook is read-only; a missing, changed, malformed, or unsupported source prevents activation.</w:t>
       </w:r>
     </w:p>
     <w:p>
@@ -10511,6 +11362,470 @@
           </w:p>
         </w:tc>
       </w:tr>
+      <w:tr>
+        <w:trPr>
+          <w:cantSplit w:val="true"/>
+        </w:trPr>
+        <w:tc>
+          <w:tcPr>
+            <w:tcW w:type="dxa" w:w="3600"/>
+            <w:vAlign w:val="center"/>
+            <w:tcMar>
+              <w:top w:w="80" w:type="dxa"/>
+              <w:bottom w:w="80" w:type="dxa"/>
+              <w:start w:w="120" w:type="dxa"/>
+              <w:end w:w="120" w:type="dxa"/>
+            </w:tcMar>
+          </w:tcPr>
+          <w:p>
+            <w:pPr>
+              <w:widowControl/>
+              <w:spacing w:before="0" w:after="0" w:line="252" w:lineRule="auto"/>
+            </w:pPr>
+            <w:r/>
+            <w:r>
+              <w:rPr>
+                <w:rFonts w:ascii="Consolas" w:hAnsi="Consolas"/>
+                <w:color w:val="1F4D78"/>
+                <w:sz w:val="17"/>
+              </w:rPr>
+              <w:t>aoa_summary.csv</w:t>
+            </w:r>
+          </w:p>
+        </w:tc>
+        <w:tc>
+          <w:tcPr>
+            <w:tcW w:type="dxa" w:w="5760"/>
+            <w:vAlign w:val="center"/>
+            <w:tcMar>
+              <w:top w:w="80" w:type="dxa"/>
+              <w:bottom w:w="80" w:type="dxa"/>
+              <w:start w:w="120" w:type="dxa"/>
+              <w:end w:w="120" w:type="dxa"/>
+            </w:tcMar>
+          </w:tcPr>
+          <w:p>
+            <w:pPr>
+              <w:widowControl/>
+              <w:spacing w:before="0" w:after="0" w:line="252" w:lineRule="auto"/>
+            </w:pPr>
+            <w:r/>
+            <w:r>
+              <w:rPr>
+                <w:rFonts w:ascii="Calibri" w:hAnsi="Calibri"/>
+                <w:sz w:val="18"/>
+              </w:rPr>
+              <w:t>Source-age statistics, thresholds, coverage, response cautions, and source identity</w:t>
+            </w:r>
+          </w:p>
+        </w:tc>
+      </w:tr>
+      <w:tr>
+        <w:trPr>
+          <w:cantSplit w:val="true"/>
+        </w:trPr>
+        <w:tc>
+          <w:tcPr>
+            <w:tcW w:type="dxa" w:w="3600"/>
+            <w:vAlign w:val="center"/>
+            <w:tcMar>
+              <w:top w:w="80" w:type="dxa"/>
+              <w:bottom w:w="80" w:type="dxa"/>
+              <w:start w:w="120" w:type="dxa"/>
+              <w:end w:w="120" w:type="dxa"/>
+            </w:tcMar>
+          </w:tcPr>
+          <w:p>
+            <w:pPr>
+              <w:widowControl/>
+              <w:spacing w:before="0" w:after="0" w:line="252" w:lineRule="auto"/>
+            </w:pPr>
+            <w:r/>
+            <w:r>
+              <w:rPr>
+                <w:rFonts w:ascii="Consolas" w:hAnsi="Consolas"/>
+                <w:color w:val="1F4D78"/>
+                <w:sz w:val="17"/>
+              </w:rPr>
+              <w:t>aoa_distribution.csv</w:t>
+            </w:r>
+          </w:p>
+        </w:tc>
+        <w:tc>
+          <w:tcPr>
+            <w:tcW w:type="dxa" w:w="5760"/>
+            <w:vAlign w:val="center"/>
+            <w:tcMar>
+              <w:top w:w="80" w:type="dxa"/>
+              <w:bottom w:w="80" w:type="dxa"/>
+              <w:start w:w="120" w:type="dxa"/>
+              <w:end w:w="120" w:type="dxa"/>
+            </w:tcMar>
+          </w:tcPr>
+          <w:p>
+            <w:pPr>
+              <w:widowControl/>
+              <w:spacing w:before="0" w:after="0" w:line="252" w:lineRule="auto"/>
+            </w:pPr>
+            <w:r/>
+            <w:r>
+              <w:rPr>
+                <w:rFonts w:ascii="Calibri" w:hAnsi="Calibri"/>
+                <w:sz w:val="18"/>
+              </w:rPr>
+              <w:t>Distribution-ready ages and configured early/middle/later band counts and proportions</w:t>
+            </w:r>
+          </w:p>
+        </w:tc>
+      </w:tr>
+      <w:tr>
+        <w:trPr>
+          <w:cantSplit w:val="true"/>
+        </w:trPr>
+        <w:tc>
+          <w:tcPr>
+            <w:tcW w:type="dxa" w:w="3600"/>
+            <w:vAlign w:val="center"/>
+            <w:tcMar>
+              <w:top w:w="80" w:type="dxa"/>
+              <w:bottom w:w="80" w:type="dxa"/>
+              <w:start w:w="120" w:type="dxa"/>
+              <w:end w:w="120" w:type="dxa"/>
+            </w:tcMar>
+          </w:tcPr>
+          <w:p>
+            <w:pPr>
+              <w:widowControl/>
+              <w:spacing w:before="0" w:after="0" w:line="252" w:lineRule="auto"/>
+            </w:pPr>
+            <w:r/>
+            <w:r>
+              <w:rPr>
+                <w:rFonts w:ascii="Consolas" w:hAnsi="Consolas"/>
+                <w:color w:val="1F4D78"/>
+                <w:sz w:val="17"/>
+              </w:rPr>
+              <w:t>aoa_by_structure.csv</w:t>
+            </w:r>
+          </w:p>
+        </w:tc>
+        <w:tc>
+          <w:tcPr>
+            <w:tcW w:type="dxa" w:w="5760"/>
+            <w:vAlign w:val="center"/>
+            <w:tcMar>
+              <w:top w:w="80" w:type="dxa"/>
+              <w:bottom w:w="80" w:type="dxa"/>
+              <w:start w:w="120" w:type="dxa"/>
+              <w:end w:w="120" w:type="dxa"/>
+            </w:tcMar>
+          </w:tcPr>
+          <w:p>
+            <w:pPr>
+              <w:widowControl/>
+              <w:spacing w:before="0" w:after="0" w:line="252" w:lineRule="auto"/>
+            </w:pPr>
+            <w:r/>
+            <w:r>
+              <w:rPr>
+                <w:rFonts w:ascii="Calibri" w:hAnsi="Calibri"/>
+                <w:sz w:val="18"/>
+              </w:rPr>
+              <w:t>Physical-line and stanza summaries with eligible/matched counts and coverage</w:t>
+            </w:r>
+          </w:p>
+        </w:tc>
+      </w:tr>
+      <w:tr>
+        <w:trPr>
+          <w:cantSplit w:val="true"/>
+        </w:trPr>
+        <w:tc>
+          <w:tcPr>
+            <w:tcW w:type="dxa" w:w="3600"/>
+            <w:vAlign w:val="center"/>
+            <w:tcMar>
+              <w:top w:w="80" w:type="dxa"/>
+              <w:bottom w:w="80" w:type="dxa"/>
+              <w:start w:w="120" w:type="dxa"/>
+              <w:end w:w="120" w:type="dxa"/>
+            </w:tcMar>
+          </w:tcPr>
+          <w:p>
+            <w:pPr>
+              <w:widowControl/>
+              <w:spacing w:before="0" w:after="0" w:line="252" w:lineRule="auto"/>
+            </w:pPr>
+            <w:r/>
+            <w:r>
+              <w:rPr>
+                <w:rFonts w:ascii="Consolas" w:hAnsi="Consolas"/>
+                <w:color w:val="1F4D78"/>
+                <w:sz w:val="17"/>
+              </w:rPr>
+              <w:t>aoa_by_pos.csv</w:t>
+            </w:r>
+          </w:p>
+        </w:tc>
+        <w:tc>
+          <w:tcPr>
+            <w:tcW w:type="dxa" w:w="5760"/>
+            <w:vAlign w:val="center"/>
+            <w:tcMar>
+              <w:top w:w="80" w:type="dxa"/>
+              <w:bottom w:w="80" w:type="dxa"/>
+              <w:start w:w="120" w:type="dxa"/>
+              <w:end w:w="120" w:type="dxa"/>
+            </w:tcMar>
+          </w:tcPr>
+          <w:p>
+            <w:pPr>
+              <w:widowControl/>
+              <w:spacing w:before="0" w:after="0" w:line="252" w:lineRule="auto"/>
+            </w:pPr>
+            <w:r/>
+            <w:r>
+              <w:rPr>
+                <w:rFonts w:ascii="Calibri" w:hAnsi="Calibri"/>
+                <w:sz w:val="18"/>
+              </w:rPr>
+              <w:t>Model-assigned part-of-speech summaries</w:t>
+            </w:r>
+          </w:p>
+        </w:tc>
+      </w:tr>
+      <w:tr>
+        <w:trPr>
+          <w:cantSplit w:val="true"/>
+        </w:trPr>
+        <w:tc>
+          <w:tcPr>
+            <w:tcW w:type="dxa" w:w="3600"/>
+            <w:vAlign w:val="center"/>
+            <w:tcMar>
+              <w:top w:w="80" w:type="dxa"/>
+              <w:bottom w:w="80" w:type="dxa"/>
+              <w:start w:w="120" w:type="dxa"/>
+              <w:end w:w="120" w:type="dxa"/>
+            </w:tcMar>
+          </w:tcPr>
+          <w:p>
+            <w:pPr>
+              <w:widowControl/>
+              <w:spacing w:before="0" w:after="0" w:line="252" w:lineRule="auto"/>
+            </w:pPr>
+            <w:r/>
+            <w:r>
+              <w:rPr>
+                <w:rFonts w:ascii="Consolas" w:hAnsi="Consolas"/>
+                <w:color w:val="1F4D78"/>
+                <w:sz w:val="17"/>
+              </w:rPr>
+              <w:t>aoa_terms.csv</w:t>
+            </w:r>
+          </w:p>
+        </w:tc>
+        <w:tc>
+          <w:tcPr>
+            <w:tcW w:type="dxa" w:w="5760"/>
+            <w:vAlign w:val="center"/>
+            <w:tcMar>
+              <w:top w:w="80" w:type="dxa"/>
+              <w:bottom w:w="80" w:type="dxa"/>
+              <w:start w:w="120" w:type="dxa"/>
+              <w:end w:w="120" w:type="dxa"/>
+            </w:tcMar>
+          </w:tcPr>
+          <w:p>
+            <w:pPr>
+              <w:widowControl/>
+              <w:spacing w:before="0" w:after="0" w:line="252" w:lineRule="auto"/>
+            </w:pPr>
+            <w:r/>
+            <w:r>
+              <w:rPr>
+                <w:rFonts w:ascii="Calibri" w:hAnsi="Calibri"/>
+                <w:sz w:val="18"/>
+              </w:rPr>
+              <w:t>Represented source terms, ages, response evidence, repetition, ranks, and source-row fields</w:t>
+            </w:r>
+          </w:p>
+        </w:tc>
+      </w:tr>
+      <w:tr>
+        <w:trPr>
+          <w:cantSplit w:val="true"/>
+        </w:trPr>
+        <w:tc>
+          <w:tcPr>
+            <w:tcW w:type="dxa" w:w="3600"/>
+            <w:vAlign w:val="center"/>
+            <w:tcMar>
+              <w:top w:w="80" w:type="dxa"/>
+              <w:bottom w:w="80" w:type="dxa"/>
+              <w:start w:w="120" w:type="dxa"/>
+              <w:end w:w="120" w:type="dxa"/>
+            </w:tcMar>
+          </w:tcPr>
+          <w:p>
+            <w:pPr>
+              <w:widowControl/>
+              <w:spacing w:before="0" w:after="0" w:line="252" w:lineRule="auto"/>
+            </w:pPr>
+            <w:r/>
+            <w:r>
+              <w:rPr>
+                <w:rFonts w:ascii="Consolas" w:hAnsi="Consolas"/>
+                <w:color w:val="1F4D78"/>
+                <w:sz w:val="17"/>
+              </w:rPr>
+              <w:t>aoa_relationships.csv</w:t>
+            </w:r>
+          </w:p>
+        </w:tc>
+        <w:tc>
+          <w:tcPr>
+            <w:tcW w:type="dxa" w:w="5760"/>
+            <w:vAlign w:val="center"/>
+            <w:tcMar>
+              <w:top w:w="80" w:type="dxa"/>
+              <w:bottom w:w="80" w:type="dxa"/>
+              <w:start w:w="120" w:type="dxa"/>
+              <w:end w:w="120" w:type="dxa"/>
+            </w:tcMar>
+          </w:tcPr>
+          <w:p>
+            <w:pPr>
+              <w:widowControl/>
+              <w:spacing w:before="0" w:after="0" w:line="252" w:lineRule="auto"/>
+            </w:pPr>
+            <w:r/>
+            <w:r>
+              <w:rPr>
+                <w:rFonts w:ascii="Calibri" w:hAnsi="Calibri"/>
+                <w:sz w:val="18"/>
+              </w:rPr>
+              <w:t>Optional descriptive unique-surface-type relationships with enabled Frequency and Concreteness results</w:t>
+            </w:r>
+          </w:p>
+        </w:tc>
+      </w:tr>
+      <w:tr>
+        <w:trPr>
+          <w:cantSplit w:val="true"/>
+        </w:trPr>
+        <w:tc>
+          <w:tcPr>
+            <w:tcW w:type="dxa" w:w="3600"/>
+            <w:vAlign w:val="center"/>
+            <w:tcMar>
+              <w:top w:w="80" w:type="dxa"/>
+              <w:bottom w:w="80" w:type="dxa"/>
+              <w:start w:w="120" w:type="dxa"/>
+              <w:end w:w="120" w:type="dxa"/>
+            </w:tcMar>
+          </w:tcPr>
+          <w:p>
+            <w:pPr>
+              <w:widowControl/>
+              <w:spacing w:before="0" w:after="0" w:line="252" w:lineRule="auto"/>
+            </w:pPr>
+            <w:r/>
+            <w:r>
+              <w:rPr>
+                <w:rFonts w:ascii="Consolas" w:hAnsi="Consolas"/>
+                <w:color w:val="1F4D78"/>
+                <w:sz w:val="17"/>
+              </w:rPr>
+              <w:t>aoa_token_audit.csv</w:t>
+            </w:r>
+          </w:p>
+        </w:tc>
+        <w:tc>
+          <w:tcPr>
+            <w:tcW w:type="dxa" w:w="5760"/>
+            <w:vAlign w:val="center"/>
+            <w:tcMar>
+              <w:top w:w="80" w:type="dxa"/>
+              <w:bottom w:w="80" w:type="dxa"/>
+              <w:start w:w="120" w:type="dxa"/>
+              <w:end w:w="120" w:type="dxa"/>
+            </w:tcMar>
+          </w:tcPr>
+          <w:p>
+            <w:pPr>
+              <w:widowControl/>
+              <w:spacing w:before="0" w:after="0" w:line="252" w:lineRule="auto"/>
+            </w:pPr>
+            <w:r/>
+            <w:r>
+              <w:rPr>
+                <w:rFonts w:ascii="Calibri" w:hAnsi="Calibri"/>
+                <w:sz w:val="18"/>
+              </w:rPr>
+              <w:t>Every token's eligibility, POS, matching method, source row, age or missing value, source-response evidence, and reason</w:t>
+            </w:r>
+          </w:p>
+        </w:tc>
+      </w:tr>
+      <w:tr>
+        <w:trPr>
+          <w:cantSplit w:val="true"/>
+        </w:trPr>
+        <w:tc>
+          <w:tcPr>
+            <w:tcW w:type="dxa" w:w="3600"/>
+            <w:vAlign w:val="center"/>
+            <w:tcMar>
+              <w:top w:w="80" w:type="dxa"/>
+              <w:bottom w:w="80" w:type="dxa"/>
+              <w:start w:w="120" w:type="dxa"/>
+              <w:end w:w="120" w:type="dxa"/>
+            </w:tcMar>
+          </w:tcPr>
+          <w:p>
+            <w:pPr>
+              <w:widowControl/>
+              <w:spacing w:before="0" w:after="0" w:line="252" w:lineRule="auto"/>
+            </w:pPr>
+            <w:r/>
+            <w:r>
+              <w:rPr>
+                <w:rFonts w:ascii="Consolas" w:hAnsi="Consolas"/>
+                <w:color w:val="1F4D78"/>
+                <w:sz w:val="17"/>
+              </w:rPr>
+              <w:t>aoa_result.json</w:t>
+            </w:r>
+          </w:p>
+        </w:tc>
+        <w:tc>
+          <w:tcPr>
+            <w:tcW w:type="dxa" w:w="5760"/>
+            <w:vAlign w:val="center"/>
+            <w:tcMar>
+              <w:top w:w="80" w:type="dxa"/>
+              <w:bottom w:w="80" w:type="dxa"/>
+              <w:start w:w="120" w:type="dxa"/>
+              <w:end w:w="120" w:type="dxa"/>
+            </w:tcMar>
+          </w:tcPr>
+          <w:p>
+            <w:pPr>
+              <w:widowControl/>
+              <w:spacing w:before="0" w:after="0" w:line="252" w:lineRule="auto"/>
+            </w:pPr>
+            <w:r/>
+            <w:r>
+              <w:rPr>
+                <w:rFonts w:ascii="Calibri" w:hAnsi="Calibri"/>
+                <w:sz w:val="18"/>
+              </w:rPr>
+              <w:t>Complete structured AoA result, configuration, warnings, relationships, and provenance</w:t>
+            </w:r>
+          </w:p>
+        </w:tc>
+      </w:tr>
     </w:tbl>
     <w:p>
       <w:pPr>
@@ -10573,7 +11888,7 @@
           <w:rFonts w:ascii="Calibri" w:hAnsi="Calibri"/>
           <w:sz w:val="22"/>
         </w:rPr>
-        <w:t xml:space="preserve"> contains the optional normative lexical concreteness result, and </w:t>
+        <w:t xml:space="preserve"> contains the optional normative lexical concreteness result, </w:t>
       </w:r>
       <w:r>
         <w:rPr>
@@ -10588,7 +11903,7 @@
           <w:rFonts w:ascii="Calibri" w:hAnsi="Calibri"/>
           <w:sz w:val="22"/>
         </w:rPr>
-        <w:t xml:space="preserve"> contains the optional SUBTLEX-US result. </w:t>
+        <w:t xml:space="preserve"> contains the optional SUBTLEX-US result, and </w:t>
       </w:r>
       <w:r>
         <w:rPr>
@@ -10596,6 +11911,21 @@
           <w:color w:val="1F4D78"/>
           <w:sz w:val="19"/>
         </w:rPr>
+        <w:t>aoa_result.json</w:t>
+      </w:r>
+      <w:r>
+        <w:rPr>
+          <w:rFonts w:ascii="Calibri" w:hAnsi="Calibri"/>
+          <w:sz w:val="22"/>
+        </w:rPr>
+        <w:t xml:space="preserve"> contains the optional Kuperman result. </w:t>
+      </w:r>
+      <w:r>
+        <w:rPr>
+          <w:rFonts w:ascii="Consolas" w:hAnsi="Consolas"/>
+          <w:color w:val="1F4D78"/>
+          <w:sz w:val="19"/>
+        </w:rPr>
         <w:t>poem_document.json</w:t>
       </w:r>
       <w:r>
@@ -10603,7 +11933,7 @@
           <w:rFonts w:ascii="Calibri" w:hAnsi="Calibri"/>
           <w:sz w:val="22"/>
         </w:rPr>
-        <w:t xml:space="preserve"> includes the original text, so protect it as research material. Concreteness and frequency exports retain source-row provenance but do not copy either full research workbook. The scholar summary is the easiest reading aid.</w:t>
+        <w:t xml:space="preserve"> includes the original text, so protect it as research material. Concreteness, Frequency, and AoA exports retain source-row provenance but do not copy any complete research workbook. The scholar summary is the easiest reading aid.</w:t>
       </w:r>
     </w:p>
     <w:p>
@@ -12151,6 +13481,208 @@
           <w:rFonts w:ascii="Calibri" w:hAnsi="Calibri"/>
           <w:sz w:val="22"/>
         </w:rPr>
+        <w:t>Age of Acquisition statistics and coverage</w:t>
+      </w:r>
+    </w:p>
+    <w:p>
+      <w:pPr>
+        <w:widowControl/>
+        <w:spacing w:before="0" w:after="120" w:line="300" w:lineRule="auto"/>
+      </w:pPr>
+      <w:r>
+        <w:rPr>
+          <w:rFonts w:ascii="Calibri" w:hAnsi="Calibri"/>
+          <w:sz w:val="22"/>
+        </w:rPr>
+        <w:t xml:space="preserve">Let </w:t>
+      </w:r>
+      <w:r>
+        <w:rPr>
+          <w:rFonts w:ascii="Consolas" w:hAnsi="Consolas"/>
+          <w:color w:val="1F4D78"/>
+          <w:sz w:val="19"/>
+        </w:rPr>
+        <w:t>a_i</w:t>
+      </w:r>
+      <w:r>
+        <w:rPr>
+          <w:rFonts w:ascii="Calibri" w:hAnsi="Calibri"/>
+          <w:sz w:val="22"/>
+        </w:rPr>
+        <w:t xml:space="preserve"> be the source mean acquisition age in years assigned to matched lexical-token position </w:t>
+      </w:r>
+      <w:r>
+        <w:rPr>
+          <w:rFonts w:ascii="Consolas" w:hAnsi="Consolas"/>
+          <w:color w:val="1F4D78"/>
+          <w:sz w:val="19"/>
+        </w:rPr>
+        <w:t>i</w:t>
+      </w:r>
+      <w:r>
+        <w:rPr>
+          <w:rFonts w:ascii="Calibri" w:hAnsi="Calibri"/>
+          <w:sz w:val="22"/>
+        </w:rPr>
+        <w:t xml:space="preserve">, and let </w:t>
+      </w:r>
+      <w:r>
+        <w:rPr>
+          <w:rFonts w:ascii="Consolas" w:hAnsi="Consolas"/>
+          <w:color w:val="1F4D78"/>
+          <w:sz w:val="19"/>
+        </w:rPr>
+        <w:t>A</w:t>
+      </w:r>
+      <w:r>
+        <w:rPr>
+          <w:rFonts w:ascii="Calibri" w:hAnsi="Calibri"/>
+          <w:sz w:val="22"/>
+        </w:rPr>
+        <w:t xml:space="preserve"> be the number of matched token positions with numeric source means.</w:t>
+      </w:r>
+    </w:p>
+    <w:p>
+      <w:pPr>
+        <w:pStyle w:val="Formula"/>
+      </w:pPr>
+      <w:r>
+        <w:rPr>
+          <w:rFonts w:ascii="Consolas" w:hAnsi="Consolas"/>
+          <w:color w:val="1F4D78"/>
+          <w:sz w:val="19"/>
+        </w:rPr>
+        <w:t>mean_aoa = sum(a_i) / A</w:t>
+      </w:r>
+    </w:p>
+    <w:p>
+      <w:pPr>
+        <w:pStyle w:val="Formula"/>
+      </w:pPr>
+      <w:r>
+        <w:rPr>
+          <w:rFonts w:ascii="Consolas" w:hAnsi="Consolas"/>
+          <w:color w:val="1F4D78"/>
+          <w:sz w:val="19"/>
+        </w:rPr>
+        <w:t>SD_population = sqrt(sum((a_i - mean_aoa)^2) / A)</w:t>
+      </w:r>
+    </w:p>
+    <w:p>
+      <w:pPr>
+        <w:pStyle w:val="Formula"/>
+      </w:pPr>
+      <w:r>
+        <w:rPr>
+          <w:rFonts w:ascii="Consolas" w:hAnsi="Consolas"/>
+          <w:color w:val="1F4D78"/>
+          <w:sz w:val="19"/>
+        </w:rPr>
+        <w:t>aoa_token_coverage = matched numeric eligible lexical-token positions / eligible lexical-token positions</w:t>
+      </w:r>
+    </w:p>
+    <w:p>
+      <w:pPr>
+        <w:pStyle w:val="Formula"/>
+      </w:pPr>
+      <w:r>
+        <w:rPr>
+          <w:rFonts w:ascii="Consolas" w:hAnsi="Consolas"/>
+          <w:color w:val="1F4D78"/>
+          <w:sz w:val="19"/>
+        </w:rPr>
+        <w:t>aoa_type_coverage = matched numeric unique normalized observed forms / eligible unique normalized observed forms</w:t>
+      </w:r>
+    </w:p>
+    <w:p>
+      <w:pPr>
+        <w:widowControl/>
+        <w:spacing w:before="0" w:after="120" w:line="300" w:lineRule="auto"/>
+      </w:pPr>
+      <w:r>
+        <w:rPr>
+          <w:rFonts w:ascii="Calibri" w:hAnsi="Calibri"/>
+          <w:sz w:val="22"/>
+        </w:rPr>
+        <w:t xml:space="preserve">The module also reports median, inclusive quartiles, IQR, range, and configured band proportions. Source entries with unavailable means remain auditable but do not enter </w:t>
+      </w:r>
+      <w:r>
+        <w:rPr>
+          <w:rFonts w:ascii="Consolas" w:hAnsi="Consolas"/>
+          <w:color w:val="1F4D78"/>
+          <w:sz w:val="19"/>
+        </w:rPr>
+        <w:t>A</w:t>
+      </w:r>
+      <w:r>
+        <w:rPr>
+          <w:rFonts w:ascii="Calibri" w:hAnsi="Calibri"/>
+          <w:sz w:val="22"/>
+        </w:rPr>
+        <w:t>. Empty eligible denominators remain missing, and unmatched forms never receive age zero.</w:t>
+      </w:r>
+    </w:p>
+    <w:p>
+      <w:pPr>
+        <w:widowControl/>
+        <w:spacing w:before="0" w:after="120" w:line="300" w:lineRule="auto"/>
+      </w:pPr>
+      <w:r>
+        <w:rPr>
+          <w:rFonts w:ascii="Calibri" w:hAnsi="Calibri"/>
+          <w:sz w:val="22"/>
+        </w:rPr>
+        <w:t>For a source entry:</w:t>
+      </w:r>
+    </w:p>
+    <w:p>
+      <w:pPr>
+        <w:pStyle w:val="Formula"/>
+      </w:pPr>
+      <w:r>
+        <w:rPr>
+          <w:rFonts w:ascii="Consolas" w:hAnsi="Consolas"/>
+          <w:color w:val="1F4D78"/>
+          <w:sz w:val="19"/>
+        </w:rPr>
+        <w:t>numeric_response_proportion = OccurNum / OccurTotal</w:t>
+      </w:r>
+    </w:p>
+    <w:p>
+      <w:pPr>
+        <w:pStyle w:val="Formula"/>
+      </w:pPr>
+      <w:r>
+        <w:rPr>
+          <w:rFonts w:ascii="Consolas" w:hAnsi="Consolas"/>
+          <w:color w:val="1F4D78"/>
+          <w:sz w:val="19"/>
+        </w:rPr>
+        <w:t>unknown_response_count = OccurTotal - OccurNum</w:t>
+      </w:r>
+    </w:p>
+    <w:p>
+      <w:pPr>
+        <w:widowControl/>
+        <w:spacing w:before="0" w:after="120" w:line="300" w:lineRule="auto"/>
+      </w:pPr>
+      <w:r>
+        <w:rPr>
+          <w:rFonts w:ascii="Calibri" w:hAnsi="Calibri"/>
+          <w:sz w:val="22"/>
+        </w:rPr>
+        <w:t>These source-response fields do not change the poem's token weighting. When a cross-module relationship is available, Spearman's rank coefficient is computed over unique paired normalized surface types, with a minimum of three paired types.</w:t>
+      </w:r>
+    </w:p>
+    <w:p>
+      <w:pPr>
+        <w:pStyle w:val="Heading2"/>
+      </w:pPr>
+      <w:r>
+        <w:rPr>
+          <w:rFonts w:ascii="Calibri" w:hAnsi="Calibri"/>
+          <w:sz w:val="22"/>
+        </w:rPr>
         <w:t>Part-of-speech share</w:t>
       </w:r>
     </w:p>
@@ -13096,6 +14628,120 @@
                 <w:sz w:val="17"/>
               </w:rPr>
               <w:t>stopwords_excluded</w:t>
+            </w:r>
+          </w:p>
+        </w:tc>
+      </w:tr>
+      <w:tr>
+        <w:trPr>
+          <w:cantSplit w:val="true"/>
+        </w:trPr>
+        <w:tc>
+          <w:tcPr>
+            <w:tcW w:type="dxa" w:w="3600"/>
+            <w:vAlign w:val="center"/>
+            <w:tcMar>
+              <w:top w:w="80" w:type="dxa"/>
+              <w:bottom w:w="80" w:type="dxa"/>
+              <w:start w:w="120" w:type="dxa"/>
+              <w:end w:w="120" w:type="dxa"/>
+            </w:tcMar>
+          </w:tcPr>
+          <w:p>
+            <w:pPr>
+              <w:widowControl/>
+              <w:spacing w:before="0" w:after="0" w:line="252" w:lineRule="auto"/>
+            </w:pPr>
+            <w:r/>
+            <w:r>
+              <w:rPr>
+                <w:rFonts w:ascii="Calibri" w:hAnsi="Calibri"/>
+                <w:sz w:val="18"/>
+              </w:rPr>
+              <w:t>Age of Acquisition rating</w:t>
+            </w:r>
+          </w:p>
+        </w:tc>
+        <w:tc>
+          <w:tcPr>
+            <w:tcW w:type="dxa" w:w="5760"/>
+            <w:vAlign w:val="center"/>
+            <w:tcMar>
+              <w:top w:w="80" w:type="dxa"/>
+              <w:bottom w:w="80" w:type="dxa"/>
+              <w:start w:w="120" w:type="dxa"/>
+              <w:end w:w="120" w:type="dxa"/>
+            </w:tcMar>
+          </w:tcPr>
+          <w:p>
+            <w:pPr>
+              <w:widowControl/>
+              <w:spacing w:before="0" w:after="0" w:line="252" w:lineRule="auto"/>
+            </w:pPr>
+            <w:r/>
+            <w:r>
+              <w:rPr>
+                <w:rFonts w:ascii="Calibri" w:hAnsi="Calibri"/>
+                <w:sz w:val="18"/>
+              </w:rPr>
+              <w:t>Adult retrospective source estimate, in years, of when a listed word was learned well enough to understand</w:t>
+            </w:r>
+          </w:p>
+        </w:tc>
+      </w:tr>
+      <w:tr>
+        <w:trPr>
+          <w:cantSplit w:val="true"/>
+        </w:trPr>
+        <w:tc>
+          <w:tcPr>
+            <w:tcW w:type="dxa" w:w="3600"/>
+            <w:vAlign w:val="center"/>
+            <w:tcMar>
+              <w:top w:w="80" w:type="dxa"/>
+              <w:bottom w:w="80" w:type="dxa"/>
+              <w:start w:w="120" w:type="dxa"/>
+              <w:end w:w="120" w:type="dxa"/>
+            </w:tcMar>
+          </w:tcPr>
+          <w:p>
+            <w:pPr>
+              <w:widowControl/>
+              <w:spacing w:before="0" w:after="0" w:line="252" w:lineRule="auto"/>
+            </w:pPr>
+            <w:r/>
+            <w:r>
+              <w:rPr>
+                <w:rFonts w:ascii="Calibri" w:hAnsi="Calibri"/>
+                <w:sz w:val="18"/>
+              </w:rPr>
+              <w:t>AoA orientation band</w:t>
+            </w:r>
+          </w:p>
+        </w:tc>
+        <w:tc>
+          <w:tcPr>
+            <w:tcW w:type="dxa" w:w="5760"/>
+            <w:vAlign w:val="center"/>
+            <w:tcMar>
+              <w:top w:w="80" w:type="dxa"/>
+              <w:bottom w:w="80" w:type="dxa"/>
+              <w:start w:w="120" w:type="dxa"/>
+              <w:end w:w="120" w:type="dxa"/>
+            </w:tcMar>
+          </w:tcPr>
+          <w:p>
+            <w:pPr>
+              <w:widowControl/>
+              <w:spacing w:before="0" w:after="0" w:line="252" w:lineRule="auto"/>
+            </w:pPr>
+            <w:r/>
+            <w:r>
+              <w:rPr>
+                <w:rFonts w:ascii="Calibri" w:hAnsi="Calibri"/>
+                <w:sz w:val="18"/>
+              </w:rPr>
+              <w:t>Configurable VerseVAD early/middle/later display aid, not a source-validated category</w:t>
             </w:r>
           </w:p>
         </w:tc>
@@ -13437,7 +15083,7 @@
                 <w:rFonts w:ascii="Calibri" w:hAnsi="Calibri"/>
                 <w:sz w:val="18"/>
               </w:rPr>
-              <w:t>Optional frequency scope limited to exact model tags NOUN, VERB, ADJ, and ADV; off by default</w:t>
+              <w:t>Optional Frequency or AoA contextual scope limited to exact model tags NOUN, VERB, ADJ, and ADV; off by default</w:t>
             </w:r>
           </w:p>
         </w:tc>
@@ -14266,6 +15912,78 @@
                 <w:rFonts w:ascii="Calibri" w:hAnsi="Calibri"/>
                 <w:sz w:val="18"/>
               </w:rPr>
+              <w:t>Numeric-response proportion</w:t>
+            </w:r>
+          </w:p>
+        </w:tc>
+        <w:tc>
+          <w:tcPr>
+            <w:tcW w:type="dxa" w:w="5760"/>
+            <w:vAlign w:val="center"/>
+            <w:tcMar>
+              <w:top w:w="80" w:type="dxa"/>
+              <w:bottom w:w="80" w:type="dxa"/>
+              <w:start w:w="120" w:type="dxa"/>
+              <w:end w:w="120" w:type="dxa"/>
+            </w:tcMar>
+          </w:tcPr>
+          <w:p>
+            <w:pPr>
+              <w:widowControl/>
+              <w:spacing w:before="0" w:after="0" w:line="252" w:lineRule="auto"/>
+            </w:pPr>
+            <w:r/>
+            <w:r>
+              <w:rPr>
+                <w:rFonts w:ascii="Calibri" w:hAnsi="Calibri"/>
+                <w:sz w:val="18"/>
+              </w:rPr>
+              <w:t xml:space="preserve">For the AoA source, numeric responses divided by total responses; preserved separately from the source's </w:t>
+            </w:r>
+            <w:r>
+              <w:rPr>
+                <w:rFonts w:ascii="Consolas" w:hAnsi="Consolas"/>
+                <w:color w:val="1F4D78"/>
+                <w:sz w:val="17"/>
+              </w:rPr>
+              <w:t>Dunno</w:t>
+            </w:r>
+            <w:r>
+              <w:rPr>
+                <w:rFonts w:ascii="Calibri" w:hAnsi="Calibri"/>
+                <w:sz w:val="18"/>
+              </w:rPr>
+              <w:t xml:space="preserve"> label</w:t>
+            </w:r>
+          </w:p>
+        </w:tc>
+      </w:tr>
+      <w:tr>
+        <w:trPr>
+          <w:cantSplit w:val="true"/>
+        </w:trPr>
+        <w:tc>
+          <w:tcPr>
+            <w:tcW w:type="dxa" w:w="3600"/>
+            <w:vAlign w:val="center"/>
+            <w:tcMar>
+              <w:top w:w="80" w:type="dxa"/>
+              <w:bottom w:w="80" w:type="dxa"/>
+              <w:start w:w="120" w:type="dxa"/>
+              <w:end w:w="120" w:type="dxa"/>
+            </w:tcMar>
+          </w:tcPr>
+          <w:p>
+            <w:pPr>
+              <w:widowControl/>
+              <w:spacing w:before="0" w:after="0" w:line="252" w:lineRule="auto"/>
+            </w:pPr>
+            <w:r/>
+            <w:r>
+              <w:rPr>
+                <w:rFonts w:ascii="Calibri" w:hAnsi="Calibri"/>
+                <w:sz w:val="18"/>
+              </w:rPr>
               <w:t>Phrase match</w:t>
             </w:r>
           </w:p>
@@ -14578,6 +16296,63 @@
                 <w:sz w:val="18"/>
               </w:rPr>
               <w:t>Named, versioned set of append-only decision revisions pinned to an analysis</w:t>
+            </w:r>
+          </w:p>
+        </w:tc>
+      </w:tr>
+      <w:tr>
+        <w:trPr>
+          <w:cantSplit w:val="true"/>
+        </w:trPr>
+        <w:tc>
+          <w:tcPr>
+            <w:tcW w:type="dxa" w:w="3600"/>
+            <w:vAlign w:val="center"/>
+            <w:tcMar>
+              <w:top w:w="80" w:type="dxa"/>
+              <w:bottom w:w="80" w:type="dxa"/>
+              <w:start w:w="120" w:type="dxa"/>
+              <w:end w:w="120" w:type="dxa"/>
+            </w:tcMar>
+          </w:tcPr>
+          <w:p>
+            <w:pPr>
+              <w:widowControl/>
+              <w:spacing w:before="0" w:after="0" w:line="252" w:lineRule="auto"/>
+            </w:pPr>
+            <w:r/>
+            <w:r>
+              <w:rPr>
+                <w:rFonts w:ascii="Calibri" w:hAnsi="Calibri"/>
+                <w:sz w:val="18"/>
+              </w:rPr>
+              <w:t>Source-unrated AoA entry</w:t>
+            </w:r>
+          </w:p>
+        </w:tc>
+        <w:tc>
+          <w:tcPr>
+            <w:tcW w:type="dxa" w:w="5760"/>
+            <w:vAlign w:val="center"/>
+            <w:tcMar>
+              <w:top w:w="80" w:type="dxa"/>
+              <w:bottom w:w="80" w:type="dxa"/>
+              <w:start w:w="120" w:type="dxa"/>
+              <w:end w:w="120" w:type="dxa"/>
+            </w:tcMar>
+          </w:tcPr>
+          <w:p>
+            <w:pPr>
+              <w:widowControl/>
+              <w:spacing w:before="0" w:after="0" w:line="252" w:lineRule="auto"/>
+            </w:pPr>
+            <w:r/>
+            <w:r>
+              <w:rPr>
+                <w:rFonts w:ascii="Calibri" w:hAnsi="Calibri"/>
+                <w:sz w:val="18"/>
+              </w:rPr>
+              <w:t>A source word row whose mean is unavailable; retained in the audit with no numeric age</w:t>
             </w:r>
           </w:p>
         </w:tc>
@@ -15965,6 +17740,150 @@
     </w:p>
     <w:p>
       <w:pPr>
+        <w:widowControl/>
+        <w:numPr>
+          <w:ilvl w:val="0"/>
+          <w:numId w:val="10"/>
+        </w:numPr>
+        <w:spacing w:before="0" w:after="80" w:line="300" w:lineRule="auto"/>
+        <w:ind w:left="540" w:hanging="271"/>
+      </w:pPr>
+      <w:r>
+        <w:rPr>
+          <w:rFonts w:ascii="Calibri" w:hAnsi="Calibri"/>
+          <w:sz w:val="22"/>
+        </w:rPr>
+        <w:t>Kuperman AoA values are adult retrospective estimates, not directly observed acquisition dates, grade levels, or contextual difficulty scores.</w:t>
+      </w:r>
+    </w:p>
+    <w:p>
+      <w:pPr>
+        <w:widowControl/>
+        <w:numPr>
+          <w:ilvl w:val="0"/>
+          <w:numId w:val="10"/>
+        </w:numPr>
+        <w:spacing w:before="0" w:after="80" w:line="300" w:lineRule="auto"/>
+        <w:ind w:left="540" w:hanging="271"/>
+      </w:pPr>
+      <w:r>
+        <w:rPr>
+          <w:rFonts w:ascii="Calibri" w:hAnsi="Calibri"/>
+          <w:sz w:val="22"/>
+        </w:rPr>
+        <w:t>The source paper's content-word sampling rule and a poem occurrence's contextual model POS are separate evidence.</w:t>
+      </w:r>
+    </w:p>
+    <w:p>
+      <w:pPr>
+        <w:widowControl/>
+        <w:numPr>
+          <w:ilvl w:val="0"/>
+          <w:numId w:val="10"/>
+        </w:numPr>
+        <w:spacing w:before="0" w:after="80" w:line="300" w:lineRule="auto"/>
+        <w:ind w:left="540" w:hanging="271"/>
+      </w:pPr>
+      <w:r>
+        <w:rPr>
+          <w:rFonts w:ascii="Calibri" w:hAnsi="Calibri"/>
+          <w:sz w:val="22"/>
+        </w:rPr>
+        <w:t>AoA proper-name, POS, and lemma decisions can be uncertain for poetic language.</w:t>
+      </w:r>
+    </w:p>
+    <w:p>
+      <w:pPr>
+        <w:widowControl/>
+        <w:numPr>
+          <w:ilvl w:val="0"/>
+          <w:numId w:val="10"/>
+        </w:numPr>
+        <w:spacing w:before="0" w:after="80" w:line="300" w:lineRule="auto"/>
+        <w:ind w:left="540" w:hanging="271"/>
+      </w:pPr>
+      <w:r>
+        <w:rPr>
+          <w:rFonts w:ascii="Calibri" w:hAnsi="Calibri"/>
+          <w:sz w:val="22"/>
+        </w:rPr>
+        <w:t>AoA source SD and response counts describe source-rating evidence, not the poem's distribution.</w:t>
+      </w:r>
+    </w:p>
+    <w:p>
+      <w:pPr>
+        <w:widowControl/>
+        <w:numPr>
+          <w:ilvl w:val="0"/>
+          <w:numId w:val="10"/>
+        </w:numPr>
+        <w:spacing w:before="0" w:after="80" w:line="300" w:lineRule="auto"/>
+        <w:ind w:left="540" w:hanging="271"/>
+      </w:pPr>
+      <w:r>
+        <w:rPr>
+          <w:rFonts w:ascii="Calibri" w:hAnsi="Calibri"/>
+          <w:sz w:val="22"/>
+        </w:rPr>
+        <w:t>AoA early/middle/later thresholds are VerseVAD orientation aids rather than source-validated categories.</w:t>
+      </w:r>
+    </w:p>
+    <w:p>
+      <w:pPr>
+        <w:widowControl/>
+        <w:numPr>
+          <w:ilvl w:val="0"/>
+          <w:numId w:val="10"/>
+        </w:numPr>
+        <w:spacing w:before="0" w:after="80" w:line="300" w:lineRule="auto"/>
+        <w:ind w:left="540" w:hanging="271"/>
+      </w:pPr>
+      <w:r>
+        <w:rPr>
+          <w:rFonts w:ascii="Calibri" w:hAnsi="Calibri"/>
+          <w:sz w:val="22"/>
+        </w:rPr>
+        <w:t>Optional AoA relationships are descriptive, require at least three paired surface types, and do not establish causation.</w:t>
+      </w:r>
+    </w:p>
+    <w:p>
+      <w:pPr>
+        <w:widowControl/>
+        <w:numPr>
+          <w:ilvl w:val="0"/>
+          <w:numId w:val="10"/>
+        </w:numPr>
+        <w:spacing w:before="0" w:after="80" w:line="300" w:lineRule="auto"/>
+        <w:ind w:left="540" w:hanging="271"/>
+      </w:pPr>
+      <w:r>
+        <w:rPr>
+          <w:rFonts w:ascii="Calibri" w:hAnsi="Calibri"/>
+          <w:sz w:val="22"/>
+        </w:rPr>
+        <w:t>Age-of-acquisition results are not diagnostic of cognitive impairment or decline.</w:t>
+      </w:r>
+    </w:p>
+    <w:p>
+      <w:pPr>
+        <w:widowControl/>
+        <w:numPr>
+          <w:ilvl w:val="0"/>
+          <w:numId w:val="10"/>
+        </w:numPr>
+        <w:spacing w:before="0" w:after="80" w:line="300" w:lineRule="auto"/>
+        <w:ind w:left="540" w:hanging="271"/>
+      </w:pPr>
+      <w:r>
+        <w:rPr>
+          <w:rFonts w:ascii="Calibri" w:hAnsi="Calibri"/>
+          <w:sz w:val="22"/>
+        </w:rPr>
+        <w:t>AoA is currently an optional one-poem in-memory module; it is not yet persisted in corpus projects.</w:t>
+      </w:r>
+    </w:p>
+    <w:p>
+      <w:pPr>
         <w:pStyle w:val="Heading1"/>
       </w:pPr>
       <w:r>
@@ -15985,7 +17904,7 @@
           <w:rFonts w:ascii="Calibri" w:hAnsi="Calibri"/>
           <w:sz w:val="22"/>
         </w:rPr>
-        <w:t>Every analysis should retain the active lexicon or optional research resource, source checksum, adapter version, software version, preprocessing recipe and configuration ID, phrase policy, stopword policy, scenario, and inclusion decisions. Completed corpus runs remain linked to preserved text versions. A concreteness result additionally retains its orientation thresholds, proper-name and phrase policies, low-coverage threshold, source-row matches, and exact workbook checksum. A frequency result retains its Zipf-band thresholds, proper-name policy, exact-before-lemma rule, optional content-word scope, low-coverage threshold, source-row matches, and exact SUBTLEX-US workbook checksum.</w:t>
+        <w:t>Every analysis should retain the active lexicon or optional research resource, source checksum, adapter version, software version, preprocessing recipe and configuration ID, phrase policy, stopword policy, scenario, and inclusion decisions. Completed corpus runs remain linked to preserved text versions. A concreteness result additionally retains its orientation thresholds, proper-name and phrase policies, low-coverage threshold, source-row matches, and exact workbook checksum. A frequency result retains its Zipf-band thresholds, proper-name policy, exact-before-lemma rule, optional content-word scope, low-coverage threshold, source-row matches, and exact SUBTLEX-US workbook checksum. An AoA result retains early/later thresholds, proper-name policy, exact-before-lemma rule, optional contextual content-word scope, coverage and source-response cautions, source-row matches, optional relationship methods, and the exact official erratum-supplement checksum.</w:t>
       </w:r>
     </w:p>
     <w:p>
@@ -16252,7 +18171,7 @@
         <w:color w:val="66727C"/>
         <w:sz w:val="18"/>
       </w:rPr>
-      <w:t xml:space="preserve">  |  0.9.0.dev0</w:t>
+      <w:t xml:space="preserve">  |  0.10.0.dev0</w:t>
     </w:r>
   </w:p>
 </w:hdr>

</xml_diff>

<commit_message>
Complete Stage 5 pronunciation foundation
</commit_message>
<xml_diff>
--- a/docs/VerseVAD_User_Manual.docx
+++ b/docs/VerseVAD_User_Manual.docx
@@ -47,7 +47,7 @@
           <w:color w:val="66727C"/>
           <w:sz w:val="21"/>
         </w:rPr>
-        <w:t xml:space="preserve"> 0.10.0.dev0</w:t>
+        <w:t xml:space="preserve"> 0.11.0.dev0</w:t>
       </w:r>
       <w:r>
         <w:rPr>
@@ -71,7 +71,7 @@
           <w:color w:val="66727C"/>
           <w:sz w:val="21"/>
         </w:rPr>
-        <w:t xml:space="preserve"> July 23, 2026</w:t>
+        <w:t xml:space="preserve"> July 24, 2026</w:t>
       </w:r>
       <w:r>
         <w:rPr>
@@ -159,7 +159,7 @@
                 <w:color w:val="193247"/>
                 <w:sz w:val="22"/>
               </w:rPr>
-              <w:t>: normative ratings and associations attached to matched words and phrases. Its optional concreteness, corpus-relative frequency, and retrospective Age of Acquisition modules remain separate lexical constructs. VerseVAD does not determine the emotion of a poem, speaker, author, or reader, diagnose cognition, or replace contextual close reading.</w:t>
+              <w:t xml:space="preserve"> and optional dictionary-based pronunciation evidence. Concreteness, corpus-relative frequency, retrospective Age of Acquisition, and pronunciation/lexical-stress results remain separate constructs. VerseVAD does not determine the emotion of a poem, speaker, author, or reader, diagnose cognition, classify meter or rhyme in Stage 5, or replace contextual close reading.</w:t>
             </w:r>
           </w:p>
         </w:tc>
@@ -570,6 +570,23 @@
                 <w:color w:val="193247"/>
                 <w:sz w:val="22"/>
               </w:rPr>
+              <w:t xml:space="preserve">, </w:t>
+            </w:r>
+            <w:r>
+              <w:rPr>
+                <w:rFonts w:ascii="Calibri" w:hAnsi="Calibri"/>
+                <w:b/>
+                <w:color w:val="193247"/>
+                <w:sz w:val="22"/>
+              </w:rPr>
+              <w:t>Age of Acquisition</w:t>
+            </w:r>
+            <w:r>
+              <w:rPr>
+                <w:rFonts w:ascii="Calibri" w:hAnsi="Calibri"/>
+                <w:color w:val="193247"/>
+                <w:sz w:val="22"/>
+              </w:rPr>
               <w:t xml:space="preserve">, and </w:t>
             </w:r>
             <w:r>
@@ -579,7 +596,7 @@
                 <w:color w:val="193247"/>
                 <w:sz w:val="22"/>
               </w:rPr>
-              <w:t>Age of Acquisition</w:t>
+              <w:t>Pronunciation &amp; Prosody</w:t>
             </w:r>
             <w:r>
               <w:rPr>
@@ -975,7 +992,38 @@
           <w:rFonts w:ascii="Calibri" w:hAnsi="Calibri"/>
           <w:sz w:val="22"/>
         </w:rPr>
-        <w:t xml:space="preserve">  source-response evidence, configurable orientation bands, structural   summaries, descriptive cross-module relationships, term rankings, and token   audit.</w:t>
+        <w:t xml:space="preserve">  source-response evidence, configurable orientation bands, structural   summaries, descriptive cross-module relationships, term rankings, and token   audit; and</w:t>
+      </w:r>
+    </w:p>
+    <w:p>
+      <w:pPr>
+        <w:widowControl/>
+        <w:numPr>
+          <w:ilvl w:val="0"/>
+          <w:numId w:val="10"/>
+        </w:numPr>
+        <w:spacing w:before="0" w:after="80" w:line="300" w:lineRule="auto"/>
+        <w:ind w:left="540" w:hanging="271"/>
+      </w:pPr>
+      <w:r>
+        <w:rPr>
+          <w:rFonts w:ascii="Calibri" w:hAnsi="Calibri"/>
+          <w:sz w:val="22"/>
+        </w:rPr>
+        <w:t>optional exact observed-form CMUdict pronunciation candidates, resolved</w:t>
+      </w:r>
+    </w:p>
+    <w:p>
+      <w:pPr>
+        <w:widowControl/>
+        <w:spacing w:before="0" w:after="120" w:line="300" w:lineRule="auto"/>
+      </w:pPr>
+      <w:r>
+        <w:rPr>
+          <w:rFonts w:ascii="Calibri" w:hAnsi="Calibri"/>
+          <w:sz w:val="22"/>
+        </w:rPr>
+        <w:t xml:space="preserve">  syllables, complete-line totals, lexical-stress sequences, coverage,   ambiguity evidence, poem-specific scholar overrides, and token/type/line   audits.</w:t>
       </w:r>
     </w:p>
     <w:p>
@@ -1096,7 +1144,7 @@
           <w:rFonts w:ascii="Calibri" w:hAnsi="Calibri"/>
           <w:sz w:val="22"/>
         </w:rPr>
-        <w:t xml:space="preserve"> are also local and excluded from source control. The Stage 2 concreteness workbook and paper, Stage 3 SUBTLEX-US workbook, and Stage 4 Kuperman Age of Acquisition workbook and paper must retain their exact paths and checksums. VerseVAD reads the workbooks in place and does not copy any complete research source into an export.</w:t>
+        <w:t xml:space="preserve"> are also local and excluded from source control. The Stage 2 concreteness workbook and paper, Stage 3 SUBTLEX-US workbook, Stage 4 Kuperman Age of Acquisition workbook and paper, and Stage 5 pinned CMUdict files must retain their exact paths and checksums. VerseVAD reads analysis sources in place and does not copy any complete research source into an export.</w:t>
       </w:r>
     </w:p>
     <w:p>
@@ -1639,6 +1687,21 @@
           <w:rFonts w:ascii="Calibri" w:hAnsi="Calibri"/>
           <w:sz w:val="22"/>
         </w:rPr>
+        <w:t xml:space="preserve">, </w:t>
+      </w:r>
+      <w:r>
+        <w:rPr>
+          <w:rFonts w:ascii="Calibri" w:hAnsi="Calibri"/>
+          <w:b/>
+          <w:sz w:val="22"/>
+        </w:rPr>
+        <w:t>Age of Acquisition profile (Kuperman et al. ratings)</w:t>
+      </w:r>
+      <w:r>
+        <w:rPr>
+          <w:rFonts w:ascii="Calibri" w:hAnsi="Calibri"/>
+          <w:sz w:val="22"/>
+        </w:rPr>
         <w:t xml:space="preserve">, and/or </w:t>
       </w:r>
       <w:r>
@@ -1647,7 +1710,7 @@
           <w:b/>
           <w:sz w:val="22"/>
         </w:rPr>
-        <w:t>Age of Acquisition profile (Kuperman et al. ratings)</w:t>
+        <w:t>Pronunciation &amp; prosody foundation (CMUdict)</w:t>
       </w:r>
       <w:r>
         <w:rPr>
@@ -1867,6 +1930,21 @@
           <w:rFonts w:ascii="Calibri" w:hAnsi="Calibri"/>
           <w:sz w:val="22"/>
         </w:rPr>
+        <w:t xml:space="preserve">, </w:t>
+      </w:r>
+      <w:r>
+        <w:rPr>
+          <w:rFonts w:ascii="Calibri" w:hAnsi="Calibri"/>
+          <w:b/>
+          <w:sz w:val="22"/>
+        </w:rPr>
+        <w:t>Age of Acquisition</w:t>
+      </w:r>
+      <w:r>
+        <w:rPr>
+          <w:rFonts w:ascii="Calibri" w:hAnsi="Calibri"/>
+          <w:sz w:val="22"/>
+        </w:rPr>
         <w:t xml:space="preserve">, and </w:t>
       </w:r>
       <w:r>
@@ -1875,7 +1953,7 @@
           <w:b/>
           <w:sz w:val="22"/>
         </w:rPr>
-        <w:t>Age of Acquisition</w:t>
+        <w:t>Pronunciation &amp; Prosody</w:t>
       </w:r>
       <w:r>
         <w:rPr>
@@ -3411,18 +3489,6 @@
     </w:p>
     <w:p>
       <w:pPr>
-        <w:pStyle w:val="Heading1"/>
-      </w:pPr>
-      <w:r>
-        <w:rPr>
-          <w:rFonts w:ascii="Calibri" w:hAnsi="Calibri"/>
-          <w:sz w:val="22"/>
-        </w:rPr>
-        <w:t>5. How text becomes auditable matches</w:t>
-      </w:r>
-    </w:p>
-    <w:p>
-      <w:pPr>
         <w:pStyle w:val="Heading2"/>
       </w:pPr>
       <w:r>
@@ -3430,7 +3496,7 @@
           <w:rFonts w:ascii="Calibri" w:hAnsi="Calibri"/>
           <w:sz w:val="22"/>
         </w:rPr>
-        <w:t>Preserved original and processing representation</w:t>
+        <w:t>Optional CMU Pronouncing Dictionary resource</w:t>
       </w:r>
     </w:p>
     <w:p>
@@ -3443,32 +3509,22 @@
           <w:rFonts w:ascii="Calibri" w:hAnsi="Calibri"/>
           <w:sz w:val="22"/>
         </w:rPr>
-        <w:t>VerseVAD preserves the supplied text exactly, including line and stanza breaks. Normalization happens in a separate processing representation. The original text is never silently rewritten.</w:t>
-      </w:r>
-    </w:p>
-    <w:p>
-      <w:pPr>
-        <w:pStyle w:val="Heading2"/>
-      </w:pPr>
-      <w:r>
-        <w:rPr>
-          <w:rFonts w:ascii="Calibri" w:hAnsi="Calibri"/>
-          <w:sz w:val="22"/>
-        </w:rPr>
-        <w:t>Shared poem document</w:t>
-      </w:r>
-    </w:p>
-    <w:p>
-      <w:pPr>
-        <w:widowControl/>
-        <w:spacing w:before="0" w:after="120" w:line="300" w:lineRule="auto"/>
-      </w:pPr>
-      <w:r>
-        <w:rPr>
-          <w:rFonts w:ascii="Calibri" w:hAnsi="Calibri"/>
-          <w:sz w:val="22"/>
-        </w:rPr>
-        <w:t>For one-poem analysis, VerseVAD creates one immutable shared document and reuses its exact token sequence for every selected lexicon. It contains:</w:t>
+        <w:t xml:space="preserve">The Stage 5 one-poem module reads official CMUdict files pinned at repository commit </w:t>
+      </w:r>
+      <w:r>
+        <w:rPr>
+          <w:rFonts w:ascii="Consolas" w:hAnsi="Consolas"/>
+          <w:color w:val="1F4D78"/>
+          <w:sz w:val="19"/>
+        </w:rPr>
+        <w:t>74790861f652b15e4ac49015a90074ad62a27690</w:t>
+      </w:r>
+      <w:r>
+        <w:rPr>
+          <w:rFonts w:ascii="Calibri" w:hAnsi="Calibri"/>
+          <w:sz w:val="22"/>
+        </w:rPr>
+        <w:t>:</w:t>
       </w:r>
     </w:p>
     <w:p>
@@ -3483,10 +3539,18 @@
       </w:pPr>
       <w:r>
         <w:rPr>
-          <w:rFonts w:ascii="Calibri" w:hAnsi="Calibri"/>
-          <w:sz w:val="22"/>
-        </w:rPr>
-        <w:t>the exact original text;</w:t>
+          <w:rFonts w:ascii="Consolas" w:hAnsi="Consolas"/>
+          <w:color w:val="1F4D78"/>
+          <w:sz w:val="19"/>
+        </w:rPr>
+        <w:t>resources/pronunciation/cmudict.dict</w:t>
+      </w:r>
+      <w:r>
+        <w:rPr>
+          <w:rFonts w:ascii="Calibri" w:hAnsi="Calibri"/>
+          <w:sz w:val="22"/>
+        </w:rPr>
+        <w:t>;</w:t>
       </w:r>
     </w:p>
     <w:p>
@@ -3501,10 +3565,18 @@
       </w:pPr>
       <w:r>
         <w:rPr>
-          <w:rFonts w:ascii="Calibri" w:hAnsi="Calibri"/>
-          <w:sz w:val="22"/>
-        </w:rPr>
-        <w:t>stanza and physical-line records, including blank separators and line endings;</w:t>
+          <w:rFonts w:ascii="Consolas" w:hAnsi="Consolas"/>
+          <w:color w:val="1F4D78"/>
+          <w:sz w:val="19"/>
+        </w:rPr>
+        <w:t>resources/pronunciation/cmudict.phones</w:t>
+      </w:r>
+      <w:r>
+        <w:rPr>
+          <w:rFonts w:ascii="Calibri" w:hAnsi="Calibri"/>
+          <w:sz w:val="22"/>
+        </w:rPr>
+        <w:t>; and</w:t>
       </w:r>
     </w:p>
     <w:p>
@@ -3519,10 +3591,106 @@
       </w:pPr>
       <w:r>
         <w:rPr>
-          <w:rFonts w:ascii="Calibri" w:hAnsi="Calibri"/>
-          <w:sz w:val="22"/>
-        </w:rPr>
-        <w:t>separate model sentence records, including line/stanza-crossing flags;</w:t>
+          <w:rFonts w:ascii="Consolas" w:hAnsi="Consolas"/>
+          <w:color w:val="1F4D78"/>
+          <w:sz w:val="19"/>
+        </w:rPr>
+        <w:t>resources/pronunciation/cmudict.symbols</w:t>
+      </w:r>
+      <w:r>
+        <w:rPr>
+          <w:rFonts w:ascii="Calibri" w:hAnsi="Calibri"/>
+          <w:sz w:val="22"/>
+        </w:rPr>
+        <w:t>.</w:t>
+      </w:r>
+    </w:p>
+    <w:p>
+      <w:pPr>
+        <w:widowControl/>
+        <w:spacing w:before="0" w:after="120" w:line="300" w:lineRule="auto"/>
+      </w:pPr>
+      <w:r>
+        <w:rPr>
+          <w:rFonts w:ascii="Calibri" w:hAnsi="Calibri"/>
+          <w:sz w:val="22"/>
+        </w:rPr>
+        <w:t>The files contain North American dictionary pronunciations encoded in ARPAbet. The adapter validates exact checksums, source counts, alternative suffixes, phone/symbol inventories, vowel stress, duplicate variants, and malformed rows without editing them. Every pronunciation alternative remains auditable.</w:t>
+      </w:r>
+    </w:p>
+    <w:p>
+      <w:pPr>
+        <w:widowControl/>
+        <w:spacing w:before="0" w:after="120" w:line="300" w:lineRule="auto"/>
+      </w:pPr>
+      <w:r>
+        <w:rPr>
+          <w:rFonts w:ascii="Calibri" w:hAnsi="Calibri"/>
+          <w:sz w:val="22"/>
+        </w:rPr>
+        <w:t>CMUdict acknowledges possible errors, omissions, and inconsistencies. Dialect, historical pronunciation, context, poetic elision, and performance may differ. The module is a pronunciation/syllable/lexical-stress foundation; it does not classify meter, rhyme, or definitive performed scansion.</w:t>
+      </w:r>
+    </w:p>
+    <w:p>
+      <w:pPr>
+        <w:pStyle w:val="Heading1"/>
+      </w:pPr>
+      <w:r>
+        <w:rPr>
+          <w:rFonts w:ascii="Calibri" w:hAnsi="Calibri"/>
+          <w:sz w:val="22"/>
+        </w:rPr>
+        <w:t>5. How text becomes auditable matches</w:t>
+      </w:r>
+    </w:p>
+    <w:p>
+      <w:pPr>
+        <w:pStyle w:val="Heading2"/>
+      </w:pPr>
+      <w:r>
+        <w:rPr>
+          <w:rFonts w:ascii="Calibri" w:hAnsi="Calibri"/>
+          <w:sz w:val="22"/>
+        </w:rPr>
+        <w:t>Preserved original and processing representation</w:t>
+      </w:r>
+    </w:p>
+    <w:p>
+      <w:pPr>
+        <w:widowControl/>
+        <w:spacing w:before="0" w:after="120" w:line="300" w:lineRule="auto"/>
+      </w:pPr>
+      <w:r>
+        <w:rPr>
+          <w:rFonts w:ascii="Calibri" w:hAnsi="Calibri"/>
+          <w:sz w:val="22"/>
+        </w:rPr>
+        <w:t>VerseVAD preserves the supplied text exactly, including line and stanza breaks. Normalization happens in a separate processing representation. The original text is never silently rewritten.</w:t>
+      </w:r>
+    </w:p>
+    <w:p>
+      <w:pPr>
+        <w:pStyle w:val="Heading2"/>
+      </w:pPr>
+      <w:r>
+        <w:rPr>
+          <w:rFonts w:ascii="Calibri" w:hAnsi="Calibri"/>
+          <w:sz w:val="22"/>
+        </w:rPr>
+        <w:t>Shared poem document</w:t>
+      </w:r>
+    </w:p>
+    <w:p>
+      <w:pPr>
+        <w:widowControl/>
+        <w:spacing w:before="0" w:after="120" w:line="300" w:lineRule="auto"/>
+      </w:pPr>
+      <w:r>
+        <w:rPr>
+          <w:rFonts w:ascii="Calibri" w:hAnsi="Calibri"/>
+          <w:sz w:val="22"/>
+        </w:rPr>
+        <w:t>For one-poem analysis, VerseVAD creates one immutable shared document and reuses its exact token sequence for every selected lexicon. It contains:</w:t>
       </w:r>
     </w:p>
     <w:p>
@@ -3540,7 +3708,7 @@
           <w:rFonts w:ascii="Calibri" w:hAnsi="Calibri"/>
           <w:sz w:val="22"/>
         </w:rPr>
-        <w:t>surface, normalized, lemma, POS, morphology, and character-offset token fields;</w:t>
+        <w:t>the exact original text;</w:t>
       </w:r>
     </w:p>
     <w:p>
@@ -3558,7 +3726,7 @@
           <w:rFonts w:ascii="Calibri" w:hAnsi="Calibri"/>
           <w:sz w:val="22"/>
         </w:rPr>
-        <w:t>dependency records and optional named-entity records;</w:t>
+        <w:t>stanza and physical-line records, including blank separators and line endings;</w:t>
       </w:r>
     </w:p>
     <w:p>
@@ -3576,7 +3744,7 @@
           <w:rFonts w:ascii="Calibri" w:hAnsi="Calibri"/>
           <w:sz w:val="22"/>
         </w:rPr>
-        <w:t>exact spans for hyphenated expressions, contractions, and apostrophe forms;</w:t>
+        <w:t>separate model sentence records, including line/stanza-crossing flags;</w:t>
       </w:r>
     </w:p>
     <w:p>
@@ -3594,7 +3762,7 @@
           <w:rFonts w:ascii="Calibri" w:hAnsi="Calibri"/>
           <w:sz w:val="22"/>
         </w:rPr>
-        <w:t>content/function/other/non-lexical classifications; and</w:t>
+        <w:t>surface, normalized, lemma, POS, morphology, and character-offset token fields;</w:t>
       </w:r>
     </w:p>
     <w:p>
@@ -3612,6 +3780,60 @@
           <w:rFonts w:ascii="Calibri" w:hAnsi="Calibri"/>
           <w:sz w:val="22"/>
         </w:rPr>
+        <w:t>dependency records and optional named-entity records;</w:t>
+      </w:r>
+    </w:p>
+    <w:p>
+      <w:pPr>
+        <w:widowControl/>
+        <w:numPr>
+          <w:ilvl w:val="0"/>
+          <w:numId w:val="10"/>
+        </w:numPr>
+        <w:spacing w:before="0" w:after="80" w:line="300" w:lineRule="auto"/>
+        <w:ind w:left="540" w:hanging="271"/>
+      </w:pPr>
+      <w:r>
+        <w:rPr>
+          <w:rFonts w:ascii="Calibri" w:hAnsi="Calibri"/>
+          <w:sz w:val="22"/>
+        </w:rPr>
+        <w:t>exact spans for hyphenated expressions, contractions, and apostrophe forms;</w:t>
+      </w:r>
+    </w:p>
+    <w:p>
+      <w:pPr>
+        <w:widowControl/>
+        <w:numPr>
+          <w:ilvl w:val="0"/>
+          <w:numId w:val="10"/>
+        </w:numPr>
+        <w:spacing w:before="0" w:after="80" w:line="300" w:lineRule="auto"/>
+        <w:ind w:left="540" w:hanging="271"/>
+      </w:pPr>
+      <w:r>
+        <w:rPr>
+          <w:rFonts w:ascii="Calibri" w:hAnsi="Calibri"/>
+          <w:sz w:val="22"/>
+        </w:rPr>
+        <w:t>content/function/other/non-lexical classifications; and</w:t>
+      </w:r>
+    </w:p>
+    <w:p>
+      <w:pPr>
+        <w:widowControl/>
+        <w:numPr>
+          <w:ilvl w:val="0"/>
+          <w:numId w:val="10"/>
+        </w:numPr>
+        <w:spacing w:before="0" w:after="80" w:line="300" w:lineRule="auto"/>
+        <w:ind w:left="540" w:hanging="271"/>
+      </w:pPr>
+      <w:r>
+        <w:rPr>
+          <w:rFonts w:ascii="Calibri" w:hAnsi="Calibri"/>
+          <w:sz w:val="22"/>
+        </w:rPr>
         <w:t>processing configuration, provenance, coverage, and warnings.</w:t>
       </w:r>
     </w:p>
@@ -3877,6 +4099,19 @@
           <w:sz w:val="22"/>
         </w:rPr>
         <w:t xml:space="preserve"> but does not enter numeric summaries. Model-tagged proper nouns are excluded by default. Unmatched, ineligible, and source-unrated tokens retain missing ages rather than zero.</w:t>
+      </w:r>
+    </w:p>
+    <w:p>
+      <w:pPr>
+        <w:widowControl/>
+        <w:spacing w:before="0" w:after="120" w:line="300" w:lineRule="auto"/>
+      </w:pPr>
+      <w:r>
+        <w:rPr>
+          <w:rFonts w:ascii="Calibri" w:hAnsi="Calibri"/>
+          <w:sz w:val="22"/>
+        </w:rPr>
+        <w:t>The optional pronunciation module uses the exact normalized observed form only. It does not use the model lemma, strip possessive endings, repair spelling, or predict a pronunciation. One CMUdict candidate resolves directly. Several candidates resolve only when all agree on syllable count and the full lexical-stress sequence; otherwise the token remains ambiguous. Unmatched, ambiguous, and source-vowelless tokens retain missing pronunciation, syllable, and stress fields.</w:t>
       </w:r>
     </w:p>
     <w:p>
@@ -6249,6 +6484,415 @@
           <w:rFonts w:ascii="Calibri" w:hAnsi="Calibri"/>
           <w:sz w:val="22"/>
         </w:rPr>
+        <w:t>Dictionary pronunciation, syllables, and lexical stress</w:t>
+      </w:r>
+    </w:p>
+    <w:p>
+      <w:pPr>
+        <w:widowControl/>
+        <w:spacing w:before="0" w:after="120" w:line="300" w:lineRule="auto"/>
+      </w:pPr>
+      <w:r>
+        <w:rPr>
+          <w:rFonts w:ascii="Calibri" w:hAnsi="Calibri"/>
+          <w:sz w:val="22"/>
+        </w:rPr>
+        <w:t xml:space="preserve">When enabled, </w:t>
+      </w:r>
+      <w:r>
+        <w:rPr>
+          <w:rFonts w:ascii="Calibri" w:hAnsi="Calibri"/>
+          <w:b/>
+          <w:sz w:val="22"/>
+        </w:rPr>
+        <w:t>Pronunciation &amp; Prosody</w:t>
+      </w:r>
+      <w:r>
+        <w:rPr>
+          <w:rFonts w:ascii="Calibri" w:hAnsi="Calibri"/>
+          <w:sz w:val="22"/>
+        </w:rPr>
+        <w:t xml:space="preserve"> reports exact observed-form CMUdict candidates, resolved-token and observed-type coverage, syllables per resolved word, complete-line syllable totals, word-grouped lexical-stress sequences, primary/secondary stress counts, stress density, and the complete candidate audit.</w:t>
+      </w:r>
+    </w:p>
+    <w:p>
+      <w:pPr>
+        <w:widowControl/>
+        <w:spacing w:before="0" w:after="120" w:line="300" w:lineRule="auto"/>
+      </w:pPr>
+      <w:r>
+        <w:rPr>
+          <w:rFonts w:ascii="Calibri" w:hAnsi="Calibri"/>
+          <w:sz w:val="22"/>
+        </w:rPr>
+        <w:t>CMUdict stress digits mean:</w:t>
+      </w:r>
+    </w:p>
+    <w:tbl>
+      <w:tblPr>
+        <w:tblStyle w:val="TableGrid"/>
+        <w:tblW w:type="dxa" w:w="9360"/>
+        <w:jc w:val="left"/>
+        <w:tblLayout w:type="fixed"/>
+        <w:tblLook w:firstColumn="1" w:firstRow="1" w:lastColumn="0" w:lastRow="0" w:noHBand="0" w:noVBand="1" w:val="04A0"/>
+        <w:tblInd w:w="120" w:type="dxa"/>
+        <w:tblBorders>
+          <w:top w:val="single" w:sz="4" w:space="0" w:color="C9D1D8"/>
+          <w:left w:val="single" w:sz="4" w:space="0" w:color="C9D1D8"/>
+          <w:bottom w:val="single" w:sz="4" w:space="0" w:color="C9D1D8"/>
+          <w:right w:val="single" w:sz="4" w:space="0" w:color="C9D1D8"/>
+          <w:insideH w:val="single" w:sz="4" w:space="0" w:color="C9D1D8"/>
+          <w:insideV w:val="single" w:sz="4" w:space="0" w:color="C9D1D8"/>
+        </w:tblBorders>
+      </w:tblPr>
+      <w:tblGrid>
+        <w:gridCol w:w="2700"/>
+        <w:gridCol w:w="6660"/>
+      </w:tblGrid>
+      <w:tr>
+        <w:trPr>
+          <w:cantSplit w:val="true"/>
+          <w:tblHeader w:val="true"/>
+        </w:trPr>
+        <w:tc>
+          <w:tcPr>
+            <w:tcW w:type="dxa" w:w="2700"/>
+            <w:vAlign w:val="center"/>
+            <w:tcMar>
+              <w:top w:w="80" w:type="dxa"/>
+              <w:bottom w:w="80" w:type="dxa"/>
+              <w:start w:w="120" w:type="dxa"/>
+              <w:end w:w="120" w:type="dxa"/>
+            </w:tcMar>
+            <w:shd w:fill="E8EEF5"/>
+          </w:tcPr>
+          <w:p>
+            <w:pPr>
+              <w:keepNext/>
+              <w:widowControl/>
+              <w:spacing w:before="0" w:after="0" w:line="252" w:lineRule="auto"/>
+            </w:pPr>
+            <w:r>
+              <w:rPr>
+                <w:b/>
+                <w:color w:val="193247"/>
+              </w:rPr>
+            </w:r>
+            <w:r>
+              <w:rPr>
+                <w:rFonts w:ascii="Calibri" w:hAnsi="Calibri"/>
+                <w:b/>
+                <w:color w:val="193247"/>
+                <w:sz w:val="18"/>
+              </w:rPr>
+              <w:t>Digit</w:t>
+            </w:r>
+          </w:p>
+        </w:tc>
+        <w:tc>
+          <w:tcPr>
+            <w:tcW w:type="dxa" w:w="6660"/>
+            <w:vAlign w:val="center"/>
+            <w:tcMar>
+              <w:top w:w="80" w:type="dxa"/>
+              <w:bottom w:w="80" w:type="dxa"/>
+              <w:start w:w="120" w:type="dxa"/>
+              <w:end w:w="120" w:type="dxa"/>
+            </w:tcMar>
+            <w:shd w:fill="E8EEF5"/>
+          </w:tcPr>
+          <w:p>
+            <w:pPr>
+              <w:keepNext/>
+              <w:widowControl/>
+              <w:spacing w:before="0" w:after="0" w:line="252" w:lineRule="auto"/>
+            </w:pPr>
+            <w:r>
+              <w:rPr>
+                <w:b/>
+                <w:color w:val="193247"/>
+              </w:rPr>
+            </w:r>
+            <w:r>
+              <w:rPr>
+                <w:rFonts w:ascii="Calibri" w:hAnsi="Calibri"/>
+                <w:b/>
+                <w:color w:val="193247"/>
+                <w:sz w:val="18"/>
+              </w:rPr>
+              <w:t>Meaning</w:t>
+            </w:r>
+          </w:p>
+        </w:tc>
+      </w:tr>
+      <w:tr>
+        <w:trPr>
+          <w:cantSplit w:val="true"/>
+        </w:trPr>
+        <w:tc>
+          <w:tcPr>
+            <w:tcW w:type="dxa" w:w="2700"/>
+            <w:vAlign w:val="center"/>
+            <w:tcMar>
+              <w:top w:w="80" w:type="dxa"/>
+              <w:bottom w:w="80" w:type="dxa"/>
+              <w:start w:w="120" w:type="dxa"/>
+              <w:end w:w="120" w:type="dxa"/>
+            </w:tcMar>
+          </w:tcPr>
+          <w:p>
+            <w:pPr>
+              <w:widowControl/>
+              <w:spacing w:before="0" w:after="0" w:line="252" w:lineRule="auto"/>
+            </w:pPr>
+            <w:r/>
+            <w:r>
+              <w:rPr>
+                <w:rFonts w:ascii="Consolas" w:hAnsi="Consolas"/>
+                <w:color w:val="1F4D78"/>
+                <w:sz w:val="17"/>
+              </w:rPr>
+              <w:t>0</w:t>
+            </w:r>
+          </w:p>
+        </w:tc>
+        <w:tc>
+          <w:tcPr>
+            <w:tcW w:type="dxa" w:w="6660"/>
+            <w:vAlign w:val="center"/>
+            <w:tcMar>
+              <w:top w:w="80" w:type="dxa"/>
+              <w:bottom w:w="80" w:type="dxa"/>
+              <w:start w:w="120" w:type="dxa"/>
+              <w:end w:w="120" w:type="dxa"/>
+            </w:tcMar>
+          </w:tcPr>
+          <w:p>
+            <w:pPr>
+              <w:widowControl/>
+              <w:spacing w:before="0" w:after="0" w:line="252" w:lineRule="auto"/>
+            </w:pPr>
+            <w:r/>
+            <w:r>
+              <w:rPr>
+                <w:rFonts w:ascii="Calibri" w:hAnsi="Calibri"/>
+                <w:sz w:val="18"/>
+              </w:rPr>
+              <w:t>Unstressed syllable</w:t>
+            </w:r>
+          </w:p>
+        </w:tc>
+      </w:tr>
+      <w:tr>
+        <w:trPr>
+          <w:cantSplit w:val="true"/>
+        </w:trPr>
+        <w:tc>
+          <w:tcPr>
+            <w:tcW w:type="dxa" w:w="2700"/>
+            <w:vAlign w:val="center"/>
+            <w:tcMar>
+              <w:top w:w="80" w:type="dxa"/>
+              <w:bottom w:w="80" w:type="dxa"/>
+              <w:start w:w="120" w:type="dxa"/>
+              <w:end w:w="120" w:type="dxa"/>
+            </w:tcMar>
+          </w:tcPr>
+          <w:p>
+            <w:pPr>
+              <w:widowControl/>
+              <w:spacing w:before="0" w:after="0" w:line="252" w:lineRule="auto"/>
+            </w:pPr>
+            <w:r/>
+            <w:r>
+              <w:rPr>
+                <w:rFonts w:ascii="Consolas" w:hAnsi="Consolas"/>
+                <w:color w:val="1F4D78"/>
+                <w:sz w:val="17"/>
+              </w:rPr>
+              <w:t>1</w:t>
+            </w:r>
+          </w:p>
+        </w:tc>
+        <w:tc>
+          <w:tcPr>
+            <w:tcW w:type="dxa" w:w="6660"/>
+            <w:vAlign w:val="center"/>
+            <w:tcMar>
+              <w:top w:w="80" w:type="dxa"/>
+              <w:bottom w:w="80" w:type="dxa"/>
+              <w:start w:w="120" w:type="dxa"/>
+              <w:end w:w="120" w:type="dxa"/>
+            </w:tcMar>
+          </w:tcPr>
+          <w:p>
+            <w:pPr>
+              <w:widowControl/>
+              <w:spacing w:before="0" w:after="0" w:line="252" w:lineRule="auto"/>
+            </w:pPr>
+            <w:r/>
+            <w:r>
+              <w:rPr>
+                <w:rFonts w:ascii="Calibri" w:hAnsi="Calibri"/>
+                <w:sz w:val="18"/>
+              </w:rPr>
+              <w:t>Primary lexical stress</w:t>
+            </w:r>
+          </w:p>
+        </w:tc>
+      </w:tr>
+      <w:tr>
+        <w:trPr>
+          <w:cantSplit w:val="true"/>
+        </w:trPr>
+        <w:tc>
+          <w:tcPr>
+            <w:tcW w:type="dxa" w:w="2700"/>
+            <w:vAlign w:val="center"/>
+            <w:tcMar>
+              <w:top w:w="80" w:type="dxa"/>
+              <w:bottom w:w="80" w:type="dxa"/>
+              <w:start w:w="120" w:type="dxa"/>
+              <w:end w:w="120" w:type="dxa"/>
+            </w:tcMar>
+          </w:tcPr>
+          <w:p>
+            <w:pPr>
+              <w:widowControl/>
+              <w:spacing w:before="0" w:after="0" w:line="252" w:lineRule="auto"/>
+            </w:pPr>
+            <w:r/>
+            <w:r>
+              <w:rPr>
+                <w:rFonts w:ascii="Consolas" w:hAnsi="Consolas"/>
+                <w:color w:val="1F4D78"/>
+                <w:sz w:val="17"/>
+              </w:rPr>
+              <w:t>2</w:t>
+            </w:r>
+          </w:p>
+        </w:tc>
+        <w:tc>
+          <w:tcPr>
+            <w:tcW w:type="dxa" w:w="6660"/>
+            <w:vAlign w:val="center"/>
+            <w:tcMar>
+              <w:top w:w="80" w:type="dxa"/>
+              <w:bottom w:w="80" w:type="dxa"/>
+              <w:start w:w="120" w:type="dxa"/>
+              <w:end w:w="120" w:type="dxa"/>
+            </w:tcMar>
+          </w:tcPr>
+          <w:p>
+            <w:pPr>
+              <w:widowControl/>
+              <w:spacing w:before="0" w:after="0" w:line="252" w:lineRule="auto"/>
+            </w:pPr>
+            <w:r/>
+            <w:r>
+              <w:rPr>
+                <w:rFonts w:ascii="Calibri" w:hAnsi="Calibri"/>
+                <w:sz w:val="18"/>
+              </w:rPr>
+              <w:t>Secondary lexical stress</w:t>
+            </w:r>
+          </w:p>
+        </w:tc>
+      </w:tr>
+    </w:tbl>
+    <w:p>
+      <w:pPr>
+        <w:widowControl/>
+        <w:spacing w:before="0" w:after="60" w:line="240" w:lineRule="auto"/>
+      </w:pPr>
+    </w:p>
+    <w:p>
+      <w:pPr>
+        <w:widowControl/>
+        <w:spacing w:before="0" w:after="120" w:line="300" w:lineRule="auto"/>
+      </w:pPr>
+      <w:r>
+        <w:rPr>
+          <w:rFonts w:ascii="Calibri" w:hAnsi="Calibri"/>
+          <w:sz w:val="22"/>
+        </w:rPr>
+        <w:t>One dictionary candidate resolves directly. Multiple candidates resolve only when every candidate agrees on both syllable count and the complete stress sequence. Phone alternatives remain visible. A difference in syllables or stress remains ambiguous; no candidate is silently selected.</w:t>
+      </w:r>
+    </w:p>
+    <w:p>
+      <w:pPr>
+        <w:widowControl/>
+        <w:spacing w:before="0" w:after="120" w:line="300" w:lineRule="auto"/>
+      </w:pPr>
+      <w:r>
+        <w:rPr>
+          <w:rFonts w:ascii="Calibri" w:hAnsi="Calibri"/>
+          <w:sz w:val="22"/>
+        </w:rPr>
+        <w:t>A physical line receives a syllable total and stress sequence only when every eligible lexical token resolves. An incomplete line remains missing rather than displaying a deceptively low partial total.</w:t>
+      </w:r>
+    </w:p>
+    <w:p>
+      <w:pPr>
+        <w:widowControl/>
+        <w:spacing w:before="0" w:after="120" w:line="300" w:lineRule="auto"/>
+      </w:pPr>
+      <w:r>
+        <w:rPr>
+          <w:rFonts w:ascii="Calibri" w:hAnsi="Calibri"/>
+          <w:sz w:val="22"/>
+        </w:rPr>
+        <w:t>Advanced settings accept poem-specific scholar overrides:</w:t>
+      </w:r>
+    </w:p>
+    <w:p>
+      <w:pPr>
+        <w:pStyle w:val="Formula"/>
+      </w:pPr>
+      <w:r>
+        <w:rPr>
+          <w:rFonts w:ascii="Consolas" w:hAnsi="Consolas"/>
+          <w:color w:val="1F4D78"/>
+          <w:sz w:val="19"/>
+        </w:rPr>
+        <w:t>permit = P ER0 M IH1 T | noun reading in this line</w:t>
+      </w:r>
+    </w:p>
+    <w:p>
+      <w:pPr>
+        <w:widowControl/>
+        <w:spacing w:before="0" w:after="120" w:line="300" w:lineRule="auto"/>
+      </w:pPr>
+      <w:r>
+        <w:rPr>
+          <w:rFonts w:ascii="Calibri" w:hAnsi="Calibri"/>
+          <w:sz w:val="22"/>
+        </w:rPr>
+        <w:t>Phones must use uppercase symbols from the pinned local CMUdict inventory and include stressed or unstressed vowels. A note is required. The override is part of the configuration identity, applies only to the exact observed type in the current analysis, remains distinct from every dictionary candidate, and is reversible.</w:t>
+      </w:r>
+    </w:p>
+    <w:p>
+      <w:pPr>
+        <w:widowControl/>
+        <w:spacing w:before="0" w:after="120" w:line="300" w:lineRule="auto"/>
+      </w:pPr>
+      <w:r>
+        <w:rPr>
+          <w:rFonts w:ascii="Calibri" w:hAnsi="Calibri"/>
+          <w:sz w:val="22"/>
+        </w:rPr>
+        <w:t>The displayed confidence label is a categorical description of source resolution, not a probability. Report these results as dictionary-based North American pronunciation, syllable, and lexical-stress evidence. Do not call them definitive performed pronunciation, meter, rhyme, or scansion.</w:t>
+      </w:r>
+    </w:p>
+    <w:p>
+      <w:pPr>
+        <w:pStyle w:val="Heading2"/>
+      </w:pPr>
+      <w:r>
+        <w:rPr>
+          <w:rFonts w:ascii="Calibri" w:hAnsi="Calibri"/>
+          <w:sz w:val="22"/>
+        </w:rPr>
         <w:t>Eight emotion associations</w:t>
       </w:r>
     </w:p>
@@ -6469,7 +7113,7 @@
           <w:rFonts w:ascii="Calibri" w:hAnsi="Calibri"/>
           <w:sz w:val="22"/>
         </w:rPr>
-        <w:t>Select one or more affective lexicons and/or enable the optional normative lexical concreteness, SUBTLEX-US frequency, and Kuperman Age of Acquisition modules. VAD, categorical association, intensity, concreteness, corpus-relative frequency, and retrospective lexical AoA answer different questions and remain separate. Any optional module can run by itself when its exact local workbook is available.</w:t>
+        <w:t>Select one or more affective lexicons and/or enable the optional normative lexical concreteness, SUBTLEX-US frequency, Kuperman Age of Acquisition, and CMUdict pronunciation/prosody-foundation modules. VAD, categorical association, intensity, concreteness, corpus-relative frequency, retrospective lexical AoA, and dictionary pronunciation/lexical stress answer different questions and remain separate. Any optional module can run by itself when its exact local source is available.</w:t>
       </w:r>
     </w:p>
     <w:p>
@@ -6482,7 +7126,7 @@
           <w:rFonts w:ascii="Calibri" w:hAnsi="Calibri"/>
           <w:sz w:val="22"/>
         </w:rPr>
-        <w:t xml:space="preserve">Concreteness, Frequency, and AoA are currently temporary </w:t>
+        <w:t xml:space="preserve">Concreteness, Frequency, AoA, and Pronunciation &amp; Prosody are currently temporary </w:t>
       </w:r>
       <w:r>
         <w:rPr>
@@ -6894,138 +7538,7 @@
           <w:rFonts w:ascii="Calibri" w:hAnsi="Calibri"/>
           <w:sz w:val="22"/>
         </w:rPr>
-        <w:t xml:space="preserve"> scope.</w:t>
-      </w:r>
-    </w:p>
-    <w:p>
-      <w:pPr>
-        <w:widowControl/>
-        <w:spacing w:before="0" w:after="120" w:line="300" w:lineRule="auto"/>
-      </w:pPr>
-      <w:r>
-        <w:rPr>
-          <w:rFonts w:ascii="Calibri" w:hAnsi="Calibri"/>
-          <w:sz w:val="22"/>
-        </w:rPr>
-        <w:t xml:space="preserve">Under </w:t>
-      </w:r>
-      <w:r>
-        <w:rPr>
-          <w:rFonts w:ascii="Calibri" w:hAnsi="Calibri"/>
-          <w:b/>
-          <w:sz w:val="22"/>
-        </w:rPr>
-        <w:t>Stopword settings</w:t>
-      </w:r>
-      <w:r>
-        <w:rPr>
-          <w:rFonts w:ascii="Calibri" w:hAnsi="Calibri"/>
-          <w:sz w:val="22"/>
-        </w:rPr>
-        <w:t>, inspect or change the secondary-view policy. The all-matched result is always preserved even when only one view is displayed.</w:t>
-      </w:r>
-    </w:p>
-    <w:p>
-      <w:pPr>
-        <w:pStyle w:val="Heading2"/>
-      </w:pPr>
-      <w:r>
-        <w:rPr>
-          <w:rFonts w:ascii="Calibri" w:hAnsi="Calibri"/>
-          <w:sz w:val="22"/>
-        </w:rPr>
-        <w:t>Overview tab</w:t>
-      </w:r>
-    </w:p>
-    <w:p>
-      <w:pPr>
-        <w:widowControl/>
-        <w:spacing w:before="0" w:after="120" w:line="300" w:lineRule="auto"/>
-      </w:pPr>
-      <w:r>
-        <w:rPr>
-          <w:rFonts w:ascii="Calibri" w:hAnsi="Calibri"/>
-          <w:sz w:val="22"/>
-        </w:rPr>
-        <w:t>Read coverage before means. The tab shows ordinary and content-focused coverage, matched counts, active methodology, excluded stopword counts, interpretive framing, and warnings.</w:t>
-      </w:r>
-    </w:p>
-    <w:p>
-      <w:pPr>
-        <w:pStyle w:val="Heading2"/>
-      </w:pPr>
-      <w:r>
-        <w:rPr>
-          <w:rFonts w:ascii="Calibri" w:hAnsi="Calibri"/>
-          <w:sz w:val="22"/>
-        </w:rPr>
-        <w:t>Language Profile tab</w:t>
-      </w:r>
-    </w:p>
-    <w:p>
-      <w:pPr>
-        <w:widowControl/>
-        <w:spacing w:before="0" w:after="120" w:line="300" w:lineRule="auto"/>
-      </w:pPr>
-      <w:r>
-        <w:rPr>
-          <w:rFonts w:ascii="Calibri" w:hAnsi="Calibri"/>
-          <w:sz w:val="22"/>
-        </w:rPr>
-        <w:t xml:space="preserve">The </w:t>
-      </w:r>
-      <w:r>
-        <w:rPr>
-          <w:rFonts w:ascii="Calibri" w:hAnsi="Calibri"/>
-          <w:b/>
-          <w:sz w:val="22"/>
-        </w:rPr>
-        <w:t>Shared Processing Record</w:t>
-      </w:r>
-      <w:r>
-        <w:rPr>
-          <w:rFonts w:ascii="Calibri" w:hAnsi="Calibri"/>
-          <w:sz w:val="22"/>
-        </w:rPr>
-        <w:t xml:space="preserve"> first reports stanzas, physical lines, model sentences, total and lexical tokens, recipe/configuration IDs, model pipeline, dependency coverage, named-entity status, and processing cautions. It is the common local representation used by every selected lexicon.</w:t>
-      </w:r>
-    </w:p>
-    <w:p>
-      <w:pPr>
-        <w:widowControl/>
-        <w:spacing w:before="0" w:after="120" w:line="300" w:lineRule="auto"/>
-      </w:pPr>
-      <w:r>
-        <w:rPr>
-          <w:rFonts w:ascii="Calibri" w:hAnsi="Calibri"/>
-          <w:sz w:val="22"/>
-        </w:rPr>
-        <w:t>The tab then reports part-of-speech counts and relative shares for all eligible lexical tokens, independently of lexicon coverage. It also shows unique normalized types and example forms. The denominator is displayed, and a caution explains that the labels are model-generated.</w:t>
-      </w:r>
-    </w:p>
-    <w:p>
-      <w:pPr>
-        <w:pStyle w:val="Heading2"/>
-      </w:pPr>
-      <w:r>
-        <w:rPr>
-          <w:rFonts w:ascii="Calibri" w:hAnsi="Calibri"/>
-          <w:sz w:val="22"/>
-        </w:rPr>
-        <w:t>VAD Profile tab</w:t>
-      </w:r>
-    </w:p>
-    <w:p>
-      <w:pPr>
-        <w:widowControl/>
-        <w:spacing w:before="0" w:after="120" w:line="300" w:lineRule="auto"/>
-      </w:pPr>
-      <w:r>
-        <w:rPr>
-          <w:rFonts w:ascii="Calibri" w:hAnsi="Calibri"/>
-          <w:sz w:val="22"/>
-        </w:rPr>
-        <w:t>This tab contains:</w:t>
+        <w:t xml:space="preserve"> scope;</w:t>
       </w:r>
     </w:p>
     <w:p>
@@ -7043,7 +7556,22 @@
           <w:rFonts w:ascii="Calibri" w:hAnsi="Calibri"/>
           <w:sz w:val="22"/>
         </w:rPr>
-        <w:t>parallel normalized VAD charts;</w:t>
+        <w:t xml:space="preserve">poem-specific </w:t>
+      </w:r>
+      <w:r>
+        <w:rPr>
+          <w:rFonts w:ascii="Consolas" w:hAnsi="Consolas"/>
+          <w:color w:val="1F4D78"/>
+          <w:sz w:val="19"/>
+        </w:rPr>
+        <w:t>word = ARPAbet phones | note</w:t>
+      </w:r>
+      <w:r>
+        <w:rPr>
+          <w:rFonts w:ascii="Calibri" w:hAnsi="Calibri"/>
+          <w:sz w:val="22"/>
+        </w:rPr>
+        <w:t xml:space="preserve"> pronunciation overrides;</w:t>
       </w:r>
     </w:p>
     <w:p>
@@ -7061,7 +7589,7 @@
           <w:rFonts w:ascii="Calibri" w:hAnsi="Calibri"/>
           <w:sz w:val="22"/>
         </w:rPr>
-        <w:t>definitions of valence, arousal, and dominance;</w:t>
+        <w:t>the pronunciation resolved-token coverage caution threshold;</w:t>
       </w:r>
     </w:p>
     <w:p>
@@ -7079,7 +7607,7 @@
           <w:rFonts w:ascii="Calibri" w:hAnsi="Calibri"/>
           <w:sz w:val="22"/>
         </w:rPr>
-        <w:t>token- and type-weighted values for each analysis view;</w:t>
+        <w:t>minimum complete pronunciation lines; and</w:t>
       </w:r>
     </w:p>
     <w:p>
@@ -7097,7 +7625,138 @@
           <w:rFonts w:ascii="Calibri" w:hAnsi="Calibri"/>
           <w:sz w:val="22"/>
         </w:rPr>
-        <w:t>plain-language midpoint interpretations;</w:t>
+        <w:t>minimum resolved pronunciation tokens for sparse-result warnings.</w:t>
+      </w:r>
+    </w:p>
+    <w:p>
+      <w:pPr>
+        <w:widowControl/>
+        <w:spacing w:before="0" w:after="120" w:line="300" w:lineRule="auto"/>
+      </w:pPr>
+      <w:r>
+        <w:rPr>
+          <w:rFonts w:ascii="Calibri" w:hAnsi="Calibri"/>
+          <w:sz w:val="22"/>
+        </w:rPr>
+        <w:t xml:space="preserve">Under </w:t>
+      </w:r>
+      <w:r>
+        <w:rPr>
+          <w:rFonts w:ascii="Calibri" w:hAnsi="Calibri"/>
+          <w:b/>
+          <w:sz w:val="22"/>
+        </w:rPr>
+        <w:t>Stopword settings</w:t>
+      </w:r>
+      <w:r>
+        <w:rPr>
+          <w:rFonts w:ascii="Calibri" w:hAnsi="Calibri"/>
+          <w:sz w:val="22"/>
+        </w:rPr>
+        <w:t>, inspect or change the secondary-view policy. The all-matched result is always preserved even when only one view is displayed.</w:t>
+      </w:r>
+    </w:p>
+    <w:p>
+      <w:pPr>
+        <w:pStyle w:val="Heading2"/>
+      </w:pPr>
+      <w:r>
+        <w:rPr>
+          <w:rFonts w:ascii="Calibri" w:hAnsi="Calibri"/>
+          <w:sz w:val="22"/>
+        </w:rPr>
+        <w:t>Overview tab</w:t>
+      </w:r>
+    </w:p>
+    <w:p>
+      <w:pPr>
+        <w:widowControl/>
+        <w:spacing w:before="0" w:after="120" w:line="300" w:lineRule="auto"/>
+      </w:pPr>
+      <w:r>
+        <w:rPr>
+          <w:rFonts w:ascii="Calibri" w:hAnsi="Calibri"/>
+          <w:sz w:val="22"/>
+        </w:rPr>
+        <w:t>Read coverage before means. The tab shows ordinary and content-focused coverage, matched counts, active methodology, excluded stopword counts, interpretive framing, and warnings.</w:t>
+      </w:r>
+    </w:p>
+    <w:p>
+      <w:pPr>
+        <w:pStyle w:val="Heading2"/>
+      </w:pPr>
+      <w:r>
+        <w:rPr>
+          <w:rFonts w:ascii="Calibri" w:hAnsi="Calibri"/>
+          <w:sz w:val="22"/>
+        </w:rPr>
+        <w:t>Language Profile tab</w:t>
+      </w:r>
+    </w:p>
+    <w:p>
+      <w:pPr>
+        <w:widowControl/>
+        <w:spacing w:before="0" w:after="120" w:line="300" w:lineRule="auto"/>
+      </w:pPr>
+      <w:r>
+        <w:rPr>
+          <w:rFonts w:ascii="Calibri" w:hAnsi="Calibri"/>
+          <w:sz w:val="22"/>
+        </w:rPr>
+        <w:t xml:space="preserve">The </w:t>
+      </w:r>
+      <w:r>
+        <w:rPr>
+          <w:rFonts w:ascii="Calibri" w:hAnsi="Calibri"/>
+          <w:b/>
+          <w:sz w:val="22"/>
+        </w:rPr>
+        <w:t>Shared Processing Record</w:t>
+      </w:r>
+      <w:r>
+        <w:rPr>
+          <w:rFonts w:ascii="Calibri" w:hAnsi="Calibri"/>
+          <w:sz w:val="22"/>
+        </w:rPr>
+        <w:t xml:space="preserve"> first reports stanzas, physical lines, model sentences, total and lexical tokens, recipe/configuration IDs, model pipeline, dependency coverage, named-entity status, and processing cautions. It is the common local representation used by every selected lexicon.</w:t>
+      </w:r>
+    </w:p>
+    <w:p>
+      <w:pPr>
+        <w:widowControl/>
+        <w:spacing w:before="0" w:after="120" w:line="300" w:lineRule="auto"/>
+      </w:pPr>
+      <w:r>
+        <w:rPr>
+          <w:rFonts w:ascii="Calibri" w:hAnsi="Calibri"/>
+          <w:sz w:val="22"/>
+        </w:rPr>
+        <w:t>The tab then reports part-of-speech counts and relative shares for all eligible lexical tokens, independently of lexicon coverage. It also shows unique normalized types and example forms. The denominator is displayed, and a caution explains that the labels are model-generated.</w:t>
+      </w:r>
+    </w:p>
+    <w:p>
+      <w:pPr>
+        <w:pStyle w:val="Heading2"/>
+      </w:pPr>
+      <w:r>
+        <w:rPr>
+          <w:rFonts w:ascii="Calibri" w:hAnsi="Calibri"/>
+          <w:sz w:val="22"/>
+        </w:rPr>
+        <w:t>VAD Profile tab</w:t>
+      </w:r>
+    </w:p>
+    <w:p>
+      <w:pPr>
+        <w:widowControl/>
+        <w:spacing w:before="0" w:after="120" w:line="300" w:lineRule="auto"/>
+      </w:pPr>
+      <w:r>
+        <w:rPr>
+          <w:rFonts w:ascii="Calibri" w:hAnsi="Calibri"/>
+          <w:sz w:val="22"/>
+        </w:rPr>
+        <w:t>This tab contains:</w:t>
       </w:r>
     </w:p>
     <w:p>
@@ -7115,7 +7774,7 @@
           <w:rFonts w:ascii="Calibri" w:hAnsi="Calibri"/>
           <w:sz w:val="22"/>
         </w:rPr>
-        <w:t>population dispersion;</w:t>
+        <w:t>parallel normalized VAD charts;</w:t>
       </w:r>
     </w:p>
     <w:p>
@@ -7133,7 +7792,7 @@
           <w:rFonts w:ascii="Calibri" w:hAnsi="Calibri"/>
           <w:sz w:val="22"/>
         </w:rPr>
-        <w:t>stopword-sensitivity differences;</w:t>
+        <w:t>definitions of valence, arousal, and dominance;</w:t>
       </w:r>
     </w:p>
     <w:p>
@@ -7151,7 +7810,7 @@
           <w:rFonts w:ascii="Calibri" w:hAnsi="Calibri"/>
           <w:sz w:val="22"/>
         </w:rPr>
-        <w:t>cumulative normalized totals;</w:t>
+        <w:t>token- and type-weighted values for each analysis view;</w:t>
       </w:r>
     </w:p>
     <w:p>
@@ -7169,7 +7828,7 @@
           <w:rFonts w:ascii="Calibri" w:hAnsi="Calibri"/>
           <w:sz w:val="22"/>
         </w:rPr>
-        <w:t>top midpoint-centered contributors;</w:t>
+        <w:t>plain-language midpoint interpretations;</w:t>
       </w:r>
     </w:p>
     <w:p>
@@ -7187,6 +7846,78 @@
           <w:rFonts w:ascii="Calibri" w:hAnsi="Calibri"/>
           <w:sz w:val="22"/>
         </w:rPr>
+        <w:t>population dispersion;</w:t>
+      </w:r>
+    </w:p>
+    <w:p>
+      <w:pPr>
+        <w:widowControl/>
+        <w:numPr>
+          <w:ilvl w:val="0"/>
+          <w:numId w:val="10"/>
+        </w:numPr>
+        <w:spacing w:before="0" w:after="80" w:line="300" w:lineRule="auto"/>
+        <w:ind w:left="540" w:hanging="271"/>
+      </w:pPr>
+      <w:r>
+        <w:rPr>
+          <w:rFonts w:ascii="Calibri" w:hAnsi="Calibri"/>
+          <w:sz w:val="22"/>
+        </w:rPr>
+        <w:t>stopword-sensitivity differences;</w:t>
+      </w:r>
+    </w:p>
+    <w:p>
+      <w:pPr>
+        <w:widowControl/>
+        <w:numPr>
+          <w:ilvl w:val="0"/>
+          <w:numId w:val="10"/>
+        </w:numPr>
+        <w:spacing w:before="0" w:after="80" w:line="300" w:lineRule="auto"/>
+        <w:ind w:left="540" w:hanging="271"/>
+      </w:pPr>
+      <w:r>
+        <w:rPr>
+          <w:rFonts w:ascii="Calibri" w:hAnsi="Calibri"/>
+          <w:sz w:val="22"/>
+        </w:rPr>
+        <w:t>cumulative normalized totals;</w:t>
+      </w:r>
+    </w:p>
+    <w:p>
+      <w:pPr>
+        <w:widowControl/>
+        <w:numPr>
+          <w:ilvl w:val="0"/>
+          <w:numId w:val="10"/>
+        </w:numPr>
+        <w:spacing w:before="0" w:after="80" w:line="300" w:lineRule="auto"/>
+        <w:ind w:left="540" w:hanging="271"/>
+      </w:pPr>
+      <w:r>
+        <w:rPr>
+          <w:rFonts w:ascii="Calibri" w:hAnsi="Calibri"/>
+          <w:sz w:val="22"/>
+        </w:rPr>
+        <w:t>top midpoint-centered contributors;</w:t>
+      </w:r>
+    </w:p>
+    <w:p>
+      <w:pPr>
+        <w:widowControl/>
+        <w:numPr>
+          <w:ilvl w:val="0"/>
+          <w:numId w:val="10"/>
+        </w:numPr>
+        <w:spacing w:before="0" w:after="80" w:line="300" w:lineRule="auto"/>
+        <w:ind w:left="540" w:hanging="271"/>
+      </w:pPr>
+      <w:r>
+        <w:rPr>
+          <w:rFonts w:ascii="Calibri" w:hAnsi="Calibri"/>
+          <w:sz w:val="22"/>
+        </w:rPr>
         <w:t>original source scales and normalization formulas.</w:t>
       </w:r>
     </w:p>
@@ -7447,6 +8178,117 @@
           <w:sz w:val="22"/>
         </w:rPr>
         <w:t xml:space="preserve"> scope was used. Exact observed form, lemma, documented fallback, source-unrated, unmatched, and ineligible decisions stay distinct. It always displays the required non-diagnostic caution. The source workbook is read-only; a missing, changed, malformed, or unsupported source prevents activation.</w:t>
+      </w:r>
+    </w:p>
+    <w:p>
+      <w:pPr>
+        <w:pStyle w:val="Heading2"/>
+      </w:pPr>
+      <w:r>
+        <w:rPr>
+          <w:rFonts w:ascii="Calibri" w:hAnsi="Calibri"/>
+          <w:sz w:val="22"/>
+        </w:rPr>
+        <w:t>Pronunciation &amp; Prosody tab</w:t>
+      </w:r>
+    </w:p>
+    <w:p>
+      <w:pPr>
+        <w:widowControl/>
+        <w:spacing w:before="0" w:after="120" w:line="300" w:lineRule="auto"/>
+      </w:pPr>
+      <w:r>
+        <w:rPr>
+          <w:rFonts w:ascii="Calibri" w:hAnsi="Calibri"/>
+          <w:sz w:val="22"/>
+        </w:rPr>
+        <w:t>This tab appears when the optional CMUdict module is enabled. It shows resolved-token coverage, syllables per resolved word, median syllables per complete line, lexical stress density, complete-line coverage, physical-line totals and stress sequences, words needing attention, every candidate pronunciation, scholar overrides, warnings, and three-file source provenance.</w:t>
+      </w:r>
+    </w:p>
+    <w:p>
+      <w:pPr>
+        <w:widowControl/>
+        <w:spacing w:before="0" w:after="120" w:line="300" w:lineRule="auto"/>
+      </w:pPr>
+      <w:r>
+        <w:rPr>
+          <w:rFonts w:ascii="Calibri" w:hAnsi="Calibri"/>
+          <w:sz w:val="22"/>
+        </w:rPr>
+        <w:t xml:space="preserve">Use </w:t>
+      </w:r>
+      <w:r>
+        <w:rPr>
+          <w:rFonts w:ascii="Calibri" w:hAnsi="Calibri"/>
+          <w:b/>
+          <w:sz w:val="22"/>
+        </w:rPr>
+        <w:t>Words needing attention</w:t>
+      </w:r>
+      <w:r>
+        <w:rPr>
+          <w:rFonts w:ascii="Calibri" w:hAnsi="Calibri"/>
+          <w:sz w:val="22"/>
+        </w:rPr>
+        <w:t xml:space="preserve"> to find out-of-dictionary and materially ambiguous forms. Add an override only when you can document the intended reading. Removing an override and analyzing again reverses it.</w:t>
+      </w:r>
+    </w:p>
+    <w:p>
+      <w:pPr>
+        <w:widowControl/>
+        <w:spacing w:before="0" w:after="120" w:line="300" w:lineRule="auto"/>
+      </w:pPr>
+      <w:r>
+        <w:rPr>
+          <w:rFonts w:ascii="Calibri" w:hAnsi="Calibri"/>
+          <w:sz w:val="22"/>
+        </w:rPr>
+        <w:t xml:space="preserve">The North American dictionary warning remains visible. </w:t>
+      </w:r>
+      <w:r>
+        <w:rPr>
+          <w:rFonts w:ascii="Consolas" w:hAnsi="Consolas"/>
+          <w:color w:val="1F4D78"/>
+          <w:sz w:val="19"/>
+        </w:rPr>
+        <w:t>0</w:t>
+      </w:r>
+      <w:r>
+        <w:rPr>
+          <w:rFonts w:ascii="Calibri" w:hAnsi="Calibri"/>
+          <w:sz w:val="22"/>
+        </w:rPr>
+        <w:t xml:space="preserve">, </w:t>
+      </w:r>
+      <w:r>
+        <w:rPr>
+          <w:rFonts w:ascii="Consolas" w:hAnsi="Consolas"/>
+          <w:color w:val="1F4D78"/>
+          <w:sz w:val="19"/>
+        </w:rPr>
+        <w:t>1</w:t>
+      </w:r>
+      <w:r>
+        <w:rPr>
+          <w:rFonts w:ascii="Calibri" w:hAnsi="Calibri"/>
+          <w:sz w:val="22"/>
+        </w:rPr>
+        <w:t xml:space="preserve">, and </w:t>
+      </w:r>
+      <w:r>
+        <w:rPr>
+          <w:rFonts w:ascii="Consolas" w:hAnsi="Consolas"/>
+          <w:color w:val="1F4D78"/>
+          <w:sz w:val="19"/>
+        </w:rPr>
+        <w:t>2</w:t>
+      </w:r>
+      <w:r>
+        <w:rPr>
+          <w:rFonts w:ascii="Calibri" w:hAnsi="Calibri"/>
+          <w:sz w:val="22"/>
+        </w:rPr>
+        <w:t xml:space="preserve"> are lexical-stress digits, not metrical beats. The Stage 5 tab does not report candidate meter or rhyme.</w:t>
       </w:r>
     </w:p>
     <w:p>
@@ -11826,6 +12668,296 @@
           </w:p>
         </w:tc>
       </w:tr>
+      <w:tr>
+        <w:trPr>
+          <w:cantSplit w:val="true"/>
+        </w:trPr>
+        <w:tc>
+          <w:tcPr>
+            <w:tcW w:type="dxa" w:w="3600"/>
+            <w:vAlign w:val="center"/>
+            <w:tcMar>
+              <w:top w:w="80" w:type="dxa"/>
+              <w:bottom w:w="80" w:type="dxa"/>
+              <w:start w:w="120" w:type="dxa"/>
+              <w:end w:w="120" w:type="dxa"/>
+            </w:tcMar>
+          </w:tcPr>
+          <w:p>
+            <w:pPr>
+              <w:widowControl/>
+              <w:spacing w:before="0" w:after="0" w:line="252" w:lineRule="auto"/>
+            </w:pPr>
+            <w:r/>
+            <w:r>
+              <w:rPr>
+                <w:rFonts w:ascii="Consolas" w:hAnsi="Consolas"/>
+                <w:color w:val="1F4D78"/>
+                <w:sz w:val="17"/>
+              </w:rPr>
+              <w:t>pronunciation_summary.csv</w:t>
+            </w:r>
+          </w:p>
+        </w:tc>
+        <w:tc>
+          <w:tcPr>
+            <w:tcW w:type="dxa" w:w="5760"/>
+            <w:vAlign w:val="center"/>
+            <w:tcMar>
+              <w:top w:w="80" w:type="dxa"/>
+              <w:bottom w:w="80" w:type="dxa"/>
+              <w:start w:w="120" w:type="dxa"/>
+              <w:end w:w="120" w:type="dxa"/>
+            </w:tcMar>
+          </w:tcPr>
+          <w:p>
+            <w:pPr>
+              <w:widowControl/>
+              <w:spacing w:before="0" w:after="0" w:line="252" w:lineRule="auto"/>
+            </w:pPr>
+            <w:r/>
+            <w:r>
+              <w:rPr>
+                <w:rFonts w:ascii="Calibri" w:hAnsi="Calibri"/>
+                <w:sz w:val="18"/>
+              </w:rPr>
+              <w:t>Syllable/stress summaries, token/type/line coverage, ambiguity, configuration, and required scope warning</w:t>
+            </w:r>
+          </w:p>
+        </w:tc>
+      </w:tr>
+      <w:tr>
+        <w:trPr>
+          <w:cantSplit w:val="true"/>
+        </w:trPr>
+        <w:tc>
+          <w:tcPr>
+            <w:tcW w:type="dxa" w:w="3600"/>
+            <w:vAlign w:val="center"/>
+            <w:tcMar>
+              <w:top w:w="80" w:type="dxa"/>
+              <w:bottom w:w="80" w:type="dxa"/>
+              <w:start w:w="120" w:type="dxa"/>
+              <w:end w:w="120" w:type="dxa"/>
+            </w:tcMar>
+          </w:tcPr>
+          <w:p>
+            <w:pPr>
+              <w:widowControl/>
+              <w:spacing w:before="0" w:after="0" w:line="252" w:lineRule="auto"/>
+            </w:pPr>
+            <w:r/>
+            <w:r>
+              <w:rPr>
+                <w:rFonts w:ascii="Consolas" w:hAnsi="Consolas"/>
+                <w:color w:val="1F4D78"/>
+                <w:sz w:val="17"/>
+              </w:rPr>
+              <w:t>pronunciation_lines.csv</w:t>
+            </w:r>
+          </w:p>
+        </w:tc>
+        <w:tc>
+          <w:tcPr>
+            <w:tcW w:type="dxa" w:w="5760"/>
+            <w:vAlign w:val="center"/>
+            <w:tcMar>
+              <w:top w:w="80" w:type="dxa"/>
+              <w:bottom w:w="80" w:type="dxa"/>
+              <w:start w:w="120" w:type="dxa"/>
+              <w:end w:w="120" w:type="dxa"/>
+            </w:tcMar>
+          </w:tcPr>
+          <w:p>
+            <w:pPr>
+              <w:widowControl/>
+              <w:spacing w:before="0" w:after="0" w:line="252" w:lineRule="auto"/>
+            </w:pPr>
+            <w:r/>
+            <w:r>
+              <w:rPr>
+                <w:rFonts w:ascii="Calibri" w:hAnsi="Calibri"/>
+                <w:sz w:val="18"/>
+              </w:rPr>
+              <w:t>Every physical line's exact text, coverage, completeness, syllable total or missing value, and lexical-stress sequence</w:t>
+            </w:r>
+          </w:p>
+        </w:tc>
+      </w:tr>
+      <w:tr>
+        <w:trPr>
+          <w:cantSplit w:val="true"/>
+        </w:trPr>
+        <w:tc>
+          <w:tcPr>
+            <w:tcW w:type="dxa" w:w="3600"/>
+            <w:vAlign w:val="center"/>
+            <w:tcMar>
+              <w:top w:w="80" w:type="dxa"/>
+              <w:bottom w:w="80" w:type="dxa"/>
+              <w:start w:w="120" w:type="dxa"/>
+              <w:end w:w="120" w:type="dxa"/>
+            </w:tcMar>
+          </w:tcPr>
+          <w:p>
+            <w:pPr>
+              <w:widowControl/>
+              <w:spacing w:before="0" w:after="0" w:line="252" w:lineRule="auto"/>
+            </w:pPr>
+            <w:r/>
+            <w:r>
+              <w:rPr>
+                <w:rFonts w:ascii="Consolas" w:hAnsi="Consolas"/>
+                <w:color w:val="1F4D78"/>
+                <w:sz w:val="17"/>
+              </w:rPr>
+              <w:t>pronunciation_types.csv</w:t>
+            </w:r>
+          </w:p>
+        </w:tc>
+        <w:tc>
+          <w:tcPr>
+            <w:tcW w:type="dxa" w:w="5760"/>
+            <w:vAlign w:val="center"/>
+            <w:tcMar>
+              <w:top w:w="80" w:type="dxa"/>
+              <w:bottom w:w="80" w:type="dxa"/>
+              <w:start w:w="120" w:type="dxa"/>
+              <w:end w:w="120" w:type="dxa"/>
+            </w:tcMar>
+          </w:tcPr>
+          <w:p>
+            <w:pPr>
+              <w:widowControl/>
+              <w:spacing w:before="0" w:after="0" w:line="252" w:lineRule="auto"/>
+            </w:pPr>
+            <w:r/>
+            <w:r>
+              <w:rPr>
+                <w:rFonts w:ascii="Calibri" w:hAnsi="Calibri"/>
+                <w:sz w:val="18"/>
+              </w:rPr>
+              <w:t>Observed forms, token occurrences, statuses, candidate phones, and resolved prosodic fields</w:t>
+            </w:r>
+          </w:p>
+        </w:tc>
+      </w:tr>
+      <w:tr>
+        <w:trPr>
+          <w:cantSplit w:val="true"/>
+        </w:trPr>
+        <w:tc>
+          <w:tcPr>
+            <w:tcW w:type="dxa" w:w="3600"/>
+            <w:vAlign w:val="center"/>
+            <w:tcMar>
+              <w:top w:w="80" w:type="dxa"/>
+              <w:bottom w:w="80" w:type="dxa"/>
+              <w:start w:w="120" w:type="dxa"/>
+              <w:end w:w="120" w:type="dxa"/>
+            </w:tcMar>
+          </w:tcPr>
+          <w:p>
+            <w:pPr>
+              <w:widowControl/>
+              <w:spacing w:before="0" w:after="0" w:line="252" w:lineRule="auto"/>
+            </w:pPr>
+            <w:r/>
+            <w:r>
+              <w:rPr>
+                <w:rFonts w:ascii="Consolas" w:hAnsi="Consolas"/>
+                <w:color w:val="1F4D78"/>
+                <w:sz w:val="17"/>
+              </w:rPr>
+              <w:t>pronunciation_token_audit.csv</w:t>
+            </w:r>
+          </w:p>
+        </w:tc>
+        <w:tc>
+          <w:tcPr>
+            <w:tcW w:type="dxa" w:w="5760"/>
+            <w:vAlign w:val="center"/>
+            <w:tcMar>
+              <w:top w:w="80" w:type="dxa"/>
+              <w:bottom w:w="80" w:type="dxa"/>
+              <w:start w:w="120" w:type="dxa"/>
+              <w:end w:w="120" w:type="dxa"/>
+            </w:tcMar>
+          </w:tcPr>
+          <w:p>
+            <w:pPr>
+              <w:widowControl/>
+              <w:spacing w:before="0" w:after="0" w:line="252" w:lineRule="auto"/>
+            </w:pPr>
+            <w:r/>
+            <w:r>
+              <w:rPr>
+                <w:rFonts w:ascii="Calibri" w:hAnsi="Calibri"/>
+                <w:sz w:val="18"/>
+              </w:rPr>
+              <w:t>Every token's eligibility, exact candidates, source lines, resolved fields or missing values, categorical resolution label, override note, and reason</w:t>
+            </w:r>
+          </w:p>
+        </w:tc>
+      </w:tr>
+      <w:tr>
+        <w:trPr>
+          <w:cantSplit w:val="true"/>
+        </w:trPr>
+        <w:tc>
+          <w:tcPr>
+            <w:tcW w:type="dxa" w:w="3600"/>
+            <w:vAlign w:val="center"/>
+            <w:tcMar>
+              <w:top w:w="80" w:type="dxa"/>
+              <w:bottom w:w="80" w:type="dxa"/>
+              <w:start w:w="120" w:type="dxa"/>
+              <w:end w:w="120" w:type="dxa"/>
+            </w:tcMar>
+          </w:tcPr>
+          <w:p>
+            <w:pPr>
+              <w:widowControl/>
+              <w:spacing w:before="0" w:after="0" w:line="252" w:lineRule="auto"/>
+            </w:pPr>
+            <w:r/>
+            <w:r>
+              <w:rPr>
+                <w:rFonts w:ascii="Consolas" w:hAnsi="Consolas"/>
+                <w:color w:val="1F4D78"/>
+                <w:sz w:val="17"/>
+              </w:rPr>
+              <w:t>pronunciation_result.json</w:t>
+            </w:r>
+          </w:p>
+        </w:tc>
+        <w:tc>
+          <w:tcPr>
+            <w:tcW w:type="dxa" w:w="5760"/>
+            <w:vAlign w:val="center"/>
+            <w:tcMar>
+              <w:top w:w="80" w:type="dxa"/>
+              <w:bottom w:w="80" w:type="dxa"/>
+              <w:start w:w="120" w:type="dxa"/>
+              <w:end w:w="120" w:type="dxa"/>
+            </w:tcMar>
+          </w:tcPr>
+          <w:p>
+            <w:pPr>
+              <w:widowControl/>
+              <w:spacing w:before="0" w:after="0" w:line="252" w:lineRule="auto"/>
+            </w:pPr>
+            <w:r/>
+            <w:r>
+              <w:rPr>
+                <w:rFonts w:ascii="Calibri" w:hAnsi="Calibri"/>
+                <w:sz w:val="18"/>
+              </w:rPr>
+              <w:t>Complete structured Stage 5 result, source contracts, configuration, candidates, warnings, and provenance</w:t>
+            </w:r>
+          </w:p>
+        </w:tc>
+      </w:tr>
     </w:tbl>
     <w:p>
       <w:pPr>
@@ -11903,7 +13035,7 @@
           <w:rFonts w:ascii="Calibri" w:hAnsi="Calibri"/>
           <w:sz w:val="22"/>
         </w:rPr>
-        <w:t xml:space="preserve"> contains the optional SUBTLEX-US result, and </w:t>
+        <w:t xml:space="preserve"> contains the optional SUBTLEX-US result, </w:t>
       </w:r>
       <w:r>
         <w:rPr>
@@ -11918,7 +13050,7 @@
           <w:rFonts w:ascii="Calibri" w:hAnsi="Calibri"/>
           <w:sz w:val="22"/>
         </w:rPr>
-        <w:t xml:space="preserve"> contains the optional Kuperman result. </w:t>
+        <w:t xml:space="preserve"> contains the optional Kuperman result, and </w:t>
       </w:r>
       <w:r>
         <w:rPr>
@@ -11926,6 +13058,21 @@
           <w:color w:val="1F4D78"/>
           <w:sz w:val="19"/>
         </w:rPr>
+        <w:t>pronunciation_result.json</w:t>
+      </w:r>
+      <w:r>
+        <w:rPr>
+          <w:rFonts w:ascii="Calibri" w:hAnsi="Calibri"/>
+          <w:sz w:val="22"/>
+        </w:rPr>
+        <w:t xml:space="preserve"> contains every Stage 5 candidate and decision. </w:t>
+      </w:r>
+      <w:r>
+        <w:rPr>
+          <w:rFonts w:ascii="Consolas" w:hAnsi="Consolas"/>
+          <w:color w:val="1F4D78"/>
+          <w:sz w:val="19"/>
+        </w:rPr>
         <w:t>poem_document.json</w:t>
       </w:r>
       <w:r>
@@ -11933,7 +13080,7 @@
           <w:rFonts w:ascii="Calibri" w:hAnsi="Calibri"/>
           <w:sz w:val="22"/>
         </w:rPr>
-        <w:t xml:space="preserve"> includes the original text, so protect it as research material. Concreteness, Frequency, and AoA exports retain source-row provenance but do not copy any complete research workbook. The scholar summary is the easiest reading aid.</w:t>
+        <w:t xml:space="preserve"> includes the original text, so protect it as research material. Concreteness, Frequency, AoA, and Pronunciation exports retain source-row provenance but do not copy any complete research source. The scholar summary is the easiest reading aid.</w:t>
       </w:r>
     </w:p>
     <w:p>
@@ -13672,6 +14819,188 @@
           <w:sz w:val="22"/>
         </w:rPr>
         <w:t>These source-response fields do not change the poem's token weighting. When a cross-module relationship is available, Spearman's rank coefficient is computed over unique paired normalized surface types, with a minimum of three paired types.</w:t>
+      </w:r>
+    </w:p>
+    <w:p>
+      <w:pPr>
+        <w:pStyle w:val="Heading2"/>
+      </w:pPr>
+      <w:r>
+        <w:rPr>
+          <w:rFonts w:ascii="Calibri" w:hAnsi="Calibri"/>
+          <w:sz w:val="22"/>
+        </w:rPr>
+        <w:t>Pronunciation coverage and stress density</w:t>
+      </w:r>
+    </w:p>
+    <w:p>
+      <w:pPr>
+        <w:widowControl/>
+        <w:spacing w:before="0" w:after="120" w:line="300" w:lineRule="auto"/>
+      </w:pPr>
+      <w:r>
+        <w:rPr>
+          <w:rFonts w:ascii="Calibri" w:hAnsi="Calibri"/>
+          <w:sz w:val="22"/>
+        </w:rPr>
+        <w:t xml:space="preserve">Let </w:t>
+      </w:r>
+      <w:r>
+        <w:rPr>
+          <w:rFonts w:ascii="Consolas" w:hAnsi="Consolas"/>
+          <w:color w:val="1F4D78"/>
+          <w:sz w:val="19"/>
+        </w:rPr>
+        <w:t>P</w:t>
+      </w:r>
+      <w:r>
+        <w:rPr>
+          <w:rFonts w:ascii="Calibri" w:hAnsi="Calibri"/>
+          <w:sz w:val="22"/>
+        </w:rPr>
+        <w:t xml:space="preserve"> be eligible lexical token occurrences, </w:t>
+      </w:r>
+      <w:r>
+        <w:rPr>
+          <w:rFonts w:ascii="Consolas" w:hAnsi="Consolas"/>
+          <w:color w:val="1F4D78"/>
+          <w:sz w:val="19"/>
+        </w:rPr>
+        <w:t>R</w:t>
+      </w:r>
+      <w:r>
+        <w:rPr>
+          <w:rFonts w:ascii="Calibri" w:hAnsi="Calibri"/>
+          <w:sz w:val="22"/>
+        </w:rPr>
+        <w:t xml:space="preserve"> resolved occurrences, </w:t>
+      </w:r>
+      <w:r>
+        <w:rPr>
+          <w:rFonts w:ascii="Consolas" w:hAnsi="Consolas"/>
+          <w:color w:val="1F4D78"/>
+          <w:sz w:val="19"/>
+        </w:rPr>
+        <w:t>L</w:t>
+      </w:r>
+      <w:r>
+        <w:rPr>
+          <w:rFonts w:ascii="Calibri" w:hAnsi="Calibri"/>
+          <w:sz w:val="22"/>
+        </w:rPr>
+        <w:t xml:space="preserve"> eligible physical lines containing lexical tokens, </w:t>
+      </w:r>
+      <w:r>
+        <w:rPr>
+          <w:rFonts w:ascii="Consolas" w:hAnsi="Consolas"/>
+          <w:color w:val="1F4D78"/>
+          <w:sz w:val="19"/>
+        </w:rPr>
+        <w:t>C</w:t>
+      </w:r>
+      <w:r>
+        <w:rPr>
+          <w:rFonts w:ascii="Calibri" w:hAnsi="Calibri"/>
+          <w:sz w:val="22"/>
+        </w:rPr>
+        <w:t xml:space="preserve"> complete lines, </w:t>
+      </w:r>
+      <w:r>
+        <w:rPr>
+          <w:rFonts w:ascii="Consolas" w:hAnsi="Consolas"/>
+          <w:color w:val="1F4D78"/>
+          <w:sz w:val="19"/>
+        </w:rPr>
+        <w:t>S</w:t>
+      </w:r>
+      <w:r>
+        <w:rPr>
+          <w:rFonts w:ascii="Calibri" w:hAnsi="Calibri"/>
+          <w:sz w:val="22"/>
+        </w:rPr>
+        <w:t xml:space="preserve"> resolved syllables, and </w:t>
+      </w:r>
+      <w:r>
+        <w:rPr>
+          <w:rFonts w:ascii="Consolas" w:hAnsi="Consolas"/>
+          <w:color w:val="1F4D78"/>
+          <w:sz w:val="19"/>
+        </w:rPr>
+        <w:t>S1</w:t>
+      </w:r>
+      <w:r>
+        <w:rPr>
+          <w:rFonts w:ascii="Calibri" w:hAnsi="Calibri"/>
+          <w:sz w:val="22"/>
+        </w:rPr>
+        <w:t>/</w:t>
+      </w:r>
+      <w:r>
+        <w:rPr>
+          <w:rFonts w:ascii="Consolas" w:hAnsi="Consolas"/>
+          <w:color w:val="1F4D78"/>
+          <w:sz w:val="19"/>
+        </w:rPr>
+        <w:t>S2</w:t>
+      </w:r>
+      <w:r>
+        <w:rPr>
+          <w:rFonts w:ascii="Calibri" w:hAnsi="Calibri"/>
+          <w:sz w:val="22"/>
+        </w:rPr>
+        <w:t xml:space="preserve"> primary/secondary stressed syllables.</w:t>
+      </w:r>
+    </w:p>
+    <w:p>
+      <w:pPr>
+        <w:pStyle w:val="Formula"/>
+      </w:pPr>
+      <w:r>
+        <w:rPr>
+          <w:rFonts w:ascii="Consolas" w:hAnsi="Consolas"/>
+          <w:color w:val="1F4D78"/>
+          <w:sz w:val="19"/>
+        </w:rPr>
+        <w:t>pronunciation_token_coverage = R / P</w:t>
+      </w:r>
+    </w:p>
+    <w:p>
+      <w:pPr>
+        <w:pStyle w:val="Formula"/>
+      </w:pPr>
+      <w:r>
+        <w:rPr>
+          <w:rFonts w:ascii="Consolas" w:hAnsi="Consolas"/>
+          <w:color w:val="1F4D78"/>
+          <w:sz w:val="19"/>
+        </w:rPr>
+        <w:t>complete_line_coverage = C / L</w:t>
+      </w:r>
+    </w:p>
+    <w:p>
+      <w:pPr>
+        <w:pStyle w:val="Formula"/>
+      </w:pPr>
+      <w:r>
+        <w:rPr>
+          <w:rFonts w:ascii="Consolas" w:hAnsi="Consolas"/>
+          <w:color w:val="1F4D78"/>
+          <w:sz w:val="19"/>
+        </w:rPr>
+        <w:t>lexical_stress_density = (S1 + S2) / S</w:t>
+      </w:r>
+    </w:p>
+    <w:p>
+      <w:pPr>
+        <w:widowControl/>
+        <w:spacing w:before="0" w:after="120" w:line="300" w:lineRule="auto"/>
+      </w:pPr>
+      <w:r>
+        <w:rPr>
+          <w:rFonts w:ascii="Calibri" w:hAnsi="Calibri"/>
+          <w:sz w:val="22"/>
+        </w:rPr>
+        <w:t>An observation resolves only from one dictionary pronunciation, prosodically agreeing alternatives, or a validated scholar override. Empty denominators and incomplete-line totals remain missing.</w:t>
       </w:r>
     </w:p>
     <w:p>
@@ -16155,6 +17484,177 @@
                 <w:rFonts w:ascii="Calibri" w:hAnsi="Calibri"/>
                 <w:sz w:val="18"/>
               </w:rPr>
+              <w:t>Pronunciation candidate</w:t>
+            </w:r>
+          </w:p>
+        </w:tc>
+        <w:tc>
+          <w:tcPr>
+            <w:tcW w:type="dxa" w:w="5760"/>
+            <w:vAlign w:val="center"/>
+            <w:tcMar>
+              <w:top w:w="80" w:type="dxa"/>
+              <w:bottom w:w="80" w:type="dxa"/>
+              <w:start w:w="120" w:type="dxa"/>
+              <w:end w:w="120" w:type="dxa"/>
+            </w:tcMar>
+          </w:tcPr>
+          <w:p>
+            <w:pPr>
+              <w:widowControl/>
+              <w:spacing w:before="0" w:after="0" w:line="252" w:lineRule="auto"/>
+            </w:pPr>
+            <w:r/>
+            <w:r>
+              <w:rPr>
+                <w:rFonts w:ascii="Calibri" w:hAnsi="Calibri"/>
+                <w:sz w:val="18"/>
+              </w:rPr>
+              <w:t>One exact CMUdict phone sequence retained for an observed spelling</w:t>
+            </w:r>
+          </w:p>
+        </w:tc>
+      </w:tr>
+      <w:tr>
+        <w:trPr>
+          <w:cantSplit w:val="true"/>
+        </w:trPr>
+        <w:tc>
+          <w:tcPr>
+            <w:tcW w:type="dxa" w:w="3600"/>
+            <w:vAlign w:val="center"/>
+            <w:tcMar>
+              <w:top w:w="80" w:type="dxa"/>
+              <w:bottom w:w="80" w:type="dxa"/>
+              <w:start w:w="120" w:type="dxa"/>
+              <w:end w:w="120" w:type="dxa"/>
+            </w:tcMar>
+          </w:tcPr>
+          <w:p>
+            <w:pPr>
+              <w:widowControl/>
+              <w:spacing w:before="0" w:after="0" w:line="252" w:lineRule="auto"/>
+            </w:pPr>
+            <w:r/>
+            <w:r>
+              <w:rPr>
+                <w:rFonts w:ascii="Calibri" w:hAnsi="Calibri"/>
+                <w:sz w:val="18"/>
+              </w:rPr>
+              <w:t>Pronunciation coverage</w:t>
+            </w:r>
+          </w:p>
+        </w:tc>
+        <w:tc>
+          <w:tcPr>
+            <w:tcW w:type="dxa" w:w="5760"/>
+            <w:vAlign w:val="center"/>
+            <w:tcMar>
+              <w:top w:w="80" w:type="dxa"/>
+              <w:bottom w:w="80" w:type="dxa"/>
+              <w:start w:w="120" w:type="dxa"/>
+              <w:end w:w="120" w:type="dxa"/>
+            </w:tcMar>
+          </w:tcPr>
+          <w:p>
+            <w:pPr>
+              <w:widowControl/>
+              <w:spacing w:before="0" w:after="0" w:line="252" w:lineRule="auto"/>
+            </w:pPr>
+            <w:r/>
+            <w:r>
+              <w:rPr>
+                <w:rFonts w:ascii="Calibri" w:hAnsi="Calibri"/>
+                <w:sz w:val="18"/>
+              </w:rPr>
+              <w:t>Resolved eligible lexical-token occurrences divided by all eligible lexical-token occurrences</w:t>
+            </w:r>
+          </w:p>
+        </w:tc>
+      </w:tr>
+      <w:tr>
+        <w:trPr>
+          <w:cantSplit w:val="true"/>
+        </w:trPr>
+        <w:tc>
+          <w:tcPr>
+            <w:tcW w:type="dxa" w:w="3600"/>
+            <w:vAlign w:val="center"/>
+            <w:tcMar>
+              <w:top w:w="80" w:type="dxa"/>
+              <w:bottom w:w="80" w:type="dxa"/>
+              <w:start w:w="120" w:type="dxa"/>
+              <w:end w:w="120" w:type="dxa"/>
+            </w:tcMar>
+          </w:tcPr>
+          <w:p>
+            <w:pPr>
+              <w:widowControl/>
+              <w:spacing w:before="0" w:after="0" w:line="252" w:lineRule="auto"/>
+            </w:pPr>
+            <w:r/>
+            <w:r>
+              <w:rPr>
+                <w:rFonts w:ascii="Calibri" w:hAnsi="Calibri"/>
+                <w:sz w:val="18"/>
+              </w:rPr>
+              <w:t>Prosodic consensus</w:t>
+            </w:r>
+          </w:p>
+        </w:tc>
+        <w:tc>
+          <w:tcPr>
+            <w:tcW w:type="dxa" w:w="5760"/>
+            <w:vAlign w:val="center"/>
+            <w:tcMar>
+              <w:top w:w="80" w:type="dxa"/>
+              <w:bottom w:w="80" w:type="dxa"/>
+              <w:start w:w="120" w:type="dxa"/>
+              <w:end w:w="120" w:type="dxa"/>
+            </w:tcMar>
+          </w:tcPr>
+          <w:p>
+            <w:pPr>
+              <w:widowControl/>
+              <w:spacing w:before="0" w:after="0" w:line="252" w:lineRule="auto"/>
+            </w:pPr>
+            <w:r/>
+            <w:r>
+              <w:rPr>
+                <w:rFonts w:ascii="Calibri" w:hAnsi="Calibri"/>
+                <w:sz w:val="18"/>
+              </w:rPr>
+              <w:t>Multiple exact dictionary candidates whose phone strings differ but syllable count and full lexical-stress sequence agree</w:t>
+            </w:r>
+          </w:p>
+        </w:tc>
+      </w:tr>
+      <w:tr>
+        <w:trPr>
+          <w:cantSplit w:val="true"/>
+        </w:trPr>
+        <w:tc>
+          <w:tcPr>
+            <w:tcW w:type="dxa" w:w="3600"/>
+            <w:vAlign w:val="center"/>
+            <w:tcMar>
+              <w:top w:w="80" w:type="dxa"/>
+              <w:bottom w:w="80" w:type="dxa"/>
+              <w:start w:w="120" w:type="dxa"/>
+              <w:end w:w="120" w:type="dxa"/>
+            </w:tcMar>
+          </w:tcPr>
+          <w:p>
+            <w:pPr>
+              <w:widowControl/>
+              <w:spacing w:before="0" w:after="0" w:line="252" w:lineRule="auto"/>
+            </w:pPr>
+            <w:r/>
+            <w:r>
+              <w:rPr>
+                <w:rFonts w:ascii="Calibri" w:hAnsi="Calibri"/>
+                <w:sz w:val="18"/>
+              </w:rPr>
               <w:t>Protected word</w:t>
             </w:r>
           </w:p>
@@ -16182,6 +17682,63 @@
                 <w:sz w:val="18"/>
               </w:rPr>
               <w:t>A word retained despite appearing in the underlying standard stopword list</w:t>
+            </w:r>
+          </w:p>
+        </w:tc>
+      </w:tr>
+      <w:tr>
+        <w:trPr>
+          <w:cantSplit w:val="true"/>
+        </w:trPr>
+        <w:tc>
+          <w:tcPr>
+            <w:tcW w:type="dxa" w:w="3600"/>
+            <w:vAlign w:val="center"/>
+            <w:tcMar>
+              <w:top w:w="80" w:type="dxa"/>
+              <w:bottom w:w="80" w:type="dxa"/>
+              <w:start w:w="120" w:type="dxa"/>
+              <w:end w:w="120" w:type="dxa"/>
+            </w:tcMar>
+          </w:tcPr>
+          <w:p>
+            <w:pPr>
+              <w:widowControl/>
+              <w:spacing w:before="0" w:after="0" w:line="252" w:lineRule="auto"/>
+            </w:pPr>
+            <w:r/>
+            <w:r>
+              <w:rPr>
+                <w:rFonts w:ascii="Calibri" w:hAnsi="Calibri"/>
+                <w:sz w:val="18"/>
+              </w:rPr>
+              <w:t>Scholar pronunciation override</w:t>
+            </w:r>
+          </w:p>
+        </w:tc>
+        <w:tc>
+          <w:tcPr>
+            <w:tcW w:type="dxa" w:w="5760"/>
+            <w:vAlign w:val="center"/>
+            <w:tcMar>
+              <w:top w:w="80" w:type="dxa"/>
+              <w:bottom w:w="80" w:type="dxa"/>
+              <w:start w:w="120" w:type="dxa"/>
+              <w:end w:w="120" w:type="dxa"/>
+            </w:tcMar>
+          </w:tcPr>
+          <w:p>
+            <w:pPr>
+              <w:widowControl/>
+              <w:spacing w:before="0" w:after="0" w:line="252" w:lineRule="auto"/>
+            </w:pPr>
+            <w:r/>
+            <w:r>
+              <w:rPr>
+                <w:rFonts w:ascii="Calibri" w:hAnsi="Calibri"/>
+                <w:sz w:val="18"/>
+              </w:rPr>
+              <w:t>Poem-specific validated ARPAbet phones with a required note, kept distinct from dictionary candidates</w:t>
             </w:r>
           </w:p>
         </w:tc>
@@ -16896,6 +18453,165 @@
                 <w:rFonts w:ascii="Calibri" w:hAnsi="Calibri"/>
                 <w:sz w:val="18"/>
               </w:rPr>
+              <w:t>Complete pronunciation line</w:t>
+            </w:r>
+          </w:p>
+        </w:tc>
+        <w:tc>
+          <w:tcPr>
+            <w:tcW w:type="dxa" w:w="5760"/>
+            <w:vAlign w:val="center"/>
+            <w:tcMar>
+              <w:top w:w="80" w:type="dxa"/>
+              <w:bottom w:w="80" w:type="dxa"/>
+              <w:start w:w="120" w:type="dxa"/>
+              <w:end w:w="120" w:type="dxa"/>
+            </w:tcMar>
+          </w:tcPr>
+          <w:p>
+            <w:pPr>
+              <w:widowControl/>
+              <w:spacing w:before="0" w:after="0" w:line="252" w:lineRule="auto"/>
+            </w:pPr>
+            <w:r/>
+            <w:r>
+              <w:rPr>
+                <w:rFonts w:ascii="Calibri" w:hAnsi="Calibri"/>
+                <w:sz w:val="18"/>
+              </w:rPr>
+              <w:t>Physical line whose every eligible lexical token has resolved syllable and lexical-stress evidence</w:t>
+            </w:r>
+          </w:p>
+        </w:tc>
+      </w:tr>
+      <w:tr>
+        <w:trPr>
+          <w:cantSplit w:val="true"/>
+        </w:trPr>
+        <w:tc>
+          <w:tcPr>
+            <w:tcW w:type="dxa" w:w="3600"/>
+            <w:vAlign w:val="center"/>
+            <w:tcMar>
+              <w:top w:w="80" w:type="dxa"/>
+              <w:bottom w:w="80" w:type="dxa"/>
+              <w:start w:w="120" w:type="dxa"/>
+              <w:end w:w="120" w:type="dxa"/>
+            </w:tcMar>
+          </w:tcPr>
+          <w:p>
+            <w:pPr>
+              <w:widowControl/>
+              <w:spacing w:before="0" w:after="0" w:line="252" w:lineRule="auto"/>
+            </w:pPr>
+            <w:r/>
+            <w:r>
+              <w:rPr>
+                <w:rFonts w:ascii="Calibri" w:hAnsi="Calibri"/>
+                <w:sz w:val="18"/>
+              </w:rPr>
+              <w:t>Lexical stress digit</w:t>
+            </w:r>
+          </w:p>
+        </w:tc>
+        <w:tc>
+          <w:tcPr>
+            <w:tcW w:type="dxa" w:w="5760"/>
+            <w:vAlign w:val="center"/>
+            <w:tcMar>
+              <w:top w:w="80" w:type="dxa"/>
+              <w:bottom w:w="80" w:type="dxa"/>
+              <w:start w:w="120" w:type="dxa"/>
+              <w:end w:w="120" w:type="dxa"/>
+            </w:tcMar>
+          </w:tcPr>
+          <w:p>
+            <w:pPr>
+              <w:widowControl/>
+              <w:spacing w:before="0" w:after="0" w:line="252" w:lineRule="auto"/>
+            </w:pPr>
+            <w:r/>
+            <w:r>
+              <w:rPr>
+                <w:rFonts w:ascii="Calibri" w:hAnsi="Calibri"/>
+                <w:sz w:val="18"/>
+              </w:rPr>
+              <w:t xml:space="preserve">CMUdict </w:t>
+            </w:r>
+            <w:r>
+              <w:rPr>
+                <w:rFonts w:ascii="Consolas" w:hAnsi="Consolas"/>
+                <w:color w:val="1F4D78"/>
+                <w:sz w:val="17"/>
+              </w:rPr>
+              <w:t>0</w:t>
+            </w:r>
+            <w:r>
+              <w:rPr>
+                <w:rFonts w:ascii="Calibri" w:hAnsi="Calibri"/>
+                <w:sz w:val="18"/>
+              </w:rPr>
+              <w:t xml:space="preserve"> unstressed, </w:t>
+            </w:r>
+            <w:r>
+              <w:rPr>
+                <w:rFonts w:ascii="Consolas" w:hAnsi="Consolas"/>
+                <w:color w:val="1F4D78"/>
+                <w:sz w:val="17"/>
+              </w:rPr>
+              <w:t>1</w:t>
+            </w:r>
+            <w:r>
+              <w:rPr>
+                <w:rFonts w:ascii="Calibri" w:hAnsi="Calibri"/>
+                <w:sz w:val="18"/>
+              </w:rPr>
+              <w:t xml:space="preserve"> primary, or </w:t>
+            </w:r>
+            <w:r>
+              <w:rPr>
+                <w:rFonts w:ascii="Consolas" w:hAnsi="Consolas"/>
+                <w:color w:val="1F4D78"/>
+                <w:sz w:val="17"/>
+              </w:rPr>
+              <w:t>2</w:t>
+            </w:r>
+            <w:r>
+              <w:rPr>
+                <w:rFonts w:ascii="Calibri" w:hAnsi="Calibri"/>
+                <w:sz w:val="18"/>
+              </w:rPr>
+              <w:t xml:space="preserve"> secondary lexical stress; not a metrical beat</w:t>
+            </w:r>
+          </w:p>
+        </w:tc>
+      </w:tr>
+      <w:tr>
+        <w:trPr>
+          <w:cantSplit w:val="true"/>
+        </w:trPr>
+        <w:tc>
+          <w:tcPr>
+            <w:tcW w:type="dxa" w:w="3600"/>
+            <w:vAlign w:val="center"/>
+            <w:tcMar>
+              <w:top w:w="80" w:type="dxa"/>
+              <w:bottom w:w="80" w:type="dxa"/>
+              <w:start w:w="120" w:type="dxa"/>
+              <w:end w:w="120" w:type="dxa"/>
+            </w:tcMar>
+          </w:tcPr>
+          <w:p>
+            <w:pPr>
+              <w:widowControl/>
+              <w:spacing w:before="0" w:after="0" w:line="252" w:lineRule="auto"/>
+            </w:pPr>
+            <w:r/>
+            <w:r>
+              <w:rPr>
+                <w:rFonts w:ascii="Calibri" w:hAnsi="Calibri"/>
+                <w:sz w:val="18"/>
+              </w:rPr>
               <w:t>Valence</w:t>
             </w:r>
           </w:p>
@@ -17884,6 +19600,161 @@
     </w:p>
     <w:p>
       <w:pPr>
+        <w:widowControl/>
+        <w:numPr>
+          <w:ilvl w:val="0"/>
+          <w:numId w:val="10"/>
+        </w:numPr>
+        <w:spacing w:before="0" w:after="80" w:line="300" w:lineRule="auto"/>
+        <w:ind w:left="540" w:hanging="271"/>
+      </w:pPr>
+      <w:r>
+        <w:rPr>
+          <w:rFonts w:ascii="Calibri" w:hAnsi="Calibri"/>
+          <w:sz w:val="22"/>
+        </w:rPr>
+        <w:t>CMUdict primarily represents North American dictionary pronunciation and</w:t>
+      </w:r>
+    </w:p>
+    <w:p>
+      <w:pPr>
+        <w:widowControl/>
+        <w:spacing w:before="0" w:after="120" w:line="300" w:lineRule="auto"/>
+      </w:pPr>
+      <w:r>
+        <w:rPr>
+          <w:rFonts w:ascii="Calibri" w:hAnsi="Calibri"/>
+          <w:sz w:val="22"/>
+        </w:rPr>
+        <w:t xml:space="preserve">  can omit or misrepresent dialectal, historical, contextual, performed, or   poetically elided forms.</w:t>
+      </w:r>
+    </w:p>
+    <w:p>
+      <w:pPr>
+        <w:widowControl/>
+        <w:numPr>
+          <w:ilvl w:val="0"/>
+          <w:numId w:val="10"/>
+        </w:numPr>
+        <w:spacing w:before="0" w:after="80" w:line="300" w:lineRule="auto"/>
+        <w:ind w:left="540" w:hanging="271"/>
+      </w:pPr>
+      <w:r>
+        <w:rPr>
+          <w:rFonts w:ascii="Calibri" w:hAnsi="Calibri"/>
+          <w:sz w:val="22"/>
+        </w:rPr>
+        <w:t>Materially different CMUdict alternatives remain ambiguous; strict handling</w:t>
+      </w:r>
+    </w:p>
+    <w:p>
+      <w:pPr>
+        <w:widowControl/>
+        <w:spacing w:before="0" w:after="120" w:line="300" w:lineRule="auto"/>
+      </w:pPr>
+      <w:r>
+        <w:rPr>
+          <w:rFonts w:ascii="Calibri" w:hAnsi="Calibri"/>
+          <w:sz w:val="22"/>
+        </w:rPr>
+        <w:t xml:space="preserve">  can make a line incomplete until a scholar documents an override.</w:t>
+      </w:r>
+    </w:p>
+    <w:p>
+      <w:pPr>
+        <w:widowControl/>
+        <w:numPr>
+          <w:ilvl w:val="0"/>
+          <w:numId w:val="10"/>
+        </w:numPr>
+        <w:spacing w:before="0" w:after="80" w:line="300" w:lineRule="auto"/>
+        <w:ind w:left="540" w:hanging="271"/>
+      </w:pPr>
+      <w:r>
+        <w:rPr>
+          <w:rFonts w:ascii="Calibri" w:hAnsi="Calibri"/>
+          <w:sz w:val="22"/>
+        </w:rPr>
+        <w:t>Pronunciation overrides apply to an exact observed type within the current</w:t>
+      </w:r>
+    </w:p>
+    <w:p>
+      <w:pPr>
+        <w:widowControl/>
+        <w:spacing w:before="0" w:after="120" w:line="300" w:lineRule="auto"/>
+      </w:pPr>
+      <w:r>
+        <w:rPr>
+          <w:rFonts w:ascii="Calibri" w:hAnsi="Calibri"/>
+          <w:sz w:val="22"/>
+        </w:rPr>
+        <w:t xml:space="preserve">  one-poem analysis, not to one individual occurrence.</w:t>
+      </w:r>
+    </w:p>
+    <w:p>
+      <w:pPr>
+        <w:widowControl/>
+        <w:numPr>
+          <w:ilvl w:val="0"/>
+          <w:numId w:val="10"/>
+        </w:numPr>
+        <w:spacing w:before="0" w:after="80" w:line="300" w:lineRule="auto"/>
+        <w:ind w:left="540" w:hanging="271"/>
+      </w:pPr>
+      <w:r>
+        <w:rPr>
+          <w:rFonts w:ascii="Calibri" w:hAnsi="Calibri"/>
+          <w:sz w:val="22"/>
+        </w:rPr>
+        <w:t>Stage 5 includes no grapheme-to-phoneme prediction, candidate meter, rhyme,</w:t>
+      </w:r>
+    </w:p>
+    <w:p>
+      <w:pPr>
+        <w:widowControl/>
+        <w:spacing w:before="0" w:after="120" w:line="300" w:lineRule="auto"/>
+      </w:pPr>
+      <w:r>
+        <w:rPr>
+          <w:rFonts w:ascii="Calibri" w:hAnsi="Calibri"/>
+          <w:sz w:val="22"/>
+        </w:rPr>
+        <w:t xml:space="preserve">  or definitive performed scansion.</w:t>
+      </w:r>
+    </w:p>
+    <w:p>
+      <w:pPr>
+        <w:widowControl/>
+        <w:numPr>
+          <w:ilvl w:val="0"/>
+          <w:numId w:val="10"/>
+        </w:numPr>
+        <w:spacing w:before="0" w:after="80" w:line="300" w:lineRule="auto"/>
+        <w:ind w:left="540" w:hanging="271"/>
+      </w:pPr>
+      <w:r>
+        <w:rPr>
+          <w:rFonts w:ascii="Calibri" w:hAnsi="Calibri"/>
+          <w:sz w:val="22"/>
+        </w:rPr>
+        <w:t>Pronunciation &amp; Prosody is currently an optional one-poem in-memory module;</w:t>
+      </w:r>
+    </w:p>
+    <w:p>
+      <w:pPr>
+        <w:widowControl/>
+        <w:spacing w:before="0" w:after="120" w:line="300" w:lineRule="auto"/>
+      </w:pPr>
+      <w:r>
+        <w:rPr>
+          <w:rFonts w:ascii="Calibri" w:hAnsi="Calibri"/>
+          <w:sz w:val="22"/>
+        </w:rPr>
+        <w:t xml:space="preserve">  it is not yet persisted in corpus projects.</w:t>
+      </w:r>
+    </w:p>
+    <w:p>
+      <w:pPr>
         <w:pStyle w:val="Heading1"/>
       </w:pPr>
       <w:r>
@@ -17904,7 +19775,7 @@
           <w:rFonts w:ascii="Calibri" w:hAnsi="Calibri"/>
           <w:sz w:val="22"/>
         </w:rPr>
-        <w:t>Every analysis should retain the active lexicon or optional research resource, source checksum, adapter version, software version, preprocessing recipe and configuration ID, phrase policy, stopword policy, scenario, and inclusion decisions. Completed corpus runs remain linked to preserved text versions. A concreteness result additionally retains its orientation thresholds, proper-name and phrase policies, low-coverage threshold, source-row matches, and exact workbook checksum. A frequency result retains its Zipf-band thresholds, proper-name policy, exact-before-lemma rule, optional content-word scope, low-coverage threshold, source-row matches, and exact SUBTLEX-US workbook checksum. An AoA result retains early/later thresholds, proper-name policy, exact-before-lemma rule, optional contextual content-word scope, coverage and source-response cautions, source-row matches, optional relationship methods, and the exact official erratum-supplement checksum.</w:t>
+        <w:t>Every analysis should retain the active lexicon or optional research resource, source checksum, adapter version, software version, preprocessing recipe and configuration ID, phrase policy, stopword policy, scenario, and inclusion decisions. Completed corpus runs remain linked to preserved text versions. A concreteness result additionally retains its orientation thresholds, proper-name and phrase policies, low-coverage threshold, source-row matches, and exact workbook checksum. A frequency result retains its Zipf-band thresholds, proper-name policy, exact-before-lemma rule, optional content-word scope, low-coverage threshold, source-row matches, and exact SUBTLEX-US workbook checksum. An AoA result retains early/later thresholds, proper-name policy, exact-before-lemma rule, optional contextual content-word scope, coverage and source-response cautions, source-row matches, optional relationship methods, and the exact official erratum-supplement checksum. A pronunciation result retains every dictionary candidate, three exact source checksums, package and adapter versions, exact observed-form policy, thresholds, scholar overrides and notes, configuration identity, missingness, and physical-line completeness.</w:t>
       </w:r>
     </w:p>
     <w:p>
@@ -18171,7 +20042,7 @@
         <w:color w:val="66727C"/>
         <w:sz w:val="18"/>
       </w:rPr>
-      <w:t xml:space="preserve">  |  0.10.0.dev0</w:t>
+      <w:t xml:space="preserve">  |  0.11.0.dev0</w:t>
     </w:r>
   </w:p>
 </w:hdr>

</xml_diff>

<commit_message>
Complete Stage 6 candidate meter
</commit_message>
<xml_diff>
--- a/docs/VerseVAD_User_Manual.docx
+++ b/docs/VerseVAD_User_Manual.docx
@@ -47,7 +47,7 @@
           <w:color w:val="66727C"/>
           <w:sz w:val="21"/>
         </w:rPr>
-        <w:t xml:space="preserve"> 0.11.0.dev0</w:t>
+        <w:t xml:space="preserve"> 0.12.0.dev0</w:t>
       </w:r>
       <w:r>
         <w:rPr>
@@ -159,7 +159,7 @@
                 <w:color w:val="193247"/>
                 <w:sz w:val="22"/>
               </w:rPr>
-              <w:t xml:space="preserve"> and optional dictionary-based pronunciation evidence. Concreteness, corpus-relative frequency, retrospective Age of Acquisition, and pronunciation/lexical-stress results remain separate constructs. VerseVAD does not determine the emotion of a poem, speaker, author, or reader, diagnose cognition, classify meter or rhyme in Stage 5, or replace contextual close reading.</w:t>
+              <w:t>, optional dictionary-based pronunciation evidence, and transparent candidate-meter comparisons. Concreteness, corpus-relative frequency, retrospective Age of Acquisition, pronunciation/lexical-stress, and meter-fit results remain separate constructs. VerseVAD does not determine the emotion of a poem, speaker, author, or reader, diagnose cognition, establish definitive meter or performed rhythm, or replace contextual close reading.</w:t>
             </w:r>
           </w:p>
         </w:tc>
@@ -587,6 +587,23 @@
                 <w:color w:val="193247"/>
                 <w:sz w:val="22"/>
               </w:rPr>
+              <w:t xml:space="preserve">, </w:t>
+            </w:r>
+            <w:r>
+              <w:rPr>
+                <w:rFonts w:ascii="Calibri" w:hAnsi="Calibri"/>
+                <w:b/>
+                <w:color w:val="193247"/>
+                <w:sz w:val="22"/>
+              </w:rPr>
+              <w:t>Pronunciation &amp; Prosody</w:t>
+            </w:r>
+            <w:r>
+              <w:rPr>
+                <w:rFonts w:ascii="Calibri" w:hAnsi="Calibri"/>
+                <w:color w:val="193247"/>
+                <w:sz w:val="22"/>
+              </w:rPr>
               <w:t xml:space="preserve">, and </w:t>
             </w:r>
             <w:r>
@@ -596,7 +613,7 @@
                 <w:color w:val="193247"/>
                 <w:sz w:val="22"/>
               </w:rPr>
-              <w:t>Pronunciation &amp; Prosody</w:t>
+              <w:t>Meter &amp; Rhythm</w:t>
             </w:r>
             <w:r>
               <w:rPr>
@@ -1023,7 +1040,53 @@
           <w:rFonts w:ascii="Calibri" w:hAnsi="Calibri"/>
           <w:sz w:val="22"/>
         </w:rPr>
-        <w:t xml:space="preserve">  syllables, complete-line totals, lexical-stress sequences, coverage,   ambiguity evidence, poem-specific scholar overrides, and token/type/line   audits.</w:t>
+        <w:t xml:space="preserve">  syllables, complete-line totals, lexical-stress sequences, coverage,   ambiguity evidence, poem-specific scholar overrides, and token/type/line   audits; and</w:t>
+      </w:r>
+    </w:p>
+    <w:p>
+      <w:pPr>
+        <w:widowControl/>
+        <w:numPr>
+          <w:ilvl w:val="0"/>
+          <w:numId w:val="10"/>
+        </w:numPr>
+        <w:spacing w:before="0" w:after="80" w:line="300" w:lineRule="auto"/>
+        <w:ind w:left="540" w:hanging="271"/>
+      </w:pPr>
+      <w:r>
+        <w:rPr>
+          <w:rFonts w:ascii="Calibri" w:hAnsi="Calibri"/>
+          <w:sz w:val="22"/>
+        </w:rPr>
+        <w:t>optional candidate-meter alignment against five recurring stress patterns</w:t>
+      </w:r>
+    </w:p>
+    <w:p>
+      <w:pPr>
+        <w:widowControl/>
+        <w:spacing w:before="0" w:after="120" w:line="300" w:lineRule="auto"/>
+      </w:pPr>
+      <w:r>
+        <w:rPr>
+          <w:rFonts w:ascii="Calibri" w:hAnsi="Calibri"/>
+          <w:sz w:val="22"/>
+        </w:rPr>
+        <w:t xml:space="preserve">  from monometer through octameter, stanza-aware common meter as iambic   </w:t>
+      </w:r>
+      <w:r>
+        <w:rPr>
+          <w:rFonts w:ascii="Consolas" w:hAnsi="Consolas"/>
+          <w:color w:val="1F4D78"/>
+          <w:sz w:val="19"/>
+        </w:rPr>
+        <w:t>4-3-4-3</w:t>
+      </w:r>
+      <w:r>
+        <w:rPr>
+          <w:rFonts w:ascii="Calibri" w:hAnsi="Calibri"/>
+          <w:sz w:val="22"/>
+        </w:rPr>
+        <w:t>, line/scheme fit, deviations, alternatives, coverage, and a   complete alignment audit.</w:t>
       </w:r>
     </w:p>
     <w:p>
@@ -1702,6 +1765,21 @@
           <w:rFonts w:ascii="Calibri" w:hAnsi="Calibri"/>
           <w:sz w:val="22"/>
         </w:rPr>
+        <w:t xml:space="preserve">, </w:t>
+      </w:r>
+      <w:r>
+        <w:rPr>
+          <w:rFonts w:ascii="Calibri" w:hAnsi="Calibri"/>
+          <w:b/>
+          <w:sz w:val="22"/>
+        </w:rPr>
+        <w:t>Pronunciation &amp; prosody foundation (CMUdict)</w:t>
+      </w:r>
+      <w:r>
+        <w:rPr>
+          <w:rFonts w:ascii="Calibri" w:hAnsi="Calibri"/>
+          <w:sz w:val="22"/>
+        </w:rPr>
         <w:t xml:space="preserve">, and/or </w:t>
       </w:r>
       <w:r>
@@ -1710,7 +1788,7 @@
           <w:b/>
           <w:sz w:val="22"/>
         </w:rPr>
-        <w:t>Pronunciation &amp; prosody foundation (CMUdict)</w:t>
+        <w:t>Meter &amp; rhythmic regularity</w:t>
       </w:r>
       <w:r>
         <w:rPr>
@@ -1945,6 +2023,21 @@
           <w:rFonts w:ascii="Calibri" w:hAnsi="Calibri"/>
           <w:sz w:val="22"/>
         </w:rPr>
+        <w:t xml:space="preserve">, </w:t>
+      </w:r>
+      <w:r>
+        <w:rPr>
+          <w:rFonts w:ascii="Calibri" w:hAnsi="Calibri"/>
+          <w:b/>
+          <w:sz w:val="22"/>
+        </w:rPr>
+        <w:t>Pronunciation &amp; Prosody</w:t>
+      </w:r>
+      <w:r>
+        <w:rPr>
+          <w:rFonts w:ascii="Calibri" w:hAnsi="Calibri"/>
+          <w:sz w:val="22"/>
+        </w:rPr>
         <w:t xml:space="preserve">, and </w:t>
       </w:r>
       <w:r>
@@ -1953,7 +2046,7 @@
           <w:b/>
           <w:sz w:val="22"/>
         </w:rPr>
-        <w:t>Pronunciation &amp; Prosody</w:t>
+        <w:t>Meter &amp; Rhythm</w:t>
       </w:r>
       <w:r>
         <w:rPr>
@@ -6893,7 +6986,7 @@
           <w:rFonts w:ascii="Calibri" w:hAnsi="Calibri"/>
           <w:sz w:val="22"/>
         </w:rPr>
-        <w:t>Eight emotion associations</w:t>
+        <w:t>Candidate meter and rhythmic regularity</w:t>
       </w:r>
     </w:p>
     <w:p>
@@ -6906,8 +6999,417 @@
           <w:rFonts w:ascii="Calibri" w:hAnsi="Calibri"/>
           <w:sz w:val="22"/>
         </w:rPr>
-        <w:t>NRC Emotion values are binary, multi-label associations. VerseVAD reports the eight emotions—anger, anticipation, disgust, fear, joy, sadness, surprise, and trust—in their own section. An entry can be associated with several categories, so percentages do not need to total 100 percent. Read the labeled denominator.</w:t>
-      </w:r>
+        <w:t xml:space="preserve">When enabled, </w:t>
+      </w:r>
+      <w:r>
+        <w:rPr>
+          <w:rFonts w:ascii="Calibri" w:hAnsi="Calibri"/>
+          <w:b/>
+          <w:sz w:val="22"/>
+        </w:rPr>
+        <w:t>Meter &amp; Rhythm</w:t>
+      </w:r>
+      <w:r>
+        <w:rPr>
+          <w:rFonts w:ascii="Calibri" w:hAnsi="Calibri"/>
+          <w:sz w:val="22"/>
+        </w:rPr>
+        <w:t xml:space="preserve"> automatically uses the retained Stage 5 pronunciation evidence. No affective lexicon is required. It compares five recurring base patterns:</w:t>
+      </w:r>
+    </w:p>
+    <w:tbl>
+      <w:tblPr>
+        <w:tblStyle w:val="TableGrid"/>
+        <w:tblW w:type="dxa" w:w="9360"/>
+        <w:jc w:val="left"/>
+        <w:tblLayout w:type="fixed"/>
+        <w:tblLook w:firstColumn="1" w:firstRow="1" w:lastColumn="0" w:lastRow="0" w:noHBand="0" w:noVBand="1" w:val="04A0"/>
+        <w:tblInd w:w="120" w:type="dxa"/>
+        <w:tblBorders>
+          <w:top w:val="single" w:sz="4" w:space="0" w:color="C9D1D8"/>
+          <w:left w:val="single" w:sz="4" w:space="0" w:color="C9D1D8"/>
+          <w:bottom w:val="single" w:sz="4" w:space="0" w:color="C9D1D8"/>
+          <w:right w:val="single" w:sz="4" w:space="0" w:color="C9D1D8"/>
+          <w:insideH w:val="single" w:sz="4" w:space="0" w:color="C9D1D8"/>
+          <w:insideV w:val="single" w:sz="4" w:space="0" w:color="C9D1D8"/>
+        </w:tblBorders>
+      </w:tblPr>
+      <w:tblGrid>
+        <w:gridCol w:w="2700"/>
+        <w:gridCol w:w="6660"/>
+      </w:tblGrid>
+      <w:tr>
+        <w:trPr>
+          <w:cantSplit w:val="true"/>
+          <w:tblHeader w:val="true"/>
+        </w:trPr>
+        <w:tc>
+          <w:tcPr>
+            <w:tcW w:type="dxa" w:w="2700"/>
+            <w:vAlign w:val="center"/>
+            <w:tcMar>
+              <w:top w:w="80" w:type="dxa"/>
+              <w:bottom w:w="80" w:type="dxa"/>
+              <w:start w:w="120" w:type="dxa"/>
+              <w:end w:w="120" w:type="dxa"/>
+            </w:tcMar>
+            <w:shd w:fill="E8EEF5"/>
+          </w:tcPr>
+          <w:p>
+            <w:pPr>
+              <w:keepNext/>
+              <w:widowControl/>
+              <w:spacing w:before="0" w:after="0" w:line="252" w:lineRule="auto"/>
+            </w:pPr>
+            <w:r>
+              <w:rPr>
+                <w:b/>
+                <w:color w:val="193247"/>
+              </w:rPr>
+            </w:r>
+            <w:r>
+              <w:rPr>
+                <w:rFonts w:ascii="Calibri" w:hAnsi="Calibri"/>
+                <w:b/>
+                <w:color w:val="193247"/>
+                <w:sz w:val="18"/>
+              </w:rPr>
+              <w:t>Pattern</w:t>
+            </w:r>
+          </w:p>
+        </w:tc>
+        <w:tc>
+          <w:tcPr>
+            <w:tcW w:type="dxa" w:w="6660"/>
+            <w:vAlign w:val="center"/>
+            <w:tcMar>
+              <w:top w:w="80" w:type="dxa"/>
+              <w:bottom w:w="80" w:type="dxa"/>
+              <w:start w:w="120" w:type="dxa"/>
+              <w:end w:w="120" w:type="dxa"/>
+            </w:tcMar>
+            <w:shd w:fill="E8EEF5"/>
+          </w:tcPr>
+          <w:p>
+            <w:pPr>
+              <w:keepNext/>
+              <w:widowControl/>
+              <w:spacing w:before="0" w:after="0" w:line="252" w:lineRule="auto"/>
+            </w:pPr>
+            <w:r>
+              <w:rPr>
+                <w:b/>
+                <w:color w:val="193247"/>
+              </w:rPr>
+            </w:r>
+            <w:r>
+              <w:rPr>
+                <w:rFonts w:ascii="Calibri" w:hAnsi="Calibri"/>
+                <w:b/>
+                <w:color w:val="193247"/>
+                <w:sz w:val="18"/>
+              </w:rPr>
+              <w:t>Stress pattern</w:t>
+            </w:r>
+          </w:p>
+        </w:tc>
+      </w:tr>
+      <w:tr>
+        <w:trPr>
+          <w:cantSplit w:val="true"/>
+        </w:trPr>
+        <w:tc>
+          <w:tcPr>
+            <w:tcW w:type="dxa" w:w="2700"/>
+            <w:vAlign w:val="center"/>
+            <w:tcMar>
+              <w:top w:w="80" w:type="dxa"/>
+              <w:bottom w:w="80" w:type="dxa"/>
+              <w:start w:w="120" w:type="dxa"/>
+              <w:end w:w="120" w:type="dxa"/>
+            </w:tcMar>
+          </w:tcPr>
+          <w:p>
+            <w:pPr>
+              <w:widowControl/>
+              <w:spacing w:before="0" w:after="0" w:line="252" w:lineRule="auto"/>
+            </w:pPr>
+            <w:r/>
+            <w:r>
+              <w:rPr>
+                <w:rFonts w:ascii="Calibri" w:hAnsi="Calibri"/>
+                <w:sz w:val="18"/>
+              </w:rPr>
+              <w:t>Iambic</w:t>
+            </w:r>
+          </w:p>
+        </w:tc>
+        <w:tc>
+          <w:tcPr>
+            <w:tcW w:type="dxa" w:w="6660"/>
+            <w:vAlign w:val="center"/>
+            <w:tcMar>
+              <w:top w:w="80" w:type="dxa"/>
+              <w:bottom w:w="80" w:type="dxa"/>
+              <w:start w:w="120" w:type="dxa"/>
+              <w:end w:w="120" w:type="dxa"/>
+            </w:tcMar>
+          </w:tcPr>
+          <w:p>
+            <w:pPr>
+              <w:widowControl/>
+              <w:spacing w:before="0" w:after="0" w:line="252" w:lineRule="auto"/>
+            </w:pPr>
+            <w:r/>
+            <w:r>
+              <w:rPr>
+                <w:rFonts w:ascii="Consolas" w:hAnsi="Consolas"/>
+                <w:color w:val="1F4D78"/>
+                <w:sz w:val="17"/>
+              </w:rPr>
+              <w:t>01</w:t>
+            </w:r>
+          </w:p>
+        </w:tc>
+      </w:tr>
+      <w:tr>
+        <w:trPr>
+          <w:cantSplit w:val="true"/>
+        </w:trPr>
+        <w:tc>
+          <w:tcPr>
+            <w:tcW w:type="dxa" w:w="2700"/>
+            <w:vAlign w:val="center"/>
+            <w:tcMar>
+              <w:top w:w="80" w:type="dxa"/>
+              <w:bottom w:w="80" w:type="dxa"/>
+              <w:start w:w="120" w:type="dxa"/>
+              <w:end w:w="120" w:type="dxa"/>
+            </w:tcMar>
+          </w:tcPr>
+          <w:p>
+            <w:pPr>
+              <w:widowControl/>
+              <w:spacing w:before="0" w:after="0" w:line="252" w:lineRule="auto"/>
+            </w:pPr>
+            <w:r/>
+            <w:r>
+              <w:rPr>
+                <w:rFonts w:ascii="Calibri" w:hAnsi="Calibri"/>
+                <w:sz w:val="18"/>
+              </w:rPr>
+              <w:t>Trochaic</w:t>
+            </w:r>
+          </w:p>
+        </w:tc>
+        <w:tc>
+          <w:tcPr>
+            <w:tcW w:type="dxa" w:w="6660"/>
+            <w:vAlign w:val="center"/>
+            <w:tcMar>
+              <w:top w:w="80" w:type="dxa"/>
+              <w:bottom w:w="80" w:type="dxa"/>
+              <w:start w:w="120" w:type="dxa"/>
+              <w:end w:w="120" w:type="dxa"/>
+            </w:tcMar>
+          </w:tcPr>
+          <w:p>
+            <w:pPr>
+              <w:widowControl/>
+              <w:spacing w:before="0" w:after="0" w:line="252" w:lineRule="auto"/>
+            </w:pPr>
+            <w:r/>
+            <w:r>
+              <w:rPr>
+                <w:rFonts w:ascii="Consolas" w:hAnsi="Consolas"/>
+                <w:color w:val="1F4D78"/>
+                <w:sz w:val="17"/>
+              </w:rPr>
+              <w:t>10</w:t>
+            </w:r>
+          </w:p>
+        </w:tc>
+      </w:tr>
+      <w:tr>
+        <w:trPr>
+          <w:cantSplit w:val="true"/>
+        </w:trPr>
+        <w:tc>
+          <w:tcPr>
+            <w:tcW w:type="dxa" w:w="2700"/>
+            <w:vAlign w:val="center"/>
+            <w:tcMar>
+              <w:top w:w="80" w:type="dxa"/>
+              <w:bottom w:w="80" w:type="dxa"/>
+              <w:start w:w="120" w:type="dxa"/>
+              <w:end w:w="120" w:type="dxa"/>
+            </w:tcMar>
+          </w:tcPr>
+          <w:p>
+            <w:pPr>
+              <w:widowControl/>
+              <w:spacing w:before="0" w:after="0" w:line="252" w:lineRule="auto"/>
+            </w:pPr>
+            <w:r/>
+            <w:r>
+              <w:rPr>
+                <w:rFonts w:ascii="Calibri" w:hAnsi="Calibri"/>
+                <w:sz w:val="18"/>
+              </w:rPr>
+              <w:t>Anapestic</w:t>
+            </w:r>
+          </w:p>
+        </w:tc>
+        <w:tc>
+          <w:tcPr>
+            <w:tcW w:type="dxa" w:w="6660"/>
+            <w:vAlign w:val="center"/>
+            <w:tcMar>
+              <w:top w:w="80" w:type="dxa"/>
+              <w:bottom w:w="80" w:type="dxa"/>
+              <w:start w:w="120" w:type="dxa"/>
+              <w:end w:w="120" w:type="dxa"/>
+            </w:tcMar>
+          </w:tcPr>
+          <w:p>
+            <w:pPr>
+              <w:widowControl/>
+              <w:spacing w:before="0" w:after="0" w:line="252" w:lineRule="auto"/>
+            </w:pPr>
+            <w:r/>
+            <w:r>
+              <w:rPr>
+                <w:rFonts w:ascii="Consolas" w:hAnsi="Consolas"/>
+                <w:color w:val="1F4D78"/>
+                <w:sz w:val="17"/>
+              </w:rPr>
+              <w:t>001</w:t>
+            </w:r>
+          </w:p>
+        </w:tc>
+      </w:tr>
+      <w:tr>
+        <w:trPr>
+          <w:cantSplit w:val="true"/>
+        </w:trPr>
+        <w:tc>
+          <w:tcPr>
+            <w:tcW w:type="dxa" w:w="2700"/>
+            <w:vAlign w:val="center"/>
+            <w:tcMar>
+              <w:top w:w="80" w:type="dxa"/>
+              <w:bottom w:w="80" w:type="dxa"/>
+              <w:start w:w="120" w:type="dxa"/>
+              <w:end w:w="120" w:type="dxa"/>
+            </w:tcMar>
+          </w:tcPr>
+          <w:p>
+            <w:pPr>
+              <w:widowControl/>
+              <w:spacing w:before="0" w:after="0" w:line="252" w:lineRule="auto"/>
+            </w:pPr>
+            <w:r/>
+            <w:r>
+              <w:rPr>
+                <w:rFonts w:ascii="Calibri" w:hAnsi="Calibri"/>
+                <w:sz w:val="18"/>
+              </w:rPr>
+              <w:t>Dactylic</w:t>
+            </w:r>
+          </w:p>
+        </w:tc>
+        <w:tc>
+          <w:tcPr>
+            <w:tcW w:type="dxa" w:w="6660"/>
+            <w:vAlign w:val="center"/>
+            <w:tcMar>
+              <w:top w:w="80" w:type="dxa"/>
+              <w:bottom w:w="80" w:type="dxa"/>
+              <w:start w:w="120" w:type="dxa"/>
+              <w:end w:w="120" w:type="dxa"/>
+            </w:tcMar>
+          </w:tcPr>
+          <w:p>
+            <w:pPr>
+              <w:widowControl/>
+              <w:spacing w:before="0" w:after="0" w:line="252" w:lineRule="auto"/>
+            </w:pPr>
+            <w:r/>
+            <w:r>
+              <w:rPr>
+                <w:rFonts w:ascii="Consolas" w:hAnsi="Consolas"/>
+                <w:color w:val="1F4D78"/>
+                <w:sz w:val="17"/>
+              </w:rPr>
+              <w:t>100</w:t>
+            </w:r>
+          </w:p>
+        </w:tc>
+      </w:tr>
+      <w:tr>
+        <w:trPr>
+          <w:cantSplit w:val="true"/>
+        </w:trPr>
+        <w:tc>
+          <w:tcPr>
+            <w:tcW w:type="dxa" w:w="2700"/>
+            <w:vAlign w:val="center"/>
+            <w:tcMar>
+              <w:top w:w="80" w:type="dxa"/>
+              <w:bottom w:w="80" w:type="dxa"/>
+              <w:start w:w="120" w:type="dxa"/>
+              <w:end w:w="120" w:type="dxa"/>
+            </w:tcMar>
+          </w:tcPr>
+          <w:p>
+            <w:pPr>
+              <w:widowControl/>
+              <w:spacing w:before="0" w:after="0" w:line="252" w:lineRule="auto"/>
+            </w:pPr>
+            <w:r/>
+            <w:r>
+              <w:rPr>
+                <w:rFonts w:ascii="Calibri" w:hAnsi="Calibri"/>
+                <w:sz w:val="18"/>
+              </w:rPr>
+              <w:t>Amphibrachic</w:t>
+            </w:r>
+          </w:p>
+        </w:tc>
+        <w:tc>
+          <w:tcPr>
+            <w:tcW w:type="dxa" w:w="6660"/>
+            <w:vAlign w:val="center"/>
+            <w:tcMar>
+              <w:top w:w="80" w:type="dxa"/>
+              <w:bottom w:w="80" w:type="dxa"/>
+              <w:start w:w="120" w:type="dxa"/>
+              <w:end w:w="120" w:type="dxa"/>
+            </w:tcMar>
+          </w:tcPr>
+          <w:p>
+            <w:pPr>
+              <w:widowControl/>
+              <w:spacing w:before="0" w:after="0" w:line="252" w:lineRule="auto"/>
+            </w:pPr>
+            <w:r/>
+            <w:r>
+              <w:rPr>
+                <w:rFonts w:ascii="Consolas" w:hAnsi="Consolas"/>
+                <w:color w:val="1F4D78"/>
+                <w:sz w:val="17"/>
+              </w:rPr>
+              <w:t>010</w:t>
+            </w:r>
+          </w:p>
+        </w:tc>
+      </w:tr>
+    </w:tbl>
+    <w:p>
+      <w:pPr>
+        <w:widowControl/>
+        <w:spacing w:before="0" w:after="60" w:line="240" w:lineRule="auto"/>
+      </w:pPr>
     </w:p>
     <w:p>
       <w:pPr>
@@ -6919,19 +7421,37 @@
           <w:rFonts w:ascii="Calibri" w:hAnsi="Calibri"/>
           <w:sz w:val="22"/>
         </w:rPr>
-        <w:t>“Fear-associated vocabulary” is appropriate wording. “The poem is afraid” is not.</w:t>
-      </w:r>
-    </w:p>
-    <w:p>
-      <w:pPr>
-        <w:pStyle w:val="Heading2"/>
-      </w:pPr>
-      <w:r>
-        <w:rPr>
-          <w:rFonts w:ascii="Calibri" w:hAnsi="Calibri"/>
-          <w:sz w:val="22"/>
-        </w:rPr>
-        <w:t>Positive and negative sentiment associations</w:t>
+        <w:t xml:space="preserve">Each pattern is checked at monometer, dimeter, trimeter, tetrameter, pentameter, hexameter, heptameter, and octameter: 40 fixed line templates. Spondees </w:t>
+      </w:r>
+      <w:r>
+        <w:rPr>
+          <w:rFonts w:ascii="Consolas" w:hAnsi="Consolas"/>
+          <w:color w:val="1F4D78"/>
+          <w:sz w:val="19"/>
+        </w:rPr>
+        <w:t>11</w:t>
+      </w:r>
+      <w:r>
+        <w:rPr>
+          <w:rFonts w:ascii="Calibri" w:hAnsi="Calibri"/>
+          <w:sz w:val="22"/>
+        </w:rPr>
+        <w:t xml:space="preserve"> and pyrrhics </w:t>
+      </w:r>
+      <w:r>
+        <w:rPr>
+          <w:rFonts w:ascii="Consolas" w:hAnsi="Consolas"/>
+          <w:color w:val="1F4D78"/>
+          <w:sz w:val="19"/>
+        </w:rPr>
+        <w:t>00</w:t>
+      </w:r>
+      <w:r>
+        <w:rPr>
+          <w:rFonts w:ascii="Calibri" w:hAnsi="Calibri"/>
+          <w:sz w:val="22"/>
+        </w:rPr>
+        <w:t xml:space="preserve"> are reported as local substitutions rather than ordinary whole-line base candidates.</w:t>
       </w:r>
     </w:p>
     <w:p>
@@ -6944,19 +7464,35 @@
           <w:rFonts w:ascii="Calibri" w:hAnsi="Calibri"/>
           <w:sz w:val="22"/>
         </w:rPr>
-        <w:t>Positive and negative are broad sentiment labels in NRC Emotion. VerseVAD analyzes them with the same documented occurrence-counting logic but reports them separately from the eight emotions. They are not endpoints of the VAD valence scale, and their rates need not sum to 100 percent.</w:t>
-      </w:r>
-    </w:p>
-    <w:p>
-      <w:pPr>
-        <w:pStyle w:val="Heading2"/>
-      </w:pPr>
-      <w:r>
-        <w:rPr>
-          <w:rFonts w:ascii="Calibri" w:hAnsi="Calibri"/>
-          <w:sz w:val="22"/>
-        </w:rPr>
-        <w:t>Emotion intensity</w:t>
+        <w:t xml:space="preserve">Stage 6 also checks </w:t>
+      </w:r>
+      <w:r>
+        <w:rPr>
+          <w:rFonts w:ascii="Calibri" w:hAnsi="Calibri"/>
+          <w:b/>
+          <w:sz w:val="22"/>
+        </w:rPr>
+        <w:t>Common meter (alternating iambic tetrameter/trimeter)</w:t>
+      </w:r>
+      <w:r>
+        <w:rPr>
+          <w:rFonts w:ascii="Calibri" w:hAnsi="Calibri"/>
+          <w:sz w:val="22"/>
+        </w:rPr>
+        <w:t xml:space="preserve"> as a stanza-aware cycle:</w:t>
+      </w:r>
+    </w:p>
+    <w:p>
+      <w:pPr>
+        <w:pStyle w:val="Formula"/>
+      </w:pPr>
+      <w:r>
+        <w:rPr>
+          <w:rFonts w:ascii="Consolas" w:hAnsi="Consolas"/>
+          <w:color w:val="1F4D78"/>
+          <w:sz w:val="19"/>
+        </w:rPr>
+        <w:t>4-3-4-3 = tetrameter, trimeter, tetrameter, trimeter</w:t>
       </w:r>
     </w:p>
     <w:p>
@@ -6969,7 +7505,33 @@
           <w:rFonts w:ascii="Calibri" w:hAnsi="Calibri"/>
           <w:sz w:val="22"/>
         </w:rPr>
-        <w:t>NRC Emotion Intensity supplies numeric values only for particular word-emotion pairs. VerseVAD keeps:</w:t>
+        <w:t>The cycle restarts at each preserved stanza. At least one complete four-line stanza is required before common meter can become the poem-level nearest scheme. Partial stanzas remain visible as incomplete scheme evidence.</w:t>
+      </w:r>
+    </w:p>
+    <w:p>
+      <w:pPr>
+        <w:widowControl/>
+        <w:spacing w:before="0" w:after="120" w:line="300" w:lineRule="auto"/>
+      </w:pPr>
+      <w:r>
+        <w:rPr>
+          <w:rFonts w:ascii="Calibri" w:hAnsi="Calibri"/>
+          <w:sz w:val="22"/>
+        </w:rPr>
+        <w:t>The line alignment can report substitutions, initial inversion, feminine ending, catalexis, and extra or omitted syllables. Multiple retained CMUdict stress alternatives are explored up to the configured line limit, but the metrically preferred path is not promoted to a dictionary or performance fact. A line with missing pronunciation evidence remains unscored.</w:t>
+      </w:r>
+    </w:p>
+    <w:p>
+      <w:pPr>
+        <w:widowControl/>
+        <w:spacing w:before="0" w:after="120" w:line="300" w:lineRule="auto"/>
+      </w:pPr>
+      <w:r>
+        <w:rPr>
+          <w:rFonts w:ascii="Calibri" w:hAnsi="Calibri"/>
+          <w:sz w:val="22"/>
+        </w:rPr>
+        <w:t>Read:</w:t>
       </w:r>
     </w:p>
     <w:p>
@@ -6987,7 +7549,7 @@
           <w:rFonts w:ascii="Calibri" w:hAnsi="Calibri"/>
           <w:sz w:val="22"/>
         </w:rPr>
-        <w:t>prevalence of matched pairs;</w:t>
+        <w:t>nearest candidate and whether it is a fixed template or alternating scheme;</w:t>
       </w:r>
     </w:p>
     <w:p>
@@ -7005,7 +7567,20 @@
           <w:rFonts w:ascii="Calibri" w:hAnsi="Calibri"/>
           <w:sz w:val="22"/>
         </w:rPr>
-        <w:t>token-weighted mean intensity among supplied pairs;</w:t>
+        <w:t>mean fit, matching-line proportion, line coverage, nearest alternative, and</w:t>
+      </w:r>
+    </w:p>
+    <w:p>
+      <w:pPr>
+        <w:widowControl/>
+        <w:spacing w:before="0" w:after="120" w:line="300" w:lineRule="auto"/>
+      </w:pPr>
+      <w:r>
+        <w:rPr>
+          <w:rFonts w:ascii="Calibri" w:hAnsi="Calibri"/>
+          <w:sz w:val="22"/>
+        </w:rPr>
+        <w:t xml:space="preserve">  candidate margin;</w:t>
       </w:r>
     </w:p>
     <w:p>
@@ -7023,168 +7598,7 @@
           <w:rFonts w:ascii="Calibri" w:hAnsi="Calibri"/>
           <w:sz w:val="22"/>
         </w:rPr>
-        <w:t>type-weighted mean intensity among supplied pairs.</w:t>
-      </w:r>
-    </w:p>
-    <w:p>
-      <w:pPr>
-        <w:widowControl/>
-        <w:spacing w:before="0" w:after="120" w:line="300" w:lineRule="auto"/>
-      </w:pPr>
-      <w:r>
-        <w:rPr>
-          <w:rFonts w:ascii="Calibri" w:hAnsi="Calibri"/>
-          <w:sz w:val="22"/>
-        </w:rPr>
-        <w:t>An absent word-emotion pair is missing, not an intensity of zero.</w:t>
-      </w:r>
-    </w:p>
-    <w:p>
-      <w:pPr>
-        <w:pStyle w:val="Heading1"/>
-      </w:pPr>
-      <w:r>
-        <w:rPr>
-          <w:rFonts w:ascii="Calibri" w:hAnsi="Calibri"/>
-          <w:sz w:val="22"/>
-        </w:rPr>
-        <w:t>8. One Poem Workspace</w:t>
-      </w:r>
-    </w:p>
-    <w:p>
-      <w:pPr>
-        <w:pStyle w:val="Heading2"/>
-      </w:pPr>
-      <w:r>
-        <w:rPr>
-          <w:rFonts w:ascii="Calibri" w:hAnsi="Calibri"/>
-          <w:sz w:val="22"/>
-        </w:rPr>
-        <w:t>Add a poem</w:t>
-      </w:r>
-    </w:p>
-    <w:p>
-      <w:pPr>
-        <w:widowControl/>
-        <w:spacing w:before="0" w:after="120" w:line="300" w:lineRule="auto"/>
-      </w:pPr>
-      <w:r>
-        <w:rPr>
-          <w:rFonts w:ascii="Calibri" w:hAnsi="Calibri"/>
-          <w:sz w:val="22"/>
-        </w:rPr>
-        <w:t xml:space="preserve">Paste text or upload one UTF-8 </w:t>
-      </w:r>
-      <w:r>
-        <w:rPr>
-          <w:rFonts w:ascii="Consolas" w:hAnsi="Consolas"/>
-          <w:color w:val="1F4D78"/>
-          <w:sz w:val="19"/>
-        </w:rPr>
-        <w:t>.txt</w:t>
-      </w:r>
-      <w:r>
-        <w:rPr>
-          <w:rFonts w:ascii="Calibri" w:hAnsi="Calibri"/>
-          <w:sz w:val="22"/>
-        </w:rPr>
-        <w:t xml:space="preserve"> file up to 5 MB. Enter a title or working label. The optional workspace name labels the temporary session but does not create a persistent corpus project.</w:t>
-      </w:r>
-    </w:p>
-    <w:p>
-      <w:pPr>
-        <w:pStyle w:val="Heading2"/>
-      </w:pPr>
-      <w:r>
-        <w:rPr>
-          <w:rFonts w:ascii="Calibri" w:hAnsi="Calibri"/>
-          <w:sz w:val="22"/>
-        </w:rPr>
-        <w:t>Choose evidence</w:t>
-      </w:r>
-    </w:p>
-    <w:p>
-      <w:pPr>
-        <w:widowControl/>
-        <w:spacing w:before="0" w:after="120" w:line="300" w:lineRule="auto"/>
-      </w:pPr>
-      <w:r>
-        <w:rPr>
-          <w:rFonts w:ascii="Calibri" w:hAnsi="Calibri"/>
-          <w:sz w:val="22"/>
-        </w:rPr>
-        <w:t>Select one or more affective lexicons and/or enable the optional normative lexical concreteness, SUBTLEX-US frequency, Kuperman Age of Acquisition, and CMUdict pronunciation/prosody-foundation modules. VAD, categorical association, intensity, concreteness, corpus-relative frequency, retrospective lexical AoA, and dictionary pronunciation/lexical stress answer different questions and remain separate. Any optional module can run by itself when its exact local source is available.</w:t>
-      </w:r>
-    </w:p>
-    <w:p>
-      <w:pPr>
-        <w:widowControl/>
-        <w:spacing w:before="0" w:after="120" w:line="300" w:lineRule="auto"/>
-      </w:pPr>
-      <w:r>
-        <w:rPr>
-          <w:rFonts w:ascii="Calibri" w:hAnsi="Calibri"/>
-          <w:sz w:val="22"/>
-        </w:rPr>
-        <w:t xml:space="preserve">Concreteness, Frequency, AoA, and Pronunciation &amp; Prosody are currently temporary </w:t>
-      </w:r>
-      <w:r>
-        <w:rPr>
-          <w:rFonts w:ascii="Calibri" w:hAnsi="Calibri"/>
-          <w:b/>
-          <w:sz w:val="22"/>
-        </w:rPr>
-        <w:t>One Poem</w:t>
-      </w:r>
-      <w:r>
-        <w:rPr>
-          <w:rFonts w:ascii="Calibri" w:hAnsi="Calibri"/>
-          <w:sz w:val="22"/>
-        </w:rPr>
-        <w:t xml:space="preserve"> modules. They are not yet batched, persisted, aggregated, or exported by </w:t>
-      </w:r>
-      <w:r>
-        <w:rPr>
-          <w:rFonts w:ascii="Calibri" w:hAnsi="Calibri"/>
-          <w:b/>
-          <w:sz w:val="22"/>
-        </w:rPr>
-        <w:t>Projects &amp; Corpus</w:t>
-      </w:r>
-      <w:r>
-        <w:rPr>
-          <w:rFonts w:ascii="Calibri" w:hAnsi="Calibri"/>
-          <w:sz w:val="22"/>
-        </w:rPr>
-        <w:t>.</w:t>
-      </w:r>
-    </w:p>
-    <w:p>
-      <w:pPr>
-        <w:widowControl/>
-        <w:spacing w:before="0" w:after="120" w:line="300" w:lineRule="auto"/>
-      </w:pPr>
-      <w:r>
-        <w:rPr>
-          <w:rFonts w:ascii="Calibri" w:hAnsi="Calibri"/>
-          <w:sz w:val="22"/>
-        </w:rPr>
-        <w:t xml:space="preserve">Under </w:t>
-      </w:r>
-      <w:r>
-        <w:rPr>
-          <w:rFonts w:ascii="Calibri" w:hAnsi="Calibri"/>
-          <w:b/>
-          <w:sz w:val="22"/>
-        </w:rPr>
-        <w:t>Advanced methodology settings</w:t>
-      </w:r>
-      <w:r>
-        <w:rPr>
-          <w:rFonts w:ascii="Calibri" w:hAnsi="Calibri"/>
-          <w:sz w:val="22"/>
-        </w:rPr>
-        <w:t>, choose:</w:t>
+        <w:t>rule-based confidence and its explanation;</w:t>
       </w:r>
     </w:p>
     <w:p>
@@ -7202,7 +7616,7 @@
           <w:rFonts w:ascii="Calibri" w:hAnsi="Calibri"/>
           <w:sz w:val="22"/>
         </w:rPr>
-        <w:t>phrase policy;</w:t>
+        <w:t>common-meter fit and complete-stanza coverage;</w:t>
       </w:r>
     </w:p>
     <w:p>
@@ -7220,7 +7634,20 @@
           <w:rFonts w:ascii="Calibri" w:hAnsi="Calibri"/>
           <w:sz w:val="22"/>
         </w:rPr>
-        <w:t>minimum matched observations for sparse-result warnings;</w:t>
+        <w:t>physical-line stress paths, alignments, deviations, and expected</w:t>
+      </w:r>
+    </w:p>
+    <w:p>
+      <w:pPr>
+        <w:widowControl/>
+        <w:spacing w:before="0" w:after="120" w:line="300" w:lineRule="auto"/>
+      </w:pPr>
+      <w:r>
+        <w:rPr>
+          <w:rFonts w:ascii="Calibri" w:hAnsi="Calibri"/>
+          <w:sz w:val="22"/>
+        </w:rPr>
+        <w:t xml:space="preserve">  common-meter foot counts; and</w:t>
       </w:r>
     </w:p>
     <w:p>
@@ -7238,7 +7665,108 @@
           <w:rFonts w:ascii="Calibri" w:hAnsi="Calibri"/>
           <w:sz w:val="22"/>
         </w:rPr>
-        <w:t>whether to display all-matched results;</w:t>
+        <w:t>all 40 fixed candidates, warnings, configuration, and provenance.</w:t>
+      </w:r>
+    </w:p>
+    <w:p>
+      <w:pPr>
+        <w:widowControl/>
+        <w:spacing w:before="0" w:after="120" w:line="300" w:lineRule="auto"/>
+      </w:pPr>
+      <w:r>
+        <w:rPr>
+          <w:rFonts w:ascii="Calibri" w:hAnsi="Calibri"/>
+          <w:sz w:val="22"/>
+        </w:rPr>
+        <w:t>Fit is a configured alignment similarity from 0 to 1, not a probability. Confidence is a rule-based category, not a calibrated probability. Safe wording is: “The nearest configured candidate was common meter under the selected alignment configuration.” Do not write: “VerseVAD proved the poem is in common meter,” “this is the correct scansion,” or “the poet performed the line this way.”</w:t>
+      </w:r>
+    </w:p>
+    <w:p>
+      <w:pPr>
+        <w:pStyle w:val="Heading2"/>
+      </w:pPr>
+      <w:r>
+        <w:rPr>
+          <w:rFonts w:ascii="Calibri" w:hAnsi="Calibri"/>
+          <w:sz w:val="22"/>
+        </w:rPr>
+        <w:t>Eight emotion associations</w:t>
+      </w:r>
+    </w:p>
+    <w:p>
+      <w:pPr>
+        <w:widowControl/>
+        <w:spacing w:before="0" w:after="120" w:line="300" w:lineRule="auto"/>
+      </w:pPr>
+      <w:r>
+        <w:rPr>
+          <w:rFonts w:ascii="Calibri" w:hAnsi="Calibri"/>
+          <w:sz w:val="22"/>
+        </w:rPr>
+        <w:t>NRC Emotion values are binary, multi-label associations. VerseVAD reports the eight emotions—anger, anticipation, disgust, fear, joy, sadness, surprise, and trust—in their own section. An entry can be associated with several categories, so percentages do not need to total 100 percent. Read the labeled denominator.</w:t>
+      </w:r>
+    </w:p>
+    <w:p>
+      <w:pPr>
+        <w:widowControl/>
+        <w:spacing w:before="0" w:after="120" w:line="300" w:lineRule="auto"/>
+      </w:pPr>
+      <w:r>
+        <w:rPr>
+          <w:rFonts w:ascii="Calibri" w:hAnsi="Calibri"/>
+          <w:sz w:val="22"/>
+        </w:rPr>
+        <w:t>“Fear-associated vocabulary” is appropriate wording. “The poem is afraid” is not.</w:t>
+      </w:r>
+    </w:p>
+    <w:p>
+      <w:pPr>
+        <w:pStyle w:val="Heading2"/>
+      </w:pPr>
+      <w:r>
+        <w:rPr>
+          <w:rFonts w:ascii="Calibri" w:hAnsi="Calibri"/>
+          <w:sz w:val="22"/>
+        </w:rPr>
+        <w:t>Positive and negative sentiment associations</w:t>
+      </w:r>
+    </w:p>
+    <w:p>
+      <w:pPr>
+        <w:widowControl/>
+        <w:spacing w:before="0" w:after="120" w:line="300" w:lineRule="auto"/>
+      </w:pPr>
+      <w:r>
+        <w:rPr>
+          <w:rFonts w:ascii="Calibri" w:hAnsi="Calibri"/>
+          <w:sz w:val="22"/>
+        </w:rPr>
+        <w:t>Positive and negative are broad sentiment labels in NRC Emotion. VerseVAD analyzes them with the same documented occurrence-counting logic but reports them separately from the eight emotions. They are not endpoints of the VAD valence scale, and their rates need not sum to 100 percent.</w:t>
+      </w:r>
+    </w:p>
+    <w:p>
+      <w:pPr>
+        <w:pStyle w:val="Heading2"/>
+      </w:pPr>
+      <w:r>
+        <w:rPr>
+          <w:rFonts w:ascii="Calibri" w:hAnsi="Calibri"/>
+          <w:sz w:val="22"/>
+        </w:rPr>
+        <w:t>Emotion intensity</w:t>
+      </w:r>
+    </w:p>
+    <w:p>
+      <w:pPr>
+        <w:widowControl/>
+        <w:spacing w:before="0" w:after="120" w:line="300" w:lineRule="auto"/>
+      </w:pPr>
+      <w:r>
+        <w:rPr>
+          <w:rFonts w:ascii="Calibri" w:hAnsi="Calibri"/>
+          <w:sz w:val="22"/>
+        </w:rPr>
+        <w:t>NRC Emotion Intensity supplies numeric values only for particular word-emotion pairs. VerseVAD keeps:</w:t>
       </w:r>
     </w:p>
     <w:p>
@@ -7256,7 +7784,7 @@
           <w:rFonts w:ascii="Calibri" w:hAnsi="Calibri"/>
           <w:sz w:val="22"/>
         </w:rPr>
-        <w:t>whether to display stopword-excluded results;</w:t>
+        <w:t>prevalence of matched pairs;</w:t>
       </w:r>
     </w:p>
     <w:p>
@@ -7274,7 +7802,7 @@
           <w:rFonts w:ascii="Calibri" w:hAnsi="Calibri"/>
           <w:sz w:val="22"/>
         </w:rPr>
-        <w:t>concreteness lower and upper orientation thresholds;</w:t>
+        <w:t>token-weighted mean intensity among supplied pairs;</w:t>
       </w:r>
     </w:p>
     <w:p>
@@ -7292,7 +7820,168 @@
           <w:rFonts w:ascii="Calibri" w:hAnsi="Calibri"/>
           <w:sz w:val="22"/>
         </w:rPr>
-        <w:t>whether concreteness excludes model-tagged proper nouns;</w:t>
+        <w:t>type-weighted mean intensity among supplied pairs.</w:t>
+      </w:r>
+    </w:p>
+    <w:p>
+      <w:pPr>
+        <w:widowControl/>
+        <w:spacing w:before="0" w:after="120" w:line="300" w:lineRule="auto"/>
+      </w:pPr>
+      <w:r>
+        <w:rPr>
+          <w:rFonts w:ascii="Calibri" w:hAnsi="Calibri"/>
+          <w:sz w:val="22"/>
+        </w:rPr>
+        <w:t>An absent word-emotion pair is missing, not an intensity of zero.</w:t>
+      </w:r>
+    </w:p>
+    <w:p>
+      <w:pPr>
+        <w:pStyle w:val="Heading1"/>
+      </w:pPr>
+      <w:r>
+        <w:rPr>
+          <w:rFonts w:ascii="Calibri" w:hAnsi="Calibri"/>
+          <w:sz w:val="22"/>
+        </w:rPr>
+        <w:t>8. One Poem Workspace</w:t>
+      </w:r>
+    </w:p>
+    <w:p>
+      <w:pPr>
+        <w:pStyle w:val="Heading2"/>
+      </w:pPr>
+      <w:r>
+        <w:rPr>
+          <w:rFonts w:ascii="Calibri" w:hAnsi="Calibri"/>
+          <w:sz w:val="22"/>
+        </w:rPr>
+        <w:t>Add a poem</w:t>
+      </w:r>
+    </w:p>
+    <w:p>
+      <w:pPr>
+        <w:widowControl/>
+        <w:spacing w:before="0" w:after="120" w:line="300" w:lineRule="auto"/>
+      </w:pPr>
+      <w:r>
+        <w:rPr>
+          <w:rFonts w:ascii="Calibri" w:hAnsi="Calibri"/>
+          <w:sz w:val="22"/>
+        </w:rPr>
+        <w:t xml:space="preserve">Paste text or upload one UTF-8 </w:t>
+      </w:r>
+      <w:r>
+        <w:rPr>
+          <w:rFonts w:ascii="Consolas" w:hAnsi="Consolas"/>
+          <w:color w:val="1F4D78"/>
+          <w:sz w:val="19"/>
+        </w:rPr>
+        <w:t>.txt</w:t>
+      </w:r>
+      <w:r>
+        <w:rPr>
+          <w:rFonts w:ascii="Calibri" w:hAnsi="Calibri"/>
+          <w:sz w:val="22"/>
+        </w:rPr>
+        <w:t xml:space="preserve"> file up to 5 MB. Enter a title or working label. The optional workspace name labels the temporary session but does not create a persistent corpus project.</w:t>
+      </w:r>
+    </w:p>
+    <w:p>
+      <w:pPr>
+        <w:pStyle w:val="Heading2"/>
+      </w:pPr>
+      <w:r>
+        <w:rPr>
+          <w:rFonts w:ascii="Calibri" w:hAnsi="Calibri"/>
+          <w:sz w:val="22"/>
+        </w:rPr>
+        <w:t>Choose evidence</w:t>
+      </w:r>
+    </w:p>
+    <w:p>
+      <w:pPr>
+        <w:widowControl/>
+        <w:spacing w:before="0" w:after="120" w:line="300" w:lineRule="auto"/>
+      </w:pPr>
+      <w:r>
+        <w:rPr>
+          <w:rFonts w:ascii="Calibri" w:hAnsi="Calibri"/>
+          <w:sz w:val="22"/>
+        </w:rPr>
+        <w:t>Select one or more affective lexicons and/or enable the optional normative lexical concreteness, SUBTLEX-US frequency, Kuperman Age of Acquisition, CMUdict pronunciation/prosody-foundation, and candidate-meter modules. VAD, categorical association, intensity, concreteness, corpus-relative frequency, retrospective lexical AoA, dictionary pronunciation/lexical stress, and configured meter fit answer different questions and remain separate. Any optional module can run by itself when its exact local source is available; selecting meter automatically runs its pronunciation dependency.</w:t>
+      </w:r>
+    </w:p>
+    <w:p>
+      <w:pPr>
+        <w:widowControl/>
+        <w:spacing w:before="0" w:after="120" w:line="300" w:lineRule="auto"/>
+      </w:pPr>
+      <w:r>
+        <w:rPr>
+          <w:rFonts w:ascii="Calibri" w:hAnsi="Calibri"/>
+          <w:sz w:val="22"/>
+        </w:rPr>
+        <w:t xml:space="preserve">Concreteness, Frequency, AoA, Pronunciation &amp; Prosody, and Meter &amp; Rhythm are currently temporary </w:t>
+      </w:r>
+      <w:r>
+        <w:rPr>
+          <w:rFonts w:ascii="Calibri" w:hAnsi="Calibri"/>
+          <w:b/>
+          <w:sz w:val="22"/>
+        </w:rPr>
+        <w:t>One Poem</w:t>
+      </w:r>
+      <w:r>
+        <w:rPr>
+          <w:rFonts w:ascii="Calibri" w:hAnsi="Calibri"/>
+          <w:sz w:val="22"/>
+        </w:rPr>
+        <w:t xml:space="preserve"> modules. They are not yet batched, persisted, aggregated, or exported by </w:t>
+      </w:r>
+      <w:r>
+        <w:rPr>
+          <w:rFonts w:ascii="Calibri" w:hAnsi="Calibri"/>
+          <w:b/>
+          <w:sz w:val="22"/>
+        </w:rPr>
+        <w:t>Projects &amp; Corpus</w:t>
+      </w:r>
+      <w:r>
+        <w:rPr>
+          <w:rFonts w:ascii="Calibri" w:hAnsi="Calibri"/>
+          <w:sz w:val="22"/>
+        </w:rPr>
+        <w:t>.</w:t>
+      </w:r>
+    </w:p>
+    <w:p>
+      <w:pPr>
+        <w:widowControl/>
+        <w:spacing w:before="0" w:after="120" w:line="300" w:lineRule="auto"/>
+      </w:pPr>
+      <w:r>
+        <w:rPr>
+          <w:rFonts w:ascii="Calibri" w:hAnsi="Calibri"/>
+          <w:sz w:val="22"/>
+        </w:rPr>
+        <w:t xml:space="preserve">Under </w:t>
+      </w:r>
+      <w:r>
+        <w:rPr>
+          <w:rFonts w:ascii="Calibri" w:hAnsi="Calibri"/>
+          <w:b/>
+          <w:sz w:val="22"/>
+        </w:rPr>
+        <w:t>Advanced methodology settings</w:t>
+      </w:r>
+      <w:r>
+        <w:rPr>
+          <w:rFonts w:ascii="Calibri" w:hAnsi="Calibri"/>
+          <w:sz w:val="22"/>
+        </w:rPr>
+        <w:t>, choose:</w:t>
       </w:r>
     </w:p>
     <w:p>
@@ -7310,7 +7999,7 @@
           <w:rFonts w:ascii="Calibri" w:hAnsi="Calibri"/>
           <w:sz w:val="22"/>
         </w:rPr>
-        <w:t>whether source-supplied concreteness phrases are activated; and</w:t>
+        <w:t>phrase policy;</w:t>
       </w:r>
     </w:p>
     <w:p>
@@ -7328,7 +8017,7 @@
           <w:rFonts w:ascii="Calibri" w:hAnsi="Calibri"/>
           <w:sz w:val="22"/>
         </w:rPr>
-        <w:t>the concreteness low-coverage caution threshold;</w:t>
+        <w:t>minimum matched observations for sparse-result warnings;</w:t>
       </w:r>
     </w:p>
     <w:p>
@@ -7346,7 +8035,7 @@
           <w:rFonts w:ascii="Calibri" w:hAnsi="Calibri"/>
           <w:sz w:val="22"/>
         </w:rPr>
-        <w:t>the four frequency orientation thresholds;</w:t>
+        <w:t>whether to display all-matched results;</w:t>
       </w:r>
     </w:p>
     <w:p>
@@ -7364,7 +8053,7 @@
           <w:rFonts w:ascii="Calibri" w:hAnsi="Calibri"/>
           <w:sz w:val="22"/>
         </w:rPr>
-        <w:t>whether frequency excludes model-tagged proper nouns;</w:t>
+        <w:t>whether to display stopword-excluded results;</w:t>
       </w:r>
     </w:p>
     <w:p>
@@ -7382,7 +8071,7 @@
           <w:rFonts w:ascii="Calibri" w:hAnsi="Calibri"/>
           <w:sz w:val="22"/>
         </w:rPr>
-        <w:t>whether frequency permits lemma fallback;</w:t>
+        <w:t>concreteness lower and upper orientation thresholds;</w:t>
       </w:r>
     </w:p>
     <w:p>
@@ -7400,7 +8089,7 @@
           <w:rFonts w:ascii="Calibri" w:hAnsi="Calibri"/>
           <w:sz w:val="22"/>
         </w:rPr>
-        <w:t>the frequency low-coverage caution threshold; and</w:t>
+        <w:t>whether concreteness excludes model-tagged proper nouns;</w:t>
       </w:r>
     </w:p>
     <w:p>
@@ -7418,22 +8107,7 @@
           <w:rFonts w:ascii="Calibri" w:hAnsi="Calibri"/>
           <w:sz w:val="22"/>
         </w:rPr>
-        <w:t xml:space="preserve">whether frequency uses the non-default </w:t>
-      </w:r>
-      <w:r>
-        <w:rPr>
-          <w:rFonts w:ascii="Calibri" w:hAnsi="Calibri"/>
-          <w:b/>
-          <w:sz w:val="22"/>
-        </w:rPr>
-        <w:t>Content words only</w:t>
-      </w:r>
-      <w:r>
-        <w:rPr>
-          <w:rFonts w:ascii="Calibri" w:hAnsi="Calibri"/>
-          <w:sz w:val="22"/>
-        </w:rPr>
-        <w:t xml:space="preserve"> scope;</w:t>
+        <w:t>whether source-supplied concreteness phrases are activated; and</w:t>
       </w:r>
     </w:p>
     <w:p>
@@ -7451,7 +8125,7 @@
           <w:rFonts w:ascii="Calibri" w:hAnsi="Calibri"/>
           <w:sz w:val="22"/>
         </w:rPr>
-        <w:t>AoA early and later orientation thresholds;</w:t>
+        <w:t>the concreteness low-coverage caution threshold;</w:t>
       </w:r>
     </w:p>
     <w:p>
@@ -7469,7 +8143,7 @@
           <w:rFonts w:ascii="Calibri" w:hAnsi="Calibri"/>
           <w:sz w:val="22"/>
         </w:rPr>
-        <w:t>whether AoA excludes model-tagged proper nouns;</w:t>
+        <w:t>the four frequency orientation thresholds;</w:t>
       </w:r>
     </w:p>
     <w:p>
@@ -7487,7 +8161,7 @@
           <w:rFonts w:ascii="Calibri" w:hAnsi="Calibri"/>
           <w:sz w:val="22"/>
         </w:rPr>
-        <w:t>whether AoA permits lemma fallback;</w:t>
+        <w:t>whether frequency excludes model-tagged proper nouns;</w:t>
       </w:r>
     </w:p>
     <w:p>
@@ -7505,7 +8179,7 @@
           <w:rFonts w:ascii="Calibri" w:hAnsi="Calibri"/>
           <w:sz w:val="22"/>
         </w:rPr>
-        <w:t>the AoA low-coverage caution threshold; and</w:t>
+        <w:t>whether frequency permits lemma fallback;</w:t>
       </w:r>
     </w:p>
     <w:p>
@@ -7523,22 +8197,7 @@
           <w:rFonts w:ascii="Calibri" w:hAnsi="Calibri"/>
           <w:sz w:val="22"/>
         </w:rPr>
-        <w:t xml:space="preserve">whether AoA uses the non-default contextual </w:t>
-      </w:r>
-      <w:r>
-        <w:rPr>
-          <w:rFonts w:ascii="Calibri" w:hAnsi="Calibri"/>
-          <w:b/>
-          <w:sz w:val="22"/>
-        </w:rPr>
-        <w:t>Content words only</w:t>
-      </w:r>
-      <w:r>
-        <w:rPr>
-          <w:rFonts w:ascii="Calibri" w:hAnsi="Calibri"/>
-          <w:sz w:val="22"/>
-        </w:rPr>
-        <w:t xml:space="preserve"> scope;</w:t>
+        <w:t>the frequency low-coverage caution threshold; and</w:t>
       </w:r>
     </w:p>
     <w:p>
@@ -7556,22 +8215,22 @@
           <w:rFonts w:ascii="Calibri" w:hAnsi="Calibri"/>
           <w:sz w:val="22"/>
         </w:rPr>
-        <w:t xml:space="preserve">poem-specific </w:t>
-      </w:r>
-      <w:r>
-        <w:rPr>
-          <w:rFonts w:ascii="Consolas" w:hAnsi="Consolas"/>
-          <w:color w:val="1F4D78"/>
-          <w:sz w:val="19"/>
-        </w:rPr>
-        <w:t>word = ARPAbet phones | note</w:t>
-      </w:r>
-      <w:r>
-        <w:rPr>
-          <w:rFonts w:ascii="Calibri" w:hAnsi="Calibri"/>
-          <w:sz w:val="22"/>
-        </w:rPr>
-        <w:t xml:space="preserve"> pronunciation overrides;</w:t>
+        <w:t xml:space="preserve">whether frequency uses the non-default </w:t>
+      </w:r>
+      <w:r>
+        <w:rPr>
+          <w:rFonts w:ascii="Calibri" w:hAnsi="Calibri"/>
+          <w:b/>
+          <w:sz w:val="22"/>
+        </w:rPr>
+        <w:t>Content words only</w:t>
+      </w:r>
+      <w:r>
+        <w:rPr>
+          <w:rFonts w:ascii="Calibri" w:hAnsi="Calibri"/>
+          <w:sz w:val="22"/>
+        </w:rPr>
+        <w:t xml:space="preserve"> scope;</w:t>
       </w:r>
     </w:p>
     <w:p>
@@ -7589,7 +8248,7 @@
           <w:rFonts w:ascii="Calibri" w:hAnsi="Calibri"/>
           <w:sz w:val="22"/>
         </w:rPr>
-        <w:t>the pronunciation resolved-token coverage caution threshold;</w:t>
+        <w:t>AoA early and later orientation thresholds;</w:t>
       </w:r>
     </w:p>
     <w:p>
@@ -7607,7 +8266,7 @@
           <w:rFonts w:ascii="Calibri" w:hAnsi="Calibri"/>
           <w:sz w:val="22"/>
         </w:rPr>
-        <w:t>minimum complete pronunciation lines; and</w:t>
+        <w:t>whether AoA excludes model-tagged proper nouns;</w:t>
       </w:r>
     </w:p>
     <w:p>
@@ -7625,138 +8284,7 @@
           <w:rFonts w:ascii="Calibri" w:hAnsi="Calibri"/>
           <w:sz w:val="22"/>
         </w:rPr>
-        <w:t>minimum resolved pronunciation tokens for sparse-result warnings.</w:t>
-      </w:r>
-    </w:p>
-    <w:p>
-      <w:pPr>
-        <w:widowControl/>
-        <w:spacing w:before="0" w:after="120" w:line="300" w:lineRule="auto"/>
-      </w:pPr>
-      <w:r>
-        <w:rPr>
-          <w:rFonts w:ascii="Calibri" w:hAnsi="Calibri"/>
-          <w:sz w:val="22"/>
-        </w:rPr>
-        <w:t xml:space="preserve">Under </w:t>
-      </w:r>
-      <w:r>
-        <w:rPr>
-          <w:rFonts w:ascii="Calibri" w:hAnsi="Calibri"/>
-          <w:b/>
-          <w:sz w:val="22"/>
-        </w:rPr>
-        <w:t>Stopword settings</w:t>
-      </w:r>
-      <w:r>
-        <w:rPr>
-          <w:rFonts w:ascii="Calibri" w:hAnsi="Calibri"/>
-          <w:sz w:val="22"/>
-        </w:rPr>
-        <w:t>, inspect or change the secondary-view policy. The all-matched result is always preserved even when only one view is displayed.</w:t>
-      </w:r>
-    </w:p>
-    <w:p>
-      <w:pPr>
-        <w:pStyle w:val="Heading2"/>
-      </w:pPr>
-      <w:r>
-        <w:rPr>
-          <w:rFonts w:ascii="Calibri" w:hAnsi="Calibri"/>
-          <w:sz w:val="22"/>
-        </w:rPr>
-        <w:t>Overview tab</w:t>
-      </w:r>
-    </w:p>
-    <w:p>
-      <w:pPr>
-        <w:widowControl/>
-        <w:spacing w:before="0" w:after="120" w:line="300" w:lineRule="auto"/>
-      </w:pPr>
-      <w:r>
-        <w:rPr>
-          <w:rFonts w:ascii="Calibri" w:hAnsi="Calibri"/>
-          <w:sz w:val="22"/>
-        </w:rPr>
-        <w:t>Read coverage before means. The tab shows ordinary and content-focused coverage, matched counts, active methodology, excluded stopword counts, interpretive framing, and warnings.</w:t>
-      </w:r>
-    </w:p>
-    <w:p>
-      <w:pPr>
-        <w:pStyle w:val="Heading2"/>
-      </w:pPr>
-      <w:r>
-        <w:rPr>
-          <w:rFonts w:ascii="Calibri" w:hAnsi="Calibri"/>
-          <w:sz w:val="22"/>
-        </w:rPr>
-        <w:t>Language Profile tab</w:t>
-      </w:r>
-    </w:p>
-    <w:p>
-      <w:pPr>
-        <w:widowControl/>
-        <w:spacing w:before="0" w:after="120" w:line="300" w:lineRule="auto"/>
-      </w:pPr>
-      <w:r>
-        <w:rPr>
-          <w:rFonts w:ascii="Calibri" w:hAnsi="Calibri"/>
-          <w:sz w:val="22"/>
-        </w:rPr>
-        <w:t xml:space="preserve">The </w:t>
-      </w:r>
-      <w:r>
-        <w:rPr>
-          <w:rFonts w:ascii="Calibri" w:hAnsi="Calibri"/>
-          <w:b/>
-          <w:sz w:val="22"/>
-        </w:rPr>
-        <w:t>Shared Processing Record</w:t>
-      </w:r>
-      <w:r>
-        <w:rPr>
-          <w:rFonts w:ascii="Calibri" w:hAnsi="Calibri"/>
-          <w:sz w:val="22"/>
-        </w:rPr>
-        <w:t xml:space="preserve"> first reports stanzas, physical lines, model sentences, total and lexical tokens, recipe/configuration IDs, model pipeline, dependency coverage, named-entity status, and processing cautions. It is the common local representation used by every selected lexicon.</w:t>
-      </w:r>
-    </w:p>
-    <w:p>
-      <w:pPr>
-        <w:widowControl/>
-        <w:spacing w:before="0" w:after="120" w:line="300" w:lineRule="auto"/>
-      </w:pPr>
-      <w:r>
-        <w:rPr>
-          <w:rFonts w:ascii="Calibri" w:hAnsi="Calibri"/>
-          <w:sz w:val="22"/>
-        </w:rPr>
-        <w:t>The tab then reports part-of-speech counts and relative shares for all eligible lexical tokens, independently of lexicon coverage. It also shows unique normalized types and example forms. The denominator is displayed, and a caution explains that the labels are model-generated.</w:t>
-      </w:r>
-    </w:p>
-    <w:p>
-      <w:pPr>
-        <w:pStyle w:val="Heading2"/>
-      </w:pPr>
-      <w:r>
-        <w:rPr>
-          <w:rFonts w:ascii="Calibri" w:hAnsi="Calibri"/>
-          <w:sz w:val="22"/>
-        </w:rPr>
-        <w:t>VAD Profile tab</w:t>
-      </w:r>
-    </w:p>
-    <w:p>
-      <w:pPr>
-        <w:widowControl/>
-        <w:spacing w:before="0" w:after="120" w:line="300" w:lineRule="auto"/>
-      </w:pPr>
-      <w:r>
-        <w:rPr>
-          <w:rFonts w:ascii="Calibri" w:hAnsi="Calibri"/>
-          <w:sz w:val="22"/>
-        </w:rPr>
-        <w:t>This tab contains:</w:t>
+        <w:t>whether AoA permits lemma fallback;</w:t>
       </w:r>
     </w:p>
     <w:p>
@@ -7774,7 +8302,7 @@
           <w:rFonts w:ascii="Calibri" w:hAnsi="Calibri"/>
           <w:sz w:val="22"/>
         </w:rPr>
-        <w:t>parallel normalized VAD charts;</w:t>
+        <w:t>the AoA low-coverage caution threshold; and</w:t>
       </w:r>
     </w:p>
     <w:p>
@@ -7792,7 +8320,22 @@
           <w:rFonts w:ascii="Calibri" w:hAnsi="Calibri"/>
           <w:sz w:val="22"/>
         </w:rPr>
-        <w:t>definitions of valence, arousal, and dominance;</w:t>
+        <w:t xml:space="preserve">whether AoA uses the non-default contextual </w:t>
+      </w:r>
+      <w:r>
+        <w:rPr>
+          <w:rFonts w:ascii="Calibri" w:hAnsi="Calibri"/>
+          <w:b/>
+          <w:sz w:val="22"/>
+        </w:rPr>
+        <w:t>Content words only</w:t>
+      </w:r>
+      <w:r>
+        <w:rPr>
+          <w:rFonts w:ascii="Calibri" w:hAnsi="Calibri"/>
+          <w:sz w:val="22"/>
+        </w:rPr>
+        <w:t xml:space="preserve"> scope;</w:t>
       </w:r>
     </w:p>
     <w:p>
@@ -7810,7 +8353,22 @@
           <w:rFonts w:ascii="Calibri" w:hAnsi="Calibri"/>
           <w:sz w:val="22"/>
         </w:rPr>
-        <w:t>token- and type-weighted values for each analysis view;</w:t>
+        <w:t xml:space="preserve">poem-specific </w:t>
+      </w:r>
+      <w:r>
+        <w:rPr>
+          <w:rFonts w:ascii="Consolas" w:hAnsi="Consolas"/>
+          <w:color w:val="1F4D78"/>
+          <w:sz w:val="19"/>
+        </w:rPr>
+        <w:t>word = ARPAbet phones | note</w:t>
+      </w:r>
+      <w:r>
+        <w:rPr>
+          <w:rFonts w:ascii="Calibri" w:hAnsi="Calibri"/>
+          <w:sz w:val="22"/>
+        </w:rPr>
+        <w:t xml:space="preserve"> pronunciation overrides;</w:t>
       </w:r>
     </w:p>
     <w:p>
@@ -7828,7 +8386,7 @@
           <w:rFonts w:ascii="Calibri" w:hAnsi="Calibri"/>
           <w:sz w:val="22"/>
         </w:rPr>
-        <w:t>plain-language midpoint interpretations;</w:t>
+        <w:t>the pronunciation resolved-token coverage caution threshold;</w:t>
       </w:r>
     </w:p>
     <w:p>
@@ -7846,7 +8404,7 @@
           <w:rFonts w:ascii="Calibri" w:hAnsi="Calibri"/>
           <w:sz w:val="22"/>
         </w:rPr>
-        <w:t>population dispersion;</w:t>
+        <w:t>minimum complete pronunciation lines; and</w:t>
       </w:r>
     </w:p>
     <w:p>
@@ -7864,7 +8422,7 @@
           <w:rFonts w:ascii="Calibri" w:hAnsi="Calibri"/>
           <w:sz w:val="22"/>
         </w:rPr>
-        <w:t>stopword-sensitivity differences;</w:t>
+        <w:t>minimum resolved pronunciation tokens for sparse-result warnings;</w:t>
       </w:r>
     </w:p>
     <w:p>
@@ -7882,7 +8440,7 @@
           <w:rFonts w:ascii="Calibri" w:hAnsi="Calibri"/>
           <w:sz w:val="22"/>
         </w:rPr>
-        <w:t>cumulative normalized totals;</w:t>
+        <w:t>the meter line-fit threshold;</w:t>
       </w:r>
     </w:p>
     <w:p>
@@ -7900,7 +8458,7 @@
           <w:rFonts w:ascii="Calibri" w:hAnsi="Calibri"/>
           <w:sz w:val="22"/>
         </w:rPr>
-        <w:t>top midpoint-centered contributors;</w:t>
+        <w:t>the poem candidate-fit threshold;</w:t>
       </w:r>
     </w:p>
     <w:p>
@@ -7918,6 +8476,317 @@
           <w:rFonts w:ascii="Calibri" w:hAnsi="Calibri"/>
           <w:sz w:val="22"/>
         </w:rPr>
+        <w:t>the candidate-margin threshold; and</w:t>
+      </w:r>
+    </w:p>
+    <w:p>
+      <w:pPr>
+        <w:widowControl/>
+        <w:numPr>
+          <w:ilvl w:val="0"/>
+          <w:numId w:val="10"/>
+        </w:numPr>
+        <w:spacing w:before="0" w:after="80" w:line="300" w:lineRule="auto"/>
+        <w:ind w:left="540" w:hanging="271"/>
+      </w:pPr>
+      <w:r>
+        <w:rPr>
+          <w:rFonts w:ascii="Calibri" w:hAnsi="Calibri"/>
+          <w:sz w:val="22"/>
+        </w:rPr>
+        <w:t>the maximum retained stress paths evaluated per line.</w:t>
+      </w:r>
+    </w:p>
+    <w:p>
+      <w:pPr>
+        <w:widowControl/>
+        <w:spacing w:before="0" w:after="120" w:line="300" w:lineRule="auto"/>
+      </w:pPr>
+      <w:r>
+        <w:rPr>
+          <w:rFonts w:ascii="Calibri" w:hAnsi="Calibri"/>
+          <w:sz w:val="22"/>
+        </w:rPr>
+        <w:t xml:space="preserve">Under </w:t>
+      </w:r>
+      <w:r>
+        <w:rPr>
+          <w:rFonts w:ascii="Calibri" w:hAnsi="Calibri"/>
+          <w:b/>
+          <w:sz w:val="22"/>
+        </w:rPr>
+        <w:t>Stopword settings</w:t>
+      </w:r>
+      <w:r>
+        <w:rPr>
+          <w:rFonts w:ascii="Calibri" w:hAnsi="Calibri"/>
+          <w:sz w:val="22"/>
+        </w:rPr>
+        <w:t>, inspect or change the secondary-view policy. The all-matched result is always preserved even when only one view is displayed.</w:t>
+      </w:r>
+    </w:p>
+    <w:p>
+      <w:pPr>
+        <w:pStyle w:val="Heading2"/>
+      </w:pPr>
+      <w:r>
+        <w:rPr>
+          <w:rFonts w:ascii="Calibri" w:hAnsi="Calibri"/>
+          <w:sz w:val="22"/>
+        </w:rPr>
+        <w:t>Overview tab</w:t>
+      </w:r>
+    </w:p>
+    <w:p>
+      <w:pPr>
+        <w:widowControl/>
+        <w:spacing w:before="0" w:after="120" w:line="300" w:lineRule="auto"/>
+      </w:pPr>
+      <w:r>
+        <w:rPr>
+          <w:rFonts w:ascii="Calibri" w:hAnsi="Calibri"/>
+          <w:sz w:val="22"/>
+        </w:rPr>
+        <w:t>Read coverage before means. The tab shows ordinary and content-focused coverage, matched counts, active methodology, excluded stopword counts, interpretive framing, and warnings.</w:t>
+      </w:r>
+    </w:p>
+    <w:p>
+      <w:pPr>
+        <w:pStyle w:val="Heading2"/>
+      </w:pPr>
+      <w:r>
+        <w:rPr>
+          <w:rFonts w:ascii="Calibri" w:hAnsi="Calibri"/>
+          <w:sz w:val="22"/>
+        </w:rPr>
+        <w:t>Language Profile tab</w:t>
+      </w:r>
+    </w:p>
+    <w:p>
+      <w:pPr>
+        <w:widowControl/>
+        <w:spacing w:before="0" w:after="120" w:line="300" w:lineRule="auto"/>
+      </w:pPr>
+      <w:r>
+        <w:rPr>
+          <w:rFonts w:ascii="Calibri" w:hAnsi="Calibri"/>
+          <w:sz w:val="22"/>
+        </w:rPr>
+        <w:t xml:space="preserve">The </w:t>
+      </w:r>
+      <w:r>
+        <w:rPr>
+          <w:rFonts w:ascii="Calibri" w:hAnsi="Calibri"/>
+          <w:b/>
+          <w:sz w:val="22"/>
+        </w:rPr>
+        <w:t>Shared Processing Record</w:t>
+      </w:r>
+      <w:r>
+        <w:rPr>
+          <w:rFonts w:ascii="Calibri" w:hAnsi="Calibri"/>
+          <w:sz w:val="22"/>
+        </w:rPr>
+        <w:t xml:space="preserve"> first reports stanzas, physical lines, model sentences, total and lexical tokens, recipe/configuration IDs, model pipeline, dependency coverage, named-entity status, and processing cautions. It is the common local representation used by every selected lexicon.</w:t>
+      </w:r>
+    </w:p>
+    <w:p>
+      <w:pPr>
+        <w:widowControl/>
+        <w:spacing w:before="0" w:after="120" w:line="300" w:lineRule="auto"/>
+      </w:pPr>
+      <w:r>
+        <w:rPr>
+          <w:rFonts w:ascii="Calibri" w:hAnsi="Calibri"/>
+          <w:sz w:val="22"/>
+        </w:rPr>
+        <w:t>The tab then reports part-of-speech counts and relative shares for all eligible lexical tokens, independently of lexicon coverage. It also shows unique normalized types and example forms. The denominator is displayed, and a caution explains that the labels are model-generated.</w:t>
+      </w:r>
+    </w:p>
+    <w:p>
+      <w:pPr>
+        <w:pStyle w:val="Heading2"/>
+      </w:pPr>
+      <w:r>
+        <w:rPr>
+          <w:rFonts w:ascii="Calibri" w:hAnsi="Calibri"/>
+          <w:sz w:val="22"/>
+        </w:rPr>
+        <w:t>VAD Profile tab</w:t>
+      </w:r>
+    </w:p>
+    <w:p>
+      <w:pPr>
+        <w:widowControl/>
+        <w:spacing w:before="0" w:after="120" w:line="300" w:lineRule="auto"/>
+      </w:pPr>
+      <w:r>
+        <w:rPr>
+          <w:rFonts w:ascii="Calibri" w:hAnsi="Calibri"/>
+          <w:sz w:val="22"/>
+        </w:rPr>
+        <w:t>This tab contains:</w:t>
+      </w:r>
+    </w:p>
+    <w:p>
+      <w:pPr>
+        <w:widowControl/>
+        <w:numPr>
+          <w:ilvl w:val="0"/>
+          <w:numId w:val="10"/>
+        </w:numPr>
+        <w:spacing w:before="0" w:after="80" w:line="300" w:lineRule="auto"/>
+        <w:ind w:left="540" w:hanging="271"/>
+      </w:pPr>
+      <w:r>
+        <w:rPr>
+          <w:rFonts w:ascii="Calibri" w:hAnsi="Calibri"/>
+          <w:sz w:val="22"/>
+        </w:rPr>
+        <w:t>parallel normalized VAD charts;</w:t>
+      </w:r>
+    </w:p>
+    <w:p>
+      <w:pPr>
+        <w:widowControl/>
+        <w:numPr>
+          <w:ilvl w:val="0"/>
+          <w:numId w:val="10"/>
+        </w:numPr>
+        <w:spacing w:before="0" w:after="80" w:line="300" w:lineRule="auto"/>
+        <w:ind w:left="540" w:hanging="271"/>
+      </w:pPr>
+      <w:r>
+        <w:rPr>
+          <w:rFonts w:ascii="Calibri" w:hAnsi="Calibri"/>
+          <w:sz w:val="22"/>
+        </w:rPr>
+        <w:t>definitions of valence, arousal, and dominance;</w:t>
+      </w:r>
+    </w:p>
+    <w:p>
+      <w:pPr>
+        <w:widowControl/>
+        <w:numPr>
+          <w:ilvl w:val="0"/>
+          <w:numId w:val="10"/>
+        </w:numPr>
+        <w:spacing w:before="0" w:after="80" w:line="300" w:lineRule="auto"/>
+        <w:ind w:left="540" w:hanging="271"/>
+      </w:pPr>
+      <w:r>
+        <w:rPr>
+          <w:rFonts w:ascii="Calibri" w:hAnsi="Calibri"/>
+          <w:sz w:val="22"/>
+        </w:rPr>
+        <w:t>token- and type-weighted values for each analysis view;</w:t>
+      </w:r>
+    </w:p>
+    <w:p>
+      <w:pPr>
+        <w:widowControl/>
+        <w:numPr>
+          <w:ilvl w:val="0"/>
+          <w:numId w:val="10"/>
+        </w:numPr>
+        <w:spacing w:before="0" w:after="80" w:line="300" w:lineRule="auto"/>
+        <w:ind w:left="540" w:hanging="271"/>
+      </w:pPr>
+      <w:r>
+        <w:rPr>
+          <w:rFonts w:ascii="Calibri" w:hAnsi="Calibri"/>
+          <w:sz w:val="22"/>
+        </w:rPr>
+        <w:t>plain-language midpoint interpretations;</w:t>
+      </w:r>
+    </w:p>
+    <w:p>
+      <w:pPr>
+        <w:widowControl/>
+        <w:numPr>
+          <w:ilvl w:val="0"/>
+          <w:numId w:val="10"/>
+        </w:numPr>
+        <w:spacing w:before="0" w:after="80" w:line="300" w:lineRule="auto"/>
+        <w:ind w:left="540" w:hanging="271"/>
+      </w:pPr>
+      <w:r>
+        <w:rPr>
+          <w:rFonts w:ascii="Calibri" w:hAnsi="Calibri"/>
+          <w:sz w:val="22"/>
+        </w:rPr>
+        <w:t>population dispersion;</w:t>
+      </w:r>
+    </w:p>
+    <w:p>
+      <w:pPr>
+        <w:widowControl/>
+        <w:numPr>
+          <w:ilvl w:val="0"/>
+          <w:numId w:val="10"/>
+        </w:numPr>
+        <w:spacing w:before="0" w:after="80" w:line="300" w:lineRule="auto"/>
+        <w:ind w:left="540" w:hanging="271"/>
+      </w:pPr>
+      <w:r>
+        <w:rPr>
+          <w:rFonts w:ascii="Calibri" w:hAnsi="Calibri"/>
+          <w:sz w:val="22"/>
+        </w:rPr>
+        <w:t>stopword-sensitivity differences;</w:t>
+      </w:r>
+    </w:p>
+    <w:p>
+      <w:pPr>
+        <w:widowControl/>
+        <w:numPr>
+          <w:ilvl w:val="0"/>
+          <w:numId w:val="10"/>
+        </w:numPr>
+        <w:spacing w:before="0" w:after="80" w:line="300" w:lineRule="auto"/>
+        <w:ind w:left="540" w:hanging="271"/>
+      </w:pPr>
+      <w:r>
+        <w:rPr>
+          <w:rFonts w:ascii="Calibri" w:hAnsi="Calibri"/>
+          <w:sz w:val="22"/>
+        </w:rPr>
+        <w:t>cumulative normalized totals;</w:t>
+      </w:r>
+    </w:p>
+    <w:p>
+      <w:pPr>
+        <w:widowControl/>
+        <w:numPr>
+          <w:ilvl w:val="0"/>
+          <w:numId w:val="10"/>
+        </w:numPr>
+        <w:spacing w:before="0" w:after="80" w:line="300" w:lineRule="auto"/>
+        <w:ind w:left="540" w:hanging="271"/>
+      </w:pPr>
+      <w:r>
+        <w:rPr>
+          <w:rFonts w:ascii="Calibri" w:hAnsi="Calibri"/>
+          <w:sz w:val="22"/>
+        </w:rPr>
+        <w:t>top midpoint-centered contributors;</w:t>
+      </w:r>
+    </w:p>
+    <w:p>
+      <w:pPr>
+        <w:widowControl/>
+        <w:numPr>
+          <w:ilvl w:val="0"/>
+          <w:numId w:val="10"/>
+        </w:numPr>
+        <w:spacing w:before="0" w:after="80" w:line="300" w:lineRule="auto"/>
+        <w:ind w:left="540" w:hanging="271"/>
+      </w:pPr>
+      <w:r>
+        <w:rPr>
+          <w:rFonts w:ascii="Calibri" w:hAnsi="Calibri"/>
+          <w:sz w:val="22"/>
+        </w:rPr>
         <w:t>original source scales and normalization formulas.</w:t>
       </w:r>
     </w:p>
@@ -8289,6 +9158,87 @@
           <w:sz w:val="22"/>
         </w:rPr>
         <w:t xml:space="preserve"> are lexical-stress digits, not metrical beats. The Stage 5 tab does not report candidate meter or rhyme.</w:t>
+      </w:r>
+    </w:p>
+    <w:p>
+      <w:pPr>
+        <w:pStyle w:val="Heading2"/>
+      </w:pPr>
+      <w:r>
+        <w:rPr>
+          <w:rFonts w:ascii="Calibri" w:hAnsi="Calibri"/>
+          <w:sz w:val="22"/>
+        </w:rPr>
+        <w:t>Meter &amp; Rhythm tab</w:t>
+      </w:r>
+    </w:p>
+    <w:p>
+      <w:pPr>
+        <w:widowControl/>
+        <w:spacing w:before="0" w:after="120" w:line="300" w:lineRule="auto"/>
+      </w:pPr>
+      <w:r>
+        <w:rPr>
+          <w:rFonts w:ascii="Calibri" w:hAnsi="Calibri"/>
+          <w:sz w:val="22"/>
+        </w:rPr>
+        <w:t xml:space="preserve">This tab appears when </w:t>
+      </w:r>
+      <w:r>
+        <w:rPr>
+          <w:rFonts w:ascii="Calibri" w:hAnsi="Calibri"/>
+          <w:b/>
+          <w:sz w:val="22"/>
+        </w:rPr>
+        <w:t>Meter &amp; rhythmic regularity</w:t>
+      </w:r>
+      <w:r>
+        <w:rPr>
+          <w:rFonts w:ascii="Calibri" w:hAnsi="Calibri"/>
+          <w:sz w:val="22"/>
+        </w:rPr>
+        <w:t xml:space="preserve"> is enabled. It reports the nearest fixed template or alternating scheme, fit, matching lines, coverage, alternative, candidate margin, rule-based confidence, rhythmic variation, a separate common-meter panel, physical-line evidence, all 40 fixed candidates, warnings, and configuration provenance.</w:t>
+      </w:r>
+    </w:p>
+    <w:p>
+      <w:pPr>
+        <w:widowControl/>
+        <w:spacing w:before="0" w:after="120" w:line="300" w:lineRule="auto"/>
+      </w:pPr>
+      <w:r>
+        <w:rPr>
+          <w:rFonts w:ascii="Calibri" w:hAnsi="Calibri"/>
+          <w:sz w:val="22"/>
+        </w:rPr>
+        <w:t xml:space="preserve">For common meter, confirm the expected foot counts restart as </w:t>
+      </w:r>
+      <w:r>
+        <w:rPr>
+          <w:rFonts w:ascii="Consolas" w:hAnsi="Consolas"/>
+          <w:color w:val="1F4D78"/>
+          <w:sz w:val="19"/>
+        </w:rPr>
+        <w:t>4, 3, 4, 3</w:t>
+      </w:r>
+      <w:r>
+        <w:rPr>
+          <w:rFonts w:ascii="Calibri" w:hAnsi="Calibri"/>
+          <w:sz w:val="22"/>
+        </w:rPr>
+        <w:t xml:space="preserve"> in each stanza and read complete-stanza coverage. A stanza fragment can supply partial line evidence but cannot by itself select common meter as the nearest poem-level scheme.</w:t>
+      </w:r>
+    </w:p>
+    <w:p>
+      <w:pPr>
+        <w:widowControl/>
+        <w:spacing w:before="0" w:after="120" w:line="300" w:lineRule="auto"/>
+      </w:pPr>
+      <w:r>
+        <w:rPr>
+          <w:rFonts w:ascii="Calibri" w:hAnsi="Calibri"/>
+          <w:sz w:val="22"/>
+        </w:rPr>
+        <w:t>The closest fixed template for one line and the phase-specific common-meter line fit are separate columns. Do not mistake a metrically preferred stress path for a change to the Stage 5 pronunciation result.</w:t>
       </w:r>
     </w:p>
     <w:p>
@@ -12958,6 +13908,354 @@
           </w:p>
         </w:tc>
       </w:tr>
+      <w:tr>
+        <w:trPr>
+          <w:cantSplit w:val="true"/>
+        </w:trPr>
+        <w:tc>
+          <w:tcPr>
+            <w:tcW w:type="dxa" w:w="3600"/>
+            <w:vAlign w:val="center"/>
+            <w:tcMar>
+              <w:top w:w="80" w:type="dxa"/>
+              <w:bottom w:w="80" w:type="dxa"/>
+              <w:start w:w="120" w:type="dxa"/>
+              <w:end w:w="120" w:type="dxa"/>
+            </w:tcMar>
+          </w:tcPr>
+          <w:p>
+            <w:pPr>
+              <w:widowControl/>
+              <w:spacing w:before="0" w:after="0" w:line="252" w:lineRule="auto"/>
+            </w:pPr>
+            <w:r/>
+            <w:r>
+              <w:rPr>
+                <w:rFonts w:ascii="Consolas" w:hAnsi="Consolas"/>
+                <w:color w:val="1F4D78"/>
+                <w:sz w:val="17"/>
+              </w:rPr>
+              <w:t>meter_summary.csv</w:t>
+            </w:r>
+          </w:p>
+        </w:tc>
+        <w:tc>
+          <w:tcPr>
+            <w:tcW w:type="dxa" w:w="5760"/>
+            <w:vAlign w:val="center"/>
+            <w:tcMar>
+              <w:top w:w="80" w:type="dxa"/>
+              <w:bottom w:w="80" w:type="dxa"/>
+              <w:start w:w="120" w:type="dxa"/>
+              <w:end w:w="120" w:type="dxa"/>
+            </w:tcMar>
+          </w:tcPr>
+          <w:p>
+            <w:pPr>
+              <w:widowControl/>
+              <w:spacing w:before="0" w:after="0" w:line="252" w:lineRule="auto"/>
+            </w:pPr>
+            <w:r/>
+            <w:r>
+              <w:rPr>
+                <w:rFonts w:ascii="Calibri" w:hAnsi="Calibri"/>
+                <w:sz w:val="18"/>
+              </w:rPr>
+              <w:t>Nearest candidate kind and label, fit, coverage, confidence, deviations, and common-meter summary</w:t>
+            </w:r>
+          </w:p>
+        </w:tc>
+      </w:tr>
+      <w:tr>
+        <w:trPr>
+          <w:cantSplit w:val="true"/>
+        </w:trPr>
+        <w:tc>
+          <w:tcPr>
+            <w:tcW w:type="dxa" w:w="3600"/>
+            <w:vAlign w:val="center"/>
+            <w:tcMar>
+              <w:top w:w="80" w:type="dxa"/>
+              <w:bottom w:w="80" w:type="dxa"/>
+              <w:start w:w="120" w:type="dxa"/>
+              <w:end w:w="120" w:type="dxa"/>
+            </w:tcMar>
+          </w:tcPr>
+          <w:p>
+            <w:pPr>
+              <w:widowControl/>
+              <w:spacing w:before="0" w:after="0" w:line="252" w:lineRule="auto"/>
+            </w:pPr>
+            <w:r/>
+            <w:r>
+              <w:rPr>
+                <w:rFonts w:ascii="Consolas" w:hAnsi="Consolas"/>
+                <w:color w:val="1F4D78"/>
+                <w:sz w:val="17"/>
+              </w:rPr>
+              <w:t>meter_candidates.csv</w:t>
+            </w:r>
+          </w:p>
+        </w:tc>
+        <w:tc>
+          <w:tcPr>
+            <w:tcW w:type="dxa" w:w="5760"/>
+            <w:vAlign w:val="center"/>
+            <w:tcMar>
+              <w:top w:w="80" w:type="dxa"/>
+              <w:bottom w:w="80" w:type="dxa"/>
+              <w:start w:w="120" w:type="dxa"/>
+              <w:end w:w="120" w:type="dxa"/>
+            </w:tcMar>
+          </w:tcPr>
+          <w:p>
+            <w:pPr>
+              <w:widowControl/>
+              <w:spacing w:before="0" w:after="0" w:line="252" w:lineRule="auto"/>
+            </w:pPr>
+            <w:r/>
+            <w:r>
+              <w:rPr>
+                <w:rFonts w:ascii="Calibri" w:hAnsi="Calibri"/>
+                <w:sz w:val="18"/>
+              </w:rPr>
+              <w:t>All 40 fixed pattern-by-foot-count candidates with rank, fit, variation, and matching lines</w:t>
+            </w:r>
+          </w:p>
+        </w:tc>
+      </w:tr>
+      <w:tr>
+        <w:trPr>
+          <w:cantSplit w:val="true"/>
+        </w:trPr>
+        <w:tc>
+          <w:tcPr>
+            <w:tcW w:type="dxa" w:w="3600"/>
+            <w:vAlign w:val="center"/>
+            <w:tcMar>
+              <w:top w:w="80" w:type="dxa"/>
+              <w:bottom w:w="80" w:type="dxa"/>
+              <w:start w:w="120" w:type="dxa"/>
+              <w:end w:w="120" w:type="dxa"/>
+            </w:tcMar>
+          </w:tcPr>
+          <w:p>
+            <w:pPr>
+              <w:widowControl/>
+              <w:spacing w:before="0" w:after="0" w:line="252" w:lineRule="auto"/>
+            </w:pPr>
+            <w:r/>
+            <w:r>
+              <w:rPr>
+                <w:rFonts w:ascii="Consolas" w:hAnsi="Consolas"/>
+                <w:color w:val="1F4D78"/>
+                <w:sz w:val="17"/>
+              </w:rPr>
+              <w:t>meter_schemes.csv</w:t>
+            </w:r>
+          </w:p>
+        </w:tc>
+        <w:tc>
+          <w:tcPr>
+            <w:tcW w:type="dxa" w:w="5760"/>
+            <w:vAlign w:val="center"/>
+            <w:tcMar>
+              <w:top w:w="80" w:type="dxa"/>
+              <w:bottom w:w="80" w:type="dxa"/>
+              <w:start w:w="120" w:type="dxa"/>
+              <w:end w:w="120" w:type="dxa"/>
+            </w:tcMar>
+          </w:tcPr>
+          <w:p>
+            <w:pPr>
+              <w:widowControl/>
+              <w:spacing w:before="0" w:after="0" w:line="252" w:lineRule="auto"/>
+            </w:pPr>
+            <w:r/>
+            <w:r>
+              <w:rPr>
+                <w:rFonts w:ascii="Calibri" w:hAnsi="Calibri"/>
+                <w:sz w:val="18"/>
+              </w:rPr>
+              <w:t>Stanza-aware scheme cycle, fit, line coverage, matching lines, and complete-stanza coverage</w:t>
+            </w:r>
+          </w:p>
+        </w:tc>
+      </w:tr>
+      <w:tr>
+        <w:trPr>
+          <w:cantSplit w:val="true"/>
+        </w:trPr>
+        <w:tc>
+          <w:tcPr>
+            <w:tcW w:type="dxa" w:w="3600"/>
+            <w:vAlign w:val="center"/>
+            <w:tcMar>
+              <w:top w:w="80" w:type="dxa"/>
+              <w:bottom w:w="80" w:type="dxa"/>
+              <w:start w:w="120" w:type="dxa"/>
+              <w:end w:w="120" w:type="dxa"/>
+            </w:tcMar>
+          </w:tcPr>
+          <w:p>
+            <w:pPr>
+              <w:widowControl/>
+              <w:spacing w:before="0" w:after="0" w:line="252" w:lineRule="auto"/>
+            </w:pPr>
+            <w:r/>
+            <w:r>
+              <w:rPr>
+                <w:rFonts w:ascii="Consolas" w:hAnsi="Consolas"/>
+                <w:color w:val="1F4D78"/>
+                <w:sz w:val="17"/>
+              </w:rPr>
+              <w:t>meter_lines.csv</w:t>
+            </w:r>
+          </w:p>
+        </w:tc>
+        <w:tc>
+          <w:tcPr>
+            <w:tcW w:type="dxa" w:w="5760"/>
+            <w:vAlign w:val="center"/>
+            <w:tcMar>
+              <w:top w:w="80" w:type="dxa"/>
+              <w:bottom w:w="80" w:type="dxa"/>
+              <w:start w:w="120" w:type="dxa"/>
+              <w:end w:w="120" w:type="dxa"/>
+            </w:tcMar>
+          </w:tcPr>
+          <w:p>
+            <w:pPr>
+              <w:widowControl/>
+              <w:spacing w:before="0" w:after="0" w:line="252" w:lineRule="auto"/>
+            </w:pPr>
+            <w:r/>
+            <w:r>
+              <w:rPr>
+                <w:rFonts w:ascii="Calibri" w:hAnsi="Calibri"/>
+                <w:sz w:val="18"/>
+              </w:rPr>
+              <w:t>Every physical line's status, nearest fixed template, selected stress path, common-meter position/expected feet/fit, alignment, and deviations</w:t>
+            </w:r>
+          </w:p>
+        </w:tc>
+      </w:tr>
+      <w:tr>
+        <w:trPr>
+          <w:cantSplit w:val="true"/>
+        </w:trPr>
+        <w:tc>
+          <w:tcPr>
+            <w:tcW w:type="dxa" w:w="3600"/>
+            <w:vAlign w:val="center"/>
+            <w:tcMar>
+              <w:top w:w="80" w:type="dxa"/>
+              <w:bottom w:w="80" w:type="dxa"/>
+              <w:start w:w="120" w:type="dxa"/>
+              <w:end w:w="120" w:type="dxa"/>
+            </w:tcMar>
+          </w:tcPr>
+          <w:p>
+            <w:pPr>
+              <w:widowControl/>
+              <w:spacing w:before="0" w:after="0" w:line="252" w:lineRule="auto"/>
+            </w:pPr>
+            <w:r/>
+            <w:r>
+              <w:rPr>
+                <w:rFonts w:ascii="Consolas" w:hAnsi="Consolas"/>
+                <w:color w:val="1F4D78"/>
+                <w:sz w:val="17"/>
+              </w:rPr>
+              <w:t>meter_alignment_operations.csv</w:t>
+            </w:r>
+          </w:p>
+        </w:tc>
+        <w:tc>
+          <w:tcPr>
+            <w:tcW w:type="dxa" w:w="5760"/>
+            <w:vAlign w:val="center"/>
+            <w:tcMar>
+              <w:top w:w="80" w:type="dxa"/>
+              <w:bottom w:w="80" w:type="dxa"/>
+              <w:start w:w="120" w:type="dxa"/>
+              <w:end w:w="120" w:type="dxa"/>
+            </w:tcMar>
+          </w:tcPr>
+          <w:p>
+            <w:pPr>
+              <w:widowControl/>
+              <w:spacing w:before="0" w:after="0" w:line="252" w:lineRule="auto"/>
+            </w:pPr>
+            <w:r/>
+            <w:r>
+              <w:rPr>
+                <w:rFonts w:ascii="Calibri" w:hAnsi="Calibri"/>
+                <w:sz w:val="18"/>
+              </w:rPr>
+              <w:t>Every selected syllable-to-template operation, cost, word, model POS, and ending flag</w:t>
+            </w:r>
+          </w:p>
+        </w:tc>
+      </w:tr>
+      <w:tr>
+        <w:trPr>
+          <w:cantSplit w:val="true"/>
+        </w:trPr>
+        <w:tc>
+          <w:tcPr>
+            <w:tcW w:type="dxa" w:w="3600"/>
+            <w:vAlign w:val="center"/>
+            <w:tcMar>
+              <w:top w:w="80" w:type="dxa"/>
+              <w:bottom w:w="80" w:type="dxa"/>
+              <w:start w:w="120" w:type="dxa"/>
+              <w:end w:w="120" w:type="dxa"/>
+            </w:tcMar>
+          </w:tcPr>
+          <w:p>
+            <w:pPr>
+              <w:widowControl/>
+              <w:spacing w:before="0" w:after="0" w:line="252" w:lineRule="auto"/>
+            </w:pPr>
+            <w:r/>
+            <w:r>
+              <w:rPr>
+                <w:rFonts w:ascii="Consolas" w:hAnsi="Consolas"/>
+                <w:color w:val="1F4D78"/>
+                <w:sz w:val="17"/>
+              </w:rPr>
+              <w:t>meter_result.json</w:t>
+            </w:r>
+          </w:p>
+        </w:tc>
+        <w:tc>
+          <w:tcPr>
+            <w:tcW w:type="dxa" w:w="5760"/>
+            <w:vAlign w:val="center"/>
+            <w:tcMar>
+              <w:top w:w="80" w:type="dxa"/>
+              <w:bottom w:w="80" w:type="dxa"/>
+              <w:start w:w="120" w:type="dxa"/>
+              <w:end w:w="120" w:type="dxa"/>
+            </w:tcMar>
+          </w:tcPr>
+          <w:p>
+            <w:pPr>
+              <w:widowControl/>
+              <w:spacing w:before="0" w:after="0" w:line="252" w:lineRule="auto"/>
+            </w:pPr>
+            <w:r/>
+            <w:r>
+              <w:rPr>
+                <w:rFonts w:ascii="Calibri" w:hAnsi="Calibri"/>
+                <w:sz w:val="18"/>
+              </w:rPr>
+              <w:t>Complete structured Stage 6 configuration, line audit, fixed candidates, schemes, metrics, warnings, and provenance</w:t>
+            </w:r>
+          </w:p>
+        </w:tc>
+      </w:tr>
     </w:tbl>
     <w:p>
       <w:pPr>
@@ -13050,7 +14348,7 @@
           <w:rFonts w:ascii="Calibri" w:hAnsi="Calibri"/>
           <w:sz w:val="22"/>
         </w:rPr>
-        <w:t xml:space="preserve"> contains the optional Kuperman result, and </w:t>
+        <w:t xml:space="preserve"> contains the optional Kuperman result, </w:t>
       </w:r>
       <w:r>
         <w:rPr>
@@ -13065,7 +14363,7 @@
           <w:rFonts w:ascii="Calibri" w:hAnsi="Calibri"/>
           <w:sz w:val="22"/>
         </w:rPr>
-        <w:t xml:space="preserve"> contains every Stage 5 candidate and decision. </w:t>
+        <w:t xml:space="preserve"> contains every Stage 5 candidate and decision, and </w:t>
       </w:r>
       <w:r>
         <w:rPr>
@@ -13073,6 +14371,21 @@
           <w:color w:val="1F4D78"/>
           <w:sz w:val="19"/>
         </w:rPr>
+        <w:t>meter_result.json</w:t>
+      </w:r>
+      <w:r>
+        <w:rPr>
+          <w:rFonts w:ascii="Calibri" w:hAnsi="Calibri"/>
+          <w:sz w:val="22"/>
+        </w:rPr>
+        <w:t xml:space="preserve"> contains every Stage 6 line, fixed-candidate, scheme, and method record. </w:t>
+      </w:r>
+      <w:r>
+        <w:rPr>
+          <w:rFonts w:ascii="Consolas" w:hAnsi="Consolas"/>
+          <w:color w:val="1F4D78"/>
+          <w:sz w:val="19"/>
+        </w:rPr>
         <w:t>poem_document.json</w:t>
       </w:r>
       <w:r>
@@ -13080,7 +14393,7 @@
           <w:rFonts w:ascii="Calibri" w:hAnsi="Calibri"/>
           <w:sz w:val="22"/>
         </w:rPr>
-        <w:t xml:space="preserve"> includes the original text, so protect it as research material. Concreteness, Frequency, AoA, and Pronunciation exports retain source-row provenance but do not copy any complete research source. The scholar summary is the easiest reading aid.</w:t>
+        <w:t xml:space="preserve"> includes the original text, so protect it as research material. Concreteness, Frequency, AoA, Pronunciation, and Meter exports retain poem-specific provenance but do not copy any complete research source. The scholar summary is the easiest reading aid.</w:t>
       </w:r>
     </w:p>
     <w:p>
@@ -15580,6 +16893,139 @@
           <w:rFonts w:ascii="Calibri" w:hAnsi="Calibri"/>
           <w:sz w:val="22"/>
         </w:rPr>
+        <w:t>Candidate-meter fit and coverage</w:t>
+      </w:r>
+    </w:p>
+    <w:p>
+      <w:pPr>
+        <w:widowControl/>
+        <w:spacing w:before="0" w:after="120" w:line="300" w:lineRule="auto"/>
+      </w:pPr>
+      <w:r>
+        <w:rPr>
+          <w:rFonts w:ascii="Calibri" w:hAnsi="Calibri"/>
+          <w:sz w:val="22"/>
+        </w:rPr>
+        <w:t>For one retained stress path and one template:</w:t>
+      </w:r>
+    </w:p>
+    <w:p>
+      <w:pPr>
+        <w:pStyle w:val="Formula"/>
+      </w:pPr>
+      <w:r>
+        <w:rPr>
+          <w:rFonts w:ascii="Consolas" w:hAnsi="Consolas"/>
+          <w:color w:val="1F4D78"/>
+          <w:sz w:val="19"/>
+        </w:rPr>
+        <w:t>meter_line_fit = max(0, 1 - selected_alignment_cost / max(observed_syllables, template_syllables, 1))</w:t>
+      </w:r>
+    </w:p>
+    <w:p>
+      <w:pPr>
+        <w:widowControl/>
+        <w:spacing w:before="0" w:after="120" w:line="300" w:lineRule="auto"/>
+      </w:pPr>
+      <w:r>
+        <w:rPr>
+          <w:rFonts w:ascii="Calibri" w:hAnsi="Calibri"/>
+          <w:sz w:val="22"/>
+        </w:rPr>
+        <w:t xml:space="preserve">For an exact alignment, cost is zero and fit is </w:t>
+      </w:r>
+      <w:r>
+        <w:rPr>
+          <w:rFonts w:ascii="Consolas" w:hAnsi="Consolas"/>
+          <w:color w:val="1F4D78"/>
+          <w:sz w:val="19"/>
+        </w:rPr>
+        <w:t>1.0</w:t>
+      </w:r>
+      <w:r>
+        <w:rPr>
+          <w:rFonts w:ascii="Calibri" w:hAnsi="Calibri"/>
+          <w:sz w:val="22"/>
+        </w:rPr>
+        <w:t>. Mismatch, insertion, omission, inversion, feminine-ending, catalectic-ending, secondary-stress, and function-word-flexibility costs are recorded configuration choices.</w:t>
+      </w:r>
+    </w:p>
+    <w:p>
+      <w:pPr>
+        <w:pStyle w:val="Formula"/>
+      </w:pPr>
+      <w:r>
+        <w:rPr>
+          <w:rFonts w:ascii="Consolas" w:hAnsi="Consolas"/>
+          <w:color w:val="1F4D78"/>
+          <w:sz w:val="19"/>
+        </w:rPr>
+        <w:t>meter_line_coverage = analyzable physical lines / eligible physical lines</w:t>
+      </w:r>
+    </w:p>
+    <w:p>
+      <w:pPr>
+        <w:pStyle w:val="Formula"/>
+      </w:pPr>
+      <w:r>
+        <w:rPr>
+          <w:rFonts w:ascii="Consolas" w:hAnsi="Consolas"/>
+          <w:color w:val="1F4D78"/>
+          <w:sz w:val="19"/>
+        </w:rPr>
+        <w:t>meter_matching_line_proportion = lines at or above the configured fit threshold / analyzable physical lines</w:t>
+      </w:r>
+    </w:p>
+    <w:p>
+      <w:pPr>
+        <w:pStyle w:val="Formula"/>
+      </w:pPr>
+      <w:r>
+        <w:rPr>
+          <w:rFonts w:ascii="Consolas" w:hAnsi="Consolas"/>
+          <w:color w:val="1F4D78"/>
+          <w:sz w:val="19"/>
+        </w:rPr>
+        <w:t>common_meter_complete_stanza_coverage = complete analyzable four-line stanzas / eligible stanzas</w:t>
+      </w:r>
+    </w:p>
+    <w:p>
+      <w:pPr>
+        <w:widowControl/>
+        <w:spacing w:before="0" w:after="120" w:line="300" w:lineRule="auto"/>
+      </w:pPr>
+      <w:r>
+        <w:rPr>
+          <w:rFonts w:ascii="Calibri" w:hAnsi="Calibri"/>
+          <w:sz w:val="22"/>
+        </w:rPr>
+        <w:t xml:space="preserve">The common-meter line template follows iambic foot counts </w:t>
+      </w:r>
+      <w:r>
+        <w:rPr>
+          <w:rFonts w:ascii="Consolas" w:hAnsi="Consolas"/>
+          <w:color w:val="1F4D78"/>
+          <w:sz w:val="19"/>
+        </w:rPr>
+        <w:t>4-3-4-3</w:t>
+      </w:r>
+      <w:r>
+        <w:rPr>
+          <w:rFonts w:ascii="Calibri" w:hAnsi="Calibri"/>
+          <w:sz w:val="22"/>
+        </w:rPr>
+        <w:t>, restarted at each stanza. Missing pronunciation produces a missing line fit, not zero. Fit is a similarity and confidence is rule-based; neither is a probability.</w:t>
+      </w:r>
+    </w:p>
+    <w:p>
+      <w:pPr>
+        <w:pStyle w:val="Heading2"/>
+      </w:pPr>
+      <w:r>
+        <w:rPr>
+          <w:rFonts w:ascii="Calibri" w:hAnsi="Calibri"/>
+          <w:sz w:val="22"/>
+        </w:rPr>
         <w:t>Worked synthetic example</w:t>
       </w:r>
     </w:p>
@@ -16242,6 +17688,120 @@
                 <w:sz w:val="18"/>
               </w:rPr>
               <w:t>Scenario-pinned link from a form to a verified exact source entry, applied only after ordinary matching fails</w:t>
+            </w:r>
+          </w:p>
+        </w:tc>
+      </w:tr>
+      <w:tr>
+        <w:trPr>
+          <w:cantSplit w:val="true"/>
+        </w:trPr>
+        <w:tc>
+          <w:tcPr>
+            <w:tcW w:type="dxa" w:w="3600"/>
+            <w:vAlign w:val="center"/>
+            <w:tcMar>
+              <w:top w:w="80" w:type="dxa"/>
+              <w:bottom w:w="80" w:type="dxa"/>
+              <w:start w:w="120" w:type="dxa"/>
+              <w:end w:w="120" w:type="dxa"/>
+            </w:tcMar>
+          </w:tcPr>
+          <w:p>
+            <w:pPr>
+              <w:widowControl/>
+              <w:spacing w:before="0" w:after="0" w:line="252" w:lineRule="auto"/>
+            </w:pPr>
+            <w:r/>
+            <w:r>
+              <w:rPr>
+                <w:rFonts w:ascii="Calibri" w:hAnsi="Calibri"/>
+                <w:sz w:val="18"/>
+              </w:rPr>
+              <w:t>Candidate meter</w:t>
+            </w:r>
+          </w:p>
+        </w:tc>
+        <w:tc>
+          <w:tcPr>
+            <w:tcW w:type="dxa" w:w="5760"/>
+            <w:vAlign w:val="center"/>
+            <w:tcMar>
+              <w:top w:w="80" w:type="dxa"/>
+              <w:bottom w:w="80" w:type="dxa"/>
+              <w:start w:w="120" w:type="dxa"/>
+              <w:end w:w="120" w:type="dxa"/>
+            </w:tcMar>
+          </w:tcPr>
+          <w:p>
+            <w:pPr>
+              <w:widowControl/>
+              <w:spacing w:before="0" w:after="0" w:line="252" w:lineRule="auto"/>
+            </w:pPr>
+            <w:r/>
+            <w:r>
+              <w:rPr>
+                <w:rFonts w:ascii="Calibri" w:hAnsi="Calibri"/>
+                <w:sz w:val="18"/>
+              </w:rPr>
+              <w:t>Nearest configured stress template or stanza-aware scheme; not definitive meter or performed rhythm</w:t>
+            </w:r>
+          </w:p>
+        </w:tc>
+      </w:tr>
+      <w:tr>
+        <w:trPr>
+          <w:cantSplit w:val="true"/>
+        </w:trPr>
+        <w:tc>
+          <w:tcPr>
+            <w:tcW w:type="dxa" w:w="3600"/>
+            <w:vAlign w:val="center"/>
+            <w:tcMar>
+              <w:top w:w="80" w:type="dxa"/>
+              <w:bottom w:w="80" w:type="dxa"/>
+              <w:start w:w="120" w:type="dxa"/>
+              <w:end w:w="120" w:type="dxa"/>
+            </w:tcMar>
+          </w:tcPr>
+          <w:p>
+            <w:pPr>
+              <w:widowControl/>
+              <w:spacing w:before="0" w:after="0" w:line="252" w:lineRule="auto"/>
+            </w:pPr>
+            <w:r/>
+            <w:r>
+              <w:rPr>
+                <w:rFonts w:ascii="Calibri" w:hAnsi="Calibri"/>
+                <w:sz w:val="18"/>
+              </w:rPr>
+              <w:t>Common meter</w:t>
+            </w:r>
+          </w:p>
+        </w:tc>
+        <w:tc>
+          <w:tcPr>
+            <w:tcW w:type="dxa" w:w="5760"/>
+            <w:vAlign w:val="center"/>
+            <w:tcMar>
+              <w:top w:w="80" w:type="dxa"/>
+              <w:bottom w:w="80" w:type="dxa"/>
+              <w:start w:w="120" w:type="dxa"/>
+              <w:end w:w="120" w:type="dxa"/>
+            </w:tcMar>
+          </w:tcPr>
+          <w:p>
+            <w:pPr>
+              <w:widowControl/>
+              <w:spacing w:before="0" w:after="0" w:line="252" w:lineRule="auto"/>
+            </w:pPr>
+            <w:r/>
+            <w:r>
+              <w:rPr>
+                <w:rFonts w:ascii="Calibri" w:hAnsi="Calibri"/>
+                <w:sz w:val="18"/>
+              </w:rPr>
+              <w:t>Stanza-aware alternating iambic tetrameter/trimeter scheme with foot-count cycle 4-3-4-3</w:t>
             </w:r>
           </w:p>
         </w:tc>
@@ -17655,6 +19215,177 @@
                 <w:rFonts w:ascii="Calibri" w:hAnsi="Calibri"/>
                 <w:sz w:val="18"/>
               </w:rPr>
+              <w:t>Meter fit</w:t>
+            </w:r>
+          </w:p>
+        </w:tc>
+        <w:tc>
+          <w:tcPr>
+            <w:tcW w:type="dxa" w:w="5760"/>
+            <w:vAlign w:val="center"/>
+            <w:tcMar>
+              <w:top w:w="80" w:type="dxa"/>
+              <w:bottom w:w="80" w:type="dxa"/>
+              <w:start w:w="120" w:type="dxa"/>
+              <w:end w:w="120" w:type="dxa"/>
+            </w:tcMar>
+          </w:tcPr>
+          <w:p>
+            <w:pPr>
+              <w:widowControl/>
+              <w:spacing w:before="0" w:after="0" w:line="252" w:lineRule="auto"/>
+            </w:pPr>
+            <w:r/>
+            <w:r>
+              <w:rPr>
+                <w:rFonts w:ascii="Calibri" w:hAnsi="Calibri"/>
+                <w:sz w:val="18"/>
+              </w:rPr>
+              <w:t>Configured 0-1 stress-alignment similarity; not a probability</w:t>
+            </w:r>
+          </w:p>
+        </w:tc>
+      </w:tr>
+      <w:tr>
+        <w:trPr>
+          <w:cantSplit w:val="true"/>
+        </w:trPr>
+        <w:tc>
+          <w:tcPr>
+            <w:tcW w:type="dxa" w:w="3600"/>
+            <w:vAlign w:val="center"/>
+            <w:tcMar>
+              <w:top w:w="80" w:type="dxa"/>
+              <w:bottom w:w="80" w:type="dxa"/>
+              <w:start w:w="120" w:type="dxa"/>
+              <w:end w:w="120" w:type="dxa"/>
+            </w:tcMar>
+          </w:tcPr>
+          <w:p>
+            <w:pPr>
+              <w:widowControl/>
+              <w:spacing w:before="0" w:after="0" w:line="252" w:lineRule="auto"/>
+            </w:pPr>
+            <w:r/>
+            <w:r>
+              <w:rPr>
+                <w:rFonts w:ascii="Calibri" w:hAnsi="Calibri"/>
+                <w:sz w:val="18"/>
+              </w:rPr>
+              <w:t>Meter line coverage</w:t>
+            </w:r>
+          </w:p>
+        </w:tc>
+        <w:tc>
+          <w:tcPr>
+            <w:tcW w:type="dxa" w:w="5760"/>
+            <w:vAlign w:val="center"/>
+            <w:tcMar>
+              <w:top w:w="80" w:type="dxa"/>
+              <w:bottom w:w="80" w:type="dxa"/>
+              <w:start w:w="120" w:type="dxa"/>
+              <w:end w:w="120" w:type="dxa"/>
+            </w:tcMar>
+          </w:tcPr>
+          <w:p>
+            <w:pPr>
+              <w:widowControl/>
+              <w:spacing w:before="0" w:after="0" w:line="252" w:lineRule="auto"/>
+            </w:pPr>
+            <w:r/>
+            <w:r>
+              <w:rPr>
+                <w:rFonts w:ascii="Calibri" w:hAnsi="Calibri"/>
+                <w:sz w:val="18"/>
+              </w:rPr>
+              <w:t>Analyzable eligible physical lines divided by all eligible physical lines</w:t>
+            </w:r>
+          </w:p>
+        </w:tc>
+      </w:tr>
+      <w:tr>
+        <w:trPr>
+          <w:cantSplit w:val="true"/>
+        </w:trPr>
+        <w:tc>
+          <w:tcPr>
+            <w:tcW w:type="dxa" w:w="3600"/>
+            <w:vAlign w:val="center"/>
+            <w:tcMar>
+              <w:top w:w="80" w:type="dxa"/>
+              <w:bottom w:w="80" w:type="dxa"/>
+              <w:start w:w="120" w:type="dxa"/>
+              <w:end w:w="120" w:type="dxa"/>
+            </w:tcMar>
+          </w:tcPr>
+          <w:p>
+            <w:pPr>
+              <w:widowControl/>
+              <w:spacing w:before="0" w:after="0" w:line="252" w:lineRule="auto"/>
+            </w:pPr>
+            <w:r/>
+            <w:r>
+              <w:rPr>
+                <w:rFonts w:ascii="Calibri" w:hAnsi="Calibri"/>
+                <w:sz w:val="18"/>
+              </w:rPr>
+              <w:t>Rule-based meter confidence</w:t>
+            </w:r>
+          </w:p>
+        </w:tc>
+        <w:tc>
+          <w:tcPr>
+            <w:tcW w:type="dxa" w:w="5760"/>
+            <w:vAlign w:val="center"/>
+            <w:tcMar>
+              <w:top w:w="80" w:type="dxa"/>
+              <w:bottom w:w="80" w:type="dxa"/>
+              <w:start w:w="120" w:type="dxa"/>
+              <w:end w:w="120" w:type="dxa"/>
+            </w:tcMar>
+          </w:tcPr>
+          <w:p>
+            <w:pPr>
+              <w:widowControl/>
+              <w:spacing w:before="0" w:after="0" w:line="252" w:lineRule="auto"/>
+            </w:pPr>
+            <w:r/>
+            <w:r>
+              <w:rPr>
+                <w:rFonts w:ascii="Calibri" w:hAnsi="Calibri"/>
+                <w:sz w:val="18"/>
+              </w:rPr>
+              <w:t>Configured category from evidence count, coverage, fit, candidate margin, and matching lines; not a calibrated probability</w:t>
+            </w:r>
+          </w:p>
+        </w:tc>
+      </w:tr>
+      <w:tr>
+        <w:trPr>
+          <w:cantSplit w:val="true"/>
+        </w:trPr>
+        <w:tc>
+          <w:tcPr>
+            <w:tcW w:type="dxa" w:w="3600"/>
+            <w:vAlign w:val="center"/>
+            <w:tcMar>
+              <w:top w:w="80" w:type="dxa"/>
+              <w:bottom w:w="80" w:type="dxa"/>
+              <w:start w:w="120" w:type="dxa"/>
+              <w:end w:w="120" w:type="dxa"/>
+            </w:tcMar>
+          </w:tcPr>
+          <w:p>
+            <w:pPr>
+              <w:widowControl/>
+              <w:spacing w:before="0" w:after="0" w:line="252" w:lineRule="auto"/>
+            </w:pPr>
+            <w:r/>
+            <w:r>
+              <w:rPr>
+                <w:rFonts w:ascii="Calibri" w:hAnsi="Calibri"/>
+                <w:sz w:val="18"/>
+              </w:rPr>
               <w:t>Protected word</w:t>
             </w:r>
           </w:p>
@@ -19706,7 +21437,7 @@
           <w:rFonts w:ascii="Calibri" w:hAnsi="Calibri"/>
           <w:sz w:val="22"/>
         </w:rPr>
-        <w:t>Stage 5 includes no grapheme-to-phoneme prediction, candidate meter, rhyme,</w:t>
+        <w:t>Stage 5 includes no grapheme-to-phoneme prediction or hidden pronunciation</w:t>
       </w:r>
     </w:p>
     <w:p>
@@ -19719,7 +21450,7 @@
           <w:rFonts w:ascii="Calibri" w:hAnsi="Calibri"/>
           <w:sz w:val="22"/>
         </w:rPr>
-        <w:t xml:space="preserve">  or definitive performed scansion.</w:t>
+        <w:t xml:space="preserve">  selection. Its own tab does not classify meter or rhyme.</w:t>
       </w:r>
     </w:p>
     <w:p>
@@ -19755,6 +21486,130 @@
     </w:p>
     <w:p>
       <w:pPr>
+        <w:widowControl/>
+        <w:numPr>
+          <w:ilvl w:val="0"/>
+          <w:numId w:val="10"/>
+        </w:numPr>
+        <w:spacing w:before="0" w:after="80" w:line="300" w:lineRule="auto"/>
+        <w:ind w:left="540" w:hanging="271"/>
+      </w:pPr>
+      <w:r>
+        <w:rPr>
+          <w:rFonts w:ascii="Calibri" w:hAnsi="Calibri"/>
+          <w:sz w:val="22"/>
+        </w:rPr>
+        <w:t>Stage 6 meter starts from dictionary lexical stress; contextual promotion,</w:t>
+      </w:r>
+    </w:p>
+    <w:p>
+      <w:pPr>
+        <w:widowControl/>
+        <w:spacing w:before="0" w:after="120" w:line="300" w:lineRule="auto"/>
+      </w:pPr>
+      <w:r>
+        <w:rPr>
+          <w:rFonts w:ascii="Calibri" w:hAnsi="Calibri"/>
+          <w:sz w:val="22"/>
+        </w:rPr>
+        <w:t xml:space="preserve">  demotion, dialect, historical pronunciation, elision, and performance may   support a different scansion.</w:t>
+      </w:r>
+    </w:p>
+    <w:p>
+      <w:pPr>
+        <w:widowControl/>
+        <w:numPr>
+          <w:ilvl w:val="0"/>
+          <w:numId w:val="10"/>
+        </w:numPr>
+        <w:spacing w:before="0" w:after="80" w:line="300" w:lineRule="auto"/>
+        <w:ind w:left="540" w:hanging="271"/>
+      </w:pPr>
+      <w:r>
+        <w:rPr>
+          <w:rFonts w:ascii="Calibri" w:hAnsi="Calibri"/>
+          <w:sz w:val="22"/>
+        </w:rPr>
+        <w:t>Meter costs, thresholds, fit, and confidence are transparent heuristics, not</w:t>
+      </w:r>
+    </w:p>
+    <w:p>
+      <w:pPr>
+        <w:widowControl/>
+        <w:spacing w:before="0" w:after="120" w:line="300" w:lineRule="auto"/>
+      </w:pPr>
+      <w:r>
+        <w:rPr>
+          <w:rFonts w:ascii="Calibri" w:hAnsi="Calibri"/>
+          <w:sz w:val="22"/>
+        </w:rPr>
+        <w:t xml:space="preserve">  a probability model or validation against every poetic tradition.</w:t>
+      </w:r>
+    </w:p>
+    <w:p>
+      <w:pPr>
+        <w:widowControl/>
+        <w:numPr>
+          <w:ilvl w:val="0"/>
+          <w:numId w:val="10"/>
+        </w:numPr>
+        <w:spacing w:before="0" w:after="80" w:line="300" w:lineRule="auto"/>
+        <w:ind w:left="540" w:hanging="271"/>
+      </w:pPr>
+      <w:r>
+        <w:rPr>
+          <w:rFonts w:ascii="Calibri" w:hAnsi="Calibri"/>
+          <w:sz w:val="22"/>
+        </w:rPr>
+        <w:t>Common meter is the only stanza-aware alternating scheme currently</w:t>
+      </w:r>
+    </w:p>
+    <w:p>
+      <w:pPr>
+        <w:widowControl/>
+        <w:spacing w:before="0" w:after="120" w:line="300" w:lineRule="auto"/>
+      </w:pPr>
+      <w:r>
+        <w:rPr>
+          <w:rFonts w:ascii="Calibri" w:hAnsi="Calibri"/>
+          <w:sz w:val="22"/>
+        </w:rPr>
+        <w:t xml:space="preserve">  implemented; rhyme remains Stage 7.</w:t>
+      </w:r>
+    </w:p>
+    <w:p>
+      <w:pPr>
+        <w:widowControl/>
+        <w:numPr>
+          <w:ilvl w:val="0"/>
+          <w:numId w:val="10"/>
+        </w:numPr>
+        <w:spacing w:before="0" w:after="80" w:line="300" w:lineRule="auto"/>
+        <w:ind w:left="540" w:hanging="271"/>
+      </w:pPr>
+      <w:r>
+        <w:rPr>
+          <w:rFonts w:ascii="Calibri" w:hAnsi="Calibri"/>
+          <w:sz w:val="22"/>
+        </w:rPr>
+        <w:t>Meter &amp; Rhythm is currently an optional one-poem in-memory module; it is not</w:t>
+      </w:r>
+    </w:p>
+    <w:p>
+      <w:pPr>
+        <w:widowControl/>
+        <w:spacing w:before="0" w:after="120" w:line="300" w:lineRule="auto"/>
+      </w:pPr>
+      <w:r>
+        <w:rPr>
+          <w:rFonts w:ascii="Calibri" w:hAnsi="Calibri"/>
+          <w:sz w:val="22"/>
+        </w:rPr>
+        <w:t xml:space="preserve">  yet persisted or aggregated in corpus projects.</w:t>
+      </w:r>
+    </w:p>
+    <w:p>
+      <w:pPr>
         <w:pStyle w:val="Heading1"/>
       </w:pPr>
       <w:r>
@@ -19775,7 +21630,7 @@
           <w:rFonts w:ascii="Calibri" w:hAnsi="Calibri"/>
           <w:sz w:val="22"/>
         </w:rPr>
-        <w:t>Every analysis should retain the active lexicon or optional research resource, source checksum, adapter version, software version, preprocessing recipe and configuration ID, phrase policy, stopword policy, scenario, and inclusion decisions. Completed corpus runs remain linked to preserved text versions. A concreteness result additionally retains its orientation thresholds, proper-name and phrase policies, low-coverage threshold, source-row matches, and exact workbook checksum. A frequency result retains its Zipf-band thresholds, proper-name policy, exact-before-lemma rule, optional content-word scope, low-coverage threshold, source-row matches, and exact SUBTLEX-US workbook checksum. An AoA result retains early/later thresholds, proper-name policy, exact-before-lemma rule, optional contextual content-word scope, coverage and source-response cautions, source-row matches, optional relationship methods, and the exact official erratum-supplement checksum. A pronunciation result retains every dictionary candidate, three exact source checksums, package and adapter versions, exact observed-form policy, thresholds, scholar overrides and notes, configuration identity, missingness, and physical-line completeness.</w:t>
+        <w:t>Every analysis should retain the active lexicon or optional research resource, source checksum, adapter version, software version, preprocessing recipe and configuration ID, phrase policy, stopword policy, scenario, and inclusion decisions. Completed corpus runs remain linked to preserved text versions. A concreteness result additionally retains its orientation thresholds, proper-name and phrase policies, low-coverage threshold, source-row matches, and exact workbook checksum. A frequency result retains its Zipf-band thresholds, proper-name policy, exact-before-lemma rule, optional content-word scope, low-coverage threshold, source-row matches, and exact SUBTLEX-US workbook checksum. An AoA result retains early/later thresholds, proper-name policy, exact-before-lemma rule, optional contextual content-word scope, coverage and source-response cautions, source-row matches, optional relationship methods, and the exact official erratum-supplement checksum. A pronunciation result retains every dictionary candidate, three exact source checksums, package and adapter versions, exact observed-form policy, thresholds, scholar overrides and notes, configuration identity, missingness, and physical-line completeness. A meter result retains the linked pronunciation configuration, every penalty and threshold, all fixed and scheme candidates, candidate-specific stress paths, line coverage, alignment operations, deviations, fit, confidence explanation, and dependency resource hashes.</w:t>
       </w:r>
     </w:p>
     <w:p>
@@ -20042,7 +21897,7 @@
         <w:color w:val="66727C"/>
         <w:sz w:val="18"/>
       </w:rPr>
-      <w:t xml:space="preserve">  |  0.11.0.dev0</w:t>
+      <w:t xml:space="preserve">  |  0.12.0.dev0</w:t>
     </w:r>
   </w:p>
 </w:hdr>

</xml_diff>

<commit_message>
Complete Poetic Fingerprint Stage 7
</commit_message>
<xml_diff>
--- a/docs/VerseVAD_User_Manual.docx
+++ b/docs/VerseVAD_User_Manual.docx
@@ -47,7 +47,7 @@
           <w:color w:val="66727C"/>
           <w:sz w:val="21"/>
         </w:rPr>
-        <w:t xml:space="preserve"> 0.12.0.dev0</w:t>
+        <w:t xml:space="preserve"> 0.13.0.dev0</w:t>
       </w:r>
       <w:r>
         <w:rPr>
@@ -1071,22 +1071,38 @@
           <w:rFonts w:ascii="Calibri" w:hAnsi="Calibri"/>
           <w:sz w:val="22"/>
         </w:rPr>
-        <w:t xml:space="preserve">  from monometer through octameter, stanza-aware common meter as iambic   </w:t>
-      </w:r>
-      <w:r>
-        <w:rPr>
-          <w:rFonts w:ascii="Consolas" w:hAnsi="Consolas"/>
-          <w:color w:val="1F4D78"/>
-          <w:sz w:val="19"/>
-        </w:rPr>
-        <w:t>4-3-4-3</w:t>
-      </w:r>
-      <w:r>
-        <w:rPr>
-          <w:rFonts w:ascii="Calibri" w:hAnsi="Calibri"/>
-          <w:sz w:val="22"/>
-        </w:rPr>
-        <w:t>, line/scheme fit, deviations, alternatives, coverage, and a   complete alignment audit.</w:t>
+        <w:t xml:space="preserve">  from monometer through octameter, line fit, deviations, alternatives,   coverage, and a complete alignment audit; and</w:t>
+      </w:r>
+    </w:p>
+    <w:p>
+      <w:pPr>
+        <w:widowControl/>
+        <w:numPr>
+          <w:ilvl w:val="0"/>
+          <w:numId w:val="10"/>
+        </w:numPr>
+        <w:spacing w:before="0" w:after="80" w:line="300" w:lineRule="auto"/>
+        <w:ind w:left="540" w:hanging="271"/>
+      </w:pPr>
+      <w:r>
+        <w:rPr>
+          <w:rFonts w:ascii="Calibri" w:hAnsi="Calibri"/>
+          <w:sz w:val="22"/>
+        </w:rPr>
+        <w:t>optional exact end-rhyme schemes, perfect/identical and</w:t>
+      </w:r>
+    </w:p>
+    <w:p>
+      <w:pPr>
+        <w:widowControl/>
+        <w:spacing w:before="0" w:after="120" w:line="300" w:lineRule="auto"/>
+      </w:pPr>
+      <w:r>
+        <w:rPr>
+          <w:rFonts w:ascii="Calibri" w:hAnsi="Calibri"/>
+          <w:sz w:val="22"/>
+        </w:rPr>
+        <w:t xml:space="preserve">  masculine/feminine/multisyllabic evidence, graded slant and eye rhyme,   internal rhyme, refrains, phonemic alliteration, assonance, consonance,   line-ending coverage, and complete line/pair audit evidence.</w:t>
       </w:r>
     </w:p>
     <w:p>
@@ -7464,60 +7480,6 @@
           <w:rFonts w:ascii="Calibri" w:hAnsi="Calibri"/>
           <w:sz w:val="22"/>
         </w:rPr>
-        <w:t xml:space="preserve">Stage 6 also checks </w:t>
-      </w:r>
-      <w:r>
-        <w:rPr>
-          <w:rFonts w:ascii="Calibri" w:hAnsi="Calibri"/>
-          <w:b/>
-          <w:sz w:val="22"/>
-        </w:rPr>
-        <w:t>Common meter (alternating iambic tetrameter/trimeter)</w:t>
-      </w:r>
-      <w:r>
-        <w:rPr>
-          <w:rFonts w:ascii="Calibri" w:hAnsi="Calibri"/>
-          <w:sz w:val="22"/>
-        </w:rPr>
-        <w:t xml:space="preserve"> as a stanza-aware cycle:</w:t>
-      </w:r>
-    </w:p>
-    <w:p>
-      <w:pPr>
-        <w:pStyle w:val="Formula"/>
-      </w:pPr>
-      <w:r>
-        <w:rPr>
-          <w:rFonts w:ascii="Consolas" w:hAnsi="Consolas"/>
-          <w:color w:val="1F4D78"/>
-          <w:sz w:val="19"/>
-        </w:rPr>
-        <w:t>4-3-4-3 = tetrameter, trimeter, tetrameter, trimeter</w:t>
-      </w:r>
-    </w:p>
-    <w:p>
-      <w:pPr>
-        <w:widowControl/>
-        <w:spacing w:before="0" w:after="120" w:line="300" w:lineRule="auto"/>
-      </w:pPr>
-      <w:r>
-        <w:rPr>
-          <w:rFonts w:ascii="Calibri" w:hAnsi="Calibri"/>
-          <w:sz w:val="22"/>
-        </w:rPr>
-        <w:t>The cycle restarts at each preserved stanza. At least one complete four-line stanza is required before common meter can become the poem-level nearest scheme. Partial stanzas remain visible as incomplete scheme evidence.</w:t>
-      </w:r>
-    </w:p>
-    <w:p>
-      <w:pPr>
-        <w:widowControl/>
-        <w:spacing w:before="0" w:after="120" w:line="300" w:lineRule="auto"/>
-      </w:pPr>
-      <w:r>
-        <w:rPr>
-          <w:rFonts w:ascii="Calibri" w:hAnsi="Calibri"/>
-          <w:sz w:val="22"/>
-        </w:rPr>
         <w:t>The line alignment can report substitutions, initial inversion, feminine ending, catalexis, and extra or omitted syllables. Multiple retained CMUdict stress alternatives are explored up to the configured line limit, but the metrically preferred path is not promoted to a dictionary or performance fact. A line with missing pronunciation evidence remains unscored.</w:t>
       </w:r>
     </w:p>
@@ -7549,7 +7511,7 @@
           <w:rFonts w:ascii="Calibri" w:hAnsi="Calibri"/>
           <w:sz w:val="22"/>
         </w:rPr>
-        <w:t>nearest candidate and whether it is a fixed template or alternating scheme;</w:t>
+        <w:t>nearest fixed pattern-by-foot-count candidate;</w:t>
       </w:r>
     </w:p>
     <w:p>
@@ -7616,7 +7578,7 @@
           <w:rFonts w:ascii="Calibri" w:hAnsi="Calibri"/>
           <w:sz w:val="22"/>
         </w:rPr>
-        <w:t>common-meter fit and complete-stanza coverage;</w:t>
+        <w:t>physical-line stress paths, alignments, and deviations; and</w:t>
       </w:r>
     </w:p>
     <w:p>
@@ -7634,7 +7596,7 @@
           <w:rFonts w:ascii="Calibri" w:hAnsi="Calibri"/>
           <w:sz w:val="22"/>
         </w:rPr>
-        <w:t>physical-line stress paths, alignments, deviations, and expected</w:t>
+        <w:t>all 40 fixed candidates, warnings, configuration, and provenance.</w:t>
       </w:r>
     </w:p>
     <w:p>
@@ -7647,7 +7609,103 @@
           <w:rFonts w:ascii="Calibri" w:hAnsi="Calibri"/>
           <w:sz w:val="22"/>
         </w:rPr>
-        <w:t xml:space="preserve">  common-meter foot counts; and</w:t>
+        <w:t>Fit is a configured alignment similarity from 0 to 1, not a probability. Confidence is a rule-based category, not a calibrated probability. Safe wording is: “The nearest configured candidate was iambic pentameter under the selected alignment configuration.” Do not write: “VerseVAD proved the poem is in iambic pentameter,” “this is the correct scansion,” or “the poet performed the line this way.”</w:t>
+      </w:r>
+    </w:p>
+    <w:p>
+      <w:pPr>
+        <w:pStyle w:val="Heading2"/>
+      </w:pPr>
+      <w:r>
+        <w:rPr>
+          <w:rFonts w:ascii="Calibri" w:hAnsi="Calibri"/>
+          <w:sz w:val="22"/>
+        </w:rPr>
+        <w:t>Rhyme and phonological patterns</w:t>
+      </w:r>
+    </w:p>
+    <w:p>
+      <w:pPr>
+        <w:widowControl/>
+        <w:spacing w:before="0" w:after="120" w:line="300" w:lineRule="auto"/>
+      </w:pPr>
+      <w:r>
+        <w:rPr>
+          <w:rFonts w:ascii="Calibri" w:hAnsi="Calibri"/>
+          <w:sz w:val="22"/>
+        </w:rPr>
+        <w:t xml:space="preserve">When enabled, </w:t>
+      </w:r>
+      <w:r>
+        <w:rPr>
+          <w:rFonts w:ascii="Calibri" w:hAnsi="Calibri"/>
+          <w:b/>
+          <w:sz w:val="22"/>
+        </w:rPr>
+        <w:t>Rhyme &amp; Sound</w:t>
+      </w:r>
+      <w:r>
+        <w:rPr>
+          <w:rFonts w:ascii="Calibri" w:hAnsi="Calibri"/>
+          <w:sz w:val="22"/>
+        </w:rPr>
+        <w:t xml:space="preserve"> automatically uses the retained Stage 5 pronunciation evidence. No affective lexicon is required. CMUdict supplies phones and lexical stress; VerseVAD derives the rhyme and recurring-sound classifications.</w:t>
+      </w:r>
+    </w:p>
+    <w:p>
+      <w:pPr>
+        <w:widowControl/>
+        <w:spacing w:before="0" w:after="120" w:line="300" w:lineRule="auto"/>
+      </w:pPr>
+      <w:r>
+        <w:rPr>
+          <w:rFonts w:ascii="Calibri" w:hAnsi="Calibri"/>
+          <w:sz w:val="22"/>
+        </w:rPr>
+        <w:t xml:space="preserve">The whole-poem and stanza schemes use only robust perfect or identical rhyme parts. Letters identify exact groups, </w:t>
+      </w:r>
+      <w:r>
+        <w:rPr>
+          <w:rFonts w:ascii="Consolas" w:hAnsi="Consolas"/>
+          <w:color w:val="1F4D78"/>
+          <w:sz w:val="19"/>
+        </w:rPr>
+        <w:t>x</w:t>
+      </w:r>
+      <w:r>
+        <w:rPr>
+          <w:rFonts w:ascii="Calibri" w:hAnsi="Calibri"/>
+          <w:sz w:val="22"/>
+        </w:rPr>
+        <w:t xml:space="preserve"> identifies an analyzable ungrouped ending, and </w:t>
+      </w:r>
+      <w:r>
+        <w:rPr>
+          <w:rFonts w:ascii="Consolas" w:hAnsi="Consolas"/>
+          <w:color w:val="1F4D78"/>
+          <w:sz w:val="19"/>
+        </w:rPr>
+        <w:t>?</w:t>
+      </w:r>
+      <w:r>
+        <w:rPr>
+          <w:rFonts w:ascii="Calibri" w:hAnsi="Calibri"/>
+          <w:sz w:val="22"/>
+        </w:rPr>
+        <w:t xml:space="preserve"> identifies an unresolved ending. Slant and eye rhyme remain separate and never create exact scheme groups.</w:t>
+      </w:r>
+    </w:p>
+    <w:p>
+      <w:pPr>
+        <w:widowControl/>
+        <w:spacing w:before="0" w:after="120" w:line="300" w:lineRule="auto"/>
+      </w:pPr>
+      <w:r>
+        <w:rPr>
+          <w:rFonts w:ascii="Calibri" w:hAnsi="Calibri"/>
+          <w:sz w:val="22"/>
+        </w:rPr>
+        <w:t>Read:</w:t>
       </w:r>
     </w:p>
     <w:p>
@@ -7665,108 +7723,7 @@
           <w:rFonts w:ascii="Calibri" w:hAnsi="Calibri"/>
           <w:sz w:val="22"/>
         </w:rPr>
-        <w:t>all 40 fixed candidates, warnings, configuration, and provenance.</w:t>
-      </w:r>
-    </w:p>
-    <w:p>
-      <w:pPr>
-        <w:widowControl/>
-        <w:spacing w:before="0" w:after="120" w:line="300" w:lineRule="auto"/>
-      </w:pPr>
-      <w:r>
-        <w:rPr>
-          <w:rFonts w:ascii="Calibri" w:hAnsi="Calibri"/>
-          <w:sz w:val="22"/>
-        </w:rPr>
-        <w:t>Fit is a configured alignment similarity from 0 to 1, not a probability. Confidence is a rule-based category, not a calibrated probability. Safe wording is: “The nearest configured candidate was common meter under the selected alignment configuration.” Do not write: “VerseVAD proved the poem is in common meter,” “this is the correct scansion,” or “the poet performed the line this way.”</w:t>
-      </w:r>
-    </w:p>
-    <w:p>
-      <w:pPr>
-        <w:pStyle w:val="Heading2"/>
-      </w:pPr>
-      <w:r>
-        <w:rPr>
-          <w:rFonts w:ascii="Calibri" w:hAnsi="Calibri"/>
-          <w:sz w:val="22"/>
-        </w:rPr>
-        <w:t>Eight emotion associations</w:t>
-      </w:r>
-    </w:p>
-    <w:p>
-      <w:pPr>
-        <w:widowControl/>
-        <w:spacing w:before="0" w:after="120" w:line="300" w:lineRule="auto"/>
-      </w:pPr>
-      <w:r>
-        <w:rPr>
-          <w:rFonts w:ascii="Calibri" w:hAnsi="Calibri"/>
-          <w:sz w:val="22"/>
-        </w:rPr>
-        <w:t>NRC Emotion values are binary, multi-label associations. VerseVAD reports the eight emotions—anger, anticipation, disgust, fear, joy, sadness, surprise, and trust—in their own section. An entry can be associated with several categories, so percentages do not need to total 100 percent. Read the labeled denominator.</w:t>
-      </w:r>
-    </w:p>
-    <w:p>
-      <w:pPr>
-        <w:widowControl/>
-        <w:spacing w:before="0" w:after="120" w:line="300" w:lineRule="auto"/>
-      </w:pPr>
-      <w:r>
-        <w:rPr>
-          <w:rFonts w:ascii="Calibri" w:hAnsi="Calibri"/>
-          <w:sz w:val="22"/>
-        </w:rPr>
-        <w:t>“Fear-associated vocabulary” is appropriate wording. “The poem is afraid” is not.</w:t>
-      </w:r>
-    </w:p>
-    <w:p>
-      <w:pPr>
-        <w:pStyle w:val="Heading2"/>
-      </w:pPr>
-      <w:r>
-        <w:rPr>
-          <w:rFonts w:ascii="Calibri" w:hAnsi="Calibri"/>
-          <w:sz w:val="22"/>
-        </w:rPr>
-        <w:t>Positive and negative sentiment associations</w:t>
-      </w:r>
-    </w:p>
-    <w:p>
-      <w:pPr>
-        <w:widowControl/>
-        <w:spacing w:before="0" w:after="120" w:line="300" w:lineRule="auto"/>
-      </w:pPr>
-      <w:r>
-        <w:rPr>
-          <w:rFonts w:ascii="Calibri" w:hAnsi="Calibri"/>
-          <w:sz w:val="22"/>
-        </w:rPr>
-        <w:t>Positive and negative are broad sentiment labels in NRC Emotion. VerseVAD analyzes them with the same documented occurrence-counting logic but reports them separately from the eight emotions. They are not endpoints of the VAD valence scale, and their rates need not sum to 100 percent.</w:t>
-      </w:r>
-    </w:p>
-    <w:p>
-      <w:pPr>
-        <w:pStyle w:val="Heading2"/>
-      </w:pPr>
-      <w:r>
-        <w:rPr>
-          <w:rFonts w:ascii="Calibri" w:hAnsi="Calibri"/>
-          <w:sz w:val="22"/>
-        </w:rPr>
-        <w:t>Emotion intensity</w:t>
-      </w:r>
-    </w:p>
-    <w:p>
-      <w:pPr>
-        <w:widowControl/>
-        <w:spacing w:before="0" w:after="120" w:line="300" w:lineRule="auto"/>
-      </w:pPr>
-      <w:r>
-        <w:rPr>
-          <w:rFonts w:ascii="Calibri" w:hAnsi="Calibri"/>
-          <w:sz w:val="22"/>
-        </w:rPr>
-        <w:t>NRC Emotion Intensity supplies numeric values only for particular word-emotion pairs. VerseVAD keeps:</w:t>
+        <w:t>ending coverage, whole-poem scheme, and stanza schemes;</w:t>
       </w:r>
     </w:p>
     <w:p>
@@ -7784,7 +7741,7 @@
           <w:rFonts w:ascii="Calibri" w:hAnsi="Calibri"/>
           <w:sz w:val="22"/>
         </w:rPr>
-        <w:t>prevalence of matched pairs;</w:t>
+        <w:t>perfect, identical, masculine, feminine, and multisyllabic pair evidence;</w:t>
       </w:r>
     </w:p>
     <w:p>
@@ -7802,7 +7759,7 @@
           <w:rFonts w:ascii="Calibri" w:hAnsi="Calibri"/>
           <w:sz w:val="22"/>
         </w:rPr>
-        <w:t>token-weighted mean intensity among supplied pairs;</w:t>
+        <w:t>the conservative graded slant score and its five components;</w:t>
       </w:r>
     </w:p>
     <w:p>
@@ -7820,168 +7777,7 @@
           <w:rFonts w:ascii="Calibri" w:hAnsi="Calibri"/>
           <w:sz w:val="22"/>
         </w:rPr>
-        <w:t>type-weighted mean intensity among supplied pairs.</w:t>
-      </w:r>
-    </w:p>
-    <w:p>
-      <w:pPr>
-        <w:widowControl/>
-        <w:spacing w:before="0" w:after="120" w:line="300" w:lineRule="auto"/>
-      </w:pPr>
-      <w:r>
-        <w:rPr>
-          <w:rFonts w:ascii="Calibri" w:hAnsi="Calibri"/>
-          <w:sz w:val="22"/>
-        </w:rPr>
-        <w:t>An absent word-emotion pair is missing, not an intensity of zero.</w:t>
-      </w:r>
-    </w:p>
-    <w:p>
-      <w:pPr>
-        <w:pStyle w:val="Heading1"/>
-      </w:pPr>
-      <w:r>
-        <w:rPr>
-          <w:rFonts w:ascii="Calibri" w:hAnsi="Calibri"/>
-          <w:sz w:val="22"/>
-        </w:rPr>
-        <w:t>8. One Poem Workspace</w:t>
-      </w:r>
-    </w:p>
-    <w:p>
-      <w:pPr>
-        <w:pStyle w:val="Heading2"/>
-      </w:pPr>
-      <w:r>
-        <w:rPr>
-          <w:rFonts w:ascii="Calibri" w:hAnsi="Calibri"/>
-          <w:sz w:val="22"/>
-        </w:rPr>
-        <w:t>Add a poem</w:t>
-      </w:r>
-    </w:p>
-    <w:p>
-      <w:pPr>
-        <w:widowControl/>
-        <w:spacing w:before="0" w:after="120" w:line="300" w:lineRule="auto"/>
-      </w:pPr>
-      <w:r>
-        <w:rPr>
-          <w:rFonts w:ascii="Calibri" w:hAnsi="Calibri"/>
-          <w:sz w:val="22"/>
-        </w:rPr>
-        <w:t xml:space="preserve">Paste text or upload one UTF-8 </w:t>
-      </w:r>
-      <w:r>
-        <w:rPr>
-          <w:rFonts w:ascii="Consolas" w:hAnsi="Consolas"/>
-          <w:color w:val="1F4D78"/>
-          <w:sz w:val="19"/>
-        </w:rPr>
-        <w:t>.txt</w:t>
-      </w:r>
-      <w:r>
-        <w:rPr>
-          <w:rFonts w:ascii="Calibri" w:hAnsi="Calibri"/>
-          <w:sz w:val="22"/>
-        </w:rPr>
-        <w:t xml:space="preserve"> file up to 5 MB. Enter a title or working label. The optional workspace name labels the temporary session but does not create a persistent corpus project.</w:t>
-      </w:r>
-    </w:p>
-    <w:p>
-      <w:pPr>
-        <w:pStyle w:val="Heading2"/>
-      </w:pPr>
-      <w:r>
-        <w:rPr>
-          <w:rFonts w:ascii="Calibri" w:hAnsi="Calibri"/>
-          <w:sz w:val="22"/>
-        </w:rPr>
-        <w:t>Choose evidence</w:t>
-      </w:r>
-    </w:p>
-    <w:p>
-      <w:pPr>
-        <w:widowControl/>
-        <w:spacing w:before="0" w:after="120" w:line="300" w:lineRule="auto"/>
-      </w:pPr>
-      <w:r>
-        <w:rPr>
-          <w:rFonts w:ascii="Calibri" w:hAnsi="Calibri"/>
-          <w:sz w:val="22"/>
-        </w:rPr>
-        <w:t>Select one or more affective lexicons and/or enable the optional normative lexical concreteness, SUBTLEX-US frequency, Kuperman Age of Acquisition, CMUdict pronunciation/prosody-foundation, and candidate-meter modules. VAD, categorical association, intensity, concreteness, corpus-relative frequency, retrospective lexical AoA, dictionary pronunciation/lexical stress, and configured meter fit answer different questions and remain separate. Any optional module can run by itself when its exact local source is available; selecting meter automatically runs its pronunciation dependency.</w:t>
-      </w:r>
-    </w:p>
-    <w:p>
-      <w:pPr>
-        <w:widowControl/>
-        <w:spacing w:before="0" w:after="120" w:line="300" w:lineRule="auto"/>
-      </w:pPr>
-      <w:r>
-        <w:rPr>
-          <w:rFonts w:ascii="Calibri" w:hAnsi="Calibri"/>
-          <w:sz w:val="22"/>
-        </w:rPr>
-        <w:t xml:space="preserve">Concreteness, Frequency, AoA, Pronunciation &amp; Prosody, and Meter &amp; Rhythm are currently temporary </w:t>
-      </w:r>
-      <w:r>
-        <w:rPr>
-          <w:rFonts w:ascii="Calibri" w:hAnsi="Calibri"/>
-          <w:b/>
-          <w:sz w:val="22"/>
-        </w:rPr>
-        <w:t>One Poem</w:t>
-      </w:r>
-      <w:r>
-        <w:rPr>
-          <w:rFonts w:ascii="Calibri" w:hAnsi="Calibri"/>
-          <w:sz w:val="22"/>
-        </w:rPr>
-        <w:t xml:space="preserve"> modules. They are not yet batched, persisted, aggregated, or exported by </w:t>
-      </w:r>
-      <w:r>
-        <w:rPr>
-          <w:rFonts w:ascii="Calibri" w:hAnsi="Calibri"/>
-          <w:b/>
-          <w:sz w:val="22"/>
-        </w:rPr>
-        <w:t>Projects &amp; Corpus</w:t>
-      </w:r>
-      <w:r>
-        <w:rPr>
-          <w:rFonts w:ascii="Calibri" w:hAnsi="Calibri"/>
-          <w:sz w:val="22"/>
-        </w:rPr>
-        <w:t>.</w:t>
-      </w:r>
-    </w:p>
-    <w:p>
-      <w:pPr>
-        <w:widowControl/>
-        <w:spacing w:before="0" w:after="120" w:line="300" w:lineRule="auto"/>
-      </w:pPr>
-      <w:r>
-        <w:rPr>
-          <w:rFonts w:ascii="Calibri" w:hAnsi="Calibri"/>
-          <w:sz w:val="22"/>
-        </w:rPr>
-        <w:t xml:space="preserve">Under </w:t>
-      </w:r>
-      <w:r>
-        <w:rPr>
-          <w:rFonts w:ascii="Calibri" w:hAnsi="Calibri"/>
-          <w:b/>
-          <w:sz w:val="22"/>
-        </w:rPr>
-        <w:t>Advanced methodology settings</w:t>
-      </w:r>
-      <w:r>
-        <w:rPr>
-          <w:rFonts w:ascii="Calibri" w:hAnsi="Calibri"/>
-          <w:sz w:val="22"/>
-        </w:rPr>
-        <w:t>, choose:</w:t>
+        <w:t>spelling-based eye rhyme, exact internal rhyme, and repeated-line refrains;</w:t>
       </w:r>
     </w:p>
     <w:p>
@@ -7999,7 +7795,20 @@
           <w:rFonts w:ascii="Calibri" w:hAnsi="Calibri"/>
           <w:sz w:val="22"/>
         </w:rPr>
-        <w:t>phrase policy;</w:t>
+        <w:t>phonemic alliteration, assonance, consonance, densities, and dominant sound</w:t>
+      </w:r>
+    </w:p>
+    <w:p>
+      <w:pPr>
+        <w:widowControl/>
+        <w:spacing w:before="0" w:after="120" w:line="300" w:lineRule="auto"/>
+      </w:pPr>
+      <w:r>
+        <w:rPr>
+          <w:rFonts w:ascii="Calibri" w:hAnsi="Calibri"/>
+          <w:sz w:val="22"/>
+        </w:rPr>
+        <w:t xml:space="preserve">  families; and</w:t>
       </w:r>
     </w:p>
     <w:p>
@@ -8017,7 +7826,211 @@
           <w:rFonts w:ascii="Calibri" w:hAnsi="Calibri"/>
           <w:sz w:val="22"/>
         </w:rPr>
-        <w:t>minimum matched observations for sparse-result warnings;</w:t>
+        <w:t>line and pair evidence, warnings, configuration, and provenance.</w:t>
+      </w:r>
+    </w:p>
+    <w:p>
+      <w:pPr>
+        <w:widowControl/>
+        <w:spacing w:before="0" w:after="120" w:line="300" w:lineRule="auto"/>
+      </w:pPr>
+      <w:r>
+        <w:rPr>
+          <w:rFonts w:ascii="Calibri" w:hAnsi="Calibri"/>
+          <w:sz w:val="22"/>
+        </w:rPr>
+        <w:t xml:space="preserve">The default slant score weights stressed vowel </w:t>
+      </w:r>
+      <w:r>
+        <w:rPr>
+          <w:rFonts w:ascii="Consolas" w:hAnsi="Consolas"/>
+          <w:color w:val="1F4D78"/>
+          <w:sz w:val="19"/>
+        </w:rPr>
+        <w:t>0.35</w:t>
+      </w:r>
+      <w:r>
+        <w:rPr>
+          <w:rFonts w:ascii="Calibri" w:hAnsi="Calibri"/>
+          <w:sz w:val="22"/>
+        </w:rPr>
+        <w:t xml:space="preserve">, final consonants </w:t>
+      </w:r>
+      <w:r>
+        <w:rPr>
+          <w:rFonts w:ascii="Consolas" w:hAnsi="Consolas"/>
+          <w:color w:val="1F4D78"/>
+          <w:sz w:val="19"/>
+        </w:rPr>
+        <w:t>0.25</w:t>
+      </w:r>
+      <w:r>
+        <w:rPr>
+          <w:rFonts w:ascii="Calibri" w:hAnsi="Calibri"/>
+          <w:sz w:val="22"/>
+        </w:rPr>
+        <w:t xml:space="preserve">, rhyme-part edit similarity </w:t>
+      </w:r>
+      <w:r>
+        <w:rPr>
+          <w:rFonts w:ascii="Consolas" w:hAnsi="Consolas"/>
+          <w:color w:val="1F4D78"/>
+          <w:sz w:val="19"/>
+        </w:rPr>
+        <w:t>0.25</w:t>
+      </w:r>
+      <w:r>
+        <w:rPr>
+          <w:rFonts w:ascii="Calibri" w:hAnsi="Calibri"/>
+          <w:sz w:val="22"/>
+        </w:rPr>
+        <w:t xml:space="preserve">, stress alignment </w:t>
+      </w:r>
+      <w:r>
+        <w:rPr>
+          <w:rFonts w:ascii="Consolas" w:hAnsi="Consolas"/>
+          <w:color w:val="1F4D78"/>
+          <w:sz w:val="19"/>
+        </w:rPr>
+        <w:t>0.10</w:t>
+      </w:r>
+      <w:r>
+        <w:rPr>
+          <w:rFonts w:ascii="Calibri" w:hAnsi="Calibri"/>
+          <w:sz w:val="22"/>
+        </w:rPr>
+        <w:t xml:space="preserve">, and syllable similarity </w:t>
+      </w:r>
+      <w:r>
+        <w:rPr>
+          <w:rFonts w:ascii="Consolas" w:hAnsi="Consolas"/>
+          <w:color w:val="1F4D78"/>
+          <w:sz w:val="19"/>
+        </w:rPr>
+        <w:t>0.05</w:t>
+      </w:r>
+      <w:r>
+        <w:rPr>
+          <w:rFonts w:ascii="Calibri" w:hAnsi="Calibri"/>
+          <w:sz w:val="22"/>
+        </w:rPr>
+        <w:t xml:space="preserve">, with a default threshold of </w:t>
+      </w:r>
+      <w:r>
+        <w:rPr>
+          <w:rFonts w:ascii="Consolas" w:hAnsi="Consolas"/>
+          <w:color w:val="1F4D78"/>
+          <w:sz w:val="19"/>
+        </w:rPr>
+        <w:t>0.68</w:t>
+      </w:r>
+      <w:r>
+        <w:rPr>
+          <w:rFonts w:ascii="Calibri" w:hAnsi="Calibri"/>
+          <w:sz w:val="22"/>
+        </w:rPr>
+        <w:t>. It is a configurable heuristic, not a probability. Materially different dictionary alternatives remain unresolved unless a documented Stage 5 scholar override applies.</w:t>
+      </w:r>
+    </w:p>
+    <w:p>
+      <w:pPr>
+        <w:widowControl/>
+        <w:spacing w:before="0" w:after="120" w:line="300" w:lineRule="auto"/>
+      </w:pPr>
+      <w:r>
+        <w:rPr>
+          <w:rFonts w:ascii="Calibri" w:hAnsi="Calibri"/>
+          <w:sz w:val="22"/>
+        </w:rPr>
+        <w:t>Safe wording is: “The dictionary-based ending evidence produced an ABAB exact- rhyme scheme among four analyzable endings.” Do not claim that VerseVAD proved how the poem must be pronounced, performed, heard, or intended.</w:t>
+      </w:r>
+    </w:p>
+    <w:p>
+      <w:pPr>
+        <w:pStyle w:val="Heading2"/>
+      </w:pPr>
+      <w:r>
+        <w:rPr>
+          <w:rFonts w:ascii="Calibri" w:hAnsi="Calibri"/>
+          <w:sz w:val="22"/>
+        </w:rPr>
+        <w:t>Eight emotion associations</w:t>
+      </w:r>
+    </w:p>
+    <w:p>
+      <w:pPr>
+        <w:widowControl/>
+        <w:spacing w:before="0" w:after="120" w:line="300" w:lineRule="auto"/>
+      </w:pPr>
+      <w:r>
+        <w:rPr>
+          <w:rFonts w:ascii="Calibri" w:hAnsi="Calibri"/>
+          <w:sz w:val="22"/>
+        </w:rPr>
+        <w:t>NRC Emotion values are binary, multi-label associations. VerseVAD reports the eight emotions—anger, anticipation, disgust, fear, joy, sadness, surprise, and trust—in their own section. An entry can be associated with several categories, so percentages do not need to total 100 percent. Read the labeled denominator.</w:t>
+      </w:r>
+    </w:p>
+    <w:p>
+      <w:pPr>
+        <w:widowControl/>
+        <w:spacing w:before="0" w:after="120" w:line="300" w:lineRule="auto"/>
+      </w:pPr>
+      <w:r>
+        <w:rPr>
+          <w:rFonts w:ascii="Calibri" w:hAnsi="Calibri"/>
+          <w:sz w:val="22"/>
+        </w:rPr>
+        <w:t>“Fear-associated vocabulary” is appropriate wording. “The poem is afraid” is not.</w:t>
+      </w:r>
+    </w:p>
+    <w:p>
+      <w:pPr>
+        <w:pStyle w:val="Heading2"/>
+      </w:pPr>
+      <w:r>
+        <w:rPr>
+          <w:rFonts w:ascii="Calibri" w:hAnsi="Calibri"/>
+          <w:sz w:val="22"/>
+        </w:rPr>
+        <w:t>Positive and negative sentiment associations</w:t>
+      </w:r>
+    </w:p>
+    <w:p>
+      <w:pPr>
+        <w:widowControl/>
+        <w:spacing w:before="0" w:after="120" w:line="300" w:lineRule="auto"/>
+      </w:pPr>
+      <w:r>
+        <w:rPr>
+          <w:rFonts w:ascii="Calibri" w:hAnsi="Calibri"/>
+          <w:sz w:val="22"/>
+        </w:rPr>
+        <w:t>Positive and negative are broad sentiment labels in NRC Emotion. VerseVAD analyzes them with the same documented occurrence-counting logic but reports them separately from the eight emotions. They are not endpoints of the VAD valence scale, and their rates need not sum to 100 percent.</w:t>
+      </w:r>
+    </w:p>
+    <w:p>
+      <w:pPr>
+        <w:pStyle w:val="Heading2"/>
+      </w:pPr>
+      <w:r>
+        <w:rPr>
+          <w:rFonts w:ascii="Calibri" w:hAnsi="Calibri"/>
+          <w:sz w:val="22"/>
+        </w:rPr>
+        <w:t>Emotion intensity</w:t>
+      </w:r>
+    </w:p>
+    <w:p>
+      <w:pPr>
+        <w:widowControl/>
+        <w:spacing w:before="0" w:after="120" w:line="300" w:lineRule="auto"/>
+      </w:pPr>
+      <w:r>
+        <w:rPr>
+          <w:rFonts w:ascii="Calibri" w:hAnsi="Calibri"/>
+          <w:sz w:val="22"/>
+        </w:rPr>
+        <w:t>NRC Emotion Intensity supplies numeric values only for particular word-emotion pairs. VerseVAD keeps:</w:t>
       </w:r>
     </w:p>
     <w:p>
@@ -8035,7 +8048,7 @@
           <w:rFonts w:ascii="Calibri" w:hAnsi="Calibri"/>
           <w:sz w:val="22"/>
         </w:rPr>
-        <w:t>whether to display all-matched results;</w:t>
+        <w:t>prevalence of matched pairs;</w:t>
       </w:r>
     </w:p>
     <w:p>
@@ -8053,7 +8066,7 @@
           <w:rFonts w:ascii="Calibri" w:hAnsi="Calibri"/>
           <w:sz w:val="22"/>
         </w:rPr>
-        <w:t>whether to display stopword-excluded results;</w:t>
+        <w:t>token-weighted mean intensity among supplied pairs;</w:t>
       </w:r>
     </w:p>
     <w:p>
@@ -8071,7 +8084,168 @@
           <w:rFonts w:ascii="Calibri" w:hAnsi="Calibri"/>
           <w:sz w:val="22"/>
         </w:rPr>
-        <w:t>concreteness lower and upper orientation thresholds;</w:t>
+        <w:t>type-weighted mean intensity among supplied pairs.</w:t>
+      </w:r>
+    </w:p>
+    <w:p>
+      <w:pPr>
+        <w:widowControl/>
+        <w:spacing w:before="0" w:after="120" w:line="300" w:lineRule="auto"/>
+      </w:pPr>
+      <w:r>
+        <w:rPr>
+          <w:rFonts w:ascii="Calibri" w:hAnsi="Calibri"/>
+          <w:sz w:val="22"/>
+        </w:rPr>
+        <w:t>An absent word-emotion pair is missing, not an intensity of zero.</w:t>
+      </w:r>
+    </w:p>
+    <w:p>
+      <w:pPr>
+        <w:pStyle w:val="Heading1"/>
+      </w:pPr>
+      <w:r>
+        <w:rPr>
+          <w:rFonts w:ascii="Calibri" w:hAnsi="Calibri"/>
+          <w:sz w:val="22"/>
+        </w:rPr>
+        <w:t>8. One Poem Workspace</w:t>
+      </w:r>
+    </w:p>
+    <w:p>
+      <w:pPr>
+        <w:pStyle w:val="Heading2"/>
+      </w:pPr>
+      <w:r>
+        <w:rPr>
+          <w:rFonts w:ascii="Calibri" w:hAnsi="Calibri"/>
+          <w:sz w:val="22"/>
+        </w:rPr>
+        <w:t>Add a poem</w:t>
+      </w:r>
+    </w:p>
+    <w:p>
+      <w:pPr>
+        <w:widowControl/>
+        <w:spacing w:before="0" w:after="120" w:line="300" w:lineRule="auto"/>
+      </w:pPr>
+      <w:r>
+        <w:rPr>
+          <w:rFonts w:ascii="Calibri" w:hAnsi="Calibri"/>
+          <w:sz w:val="22"/>
+        </w:rPr>
+        <w:t xml:space="preserve">Paste text or upload one UTF-8 </w:t>
+      </w:r>
+      <w:r>
+        <w:rPr>
+          <w:rFonts w:ascii="Consolas" w:hAnsi="Consolas"/>
+          <w:color w:val="1F4D78"/>
+          <w:sz w:val="19"/>
+        </w:rPr>
+        <w:t>.txt</w:t>
+      </w:r>
+      <w:r>
+        <w:rPr>
+          <w:rFonts w:ascii="Calibri" w:hAnsi="Calibri"/>
+          <w:sz w:val="22"/>
+        </w:rPr>
+        <w:t xml:space="preserve"> file up to 5 MB. Enter a title or working label. The optional workspace name labels the temporary session but does not create a persistent corpus project.</w:t>
+      </w:r>
+    </w:p>
+    <w:p>
+      <w:pPr>
+        <w:pStyle w:val="Heading2"/>
+      </w:pPr>
+      <w:r>
+        <w:rPr>
+          <w:rFonts w:ascii="Calibri" w:hAnsi="Calibri"/>
+          <w:sz w:val="22"/>
+        </w:rPr>
+        <w:t>Choose evidence</w:t>
+      </w:r>
+    </w:p>
+    <w:p>
+      <w:pPr>
+        <w:widowControl/>
+        <w:spacing w:before="0" w:after="120" w:line="300" w:lineRule="auto"/>
+      </w:pPr>
+      <w:r>
+        <w:rPr>
+          <w:rFonts w:ascii="Calibri" w:hAnsi="Calibri"/>
+          <w:sz w:val="22"/>
+        </w:rPr>
+        <w:t>Select one or more affective lexicons and/or enable the optional normative lexical concreteness, SUBTLEX-US frequency, Kuperman Age of Acquisition, CMUdict pronunciation/prosody-foundation, and candidate-meter modules. VAD, categorical association, intensity, concreteness, corpus-relative frequency, retrospective lexical AoA, dictionary pronunciation/lexical stress, and configured meter fit answer different questions and remain separate. Any optional module can run by itself when its exact local source is available; selecting meter automatically runs its pronunciation dependency.</w:t>
+      </w:r>
+    </w:p>
+    <w:p>
+      <w:pPr>
+        <w:widowControl/>
+        <w:spacing w:before="0" w:after="120" w:line="300" w:lineRule="auto"/>
+      </w:pPr>
+      <w:r>
+        <w:rPr>
+          <w:rFonts w:ascii="Calibri" w:hAnsi="Calibri"/>
+          <w:sz w:val="22"/>
+        </w:rPr>
+        <w:t xml:space="preserve">Concreteness, Frequency, AoA, Pronunciation &amp; Prosody, and Meter &amp; Rhythm are currently temporary </w:t>
+      </w:r>
+      <w:r>
+        <w:rPr>
+          <w:rFonts w:ascii="Calibri" w:hAnsi="Calibri"/>
+          <w:b/>
+          <w:sz w:val="22"/>
+        </w:rPr>
+        <w:t>One Poem</w:t>
+      </w:r>
+      <w:r>
+        <w:rPr>
+          <w:rFonts w:ascii="Calibri" w:hAnsi="Calibri"/>
+          <w:sz w:val="22"/>
+        </w:rPr>
+        <w:t xml:space="preserve"> modules. They are not yet batched, persisted, aggregated, or exported by </w:t>
+      </w:r>
+      <w:r>
+        <w:rPr>
+          <w:rFonts w:ascii="Calibri" w:hAnsi="Calibri"/>
+          <w:b/>
+          <w:sz w:val="22"/>
+        </w:rPr>
+        <w:t>Projects &amp; Corpus</w:t>
+      </w:r>
+      <w:r>
+        <w:rPr>
+          <w:rFonts w:ascii="Calibri" w:hAnsi="Calibri"/>
+          <w:sz w:val="22"/>
+        </w:rPr>
+        <w:t>.</w:t>
+      </w:r>
+    </w:p>
+    <w:p>
+      <w:pPr>
+        <w:widowControl/>
+        <w:spacing w:before="0" w:after="120" w:line="300" w:lineRule="auto"/>
+      </w:pPr>
+      <w:r>
+        <w:rPr>
+          <w:rFonts w:ascii="Calibri" w:hAnsi="Calibri"/>
+          <w:sz w:val="22"/>
+        </w:rPr>
+        <w:t xml:space="preserve">Under </w:t>
+      </w:r>
+      <w:r>
+        <w:rPr>
+          <w:rFonts w:ascii="Calibri" w:hAnsi="Calibri"/>
+          <w:b/>
+          <w:sz w:val="22"/>
+        </w:rPr>
+        <w:t>Advanced methodology settings</w:t>
+      </w:r>
+      <w:r>
+        <w:rPr>
+          <w:rFonts w:ascii="Calibri" w:hAnsi="Calibri"/>
+          <w:sz w:val="22"/>
+        </w:rPr>
+        <w:t>, choose:</w:t>
       </w:r>
     </w:p>
     <w:p>
@@ -8089,7 +8263,7 @@
           <w:rFonts w:ascii="Calibri" w:hAnsi="Calibri"/>
           <w:sz w:val="22"/>
         </w:rPr>
-        <w:t>whether concreteness excludes model-tagged proper nouns;</w:t>
+        <w:t>phrase policy;</w:t>
       </w:r>
     </w:p>
     <w:p>
@@ -8107,7 +8281,7 @@
           <w:rFonts w:ascii="Calibri" w:hAnsi="Calibri"/>
           <w:sz w:val="22"/>
         </w:rPr>
-        <w:t>whether source-supplied concreteness phrases are activated; and</w:t>
+        <w:t>minimum matched observations for sparse-result warnings;</w:t>
       </w:r>
     </w:p>
     <w:p>
@@ -8125,7 +8299,7 @@
           <w:rFonts w:ascii="Calibri" w:hAnsi="Calibri"/>
           <w:sz w:val="22"/>
         </w:rPr>
-        <w:t>the concreteness low-coverage caution threshold;</w:t>
+        <w:t>whether to display all-matched results;</w:t>
       </w:r>
     </w:p>
     <w:p>
@@ -8143,7 +8317,7 @@
           <w:rFonts w:ascii="Calibri" w:hAnsi="Calibri"/>
           <w:sz w:val="22"/>
         </w:rPr>
-        <w:t>the four frequency orientation thresholds;</w:t>
+        <w:t>whether to display stopword-excluded results;</w:t>
       </w:r>
     </w:p>
     <w:p>
@@ -8161,7 +8335,7 @@
           <w:rFonts w:ascii="Calibri" w:hAnsi="Calibri"/>
           <w:sz w:val="22"/>
         </w:rPr>
-        <w:t>whether frequency excludes model-tagged proper nouns;</w:t>
+        <w:t>concreteness lower and upper orientation thresholds;</w:t>
       </w:r>
     </w:p>
     <w:p>
@@ -8179,7 +8353,7 @@
           <w:rFonts w:ascii="Calibri" w:hAnsi="Calibri"/>
           <w:sz w:val="22"/>
         </w:rPr>
-        <w:t>whether frequency permits lemma fallback;</w:t>
+        <w:t>whether concreteness excludes model-tagged proper nouns;</w:t>
       </w:r>
     </w:p>
     <w:p>
@@ -8197,7 +8371,7 @@
           <w:rFonts w:ascii="Calibri" w:hAnsi="Calibri"/>
           <w:sz w:val="22"/>
         </w:rPr>
-        <w:t>the frequency low-coverage caution threshold; and</w:t>
+        <w:t>whether source-supplied concreteness phrases are activated; and</w:t>
       </w:r>
     </w:p>
     <w:p>
@@ -8215,22 +8389,7 @@
           <w:rFonts w:ascii="Calibri" w:hAnsi="Calibri"/>
           <w:sz w:val="22"/>
         </w:rPr>
-        <w:t xml:space="preserve">whether frequency uses the non-default </w:t>
-      </w:r>
-      <w:r>
-        <w:rPr>
-          <w:rFonts w:ascii="Calibri" w:hAnsi="Calibri"/>
-          <w:b/>
-          <w:sz w:val="22"/>
-        </w:rPr>
-        <w:t>Content words only</w:t>
-      </w:r>
-      <w:r>
-        <w:rPr>
-          <w:rFonts w:ascii="Calibri" w:hAnsi="Calibri"/>
-          <w:sz w:val="22"/>
-        </w:rPr>
-        <w:t xml:space="preserve"> scope;</w:t>
+        <w:t>the concreteness low-coverage caution threshold;</w:t>
       </w:r>
     </w:p>
     <w:p>
@@ -8248,7 +8407,7 @@
           <w:rFonts w:ascii="Calibri" w:hAnsi="Calibri"/>
           <w:sz w:val="22"/>
         </w:rPr>
-        <w:t>AoA early and later orientation thresholds;</w:t>
+        <w:t>the four frequency orientation thresholds;</w:t>
       </w:r>
     </w:p>
     <w:p>
@@ -8266,7 +8425,7 @@
           <w:rFonts w:ascii="Calibri" w:hAnsi="Calibri"/>
           <w:sz w:val="22"/>
         </w:rPr>
-        <w:t>whether AoA excludes model-tagged proper nouns;</w:t>
+        <w:t>whether frequency excludes model-tagged proper nouns;</w:t>
       </w:r>
     </w:p>
     <w:p>
@@ -8284,7 +8443,7 @@
           <w:rFonts w:ascii="Calibri" w:hAnsi="Calibri"/>
           <w:sz w:val="22"/>
         </w:rPr>
-        <w:t>whether AoA permits lemma fallback;</w:t>
+        <w:t>whether frequency permits lemma fallback;</w:t>
       </w:r>
     </w:p>
     <w:p>
@@ -8302,7 +8461,7 @@
           <w:rFonts w:ascii="Calibri" w:hAnsi="Calibri"/>
           <w:sz w:val="22"/>
         </w:rPr>
-        <w:t>the AoA low-coverage caution threshold; and</w:t>
+        <w:t>the frequency low-coverage caution threshold; and</w:t>
       </w:r>
     </w:p>
     <w:p>
@@ -8320,7 +8479,7 @@
           <w:rFonts w:ascii="Calibri" w:hAnsi="Calibri"/>
           <w:sz w:val="22"/>
         </w:rPr>
-        <w:t xml:space="preserve">whether AoA uses the non-default contextual </w:t>
+        <w:t xml:space="preserve">whether frequency uses the non-default </w:t>
       </w:r>
       <w:r>
         <w:rPr>
@@ -8353,22 +8512,7 @@
           <w:rFonts w:ascii="Calibri" w:hAnsi="Calibri"/>
           <w:sz w:val="22"/>
         </w:rPr>
-        <w:t xml:space="preserve">poem-specific </w:t>
-      </w:r>
-      <w:r>
-        <w:rPr>
-          <w:rFonts w:ascii="Consolas" w:hAnsi="Consolas"/>
-          <w:color w:val="1F4D78"/>
-          <w:sz w:val="19"/>
-        </w:rPr>
-        <w:t>word = ARPAbet phones | note</w:t>
-      </w:r>
-      <w:r>
-        <w:rPr>
-          <w:rFonts w:ascii="Calibri" w:hAnsi="Calibri"/>
-          <w:sz w:val="22"/>
-        </w:rPr>
-        <w:t xml:space="preserve"> pronunciation overrides;</w:t>
+        <w:t>AoA early and later orientation thresholds;</w:t>
       </w:r>
     </w:p>
     <w:p>
@@ -8386,7 +8530,7 @@
           <w:rFonts w:ascii="Calibri" w:hAnsi="Calibri"/>
           <w:sz w:val="22"/>
         </w:rPr>
-        <w:t>the pronunciation resolved-token coverage caution threshold;</w:t>
+        <w:t>whether AoA excludes model-tagged proper nouns;</w:t>
       </w:r>
     </w:p>
     <w:p>
@@ -8404,7 +8548,7 @@
           <w:rFonts w:ascii="Calibri" w:hAnsi="Calibri"/>
           <w:sz w:val="22"/>
         </w:rPr>
-        <w:t>minimum complete pronunciation lines; and</w:t>
+        <w:t>whether AoA permits lemma fallback;</w:t>
       </w:r>
     </w:p>
     <w:p>
@@ -8422,7 +8566,7 @@
           <w:rFonts w:ascii="Calibri" w:hAnsi="Calibri"/>
           <w:sz w:val="22"/>
         </w:rPr>
-        <w:t>minimum resolved pronunciation tokens for sparse-result warnings;</w:t>
+        <w:t>the AoA low-coverage caution threshold; and</w:t>
       </w:r>
     </w:p>
     <w:p>
@@ -8440,7 +8584,22 @@
           <w:rFonts w:ascii="Calibri" w:hAnsi="Calibri"/>
           <w:sz w:val="22"/>
         </w:rPr>
-        <w:t>the meter line-fit threshold;</w:t>
+        <w:t xml:space="preserve">whether AoA uses the non-default contextual </w:t>
+      </w:r>
+      <w:r>
+        <w:rPr>
+          <w:rFonts w:ascii="Calibri" w:hAnsi="Calibri"/>
+          <w:b/>
+          <w:sz w:val="22"/>
+        </w:rPr>
+        <w:t>Content words only</w:t>
+      </w:r>
+      <w:r>
+        <w:rPr>
+          <w:rFonts w:ascii="Calibri" w:hAnsi="Calibri"/>
+          <w:sz w:val="22"/>
+        </w:rPr>
+        <w:t xml:space="preserve"> scope;</w:t>
       </w:r>
     </w:p>
     <w:p>
@@ -8458,7 +8617,22 @@
           <w:rFonts w:ascii="Calibri" w:hAnsi="Calibri"/>
           <w:sz w:val="22"/>
         </w:rPr>
-        <w:t>the poem candidate-fit threshold;</w:t>
+        <w:t xml:space="preserve">poem-specific </w:t>
+      </w:r>
+      <w:r>
+        <w:rPr>
+          <w:rFonts w:ascii="Consolas" w:hAnsi="Consolas"/>
+          <w:color w:val="1F4D78"/>
+          <w:sz w:val="19"/>
+        </w:rPr>
+        <w:t>word = ARPAbet phones | note</w:t>
+      </w:r>
+      <w:r>
+        <w:rPr>
+          <w:rFonts w:ascii="Calibri" w:hAnsi="Calibri"/>
+          <w:sz w:val="22"/>
+        </w:rPr>
+        <w:t xml:space="preserve"> pronunciation overrides;</w:t>
       </w:r>
     </w:p>
     <w:p>
@@ -8476,7 +8650,7 @@
           <w:rFonts w:ascii="Calibri" w:hAnsi="Calibri"/>
           <w:sz w:val="22"/>
         </w:rPr>
-        <w:t>the candidate-margin threshold; and</w:t>
+        <w:t>the pronunciation resolved-token coverage caution threshold;</w:t>
       </w:r>
     </w:p>
     <w:p>
@@ -8494,138 +8668,7 @@
           <w:rFonts w:ascii="Calibri" w:hAnsi="Calibri"/>
           <w:sz w:val="22"/>
         </w:rPr>
-        <w:t>the maximum retained stress paths evaluated per line.</w:t>
-      </w:r>
-    </w:p>
-    <w:p>
-      <w:pPr>
-        <w:widowControl/>
-        <w:spacing w:before="0" w:after="120" w:line="300" w:lineRule="auto"/>
-      </w:pPr>
-      <w:r>
-        <w:rPr>
-          <w:rFonts w:ascii="Calibri" w:hAnsi="Calibri"/>
-          <w:sz w:val="22"/>
-        </w:rPr>
-        <w:t xml:space="preserve">Under </w:t>
-      </w:r>
-      <w:r>
-        <w:rPr>
-          <w:rFonts w:ascii="Calibri" w:hAnsi="Calibri"/>
-          <w:b/>
-          <w:sz w:val="22"/>
-        </w:rPr>
-        <w:t>Stopword settings</w:t>
-      </w:r>
-      <w:r>
-        <w:rPr>
-          <w:rFonts w:ascii="Calibri" w:hAnsi="Calibri"/>
-          <w:sz w:val="22"/>
-        </w:rPr>
-        <w:t>, inspect or change the secondary-view policy. The all-matched result is always preserved even when only one view is displayed.</w:t>
-      </w:r>
-    </w:p>
-    <w:p>
-      <w:pPr>
-        <w:pStyle w:val="Heading2"/>
-      </w:pPr>
-      <w:r>
-        <w:rPr>
-          <w:rFonts w:ascii="Calibri" w:hAnsi="Calibri"/>
-          <w:sz w:val="22"/>
-        </w:rPr>
-        <w:t>Overview tab</w:t>
-      </w:r>
-    </w:p>
-    <w:p>
-      <w:pPr>
-        <w:widowControl/>
-        <w:spacing w:before="0" w:after="120" w:line="300" w:lineRule="auto"/>
-      </w:pPr>
-      <w:r>
-        <w:rPr>
-          <w:rFonts w:ascii="Calibri" w:hAnsi="Calibri"/>
-          <w:sz w:val="22"/>
-        </w:rPr>
-        <w:t>Read coverage before means. The tab shows ordinary and content-focused coverage, matched counts, active methodology, excluded stopword counts, interpretive framing, and warnings.</w:t>
-      </w:r>
-    </w:p>
-    <w:p>
-      <w:pPr>
-        <w:pStyle w:val="Heading2"/>
-      </w:pPr>
-      <w:r>
-        <w:rPr>
-          <w:rFonts w:ascii="Calibri" w:hAnsi="Calibri"/>
-          <w:sz w:val="22"/>
-        </w:rPr>
-        <w:t>Language Profile tab</w:t>
-      </w:r>
-    </w:p>
-    <w:p>
-      <w:pPr>
-        <w:widowControl/>
-        <w:spacing w:before="0" w:after="120" w:line="300" w:lineRule="auto"/>
-      </w:pPr>
-      <w:r>
-        <w:rPr>
-          <w:rFonts w:ascii="Calibri" w:hAnsi="Calibri"/>
-          <w:sz w:val="22"/>
-        </w:rPr>
-        <w:t xml:space="preserve">The </w:t>
-      </w:r>
-      <w:r>
-        <w:rPr>
-          <w:rFonts w:ascii="Calibri" w:hAnsi="Calibri"/>
-          <w:b/>
-          <w:sz w:val="22"/>
-        </w:rPr>
-        <w:t>Shared Processing Record</w:t>
-      </w:r>
-      <w:r>
-        <w:rPr>
-          <w:rFonts w:ascii="Calibri" w:hAnsi="Calibri"/>
-          <w:sz w:val="22"/>
-        </w:rPr>
-        <w:t xml:space="preserve"> first reports stanzas, physical lines, model sentences, total and lexical tokens, recipe/configuration IDs, model pipeline, dependency coverage, named-entity status, and processing cautions. It is the common local representation used by every selected lexicon.</w:t>
-      </w:r>
-    </w:p>
-    <w:p>
-      <w:pPr>
-        <w:widowControl/>
-        <w:spacing w:before="0" w:after="120" w:line="300" w:lineRule="auto"/>
-      </w:pPr>
-      <w:r>
-        <w:rPr>
-          <w:rFonts w:ascii="Calibri" w:hAnsi="Calibri"/>
-          <w:sz w:val="22"/>
-        </w:rPr>
-        <w:t>The tab then reports part-of-speech counts and relative shares for all eligible lexical tokens, independently of lexicon coverage. It also shows unique normalized types and example forms. The denominator is displayed, and a caution explains that the labels are model-generated.</w:t>
-      </w:r>
-    </w:p>
-    <w:p>
-      <w:pPr>
-        <w:pStyle w:val="Heading2"/>
-      </w:pPr>
-      <w:r>
-        <w:rPr>
-          <w:rFonts w:ascii="Calibri" w:hAnsi="Calibri"/>
-          <w:sz w:val="22"/>
-        </w:rPr>
-        <w:t>VAD Profile tab</w:t>
-      </w:r>
-    </w:p>
-    <w:p>
-      <w:pPr>
-        <w:widowControl/>
-        <w:spacing w:before="0" w:after="120" w:line="300" w:lineRule="auto"/>
-      </w:pPr>
-      <w:r>
-        <w:rPr>
-          <w:rFonts w:ascii="Calibri" w:hAnsi="Calibri"/>
-          <w:sz w:val="22"/>
-        </w:rPr>
-        <w:t>This tab contains:</w:t>
+        <w:t>minimum complete pronunciation lines; and</w:t>
       </w:r>
     </w:p>
     <w:p>
@@ -8643,7 +8686,7 @@
           <w:rFonts w:ascii="Calibri" w:hAnsi="Calibri"/>
           <w:sz w:val="22"/>
         </w:rPr>
-        <w:t>parallel normalized VAD charts;</w:t>
+        <w:t>minimum resolved pronunciation tokens for sparse-result warnings;</w:t>
       </w:r>
     </w:p>
     <w:p>
@@ -8661,7 +8704,7 @@
           <w:rFonts w:ascii="Calibri" w:hAnsi="Calibri"/>
           <w:sz w:val="22"/>
         </w:rPr>
-        <w:t>definitions of valence, arousal, and dominance;</w:t>
+        <w:t>the meter line-fit threshold;</w:t>
       </w:r>
     </w:p>
     <w:p>
@@ -8679,7 +8722,7 @@
           <w:rFonts w:ascii="Calibri" w:hAnsi="Calibri"/>
           <w:sz w:val="22"/>
         </w:rPr>
-        <w:t>token- and type-weighted values for each analysis view;</w:t>
+        <w:t>the poem candidate-fit threshold;</w:t>
       </w:r>
     </w:p>
     <w:p>
@@ -8697,7 +8740,7 @@
           <w:rFonts w:ascii="Calibri" w:hAnsi="Calibri"/>
           <w:sz w:val="22"/>
         </w:rPr>
-        <w:t>plain-language midpoint interpretations;</w:t>
+        <w:t>the candidate-margin threshold; and</w:t>
       </w:r>
     </w:p>
     <w:p>
@@ -8715,7 +8758,138 @@
           <w:rFonts w:ascii="Calibri" w:hAnsi="Calibri"/>
           <w:sz w:val="22"/>
         </w:rPr>
-        <w:t>population dispersion;</w:t>
+        <w:t>the maximum retained stress paths evaluated per line.</w:t>
+      </w:r>
+    </w:p>
+    <w:p>
+      <w:pPr>
+        <w:widowControl/>
+        <w:spacing w:before="0" w:after="120" w:line="300" w:lineRule="auto"/>
+      </w:pPr>
+      <w:r>
+        <w:rPr>
+          <w:rFonts w:ascii="Calibri" w:hAnsi="Calibri"/>
+          <w:sz w:val="22"/>
+        </w:rPr>
+        <w:t xml:space="preserve">Under </w:t>
+      </w:r>
+      <w:r>
+        <w:rPr>
+          <w:rFonts w:ascii="Calibri" w:hAnsi="Calibri"/>
+          <w:b/>
+          <w:sz w:val="22"/>
+        </w:rPr>
+        <w:t>Stopword settings</w:t>
+      </w:r>
+      <w:r>
+        <w:rPr>
+          <w:rFonts w:ascii="Calibri" w:hAnsi="Calibri"/>
+          <w:sz w:val="22"/>
+        </w:rPr>
+        <w:t>, inspect or change the secondary-view policy. The all-matched result is always preserved even when only one view is displayed.</w:t>
+      </w:r>
+    </w:p>
+    <w:p>
+      <w:pPr>
+        <w:pStyle w:val="Heading2"/>
+      </w:pPr>
+      <w:r>
+        <w:rPr>
+          <w:rFonts w:ascii="Calibri" w:hAnsi="Calibri"/>
+          <w:sz w:val="22"/>
+        </w:rPr>
+        <w:t>Overview tab</w:t>
+      </w:r>
+    </w:p>
+    <w:p>
+      <w:pPr>
+        <w:widowControl/>
+        <w:spacing w:before="0" w:after="120" w:line="300" w:lineRule="auto"/>
+      </w:pPr>
+      <w:r>
+        <w:rPr>
+          <w:rFonts w:ascii="Calibri" w:hAnsi="Calibri"/>
+          <w:sz w:val="22"/>
+        </w:rPr>
+        <w:t>Read coverage before means. The tab shows ordinary and content-focused coverage, matched counts, active methodology, excluded stopword counts, interpretive framing, and warnings.</w:t>
+      </w:r>
+    </w:p>
+    <w:p>
+      <w:pPr>
+        <w:pStyle w:val="Heading2"/>
+      </w:pPr>
+      <w:r>
+        <w:rPr>
+          <w:rFonts w:ascii="Calibri" w:hAnsi="Calibri"/>
+          <w:sz w:val="22"/>
+        </w:rPr>
+        <w:t>Language Profile tab</w:t>
+      </w:r>
+    </w:p>
+    <w:p>
+      <w:pPr>
+        <w:widowControl/>
+        <w:spacing w:before="0" w:after="120" w:line="300" w:lineRule="auto"/>
+      </w:pPr>
+      <w:r>
+        <w:rPr>
+          <w:rFonts w:ascii="Calibri" w:hAnsi="Calibri"/>
+          <w:sz w:val="22"/>
+        </w:rPr>
+        <w:t xml:space="preserve">The </w:t>
+      </w:r>
+      <w:r>
+        <w:rPr>
+          <w:rFonts w:ascii="Calibri" w:hAnsi="Calibri"/>
+          <w:b/>
+          <w:sz w:val="22"/>
+        </w:rPr>
+        <w:t>Shared Processing Record</w:t>
+      </w:r>
+      <w:r>
+        <w:rPr>
+          <w:rFonts w:ascii="Calibri" w:hAnsi="Calibri"/>
+          <w:sz w:val="22"/>
+        </w:rPr>
+        <w:t xml:space="preserve"> first reports stanzas, physical lines, model sentences, total and lexical tokens, recipe/configuration IDs, model pipeline, dependency coverage, named-entity status, and processing cautions. It is the common local representation used by every selected lexicon.</w:t>
+      </w:r>
+    </w:p>
+    <w:p>
+      <w:pPr>
+        <w:widowControl/>
+        <w:spacing w:before="0" w:after="120" w:line="300" w:lineRule="auto"/>
+      </w:pPr>
+      <w:r>
+        <w:rPr>
+          <w:rFonts w:ascii="Calibri" w:hAnsi="Calibri"/>
+          <w:sz w:val="22"/>
+        </w:rPr>
+        <w:t>The tab then reports part-of-speech counts and relative shares for all eligible lexical tokens, independently of lexicon coverage. It also shows unique normalized types and example forms. The denominator is displayed, and a caution explains that the labels are model-generated.</w:t>
+      </w:r>
+    </w:p>
+    <w:p>
+      <w:pPr>
+        <w:pStyle w:val="Heading2"/>
+      </w:pPr>
+      <w:r>
+        <w:rPr>
+          <w:rFonts w:ascii="Calibri" w:hAnsi="Calibri"/>
+          <w:sz w:val="22"/>
+        </w:rPr>
+        <w:t>VAD Profile tab</w:t>
+      </w:r>
+    </w:p>
+    <w:p>
+      <w:pPr>
+        <w:widowControl/>
+        <w:spacing w:before="0" w:after="120" w:line="300" w:lineRule="auto"/>
+      </w:pPr>
+      <w:r>
+        <w:rPr>
+          <w:rFonts w:ascii="Calibri" w:hAnsi="Calibri"/>
+          <w:sz w:val="22"/>
+        </w:rPr>
+        <w:t>This tab contains:</w:t>
       </w:r>
     </w:p>
     <w:p>
@@ -8733,7 +8907,7 @@
           <w:rFonts w:ascii="Calibri" w:hAnsi="Calibri"/>
           <w:sz w:val="22"/>
         </w:rPr>
-        <w:t>stopword-sensitivity differences;</w:t>
+        <w:t>parallel normalized VAD charts;</w:t>
       </w:r>
     </w:p>
     <w:p>
@@ -8751,7 +8925,7 @@
           <w:rFonts w:ascii="Calibri" w:hAnsi="Calibri"/>
           <w:sz w:val="22"/>
         </w:rPr>
-        <w:t>cumulative normalized totals;</w:t>
+        <w:t>definitions of valence, arousal, and dominance;</w:t>
       </w:r>
     </w:p>
     <w:p>
@@ -8769,7 +8943,7 @@
           <w:rFonts w:ascii="Calibri" w:hAnsi="Calibri"/>
           <w:sz w:val="22"/>
         </w:rPr>
-        <w:t>top midpoint-centered contributors;</w:t>
+        <w:t>token- and type-weighted values for each analysis view;</w:t>
       </w:r>
     </w:p>
     <w:p>
@@ -8787,6 +8961,96 @@
           <w:rFonts w:ascii="Calibri" w:hAnsi="Calibri"/>
           <w:sz w:val="22"/>
         </w:rPr>
+        <w:t>plain-language midpoint interpretations;</w:t>
+      </w:r>
+    </w:p>
+    <w:p>
+      <w:pPr>
+        <w:widowControl/>
+        <w:numPr>
+          <w:ilvl w:val="0"/>
+          <w:numId w:val="10"/>
+        </w:numPr>
+        <w:spacing w:before="0" w:after="80" w:line="300" w:lineRule="auto"/>
+        <w:ind w:left="540" w:hanging="271"/>
+      </w:pPr>
+      <w:r>
+        <w:rPr>
+          <w:rFonts w:ascii="Calibri" w:hAnsi="Calibri"/>
+          <w:sz w:val="22"/>
+        </w:rPr>
+        <w:t>population dispersion;</w:t>
+      </w:r>
+    </w:p>
+    <w:p>
+      <w:pPr>
+        <w:widowControl/>
+        <w:numPr>
+          <w:ilvl w:val="0"/>
+          <w:numId w:val="10"/>
+        </w:numPr>
+        <w:spacing w:before="0" w:after="80" w:line="300" w:lineRule="auto"/>
+        <w:ind w:left="540" w:hanging="271"/>
+      </w:pPr>
+      <w:r>
+        <w:rPr>
+          <w:rFonts w:ascii="Calibri" w:hAnsi="Calibri"/>
+          <w:sz w:val="22"/>
+        </w:rPr>
+        <w:t>stopword-sensitivity differences;</w:t>
+      </w:r>
+    </w:p>
+    <w:p>
+      <w:pPr>
+        <w:widowControl/>
+        <w:numPr>
+          <w:ilvl w:val="0"/>
+          <w:numId w:val="10"/>
+        </w:numPr>
+        <w:spacing w:before="0" w:after="80" w:line="300" w:lineRule="auto"/>
+        <w:ind w:left="540" w:hanging="271"/>
+      </w:pPr>
+      <w:r>
+        <w:rPr>
+          <w:rFonts w:ascii="Calibri" w:hAnsi="Calibri"/>
+          <w:sz w:val="22"/>
+        </w:rPr>
+        <w:t>cumulative normalized totals;</w:t>
+      </w:r>
+    </w:p>
+    <w:p>
+      <w:pPr>
+        <w:widowControl/>
+        <w:numPr>
+          <w:ilvl w:val="0"/>
+          <w:numId w:val="10"/>
+        </w:numPr>
+        <w:spacing w:before="0" w:after="80" w:line="300" w:lineRule="auto"/>
+        <w:ind w:left="540" w:hanging="271"/>
+      </w:pPr>
+      <w:r>
+        <w:rPr>
+          <w:rFonts w:ascii="Calibri" w:hAnsi="Calibri"/>
+          <w:sz w:val="22"/>
+        </w:rPr>
+        <w:t>top midpoint-centered contributors;</w:t>
+      </w:r>
+    </w:p>
+    <w:p>
+      <w:pPr>
+        <w:widowControl/>
+        <w:numPr>
+          <w:ilvl w:val="0"/>
+          <w:numId w:val="10"/>
+        </w:numPr>
+        <w:spacing w:before="0" w:after="80" w:line="300" w:lineRule="auto"/>
+        <w:ind w:left="540" w:hanging="271"/>
+      </w:pPr>
+      <w:r>
+        <w:rPr>
+          <w:rFonts w:ascii="Calibri" w:hAnsi="Calibri"/>
+          <w:sz w:val="22"/>
+        </w:rPr>
         <w:t>original source scales and normalization formulas.</w:t>
       </w:r>
     </w:p>
@@ -9197,7 +9461,7 @@
           <w:rFonts w:ascii="Calibri" w:hAnsi="Calibri"/>
           <w:sz w:val="22"/>
         </w:rPr>
-        <w:t xml:space="preserve"> is enabled. It reports the nearest fixed template or alternating scheme, fit, matching lines, coverage, alternative, candidate margin, rule-based confidence, rhythmic variation, a separate common-meter panel, physical-line evidence, all 40 fixed candidates, warnings, and configuration provenance.</w:t>
+        <w:t xml:space="preserve"> is enabled. It reports the nearest fixed template, fit, matching lines, coverage, alternative, candidate margin, rule-based confidence, rhythmic variation, physical-line evidence, all 40 fixed candidates, warnings, and configuration provenance.</w:t>
       </w:r>
     </w:p>
     <w:p>
@@ -9210,7 +9474,73 @@
           <w:rFonts w:ascii="Calibri" w:hAnsi="Calibri"/>
           <w:sz w:val="22"/>
         </w:rPr>
-        <w:t xml:space="preserve">For common meter, confirm the expected foot counts restart as </w:t>
+        <w:t>Do not mistake a metrically preferred stress path for a change to the Stage 5 pronunciation result.</w:t>
+      </w:r>
+    </w:p>
+    <w:p>
+      <w:pPr>
+        <w:pStyle w:val="Heading2"/>
+      </w:pPr>
+      <w:r>
+        <w:rPr>
+          <w:rFonts w:ascii="Calibri" w:hAnsi="Calibri"/>
+          <w:sz w:val="22"/>
+        </w:rPr>
+        <w:t>Rhyme &amp; Sound tab</w:t>
+      </w:r>
+    </w:p>
+    <w:p>
+      <w:pPr>
+        <w:widowControl/>
+        <w:spacing w:before="0" w:after="120" w:line="300" w:lineRule="auto"/>
+      </w:pPr>
+      <w:r>
+        <w:rPr>
+          <w:rFonts w:ascii="Calibri" w:hAnsi="Calibri"/>
+          <w:sz w:val="22"/>
+        </w:rPr>
+        <w:t xml:space="preserve">This tab appears when </w:t>
+      </w:r>
+      <w:r>
+        <w:rPr>
+          <w:rFonts w:ascii="Calibri" w:hAnsi="Calibri"/>
+          <w:b/>
+          <w:sz w:val="22"/>
+        </w:rPr>
+        <w:t>Rhyme &amp; phonological patterns</w:t>
+      </w:r>
+      <w:r>
+        <w:rPr>
+          <w:rFonts w:ascii="Calibri" w:hAnsi="Calibri"/>
+          <w:sz w:val="22"/>
+        </w:rPr>
+        <w:t xml:space="preserve"> is enabled. It reports the whole-poem and stanza exact-rhyme schemes with ending coverage, then separately shows perfect, identical, masculine, feminine, multisyllabic, graded slant, eye, internal-rhyme, refrain, alliteration, assonance, and consonance evidence.</w:t>
+      </w:r>
+    </w:p>
+    <w:p>
+      <w:pPr>
+        <w:widowControl/>
+        <w:spacing w:before="0" w:after="120" w:line="300" w:lineRule="auto"/>
+      </w:pPr>
+      <w:r>
+        <w:rPr>
+          <w:rFonts w:ascii="Calibri" w:hAnsi="Calibri"/>
+          <w:sz w:val="22"/>
+        </w:rPr>
+        <w:t>Read the physical-line table before interpreting a scheme. It preserves the end word, candidate phones and rhyme parts, resolution status, scheme labels, repeated sounds, densities, and reason. The within-stanza pair table preserves the rhyme types, five slant components, conservative and maximum scores, eye-rhyme evidence, and caution label.</w:t>
+      </w:r>
+    </w:p>
+    <w:p>
+      <w:pPr>
+        <w:widowControl/>
+        <w:spacing w:before="0" w:after="120" w:line="300" w:lineRule="auto"/>
+      </w:pPr>
+      <w:r>
+        <w:rPr>
+          <w:rFonts w:ascii="Calibri" w:hAnsi="Calibri"/>
+          <w:sz w:val="22"/>
+        </w:rPr>
+        <w:t xml:space="preserve">An unresolved line ending appears as </w:t>
       </w:r>
       <w:r>
         <w:rPr>
@@ -9218,27 +9548,14 @@
           <w:color w:val="1F4D78"/>
           <w:sz w:val="19"/>
         </w:rPr>
-        <w:t>4, 3, 4, 3</w:t>
-      </w:r>
-      <w:r>
-        <w:rPr>
-          <w:rFonts w:ascii="Calibri" w:hAnsi="Calibri"/>
-          <w:sz w:val="22"/>
-        </w:rPr>
-        <w:t xml:space="preserve"> in each stanza and read complete-stanza coverage. A stanza fragment can supply partial line evidence but cannot by itself select common meter as the nearest poem-level scheme.</w:t>
-      </w:r>
-    </w:p>
-    <w:p>
-      <w:pPr>
-        <w:widowControl/>
-        <w:spacing w:before="0" w:after="120" w:line="300" w:lineRule="auto"/>
-      </w:pPr>
-      <w:r>
-        <w:rPr>
-          <w:rFonts w:ascii="Calibri" w:hAnsi="Calibri"/>
-          <w:sz w:val="22"/>
-        </w:rPr>
-        <w:t>The closest fixed template for one line and the phase-specific common-meter line fit are separate columns. Do not mistake a metrically preferred stress path for a change to the Stage 5 pronunciation result.</w:t>
+        <w:t>?</w:t>
+      </w:r>
+      <w:r>
+        <w:rPr>
+          <w:rFonts w:ascii="Calibri" w:hAnsi="Calibri"/>
+          <w:sz w:val="22"/>
+        </w:rPr>
+        <w:t xml:space="preserve"> and reduces coverage. It receives no neutral value or fabricated rhyme label. Add a Stage 5 override only when you can document the intended pronunciation.</w:t>
       </w:r>
     </w:p>
     <w:p>
@@ -13961,7 +14278,7 @@
                 <w:rFonts w:ascii="Calibri" w:hAnsi="Calibri"/>
                 <w:sz w:val="18"/>
               </w:rPr>
-              <w:t>Nearest candidate kind and label, fit, coverage, confidence, deviations, and common-meter summary</w:t>
+              <w:t>Nearest fixed candidate kind and label, fit, coverage, confidence, and deviations</w:t>
             </w:r>
           </w:p>
         </w:tc>
@@ -14051,64 +14368,6 @@
                 <w:color w:val="1F4D78"/>
                 <w:sz w:val="17"/>
               </w:rPr>
-              <w:t>meter_schemes.csv</w:t>
-            </w:r>
-          </w:p>
-        </w:tc>
-        <w:tc>
-          <w:tcPr>
-            <w:tcW w:type="dxa" w:w="5760"/>
-            <w:vAlign w:val="center"/>
-            <w:tcMar>
-              <w:top w:w="80" w:type="dxa"/>
-              <w:bottom w:w="80" w:type="dxa"/>
-              <w:start w:w="120" w:type="dxa"/>
-              <w:end w:w="120" w:type="dxa"/>
-            </w:tcMar>
-          </w:tcPr>
-          <w:p>
-            <w:pPr>
-              <w:widowControl/>
-              <w:spacing w:before="0" w:after="0" w:line="252" w:lineRule="auto"/>
-            </w:pPr>
-            <w:r/>
-            <w:r>
-              <w:rPr>
-                <w:rFonts w:ascii="Calibri" w:hAnsi="Calibri"/>
-                <w:sz w:val="18"/>
-              </w:rPr>
-              <w:t>Stanza-aware scheme cycle, fit, line coverage, matching lines, and complete-stanza coverage</w:t>
-            </w:r>
-          </w:p>
-        </w:tc>
-      </w:tr>
-      <w:tr>
-        <w:trPr>
-          <w:cantSplit w:val="true"/>
-        </w:trPr>
-        <w:tc>
-          <w:tcPr>
-            <w:tcW w:type="dxa" w:w="3600"/>
-            <w:vAlign w:val="center"/>
-            <w:tcMar>
-              <w:top w:w="80" w:type="dxa"/>
-              <w:bottom w:w="80" w:type="dxa"/>
-              <w:start w:w="120" w:type="dxa"/>
-              <w:end w:w="120" w:type="dxa"/>
-            </w:tcMar>
-          </w:tcPr>
-          <w:p>
-            <w:pPr>
-              <w:widowControl/>
-              <w:spacing w:before="0" w:after="0" w:line="252" w:lineRule="auto"/>
-            </w:pPr>
-            <w:r/>
-            <w:r>
-              <w:rPr>
-                <w:rFonts w:ascii="Consolas" w:hAnsi="Consolas"/>
-                <w:color w:val="1F4D78"/>
-                <w:sz w:val="17"/>
-              </w:rPr>
               <w:t>meter_lines.csv</w:t>
             </w:r>
           </w:p>
@@ -14135,7 +14394,7 @@
                 <w:rFonts w:ascii="Calibri" w:hAnsi="Calibri"/>
                 <w:sz w:val="18"/>
               </w:rPr>
-              <w:t>Every physical line's status, nearest fixed template, selected stress path, common-meter position/expected feet/fit, alignment, and deviations</w:t>
+              <w:t>Every physical line's status, nearest fixed template, selected stress path, alignment, and deviations</w:t>
             </w:r>
           </w:p>
         </w:tc>
@@ -14251,7 +14510,413 @@
                 <w:rFonts w:ascii="Calibri" w:hAnsi="Calibri"/>
                 <w:sz w:val="18"/>
               </w:rPr>
-              <w:t>Complete structured Stage 6 configuration, line audit, fixed candidates, schemes, metrics, warnings, and provenance</w:t>
+              <w:t>Complete structured Stage 6 configuration, line audit, fixed candidates, metrics, warnings, and provenance</w:t>
+            </w:r>
+          </w:p>
+        </w:tc>
+      </w:tr>
+      <w:tr>
+        <w:trPr>
+          <w:cantSplit w:val="true"/>
+        </w:trPr>
+        <w:tc>
+          <w:tcPr>
+            <w:tcW w:type="dxa" w:w="3600"/>
+            <w:vAlign w:val="center"/>
+            <w:tcMar>
+              <w:top w:w="80" w:type="dxa"/>
+              <w:bottom w:w="80" w:type="dxa"/>
+              <w:start w:w="120" w:type="dxa"/>
+              <w:end w:w="120" w:type="dxa"/>
+            </w:tcMar>
+          </w:tcPr>
+          <w:p>
+            <w:pPr>
+              <w:widowControl/>
+              <w:spacing w:before="0" w:after="0" w:line="252" w:lineRule="auto"/>
+            </w:pPr>
+            <w:r/>
+            <w:r>
+              <w:rPr>
+                <w:rFonts w:ascii="Consolas" w:hAnsi="Consolas"/>
+                <w:color w:val="1F4D78"/>
+                <w:sz w:val="17"/>
+              </w:rPr>
+              <w:t>rhyme_summary.csv</w:t>
+            </w:r>
+          </w:p>
+        </w:tc>
+        <w:tc>
+          <w:tcPr>
+            <w:tcW w:type="dxa" w:w="5760"/>
+            <w:vAlign w:val="center"/>
+            <w:tcMar>
+              <w:top w:w="80" w:type="dxa"/>
+              <w:bottom w:w="80" w:type="dxa"/>
+              <w:start w:w="120" w:type="dxa"/>
+              <w:end w:w="120" w:type="dxa"/>
+            </w:tcMar>
+          </w:tcPr>
+          <w:p>
+            <w:pPr>
+              <w:widowControl/>
+              <w:spacing w:before="0" w:after="0" w:line="252" w:lineRule="auto"/>
+            </w:pPr>
+            <w:r/>
+            <w:r>
+              <w:rPr>
+                <w:rFonts w:ascii="Calibri" w:hAnsi="Calibri"/>
+                <w:sz w:val="18"/>
+              </w:rPr>
+              <w:t>Whole-poem scheme, ending coverage, rhyme density, pair counts, refrain/internal-rhyme counts, and recurring-sound densities</w:t>
+            </w:r>
+          </w:p>
+        </w:tc>
+      </w:tr>
+      <w:tr>
+        <w:trPr>
+          <w:cantSplit w:val="true"/>
+        </w:trPr>
+        <w:tc>
+          <w:tcPr>
+            <w:tcW w:type="dxa" w:w="3600"/>
+            <w:vAlign w:val="center"/>
+            <w:tcMar>
+              <w:top w:w="80" w:type="dxa"/>
+              <w:bottom w:w="80" w:type="dxa"/>
+              <w:start w:w="120" w:type="dxa"/>
+              <w:end w:w="120" w:type="dxa"/>
+            </w:tcMar>
+          </w:tcPr>
+          <w:p>
+            <w:pPr>
+              <w:widowControl/>
+              <w:spacing w:before="0" w:after="0" w:line="252" w:lineRule="auto"/>
+            </w:pPr>
+            <w:r/>
+            <w:r>
+              <w:rPr>
+                <w:rFonts w:ascii="Consolas" w:hAnsi="Consolas"/>
+                <w:color w:val="1F4D78"/>
+                <w:sz w:val="17"/>
+              </w:rPr>
+              <w:t>rhyme_stanzas.csv</w:t>
+            </w:r>
+          </w:p>
+        </w:tc>
+        <w:tc>
+          <w:tcPr>
+            <w:tcW w:type="dxa" w:w="5760"/>
+            <w:vAlign w:val="center"/>
+            <w:tcMar>
+              <w:top w:w="80" w:type="dxa"/>
+              <w:bottom w:w="80" w:type="dxa"/>
+              <w:start w:w="120" w:type="dxa"/>
+              <w:end w:w="120" w:type="dxa"/>
+            </w:tcMar>
+          </w:tcPr>
+          <w:p>
+            <w:pPr>
+              <w:widowControl/>
+              <w:spacing w:before="0" w:after="0" w:line="252" w:lineRule="auto"/>
+            </w:pPr>
+            <w:r/>
+            <w:r>
+              <w:rPr>
+                <w:rFonts w:ascii="Calibri" w:hAnsi="Calibri"/>
+                <w:sz w:val="18"/>
+              </w:rPr>
+              <w:t>Stanza schemes, ending coverage, exact/slant pair counts, rhymed lines, and density</w:t>
+            </w:r>
+          </w:p>
+        </w:tc>
+      </w:tr>
+      <w:tr>
+        <w:trPr>
+          <w:cantSplit w:val="true"/>
+        </w:trPr>
+        <w:tc>
+          <w:tcPr>
+            <w:tcW w:type="dxa" w:w="3600"/>
+            <w:vAlign w:val="center"/>
+            <w:tcMar>
+              <w:top w:w="80" w:type="dxa"/>
+              <w:bottom w:w="80" w:type="dxa"/>
+              <w:start w:w="120" w:type="dxa"/>
+              <w:end w:w="120" w:type="dxa"/>
+            </w:tcMar>
+          </w:tcPr>
+          <w:p>
+            <w:pPr>
+              <w:widowControl/>
+              <w:spacing w:before="0" w:after="0" w:line="252" w:lineRule="auto"/>
+            </w:pPr>
+            <w:r/>
+            <w:r>
+              <w:rPr>
+                <w:rFonts w:ascii="Consolas" w:hAnsi="Consolas"/>
+                <w:color w:val="1F4D78"/>
+                <w:sz w:val="17"/>
+              </w:rPr>
+              <w:t>rhyme_lines.csv</w:t>
+            </w:r>
+          </w:p>
+        </w:tc>
+        <w:tc>
+          <w:tcPr>
+            <w:tcW w:type="dxa" w:w="5760"/>
+            <w:vAlign w:val="center"/>
+            <w:tcMar>
+              <w:top w:w="80" w:type="dxa"/>
+              <w:bottom w:w="80" w:type="dxa"/>
+              <w:start w:w="120" w:type="dxa"/>
+              <w:end w:w="120" w:type="dxa"/>
+            </w:tcMar>
+          </w:tcPr>
+          <w:p>
+            <w:pPr>
+              <w:widowControl/>
+              <w:spacing w:before="0" w:after="0" w:line="252" w:lineRule="auto"/>
+            </w:pPr>
+            <w:r/>
+            <w:r>
+              <w:rPr>
+                <w:rFonts w:ascii="Calibri" w:hAnsi="Calibri"/>
+                <w:sz w:val="18"/>
+              </w:rPr>
+              <w:t>Every physical line's end word, status, pronunciation/rhyme parts, scheme labels, refrain, internal-rhyme and recurring-sound evidence</w:t>
+            </w:r>
+          </w:p>
+        </w:tc>
+      </w:tr>
+      <w:tr>
+        <w:trPr>
+          <w:cantSplit w:val="true"/>
+        </w:trPr>
+        <w:tc>
+          <w:tcPr>
+            <w:tcW w:type="dxa" w:w="3600"/>
+            <w:vAlign w:val="center"/>
+            <w:tcMar>
+              <w:top w:w="80" w:type="dxa"/>
+              <w:bottom w:w="80" w:type="dxa"/>
+              <w:start w:w="120" w:type="dxa"/>
+              <w:end w:w="120" w:type="dxa"/>
+            </w:tcMar>
+          </w:tcPr>
+          <w:p>
+            <w:pPr>
+              <w:widowControl/>
+              <w:spacing w:before="0" w:after="0" w:line="252" w:lineRule="auto"/>
+            </w:pPr>
+            <w:r/>
+            <w:r>
+              <w:rPr>
+                <w:rFonts w:ascii="Consolas" w:hAnsi="Consolas"/>
+                <w:color w:val="1F4D78"/>
+                <w:sz w:val="17"/>
+              </w:rPr>
+              <w:t>rhyme_pairs.csv</w:t>
+            </w:r>
+          </w:p>
+        </w:tc>
+        <w:tc>
+          <w:tcPr>
+            <w:tcW w:type="dxa" w:w="5760"/>
+            <w:vAlign w:val="center"/>
+            <w:tcMar>
+              <w:top w:w="80" w:type="dxa"/>
+              <w:bottom w:w="80" w:type="dxa"/>
+              <w:start w:w="120" w:type="dxa"/>
+              <w:end w:w="120" w:type="dxa"/>
+            </w:tcMar>
+          </w:tcPr>
+          <w:p>
+            <w:pPr>
+              <w:widowControl/>
+              <w:spacing w:before="0" w:after="0" w:line="252" w:lineRule="auto"/>
+            </w:pPr>
+            <w:r/>
+            <w:r>
+              <w:rPr>
+                <w:rFonts w:ascii="Calibri" w:hAnsi="Calibri"/>
+                <w:sz w:val="18"/>
+              </w:rPr>
+              <w:t>Within-stanza ending pairs with relationship, rhyme types, graded similarity components, eye-rhyme evidence, and cautions</w:t>
+            </w:r>
+          </w:p>
+        </w:tc>
+      </w:tr>
+      <w:tr>
+        <w:trPr>
+          <w:cantSplit w:val="true"/>
+        </w:trPr>
+        <w:tc>
+          <w:tcPr>
+            <w:tcW w:type="dxa" w:w="3600"/>
+            <w:vAlign w:val="center"/>
+            <w:tcMar>
+              <w:top w:w="80" w:type="dxa"/>
+              <w:bottom w:w="80" w:type="dxa"/>
+              <w:start w:w="120" w:type="dxa"/>
+              <w:end w:w="120" w:type="dxa"/>
+            </w:tcMar>
+          </w:tcPr>
+          <w:p>
+            <w:pPr>
+              <w:widowControl/>
+              <w:spacing w:before="0" w:after="0" w:line="252" w:lineRule="auto"/>
+            </w:pPr>
+            <w:r/>
+            <w:r>
+              <w:rPr>
+                <w:rFonts w:ascii="Consolas" w:hAnsi="Consolas"/>
+                <w:color w:val="1F4D78"/>
+                <w:sz w:val="17"/>
+              </w:rPr>
+              <w:t>rhyme_internal.csv</w:t>
+            </w:r>
+          </w:p>
+        </w:tc>
+        <w:tc>
+          <w:tcPr>
+            <w:tcW w:type="dxa" w:w="5760"/>
+            <w:vAlign w:val="center"/>
+            <w:tcMar>
+              <w:top w:w="80" w:type="dxa"/>
+              <w:bottom w:w="80" w:type="dxa"/>
+              <w:start w:w="120" w:type="dxa"/>
+              <w:end w:w="120" w:type="dxa"/>
+            </w:tcMar>
+          </w:tcPr>
+          <w:p>
+            <w:pPr>
+              <w:widowControl/>
+              <w:spacing w:before="0" w:after="0" w:line="252" w:lineRule="auto"/>
+            </w:pPr>
+            <w:r/>
+            <w:r>
+              <w:rPr>
+                <w:rFonts w:ascii="Calibri" w:hAnsi="Calibri"/>
+                <w:sz w:val="18"/>
+              </w:rPr>
+              <w:t>Exact dictionary rhyme parts recurring between eligible words within one physical line</w:t>
+            </w:r>
+          </w:p>
+        </w:tc>
+      </w:tr>
+      <w:tr>
+        <w:trPr>
+          <w:cantSplit w:val="true"/>
+        </w:trPr>
+        <w:tc>
+          <w:tcPr>
+            <w:tcW w:type="dxa" w:w="3600"/>
+            <w:vAlign w:val="center"/>
+            <w:tcMar>
+              <w:top w:w="80" w:type="dxa"/>
+              <w:bottom w:w="80" w:type="dxa"/>
+              <w:start w:w="120" w:type="dxa"/>
+              <w:end w:w="120" w:type="dxa"/>
+            </w:tcMar>
+          </w:tcPr>
+          <w:p>
+            <w:pPr>
+              <w:widowControl/>
+              <w:spacing w:before="0" w:after="0" w:line="252" w:lineRule="auto"/>
+            </w:pPr>
+            <w:r/>
+            <w:r>
+              <w:rPr>
+                <w:rFonts w:ascii="Consolas" w:hAnsi="Consolas"/>
+                <w:color w:val="1F4D78"/>
+                <w:sz w:val="17"/>
+              </w:rPr>
+              <w:t>phonological_sounds.csv</w:t>
+            </w:r>
+          </w:p>
+        </w:tc>
+        <w:tc>
+          <w:tcPr>
+            <w:tcW w:type="dxa" w:w="5760"/>
+            <w:vAlign w:val="center"/>
+            <w:tcMar>
+              <w:top w:w="80" w:type="dxa"/>
+              <w:bottom w:w="80" w:type="dxa"/>
+              <w:start w:w="120" w:type="dxa"/>
+              <w:end w:w="120" w:type="dxa"/>
+            </w:tcMar>
+          </w:tcPr>
+          <w:p>
+            <w:pPr>
+              <w:widowControl/>
+              <w:spacing w:before="0" w:after="0" w:line="252" w:lineRule="auto"/>
+            </w:pPr>
+            <w:r/>
+            <w:r>
+              <w:rPr>
+                <w:rFonts w:ascii="Calibri" w:hAnsi="Calibri"/>
+                <w:sz w:val="18"/>
+              </w:rPr>
+              <w:t>Recurring initial consonants, stressed vowels, and consonants with occurrence and line counts</w:t>
+            </w:r>
+          </w:p>
+        </w:tc>
+      </w:tr>
+      <w:tr>
+        <w:trPr>
+          <w:cantSplit w:val="true"/>
+        </w:trPr>
+        <w:tc>
+          <w:tcPr>
+            <w:tcW w:type="dxa" w:w="3600"/>
+            <w:vAlign w:val="center"/>
+            <w:tcMar>
+              <w:top w:w="80" w:type="dxa"/>
+              <w:bottom w:w="80" w:type="dxa"/>
+              <w:start w:w="120" w:type="dxa"/>
+              <w:end w:w="120" w:type="dxa"/>
+            </w:tcMar>
+          </w:tcPr>
+          <w:p>
+            <w:pPr>
+              <w:widowControl/>
+              <w:spacing w:before="0" w:after="0" w:line="252" w:lineRule="auto"/>
+            </w:pPr>
+            <w:r/>
+            <w:r>
+              <w:rPr>
+                <w:rFonts w:ascii="Consolas" w:hAnsi="Consolas"/>
+                <w:color w:val="1F4D78"/>
+                <w:sz w:val="17"/>
+              </w:rPr>
+              <w:t>rhyme_result.json</w:t>
+            </w:r>
+          </w:p>
+        </w:tc>
+        <w:tc>
+          <w:tcPr>
+            <w:tcW w:type="dxa" w:w="5760"/>
+            <w:vAlign w:val="center"/>
+            <w:tcMar>
+              <w:top w:w="80" w:type="dxa"/>
+              <w:bottom w:w="80" w:type="dxa"/>
+              <w:start w:w="120" w:type="dxa"/>
+              <w:end w:w="120" w:type="dxa"/>
+            </w:tcMar>
+          </w:tcPr>
+          <w:p>
+            <w:pPr>
+              <w:widowControl/>
+              <w:spacing w:before="0" w:after="0" w:line="252" w:lineRule="auto"/>
+            </w:pPr>
+            <w:r/>
+            <w:r>
+              <w:rPr>
+                <w:rFonts w:ascii="Calibri" w:hAnsi="Calibri"/>
+                <w:sz w:val="18"/>
+              </w:rPr>
+              <w:t>Complete structured Stage 7 configuration, summary, stanza/line/pair evidence, sound families, coverage, warnings, and provenance</w:t>
             </w:r>
           </w:p>
         </w:tc>
@@ -14363,7 +15028,7 @@
           <w:rFonts w:ascii="Calibri" w:hAnsi="Calibri"/>
           <w:sz w:val="22"/>
         </w:rPr>
-        <w:t xml:space="preserve"> contains every Stage 5 candidate and decision, and </w:t>
+        <w:t xml:space="preserve"> contains every Stage 5 candidate and decision, </w:t>
       </w:r>
       <w:r>
         <w:rPr>
@@ -14378,7 +15043,7 @@
           <w:rFonts w:ascii="Calibri" w:hAnsi="Calibri"/>
           <w:sz w:val="22"/>
         </w:rPr>
-        <w:t xml:space="preserve"> contains every Stage 6 line, fixed-candidate, scheme, and method record. </w:t>
+        <w:t xml:space="preserve"> contains every Stage 6 line, fixed candidate, and method record, and </w:t>
       </w:r>
       <w:r>
         <w:rPr>
@@ -14386,6 +15051,21 @@
           <w:color w:val="1F4D78"/>
           <w:sz w:val="19"/>
         </w:rPr>
+        <w:t>rhyme_result.json</w:t>
+      </w:r>
+      <w:r>
+        <w:rPr>
+          <w:rFonts w:ascii="Calibri" w:hAnsi="Calibri"/>
+          <w:sz w:val="22"/>
+        </w:rPr>
+        <w:t xml:space="preserve"> contains every Stage 7 stanza, line, pair, sound-family, and method record. </w:t>
+      </w:r>
+      <w:r>
+        <w:rPr>
+          <w:rFonts w:ascii="Consolas" w:hAnsi="Consolas"/>
+          <w:color w:val="1F4D78"/>
+          <w:sz w:val="19"/>
+        </w:rPr>
         <w:t>poem_document.json</w:t>
       </w:r>
       <w:r>
@@ -14393,7 +15073,7 @@
           <w:rFonts w:ascii="Calibri" w:hAnsi="Calibri"/>
           <w:sz w:val="22"/>
         </w:rPr>
-        <w:t xml:space="preserve"> includes the original text, so protect it as research material. Concreteness, Frequency, AoA, Pronunciation, and Meter exports retain poem-specific provenance but do not copy any complete research source. The scholar summary is the easiest reading aid.</w:t>
+        <w:t xml:space="preserve"> includes the original text, so protect it as research material. Concreteness, Frequency, AoA, Pronunciation, Meter, and Rhyme &amp; Sound exports retain poem-specific provenance but do not copy any complete research source. The scholar summary is the easiest reading aid.</w:t>
       </w:r>
     </w:p>
     <w:p>
@@ -16978,6 +17658,31 @@
     </w:p>
     <w:p>
       <w:pPr>
+        <w:widowControl/>
+        <w:spacing w:before="0" w:after="120" w:line="300" w:lineRule="auto"/>
+      </w:pPr>
+      <w:r>
+        <w:rPr>
+          <w:rFonts w:ascii="Calibri" w:hAnsi="Calibri"/>
+          <w:sz w:val="22"/>
+        </w:rPr>
+        <w:t>Missing pronunciation produces a missing line fit, not zero. Fit is a similarity and confidence is rule-based; neither is a probability.</w:t>
+      </w:r>
+    </w:p>
+    <w:p>
+      <w:pPr>
+        <w:pStyle w:val="Heading2"/>
+      </w:pPr>
+      <w:r>
+        <w:rPr>
+          <w:rFonts w:ascii="Calibri" w:hAnsi="Calibri"/>
+          <w:sz w:val="22"/>
+        </w:rPr>
+        <w:t>Rhyme, slant, and recurring-sound formulas</w:t>
+      </w:r>
+    </w:p>
+    <w:p>
+      <w:pPr>
         <w:pStyle w:val="Formula"/>
       </w:pPr>
       <w:r>
@@ -16986,35 +17691,74 @@
           <w:color w:val="1F4D78"/>
           <w:sz w:val="19"/>
         </w:rPr>
-        <w:t>common_meter_complete_stanza_coverage = complete analyzable four-line stanzas / eligible stanzas</w:t>
-      </w:r>
-    </w:p>
-    <w:p>
-      <w:pPr>
-        <w:widowControl/>
-        <w:spacing w:before="0" w:after="120" w:line="300" w:lineRule="auto"/>
-      </w:pPr>
-      <w:r>
-        <w:rPr>
-          <w:rFonts w:ascii="Calibri" w:hAnsi="Calibri"/>
-          <w:sz w:val="22"/>
-        </w:rPr>
-        <w:t xml:space="preserve">The common-meter line template follows iambic foot counts </w:t>
-      </w:r>
+        <w:t>ending_coverage = analyzable eligible line endings / eligible line endings</w:t>
+      </w:r>
+    </w:p>
+    <w:p>
+      <w:pPr>
+        <w:pStyle w:val="Formula"/>
+      </w:pPr>
       <w:r>
         <w:rPr>
           <w:rFonts w:ascii="Consolas" w:hAnsi="Consolas"/>
           <w:color w:val="1F4D78"/>
           <w:sz w:val="19"/>
         </w:rPr>
-        <w:t>4-3-4-3</w:t>
-      </w:r>
-      <w:r>
-        <w:rPr>
-          <w:rFonts w:ascii="Calibri" w:hAnsi="Calibri"/>
-          <w:sz w:val="22"/>
-        </w:rPr>
-        <w:t>, restarted at each stanza. Missing pronunciation produces a missing line fit, not zero. Fit is a similarity and confidence is rule-based; neither is a probability.</w:t>
+        <w:t>rhyme_density = analyzable line endings in an exact within-stanza pair / analyzable line endings</w:t>
+      </w:r>
+    </w:p>
+    <w:p>
+      <w:pPr>
+        <w:pStyle w:val="Formula"/>
+      </w:pPr>
+      <w:r>
+        <w:rPr>
+          <w:rFonts w:ascii="Consolas" w:hAnsi="Consolas"/>
+          <w:color w:val="1F4D78"/>
+          <w:sz w:val="19"/>
+        </w:rPr>
+        <w:t>slant_similarity = 0.35(stressed_vowel) + 0.25(final_consonants) + 0.25(rhyme_part_edit) + 0.10(stress_alignment) + 0.05(syllable_similarity)</w:t>
+      </w:r>
+    </w:p>
+    <w:p>
+      <w:pPr>
+        <w:widowControl/>
+        <w:spacing w:before="0" w:after="120" w:line="300" w:lineRule="auto"/>
+      </w:pPr>
+      <w:r>
+        <w:rPr>
+          <w:rFonts w:ascii="Calibri" w:hAnsi="Calibri"/>
+          <w:sz w:val="22"/>
+        </w:rPr>
+        <w:t xml:space="preserve">For multiple retained pronunciations, the minimum combination score controls the conservative relationship and the maximum is also retained. The default slant threshold is </w:t>
+      </w:r>
+      <w:r>
+        <w:rPr>
+          <w:rFonts w:ascii="Consolas" w:hAnsi="Consolas"/>
+          <w:color w:val="1F4D78"/>
+          <w:sz w:val="19"/>
+        </w:rPr>
+        <w:t>0.68</w:t>
+      </w:r>
+      <w:r>
+        <w:rPr>
+          <w:rFonts w:ascii="Calibri" w:hAnsi="Calibri"/>
+          <w:sz w:val="22"/>
+        </w:rPr>
+        <w:t>. This configured similarity is not a probability.</w:t>
+      </w:r>
+    </w:p>
+    <w:p>
+      <w:pPr>
+        <w:widowControl/>
+        <w:spacing w:before="0" w:after="120" w:line="300" w:lineRule="auto"/>
+      </w:pPr>
+      <w:r>
+        <w:rPr>
+          <w:rFonts w:ascii="Calibri" w:hAnsi="Calibri"/>
+          <w:sz w:val="22"/>
+        </w:rPr>
+        <w:t>Alliteration and assonance densities divide supported words participating in a repeated within-line sound by supported words. Consonance density divides repeated consonant occurrences by resolved consonant occurrences.</w:t>
       </w:r>
     </w:p>
     <w:p>
@@ -17744,64 +18488,7 @@
                 <w:rFonts w:ascii="Calibri" w:hAnsi="Calibri"/>
                 <w:sz w:val="18"/>
               </w:rPr>
-              <w:t>Nearest configured stress template or stanza-aware scheme; not definitive meter or performed rhythm</w:t>
-            </w:r>
-          </w:p>
-        </w:tc>
-      </w:tr>
-      <w:tr>
-        <w:trPr>
-          <w:cantSplit w:val="true"/>
-        </w:trPr>
-        <w:tc>
-          <w:tcPr>
-            <w:tcW w:type="dxa" w:w="3600"/>
-            <w:vAlign w:val="center"/>
-            <w:tcMar>
-              <w:top w:w="80" w:type="dxa"/>
-              <w:bottom w:w="80" w:type="dxa"/>
-              <w:start w:w="120" w:type="dxa"/>
-              <w:end w:w="120" w:type="dxa"/>
-            </w:tcMar>
-          </w:tcPr>
-          <w:p>
-            <w:pPr>
-              <w:widowControl/>
-              <w:spacing w:before="0" w:after="0" w:line="252" w:lineRule="auto"/>
-            </w:pPr>
-            <w:r/>
-            <w:r>
-              <w:rPr>
-                <w:rFonts w:ascii="Calibri" w:hAnsi="Calibri"/>
-                <w:sz w:val="18"/>
-              </w:rPr>
-              <w:t>Common meter</w:t>
-            </w:r>
-          </w:p>
-        </w:tc>
-        <w:tc>
-          <w:tcPr>
-            <w:tcW w:type="dxa" w:w="5760"/>
-            <w:vAlign w:val="center"/>
-            <w:tcMar>
-              <w:top w:w="80" w:type="dxa"/>
-              <w:bottom w:w="80" w:type="dxa"/>
-              <w:start w:w="120" w:type="dxa"/>
-              <w:end w:w="120" w:type="dxa"/>
-            </w:tcMar>
-          </w:tcPr>
-          <w:p>
-            <w:pPr>
-              <w:widowControl/>
-              <w:spacing w:before="0" w:after="0" w:line="252" w:lineRule="auto"/>
-            </w:pPr>
-            <w:r/>
-            <w:r>
-              <w:rPr>
-                <w:rFonts w:ascii="Calibri" w:hAnsi="Calibri"/>
-                <w:sz w:val="18"/>
-              </w:rPr>
-              <w:t>Stanza-aware alternating iambic tetrameter/trimeter scheme with foot-count cycle 4-3-4-3</w:t>
+              <w:t>Nearest configured fixed stress template; not definitive meter or performed rhythm</w:t>
             </w:r>
           </w:p>
         </w:tc>
@@ -18459,6 +19146,177 @@
                 <w:rFonts w:ascii="Calibri" w:hAnsi="Calibri"/>
                 <w:sz w:val="18"/>
               </w:rPr>
+              <w:t>Graded slant evidence</w:t>
+            </w:r>
+          </w:p>
+        </w:tc>
+        <w:tc>
+          <w:tcPr>
+            <w:tcW w:type="dxa" w:w="5760"/>
+            <w:vAlign w:val="center"/>
+            <w:tcMar>
+              <w:top w:w="80" w:type="dxa"/>
+              <w:bottom w:w="80" w:type="dxa"/>
+              <w:start w:w="120" w:type="dxa"/>
+              <w:end w:w="120" w:type="dxa"/>
+            </w:tcMar>
+          </w:tcPr>
+          <w:p>
+            <w:pPr>
+              <w:widowControl/>
+              <w:spacing w:before="0" w:after="0" w:line="252" w:lineRule="auto"/>
+            </w:pPr>
+            <w:r/>
+            <w:r>
+              <w:rPr>
+                <w:rFonts w:ascii="Calibri" w:hAnsi="Calibri"/>
+                <w:sz w:val="18"/>
+              </w:rPr>
+              <w:t>Configured similarity across stressed vowel, final consonants, rhyme-part edit, stress alignment, and syllable count; not a probability</w:t>
+            </w:r>
+          </w:p>
+        </w:tc>
+      </w:tr>
+      <w:tr>
+        <w:trPr>
+          <w:cantSplit w:val="true"/>
+        </w:trPr>
+        <w:tc>
+          <w:tcPr>
+            <w:tcW w:type="dxa" w:w="3600"/>
+            <w:vAlign w:val="center"/>
+            <w:tcMar>
+              <w:top w:w="80" w:type="dxa"/>
+              <w:bottom w:w="80" w:type="dxa"/>
+              <w:start w:w="120" w:type="dxa"/>
+              <w:end w:w="120" w:type="dxa"/>
+            </w:tcMar>
+          </w:tcPr>
+          <w:p>
+            <w:pPr>
+              <w:widowControl/>
+              <w:spacing w:before="0" w:after="0" w:line="252" w:lineRule="auto"/>
+            </w:pPr>
+            <w:r/>
+            <w:r>
+              <w:rPr>
+                <w:rFonts w:ascii="Calibri" w:hAnsi="Calibri"/>
+                <w:sz w:val="18"/>
+              </w:rPr>
+              <w:t>Identical rhyme</w:t>
+            </w:r>
+          </w:p>
+        </w:tc>
+        <w:tc>
+          <w:tcPr>
+            <w:tcW w:type="dxa" w:w="5760"/>
+            <w:vAlign w:val="center"/>
+            <w:tcMar>
+              <w:top w:w="80" w:type="dxa"/>
+              <w:bottom w:w="80" w:type="dxa"/>
+              <w:start w:w="120" w:type="dxa"/>
+              <w:end w:w="120" w:type="dxa"/>
+            </w:tcMar>
+          </w:tcPr>
+          <w:p>
+            <w:pPr>
+              <w:widowControl/>
+              <w:spacing w:before="0" w:after="0" w:line="252" w:lineRule="auto"/>
+            </w:pPr>
+            <w:r/>
+            <w:r>
+              <w:rPr>
+                <w:rFonts w:ascii="Calibri" w:hAnsi="Calibri"/>
+                <w:sz w:val="18"/>
+              </w:rPr>
+              <w:t>Complete retained phonological endings agree, including repeated words or homophonic complete endings</w:t>
+            </w:r>
+          </w:p>
+        </w:tc>
+      </w:tr>
+      <w:tr>
+        <w:trPr>
+          <w:cantSplit w:val="true"/>
+        </w:trPr>
+        <w:tc>
+          <w:tcPr>
+            <w:tcW w:type="dxa" w:w="3600"/>
+            <w:vAlign w:val="center"/>
+            <w:tcMar>
+              <w:top w:w="80" w:type="dxa"/>
+              <w:bottom w:w="80" w:type="dxa"/>
+              <w:start w:w="120" w:type="dxa"/>
+              <w:end w:w="120" w:type="dxa"/>
+            </w:tcMar>
+          </w:tcPr>
+          <w:p>
+            <w:pPr>
+              <w:widowControl/>
+              <w:spacing w:before="0" w:after="0" w:line="252" w:lineRule="auto"/>
+            </w:pPr>
+            <w:r/>
+            <w:r>
+              <w:rPr>
+                <w:rFonts w:ascii="Calibri" w:hAnsi="Calibri"/>
+                <w:sz w:val="18"/>
+              </w:rPr>
+              <w:t>Internal rhyme</w:t>
+            </w:r>
+          </w:p>
+        </w:tc>
+        <w:tc>
+          <w:tcPr>
+            <w:tcW w:type="dxa" w:w="5760"/>
+            <w:vAlign w:val="center"/>
+            <w:tcMar>
+              <w:top w:w="80" w:type="dxa"/>
+              <w:bottom w:w="80" w:type="dxa"/>
+              <w:start w:w="120" w:type="dxa"/>
+              <w:end w:w="120" w:type="dxa"/>
+            </w:tcMar>
+          </w:tcPr>
+          <w:p>
+            <w:pPr>
+              <w:widowControl/>
+              <w:spacing w:before="0" w:after="0" w:line="252" w:lineRule="auto"/>
+            </w:pPr>
+            <w:r/>
+            <w:r>
+              <w:rPr>
+                <w:rFonts w:ascii="Calibri" w:hAnsi="Calibri"/>
+                <w:sz w:val="18"/>
+              </w:rPr>
+              <w:t>Exact dictionary rhyme parts recur between eligible words within one physical line</w:t>
+            </w:r>
+          </w:p>
+        </w:tc>
+      </w:tr>
+      <w:tr>
+        <w:trPr>
+          <w:cantSplit w:val="true"/>
+        </w:trPr>
+        <w:tc>
+          <w:tcPr>
+            <w:tcW w:type="dxa" w:w="3600"/>
+            <w:vAlign w:val="center"/>
+            <w:tcMar>
+              <w:top w:w="80" w:type="dxa"/>
+              <w:bottom w:w="80" w:type="dxa"/>
+              <w:start w:w="120" w:type="dxa"/>
+              <w:end w:w="120" w:type="dxa"/>
+            </w:tcMar>
+          </w:tcPr>
+          <w:p>
+            <w:pPr>
+              <w:widowControl/>
+              <w:spacing w:before="0" w:after="0" w:line="252" w:lineRule="auto"/>
+            </w:pPr>
+            <w:r/>
+            <w:r>
+              <w:rPr>
+                <w:rFonts w:ascii="Calibri" w:hAnsi="Calibri"/>
+                <w:sz w:val="18"/>
+              </w:rPr>
               <w:t>Lemma</w:t>
             </w:r>
           </w:p>
@@ -18600,6 +19458,150 @@
                 <w:sz w:val="18"/>
               </w:rPr>
               <w:t>A word or phrase and its source-supplied value or association</w:t>
+            </w:r>
+          </w:p>
+        </w:tc>
+      </w:tr>
+      <w:tr>
+        <w:trPr>
+          <w:cantSplit w:val="true"/>
+        </w:trPr>
+        <w:tc>
+          <w:tcPr>
+            <w:tcW w:type="dxa" w:w="3600"/>
+            <w:vAlign w:val="center"/>
+            <w:tcMar>
+              <w:top w:w="80" w:type="dxa"/>
+              <w:bottom w:w="80" w:type="dxa"/>
+              <w:start w:w="120" w:type="dxa"/>
+              <w:end w:w="120" w:type="dxa"/>
+            </w:tcMar>
+          </w:tcPr>
+          <w:p>
+            <w:pPr>
+              <w:widowControl/>
+              <w:spacing w:before="0" w:after="0" w:line="252" w:lineRule="auto"/>
+            </w:pPr>
+            <w:r/>
+            <w:r>
+              <w:rPr>
+                <w:rFonts w:ascii="Calibri" w:hAnsi="Calibri"/>
+                <w:sz w:val="18"/>
+              </w:rPr>
+              <w:t>Perfect rhyme</w:t>
+            </w:r>
+          </w:p>
+        </w:tc>
+        <w:tc>
+          <w:tcPr>
+            <w:tcW w:type="dxa" w:w="5760"/>
+            <w:vAlign w:val="center"/>
+            <w:tcMar>
+              <w:top w:w="80" w:type="dxa"/>
+              <w:bottom w:w="80" w:type="dxa"/>
+              <w:start w:w="120" w:type="dxa"/>
+              <w:end w:w="120" w:type="dxa"/>
+            </w:tcMar>
+          </w:tcPr>
+          <w:p>
+            <w:pPr>
+              <w:widowControl/>
+              <w:spacing w:before="0" w:after="0" w:line="252" w:lineRule="auto"/>
+            </w:pPr>
+            <w:r/>
+            <w:r>
+              <w:rPr>
+                <w:rFonts w:ascii="Calibri" w:hAnsi="Calibri"/>
+                <w:sz w:val="18"/>
+              </w:rPr>
+              <w:t>Robust line-ending rhyme parts agree while complete retained endings are not identical</w:t>
+            </w:r>
+          </w:p>
+        </w:tc>
+      </w:tr>
+      <w:tr>
+        <w:trPr>
+          <w:cantSplit w:val="true"/>
+        </w:trPr>
+        <w:tc>
+          <w:tcPr>
+            <w:tcW w:type="dxa" w:w="3600"/>
+            <w:vAlign w:val="center"/>
+            <w:tcMar>
+              <w:top w:w="80" w:type="dxa"/>
+              <w:bottom w:w="80" w:type="dxa"/>
+              <w:start w:w="120" w:type="dxa"/>
+              <w:end w:w="120" w:type="dxa"/>
+            </w:tcMar>
+          </w:tcPr>
+          <w:p>
+            <w:pPr>
+              <w:widowControl/>
+              <w:spacing w:before="0" w:after="0" w:line="252" w:lineRule="auto"/>
+            </w:pPr>
+            <w:r/>
+            <w:r>
+              <w:rPr>
+                <w:rFonts w:ascii="Calibri" w:hAnsi="Calibri"/>
+                <w:sz w:val="18"/>
+              </w:rPr>
+              <w:t>Rhyme scheme</w:t>
+            </w:r>
+          </w:p>
+        </w:tc>
+        <w:tc>
+          <w:tcPr>
+            <w:tcW w:type="dxa" w:w="5760"/>
+            <w:vAlign w:val="center"/>
+            <w:tcMar>
+              <w:top w:w="80" w:type="dxa"/>
+              <w:bottom w:w="80" w:type="dxa"/>
+              <w:start w:w="120" w:type="dxa"/>
+              <w:end w:w="120" w:type="dxa"/>
+            </w:tcMar>
+          </w:tcPr>
+          <w:p>
+            <w:pPr>
+              <w:widowControl/>
+              <w:spacing w:before="0" w:after="0" w:line="252" w:lineRule="auto"/>
+            </w:pPr>
+            <w:r/>
+            <w:r>
+              <w:rPr>
+                <w:rFonts w:ascii="Calibri" w:hAnsi="Calibri"/>
+                <w:sz w:val="18"/>
+              </w:rPr>
+              <w:t xml:space="preserve">Letter sequence formed only from robust perfect/identical groups; </w:t>
+            </w:r>
+            <w:r>
+              <w:rPr>
+                <w:rFonts w:ascii="Consolas" w:hAnsi="Consolas"/>
+                <w:color w:val="1F4D78"/>
+                <w:sz w:val="17"/>
+              </w:rPr>
+              <w:t>x</w:t>
+            </w:r>
+            <w:r>
+              <w:rPr>
+                <w:rFonts w:ascii="Calibri" w:hAnsi="Calibri"/>
+                <w:sz w:val="18"/>
+              </w:rPr>
+              <w:t xml:space="preserve"> is analyzable and ungrouped, </w:t>
+            </w:r>
+            <w:r>
+              <w:rPr>
+                <w:rFonts w:ascii="Consolas" w:hAnsi="Consolas"/>
+                <w:color w:val="1F4D78"/>
+                <w:sz w:val="17"/>
+              </w:rPr>
+              <w:t>?</w:t>
+            </w:r>
+            <w:r>
+              <w:rPr>
+                <w:rFonts w:ascii="Calibri" w:hAnsi="Calibri"/>
+                <w:sz w:val="18"/>
+              </w:rPr>
+              <w:t xml:space="preserve"> unresolved</w:t>
             </w:r>
           </w:p>
         </w:tc>
@@ -21561,7 +22563,7 @@
           <w:rFonts w:ascii="Calibri" w:hAnsi="Calibri"/>
           <w:sz w:val="22"/>
         </w:rPr>
-        <w:t>Common meter is the only stanza-aware alternating scheme currently</w:t>
+        <w:t>Meter &amp; Rhythm is currently an optional one-poem in-memory module; it is not</w:t>
       </w:r>
     </w:p>
     <w:p>
@@ -21574,7 +22576,7 @@
           <w:rFonts w:ascii="Calibri" w:hAnsi="Calibri"/>
           <w:sz w:val="22"/>
         </w:rPr>
-        <w:t xml:space="preserve">  implemented; rhyme remains Stage 7.</w:t>
+        <w:t xml:space="preserve">  yet persisted or aggregated in corpus projects.</w:t>
       </w:r>
     </w:p>
     <w:p>
@@ -21592,7 +22594,7 @@
           <w:rFonts w:ascii="Calibri" w:hAnsi="Calibri"/>
           <w:sz w:val="22"/>
         </w:rPr>
-        <w:t>Meter &amp; Rhythm is currently an optional one-poem in-memory module; it is not</w:t>
+        <w:t>Stage 7 starts from North American dictionary phones and spelling; dialect,</w:t>
       </w:r>
     </w:p>
     <w:p>
@@ -21605,6 +22607,68 @@
           <w:rFonts w:ascii="Calibri" w:hAnsi="Calibri"/>
           <w:sz w:val="22"/>
         </w:rPr>
+        <w:t xml:space="preserve">  historical pronunciation, performance, and poetic elision can change rhyme   and recurring-sound evidence.</w:t>
+      </w:r>
+    </w:p>
+    <w:p>
+      <w:pPr>
+        <w:widowControl/>
+        <w:numPr>
+          <w:ilvl w:val="0"/>
+          <w:numId w:val="10"/>
+        </w:numPr>
+        <w:spacing w:before="0" w:after="80" w:line="300" w:lineRule="auto"/>
+        <w:ind w:left="540" w:hanging="271"/>
+      </w:pPr>
+      <w:r>
+        <w:rPr>
+          <w:rFonts w:ascii="Calibri" w:hAnsi="Calibri"/>
+          <w:sz w:val="22"/>
+        </w:rPr>
+        <w:t>Slant, eye, internal-rhyme, alliteration, assonance, and consonance methods</w:t>
+      </w:r>
+    </w:p>
+    <w:p>
+      <w:pPr>
+        <w:widowControl/>
+        <w:spacing w:before="0" w:after="120" w:line="300" w:lineRule="auto"/>
+      </w:pPr>
+      <w:r>
+        <w:rPr>
+          <w:rFonts w:ascii="Calibri" w:hAnsi="Calibri"/>
+          <w:sz w:val="22"/>
+        </w:rPr>
+        <w:t xml:space="preserve">  are transparent descriptive heuristics, not probabilities or claims about   authorial intention or perceptual effect.</w:t>
+      </w:r>
+    </w:p>
+    <w:p>
+      <w:pPr>
+        <w:widowControl/>
+        <w:numPr>
+          <w:ilvl w:val="0"/>
+          <w:numId w:val="10"/>
+        </w:numPr>
+        <w:spacing w:before="0" w:after="80" w:line="300" w:lineRule="auto"/>
+        <w:ind w:left="540" w:hanging="271"/>
+      </w:pPr>
+      <w:r>
+        <w:rPr>
+          <w:rFonts w:ascii="Calibri" w:hAnsi="Calibri"/>
+          <w:sz w:val="22"/>
+        </w:rPr>
+        <w:t>Rhyme &amp; Sound is currently an optional one-poem in-memory module; it is not</w:t>
+      </w:r>
+    </w:p>
+    <w:p>
+      <w:pPr>
+        <w:widowControl/>
+        <w:spacing w:before="0" w:after="120" w:line="300" w:lineRule="auto"/>
+      </w:pPr>
+      <w:r>
+        <w:rPr>
+          <w:rFonts w:ascii="Calibri" w:hAnsi="Calibri"/>
+          <w:sz w:val="22"/>
+        </w:rPr>
         <w:t xml:space="preserve">  yet persisted or aggregated in corpus projects.</w:t>
       </w:r>
     </w:p>
@@ -21630,7 +22694,7 @@
           <w:rFonts w:ascii="Calibri" w:hAnsi="Calibri"/>
           <w:sz w:val="22"/>
         </w:rPr>
-        <w:t>Every analysis should retain the active lexicon or optional research resource, source checksum, adapter version, software version, preprocessing recipe and configuration ID, phrase policy, stopword policy, scenario, and inclusion decisions. Completed corpus runs remain linked to preserved text versions. A concreteness result additionally retains its orientation thresholds, proper-name and phrase policies, low-coverage threshold, source-row matches, and exact workbook checksum. A frequency result retains its Zipf-band thresholds, proper-name policy, exact-before-lemma rule, optional content-word scope, low-coverage threshold, source-row matches, and exact SUBTLEX-US workbook checksum. An AoA result retains early/later thresholds, proper-name policy, exact-before-lemma rule, optional contextual content-word scope, coverage and source-response cautions, source-row matches, optional relationship methods, and the exact official erratum-supplement checksum. A pronunciation result retains every dictionary candidate, three exact source checksums, package and adapter versions, exact observed-form policy, thresholds, scholar overrides and notes, configuration identity, missingness, and physical-line completeness. A meter result retains the linked pronunciation configuration, every penalty and threshold, all fixed and scheme candidates, candidate-specific stress paths, line coverage, alignment operations, deviations, fit, confidence explanation, and dependency resource hashes.</w:t>
+        <w:t>Every analysis should retain the active lexicon or optional research resource, source checksum, adapter version, software version, preprocessing recipe and configuration ID, phrase policy, stopword policy, scenario, and inclusion decisions. Completed corpus runs remain linked to preserved text versions. A concreteness result additionally retains its orientation thresholds, proper-name and phrase policies, low-coverage threshold, source-row matches, and exact workbook checksum. A frequency result retains its Zipf-band thresholds, proper-name policy, exact-before-lemma rule, optional content-word scope, low-coverage threshold, source-row matches, and exact SUBTLEX-US workbook checksum. An AoA result retains early/later thresholds, proper-name policy, exact-before-lemma rule, optional contextual content-word scope, coverage and source-response cautions, source-row matches, optional relationship methods, and the exact official erratum-supplement checksum. A pronunciation result retains every dictionary candidate, three exact source checksums, package and adapter versions, exact observed-form policy, thresholds, scholar overrides and notes, configuration identity, missingness, and physical-line completeness. A meter result retains the linked pronunciation configuration, every penalty and threshold, all fixed candidates, candidate-specific stress paths, line coverage, alignment operations, deviations, fit, confidence explanation, and dependency resource hashes. A Stage 7 result retains the linked pronunciation configuration, exact resource hashes, rhyme/sound thresholds and weights, line-ending coverage, stanza/line/pair evidence, sound families, warnings, and immutable result/configuration identities.</w:t>
       </w:r>
     </w:p>
     <w:p>
@@ -21897,7 +22961,7 @@
         <w:color w:val="66727C"/>
         <w:sz w:val="18"/>
       </w:rPr>
-      <w:t xml:space="preserve">  |  0.12.0.dev0</w:t>
+      <w:t xml:space="preserve">  |  0.13.0.dev0</w:t>
     </w:r>
   </w:p>
 </w:hdr>

</xml_diff>

<commit_message>
Complete narrowed lexical style stage
</commit_message>
<xml_diff>
--- a/docs/VerseVAD_User_Manual.docx
+++ b/docs/VerseVAD_User_Manual.docx
@@ -47,7 +47,7 @@
           <w:color w:val="66727C"/>
           <w:sz w:val="21"/>
         </w:rPr>
-        <w:t xml:space="preserve"> 0.13.0.dev0</w:t>
+        <w:t xml:space="preserve"> 0.14.0.dev0</w:t>
       </w:r>
       <w:r>
         <w:rPr>
@@ -159,7 +159,7 @@
                 <w:color w:val="193247"/>
                 <w:sz w:val="22"/>
               </w:rPr>
-              <w:t>, optional dictionary-based pronunciation evidence, and transparent candidate-meter comparisons. Concreteness, corpus-relative frequency, retrospective Age of Acquisition, pronunciation/lexical-stress, and meter-fit results remain separate constructs. VerseVAD does not determine the emotion of a poem, speaker, author, or reader, diagnose cognition, establish definitive meter or performed rhythm, or replace contextual close reading.</w:t>
+              <w:t>, optional dictionary-based pronunciation evidence, transparent candidate-meter comparisons, phonological patterns, and lexical-style counts. Concreteness, corpus-relative frequency, retrospective Age of Acquisition, pronunciation/lexical stress, meter fit, rhyme/sound evidence, lexical diversity, word length, and structural word counts remain separate constructs. VerseVAD does not determine the emotion of a poem, speaker, author, or reader, diagnose cognition, establish definitive meter or performed rhythm, or replace contextual close reading.</w:t>
             </w:r>
           </w:p>
         </w:tc>
@@ -604,6 +604,40 @@
                 <w:color w:val="193247"/>
                 <w:sz w:val="22"/>
               </w:rPr>
+              <w:t xml:space="preserve">, </w:t>
+            </w:r>
+            <w:r>
+              <w:rPr>
+                <w:rFonts w:ascii="Calibri" w:hAnsi="Calibri"/>
+                <w:b/>
+                <w:color w:val="193247"/>
+                <w:sz w:val="22"/>
+              </w:rPr>
+              <w:t>Meter &amp; Rhythm</w:t>
+            </w:r>
+            <w:r>
+              <w:rPr>
+                <w:rFonts w:ascii="Calibri" w:hAnsi="Calibri"/>
+                <w:color w:val="193247"/>
+                <w:sz w:val="22"/>
+              </w:rPr>
+              <w:t xml:space="preserve">, </w:t>
+            </w:r>
+            <w:r>
+              <w:rPr>
+                <w:rFonts w:ascii="Calibri" w:hAnsi="Calibri"/>
+                <w:b/>
+                <w:color w:val="193247"/>
+                <w:sz w:val="22"/>
+              </w:rPr>
+              <w:t>Rhyme &amp; Sound</w:t>
+            </w:r>
+            <w:r>
+              <w:rPr>
+                <w:rFonts w:ascii="Calibri" w:hAnsi="Calibri"/>
+                <w:color w:val="193247"/>
+                <w:sz w:val="22"/>
+              </w:rPr>
               <w:t xml:space="preserve">, and </w:t>
             </w:r>
             <w:r>
@@ -613,7 +647,7 @@
                 <w:color w:val="193247"/>
                 <w:sz w:val="22"/>
               </w:rPr>
-              <w:t>Meter &amp; Rhythm</w:t>
+              <w:t>Lexical Style</w:t>
             </w:r>
             <w:r>
               <w:rPr>
@@ -1102,7 +1136,38 @@
           <w:rFonts w:ascii="Calibri" w:hAnsi="Calibri"/>
           <w:sz w:val="22"/>
         </w:rPr>
-        <w:t xml:space="preserve">  masculine/feminine/multisyllabic evidence, graded slant and eye rhyme,   internal rhyme, refrains, phonemic alliteration, assonance, consonance,   line-ending coverage, and complete line/pair audit evidence.</w:t>
+        <w:t xml:space="preserve">  masculine/feminine/multisyllabic evidence, graded slant and eye rhyme,   internal rhyme, refrains, phonemic alliteration, assonance, consonance,   line-ending coverage, and complete line/pair audit evidence; and</w:t>
+      </w:r>
+    </w:p>
+    <w:p>
+      <w:pPr>
+        <w:widowControl/>
+        <w:numPr>
+          <w:ilvl w:val="0"/>
+          <w:numId w:val="10"/>
+        </w:numPr>
+        <w:spacing w:before="0" w:after="80" w:line="300" w:lineRule="auto"/>
+        <w:ind w:left="540" w:hanging="271"/>
+      </w:pPr>
+      <w:r>
+        <w:rPr>
+          <w:rFonts w:ascii="Calibri" w:hAnsi="Calibri"/>
+          <w:sz w:val="22"/>
+        </w:rPr>
+        <w:t>optional surface-form lexical diversity, alphabetic word length, and</w:t>
+      </w:r>
+    </w:p>
+    <w:p>
+      <w:pPr>
+        <w:widowControl/>
+        <w:spacing w:before="0" w:after="120" w:line="300" w:lineRule="auto"/>
+      </w:pPr>
+      <w:r>
+        <w:rPr>
+          <w:rFonts w:ascii="Calibri" w:hAnsi="Calibri"/>
+          <w:sz w:val="22"/>
+        </w:rPr>
+        <w:t xml:space="preserve">  physical-line and stanza word-count evidence with complete token and   structural audits.</w:t>
       </w:r>
     </w:p>
     <w:p>
@@ -7954,7 +8019,7 @@
           <w:rFonts w:ascii="Calibri" w:hAnsi="Calibri"/>
           <w:sz w:val="22"/>
         </w:rPr>
-        <w:t>Eight emotion associations</w:t>
+        <w:t>Lexical diversity, word length, and structural word counts</w:t>
       </w:r>
     </w:p>
     <w:p>
@@ -7967,7 +8032,22 @@
           <w:rFonts w:ascii="Calibri" w:hAnsi="Calibri"/>
           <w:sz w:val="22"/>
         </w:rPr>
-        <w:t>NRC Emotion values are binary, multi-label associations. VerseVAD reports the eight emotions—anger, anticipation, disgust, fear, joy, sadness, surprise, and trust—in their own section. An entry can be associated with several categories, so percentages do not need to total 100 percent. Read the labeled denominator.</w:t>
+        <w:t xml:space="preserve">The optional </w:t>
+      </w:r>
+      <w:r>
+        <w:rPr>
+          <w:rFonts w:ascii="Calibri" w:hAnsi="Calibri"/>
+          <w:b/>
+          <w:sz w:val="22"/>
+        </w:rPr>
+        <w:t>Lexical Style</w:t>
+      </w:r>
+      <w:r>
+        <w:rPr>
+          <w:rFonts w:ascii="Calibri" w:hAnsi="Calibri"/>
+          <w:sz w:val="22"/>
+        </w:rPr>
+        <w:t xml:space="preserve"> module uses the shared poetry-preserving processing record and requires no external dataset. The broader planned visible-structure and syntax/lineation modules were skipped at the scholar's direction.</w:t>
       </w:r>
     </w:p>
     <w:p>
@@ -7980,19 +8060,7 @@
           <w:rFonts w:ascii="Calibri" w:hAnsi="Calibri"/>
           <w:sz w:val="22"/>
         </w:rPr>
-        <w:t>“Fear-associated vocabulary” is appropriate wording. “The poem is afraid” is not.</w:t>
-      </w:r>
-    </w:p>
-    <w:p>
-      <w:pPr>
-        <w:pStyle w:val="Heading2"/>
-      </w:pPr>
-      <w:r>
-        <w:rPr>
-          <w:rFonts w:ascii="Calibri" w:hAnsi="Calibri"/>
-          <w:sz w:val="22"/>
-        </w:rPr>
-        <w:t>Positive and negative sentiment associations</w:t>
+        <w:t>One counted word is one shared-preprocessing lexical token. Punctuation and numeric tokens are excluded. This word unit may differ from an editor's orthographic convention for a contraction or hyphenated expression, so the token audit preserves exact surfaces, offsets, and inclusion reasons.</w:t>
       </w:r>
     </w:p>
     <w:p>
@@ -8005,32 +8073,7 @@
           <w:rFonts w:ascii="Calibri" w:hAnsi="Calibri"/>
           <w:sz w:val="22"/>
         </w:rPr>
-        <w:t>Positive and negative are broad sentiment labels in NRC Emotion. VerseVAD analyzes them with the same documented occurrence-counting logic but reports them separately from the eight emotions. They are not endpoints of the VAD valence scale, and their rates need not sum to 100 percent.</w:t>
-      </w:r>
-    </w:p>
-    <w:p>
-      <w:pPr>
-        <w:pStyle w:val="Heading2"/>
-      </w:pPr>
-      <w:r>
-        <w:rPr>
-          <w:rFonts w:ascii="Calibri" w:hAnsi="Calibri"/>
-          <w:sz w:val="22"/>
-        </w:rPr>
-        <w:t>Emotion intensity</w:t>
-      </w:r>
-    </w:p>
-    <w:p>
-      <w:pPr>
-        <w:widowControl/>
-        <w:spacing w:before="0" w:after="120" w:line="300" w:lineRule="auto"/>
-      </w:pPr>
-      <w:r>
-        <w:rPr>
-          <w:rFonts w:ascii="Calibri" w:hAnsi="Calibri"/>
-          <w:sz w:val="22"/>
-        </w:rPr>
-        <w:t>NRC Emotion Intensity supplies numeric values only for particular word-emotion pairs. VerseVAD keeps:</w:t>
+        <w:t>Lexical diversity uses normalized observed surface forms. Lemmas remain separate audit evidence and never silently replace the forms present in the poem. The module reports:</w:t>
       </w:r>
     </w:p>
     <w:p>
@@ -8048,7 +8091,7 @@
           <w:rFonts w:ascii="Calibri" w:hAnsi="Calibri"/>
           <w:sz w:val="22"/>
         </w:rPr>
-        <w:t>prevalence of matched pairs;</w:t>
+        <w:t>descriptive lexical-token, normalized surface-type, and plain TTR values;</w:t>
       </w:r>
     </w:p>
     <w:p>
@@ -8066,7 +8109,7 @@
           <w:rFonts w:ascii="Calibri" w:hAnsi="Calibri"/>
           <w:sz w:val="22"/>
         </w:rPr>
-        <w:t>token-weighted mean intensity among supplied pairs;</w:t>
+        <w:t>MATTR across every overlapping configured token window;</w:t>
       </w:r>
     </w:p>
     <w:p>
@@ -8084,7 +8127,7 @@
           <w:rFonts w:ascii="Calibri" w:hAnsi="Calibri"/>
           <w:sz w:val="22"/>
         </w:rPr>
-        <w:t>type-weighted mean intensity among supplied pairs.</w:t>
+        <w:t>HD-D as the expected distinct-type proportion in a configured</w:t>
       </w:r>
     </w:p>
     <w:p>
@@ -8097,155 +8140,7 @@
           <w:rFonts w:ascii="Calibri" w:hAnsi="Calibri"/>
           <w:sz w:val="22"/>
         </w:rPr>
-        <w:t>An absent word-emotion pair is missing, not an intensity of zero.</w:t>
-      </w:r>
-    </w:p>
-    <w:p>
-      <w:pPr>
-        <w:pStyle w:val="Heading1"/>
-      </w:pPr>
-      <w:r>
-        <w:rPr>
-          <w:rFonts w:ascii="Calibri" w:hAnsi="Calibri"/>
-          <w:sz w:val="22"/>
-        </w:rPr>
-        <w:t>8. One Poem Workspace</w:t>
-      </w:r>
-    </w:p>
-    <w:p>
-      <w:pPr>
-        <w:pStyle w:val="Heading2"/>
-      </w:pPr>
-      <w:r>
-        <w:rPr>
-          <w:rFonts w:ascii="Calibri" w:hAnsi="Calibri"/>
-          <w:sz w:val="22"/>
-        </w:rPr>
-        <w:t>Add a poem</w:t>
-      </w:r>
-    </w:p>
-    <w:p>
-      <w:pPr>
-        <w:widowControl/>
-        <w:spacing w:before="0" w:after="120" w:line="300" w:lineRule="auto"/>
-      </w:pPr>
-      <w:r>
-        <w:rPr>
-          <w:rFonts w:ascii="Calibri" w:hAnsi="Calibri"/>
-          <w:sz w:val="22"/>
-        </w:rPr>
-        <w:t xml:space="preserve">Paste text or upload one UTF-8 </w:t>
-      </w:r>
-      <w:r>
-        <w:rPr>
-          <w:rFonts w:ascii="Consolas" w:hAnsi="Consolas"/>
-          <w:color w:val="1F4D78"/>
-          <w:sz w:val="19"/>
-        </w:rPr>
-        <w:t>.txt</w:t>
-      </w:r>
-      <w:r>
-        <w:rPr>
-          <w:rFonts w:ascii="Calibri" w:hAnsi="Calibri"/>
-          <w:sz w:val="22"/>
-        </w:rPr>
-        <w:t xml:space="preserve"> file up to 5 MB. Enter a title or working label. The optional workspace name labels the temporary session but does not create a persistent corpus project.</w:t>
-      </w:r>
-    </w:p>
-    <w:p>
-      <w:pPr>
-        <w:pStyle w:val="Heading2"/>
-      </w:pPr>
-      <w:r>
-        <w:rPr>
-          <w:rFonts w:ascii="Calibri" w:hAnsi="Calibri"/>
-          <w:sz w:val="22"/>
-        </w:rPr>
-        <w:t>Choose evidence</w:t>
-      </w:r>
-    </w:p>
-    <w:p>
-      <w:pPr>
-        <w:widowControl/>
-        <w:spacing w:before="0" w:after="120" w:line="300" w:lineRule="auto"/>
-      </w:pPr>
-      <w:r>
-        <w:rPr>
-          <w:rFonts w:ascii="Calibri" w:hAnsi="Calibri"/>
-          <w:sz w:val="22"/>
-        </w:rPr>
-        <w:t>Select one or more affective lexicons and/or enable the optional normative lexical concreteness, SUBTLEX-US frequency, Kuperman Age of Acquisition, CMUdict pronunciation/prosody-foundation, and candidate-meter modules. VAD, categorical association, intensity, concreteness, corpus-relative frequency, retrospective lexical AoA, dictionary pronunciation/lexical stress, and configured meter fit answer different questions and remain separate. Any optional module can run by itself when its exact local source is available; selecting meter automatically runs its pronunciation dependency.</w:t>
-      </w:r>
-    </w:p>
-    <w:p>
-      <w:pPr>
-        <w:widowControl/>
-        <w:spacing w:before="0" w:after="120" w:line="300" w:lineRule="auto"/>
-      </w:pPr>
-      <w:r>
-        <w:rPr>
-          <w:rFonts w:ascii="Calibri" w:hAnsi="Calibri"/>
-          <w:sz w:val="22"/>
-        </w:rPr>
-        <w:t xml:space="preserve">Concreteness, Frequency, AoA, Pronunciation &amp; Prosody, and Meter &amp; Rhythm are currently temporary </w:t>
-      </w:r>
-      <w:r>
-        <w:rPr>
-          <w:rFonts w:ascii="Calibri" w:hAnsi="Calibri"/>
-          <w:b/>
-          <w:sz w:val="22"/>
-        </w:rPr>
-        <w:t>One Poem</w:t>
-      </w:r>
-      <w:r>
-        <w:rPr>
-          <w:rFonts w:ascii="Calibri" w:hAnsi="Calibri"/>
-          <w:sz w:val="22"/>
-        </w:rPr>
-        <w:t xml:space="preserve"> modules. They are not yet batched, persisted, aggregated, or exported by </w:t>
-      </w:r>
-      <w:r>
-        <w:rPr>
-          <w:rFonts w:ascii="Calibri" w:hAnsi="Calibri"/>
-          <w:b/>
-          <w:sz w:val="22"/>
-        </w:rPr>
-        <w:t>Projects &amp; Corpus</w:t>
-      </w:r>
-      <w:r>
-        <w:rPr>
-          <w:rFonts w:ascii="Calibri" w:hAnsi="Calibri"/>
-          <w:sz w:val="22"/>
-        </w:rPr>
-        <w:t>.</w:t>
-      </w:r>
-    </w:p>
-    <w:p>
-      <w:pPr>
-        <w:widowControl/>
-        <w:spacing w:before="0" w:after="120" w:line="300" w:lineRule="auto"/>
-      </w:pPr>
-      <w:r>
-        <w:rPr>
-          <w:rFonts w:ascii="Calibri" w:hAnsi="Calibri"/>
-          <w:sz w:val="22"/>
-        </w:rPr>
-        <w:t xml:space="preserve">Under </w:t>
-      </w:r>
-      <w:r>
-        <w:rPr>
-          <w:rFonts w:ascii="Calibri" w:hAnsi="Calibri"/>
-          <w:b/>
-          <w:sz w:val="22"/>
-        </w:rPr>
-        <w:t>Advanced methodology settings</w:t>
-      </w:r>
-      <w:r>
-        <w:rPr>
-          <w:rFonts w:ascii="Calibri" w:hAnsi="Calibri"/>
-          <w:sz w:val="22"/>
-        </w:rPr>
-        <w:t>, choose:</w:t>
+        <w:t xml:space="preserve">  without-replacement sample;</w:t>
       </w:r>
     </w:p>
     <w:p>
@@ -8263,7 +8158,7 @@
           <w:rFonts w:ascii="Calibri" w:hAnsi="Calibri"/>
           <w:sz w:val="22"/>
         </w:rPr>
-        <w:t>phrase policy;</w:t>
+        <w:t>forward/reverse and mean MTLD at a configured TTR threshold;</w:t>
       </w:r>
     </w:p>
     <w:p>
@@ -8281,7 +8176,7 @@
           <w:rFonts w:ascii="Calibri" w:hAnsi="Calibri"/>
           <w:sz w:val="22"/>
         </w:rPr>
-        <w:t>minimum matched observations for sparse-result warnings;</w:t>
+        <w:t>Unicode alphabetic-character word-length statistics and distribution;</w:t>
       </w:r>
     </w:p>
     <w:p>
@@ -8299,7 +8194,20 @@
           <w:rFonts w:ascii="Calibri" w:hAnsi="Calibri"/>
           <w:sz w:val="22"/>
         </w:rPr>
-        <w:t>whether to display all-matched results;</w:t>
+        <w:t>one lexical-token count row for every preserved physical line, including</w:t>
+      </w:r>
+    </w:p>
+    <w:p>
+      <w:pPr>
+        <w:widowControl/>
+        <w:spacing w:before="0" w:after="120" w:line="300" w:lineRule="auto"/>
+      </w:pPr>
+      <w:r>
+        <w:rPr>
+          <w:rFonts w:ascii="Calibri" w:hAnsi="Calibri"/>
+          <w:sz w:val="22"/>
+        </w:rPr>
+        <w:t xml:space="preserve">  blank separators with zero; and</w:t>
       </w:r>
     </w:p>
     <w:p>
@@ -8317,7 +8225,121 @@
           <w:rFonts w:ascii="Calibri" w:hAnsi="Calibri"/>
           <w:sz w:val="22"/>
         </w:rPr>
-        <w:t>whether to display stopword-excluded results;</w:t>
+        <w:t>lexical-token and nonblank-line counts for every stanza.</w:t>
+      </w:r>
+    </w:p>
+    <w:p>
+      <w:pPr>
+        <w:widowControl/>
+        <w:spacing w:before="0" w:after="120" w:line="300" w:lineRule="auto"/>
+      </w:pPr>
+      <w:r>
+        <w:rPr>
+          <w:rFonts w:ascii="Calibri" w:hAnsi="Calibri"/>
+          <w:sz w:val="22"/>
+        </w:rPr>
+        <w:t>Defaults are MATTR window 50, HD-D sample 42, and MTLD threshold 0.72. MATTR and HD-D remain missing when the text is shorter than their configured denominator. Undefined MTLD remains missing rather than becoming infinity or zero.</w:t>
+      </w:r>
+    </w:p>
+    <w:p>
+      <w:pPr>
+        <w:widowControl/>
+        <w:spacing w:before="0" w:after="120" w:line="300" w:lineRule="auto"/>
+      </w:pPr>
+      <w:r>
+        <w:rPr>
+          <w:rFonts w:ascii="Calibri" w:hAnsi="Calibri"/>
+          <w:sz w:val="22"/>
+        </w:rPr>
+        <w:t>Safe wording is: “Using a 50-token MATTR window, the normalized observed surface forms produced MATTR = [value].” Do not treat lexical diversity or word length as proof of literary quality, vocabulary knowledge, intelligence, education, comprehension, or reader ability.</w:t>
+      </w:r>
+    </w:p>
+    <w:p>
+      <w:pPr>
+        <w:pStyle w:val="Heading2"/>
+      </w:pPr>
+      <w:r>
+        <w:rPr>
+          <w:rFonts w:ascii="Calibri" w:hAnsi="Calibri"/>
+          <w:sz w:val="22"/>
+        </w:rPr>
+        <w:t>Eight emotion associations</w:t>
+      </w:r>
+    </w:p>
+    <w:p>
+      <w:pPr>
+        <w:widowControl/>
+        <w:spacing w:before="0" w:after="120" w:line="300" w:lineRule="auto"/>
+      </w:pPr>
+      <w:r>
+        <w:rPr>
+          <w:rFonts w:ascii="Calibri" w:hAnsi="Calibri"/>
+          <w:sz w:val="22"/>
+        </w:rPr>
+        <w:t>NRC Emotion values are binary, multi-label associations. VerseVAD reports the eight emotions—anger, anticipation, disgust, fear, joy, sadness, surprise, and trust—in their own section. An entry can be associated with several categories, so percentages do not need to total 100 percent. Read the labeled denominator.</w:t>
+      </w:r>
+    </w:p>
+    <w:p>
+      <w:pPr>
+        <w:widowControl/>
+        <w:spacing w:before="0" w:after="120" w:line="300" w:lineRule="auto"/>
+      </w:pPr>
+      <w:r>
+        <w:rPr>
+          <w:rFonts w:ascii="Calibri" w:hAnsi="Calibri"/>
+          <w:sz w:val="22"/>
+        </w:rPr>
+        <w:t>“Fear-associated vocabulary” is appropriate wording. “The poem is afraid” is not.</w:t>
+      </w:r>
+    </w:p>
+    <w:p>
+      <w:pPr>
+        <w:pStyle w:val="Heading2"/>
+      </w:pPr>
+      <w:r>
+        <w:rPr>
+          <w:rFonts w:ascii="Calibri" w:hAnsi="Calibri"/>
+          <w:sz w:val="22"/>
+        </w:rPr>
+        <w:t>Positive and negative sentiment associations</w:t>
+      </w:r>
+    </w:p>
+    <w:p>
+      <w:pPr>
+        <w:widowControl/>
+        <w:spacing w:before="0" w:after="120" w:line="300" w:lineRule="auto"/>
+      </w:pPr>
+      <w:r>
+        <w:rPr>
+          <w:rFonts w:ascii="Calibri" w:hAnsi="Calibri"/>
+          <w:sz w:val="22"/>
+        </w:rPr>
+        <w:t>Positive and negative are broad sentiment labels in NRC Emotion. VerseVAD analyzes them with the same documented occurrence-counting logic but reports them separately from the eight emotions. They are not endpoints of the VAD valence scale, and their rates need not sum to 100 percent.</w:t>
+      </w:r>
+    </w:p>
+    <w:p>
+      <w:pPr>
+        <w:pStyle w:val="Heading2"/>
+      </w:pPr>
+      <w:r>
+        <w:rPr>
+          <w:rFonts w:ascii="Calibri" w:hAnsi="Calibri"/>
+          <w:sz w:val="22"/>
+        </w:rPr>
+        <w:t>Emotion intensity</w:t>
+      </w:r>
+    </w:p>
+    <w:p>
+      <w:pPr>
+        <w:widowControl/>
+        <w:spacing w:before="0" w:after="120" w:line="300" w:lineRule="auto"/>
+      </w:pPr>
+      <w:r>
+        <w:rPr>
+          <w:rFonts w:ascii="Calibri" w:hAnsi="Calibri"/>
+          <w:sz w:val="22"/>
+        </w:rPr>
+        <w:t>NRC Emotion Intensity supplies numeric values only for particular word-emotion pairs. VerseVAD keeps:</w:t>
       </w:r>
     </w:p>
     <w:p>
@@ -8335,7 +8357,7 @@
           <w:rFonts w:ascii="Calibri" w:hAnsi="Calibri"/>
           <w:sz w:val="22"/>
         </w:rPr>
-        <w:t>concreteness lower and upper orientation thresholds;</w:t>
+        <w:t>prevalence of matched pairs;</w:t>
       </w:r>
     </w:p>
     <w:p>
@@ -8353,7 +8375,7 @@
           <w:rFonts w:ascii="Calibri" w:hAnsi="Calibri"/>
           <w:sz w:val="22"/>
         </w:rPr>
-        <w:t>whether concreteness excludes model-tagged proper nouns;</w:t>
+        <w:t>token-weighted mean intensity among supplied pairs;</w:t>
       </w:r>
     </w:p>
     <w:p>
@@ -8371,7 +8393,168 @@
           <w:rFonts w:ascii="Calibri" w:hAnsi="Calibri"/>
           <w:sz w:val="22"/>
         </w:rPr>
-        <w:t>whether source-supplied concreteness phrases are activated; and</w:t>
+        <w:t>type-weighted mean intensity among supplied pairs.</w:t>
+      </w:r>
+    </w:p>
+    <w:p>
+      <w:pPr>
+        <w:widowControl/>
+        <w:spacing w:before="0" w:after="120" w:line="300" w:lineRule="auto"/>
+      </w:pPr>
+      <w:r>
+        <w:rPr>
+          <w:rFonts w:ascii="Calibri" w:hAnsi="Calibri"/>
+          <w:sz w:val="22"/>
+        </w:rPr>
+        <w:t>An absent word-emotion pair is missing, not an intensity of zero.</w:t>
+      </w:r>
+    </w:p>
+    <w:p>
+      <w:pPr>
+        <w:pStyle w:val="Heading1"/>
+      </w:pPr>
+      <w:r>
+        <w:rPr>
+          <w:rFonts w:ascii="Calibri" w:hAnsi="Calibri"/>
+          <w:sz w:val="22"/>
+        </w:rPr>
+        <w:t>8. One Poem Workspace</w:t>
+      </w:r>
+    </w:p>
+    <w:p>
+      <w:pPr>
+        <w:pStyle w:val="Heading2"/>
+      </w:pPr>
+      <w:r>
+        <w:rPr>
+          <w:rFonts w:ascii="Calibri" w:hAnsi="Calibri"/>
+          <w:sz w:val="22"/>
+        </w:rPr>
+        <w:t>Add a poem</w:t>
+      </w:r>
+    </w:p>
+    <w:p>
+      <w:pPr>
+        <w:widowControl/>
+        <w:spacing w:before="0" w:after="120" w:line="300" w:lineRule="auto"/>
+      </w:pPr>
+      <w:r>
+        <w:rPr>
+          <w:rFonts w:ascii="Calibri" w:hAnsi="Calibri"/>
+          <w:sz w:val="22"/>
+        </w:rPr>
+        <w:t xml:space="preserve">Paste text or upload one UTF-8 </w:t>
+      </w:r>
+      <w:r>
+        <w:rPr>
+          <w:rFonts w:ascii="Consolas" w:hAnsi="Consolas"/>
+          <w:color w:val="1F4D78"/>
+          <w:sz w:val="19"/>
+        </w:rPr>
+        <w:t>.txt</w:t>
+      </w:r>
+      <w:r>
+        <w:rPr>
+          <w:rFonts w:ascii="Calibri" w:hAnsi="Calibri"/>
+          <w:sz w:val="22"/>
+        </w:rPr>
+        <w:t xml:space="preserve"> file up to 5 MB. Enter a title or working label. The optional workspace name labels the temporary session but does not create a persistent corpus project.</w:t>
+      </w:r>
+    </w:p>
+    <w:p>
+      <w:pPr>
+        <w:pStyle w:val="Heading2"/>
+      </w:pPr>
+      <w:r>
+        <w:rPr>
+          <w:rFonts w:ascii="Calibri" w:hAnsi="Calibri"/>
+          <w:sz w:val="22"/>
+        </w:rPr>
+        <w:t>Choose evidence</w:t>
+      </w:r>
+    </w:p>
+    <w:p>
+      <w:pPr>
+        <w:widowControl/>
+        <w:spacing w:before="0" w:after="120" w:line="300" w:lineRule="auto"/>
+      </w:pPr>
+      <w:r>
+        <w:rPr>
+          <w:rFonts w:ascii="Calibri" w:hAnsi="Calibri"/>
+          <w:sz w:val="22"/>
+        </w:rPr>
+        <w:t>Select one or more affective lexicons and/or enable the optional normative lexical concreteness, SUBTLEX-US frequency, Kuperman Age of Acquisition, CMUdict pronunciation/prosody-foundation, candidate-meter, rhyme/sound, or Lexical Style modules. VAD, categorical association, intensity, concreteness, corpus-relative frequency, retrospective lexical AoA, dictionary pronunciation/lexical stress, configured meter fit, rhyme/sound evidence, and lexical diversity/word counts answer different questions and remain separate. Any optional module can run by itself; selecting meter or rhyme automatically runs its pronunciation dependency.</w:t>
+      </w:r>
+    </w:p>
+    <w:p>
+      <w:pPr>
+        <w:widowControl/>
+        <w:spacing w:before="0" w:after="120" w:line="300" w:lineRule="auto"/>
+      </w:pPr>
+      <w:r>
+        <w:rPr>
+          <w:rFonts w:ascii="Calibri" w:hAnsi="Calibri"/>
+          <w:sz w:val="22"/>
+        </w:rPr>
+        <w:t xml:space="preserve">Concreteness, Frequency, AoA, Pronunciation &amp; Prosody, Meter &amp; Rhythm, Rhyme &amp; Sound, and Lexical Style are currently temporary </w:t>
+      </w:r>
+      <w:r>
+        <w:rPr>
+          <w:rFonts w:ascii="Calibri" w:hAnsi="Calibri"/>
+          <w:b/>
+          <w:sz w:val="22"/>
+        </w:rPr>
+        <w:t>One Poem</w:t>
+      </w:r>
+      <w:r>
+        <w:rPr>
+          <w:rFonts w:ascii="Calibri" w:hAnsi="Calibri"/>
+          <w:sz w:val="22"/>
+        </w:rPr>
+        <w:t xml:space="preserve"> modules. They are not yet batched, persisted, aggregated, or exported by </w:t>
+      </w:r>
+      <w:r>
+        <w:rPr>
+          <w:rFonts w:ascii="Calibri" w:hAnsi="Calibri"/>
+          <w:b/>
+          <w:sz w:val="22"/>
+        </w:rPr>
+        <w:t>Projects &amp; Corpus</w:t>
+      </w:r>
+      <w:r>
+        <w:rPr>
+          <w:rFonts w:ascii="Calibri" w:hAnsi="Calibri"/>
+          <w:sz w:val="22"/>
+        </w:rPr>
+        <w:t>.</w:t>
+      </w:r>
+    </w:p>
+    <w:p>
+      <w:pPr>
+        <w:widowControl/>
+        <w:spacing w:before="0" w:after="120" w:line="300" w:lineRule="auto"/>
+      </w:pPr>
+      <w:r>
+        <w:rPr>
+          <w:rFonts w:ascii="Calibri" w:hAnsi="Calibri"/>
+          <w:sz w:val="22"/>
+        </w:rPr>
+        <w:t xml:space="preserve">Under </w:t>
+      </w:r>
+      <w:r>
+        <w:rPr>
+          <w:rFonts w:ascii="Calibri" w:hAnsi="Calibri"/>
+          <w:b/>
+          <w:sz w:val="22"/>
+        </w:rPr>
+        <w:t>Advanced methodology settings</w:t>
+      </w:r>
+      <w:r>
+        <w:rPr>
+          <w:rFonts w:ascii="Calibri" w:hAnsi="Calibri"/>
+          <w:sz w:val="22"/>
+        </w:rPr>
+        <w:t>, choose:</w:t>
       </w:r>
     </w:p>
     <w:p>
@@ -8389,7 +8572,7 @@
           <w:rFonts w:ascii="Calibri" w:hAnsi="Calibri"/>
           <w:sz w:val="22"/>
         </w:rPr>
-        <w:t>the concreteness low-coverage caution threshold;</w:t>
+        <w:t>phrase policy;</w:t>
       </w:r>
     </w:p>
     <w:p>
@@ -8407,7 +8590,7 @@
           <w:rFonts w:ascii="Calibri" w:hAnsi="Calibri"/>
           <w:sz w:val="22"/>
         </w:rPr>
-        <w:t>the four frequency orientation thresholds;</w:t>
+        <w:t>minimum matched observations for sparse-result warnings;</w:t>
       </w:r>
     </w:p>
     <w:p>
@@ -8425,7 +8608,7 @@
           <w:rFonts w:ascii="Calibri" w:hAnsi="Calibri"/>
           <w:sz w:val="22"/>
         </w:rPr>
-        <w:t>whether frequency excludes model-tagged proper nouns;</w:t>
+        <w:t>whether to display all-matched results;</w:t>
       </w:r>
     </w:p>
     <w:p>
@@ -8443,7 +8626,7 @@
           <w:rFonts w:ascii="Calibri" w:hAnsi="Calibri"/>
           <w:sz w:val="22"/>
         </w:rPr>
-        <w:t>whether frequency permits lemma fallback;</w:t>
+        <w:t>whether to display stopword-excluded results;</w:t>
       </w:r>
     </w:p>
     <w:p>
@@ -8461,7 +8644,7 @@
           <w:rFonts w:ascii="Calibri" w:hAnsi="Calibri"/>
           <w:sz w:val="22"/>
         </w:rPr>
-        <w:t>the frequency low-coverage caution threshold; and</w:t>
+        <w:t>concreteness lower and upper orientation thresholds;</w:t>
       </w:r>
     </w:p>
     <w:p>
@@ -8479,22 +8662,7 @@
           <w:rFonts w:ascii="Calibri" w:hAnsi="Calibri"/>
           <w:sz w:val="22"/>
         </w:rPr>
-        <w:t xml:space="preserve">whether frequency uses the non-default </w:t>
-      </w:r>
-      <w:r>
-        <w:rPr>
-          <w:rFonts w:ascii="Calibri" w:hAnsi="Calibri"/>
-          <w:b/>
-          <w:sz w:val="22"/>
-        </w:rPr>
-        <w:t>Content words only</w:t>
-      </w:r>
-      <w:r>
-        <w:rPr>
-          <w:rFonts w:ascii="Calibri" w:hAnsi="Calibri"/>
-          <w:sz w:val="22"/>
-        </w:rPr>
-        <w:t xml:space="preserve"> scope;</w:t>
+        <w:t>whether concreteness excludes model-tagged proper nouns;</w:t>
       </w:r>
     </w:p>
     <w:p>
@@ -8512,7 +8680,7 @@
           <w:rFonts w:ascii="Calibri" w:hAnsi="Calibri"/>
           <w:sz w:val="22"/>
         </w:rPr>
-        <w:t>AoA early and later orientation thresholds;</w:t>
+        <w:t>whether source-supplied concreteness phrases are activated; and</w:t>
       </w:r>
     </w:p>
     <w:p>
@@ -8530,7 +8698,7 @@
           <w:rFonts w:ascii="Calibri" w:hAnsi="Calibri"/>
           <w:sz w:val="22"/>
         </w:rPr>
-        <w:t>whether AoA excludes model-tagged proper nouns;</w:t>
+        <w:t>the concreteness low-coverage caution threshold;</w:t>
       </w:r>
     </w:p>
     <w:p>
@@ -8548,7 +8716,7 @@
           <w:rFonts w:ascii="Calibri" w:hAnsi="Calibri"/>
           <w:sz w:val="22"/>
         </w:rPr>
-        <w:t>whether AoA permits lemma fallback;</w:t>
+        <w:t>the four frequency orientation thresholds;</w:t>
       </w:r>
     </w:p>
     <w:p>
@@ -8566,7 +8734,7 @@
           <w:rFonts w:ascii="Calibri" w:hAnsi="Calibri"/>
           <w:sz w:val="22"/>
         </w:rPr>
-        <w:t>the AoA low-coverage caution threshold; and</w:t>
+        <w:t>whether frequency excludes model-tagged proper nouns;</w:t>
       </w:r>
     </w:p>
     <w:p>
@@ -8584,22 +8752,7 @@
           <w:rFonts w:ascii="Calibri" w:hAnsi="Calibri"/>
           <w:sz w:val="22"/>
         </w:rPr>
-        <w:t xml:space="preserve">whether AoA uses the non-default contextual </w:t>
-      </w:r>
-      <w:r>
-        <w:rPr>
-          <w:rFonts w:ascii="Calibri" w:hAnsi="Calibri"/>
-          <w:b/>
-          <w:sz w:val="22"/>
-        </w:rPr>
-        <w:t>Content words only</w:t>
-      </w:r>
-      <w:r>
-        <w:rPr>
-          <w:rFonts w:ascii="Calibri" w:hAnsi="Calibri"/>
-          <w:sz w:val="22"/>
-        </w:rPr>
-        <w:t xml:space="preserve"> scope;</w:t>
+        <w:t>whether frequency permits lemma fallback;</w:t>
       </w:r>
     </w:p>
     <w:p>
@@ -8617,22 +8770,7 @@
           <w:rFonts w:ascii="Calibri" w:hAnsi="Calibri"/>
           <w:sz w:val="22"/>
         </w:rPr>
-        <w:t xml:space="preserve">poem-specific </w:t>
-      </w:r>
-      <w:r>
-        <w:rPr>
-          <w:rFonts w:ascii="Consolas" w:hAnsi="Consolas"/>
-          <w:color w:val="1F4D78"/>
-          <w:sz w:val="19"/>
-        </w:rPr>
-        <w:t>word = ARPAbet phones | note</w:t>
-      </w:r>
-      <w:r>
-        <w:rPr>
-          <w:rFonts w:ascii="Calibri" w:hAnsi="Calibri"/>
-          <w:sz w:val="22"/>
-        </w:rPr>
-        <w:t xml:space="preserve"> pronunciation overrides;</w:t>
+        <w:t>the frequency low-coverage caution threshold; and</w:t>
       </w:r>
     </w:p>
     <w:p>
@@ -8650,7 +8788,22 @@
           <w:rFonts w:ascii="Calibri" w:hAnsi="Calibri"/>
           <w:sz w:val="22"/>
         </w:rPr>
-        <w:t>the pronunciation resolved-token coverage caution threshold;</w:t>
+        <w:t xml:space="preserve">whether frequency uses the non-default </w:t>
+      </w:r>
+      <w:r>
+        <w:rPr>
+          <w:rFonts w:ascii="Calibri" w:hAnsi="Calibri"/>
+          <w:b/>
+          <w:sz w:val="22"/>
+        </w:rPr>
+        <w:t>Content words only</w:t>
+      </w:r>
+      <w:r>
+        <w:rPr>
+          <w:rFonts w:ascii="Calibri" w:hAnsi="Calibri"/>
+          <w:sz w:val="22"/>
+        </w:rPr>
+        <w:t xml:space="preserve"> scope;</w:t>
       </w:r>
     </w:p>
     <w:p>
@@ -8668,7 +8821,7 @@
           <w:rFonts w:ascii="Calibri" w:hAnsi="Calibri"/>
           <w:sz w:val="22"/>
         </w:rPr>
-        <w:t>minimum complete pronunciation lines; and</w:t>
+        <w:t>AoA early and later orientation thresholds;</w:t>
       </w:r>
     </w:p>
     <w:p>
@@ -8686,7 +8839,7 @@
           <w:rFonts w:ascii="Calibri" w:hAnsi="Calibri"/>
           <w:sz w:val="22"/>
         </w:rPr>
-        <w:t>minimum resolved pronunciation tokens for sparse-result warnings;</w:t>
+        <w:t>whether AoA excludes model-tagged proper nouns;</w:t>
       </w:r>
     </w:p>
     <w:p>
@@ -8704,7 +8857,7 @@
           <w:rFonts w:ascii="Calibri" w:hAnsi="Calibri"/>
           <w:sz w:val="22"/>
         </w:rPr>
-        <w:t>the meter line-fit threshold;</w:t>
+        <w:t>whether AoA permits lemma fallback;</w:t>
       </w:r>
     </w:p>
     <w:p>
@@ -8722,7 +8875,7 @@
           <w:rFonts w:ascii="Calibri" w:hAnsi="Calibri"/>
           <w:sz w:val="22"/>
         </w:rPr>
-        <w:t>the poem candidate-fit threshold;</w:t>
+        <w:t>the AoA low-coverage caution threshold; and</w:t>
       </w:r>
     </w:p>
     <w:p>
@@ -8740,7 +8893,22 @@
           <w:rFonts w:ascii="Calibri" w:hAnsi="Calibri"/>
           <w:sz w:val="22"/>
         </w:rPr>
-        <w:t>the candidate-margin threshold; and</w:t>
+        <w:t xml:space="preserve">whether AoA uses the non-default contextual </w:t>
+      </w:r>
+      <w:r>
+        <w:rPr>
+          <w:rFonts w:ascii="Calibri" w:hAnsi="Calibri"/>
+          <w:b/>
+          <w:sz w:val="22"/>
+        </w:rPr>
+        <w:t>Content words only</w:t>
+      </w:r>
+      <w:r>
+        <w:rPr>
+          <w:rFonts w:ascii="Calibri" w:hAnsi="Calibri"/>
+          <w:sz w:val="22"/>
+        </w:rPr>
+        <w:t xml:space="preserve"> scope;</w:t>
       </w:r>
     </w:p>
     <w:p>
@@ -8758,138 +8926,7 @@
           <w:rFonts w:ascii="Calibri" w:hAnsi="Calibri"/>
           <w:sz w:val="22"/>
         </w:rPr>
-        <w:t>the maximum retained stress paths evaluated per line.</w:t>
-      </w:r>
-    </w:p>
-    <w:p>
-      <w:pPr>
-        <w:widowControl/>
-        <w:spacing w:before="0" w:after="120" w:line="300" w:lineRule="auto"/>
-      </w:pPr>
-      <w:r>
-        <w:rPr>
-          <w:rFonts w:ascii="Calibri" w:hAnsi="Calibri"/>
-          <w:sz w:val="22"/>
-        </w:rPr>
-        <w:t xml:space="preserve">Under </w:t>
-      </w:r>
-      <w:r>
-        <w:rPr>
-          <w:rFonts w:ascii="Calibri" w:hAnsi="Calibri"/>
-          <w:b/>
-          <w:sz w:val="22"/>
-        </w:rPr>
-        <w:t>Stopword settings</w:t>
-      </w:r>
-      <w:r>
-        <w:rPr>
-          <w:rFonts w:ascii="Calibri" w:hAnsi="Calibri"/>
-          <w:sz w:val="22"/>
-        </w:rPr>
-        <w:t>, inspect or change the secondary-view policy. The all-matched result is always preserved even when only one view is displayed.</w:t>
-      </w:r>
-    </w:p>
-    <w:p>
-      <w:pPr>
-        <w:pStyle w:val="Heading2"/>
-      </w:pPr>
-      <w:r>
-        <w:rPr>
-          <w:rFonts w:ascii="Calibri" w:hAnsi="Calibri"/>
-          <w:sz w:val="22"/>
-        </w:rPr>
-        <w:t>Overview tab</w:t>
-      </w:r>
-    </w:p>
-    <w:p>
-      <w:pPr>
-        <w:widowControl/>
-        <w:spacing w:before="0" w:after="120" w:line="300" w:lineRule="auto"/>
-      </w:pPr>
-      <w:r>
-        <w:rPr>
-          <w:rFonts w:ascii="Calibri" w:hAnsi="Calibri"/>
-          <w:sz w:val="22"/>
-        </w:rPr>
-        <w:t>Read coverage before means. The tab shows ordinary and content-focused coverage, matched counts, active methodology, excluded stopword counts, interpretive framing, and warnings.</w:t>
-      </w:r>
-    </w:p>
-    <w:p>
-      <w:pPr>
-        <w:pStyle w:val="Heading2"/>
-      </w:pPr>
-      <w:r>
-        <w:rPr>
-          <w:rFonts w:ascii="Calibri" w:hAnsi="Calibri"/>
-          <w:sz w:val="22"/>
-        </w:rPr>
-        <w:t>Language Profile tab</w:t>
-      </w:r>
-    </w:p>
-    <w:p>
-      <w:pPr>
-        <w:widowControl/>
-        <w:spacing w:before="0" w:after="120" w:line="300" w:lineRule="auto"/>
-      </w:pPr>
-      <w:r>
-        <w:rPr>
-          <w:rFonts w:ascii="Calibri" w:hAnsi="Calibri"/>
-          <w:sz w:val="22"/>
-        </w:rPr>
-        <w:t xml:space="preserve">The </w:t>
-      </w:r>
-      <w:r>
-        <w:rPr>
-          <w:rFonts w:ascii="Calibri" w:hAnsi="Calibri"/>
-          <w:b/>
-          <w:sz w:val="22"/>
-        </w:rPr>
-        <w:t>Shared Processing Record</w:t>
-      </w:r>
-      <w:r>
-        <w:rPr>
-          <w:rFonts w:ascii="Calibri" w:hAnsi="Calibri"/>
-          <w:sz w:val="22"/>
-        </w:rPr>
-        <w:t xml:space="preserve"> first reports stanzas, physical lines, model sentences, total and lexical tokens, recipe/configuration IDs, model pipeline, dependency coverage, named-entity status, and processing cautions. It is the common local representation used by every selected lexicon.</w:t>
-      </w:r>
-    </w:p>
-    <w:p>
-      <w:pPr>
-        <w:widowControl/>
-        <w:spacing w:before="0" w:after="120" w:line="300" w:lineRule="auto"/>
-      </w:pPr>
-      <w:r>
-        <w:rPr>
-          <w:rFonts w:ascii="Calibri" w:hAnsi="Calibri"/>
-          <w:sz w:val="22"/>
-        </w:rPr>
-        <w:t>The tab then reports part-of-speech counts and relative shares for all eligible lexical tokens, independently of lexicon coverage. It also shows unique normalized types and example forms. The denominator is displayed, and a caution explains that the labels are model-generated.</w:t>
-      </w:r>
-    </w:p>
-    <w:p>
-      <w:pPr>
-        <w:pStyle w:val="Heading2"/>
-      </w:pPr>
-      <w:r>
-        <w:rPr>
-          <w:rFonts w:ascii="Calibri" w:hAnsi="Calibri"/>
-          <w:sz w:val="22"/>
-        </w:rPr>
-        <w:t>VAD Profile tab</w:t>
-      </w:r>
-    </w:p>
-    <w:p>
-      <w:pPr>
-        <w:widowControl/>
-        <w:spacing w:before="0" w:after="120" w:line="300" w:lineRule="auto"/>
-      </w:pPr>
-      <w:r>
-        <w:rPr>
-          <w:rFonts w:ascii="Calibri" w:hAnsi="Calibri"/>
-          <w:sz w:val="22"/>
-        </w:rPr>
-        <w:t>This tab contains:</w:t>
+        <w:t>the MATTR overlapping-window size;</w:t>
       </w:r>
     </w:p>
     <w:p>
@@ -8907,7 +8944,7 @@
           <w:rFonts w:ascii="Calibri" w:hAnsi="Calibri"/>
           <w:sz w:val="22"/>
         </w:rPr>
-        <w:t>parallel normalized VAD charts;</w:t>
+        <w:t>the HD-D without-replacement sample size;</w:t>
       </w:r>
     </w:p>
     <w:p>
@@ -8925,7 +8962,7 @@
           <w:rFonts w:ascii="Calibri" w:hAnsi="Calibri"/>
           <w:sz w:val="22"/>
         </w:rPr>
-        <w:t>definitions of valence, arousal, and dominance;</w:t>
+        <w:t>the MTLD TTR threshold;</w:t>
       </w:r>
     </w:p>
     <w:p>
@@ -8943,7 +8980,7 @@
           <w:rFonts w:ascii="Calibri" w:hAnsi="Calibri"/>
           <w:sz w:val="22"/>
         </w:rPr>
-        <w:t>token- and type-weighted values for each analysis view;</w:t>
+        <w:t>the lexical-diversity short-text caution threshold;</w:t>
       </w:r>
     </w:p>
     <w:p>
@@ -8961,7 +8998,22 @@
           <w:rFonts w:ascii="Calibri" w:hAnsi="Calibri"/>
           <w:sz w:val="22"/>
         </w:rPr>
-        <w:t>plain-language midpoint interpretations;</w:t>
+        <w:t xml:space="preserve">poem-specific </w:t>
+      </w:r>
+      <w:r>
+        <w:rPr>
+          <w:rFonts w:ascii="Consolas" w:hAnsi="Consolas"/>
+          <w:color w:val="1F4D78"/>
+          <w:sz w:val="19"/>
+        </w:rPr>
+        <w:t>word = ARPAbet phones | note</w:t>
+      </w:r>
+      <w:r>
+        <w:rPr>
+          <w:rFonts w:ascii="Calibri" w:hAnsi="Calibri"/>
+          <w:sz w:val="22"/>
+        </w:rPr>
+        <w:t xml:space="preserve"> pronunciation overrides;</w:t>
       </w:r>
     </w:p>
     <w:p>
@@ -8979,7 +9031,7 @@
           <w:rFonts w:ascii="Calibri" w:hAnsi="Calibri"/>
           <w:sz w:val="22"/>
         </w:rPr>
-        <w:t>population dispersion;</w:t>
+        <w:t>the pronunciation resolved-token coverage caution threshold;</w:t>
       </w:r>
     </w:p>
     <w:p>
@@ -8997,7 +9049,7 @@
           <w:rFonts w:ascii="Calibri" w:hAnsi="Calibri"/>
           <w:sz w:val="22"/>
         </w:rPr>
-        <w:t>stopword-sensitivity differences;</w:t>
+        <w:t>minimum complete pronunciation lines; and</w:t>
       </w:r>
     </w:p>
     <w:p>
@@ -9015,7 +9067,7 @@
           <w:rFonts w:ascii="Calibri" w:hAnsi="Calibri"/>
           <w:sz w:val="22"/>
         </w:rPr>
-        <w:t>cumulative normalized totals;</w:t>
+        <w:t>minimum resolved pronunciation tokens for sparse-result warnings;</w:t>
       </w:r>
     </w:p>
     <w:p>
@@ -9033,7 +9085,7 @@
           <w:rFonts w:ascii="Calibri" w:hAnsi="Calibri"/>
           <w:sz w:val="22"/>
         </w:rPr>
-        <w:t>top midpoint-centered contributors;</w:t>
+        <w:t>the meter line-fit threshold;</w:t>
       </w:r>
     </w:p>
     <w:p>
@@ -9051,6 +9103,335 @@
           <w:rFonts w:ascii="Calibri" w:hAnsi="Calibri"/>
           <w:sz w:val="22"/>
         </w:rPr>
+        <w:t>the poem candidate-fit threshold;</w:t>
+      </w:r>
+    </w:p>
+    <w:p>
+      <w:pPr>
+        <w:widowControl/>
+        <w:numPr>
+          <w:ilvl w:val="0"/>
+          <w:numId w:val="10"/>
+        </w:numPr>
+        <w:spacing w:before="0" w:after="80" w:line="300" w:lineRule="auto"/>
+        <w:ind w:left="540" w:hanging="271"/>
+      </w:pPr>
+      <w:r>
+        <w:rPr>
+          <w:rFonts w:ascii="Calibri" w:hAnsi="Calibri"/>
+          <w:sz w:val="22"/>
+        </w:rPr>
+        <w:t>the candidate-margin threshold; and</w:t>
+      </w:r>
+    </w:p>
+    <w:p>
+      <w:pPr>
+        <w:widowControl/>
+        <w:numPr>
+          <w:ilvl w:val="0"/>
+          <w:numId w:val="10"/>
+        </w:numPr>
+        <w:spacing w:before="0" w:after="80" w:line="300" w:lineRule="auto"/>
+        <w:ind w:left="540" w:hanging="271"/>
+      </w:pPr>
+      <w:r>
+        <w:rPr>
+          <w:rFonts w:ascii="Calibri" w:hAnsi="Calibri"/>
+          <w:sz w:val="22"/>
+        </w:rPr>
+        <w:t>the maximum retained stress paths evaluated per line.</w:t>
+      </w:r>
+    </w:p>
+    <w:p>
+      <w:pPr>
+        <w:widowControl/>
+        <w:spacing w:before="0" w:after="120" w:line="300" w:lineRule="auto"/>
+      </w:pPr>
+      <w:r>
+        <w:rPr>
+          <w:rFonts w:ascii="Calibri" w:hAnsi="Calibri"/>
+          <w:sz w:val="22"/>
+        </w:rPr>
+        <w:t xml:space="preserve">Under </w:t>
+      </w:r>
+      <w:r>
+        <w:rPr>
+          <w:rFonts w:ascii="Calibri" w:hAnsi="Calibri"/>
+          <w:b/>
+          <w:sz w:val="22"/>
+        </w:rPr>
+        <w:t>Stopword settings</w:t>
+      </w:r>
+      <w:r>
+        <w:rPr>
+          <w:rFonts w:ascii="Calibri" w:hAnsi="Calibri"/>
+          <w:sz w:val="22"/>
+        </w:rPr>
+        <w:t>, inspect or change the secondary-view policy. The all-matched result is always preserved even when only one view is displayed.</w:t>
+      </w:r>
+    </w:p>
+    <w:p>
+      <w:pPr>
+        <w:pStyle w:val="Heading2"/>
+      </w:pPr>
+      <w:r>
+        <w:rPr>
+          <w:rFonts w:ascii="Calibri" w:hAnsi="Calibri"/>
+          <w:sz w:val="22"/>
+        </w:rPr>
+        <w:t>Overview tab</w:t>
+      </w:r>
+    </w:p>
+    <w:p>
+      <w:pPr>
+        <w:widowControl/>
+        <w:spacing w:before="0" w:after="120" w:line="300" w:lineRule="auto"/>
+      </w:pPr>
+      <w:r>
+        <w:rPr>
+          <w:rFonts w:ascii="Calibri" w:hAnsi="Calibri"/>
+          <w:sz w:val="22"/>
+        </w:rPr>
+        <w:t>Read coverage before means. The tab shows ordinary and content-focused coverage, matched counts, active methodology, excluded stopword counts, interpretive framing, and warnings.</w:t>
+      </w:r>
+    </w:p>
+    <w:p>
+      <w:pPr>
+        <w:pStyle w:val="Heading2"/>
+      </w:pPr>
+      <w:r>
+        <w:rPr>
+          <w:rFonts w:ascii="Calibri" w:hAnsi="Calibri"/>
+          <w:sz w:val="22"/>
+        </w:rPr>
+        <w:t>Language Profile tab</w:t>
+      </w:r>
+    </w:p>
+    <w:p>
+      <w:pPr>
+        <w:widowControl/>
+        <w:spacing w:before="0" w:after="120" w:line="300" w:lineRule="auto"/>
+      </w:pPr>
+      <w:r>
+        <w:rPr>
+          <w:rFonts w:ascii="Calibri" w:hAnsi="Calibri"/>
+          <w:sz w:val="22"/>
+        </w:rPr>
+        <w:t xml:space="preserve">The </w:t>
+      </w:r>
+      <w:r>
+        <w:rPr>
+          <w:rFonts w:ascii="Calibri" w:hAnsi="Calibri"/>
+          <w:b/>
+          <w:sz w:val="22"/>
+        </w:rPr>
+        <w:t>Shared Processing Record</w:t>
+      </w:r>
+      <w:r>
+        <w:rPr>
+          <w:rFonts w:ascii="Calibri" w:hAnsi="Calibri"/>
+          <w:sz w:val="22"/>
+        </w:rPr>
+        <w:t xml:space="preserve"> first reports stanzas, physical lines, model sentences, total and lexical tokens, recipe/configuration IDs, model pipeline, dependency coverage, named-entity status, and processing cautions. It is the common local representation used by every selected lexicon.</w:t>
+      </w:r>
+    </w:p>
+    <w:p>
+      <w:pPr>
+        <w:widowControl/>
+        <w:spacing w:before="0" w:after="120" w:line="300" w:lineRule="auto"/>
+      </w:pPr>
+      <w:r>
+        <w:rPr>
+          <w:rFonts w:ascii="Calibri" w:hAnsi="Calibri"/>
+          <w:sz w:val="22"/>
+        </w:rPr>
+        <w:t>The tab then reports part-of-speech counts and relative shares for all eligible lexical tokens, independently of lexicon coverage. It also shows unique normalized types and example forms. The denominator is displayed, and a caution explains that the labels are model-generated.</w:t>
+      </w:r>
+    </w:p>
+    <w:p>
+      <w:pPr>
+        <w:pStyle w:val="Heading2"/>
+      </w:pPr>
+      <w:r>
+        <w:rPr>
+          <w:rFonts w:ascii="Calibri" w:hAnsi="Calibri"/>
+          <w:sz w:val="22"/>
+        </w:rPr>
+        <w:t>VAD Profile tab</w:t>
+      </w:r>
+    </w:p>
+    <w:p>
+      <w:pPr>
+        <w:widowControl/>
+        <w:spacing w:before="0" w:after="120" w:line="300" w:lineRule="auto"/>
+      </w:pPr>
+      <w:r>
+        <w:rPr>
+          <w:rFonts w:ascii="Calibri" w:hAnsi="Calibri"/>
+          <w:sz w:val="22"/>
+        </w:rPr>
+        <w:t>This tab contains:</w:t>
+      </w:r>
+    </w:p>
+    <w:p>
+      <w:pPr>
+        <w:widowControl/>
+        <w:numPr>
+          <w:ilvl w:val="0"/>
+          <w:numId w:val="10"/>
+        </w:numPr>
+        <w:spacing w:before="0" w:after="80" w:line="300" w:lineRule="auto"/>
+        <w:ind w:left="540" w:hanging="271"/>
+      </w:pPr>
+      <w:r>
+        <w:rPr>
+          <w:rFonts w:ascii="Calibri" w:hAnsi="Calibri"/>
+          <w:sz w:val="22"/>
+        </w:rPr>
+        <w:t>parallel normalized VAD charts;</w:t>
+      </w:r>
+    </w:p>
+    <w:p>
+      <w:pPr>
+        <w:widowControl/>
+        <w:numPr>
+          <w:ilvl w:val="0"/>
+          <w:numId w:val="10"/>
+        </w:numPr>
+        <w:spacing w:before="0" w:after="80" w:line="300" w:lineRule="auto"/>
+        <w:ind w:left="540" w:hanging="271"/>
+      </w:pPr>
+      <w:r>
+        <w:rPr>
+          <w:rFonts w:ascii="Calibri" w:hAnsi="Calibri"/>
+          <w:sz w:val="22"/>
+        </w:rPr>
+        <w:t>definitions of valence, arousal, and dominance;</w:t>
+      </w:r>
+    </w:p>
+    <w:p>
+      <w:pPr>
+        <w:widowControl/>
+        <w:numPr>
+          <w:ilvl w:val="0"/>
+          <w:numId w:val="10"/>
+        </w:numPr>
+        <w:spacing w:before="0" w:after="80" w:line="300" w:lineRule="auto"/>
+        <w:ind w:left="540" w:hanging="271"/>
+      </w:pPr>
+      <w:r>
+        <w:rPr>
+          <w:rFonts w:ascii="Calibri" w:hAnsi="Calibri"/>
+          <w:sz w:val="22"/>
+        </w:rPr>
+        <w:t>token- and type-weighted values for each analysis view;</w:t>
+      </w:r>
+    </w:p>
+    <w:p>
+      <w:pPr>
+        <w:widowControl/>
+        <w:numPr>
+          <w:ilvl w:val="0"/>
+          <w:numId w:val="10"/>
+        </w:numPr>
+        <w:spacing w:before="0" w:after="80" w:line="300" w:lineRule="auto"/>
+        <w:ind w:left="540" w:hanging="271"/>
+      </w:pPr>
+      <w:r>
+        <w:rPr>
+          <w:rFonts w:ascii="Calibri" w:hAnsi="Calibri"/>
+          <w:sz w:val="22"/>
+        </w:rPr>
+        <w:t>plain-language midpoint interpretations;</w:t>
+      </w:r>
+    </w:p>
+    <w:p>
+      <w:pPr>
+        <w:widowControl/>
+        <w:numPr>
+          <w:ilvl w:val="0"/>
+          <w:numId w:val="10"/>
+        </w:numPr>
+        <w:spacing w:before="0" w:after="80" w:line="300" w:lineRule="auto"/>
+        <w:ind w:left="540" w:hanging="271"/>
+      </w:pPr>
+      <w:r>
+        <w:rPr>
+          <w:rFonts w:ascii="Calibri" w:hAnsi="Calibri"/>
+          <w:sz w:val="22"/>
+        </w:rPr>
+        <w:t>population dispersion;</w:t>
+      </w:r>
+    </w:p>
+    <w:p>
+      <w:pPr>
+        <w:widowControl/>
+        <w:numPr>
+          <w:ilvl w:val="0"/>
+          <w:numId w:val="10"/>
+        </w:numPr>
+        <w:spacing w:before="0" w:after="80" w:line="300" w:lineRule="auto"/>
+        <w:ind w:left="540" w:hanging="271"/>
+      </w:pPr>
+      <w:r>
+        <w:rPr>
+          <w:rFonts w:ascii="Calibri" w:hAnsi="Calibri"/>
+          <w:sz w:val="22"/>
+        </w:rPr>
+        <w:t>stopword-sensitivity differences;</w:t>
+      </w:r>
+    </w:p>
+    <w:p>
+      <w:pPr>
+        <w:widowControl/>
+        <w:numPr>
+          <w:ilvl w:val="0"/>
+          <w:numId w:val="10"/>
+        </w:numPr>
+        <w:spacing w:before="0" w:after="80" w:line="300" w:lineRule="auto"/>
+        <w:ind w:left="540" w:hanging="271"/>
+      </w:pPr>
+      <w:r>
+        <w:rPr>
+          <w:rFonts w:ascii="Calibri" w:hAnsi="Calibri"/>
+          <w:sz w:val="22"/>
+        </w:rPr>
+        <w:t>cumulative normalized totals;</w:t>
+      </w:r>
+    </w:p>
+    <w:p>
+      <w:pPr>
+        <w:widowControl/>
+        <w:numPr>
+          <w:ilvl w:val="0"/>
+          <w:numId w:val="10"/>
+        </w:numPr>
+        <w:spacing w:before="0" w:after="80" w:line="300" w:lineRule="auto"/>
+        <w:ind w:left="540" w:hanging="271"/>
+      </w:pPr>
+      <w:r>
+        <w:rPr>
+          <w:rFonts w:ascii="Calibri" w:hAnsi="Calibri"/>
+          <w:sz w:val="22"/>
+        </w:rPr>
+        <w:t>top midpoint-centered contributors;</w:t>
+      </w:r>
+    </w:p>
+    <w:p>
+      <w:pPr>
+        <w:widowControl/>
+        <w:numPr>
+          <w:ilvl w:val="0"/>
+          <w:numId w:val="10"/>
+        </w:numPr>
+        <w:spacing w:before="0" w:after="80" w:line="300" w:lineRule="auto"/>
+        <w:ind w:left="540" w:hanging="271"/>
+      </w:pPr>
+      <w:r>
+        <w:rPr>
+          <w:rFonts w:ascii="Calibri" w:hAnsi="Calibri"/>
+          <w:sz w:val="22"/>
+        </w:rPr>
         <w:t>original source scales and normalization formulas.</w:t>
       </w:r>
     </w:p>
@@ -9556,6 +9937,72 @@
           <w:sz w:val="22"/>
         </w:rPr>
         <w:t xml:space="preserve"> and reduces coverage. It receives no neutral value or fabricated rhyme label. Add a Stage 5 override only when you can document the intended pronunciation.</w:t>
+      </w:r>
+    </w:p>
+    <w:p>
+      <w:pPr>
+        <w:pStyle w:val="Heading2"/>
+      </w:pPr>
+      <w:r>
+        <w:rPr>
+          <w:rFonts w:ascii="Calibri" w:hAnsi="Calibri"/>
+          <w:sz w:val="22"/>
+        </w:rPr>
+        <w:t>Lexical Style tab</w:t>
+      </w:r>
+    </w:p>
+    <w:p>
+      <w:pPr>
+        <w:widowControl/>
+        <w:spacing w:before="0" w:after="120" w:line="300" w:lineRule="auto"/>
+      </w:pPr>
+      <w:r>
+        <w:rPr>
+          <w:rFonts w:ascii="Calibri" w:hAnsi="Calibri"/>
+          <w:sz w:val="22"/>
+        </w:rPr>
+        <w:t xml:space="preserve">This tab appears when </w:t>
+      </w:r>
+      <w:r>
+        <w:rPr>
+          <w:rFonts w:ascii="Calibri" w:hAnsi="Calibri"/>
+          <w:b/>
+          <w:sz w:val="22"/>
+        </w:rPr>
+        <w:t>Lexical diversity, word length &amp; structural word counts</w:t>
+      </w:r>
+      <w:r>
+        <w:rPr>
+          <w:rFonts w:ascii="Calibri" w:hAnsi="Calibri"/>
+          <w:sz w:val="22"/>
+        </w:rPr>
+        <w:t xml:space="preserve"> is enabled. It reports token/type totals, MATTR, HD-D, MTLD, alphabetic-character word-length statistics and distribution, and detailed word counts for each physical line and stanza.</w:t>
+      </w:r>
+    </w:p>
+    <w:p>
+      <w:pPr>
+        <w:widowControl/>
+        <w:spacing w:before="0" w:after="120" w:line="300" w:lineRule="auto"/>
+      </w:pPr>
+      <w:r>
+        <w:rPr>
+          <w:rFonts w:ascii="Calibri" w:hAnsi="Calibri"/>
+          <w:sz w:val="22"/>
+        </w:rPr>
+        <w:t>Read the displayed parameters and token policy before comparing results. Physical blank lines remain visible with word count zero. A missing MATTR or HD-D normally means the text is shorter than the configured window or sample; the module does not change the denominator silently.</w:t>
+      </w:r>
+    </w:p>
+    <w:p>
+      <w:pPr>
+        <w:widowControl/>
+        <w:spacing w:before="0" w:after="120" w:line="300" w:lineRule="auto"/>
+      </w:pPr>
+      <w:r>
+        <w:rPr>
+          <w:rFonts w:ascii="Calibri" w:hAnsi="Calibri"/>
+          <w:sz w:val="22"/>
+        </w:rPr>
+        <w:t>The line and stanza tables also show local surface-type counts, descriptive TTR, and mean/median alphabetic word length. These local TTR values are not length-resistant comparison statistics.</w:t>
       </w:r>
     </w:p>
     <w:p>
@@ -14921,6 +15368,354 @@
           </w:p>
         </w:tc>
       </w:tr>
+      <w:tr>
+        <w:trPr>
+          <w:cantSplit w:val="true"/>
+        </w:trPr>
+        <w:tc>
+          <w:tcPr>
+            <w:tcW w:type="dxa" w:w="3600"/>
+            <w:vAlign w:val="center"/>
+            <w:tcMar>
+              <w:top w:w="80" w:type="dxa"/>
+              <w:bottom w:w="80" w:type="dxa"/>
+              <w:start w:w="120" w:type="dxa"/>
+              <w:end w:w="120" w:type="dxa"/>
+            </w:tcMar>
+          </w:tcPr>
+          <w:p>
+            <w:pPr>
+              <w:widowControl/>
+              <w:spacing w:before="0" w:after="0" w:line="252" w:lineRule="auto"/>
+            </w:pPr>
+            <w:r/>
+            <w:r>
+              <w:rPr>
+                <w:rFonts w:ascii="Consolas" w:hAnsi="Consolas"/>
+                <w:color w:val="1F4D78"/>
+                <w:sz w:val="17"/>
+              </w:rPr>
+              <w:t>lexical_style_summary.csv</w:t>
+            </w:r>
+          </w:p>
+        </w:tc>
+        <w:tc>
+          <w:tcPr>
+            <w:tcW w:type="dxa" w:w="5760"/>
+            <w:vAlign w:val="center"/>
+            <w:tcMar>
+              <w:top w:w="80" w:type="dxa"/>
+              <w:bottom w:w="80" w:type="dxa"/>
+              <w:start w:w="120" w:type="dxa"/>
+              <w:end w:w="120" w:type="dxa"/>
+            </w:tcMar>
+          </w:tcPr>
+          <w:p>
+            <w:pPr>
+              <w:widowControl/>
+              <w:spacing w:before="0" w:after="0" w:line="252" w:lineRule="auto"/>
+            </w:pPr>
+            <w:r/>
+            <w:r>
+              <w:rPr>
+                <w:rFonts w:ascii="Calibri" w:hAnsi="Calibri"/>
+                <w:sz w:val="18"/>
+              </w:rPr>
+              <w:t>Token/type and configured MATTR, HD-D, MTLD, word-length, and structural-count summaries</w:t>
+            </w:r>
+          </w:p>
+        </w:tc>
+      </w:tr>
+      <w:tr>
+        <w:trPr>
+          <w:cantSplit w:val="true"/>
+        </w:trPr>
+        <w:tc>
+          <w:tcPr>
+            <w:tcW w:type="dxa" w:w="3600"/>
+            <w:vAlign w:val="center"/>
+            <w:tcMar>
+              <w:top w:w="80" w:type="dxa"/>
+              <w:bottom w:w="80" w:type="dxa"/>
+              <w:start w:w="120" w:type="dxa"/>
+              <w:end w:w="120" w:type="dxa"/>
+            </w:tcMar>
+          </w:tcPr>
+          <w:p>
+            <w:pPr>
+              <w:widowControl/>
+              <w:spacing w:before="0" w:after="0" w:line="252" w:lineRule="auto"/>
+            </w:pPr>
+            <w:r/>
+            <w:r>
+              <w:rPr>
+                <w:rFonts w:ascii="Consolas" w:hAnsi="Consolas"/>
+                <w:color w:val="1F4D78"/>
+                <w:sz w:val="17"/>
+              </w:rPr>
+              <w:t>lexical_style_word_lengths.csv</w:t>
+            </w:r>
+          </w:p>
+        </w:tc>
+        <w:tc>
+          <w:tcPr>
+            <w:tcW w:type="dxa" w:w="5760"/>
+            <w:vAlign w:val="center"/>
+            <w:tcMar>
+              <w:top w:w="80" w:type="dxa"/>
+              <w:bottom w:w="80" w:type="dxa"/>
+              <w:start w:w="120" w:type="dxa"/>
+              <w:end w:w="120" w:type="dxa"/>
+            </w:tcMar>
+          </w:tcPr>
+          <w:p>
+            <w:pPr>
+              <w:widowControl/>
+              <w:spacing w:before="0" w:after="0" w:line="252" w:lineRule="auto"/>
+            </w:pPr>
+            <w:r/>
+            <w:r>
+              <w:rPr>
+                <w:rFonts w:ascii="Calibri" w:hAnsi="Calibri"/>
+                <w:sz w:val="18"/>
+              </w:rPr>
+              <w:t>Exact alphabetic-character lengths with token counts and proportions</w:t>
+            </w:r>
+          </w:p>
+        </w:tc>
+      </w:tr>
+      <w:tr>
+        <w:trPr>
+          <w:cantSplit w:val="true"/>
+        </w:trPr>
+        <w:tc>
+          <w:tcPr>
+            <w:tcW w:type="dxa" w:w="3600"/>
+            <w:vAlign w:val="center"/>
+            <w:tcMar>
+              <w:top w:w="80" w:type="dxa"/>
+              <w:bottom w:w="80" w:type="dxa"/>
+              <w:start w:w="120" w:type="dxa"/>
+              <w:end w:w="120" w:type="dxa"/>
+            </w:tcMar>
+          </w:tcPr>
+          <w:p>
+            <w:pPr>
+              <w:widowControl/>
+              <w:spacing w:before="0" w:after="0" w:line="252" w:lineRule="auto"/>
+            </w:pPr>
+            <w:r/>
+            <w:r>
+              <w:rPr>
+                <w:rFonts w:ascii="Consolas" w:hAnsi="Consolas"/>
+                <w:color w:val="1F4D78"/>
+                <w:sz w:val="17"/>
+              </w:rPr>
+              <w:t>lexical_style_lines.csv</w:t>
+            </w:r>
+          </w:p>
+        </w:tc>
+        <w:tc>
+          <w:tcPr>
+            <w:tcW w:type="dxa" w:w="5760"/>
+            <w:vAlign w:val="center"/>
+            <w:tcMar>
+              <w:top w:w="80" w:type="dxa"/>
+              <w:bottom w:w="80" w:type="dxa"/>
+              <w:start w:w="120" w:type="dxa"/>
+              <w:end w:w="120" w:type="dxa"/>
+            </w:tcMar>
+          </w:tcPr>
+          <w:p>
+            <w:pPr>
+              <w:widowControl/>
+              <w:spacing w:before="0" w:after="0" w:line="252" w:lineRule="auto"/>
+            </w:pPr>
+            <w:r/>
+            <w:r>
+              <w:rPr>
+                <w:rFonts w:ascii="Calibri" w:hAnsi="Calibri"/>
+                <w:sz w:val="18"/>
+              </w:rPr>
+              <w:t>Every preserved physical line with blank status, lexical-token count, surface types, local TTR, and word length</w:t>
+            </w:r>
+          </w:p>
+        </w:tc>
+      </w:tr>
+      <w:tr>
+        <w:trPr>
+          <w:cantSplit w:val="true"/>
+        </w:trPr>
+        <w:tc>
+          <w:tcPr>
+            <w:tcW w:type="dxa" w:w="3600"/>
+            <w:vAlign w:val="center"/>
+            <w:tcMar>
+              <w:top w:w="80" w:type="dxa"/>
+              <w:bottom w:w="80" w:type="dxa"/>
+              <w:start w:w="120" w:type="dxa"/>
+              <w:end w:w="120" w:type="dxa"/>
+            </w:tcMar>
+          </w:tcPr>
+          <w:p>
+            <w:pPr>
+              <w:widowControl/>
+              <w:spacing w:before="0" w:after="0" w:line="252" w:lineRule="auto"/>
+            </w:pPr>
+            <w:r/>
+            <w:r>
+              <w:rPr>
+                <w:rFonts w:ascii="Consolas" w:hAnsi="Consolas"/>
+                <w:color w:val="1F4D78"/>
+                <w:sz w:val="17"/>
+              </w:rPr>
+              <w:t>lexical_style_stanzas.csv</w:t>
+            </w:r>
+          </w:p>
+        </w:tc>
+        <w:tc>
+          <w:tcPr>
+            <w:tcW w:type="dxa" w:w="5760"/>
+            <w:vAlign w:val="center"/>
+            <w:tcMar>
+              <w:top w:w="80" w:type="dxa"/>
+              <w:bottom w:w="80" w:type="dxa"/>
+              <w:start w:w="120" w:type="dxa"/>
+              <w:end w:w="120" w:type="dxa"/>
+            </w:tcMar>
+          </w:tcPr>
+          <w:p>
+            <w:pPr>
+              <w:widowControl/>
+              <w:spacing w:before="0" w:after="0" w:line="252" w:lineRule="auto"/>
+            </w:pPr>
+            <w:r/>
+            <w:r>
+              <w:rPr>
+                <w:rFonts w:ascii="Calibri" w:hAnsi="Calibri"/>
+                <w:sz w:val="18"/>
+              </w:rPr>
+              <w:t>Every preserved stanza with nonblank-line count, lexical-token count, surface types, local TTR, and word length</w:t>
+            </w:r>
+          </w:p>
+        </w:tc>
+      </w:tr>
+      <w:tr>
+        <w:trPr>
+          <w:cantSplit w:val="true"/>
+        </w:trPr>
+        <w:tc>
+          <w:tcPr>
+            <w:tcW w:type="dxa" w:w="3600"/>
+            <w:vAlign w:val="center"/>
+            <w:tcMar>
+              <w:top w:w="80" w:type="dxa"/>
+              <w:bottom w:w="80" w:type="dxa"/>
+              <w:start w:w="120" w:type="dxa"/>
+              <w:end w:w="120" w:type="dxa"/>
+            </w:tcMar>
+          </w:tcPr>
+          <w:p>
+            <w:pPr>
+              <w:widowControl/>
+              <w:spacing w:before="0" w:after="0" w:line="252" w:lineRule="auto"/>
+            </w:pPr>
+            <w:r/>
+            <w:r>
+              <w:rPr>
+                <w:rFonts w:ascii="Consolas" w:hAnsi="Consolas"/>
+                <w:color w:val="1F4D78"/>
+                <w:sz w:val="17"/>
+              </w:rPr>
+              <w:t>lexical_style_token_audit.csv</w:t>
+            </w:r>
+          </w:p>
+        </w:tc>
+        <w:tc>
+          <w:tcPr>
+            <w:tcW w:type="dxa" w:w="5760"/>
+            <w:vAlign w:val="center"/>
+            <w:tcMar>
+              <w:top w:w="80" w:type="dxa"/>
+              <w:bottom w:w="80" w:type="dxa"/>
+              <w:start w:w="120" w:type="dxa"/>
+              <w:end w:w="120" w:type="dxa"/>
+            </w:tcMar>
+          </w:tcPr>
+          <w:p>
+            <w:pPr>
+              <w:widowControl/>
+              <w:spacing w:before="0" w:after="0" w:line="252" w:lineRule="auto"/>
+            </w:pPr>
+            <w:r/>
+            <w:r>
+              <w:rPr>
+                <w:rFonts w:ascii="Calibri" w:hAnsi="Calibri"/>
+                <w:sz w:val="18"/>
+              </w:rPr>
+              <w:t>Every token's exact/normalized surface, separate lemma, structural IDs, inclusion, alphabetic length or missing value, and reason</w:t>
+            </w:r>
+          </w:p>
+        </w:tc>
+      </w:tr>
+      <w:tr>
+        <w:trPr>
+          <w:cantSplit w:val="true"/>
+        </w:trPr>
+        <w:tc>
+          <w:tcPr>
+            <w:tcW w:type="dxa" w:w="3600"/>
+            <w:vAlign w:val="center"/>
+            <w:tcMar>
+              <w:top w:w="80" w:type="dxa"/>
+              <w:bottom w:w="80" w:type="dxa"/>
+              <w:start w:w="120" w:type="dxa"/>
+              <w:end w:w="120" w:type="dxa"/>
+            </w:tcMar>
+          </w:tcPr>
+          <w:p>
+            <w:pPr>
+              <w:widowControl/>
+              <w:spacing w:before="0" w:after="0" w:line="252" w:lineRule="auto"/>
+            </w:pPr>
+            <w:r/>
+            <w:r>
+              <w:rPr>
+                <w:rFonts w:ascii="Consolas" w:hAnsi="Consolas"/>
+                <w:color w:val="1F4D78"/>
+                <w:sz w:val="17"/>
+              </w:rPr>
+              <w:t>lexical_style_result.json</w:t>
+            </w:r>
+          </w:p>
+        </w:tc>
+        <w:tc>
+          <w:tcPr>
+            <w:tcW w:type="dxa" w:w="5760"/>
+            <w:vAlign w:val="center"/>
+            <w:tcMar>
+              <w:top w:w="80" w:type="dxa"/>
+              <w:bottom w:w="80" w:type="dxa"/>
+              <w:start w:w="120" w:type="dxa"/>
+              <w:end w:w="120" w:type="dxa"/>
+            </w:tcMar>
+          </w:tcPr>
+          <w:p>
+            <w:pPr>
+              <w:widowControl/>
+              <w:spacing w:before="0" w:after="0" w:line="252" w:lineRule="auto"/>
+            </w:pPr>
+            <w:r/>
+            <w:r>
+              <w:rPr>
+                <w:rFonts w:ascii="Calibri" w:hAnsi="Calibri"/>
+                <w:sz w:val="18"/>
+              </w:rPr>
+              <w:t>Complete structured Stage 10 configuration, summaries, distribution, audit, coverage, warnings, and provenance</w:t>
+            </w:r>
+          </w:p>
+        </w:tc>
+      </w:tr>
     </w:tbl>
     <w:p>
       <w:pPr>
@@ -15043,7 +15838,7 @@
           <w:rFonts w:ascii="Calibri" w:hAnsi="Calibri"/>
           <w:sz w:val="22"/>
         </w:rPr>
-        <w:t xml:space="preserve"> contains every Stage 6 line, fixed candidate, and method record, and </w:t>
+        <w:t xml:space="preserve"> contains every Stage 6 line, fixed candidate, and method record, </w:t>
       </w:r>
       <w:r>
         <w:rPr>
@@ -15058,7 +15853,7 @@
           <w:rFonts w:ascii="Calibri" w:hAnsi="Calibri"/>
           <w:sz w:val="22"/>
         </w:rPr>
-        <w:t xml:space="preserve"> contains every Stage 7 stanza, line, pair, sound-family, and method record. </w:t>
+        <w:t xml:space="preserve"> contains every Stage 7 stanza, line, pair, sound-family, and method record, and </w:t>
       </w:r>
       <w:r>
         <w:rPr>
@@ -15066,6 +15861,21 @@
           <w:color w:val="1F4D78"/>
           <w:sz w:val="19"/>
         </w:rPr>
+        <w:t>lexical_style_result.json</w:t>
+      </w:r>
+      <w:r>
+        <w:rPr>
+          <w:rFonts w:ascii="Calibri" w:hAnsi="Calibri"/>
+          <w:sz w:val="22"/>
+        </w:rPr>
+        <w:t xml:space="preserve"> contains every narrowed Stage 10 configuration, diversity/length summary, structural count, and token decision. </w:t>
+      </w:r>
+      <w:r>
+        <w:rPr>
+          <w:rFonts w:ascii="Consolas" w:hAnsi="Consolas"/>
+          <w:color w:val="1F4D78"/>
+          <w:sz w:val="19"/>
+        </w:rPr>
         <w:t>poem_document.json</w:t>
       </w:r>
       <w:r>
@@ -15073,7 +15883,7 @@
           <w:rFonts w:ascii="Calibri" w:hAnsi="Calibri"/>
           <w:sz w:val="22"/>
         </w:rPr>
-        <w:t xml:space="preserve"> includes the original text, so protect it as research material. Concreteness, Frequency, AoA, Pronunciation, Meter, and Rhyme &amp; Sound exports retain poem-specific provenance but do not copy any complete research source. The scholar summary is the easiest reading aid.</w:t>
+        <w:t xml:space="preserve"> includes the original text, so protect it as research material. Optional module exports retain poem-specific provenance but do not copy any complete research source. The scholar summary is the easiest reading aid.</w:t>
       </w:r>
     </w:p>
     <w:p>
@@ -16994,6 +17804,264 @@
           <w:sz w:val="22"/>
         </w:rPr>
         <w:t>An observation resolves only from one dictionary pronunciation, prosodically agreeing alternatives, or a validated scholar override. Empty denominators and incomplete-line totals remain missing.</w:t>
+      </w:r>
+    </w:p>
+    <w:p>
+      <w:pPr>
+        <w:pStyle w:val="Heading2"/>
+      </w:pPr>
+      <w:r>
+        <w:rPr>
+          <w:rFonts w:ascii="Calibri" w:hAnsi="Calibri"/>
+          <w:sz w:val="22"/>
+        </w:rPr>
+        <w:t>Lexical diversity, word length, and structural counts</w:t>
+      </w:r>
+    </w:p>
+    <w:p>
+      <w:pPr>
+        <w:widowControl/>
+        <w:spacing w:before="0" w:after="120" w:line="300" w:lineRule="auto"/>
+      </w:pPr>
+      <w:r>
+        <w:rPr>
+          <w:rFonts w:ascii="Calibri" w:hAnsi="Calibri"/>
+          <w:sz w:val="22"/>
+        </w:rPr>
+        <w:t xml:space="preserve">Let </w:t>
+      </w:r>
+      <w:r>
+        <w:rPr>
+          <w:rFonts w:ascii="Consolas" w:hAnsi="Consolas"/>
+          <w:color w:val="1F4D78"/>
+          <w:sz w:val="19"/>
+        </w:rPr>
+        <w:t>N</w:t>
+      </w:r>
+      <w:r>
+        <w:rPr>
+          <w:rFonts w:ascii="Calibri" w:hAnsi="Calibri"/>
+          <w:sz w:val="22"/>
+        </w:rPr>
+        <w:t xml:space="preserve"> be included shared-preprocessing lexical tokens and </w:t>
+      </w:r>
+      <w:r>
+        <w:rPr>
+          <w:rFonts w:ascii="Consolas" w:hAnsi="Consolas"/>
+          <w:color w:val="1F4D78"/>
+          <w:sz w:val="19"/>
+        </w:rPr>
+        <w:t>V</w:t>
+      </w:r>
+      <w:r>
+        <w:rPr>
+          <w:rFonts w:ascii="Calibri" w:hAnsi="Calibri"/>
+          <w:sz w:val="22"/>
+        </w:rPr>
+        <w:t xml:space="preserve"> normalized observed surface types.</w:t>
+      </w:r>
+    </w:p>
+    <w:p>
+      <w:pPr>
+        <w:pStyle w:val="Formula"/>
+      </w:pPr>
+      <w:r>
+        <w:rPr>
+          <w:rFonts w:ascii="Consolas" w:hAnsi="Consolas"/>
+          <w:color w:val="1F4D78"/>
+          <w:sz w:val="19"/>
+        </w:rPr>
+        <w:t>surface_TTR = V / N</w:t>
+      </w:r>
+    </w:p>
+    <w:p>
+      <w:pPr>
+        <w:widowControl/>
+        <w:spacing w:before="0" w:after="120" w:line="300" w:lineRule="auto"/>
+      </w:pPr>
+      <w:r>
+        <w:rPr>
+          <w:rFonts w:ascii="Calibri" w:hAnsi="Calibri"/>
+          <w:sz w:val="22"/>
+        </w:rPr>
+        <w:t xml:space="preserve">For configured MATTR window </w:t>
+      </w:r>
+      <w:r>
+        <w:rPr>
+          <w:rFonts w:ascii="Consolas" w:hAnsi="Consolas"/>
+          <w:color w:val="1F4D78"/>
+          <w:sz w:val="19"/>
+        </w:rPr>
+        <w:t>w</w:t>
+      </w:r>
+      <w:r>
+        <w:rPr>
+          <w:rFonts w:ascii="Calibri" w:hAnsi="Calibri"/>
+          <w:sz w:val="22"/>
+        </w:rPr>
+        <w:t>:</w:t>
+      </w:r>
+    </w:p>
+    <w:p>
+      <w:pPr>
+        <w:pStyle w:val="Formula"/>
+      </w:pPr>
+      <w:r>
+        <w:rPr>
+          <w:rFonts w:ascii="Consolas" w:hAnsi="Consolas"/>
+          <w:color w:val="1F4D78"/>
+          <w:sz w:val="19"/>
+        </w:rPr>
+        <w:t>MATTR(w) = mean(TTR of every overlapping w-token window)</w:t>
+      </w:r>
+    </w:p>
+    <w:p>
+      <w:pPr>
+        <w:widowControl/>
+        <w:spacing w:before="0" w:after="120" w:line="300" w:lineRule="auto"/>
+      </w:pPr>
+      <w:r>
+        <w:rPr>
+          <w:rFonts w:ascii="Calibri" w:hAnsi="Calibri"/>
+          <w:sz w:val="22"/>
+        </w:rPr>
+        <w:t xml:space="preserve">For type frequency </w:t>
+      </w:r>
+      <w:r>
+        <w:rPr>
+          <w:rFonts w:ascii="Consolas" w:hAnsi="Consolas"/>
+          <w:color w:val="1F4D78"/>
+          <w:sz w:val="19"/>
+        </w:rPr>
+        <w:t>f</w:t>
+      </w:r>
+      <w:r>
+        <w:rPr>
+          <w:rFonts w:ascii="Calibri" w:hAnsi="Calibri"/>
+          <w:sz w:val="22"/>
+        </w:rPr>
+        <w:t xml:space="preserve">, text length </w:t>
+      </w:r>
+      <w:r>
+        <w:rPr>
+          <w:rFonts w:ascii="Consolas" w:hAnsi="Consolas"/>
+          <w:color w:val="1F4D78"/>
+          <w:sz w:val="19"/>
+        </w:rPr>
+        <w:t>N</w:t>
+      </w:r>
+      <w:r>
+        <w:rPr>
+          <w:rFonts w:ascii="Calibri" w:hAnsi="Calibri"/>
+          <w:sz w:val="22"/>
+        </w:rPr>
+        <w:t xml:space="preserve">, and configured HD-D sample </w:t>
+      </w:r>
+      <w:r>
+        <w:rPr>
+          <w:rFonts w:ascii="Consolas" w:hAnsi="Consolas"/>
+          <w:color w:val="1F4D78"/>
+          <w:sz w:val="19"/>
+        </w:rPr>
+        <w:t>s</w:t>
+      </w:r>
+      <w:r>
+        <w:rPr>
+          <w:rFonts w:ascii="Calibri" w:hAnsi="Calibri"/>
+          <w:sz w:val="22"/>
+        </w:rPr>
+        <w:t>:</w:t>
+      </w:r>
+    </w:p>
+    <w:p>
+      <w:pPr>
+        <w:pStyle w:val="Formula"/>
+      </w:pPr>
+      <w:r>
+        <w:rPr>
+          <w:rFonts w:ascii="Consolas" w:hAnsi="Consolas"/>
+          <w:color w:val="1F4D78"/>
+          <w:sz w:val="19"/>
+        </w:rPr>
+        <w:t>P(type observed) = 1 - C(N-f, s) / C(N, s)</w:t>
+      </w:r>
+    </w:p>
+    <w:p>
+      <w:pPr>
+        <w:pStyle w:val="Formula"/>
+      </w:pPr>
+      <w:r>
+        <w:rPr>
+          <w:rFonts w:ascii="Consolas" w:hAnsi="Consolas"/>
+          <w:color w:val="1F4D78"/>
+          <w:sz w:val="19"/>
+        </w:rPr>
+        <w:t>HD-D = sum(P(type observed) for each type) / s</w:t>
+      </w:r>
+    </w:p>
+    <w:p>
+      <w:pPr>
+        <w:widowControl/>
+        <w:spacing w:before="0" w:after="120" w:line="300" w:lineRule="auto"/>
+      </w:pPr>
+      <w:r>
+        <w:rPr>
+          <w:rFonts w:ascii="Calibri" w:hAnsi="Calibri"/>
+          <w:sz w:val="22"/>
+        </w:rPr>
+        <w:t>MTLD counts token-sequence factors ending when cumulative TTR reaches the configured threshold, adds a proportional final factor, calculates forward and reverse values, and reports their mean.</w:t>
+      </w:r>
+    </w:p>
+    <w:p>
+      <w:pPr>
+        <w:pStyle w:val="Formula"/>
+      </w:pPr>
+      <w:r>
+        <w:rPr>
+          <w:rFonts w:ascii="Consolas" w:hAnsi="Consolas"/>
+          <w:color w:val="1F4D78"/>
+          <w:sz w:val="19"/>
+        </w:rPr>
+        <w:t>mean_alphabetic_word_length = sum(Unicode alphabetic characters per represented lexical token) / represented length observations</w:t>
+      </w:r>
+    </w:p>
+    <w:p>
+      <w:pPr>
+        <w:pStyle w:val="Formula"/>
+      </w:pPr>
+      <w:r>
+        <w:rPr>
+          <w:rFonts w:ascii="Consolas" w:hAnsi="Consolas"/>
+          <w:color w:val="1F4D78"/>
+          <w:sz w:val="19"/>
+        </w:rPr>
+        <w:t>line_word_count = included lexical tokens assigned to the preserved physical line</w:t>
+      </w:r>
+    </w:p>
+    <w:p>
+      <w:pPr>
+        <w:pStyle w:val="Formula"/>
+      </w:pPr>
+      <w:r>
+        <w:rPr>
+          <w:rFonts w:ascii="Consolas" w:hAnsi="Consolas"/>
+          <w:color w:val="1F4D78"/>
+          <w:sz w:val="19"/>
+        </w:rPr>
+        <w:t>stanza_word_count = included lexical tokens assigned to the preserved stanza</w:t>
+      </w:r>
+    </w:p>
+    <w:p>
+      <w:pPr>
+        <w:widowControl/>
+        <w:spacing w:before="0" w:after="120" w:line="300" w:lineRule="auto"/>
+      </w:pPr>
+      <w:r>
+        <w:rPr>
+          <w:rFonts w:ascii="Calibri" w:hAnsi="Calibri"/>
+          <w:sz w:val="22"/>
+        </w:rPr>
+        <w:t>Plain TTR is length-sensitive. MATTR, HD-D, and MTLD are comparable only under matching parameters and token policies. Unavailable values remain missing.</w:t>
       </w:r>
     </w:p>
     <w:p>
@@ -19317,6 +20385,63 @@
                 <w:rFonts w:ascii="Calibri" w:hAnsi="Calibri"/>
                 <w:sz w:val="18"/>
               </w:rPr>
+              <w:t>HD-D</w:t>
+            </w:r>
+          </w:p>
+        </w:tc>
+        <w:tc>
+          <w:tcPr>
+            <w:tcW w:type="dxa" w:w="5760"/>
+            <w:vAlign w:val="center"/>
+            <w:tcMar>
+              <w:top w:w="80" w:type="dxa"/>
+              <w:bottom w:w="80" w:type="dxa"/>
+              <w:start w:w="120" w:type="dxa"/>
+              <w:end w:w="120" w:type="dxa"/>
+            </w:tcMar>
+          </w:tcPr>
+          <w:p>
+            <w:pPr>
+              <w:widowControl/>
+              <w:spacing w:before="0" w:after="0" w:line="252" w:lineRule="auto"/>
+            </w:pPr>
+            <w:r/>
+            <w:r>
+              <w:rPr>
+                <w:rFonts w:ascii="Calibri" w:hAnsi="Calibri"/>
+                <w:sz w:val="18"/>
+              </w:rPr>
+              <w:t>Expected distinct-type proportion in a configured without-replacement token sample</w:t>
+            </w:r>
+          </w:p>
+        </w:tc>
+      </w:tr>
+      <w:tr>
+        <w:trPr>
+          <w:cantSplit w:val="true"/>
+        </w:trPr>
+        <w:tc>
+          <w:tcPr>
+            <w:tcW w:type="dxa" w:w="3600"/>
+            <w:vAlign w:val="center"/>
+            <w:tcMar>
+              <w:top w:w="80" w:type="dxa"/>
+              <w:bottom w:w="80" w:type="dxa"/>
+              <w:start w:w="120" w:type="dxa"/>
+              <w:end w:w="120" w:type="dxa"/>
+            </w:tcMar>
+          </w:tcPr>
+          <w:p>
+            <w:pPr>
+              <w:widowControl/>
+              <w:spacing w:before="0" w:after="0" w:line="252" w:lineRule="auto"/>
+            </w:pPr>
+            <w:r/>
+            <w:r>
+              <w:rPr>
+                <w:rFonts w:ascii="Calibri" w:hAnsi="Calibri"/>
+                <w:sz w:val="18"/>
+              </w:rPr>
               <w:t>Lemma</w:t>
             </w:r>
           </w:p>
@@ -19401,6 +20526,120 @@
                 <w:sz w:val="18"/>
               </w:rPr>
               <w:t>Match obtained from the lemma only after exact candidates fail</w:t>
+            </w:r>
+          </w:p>
+        </w:tc>
+      </w:tr>
+      <w:tr>
+        <w:trPr>
+          <w:cantSplit w:val="true"/>
+        </w:trPr>
+        <w:tc>
+          <w:tcPr>
+            <w:tcW w:type="dxa" w:w="3600"/>
+            <w:vAlign w:val="center"/>
+            <w:tcMar>
+              <w:top w:w="80" w:type="dxa"/>
+              <w:bottom w:w="80" w:type="dxa"/>
+              <w:start w:w="120" w:type="dxa"/>
+              <w:end w:w="120" w:type="dxa"/>
+            </w:tcMar>
+          </w:tcPr>
+          <w:p>
+            <w:pPr>
+              <w:widowControl/>
+              <w:spacing w:before="0" w:after="0" w:line="252" w:lineRule="auto"/>
+            </w:pPr>
+            <w:r/>
+            <w:r>
+              <w:rPr>
+                <w:rFonts w:ascii="Calibri" w:hAnsi="Calibri"/>
+                <w:sz w:val="18"/>
+              </w:rPr>
+              <w:t>Lexical-style word unit</w:t>
+            </w:r>
+          </w:p>
+        </w:tc>
+        <w:tc>
+          <w:tcPr>
+            <w:tcW w:type="dxa" w:w="5760"/>
+            <w:vAlign w:val="center"/>
+            <w:tcMar>
+              <w:top w:w="80" w:type="dxa"/>
+              <w:bottom w:w="80" w:type="dxa"/>
+              <w:start w:w="120" w:type="dxa"/>
+              <w:end w:w="120" w:type="dxa"/>
+            </w:tcMar>
+          </w:tcPr>
+          <w:p>
+            <w:pPr>
+              <w:widowControl/>
+              <w:spacing w:before="0" w:after="0" w:line="252" w:lineRule="auto"/>
+            </w:pPr>
+            <w:r/>
+            <w:r>
+              <w:rPr>
+                <w:rFonts w:ascii="Calibri" w:hAnsi="Calibri"/>
+                <w:sz w:val="18"/>
+              </w:rPr>
+              <w:t>Eligible lexical token represented by its normalized observed surface form, without lemma substitution</w:t>
+            </w:r>
+          </w:p>
+        </w:tc>
+      </w:tr>
+      <w:tr>
+        <w:trPr>
+          <w:cantSplit w:val="true"/>
+        </w:trPr>
+        <w:tc>
+          <w:tcPr>
+            <w:tcW w:type="dxa" w:w="3600"/>
+            <w:vAlign w:val="center"/>
+            <w:tcMar>
+              <w:top w:w="80" w:type="dxa"/>
+              <w:bottom w:w="80" w:type="dxa"/>
+              <w:start w:w="120" w:type="dxa"/>
+              <w:end w:w="120" w:type="dxa"/>
+            </w:tcMar>
+          </w:tcPr>
+          <w:p>
+            <w:pPr>
+              <w:widowControl/>
+              <w:spacing w:before="0" w:after="0" w:line="252" w:lineRule="auto"/>
+            </w:pPr>
+            <w:r/>
+            <w:r>
+              <w:rPr>
+                <w:rFonts w:ascii="Calibri" w:hAnsi="Calibri"/>
+                <w:sz w:val="18"/>
+              </w:rPr>
+              <w:t>MATTR</w:t>
+            </w:r>
+          </w:p>
+        </w:tc>
+        <w:tc>
+          <w:tcPr>
+            <w:tcW w:type="dxa" w:w="5760"/>
+            <w:vAlign w:val="center"/>
+            <w:tcMar>
+              <w:top w:w="80" w:type="dxa"/>
+              <w:bottom w:w="80" w:type="dxa"/>
+              <w:start w:w="120" w:type="dxa"/>
+              <w:end w:w="120" w:type="dxa"/>
+            </w:tcMar>
+          </w:tcPr>
+          <w:p>
+            <w:pPr>
+              <w:widowControl/>
+              <w:spacing w:before="0" w:after="0" w:line="252" w:lineRule="auto"/>
+            </w:pPr>
+            <w:r/>
+            <w:r>
+              <w:rPr>
+                <w:rFonts w:ascii="Calibri" w:hAnsi="Calibri"/>
+                <w:sz w:val="18"/>
+              </w:rPr>
+              <w:t>Mean type-token ratio across all overlapping token windows of a configured size</w:t>
             </w:r>
           </w:p>
         </w:tc>
@@ -20301,6 +21540,63 @@
                 <w:sz w:val="18"/>
               </w:rPr>
               <w:t>Analyzable eligible physical lines divided by all eligible physical lines</w:t>
+            </w:r>
+          </w:p>
+        </w:tc>
+      </w:tr>
+      <w:tr>
+        <w:trPr>
+          <w:cantSplit w:val="true"/>
+        </w:trPr>
+        <w:tc>
+          <w:tcPr>
+            <w:tcW w:type="dxa" w:w="3600"/>
+            <w:vAlign w:val="center"/>
+            <w:tcMar>
+              <w:top w:w="80" w:type="dxa"/>
+              <w:bottom w:w="80" w:type="dxa"/>
+              <w:start w:w="120" w:type="dxa"/>
+              <w:end w:w="120" w:type="dxa"/>
+            </w:tcMar>
+          </w:tcPr>
+          <w:p>
+            <w:pPr>
+              <w:widowControl/>
+              <w:spacing w:before="0" w:after="0" w:line="252" w:lineRule="auto"/>
+            </w:pPr>
+            <w:r/>
+            <w:r>
+              <w:rPr>
+                <w:rFonts w:ascii="Calibri" w:hAnsi="Calibri"/>
+                <w:sz w:val="18"/>
+              </w:rPr>
+              <w:t>MTLD</w:t>
+            </w:r>
+          </w:p>
+        </w:tc>
+        <w:tc>
+          <w:tcPr>
+            <w:tcW w:type="dxa" w:w="5760"/>
+            <w:vAlign w:val="center"/>
+            <w:tcMar>
+              <w:top w:w="80" w:type="dxa"/>
+              <w:bottom w:w="80" w:type="dxa"/>
+              <w:start w:w="120" w:type="dxa"/>
+              <w:end w:w="120" w:type="dxa"/>
+            </w:tcMar>
+          </w:tcPr>
+          <w:p>
+            <w:pPr>
+              <w:widowControl/>
+              <w:spacing w:before="0" w:after="0" w:line="252" w:lineRule="auto"/>
+            </w:pPr>
+            <w:r/>
+            <w:r>
+              <w:rPr>
+                <w:rFonts w:ascii="Calibri" w:hAnsi="Calibri"/>
+                <w:sz w:val="18"/>
+              </w:rPr>
+              <w:t>Mean forward/reverse sequential factor-length estimate at a configured TTR threshold</w:t>
             </w:r>
           </w:p>
         </w:tc>
@@ -21490,6 +22786,63 @@
           </w:p>
         </w:tc>
       </w:tr>
+      <w:tr>
+        <w:trPr>
+          <w:cantSplit w:val="true"/>
+        </w:trPr>
+        <w:tc>
+          <w:tcPr>
+            <w:tcW w:type="dxa" w:w="3600"/>
+            <w:vAlign w:val="center"/>
+            <w:tcMar>
+              <w:top w:w="80" w:type="dxa"/>
+              <w:bottom w:w="80" w:type="dxa"/>
+              <w:start w:w="120" w:type="dxa"/>
+              <w:end w:w="120" w:type="dxa"/>
+            </w:tcMar>
+          </w:tcPr>
+          <w:p>
+            <w:pPr>
+              <w:widowControl/>
+              <w:spacing w:before="0" w:after="0" w:line="252" w:lineRule="auto"/>
+            </w:pPr>
+            <w:r/>
+            <w:r>
+              <w:rPr>
+                <w:rFonts w:ascii="Calibri" w:hAnsi="Calibri"/>
+                <w:sz w:val="18"/>
+              </w:rPr>
+              <w:t>Alphabetic word length</w:t>
+            </w:r>
+          </w:p>
+        </w:tc>
+        <w:tc>
+          <w:tcPr>
+            <w:tcW w:type="dxa" w:w="5760"/>
+            <w:vAlign w:val="center"/>
+            <w:tcMar>
+              <w:top w:w="80" w:type="dxa"/>
+              <w:bottom w:w="80" w:type="dxa"/>
+              <w:start w:w="120" w:type="dxa"/>
+              <w:end w:w="120" w:type="dxa"/>
+            </w:tcMar>
+          </w:tcPr>
+          <w:p>
+            <w:pPr>
+              <w:widowControl/>
+              <w:spacing w:before="0" w:after="0" w:line="252" w:lineRule="auto"/>
+            </w:pPr>
+            <w:r/>
+            <w:r>
+              <w:rPr>
+                <w:rFonts w:ascii="Calibri" w:hAnsi="Calibri"/>
+                <w:sz w:val="18"/>
+              </w:rPr>
+              <w:t>Number of Unicode alphabetic characters in the preserved surface token</w:t>
+            </w:r>
+          </w:p>
+        </w:tc>
+      </w:tr>
     </w:tbl>
     <w:p>
       <w:pPr>
@@ -22961,7 +24314,7 @@
         <w:color w:val="66727C"/>
         <w:sz w:val="18"/>
       </w:rPr>
-      <w:t xml:space="preserve">  |  0.13.0.dev0</w:t>
+      <w:t xml:space="preserve">  |  0.14.0.dev0</w:t>
     </w:r>
   </w:p>
 </w:hdr>

</xml_diff>

<commit_message>
Complete Stage 11 corpus modules and explorer
</commit_message>
<xml_diff>
--- a/docs/VerseVAD_User_Manual.docx
+++ b/docs/VerseVAD_User_Manual.docx
@@ -47,7 +47,7 @@
           <w:color w:val="66727C"/>
           <w:sz w:val="21"/>
         </w:rPr>
-        <w:t xml:space="preserve"> 0.14.0.dev0</w:t>
+        <w:t xml:space="preserve"> 0.15.0.dev0</w:t>
       </w:r>
       <w:r>
         <w:rPr>
@@ -8496,7 +8496,7 @@
           <w:rFonts w:ascii="Calibri" w:hAnsi="Calibri"/>
           <w:sz w:val="22"/>
         </w:rPr>
-        <w:t xml:space="preserve">Concreteness, Frequency, AoA, Pronunciation &amp; Prosody, Meter &amp; Rhythm, Rhyme &amp; Sound, and Lexical Style are currently temporary </w:t>
+        <w:t xml:space="preserve">The same seven optional modules are also available in </w:t>
       </w:r>
       <w:r>
         <w:rPr>
@@ -8504,21 +8504,6 @@
           <w:b/>
           <w:sz w:val="22"/>
         </w:rPr>
-        <w:t>One Poem</w:t>
-      </w:r>
-      <w:r>
-        <w:rPr>
-          <w:rFonts w:ascii="Calibri" w:hAnsi="Calibri"/>
-          <w:sz w:val="22"/>
-        </w:rPr>
-        <w:t xml:space="preserve"> modules. They are not yet batched, persisted, aggregated, or exported by </w:t>
-      </w:r>
-      <w:r>
-        <w:rPr>
-          <w:rFonts w:ascii="Calibri" w:hAnsi="Calibri"/>
-          <w:b/>
-          <w:sz w:val="22"/>
-        </w:rPr>
         <w:t>Projects &amp; Corpus</w:t>
       </w:r>
       <w:r>
@@ -8526,7 +8511,7 @@
           <w:rFonts w:ascii="Calibri" w:hAnsi="Calibri"/>
           <w:sz w:val="22"/>
         </w:rPr>
-        <w:t>.</w:t>
+        <w:t>. One Poem results remain temporary unless downloaded; corpus runs persist the same module result envelopes, configurations, coverage, warnings, provenance, and audit artifacts against exact text versions.</w:t>
       </w:r>
     </w:p>
     <w:p>
@@ -10621,7 +10606,22 @@
           <w:rFonts w:ascii="Calibri" w:hAnsi="Calibri"/>
           <w:sz w:val="22"/>
         </w:rPr>
-        <w:t>Select the lexicons.</w:t>
+        <w:t xml:space="preserve">Select affective lexicons and/or </w:t>
+      </w:r>
+      <w:r>
+        <w:rPr>
+          <w:rFonts w:ascii="Calibri" w:hAnsi="Calibri"/>
+          <w:b/>
+          <w:sz w:val="22"/>
+        </w:rPr>
+        <w:t>Additional analysis modules</w:t>
+      </w:r>
+      <w:r>
+        <w:rPr>
+          <w:rFonts w:ascii="Calibri" w:hAnsi="Calibri"/>
+          <w:sz w:val="22"/>
+        </w:rPr>
+        <w:t>.</w:t>
       </w:r>
     </w:p>
     <w:p>
@@ -10657,7 +10657,35 @@
           <w:rFonts w:ascii="Calibri" w:hAnsi="Calibri"/>
           <w:sz w:val="22"/>
         </w:rPr>
-        <w:t>Choose the stopword policy.</w:t>
+        <w:t>For Frequency or AoA, optionally enable the non-default content-word-only</w:t>
+      </w:r>
+    </w:p>
+    <w:p>
+      <w:pPr>
+        <w:widowControl/>
+        <w:spacing w:before="0" w:after="120" w:line="300" w:lineRule="auto"/>
+      </w:pPr>
+      <w:r>
+        <w:rPr>
+          <w:rFonts w:ascii="Calibri" w:hAnsi="Calibri"/>
+          <w:sz w:val="22"/>
+        </w:rPr>
+        <w:t xml:space="preserve">   scope under </w:t>
+      </w:r>
+      <w:r>
+        <w:rPr>
+          <w:rFonts w:ascii="Calibri" w:hAnsi="Calibri"/>
+          <w:b/>
+          <w:sz w:val="22"/>
+        </w:rPr>
+        <w:t>Advanced batch methodology</w:t>
+      </w:r>
+      <w:r>
+        <w:rPr>
+          <w:rFonts w:ascii="Calibri" w:hAnsi="Calibri"/>
+          <w:sz w:val="22"/>
+        </w:rPr>
+        <w:t>.</w:t>
       </w:r>
     </w:p>
     <w:p>
@@ -10675,22 +10703,7 @@
           <w:rFonts w:ascii="Calibri" w:hAnsi="Calibri"/>
           <w:sz w:val="22"/>
         </w:rPr>
-        <w:t xml:space="preserve">Choose </w:t>
-      </w:r>
-      <w:r>
-        <w:rPr>
-          <w:rFonts w:ascii="Calibri" w:hAnsi="Calibri"/>
-          <w:b/>
-          <w:sz w:val="22"/>
-        </w:rPr>
-        <w:t>Unreviewed baseline</w:t>
-      </w:r>
-      <w:r>
-        <w:rPr>
-          <w:rFonts w:ascii="Calibri" w:hAnsi="Calibri"/>
-          <w:sz w:val="22"/>
-        </w:rPr>
-        <w:t xml:space="preserve"> or an exact named review-scenario version.</w:t>
+        <w:t>Choose the stopword policy.</w:t>
       </w:r>
     </w:p>
     <w:p>
@@ -10708,6 +10721,39 @@
           <w:rFonts w:ascii="Calibri" w:hAnsi="Calibri"/>
           <w:sz w:val="22"/>
         </w:rPr>
+        <w:t xml:space="preserve">Choose </w:t>
+      </w:r>
+      <w:r>
+        <w:rPr>
+          <w:rFonts w:ascii="Calibri" w:hAnsi="Calibri"/>
+          <w:b/>
+          <w:sz w:val="22"/>
+        </w:rPr>
+        <w:t>Unreviewed baseline</w:t>
+      </w:r>
+      <w:r>
+        <w:rPr>
+          <w:rFonts w:ascii="Calibri" w:hAnsi="Calibri"/>
+          <w:sz w:val="22"/>
+        </w:rPr>
+        <w:t xml:space="preserve"> or an exact named review-scenario version.</w:t>
+      </w:r>
+    </w:p>
+    <w:p>
+      <w:pPr>
+        <w:widowControl/>
+        <w:numPr>
+          <w:ilvl w:val="0"/>
+          <w:numId w:val="17"/>
+        </w:numPr>
+        <w:spacing w:before="0" w:after="80" w:line="300" w:lineRule="auto"/>
+        <w:ind w:left="540" w:hanging="271"/>
+      </w:pPr>
+      <w:r>
+        <w:rPr>
+          <w:rFonts w:ascii="Calibri" w:hAnsi="Calibri"/>
+          <w:sz w:val="22"/>
+        </w:rPr>
         <w:t xml:space="preserve">Click </w:t>
       </w:r>
       <w:r>
@@ -10737,6 +10783,19 @@
           <w:sz w:val="22"/>
         </w:rPr>
         <w:t>VerseVAD analyzes every work separately. The new comparison is published only after the entire selected batch completes. Pending or failed batches never replace the latest complete comparison.</w:t>
+      </w:r>
+    </w:p>
+    <w:p>
+      <w:pPr>
+        <w:widowControl/>
+        <w:spacing w:before="0" w:after="120" w:line="300" w:lineRule="auto"/>
+      </w:pPr>
+      <w:r>
+        <w:rPr>
+          <w:rFonts w:ascii="Calibri" w:hAnsi="Calibri"/>
+          <w:sz w:val="22"/>
+        </w:rPr>
+        <w:t>Additional modules are off by default because pronunciation, meter, and rhyme can add substantial processing time to a large collection. Selecting meter or rhyme automatically includes the pronunciation dependency. The corpus path calls the same tested modules as One Poem and does not duplicate their calculations.</w:t>
       </w:r>
     </w:p>
     <w:p>
@@ -10888,6 +10947,87 @@
           <w:rFonts w:ascii="Calibri" w:hAnsi="Calibri"/>
           <w:sz w:val="22"/>
         </w:rPr>
+        <w:t>Additional module corpus results</w:t>
+      </w:r>
+    </w:p>
+    <w:p>
+      <w:pPr>
+        <w:widowControl/>
+        <w:spacing w:before="0" w:after="120" w:line="300" w:lineRule="auto"/>
+      </w:pPr>
+      <w:r>
+        <w:rPr>
+          <w:rFonts w:ascii="Calibri" w:hAnsi="Calibri"/>
+          <w:sz w:val="22"/>
+        </w:rPr>
+        <w:t xml:space="preserve">Choose one enabled module under </w:t>
+      </w:r>
+      <w:r>
+        <w:rPr>
+          <w:rFonts w:ascii="Calibri" w:hAnsi="Calibri"/>
+          <w:b/>
+          <w:sz w:val="22"/>
+        </w:rPr>
+        <w:t>Additional Module Results</w:t>
+      </w:r>
+      <w:r>
+        <w:rPr>
+          <w:rFonts w:ascii="Calibri" w:hAnsi="Calibri"/>
+          <w:sz w:val="22"/>
+        </w:rPr>
+        <w:t>. VerseVAD shows compatible collection summaries followed by the original work, line, stanza, token, type, or distribution rows. Equal-work means and observation-weighted means are separate. An observation-weighted mean appears only when every included work supplies a defensible count for that metric.</w:t>
+      </w:r>
+    </w:p>
+    <w:p>
+      <w:pPr>
+        <w:widowControl/>
+        <w:spacing w:before="0" w:after="120" w:line="300" w:lineRule="auto"/>
+      </w:pPr>
+      <w:r>
+        <w:rPr>
+          <w:rFonts w:ascii="Calibri" w:hAnsi="Calibri"/>
+          <w:sz w:val="22"/>
+        </w:rPr>
+        <w:t>Lexical-style pooled TTR, MATTR, HD-D, MTLD, and mean word length are recalculated from the ordered pooled token evidence and are not averages of work-level diversity scores. Meter and rhyme remain work-level candidates/evidence; no corpus-wide definitive meter or rhyme scheme is created.</w:t>
+      </w:r>
+    </w:p>
+    <w:p>
+      <w:pPr>
+        <w:widowControl/>
+        <w:spacing w:before="0" w:after="120" w:line="300" w:lineRule="auto"/>
+      </w:pPr>
+      <w:r>
+        <w:rPr>
+          <w:rFonts w:ascii="Calibri" w:hAnsi="Calibri"/>
+          <w:sz w:val="22"/>
+        </w:rPr>
+        <w:t xml:space="preserve">Coverage, unmatched evidence, warnings, configuration IDs, and denominators remain visible. </w:t>
+      </w:r>
+      <w:r>
+        <w:rPr>
+          <w:rFonts w:ascii="Calibri" w:hAnsi="Calibri"/>
+          <w:b/>
+          <w:sz w:val="22"/>
+        </w:rPr>
+        <w:t>Download module audit ZIP</w:t>
+      </w:r>
+      <w:r>
+        <w:rPr>
+          <w:rFonts w:ascii="Calibri" w:hAnsi="Calibri"/>
+          <w:sz w:val="22"/>
+        </w:rPr>
+        <w:t xml:space="preserve"> reconstructs and checksum-checks the persisted CSV/JSON bundle for one work and module.</w:t>
+      </w:r>
+    </w:p>
+    <w:p>
+      <w:pPr>
+        <w:pStyle w:val="Heading2"/>
+      </w:pPr>
+      <w:r>
+        <w:rPr>
+          <w:rFonts w:ascii="Calibri" w:hAnsi="Calibri"/>
+          <w:sz w:val="22"/>
+        </w:rPr>
         <w:t>Corpus Language Profile</w:t>
       </w:r>
     </w:p>
@@ -11612,7 +11752,112 @@
           <w:rFonts w:ascii="Calibri" w:hAnsi="Calibri"/>
           <w:sz w:val="22"/>
         </w:rPr>
-        <w:t>After a complete batch, download the corpus workbook. It includes a reading guide, both collection weighting views, both stopword views, work-level data, cumulative totals, coverage, separately labeled emotion/sentiment/intensity constructs, unmatched notes, text/version provenance, review decisions when applicable, and the recorded methodology.</w:t>
+        <w:t xml:space="preserve">After a complete batch, download the corpus workbook. It includes a reading guide, both collection weighting views, both stopword views, work-level data, cumulative totals, coverage, separately labeled emotion/sentiment/intensity constructs, unmatched notes, text/version provenance, review decisions when applicable, and the recorded methodology. Optional-module batches add </w:t>
+      </w:r>
+      <w:r>
+        <w:rPr>
+          <w:rFonts w:ascii="Calibri" w:hAnsi="Calibri"/>
+          <w:b/>
+          <w:sz w:val="22"/>
+        </w:rPr>
+        <w:t>Module Collection</w:t>
+      </w:r>
+      <w:r>
+        <w:rPr>
+          <w:rFonts w:ascii="Calibri" w:hAnsi="Calibri"/>
+          <w:sz w:val="22"/>
+        </w:rPr>
+        <w:t xml:space="preserve">, </w:t>
+      </w:r>
+      <w:r>
+        <w:rPr>
+          <w:rFonts w:ascii="Calibri" w:hAnsi="Calibri"/>
+          <w:b/>
+          <w:sz w:val="22"/>
+        </w:rPr>
+        <w:t>Module Categories</w:t>
+      </w:r>
+      <w:r>
+        <w:rPr>
+          <w:rFonts w:ascii="Calibri" w:hAnsi="Calibri"/>
+          <w:sz w:val="22"/>
+        </w:rPr>
+        <w:t xml:space="preserve">, </w:t>
+      </w:r>
+      <w:r>
+        <w:rPr>
+          <w:rFonts w:ascii="Calibri" w:hAnsi="Calibri"/>
+          <w:b/>
+          <w:sz w:val="22"/>
+        </w:rPr>
+        <w:t>Module Work Results</w:t>
+      </w:r>
+      <w:r>
+        <w:rPr>
+          <w:rFonts w:ascii="Calibri" w:hAnsi="Calibri"/>
+          <w:sz w:val="22"/>
+        </w:rPr>
+        <w:t xml:space="preserve">, </w:t>
+      </w:r>
+      <w:r>
+        <w:rPr>
+          <w:rFonts w:ascii="Calibri" w:hAnsi="Calibri"/>
+          <w:b/>
+          <w:sz w:val="22"/>
+        </w:rPr>
+        <w:t>Module Structure</w:t>
+      </w:r>
+      <w:r>
+        <w:rPr>
+          <w:rFonts w:ascii="Calibri" w:hAnsi="Calibri"/>
+          <w:sz w:val="22"/>
+        </w:rPr>
+        <w:t xml:space="preserve">, </w:t>
+      </w:r>
+      <w:r>
+        <w:rPr>
+          <w:rFonts w:ascii="Calibri" w:hAnsi="Calibri"/>
+          <w:b/>
+          <w:sz w:val="22"/>
+        </w:rPr>
+        <w:t>Module Coverage</w:t>
+      </w:r>
+      <w:r>
+        <w:rPr>
+          <w:rFonts w:ascii="Calibri" w:hAnsi="Calibri"/>
+          <w:sz w:val="22"/>
+        </w:rPr>
+        <w:t xml:space="preserve">, </w:t>
+      </w:r>
+      <w:r>
+        <w:rPr>
+          <w:rFonts w:ascii="Calibri" w:hAnsi="Calibri"/>
+          <w:b/>
+          <w:sz w:val="22"/>
+        </w:rPr>
+        <w:t>Module Provenance</w:t>
+      </w:r>
+      <w:r>
+        <w:rPr>
+          <w:rFonts w:ascii="Calibri" w:hAnsi="Calibri"/>
+          <w:sz w:val="22"/>
+        </w:rPr>
+        <w:t xml:space="preserve">, and </w:t>
+      </w:r>
+      <w:r>
+        <w:rPr>
+          <w:rFonts w:ascii="Calibri" w:hAnsi="Calibri"/>
+          <w:b/>
+          <w:sz w:val="22"/>
+        </w:rPr>
+        <w:t>Module Warnings</w:t>
+      </w:r>
+      <w:r>
+        <w:rPr>
+          <w:rFonts w:ascii="Calibri" w:hAnsi="Calibri"/>
+          <w:sz w:val="22"/>
+        </w:rPr>
+        <w:t xml:space="preserve"> sheets.</w:t>
       </w:r>
     </w:p>
     <w:p>
@@ -12136,6 +12381,97 @@
           <w:sz w:val="22"/>
         </w:rPr>
         <w:t>The provenance panel identifies the lexicon, version, source scale, adapter, imported file, checksum, and source details. Empty uncertainty fields mean the source did not provide those values.</w:t>
+      </w:r>
+    </w:p>
+    <w:p>
+      <w:pPr>
+        <w:pStyle w:val="Heading2"/>
+      </w:pPr>
+      <w:r>
+        <w:rPr>
+          <w:rFonts w:ascii="Calibri" w:hAnsi="Calibri"/>
+          <w:sz w:val="22"/>
+        </w:rPr>
+        <w:t>Additional lexical evidence</w:t>
+      </w:r>
+    </w:p>
+    <w:p>
+      <w:pPr>
+        <w:widowControl/>
+        <w:spacing w:before="0" w:after="120" w:line="300" w:lineRule="auto"/>
+      </w:pPr>
+      <w:r>
+        <w:rPr>
+          <w:rFonts w:ascii="Calibri" w:hAnsi="Calibri"/>
+          <w:sz w:val="22"/>
+        </w:rPr>
+        <w:t>The Explorer also checks installed concreteness, SUBTLEX-US, Kuperman AoA, and CMUdict resources. It reports source-supplied concreteness fields; Zipf, frequency, contextual diversity, and source POS fields; AoA ratings and response evidence; and every exact CMUdict pronunciation candidate with ARPAbet phones, syllable count, and lexical-stress digits.</w:t>
+      </w:r>
+    </w:p>
+    <w:p>
+      <w:pPr>
+        <w:widowControl/>
+        <w:spacing w:before="0" w:after="120" w:line="300" w:lineRule="auto"/>
+      </w:pPr>
+      <w:r>
+        <w:rPr>
+          <w:rFonts w:ascii="Calibri" w:hAnsi="Calibri"/>
+          <w:b/>
+          <w:sz w:val="22"/>
+        </w:rPr>
+        <w:t>Matched</w:t>
+      </w:r>
+      <w:r>
+        <w:rPr>
+          <w:rFonts w:ascii="Calibri" w:hAnsi="Calibri"/>
+          <w:sz w:val="22"/>
+        </w:rPr>
+        <w:t xml:space="preserve">, </w:t>
+      </w:r>
+      <w:r>
+        <w:rPr>
+          <w:rFonts w:ascii="Calibri" w:hAnsi="Calibri"/>
+          <w:b/>
+          <w:sz w:val="22"/>
+        </w:rPr>
+        <w:t>Source unrated</w:t>
+      </w:r>
+      <w:r>
+        <w:rPr>
+          <w:rFonts w:ascii="Calibri" w:hAnsi="Calibri"/>
+          <w:sz w:val="22"/>
+        </w:rPr>
+        <w:t xml:space="preserve">, </w:t>
+      </w:r>
+      <w:r>
+        <w:rPr>
+          <w:rFonts w:ascii="Calibri" w:hAnsi="Calibri"/>
+          <w:b/>
+          <w:sz w:val="22"/>
+        </w:rPr>
+        <w:t>Unmatched</w:t>
+      </w:r>
+      <w:r>
+        <w:rPr>
+          <w:rFonts w:ascii="Calibri" w:hAnsi="Calibri"/>
+          <w:sz w:val="22"/>
+        </w:rPr>
+        <w:t xml:space="preserve">, and </w:t>
+      </w:r>
+      <w:r>
+        <w:rPr>
+          <w:rFonts w:ascii="Calibri" w:hAnsi="Calibri"/>
+          <w:b/>
+          <w:sz w:val="22"/>
+        </w:rPr>
+        <w:t>Resource unavailable</w:t>
+      </w:r>
+      <w:r>
+        <w:rPr>
+          <w:rFonts w:ascii="Calibri" w:hAnsi="Calibri"/>
+          <w:sz w:val="22"/>
+        </w:rPr>
+        <w:t xml:space="preserve"> are different statuses. A missing field remains missing. Pronunciation alternatives remain separate and are dictionary candidates rather than a context-sensitive performance or dialect judgment.</w:t>
       </w:r>
     </w:p>
     <w:p>
@@ -23417,7 +23753,7 @@
           <w:rFonts w:ascii="Calibri" w:hAnsi="Calibri"/>
           <w:sz w:val="22"/>
         </w:rPr>
-        <w:t>Concreteness is currently an optional one-poem in-memory module; it is not yet persisted in corpus projects.</w:t>
+        <w:t>Corpus concreteness results persist by work with their exact configuration, coverage, warnings, provenance, and audit bundle.</w:t>
       </w:r>
     </w:p>
     <w:p>
@@ -23537,7 +23873,7 @@
           <w:rFonts w:ascii="Calibri" w:hAnsi="Calibri"/>
           <w:sz w:val="22"/>
         </w:rPr>
-        <w:t>Frequency is currently an optional one-poem in-memory module; it is not yet persisted in corpus projects.</w:t>
+        <w:t>Corpus frequency results persist by work; equal-work and safe observation-weighted summaries remain separately labeled.</w:t>
       </w:r>
     </w:p>
     <w:p>
@@ -23681,7 +24017,7 @@
           <w:rFonts w:ascii="Calibri" w:hAnsi="Calibri"/>
           <w:sz w:val="22"/>
         </w:rPr>
-        <w:t>AoA is currently an optional one-poem in-memory module; it is not yet persisted in corpus projects.</w:t>
+        <w:t>Corpus AoA results persist by work with source-unrated and unmatched evidence kept distinct.</w:t>
       </w:r>
     </w:p>
     <w:p>
@@ -23823,7 +24159,7 @@
           <w:rFonts w:ascii="Calibri" w:hAnsi="Calibri"/>
           <w:sz w:val="22"/>
         </w:rPr>
-        <w:t>Pronunciation &amp; Prosody is currently an optional one-poem in-memory module;</w:t>
+        <w:t>Corpus pronunciation results persist by work. The current corpus controls use</w:t>
       </w:r>
     </w:p>
     <w:p>
@@ -23836,7 +24172,7 @@
           <w:rFonts w:ascii="Calibri" w:hAnsi="Calibri"/>
           <w:sz w:val="22"/>
         </w:rPr>
-        <w:t xml:space="preserve">  it is not yet persisted in corpus projects.</w:t>
+        <w:t xml:space="preserve">  the recorded default pronunciation configuration rather than offering   project-wide scholar overrides.</w:t>
       </w:r>
     </w:p>
     <w:p>
@@ -23916,7 +24252,7 @@
           <w:rFonts w:ascii="Calibri" w:hAnsi="Calibri"/>
           <w:sz w:val="22"/>
         </w:rPr>
-        <w:t>Meter &amp; Rhythm is currently an optional one-poem in-memory module; it is not</w:t>
+        <w:t>Corpus meter results persist as work-level candidates; categorical</w:t>
       </w:r>
     </w:p>
     <w:p>
@@ -23929,7 +24265,7 @@
           <w:rFonts w:ascii="Calibri" w:hAnsi="Calibri"/>
           <w:sz w:val="22"/>
         </w:rPr>
-        <w:t xml:space="preserve">  yet persisted or aggregated in corpus projects.</w:t>
+        <w:t xml:space="preserve">  prevalence does not declare one corpus-wide meter.</w:t>
       </w:r>
     </w:p>
     <w:p>
@@ -24009,7 +24345,7 @@
           <w:rFonts w:ascii="Calibri" w:hAnsi="Calibri"/>
           <w:sz w:val="22"/>
         </w:rPr>
-        <w:t>Rhyme &amp; Sound is currently an optional one-poem in-memory module; it is not</w:t>
+        <w:t>Corpus rhyme/sound results persist as work-level evidence; scheme prevalence</w:t>
       </w:r>
     </w:p>
     <w:p>
@@ -24022,7 +24358,7 @@
           <w:rFonts w:ascii="Calibri" w:hAnsi="Calibri"/>
           <w:sz w:val="22"/>
         </w:rPr>
-        <w:t xml:space="preserve">  yet persisted or aggregated in corpus projects.</w:t>
+        <w:t xml:space="preserve">  does not declare one corpus-wide rhyme scheme.</w:t>
       </w:r>
     </w:p>
     <w:p>
@@ -24314,7 +24650,7 @@
         <w:color w:val="66727C"/>
         <w:sz w:val="18"/>
       </w:rPr>
-      <w:t xml:space="preserve">  |  0.14.0.dev0</w:t>
+      <w:t xml:space="preserve">  |  0.15.0.dev0</w:t>
     </w:r>
   </w:p>
 </w:hdr>

</xml_diff>

<commit_message>
Implement Stage 12 PoetryID module
</commit_message>
<xml_diff>
--- a/docs/VerseVAD_User_Manual.docx
+++ b/docs/VerseVAD_User_Manual.docx
@@ -47,7 +47,7 @@
           <w:color w:val="66727C"/>
           <w:sz w:val="21"/>
         </w:rPr>
-        <w:t xml:space="preserve"> 0.15.0.dev0</w:t>
+        <w:t xml:space="preserve"> 0.16.0.dev0</w:t>
       </w:r>
       <w:r>
         <w:rPr>
@@ -159,7 +159,7 @@
                 <w:color w:val="193247"/>
                 <w:sz w:val="22"/>
               </w:rPr>
-              <w:t>, optional dictionary-based pronunciation evidence, transparent candidate-meter comparisons, phonological patterns, and lexical-style counts. Concreteness, corpus-relative frequency, retrospective Age of Acquisition, pronunciation/lexical stress, meter fit, rhyme/sound evidence, lexical diversity, word length, and structural word counts remain separate constructs. VerseVAD does not determine the emotion of a poem, speaker, author, or reader, diagnose cognition, establish definitive meter or performed rhythm, or replace contextual close reading.</w:t>
+              <w:t>, optional dictionary-based pronunciation evidence, transparent candidate-meter comparisons, phonological patterns, lexical-style counts, and PoetryID candidate lexical-affective neighborhoods. Concreteness, corpus-relative frequency, retrospective Age of Acquisition, pronunciation/lexical stress, meter fit, rhyme/sound evidence, lexical diversity, word length, structural word counts, and PoetryID remain separately documented constructs. VerseVAD does not determine the emotion of a poem, speaker, author, or reader, diagnose cognition, establish definitive meter or performed rhythm, or replace contextual close reading.</w:t>
             </w:r>
           </w:p>
         </w:tc>
@@ -638,6 +638,23 @@
                 <w:color w:val="193247"/>
                 <w:sz w:val="22"/>
               </w:rPr>
+              <w:t xml:space="preserve">, </w:t>
+            </w:r>
+            <w:r>
+              <w:rPr>
+                <w:rFonts w:ascii="Calibri" w:hAnsi="Calibri"/>
+                <w:b/>
+                <w:color w:val="193247"/>
+                <w:sz w:val="22"/>
+              </w:rPr>
+              <w:t>Lexical Style</w:t>
+            </w:r>
+            <w:r>
+              <w:rPr>
+                <w:rFonts w:ascii="Calibri" w:hAnsi="Calibri"/>
+                <w:color w:val="193247"/>
+                <w:sz w:val="22"/>
+              </w:rPr>
               <w:t xml:space="preserve">, and </w:t>
             </w:r>
             <w:r>
@@ -647,7 +664,7 @@
                 <w:color w:val="193247"/>
                 <w:sz w:val="22"/>
               </w:rPr>
-              <w:t>Lexical Style</w:t>
+              <w:t>PoetryID</w:t>
             </w:r>
             <w:r>
               <w:rPr>
@@ -8483,7 +8500,7 @@
           <w:rFonts w:ascii="Calibri" w:hAnsi="Calibri"/>
           <w:sz w:val="22"/>
         </w:rPr>
-        <w:t>Select one or more affective lexicons and/or enable the optional normative lexical concreteness, SUBTLEX-US frequency, Kuperman Age of Acquisition, CMUdict pronunciation/prosody-foundation, candidate-meter, rhyme/sound, or Lexical Style modules. VAD, categorical association, intensity, concreteness, corpus-relative frequency, retrospective lexical AoA, dictionary pronunciation/lexical stress, configured meter fit, rhyme/sound evidence, and lexical diversity/word counts answer different questions and remain separate. Any optional module can run by itself; selecting meter or rhyme automatically runs its pronunciation dependency.</w:t>
+        <w:t>Select one or more affective lexicons and/or enable the optional normative lexical concreteness, SUBTLEX-US frequency, Kuperman Age of Acquisition, CMUdict pronunciation/prosody-foundation, candidate-meter, rhyme/sound, Lexical Style, or PoetryID modules. VAD, categorical association, intensity, concreteness, corpus-relative frequency, retrospective lexical AoA, dictionary pronunciation/lexical stress, configured meter fit, rhyme/sound evidence, lexical diversity/word counts, and PoetryID candidate profiles answer different questions and remain separate. PoetryID requires an enabled VAD source and reuses its completed result; selecting meter or rhyme automatically runs its pronunciation dependency.</w:t>
       </w:r>
     </w:p>
     <w:p>
@@ -8496,7 +8513,7 @@
           <w:rFonts w:ascii="Calibri" w:hAnsi="Calibri"/>
           <w:sz w:val="22"/>
         </w:rPr>
-        <w:t xml:space="preserve">The same seven optional modules are also available in </w:t>
+        <w:t xml:space="preserve">The same eight optional modules are also available in </w:t>
       </w:r>
       <w:r>
         <w:rPr>
@@ -8983,22 +9000,7 @@
           <w:rFonts w:ascii="Calibri" w:hAnsi="Calibri"/>
           <w:sz w:val="22"/>
         </w:rPr>
-        <w:t xml:space="preserve">poem-specific </w:t>
-      </w:r>
-      <w:r>
-        <w:rPr>
-          <w:rFonts w:ascii="Consolas" w:hAnsi="Consolas"/>
-          <w:color w:val="1F4D78"/>
-          <w:sz w:val="19"/>
-        </w:rPr>
-        <w:t>word = ARPAbet phones | note</w:t>
-      </w:r>
-      <w:r>
-        <w:rPr>
-          <w:rFonts w:ascii="Calibri" w:hAnsi="Calibri"/>
-          <w:sz w:val="22"/>
-        </w:rPr>
-        <w:t xml:space="preserve"> pronunciation overrides;</w:t>
+        <w:t>PoetryID VAD sources, token/type weightings, and analysis views;</w:t>
       </w:r>
     </w:p>
     <w:p>
@@ -9016,7 +9018,7 @@
           <w:rFonts w:ascii="Calibri" w:hAnsi="Calibri"/>
           <w:sz w:val="22"/>
         </w:rPr>
-        <w:t>the pronunciation resolved-token coverage caution threshold;</w:t>
+        <w:t>default or custom-fixed PoetryID VAD thresholds;</w:t>
       </w:r>
     </w:p>
     <w:p>
@@ -9034,7 +9036,7 @@
           <w:rFonts w:ascii="Calibri" w:hAnsi="Calibri"/>
           <w:sz w:val="22"/>
         </w:rPr>
-        <w:t>minimum complete pronunciation lines; and</w:t>
+        <w:t>PoetryID minimum VAD observations and token/type coverage; and</w:t>
       </w:r>
     </w:p>
     <w:p>
@@ -9052,7 +9054,7 @@
           <w:rFonts w:ascii="Calibri" w:hAnsi="Calibri"/>
           <w:sz w:val="22"/>
         </w:rPr>
-        <w:t>minimum resolved pronunciation tokens for sparse-result warnings;</w:t>
+        <w:t>optional secondary PoetryID concreteness, frequency, and AoA character;</w:t>
       </w:r>
     </w:p>
     <w:p>
@@ -9070,7 +9072,22 @@
           <w:rFonts w:ascii="Calibri" w:hAnsi="Calibri"/>
           <w:sz w:val="22"/>
         </w:rPr>
-        <w:t>the meter line-fit threshold;</w:t>
+        <w:t xml:space="preserve">poem-specific </w:t>
+      </w:r>
+      <w:r>
+        <w:rPr>
+          <w:rFonts w:ascii="Consolas" w:hAnsi="Consolas"/>
+          <w:color w:val="1F4D78"/>
+          <w:sz w:val="19"/>
+        </w:rPr>
+        <w:t>word = ARPAbet phones | note</w:t>
+      </w:r>
+      <w:r>
+        <w:rPr>
+          <w:rFonts w:ascii="Calibri" w:hAnsi="Calibri"/>
+          <w:sz w:val="22"/>
+        </w:rPr>
+        <w:t xml:space="preserve"> pronunciation overrides;</w:t>
       </w:r>
     </w:p>
     <w:p>
@@ -9088,7 +9105,7 @@
           <w:rFonts w:ascii="Calibri" w:hAnsi="Calibri"/>
           <w:sz w:val="22"/>
         </w:rPr>
-        <w:t>the poem candidate-fit threshold;</w:t>
+        <w:t>the pronunciation resolved-token coverage caution threshold;</w:t>
       </w:r>
     </w:p>
     <w:p>
@@ -9106,7 +9123,7 @@
           <w:rFonts w:ascii="Calibri" w:hAnsi="Calibri"/>
           <w:sz w:val="22"/>
         </w:rPr>
-        <w:t>the candidate-margin threshold; and</w:t>
+        <w:t>minimum complete pronunciation lines; and</w:t>
       </w:r>
     </w:p>
     <w:p>
@@ -9124,138 +9141,7 @@
           <w:rFonts w:ascii="Calibri" w:hAnsi="Calibri"/>
           <w:sz w:val="22"/>
         </w:rPr>
-        <w:t>the maximum retained stress paths evaluated per line.</w:t>
-      </w:r>
-    </w:p>
-    <w:p>
-      <w:pPr>
-        <w:widowControl/>
-        <w:spacing w:before="0" w:after="120" w:line="300" w:lineRule="auto"/>
-      </w:pPr>
-      <w:r>
-        <w:rPr>
-          <w:rFonts w:ascii="Calibri" w:hAnsi="Calibri"/>
-          <w:sz w:val="22"/>
-        </w:rPr>
-        <w:t xml:space="preserve">Under </w:t>
-      </w:r>
-      <w:r>
-        <w:rPr>
-          <w:rFonts w:ascii="Calibri" w:hAnsi="Calibri"/>
-          <w:b/>
-          <w:sz w:val="22"/>
-        </w:rPr>
-        <w:t>Stopword settings</w:t>
-      </w:r>
-      <w:r>
-        <w:rPr>
-          <w:rFonts w:ascii="Calibri" w:hAnsi="Calibri"/>
-          <w:sz w:val="22"/>
-        </w:rPr>
-        <w:t>, inspect or change the secondary-view policy. The all-matched result is always preserved even when only one view is displayed.</w:t>
-      </w:r>
-    </w:p>
-    <w:p>
-      <w:pPr>
-        <w:pStyle w:val="Heading2"/>
-      </w:pPr>
-      <w:r>
-        <w:rPr>
-          <w:rFonts w:ascii="Calibri" w:hAnsi="Calibri"/>
-          <w:sz w:val="22"/>
-        </w:rPr>
-        <w:t>Overview tab</w:t>
-      </w:r>
-    </w:p>
-    <w:p>
-      <w:pPr>
-        <w:widowControl/>
-        <w:spacing w:before="0" w:after="120" w:line="300" w:lineRule="auto"/>
-      </w:pPr>
-      <w:r>
-        <w:rPr>
-          <w:rFonts w:ascii="Calibri" w:hAnsi="Calibri"/>
-          <w:sz w:val="22"/>
-        </w:rPr>
-        <w:t>Read coverage before means. The tab shows ordinary and content-focused coverage, matched counts, active methodology, excluded stopword counts, interpretive framing, and warnings.</w:t>
-      </w:r>
-    </w:p>
-    <w:p>
-      <w:pPr>
-        <w:pStyle w:val="Heading2"/>
-      </w:pPr>
-      <w:r>
-        <w:rPr>
-          <w:rFonts w:ascii="Calibri" w:hAnsi="Calibri"/>
-          <w:sz w:val="22"/>
-        </w:rPr>
-        <w:t>Language Profile tab</w:t>
-      </w:r>
-    </w:p>
-    <w:p>
-      <w:pPr>
-        <w:widowControl/>
-        <w:spacing w:before="0" w:after="120" w:line="300" w:lineRule="auto"/>
-      </w:pPr>
-      <w:r>
-        <w:rPr>
-          <w:rFonts w:ascii="Calibri" w:hAnsi="Calibri"/>
-          <w:sz w:val="22"/>
-        </w:rPr>
-        <w:t xml:space="preserve">The </w:t>
-      </w:r>
-      <w:r>
-        <w:rPr>
-          <w:rFonts w:ascii="Calibri" w:hAnsi="Calibri"/>
-          <w:b/>
-          <w:sz w:val="22"/>
-        </w:rPr>
-        <w:t>Shared Processing Record</w:t>
-      </w:r>
-      <w:r>
-        <w:rPr>
-          <w:rFonts w:ascii="Calibri" w:hAnsi="Calibri"/>
-          <w:sz w:val="22"/>
-        </w:rPr>
-        <w:t xml:space="preserve"> first reports stanzas, physical lines, model sentences, total and lexical tokens, recipe/configuration IDs, model pipeline, dependency coverage, named-entity status, and processing cautions. It is the common local representation used by every selected lexicon.</w:t>
-      </w:r>
-    </w:p>
-    <w:p>
-      <w:pPr>
-        <w:widowControl/>
-        <w:spacing w:before="0" w:after="120" w:line="300" w:lineRule="auto"/>
-      </w:pPr>
-      <w:r>
-        <w:rPr>
-          <w:rFonts w:ascii="Calibri" w:hAnsi="Calibri"/>
-          <w:sz w:val="22"/>
-        </w:rPr>
-        <w:t>The tab then reports part-of-speech counts and relative shares for all eligible lexical tokens, independently of lexicon coverage. It also shows unique normalized types and example forms. The denominator is displayed, and a caution explains that the labels are model-generated.</w:t>
-      </w:r>
-    </w:p>
-    <w:p>
-      <w:pPr>
-        <w:pStyle w:val="Heading2"/>
-      </w:pPr>
-      <w:r>
-        <w:rPr>
-          <w:rFonts w:ascii="Calibri" w:hAnsi="Calibri"/>
-          <w:sz w:val="22"/>
-        </w:rPr>
-        <w:t>VAD Profile tab</w:t>
-      </w:r>
-    </w:p>
-    <w:p>
-      <w:pPr>
-        <w:widowControl/>
-        <w:spacing w:before="0" w:after="120" w:line="300" w:lineRule="auto"/>
-      </w:pPr>
-      <w:r>
-        <w:rPr>
-          <w:rFonts w:ascii="Calibri" w:hAnsi="Calibri"/>
-          <w:sz w:val="22"/>
-        </w:rPr>
-        <w:t>This tab contains:</w:t>
+        <w:t>minimum resolved pronunciation tokens for sparse-result warnings;</w:t>
       </w:r>
     </w:p>
     <w:p>
@@ -9273,7 +9159,7 @@
           <w:rFonts w:ascii="Calibri" w:hAnsi="Calibri"/>
           <w:sz w:val="22"/>
         </w:rPr>
-        <w:t>parallel normalized VAD charts;</w:t>
+        <w:t>the meter line-fit threshold;</w:t>
       </w:r>
     </w:p>
     <w:p>
@@ -9291,7 +9177,7 @@
           <w:rFonts w:ascii="Calibri" w:hAnsi="Calibri"/>
           <w:sz w:val="22"/>
         </w:rPr>
-        <w:t>definitions of valence, arousal, and dominance;</w:t>
+        <w:t>the poem candidate-fit threshold;</w:t>
       </w:r>
     </w:p>
     <w:p>
@@ -9309,7 +9195,7 @@
           <w:rFonts w:ascii="Calibri" w:hAnsi="Calibri"/>
           <w:sz w:val="22"/>
         </w:rPr>
-        <w:t>token- and type-weighted values for each analysis view;</w:t>
+        <w:t>the candidate-margin threshold; and</w:t>
       </w:r>
     </w:p>
     <w:p>
@@ -9327,7 +9213,138 @@
           <w:rFonts w:ascii="Calibri" w:hAnsi="Calibri"/>
           <w:sz w:val="22"/>
         </w:rPr>
-        <w:t>plain-language midpoint interpretations;</w:t>
+        <w:t>the maximum retained stress paths evaluated per line.</w:t>
+      </w:r>
+    </w:p>
+    <w:p>
+      <w:pPr>
+        <w:widowControl/>
+        <w:spacing w:before="0" w:after="120" w:line="300" w:lineRule="auto"/>
+      </w:pPr>
+      <w:r>
+        <w:rPr>
+          <w:rFonts w:ascii="Calibri" w:hAnsi="Calibri"/>
+          <w:sz w:val="22"/>
+        </w:rPr>
+        <w:t xml:space="preserve">Under </w:t>
+      </w:r>
+      <w:r>
+        <w:rPr>
+          <w:rFonts w:ascii="Calibri" w:hAnsi="Calibri"/>
+          <w:b/>
+          <w:sz w:val="22"/>
+        </w:rPr>
+        <w:t>Stopword settings</w:t>
+      </w:r>
+      <w:r>
+        <w:rPr>
+          <w:rFonts w:ascii="Calibri" w:hAnsi="Calibri"/>
+          <w:sz w:val="22"/>
+        </w:rPr>
+        <w:t>, inspect or change the secondary-view policy. The all-matched result is always preserved even when only one view is displayed.</w:t>
+      </w:r>
+    </w:p>
+    <w:p>
+      <w:pPr>
+        <w:pStyle w:val="Heading2"/>
+      </w:pPr>
+      <w:r>
+        <w:rPr>
+          <w:rFonts w:ascii="Calibri" w:hAnsi="Calibri"/>
+          <w:sz w:val="22"/>
+        </w:rPr>
+        <w:t>Overview tab</w:t>
+      </w:r>
+    </w:p>
+    <w:p>
+      <w:pPr>
+        <w:widowControl/>
+        <w:spacing w:before="0" w:after="120" w:line="300" w:lineRule="auto"/>
+      </w:pPr>
+      <w:r>
+        <w:rPr>
+          <w:rFonts w:ascii="Calibri" w:hAnsi="Calibri"/>
+          <w:sz w:val="22"/>
+        </w:rPr>
+        <w:t>Read coverage before means. The tab shows ordinary and content-focused coverage, matched counts, active methodology, excluded stopword counts, interpretive framing, and warnings.</w:t>
+      </w:r>
+    </w:p>
+    <w:p>
+      <w:pPr>
+        <w:pStyle w:val="Heading2"/>
+      </w:pPr>
+      <w:r>
+        <w:rPr>
+          <w:rFonts w:ascii="Calibri" w:hAnsi="Calibri"/>
+          <w:sz w:val="22"/>
+        </w:rPr>
+        <w:t>Language Profile tab</w:t>
+      </w:r>
+    </w:p>
+    <w:p>
+      <w:pPr>
+        <w:widowControl/>
+        <w:spacing w:before="0" w:after="120" w:line="300" w:lineRule="auto"/>
+      </w:pPr>
+      <w:r>
+        <w:rPr>
+          <w:rFonts w:ascii="Calibri" w:hAnsi="Calibri"/>
+          <w:sz w:val="22"/>
+        </w:rPr>
+        <w:t xml:space="preserve">The </w:t>
+      </w:r>
+      <w:r>
+        <w:rPr>
+          <w:rFonts w:ascii="Calibri" w:hAnsi="Calibri"/>
+          <w:b/>
+          <w:sz w:val="22"/>
+        </w:rPr>
+        <w:t>Shared Processing Record</w:t>
+      </w:r>
+      <w:r>
+        <w:rPr>
+          <w:rFonts w:ascii="Calibri" w:hAnsi="Calibri"/>
+          <w:sz w:val="22"/>
+        </w:rPr>
+        <w:t xml:space="preserve"> first reports stanzas, physical lines, model sentences, total and lexical tokens, recipe/configuration IDs, model pipeline, dependency coverage, named-entity status, and processing cautions. It is the common local representation used by every selected lexicon.</w:t>
+      </w:r>
+    </w:p>
+    <w:p>
+      <w:pPr>
+        <w:widowControl/>
+        <w:spacing w:before="0" w:after="120" w:line="300" w:lineRule="auto"/>
+      </w:pPr>
+      <w:r>
+        <w:rPr>
+          <w:rFonts w:ascii="Calibri" w:hAnsi="Calibri"/>
+          <w:sz w:val="22"/>
+        </w:rPr>
+        <w:t>The tab then reports part-of-speech counts and relative shares for all eligible lexical tokens, independently of lexicon coverage. It also shows unique normalized types and example forms. The denominator is displayed, and a caution explains that the labels are model-generated.</w:t>
+      </w:r>
+    </w:p>
+    <w:p>
+      <w:pPr>
+        <w:pStyle w:val="Heading2"/>
+      </w:pPr>
+      <w:r>
+        <w:rPr>
+          <w:rFonts w:ascii="Calibri" w:hAnsi="Calibri"/>
+          <w:sz w:val="22"/>
+        </w:rPr>
+        <w:t>VAD Profile tab</w:t>
+      </w:r>
+    </w:p>
+    <w:p>
+      <w:pPr>
+        <w:widowControl/>
+        <w:spacing w:before="0" w:after="120" w:line="300" w:lineRule="auto"/>
+      </w:pPr>
+      <w:r>
+        <w:rPr>
+          <w:rFonts w:ascii="Calibri" w:hAnsi="Calibri"/>
+          <w:sz w:val="22"/>
+        </w:rPr>
+        <w:t>This tab contains:</w:t>
       </w:r>
     </w:p>
     <w:p>
@@ -9345,7 +9362,7 @@
           <w:rFonts w:ascii="Calibri" w:hAnsi="Calibri"/>
           <w:sz w:val="22"/>
         </w:rPr>
-        <w:t>population dispersion;</w:t>
+        <w:t>parallel normalized VAD charts;</w:t>
       </w:r>
     </w:p>
     <w:p>
@@ -9363,7 +9380,7 @@
           <w:rFonts w:ascii="Calibri" w:hAnsi="Calibri"/>
           <w:sz w:val="22"/>
         </w:rPr>
-        <w:t>stopword-sensitivity differences;</w:t>
+        <w:t>definitions of valence, arousal, and dominance;</w:t>
       </w:r>
     </w:p>
     <w:p>
@@ -9381,7 +9398,7 @@
           <w:rFonts w:ascii="Calibri" w:hAnsi="Calibri"/>
           <w:sz w:val="22"/>
         </w:rPr>
-        <w:t>cumulative normalized totals;</w:t>
+        <w:t>token- and type-weighted values for each analysis view;</w:t>
       </w:r>
     </w:p>
     <w:p>
@@ -9399,7 +9416,7 @@
           <w:rFonts w:ascii="Calibri" w:hAnsi="Calibri"/>
           <w:sz w:val="22"/>
         </w:rPr>
-        <w:t>top midpoint-centered contributors;</w:t>
+        <w:t>plain-language midpoint interpretations;</w:t>
       </w:r>
     </w:p>
     <w:p>
@@ -9417,640 +9434,7 @@
           <w:rFonts w:ascii="Calibri" w:hAnsi="Calibri"/>
           <w:sz w:val="22"/>
         </w:rPr>
-        <w:t>original source scales and normalization formulas.</w:t>
-      </w:r>
-    </w:p>
-    <w:p>
-      <w:pPr>
-        <w:pStyle w:val="Heading2"/>
-      </w:pPr>
-      <w:r>
-        <w:rPr>
-          <w:rFonts w:ascii="Calibri" w:hAnsi="Calibri"/>
-          <w:sz w:val="22"/>
-        </w:rPr>
-        <w:t>Emotion Profile tab</w:t>
-      </w:r>
-    </w:p>
-    <w:p>
-      <w:pPr>
-        <w:widowControl/>
-        <w:spacing w:before="0" w:after="120" w:line="300" w:lineRule="auto"/>
-      </w:pPr>
-      <w:r>
-        <w:rPr>
-          <w:rFonts w:ascii="Calibri" w:hAnsi="Calibri"/>
-          <w:sz w:val="22"/>
-        </w:rPr>
-        <w:t>The eight emotion associations, positive/negative sentiment associations, and numeric emotion intensities appear in three separate sections. Do not compare their values as though they were alternate VAD scales.</w:t>
-      </w:r>
-    </w:p>
-    <w:p>
-      <w:pPr>
-        <w:pStyle w:val="Heading2"/>
-      </w:pPr>
-      <w:r>
-        <w:rPr>
-          <w:rFonts w:ascii="Calibri" w:hAnsi="Calibri"/>
-          <w:sz w:val="22"/>
-        </w:rPr>
-        <w:t>Concreteness Profile tab</w:t>
-      </w:r>
-    </w:p>
-    <w:p>
-      <w:pPr>
-        <w:widowControl/>
-        <w:spacing w:before="0" w:after="120" w:line="300" w:lineRule="auto"/>
-      </w:pPr>
-      <w:r>
-        <w:rPr>
-          <w:rFonts w:ascii="Calibri" w:hAnsi="Calibri"/>
-          <w:sz w:val="22"/>
-        </w:rPr>
-        <w:t>This tab appears as the dedicated home for the optional result. It shows overall 1-5 source-scale statistics, token/type coverage, configured bands, warnings, line and stanza patterns, model-assigned POS groups, represented term extremes, a token audit, and source/configuration provenance. Exact surface, exact phrase, lemma, documented fallback, unmatched, and ineligible rows stay distinct.</w:t>
-      </w:r>
-    </w:p>
-    <w:p>
-      <w:pPr>
-        <w:widowControl/>
-        <w:spacing w:before="0" w:after="120" w:line="300" w:lineRule="auto"/>
-      </w:pPr>
-      <w:r>
-        <w:rPr>
-          <w:rFonts w:ascii="Calibri" w:hAnsi="Calibri"/>
-          <w:sz w:val="22"/>
-        </w:rPr>
-        <w:t>The source workbook is read-only. If it is missing, changed, malformed, or unsupported, the checkbox is unavailable and VerseVAD presents a plain-language status instead of partially activating the module.</w:t>
-      </w:r>
-    </w:p>
-    <w:p>
-      <w:pPr>
-        <w:pStyle w:val="Heading2"/>
-      </w:pPr>
-      <w:r>
-        <w:rPr>
-          <w:rFonts w:ascii="Calibri" w:hAnsi="Calibri"/>
-          <w:sz w:val="22"/>
-        </w:rPr>
-        <w:t>Frequency &amp; Rarity tab</w:t>
-      </w:r>
-    </w:p>
-    <w:p>
-      <w:pPr>
-        <w:widowControl/>
-        <w:spacing w:before="0" w:after="120" w:line="300" w:lineRule="auto"/>
-      </w:pPr>
-      <w:r>
-        <w:rPr>
-          <w:rFonts w:ascii="Calibri" w:hAnsi="Calibri"/>
-          <w:sz w:val="22"/>
-        </w:rPr>
-        <w:t>This tab appears when the optional SUBTLEX-US module is enabled. It emphasizes the token-weighted median Zipf value and shows the mean, IQR, token/type coverage, configured bands, warnings, line and stanza patterns, model-assigned POS groups, lowest/highest represented terms, rare tail, complete token audit, and source/configuration provenance.</w:t>
-      </w:r>
-    </w:p>
-    <w:p>
-      <w:pPr>
-        <w:widowControl/>
-        <w:spacing w:before="0" w:after="120" w:line="300" w:lineRule="auto"/>
-      </w:pPr>
-      <w:r>
-        <w:rPr>
-          <w:rFonts w:ascii="Calibri" w:hAnsi="Calibri"/>
-          <w:sz w:val="22"/>
-        </w:rPr>
-        <w:t xml:space="preserve">The page identifies whether the default all-lexical-token scope or the non-default </w:t>
-      </w:r>
-      <w:r>
-        <w:rPr>
-          <w:rFonts w:ascii="Consolas" w:hAnsi="Consolas"/>
-          <w:color w:val="1F4D78"/>
-          <w:sz w:val="19"/>
-        </w:rPr>
-        <w:t>NOUN</w:t>
-      </w:r>
-      <w:r>
-        <w:rPr>
-          <w:rFonts w:ascii="Calibri" w:hAnsi="Calibri"/>
-          <w:sz w:val="22"/>
-        </w:rPr>
-        <w:t>/</w:t>
-      </w:r>
-      <w:r>
-        <w:rPr>
-          <w:rFonts w:ascii="Consolas" w:hAnsi="Consolas"/>
-          <w:color w:val="1F4D78"/>
-          <w:sz w:val="19"/>
-        </w:rPr>
-        <w:t>VERB</w:t>
-      </w:r>
-      <w:r>
-        <w:rPr>
-          <w:rFonts w:ascii="Calibri" w:hAnsi="Calibri"/>
-          <w:sz w:val="22"/>
-        </w:rPr>
-        <w:t>/</w:t>
-      </w:r>
-      <w:r>
-        <w:rPr>
-          <w:rFonts w:ascii="Consolas" w:hAnsi="Consolas"/>
-          <w:color w:val="1F4D78"/>
-          <w:sz w:val="19"/>
-        </w:rPr>
-        <w:t>ADJ</w:t>
-      </w:r>
-      <w:r>
-        <w:rPr>
-          <w:rFonts w:ascii="Calibri" w:hAnsi="Calibri"/>
-          <w:sz w:val="22"/>
-        </w:rPr>
-        <w:t>/</w:t>
-      </w:r>
-      <w:r>
-        <w:rPr>
-          <w:rFonts w:ascii="Consolas" w:hAnsi="Consolas"/>
-          <w:color w:val="1F4D78"/>
-          <w:sz w:val="19"/>
-        </w:rPr>
-        <w:t>ADV</w:t>
-      </w:r>
-      <w:r>
-        <w:rPr>
-          <w:rFonts w:ascii="Calibri" w:hAnsi="Calibri"/>
-          <w:sz w:val="22"/>
-        </w:rPr>
-        <w:t xml:space="preserve"> scope was used. Exact observed form, lemma, documented fallback, unmatched, and ineligible decisions stay distinct. The source workbook is read-only; a missing, changed, malformed, or unsupported source prevents activation.</w:t>
-      </w:r>
-    </w:p>
-    <w:p>
-      <w:pPr>
-        <w:pStyle w:val="Heading2"/>
-      </w:pPr>
-      <w:r>
-        <w:rPr>
-          <w:rFonts w:ascii="Calibri" w:hAnsi="Calibri"/>
-          <w:sz w:val="22"/>
-        </w:rPr>
-        <w:t>Age of Acquisition tab</w:t>
-      </w:r>
-    </w:p>
-    <w:p>
-      <w:pPr>
-        <w:widowControl/>
-        <w:spacing w:before="0" w:after="120" w:line="300" w:lineRule="auto"/>
-      </w:pPr>
-      <w:r>
-        <w:rPr>
-          <w:rFonts w:ascii="Calibri" w:hAnsi="Calibri"/>
-          <w:sz w:val="22"/>
-        </w:rPr>
-        <w:t>This tab appears when the optional Kuperman module is enabled. It shows source-age mean, median, dispersion, range, token/type coverage, configured early/middle/later bands, source-response evidence, warnings, line and stanza patterns, model-assigned POS groups, earliest/latest represented terms, complete token audit, and source/configuration provenance. When corresponding modules are enabled, it also shows descriptive type-level relationships with Frequency and Concreteness.</w:t>
-      </w:r>
-    </w:p>
-    <w:p>
-      <w:pPr>
-        <w:widowControl/>
-        <w:spacing w:before="0" w:after="120" w:line="300" w:lineRule="auto"/>
-      </w:pPr>
-      <w:r>
-        <w:rPr>
-          <w:rFonts w:ascii="Calibri" w:hAnsi="Calibri"/>
-          <w:sz w:val="22"/>
-        </w:rPr>
-        <w:t xml:space="preserve">The page identifies whether the default all-lexical-token scope or the non-default contextual </w:t>
-      </w:r>
-      <w:r>
-        <w:rPr>
-          <w:rFonts w:ascii="Consolas" w:hAnsi="Consolas"/>
-          <w:color w:val="1F4D78"/>
-          <w:sz w:val="19"/>
-        </w:rPr>
-        <w:t>NOUN</w:t>
-      </w:r>
-      <w:r>
-        <w:rPr>
-          <w:rFonts w:ascii="Calibri" w:hAnsi="Calibri"/>
-          <w:sz w:val="22"/>
-        </w:rPr>
-        <w:t>/</w:t>
-      </w:r>
-      <w:r>
-        <w:rPr>
-          <w:rFonts w:ascii="Consolas" w:hAnsi="Consolas"/>
-          <w:color w:val="1F4D78"/>
-          <w:sz w:val="19"/>
-        </w:rPr>
-        <w:t>VERB</w:t>
-      </w:r>
-      <w:r>
-        <w:rPr>
-          <w:rFonts w:ascii="Calibri" w:hAnsi="Calibri"/>
-          <w:sz w:val="22"/>
-        </w:rPr>
-        <w:t>/</w:t>
-      </w:r>
-      <w:r>
-        <w:rPr>
-          <w:rFonts w:ascii="Consolas" w:hAnsi="Consolas"/>
-          <w:color w:val="1F4D78"/>
-          <w:sz w:val="19"/>
-        </w:rPr>
-        <w:t>ADJ</w:t>
-      </w:r>
-      <w:r>
-        <w:rPr>
-          <w:rFonts w:ascii="Calibri" w:hAnsi="Calibri"/>
-          <w:sz w:val="22"/>
-        </w:rPr>
-        <w:t>/</w:t>
-      </w:r>
-      <w:r>
-        <w:rPr>
-          <w:rFonts w:ascii="Consolas" w:hAnsi="Consolas"/>
-          <w:color w:val="1F4D78"/>
-          <w:sz w:val="19"/>
-        </w:rPr>
-        <w:t>ADV</w:t>
-      </w:r>
-      <w:r>
-        <w:rPr>
-          <w:rFonts w:ascii="Calibri" w:hAnsi="Calibri"/>
-          <w:sz w:val="22"/>
-        </w:rPr>
-        <w:t xml:space="preserve"> scope was used. Exact observed form, lemma, documented fallback, source-unrated, unmatched, and ineligible decisions stay distinct. It always displays the required non-diagnostic caution. The source workbook is read-only; a missing, changed, malformed, or unsupported source prevents activation.</w:t>
-      </w:r>
-    </w:p>
-    <w:p>
-      <w:pPr>
-        <w:pStyle w:val="Heading2"/>
-      </w:pPr>
-      <w:r>
-        <w:rPr>
-          <w:rFonts w:ascii="Calibri" w:hAnsi="Calibri"/>
-          <w:sz w:val="22"/>
-        </w:rPr>
-        <w:t>Pronunciation &amp; Prosody tab</w:t>
-      </w:r>
-    </w:p>
-    <w:p>
-      <w:pPr>
-        <w:widowControl/>
-        <w:spacing w:before="0" w:after="120" w:line="300" w:lineRule="auto"/>
-      </w:pPr>
-      <w:r>
-        <w:rPr>
-          <w:rFonts w:ascii="Calibri" w:hAnsi="Calibri"/>
-          <w:sz w:val="22"/>
-        </w:rPr>
-        <w:t>This tab appears when the optional CMUdict module is enabled. It shows resolved-token coverage, syllables per resolved word, median syllables per complete line, lexical stress density, complete-line coverage, physical-line totals and stress sequences, words needing attention, every candidate pronunciation, scholar overrides, warnings, and three-file source provenance.</w:t>
-      </w:r>
-    </w:p>
-    <w:p>
-      <w:pPr>
-        <w:widowControl/>
-        <w:spacing w:before="0" w:after="120" w:line="300" w:lineRule="auto"/>
-      </w:pPr>
-      <w:r>
-        <w:rPr>
-          <w:rFonts w:ascii="Calibri" w:hAnsi="Calibri"/>
-          <w:sz w:val="22"/>
-        </w:rPr>
-        <w:t xml:space="preserve">Use </w:t>
-      </w:r>
-      <w:r>
-        <w:rPr>
-          <w:rFonts w:ascii="Calibri" w:hAnsi="Calibri"/>
-          <w:b/>
-          <w:sz w:val="22"/>
-        </w:rPr>
-        <w:t>Words needing attention</w:t>
-      </w:r>
-      <w:r>
-        <w:rPr>
-          <w:rFonts w:ascii="Calibri" w:hAnsi="Calibri"/>
-          <w:sz w:val="22"/>
-        </w:rPr>
-        <w:t xml:space="preserve"> to find out-of-dictionary and materially ambiguous forms. Add an override only when you can document the intended reading. Removing an override and analyzing again reverses it.</w:t>
-      </w:r>
-    </w:p>
-    <w:p>
-      <w:pPr>
-        <w:widowControl/>
-        <w:spacing w:before="0" w:after="120" w:line="300" w:lineRule="auto"/>
-      </w:pPr>
-      <w:r>
-        <w:rPr>
-          <w:rFonts w:ascii="Calibri" w:hAnsi="Calibri"/>
-          <w:sz w:val="22"/>
-        </w:rPr>
-        <w:t xml:space="preserve">The North American dictionary warning remains visible. </w:t>
-      </w:r>
-      <w:r>
-        <w:rPr>
-          <w:rFonts w:ascii="Consolas" w:hAnsi="Consolas"/>
-          <w:color w:val="1F4D78"/>
-          <w:sz w:val="19"/>
-        </w:rPr>
-        <w:t>0</w:t>
-      </w:r>
-      <w:r>
-        <w:rPr>
-          <w:rFonts w:ascii="Calibri" w:hAnsi="Calibri"/>
-          <w:sz w:val="22"/>
-        </w:rPr>
-        <w:t xml:space="preserve">, </w:t>
-      </w:r>
-      <w:r>
-        <w:rPr>
-          <w:rFonts w:ascii="Consolas" w:hAnsi="Consolas"/>
-          <w:color w:val="1F4D78"/>
-          <w:sz w:val="19"/>
-        </w:rPr>
-        <w:t>1</w:t>
-      </w:r>
-      <w:r>
-        <w:rPr>
-          <w:rFonts w:ascii="Calibri" w:hAnsi="Calibri"/>
-          <w:sz w:val="22"/>
-        </w:rPr>
-        <w:t xml:space="preserve">, and </w:t>
-      </w:r>
-      <w:r>
-        <w:rPr>
-          <w:rFonts w:ascii="Consolas" w:hAnsi="Consolas"/>
-          <w:color w:val="1F4D78"/>
-          <w:sz w:val="19"/>
-        </w:rPr>
-        <w:t>2</w:t>
-      </w:r>
-      <w:r>
-        <w:rPr>
-          <w:rFonts w:ascii="Calibri" w:hAnsi="Calibri"/>
-          <w:sz w:val="22"/>
-        </w:rPr>
-        <w:t xml:space="preserve"> are lexical-stress digits, not metrical beats. The Stage 5 tab does not report candidate meter or rhyme.</w:t>
-      </w:r>
-    </w:p>
-    <w:p>
-      <w:pPr>
-        <w:pStyle w:val="Heading2"/>
-      </w:pPr>
-      <w:r>
-        <w:rPr>
-          <w:rFonts w:ascii="Calibri" w:hAnsi="Calibri"/>
-          <w:sz w:val="22"/>
-        </w:rPr>
-        <w:t>Meter &amp; Rhythm tab</w:t>
-      </w:r>
-    </w:p>
-    <w:p>
-      <w:pPr>
-        <w:widowControl/>
-        <w:spacing w:before="0" w:after="120" w:line="300" w:lineRule="auto"/>
-      </w:pPr>
-      <w:r>
-        <w:rPr>
-          <w:rFonts w:ascii="Calibri" w:hAnsi="Calibri"/>
-          <w:sz w:val="22"/>
-        </w:rPr>
-        <w:t xml:space="preserve">This tab appears when </w:t>
-      </w:r>
-      <w:r>
-        <w:rPr>
-          <w:rFonts w:ascii="Calibri" w:hAnsi="Calibri"/>
-          <w:b/>
-          <w:sz w:val="22"/>
-        </w:rPr>
-        <w:t>Meter &amp; rhythmic regularity</w:t>
-      </w:r>
-      <w:r>
-        <w:rPr>
-          <w:rFonts w:ascii="Calibri" w:hAnsi="Calibri"/>
-          <w:sz w:val="22"/>
-        </w:rPr>
-        <w:t xml:space="preserve"> is enabled. It reports the nearest fixed template, fit, matching lines, coverage, alternative, candidate margin, rule-based confidence, rhythmic variation, physical-line evidence, all 40 fixed candidates, warnings, and configuration provenance.</w:t>
-      </w:r>
-    </w:p>
-    <w:p>
-      <w:pPr>
-        <w:widowControl/>
-        <w:spacing w:before="0" w:after="120" w:line="300" w:lineRule="auto"/>
-      </w:pPr>
-      <w:r>
-        <w:rPr>
-          <w:rFonts w:ascii="Calibri" w:hAnsi="Calibri"/>
-          <w:sz w:val="22"/>
-        </w:rPr>
-        <w:t>Do not mistake a metrically preferred stress path for a change to the Stage 5 pronunciation result.</w:t>
-      </w:r>
-    </w:p>
-    <w:p>
-      <w:pPr>
-        <w:pStyle w:val="Heading2"/>
-      </w:pPr>
-      <w:r>
-        <w:rPr>
-          <w:rFonts w:ascii="Calibri" w:hAnsi="Calibri"/>
-          <w:sz w:val="22"/>
-        </w:rPr>
-        <w:t>Rhyme &amp; Sound tab</w:t>
-      </w:r>
-    </w:p>
-    <w:p>
-      <w:pPr>
-        <w:widowControl/>
-        <w:spacing w:before="0" w:after="120" w:line="300" w:lineRule="auto"/>
-      </w:pPr>
-      <w:r>
-        <w:rPr>
-          <w:rFonts w:ascii="Calibri" w:hAnsi="Calibri"/>
-          <w:sz w:val="22"/>
-        </w:rPr>
-        <w:t xml:space="preserve">This tab appears when </w:t>
-      </w:r>
-      <w:r>
-        <w:rPr>
-          <w:rFonts w:ascii="Calibri" w:hAnsi="Calibri"/>
-          <w:b/>
-          <w:sz w:val="22"/>
-        </w:rPr>
-        <w:t>Rhyme &amp; phonological patterns</w:t>
-      </w:r>
-      <w:r>
-        <w:rPr>
-          <w:rFonts w:ascii="Calibri" w:hAnsi="Calibri"/>
-          <w:sz w:val="22"/>
-        </w:rPr>
-        <w:t xml:space="preserve"> is enabled. It reports the whole-poem and stanza exact-rhyme schemes with ending coverage, then separately shows perfect, identical, masculine, feminine, multisyllabic, graded slant, eye, internal-rhyme, refrain, alliteration, assonance, and consonance evidence.</w:t>
-      </w:r>
-    </w:p>
-    <w:p>
-      <w:pPr>
-        <w:widowControl/>
-        <w:spacing w:before="0" w:after="120" w:line="300" w:lineRule="auto"/>
-      </w:pPr>
-      <w:r>
-        <w:rPr>
-          <w:rFonts w:ascii="Calibri" w:hAnsi="Calibri"/>
-          <w:sz w:val="22"/>
-        </w:rPr>
-        <w:t>Read the physical-line table before interpreting a scheme. It preserves the end word, candidate phones and rhyme parts, resolution status, scheme labels, repeated sounds, densities, and reason. The within-stanza pair table preserves the rhyme types, five slant components, conservative and maximum scores, eye-rhyme evidence, and caution label.</w:t>
-      </w:r>
-    </w:p>
-    <w:p>
-      <w:pPr>
-        <w:widowControl/>
-        <w:spacing w:before="0" w:after="120" w:line="300" w:lineRule="auto"/>
-      </w:pPr>
-      <w:r>
-        <w:rPr>
-          <w:rFonts w:ascii="Calibri" w:hAnsi="Calibri"/>
-          <w:sz w:val="22"/>
-        </w:rPr>
-        <w:t xml:space="preserve">An unresolved line ending appears as </w:t>
-      </w:r>
-      <w:r>
-        <w:rPr>
-          <w:rFonts w:ascii="Consolas" w:hAnsi="Consolas"/>
-          <w:color w:val="1F4D78"/>
-          <w:sz w:val="19"/>
-        </w:rPr>
-        <w:t>?</w:t>
-      </w:r>
-      <w:r>
-        <w:rPr>
-          <w:rFonts w:ascii="Calibri" w:hAnsi="Calibri"/>
-          <w:sz w:val="22"/>
-        </w:rPr>
-        <w:t xml:space="preserve"> and reduces coverage. It receives no neutral value or fabricated rhyme label. Add a Stage 5 override only when you can document the intended pronunciation.</w:t>
-      </w:r>
-    </w:p>
-    <w:p>
-      <w:pPr>
-        <w:pStyle w:val="Heading2"/>
-      </w:pPr>
-      <w:r>
-        <w:rPr>
-          <w:rFonts w:ascii="Calibri" w:hAnsi="Calibri"/>
-          <w:sz w:val="22"/>
-        </w:rPr>
-        <w:t>Lexical Style tab</w:t>
-      </w:r>
-    </w:p>
-    <w:p>
-      <w:pPr>
-        <w:widowControl/>
-        <w:spacing w:before="0" w:after="120" w:line="300" w:lineRule="auto"/>
-      </w:pPr>
-      <w:r>
-        <w:rPr>
-          <w:rFonts w:ascii="Calibri" w:hAnsi="Calibri"/>
-          <w:sz w:val="22"/>
-        </w:rPr>
-        <w:t xml:space="preserve">This tab appears when </w:t>
-      </w:r>
-      <w:r>
-        <w:rPr>
-          <w:rFonts w:ascii="Calibri" w:hAnsi="Calibri"/>
-          <w:b/>
-          <w:sz w:val="22"/>
-        </w:rPr>
-        <w:t>Lexical diversity, word length &amp; structural word counts</w:t>
-      </w:r>
-      <w:r>
-        <w:rPr>
-          <w:rFonts w:ascii="Calibri" w:hAnsi="Calibri"/>
-          <w:sz w:val="22"/>
-        </w:rPr>
-        <w:t xml:space="preserve"> is enabled. It reports token/type totals, MATTR, HD-D, MTLD, alphabetic-character word-length statistics and distribution, and detailed word counts for each physical line and stanza.</w:t>
-      </w:r>
-    </w:p>
-    <w:p>
-      <w:pPr>
-        <w:widowControl/>
-        <w:spacing w:before="0" w:after="120" w:line="300" w:lineRule="auto"/>
-      </w:pPr>
-      <w:r>
-        <w:rPr>
-          <w:rFonts w:ascii="Calibri" w:hAnsi="Calibri"/>
-          <w:sz w:val="22"/>
-        </w:rPr>
-        <w:t>Read the displayed parameters and token policy before comparing results. Physical blank lines remain visible with word count zero. A missing MATTR or HD-D normally means the text is shorter than the configured window or sample; the module does not change the denominator silently.</w:t>
-      </w:r>
-    </w:p>
-    <w:p>
-      <w:pPr>
-        <w:widowControl/>
-        <w:spacing w:before="0" w:after="120" w:line="300" w:lineRule="auto"/>
-      </w:pPr>
-      <w:r>
-        <w:rPr>
-          <w:rFonts w:ascii="Calibri" w:hAnsi="Calibri"/>
-          <w:sz w:val="22"/>
-        </w:rPr>
-        <w:t>The line and stanza tables also show local surface-type counts, descriptive TTR, and mean/median alphabetic word length. These local TTR values are not length-resistant comparison statistics.</w:t>
-      </w:r>
-    </w:p>
-    <w:p>
-      <w:pPr>
-        <w:pStyle w:val="Heading2"/>
-      </w:pPr>
-      <w:r>
-        <w:rPr>
-          <w:rFonts w:ascii="Calibri" w:hAnsi="Calibri"/>
-          <w:sz w:val="22"/>
-        </w:rPr>
-        <w:t>Evidence tab</w:t>
-      </w:r>
-    </w:p>
-    <w:p>
-      <w:pPr>
-        <w:widowControl/>
-        <w:spacing w:before="0" w:after="120" w:line="300" w:lineRule="auto"/>
-      </w:pPr>
-      <w:r>
-        <w:rPr>
-          <w:rFonts w:ascii="Calibri" w:hAnsi="Calibri"/>
-          <w:sz w:val="22"/>
-        </w:rPr>
-        <w:t>Filter by lexicon, match status, or stopword status. The excluded-only control isolates matched observations omitted from the stopword-excluded view. Inspect normalized form, lemma, match method, matched entry, source values, and the exact stopword reason.</w:t>
-      </w:r>
-    </w:p>
-    <w:p>
-      <w:pPr>
-        <w:widowControl/>
-        <w:spacing w:before="0" w:after="120" w:line="300" w:lineRule="auto"/>
-      </w:pPr>
-      <w:r>
-        <w:rPr>
-          <w:rFonts w:ascii="Calibri" w:hAnsi="Calibri"/>
-          <w:sz w:val="22"/>
-        </w:rPr>
-        <w:t>The unmatched-vocabulary table supports quality control. It does not silently guess replacements.</w:t>
-      </w:r>
-    </w:p>
-    <w:p>
-      <w:pPr>
-        <w:pStyle w:val="Heading2"/>
-      </w:pPr>
-      <w:r>
-        <w:rPr>
-          <w:rFonts w:ascii="Calibri" w:hAnsi="Calibri"/>
-          <w:sz w:val="22"/>
-        </w:rPr>
-        <w:t>Downloads tab</w:t>
-      </w:r>
-    </w:p>
-    <w:p>
-      <w:pPr>
-        <w:widowControl/>
-        <w:spacing w:before="0" w:after="120" w:line="300" w:lineRule="auto"/>
-      </w:pPr>
-      <w:r>
-        <w:rPr>
-          <w:rFonts w:ascii="Calibri" w:hAnsi="Calibri"/>
-          <w:sz w:val="22"/>
-        </w:rPr>
-        <w:t>Download:</w:t>
+        <w:t>population dispersion;</w:t>
       </w:r>
     </w:p>
     <w:p>
@@ -10068,7 +9452,7 @@
           <w:rFonts w:ascii="Calibri" w:hAnsi="Calibri"/>
           <w:sz w:val="22"/>
         </w:rPr>
-        <w:t>a readable scholar summary CSV;</w:t>
+        <w:t>stopword-sensitivity differences;</w:t>
       </w:r>
     </w:p>
     <w:p>
@@ -10086,7 +9470,7 @@
           <w:rFonts w:ascii="Calibri" w:hAnsi="Calibri"/>
           <w:sz w:val="22"/>
         </w:rPr>
-        <w:t>the CSV reading guide;</w:t>
+        <w:t>cumulative normalized totals;</w:t>
       </w:r>
     </w:p>
     <w:p>
@@ -10104,6 +9488,964 @@
           <w:rFonts w:ascii="Calibri" w:hAnsi="Calibri"/>
           <w:sz w:val="22"/>
         </w:rPr>
+        <w:t>top midpoint-centered contributors;</w:t>
+      </w:r>
+    </w:p>
+    <w:p>
+      <w:pPr>
+        <w:widowControl/>
+        <w:numPr>
+          <w:ilvl w:val="0"/>
+          <w:numId w:val="10"/>
+        </w:numPr>
+        <w:spacing w:before="0" w:after="80" w:line="300" w:lineRule="auto"/>
+        <w:ind w:left="540" w:hanging="271"/>
+      </w:pPr>
+      <w:r>
+        <w:rPr>
+          <w:rFonts w:ascii="Calibri" w:hAnsi="Calibri"/>
+          <w:sz w:val="22"/>
+        </w:rPr>
+        <w:t>original source scales and normalization formulas.</w:t>
+      </w:r>
+    </w:p>
+    <w:p>
+      <w:pPr>
+        <w:pStyle w:val="Heading2"/>
+      </w:pPr>
+      <w:r>
+        <w:rPr>
+          <w:rFonts w:ascii="Calibri" w:hAnsi="Calibri"/>
+          <w:sz w:val="22"/>
+        </w:rPr>
+        <w:t>Emotion Profile tab</w:t>
+      </w:r>
+    </w:p>
+    <w:p>
+      <w:pPr>
+        <w:widowControl/>
+        <w:spacing w:before="0" w:after="120" w:line="300" w:lineRule="auto"/>
+      </w:pPr>
+      <w:r>
+        <w:rPr>
+          <w:rFonts w:ascii="Calibri" w:hAnsi="Calibri"/>
+          <w:sz w:val="22"/>
+        </w:rPr>
+        <w:t>The eight emotion associations, positive/negative sentiment associations, and numeric emotion intensities appear in three separate sections. Do not compare their values as though they were alternate VAD scales.</w:t>
+      </w:r>
+    </w:p>
+    <w:p>
+      <w:pPr>
+        <w:pStyle w:val="Heading2"/>
+      </w:pPr>
+      <w:r>
+        <w:rPr>
+          <w:rFonts w:ascii="Calibri" w:hAnsi="Calibri"/>
+          <w:sz w:val="22"/>
+        </w:rPr>
+        <w:t>Concreteness Profile tab</w:t>
+      </w:r>
+    </w:p>
+    <w:p>
+      <w:pPr>
+        <w:widowControl/>
+        <w:spacing w:before="0" w:after="120" w:line="300" w:lineRule="auto"/>
+      </w:pPr>
+      <w:r>
+        <w:rPr>
+          <w:rFonts w:ascii="Calibri" w:hAnsi="Calibri"/>
+          <w:sz w:val="22"/>
+        </w:rPr>
+        <w:t>This tab appears as the dedicated home for the optional result. It shows overall 1-5 source-scale statistics, token/type coverage, configured bands, warnings, line and stanza patterns, model-assigned POS groups, represented term extremes, a token audit, and source/configuration provenance. Exact surface, exact phrase, lemma, documented fallback, unmatched, and ineligible rows stay distinct.</w:t>
+      </w:r>
+    </w:p>
+    <w:p>
+      <w:pPr>
+        <w:widowControl/>
+        <w:spacing w:before="0" w:after="120" w:line="300" w:lineRule="auto"/>
+      </w:pPr>
+      <w:r>
+        <w:rPr>
+          <w:rFonts w:ascii="Calibri" w:hAnsi="Calibri"/>
+          <w:sz w:val="22"/>
+        </w:rPr>
+        <w:t>The source workbook is read-only. If it is missing, changed, malformed, or unsupported, the checkbox is unavailable and VerseVAD presents a plain-language status instead of partially activating the module.</w:t>
+      </w:r>
+    </w:p>
+    <w:p>
+      <w:pPr>
+        <w:pStyle w:val="Heading2"/>
+      </w:pPr>
+      <w:r>
+        <w:rPr>
+          <w:rFonts w:ascii="Calibri" w:hAnsi="Calibri"/>
+          <w:sz w:val="22"/>
+        </w:rPr>
+        <w:t>Frequency &amp; Rarity tab</w:t>
+      </w:r>
+    </w:p>
+    <w:p>
+      <w:pPr>
+        <w:widowControl/>
+        <w:spacing w:before="0" w:after="120" w:line="300" w:lineRule="auto"/>
+      </w:pPr>
+      <w:r>
+        <w:rPr>
+          <w:rFonts w:ascii="Calibri" w:hAnsi="Calibri"/>
+          <w:sz w:val="22"/>
+        </w:rPr>
+        <w:t>This tab appears when the optional SUBTLEX-US module is enabled. It emphasizes the token-weighted median Zipf value and shows the mean, IQR, token/type coverage, configured bands, warnings, line and stanza patterns, model-assigned POS groups, lowest/highest represented terms, rare tail, complete token audit, and source/configuration provenance.</w:t>
+      </w:r>
+    </w:p>
+    <w:p>
+      <w:pPr>
+        <w:widowControl/>
+        <w:spacing w:before="0" w:after="120" w:line="300" w:lineRule="auto"/>
+      </w:pPr>
+      <w:r>
+        <w:rPr>
+          <w:rFonts w:ascii="Calibri" w:hAnsi="Calibri"/>
+          <w:sz w:val="22"/>
+        </w:rPr>
+        <w:t xml:space="preserve">The page identifies whether the default all-lexical-token scope or the non-default </w:t>
+      </w:r>
+      <w:r>
+        <w:rPr>
+          <w:rFonts w:ascii="Consolas" w:hAnsi="Consolas"/>
+          <w:color w:val="1F4D78"/>
+          <w:sz w:val="19"/>
+        </w:rPr>
+        <w:t>NOUN</w:t>
+      </w:r>
+      <w:r>
+        <w:rPr>
+          <w:rFonts w:ascii="Calibri" w:hAnsi="Calibri"/>
+          <w:sz w:val="22"/>
+        </w:rPr>
+        <w:t>/</w:t>
+      </w:r>
+      <w:r>
+        <w:rPr>
+          <w:rFonts w:ascii="Consolas" w:hAnsi="Consolas"/>
+          <w:color w:val="1F4D78"/>
+          <w:sz w:val="19"/>
+        </w:rPr>
+        <w:t>VERB</w:t>
+      </w:r>
+      <w:r>
+        <w:rPr>
+          <w:rFonts w:ascii="Calibri" w:hAnsi="Calibri"/>
+          <w:sz w:val="22"/>
+        </w:rPr>
+        <w:t>/</w:t>
+      </w:r>
+      <w:r>
+        <w:rPr>
+          <w:rFonts w:ascii="Consolas" w:hAnsi="Consolas"/>
+          <w:color w:val="1F4D78"/>
+          <w:sz w:val="19"/>
+        </w:rPr>
+        <w:t>ADJ</w:t>
+      </w:r>
+      <w:r>
+        <w:rPr>
+          <w:rFonts w:ascii="Calibri" w:hAnsi="Calibri"/>
+          <w:sz w:val="22"/>
+        </w:rPr>
+        <w:t>/</w:t>
+      </w:r>
+      <w:r>
+        <w:rPr>
+          <w:rFonts w:ascii="Consolas" w:hAnsi="Consolas"/>
+          <w:color w:val="1F4D78"/>
+          <w:sz w:val="19"/>
+        </w:rPr>
+        <w:t>ADV</w:t>
+      </w:r>
+      <w:r>
+        <w:rPr>
+          <w:rFonts w:ascii="Calibri" w:hAnsi="Calibri"/>
+          <w:sz w:val="22"/>
+        </w:rPr>
+        <w:t xml:space="preserve"> scope was used. Exact observed form, lemma, documented fallback, unmatched, and ineligible decisions stay distinct. The source workbook is read-only; a missing, changed, malformed, or unsupported source prevents activation.</w:t>
+      </w:r>
+    </w:p>
+    <w:p>
+      <w:pPr>
+        <w:pStyle w:val="Heading2"/>
+      </w:pPr>
+      <w:r>
+        <w:rPr>
+          <w:rFonts w:ascii="Calibri" w:hAnsi="Calibri"/>
+          <w:sz w:val="22"/>
+        </w:rPr>
+        <w:t>Age of Acquisition tab</w:t>
+      </w:r>
+    </w:p>
+    <w:p>
+      <w:pPr>
+        <w:widowControl/>
+        <w:spacing w:before="0" w:after="120" w:line="300" w:lineRule="auto"/>
+      </w:pPr>
+      <w:r>
+        <w:rPr>
+          <w:rFonts w:ascii="Calibri" w:hAnsi="Calibri"/>
+          <w:sz w:val="22"/>
+        </w:rPr>
+        <w:t>This tab appears when the optional Kuperman module is enabled. It shows source-age mean, median, dispersion, range, token/type coverage, configured early/middle/later bands, source-response evidence, warnings, line and stanza patterns, model-assigned POS groups, earliest/latest represented terms, complete token audit, and source/configuration provenance. When corresponding modules are enabled, it also shows descriptive type-level relationships with Frequency and Concreteness.</w:t>
+      </w:r>
+    </w:p>
+    <w:p>
+      <w:pPr>
+        <w:widowControl/>
+        <w:spacing w:before="0" w:after="120" w:line="300" w:lineRule="auto"/>
+      </w:pPr>
+      <w:r>
+        <w:rPr>
+          <w:rFonts w:ascii="Calibri" w:hAnsi="Calibri"/>
+          <w:sz w:val="22"/>
+        </w:rPr>
+        <w:t xml:space="preserve">The page identifies whether the default all-lexical-token scope or the non-default contextual </w:t>
+      </w:r>
+      <w:r>
+        <w:rPr>
+          <w:rFonts w:ascii="Consolas" w:hAnsi="Consolas"/>
+          <w:color w:val="1F4D78"/>
+          <w:sz w:val="19"/>
+        </w:rPr>
+        <w:t>NOUN</w:t>
+      </w:r>
+      <w:r>
+        <w:rPr>
+          <w:rFonts w:ascii="Calibri" w:hAnsi="Calibri"/>
+          <w:sz w:val="22"/>
+        </w:rPr>
+        <w:t>/</w:t>
+      </w:r>
+      <w:r>
+        <w:rPr>
+          <w:rFonts w:ascii="Consolas" w:hAnsi="Consolas"/>
+          <w:color w:val="1F4D78"/>
+          <w:sz w:val="19"/>
+        </w:rPr>
+        <w:t>VERB</w:t>
+      </w:r>
+      <w:r>
+        <w:rPr>
+          <w:rFonts w:ascii="Calibri" w:hAnsi="Calibri"/>
+          <w:sz w:val="22"/>
+        </w:rPr>
+        <w:t>/</w:t>
+      </w:r>
+      <w:r>
+        <w:rPr>
+          <w:rFonts w:ascii="Consolas" w:hAnsi="Consolas"/>
+          <w:color w:val="1F4D78"/>
+          <w:sz w:val="19"/>
+        </w:rPr>
+        <w:t>ADJ</w:t>
+      </w:r>
+      <w:r>
+        <w:rPr>
+          <w:rFonts w:ascii="Calibri" w:hAnsi="Calibri"/>
+          <w:sz w:val="22"/>
+        </w:rPr>
+        <w:t>/</w:t>
+      </w:r>
+      <w:r>
+        <w:rPr>
+          <w:rFonts w:ascii="Consolas" w:hAnsi="Consolas"/>
+          <w:color w:val="1F4D78"/>
+          <w:sz w:val="19"/>
+        </w:rPr>
+        <w:t>ADV</w:t>
+      </w:r>
+      <w:r>
+        <w:rPr>
+          <w:rFonts w:ascii="Calibri" w:hAnsi="Calibri"/>
+          <w:sz w:val="22"/>
+        </w:rPr>
+        <w:t xml:space="preserve"> scope was used. Exact observed form, lemma, documented fallback, source-unrated, unmatched, and ineligible decisions stay distinct. It always displays the required non-diagnostic caution. The source workbook is read-only; a missing, changed, malformed, or unsupported source prevents activation.</w:t>
+      </w:r>
+    </w:p>
+    <w:p>
+      <w:pPr>
+        <w:pStyle w:val="Heading2"/>
+      </w:pPr>
+      <w:r>
+        <w:rPr>
+          <w:rFonts w:ascii="Calibri" w:hAnsi="Calibri"/>
+          <w:sz w:val="22"/>
+        </w:rPr>
+        <w:t>Pronunciation &amp; Prosody tab</w:t>
+      </w:r>
+    </w:p>
+    <w:p>
+      <w:pPr>
+        <w:widowControl/>
+        <w:spacing w:before="0" w:after="120" w:line="300" w:lineRule="auto"/>
+      </w:pPr>
+      <w:r>
+        <w:rPr>
+          <w:rFonts w:ascii="Calibri" w:hAnsi="Calibri"/>
+          <w:sz w:val="22"/>
+        </w:rPr>
+        <w:t>This tab appears when the optional CMUdict module is enabled. It shows resolved-token coverage, syllables per resolved word, median syllables per complete line, lexical stress density, complete-line coverage, physical-line totals and stress sequences, words needing attention, every candidate pronunciation, scholar overrides, warnings, and three-file source provenance.</w:t>
+      </w:r>
+    </w:p>
+    <w:p>
+      <w:pPr>
+        <w:widowControl/>
+        <w:spacing w:before="0" w:after="120" w:line="300" w:lineRule="auto"/>
+      </w:pPr>
+      <w:r>
+        <w:rPr>
+          <w:rFonts w:ascii="Calibri" w:hAnsi="Calibri"/>
+          <w:sz w:val="22"/>
+        </w:rPr>
+        <w:t xml:space="preserve">Use </w:t>
+      </w:r>
+      <w:r>
+        <w:rPr>
+          <w:rFonts w:ascii="Calibri" w:hAnsi="Calibri"/>
+          <w:b/>
+          <w:sz w:val="22"/>
+        </w:rPr>
+        <w:t>Words needing attention</w:t>
+      </w:r>
+      <w:r>
+        <w:rPr>
+          <w:rFonts w:ascii="Calibri" w:hAnsi="Calibri"/>
+          <w:sz w:val="22"/>
+        </w:rPr>
+        <w:t xml:space="preserve"> to find out-of-dictionary and materially ambiguous forms. Add an override only when you can document the intended reading. Removing an override and analyzing again reverses it.</w:t>
+      </w:r>
+    </w:p>
+    <w:p>
+      <w:pPr>
+        <w:widowControl/>
+        <w:spacing w:before="0" w:after="120" w:line="300" w:lineRule="auto"/>
+      </w:pPr>
+      <w:r>
+        <w:rPr>
+          <w:rFonts w:ascii="Calibri" w:hAnsi="Calibri"/>
+          <w:sz w:val="22"/>
+        </w:rPr>
+        <w:t xml:space="preserve">The North American dictionary warning remains visible. </w:t>
+      </w:r>
+      <w:r>
+        <w:rPr>
+          <w:rFonts w:ascii="Consolas" w:hAnsi="Consolas"/>
+          <w:color w:val="1F4D78"/>
+          <w:sz w:val="19"/>
+        </w:rPr>
+        <w:t>0</w:t>
+      </w:r>
+      <w:r>
+        <w:rPr>
+          <w:rFonts w:ascii="Calibri" w:hAnsi="Calibri"/>
+          <w:sz w:val="22"/>
+        </w:rPr>
+        <w:t xml:space="preserve">, </w:t>
+      </w:r>
+      <w:r>
+        <w:rPr>
+          <w:rFonts w:ascii="Consolas" w:hAnsi="Consolas"/>
+          <w:color w:val="1F4D78"/>
+          <w:sz w:val="19"/>
+        </w:rPr>
+        <w:t>1</w:t>
+      </w:r>
+      <w:r>
+        <w:rPr>
+          <w:rFonts w:ascii="Calibri" w:hAnsi="Calibri"/>
+          <w:sz w:val="22"/>
+        </w:rPr>
+        <w:t xml:space="preserve">, and </w:t>
+      </w:r>
+      <w:r>
+        <w:rPr>
+          <w:rFonts w:ascii="Consolas" w:hAnsi="Consolas"/>
+          <w:color w:val="1F4D78"/>
+          <w:sz w:val="19"/>
+        </w:rPr>
+        <w:t>2</w:t>
+      </w:r>
+      <w:r>
+        <w:rPr>
+          <w:rFonts w:ascii="Calibri" w:hAnsi="Calibri"/>
+          <w:sz w:val="22"/>
+        </w:rPr>
+        <w:t xml:space="preserve"> are lexical-stress digits, not metrical beats. The Stage 5 tab does not report candidate meter or rhyme.</w:t>
+      </w:r>
+    </w:p>
+    <w:p>
+      <w:pPr>
+        <w:pStyle w:val="Heading2"/>
+      </w:pPr>
+      <w:r>
+        <w:rPr>
+          <w:rFonts w:ascii="Calibri" w:hAnsi="Calibri"/>
+          <w:sz w:val="22"/>
+        </w:rPr>
+        <w:t>Meter &amp; Rhythm tab</w:t>
+      </w:r>
+    </w:p>
+    <w:p>
+      <w:pPr>
+        <w:widowControl/>
+        <w:spacing w:before="0" w:after="120" w:line="300" w:lineRule="auto"/>
+      </w:pPr>
+      <w:r>
+        <w:rPr>
+          <w:rFonts w:ascii="Calibri" w:hAnsi="Calibri"/>
+          <w:sz w:val="22"/>
+        </w:rPr>
+        <w:t xml:space="preserve">This tab appears when </w:t>
+      </w:r>
+      <w:r>
+        <w:rPr>
+          <w:rFonts w:ascii="Calibri" w:hAnsi="Calibri"/>
+          <w:b/>
+          <w:sz w:val="22"/>
+        </w:rPr>
+        <w:t>Meter &amp; rhythmic regularity</w:t>
+      </w:r>
+      <w:r>
+        <w:rPr>
+          <w:rFonts w:ascii="Calibri" w:hAnsi="Calibri"/>
+          <w:sz w:val="22"/>
+        </w:rPr>
+        <w:t xml:space="preserve"> is enabled. It reports the nearest fixed template, fit, matching lines, coverage, alternative, candidate margin, rule-based confidence, rhythmic variation, physical-line evidence, all 40 fixed candidates, warnings, and configuration provenance.</w:t>
+      </w:r>
+    </w:p>
+    <w:p>
+      <w:pPr>
+        <w:widowControl/>
+        <w:spacing w:before="0" w:after="120" w:line="300" w:lineRule="auto"/>
+      </w:pPr>
+      <w:r>
+        <w:rPr>
+          <w:rFonts w:ascii="Calibri" w:hAnsi="Calibri"/>
+          <w:sz w:val="22"/>
+        </w:rPr>
+        <w:t>Do not mistake a metrically preferred stress path for a change to the Stage 5 pronunciation result.</w:t>
+      </w:r>
+    </w:p>
+    <w:p>
+      <w:pPr>
+        <w:pStyle w:val="Heading2"/>
+      </w:pPr>
+      <w:r>
+        <w:rPr>
+          <w:rFonts w:ascii="Calibri" w:hAnsi="Calibri"/>
+          <w:sz w:val="22"/>
+        </w:rPr>
+        <w:t>Rhyme &amp; Sound tab</w:t>
+      </w:r>
+    </w:p>
+    <w:p>
+      <w:pPr>
+        <w:widowControl/>
+        <w:spacing w:before="0" w:after="120" w:line="300" w:lineRule="auto"/>
+      </w:pPr>
+      <w:r>
+        <w:rPr>
+          <w:rFonts w:ascii="Calibri" w:hAnsi="Calibri"/>
+          <w:sz w:val="22"/>
+        </w:rPr>
+        <w:t xml:space="preserve">This tab appears when </w:t>
+      </w:r>
+      <w:r>
+        <w:rPr>
+          <w:rFonts w:ascii="Calibri" w:hAnsi="Calibri"/>
+          <w:b/>
+          <w:sz w:val="22"/>
+        </w:rPr>
+        <w:t>Rhyme &amp; phonological patterns</w:t>
+      </w:r>
+      <w:r>
+        <w:rPr>
+          <w:rFonts w:ascii="Calibri" w:hAnsi="Calibri"/>
+          <w:sz w:val="22"/>
+        </w:rPr>
+        <w:t xml:space="preserve"> is enabled. It reports the whole-poem and stanza exact-rhyme schemes with ending coverage, then separately shows perfect, identical, masculine, feminine, multisyllabic, graded slant, eye, internal-rhyme, refrain, alliteration, assonance, and consonance evidence.</w:t>
+      </w:r>
+    </w:p>
+    <w:p>
+      <w:pPr>
+        <w:widowControl/>
+        <w:spacing w:before="0" w:after="120" w:line="300" w:lineRule="auto"/>
+      </w:pPr>
+      <w:r>
+        <w:rPr>
+          <w:rFonts w:ascii="Calibri" w:hAnsi="Calibri"/>
+          <w:sz w:val="22"/>
+        </w:rPr>
+        <w:t>Read the physical-line table before interpreting a scheme. It preserves the end word, candidate phones and rhyme parts, resolution status, scheme labels, repeated sounds, densities, and reason. The within-stanza pair table preserves the rhyme types, five slant components, conservative and maximum scores, eye-rhyme evidence, and caution label.</w:t>
+      </w:r>
+    </w:p>
+    <w:p>
+      <w:pPr>
+        <w:widowControl/>
+        <w:spacing w:before="0" w:after="120" w:line="300" w:lineRule="auto"/>
+      </w:pPr>
+      <w:r>
+        <w:rPr>
+          <w:rFonts w:ascii="Calibri" w:hAnsi="Calibri"/>
+          <w:sz w:val="22"/>
+        </w:rPr>
+        <w:t xml:space="preserve">An unresolved line ending appears as </w:t>
+      </w:r>
+      <w:r>
+        <w:rPr>
+          <w:rFonts w:ascii="Consolas" w:hAnsi="Consolas"/>
+          <w:color w:val="1F4D78"/>
+          <w:sz w:val="19"/>
+        </w:rPr>
+        <w:t>?</w:t>
+      </w:r>
+      <w:r>
+        <w:rPr>
+          <w:rFonts w:ascii="Calibri" w:hAnsi="Calibri"/>
+          <w:sz w:val="22"/>
+        </w:rPr>
+        <w:t xml:space="preserve"> and reduces coverage. It receives no neutral value or fabricated rhyme label. Add a Stage 5 override only when you can document the intended pronunciation.</w:t>
+      </w:r>
+    </w:p>
+    <w:p>
+      <w:pPr>
+        <w:pStyle w:val="Heading2"/>
+      </w:pPr>
+      <w:r>
+        <w:rPr>
+          <w:rFonts w:ascii="Calibri" w:hAnsi="Calibri"/>
+          <w:sz w:val="22"/>
+        </w:rPr>
+        <w:t>Lexical Style tab</w:t>
+      </w:r>
+    </w:p>
+    <w:p>
+      <w:pPr>
+        <w:widowControl/>
+        <w:spacing w:before="0" w:after="120" w:line="300" w:lineRule="auto"/>
+      </w:pPr>
+      <w:r>
+        <w:rPr>
+          <w:rFonts w:ascii="Calibri" w:hAnsi="Calibri"/>
+          <w:sz w:val="22"/>
+        </w:rPr>
+        <w:t xml:space="preserve">This tab appears when </w:t>
+      </w:r>
+      <w:r>
+        <w:rPr>
+          <w:rFonts w:ascii="Calibri" w:hAnsi="Calibri"/>
+          <w:b/>
+          <w:sz w:val="22"/>
+        </w:rPr>
+        <w:t>Lexical diversity, word length &amp; structural word counts</w:t>
+      </w:r>
+      <w:r>
+        <w:rPr>
+          <w:rFonts w:ascii="Calibri" w:hAnsi="Calibri"/>
+          <w:sz w:val="22"/>
+        </w:rPr>
+        <w:t xml:space="preserve"> is enabled. It reports token/type totals, MATTR, HD-D, MTLD, alphabetic-character word-length statistics and distribution, and detailed word counts for each physical line and stanza.</w:t>
+      </w:r>
+    </w:p>
+    <w:p>
+      <w:pPr>
+        <w:widowControl/>
+        <w:spacing w:before="0" w:after="120" w:line="300" w:lineRule="auto"/>
+      </w:pPr>
+      <w:r>
+        <w:rPr>
+          <w:rFonts w:ascii="Calibri" w:hAnsi="Calibri"/>
+          <w:sz w:val="22"/>
+        </w:rPr>
+        <w:t>Read the displayed parameters and token policy before comparing results. Physical blank lines remain visible with word count zero. A missing MATTR or HD-D normally means the text is shorter than the configured window or sample; the module does not change the denominator silently.</w:t>
+      </w:r>
+    </w:p>
+    <w:p>
+      <w:pPr>
+        <w:widowControl/>
+        <w:spacing w:before="0" w:after="120" w:line="300" w:lineRule="auto"/>
+      </w:pPr>
+      <w:r>
+        <w:rPr>
+          <w:rFonts w:ascii="Calibri" w:hAnsi="Calibri"/>
+          <w:sz w:val="22"/>
+        </w:rPr>
+        <w:t>The line and stanza tables also show local surface-type counts, descriptive TTR, and mean/median alphabetic word length. These local TTR values are not length-resistant comparison statistics.</w:t>
+      </w:r>
+    </w:p>
+    <w:p>
+      <w:pPr>
+        <w:pStyle w:val="Heading2"/>
+      </w:pPr>
+      <w:r>
+        <w:rPr>
+          <w:rFonts w:ascii="Calibri" w:hAnsi="Calibri"/>
+          <w:sz w:val="22"/>
+        </w:rPr>
+        <w:t>PoetryID tab</w:t>
+      </w:r>
+    </w:p>
+    <w:p>
+      <w:pPr>
+        <w:widowControl/>
+        <w:spacing w:before="0" w:after="120" w:line="300" w:lineRule="auto"/>
+      </w:pPr>
+      <w:r>
+        <w:rPr>
+          <w:rFonts w:ascii="Calibri" w:hAnsi="Calibri"/>
+          <w:sz w:val="22"/>
+        </w:rPr>
+        <w:t xml:space="preserve">This tab appears when </w:t>
+      </w:r>
+      <w:r>
+        <w:rPr>
+          <w:rFonts w:ascii="Calibri" w:hAnsi="Calibri"/>
+          <w:b/>
+          <w:sz w:val="22"/>
+        </w:rPr>
+        <w:t>PoetryID lexical-affective profile</w:t>
+      </w:r>
+      <w:r>
+        <w:rPr>
+          <w:rFonts w:ascii="Calibri" w:hAnsi="Calibri"/>
+          <w:sz w:val="22"/>
+        </w:rPr>
+        <w:t xml:space="preserve"> is enabled with at least one selected VAD source. PoetryID consumes the completed normalized VAD result; it does not tokenize, load a lexicon, match words, or calculate VAD again.</w:t>
+      </w:r>
+    </w:p>
+    <w:p>
+      <w:pPr>
+        <w:widowControl/>
+        <w:spacing w:before="0" w:after="120" w:line="300" w:lineRule="auto"/>
+      </w:pPr>
+      <w:r>
+        <w:rPr>
+          <w:rFonts w:ascii="Calibri" w:hAnsi="Calibri"/>
+          <w:sz w:val="22"/>
+        </w:rPr>
+        <w:t>Read one source/view/weighting combination at a time. The tab presents:</w:t>
+      </w:r>
+    </w:p>
+    <w:p>
+      <w:pPr>
+        <w:widowControl/>
+        <w:numPr>
+          <w:ilvl w:val="0"/>
+          <w:numId w:val="10"/>
+        </w:numPr>
+        <w:spacing w:before="0" w:after="80" w:line="300" w:lineRule="auto"/>
+        <w:ind w:left="540" w:hanging="271"/>
+      </w:pPr>
+      <w:r>
+        <w:rPr>
+          <w:rFonts w:ascii="Calibri" w:hAnsi="Calibri"/>
+          <w:sz w:val="22"/>
+        </w:rPr>
+        <w:t>continuous normalized valence, arousal, and dominance before any label;</w:t>
+      </w:r>
+    </w:p>
+    <w:p>
+      <w:pPr>
+        <w:widowControl/>
+        <w:numPr>
+          <w:ilvl w:val="0"/>
+          <w:numId w:val="10"/>
+        </w:numPr>
+        <w:spacing w:before="0" w:after="80" w:line="300" w:lineRule="auto"/>
+        <w:ind w:left="540" w:hanging="271"/>
+      </w:pPr>
+      <w:r>
+        <w:rPr>
+          <w:rFonts w:ascii="Calibri" w:hAnsi="Calibri"/>
+          <w:sz w:val="22"/>
+        </w:rPr>
+        <w:t>the low/moderate/high categorical levels and candidate profile;</w:t>
+      </w:r>
+    </w:p>
+    <w:p>
+      <w:pPr>
+        <w:widowControl/>
+        <w:numPr>
+          <w:ilvl w:val="0"/>
+          <w:numId w:val="10"/>
+        </w:numPr>
+        <w:spacing w:before="0" w:after="80" w:line="300" w:lineRule="auto"/>
+        <w:ind w:left="540" w:hanging="271"/>
+      </w:pPr>
+      <w:r>
+        <w:rPr>
+          <w:rFonts w:ascii="Calibri" w:hAnsi="Calibri"/>
+          <w:sz w:val="22"/>
+        </w:rPr>
+        <w:t>the separately retained nearest Euclidean centroid;</w:t>
+      </w:r>
+    </w:p>
+    <w:p>
+      <w:pPr>
+        <w:widowControl/>
+        <w:numPr>
+          <w:ilvl w:val="0"/>
+          <w:numId w:val="10"/>
+        </w:numPr>
+        <w:spacing w:before="0" w:after="80" w:line="300" w:lineRule="auto"/>
+        <w:ind w:left="540" w:hanging="271"/>
+      </w:pPr>
+      <w:r>
+        <w:rPr>
+          <w:rFonts w:ascii="Calibri" w:hAnsi="Calibri"/>
+          <w:sz w:val="22"/>
+        </w:rPr>
+        <w:t>rule-based confidence, threshold proximity, matched counts, and coverage;</w:t>
+      </w:r>
+    </w:p>
+    <w:p>
+      <w:pPr>
+        <w:widowControl/>
+        <w:numPr>
+          <w:ilvl w:val="0"/>
+          <w:numId w:val="10"/>
+        </w:numPr>
+        <w:spacing w:before="0" w:after="80" w:line="300" w:lineRule="auto"/>
+        <w:ind w:left="540" w:hanging="271"/>
+      </w:pPr>
+      <w:r>
+        <w:rPr>
+          <w:rFonts w:ascii="Calibri" w:hAnsi="Calibri"/>
+          <w:sz w:val="22"/>
+        </w:rPr>
+        <w:t>three threshold scales and three 3x3 valence-by-arousal maps, one per</w:t>
+      </w:r>
+    </w:p>
+    <w:p>
+      <w:pPr>
+        <w:widowControl/>
+        <w:spacing w:before="0" w:after="120" w:line="300" w:lineRule="auto"/>
+      </w:pPr>
+      <w:r>
+        <w:rPr>
+          <w:rFonts w:ascii="Calibri" w:hAnsi="Calibri"/>
+          <w:sz w:val="22"/>
+        </w:rPr>
+        <w:t xml:space="preserve">  dominance level;</w:t>
+      </w:r>
+    </w:p>
+    <w:p>
+      <w:pPr>
+        <w:widowControl/>
+        <w:numPr>
+          <w:ilvl w:val="0"/>
+          <w:numId w:val="10"/>
+        </w:numPr>
+        <w:spacing w:before="0" w:after="80" w:line="300" w:lineRule="auto"/>
+        <w:ind w:left="540" w:hanging="271"/>
+      </w:pPr>
+      <w:r>
+        <w:rPr>
+          <w:rFonts w:ascii="Calibri" w:hAnsi="Calibri"/>
+          <w:sz w:val="22"/>
+        </w:rPr>
+        <w:t>nearest alternatives plus all 27 centroid distances and relative affinities;</w:t>
+      </w:r>
+    </w:p>
+    <w:p>
+      <w:pPr>
+        <w:widowControl/>
+        <w:numPr>
+          <w:ilvl w:val="0"/>
+          <w:numId w:val="10"/>
+        </w:numPr>
+        <w:spacing w:before="0" w:after="80" w:line="300" w:lineRule="auto"/>
+        <w:ind w:left="540" w:hanging="271"/>
+      </w:pPr>
+      <w:r>
+        <w:rPr>
+          <w:rFonts w:ascii="Calibri" w:hAnsi="Calibri"/>
+          <w:sz w:val="22"/>
+        </w:rPr>
+        <w:t>optional secondary concreteness, SUBTLEX-US Zipf, and AoA character; and</w:t>
+      </w:r>
+    </w:p>
+    <w:p>
+      <w:pPr>
+        <w:widowControl/>
+        <w:numPr>
+          <w:ilvl w:val="0"/>
+          <w:numId w:val="10"/>
+        </w:numPr>
+        <w:spacing w:before="0" w:after="80" w:line="300" w:lineRule="auto"/>
+        <w:ind w:left="540" w:hanging="271"/>
+      </w:pPr>
+      <w:r>
+        <w:rPr>
+          <w:rFonts w:ascii="Calibri" w:hAnsi="Calibri"/>
+          <w:sz w:val="22"/>
+        </w:rPr>
+        <w:t>methodology, cautions, unmatched terms, and downloads.</w:t>
+      </w:r>
+    </w:p>
+    <w:p>
+      <w:pPr>
+        <w:widowControl/>
+        <w:spacing w:before="0" w:after="120" w:line="300" w:lineRule="auto"/>
+      </w:pPr>
+      <w:r>
+        <w:rPr>
+          <w:rFonts w:ascii="Calibri" w:hAnsi="Calibri"/>
+          <w:sz w:val="22"/>
+        </w:rPr>
+        <w:t xml:space="preserve">The default fixed boundaries are </w:t>
+      </w:r>
+      <w:r>
+        <w:rPr>
+          <w:rFonts w:ascii="Consolas" w:hAnsi="Consolas"/>
+          <w:color w:val="1F4D78"/>
+          <w:sz w:val="19"/>
+        </w:rPr>
+        <w:t>low &lt;= 0.40</w:t>
+      </w:r>
+      <w:r>
+        <w:rPr>
+          <w:rFonts w:ascii="Calibri" w:hAnsi="Calibri"/>
+          <w:sz w:val="22"/>
+        </w:rPr>
+        <w:t xml:space="preserve">, </w:t>
+      </w:r>
+      <w:r>
+        <w:rPr>
+          <w:rFonts w:ascii="Consolas" w:hAnsi="Consolas"/>
+          <w:color w:val="1F4D78"/>
+          <w:sz w:val="19"/>
+        </w:rPr>
+        <w:t>high &gt;= 0.60</w:t>
+      </w:r>
+      <w:r>
+        <w:rPr>
+          <w:rFonts w:ascii="Calibri" w:hAnsi="Calibri"/>
+          <w:sz w:val="22"/>
+        </w:rPr>
+        <w:t>, with moderate between them. Custom fixed boundaries are available. Relative affinities and confidence labels are not probabilities. Profile names are interpretive labels for normative lexical neighborhoods, not declarations of the poem's emotion, speaker psychology, authorial intent, or reader response.</w:t>
+      </w:r>
+    </w:p>
+    <w:p>
+      <w:pPr>
+        <w:pStyle w:val="Heading2"/>
+      </w:pPr>
+      <w:r>
+        <w:rPr>
+          <w:rFonts w:ascii="Calibri" w:hAnsi="Calibri"/>
+          <w:sz w:val="22"/>
+        </w:rPr>
+        <w:t>Evidence tab</w:t>
+      </w:r>
+    </w:p>
+    <w:p>
+      <w:pPr>
+        <w:widowControl/>
+        <w:spacing w:before="0" w:after="120" w:line="300" w:lineRule="auto"/>
+      </w:pPr>
+      <w:r>
+        <w:rPr>
+          <w:rFonts w:ascii="Calibri" w:hAnsi="Calibri"/>
+          <w:sz w:val="22"/>
+        </w:rPr>
+        <w:t>Filter by lexicon, match status, or stopword status. The excluded-only control isolates matched observations omitted from the stopword-excluded view. Inspect normalized form, lemma, match method, matched entry, source values, and the exact stopword reason.</w:t>
+      </w:r>
+    </w:p>
+    <w:p>
+      <w:pPr>
+        <w:widowControl/>
+        <w:spacing w:before="0" w:after="120" w:line="300" w:lineRule="auto"/>
+      </w:pPr>
+      <w:r>
+        <w:rPr>
+          <w:rFonts w:ascii="Calibri" w:hAnsi="Calibri"/>
+          <w:sz w:val="22"/>
+        </w:rPr>
+        <w:t>The unmatched-vocabulary table supports quality control. It does not silently guess replacements.</w:t>
+      </w:r>
+    </w:p>
+    <w:p>
+      <w:pPr>
+        <w:pStyle w:val="Heading2"/>
+      </w:pPr>
+      <w:r>
+        <w:rPr>
+          <w:rFonts w:ascii="Calibri" w:hAnsi="Calibri"/>
+          <w:sz w:val="22"/>
+        </w:rPr>
+        <w:t>Downloads tab</w:t>
+      </w:r>
+    </w:p>
+    <w:p>
+      <w:pPr>
+        <w:widowControl/>
+        <w:spacing w:before="0" w:after="120" w:line="300" w:lineRule="auto"/>
+      </w:pPr>
+      <w:r>
+        <w:rPr>
+          <w:rFonts w:ascii="Calibri" w:hAnsi="Calibri"/>
+          <w:sz w:val="22"/>
+        </w:rPr>
+        <w:t>Download:</w:t>
+      </w:r>
+    </w:p>
+    <w:p>
+      <w:pPr>
+        <w:widowControl/>
+        <w:numPr>
+          <w:ilvl w:val="0"/>
+          <w:numId w:val="10"/>
+        </w:numPr>
+        <w:spacing w:before="0" w:after="80" w:line="300" w:lineRule="auto"/>
+        <w:ind w:left="540" w:hanging="271"/>
+      </w:pPr>
+      <w:r>
+        <w:rPr>
+          <w:rFonts w:ascii="Calibri" w:hAnsi="Calibri"/>
+          <w:sz w:val="22"/>
+        </w:rPr>
+        <w:t>a readable scholar summary CSV;</w:t>
+      </w:r>
+    </w:p>
+    <w:p>
+      <w:pPr>
+        <w:widowControl/>
+        <w:numPr>
+          <w:ilvl w:val="0"/>
+          <w:numId w:val="10"/>
+        </w:numPr>
+        <w:spacing w:before="0" w:after="80" w:line="300" w:lineRule="auto"/>
+        <w:ind w:left="540" w:hanging="271"/>
+      </w:pPr>
+      <w:r>
+        <w:rPr>
+          <w:rFonts w:ascii="Calibri" w:hAnsi="Calibri"/>
+          <w:sz w:val="22"/>
+        </w:rPr>
+        <w:t>the CSV reading guide;</w:t>
+      </w:r>
+    </w:p>
+    <w:p>
+      <w:pPr>
+        <w:widowControl/>
+        <w:numPr>
+          <w:ilvl w:val="0"/>
+          <w:numId w:val="10"/>
+        </w:numPr>
+        <w:spacing w:before="0" w:after="80" w:line="300" w:lineRule="auto"/>
+        <w:ind w:left="540" w:hanging="271"/>
+      </w:pPr>
+      <w:r>
+        <w:rPr>
+          <w:rFonts w:ascii="Calibri" w:hAnsi="Calibri"/>
+          <w:sz w:val="22"/>
+        </w:rPr>
         <w:t>the full audit ZIP.</w:t>
       </w:r>
     </w:p>
@@ -10989,6 +11331,19 @@
           <w:sz w:val="22"/>
         </w:rPr>
         <w:t>Lexical-style pooled TTR, MATTR, HD-D, MTLD, and mean word length are recalculated from the ordered pooled token evidence and are not averages of work-level diversity scores. Meter and rhyme remain work-level candidates/evidence; no corpus-wide definitive meter or rhyme scheme is created.</w:t>
+      </w:r>
+    </w:p>
+    <w:p>
+      <w:pPr>
+        <w:widowControl/>
+        <w:spacing w:before="0" w:after="120" w:line="300" w:lineRule="auto"/>
+      </w:pPr>
+      <w:r>
+        <w:rPr>
+          <w:rFonts w:ascii="Calibri" w:hAnsi="Calibri"/>
+          <w:sz w:val="22"/>
+        </w:rPr>
+        <w:t>PoetryID corpus views group only matching source, all-matched or stopword-excluded view, token/type weighting, module version, and configuration. They show profile prevalence, three map-count tables, continuous work-level VAD positions, and token/type sensitivity without declaring one corpus-wide identity.</w:t>
       </w:r>
     </w:p>
     <w:p>
@@ -16052,6 +16407,412 @@
           </w:p>
         </w:tc>
       </w:tr>
+      <w:tr>
+        <w:trPr>
+          <w:cantSplit w:val="true"/>
+        </w:trPr>
+        <w:tc>
+          <w:tcPr>
+            <w:tcW w:type="dxa" w:w="3600"/>
+            <w:vAlign w:val="center"/>
+            <w:tcMar>
+              <w:top w:w="80" w:type="dxa"/>
+              <w:bottom w:w="80" w:type="dxa"/>
+              <w:start w:w="120" w:type="dxa"/>
+              <w:end w:w="120" w:type="dxa"/>
+            </w:tcMar>
+          </w:tcPr>
+          <w:p>
+            <w:pPr>
+              <w:widowControl/>
+              <w:spacing w:before="0" w:after="0" w:line="252" w:lineRule="auto"/>
+            </w:pPr>
+            <w:r/>
+            <w:r>
+              <w:rPr>
+                <w:rFonts w:ascii="Consolas" w:hAnsi="Consolas"/>
+                <w:color w:val="1F4D78"/>
+                <w:sz w:val="17"/>
+              </w:rPr>
+              <w:t>poetry_id_summary.csv</w:t>
+            </w:r>
+          </w:p>
+        </w:tc>
+        <w:tc>
+          <w:tcPr>
+            <w:tcW w:type="dxa" w:w="5760"/>
+            <w:vAlign w:val="center"/>
+            <w:tcMar>
+              <w:top w:w="80" w:type="dxa"/>
+              <w:bottom w:w="80" w:type="dxa"/>
+              <w:start w:w="120" w:type="dxa"/>
+              <w:end w:w="120" w:type="dxa"/>
+            </w:tcMar>
+          </w:tcPr>
+          <w:p>
+            <w:pPr>
+              <w:widowControl/>
+              <w:spacing w:before="0" w:after="0" w:line="252" w:lineRule="auto"/>
+            </w:pPr>
+            <w:r/>
+            <w:r>
+              <w:rPr>
+                <w:rFonts w:ascii="Calibri" w:hAnsi="Calibri"/>
+                <w:sz w:val="18"/>
+              </w:rPr>
+              <w:t>Source/view/weighting-specific continuous VAD, categorical and nearest-centroid candidates, confidence, boundary, and coverage evidence</w:t>
+            </w:r>
+          </w:p>
+        </w:tc>
+      </w:tr>
+      <w:tr>
+        <w:trPr>
+          <w:cantSplit w:val="true"/>
+        </w:trPr>
+        <w:tc>
+          <w:tcPr>
+            <w:tcW w:type="dxa" w:w="3600"/>
+            <w:vAlign w:val="center"/>
+            <w:tcMar>
+              <w:top w:w="80" w:type="dxa"/>
+              <w:bottom w:w="80" w:type="dxa"/>
+              <w:start w:w="120" w:type="dxa"/>
+              <w:end w:w="120" w:type="dxa"/>
+            </w:tcMar>
+          </w:tcPr>
+          <w:p>
+            <w:pPr>
+              <w:widowControl/>
+              <w:spacing w:before="0" w:after="0" w:line="252" w:lineRule="auto"/>
+            </w:pPr>
+            <w:r/>
+            <w:r>
+              <w:rPr>
+                <w:rFonts w:ascii="Consolas" w:hAnsi="Consolas"/>
+                <w:color w:val="1F4D78"/>
+                <w:sz w:val="17"/>
+              </w:rPr>
+              <w:t>poetry_id_neighbors.csv</w:t>
+            </w:r>
+          </w:p>
+        </w:tc>
+        <w:tc>
+          <w:tcPr>
+            <w:tcW w:type="dxa" w:w="5760"/>
+            <w:vAlign w:val="center"/>
+            <w:tcMar>
+              <w:top w:w="80" w:type="dxa"/>
+              <w:bottom w:w="80" w:type="dxa"/>
+              <w:start w:w="120" w:type="dxa"/>
+              <w:end w:w="120" w:type="dxa"/>
+            </w:tcMar>
+          </w:tcPr>
+          <w:p>
+            <w:pPr>
+              <w:widowControl/>
+              <w:spacing w:before="0" w:after="0" w:line="252" w:lineRule="auto"/>
+            </w:pPr>
+            <w:r/>
+            <w:r>
+              <w:rPr>
+                <w:rFonts w:ascii="Calibri" w:hAnsi="Calibri"/>
+                <w:sz w:val="18"/>
+              </w:rPr>
+              <w:t>All 27 ranked centroid distances and inverse-distance relative affinities, explicitly not probabilities</w:t>
+            </w:r>
+          </w:p>
+        </w:tc>
+      </w:tr>
+      <w:tr>
+        <w:trPr>
+          <w:cantSplit w:val="true"/>
+        </w:trPr>
+        <w:tc>
+          <w:tcPr>
+            <w:tcW w:type="dxa" w:w="3600"/>
+            <w:vAlign w:val="center"/>
+            <w:tcMar>
+              <w:top w:w="80" w:type="dxa"/>
+              <w:bottom w:w="80" w:type="dxa"/>
+              <w:start w:w="120" w:type="dxa"/>
+              <w:end w:w="120" w:type="dxa"/>
+            </w:tcMar>
+          </w:tcPr>
+          <w:p>
+            <w:pPr>
+              <w:widowControl/>
+              <w:spacing w:before="0" w:after="0" w:line="252" w:lineRule="auto"/>
+            </w:pPr>
+            <w:r/>
+            <w:r>
+              <w:rPr>
+                <w:rFonts w:ascii="Consolas" w:hAnsi="Consolas"/>
+                <w:color w:val="1F4D78"/>
+                <w:sz w:val="17"/>
+              </w:rPr>
+              <w:t>poetry_id_lexical_character.csv</w:t>
+            </w:r>
+          </w:p>
+        </w:tc>
+        <w:tc>
+          <w:tcPr>
+            <w:tcW w:type="dxa" w:w="5760"/>
+            <w:vAlign w:val="center"/>
+            <w:tcMar>
+              <w:top w:w="80" w:type="dxa"/>
+              <w:bottom w:w="80" w:type="dxa"/>
+              <w:start w:w="120" w:type="dxa"/>
+              <w:end w:w="120" w:type="dxa"/>
+            </w:tcMar>
+          </w:tcPr>
+          <w:p>
+            <w:pPr>
+              <w:widowControl/>
+              <w:spacing w:before="0" w:after="0" w:line="252" w:lineRule="auto"/>
+            </w:pPr>
+            <w:r/>
+            <w:r>
+              <w:rPr>
+                <w:rFonts w:ascii="Calibri" w:hAnsi="Calibri"/>
+                <w:sz w:val="18"/>
+              </w:rPr>
+              <w:t>Optional native-scale concreteness, SUBTLEX-US Zipf, and AoA token/type character</w:t>
+            </w:r>
+          </w:p>
+        </w:tc>
+      </w:tr>
+      <w:tr>
+        <w:trPr>
+          <w:cantSplit w:val="true"/>
+        </w:trPr>
+        <w:tc>
+          <w:tcPr>
+            <w:tcW w:type="dxa" w:w="3600"/>
+            <w:vAlign w:val="center"/>
+            <w:tcMar>
+              <w:top w:w="80" w:type="dxa"/>
+              <w:bottom w:w="80" w:type="dxa"/>
+              <w:start w:w="120" w:type="dxa"/>
+              <w:end w:w="120" w:type="dxa"/>
+            </w:tcMar>
+          </w:tcPr>
+          <w:p>
+            <w:pPr>
+              <w:widowControl/>
+              <w:spacing w:before="0" w:after="0" w:line="252" w:lineRule="auto"/>
+            </w:pPr>
+            <w:r/>
+            <w:r>
+              <w:rPr>
+                <w:rFonts w:ascii="Consolas" w:hAnsi="Consolas"/>
+                <w:color w:val="1F4D78"/>
+                <w:sz w:val="17"/>
+              </w:rPr>
+              <w:t>poetry_id_methodology.csv</w:t>
+            </w:r>
+          </w:p>
+        </w:tc>
+        <w:tc>
+          <w:tcPr>
+            <w:tcW w:type="dxa" w:w="5760"/>
+            <w:vAlign w:val="center"/>
+            <w:tcMar>
+              <w:top w:w="80" w:type="dxa"/>
+              <w:bottom w:w="80" w:type="dxa"/>
+              <w:start w:w="120" w:type="dxa"/>
+              <w:end w:w="120" w:type="dxa"/>
+            </w:tcMar>
+          </w:tcPr>
+          <w:p>
+            <w:pPr>
+              <w:widowControl/>
+              <w:spacing w:before="0" w:after="0" w:line="252" w:lineRule="auto"/>
+            </w:pPr>
+            <w:r/>
+            <w:r>
+              <w:rPr>
+                <w:rFonts w:ascii="Calibri" w:hAnsi="Calibri"/>
+                <w:sz w:val="18"/>
+              </w:rPr>
+              <w:t>Exact threshold profile, centroids, distance rule, evidence minimums, configuration, and cautions</w:t>
+            </w:r>
+          </w:p>
+        </w:tc>
+      </w:tr>
+      <w:tr>
+        <w:trPr>
+          <w:cantSplit w:val="true"/>
+        </w:trPr>
+        <w:tc>
+          <w:tcPr>
+            <w:tcW w:type="dxa" w:w="3600"/>
+            <w:vAlign w:val="center"/>
+            <w:tcMar>
+              <w:top w:w="80" w:type="dxa"/>
+              <w:bottom w:w="80" w:type="dxa"/>
+              <w:start w:w="120" w:type="dxa"/>
+              <w:end w:w="120" w:type="dxa"/>
+            </w:tcMar>
+          </w:tcPr>
+          <w:p>
+            <w:pPr>
+              <w:widowControl/>
+              <w:spacing w:before="0" w:after="0" w:line="252" w:lineRule="auto"/>
+            </w:pPr>
+            <w:r/>
+            <w:r>
+              <w:rPr>
+                <w:rFonts w:ascii="Consolas" w:hAnsi="Consolas"/>
+                <w:color w:val="1F4D78"/>
+                <w:sz w:val="17"/>
+              </w:rPr>
+              <w:t>poetry_id_archetype_map.csv</w:t>
+            </w:r>
+          </w:p>
+        </w:tc>
+        <w:tc>
+          <w:tcPr>
+            <w:tcW w:type="dxa" w:w="5760"/>
+            <w:vAlign w:val="center"/>
+            <w:tcMar>
+              <w:top w:w="80" w:type="dxa"/>
+              <w:bottom w:w="80" w:type="dxa"/>
+              <w:start w:w="120" w:type="dxa"/>
+              <w:end w:w="120" w:type="dxa"/>
+            </w:tcMar>
+          </w:tcPr>
+          <w:p>
+            <w:pPr>
+              <w:widowControl/>
+              <w:spacing w:before="0" w:after="0" w:line="252" w:lineRule="auto"/>
+            </w:pPr>
+            <w:r/>
+            <w:r>
+              <w:rPr>
+                <w:rFonts w:ascii="Calibri" w:hAnsi="Calibri"/>
+                <w:sz w:val="18"/>
+              </w:rPr>
+              <w:t>All 27 canonical level combinations, centroids, descriptors, summaries, and cautions</w:t>
+            </w:r>
+          </w:p>
+        </w:tc>
+      </w:tr>
+      <w:tr>
+        <w:trPr>
+          <w:cantSplit w:val="true"/>
+        </w:trPr>
+        <w:tc>
+          <w:tcPr>
+            <w:tcW w:type="dxa" w:w="3600"/>
+            <w:vAlign w:val="center"/>
+            <w:tcMar>
+              <w:top w:w="80" w:type="dxa"/>
+              <w:bottom w:w="80" w:type="dxa"/>
+              <w:start w:w="120" w:type="dxa"/>
+              <w:end w:w="120" w:type="dxa"/>
+            </w:tcMar>
+          </w:tcPr>
+          <w:p>
+            <w:pPr>
+              <w:widowControl/>
+              <w:spacing w:before="0" w:after="0" w:line="252" w:lineRule="auto"/>
+            </w:pPr>
+            <w:r/>
+            <w:r>
+              <w:rPr>
+                <w:rFonts w:ascii="Consolas" w:hAnsi="Consolas"/>
+                <w:color w:val="1F4D78"/>
+                <w:sz w:val="17"/>
+              </w:rPr>
+              <w:t>poetry_id_vad_scales.csv</w:t>
+            </w:r>
+          </w:p>
+        </w:tc>
+        <w:tc>
+          <w:tcPr>
+            <w:tcW w:type="dxa" w:w="5760"/>
+            <w:vAlign w:val="center"/>
+            <w:tcMar>
+              <w:top w:w="80" w:type="dxa"/>
+              <w:bottom w:w="80" w:type="dxa"/>
+              <w:start w:w="120" w:type="dxa"/>
+              <w:end w:w="120" w:type="dxa"/>
+            </w:tcMar>
+          </w:tcPr>
+          <w:p>
+            <w:pPr>
+              <w:widowControl/>
+              <w:spacing w:before="0" w:after="0" w:line="252" w:lineRule="auto"/>
+            </w:pPr>
+            <w:r/>
+            <w:r>
+              <w:rPr>
+                <w:rFonts w:ascii="Calibri" w:hAnsi="Calibri"/>
+                <w:sz w:val="18"/>
+              </w:rPr>
+              <w:t>Chart-ready continuous scores, levels, boundaries, centroids, and boundary distances</w:t>
+            </w:r>
+          </w:p>
+        </w:tc>
+      </w:tr>
+      <w:tr>
+        <w:trPr>
+          <w:cantSplit w:val="true"/>
+        </w:trPr>
+        <w:tc>
+          <w:tcPr>
+            <w:tcW w:type="dxa" w:w="3600"/>
+            <w:vAlign w:val="center"/>
+            <w:tcMar>
+              <w:top w:w="80" w:type="dxa"/>
+              <w:bottom w:w="80" w:type="dxa"/>
+              <w:start w:w="120" w:type="dxa"/>
+              <w:end w:w="120" w:type="dxa"/>
+            </w:tcMar>
+          </w:tcPr>
+          <w:p>
+            <w:pPr>
+              <w:widowControl/>
+              <w:spacing w:before="0" w:after="0" w:line="252" w:lineRule="auto"/>
+            </w:pPr>
+            <w:r/>
+            <w:r>
+              <w:rPr>
+                <w:rFonts w:ascii="Consolas" w:hAnsi="Consolas"/>
+                <w:color w:val="1F4D78"/>
+                <w:sz w:val="17"/>
+              </w:rPr>
+              <w:t>poetry_id_report.txt</w:t>
+            </w:r>
+          </w:p>
+        </w:tc>
+        <w:tc>
+          <w:tcPr>
+            <w:tcW w:type="dxa" w:w="5760"/>
+            <w:vAlign w:val="center"/>
+            <w:tcMar>
+              <w:top w:w="80" w:type="dxa"/>
+              <w:bottom w:w="80" w:type="dxa"/>
+              <w:start w:w="120" w:type="dxa"/>
+              <w:end w:w="120" w:type="dxa"/>
+            </w:tcMar>
+          </w:tcPr>
+          <w:p>
+            <w:pPr>
+              <w:widowControl/>
+              <w:spacing w:before="0" w:after="0" w:line="252" w:lineRule="auto"/>
+            </w:pPr>
+            <w:r/>
+            <w:r>
+              <w:rPr>
+                <w:rFonts w:ascii="Calibri" w:hAnsi="Calibri"/>
+                <w:sz w:val="18"/>
+              </w:rPr>
+              <w:t>Compact readable profile, VAD, confidence, narrative, and caution report</w:t>
+            </w:r>
+          </w:p>
+        </w:tc>
+      </w:tr>
     </w:tbl>
     <w:p>
       <w:pPr>
@@ -16204,7 +16965,7 @@
           <w:rFonts w:ascii="Calibri" w:hAnsi="Calibri"/>
           <w:sz w:val="22"/>
         </w:rPr>
-        <w:t xml:space="preserve"> contains every narrowed Stage 10 configuration, diversity/length summary, structural count, and token decision. </w:t>
+        <w:t xml:space="preserve"> contains every narrowed Stage 10 configuration, diversity/length summary, structural count, and token decision. At the scholar's direction, PoetryID produces CSV and plain text only and has no JSON export. </w:t>
       </w:r>
       <w:r>
         <w:rPr>
@@ -24650,7 +25411,7 @@
         <w:color w:val="66727C"/>
         <w:sz w:val="18"/>
       </w:rPr>
-      <w:t xml:space="preserve">  |  0.15.0.dev0</w:t>
+      <w:t xml:space="preserve">  |  0.16.0.dev0</w:t>
     </w:r>
   </w:p>
 </w:hdr>

</xml_diff>

<commit_message>
Implement Stage 13 interface overhaul
</commit_message>
<xml_diff>
--- a/docs/VerseVAD_User_Manual.docx
+++ b/docs/VerseVAD_User_Manual.docx
@@ -47,7 +47,7 @@
           <w:color w:val="66727C"/>
           <w:sz w:val="21"/>
         </w:rPr>
-        <w:t xml:space="preserve"> 0.16.0.dev0</w:t>
+        <w:t xml:space="preserve"> 0.17.0.dev0</w:t>
       </w:r>
       <w:r>
         <w:rPr>
@@ -329,7 +329,7 @@
           <w:rFonts w:ascii="Calibri" w:hAnsi="Calibri"/>
           <w:sz w:val="22"/>
         </w:rPr>
-        <w:t>One Poem workspace</w:t>
+        <w:t>Single Poem and Other Text workspaces</w:t>
       </w:r>
     </w:p>
     <w:p>
@@ -347,7 +347,7 @@
           <w:rFonts w:ascii="Calibri" w:hAnsi="Calibri"/>
           <w:sz w:val="22"/>
         </w:rPr>
-        <w:t>Projects &amp; Corpus workspace</w:t>
+        <w:t>Project / Corpus workspace</w:t>
       </w:r>
     </w:p>
     <w:p>
@@ -519,7 +519,7 @@
                 <w:color w:val="193247"/>
                 <w:sz w:val="22"/>
               </w:rPr>
-              <w:t xml:space="preserve"> first, inspect the shared record in </w:t>
+              <w:t xml:space="preserve"> first, then use the seven report families: </w:t>
             </w:r>
             <w:r>
               <w:rPr>
@@ -528,24 +528,7 @@
                 <w:color w:val="193247"/>
                 <w:sz w:val="22"/>
               </w:rPr>
-              <w:t>Language Profile</w:t>
-            </w:r>
-            <w:r>
-              <w:rPr>
-                <w:rFonts w:ascii="Calibri" w:hAnsi="Calibri"/>
-                <w:color w:val="193247"/>
-                <w:sz w:val="22"/>
-              </w:rPr>
-              <w:t xml:space="preserve">, then read the enabled evidence tabs, including </w:t>
-            </w:r>
-            <w:r>
-              <w:rPr>
-                <w:rFonts w:ascii="Calibri" w:hAnsi="Calibri"/>
-                <w:b/>
-                <w:color w:val="193247"/>
-                <w:sz w:val="22"/>
-              </w:rPr>
-              <w:t>Concreteness Profile</w:t>
+              <w:t>Affective Evidence</w:t>
             </w:r>
             <w:r>
               <w:rPr>
@@ -562,7 +545,7 @@
                 <w:color w:val="193247"/>
                 <w:sz w:val="22"/>
               </w:rPr>
-              <w:t>Frequency &amp; Rarity</w:t>
+              <w:t>Lexical Character</w:t>
             </w:r>
             <w:r>
               <w:rPr>
@@ -579,7 +562,7 @@
                 <w:color w:val="193247"/>
                 <w:sz w:val="22"/>
               </w:rPr>
-              <w:t>Age of Acquisition</w:t>
+              <w:t>Sound &amp; Form</w:t>
             </w:r>
             <w:r>
               <w:rPr>
@@ -596,7 +579,7 @@
                 <w:color w:val="193247"/>
                 <w:sz w:val="22"/>
               </w:rPr>
-              <w:t>Pronunciation &amp; Prosody</w:t>
+              <w:t>Structure</w:t>
             </w:r>
             <w:r>
               <w:rPr>
@@ -613,41 +596,7 @@
                 <w:color w:val="193247"/>
                 <w:sz w:val="22"/>
               </w:rPr>
-              <w:t>Meter &amp; Rhythm</w:t>
-            </w:r>
-            <w:r>
-              <w:rPr>
-                <w:rFonts w:ascii="Calibri" w:hAnsi="Calibri"/>
-                <w:color w:val="193247"/>
-                <w:sz w:val="22"/>
-              </w:rPr>
-              <w:t xml:space="preserve">, </w:t>
-            </w:r>
-            <w:r>
-              <w:rPr>
-                <w:rFonts w:ascii="Calibri" w:hAnsi="Calibri"/>
-                <w:b/>
-                <w:color w:val="193247"/>
-                <w:sz w:val="22"/>
-              </w:rPr>
-              <w:t>Rhyme &amp; Sound</w:t>
-            </w:r>
-            <w:r>
-              <w:rPr>
-                <w:rFonts w:ascii="Calibri" w:hAnsi="Calibri"/>
-                <w:color w:val="193247"/>
-                <w:sz w:val="22"/>
-              </w:rPr>
-              <w:t xml:space="preserve">, </w:t>
-            </w:r>
-            <w:r>
-              <w:rPr>
-                <w:rFonts w:ascii="Calibri" w:hAnsi="Calibri"/>
-                <w:b/>
-                <w:color w:val="193247"/>
-                <w:sz w:val="22"/>
-              </w:rPr>
-              <w:t>Lexical Style</w:t>
+              <w:t>Evidence &amp; Diagnostics</w:t>
             </w:r>
             <w:r>
               <w:rPr>
@@ -664,7 +613,7 @@
                 <w:color w:val="193247"/>
                 <w:sz w:val="22"/>
               </w:rPr>
-              <w:t>PoetryID</w:t>
+              <w:t>Export &amp; Help</w:t>
             </w:r>
             <w:r>
               <w:rPr>
@@ -672,24 +621,7 @@
                 <w:color w:val="193247"/>
                 <w:sz w:val="22"/>
               </w:rPr>
-              <w:t xml:space="preserve"> when selected, and inspect </w:t>
-            </w:r>
-            <w:r>
-              <w:rPr>
-                <w:rFonts w:ascii="Calibri" w:hAnsi="Calibri"/>
-                <w:b/>
-                <w:color w:val="193247"/>
-                <w:sz w:val="22"/>
-              </w:rPr>
-              <w:t>Evidence</w:t>
-            </w:r>
-            <w:r>
-              <w:rPr>
-                <w:rFonts w:ascii="Calibri" w:hAnsi="Calibri"/>
-                <w:color w:val="193247"/>
-                <w:sz w:val="22"/>
-              </w:rPr>
-              <w:t xml:space="preserve">. Download the readable summary for ordinary review and the full audit bundle when you need reproducibility. If a term is unfamiliar, use the separate </w:t>
+              <w:t xml:space="preserve">. Each analytical module is a large collapsible section with a visible status. Download the readable summary for ordinary review and the full audit bundle when you need reproducibility. If a term is unfamiliar, use the separate </w:t>
             </w:r>
             <w:r>
               <w:rPr>
@@ -1604,7 +1536,7 @@
           <w:rFonts w:ascii="Calibri" w:hAnsi="Calibri"/>
           <w:sz w:val="22"/>
         </w:rPr>
-        <w:t>The workspace selector appears as three tabs across the top:</w:t>
+        <w:t>The shared application header contains:</w:t>
       </w:r>
     </w:p>
     <w:p>
@@ -1623,7 +1555,7 @@
           <w:b/>
           <w:sz w:val="22"/>
         </w:rPr>
-        <w:t>One Poem</w:t>
+        <w:t>Single Poem</w:t>
       </w:r>
     </w:p>
     <w:p>
@@ -1642,7 +1574,7 @@
           <w:b/>
           <w:sz w:val="22"/>
         </w:rPr>
-        <w:t>Projects &amp; Corpus</w:t>
+        <w:t>Project / Corpus</w:t>
       </w:r>
     </w:p>
     <w:p>
@@ -1661,7 +1593,131 @@
           <w:b/>
           <w:sz w:val="22"/>
         </w:rPr>
+        <w:t>Other Text</w:t>
+      </w:r>
+    </w:p>
+    <w:p>
+      <w:pPr>
+        <w:widowControl/>
+        <w:numPr>
+          <w:ilvl w:val="0"/>
+          <w:numId w:val="10"/>
+        </w:numPr>
+        <w:spacing w:before="0" w:after="80" w:line="300" w:lineRule="auto"/>
+        <w:ind w:left="540" w:hanging="271"/>
+      </w:pPr>
+      <w:r>
+        <w:rPr>
+          <w:rFonts w:ascii="Calibri" w:hAnsi="Calibri"/>
+          <w:b/>
+          <w:sz w:val="22"/>
+        </w:rPr>
         <w:t>Lexicon Explorer</w:t>
+      </w:r>
+    </w:p>
+    <w:p>
+      <w:pPr>
+        <w:widowControl/>
+        <w:numPr>
+          <w:ilvl w:val="0"/>
+          <w:numId w:val="10"/>
+        </w:numPr>
+        <w:spacing w:before="0" w:after="80" w:line="300" w:lineRule="auto"/>
+        <w:ind w:left="540" w:hanging="271"/>
+      </w:pPr>
+      <w:r>
+        <w:rPr>
+          <w:rFonts w:ascii="Calibri" w:hAnsi="Calibri"/>
+          <w:sz w:val="22"/>
+        </w:rPr>
+        <w:t>the current VerseVAD version;</w:t>
+      </w:r>
+    </w:p>
+    <w:p>
+      <w:pPr>
+        <w:widowControl/>
+        <w:numPr>
+          <w:ilvl w:val="0"/>
+          <w:numId w:val="10"/>
+        </w:numPr>
+        <w:spacing w:before="0" w:after="80" w:line="300" w:lineRule="auto"/>
+        <w:ind w:left="540" w:hanging="271"/>
+      </w:pPr>
+      <w:r>
+        <w:rPr>
+          <w:rFonts w:ascii="Calibri" w:hAnsi="Calibri"/>
+          <w:b/>
+          <w:sz w:val="22"/>
+        </w:rPr>
+        <w:t>Light</w:t>
+      </w:r>
+      <w:r>
+        <w:rPr>
+          <w:rFonts w:ascii="Calibri" w:hAnsi="Calibri"/>
+          <w:sz w:val="22"/>
+        </w:rPr>
+        <w:t xml:space="preserve">, </w:t>
+      </w:r>
+      <w:r>
+        <w:rPr>
+          <w:rFonts w:ascii="Calibri" w:hAnsi="Calibri"/>
+          <w:b/>
+          <w:sz w:val="22"/>
+        </w:rPr>
+        <w:t>Dark</w:t>
+      </w:r>
+      <w:r>
+        <w:rPr>
+          <w:rFonts w:ascii="Calibri" w:hAnsi="Calibri"/>
+          <w:sz w:val="22"/>
+        </w:rPr>
+        <w:t xml:space="preserve">, and </w:t>
+      </w:r>
+      <w:r>
+        <w:rPr>
+          <w:rFonts w:ascii="Calibri" w:hAnsi="Calibri"/>
+          <w:b/>
+          <w:sz w:val="22"/>
+        </w:rPr>
+        <w:t>System</w:t>
+      </w:r>
+      <w:r>
+        <w:rPr>
+          <w:rFonts w:ascii="Calibri" w:hAnsi="Calibri"/>
+          <w:sz w:val="22"/>
+        </w:rPr>
+        <w:t xml:space="preserve"> appearance;</w:t>
+      </w:r>
+    </w:p>
+    <w:p>
+      <w:pPr>
+        <w:widowControl/>
+        <w:numPr>
+          <w:ilvl w:val="0"/>
+          <w:numId w:val="10"/>
+        </w:numPr>
+        <w:spacing w:before="0" w:after="80" w:line="300" w:lineRule="auto"/>
+        <w:ind w:left="540" w:hanging="271"/>
+      </w:pPr>
+      <w:r>
+        <w:rPr>
+          <w:rFonts w:ascii="Calibri" w:hAnsi="Calibri"/>
+          <w:sz w:val="22"/>
+        </w:rPr>
+        <w:t>settings and help access.</w:t>
+      </w:r>
+    </w:p>
+    <w:p>
+      <w:pPr>
+        <w:widowControl/>
+        <w:spacing w:before="0" w:after="120" w:line="300" w:lineRule="auto"/>
+      </w:pPr>
+      <w:r>
+        <w:rPr>
+          <w:rFonts w:ascii="Calibri" w:hAnsi="Calibri"/>
+          <w:sz w:val="22"/>
+        </w:rPr>
+        <w:t>System appearance follows the browser or operating-system preference. The selection is stored as an application-level local preference, not in a project or analysis configuration. Appearance does not change calculations, result IDs, project data, or exports. Publication-oriented charts remain light.</w:t>
       </w:r>
     </w:p>
     <w:p>
@@ -1724,7 +1780,7 @@
           <w:b/>
           <w:sz w:val="22"/>
         </w:rPr>
-        <w:t>One Poem</w:t>
+        <w:t>Single Poem</w:t>
       </w:r>
       <w:r>
         <w:rPr>
@@ -1952,7 +2008,7 @@
           <w:b/>
           <w:sz w:val="22"/>
         </w:rPr>
-        <w:t>Analyze this text</w:t>
+        <w:t>Analyze Poem</w:t>
       </w:r>
       <w:r>
         <w:rPr>
@@ -2018,14 +2074,14 @@
           <w:b/>
           <w:sz w:val="22"/>
         </w:rPr>
-        <w:t>VAD Profile</w:t>
-      </w:r>
-      <w:r>
-        <w:rPr>
-          <w:rFonts w:ascii="Calibri" w:hAnsi="Calibri"/>
-          <w:sz w:val="22"/>
-        </w:rPr>
-        <w:t>, compare all matched observations with stopwords excluded.</w:t>
+        <w:t>Affective Evidence</w:t>
+      </w:r>
+      <w:r>
+        <w:rPr>
+          <w:rFonts w:ascii="Calibri" w:hAnsi="Calibri"/>
+          <w:sz w:val="22"/>
+        </w:rPr>
+        <w:t>, compare VAD sources/views, emotion evidence, and PoetryID when selected.</w:t>
       </w:r>
     </w:p>
     <w:p>
@@ -2051,14 +2107,14 @@
           <w:b/>
           <w:sz w:val="22"/>
         </w:rPr>
-        <w:t>Language Profile</w:t>
-      </w:r>
-      <w:r>
-        <w:rPr>
-          <w:rFonts w:ascii="Calibri" w:hAnsi="Calibri"/>
-          <w:sz w:val="22"/>
-        </w:rPr>
-        <w:t>, inspect the independent grammatical profile when it is relevant to your question.</w:t>
+        <w:t>Lexical Character</w:t>
+      </w:r>
+      <w:r>
+        <w:rPr>
+          <w:rFonts w:ascii="Calibri" w:hAnsi="Calibri"/>
+          <w:sz w:val="22"/>
+        </w:rPr>
+        <w:t>, inspect Concreteness, Frequency &amp; Rarity, and Age of Acquisition when selected.</w:t>
       </w:r>
     </w:p>
     <w:p>
@@ -2076,7 +2132,7 @@
           <w:rFonts w:ascii="Calibri" w:hAnsi="Calibri"/>
           <w:sz w:val="22"/>
         </w:rPr>
-        <w:t xml:space="preserve">If enabled, inspect the separate </w:t>
+        <w:t xml:space="preserve">In </w:t>
       </w:r>
       <w:r>
         <w:rPr>
@@ -2084,74 +2140,14 @@
           <w:b/>
           <w:sz w:val="22"/>
         </w:rPr>
-        <w:t>Concreteness Profile</w:t>
-      </w:r>
-      <w:r>
-        <w:rPr>
-          <w:rFonts w:ascii="Calibri" w:hAnsi="Calibri"/>
-          <w:sz w:val="22"/>
-        </w:rPr>
-        <w:t xml:space="preserve">, </w:t>
-      </w:r>
-      <w:r>
-        <w:rPr>
-          <w:rFonts w:ascii="Calibri" w:hAnsi="Calibri"/>
-          <w:b/>
-          <w:sz w:val="22"/>
-        </w:rPr>
-        <w:t>Frequency &amp; Rarity</w:t>
-      </w:r>
-      <w:r>
-        <w:rPr>
-          <w:rFonts w:ascii="Calibri" w:hAnsi="Calibri"/>
-          <w:sz w:val="22"/>
-        </w:rPr>
-        <w:t xml:space="preserve">, </w:t>
-      </w:r>
-      <w:r>
-        <w:rPr>
-          <w:rFonts w:ascii="Calibri" w:hAnsi="Calibri"/>
-          <w:b/>
-          <w:sz w:val="22"/>
-        </w:rPr>
-        <w:t>Age of Acquisition</w:t>
-      </w:r>
-      <w:r>
-        <w:rPr>
-          <w:rFonts w:ascii="Calibri" w:hAnsi="Calibri"/>
-          <w:sz w:val="22"/>
-        </w:rPr>
-        <w:t xml:space="preserve">, </w:t>
-      </w:r>
-      <w:r>
-        <w:rPr>
-          <w:rFonts w:ascii="Calibri" w:hAnsi="Calibri"/>
-          <w:b/>
-          <w:sz w:val="22"/>
-        </w:rPr>
-        <w:t>Pronunciation &amp; Prosody</w:t>
-      </w:r>
-      <w:r>
-        <w:rPr>
-          <w:rFonts w:ascii="Calibri" w:hAnsi="Calibri"/>
-          <w:sz w:val="22"/>
-        </w:rPr>
-        <w:t xml:space="preserve">, and </w:t>
-      </w:r>
-      <w:r>
-        <w:rPr>
-          <w:rFonts w:ascii="Calibri" w:hAnsi="Calibri"/>
-          <w:b/>
-          <w:sz w:val="22"/>
-        </w:rPr>
-        <w:t>Meter &amp; Rhythm</w:t>
-      </w:r>
-      <w:r>
-        <w:rPr>
-          <w:rFonts w:ascii="Calibri" w:hAnsi="Calibri"/>
-          <w:sz w:val="22"/>
-        </w:rPr>
-        <w:t xml:space="preserve"> tabs.</w:t>
+        <w:t>Sound &amp; Form</w:t>
+      </w:r>
+      <w:r>
+        <w:rPr>
+          <w:rFonts w:ascii="Calibri" w:hAnsi="Calibri"/>
+          <w:sz w:val="22"/>
+        </w:rPr>
+        <w:t>, inspect Pronunciation, Meter &amp; Rhythm, and Rhyme &amp; Sound when selected.</w:t>
       </w:r>
     </w:p>
     <w:p>
@@ -2177,14 +2173,14 @@
           <w:b/>
           <w:sz w:val="22"/>
         </w:rPr>
-        <w:t>Evidence</w:t>
-      </w:r>
-      <w:r>
-        <w:rPr>
-          <w:rFonts w:ascii="Calibri" w:hAnsi="Calibri"/>
-          <w:sz w:val="22"/>
-        </w:rPr>
-        <w:t>, inspect exactly which surface forms, lemmas, or phrases matched.</w:t>
+        <w:t>Structure</w:t>
+      </w:r>
+      <w:r>
+        <w:rPr>
+          <w:rFonts w:ascii="Calibri" w:hAnsi="Calibri"/>
+          <w:sz w:val="22"/>
+        </w:rPr>
+        <w:t>, inspect the language profile and lexical/structural measures.</w:t>
       </w:r>
     </w:p>
     <w:p>
@@ -2210,7 +2206,40 @@
           <w:b/>
           <w:sz w:val="22"/>
         </w:rPr>
-        <w:t>Downloads</w:t>
+        <w:t>Evidence &amp; Diagnostics</w:t>
+      </w:r>
+      <w:r>
+        <w:rPr>
+          <w:rFonts w:ascii="Calibri" w:hAnsi="Calibri"/>
+          <w:sz w:val="22"/>
+        </w:rPr>
+        <w:t>, inspect exactly which surface forms, lemmas, or phrases matched.</w:t>
+      </w:r>
+    </w:p>
+    <w:p>
+      <w:pPr>
+        <w:widowControl/>
+        <w:numPr>
+          <w:ilvl w:val="0"/>
+          <w:numId w:val="14"/>
+        </w:numPr>
+        <w:spacing w:before="0" w:after="80" w:line="300" w:lineRule="auto"/>
+        <w:ind w:left="540" w:hanging="271"/>
+      </w:pPr>
+      <w:r>
+        <w:rPr>
+          <w:rFonts w:ascii="Calibri" w:hAnsi="Calibri"/>
+          <w:sz w:val="22"/>
+        </w:rPr>
+        <w:t xml:space="preserve">In </w:t>
+      </w:r>
+      <w:r>
+        <w:rPr>
+          <w:rFonts w:ascii="Calibri" w:hAnsi="Calibri"/>
+          <w:b/>
+          <w:sz w:val="22"/>
+        </w:rPr>
+        <w:t>Export &amp; Help</w:t>
       </w:r>
       <w:r>
         <w:rPr>
@@ -8435,7 +8464,7 @@
           <w:rFonts w:ascii="Calibri" w:hAnsi="Calibri"/>
           <w:sz w:val="22"/>
         </w:rPr>
-        <w:t>8. One Poem Workspace</w:t>
+        <w:t>8. Single Poem and Other Text Workspaces</w:t>
       </w:r>
     </w:p>
     <w:p>
@@ -8475,7 +8504,58 @@
           <w:rFonts w:ascii="Calibri" w:hAnsi="Calibri"/>
           <w:sz w:val="22"/>
         </w:rPr>
-        <w:t xml:space="preserve"> file up to 5 MB. Enter a title or working label. The optional workspace name labels the temporary session but does not create a persistent corpus project.</w:t>
+        <w:t xml:space="preserve"> file up to 5 MB. Enter a title or working label. Optional author, date/year, and source/edition notes are available under bibliographic metadata. The live word, physical-line, and text-block counts are orientation only; the actual analysis uses the shared linguistic tokenizer. </w:t>
+      </w:r>
+      <w:r>
+        <w:rPr>
+          <w:rFonts w:ascii="Calibri" w:hAnsi="Calibri"/>
+          <w:b/>
+          <w:sz w:val="22"/>
+        </w:rPr>
+        <w:t>Clear text</w:t>
+      </w:r>
+      <w:r>
+        <w:rPr>
+          <w:rFonts w:ascii="Calibri" w:hAnsi="Calibri"/>
+          <w:sz w:val="22"/>
+        </w:rPr>
+        <w:t xml:space="preserve"> requires confirmation. The optional workspace name labels the temporary session but does not create a persistent corpus project.</w:t>
+      </w:r>
+    </w:p>
+    <w:p>
+      <w:pPr>
+        <w:widowControl/>
+        <w:spacing w:before="0" w:after="120" w:line="300" w:lineRule="auto"/>
+      </w:pPr>
+      <w:r>
+        <w:rPr>
+          <w:rFonts w:ascii="Calibri" w:hAnsi="Calibri"/>
+          <w:b/>
+          <w:sz w:val="22"/>
+        </w:rPr>
+        <w:t>Other Text</w:t>
+      </w:r>
+      <w:r>
+        <w:rPr>
+          <w:rFonts w:ascii="Calibri" w:hAnsi="Calibri"/>
+          <w:sz w:val="22"/>
+        </w:rPr>
+        <w:t xml:space="preserve"> reuses this interface and the same analysis engines with </w:t>
+      </w:r>
+      <w:r>
+        <w:rPr>
+          <w:rFonts w:ascii="Calibri" w:hAnsi="Calibri"/>
+          <w:b/>
+          <w:sz w:val="22"/>
+        </w:rPr>
+        <w:t>Analyze Text</w:t>
+      </w:r>
+      <w:r>
+        <w:rPr>
+          <w:rFonts w:ascii="Calibri" w:hAnsi="Calibri"/>
+          <w:sz w:val="22"/>
+        </w:rPr>
+        <w:t xml:space="preserve"> terminology. Pronunciation, meter, and rhyme remain available, but meter and rhyme are visibly marked experimental for non-lineated prose.</w:t>
       </w:r>
     </w:p>
     <w:p>
@@ -8500,7 +8580,82 @@
           <w:rFonts w:ascii="Calibri" w:hAnsi="Calibri"/>
           <w:sz w:val="22"/>
         </w:rPr>
-        <w:t>Select one or more affective lexicons and/or enable the optional normative lexical concreteness, SUBTLEX-US frequency, Kuperman Age of Acquisition, CMUdict pronunciation/prosody-foundation, candidate-meter, rhyme/sound, Lexical Style, or PoetryID modules. VAD, categorical association, intensity, concreteness, corpus-relative frequency, retrospective lexical AoA, dictionary pronunciation/lexical stress, configured meter fit, rhyme/sound evidence, lexical diversity/word counts, and PoetryID candidate profiles answer different questions and remain separate. PoetryID requires an enabled VAD source and reuses its completed result; selecting meter or rhyme automatically runs its pronunciation dependency.</w:t>
+        <w:t xml:space="preserve">Select one or more affective lexicons and/or enable the optional normative lexical concreteness, SUBTLEX-US frequency, Kuperman Age of Acquisition, CMUdict pronunciation/prosody-foundation, candidate-meter, rhyme/sound, Lexical Style, or PoetryID modules. The controls are grouped as </w:t>
+      </w:r>
+      <w:r>
+        <w:rPr>
+          <w:rFonts w:ascii="Calibri" w:hAnsi="Calibri"/>
+          <w:b/>
+          <w:sz w:val="22"/>
+        </w:rPr>
+        <w:t>Core Analysis</w:t>
+      </w:r>
+      <w:r>
+        <w:rPr>
+          <w:rFonts w:ascii="Calibri" w:hAnsi="Calibri"/>
+          <w:sz w:val="22"/>
+        </w:rPr>
+        <w:t xml:space="preserve">, </w:t>
+      </w:r>
+      <w:r>
+        <w:rPr>
+          <w:rFonts w:ascii="Calibri" w:hAnsi="Calibri"/>
+          <w:b/>
+          <w:sz w:val="22"/>
+        </w:rPr>
+        <w:t>Lexical Character</w:t>
+      </w:r>
+      <w:r>
+        <w:rPr>
+          <w:rFonts w:ascii="Calibri" w:hAnsi="Calibri"/>
+          <w:sz w:val="22"/>
+        </w:rPr>
+        <w:t xml:space="preserve">, </w:t>
+      </w:r>
+      <w:r>
+        <w:rPr>
+          <w:rFonts w:ascii="Calibri" w:hAnsi="Calibri"/>
+          <w:b/>
+          <w:sz w:val="22"/>
+        </w:rPr>
+        <w:t>Structural and Lexical Measures</w:t>
+      </w:r>
+      <w:r>
+        <w:rPr>
+          <w:rFonts w:ascii="Calibri" w:hAnsi="Calibri"/>
+          <w:sz w:val="22"/>
+        </w:rPr>
+        <w:t xml:space="preserve">, </w:t>
+      </w:r>
+      <w:r>
+        <w:rPr>
+          <w:rFonts w:ascii="Calibri" w:hAnsi="Calibri"/>
+          <w:b/>
+          <w:sz w:val="22"/>
+        </w:rPr>
+        <w:t>PoetryID</w:t>
+      </w:r>
+      <w:r>
+        <w:rPr>
+          <w:rFonts w:ascii="Calibri" w:hAnsi="Calibri"/>
+          <w:sz w:val="22"/>
+        </w:rPr>
+        <w:t xml:space="preserve">, and </w:t>
+      </w:r>
+      <w:r>
+        <w:rPr>
+          <w:rFonts w:ascii="Calibri" w:hAnsi="Calibri"/>
+          <w:b/>
+          <w:sz w:val="22"/>
+        </w:rPr>
+        <w:t>Sound and Form</w:t>
+      </w:r>
+      <w:r>
+        <w:rPr>
+          <w:rFonts w:ascii="Calibri" w:hAnsi="Calibri"/>
+          <w:sz w:val="22"/>
+        </w:rPr>
+        <w:t>.</w:t>
       </w:r>
     </w:p>
     <w:p>
@@ -8513,6 +8668,122 @@
           <w:rFonts w:ascii="Calibri" w:hAnsi="Calibri"/>
           <w:sz w:val="22"/>
         </w:rPr>
+        <w:t xml:space="preserve">The optional </w:t>
+      </w:r>
+      <w:r>
+        <w:rPr>
+          <w:rFonts w:ascii="Calibri" w:hAnsi="Calibri"/>
+          <w:b/>
+          <w:sz w:val="22"/>
+        </w:rPr>
+        <w:t>Essential</w:t>
+      </w:r>
+      <w:r>
+        <w:rPr>
+          <w:rFonts w:ascii="Calibri" w:hAnsi="Calibri"/>
+          <w:sz w:val="22"/>
+        </w:rPr>
+        <w:t xml:space="preserve">, </w:t>
+      </w:r>
+      <w:r>
+        <w:rPr>
+          <w:rFonts w:ascii="Calibri" w:hAnsi="Calibri"/>
+          <w:b/>
+          <w:sz w:val="22"/>
+        </w:rPr>
+        <w:t>Literary</w:t>
+      </w:r>
+      <w:r>
+        <w:rPr>
+          <w:rFonts w:ascii="Calibri" w:hAnsi="Calibri"/>
+          <w:sz w:val="22"/>
+        </w:rPr>
+        <w:t xml:space="preserve">, </w:t>
+      </w:r>
+      <w:r>
+        <w:rPr>
+          <w:rFonts w:ascii="Calibri" w:hAnsi="Calibri"/>
+          <w:b/>
+          <w:sz w:val="22"/>
+        </w:rPr>
+        <w:t>Sound and Form</w:t>
+      </w:r>
+      <w:r>
+        <w:rPr>
+          <w:rFonts w:ascii="Calibri" w:hAnsi="Calibri"/>
+          <w:sz w:val="22"/>
+        </w:rPr>
+        <w:t xml:space="preserve">, and </w:t>
+      </w:r>
+      <w:r>
+        <w:rPr>
+          <w:rFonts w:ascii="Calibri" w:hAnsi="Calibri"/>
+          <w:b/>
+          <w:sz w:val="22"/>
+        </w:rPr>
+        <w:t>Complete</w:t>
+      </w:r>
+      <w:r>
+        <w:rPr>
+          <w:rFonts w:ascii="Calibri" w:hAnsi="Calibri"/>
+          <w:sz w:val="22"/>
+        </w:rPr>
+        <w:t xml:space="preserve"> presets change module selections only after </w:t>
+      </w:r>
+      <w:r>
+        <w:rPr>
+          <w:rFonts w:ascii="Calibri" w:hAnsi="Calibri"/>
+          <w:b/>
+          <w:sz w:val="22"/>
+        </w:rPr>
+        <w:t>Apply preset</w:t>
+      </w:r>
+      <w:r>
+        <w:rPr>
+          <w:rFonts w:ascii="Calibri" w:hAnsi="Calibri"/>
+          <w:sz w:val="22"/>
+        </w:rPr>
+        <w:t xml:space="preserve"> is clicked. </w:t>
+      </w:r>
+      <w:r>
+        <w:rPr>
+          <w:rFonts w:ascii="Calibri" w:hAnsi="Calibri"/>
+          <w:b/>
+          <w:sz w:val="22"/>
+        </w:rPr>
+        <w:t>Custom</w:t>
+      </w:r>
+      <w:r>
+        <w:rPr>
+          <w:rFonts w:ascii="Calibri" w:hAnsi="Calibri"/>
+          <w:sz w:val="22"/>
+        </w:rPr>
+        <w:t xml:space="preserve"> retains the current manual selection. Presets never overwrite advanced thresholds, filtering, phrase policy, stopwords, pronunciation overrides, or other methodology.</w:t>
+      </w:r>
+    </w:p>
+    <w:p>
+      <w:pPr>
+        <w:widowControl/>
+        <w:spacing w:before="0" w:after="120" w:line="300" w:lineRule="auto"/>
+      </w:pPr>
+      <w:r>
+        <w:rPr>
+          <w:rFonts w:ascii="Calibri" w:hAnsi="Calibri"/>
+          <w:sz w:val="22"/>
+        </w:rPr>
+        <w:t>VAD, categorical association, intensity, concreteness, corpus-relative frequency, retrospective lexical AoA, dictionary pronunciation/lexical stress, configured meter fit, rhyme/sound evidence, lexical diversity/word counts, and PoetryID candidate profiles answer different questions and remain separate. PoetryID requires an enabled VAD source and reuses its completed result; selecting meter or rhyme automatically runs its pronunciation dependency.</w:t>
+      </w:r>
+    </w:p>
+    <w:p>
+      <w:pPr>
+        <w:widowControl/>
+        <w:spacing w:before="0" w:after="120" w:line="300" w:lineRule="auto"/>
+      </w:pPr>
+      <w:r>
+        <w:rPr>
+          <w:rFonts w:ascii="Calibri" w:hAnsi="Calibri"/>
+          <w:sz w:val="22"/>
+        </w:rPr>
         <w:t xml:space="preserve">The same eight optional modules are also available in </w:t>
       </w:r>
       <w:r>
@@ -8521,14 +8792,14 @@
           <w:b/>
           <w:sz w:val="22"/>
         </w:rPr>
-        <w:t>Projects &amp; Corpus</w:t>
-      </w:r>
-      <w:r>
-        <w:rPr>
-          <w:rFonts w:ascii="Calibri" w:hAnsi="Calibri"/>
-          <w:sz w:val="22"/>
-        </w:rPr>
-        <w:t>. One Poem results remain temporary unless downloaded; corpus runs persist the same module result envelopes, configurations, coverage, warnings, provenance, and audit artifacts against exact text versions.</w:t>
+        <w:t>Project / Corpus</w:t>
+      </w:r>
+      <w:r>
+        <w:rPr>
+          <w:rFonts w:ascii="Calibri" w:hAnsi="Calibri"/>
+          <w:sz w:val="22"/>
+        </w:rPr>
+        <w:t>. Single Poem and Other Text results remain temporary unless downloaded; corpus runs persist the same module result envelopes, configurations, coverage, warnings, provenance, and audit artifacts against exact text versions.</w:t>
       </w:r>
     </w:p>
     <w:p>
@@ -8549,7 +8820,7 @@
           <w:b/>
           <w:sz w:val="22"/>
         </w:rPr>
-        <w:t>Advanced methodology settings</w:t>
+        <w:t>Analysis configuration and methodology</w:t>
       </w:r>
       <w:r>
         <w:rPr>
@@ -9253,7 +9524,7 @@
           <w:rFonts w:ascii="Calibri" w:hAnsi="Calibri"/>
           <w:sz w:val="22"/>
         </w:rPr>
-        <w:t>Overview tab</w:t>
+        <w:t>Overview report family</w:t>
       </w:r>
     </w:p>
     <w:p>
@@ -9266,7 +9537,7 @@
           <w:rFonts w:ascii="Calibri" w:hAnsi="Calibri"/>
           <w:sz w:val="22"/>
         </w:rPr>
-        <w:t>Read coverage before means. The tab shows ordinary and content-focused coverage, matched counts, active methodology, excluded stopword counts, interpretive framing, and warnings.</w:t>
+        <w:t>Read coverage before means. The Overview begins with a grouped at-a-glance summary for affective evidence, lexical character, sound/form, and structure. It then shows ordinary and content-focused coverage, matched counts, active methodology, excluded stopword counts, interpretive framing, and warnings.</w:t>
       </w:r>
     </w:p>
     <w:p>
@@ -9278,7 +9549,7 @@
           <w:rFonts w:ascii="Calibri" w:hAnsi="Calibri"/>
           <w:sz w:val="22"/>
         </w:rPr>
-        <w:t>Language Profile tab</w:t>
+        <w:t>Structure report family: Language Profile section</w:t>
       </w:r>
     </w:p>
     <w:p>
@@ -9331,7 +9602,7 @@
           <w:rFonts w:ascii="Calibri" w:hAnsi="Calibri"/>
           <w:sz w:val="22"/>
         </w:rPr>
-        <w:t>VAD Profile tab</w:t>
+        <w:t>Affective Evidence: VAD section</w:t>
       </w:r>
     </w:p>
     <w:p>
@@ -9518,7 +9789,7 @@
           <w:rFonts w:ascii="Calibri" w:hAnsi="Calibri"/>
           <w:sz w:val="22"/>
         </w:rPr>
-        <w:t>Emotion Profile tab</w:t>
+        <w:t>Affective Evidence: Emotion Association and Intensity section</w:t>
       </w:r>
     </w:p>
     <w:p>
@@ -9543,7 +9814,7 @@
           <w:rFonts w:ascii="Calibri" w:hAnsi="Calibri"/>
           <w:sz w:val="22"/>
         </w:rPr>
-        <w:t>Concreteness Profile tab</w:t>
+        <w:t>Lexical Character: Concreteness section</w:t>
       </w:r>
     </w:p>
     <w:p>
@@ -9581,7 +9852,7 @@
           <w:rFonts w:ascii="Calibri" w:hAnsi="Calibri"/>
           <w:sz w:val="22"/>
         </w:rPr>
-        <w:t>Frequency &amp; Rarity tab</w:t>
+        <w:t>Lexical Character: Frequency &amp; Rarity section</w:t>
       </w:r>
     </w:p>
     <w:p>
@@ -9679,7 +9950,7 @@
           <w:rFonts w:ascii="Calibri" w:hAnsi="Calibri"/>
           <w:sz w:val="22"/>
         </w:rPr>
-        <w:t>Age of Acquisition tab</w:t>
+        <w:t>Lexical Character: Age of Acquisition section</w:t>
       </w:r>
     </w:p>
     <w:p>
@@ -9777,7 +10048,7 @@
           <w:rFonts w:ascii="Calibri" w:hAnsi="Calibri"/>
           <w:sz w:val="22"/>
         </w:rPr>
-        <w:t>Pronunciation &amp; Prosody tab</w:t>
+        <w:t>Sound &amp; Form: Pronunciation, Syllables, and Stress section</w:t>
       </w:r>
     </w:p>
     <w:p>
@@ -9888,7 +10159,7 @@
           <w:rFonts w:ascii="Calibri" w:hAnsi="Calibri"/>
           <w:sz w:val="22"/>
         </w:rPr>
-        <w:t>Meter &amp; Rhythm tab</w:t>
+        <w:t>Sound &amp; Form: Meter &amp; Rhythm section</w:t>
       </w:r>
     </w:p>
     <w:p>
@@ -9941,7 +10212,7 @@
           <w:rFonts w:ascii="Calibri" w:hAnsi="Calibri"/>
           <w:sz w:val="22"/>
         </w:rPr>
-        <w:t>Rhyme &amp; Sound tab</w:t>
+        <w:t>Sound &amp; Form: Rhyme &amp; Recurring Sound section</w:t>
       </w:r>
     </w:p>
     <w:p>
@@ -10022,7 +10293,7 @@
           <w:rFonts w:ascii="Calibri" w:hAnsi="Calibri"/>
           <w:sz w:val="22"/>
         </w:rPr>
-        <w:t>Lexical Style tab</w:t>
+        <w:t>Structure: Lexical and Structural Measures section</w:t>
       </w:r>
     </w:p>
     <w:p>
@@ -10088,7 +10359,7 @@
           <w:rFonts w:ascii="Calibri" w:hAnsi="Calibri"/>
           <w:sz w:val="22"/>
         </w:rPr>
-        <w:t>PoetryID tab</w:t>
+        <w:t>Affective Evidence: PoetryID section</w:t>
       </w:r>
     </w:p>
     <w:p>
@@ -10341,7 +10612,7 @@
           <w:rFonts w:ascii="Calibri" w:hAnsi="Calibri"/>
           <w:sz w:val="22"/>
         </w:rPr>
-        <w:t>Evidence tab</w:t>
+        <w:t>Evidence &amp; Diagnostics</w:t>
       </w:r>
     </w:p>
     <w:p>
@@ -10379,7 +10650,7 @@
           <w:rFonts w:ascii="Calibri" w:hAnsi="Calibri"/>
           <w:sz w:val="22"/>
         </w:rPr>
-        <w:t>Downloads tab</w:t>
+        <w:t>Export &amp; Help: Export Report and Data</w:t>
       </w:r>
     </w:p>
     <w:p>
@@ -10459,7 +10730,7 @@
           <w:rFonts w:ascii="Calibri" w:hAnsi="Calibri"/>
           <w:sz w:val="22"/>
         </w:rPr>
-        <w:t>One-poem results are temporary, so download anything you need before closing the application.</w:t>
+        <w:t>Single-text results are temporary, so download anything you need before closing the application.</w:t>
       </w:r>
     </w:p>
     <w:p>
@@ -10471,7 +10742,7 @@
           <w:rFonts w:ascii="Calibri" w:hAnsi="Calibri"/>
           <w:sz w:val="22"/>
         </w:rPr>
-        <w:t>How to Read tab</w:t>
+        <w:t>Export &amp; Help: Methodology and How to Read</w:t>
       </w:r>
     </w:p>
     <w:p>
@@ -10484,7 +10755,7 @@
           <w:rFonts w:ascii="Calibri" w:hAnsi="Calibri"/>
           <w:sz w:val="22"/>
         </w:rPr>
-        <w:t>Use this tab as an in-application reminder of the recommended reading order, terminology, and scholarly limits.</w:t>
+        <w:t>Use this section as an in-application reminder of the recommended reading order, terminology, and scholarly limits.</w:t>
       </w:r>
     </w:p>
     <w:p>
@@ -10496,7 +10767,7 @@
           <w:rFonts w:ascii="Calibri" w:hAnsi="Calibri"/>
           <w:sz w:val="22"/>
         </w:rPr>
-        <w:t>9. Projects &amp; Corpus Workspace</w:t>
+        <w:t>9. Project / Corpus Workspace</w:t>
       </w:r>
     </w:p>
     <w:p>
@@ -10529,7 +10800,7 @@
           <w:b/>
           <w:sz w:val="22"/>
         </w:rPr>
-        <w:t>Projects &amp; Corpus</w:t>
+        <w:t>Project / Corpus</w:t>
       </w:r>
       <w:r>
         <w:rPr>
@@ -10567,6 +10838,19 @@
           <w:sz w:val="22"/>
         </w:rPr>
         <w:t xml:space="preserve"> unless an alternate database path is configured.</w:t>
+      </w:r>
+    </w:p>
+    <w:p>
+      <w:pPr>
+        <w:widowControl/>
+        <w:spacing w:before="0" w:after="120" w:line="300" w:lineRule="auto"/>
+      </w:pPr>
+      <w:r>
+        <w:rPr>
+          <w:rFonts w:ascii="Calibri" w:hAnsi="Calibri"/>
+          <w:sz w:val="22"/>
+        </w:rPr>
+        <w:t>After selecting a project, the status header shows active-work count, repository schema, researcher, last-modified date, and local-save context.</w:t>
       </w:r>
     </w:p>
     <w:p>
@@ -10872,7 +11156,22 @@
           <w:rFonts w:ascii="Calibri" w:hAnsi="Calibri"/>
           <w:sz w:val="22"/>
         </w:rPr>
-        <w:t>Metadata filters affect presentation and grouping, not lexical scores.</w:t>
+        <w:t xml:space="preserve">Metadata filters affect presentation and grouping, not lexical scores. The work list can be searched across title, author, collection, and date, then filtered by author or collection. Its </w:t>
+      </w:r>
+      <w:r>
+        <w:rPr>
+          <w:rFonts w:ascii="Calibri" w:hAnsi="Calibri"/>
+          <w:b/>
+          <w:sz w:val="22"/>
+        </w:rPr>
+        <w:t>Analysis status</w:t>
+      </w:r>
+      <w:r>
+        <w:rPr>
+          <w:rFonts w:ascii="Calibri" w:hAnsi="Calibri"/>
+          <w:sz w:val="22"/>
+        </w:rPr>
+        <w:t xml:space="preserve"> column distinguishes Not run, Complete, and Complete with warnings. Column headers provide sorting.</w:t>
       </w:r>
     </w:p>
     <w:p>
@@ -10948,7 +11247,7 @@
           <w:rFonts w:ascii="Calibri" w:hAnsi="Calibri"/>
           <w:sz w:val="22"/>
         </w:rPr>
-        <w:t xml:space="preserve">Select affective lexicons and/or </w:t>
+        <w:t xml:space="preserve">Leave the corpus preset at </w:t>
       </w:r>
       <w:r>
         <w:rPr>
@@ -10956,14 +11255,27 @@
           <w:b/>
           <w:sz w:val="22"/>
         </w:rPr>
-        <w:t>Additional analysis modules</w:t>
-      </w:r>
-      <w:r>
-        <w:rPr>
-          <w:rFonts w:ascii="Calibri" w:hAnsi="Calibri"/>
-          <w:sz w:val="22"/>
-        </w:rPr>
-        <w:t>.</w:t>
+        <w:t>Custom</w:t>
+      </w:r>
+      <w:r>
+        <w:rPr>
+          <w:rFonts w:ascii="Calibri" w:hAnsi="Calibri"/>
+          <w:sz w:val="22"/>
+        </w:rPr>
+        <w:t>, or choose and explicitly apply</w:t>
+      </w:r>
+    </w:p>
+    <w:p>
+      <w:pPr>
+        <w:widowControl/>
+        <w:spacing w:before="0" w:after="120" w:line="300" w:lineRule="auto"/>
+      </w:pPr>
+      <w:r>
+        <w:rPr>
+          <w:rFonts w:ascii="Calibri" w:hAnsi="Calibri"/>
+          <w:sz w:val="22"/>
+        </w:rPr>
+        <w:t xml:space="preserve">   Essential, Literary, Sound and Form, or Complete.</w:t>
       </w:r>
     </w:p>
     <w:p>
@@ -10981,7 +11293,22 @@
           <w:rFonts w:ascii="Calibri" w:hAnsi="Calibri"/>
           <w:sz w:val="22"/>
         </w:rPr>
-        <w:t>Choose phrase and sparse-result settings.</w:t>
+        <w:t xml:space="preserve">Select affective lexicons and/or </w:t>
+      </w:r>
+      <w:r>
+        <w:rPr>
+          <w:rFonts w:ascii="Calibri" w:hAnsi="Calibri"/>
+          <w:b/>
+          <w:sz w:val="22"/>
+        </w:rPr>
+        <w:t>Additional analysis modules</w:t>
+      </w:r>
+      <w:r>
+        <w:rPr>
+          <w:rFonts w:ascii="Calibri" w:hAnsi="Calibri"/>
+          <w:sz w:val="22"/>
+        </w:rPr>
+        <w:t>.</w:t>
       </w:r>
     </w:p>
     <w:p>
@@ -10999,35 +11326,7 @@
           <w:rFonts w:ascii="Calibri" w:hAnsi="Calibri"/>
           <w:sz w:val="22"/>
         </w:rPr>
-        <w:t>For Frequency or AoA, optionally enable the non-default content-word-only</w:t>
-      </w:r>
-    </w:p>
-    <w:p>
-      <w:pPr>
-        <w:widowControl/>
-        <w:spacing w:before="0" w:after="120" w:line="300" w:lineRule="auto"/>
-      </w:pPr>
-      <w:r>
-        <w:rPr>
-          <w:rFonts w:ascii="Calibri" w:hAnsi="Calibri"/>
-          <w:sz w:val="22"/>
-        </w:rPr>
-        <w:t xml:space="preserve">   scope under </w:t>
-      </w:r>
-      <w:r>
-        <w:rPr>
-          <w:rFonts w:ascii="Calibri" w:hAnsi="Calibri"/>
-          <w:b/>
-          <w:sz w:val="22"/>
-        </w:rPr>
-        <w:t>Advanced batch methodology</w:t>
-      </w:r>
-      <w:r>
-        <w:rPr>
-          <w:rFonts w:ascii="Calibri" w:hAnsi="Calibri"/>
-          <w:sz w:val="22"/>
-        </w:rPr>
-        <w:t>.</w:t>
+        <w:t>Choose phrase and sparse-result settings.</w:t>
       </w:r>
     </w:p>
     <w:p>
@@ -11045,7 +11344,35 @@
           <w:rFonts w:ascii="Calibri" w:hAnsi="Calibri"/>
           <w:sz w:val="22"/>
         </w:rPr>
-        <w:t>Choose the stopword policy.</w:t>
+        <w:t>For Frequency or AoA, optionally enable the non-default content-word-only</w:t>
+      </w:r>
+    </w:p>
+    <w:p>
+      <w:pPr>
+        <w:widowControl/>
+        <w:spacing w:before="0" w:after="120" w:line="300" w:lineRule="auto"/>
+      </w:pPr>
+      <w:r>
+        <w:rPr>
+          <w:rFonts w:ascii="Calibri" w:hAnsi="Calibri"/>
+          <w:sz w:val="22"/>
+        </w:rPr>
+        <w:t xml:space="preserve">   scope under </w:t>
+      </w:r>
+      <w:r>
+        <w:rPr>
+          <w:rFonts w:ascii="Calibri" w:hAnsi="Calibri"/>
+          <w:b/>
+          <w:sz w:val="22"/>
+        </w:rPr>
+        <w:t>Advanced batch methodology</w:t>
+      </w:r>
+      <w:r>
+        <w:rPr>
+          <w:rFonts w:ascii="Calibri" w:hAnsi="Calibri"/>
+          <w:sz w:val="22"/>
+        </w:rPr>
+        <w:t>.</w:t>
       </w:r>
     </w:p>
     <w:p>
@@ -11063,22 +11390,7 @@
           <w:rFonts w:ascii="Calibri" w:hAnsi="Calibri"/>
           <w:sz w:val="22"/>
         </w:rPr>
-        <w:t xml:space="preserve">Choose </w:t>
-      </w:r>
-      <w:r>
-        <w:rPr>
-          <w:rFonts w:ascii="Calibri" w:hAnsi="Calibri"/>
-          <w:b/>
-          <w:sz w:val="22"/>
-        </w:rPr>
-        <w:t>Unreviewed baseline</w:t>
-      </w:r>
-      <w:r>
-        <w:rPr>
-          <w:rFonts w:ascii="Calibri" w:hAnsi="Calibri"/>
-          <w:sz w:val="22"/>
-        </w:rPr>
-        <w:t xml:space="preserve"> or an exact named review-scenario version.</w:t>
+        <w:t>Choose the stopword policy.</w:t>
       </w:r>
     </w:p>
     <w:p>
@@ -11096,6 +11408,39 @@
           <w:rFonts w:ascii="Calibri" w:hAnsi="Calibri"/>
           <w:sz w:val="22"/>
         </w:rPr>
+        <w:t xml:space="preserve">Choose </w:t>
+      </w:r>
+      <w:r>
+        <w:rPr>
+          <w:rFonts w:ascii="Calibri" w:hAnsi="Calibri"/>
+          <w:b/>
+          <w:sz w:val="22"/>
+        </w:rPr>
+        <w:t>Unreviewed baseline</w:t>
+      </w:r>
+      <w:r>
+        <w:rPr>
+          <w:rFonts w:ascii="Calibri" w:hAnsi="Calibri"/>
+          <w:sz w:val="22"/>
+        </w:rPr>
+        <w:t xml:space="preserve"> or an exact named review-scenario version.</w:t>
+      </w:r>
+    </w:p>
+    <w:p>
+      <w:pPr>
+        <w:widowControl/>
+        <w:numPr>
+          <w:ilvl w:val="0"/>
+          <w:numId w:val="17"/>
+        </w:numPr>
+        <w:spacing w:before="0" w:after="80" w:line="300" w:lineRule="auto"/>
+        <w:ind w:left="540" w:hanging="271"/>
+      </w:pPr>
+      <w:r>
+        <w:rPr>
+          <w:rFonts w:ascii="Calibri" w:hAnsi="Calibri"/>
+          <w:sz w:val="22"/>
+        </w:rPr>
         <w:t xml:space="preserve">Click </w:t>
       </w:r>
       <w:r>
@@ -11104,7 +11449,7 @@
           <w:b/>
           <w:sz w:val="22"/>
         </w:rPr>
-        <w:t>Analyze selected works</w:t>
+        <w:t>Analyze Corpus</w:t>
       </w:r>
       <w:r>
         <w:rPr>
@@ -11137,7 +11482,7 @@
           <w:rFonts w:ascii="Calibri" w:hAnsi="Calibri"/>
           <w:sz w:val="22"/>
         </w:rPr>
-        <w:t>Additional modules are off by default because pronunciation, meter, and rhyme can add substantial processing time to a large collection. Selecting meter or rhyme automatically includes the pronunciation dependency. The corpus path calls the same tested modules as One Poem and does not duplicate their calculations.</w:t>
+        <w:t>Additional modules are off by default because pronunciation, meter, and rhyme can add substantial processing time to a large collection. Selecting meter or rhyme automatically includes the pronunciation dependency. The corpus path calls the same tested modules as Single Poem and does not duplicate their calculations.</w:t>
       </w:r>
     </w:p>
     <w:p>
@@ -25411,7 +25756,7 @@
         <w:color w:val="66727C"/>
         <w:sz w:val="18"/>
       </w:rPr>
-      <w:t xml:space="preserve">  |  0.16.0.dev0</w:t>
+      <w:t xml:space="preserve">  |  0.17.0.dev0</w:t>
     </w:r>
   </w:p>
 </w:hdr>

</xml_diff>

<commit_message>
Complete Stage 14 and prepare GPL release
</commit_message>
<xml_diff>
--- a/docs/VerseVAD_User_Manual.docx
+++ b/docs/VerseVAD_User_Manual.docx
@@ -47,7 +47,7 @@
           <w:color w:val="66727C"/>
           <w:sz w:val="21"/>
         </w:rPr>
-        <w:t xml:space="preserve"> 0.17.0.dev0</w:t>
+        <w:t xml:space="preserve"> 0.18.0.dev0</w:t>
       </w:r>
       <w:r>
         <w:rPr>
@@ -98,78 +98,44 @@
         <w:t xml:space="preserve"> A first-time user who needs no programming, linguistics, or statistics background</w:t>
       </w:r>
     </w:p>
-    <w:tbl>
-      <w:tblPr>
-        <w:tblStyle w:val="TableGrid"/>
-        <w:tblW w:type="dxa" w:w="9360"/>
-        <w:jc w:val="left"/>
-        <w:tblLayout w:type="fixed"/>
-        <w:tblLook w:firstColumn="1" w:firstRow="1" w:lastColumn="0" w:lastRow="0" w:noHBand="0" w:noVBand="1" w:val="04A0"/>
-        <w:tblInd w:w="120" w:type="dxa"/>
-        <w:tblBorders>
-          <w:top w:val="single" w:sz="5" w:space="0" w:color="D7DEE5"/>
-          <w:left w:val="single" w:sz="5" w:space="0" w:color="D7DEE5"/>
-          <w:bottom w:val="single" w:sz="5" w:space="0" w:color="D7DEE5"/>
-          <w:right w:val="single" w:sz="5" w:space="0" w:color="D7DEE5"/>
-          <w:insideH w:val="single" w:sz="5" w:space="0" w:color="D7DEE5"/>
-          <w:insideV w:val="single" w:sz="5" w:space="0" w:color="D7DEE5"/>
-        </w:tblBorders>
-      </w:tblPr>
-      <w:tblGrid>
-        <w:gridCol w:w="9360"/>
-      </w:tblGrid>
-      <w:tr>
-        <w:tc>
-          <w:tcPr>
-            <w:tcW w:type="dxa" w:w="9360"/>
-            <w:vAlign w:val="center"/>
-            <w:tcMar>
-              <w:top w:w="80" w:type="dxa"/>
-              <w:bottom w:w="80" w:type="dxa"/>
-              <w:start w:w="120" w:type="dxa"/>
-              <w:end w:w="120" w:type="dxa"/>
-            </w:tcMar>
-            <w:shd w:fill="F4F6F9"/>
-          </w:tcPr>
-          <w:p>
-            <w:pPr>
-              <w:widowControl/>
-              <w:spacing w:before="0" w:after="0" w:line="276" w:lineRule="auto"/>
-            </w:pPr>
-            <w:r>
-              <w:rPr>
-                <w:rFonts w:ascii="Calibri" w:hAnsi="Calibri"/>
-                <w:color w:val="193247"/>
-                <w:sz w:val="22"/>
-              </w:rPr>
-              <w:t xml:space="preserve">IMPORTANT: VerseVAD describes </w:t>
-            </w:r>
-            <w:r>
-              <w:rPr>
-                <w:rFonts w:ascii="Calibri" w:hAnsi="Calibri"/>
-                <w:b/>
-                <w:color w:val="193247"/>
-                <w:sz w:val="22"/>
-              </w:rPr>
-              <w:t>lexical evidence</w:t>
-            </w:r>
-            <w:r>
-              <w:rPr>
-                <w:rFonts w:ascii="Calibri" w:hAnsi="Calibri"/>
-                <w:color w:val="193247"/>
-                <w:sz w:val="22"/>
-              </w:rPr>
-              <w:t>, optional dictionary-based pronunciation evidence, transparent candidate-meter comparisons, phonological patterns, lexical-style counts, and PoetryID candidate lexical-affective neighborhoods. Concreteness, corpus-relative frequency, retrospective Age of Acquisition, pronunciation/lexical stress, meter fit, rhyme/sound evidence, lexical diversity, word length, structural word counts, and PoetryID remain separately documented constructs. VerseVAD does not determine the emotion of a poem, speaker, author, or reader, diagnose cognition, establish definitive meter or performed rhythm, or replace contextual close reading.</w:t>
-            </w:r>
-          </w:p>
-        </w:tc>
-      </w:tr>
-    </w:tbl>
-    <w:p>
-      <w:pPr>
-        <w:widowControl/>
-        <w:spacing w:before="0" w:after="40" w:line="240" w:lineRule="auto"/>
-      </w:pPr>
+    <w:p>
+      <w:pPr>
+        <w:widowControl/>
+        <w:spacing w:before="80" w:after="120" w:line="276" w:lineRule="auto"/>
+        <w:ind w:left="173" w:right="173"/>
+        <w:shd w:fill="F4F6F9"/>
+        <w:pBdr>
+          <w:top w:val="single" w:sz="5" w:space="5" w:color="D7DEE5"/>
+          <w:left w:val="single" w:sz="5" w:space="5" w:color="D7DEE5"/>
+          <w:bottom w:val="single" w:sz="5" w:space="5" w:color="D7DEE5"/>
+          <w:right w:val="single" w:sz="5" w:space="5" w:color="D7DEE5"/>
+        </w:pBdr>
+      </w:pPr>
+      <w:r>
+        <w:rPr>
+          <w:rFonts w:ascii="Calibri" w:hAnsi="Calibri"/>
+          <w:color w:val="193247"/>
+          <w:sz w:val="22"/>
+        </w:rPr>
+        <w:t xml:space="preserve">IMPORTANT: VerseVAD describes </w:t>
+      </w:r>
+      <w:r>
+        <w:rPr>
+          <w:rFonts w:ascii="Calibri" w:hAnsi="Calibri"/>
+          <w:b/>
+          <w:color w:val="193247"/>
+          <w:sz w:val="22"/>
+        </w:rPr>
+        <w:t>lexical evidence</w:t>
+      </w:r>
+      <w:r>
+        <w:rPr>
+          <w:rFonts w:ascii="Calibri" w:hAnsi="Calibri"/>
+          <w:color w:val="193247"/>
+          <w:sz w:val="22"/>
+        </w:rPr>
+        <w:t>, optional dictionary-based pronunciation evidence, transparent candidate-meter comparisons, phonological patterns, lexical-style counts, and PoetryID candidate lexical-affective neighborhoods. Concreteness, corpus-relative frequency, retrospective Age of Acquisition, pronunciation/lexical stress, meter fit, rhyme/sound evidence, lexical diversity, word length, structural word counts, and PoetryID remain separately documented constructs. VerseVAD does not determine the emotion of a poem, speaker, author, or reader, diagnose cognition, establish definitive meter or performed rhythm, or replace contextual close reading.</w:t>
+      </w:r>
     </w:p>
     <w:p>
       <w:r>
@@ -458,196 +424,162 @@
         <w:t>Reproducibility and updating this manual</w:t>
       </w:r>
     </w:p>
-    <w:tbl>
-      <w:tblPr>
-        <w:tblStyle w:val="TableGrid"/>
-        <w:tblW w:type="dxa" w:w="9360"/>
-        <w:jc w:val="left"/>
-        <w:tblLayout w:type="fixed"/>
-        <w:tblLook w:firstColumn="1" w:firstRow="1" w:lastColumn="0" w:lastRow="0" w:noHBand="0" w:noVBand="1" w:val="04A0"/>
-        <w:tblInd w:w="120" w:type="dxa"/>
-        <w:tblBorders>
-          <w:top w:val="single" w:sz="5" w:space="0" w:color="D7DEE5"/>
-          <w:left w:val="single" w:sz="5" w:space="0" w:color="D7DEE5"/>
-          <w:bottom w:val="single" w:sz="5" w:space="0" w:color="D7DEE5"/>
-          <w:right w:val="single" w:sz="5" w:space="0" w:color="D7DEE5"/>
-          <w:insideH w:val="single" w:sz="5" w:space="0" w:color="D7DEE5"/>
-          <w:insideV w:val="single" w:sz="5" w:space="0" w:color="D7DEE5"/>
-        </w:tblBorders>
-      </w:tblPr>
-      <w:tblGrid>
-        <w:gridCol w:w="9360"/>
-      </w:tblGrid>
-      <w:tr>
-        <w:tc>
-          <w:tcPr>
-            <w:tcW w:type="dxa" w:w="9360"/>
-            <w:vAlign w:val="center"/>
-            <w:tcMar>
-              <w:top w:w="80" w:type="dxa"/>
-              <w:bottom w:w="80" w:type="dxa"/>
-              <w:start w:w="120" w:type="dxa"/>
-              <w:end w:w="120" w:type="dxa"/>
-            </w:tcMar>
-            <w:shd w:fill="F4F6F9"/>
-          </w:tcPr>
-          <w:p>
-            <w:pPr>
-              <w:widowControl/>
-              <w:spacing w:before="0" w:after="0" w:line="276" w:lineRule="auto"/>
-            </w:pPr>
-            <w:r>
-              <w:rPr>
-                <w:rFonts w:ascii="Calibri" w:hAnsi="Calibri"/>
-                <w:color w:val="193247"/>
-                <w:sz w:val="22"/>
-              </w:rPr>
-              <w:t xml:space="preserve">QUICK ORIENTATION: Read </w:t>
-            </w:r>
-            <w:r>
-              <w:rPr>
-                <w:rFonts w:ascii="Calibri" w:hAnsi="Calibri"/>
-                <w:b/>
-                <w:color w:val="193247"/>
-                <w:sz w:val="22"/>
-              </w:rPr>
-              <w:t>Overview</w:t>
-            </w:r>
-            <w:r>
-              <w:rPr>
-                <w:rFonts w:ascii="Calibri" w:hAnsi="Calibri"/>
-                <w:color w:val="193247"/>
-                <w:sz w:val="22"/>
-              </w:rPr>
-              <w:t xml:space="preserve"> first, then use the seven report families: </w:t>
-            </w:r>
-            <w:r>
-              <w:rPr>
-                <w:rFonts w:ascii="Calibri" w:hAnsi="Calibri"/>
-                <w:b/>
-                <w:color w:val="193247"/>
-                <w:sz w:val="22"/>
-              </w:rPr>
-              <w:t>Affective Evidence</w:t>
-            </w:r>
-            <w:r>
-              <w:rPr>
-                <w:rFonts w:ascii="Calibri" w:hAnsi="Calibri"/>
-                <w:color w:val="193247"/>
-                <w:sz w:val="22"/>
-              </w:rPr>
-              <w:t xml:space="preserve">, </w:t>
-            </w:r>
-            <w:r>
-              <w:rPr>
-                <w:rFonts w:ascii="Calibri" w:hAnsi="Calibri"/>
-                <w:b/>
-                <w:color w:val="193247"/>
-                <w:sz w:val="22"/>
-              </w:rPr>
-              <w:t>Lexical Character</w:t>
-            </w:r>
-            <w:r>
-              <w:rPr>
-                <w:rFonts w:ascii="Calibri" w:hAnsi="Calibri"/>
-                <w:color w:val="193247"/>
-                <w:sz w:val="22"/>
-              </w:rPr>
-              <w:t xml:space="preserve">, </w:t>
-            </w:r>
-            <w:r>
-              <w:rPr>
-                <w:rFonts w:ascii="Calibri" w:hAnsi="Calibri"/>
-                <w:b/>
-                <w:color w:val="193247"/>
-                <w:sz w:val="22"/>
-              </w:rPr>
-              <w:t>Sound &amp; Form</w:t>
-            </w:r>
-            <w:r>
-              <w:rPr>
-                <w:rFonts w:ascii="Calibri" w:hAnsi="Calibri"/>
-                <w:color w:val="193247"/>
-                <w:sz w:val="22"/>
-              </w:rPr>
-              <w:t xml:space="preserve">, </w:t>
-            </w:r>
-            <w:r>
-              <w:rPr>
-                <w:rFonts w:ascii="Calibri" w:hAnsi="Calibri"/>
-                <w:b/>
-                <w:color w:val="193247"/>
-                <w:sz w:val="22"/>
-              </w:rPr>
-              <w:t>Structure</w:t>
-            </w:r>
-            <w:r>
-              <w:rPr>
-                <w:rFonts w:ascii="Calibri" w:hAnsi="Calibri"/>
-                <w:color w:val="193247"/>
-                <w:sz w:val="22"/>
-              </w:rPr>
-              <w:t xml:space="preserve">, </w:t>
-            </w:r>
-            <w:r>
-              <w:rPr>
-                <w:rFonts w:ascii="Calibri" w:hAnsi="Calibri"/>
-                <w:b/>
-                <w:color w:val="193247"/>
-                <w:sz w:val="22"/>
-              </w:rPr>
-              <w:t>Evidence &amp; Diagnostics</w:t>
-            </w:r>
-            <w:r>
-              <w:rPr>
-                <w:rFonts w:ascii="Calibri" w:hAnsi="Calibri"/>
-                <w:color w:val="193247"/>
-                <w:sz w:val="22"/>
-              </w:rPr>
-              <w:t xml:space="preserve">, and </w:t>
-            </w:r>
-            <w:r>
-              <w:rPr>
-                <w:rFonts w:ascii="Calibri" w:hAnsi="Calibri"/>
-                <w:b/>
-                <w:color w:val="193247"/>
-                <w:sz w:val="22"/>
-              </w:rPr>
-              <w:t>Export &amp; Help</w:t>
-            </w:r>
-            <w:r>
-              <w:rPr>
-                <w:rFonts w:ascii="Calibri" w:hAnsi="Calibri"/>
-                <w:color w:val="193247"/>
-                <w:sz w:val="22"/>
-              </w:rPr>
-              <w:t xml:space="preserve">. Each analytical module is a large collapsible section with a visible status. Download the readable summary for ordinary review and the full audit bundle when you need reproducibility. If a term is unfamiliar, use the separate </w:t>
-            </w:r>
-            <w:r>
-              <w:rPr>
-                <w:rFonts w:ascii="Consolas" w:hAnsi="Consolas"/>
-                <w:color w:val="193247"/>
-                <w:sz w:val="19"/>
-              </w:rPr>
-              <w:t>VerseVAD_Values_and_Terminology_Guide.docx</w:t>
-            </w:r>
-            <w:r>
-              <w:rPr>
-                <w:rFonts w:ascii="Calibri" w:hAnsi="Calibri"/>
-                <w:color w:val="193247"/>
-                <w:sz w:val="22"/>
-              </w:rPr>
-              <w:t>, which includes plain-language definitions, formulas, worked examples, and reporting templates.</w:t>
-            </w:r>
-          </w:p>
-        </w:tc>
-      </w:tr>
-    </w:tbl>
-    <w:p>
-      <w:pPr>
-        <w:widowControl/>
-        <w:spacing w:before="0" w:after="40" w:line="240" w:lineRule="auto"/>
-      </w:pPr>
+    <w:p>
+      <w:pPr>
+        <w:widowControl/>
+        <w:spacing w:before="80" w:after="120" w:line="276" w:lineRule="auto"/>
+        <w:ind w:left="173" w:right="173"/>
+        <w:shd w:fill="F4F6F9"/>
+        <w:pBdr>
+          <w:top w:val="single" w:sz="5" w:space="5" w:color="D7DEE5"/>
+          <w:left w:val="single" w:sz="5" w:space="5" w:color="D7DEE5"/>
+          <w:bottom w:val="single" w:sz="5" w:space="5" w:color="D7DEE5"/>
+          <w:right w:val="single" w:sz="5" w:space="5" w:color="D7DEE5"/>
+        </w:pBdr>
+      </w:pPr>
+      <w:r>
+        <w:rPr>
+          <w:rFonts w:ascii="Calibri" w:hAnsi="Calibri"/>
+          <w:color w:val="193247"/>
+          <w:sz w:val="22"/>
+        </w:rPr>
+        <w:t xml:space="preserve">QUICK ORIENTATION: Read </w:t>
+      </w:r>
+      <w:r>
+        <w:rPr>
+          <w:rFonts w:ascii="Calibri" w:hAnsi="Calibri"/>
+          <w:b/>
+          <w:color w:val="193247"/>
+          <w:sz w:val="22"/>
+        </w:rPr>
+        <w:t>Overview</w:t>
+      </w:r>
+      <w:r>
+        <w:rPr>
+          <w:rFonts w:ascii="Calibri" w:hAnsi="Calibri"/>
+          <w:color w:val="193247"/>
+          <w:sz w:val="22"/>
+        </w:rPr>
+        <w:t xml:space="preserve"> first, then use the seven report families: </w:t>
+      </w:r>
+      <w:r>
+        <w:rPr>
+          <w:rFonts w:ascii="Calibri" w:hAnsi="Calibri"/>
+          <w:b/>
+          <w:color w:val="193247"/>
+          <w:sz w:val="22"/>
+        </w:rPr>
+        <w:t>Affective Evidence</w:t>
+      </w:r>
+      <w:r>
+        <w:rPr>
+          <w:rFonts w:ascii="Calibri" w:hAnsi="Calibri"/>
+          <w:color w:val="193247"/>
+          <w:sz w:val="22"/>
+        </w:rPr>
+        <w:t xml:space="preserve">, </w:t>
+      </w:r>
+      <w:r>
+        <w:rPr>
+          <w:rFonts w:ascii="Calibri" w:hAnsi="Calibri"/>
+          <w:b/>
+          <w:color w:val="193247"/>
+          <w:sz w:val="22"/>
+        </w:rPr>
+        <w:t>Lexical Character</w:t>
+      </w:r>
+      <w:r>
+        <w:rPr>
+          <w:rFonts w:ascii="Calibri" w:hAnsi="Calibri"/>
+          <w:color w:val="193247"/>
+          <w:sz w:val="22"/>
+        </w:rPr>
+        <w:t xml:space="preserve">, </w:t>
+      </w:r>
+      <w:r>
+        <w:rPr>
+          <w:rFonts w:ascii="Calibri" w:hAnsi="Calibri"/>
+          <w:b/>
+          <w:color w:val="193247"/>
+          <w:sz w:val="22"/>
+        </w:rPr>
+        <w:t>Sound &amp; Form</w:t>
+      </w:r>
+      <w:r>
+        <w:rPr>
+          <w:rFonts w:ascii="Calibri" w:hAnsi="Calibri"/>
+          <w:color w:val="193247"/>
+          <w:sz w:val="22"/>
+        </w:rPr>
+        <w:t xml:space="preserve">, </w:t>
+      </w:r>
+      <w:r>
+        <w:rPr>
+          <w:rFonts w:ascii="Calibri" w:hAnsi="Calibri"/>
+          <w:b/>
+          <w:color w:val="193247"/>
+          <w:sz w:val="22"/>
+        </w:rPr>
+        <w:t>Structure</w:t>
+      </w:r>
+      <w:r>
+        <w:rPr>
+          <w:rFonts w:ascii="Calibri" w:hAnsi="Calibri"/>
+          <w:color w:val="193247"/>
+          <w:sz w:val="22"/>
+        </w:rPr>
+        <w:t xml:space="preserve">, </w:t>
+      </w:r>
+      <w:r>
+        <w:rPr>
+          <w:rFonts w:ascii="Calibri" w:hAnsi="Calibri"/>
+          <w:b/>
+          <w:color w:val="193247"/>
+          <w:sz w:val="22"/>
+        </w:rPr>
+        <w:t>Evidence &amp; Diagnostics</w:t>
+      </w:r>
+      <w:r>
+        <w:rPr>
+          <w:rFonts w:ascii="Calibri" w:hAnsi="Calibri"/>
+          <w:color w:val="193247"/>
+          <w:sz w:val="22"/>
+        </w:rPr>
+        <w:t xml:space="preserve">, and </w:t>
+      </w:r>
+      <w:r>
+        <w:rPr>
+          <w:rFonts w:ascii="Calibri" w:hAnsi="Calibri"/>
+          <w:b/>
+          <w:color w:val="193247"/>
+          <w:sz w:val="22"/>
+        </w:rPr>
+        <w:t>Export &amp; Help</w:t>
+      </w:r>
+      <w:r>
+        <w:rPr>
+          <w:rFonts w:ascii="Calibri" w:hAnsi="Calibri"/>
+          <w:color w:val="193247"/>
+          <w:sz w:val="22"/>
+        </w:rPr>
+        <w:t xml:space="preserve">. Each analytical module is a large collapsible section with a visible status. Download the readable summary for ordinary review and the full audit bundle when you need reproducibility. If a term is unfamiliar, use the separate </w:t>
+      </w:r>
+      <w:r>
+        <w:rPr>
+          <w:rFonts w:ascii="Consolas" w:hAnsi="Consolas"/>
+          <w:color w:val="193247"/>
+          <w:sz w:val="19"/>
+        </w:rPr>
+        <w:t>VerseVAD_Values_and_Terminology_Guide.docx</w:t>
+      </w:r>
+      <w:r>
+        <w:rPr>
+          <w:rFonts w:ascii="Calibri" w:hAnsi="Calibri"/>
+          <w:color w:val="193247"/>
+          <w:sz w:val="22"/>
+        </w:rPr>
+        <w:t>, which includes plain-language definitions, formulas, worked examples, and reporting templates.</w:t>
+      </w:r>
     </w:p>
     <w:p>
       <w:pPr>
@@ -1054,7 +986,7 @@
           <w:rFonts w:ascii="Calibri" w:hAnsi="Calibri"/>
           <w:sz w:val="22"/>
         </w:rPr>
-        <w:t xml:space="preserve">  from monometer through octameter, line fit, deviations, alternatives,   coverage, and a complete alignment audit; and</w:t>
+        <w:t xml:space="preserve">  from monometer through octameter, line fit, deviations, alternatives,   coverage, and a complete alignment audit, plus an optional separate   performance-aware realization layer with contextual prominence, phrasing,   substitutions, stanza recurrence, alternate readings, and scholar   revisions; and</w:t>
       </w:r>
     </w:p>
     <w:p>
@@ -1242,6 +1174,362 @@
     </w:p>
     <w:p>
       <w:pPr>
+        <w:pStyle w:val="Heading2"/>
+      </w:pPr>
+      <w:r>
+        <w:rPr>
+          <w:rFonts w:ascii="Calibri" w:hAnsi="Calibri"/>
+          <w:sz w:val="22"/>
+        </w:rPr>
+        <w:t>Software and research-source licensing</w:t>
+      </w:r>
+    </w:p>
+    <w:p>
+      <w:pPr>
+        <w:widowControl/>
+        <w:spacing w:before="0" w:after="120" w:line="300" w:lineRule="auto"/>
+      </w:pPr>
+      <w:r>
+        <w:rPr>
+          <w:rFonts w:ascii="Calibri" w:hAnsi="Calibri"/>
+          <w:sz w:val="22"/>
+        </w:rPr>
+        <w:t xml:space="preserve">VerseVAD code and documentation are free and open-source software under </w:t>
+      </w:r>
+      <w:r>
+        <w:rPr>
+          <w:rFonts w:ascii="Consolas" w:hAnsi="Consolas"/>
+          <w:color w:val="1F4D78"/>
+          <w:sz w:val="19"/>
+        </w:rPr>
+        <w:t>GPL-3.0-only</w:t>
+      </w:r>
+      <w:r>
+        <w:rPr>
+          <w:rFonts w:ascii="Calibri" w:hAnsi="Calibri"/>
+          <w:sz w:val="22"/>
+        </w:rPr>
+        <w:t xml:space="preserve">. The GPL permits educational, research, personal, and commercial use of VerseVAD, subject to its source-distribution and copyleft conditions. VerseVAD is supplied without warranty; the full terms are in </w:t>
+      </w:r>
+      <w:r>
+        <w:rPr>
+          <w:rFonts w:ascii="Consolas" w:hAnsi="Consolas"/>
+          <w:color w:val="1F4D78"/>
+          <w:sz w:val="19"/>
+        </w:rPr>
+        <w:t>LICENSE</w:t>
+      </w:r>
+      <w:r>
+        <w:rPr>
+          <w:rFonts w:ascii="Calibri" w:hAnsi="Calibri"/>
+          <w:sz w:val="22"/>
+        </w:rPr>
+        <w:t>.</w:t>
+      </w:r>
+    </w:p>
+    <w:p>
+      <w:pPr>
+        <w:widowControl/>
+        <w:spacing w:before="0" w:after="120" w:line="300" w:lineRule="auto"/>
+      </w:pPr>
+      <w:r>
+        <w:rPr>
+          <w:rFonts w:ascii="Calibri" w:hAnsi="Calibri"/>
+          <w:sz w:val="22"/>
+        </w:rPr>
+        <w:t>The GPL does not relicense the lexicons, workbooks, papers, language model, or literary texts used with VerseVAD. A public VerseVAD checkout contains no research datasets. Users must obtain each source from its creator or publisher, follow its current terms, and must not assume that a permission applying to the software also applies to the data.</w:t>
+      </w:r>
+    </w:p>
+    <w:p>
+      <w:pPr>
+        <w:pStyle w:val="Heading2"/>
+      </w:pPr>
+      <w:r>
+        <w:rPr>
+          <w:rFonts w:ascii="Calibri" w:hAnsi="Calibri"/>
+          <w:sz w:val="22"/>
+        </w:rPr>
+        <w:t>Installing separately downloaded research resources</w:t>
+      </w:r>
+    </w:p>
+    <w:p>
+      <w:pPr>
+        <w:widowControl/>
+        <w:spacing w:before="0" w:after="120" w:line="300" w:lineRule="auto"/>
+      </w:pPr>
+      <w:r>
+        <w:rPr>
+          <w:rFonts w:ascii="Calibri" w:hAnsi="Calibri"/>
+          <w:sz w:val="22"/>
+        </w:rPr>
+        <w:t xml:space="preserve">The tracked </w:t>
+      </w:r>
+      <w:r>
+        <w:rPr>
+          <w:rFonts w:ascii="Consolas" w:hAnsi="Consolas"/>
+          <w:color w:val="1F4D78"/>
+          <w:sz w:val="19"/>
+        </w:rPr>
+        <w:t>docs/resource-installation.md</w:t>
+      </w:r>
+      <w:r>
+        <w:rPr>
+          <w:rFonts w:ascii="Calibri" w:hAnsi="Calibri"/>
+          <w:sz w:val="22"/>
+        </w:rPr>
+        <w:t xml:space="preserve"> guide is the source of truth for official download pages, exact destinations, supported SHA-256 values, and source-specific cautions. The principal official pages are:</w:t>
+      </w:r>
+    </w:p>
+    <w:p>
+      <w:pPr>
+        <w:widowControl/>
+        <w:numPr>
+          <w:ilvl w:val="0"/>
+          <w:numId w:val="10"/>
+        </w:numPr>
+        <w:spacing w:before="0" w:after="80" w:line="300" w:lineRule="auto"/>
+        <w:ind w:left="540" w:hanging="271"/>
+      </w:pPr>
+      <w:r>
+        <w:rPr>
+          <w:rFonts w:ascii="Calibri" w:hAnsi="Calibri"/>
+          <w:sz w:val="22"/>
+        </w:rPr>
+        <w:t>Warriner VAD, concreteness, and Kuperman AoA: the relevant *Behavior</w:t>
+      </w:r>
+    </w:p>
+    <w:p>
+      <w:pPr>
+        <w:widowControl/>
+        <w:spacing w:before="0" w:after="120" w:line="300" w:lineRule="auto"/>
+      </w:pPr>
+      <w:r>
+        <w:rPr>
+          <w:rFonts w:ascii="Calibri" w:hAnsi="Calibri"/>
+          <w:sz w:val="22"/>
+        </w:rPr>
+        <w:t xml:space="preserve">  Research Methods* article and supplementary-material pages;</w:t>
+      </w:r>
+    </w:p>
+    <w:p>
+      <w:pPr>
+        <w:widowControl/>
+        <w:numPr>
+          <w:ilvl w:val="0"/>
+          <w:numId w:val="10"/>
+        </w:numPr>
+        <w:spacing w:before="0" w:after="80" w:line="300" w:lineRule="auto"/>
+        <w:ind w:left="540" w:hanging="271"/>
+      </w:pPr>
+      <w:r>
+        <w:rPr>
+          <w:rFonts w:ascii="Calibri" w:hAnsi="Calibri"/>
+          <w:sz w:val="22"/>
+        </w:rPr>
+        <w:t xml:space="preserve">NRC VAD: </w:t>
+      </w:r>
+      <w:r>
+        <w:rPr>
+          <w:rFonts w:ascii="Consolas" w:hAnsi="Consolas"/>
+          <w:color w:val="1F4D78"/>
+          <w:sz w:val="19"/>
+        </w:rPr>
+        <w:t>https://saifmohammad.com/WebPages/nrc-vad.html</w:t>
+      </w:r>
+      <w:r>
+        <w:rPr>
+          <w:rFonts w:ascii="Calibri" w:hAnsi="Calibri"/>
+          <w:sz w:val="22"/>
+        </w:rPr>
+        <w:t>;</w:t>
+      </w:r>
+    </w:p>
+    <w:p>
+      <w:pPr>
+        <w:widowControl/>
+        <w:numPr>
+          <w:ilvl w:val="0"/>
+          <w:numId w:val="10"/>
+        </w:numPr>
+        <w:spacing w:before="0" w:after="80" w:line="300" w:lineRule="auto"/>
+        <w:ind w:left="540" w:hanging="271"/>
+      </w:pPr>
+      <w:r>
+        <w:rPr>
+          <w:rFonts w:ascii="Calibri" w:hAnsi="Calibri"/>
+          <w:sz w:val="22"/>
+        </w:rPr>
+        <w:t>NRC Emotion:</w:t>
+      </w:r>
+    </w:p>
+    <w:p>
+      <w:pPr>
+        <w:widowControl/>
+        <w:spacing w:before="0" w:after="120" w:line="300" w:lineRule="auto"/>
+      </w:pPr>
+      <w:r>
+        <w:rPr>
+          <w:rFonts w:ascii="Calibri" w:hAnsi="Calibri"/>
+          <w:sz w:val="22"/>
+        </w:rPr>
+        <w:t xml:space="preserve">  </w:t>
+      </w:r>
+      <w:r>
+        <w:rPr>
+          <w:rFonts w:ascii="Consolas" w:hAnsi="Consolas"/>
+          <w:color w:val="1F4D78"/>
+          <w:sz w:val="19"/>
+        </w:rPr>
+        <w:t>https://saifmohammad.com/WebPages/NRC-Emotion-Lexicon.htm</w:t>
+      </w:r>
+      <w:r>
+        <w:rPr>
+          <w:rFonts w:ascii="Calibri" w:hAnsi="Calibri"/>
+          <w:sz w:val="22"/>
+        </w:rPr>
+        <w:t>;</w:t>
+      </w:r>
+    </w:p>
+    <w:p>
+      <w:pPr>
+        <w:widowControl/>
+        <w:numPr>
+          <w:ilvl w:val="0"/>
+          <w:numId w:val="10"/>
+        </w:numPr>
+        <w:spacing w:before="0" w:after="80" w:line="300" w:lineRule="auto"/>
+        <w:ind w:left="540" w:hanging="271"/>
+      </w:pPr>
+      <w:r>
+        <w:rPr>
+          <w:rFonts w:ascii="Calibri" w:hAnsi="Calibri"/>
+          <w:sz w:val="22"/>
+        </w:rPr>
+        <w:t>NRC Affect Intensity:</w:t>
+      </w:r>
+    </w:p>
+    <w:p>
+      <w:pPr>
+        <w:widowControl/>
+        <w:spacing w:before="0" w:after="120" w:line="300" w:lineRule="auto"/>
+      </w:pPr>
+      <w:r>
+        <w:rPr>
+          <w:rFonts w:ascii="Calibri" w:hAnsi="Calibri"/>
+          <w:sz w:val="22"/>
+        </w:rPr>
+        <w:t xml:space="preserve">  </w:t>
+      </w:r>
+      <w:r>
+        <w:rPr>
+          <w:rFonts w:ascii="Consolas" w:hAnsi="Consolas"/>
+          <w:color w:val="1F4D78"/>
+          <w:sz w:val="19"/>
+        </w:rPr>
+        <w:t>https://www.saifmohammad.com/WebPages/AffectIntensity.htm</w:t>
+      </w:r>
+      <w:r>
+        <w:rPr>
+          <w:rFonts w:ascii="Calibri" w:hAnsi="Calibri"/>
+          <w:sz w:val="22"/>
+        </w:rPr>
+        <w:t>;</w:t>
+      </w:r>
+    </w:p>
+    <w:p>
+      <w:pPr>
+        <w:widowControl/>
+        <w:numPr>
+          <w:ilvl w:val="0"/>
+          <w:numId w:val="10"/>
+        </w:numPr>
+        <w:spacing w:before="0" w:after="80" w:line="300" w:lineRule="auto"/>
+        <w:ind w:left="540" w:hanging="271"/>
+      </w:pPr>
+      <w:r>
+        <w:rPr>
+          <w:rFonts w:ascii="Calibri" w:hAnsi="Calibri"/>
+          <w:sz w:val="22"/>
+        </w:rPr>
+        <w:t>SUBTLEX-US:</w:t>
+      </w:r>
+    </w:p>
+    <w:p>
+      <w:pPr>
+        <w:widowControl/>
+        <w:spacing w:before="0" w:after="120" w:line="300" w:lineRule="auto"/>
+      </w:pPr>
+      <w:r>
+        <w:rPr>
+          <w:rFonts w:ascii="Calibri" w:hAnsi="Calibri"/>
+          <w:sz w:val="22"/>
+        </w:rPr>
+        <w:t xml:space="preserve">  </w:t>
+      </w:r>
+      <w:r>
+        <w:rPr>
+          <w:rFonts w:ascii="Consolas" w:hAnsi="Consolas"/>
+          <w:color w:val="1F4D78"/>
+          <w:sz w:val="19"/>
+        </w:rPr>
+        <w:t>https://www.ugent.be/pp/experimentele-psychologie/en/research/documents/subtlexus</w:t>
+      </w:r>
+      <w:r>
+        <w:rPr>
+          <w:rFonts w:ascii="Calibri" w:hAnsi="Calibri"/>
+          <w:sz w:val="22"/>
+        </w:rPr>
+        <w:t>;   and</w:t>
+      </w:r>
+    </w:p>
+    <w:p>
+      <w:pPr>
+        <w:widowControl/>
+        <w:numPr>
+          <w:ilvl w:val="0"/>
+          <w:numId w:val="10"/>
+        </w:numPr>
+        <w:spacing w:before="0" w:after="80" w:line="300" w:lineRule="auto"/>
+        <w:ind w:left="540" w:hanging="271"/>
+      </w:pPr>
+      <w:r>
+        <w:rPr>
+          <w:rFonts w:ascii="Calibri" w:hAnsi="Calibri"/>
+          <w:sz w:val="22"/>
+        </w:rPr>
+        <w:t xml:space="preserve">CMUdict: </w:t>
+      </w:r>
+      <w:r>
+        <w:rPr>
+          <w:rFonts w:ascii="Consolas" w:hAnsi="Consolas"/>
+          <w:color w:val="1F4D78"/>
+          <w:sz w:val="19"/>
+        </w:rPr>
+        <w:t>https://github.com/cmusphinx/cmudict</w:t>
+      </w:r>
+      <w:r>
+        <w:rPr>
+          <w:rFonts w:ascii="Calibri" w:hAnsi="Calibri"/>
+          <w:sz w:val="22"/>
+        </w:rPr>
+        <w:t>.</w:t>
+      </w:r>
+    </w:p>
+    <w:p>
+      <w:pPr>
+        <w:widowControl/>
+        <w:spacing w:before="0" w:after="120" w:line="300" w:lineRule="auto"/>
+      </w:pPr>
+      <w:r>
+        <w:rPr>
+          <w:rFonts w:ascii="Calibri" w:hAnsi="Calibri"/>
+          <w:sz w:val="22"/>
+        </w:rPr>
+        <w:t>VerseVAD never downloads these sources automatically. At startup it checks each exact path, file size, and supported checksum. A warning lists missing, malformed, or unsupported files with their expected destinations. Unavailable affective sources are removed from selectors; optional modules are disabled only when their own dependency is unavailable. Other installed analyses, including resource-free lexical style, remain usable.</w:t>
+      </w:r>
+    </w:p>
+    <w:p>
+      <w:pPr>
         <w:pStyle w:val="Heading1"/>
       </w:pPr>
       <w:r>
@@ -1287,7 +1575,7 @@
           <w:color w:val="1F4D78"/>
           <w:sz w:val="19"/>
         </w:rPr>
-        <w:t>ANEW VAD Study</w:t>
+        <w:t>VerseVAD</w:t>
       </w:r>
       <w:r>
         <w:rPr>
@@ -1363,7 +1651,20 @@
           <w:rFonts w:ascii="Calibri" w:hAnsi="Calibri"/>
           <w:sz w:val="22"/>
         </w:rPr>
-        <w:t xml:space="preserve">Confirm that the diagnostic lines end in </w:t>
+        <w:t>Install the desired research sources using</w:t>
+      </w:r>
+    </w:p>
+    <w:p>
+      <w:pPr>
+        <w:widowControl/>
+        <w:spacing w:before="0" w:after="120" w:line="300" w:lineRule="auto"/>
+      </w:pPr>
+      <w:r>
+        <w:rPr>
+          <w:rFonts w:ascii="Calibri" w:hAnsi="Calibri"/>
+          <w:sz w:val="22"/>
+        </w:rPr>
+        <w:t xml:space="preserve">   </w:t>
       </w:r>
       <w:r>
         <w:rPr>
@@ -1371,14 +1672,14 @@
           <w:color w:val="1F4D78"/>
           <w:sz w:val="19"/>
         </w:rPr>
-        <w:t>PASS</w:t>
-      </w:r>
-      <w:r>
-        <w:rPr>
-          <w:rFonts w:ascii="Calibri" w:hAnsi="Calibri"/>
-          <w:sz w:val="22"/>
-        </w:rPr>
-        <w:t xml:space="preserve"> and the setup reports that all checks passed.</w:t>
+        <w:t>docs/resource-installation.md</w:t>
+      </w:r>
+      <w:r>
+        <w:rPr>
+          <w:rFonts w:ascii="Calibri" w:hAnsi="Calibri"/>
+          <w:sz w:val="22"/>
+        </w:rPr>
+        <w:t>. This is intentionally a separate manual    step.</w:t>
       </w:r>
     </w:p>
     <w:p>
@@ -1396,6 +1697,85 @@
           <w:rFonts w:ascii="Calibri" w:hAnsi="Calibri"/>
           <w:sz w:val="22"/>
         </w:rPr>
+        <w:t>Start VerseVAD, resolve any resource warning by checking the exact</w:t>
+      </w:r>
+    </w:p>
+    <w:p>
+      <w:pPr>
+        <w:widowControl/>
+        <w:spacing w:before="0" w:after="120" w:line="300" w:lineRule="auto"/>
+      </w:pPr>
+      <w:r>
+        <w:rPr>
+          <w:rFonts w:ascii="Calibri" w:hAnsi="Calibri"/>
+          <w:sz w:val="22"/>
+        </w:rPr>
+        <w:t xml:space="preserve">   destination and checksum, and use </w:t>
+      </w:r>
+      <w:r>
+        <w:rPr>
+          <w:rFonts w:ascii="Calibri" w:hAnsi="Calibri"/>
+          <w:b/>
+          <w:sz w:val="22"/>
+        </w:rPr>
+        <w:t>Run self-test</w:t>
+      </w:r>
+      <w:r>
+        <w:rPr>
+          <w:rFonts w:ascii="Calibri" w:hAnsi="Calibri"/>
+          <w:sz w:val="22"/>
+        </w:rPr>
+        <w:t>.</w:t>
+      </w:r>
+    </w:p>
+    <w:p>
+      <w:pPr>
+        <w:widowControl/>
+        <w:numPr>
+          <w:ilvl w:val="0"/>
+          <w:numId w:val="12"/>
+        </w:numPr>
+        <w:spacing w:before="0" w:after="80" w:line="300" w:lineRule="auto"/>
+        <w:ind w:left="540" w:hanging="271"/>
+      </w:pPr>
+      <w:r>
+        <w:rPr>
+          <w:rFonts w:ascii="Calibri" w:hAnsi="Calibri"/>
+          <w:sz w:val="22"/>
+        </w:rPr>
+        <w:t xml:space="preserve">Confirm that the applicable diagnostic lines end in </w:t>
+      </w:r>
+      <w:r>
+        <w:rPr>
+          <w:rFonts w:ascii="Consolas" w:hAnsi="Consolas"/>
+          <w:color w:val="1F4D78"/>
+          <w:sz w:val="19"/>
+        </w:rPr>
+        <w:t>PASS</w:t>
+      </w:r>
+      <w:r>
+        <w:rPr>
+          <w:rFonts w:ascii="Calibri" w:hAnsi="Calibri"/>
+          <w:sz w:val="22"/>
+        </w:rPr>
+        <w:t>.</w:t>
+      </w:r>
+    </w:p>
+    <w:p>
+      <w:pPr>
+        <w:widowControl/>
+        <w:numPr>
+          <w:ilvl w:val="0"/>
+          <w:numId w:val="12"/>
+        </w:numPr>
+        <w:spacing w:before="0" w:after="80" w:line="300" w:lineRule="auto"/>
+        <w:ind w:left="540" w:hanging="271"/>
+      </w:pPr>
+      <w:r>
+        <w:rPr>
+          <w:rFonts w:ascii="Calibri" w:hAnsi="Calibri"/>
+          <w:sz w:val="22"/>
+        </w:rPr>
         <w:t>Press a key if the setup window asks you to do so.</w:t>
       </w:r>
     </w:p>
@@ -1409,7 +1789,52 @@
           <w:rFonts w:ascii="Calibri" w:hAnsi="Calibri"/>
           <w:sz w:val="22"/>
         </w:rPr>
-        <w:t>Setup is project-local. It does not require administrator access or a system-wide Python installation.</w:t>
+        <w:t xml:space="preserve">Setup is project-local. It does not require administrator access or a system-wide Python installation. If the </w:t>
+      </w:r>
+      <w:r>
+        <w:rPr>
+          <w:rFonts w:ascii="Consolas" w:hAnsi="Consolas"/>
+          <w:color w:val="1F4D78"/>
+          <w:sz w:val="19"/>
+        </w:rPr>
+        <w:t>VerseVAD</w:t>
+      </w:r>
+      <w:r>
+        <w:rPr>
+          <w:rFonts w:ascii="Calibri" w:hAnsi="Calibri"/>
+          <w:sz w:val="22"/>
+        </w:rPr>
+        <w:t xml:space="preserve"> folder is moved or renamed, rerun </w:t>
+      </w:r>
+      <w:r>
+        <w:rPr>
+          <w:rFonts w:ascii="Consolas" w:hAnsi="Consolas"/>
+          <w:color w:val="1F4D78"/>
+          <w:sz w:val="19"/>
+        </w:rPr>
+        <w:t>setup_windows.bat</w:t>
+      </w:r>
+      <w:r>
+        <w:rPr>
+          <w:rFonts w:ascii="Calibri" w:hAnsi="Calibri"/>
+          <w:sz w:val="22"/>
+        </w:rPr>
+        <w:t xml:space="preserve">. Setup detects stale absolute virtual-environment paths and rebuilds only the disposable </w:t>
+      </w:r>
+      <w:r>
+        <w:rPr>
+          <w:rFonts w:ascii="Consolas" w:hAnsi="Consolas"/>
+          <w:color w:val="1F4D78"/>
+          <w:sz w:val="19"/>
+        </w:rPr>
+        <w:t>.venv</w:t>
+      </w:r>
+      <w:r>
+        <w:rPr>
+          <w:rFonts w:ascii="Calibri" w:hAnsi="Calibri"/>
+          <w:sz w:val="22"/>
+        </w:rPr>
+        <w:t>; research sources and project data are not removed.</w:t>
       </w:r>
     </w:p>
     <w:p>
@@ -2249,61 +2674,27 @@
         <w:t>, save the readable summary or full audit bundle.</w:t>
       </w:r>
     </w:p>
-    <w:tbl>
-      <w:tblPr>
-        <w:tblStyle w:val="TableGrid"/>
-        <w:tblW w:type="dxa" w:w="9360"/>
-        <w:jc w:val="left"/>
-        <w:tblLayout w:type="fixed"/>
-        <w:tblLook w:firstColumn="1" w:firstRow="1" w:lastColumn="0" w:lastRow="0" w:noHBand="0" w:noVBand="1" w:val="04A0"/>
-        <w:tblInd w:w="120" w:type="dxa"/>
-        <w:tblBorders>
-          <w:top w:val="single" w:sz="5" w:space="0" w:color="D7DEE5"/>
-          <w:left w:val="single" w:sz="5" w:space="0" w:color="D7DEE5"/>
-          <w:bottom w:val="single" w:sz="5" w:space="0" w:color="D7DEE5"/>
-          <w:right w:val="single" w:sz="5" w:space="0" w:color="D7DEE5"/>
-          <w:insideH w:val="single" w:sz="5" w:space="0" w:color="D7DEE5"/>
-          <w:insideV w:val="single" w:sz="5" w:space="0" w:color="D7DEE5"/>
-        </w:tblBorders>
-      </w:tblPr>
-      <w:tblGrid>
-        <w:gridCol w:w="9360"/>
-      </w:tblGrid>
-      <w:tr>
-        <w:tc>
-          <w:tcPr>
-            <w:tcW w:type="dxa" w:w="9360"/>
-            <w:vAlign w:val="center"/>
-            <w:tcMar>
-              <w:top w:w="80" w:type="dxa"/>
-              <w:bottom w:w="80" w:type="dxa"/>
-              <w:start w:w="120" w:type="dxa"/>
-              <w:end w:w="120" w:type="dxa"/>
-            </w:tcMar>
-            <w:shd w:fill="F4F6F9"/>
-          </w:tcPr>
-          <w:p>
-            <w:pPr>
-              <w:widowControl/>
-              <w:spacing w:before="0" w:after="0" w:line="276" w:lineRule="auto"/>
-            </w:pPr>
-            <w:r>
-              <w:rPr>
-                <w:rFonts w:ascii="Calibri" w:hAnsi="Calibri"/>
-                <w:color w:val="193247"/>
-                <w:sz w:val="22"/>
-              </w:rPr>
-              <w:t>SAFE PRACTICE: A high or low mean is not self-interpreting. Always read it with the lexicon name, analysis view, weighting, matched count, coverage, and evidence table.</w:t>
-            </w:r>
-          </w:p>
-        </w:tc>
-      </w:tr>
-    </w:tbl>
-    <w:p>
-      <w:pPr>
-        <w:widowControl/>
-        <w:spacing w:before="0" w:after="40" w:line="240" w:lineRule="auto"/>
-      </w:pPr>
+    <w:p>
+      <w:pPr>
+        <w:widowControl/>
+        <w:spacing w:before="80" w:after="120" w:line="276" w:lineRule="auto"/>
+        <w:ind w:left="173" w:right="173"/>
+        <w:shd w:fill="F4F6F9"/>
+        <w:pBdr>
+          <w:top w:val="single" w:sz="5" w:space="5" w:color="D7DEE5"/>
+          <w:left w:val="single" w:sz="5" w:space="5" w:color="D7DEE5"/>
+          <w:bottom w:val="single" w:sz="5" w:space="5" w:color="D7DEE5"/>
+          <w:right w:val="single" w:sz="5" w:space="5" w:color="D7DEE5"/>
+        </w:pBdr>
+      </w:pPr>
+      <w:r>
+        <w:rPr>
+          <w:rFonts w:ascii="Calibri" w:hAnsi="Calibri"/>
+          <w:color w:val="193247"/>
+          <w:sz w:val="22"/>
+        </w:rPr>
+        <w:t>SAFE PRACTICE: A high or low mean is not self-interpreting. Always read it with the lexicon name, analysis view, weighting, matched count, coverage, and evidence table.</w:t>
+      </w:r>
     </w:p>
     <w:p>
       <w:pPr>
@@ -7589,6 +7980,27 @@
       <w:r>
         <w:rPr>
           <w:rFonts w:ascii="Calibri" w:hAnsi="Calibri"/>
+          <w:b/>
+          <w:sz w:val="22"/>
+        </w:rPr>
+        <w:t>Candidate meter only</w:t>
+      </w:r>
+      <w:r>
+        <w:rPr>
+          <w:rFonts w:ascii="Calibri" w:hAnsi="Calibri"/>
+          <w:sz w:val="22"/>
+        </w:rPr>
+        <w:t xml:space="preserve"> is the validated default and preserves the Stage 6 result exactly. Two non-default choices add an independent performance-aware realization or display candidate and performance-aware readings together. The second layer does not rewrite the dictionary lexical stress or replace the fixed candidate audit.</w:t>
+      </w:r>
+    </w:p>
+    <w:p>
+      <w:pPr>
+        <w:widowControl/>
+        <w:spacing w:before="0" w:after="120" w:line="300" w:lineRule="auto"/>
+      </w:pPr>
+      <w:r>
+        <w:rPr>
+          <w:rFonts w:ascii="Calibri" w:hAnsi="Calibri"/>
           <w:sz w:val="22"/>
         </w:rPr>
         <w:t>The line alignment can report substitutions, initial inversion, feminine ending, catalexis, and extra or omitted syllables. Multiple retained CMUdict stress alternatives are explored up to the configured line limit, but the metrically preferred path is not promoted to a dictionary or performance fact. A line with missing pronunciation evidence remains unscored.</w:t>
@@ -7720,103 +8132,7 @@
           <w:rFonts w:ascii="Calibri" w:hAnsi="Calibri"/>
           <w:sz w:val="22"/>
         </w:rPr>
-        <w:t>Fit is a configured alignment similarity from 0 to 1, not a probability. Confidence is a rule-based category, not a calibrated probability. Safe wording is: “The nearest configured candidate was iambic pentameter under the selected alignment configuration.” Do not write: “VerseVAD proved the poem is in iambic pentameter,” “this is the correct scansion,” or “the poet performed the line this way.”</w:t>
-      </w:r>
-    </w:p>
-    <w:p>
-      <w:pPr>
-        <w:pStyle w:val="Heading2"/>
-      </w:pPr>
-      <w:r>
-        <w:rPr>
-          <w:rFonts w:ascii="Calibri" w:hAnsi="Calibri"/>
-          <w:sz w:val="22"/>
-        </w:rPr>
-        <w:t>Rhyme and phonological patterns</w:t>
-      </w:r>
-    </w:p>
-    <w:p>
-      <w:pPr>
-        <w:widowControl/>
-        <w:spacing w:before="0" w:after="120" w:line="300" w:lineRule="auto"/>
-      </w:pPr>
-      <w:r>
-        <w:rPr>
-          <w:rFonts w:ascii="Calibri" w:hAnsi="Calibri"/>
-          <w:sz w:val="22"/>
-        </w:rPr>
-        <w:t xml:space="preserve">When enabled, </w:t>
-      </w:r>
-      <w:r>
-        <w:rPr>
-          <w:rFonts w:ascii="Calibri" w:hAnsi="Calibri"/>
-          <w:b/>
-          <w:sz w:val="22"/>
-        </w:rPr>
-        <w:t>Rhyme &amp; Sound</w:t>
-      </w:r>
-      <w:r>
-        <w:rPr>
-          <w:rFonts w:ascii="Calibri" w:hAnsi="Calibri"/>
-          <w:sz w:val="22"/>
-        </w:rPr>
-        <w:t xml:space="preserve"> automatically uses the retained Stage 5 pronunciation evidence. No affective lexicon is required. CMUdict supplies phones and lexical stress; VerseVAD derives the rhyme and recurring-sound classifications.</w:t>
-      </w:r>
-    </w:p>
-    <w:p>
-      <w:pPr>
-        <w:widowControl/>
-        <w:spacing w:before="0" w:after="120" w:line="300" w:lineRule="auto"/>
-      </w:pPr>
-      <w:r>
-        <w:rPr>
-          <w:rFonts w:ascii="Calibri" w:hAnsi="Calibri"/>
-          <w:sz w:val="22"/>
-        </w:rPr>
-        <w:t xml:space="preserve">The whole-poem and stanza schemes use only robust perfect or identical rhyme parts. Letters identify exact groups, </w:t>
-      </w:r>
-      <w:r>
-        <w:rPr>
-          <w:rFonts w:ascii="Consolas" w:hAnsi="Consolas"/>
-          <w:color w:val="1F4D78"/>
-          <w:sz w:val="19"/>
-        </w:rPr>
-        <w:t>x</w:t>
-      </w:r>
-      <w:r>
-        <w:rPr>
-          <w:rFonts w:ascii="Calibri" w:hAnsi="Calibri"/>
-          <w:sz w:val="22"/>
-        </w:rPr>
-        <w:t xml:space="preserve"> identifies an analyzable ungrouped ending, and </w:t>
-      </w:r>
-      <w:r>
-        <w:rPr>
-          <w:rFonts w:ascii="Consolas" w:hAnsi="Consolas"/>
-          <w:color w:val="1F4D78"/>
-          <w:sz w:val="19"/>
-        </w:rPr>
-        <w:t>?</w:t>
-      </w:r>
-      <w:r>
-        <w:rPr>
-          <w:rFonts w:ascii="Calibri" w:hAnsi="Calibri"/>
-          <w:sz w:val="22"/>
-        </w:rPr>
-        <w:t xml:space="preserve"> identifies an unresolved ending. Slant and eye rhyme remain separate and never create exact scheme groups.</w:t>
-      </w:r>
-    </w:p>
-    <w:p>
-      <w:pPr>
-        <w:widowControl/>
-        <w:spacing w:before="0" w:after="120" w:line="300" w:lineRule="auto"/>
-      </w:pPr>
-      <w:r>
-        <w:rPr>
-          <w:rFonts w:ascii="Calibri" w:hAnsi="Calibri"/>
-          <w:sz w:val="22"/>
-        </w:rPr>
-        <w:t>Read:</w:t>
+        <w:t>When performance-aware analysis is selected, also read:</w:t>
       </w:r>
     </w:p>
     <w:p>
@@ -7834,7 +8150,20 @@
           <w:rFonts w:ascii="Calibri" w:hAnsi="Calibri"/>
           <w:sz w:val="22"/>
         </w:rPr>
-        <w:t>ending coverage, whole-poem scheme, and stanza schemes;</w:t>
+        <w:t>raw lexical stress, metrical positions, contextual prominence, and visible</w:t>
+      </w:r>
+    </w:p>
+    <w:p>
+      <w:pPr>
+        <w:widowControl/>
+        <w:spacing w:before="0" w:after="120" w:line="300" w:lineRule="auto"/>
+      </w:pPr>
+      <w:r>
+        <w:rPr>
+          <w:rFonts w:ascii="Calibri" w:hAnsi="Calibri"/>
+          <w:sz w:val="22"/>
+        </w:rPr>
+        <w:t xml:space="preserve">  promotion or demotion decisions syllable by syllable;</w:t>
       </w:r>
     </w:p>
     <w:p>
@@ -7852,7 +8181,20 @@
           <w:rFonts w:ascii="Calibri" w:hAnsi="Calibri"/>
           <w:sz w:val="22"/>
         </w:rPr>
-        <w:t>perfect, identical, masculine, feminine, and multisyllabic pair evidence;</w:t>
+        <w:t>local substitutions, stress clashes and lapses, punctuation-supported</w:t>
+      </w:r>
+    </w:p>
+    <w:p>
+      <w:pPr>
+        <w:widowControl/>
+        <w:spacing w:before="0" w:after="120" w:line="300" w:lineRule="auto"/>
+      </w:pPr>
+      <w:r>
+        <w:rPr>
+          <w:rFonts w:ascii="Calibri" w:hAnsi="Calibri"/>
+          <w:sz w:val="22"/>
+        </w:rPr>
+        <w:t xml:space="preserve">  caesura evidence, selected pronunciation path, and alternate readings;</w:t>
       </w:r>
     </w:p>
     <w:p>
@@ -7870,7 +8212,20 @@
           <w:rFonts w:ascii="Calibri" w:hAnsi="Calibri"/>
           <w:sz w:val="22"/>
         </w:rPr>
-        <w:t>the conservative graded slant score and its five components;</w:t>
+        <w:t>candidate fit, contextual fit, syllable-count fit, phrase fit, line-ending</w:t>
+      </w:r>
+    </w:p>
+    <w:p>
+      <w:pPr>
+        <w:widowControl/>
+        <w:spacing w:before="0" w:after="120" w:line="300" w:lineRule="auto"/>
+      </w:pPr>
+      <w:r>
+        <w:rPr>
+          <w:rFonts w:ascii="Calibri" w:hAnsi="Calibri"/>
+          <w:sz w:val="22"/>
+        </w:rPr>
+        <w:t xml:space="preserve">  fit, pronunciation plausibility, stanza/poem consistency, style   compatibility, substitution penalty, and their visible weights;</w:t>
       </w:r>
     </w:p>
     <w:p>
@@ -7888,7 +8243,20 @@
           <w:rFonts w:ascii="Calibri" w:hAnsi="Calibri"/>
           <w:sz w:val="22"/>
         </w:rPr>
-        <w:t>spelling-based eye rhyme, exact internal rhyme, and repeated-line refrains;</w:t>
+        <w:t>stanza summaries, recurrence, exceptions, rhythmic trajectory, generic</w:t>
+      </w:r>
+    </w:p>
+    <w:p>
+      <w:pPr>
+        <w:widowControl/>
+        <w:spacing w:before="0" w:after="120" w:line="300" w:lineRule="auto"/>
+      </w:pPr>
+      <w:r>
+        <w:rPr>
+          <w:rFonts w:ascii="Calibri" w:hAnsi="Calibri"/>
+          <w:sz w:val="22"/>
+        </w:rPr>
+        <w:t xml:space="preserve">  alternating line-position sequences, and the poem-level rhythmic-   organization label; and</w:t>
       </w:r>
     </w:p>
     <w:p>
@@ -7906,7 +8274,7 @@
           <w:rFonts w:ascii="Calibri" w:hAnsi="Calibri"/>
           <w:sz w:val="22"/>
         </w:rPr>
-        <w:t>phonemic alliteration, assonance, consonance, densities, and dominant sound</w:t>
+        <w:t>strong, moderate, tentative, ambiguous, or insufficient rule-based</w:t>
       </w:r>
     </w:p>
     <w:p>
@@ -7919,7 +8287,157 @@
           <w:rFonts w:ascii="Calibri" w:hAnsi="Calibri"/>
           <w:sz w:val="22"/>
         </w:rPr>
-        <w:t xml:space="preserve">  families; and</w:t>
+        <w:t xml:space="preserve">  confidence with a plain-language explanation.</w:t>
+      </w:r>
+    </w:p>
+    <w:p>
+      <w:pPr>
+        <w:widowControl/>
+        <w:spacing w:before="0" w:after="120" w:line="300" w:lineRule="auto"/>
+      </w:pPr>
+      <w:r>
+        <w:rPr>
+          <w:rFonts w:ascii="Calibri" w:hAnsi="Calibri"/>
+          <w:sz w:val="22"/>
+        </w:rPr>
+        <w:t>The scholar explicitly selects one broad versioned profile: General English Verse, Traditional Accentual-Syllabic Verse, Romantic / Victorian Verse, Modernist Verse, Contemporary Formal Verse, Free Verse / Cadential, or Custom visible weights. VerseVAD never infers a period, movement, tradition, author, or performance from the text. Summary, Standard, and Detailed control presentation depth rather than analytical truth.</w:t>
+      </w:r>
+    </w:p>
+    <w:p>
+      <w:pPr>
+        <w:widowControl/>
+        <w:spacing w:before="0" w:after="120" w:line="300" w:lineRule="auto"/>
+      </w:pPr>
+      <w:r>
+        <w:rPr>
+          <w:rFonts w:ascii="Calibri" w:hAnsi="Calibri"/>
+          <w:sz w:val="22"/>
+        </w:rPr>
+        <w:t xml:space="preserve">Recognizing visibly marked contractions such as </w:t>
+      </w:r>
+      <w:r>
+        <w:rPr>
+          <w:rFonts w:ascii="Consolas" w:hAnsi="Consolas"/>
+          <w:color w:val="1F4D78"/>
+          <w:sz w:val="19"/>
+        </w:rPr>
+        <w:t>o'er</w:t>
+      </w:r>
+      <w:r>
+        <w:rPr>
+          <w:rFonts w:ascii="Calibri" w:hAnsi="Calibri"/>
+          <w:sz w:val="22"/>
+        </w:rPr>
+        <w:t xml:space="preserve"> is off by default. Unmarked syllables are never silently elided. Optional scholar scansion revisions require a line number, fixed candidate, visible scansion, and note; the automatic and revised readings remain separate and reversible.</w:t>
+      </w:r>
+    </w:p>
+    <w:p>
+      <w:pPr>
+        <w:widowControl/>
+        <w:spacing w:before="0" w:after="120" w:line="300" w:lineRule="auto"/>
+      </w:pPr>
+      <w:r>
+        <w:rPr>
+          <w:rFonts w:ascii="Calibri" w:hAnsi="Calibri"/>
+          <w:sz w:val="22"/>
+        </w:rPr>
+        <w:t>Fit is a configured alignment similarity from 0 to 1, not a probability. Confidence is a rule-based category, not a calibrated probability. Safe wording is: “The nearest configured candidate was iambic pentameter under the selected alignment configuration.” Do not write: “VerseVAD proved the poem is in iambic pentameter,” “this is the correct scansion,” or “the poet performed the line this way.”</w:t>
+      </w:r>
+    </w:p>
+    <w:p>
+      <w:pPr>
+        <w:pStyle w:val="Heading2"/>
+      </w:pPr>
+      <w:r>
+        <w:rPr>
+          <w:rFonts w:ascii="Calibri" w:hAnsi="Calibri"/>
+          <w:sz w:val="22"/>
+        </w:rPr>
+        <w:t>Rhyme and phonological patterns</w:t>
+      </w:r>
+    </w:p>
+    <w:p>
+      <w:pPr>
+        <w:widowControl/>
+        <w:spacing w:before="0" w:after="120" w:line="300" w:lineRule="auto"/>
+      </w:pPr>
+      <w:r>
+        <w:rPr>
+          <w:rFonts w:ascii="Calibri" w:hAnsi="Calibri"/>
+          <w:sz w:val="22"/>
+        </w:rPr>
+        <w:t xml:space="preserve">When enabled, </w:t>
+      </w:r>
+      <w:r>
+        <w:rPr>
+          <w:rFonts w:ascii="Calibri" w:hAnsi="Calibri"/>
+          <w:b/>
+          <w:sz w:val="22"/>
+        </w:rPr>
+        <w:t>Rhyme &amp; Sound</w:t>
+      </w:r>
+      <w:r>
+        <w:rPr>
+          <w:rFonts w:ascii="Calibri" w:hAnsi="Calibri"/>
+          <w:sz w:val="22"/>
+        </w:rPr>
+        <w:t xml:space="preserve"> automatically uses the retained Stage 5 pronunciation evidence. No affective lexicon is required. CMUdict supplies phones and lexical stress; VerseVAD derives the rhyme and recurring-sound classifications.</w:t>
+      </w:r>
+    </w:p>
+    <w:p>
+      <w:pPr>
+        <w:widowControl/>
+        <w:spacing w:before="0" w:after="120" w:line="300" w:lineRule="auto"/>
+      </w:pPr>
+      <w:r>
+        <w:rPr>
+          <w:rFonts w:ascii="Calibri" w:hAnsi="Calibri"/>
+          <w:sz w:val="22"/>
+        </w:rPr>
+        <w:t xml:space="preserve">The whole-poem and stanza schemes use only robust perfect or identical rhyme parts. Letters identify exact groups, </w:t>
+      </w:r>
+      <w:r>
+        <w:rPr>
+          <w:rFonts w:ascii="Consolas" w:hAnsi="Consolas"/>
+          <w:color w:val="1F4D78"/>
+          <w:sz w:val="19"/>
+        </w:rPr>
+        <w:t>x</w:t>
+      </w:r>
+      <w:r>
+        <w:rPr>
+          <w:rFonts w:ascii="Calibri" w:hAnsi="Calibri"/>
+          <w:sz w:val="22"/>
+        </w:rPr>
+        <w:t xml:space="preserve"> identifies an analyzable ungrouped ending, and </w:t>
+      </w:r>
+      <w:r>
+        <w:rPr>
+          <w:rFonts w:ascii="Consolas" w:hAnsi="Consolas"/>
+          <w:color w:val="1F4D78"/>
+          <w:sz w:val="19"/>
+        </w:rPr>
+        <w:t>?</w:t>
+      </w:r>
+      <w:r>
+        <w:rPr>
+          <w:rFonts w:ascii="Calibri" w:hAnsi="Calibri"/>
+          <w:sz w:val="22"/>
+        </w:rPr>
+        <w:t xml:space="preserve"> identifies an unresolved ending. Slant and eye rhyme remain separate and never create exact scheme groups.</w:t>
+      </w:r>
+    </w:p>
+    <w:p>
+      <w:pPr>
+        <w:widowControl/>
+        <w:spacing w:before="0" w:after="120" w:line="300" w:lineRule="auto"/>
+      </w:pPr>
+      <w:r>
+        <w:rPr>
+          <w:rFonts w:ascii="Calibri" w:hAnsi="Calibri"/>
+          <w:sz w:val="22"/>
+        </w:rPr>
+        <w:t>Read:</w:t>
       </w:r>
     </w:p>
     <w:p>
@@ -7937,189 +8455,7 @@
           <w:rFonts w:ascii="Calibri" w:hAnsi="Calibri"/>
           <w:sz w:val="22"/>
         </w:rPr>
-        <w:t>line and pair evidence, warnings, configuration, and provenance.</w:t>
-      </w:r>
-    </w:p>
-    <w:p>
-      <w:pPr>
-        <w:widowControl/>
-        <w:spacing w:before="0" w:after="120" w:line="300" w:lineRule="auto"/>
-      </w:pPr>
-      <w:r>
-        <w:rPr>
-          <w:rFonts w:ascii="Calibri" w:hAnsi="Calibri"/>
-          <w:sz w:val="22"/>
-        </w:rPr>
-        <w:t xml:space="preserve">The default slant score weights stressed vowel </w:t>
-      </w:r>
-      <w:r>
-        <w:rPr>
-          <w:rFonts w:ascii="Consolas" w:hAnsi="Consolas"/>
-          <w:color w:val="1F4D78"/>
-          <w:sz w:val="19"/>
-        </w:rPr>
-        <w:t>0.35</w:t>
-      </w:r>
-      <w:r>
-        <w:rPr>
-          <w:rFonts w:ascii="Calibri" w:hAnsi="Calibri"/>
-          <w:sz w:val="22"/>
-        </w:rPr>
-        <w:t xml:space="preserve">, final consonants </w:t>
-      </w:r>
-      <w:r>
-        <w:rPr>
-          <w:rFonts w:ascii="Consolas" w:hAnsi="Consolas"/>
-          <w:color w:val="1F4D78"/>
-          <w:sz w:val="19"/>
-        </w:rPr>
-        <w:t>0.25</w:t>
-      </w:r>
-      <w:r>
-        <w:rPr>
-          <w:rFonts w:ascii="Calibri" w:hAnsi="Calibri"/>
-          <w:sz w:val="22"/>
-        </w:rPr>
-        <w:t xml:space="preserve">, rhyme-part edit similarity </w:t>
-      </w:r>
-      <w:r>
-        <w:rPr>
-          <w:rFonts w:ascii="Consolas" w:hAnsi="Consolas"/>
-          <w:color w:val="1F4D78"/>
-          <w:sz w:val="19"/>
-        </w:rPr>
-        <w:t>0.25</w:t>
-      </w:r>
-      <w:r>
-        <w:rPr>
-          <w:rFonts w:ascii="Calibri" w:hAnsi="Calibri"/>
-          <w:sz w:val="22"/>
-        </w:rPr>
-        <w:t xml:space="preserve">, stress alignment </w:t>
-      </w:r>
-      <w:r>
-        <w:rPr>
-          <w:rFonts w:ascii="Consolas" w:hAnsi="Consolas"/>
-          <w:color w:val="1F4D78"/>
-          <w:sz w:val="19"/>
-        </w:rPr>
-        <w:t>0.10</w:t>
-      </w:r>
-      <w:r>
-        <w:rPr>
-          <w:rFonts w:ascii="Calibri" w:hAnsi="Calibri"/>
-          <w:sz w:val="22"/>
-        </w:rPr>
-        <w:t xml:space="preserve">, and syllable similarity </w:t>
-      </w:r>
-      <w:r>
-        <w:rPr>
-          <w:rFonts w:ascii="Consolas" w:hAnsi="Consolas"/>
-          <w:color w:val="1F4D78"/>
-          <w:sz w:val="19"/>
-        </w:rPr>
-        <w:t>0.05</w:t>
-      </w:r>
-      <w:r>
-        <w:rPr>
-          <w:rFonts w:ascii="Calibri" w:hAnsi="Calibri"/>
-          <w:sz w:val="22"/>
-        </w:rPr>
-        <w:t xml:space="preserve">, with a default threshold of </w:t>
-      </w:r>
-      <w:r>
-        <w:rPr>
-          <w:rFonts w:ascii="Consolas" w:hAnsi="Consolas"/>
-          <w:color w:val="1F4D78"/>
-          <w:sz w:val="19"/>
-        </w:rPr>
-        <w:t>0.68</w:t>
-      </w:r>
-      <w:r>
-        <w:rPr>
-          <w:rFonts w:ascii="Calibri" w:hAnsi="Calibri"/>
-          <w:sz w:val="22"/>
-        </w:rPr>
-        <w:t>. It is a configurable heuristic, not a probability. Materially different dictionary alternatives remain unresolved unless a documented Stage 5 scholar override applies.</w:t>
-      </w:r>
-    </w:p>
-    <w:p>
-      <w:pPr>
-        <w:widowControl/>
-        <w:spacing w:before="0" w:after="120" w:line="300" w:lineRule="auto"/>
-      </w:pPr>
-      <w:r>
-        <w:rPr>
-          <w:rFonts w:ascii="Calibri" w:hAnsi="Calibri"/>
-          <w:sz w:val="22"/>
-        </w:rPr>
-        <w:t>Safe wording is: “The dictionary-based ending evidence produced an ABAB exact- rhyme scheme among four analyzable endings.” Do not claim that VerseVAD proved how the poem must be pronounced, performed, heard, or intended.</w:t>
-      </w:r>
-    </w:p>
-    <w:p>
-      <w:pPr>
-        <w:pStyle w:val="Heading2"/>
-      </w:pPr>
-      <w:r>
-        <w:rPr>
-          <w:rFonts w:ascii="Calibri" w:hAnsi="Calibri"/>
-          <w:sz w:val="22"/>
-        </w:rPr>
-        <w:t>Lexical diversity, word length, and structural word counts</w:t>
-      </w:r>
-    </w:p>
-    <w:p>
-      <w:pPr>
-        <w:widowControl/>
-        <w:spacing w:before="0" w:after="120" w:line="300" w:lineRule="auto"/>
-      </w:pPr>
-      <w:r>
-        <w:rPr>
-          <w:rFonts w:ascii="Calibri" w:hAnsi="Calibri"/>
-          <w:sz w:val="22"/>
-        </w:rPr>
-        <w:t xml:space="preserve">The optional </w:t>
-      </w:r>
-      <w:r>
-        <w:rPr>
-          <w:rFonts w:ascii="Calibri" w:hAnsi="Calibri"/>
-          <w:b/>
-          <w:sz w:val="22"/>
-        </w:rPr>
-        <w:t>Lexical Style</w:t>
-      </w:r>
-      <w:r>
-        <w:rPr>
-          <w:rFonts w:ascii="Calibri" w:hAnsi="Calibri"/>
-          <w:sz w:val="22"/>
-        </w:rPr>
-        <w:t xml:space="preserve"> module uses the shared poetry-preserving processing record and requires no external dataset. The broader planned visible-structure and syntax/lineation modules were skipped at the scholar's direction.</w:t>
-      </w:r>
-    </w:p>
-    <w:p>
-      <w:pPr>
-        <w:widowControl/>
-        <w:spacing w:before="0" w:after="120" w:line="300" w:lineRule="auto"/>
-      </w:pPr>
-      <w:r>
-        <w:rPr>
-          <w:rFonts w:ascii="Calibri" w:hAnsi="Calibri"/>
-          <w:sz w:val="22"/>
-        </w:rPr>
-        <w:t>One counted word is one shared-preprocessing lexical token. Punctuation and numeric tokens are excluded. This word unit may differ from an editor's orthographic convention for a contraction or hyphenated expression, so the token audit preserves exact surfaces, offsets, and inclusion reasons.</w:t>
-      </w:r>
-    </w:p>
-    <w:p>
-      <w:pPr>
-        <w:widowControl/>
-        <w:spacing w:before="0" w:after="120" w:line="300" w:lineRule="auto"/>
-      </w:pPr>
-      <w:r>
-        <w:rPr>
-          <w:rFonts w:ascii="Calibri" w:hAnsi="Calibri"/>
-          <w:sz w:val="22"/>
-        </w:rPr>
-        <w:t>Lexical diversity uses normalized observed surface forms. Lemmas remain separate audit evidence and never silently replace the forms present in the poem. The module reports:</w:t>
+        <w:t>ending coverage, whole-poem scheme, and stanza schemes;</w:t>
       </w:r>
     </w:p>
     <w:p>
@@ -8137,7 +8473,7 @@
           <w:rFonts w:ascii="Calibri" w:hAnsi="Calibri"/>
           <w:sz w:val="22"/>
         </w:rPr>
-        <w:t>descriptive lexical-token, normalized surface-type, and plain TTR values;</w:t>
+        <w:t>perfect, identical, masculine, feminine, and multisyllabic pair evidence;</w:t>
       </w:r>
     </w:p>
     <w:p>
@@ -8155,7 +8491,7 @@
           <w:rFonts w:ascii="Calibri" w:hAnsi="Calibri"/>
           <w:sz w:val="22"/>
         </w:rPr>
-        <w:t>MATTR across every overlapping configured token window;</w:t>
+        <w:t>the conservative graded slant score and its five components;</w:t>
       </w:r>
     </w:p>
     <w:p>
@@ -8173,20 +8509,7 @@
           <w:rFonts w:ascii="Calibri" w:hAnsi="Calibri"/>
           <w:sz w:val="22"/>
         </w:rPr>
-        <w:t>HD-D as the expected distinct-type proportion in a configured</w:t>
-      </w:r>
-    </w:p>
-    <w:p>
-      <w:pPr>
-        <w:widowControl/>
-        <w:spacing w:before="0" w:after="120" w:line="300" w:lineRule="auto"/>
-      </w:pPr>
-      <w:r>
-        <w:rPr>
-          <w:rFonts w:ascii="Calibri" w:hAnsi="Calibri"/>
-          <w:sz w:val="22"/>
-        </w:rPr>
-        <w:t xml:space="preserve">  without-replacement sample;</w:t>
+        <w:t>spelling-based eye rhyme, exact internal rhyme, and repeated-line refrains;</w:t>
       </w:r>
     </w:p>
     <w:p>
@@ -8204,7 +8527,20 @@
           <w:rFonts w:ascii="Calibri" w:hAnsi="Calibri"/>
           <w:sz w:val="22"/>
         </w:rPr>
-        <w:t>forward/reverse and mean MTLD at a configured TTR threshold;</w:t>
+        <w:t>phonemic alliteration, assonance, consonance, densities, and dominant sound</w:t>
+      </w:r>
+    </w:p>
+    <w:p>
+      <w:pPr>
+        <w:widowControl/>
+        <w:spacing w:before="0" w:after="120" w:line="300" w:lineRule="auto"/>
+      </w:pPr>
+      <w:r>
+        <w:rPr>
+          <w:rFonts w:ascii="Calibri" w:hAnsi="Calibri"/>
+          <w:sz w:val="22"/>
+        </w:rPr>
+        <w:t xml:space="preserve">  families; and</w:t>
       </w:r>
     </w:p>
     <w:p>
@@ -8222,7 +8558,189 @@
           <w:rFonts w:ascii="Calibri" w:hAnsi="Calibri"/>
           <w:sz w:val="22"/>
         </w:rPr>
-        <w:t>Unicode alphabetic-character word-length statistics and distribution;</w:t>
+        <w:t>line and pair evidence, warnings, configuration, and provenance.</w:t>
+      </w:r>
+    </w:p>
+    <w:p>
+      <w:pPr>
+        <w:widowControl/>
+        <w:spacing w:before="0" w:after="120" w:line="300" w:lineRule="auto"/>
+      </w:pPr>
+      <w:r>
+        <w:rPr>
+          <w:rFonts w:ascii="Calibri" w:hAnsi="Calibri"/>
+          <w:sz w:val="22"/>
+        </w:rPr>
+        <w:t xml:space="preserve">The default slant score weights stressed vowel </w:t>
+      </w:r>
+      <w:r>
+        <w:rPr>
+          <w:rFonts w:ascii="Consolas" w:hAnsi="Consolas"/>
+          <w:color w:val="1F4D78"/>
+          <w:sz w:val="19"/>
+        </w:rPr>
+        <w:t>0.35</w:t>
+      </w:r>
+      <w:r>
+        <w:rPr>
+          <w:rFonts w:ascii="Calibri" w:hAnsi="Calibri"/>
+          <w:sz w:val="22"/>
+        </w:rPr>
+        <w:t xml:space="preserve">, final consonants </w:t>
+      </w:r>
+      <w:r>
+        <w:rPr>
+          <w:rFonts w:ascii="Consolas" w:hAnsi="Consolas"/>
+          <w:color w:val="1F4D78"/>
+          <w:sz w:val="19"/>
+        </w:rPr>
+        <w:t>0.25</w:t>
+      </w:r>
+      <w:r>
+        <w:rPr>
+          <w:rFonts w:ascii="Calibri" w:hAnsi="Calibri"/>
+          <w:sz w:val="22"/>
+        </w:rPr>
+        <w:t xml:space="preserve">, rhyme-part edit similarity </w:t>
+      </w:r>
+      <w:r>
+        <w:rPr>
+          <w:rFonts w:ascii="Consolas" w:hAnsi="Consolas"/>
+          <w:color w:val="1F4D78"/>
+          <w:sz w:val="19"/>
+        </w:rPr>
+        <w:t>0.25</w:t>
+      </w:r>
+      <w:r>
+        <w:rPr>
+          <w:rFonts w:ascii="Calibri" w:hAnsi="Calibri"/>
+          <w:sz w:val="22"/>
+        </w:rPr>
+        <w:t xml:space="preserve">, stress alignment </w:t>
+      </w:r>
+      <w:r>
+        <w:rPr>
+          <w:rFonts w:ascii="Consolas" w:hAnsi="Consolas"/>
+          <w:color w:val="1F4D78"/>
+          <w:sz w:val="19"/>
+        </w:rPr>
+        <w:t>0.10</w:t>
+      </w:r>
+      <w:r>
+        <w:rPr>
+          <w:rFonts w:ascii="Calibri" w:hAnsi="Calibri"/>
+          <w:sz w:val="22"/>
+        </w:rPr>
+        <w:t xml:space="preserve">, and syllable similarity </w:t>
+      </w:r>
+      <w:r>
+        <w:rPr>
+          <w:rFonts w:ascii="Consolas" w:hAnsi="Consolas"/>
+          <w:color w:val="1F4D78"/>
+          <w:sz w:val="19"/>
+        </w:rPr>
+        <w:t>0.05</w:t>
+      </w:r>
+      <w:r>
+        <w:rPr>
+          <w:rFonts w:ascii="Calibri" w:hAnsi="Calibri"/>
+          <w:sz w:val="22"/>
+        </w:rPr>
+        <w:t xml:space="preserve">, with a default threshold of </w:t>
+      </w:r>
+      <w:r>
+        <w:rPr>
+          <w:rFonts w:ascii="Consolas" w:hAnsi="Consolas"/>
+          <w:color w:val="1F4D78"/>
+          <w:sz w:val="19"/>
+        </w:rPr>
+        <w:t>0.68</w:t>
+      </w:r>
+      <w:r>
+        <w:rPr>
+          <w:rFonts w:ascii="Calibri" w:hAnsi="Calibri"/>
+          <w:sz w:val="22"/>
+        </w:rPr>
+        <w:t>. It is a configurable heuristic, not a probability. Materially different dictionary alternatives remain unresolved unless a documented Stage 5 scholar override applies.</w:t>
+      </w:r>
+    </w:p>
+    <w:p>
+      <w:pPr>
+        <w:widowControl/>
+        <w:spacing w:before="0" w:after="120" w:line="300" w:lineRule="auto"/>
+      </w:pPr>
+      <w:r>
+        <w:rPr>
+          <w:rFonts w:ascii="Calibri" w:hAnsi="Calibri"/>
+          <w:sz w:val="22"/>
+        </w:rPr>
+        <w:t>Safe wording is: “The dictionary-based ending evidence produced an ABAB exact- rhyme scheme among four analyzable endings.” Do not claim that VerseVAD proved how the poem must be pronounced, performed, heard, or intended.</w:t>
+      </w:r>
+    </w:p>
+    <w:p>
+      <w:pPr>
+        <w:pStyle w:val="Heading2"/>
+      </w:pPr>
+      <w:r>
+        <w:rPr>
+          <w:rFonts w:ascii="Calibri" w:hAnsi="Calibri"/>
+          <w:sz w:val="22"/>
+        </w:rPr>
+        <w:t>Lexical diversity, word length, and structural word counts</w:t>
+      </w:r>
+    </w:p>
+    <w:p>
+      <w:pPr>
+        <w:widowControl/>
+        <w:spacing w:before="0" w:after="120" w:line="300" w:lineRule="auto"/>
+      </w:pPr>
+      <w:r>
+        <w:rPr>
+          <w:rFonts w:ascii="Calibri" w:hAnsi="Calibri"/>
+          <w:sz w:val="22"/>
+        </w:rPr>
+        <w:t xml:space="preserve">The optional </w:t>
+      </w:r>
+      <w:r>
+        <w:rPr>
+          <w:rFonts w:ascii="Calibri" w:hAnsi="Calibri"/>
+          <w:b/>
+          <w:sz w:val="22"/>
+        </w:rPr>
+        <w:t>Lexical Style</w:t>
+      </w:r>
+      <w:r>
+        <w:rPr>
+          <w:rFonts w:ascii="Calibri" w:hAnsi="Calibri"/>
+          <w:sz w:val="22"/>
+        </w:rPr>
+        <w:t xml:space="preserve"> module uses the shared poetry-preserving processing record and requires no external dataset. The broader planned visible-structure and syntax/lineation modules were skipped at the scholar's direction.</w:t>
+      </w:r>
+    </w:p>
+    <w:p>
+      <w:pPr>
+        <w:widowControl/>
+        <w:spacing w:before="0" w:after="120" w:line="300" w:lineRule="auto"/>
+      </w:pPr>
+      <w:r>
+        <w:rPr>
+          <w:rFonts w:ascii="Calibri" w:hAnsi="Calibri"/>
+          <w:sz w:val="22"/>
+        </w:rPr>
+        <w:t>One counted word is one shared-preprocessing lexical token. Punctuation and numeric tokens are excluded. This word unit may differ from an editor's orthographic convention for a contraction or hyphenated expression, so the token audit preserves exact surfaces, offsets, and inclusion reasons.</w:t>
+      </w:r>
+    </w:p>
+    <w:p>
+      <w:pPr>
+        <w:widowControl/>
+        <w:spacing w:before="0" w:after="120" w:line="300" w:lineRule="auto"/>
+      </w:pPr>
+      <w:r>
+        <w:rPr>
+          <w:rFonts w:ascii="Calibri" w:hAnsi="Calibri"/>
+          <w:sz w:val="22"/>
+        </w:rPr>
+        <w:t>Lexical diversity uses normalized observed surface forms. Lemmas remain separate audit evidence and never silently replace the forms present in the poem. The module reports:</w:t>
       </w:r>
     </w:p>
     <w:p>
@@ -8240,20 +8758,7 @@
           <w:rFonts w:ascii="Calibri" w:hAnsi="Calibri"/>
           <w:sz w:val="22"/>
         </w:rPr>
-        <w:t>one lexical-token count row for every preserved physical line, including</w:t>
-      </w:r>
-    </w:p>
-    <w:p>
-      <w:pPr>
-        <w:widowControl/>
-        <w:spacing w:before="0" w:after="120" w:line="300" w:lineRule="auto"/>
-      </w:pPr>
-      <w:r>
-        <w:rPr>
-          <w:rFonts w:ascii="Calibri" w:hAnsi="Calibri"/>
-          <w:sz w:val="22"/>
-        </w:rPr>
-        <w:t xml:space="preserve">  blank separators with zero; and</w:t>
+        <w:t>descriptive lexical-token, normalized surface-type, and plain TTR values;</w:t>
       </w:r>
     </w:p>
     <w:p>
@@ -8271,121 +8776,7 @@
           <w:rFonts w:ascii="Calibri" w:hAnsi="Calibri"/>
           <w:sz w:val="22"/>
         </w:rPr>
-        <w:t>lexical-token and nonblank-line counts for every stanza.</w:t>
-      </w:r>
-    </w:p>
-    <w:p>
-      <w:pPr>
-        <w:widowControl/>
-        <w:spacing w:before="0" w:after="120" w:line="300" w:lineRule="auto"/>
-      </w:pPr>
-      <w:r>
-        <w:rPr>
-          <w:rFonts w:ascii="Calibri" w:hAnsi="Calibri"/>
-          <w:sz w:val="22"/>
-        </w:rPr>
-        <w:t>Defaults are MATTR window 50, HD-D sample 42, and MTLD threshold 0.72. MATTR and HD-D remain missing when the text is shorter than their configured denominator. Undefined MTLD remains missing rather than becoming infinity or zero.</w:t>
-      </w:r>
-    </w:p>
-    <w:p>
-      <w:pPr>
-        <w:widowControl/>
-        <w:spacing w:before="0" w:after="120" w:line="300" w:lineRule="auto"/>
-      </w:pPr>
-      <w:r>
-        <w:rPr>
-          <w:rFonts w:ascii="Calibri" w:hAnsi="Calibri"/>
-          <w:sz w:val="22"/>
-        </w:rPr>
-        <w:t>Safe wording is: “Using a 50-token MATTR window, the normalized observed surface forms produced MATTR = [value].” Do not treat lexical diversity or word length as proof of literary quality, vocabulary knowledge, intelligence, education, comprehension, or reader ability.</w:t>
-      </w:r>
-    </w:p>
-    <w:p>
-      <w:pPr>
-        <w:pStyle w:val="Heading2"/>
-      </w:pPr>
-      <w:r>
-        <w:rPr>
-          <w:rFonts w:ascii="Calibri" w:hAnsi="Calibri"/>
-          <w:sz w:val="22"/>
-        </w:rPr>
-        <w:t>Eight emotion associations</w:t>
-      </w:r>
-    </w:p>
-    <w:p>
-      <w:pPr>
-        <w:widowControl/>
-        <w:spacing w:before="0" w:after="120" w:line="300" w:lineRule="auto"/>
-      </w:pPr>
-      <w:r>
-        <w:rPr>
-          <w:rFonts w:ascii="Calibri" w:hAnsi="Calibri"/>
-          <w:sz w:val="22"/>
-        </w:rPr>
-        <w:t>NRC Emotion values are binary, multi-label associations. VerseVAD reports the eight emotions—anger, anticipation, disgust, fear, joy, sadness, surprise, and trust—in their own section. An entry can be associated with several categories, so percentages do not need to total 100 percent. Read the labeled denominator.</w:t>
-      </w:r>
-    </w:p>
-    <w:p>
-      <w:pPr>
-        <w:widowControl/>
-        <w:spacing w:before="0" w:after="120" w:line="300" w:lineRule="auto"/>
-      </w:pPr>
-      <w:r>
-        <w:rPr>
-          <w:rFonts w:ascii="Calibri" w:hAnsi="Calibri"/>
-          <w:sz w:val="22"/>
-        </w:rPr>
-        <w:t>“Fear-associated vocabulary” is appropriate wording. “The poem is afraid” is not.</w:t>
-      </w:r>
-    </w:p>
-    <w:p>
-      <w:pPr>
-        <w:pStyle w:val="Heading2"/>
-      </w:pPr>
-      <w:r>
-        <w:rPr>
-          <w:rFonts w:ascii="Calibri" w:hAnsi="Calibri"/>
-          <w:sz w:val="22"/>
-        </w:rPr>
-        <w:t>Positive and negative sentiment associations</w:t>
-      </w:r>
-    </w:p>
-    <w:p>
-      <w:pPr>
-        <w:widowControl/>
-        <w:spacing w:before="0" w:after="120" w:line="300" w:lineRule="auto"/>
-      </w:pPr>
-      <w:r>
-        <w:rPr>
-          <w:rFonts w:ascii="Calibri" w:hAnsi="Calibri"/>
-          <w:sz w:val="22"/>
-        </w:rPr>
-        <w:t>Positive and negative are broad sentiment labels in NRC Emotion. VerseVAD analyzes them with the same documented occurrence-counting logic but reports them separately from the eight emotions. They are not endpoints of the VAD valence scale, and their rates need not sum to 100 percent.</w:t>
-      </w:r>
-    </w:p>
-    <w:p>
-      <w:pPr>
-        <w:pStyle w:val="Heading2"/>
-      </w:pPr>
-      <w:r>
-        <w:rPr>
-          <w:rFonts w:ascii="Calibri" w:hAnsi="Calibri"/>
-          <w:sz w:val="22"/>
-        </w:rPr>
-        <w:t>Emotion intensity</w:t>
-      </w:r>
-    </w:p>
-    <w:p>
-      <w:pPr>
-        <w:widowControl/>
-        <w:spacing w:before="0" w:after="120" w:line="300" w:lineRule="auto"/>
-      </w:pPr>
-      <w:r>
-        <w:rPr>
-          <w:rFonts w:ascii="Calibri" w:hAnsi="Calibri"/>
-          <w:sz w:val="22"/>
-        </w:rPr>
-        <w:t>NRC Emotion Intensity supplies numeric values only for particular word-emotion pairs. VerseVAD keeps:</w:t>
+        <w:t>MATTR across every overlapping configured token window;</w:t>
       </w:r>
     </w:p>
     <w:p>
@@ -8403,7 +8794,20 @@
           <w:rFonts w:ascii="Calibri" w:hAnsi="Calibri"/>
           <w:sz w:val="22"/>
         </w:rPr>
-        <w:t>prevalence of matched pairs;</w:t>
+        <w:t>HD-D as the expected distinct-type proportion in a configured</w:t>
+      </w:r>
+    </w:p>
+    <w:p>
+      <w:pPr>
+        <w:widowControl/>
+        <w:spacing w:before="0" w:after="120" w:line="300" w:lineRule="auto"/>
+      </w:pPr>
+      <w:r>
+        <w:rPr>
+          <w:rFonts w:ascii="Calibri" w:hAnsi="Calibri"/>
+          <w:sz w:val="22"/>
+        </w:rPr>
+        <w:t xml:space="preserve">  without-replacement sample;</w:t>
       </w:r>
     </w:p>
     <w:p>
@@ -8421,7 +8825,7 @@
           <w:rFonts w:ascii="Calibri" w:hAnsi="Calibri"/>
           <w:sz w:val="22"/>
         </w:rPr>
-        <w:t>token-weighted mean intensity among supplied pairs;</w:t>
+        <w:t>forward/reverse and mean MTLD at a configured TTR threshold;</w:t>
       </w:r>
     </w:p>
     <w:p>
@@ -8439,395 +8843,7 @@
           <w:rFonts w:ascii="Calibri" w:hAnsi="Calibri"/>
           <w:sz w:val="22"/>
         </w:rPr>
-        <w:t>type-weighted mean intensity among supplied pairs.</w:t>
-      </w:r>
-    </w:p>
-    <w:p>
-      <w:pPr>
-        <w:widowControl/>
-        <w:spacing w:before="0" w:after="120" w:line="300" w:lineRule="auto"/>
-      </w:pPr>
-      <w:r>
-        <w:rPr>
-          <w:rFonts w:ascii="Calibri" w:hAnsi="Calibri"/>
-          <w:sz w:val="22"/>
-        </w:rPr>
-        <w:t>An absent word-emotion pair is missing, not an intensity of zero.</w:t>
-      </w:r>
-    </w:p>
-    <w:p>
-      <w:pPr>
-        <w:pStyle w:val="Heading1"/>
-      </w:pPr>
-      <w:r>
-        <w:rPr>
-          <w:rFonts w:ascii="Calibri" w:hAnsi="Calibri"/>
-          <w:sz w:val="22"/>
-        </w:rPr>
-        <w:t>8. Single Poem and Other Text Workspaces</w:t>
-      </w:r>
-    </w:p>
-    <w:p>
-      <w:pPr>
-        <w:pStyle w:val="Heading2"/>
-      </w:pPr>
-      <w:r>
-        <w:rPr>
-          <w:rFonts w:ascii="Calibri" w:hAnsi="Calibri"/>
-          <w:sz w:val="22"/>
-        </w:rPr>
-        <w:t>Add a poem</w:t>
-      </w:r>
-    </w:p>
-    <w:p>
-      <w:pPr>
-        <w:widowControl/>
-        <w:spacing w:before="0" w:after="120" w:line="300" w:lineRule="auto"/>
-      </w:pPr>
-      <w:r>
-        <w:rPr>
-          <w:rFonts w:ascii="Calibri" w:hAnsi="Calibri"/>
-          <w:sz w:val="22"/>
-        </w:rPr>
-        <w:t xml:space="preserve">Paste text or upload one UTF-8 </w:t>
-      </w:r>
-      <w:r>
-        <w:rPr>
-          <w:rFonts w:ascii="Consolas" w:hAnsi="Consolas"/>
-          <w:color w:val="1F4D78"/>
-          <w:sz w:val="19"/>
-        </w:rPr>
-        <w:t>.txt</w:t>
-      </w:r>
-      <w:r>
-        <w:rPr>
-          <w:rFonts w:ascii="Calibri" w:hAnsi="Calibri"/>
-          <w:sz w:val="22"/>
-        </w:rPr>
-        <w:t xml:space="preserve"> file up to 5 MB. Enter a title or working label. Optional author, date/year, and source/edition notes are available under bibliographic metadata. The live word, physical-line, and text-block counts are orientation only; the actual analysis uses the shared linguistic tokenizer. </w:t>
-      </w:r>
-      <w:r>
-        <w:rPr>
-          <w:rFonts w:ascii="Calibri" w:hAnsi="Calibri"/>
-          <w:b/>
-          <w:sz w:val="22"/>
-        </w:rPr>
-        <w:t>Clear text</w:t>
-      </w:r>
-      <w:r>
-        <w:rPr>
-          <w:rFonts w:ascii="Calibri" w:hAnsi="Calibri"/>
-          <w:sz w:val="22"/>
-        </w:rPr>
-        <w:t xml:space="preserve"> requires confirmation. The optional workspace name labels the temporary session but does not create a persistent corpus project.</w:t>
-      </w:r>
-    </w:p>
-    <w:p>
-      <w:pPr>
-        <w:widowControl/>
-        <w:spacing w:before="0" w:after="120" w:line="300" w:lineRule="auto"/>
-      </w:pPr>
-      <w:r>
-        <w:rPr>
-          <w:rFonts w:ascii="Calibri" w:hAnsi="Calibri"/>
-          <w:b/>
-          <w:sz w:val="22"/>
-        </w:rPr>
-        <w:t>Other Text</w:t>
-      </w:r>
-      <w:r>
-        <w:rPr>
-          <w:rFonts w:ascii="Calibri" w:hAnsi="Calibri"/>
-          <w:sz w:val="22"/>
-        </w:rPr>
-        <w:t xml:space="preserve"> reuses this interface and the same analysis engines with </w:t>
-      </w:r>
-      <w:r>
-        <w:rPr>
-          <w:rFonts w:ascii="Calibri" w:hAnsi="Calibri"/>
-          <w:b/>
-          <w:sz w:val="22"/>
-        </w:rPr>
-        <w:t>Analyze Text</w:t>
-      </w:r>
-      <w:r>
-        <w:rPr>
-          <w:rFonts w:ascii="Calibri" w:hAnsi="Calibri"/>
-          <w:sz w:val="22"/>
-        </w:rPr>
-        <w:t xml:space="preserve"> terminology. Pronunciation, meter, and rhyme remain available, but meter and rhyme are visibly marked experimental for non-lineated prose.</w:t>
-      </w:r>
-    </w:p>
-    <w:p>
-      <w:pPr>
-        <w:pStyle w:val="Heading2"/>
-      </w:pPr>
-      <w:r>
-        <w:rPr>
-          <w:rFonts w:ascii="Calibri" w:hAnsi="Calibri"/>
-          <w:sz w:val="22"/>
-        </w:rPr>
-        <w:t>Choose evidence</w:t>
-      </w:r>
-    </w:p>
-    <w:p>
-      <w:pPr>
-        <w:widowControl/>
-        <w:spacing w:before="0" w:after="120" w:line="300" w:lineRule="auto"/>
-      </w:pPr>
-      <w:r>
-        <w:rPr>
-          <w:rFonts w:ascii="Calibri" w:hAnsi="Calibri"/>
-          <w:sz w:val="22"/>
-        </w:rPr>
-        <w:t xml:space="preserve">Select one or more affective lexicons and/or enable the optional normative lexical concreteness, SUBTLEX-US frequency, Kuperman Age of Acquisition, CMUdict pronunciation/prosody-foundation, candidate-meter, rhyme/sound, Lexical Style, or PoetryID modules. The controls are grouped as </w:t>
-      </w:r>
-      <w:r>
-        <w:rPr>
-          <w:rFonts w:ascii="Calibri" w:hAnsi="Calibri"/>
-          <w:b/>
-          <w:sz w:val="22"/>
-        </w:rPr>
-        <w:t>Core Analysis</w:t>
-      </w:r>
-      <w:r>
-        <w:rPr>
-          <w:rFonts w:ascii="Calibri" w:hAnsi="Calibri"/>
-          <w:sz w:val="22"/>
-        </w:rPr>
-        <w:t xml:space="preserve">, </w:t>
-      </w:r>
-      <w:r>
-        <w:rPr>
-          <w:rFonts w:ascii="Calibri" w:hAnsi="Calibri"/>
-          <w:b/>
-          <w:sz w:val="22"/>
-        </w:rPr>
-        <w:t>Lexical Character</w:t>
-      </w:r>
-      <w:r>
-        <w:rPr>
-          <w:rFonts w:ascii="Calibri" w:hAnsi="Calibri"/>
-          <w:sz w:val="22"/>
-        </w:rPr>
-        <w:t xml:space="preserve">, </w:t>
-      </w:r>
-      <w:r>
-        <w:rPr>
-          <w:rFonts w:ascii="Calibri" w:hAnsi="Calibri"/>
-          <w:b/>
-          <w:sz w:val="22"/>
-        </w:rPr>
-        <w:t>Structural and Lexical Measures</w:t>
-      </w:r>
-      <w:r>
-        <w:rPr>
-          <w:rFonts w:ascii="Calibri" w:hAnsi="Calibri"/>
-          <w:sz w:val="22"/>
-        </w:rPr>
-        <w:t xml:space="preserve">, </w:t>
-      </w:r>
-      <w:r>
-        <w:rPr>
-          <w:rFonts w:ascii="Calibri" w:hAnsi="Calibri"/>
-          <w:b/>
-          <w:sz w:val="22"/>
-        </w:rPr>
-        <w:t>PoetryID</w:t>
-      </w:r>
-      <w:r>
-        <w:rPr>
-          <w:rFonts w:ascii="Calibri" w:hAnsi="Calibri"/>
-          <w:sz w:val="22"/>
-        </w:rPr>
-        <w:t xml:space="preserve">, and </w:t>
-      </w:r>
-      <w:r>
-        <w:rPr>
-          <w:rFonts w:ascii="Calibri" w:hAnsi="Calibri"/>
-          <w:b/>
-          <w:sz w:val="22"/>
-        </w:rPr>
-        <w:t>Sound and Form</w:t>
-      </w:r>
-      <w:r>
-        <w:rPr>
-          <w:rFonts w:ascii="Calibri" w:hAnsi="Calibri"/>
-          <w:sz w:val="22"/>
-        </w:rPr>
-        <w:t>.</w:t>
-      </w:r>
-    </w:p>
-    <w:p>
-      <w:pPr>
-        <w:widowControl/>
-        <w:spacing w:before="0" w:after="120" w:line="300" w:lineRule="auto"/>
-      </w:pPr>
-      <w:r>
-        <w:rPr>
-          <w:rFonts w:ascii="Calibri" w:hAnsi="Calibri"/>
-          <w:sz w:val="22"/>
-        </w:rPr>
-        <w:t xml:space="preserve">The optional </w:t>
-      </w:r>
-      <w:r>
-        <w:rPr>
-          <w:rFonts w:ascii="Calibri" w:hAnsi="Calibri"/>
-          <w:b/>
-          <w:sz w:val="22"/>
-        </w:rPr>
-        <w:t>Essential</w:t>
-      </w:r>
-      <w:r>
-        <w:rPr>
-          <w:rFonts w:ascii="Calibri" w:hAnsi="Calibri"/>
-          <w:sz w:val="22"/>
-        </w:rPr>
-        <w:t xml:space="preserve">, </w:t>
-      </w:r>
-      <w:r>
-        <w:rPr>
-          <w:rFonts w:ascii="Calibri" w:hAnsi="Calibri"/>
-          <w:b/>
-          <w:sz w:val="22"/>
-        </w:rPr>
-        <w:t>Literary</w:t>
-      </w:r>
-      <w:r>
-        <w:rPr>
-          <w:rFonts w:ascii="Calibri" w:hAnsi="Calibri"/>
-          <w:sz w:val="22"/>
-        </w:rPr>
-        <w:t xml:space="preserve">, </w:t>
-      </w:r>
-      <w:r>
-        <w:rPr>
-          <w:rFonts w:ascii="Calibri" w:hAnsi="Calibri"/>
-          <w:b/>
-          <w:sz w:val="22"/>
-        </w:rPr>
-        <w:t>Sound and Form</w:t>
-      </w:r>
-      <w:r>
-        <w:rPr>
-          <w:rFonts w:ascii="Calibri" w:hAnsi="Calibri"/>
-          <w:sz w:val="22"/>
-        </w:rPr>
-        <w:t xml:space="preserve">, and </w:t>
-      </w:r>
-      <w:r>
-        <w:rPr>
-          <w:rFonts w:ascii="Calibri" w:hAnsi="Calibri"/>
-          <w:b/>
-          <w:sz w:val="22"/>
-        </w:rPr>
-        <w:t>Complete</w:t>
-      </w:r>
-      <w:r>
-        <w:rPr>
-          <w:rFonts w:ascii="Calibri" w:hAnsi="Calibri"/>
-          <w:sz w:val="22"/>
-        </w:rPr>
-        <w:t xml:space="preserve"> presets change module selections only after </w:t>
-      </w:r>
-      <w:r>
-        <w:rPr>
-          <w:rFonts w:ascii="Calibri" w:hAnsi="Calibri"/>
-          <w:b/>
-          <w:sz w:val="22"/>
-        </w:rPr>
-        <w:t>Apply preset</w:t>
-      </w:r>
-      <w:r>
-        <w:rPr>
-          <w:rFonts w:ascii="Calibri" w:hAnsi="Calibri"/>
-          <w:sz w:val="22"/>
-        </w:rPr>
-        <w:t xml:space="preserve"> is clicked. </w:t>
-      </w:r>
-      <w:r>
-        <w:rPr>
-          <w:rFonts w:ascii="Calibri" w:hAnsi="Calibri"/>
-          <w:b/>
-          <w:sz w:val="22"/>
-        </w:rPr>
-        <w:t>Custom</w:t>
-      </w:r>
-      <w:r>
-        <w:rPr>
-          <w:rFonts w:ascii="Calibri" w:hAnsi="Calibri"/>
-          <w:sz w:val="22"/>
-        </w:rPr>
-        <w:t xml:space="preserve"> retains the current manual selection. Presets never overwrite advanced thresholds, filtering, phrase policy, stopwords, pronunciation overrides, or other methodology.</w:t>
-      </w:r>
-    </w:p>
-    <w:p>
-      <w:pPr>
-        <w:widowControl/>
-        <w:spacing w:before="0" w:after="120" w:line="300" w:lineRule="auto"/>
-      </w:pPr>
-      <w:r>
-        <w:rPr>
-          <w:rFonts w:ascii="Calibri" w:hAnsi="Calibri"/>
-          <w:sz w:val="22"/>
-        </w:rPr>
-        <w:t>VAD, categorical association, intensity, concreteness, corpus-relative frequency, retrospective lexical AoA, dictionary pronunciation/lexical stress, configured meter fit, rhyme/sound evidence, lexical diversity/word counts, and PoetryID candidate profiles answer different questions and remain separate. PoetryID requires an enabled VAD source and reuses its completed result; selecting meter or rhyme automatically runs its pronunciation dependency.</w:t>
-      </w:r>
-    </w:p>
-    <w:p>
-      <w:pPr>
-        <w:widowControl/>
-        <w:spacing w:before="0" w:after="120" w:line="300" w:lineRule="auto"/>
-      </w:pPr>
-      <w:r>
-        <w:rPr>
-          <w:rFonts w:ascii="Calibri" w:hAnsi="Calibri"/>
-          <w:sz w:val="22"/>
-        </w:rPr>
-        <w:t xml:space="preserve">The same eight optional modules are also available in </w:t>
-      </w:r>
-      <w:r>
-        <w:rPr>
-          <w:rFonts w:ascii="Calibri" w:hAnsi="Calibri"/>
-          <w:b/>
-          <w:sz w:val="22"/>
-        </w:rPr>
-        <w:t>Project / Corpus</w:t>
-      </w:r>
-      <w:r>
-        <w:rPr>
-          <w:rFonts w:ascii="Calibri" w:hAnsi="Calibri"/>
-          <w:sz w:val="22"/>
-        </w:rPr>
-        <w:t>. Single Poem and Other Text results remain temporary unless downloaded; corpus runs persist the same module result envelopes, configurations, coverage, warnings, provenance, and audit artifacts against exact text versions.</w:t>
-      </w:r>
-    </w:p>
-    <w:p>
-      <w:pPr>
-        <w:widowControl/>
-        <w:spacing w:before="0" w:after="120" w:line="300" w:lineRule="auto"/>
-      </w:pPr>
-      <w:r>
-        <w:rPr>
-          <w:rFonts w:ascii="Calibri" w:hAnsi="Calibri"/>
-          <w:sz w:val="22"/>
-        </w:rPr>
-        <w:t xml:space="preserve">Under </w:t>
-      </w:r>
-      <w:r>
-        <w:rPr>
-          <w:rFonts w:ascii="Calibri" w:hAnsi="Calibri"/>
-          <w:b/>
-          <w:sz w:val="22"/>
-        </w:rPr>
-        <w:t>Analysis configuration and methodology</w:t>
-      </w:r>
-      <w:r>
-        <w:rPr>
-          <w:rFonts w:ascii="Calibri" w:hAnsi="Calibri"/>
-          <w:sz w:val="22"/>
-        </w:rPr>
-        <w:t>, choose:</w:t>
+        <w:t>Unicode alphabetic-character word-length statistics and distribution;</w:t>
       </w:r>
     </w:p>
     <w:p>
@@ -8845,7 +8861,20 @@
           <w:rFonts w:ascii="Calibri" w:hAnsi="Calibri"/>
           <w:sz w:val="22"/>
         </w:rPr>
-        <w:t>phrase policy;</w:t>
+        <w:t>one lexical-token count row for every preserved physical line, including</w:t>
+      </w:r>
+    </w:p>
+    <w:p>
+      <w:pPr>
+        <w:widowControl/>
+        <w:spacing w:before="0" w:after="120" w:line="300" w:lineRule="auto"/>
+      </w:pPr>
+      <w:r>
+        <w:rPr>
+          <w:rFonts w:ascii="Calibri" w:hAnsi="Calibri"/>
+          <w:sz w:val="22"/>
+        </w:rPr>
+        <w:t xml:space="preserve">  blank separators with zero; and</w:t>
       </w:r>
     </w:p>
     <w:p>
@@ -8863,7 +8892,121 @@
           <w:rFonts w:ascii="Calibri" w:hAnsi="Calibri"/>
           <w:sz w:val="22"/>
         </w:rPr>
-        <w:t>minimum matched observations for sparse-result warnings;</w:t>
+        <w:t>lexical-token and nonblank-line counts for every stanza.</w:t>
+      </w:r>
+    </w:p>
+    <w:p>
+      <w:pPr>
+        <w:widowControl/>
+        <w:spacing w:before="0" w:after="120" w:line="300" w:lineRule="auto"/>
+      </w:pPr>
+      <w:r>
+        <w:rPr>
+          <w:rFonts w:ascii="Calibri" w:hAnsi="Calibri"/>
+          <w:sz w:val="22"/>
+        </w:rPr>
+        <w:t>Defaults are MATTR window 50, HD-D sample 42, and MTLD threshold 0.72. MATTR and HD-D remain missing when the text is shorter than their configured denominator. Undefined MTLD remains missing rather than becoming infinity or zero.</w:t>
+      </w:r>
+    </w:p>
+    <w:p>
+      <w:pPr>
+        <w:widowControl/>
+        <w:spacing w:before="0" w:after="120" w:line="300" w:lineRule="auto"/>
+      </w:pPr>
+      <w:r>
+        <w:rPr>
+          <w:rFonts w:ascii="Calibri" w:hAnsi="Calibri"/>
+          <w:sz w:val="22"/>
+        </w:rPr>
+        <w:t>Safe wording is: “Using a 50-token MATTR window, the normalized observed surface forms produced MATTR = [value].” Do not treat lexical diversity or word length as proof of literary quality, vocabulary knowledge, intelligence, education, comprehension, or reader ability.</w:t>
+      </w:r>
+    </w:p>
+    <w:p>
+      <w:pPr>
+        <w:pStyle w:val="Heading2"/>
+      </w:pPr>
+      <w:r>
+        <w:rPr>
+          <w:rFonts w:ascii="Calibri" w:hAnsi="Calibri"/>
+          <w:sz w:val="22"/>
+        </w:rPr>
+        <w:t>Eight emotion associations</w:t>
+      </w:r>
+    </w:p>
+    <w:p>
+      <w:pPr>
+        <w:widowControl/>
+        <w:spacing w:before="0" w:after="120" w:line="300" w:lineRule="auto"/>
+      </w:pPr>
+      <w:r>
+        <w:rPr>
+          <w:rFonts w:ascii="Calibri" w:hAnsi="Calibri"/>
+          <w:sz w:val="22"/>
+        </w:rPr>
+        <w:t>NRC Emotion values are binary, multi-label associations. VerseVAD reports the eight emotions—anger, anticipation, disgust, fear, joy, sadness, surprise, and trust—in their own section. An entry can be associated with several categories, so percentages do not need to total 100 percent. Read the labeled denominator.</w:t>
+      </w:r>
+    </w:p>
+    <w:p>
+      <w:pPr>
+        <w:widowControl/>
+        <w:spacing w:before="0" w:after="120" w:line="300" w:lineRule="auto"/>
+      </w:pPr>
+      <w:r>
+        <w:rPr>
+          <w:rFonts w:ascii="Calibri" w:hAnsi="Calibri"/>
+          <w:sz w:val="22"/>
+        </w:rPr>
+        <w:t>“Fear-associated vocabulary” is appropriate wording. “The poem is afraid” is not.</w:t>
+      </w:r>
+    </w:p>
+    <w:p>
+      <w:pPr>
+        <w:pStyle w:val="Heading2"/>
+      </w:pPr>
+      <w:r>
+        <w:rPr>
+          <w:rFonts w:ascii="Calibri" w:hAnsi="Calibri"/>
+          <w:sz w:val="22"/>
+        </w:rPr>
+        <w:t>Positive and negative sentiment associations</w:t>
+      </w:r>
+    </w:p>
+    <w:p>
+      <w:pPr>
+        <w:widowControl/>
+        <w:spacing w:before="0" w:after="120" w:line="300" w:lineRule="auto"/>
+      </w:pPr>
+      <w:r>
+        <w:rPr>
+          <w:rFonts w:ascii="Calibri" w:hAnsi="Calibri"/>
+          <w:sz w:val="22"/>
+        </w:rPr>
+        <w:t>Positive and negative are broad sentiment labels in NRC Emotion. VerseVAD analyzes them with the same documented occurrence-counting logic but reports them separately from the eight emotions. They are not endpoints of the VAD valence scale, and their rates need not sum to 100 percent.</w:t>
+      </w:r>
+    </w:p>
+    <w:p>
+      <w:pPr>
+        <w:pStyle w:val="Heading2"/>
+      </w:pPr>
+      <w:r>
+        <w:rPr>
+          <w:rFonts w:ascii="Calibri" w:hAnsi="Calibri"/>
+          <w:sz w:val="22"/>
+        </w:rPr>
+        <w:t>Emotion intensity</w:t>
+      </w:r>
+    </w:p>
+    <w:p>
+      <w:pPr>
+        <w:widowControl/>
+        <w:spacing w:before="0" w:after="120" w:line="300" w:lineRule="auto"/>
+      </w:pPr>
+      <w:r>
+        <w:rPr>
+          <w:rFonts w:ascii="Calibri" w:hAnsi="Calibri"/>
+          <w:sz w:val="22"/>
+        </w:rPr>
+        <w:t>NRC Emotion Intensity supplies numeric values only for particular word-emotion pairs. VerseVAD keeps:</w:t>
       </w:r>
     </w:p>
     <w:p>
@@ -8881,7 +9024,7 @@
           <w:rFonts w:ascii="Calibri" w:hAnsi="Calibri"/>
           <w:sz w:val="22"/>
         </w:rPr>
-        <w:t>whether to display all-matched results;</w:t>
+        <w:t>prevalence of matched pairs;</w:t>
       </w:r>
     </w:p>
     <w:p>
@@ -8899,7 +9042,7 @@
           <w:rFonts w:ascii="Calibri" w:hAnsi="Calibri"/>
           <w:sz w:val="22"/>
         </w:rPr>
-        <w:t>whether to display stopword-excluded results;</w:t>
+        <w:t>token-weighted mean intensity among supplied pairs;</w:t>
       </w:r>
     </w:p>
     <w:p>
@@ -8917,7 +9060,395 @@
           <w:rFonts w:ascii="Calibri" w:hAnsi="Calibri"/>
           <w:sz w:val="22"/>
         </w:rPr>
-        <w:t>concreteness lower and upper orientation thresholds;</w:t>
+        <w:t>type-weighted mean intensity among supplied pairs.</w:t>
+      </w:r>
+    </w:p>
+    <w:p>
+      <w:pPr>
+        <w:widowControl/>
+        <w:spacing w:before="0" w:after="120" w:line="300" w:lineRule="auto"/>
+      </w:pPr>
+      <w:r>
+        <w:rPr>
+          <w:rFonts w:ascii="Calibri" w:hAnsi="Calibri"/>
+          <w:sz w:val="22"/>
+        </w:rPr>
+        <w:t>An absent word-emotion pair is missing, not an intensity of zero.</w:t>
+      </w:r>
+    </w:p>
+    <w:p>
+      <w:pPr>
+        <w:pStyle w:val="Heading1"/>
+      </w:pPr>
+      <w:r>
+        <w:rPr>
+          <w:rFonts w:ascii="Calibri" w:hAnsi="Calibri"/>
+          <w:sz w:val="22"/>
+        </w:rPr>
+        <w:t>8. Single Poem and Other Text Workspaces</w:t>
+      </w:r>
+    </w:p>
+    <w:p>
+      <w:pPr>
+        <w:pStyle w:val="Heading2"/>
+      </w:pPr>
+      <w:r>
+        <w:rPr>
+          <w:rFonts w:ascii="Calibri" w:hAnsi="Calibri"/>
+          <w:sz w:val="22"/>
+        </w:rPr>
+        <w:t>Add a poem</w:t>
+      </w:r>
+    </w:p>
+    <w:p>
+      <w:pPr>
+        <w:widowControl/>
+        <w:spacing w:before="0" w:after="120" w:line="300" w:lineRule="auto"/>
+      </w:pPr>
+      <w:r>
+        <w:rPr>
+          <w:rFonts w:ascii="Calibri" w:hAnsi="Calibri"/>
+          <w:sz w:val="22"/>
+        </w:rPr>
+        <w:t xml:space="preserve">Paste text or upload one UTF-8 </w:t>
+      </w:r>
+      <w:r>
+        <w:rPr>
+          <w:rFonts w:ascii="Consolas" w:hAnsi="Consolas"/>
+          <w:color w:val="1F4D78"/>
+          <w:sz w:val="19"/>
+        </w:rPr>
+        <w:t>.txt</w:t>
+      </w:r>
+      <w:r>
+        <w:rPr>
+          <w:rFonts w:ascii="Calibri" w:hAnsi="Calibri"/>
+          <w:sz w:val="22"/>
+        </w:rPr>
+        <w:t xml:space="preserve"> file up to 5 MB. Enter a title or working label. Optional author, date/year, and source/edition notes are available under bibliographic metadata. The live word, physical-line, and text-block counts are orientation only; the actual analysis uses the shared linguistic tokenizer. </w:t>
+      </w:r>
+      <w:r>
+        <w:rPr>
+          <w:rFonts w:ascii="Calibri" w:hAnsi="Calibri"/>
+          <w:b/>
+          <w:sz w:val="22"/>
+        </w:rPr>
+        <w:t>Clear text</w:t>
+      </w:r>
+      <w:r>
+        <w:rPr>
+          <w:rFonts w:ascii="Calibri" w:hAnsi="Calibri"/>
+          <w:sz w:val="22"/>
+        </w:rPr>
+        <w:t xml:space="preserve"> requires confirmation. The optional workspace name labels the temporary session but does not create a persistent corpus project.</w:t>
+      </w:r>
+    </w:p>
+    <w:p>
+      <w:pPr>
+        <w:widowControl/>
+        <w:spacing w:before="0" w:after="120" w:line="300" w:lineRule="auto"/>
+      </w:pPr>
+      <w:r>
+        <w:rPr>
+          <w:rFonts w:ascii="Calibri" w:hAnsi="Calibri"/>
+          <w:b/>
+          <w:sz w:val="22"/>
+        </w:rPr>
+        <w:t>Other Text</w:t>
+      </w:r>
+      <w:r>
+        <w:rPr>
+          <w:rFonts w:ascii="Calibri" w:hAnsi="Calibri"/>
+          <w:sz w:val="22"/>
+        </w:rPr>
+        <w:t xml:space="preserve"> reuses this interface and the same analysis engines with </w:t>
+      </w:r>
+      <w:r>
+        <w:rPr>
+          <w:rFonts w:ascii="Calibri" w:hAnsi="Calibri"/>
+          <w:b/>
+          <w:sz w:val="22"/>
+        </w:rPr>
+        <w:t>Analyze Text</w:t>
+      </w:r>
+      <w:r>
+        <w:rPr>
+          <w:rFonts w:ascii="Calibri" w:hAnsi="Calibri"/>
+          <w:sz w:val="22"/>
+        </w:rPr>
+        <w:t xml:space="preserve"> terminology. Pronunciation, meter, and rhyme remain available, but meter and rhyme are visibly marked experimental for non-lineated prose.</w:t>
+      </w:r>
+    </w:p>
+    <w:p>
+      <w:pPr>
+        <w:pStyle w:val="Heading2"/>
+      </w:pPr>
+      <w:r>
+        <w:rPr>
+          <w:rFonts w:ascii="Calibri" w:hAnsi="Calibri"/>
+          <w:sz w:val="22"/>
+        </w:rPr>
+        <w:t>Choose evidence</w:t>
+      </w:r>
+    </w:p>
+    <w:p>
+      <w:pPr>
+        <w:widowControl/>
+        <w:spacing w:before="0" w:after="120" w:line="300" w:lineRule="auto"/>
+      </w:pPr>
+      <w:r>
+        <w:rPr>
+          <w:rFonts w:ascii="Calibri" w:hAnsi="Calibri"/>
+          <w:sz w:val="22"/>
+        </w:rPr>
+        <w:t xml:space="preserve">Select one or more affective lexicons and/or enable the optional normative lexical concreteness, SUBTLEX-US frequency, Kuperman Age of Acquisition, CMUdict pronunciation/prosody-foundation, candidate-meter, rhyme/sound, Lexical Style, or PoetryID modules. The controls are grouped as </w:t>
+      </w:r>
+      <w:r>
+        <w:rPr>
+          <w:rFonts w:ascii="Calibri" w:hAnsi="Calibri"/>
+          <w:b/>
+          <w:sz w:val="22"/>
+        </w:rPr>
+        <w:t>Core Analysis</w:t>
+      </w:r>
+      <w:r>
+        <w:rPr>
+          <w:rFonts w:ascii="Calibri" w:hAnsi="Calibri"/>
+          <w:sz w:val="22"/>
+        </w:rPr>
+        <w:t xml:space="preserve">, </w:t>
+      </w:r>
+      <w:r>
+        <w:rPr>
+          <w:rFonts w:ascii="Calibri" w:hAnsi="Calibri"/>
+          <w:b/>
+          <w:sz w:val="22"/>
+        </w:rPr>
+        <w:t>Lexical Character</w:t>
+      </w:r>
+      <w:r>
+        <w:rPr>
+          <w:rFonts w:ascii="Calibri" w:hAnsi="Calibri"/>
+          <w:sz w:val="22"/>
+        </w:rPr>
+        <w:t xml:space="preserve">, </w:t>
+      </w:r>
+      <w:r>
+        <w:rPr>
+          <w:rFonts w:ascii="Calibri" w:hAnsi="Calibri"/>
+          <w:b/>
+          <w:sz w:val="22"/>
+        </w:rPr>
+        <w:t>Structural and Lexical Measures</w:t>
+      </w:r>
+      <w:r>
+        <w:rPr>
+          <w:rFonts w:ascii="Calibri" w:hAnsi="Calibri"/>
+          <w:sz w:val="22"/>
+        </w:rPr>
+        <w:t xml:space="preserve">, </w:t>
+      </w:r>
+      <w:r>
+        <w:rPr>
+          <w:rFonts w:ascii="Calibri" w:hAnsi="Calibri"/>
+          <w:b/>
+          <w:sz w:val="22"/>
+        </w:rPr>
+        <w:t>PoetryID</w:t>
+      </w:r>
+      <w:r>
+        <w:rPr>
+          <w:rFonts w:ascii="Calibri" w:hAnsi="Calibri"/>
+          <w:sz w:val="22"/>
+        </w:rPr>
+        <w:t xml:space="preserve">, and </w:t>
+      </w:r>
+      <w:r>
+        <w:rPr>
+          <w:rFonts w:ascii="Calibri" w:hAnsi="Calibri"/>
+          <w:b/>
+          <w:sz w:val="22"/>
+        </w:rPr>
+        <w:t>Sound and Form</w:t>
+      </w:r>
+      <w:r>
+        <w:rPr>
+          <w:rFonts w:ascii="Calibri" w:hAnsi="Calibri"/>
+          <w:sz w:val="22"/>
+        </w:rPr>
+        <w:t>.</w:t>
+      </w:r>
+    </w:p>
+    <w:p>
+      <w:pPr>
+        <w:widowControl/>
+        <w:spacing w:before="0" w:after="120" w:line="300" w:lineRule="auto"/>
+      </w:pPr>
+      <w:r>
+        <w:rPr>
+          <w:rFonts w:ascii="Calibri" w:hAnsi="Calibri"/>
+          <w:sz w:val="22"/>
+        </w:rPr>
+        <w:t xml:space="preserve">The optional </w:t>
+      </w:r>
+      <w:r>
+        <w:rPr>
+          <w:rFonts w:ascii="Calibri" w:hAnsi="Calibri"/>
+          <w:b/>
+          <w:sz w:val="22"/>
+        </w:rPr>
+        <w:t>Essential</w:t>
+      </w:r>
+      <w:r>
+        <w:rPr>
+          <w:rFonts w:ascii="Calibri" w:hAnsi="Calibri"/>
+          <w:sz w:val="22"/>
+        </w:rPr>
+        <w:t xml:space="preserve">, </w:t>
+      </w:r>
+      <w:r>
+        <w:rPr>
+          <w:rFonts w:ascii="Calibri" w:hAnsi="Calibri"/>
+          <w:b/>
+          <w:sz w:val="22"/>
+        </w:rPr>
+        <w:t>Literary</w:t>
+      </w:r>
+      <w:r>
+        <w:rPr>
+          <w:rFonts w:ascii="Calibri" w:hAnsi="Calibri"/>
+          <w:sz w:val="22"/>
+        </w:rPr>
+        <w:t xml:space="preserve">, </w:t>
+      </w:r>
+      <w:r>
+        <w:rPr>
+          <w:rFonts w:ascii="Calibri" w:hAnsi="Calibri"/>
+          <w:b/>
+          <w:sz w:val="22"/>
+        </w:rPr>
+        <w:t>Sound and Form</w:t>
+      </w:r>
+      <w:r>
+        <w:rPr>
+          <w:rFonts w:ascii="Calibri" w:hAnsi="Calibri"/>
+          <w:sz w:val="22"/>
+        </w:rPr>
+        <w:t xml:space="preserve">, and </w:t>
+      </w:r>
+      <w:r>
+        <w:rPr>
+          <w:rFonts w:ascii="Calibri" w:hAnsi="Calibri"/>
+          <w:b/>
+          <w:sz w:val="22"/>
+        </w:rPr>
+        <w:t>Complete</w:t>
+      </w:r>
+      <w:r>
+        <w:rPr>
+          <w:rFonts w:ascii="Calibri" w:hAnsi="Calibri"/>
+          <w:sz w:val="22"/>
+        </w:rPr>
+        <w:t xml:space="preserve"> presets change module selections only after </w:t>
+      </w:r>
+      <w:r>
+        <w:rPr>
+          <w:rFonts w:ascii="Calibri" w:hAnsi="Calibri"/>
+          <w:b/>
+          <w:sz w:val="22"/>
+        </w:rPr>
+        <w:t>Apply preset</w:t>
+      </w:r>
+      <w:r>
+        <w:rPr>
+          <w:rFonts w:ascii="Calibri" w:hAnsi="Calibri"/>
+          <w:sz w:val="22"/>
+        </w:rPr>
+        <w:t xml:space="preserve"> is clicked. </w:t>
+      </w:r>
+      <w:r>
+        <w:rPr>
+          <w:rFonts w:ascii="Calibri" w:hAnsi="Calibri"/>
+          <w:b/>
+          <w:sz w:val="22"/>
+        </w:rPr>
+        <w:t>Custom</w:t>
+      </w:r>
+      <w:r>
+        <w:rPr>
+          <w:rFonts w:ascii="Calibri" w:hAnsi="Calibri"/>
+          <w:sz w:val="22"/>
+        </w:rPr>
+        <w:t xml:space="preserve"> retains the current manual selection. Presets never overwrite advanced thresholds, filtering, phrase policy, stopwords, pronunciation overrides, or other methodology.</w:t>
+      </w:r>
+    </w:p>
+    <w:p>
+      <w:pPr>
+        <w:widowControl/>
+        <w:spacing w:before="0" w:after="120" w:line="300" w:lineRule="auto"/>
+      </w:pPr>
+      <w:r>
+        <w:rPr>
+          <w:rFonts w:ascii="Calibri" w:hAnsi="Calibri"/>
+          <w:sz w:val="22"/>
+        </w:rPr>
+        <w:t>VAD, categorical association, intensity, concreteness, corpus-relative frequency, retrospective lexical AoA, dictionary pronunciation/lexical stress, configured meter fit, rhyme/sound evidence, lexical diversity/word counts, and PoetryID candidate profiles answer different questions and remain separate. PoetryID requires an enabled VAD source and reuses its completed result; selecting meter or rhyme automatically runs its pronunciation dependency.</w:t>
+      </w:r>
+    </w:p>
+    <w:p>
+      <w:pPr>
+        <w:widowControl/>
+        <w:spacing w:before="0" w:after="120" w:line="300" w:lineRule="auto"/>
+      </w:pPr>
+      <w:r>
+        <w:rPr>
+          <w:rFonts w:ascii="Calibri" w:hAnsi="Calibri"/>
+          <w:sz w:val="22"/>
+        </w:rPr>
+        <w:t xml:space="preserve">The same eight optional modules are also available in </w:t>
+      </w:r>
+      <w:r>
+        <w:rPr>
+          <w:rFonts w:ascii="Calibri" w:hAnsi="Calibri"/>
+          <w:b/>
+          <w:sz w:val="22"/>
+        </w:rPr>
+        <w:t>Project / Corpus</w:t>
+      </w:r>
+      <w:r>
+        <w:rPr>
+          <w:rFonts w:ascii="Calibri" w:hAnsi="Calibri"/>
+          <w:sz w:val="22"/>
+        </w:rPr>
+        <w:t>. Single Poem and Other Text results remain temporary unless downloaded; corpus runs persist the same module result envelopes, configurations, coverage, warnings, provenance, and audit artifacts against exact text versions.</w:t>
+      </w:r>
+    </w:p>
+    <w:p>
+      <w:pPr>
+        <w:widowControl/>
+        <w:spacing w:before="0" w:after="120" w:line="300" w:lineRule="auto"/>
+      </w:pPr>
+      <w:r>
+        <w:rPr>
+          <w:rFonts w:ascii="Calibri" w:hAnsi="Calibri"/>
+          <w:sz w:val="22"/>
+        </w:rPr>
+        <w:t xml:space="preserve">Under </w:t>
+      </w:r>
+      <w:r>
+        <w:rPr>
+          <w:rFonts w:ascii="Calibri" w:hAnsi="Calibri"/>
+          <w:b/>
+          <w:sz w:val="22"/>
+        </w:rPr>
+        <w:t>Analysis configuration and methodology</w:t>
+      </w:r>
+      <w:r>
+        <w:rPr>
+          <w:rFonts w:ascii="Calibri" w:hAnsi="Calibri"/>
+          <w:sz w:val="22"/>
+        </w:rPr>
+        <w:t>, choose:</w:t>
       </w:r>
     </w:p>
     <w:p>
@@ -8935,7 +9466,7 @@
           <w:rFonts w:ascii="Calibri" w:hAnsi="Calibri"/>
           <w:sz w:val="22"/>
         </w:rPr>
-        <w:t>whether concreteness excludes model-tagged proper nouns;</w:t>
+        <w:t>phrase policy;</w:t>
       </w:r>
     </w:p>
     <w:p>
@@ -8953,7 +9484,7 @@
           <w:rFonts w:ascii="Calibri" w:hAnsi="Calibri"/>
           <w:sz w:val="22"/>
         </w:rPr>
-        <w:t>whether source-supplied concreteness phrases are activated; and</w:t>
+        <w:t>minimum matched observations for sparse-result warnings;</w:t>
       </w:r>
     </w:p>
     <w:p>
@@ -8971,7 +9502,7 @@
           <w:rFonts w:ascii="Calibri" w:hAnsi="Calibri"/>
           <w:sz w:val="22"/>
         </w:rPr>
-        <w:t>the concreteness low-coverage caution threshold;</w:t>
+        <w:t>whether to display all-matched results;</w:t>
       </w:r>
     </w:p>
     <w:p>
@@ -8989,7 +9520,7 @@
           <w:rFonts w:ascii="Calibri" w:hAnsi="Calibri"/>
           <w:sz w:val="22"/>
         </w:rPr>
-        <w:t>the four frequency orientation thresholds;</w:t>
+        <w:t>whether to display stopword-excluded results;</w:t>
       </w:r>
     </w:p>
     <w:p>
@@ -9007,7 +9538,7 @@
           <w:rFonts w:ascii="Calibri" w:hAnsi="Calibri"/>
           <w:sz w:val="22"/>
         </w:rPr>
-        <w:t>whether frequency excludes model-tagged proper nouns;</w:t>
+        <w:t>concreteness lower and upper orientation thresholds;</w:t>
       </w:r>
     </w:p>
     <w:p>
@@ -9025,7 +9556,7 @@
           <w:rFonts w:ascii="Calibri" w:hAnsi="Calibri"/>
           <w:sz w:val="22"/>
         </w:rPr>
-        <w:t>whether frequency permits lemma fallback;</w:t>
+        <w:t>whether concreteness excludes model-tagged proper nouns;</w:t>
       </w:r>
     </w:p>
     <w:p>
@@ -9043,7 +9574,7 @@
           <w:rFonts w:ascii="Calibri" w:hAnsi="Calibri"/>
           <w:sz w:val="22"/>
         </w:rPr>
-        <w:t>the frequency low-coverage caution threshold; and</w:t>
+        <w:t>whether source-supplied concreteness phrases are activated; and</w:t>
       </w:r>
     </w:p>
     <w:p>
@@ -9061,22 +9592,7 @@
           <w:rFonts w:ascii="Calibri" w:hAnsi="Calibri"/>
           <w:sz w:val="22"/>
         </w:rPr>
-        <w:t xml:space="preserve">whether frequency uses the non-default </w:t>
-      </w:r>
-      <w:r>
-        <w:rPr>
-          <w:rFonts w:ascii="Calibri" w:hAnsi="Calibri"/>
-          <w:b/>
-          <w:sz w:val="22"/>
-        </w:rPr>
-        <w:t>Content words only</w:t>
-      </w:r>
-      <w:r>
-        <w:rPr>
-          <w:rFonts w:ascii="Calibri" w:hAnsi="Calibri"/>
-          <w:sz w:val="22"/>
-        </w:rPr>
-        <w:t xml:space="preserve"> scope;</w:t>
+        <w:t>the concreteness low-coverage caution threshold;</w:t>
       </w:r>
     </w:p>
     <w:p>
@@ -9094,7 +9610,7 @@
           <w:rFonts w:ascii="Calibri" w:hAnsi="Calibri"/>
           <w:sz w:val="22"/>
         </w:rPr>
-        <w:t>AoA early and later orientation thresholds;</w:t>
+        <w:t>the four frequency orientation thresholds;</w:t>
       </w:r>
     </w:p>
     <w:p>
@@ -9112,7 +9628,7 @@
           <w:rFonts w:ascii="Calibri" w:hAnsi="Calibri"/>
           <w:sz w:val="22"/>
         </w:rPr>
-        <w:t>whether AoA excludes model-tagged proper nouns;</w:t>
+        <w:t>whether frequency excludes model-tagged proper nouns;</w:t>
       </w:r>
     </w:p>
     <w:p>
@@ -9130,7 +9646,7 @@
           <w:rFonts w:ascii="Calibri" w:hAnsi="Calibri"/>
           <w:sz w:val="22"/>
         </w:rPr>
-        <w:t>whether AoA permits lemma fallback;</w:t>
+        <w:t>whether frequency permits lemma fallback;</w:t>
       </w:r>
     </w:p>
     <w:p>
@@ -9148,7 +9664,7 @@
           <w:rFonts w:ascii="Calibri" w:hAnsi="Calibri"/>
           <w:sz w:val="22"/>
         </w:rPr>
-        <w:t>the AoA low-coverage caution threshold; and</w:t>
+        <w:t>the frequency low-coverage caution threshold; and</w:t>
       </w:r>
     </w:p>
     <w:p>
@@ -9166,7 +9682,7 @@
           <w:rFonts w:ascii="Calibri" w:hAnsi="Calibri"/>
           <w:sz w:val="22"/>
         </w:rPr>
-        <w:t xml:space="preserve">whether AoA uses the non-default contextual </w:t>
+        <w:t xml:space="preserve">whether frequency uses the non-default </w:t>
       </w:r>
       <w:r>
         <w:rPr>
@@ -9199,7 +9715,7 @@
           <w:rFonts w:ascii="Calibri" w:hAnsi="Calibri"/>
           <w:sz w:val="22"/>
         </w:rPr>
-        <w:t>the MATTR overlapping-window size;</w:t>
+        <w:t>AoA early and later orientation thresholds;</w:t>
       </w:r>
     </w:p>
     <w:p>
@@ -9217,7 +9733,7 @@
           <w:rFonts w:ascii="Calibri" w:hAnsi="Calibri"/>
           <w:sz w:val="22"/>
         </w:rPr>
-        <w:t>the HD-D without-replacement sample size;</w:t>
+        <w:t>whether AoA excludes model-tagged proper nouns;</w:t>
       </w:r>
     </w:p>
     <w:p>
@@ -9235,7 +9751,7 @@
           <w:rFonts w:ascii="Calibri" w:hAnsi="Calibri"/>
           <w:sz w:val="22"/>
         </w:rPr>
-        <w:t>the MTLD TTR threshold;</w:t>
+        <w:t>whether AoA permits lemma fallback;</w:t>
       </w:r>
     </w:p>
     <w:p>
@@ -9253,7 +9769,7 @@
           <w:rFonts w:ascii="Calibri" w:hAnsi="Calibri"/>
           <w:sz w:val="22"/>
         </w:rPr>
-        <w:t>the lexical-diversity short-text caution threshold;</w:t>
+        <w:t>the AoA low-coverage caution threshold; and</w:t>
       </w:r>
     </w:p>
     <w:p>
@@ -9271,7 +9787,22 @@
           <w:rFonts w:ascii="Calibri" w:hAnsi="Calibri"/>
           <w:sz w:val="22"/>
         </w:rPr>
-        <w:t>PoetryID VAD sources, token/type weightings, and analysis views;</w:t>
+        <w:t xml:space="preserve">whether AoA uses the non-default contextual </w:t>
+      </w:r>
+      <w:r>
+        <w:rPr>
+          <w:rFonts w:ascii="Calibri" w:hAnsi="Calibri"/>
+          <w:b/>
+          <w:sz w:val="22"/>
+        </w:rPr>
+        <w:t>Content words only</w:t>
+      </w:r>
+      <w:r>
+        <w:rPr>
+          <w:rFonts w:ascii="Calibri" w:hAnsi="Calibri"/>
+          <w:sz w:val="22"/>
+        </w:rPr>
+        <w:t xml:space="preserve"> scope;</w:t>
       </w:r>
     </w:p>
     <w:p>
@@ -9289,7 +9820,7 @@
           <w:rFonts w:ascii="Calibri" w:hAnsi="Calibri"/>
           <w:sz w:val="22"/>
         </w:rPr>
-        <w:t>default or custom-fixed PoetryID VAD thresholds;</w:t>
+        <w:t>the MATTR overlapping-window size;</w:t>
       </w:r>
     </w:p>
     <w:p>
@@ -9307,7 +9838,7 @@
           <w:rFonts w:ascii="Calibri" w:hAnsi="Calibri"/>
           <w:sz w:val="22"/>
         </w:rPr>
-        <w:t>PoetryID minimum VAD observations and token/type coverage; and</w:t>
+        <w:t>the HD-D without-replacement sample size;</w:t>
       </w:r>
     </w:p>
     <w:p>
@@ -9325,7 +9856,7 @@
           <w:rFonts w:ascii="Calibri" w:hAnsi="Calibri"/>
           <w:sz w:val="22"/>
         </w:rPr>
-        <w:t>optional secondary PoetryID concreteness, frequency, and AoA character;</w:t>
+        <w:t>the MTLD TTR threshold;</w:t>
       </w:r>
     </w:p>
     <w:p>
@@ -9343,22 +9874,7 @@
           <w:rFonts w:ascii="Calibri" w:hAnsi="Calibri"/>
           <w:sz w:val="22"/>
         </w:rPr>
-        <w:t xml:space="preserve">poem-specific </w:t>
-      </w:r>
-      <w:r>
-        <w:rPr>
-          <w:rFonts w:ascii="Consolas" w:hAnsi="Consolas"/>
-          <w:color w:val="1F4D78"/>
-          <w:sz w:val="19"/>
-        </w:rPr>
-        <w:t>word = ARPAbet phones | note</w:t>
-      </w:r>
-      <w:r>
-        <w:rPr>
-          <w:rFonts w:ascii="Calibri" w:hAnsi="Calibri"/>
-          <w:sz w:val="22"/>
-        </w:rPr>
-        <w:t xml:space="preserve"> pronunciation overrides;</w:t>
+        <w:t>the lexical-diversity short-text caution threshold;</w:t>
       </w:r>
     </w:p>
     <w:p>
@@ -9376,7 +9892,7 @@
           <w:rFonts w:ascii="Calibri" w:hAnsi="Calibri"/>
           <w:sz w:val="22"/>
         </w:rPr>
-        <w:t>the pronunciation resolved-token coverage caution threshold;</w:t>
+        <w:t>PoetryID VAD sources, token/type weightings, and analysis views;</w:t>
       </w:r>
     </w:p>
     <w:p>
@@ -9394,7 +9910,7 @@
           <w:rFonts w:ascii="Calibri" w:hAnsi="Calibri"/>
           <w:sz w:val="22"/>
         </w:rPr>
-        <w:t>minimum complete pronunciation lines; and</w:t>
+        <w:t>default or custom-fixed PoetryID VAD thresholds;</w:t>
       </w:r>
     </w:p>
     <w:p>
@@ -9412,7 +9928,7 @@
           <w:rFonts w:ascii="Calibri" w:hAnsi="Calibri"/>
           <w:sz w:val="22"/>
         </w:rPr>
-        <w:t>minimum resolved pronunciation tokens for sparse-result warnings;</w:t>
+        <w:t>PoetryID minimum VAD observations and token/type coverage; and</w:t>
       </w:r>
     </w:p>
     <w:p>
@@ -9430,7 +9946,7 @@
           <w:rFonts w:ascii="Calibri" w:hAnsi="Calibri"/>
           <w:sz w:val="22"/>
         </w:rPr>
-        <w:t>the meter line-fit threshold;</w:t>
+        <w:t>optional secondary PoetryID concreteness, frequency, and AoA character;</w:t>
       </w:r>
     </w:p>
     <w:p>
@@ -9448,7 +9964,22 @@
           <w:rFonts w:ascii="Calibri" w:hAnsi="Calibri"/>
           <w:sz w:val="22"/>
         </w:rPr>
-        <w:t>the poem candidate-fit threshold;</w:t>
+        <w:t xml:space="preserve">poem-specific </w:t>
+      </w:r>
+      <w:r>
+        <w:rPr>
+          <w:rFonts w:ascii="Consolas" w:hAnsi="Consolas"/>
+          <w:color w:val="1F4D78"/>
+          <w:sz w:val="19"/>
+        </w:rPr>
+        <w:t>word = ARPAbet phones | note</w:t>
+      </w:r>
+      <w:r>
+        <w:rPr>
+          <w:rFonts w:ascii="Calibri" w:hAnsi="Calibri"/>
+          <w:sz w:val="22"/>
+        </w:rPr>
+        <w:t xml:space="preserve"> pronunciation overrides;</w:t>
       </w:r>
     </w:p>
     <w:p>
@@ -9466,7 +9997,7 @@
           <w:rFonts w:ascii="Calibri" w:hAnsi="Calibri"/>
           <w:sz w:val="22"/>
         </w:rPr>
-        <w:t>the candidate-margin threshold; and</w:t>
+        <w:t>the pronunciation resolved-token coverage caution threshold;</w:t>
       </w:r>
     </w:p>
     <w:p>
@@ -9484,138 +10015,7 @@
           <w:rFonts w:ascii="Calibri" w:hAnsi="Calibri"/>
           <w:sz w:val="22"/>
         </w:rPr>
-        <w:t>the maximum retained stress paths evaluated per line.</w:t>
-      </w:r>
-    </w:p>
-    <w:p>
-      <w:pPr>
-        <w:widowControl/>
-        <w:spacing w:before="0" w:after="120" w:line="300" w:lineRule="auto"/>
-      </w:pPr>
-      <w:r>
-        <w:rPr>
-          <w:rFonts w:ascii="Calibri" w:hAnsi="Calibri"/>
-          <w:sz w:val="22"/>
-        </w:rPr>
-        <w:t xml:space="preserve">Under </w:t>
-      </w:r>
-      <w:r>
-        <w:rPr>
-          <w:rFonts w:ascii="Calibri" w:hAnsi="Calibri"/>
-          <w:b/>
-          <w:sz w:val="22"/>
-        </w:rPr>
-        <w:t>Stopword settings</w:t>
-      </w:r>
-      <w:r>
-        <w:rPr>
-          <w:rFonts w:ascii="Calibri" w:hAnsi="Calibri"/>
-          <w:sz w:val="22"/>
-        </w:rPr>
-        <w:t>, inspect or change the secondary-view policy. The all-matched result is always preserved even when only one view is displayed.</w:t>
-      </w:r>
-    </w:p>
-    <w:p>
-      <w:pPr>
-        <w:pStyle w:val="Heading2"/>
-      </w:pPr>
-      <w:r>
-        <w:rPr>
-          <w:rFonts w:ascii="Calibri" w:hAnsi="Calibri"/>
-          <w:sz w:val="22"/>
-        </w:rPr>
-        <w:t>Overview report family</w:t>
-      </w:r>
-    </w:p>
-    <w:p>
-      <w:pPr>
-        <w:widowControl/>
-        <w:spacing w:before="0" w:after="120" w:line="300" w:lineRule="auto"/>
-      </w:pPr>
-      <w:r>
-        <w:rPr>
-          <w:rFonts w:ascii="Calibri" w:hAnsi="Calibri"/>
-          <w:sz w:val="22"/>
-        </w:rPr>
-        <w:t>Read coverage before means. The Overview begins with a grouped at-a-glance summary for affective evidence, lexical character, sound/form, and structure. It then shows ordinary and content-focused coverage, matched counts, active methodology, excluded stopword counts, interpretive framing, and warnings.</w:t>
-      </w:r>
-    </w:p>
-    <w:p>
-      <w:pPr>
-        <w:pStyle w:val="Heading2"/>
-      </w:pPr>
-      <w:r>
-        <w:rPr>
-          <w:rFonts w:ascii="Calibri" w:hAnsi="Calibri"/>
-          <w:sz w:val="22"/>
-        </w:rPr>
-        <w:t>Structure report family: Language Profile section</w:t>
-      </w:r>
-    </w:p>
-    <w:p>
-      <w:pPr>
-        <w:widowControl/>
-        <w:spacing w:before="0" w:after="120" w:line="300" w:lineRule="auto"/>
-      </w:pPr>
-      <w:r>
-        <w:rPr>
-          <w:rFonts w:ascii="Calibri" w:hAnsi="Calibri"/>
-          <w:sz w:val="22"/>
-        </w:rPr>
-        <w:t xml:space="preserve">The </w:t>
-      </w:r>
-      <w:r>
-        <w:rPr>
-          <w:rFonts w:ascii="Calibri" w:hAnsi="Calibri"/>
-          <w:b/>
-          <w:sz w:val="22"/>
-        </w:rPr>
-        <w:t>Shared Processing Record</w:t>
-      </w:r>
-      <w:r>
-        <w:rPr>
-          <w:rFonts w:ascii="Calibri" w:hAnsi="Calibri"/>
-          <w:sz w:val="22"/>
-        </w:rPr>
-        <w:t xml:space="preserve"> first reports stanzas, physical lines, model sentences, total and lexical tokens, recipe/configuration IDs, model pipeline, dependency coverage, named-entity status, and processing cautions. It is the common local representation used by every selected lexicon.</w:t>
-      </w:r>
-    </w:p>
-    <w:p>
-      <w:pPr>
-        <w:widowControl/>
-        <w:spacing w:before="0" w:after="120" w:line="300" w:lineRule="auto"/>
-      </w:pPr>
-      <w:r>
-        <w:rPr>
-          <w:rFonts w:ascii="Calibri" w:hAnsi="Calibri"/>
-          <w:sz w:val="22"/>
-        </w:rPr>
-        <w:t>The tab then reports part-of-speech counts and relative shares for all eligible lexical tokens, independently of lexicon coverage. It also shows unique normalized types and example forms. The denominator is displayed, and a caution explains that the labels are model-generated.</w:t>
-      </w:r>
-    </w:p>
-    <w:p>
-      <w:pPr>
-        <w:pStyle w:val="Heading2"/>
-      </w:pPr>
-      <w:r>
-        <w:rPr>
-          <w:rFonts w:ascii="Calibri" w:hAnsi="Calibri"/>
-          <w:sz w:val="22"/>
-        </w:rPr>
-        <w:t>Affective Evidence: VAD section</w:t>
-      </w:r>
-    </w:p>
-    <w:p>
-      <w:pPr>
-        <w:widowControl/>
-        <w:spacing w:before="0" w:after="120" w:line="300" w:lineRule="auto"/>
-      </w:pPr>
-      <w:r>
-        <w:rPr>
-          <w:rFonts w:ascii="Calibri" w:hAnsi="Calibri"/>
-          <w:sz w:val="22"/>
-        </w:rPr>
-        <w:t>This tab contains:</w:t>
+        <w:t>minimum complete pronunciation lines; and</w:t>
       </w:r>
     </w:p>
     <w:p>
@@ -9633,7 +10033,7 @@
           <w:rFonts w:ascii="Calibri" w:hAnsi="Calibri"/>
           <w:sz w:val="22"/>
         </w:rPr>
-        <w:t>parallel normalized VAD charts;</w:t>
+        <w:t>minimum resolved pronunciation tokens for sparse-result warnings;</w:t>
       </w:r>
     </w:p>
     <w:p>
@@ -9651,7 +10051,7 @@
           <w:rFonts w:ascii="Calibri" w:hAnsi="Calibri"/>
           <w:sz w:val="22"/>
         </w:rPr>
-        <w:t>definitions of valence, arousal, and dominance;</w:t>
+        <w:t>the meter line-fit threshold;</w:t>
       </w:r>
     </w:p>
     <w:p>
@@ -9669,7 +10069,7 @@
           <w:rFonts w:ascii="Calibri" w:hAnsi="Calibri"/>
           <w:sz w:val="22"/>
         </w:rPr>
-        <w:t>token- and type-weighted values for each analysis view;</w:t>
+        <w:t>the poem candidate-fit threshold;</w:t>
       </w:r>
     </w:p>
     <w:p>
@@ -9687,7 +10087,7 @@
           <w:rFonts w:ascii="Calibri" w:hAnsi="Calibri"/>
           <w:sz w:val="22"/>
         </w:rPr>
-        <w:t>plain-language midpoint interpretations;</w:t>
+        <w:t>the candidate-margin threshold; and</w:t>
       </w:r>
     </w:p>
     <w:p>
@@ -9705,7 +10105,138 @@
           <w:rFonts w:ascii="Calibri" w:hAnsi="Calibri"/>
           <w:sz w:val="22"/>
         </w:rPr>
-        <w:t>population dispersion;</w:t>
+        <w:t>the maximum retained stress paths evaluated per line.</w:t>
+      </w:r>
+    </w:p>
+    <w:p>
+      <w:pPr>
+        <w:widowControl/>
+        <w:spacing w:before="0" w:after="120" w:line="300" w:lineRule="auto"/>
+      </w:pPr>
+      <w:r>
+        <w:rPr>
+          <w:rFonts w:ascii="Calibri" w:hAnsi="Calibri"/>
+          <w:sz w:val="22"/>
+        </w:rPr>
+        <w:t xml:space="preserve">Under </w:t>
+      </w:r>
+      <w:r>
+        <w:rPr>
+          <w:rFonts w:ascii="Calibri" w:hAnsi="Calibri"/>
+          <w:b/>
+          <w:sz w:val="22"/>
+        </w:rPr>
+        <w:t>Stopword settings</w:t>
+      </w:r>
+      <w:r>
+        <w:rPr>
+          <w:rFonts w:ascii="Calibri" w:hAnsi="Calibri"/>
+          <w:sz w:val="22"/>
+        </w:rPr>
+        <w:t>, inspect or change the secondary-view policy. The all-matched result is always preserved even when only one view is displayed.</w:t>
+      </w:r>
+    </w:p>
+    <w:p>
+      <w:pPr>
+        <w:pStyle w:val="Heading2"/>
+      </w:pPr>
+      <w:r>
+        <w:rPr>
+          <w:rFonts w:ascii="Calibri" w:hAnsi="Calibri"/>
+          <w:sz w:val="22"/>
+        </w:rPr>
+        <w:t>Overview report family</w:t>
+      </w:r>
+    </w:p>
+    <w:p>
+      <w:pPr>
+        <w:widowControl/>
+        <w:spacing w:before="0" w:after="120" w:line="300" w:lineRule="auto"/>
+      </w:pPr>
+      <w:r>
+        <w:rPr>
+          <w:rFonts w:ascii="Calibri" w:hAnsi="Calibri"/>
+          <w:sz w:val="22"/>
+        </w:rPr>
+        <w:t>Read coverage before means. The Overview begins with a grouped at-a-glance summary for affective evidence, lexical character, sound/form, and structure. It then shows ordinary and content-focused coverage, matched counts, active methodology, excluded stopword counts, interpretive framing, and warnings.</w:t>
+      </w:r>
+    </w:p>
+    <w:p>
+      <w:pPr>
+        <w:pStyle w:val="Heading2"/>
+      </w:pPr>
+      <w:r>
+        <w:rPr>
+          <w:rFonts w:ascii="Calibri" w:hAnsi="Calibri"/>
+          <w:sz w:val="22"/>
+        </w:rPr>
+        <w:t>Structure report family: Language Profile section</w:t>
+      </w:r>
+    </w:p>
+    <w:p>
+      <w:pPr>
+        <w:widowControl/>
+        <w:spacing w:before="0" w:after="120" w:line="300" w:lineRule="auto"/>
+      </w:pPr>
+      <w:r>
+        <w:rPr>
+          <w:rFonts w:ascii="Calibri" w:hAnsi="Calibri"/>
+          <w:sz w:val="22"/>
+        </w:rPr>
+        <w:t xml:space="preserve">The </w:t>
+      </w:r>
+      <w:r>
+        <w:rPr>
+          <w:rFonts w:ascii="Calibri" w:hAnsi="Calibri"/>
+          <w:b/>
+          <w:sz w:val="22"/>
+        </w:rPr>
+        <w:t>Shared Processing Record</w:t>
+      </w:r>
+      <w:r>
+        <w:rPr>
+          <w:rFonts w:ascii="Calibri" w:hAnsi="Calibri"/>
+          <w:sz w:val="22"/>
+        </w:rPr>
+        <w:t xml:space="preserve"> first reports stanzas, physical lines, model sentences, total and lexical tokens, recipe/configuration IDs, model pipeline, dependency coverage, named-entity status, and processing cautions. It is the common local representation used by every selected lexicon.</w:t>
+      </w:r>
+    </w:p>
+    <w:p>
+      <w:pPr>
+        <w:widowControl/>
+        <w:spacing w:before="0" w:after="120" w:line="300" w:lineRule="auto"/>
+      </w:pPr>
+      <w:r>
+        <w:rPr>
+          <w:rFonts w:ascii="Calibri" w:hAnsi="Calibri"/>
+          <w:sz w:val="22"/>
+        </w:rPr>
+        <w:t>The tab then reports part-of-speech counts and relative shares for all eligible lexical tokens, independently of lexicon coverage. It also shows unique normalized types and example forms. The denominator is displayed, and a caution explains that the labels are model-generated.</w:t>
+      </w:r>
+    </w:p>
+    <w:p>
+      <w:pPr>
+        <w:pStyle w:val="Heading2"/>
+      </w:pPr>
+      <w:r>
+        <w:rPr>
+          <w:rFonts w:ascii="Calibri" w:hAnsi="Calibri"/>
+          <w:sz w:val="22"/>
+        </w:rPr>
+        <w:t>Affective Evidence: VAD section</w:t>
+      </w:r>
+    </w:p>
+    <w:p>
+      <w:pPr>
+        <w:widowControl/>
+        <w:spacing w:before="0" w:after="120" w:line="300" w:lineRule="auto"/>
+      </w:pPr>
+      <w:r>
+        <w:rPr>
+          <w:rFonts w:ascii="Calibri" w:hAnsi="Calibri"/>
+          <w:sz w:val="22"/>
+        </w:rPr>
+        <w:t>This tab contains:</w:t>
       </w:r>
     </w:p>
     <w:p>
@@ -9723,7 +10254,7 @@
           <w:rFonts w:ascii="Calibri" w:hAnsi="Calibri"/>
           <w:sz w:val="22"/>
         </w:rPr>
-        <w:t>stopword-sensitivity differences;</w:t>
+        <w:t>parallel normalized VAD charts;</w:t>
       </w:r>
     </w:p>
     <w:p>
@@ -9741,7 +10272,7 @@
           <w:rFonts w:ascii="Calibri" w:hAnsi="Calibri"/>
           <w:sz w:val="22"/>
         </w:rPr>
-        <w:t>cumulative normalized totals;</w:t>
+        <w:t>definitions of valence, arousal, and dominance;</w:t>
       </w:r>
     </w:p>
     <w:p>
@@ -9759,7 +10290,7 @@
           <w:rFonts w:ascii="Calibri" w:hAnsi="Calibri"/>
           <w:sz w:val="22"/>
         </w:rPr>
-        <w:t>top midpoint-centered contributors;</w:t>
+        <w:t>token- and type-weighted values for each analysis view;</w:t>
       </w:r>
     </w:p>
     <w:p>
@@ -9777,6 +10308,96 @@
           <w:rFonts w:ascii="Calibri" w:hAnsi="Calibri"/>
           <w:sz w:val="22"/>
         </w:rPr>
+        <w:t>plain-language midpoint interpretations;</w:t>
+      </w:r>
+    </w:p>
+    <w:p>
+      <w:pPr>
+        <w:widowControl/>
+        <w:numPr>
+          <w:ilvl w:val="0"/>
+          <w:numId w:val="10"/>
+        </w:numPr>
+        <w:spacing w:before="0" w:after="80" w:line="300" w:lineRule="auto"/>
+        <w:ind w:left="540" w:hanging="271"/>
+      </w:pPr>
+      <w:r>
+        <w:rPr>
+          <w:rFonts w:ascii="Calibri" w:hAnsi="Calibri"/>
+          <w:sz w:val="22"/>
+        </w:rPr>
+        <w:t>population dispersion;</w:t>
+      </w:r>
+    </w:p>
+    <w:p>
+      <w:pPr>
+        <w:widowControl/>
+        <w:numPr>
+          <w:ilvl w:val="0"/>
+          <w:numId w:val="10"/>
+        </w:numPr>
+        <w:spacing w:before="0" w:after="80" w:line="300" w:lineRule="auto"/>
+        <w:ind w:left="540" w:hanging="271"/>
+      </w:pPr>
+      <w:r>
+        <w:rPr>
+          <w:rFonts w:ascii="Calibri" w:hAnsi="Calibri"/>
+          <w:sz w:val="22"/>
+        </w:rPr>
+        <w:t>stopword-sensitivity differences;</w:t>
+      </w:r>
+    </w:p>
+    <w:p>
+      <w:pPr>
+        <w:widowControl/>
+        <w:numPr>
+          <w:ilvl w:val="0"/>
+          <w:numId w:val="10"/>
+        </w:numPr>
+        <w:spacing w:before="0" w:after="80" w:line="300" w:lineRule="auto"/>
+        <w:ind w:left="540" w:hanging="271"/>
+      </w:pPr>
+      <w:r>
+        <w:rPr>
+          <w:rFonts w:ascii="Calibri" w:hAnsi="Calibri"/>
+          <w:sz w:val="22"/>
+        </w:rPr>
+        <w:t>cumulative normalized totals;</w:t>
+      </w:r>
+    </w:p>
+    <w:p>
+      <w:pPr>
+        <w:widowControl/>
+        <w:numPr>
+          <w:ilvl w:val="0"/>
+          <w:numId w:val="10"/>
+        </w:numPr>
+        <w:spacing w:before="0" w:after="80" w:line="300" w:lineRule="auto"/>
+        <w:ind w:left="540" w:hanging="271"/>
+      </w:pPr>
+      <w:r>
+        <w:rPr>
+          <w:rFonts w:ascii="Calibri" w:hAnsi="Calibri"/>
+          <w:sz w:val="22"/>
+        </w:rPr>
+        <w:t>top midpoint-centered contributors;</w:t>
+      </w:r>
+    </w:p>
+    <w:p>
+      <w:pPr>
+        <w:widowControl/>
+        <w:numPr>
+          <w:ilvl w:val="0"/>
+          <w:numId w:val="10"/>
+        </w:numPr>
+        <w:spacing w:before="0" w:after="80" w:line="300" w:lineRule="auto"/>
+        <w:ind w:left="540" w:hanging="271"/>
+      </w:pPr>
+      <w:r>
+        <w:rPr>
+          <w:rFonts w:ascii="Calibri" w:hAnsi="Calibri"/>
+          <w:sz w:val="22"/>
+        </w:rPr>
         <w:t>original source scales and normalization formulas.</w:t>
       </w:r>
     </w:p>
@@ -10201,6 +10822,19 @@
           <w:sz w:val="22"/>
         </w:rPr>
         <w:t>Do not mistake a metrically preferred stress path for a change to the Stage 5 pronunciation result.</w:t>
+      </w:r>
+    </w:p>
+    <w:p>
+      <w:pPr>
+        <w:widowControl/>
+        <w:spacing w:before="0" w:after="120" w:line="300" w:lineRule="auto"/>
+      </w:pPr>
+      <w:r>
+        <w:rPr>
+          <w:rFonts w:ascii="Calibri" w:hAnsi="Calibri"/>
+          <w:sz w:val="22"/>
+        </w:rPr>
+        <w:t>In performance-aware or comparison mode, the same section adds the declared profile and depth, poem/stanza organization, realized line readings, scoring components, promotion/demotion and substitution evidence, caesurae, clashes/lapses, alternate readings, recurrence/trajectory, and any separately recorded scholar revisions. These are inspectable candidate realizations, not performed scansion facts.</w:t>
       </w:r>
     </w:p>
     <w:p>
@@ -16025,6 +16659,296 @@
                 <w:color w:val="1F4D78"/>
                 <w:sz w:val="17"/>
               </w:rPr>
+              <w:t>meter_realizations.csv</w:t>
+            </w:r>
+          </w:p>
+        </w:tc>
+        <w:tc>
+          <w:tcPr>
+            <w:tcW w:type="dxa" w:w="5760"/>
+            <w:vAlign w:val="center"/>
+            <w:tcMar>
+              <w:top w:w="80" w:type="dxa"/>
+              <w:bottom w:w="80" w:type="dxa"/>
+              <w:start w:w="120" w:type="dxa"/>
+              <w:end w:w="120" w:type="dxa"/>
+            </w:tcMar>
+          </w:tcPr>
+          <w:p>
+            <w:pPr>
+              <w:widowControl/>
+              <w:spacing w:before="0" w:after="0" w:line="252" w:lineRule="auto"/>
+            </w:pPr>
+            <w:r/>
+            <w:r>
+              <w:rPr>
+                <w:rFonts w:ascii="Calibri" w:hAnsi="Calibri"/>
+                <w:sz w:val="18"/>
+              </w:rPr>
+              <w:t>Performance-aware line readings, syllable decisions, substitutions, component scores, alternatives, and confidence</w:t>
+            </w:r>
+          </w:p>
+        </w:tc>
+      </w:tr>
+      <w:tr>
+        <w:trPr>
+          <w:cantSplit w:val="true"/>
+        </w:trPr>
+        <w:tc>
+          <w:tcPr>
+            <w:tcW w:type="dxa" w:w="3600"/>
+            <w:vAlign w:val="center"/>
+            <w:tcMar>
+              <w:top w:w="80" w:type="dxa"/>
+              <w:bottom w:w="80" w:type="dxa"/>
+              <w:start w:w="120" w:type="dxa"/>
+              <w:end w:w="120" w:type="dxa"/>
+            </w:tcMar>
+          </w:tcPr>
+          <w:p>
+            <w:pPr>
+              <w:widowControl/>
+              <w:spacing w:before="0" w:after="0" w:line="252" w:lineRule="auto"/>
+            </w:pPr>
+            <w:r/>
+            <w:r>
+              <w:rPr>
+                <w:rFonts w:ascii="Consolas" w:hAnsi="Consolas"/>
+                <w:color w:val="1F4D78"/>
+                <w:sz w:val="17"/>
+              </w:rPr>
+              <w:t>meter_stanzas.csv</w:t>
+            </w:r>
+          </w:p>
+        </w:tc>
+        <w:tc>
+          <w:tcPr>
+            <w:tcW w:type="dxa" w:w="5760"/>
+            <w:vAlign w:val="center"/>
+            <w:tcMar>
+              <w:top w:w="80" w:type="dxa"/>
+              <w:bottom w:w="80" w:type="dxa"/>
+              <w:start w:w="120" w:type="dxa"/>
+              <w:end w:w="120" w:type="dxa"/>
+            </w:tcMar>
+          </w:tcPr>
+          <w:p>
+            <w:pPr>
+              <w:widowControl/>
+              <w:spacing w:before="0" w:after="0" w:line="252" w:lineRule="auto"/>
+            </w:pPr>
+            <w:r/>
+            <w:r>
+              <w:rPr>
+                <w:rFonts w:ascii="Calibri" w:hAnsi="Calibri"/>
+                <w:sz w:val="18"/>
+              </w:rPr>
+              <w:t>Stanza-level primary/alternate candidates, realized score, regularity, line-position pattern, and exceptions</w:t>
+            </w:r>
+          </w:p>
+        </w:tc>
+      </w:tr>
+      <w:tr>
+        <w:trPr>
+          <w:cantSplit w:val="true"/>
+        </w:trPr>
+        <w:tc>
+          <w:tcPr>
+            <w:tcW w:type="dxa" w:w="3600"/>
+            <w:vAlign w:val="center"/>
+            <w:tcMar>
+              <w:top w:w="80" w:type="dxa"/>
+              <w:bottom w:w="80" w:type="dxa"/>
+              <w:start w:w="120" w:type="dxa"/>
+              <w:end w:w="120" w:type="dxa"/>
+            </w:tcMar>
+          </w:tcPr>
+          <w:p>
+            <w:pPr>
+              <w:widowControl/>
+              <w:spacing w:before="0" w:after="0" w:line="252" w:lineRule="auto"/>
+            </w:pPr>
+            <w:r/>
+            <w:r>
+              <w:rPr>
+                <w:rFonts w:ascii="Consolas" w:hAnsi="Consolas"/>
+                <w:color w:val="1F4D78"/>
+                <w:sz w:val="17"/>
+              </w:rPr>
+              <w:t>meter_rhythm_trajectory.csv</w:t>
+            </w:r>
+          </w:p>
+        </w:tc>
+        <w:tc>
+          <w:tcPr>
+            <w:tcW w:type="dxa" w:w="5760"/>
+            <w:vAlign w:val="center"/>
+            <w:tcMar>
+              <w:top w:w="80" w:type="dxa"/>
+              <w:bottom w:w="80" w:type="dxa"/>
+              <w:start w:w="120" w:type="dxa"/>
+              <w:end w:w="120" w:type="dxa"/>
+            </w:tcMar>
+          </w:tcPr>
+          <w:p>
+            <w:pPr>
+              <w:widowControl/>
+              <w:spacing w:before="0" w:after="0" w:line="252" w:lineRule="auto"/>
+            </w:pPr>
+            <w:r/>
+            <w:r>
+              <w:rPr>
+                <w:rFonts w:ascii="Calibri" w:hAnsi="Calibri"/>
+                <w:sz w:val="18"/>
+              </w:rPr>
+              <w:t>Ordered line-by-line rhythmic trajectory and recurrence evidence</w:t>
+            </w:r>
+          </w:p>
+        </w:tc>
+      </w:tr>
+      <w:tr>
+        <w:trPr>
+          <w:cantSplit w:val="true"/>
+        </w:trPr>
+        <w:tc>
+          <w:tcPr>
+            <w:tcW w:type="dxa" w:w="3600"/>
+            <w:vAlign w:val="center"/>
+            <w:tcMar>
+              <w:top w:w="80" w:type="dxa"/>
+              <w:bottom w:w="80" w:type="dxa"/>
+              <w:start w:w="120" w:type="dxa"/>
+              <w:end w:w="120" w:type="dxa"/>
+            </w:tcMar>
+          </w:tcPr>
+          <w:p>
+            <w:pPr>
+              <w:widowControl/>
+              <w:spacing w:before="0" w:after="0" w:line="252" w:lineRule="auto"/>
+            </w:pPr>
+            <w:r/>
+            <w:r>
+              <w:rPr>
+                <w:rFonts w:ascii="Consolas" w:hAnsi="Consolas"/>
+                <w:color w:val="1F4D78"/>
+                <w:sz w:val="17"/>
+              </w:rPr>
+              <w:t>meter_scansion_report.txt</w:t>
+            </w:r>
+          </w:p>
+        </w:tc>
+        <w:tc>
+          <w:tcPr>
+            <w:tcW w:type="dxa" w:w="5760"/>
+            <w:vAlign w:val="center"/>
+            <w:tcMar>
+              <w:top w:w="80" w:type="dxa"/>
+              <w:bottom w:w="80" w:type="dxa"/>
+              <w:start w:w="120" w:type="dxa"/>
+              <w:end w:w="120" w:type="dxa"/>
+            </w:tcMar>
+          </w:tcPr>
+          <w:p>
+            <w:pPr>
+              <w:widowControl/>
+              <w:spacing w:before="0" w:after="0" w:line="252" w:lineRule="auto"/>
+            </w:pPr>
+            <w:r/>
+            <w:r>
+              <w:rPr>
+                <w:rFonts w:ascii="Calibri" w:hAnsi="Calibri"/>
+                <w:sz w:val="18"/>
+              </w:rPr>
+              <w:t>Accessible plain-text candidate and performance-aware reading report</w:t>
+            </w:r>
+          </w:p>
+        </w:tc>
+      </w:tr>
+      <w:tr>
+        <w:trPr>
+          <w:cantSplit w:val="true"/>
+        </w:trPr>
+        <w:tc>
+          <w:tcPr>
+            <w:tcW w:type="dxa" w:w="3600"/>
+            <w:vAlign w:val="center"/>
+            <w:tcMar>
+              <w:top w:w="80" w:type="dxa"/>
+              <w:bottom w:w="80" w:type="dxa"/>
+              <w:start w:w="120" w:type="dxa"/>
+              <w:end w:w="120" w:type="dxa"/>
+            </w:tcMar>
+          </w:tcPr>
+          <w:p>
+            <w:pPr>
+              <w:widowControl/>
+              <w:spacing w:before="0" w:after="0" w:line="252" w:lineRule="auto"/>
+            </w:pPr>
+            <w:r/>
+            <w:r>
+              <w:rPr>
+                <w:rFonts w:ascii="Consolas" w:hAnsi="Consolas"/>
+                <w:color w:val="1F4D78"/>
+                <w:sz w:val="17"/>
+              </w:rPr>
+              <w:t>meter_scholar_revisions.csv</w:t>
+            </w:r>
+          </w:p>
+        </w:tc>
+        <w:tc>
+          <w:tcPr>
+            <w:tcW w:type="dxa" w:w="5760"/>
+            <w:vAlign w:val="center"/>
+            <w:tcMar>
+              <w:top w:w="80" w:type="dxa"/>
+              <w:bottom w:w="80" w:type="dxa"/>
+              <w:start w:w="120" w:type="dxa"/>
+              <w:end w:w="120" w:type="dxa"/>
+            </w:tcMar>
+          </w:tcPr>
+          <w:p>
+            <w:pPr>
+              <w:widowControl/>
+              <w:spacing w:before="0" w:after="0" w:line="252" w:lineRule="auto"/>
+            </w:pPr>
+            <w:r/>
+            <w:r>
+              <w:rPr>
+                <w:rFonts w:ascii="Calibri" w:hAnsi="Calibri"/>
+                <w:sz w:val="18"/>
+              </w:rPr>
+              <w:t>Conditional audit of explicit scholar revisions; created only when at least one revision is supplied</w:t>
+            </w:r>
+          </w:p>
+        </w:tc>
+      </w:tr>
+      <w:tr>
+        <w:trPr>
+          <w:cantSplit w:val="true"/>
+        </w:trPr>
+        <w:tc>
+          <w:tcPr>
+            <w:tcW w:type="dxa" w:w="3600"/>
+            <w:vAlign w:val="center"/>
+            <w:tcMar>
+              <w:top w:w="80" w:type="dxa"/>
+              <w:bottom w:w="80" w:type="dxa"/>
+              <w:start w:w="120" w:type="dxa"/>
+              <w:end w:w="120" w:type="dxa"/>
+            </w:tcMar>
+          </w:tcPr>
+          <w:p>
+            <w:pPr>
+              <w:widowControl/>
+              <w:spacing w:before="0" w:after="0" w:line="252" w:lineRule="auto"/>
+            </w:pPr>
+            <w:r/>
+            <w:r>
+              <w:rPr>
+                <w:rFonts w:ascii="Consolas" w:hAnsi="Consolas"/>
+                <w:color w:val="1F4D78"/>
+                <w:sz w:val="17"/>
+              </w:rPr>
               <w:t>rhyme_summary.csv</w:t>
             </w:r>
           </w:p>
@@ -17280,7 +18204,7 @@
           <w:rFonts w:ascii="Calibri" w:hAnsi="Calibri"/>
           <w:sz w:val="22"/>
         </w:rPr>
-        <w:t xml:space="preserve"> contains every Stage 6 line, fixed candidate, and method record, </w:t>
+        <w:t xml:space="preserve"> contains every fixed candidate and, when enabled, the nested performance-aware realization, </w:t>
       </w:r>
       <w:r>
         <w:rPr>
@@ -20181,6 +21105,19 @@
     </w:p>
     <w:p>
       <w:pPr>
+        <w:widowControl/>
+        <w:spacing w:before="0" w:after="120" w:line="300" w:lineRule="auto"/>
+      </w:pPr>
+      <w:r>
+        <w:rPr>
+          <w:rFonts w:ascii="Calibri" w:hAnsi="Calibri"/>
+          <w:sz w:val="22"/>
+        </w:rPr>
+        <w:t>For the optional performance-aware layer, the exported overall realization score is a bounded weighted combination of the visible component scores minus the visible substitution penalty. Its exact weights depend on the declared style profile and configuration. It is a ranking heuristic, not a probability or independently validated likelihood.</w:t>
+      </w:r>
+    </w:p>
+    <w:p>
+      <w:pPr>
         <w:pStyle w:val="Heading2"/>
       </w:pPr>
       <w:r>
@@ -20999,6 +21936,63 @@
                 <w:sz w:val="18"/>
               </w:rPr>
               <w:t>Nearest configured fixed stress template; not definitive meter or performed rhythm</w:t>
+            </w:r>
+          </w:p>
+        </w:tc>
+      </w:tr>
+      <w:tr>
+        <w:trPr>
+          <w:cantSplit w:val="true"/>
+        </w:trPr>
+        <w:tc>
+          <w:tcPr>
+            <w:tcW w:type="dxa" w:w="3600"/>
+            <w:vAlign w:val="center"/>
+            <w:tcMar>
+              <w:top w:w="80" w:type="dxa"/>
+              <w:bottom w:w="80" w:type="dxa"/>
+              <w:start w:w="120" w:type="dxa"/>
+              <w:end w:w="120" w:type="dxa"/>
+            </w:tcMar>
+          </w:tcPr>
+          <w:p>
+            <w:pPr>
+              <w:widowControl/>
+              <w:spacing w:before="0" w:after="0" w:line="252" w:lineRule="auto"/>
+            </w:pPr>
+            <w:r/>
+            <w:r>
+              <w:rPr>
+                <w:rFonts w:ascii="Calibri" w:hAnsi="Calibri"/>
+                <w:sz w:val="18"/>
+              </w:rPr>
+              <w:t>Declared meter style profile</w:t>
+            </w:r>
+          </w:p>
+        </w:tc>
+        <w:tc>
+          <w:tcPr>
+            <w:tcW w:type="dxa" w:w="5760"/>
+            <w:vAlign w:val="center"/>
+            <w:tcMar>
+              <w:top w:w="80" w:type="dxa"/>
+              <w:bottom w:w="80" w:type="dxa"/>
+              <w:start w:w="120" w:type="dxa"/>
+              <w:end w:w="120" w:type="dxa"/>
+            </w:tcMar>
+          </w:tcPr>
+          <w:p>
+            <w:pPr>
+              <w:widowControl/>
+              <w:spacing w:before="0" w:after="0" w:line="252" w:lineRule="auto"/>
+            </w:pPr>
+            <w:r/>
+            <w:r>
+              <w:rPr>
+                <w:rFonts w:ascii="Calibri" w:hAnsi="Calibri"/>
+                <w:sz w:val="18"/>
+              </w:rPr>
+              <w:t>Scholar-selected versioned realization weights; never an inferred period, movement, author, or tradition</w:t>
             </w:r>
           </w:p>
         </w:tc>
@@ -23012,6 +24006,120 @@
                 <w:rFonts w:ascii="Calibri" w:hAnsi="Calibri"/>
                 <w:sz w:val="18"/>
               </w:rPr>
+              <w:t>Performance-aware realization</w:t>
+            </w:r>
+          </w:p>
+        </w:tc>
+        <w:tc>
+          <w:tcPr>
+            <w:tcW w:type="dxa" w:w="5760"/>
+            <w:vAlign w:val="center"/>
+            <w:tcMar>
+              <w:top w:w="80" w:type="dxa"/>
+              <w:bottom w:w="80" w:type="dxa"/>
+              <w:start w:w="120" w:type="dxa"/>
+              <w:end w:w="120" w:type="dxa"/>
+            </w:tcMar>
+          </w:tcPr>
+          <w:p>
+            <w:pPr>
+              <w:widowControl/>
+              <w:spacing w:before="0" w:after="0" w:line="252" w:lineRule="auto"/>
+            </w:pPr>
+            <w:r/>
+            <w:r>
+              <w:rPr>
+                <w:rFonts w:ascii="Calibri" w:hAnsi="Calibri"/>
+                <w:sz w:val="18"/>
+              </w:rPr>
+              <w:t>Optional contextual reranking and annotated reading above the unchanged fixed candidate layer; not performed scansion</w:t>
+            </w:r>
+          </w:p>
+        </w:tc>
+      </w:tr>
+      <w:tr>
+        <w:trPr>
+          <w:cantSplit w:val="true"/>
+        </w:trPr>
+        <w:tc>
+          <w:tcPr>
+            <w:tcW w:type="dxa" w:w="3600"/>
+            <w:vAlign w:val="center"/>
+            <w:tcMar>
+              <w:top w:w="80" w:type="dxa"/>
+              <w:bottom w:w="80" w:type="dxa"/>
+              <w:start w:w="120" w:type="dxa"/>
+              <w:end w:w="120" w:type="dxa"/>
+            </w:tcMar>
+          </w:tcPr>
+          <w:p>
+            <w:pPr>
+              <w:widowControl/>
+              <w:spacing w:before="0" w:after="0" w:line="252" w:lineRule="auto"/>
+            </w:pPr>
+            <w:r/>
+            <w:r>
+              <w:rPr>
+                <w:rFonts w:ascii="Calibri" w:hAnsi="Calibri"/>
+                <w:sz w:val="18"/>
+              </w:rPr>
+              <w:t>Rhythmic organization</w:t>
+            </w:r>
+          </w:p>
+        </w:tc>
+        <w:tc>
+          <w:tcPr>
+            <w:tcW w:type="dxa" w:w="5760"/>
+            <w:vAlign w:val="center"/>
+            <w:tcMar>
+              <w:top w:w="80" w:type="dxa"/>
+              <w:bottom w:w="80" w:type="dxa"/>
+              <w:start w:w="120" w:type="dxa"/>
+              <w:end w:w="120" w:type="dxa"/>
+            </w:tcMar>
+          </w:tcPr>
+          <w:p>
+            <w:pPr>
+              <w:widowControl/>
+              <w:spacing w:before="0" w:after="0" w:line="252" w:lineRule="auto"/>
+            </w:pPr>
+            <w:r/>
+            <w:r>
+              <w:rPr>
+                <w:rFonts w:ascii="Calibri" w:hAnsi="Calibri"/>
+                <w:sz w:val="18"/>
+              </w:rPr>
+              <w:t>Rule-based accentual-syllabic, accentual, syllabic, locally metrical, mixed, no-stable-pattern, or insufficient-evidence description</w:t>
+            </w:r>
+          </w:p>
+        </w:tc>
+      </w:tr>
+      <w:tr>
+        <w:trPr>
+          <w:cantSplit w:val="true"/>
+        </w:trPr>
+        <w:tc>
+          <w:tcPr>
+            <w:tcW w:type="dxa" w:w="3600"/>
+            <w:vAlign w:val="center"/>
+            <w:tcMar>
+              <w:top w:w="80" w:type="dxa"/>
+              <w:bottom w:w="80" w:type="dxa"/>
+              <w:start w:w="120" w:type="dxa"/>
+              <w:end w:w="120" w:type="dxa"/>
+            </w:tcMar>
+          </w:tcPr>
+          <w:p>
+            <w:pPr>
+              <w:widowControl/>
+              <w:spacing w:before="0" w:after="0" w:line="252" w:lineRule="auto"/>
+            </w:pPr>
+            <w:r/>
+            <w:r>
+              <w:rPr>
+                <w:rFonts w:ascii="Calibri" w:hAnsi="Calibri"/>
+                <w:sz w:val="18"/>
+              </w:rPr>
               <w:t>MTLD</w:t>
             </w:r>
           </w:p>
@@ -25358,7 +26466,7 @@
           <w:rFonts w:ascii="Calibri" w:hAnsi="Calibri"/>
           <w:sz w:val="22"/>
         </w:rPr>
-        <w:t>Corpus meter results persist as work-level candidates; categorical</w:t>
+        <w:t>Stage 14 performance-aware scores, style compatibility, promotion/demotion,</w:t>
       </w:r>
     </w:p>
     <w:p>
@@ -25371,7 +26479,7 @@
           <w:rFonts w:ascii="Calibri" w:hAnsi="Calibri"/>
           <w:sz w:val="22"/>
         </w:rPr>
-        <w:t xml:space="preserve">  prevalence does not declare one corpus-wide meter.</w:t>
+        <w:t xml:space="preserve">  caesura, organization, recurrence, and confidence are transparent heuristics.   They do not establish the performed rhythm, correct scansion, literary   period, authorial intention, or universal metrical tradition.</w:t>
       </w:r>
     </w:p>
     <w:p>
@@ -25389,7 +26497,7 @@
           <w:rFonts w:ascii="Calibri" w:hAnsi="Calibri"/>
           <w:sz w:val="22"/>
         </w:rPr>
-        <w:t>Stage 7 starts from North American dictionary phones and spelling; dialect,</w:t>
+        <w:t>Broad style profiles are scholar-selected sensitivity settings. Comparing</w:t>
       </w:r>
     </w:p>
     <w:p>
@@ -25402,7 +26510,7 @@
           <w:rFonts w:ascii="Calibri" w:hAnsi="Calibri"/>
           <w:sz w:val="22"/>
         </w:rPr>
-        <w:t xml:space="preserve">  historical pronunciation, performance, and poetic elision can change rhyme   and recurring-sound evidence.</w:t>
+        <w:t xml:space="preserve">  profiles can reveal model dependence; it cannot discover which profile the   poem historically belongs to.</w:t>
       </w:r>
     </w:p>
     <w:p>
@@ -25420,7 +26528,7 @@
           <w:rFonts w:ascii="Calibri" w:hAnsi="Calibri"/>
           <w:sz w:val="22"/>
         </w:rPr>
-        <w:t>Slant, eye, internal-rhyme, alliteration, assonance, and consonance methods</w:t>
+        <w:t>Corpus meter results persist as work-level candidates; categorical</w:t>
       </w:r>
     </w:p>
     <w:p>
@@ -25433,7 +26541,7 @@
           <w:rFonts w:ascii="Calibri" w:hAnsi="Calibri"/>
           <w:sz w:val="22"/>
         </w:rPr>
-        <w:t xml:space="preserve">  are transparent descriptive heuristics, not probabilities or claims about   authorial intention or perceptual effect.</w:t>
+        <w:t xml:space="preserve">  prevalence does not declare one corpus-wide meter.</w:t>
       </w:r>
     </w:p>
     <w:p>
@@ -25451,6 +26559,68 @@
           <w:rFonts w:ascii="Calibri" w:hAnsi="Calibri"/>
           <w:sz w:val="22"/>
         </w:rPr>
+        <w:t>Stage 7 starts from North American dictionary phones and spelling; dialect,</w:t>
+      </w:r>
+    </w:p>
+    <w:p>
+      <w:pPr>
+        <w:widowControl/>
+        <w:spacing w:before="0" w:after="120" w:line="300" w:lineRule="auto"/>
+      </w:pPr>
+      <w:r>
+        <w:rPr>
+          <w:rFonts w:ascii="Calibri" w:hAnsi="Calibri"/>
+          <w:sz w:val="22"/>
+        </w:rPr>
+        <w:t xml:space="preserve">  historical pronunciation, performance, and poetic elision can change rhyme   and recurring-sound evidence.</w:t>
+      </w:r>
+    </w:p>
+    <w:p>
+      <w:pPr>
+        <w:widowControl/>
+        <w:numPr>
+          <w:ilvl w:val="0"/>
+          <w:numId w:val="10"/>
+        </w:numPr>
+        <w:spacing w:before="0" w:after="80" w:line="300" w:lineRule="auto"/>
+        <w:ind w:left="540" w:hanging="271"/>
+      </w:pPr>
+      <w:r>
+        <w:rPr>
+          <w:rFonts w:ascii="Calibri" w:hAnsi="Calibri"/>
+          <w:sz w:val="22"/>
+        </w:rPr>
+        <w:t>Slant, eye, internal-rhyme, alliteration, assonance, and consonance methods</w:t>
+      </w:r>
+    </w:p>
+    <w:p>
+      <w:pPr>
+        <w:widowControl/>
+        <w:spacing w:before="0" w:after="120" w:line="300" w:lineRule="auto"/>
+      </w:pPr>
+      <w:r>
+        <w:rPr>
+          <w:rFonts w:ascii="Calibri" w:hAnsi="Calibri"/>
+          <w:sz w:val="22"/>
+        </w:rPr>
+        <w:t xml:space="preserve">  are transparent descriptive heuristics, not probabilities or claims about   authorial intention or perceptual effect.</w:t>
+      </w:r>
+    </w:p>
+    <w:p>
+      <w:pPr>
+        <w:widowControl/>
+        <w:numPr>
+          <w:ilvl w:val="0"/>
+          <w:numId w:val="10"/>
+        </w:numPr>
+        <w:spacing w:before="0" w:after="80" w:line="300" w:lineRule="auto"/>
+        <w:ind w:left="540" w:hanging="271"/>
+      </w:pPr>
+      <w:r>
+        <w:rPr>
+          <w:rFonts w:ascii="Calibri" w:hAnsi="Calibri"/>
+          <w:sz w:val="22"/>
+        </w:rPr>
         <w:t>Corpus rhyme/sound results persist as work-level evidence; scheme prevalence</w:t>
       </w:r>
     </w:p>
@@ -25489,7 +26659,7 @@
           <w:rFonts w:ascii="Calibri" w:hAnsi="Calibri"/>
           <w:sz w:val="22"/>
         </w:rPr>
-        <w:t>Every analysis should retain the active lexicon or optional research resource, source checksum, adapter version, software version, preprocessing recipe and configuration ID, phrase policy, stopword policy, scenario, and inclusion decisions. Completed corpus runs remain linked to preserved text versions. A concreteness result additionally retains its orientation thresholds, proper-name and phrase policies, low-coverage threshold, source-row matches, and exact workbook checksum. A frequency result retains its Zipf-band thresholds, proper-name policy, exact-before-lemma rule, optional content-word scope, low-coverage threshold, source-row matches, and exact SUBTLEX-US workbook checksum. An AoA result retains early/later thresholds, proper-name policy, exact-before-lemma rule, optional contextual content-word scope, coverage and source-response cautions, source-row matches, optional relationship methods, and the exact official erratum-supplement checksum. A pronunciation result retains every dictionary candidate, three exact source checksums, package and adapter versions, exact observed-form policy, thresholds, scholar overrides and notes, configuration identity, missingness, and physical-line completeness. A meter result retains the linked pronunciation configuration, every penalty and threshold, all fixed candidates, candidate-specific stress paths, line coverage, alignment operations, deviations, fit, confidence explanation, and dependency resource hashes. A Stage 7 result retains the linked pronunciation configuration, exact resource hashes, rhyme/sound thresholds and weights, line-ending coverage, stanza/line/pair evidence, sound families, warnings, and immutable result/configuration identities.</w:t>
+        <w:t>Every analysis should retain the active lexicon or optional research resource, source checksum, adapter version, software version, preprocessing recipe and configuration ID, phrase policy, stopword policy, scenario, and inclusion decisions. Completed corpus runs remain linked to preserved text versions. A concreteness result additionally retains its orientation thresholds, proper-name and phrase policies, low-coverage threshold, source-row matches, and exact workbook checksum. A frequency result retains its Zipf-band thresholds, proper-name policy, exact-before-lemma rule, optional content-word scope, low-coverage threshold, source-row matches, and exact SUBTLEX-US workbook checksum. An AoA result retains early/later thresholds, proper-name policy, exact-before-lemma rule, optional contextual content-word scope, coverage and source-response cautions, source-row matches, optional relationship methods, and the exact official erratum-supplement checksum. A pronunciation result retains every dictionary candidate, three exact source checksums, package and adapter versions, exact observed-form policy, thresholds, scholar overrides and notes, configuration identity, missingness, and physical-line completeness. A meter result retains the linked pronunciation configuration, every penalty and threshold, all fixed candidates, candidate-specific stress paths, line coverage, alignment operations, deviations, fit, confidence explanation, and dependency resource hashes. Performance-aware meter additionally retains analysis mode, declared profile/version, interpretation depth, bounded candidate/alternative limits, visible-elision policy, component weights/scores, syllable-level adjustments, alternates, stanza/poem recurrence, trajectory, organization, and separately preserved scholar revisions. A Stage 7 result retains the linked pronunciation configuration, exact resource hashes, rhyme/sound thresholds and weights, line-ending coverage, stanza/line/pair evidence, sound families, warnings, and immutable result/configuration identities.</w:t>
       </w:r>
     </w:p>
     <w:p>
@@ -25635,61 +26805,27 @@
         <w:t>When VerseVAD gains or changes a feature, update the Markdown source and rebuild, render, and visually inspect the Word file before treating the manual as current.</w:t>
       </w:r>
     </w:p>
-    <w:tbl>
-      <w:tblPr>
-        <w:tblStyle w:val="TableGrid"/>
-        <w:tblW w:type="dxa" w:w="9360"/>
-        <w:jc w:val="left"/>
-        <w:tblLayout w:type="fixed"/>
-        <w:tblLook w:firstColumn="1" w:firstRow="1" w:lastColumn="0" w:lastRow="0" w:noHBand="0" w:noVBand="1" w:val="04A0"/>
-        <w:tblInd w:w="120" w:type="dxa"/>
-        <w:tblBorders>
-          <w:top w:val="single" w:sz="5" w:space="0" w:color="D7DEE5"/>
-          <w:left w:val="single" w:sz="5" w:space="0" w:color="D7DEE5"/>
-          <w:bottom w:val="single" w:sz="5" w:space="0" w:color="D7DEE5"/>
-          <w:right w:val="single" w:sz="5" w:space="0" w:color="D7DEE5"/>
-          <w:insideH w:val="single" w:sz="5" w:space="0" w:color="D7DEE5"/>
-          <w:insideV w:val="single" w:sz="5" w:space="0" w:color="D7DEE5"/>
-        </w:tblBorders>
-      </w:tblPr>
-      <w:tblGrid>
-        <w:gridCol w:w="9360"/>
-      </w:tblGrid>
-      <w:tr>
-        <w:tc>
-          <w:tcPr>
-            <w:tcW w:type="dxa" w:w="9360"/>
-            <w:vAlign w:val="center"/>
-            <w:tcMar>
-              <w:top w:w="80" w:type="dxa"/>
-              <w:bottom w:w="80" w:type="dxa"/>
-              <w:start w:w="120" w:type="dxa"/>
-              <w:end w:w="120" w:type="dxa"/>
-            </w:tcMar>
-            <w:shd w:fill="F4F6F9"/>
-          </w:tcPr>
-          <w:p>
-            <w:pPr>
-              <w:widowControl/>
-              <w:spacing w:before="0" w:after="0" w:line="276" w:lineRule="auto"/>
-            </w:pPr>
-            <w:r>
-              <w:rPr>
-                <w:rFonts w:ascii="Calibri" w:hAnsi="Calibri"/>
-                <w:color w:val="193247"/>
-                <w:sz w:val="22"/>
-              </w:rPr>
-              <w:t>FINAL READING RULE: Report the lexicon, result view, weighting, matched count, coverage, and relevant evidence with every numeric claim. Describe lexical norms and associations; reserve claims about meaning and experience for contextual scholarly argument.</w:t>
-            </w:r>
-          </w:p>
-        </w:tc>
-      </w:tr>
-    </w:tbl>
-    <w:p>
-      <w:pPr>
-        <w:widowControl/>
-        <w:spacing w:before="0" w:after="40" w:line="240" w:lineRule="auto"/>
-      </w:pPr>
+    <w:p>
+      <w:pPr>
+        <w:widowControl/>
+        <w:spacing w:before="80" w:after="120" w:line="276" w:lineRule="auto"/>
+        <w:ind w:left="173" w:right="173"/>
+        <w:shd w:fill="F4F6F9"/>
+        <w:pBdr>
+          <w:top w:val="single" w:sz="5" w:space="5" w:color="D7DEE5"/>
+          <w:left w:val="single" w:sz="5" w:space="5" w:color="D7DEE5"/>
+          <w:bottom w:val="single" w:sz="5" w:space="5" w:color="D7DEE5"/>
+          <w:right w:val="single" w:sz="5" w:space="5" w:color="D7DEE5"/>
+        </w:pBdr>
+      </w:pPr>
+      <w:r>
+        <w:rPr>
+          <w:rFonts w:ascii="Calibri" w:hAnsi="Calibri"/>
+          <w:color w:val="193247"/>
+          <w:sz w:val="22"/>
+        </w:rPr>
+        <w:t>FINAL READING RULE: Report the lexicon, result view, weighting, matched count, coverage, and relevant evidence with every numeric claim. Describe lexical norms and associations; reserve claims about meaning and experience for contextual scholarly argument.</w:t>
+      </w:r>
     </w:p>
     <w:sectPr>
       <w:headerReference w:type="default" r:id="rId9"/>
@@ -25756,7 +26892,7 @@
         <w:color w:val="66727C"/>
         <w:sz w:val="18"/>
       </w:rPr>
-      <w:t xml:space="preserve">  |  0.17.0.dev0</w:t>
+      <w:t xml:space="preserve">  |  0.18.0.dev0</w:t>
     </w:r>
   </w:p>
 </w:hdr>

</xml_diff>

<commit_message>
Updated user-facing analysis exports and reporting.
</commit_message>
<xml_diff>
--- a/docs/VerseVAD_User_Manual.docx
+++ b/docs/VerseVAD_User_Manual.docx
@@ -47,7 +47,7 @@
           <w:color w:val="66727C"/>
           <w:sz w:val="21"/>
         </w:rPr>
-        <w:t xml:space="preserve"> 0.18.0.dev0</w:t>
+        <w:t xml:space="preserve"> 1.0.0</w:t>
       </w:r>
       <w:r>
         <w:rPr>
@@ -71,7 +71,7 @@
           <w:color w:val="66727C"/>
           <w:sz w:val="21"/>
         </w:rPr>
-        <w:t xml:space="preserve"> July 24, 2026</w:t>
+        <w:t xml:space="preserve"> July 25, 2026</w:t>
       </w:r>
       <w:r>
         <w:rPr>
@@ -6034,6 +6034,102 @@
     </w:p>
     <w:p>
       <w:pPr>
+        <w:pStyle w:val="Heading3"/>
+      </w:pPr>
+      <w:r>
+        <w:rPr>
+          <w:rFonts w:ascii="Calibri" w:hAnsi="Calibri"/>
+          <w:sz w:val="22"/>
+        </w:rPr>
+        <w:t>VAD means by part of speech</w:t>
+      </w:r>
+    </w:p>
+    <w:p>
+      <w:pPr>
+        <w:widowControl/>
+        <w:spacing w:before="0" w:after="120" w:line="300" w:lineRule="auto"/>
+      </w:pPr>
+      <w:r>
+        <w:rPr>
+          <w:rFonts w:ascii="Calibri" w:hAnsi="Calibri"/>
+          <w:sz w:val="22"/>
+        </w:rPr>
+        <w:t xml:space="preserve">When a one-text analysis includes at least one VAD lexicon, the Language Profile adds a separate </w:t>
+      </w:r>
+      <w:r>
+        <w:rPr>
+          <w:rFonts w:ascii="Calibri" w:hAnsi="Calibri"/>
+          <w:b/>
+          <w:sz w:val="22"/>
+        </w:rPr>
+        <w:t>VAD Means by Part of Speech</w:t>
+      </w:r>
+      <w:r>
+        <w:rPr>
+          <w:rFonts w:ascii="Calibri" w:hAnsi="Calibri"/>
+          <w:sz w:val="22"/>
+        </w:rPr>
+        <w:t xml:space="preserve"> table. The grammatical count/share profile above it remains independent of lexicon matching.</w:t>
+      </w:r>
+    </w:p>
+    <w:p>
+      <w:pPr>
+        <w:widowControl/>
+        <w:spacing w:before="0" w:after="120" w:line="300" w:lineRule="auto"/>
+      </w:pPr>
+      <w:r>
+        <w:rPr>
+          <w:rFonts w:ascii="Calibri" w:hAnsi="Calibri"/>
+          <w:sz w:val="22"/>
+        </w:rPr>
+        <w:t xml:space="preserve">Every VAD source and the all-matched and stopword-excluded views remain separate. Within each broad POS group, token-weighted means count every included matched occurrence, while type-weighted means count each distinct matched lexicon entry once within that source, view, and POS group. The interface displays normalized 0-to-1 valence, arousal, and dominance means alongside matched observations, distinct matched types, covered and eligible token occurrences, coverage, and a sparse-evidence label. Original-scale means and the normalization formula remain in </w:t>
+      </w:r>
+      <w:r>
+        <w:rPr>
+          <w:rFonts w:ascii="Consolas" w:hAnsi="Consolas"/>
+          <w:color w:val="1F4D78"/>
+          <w:sz w:val="19"/>
+        </w:rPr>
+        <w:t>vad_by_part_of_speech.csv</w:t>
+      </w:r>
+      <w:r>
+        <w:rPr>
+          <w:rFonts w:ascii="Calibri" w:hAnsi="Calibri"/>
+          <w:sz w:val="22"/>
+        </w:rPr>
+        <w:t>.</w:t>
+      </w:r>
+    </w:p>
+    <w:p>
+      <w:pPr>
+        <w:widowControl/>
+        <w:spacing w:before="0" w:after="120" w:line="300" w:lineRule="auto"/>
+      </w:pPr>
+      <w:r>
+        <w:rPr>
+          <w:rFonts w:ascii="Calibri" w:hAnsi="Calibri"/>
+          <w:sz w:val="22"/>
+        </w:rPr>
+        <w:t xml:space="preserve">Unmatched evidence remains missing rather than neutral. An accepted multiword entry contributes one observation. A phrase whose lexical tokens span more than one broad POS stays in a </w:t>
+      </w:r>
+      <w:r>
+        <w:rPr>
+          <w:rFonts w:ascii="Calibri" w:hAnsi="Calibri"/>
+          <w:b/>
+          <w:sz w:val="22"/>
+        </w:rPr>
+        <w:t>Mixed-POS Phrase</w:t>
+      </w:r>
+      <w:r>
+        <w:rPr>
+          <w:rFonts w:ascii="Calibri" w:hAnsi="Calibri"/>
+          <w:sz w:val="22"/>
+        </w:rPr>
+        <w:t xml:space="preserve"> row instead of being forced into one grammatical category; because that is a span category rather than a token population, its coverage denominator remains missing.</w:t>
+      </w:r>
+    </w:p>
+    <w:p>
+      <w:pPr>
         <w:pStyle w:val="Heading2"/>
       </w:pPr>
       <w:r>
@@ -12350,7 +12446,7 @@
           <w:rFonts w:ascii="Calibri" w:hAnsi="Calibri"/>
           <w:sz w:val="22"/>
         </w:rPr>
-        <w:t xml:space="preserve"> reconstructs and checksum-checks the persisted CSV/JSON bundle for one work and module.</w:t>
+        <w:t xml:space="preserve"> reconstructs and checksum-checks the persisted CSV/DOCX bundle for one work and module.</w:t>
       </w:r>
     </w:p>
     <w:p>
@@ -13073,7 +13169,7 @@
           <w:rFonts w:ascii="Calibri" w:hAnsi="Calibri"/>
           <w:sz w:val="22"/>
         </w:rPr>
-        <w:t>Excel Export</w:t>
+        <w:t>Export</w:t>
       </w:r>
     </w:p>
     <w:p>
@@ -13086,112 +13182,22 @@
           <w:rFonts w:ascii="Calibri" w:hAnsi="Calibri"/>
           <w:sz w:val="22"/>
         </w:rPr>
-        <w:t xml:space="preserve">After a complete batch, download the corpus workbook. It includes a reading guide, both collection weighting views, both stopword views, work-level data, cumulative totals, coverage, separately labeled emotion/sentiment/intensity constructs, unmatched notes, text/version provenance, review decisions when applicable, and the recorded methodology. Optional-module batches add </w:t>
-      </w:r>
-      <w:r>
-        <w:rPr>
-          <w:rFonts w:ascii="Calibri" w:hAnsi="Calibri"/>
-          <w:b/>
-          <w:sz w:val="22"/>
-        </w:rPr>
-        <w:t>Module Collection</w:t>
-      </w:r>
-      <w:r>
-        <w:rPr>
-          <w:rFonts w:ascii="Calibri" w:hAnsi="Calibri"/>
-          <w:sz w:val="22"/>
-        </w:rPr>
-        <w:t xml:space="preserve">, </w:t>
-      </w:r>
-      <w:r>
-        <w:rPr>
-          <w:rFonts w:ascii="Calibri" w:hAnsi="Calibri"/>
-          <w:b/>
-          <w:sz w:val="22"/>
-        </w:rPr>
-        <w:t>Module Categories</w:t>
-      </w:r>
-      <w:r>
-        <w:rPr>
-          <w:rFonts w:ascii="Calibri" w:hAnsi="Calibri"/>
-          <w:sz w:val="22"/>
-        </w:rPr>
-        <w:t xml:space="preserve">, </w:t>
-      </w:r>
-      <w:r>
-        <w:rPr>
-          <w:rFonts w:ascii="Calibri" w:hAnsi="Calibri"/>
-          <w:b/>
-          <w:sz w:val="22"/>
-        </w:rPr>
-        <w:t>Module Work Results</w:t>
-      </w:r>
-      <w:r>
-        <w:rPr>
-          <w:rFonts w:ascii="Calibri" w:hAnsi="Calibri"/>
-          <w:sz w:val="22"/>
-        </w:rPr>
-        <w:t xml:space="preserve">, </w:t>
-      </w:r>
-      <w:r>
-        <w:rPr>
-          <w:rFonts w:ascii="Calibri" w:hAnsi="Calibri"/>
-          <w:b/>
-          <w:sz w:val="22"/>
-        </w:rPr>
-        <w:t>Module Structure</w:t>
-      </w:r>
-      <w:r>
-        <w:rPr>
-          <w:rFonts w:ascii="Calibri" w:hAnsi="Calibri"/>
-          <w:sz w:val="22"/>
-        </w:rPr>
-        <w:t xml:space="preserve">, </w:t>
-      </w:r>
-      <w:r>
-        <w:rPr>
-          <w:rFonts w:ascii="Calibri" w:hAnsi="Calibri"/>
-          <w:b/>
-          <w:sz w:val="22"/>
-        </w:rPr>
-        <w:t>Module Coverage</w:t>
-      </w:r>
-      <w:r>
-        <w:rPr>
-          <w:rFonts w:ascii="Calibri" w:hAnsi="Calibri"/>
-          <w:sz w:val="22"/>
-        </w:rPr>
-        <w:t xml:space="preserve">, </w:t>
-      </w:r>
-      <w:r>
-        <w:rPr>
-          <w:rFonts w:ascii="Calibri" w:hAnsi="Calibri"/>
-          <w:b/>
-          <w:sz w:val="22"/>
-        </w:rPr>
-        <w:t>Module Provenance</w:t>
-      </w:r>
-      <w:r>
-        <w:rPr>
-          <w:rFonts w:ascii="Calibri" w:hAnsi="Calibri"/>
-          <w:sz w:val="22"/>
-        </w:rPr>
-        <w:t xml:space="preserve">, and </w:t>
-      </w:r>
-      <w:r>
-        <w:rPr>
-          <w:rFonts w:ascii="Calibri" w:hAnsi="Calibri"/>
-          <w:b/>
-          <w:sz w:val="22"/>
-        </w:rPr>
-        <w:t>Module Warnings</w:t>
-      </w:r>
-      <w:r>
-        <w:rPr>
-          <w:rFonts w:ascii="Calibri" w:hAnsi="Calibri"/>
-          <w:sz w:val="22"/>
-        </w:rPr>
-        <w:t xml:space="preserve"> sheets.</w:t>
+        <w:t xml:space="preserve">After a complete batch, download the corpus CSV and Word bundle. It includes both collection weighting views, both stopword views, work-level data, cumulative totals, coverage, separately labeled emotion/sentiment/intensity constructs, unmatched notes, text/version provenance, review decisions when applicable, the recorded methodology, and </w:t>
+      </w:r>
+      <w:r>
+        <w:rPr>
+          <w:rFonts w:ascii="Consolas" w:hAnsi="Consolas"/>
+          <w:color w:val="1F4D78"/>
+          <w:sz w:val="19"/>
+        </w:rPr>
+        <w:t>corpus_report.docx</w:t>
+      </w:r>
+      <w:r>
+        <w:rPr>
+          <w:rFonts w:ascii="Calibri" w:hAnsi="Calibri"/>
+          <w:sz w:val="22"/>
+        </w:rPr>
+        <w:t>. Optional-module results, structure, coverage, provenance, and warnings remain in separately named CSV tables.</w:t>
       </w:r>
     </w:p>
     <w:p>
@@ -13897,7 +13903,7 @@
           <w:rFonts w:ascii="Calibri" w:hAnsi="Calibri"/>
           <w:sz w:val="22"/>
         </w:rPr>
-        <w:t>11. Downloads, CSV files, JSON, and Excel</w:t>
+        <w:t>11. Downloads, CSV files, and Word reports</w:t>
       </w:r>
     </w:p>
     <w:p>
@@ -14149,6 +14155,63 @@
                 <w:rFonts w:ascii="Calibri" w:hAnsi="Calibri"/>
                 <w:sz w:val="18"/>
               </w:rPr>
+              <w:t>Narrative Word report</w:t>
+            </w:r>
+          </w:p>
+        </w:tc>
+        <w:tc>
+          <w:tcPr>
+            <w:tcW w:type="dxa" w:w="6660"/>
+            <w:vAlign w:val="center"/>
+            <w:tcMar>
+              <w:top w:w="80" w:type="dxa"/>
+              <w:bottom w:w="80" w:type="dxa"/>
+              <w:start w:w="120" w:type="dxa"/>
+              <w:end w:w="120" w:type="dxa"/>
+            </w:tcMar>
+          </w:tcPr>
+          <w:p>
+            <w:pPr>
+              <w:widowControl/>
+              <w:spacing w:before="0" w:after="0" w:line="252" w:lineRule="auto"/>
+            </w:pPr>
+            <w:r/>
+            <w:r>
+              <w:rPr>
+                <w:rFonts w:ascii="Calibri" w:hAnsi="Calibri"/>
+                <w:sz w:val="18"/>
+              </w:rPr>
+              <w:t>Readable interpretation, denominators, and cautions</w:t>
+            </w:r>
+          </w:p>
+        </w:tc>
+      </w:tr>
+      <w:tr>
+        <w:trPr>
+          <w:cantSplit w:val="true"/>
+        </w:trPr>
+        <w:tc>
+          <w:tcPr>
+            <w:tcW w:type="dxa" w:w="2700"/>
+            <w:vAlign w:val="center"/>
+            <w:tcMar>
+              <w:top w:w="80" w:type="dxa"/>
+              <w:bottom w:w="80" w:type="dxa"/>
+              <w:start w:w="120" w:type="dxa"/>
+              <w:end w:w="120" w:type="dxa"/>
+            </w:tcMar>
+          </w:tcPr>
+          <w:p>
+            <w:pPr>
+              <w:widowControl/>
+              <w:spacing w:before="0" w:after="0" w:line="252" w:lineRule="auto"/>
+            </w:pPr>
+            <w:r/>
+            <w:r>
+              <w:rPr>
+                <w:rFonts w:ascii="Calibri" w:hAnsi="Calibri"/>
+                <w:sz w:val="18"/>
+              </w:rPr>
               <w:t>Full audit ZIP</w:t>
             </w:r>
           </w:p>
@@ -14197,7 +14260,7 @@
           <w:rFonts w:ascii="Calibri" w:hAnsi="Calibri"/>
           <w:sz w:val="22"/>
         </w:rPr>
-        <w:t xml:space="preserve">The ZIP begins with </w:t>
+        <w:t xml:space="preserve">The ZIP contains the summary, guide, comprehensive </w:t>
       </w:r>
       <w:r>
         <w:rPr>
@@ -14205,14 +14268,14 @@
           <w:color w:val="1F4D78"/>
           <w:sz w:val="19"/>
         </w:rPr>
-        <w:t>START_HERE.txt</w:t>
-      </w:r>
-      <w:r>
-        <w:rPr>
-          <w:rFonts w:ascii="Calibri" w:hAnsi="Calibri"/>
-          <w:sz w:val="22"/>
-        </w:rPr>
-        <w:t xml:space="preserve"> and contains the summary, guide, and the following detailed files.</w:t>
+        <w:t>VerseVAD_analysis_report.docx</w:t>
+      </w:r>
+      <w:r>
+        <w:rPr>
+          <w:rFonts w:ascii="Calibri" w:hAnsi="Calibri"/>
+          <w:sz w:val="22"/>
+        </w:rPr>
+        <w:t>, module-specific Word reports, and the following detailed CSV files.</w:t>
       </w:r>
     </w:p>
     <w:tbl>
@@ -14745,65 +14808,7 @@
                 <w:color w:val="1F4D78"/>
                 <w:sz w:val="17"/>
               </w:rPr>
-              <w:t>phase2_results.json</w:t>
-            </w:r>
-          </w:p>
-        </w:tc>
-        <w:tc>
-          <w:tcPr>
-            <w:tcW w:type="dxa" w:w="5760"/>
-            <w:vAlign w:val="center"/>
-            <w:tcMar>
-              <w:top w:w="80" w:type="dxa"/>
-              <w:bottom w:w="80" w:type="dxa"/>
-              <w:start w:w="120" w:type="dxa"/>
-              <w:end w:w="120" w:type="dxa"/>
-            </w:tcMar>
-          </w:tcPr>
-          <w:p>
-            <w:pPr>
-              <w:widowControl/>
-              <w:spacing w:before="0" w:after="0" w:line="252" w:lineRule="auto"/>
-            </w:pPr>
-            <w:r/>
-            <w:r>
-              <w:rPr>
-                <w:rFonts w:ascii="Calibri" w:hAnsi="Calibri"/>
-                <w:sz w:val="18"/>
-              </w:rPr>
-              <w:t>Complete structured analysis result for machine-readable reuse</w:t>
-            </w:r>
-          </w:p>
-        </w:tc>
-      </w:tr>
-      <w:tr>
-        <w:trPr>
-          <w:cantSplit w:val="true"/>
-        </w:trPr>
-        <w:tc>
-          <w:tcPr>
-            <w:tcW w:type="dxa" w:w="3600"/>
-            <w:vAlign w:val="center"/>
-            <w:tcMar>
-              <w:top w:w="80" w:type="dxa"/>
-              <w:bottom w:w="80" w:type="dxa"/>
-              <w:start w:w="120" w:type="dxa"/>
-              <w:end w:w="120" w:type="dxa"/>
-            </w:tcMar>
-          </w:tcPr>
-          <w:p>
-            <w:pPr>
-              <w:widowControl/>
-              <w:spacing w:before="0" w:after="0" w:line="252" w:lineRule="auto"/>
-            </w:pPr>
-            <w:r/>
-            <w:r>
-              <w:rPr>
-                <w:rFonts w:ascii="Consolas" w:hAnsi="Consolas"/>
-                <w:color w:val="1F4D78"/>
-                <w:sz w:val="17"/>
-              </w:rPr>
-              <w:t>poem_document.json</w:t>
+              <w:t>processing_*.csv</w:t>
             </w:r>
           </w:p>
         </w:tc>
@@ -15151,7 +15156,7 @@
                 <w:color w:val="1F4D78"/>
                 <w:sz w:val="17"/>
               </w:rPr>
-              <w:t>concreteness_result.json</w:t>
+              <w:t>concreteness_report.docx</w:t>
             </w:r>
           </w:p>
         </w:tc>
@@ -15177,7 +15182,7 @@
                 <w:rFonts w:ascii="Calibri" w:hAnsi="Calibri"/>
                 <w:sz w:val="18"/>
               </w:rPr>
-              <w:t>Complete structured concreteness result, configuration, warnings, and provenance</w:t>
+              <w:t>Narrative concreteness findings, denominators, coverage, cautions, and companion-file guide</w:t>
             </w:r>
           </w:p>
         </w:tc>
@@ -15557,7 +15562,7 @@
                 <w:color w:val="1F4D78"/>
                 <w:sz w:val="17"/>
               </w:rPr>
-              <w:t>frequency_result.json</w:t>
+              <w:t>frequency_report.docx</w:t>
             </w:r>
           </w:p>
         </w:tc>
@@ -15583,7 +15588,7 @@
                 <w:rFonts w:ascii="Calibri" w:hAnsi="Calibri"/>
                 <w:sz w:val="18"/>
               </w:rPr>
-              <w:t>Complete structured frequency result, configuration, warnings, and provenance</w:t>
+              <w:t>Narrative frequency findings, denominators, coverage, cautions, and companion-file guide</w:t>
             </w:r>
           </w:p>
         </w:tc>
@@ -16021,7 +16026,7 @@
                 <w:color w:val="1F4D78"/>
                 <w:sz w:val="17"/>
               </w:rPr>
-              <w:t>aoa_result.json</w:t>
+              <w:t>aoa_report.docx</w:t>
             </w:r>
           </w:p>
         </w:tc>
@@ -16047,7 +16052,7 @@
                 <w:rFonts w:ascii="Calibri" w:hAnsi="Calibri"/>
                 <w:sz w:val="18"/>
               </w:rPr>
-              <w:t>Complete structured AoA result, configuration, warnings, relationships, and provenance</w:t>
+              <w:t>Narrative AoA findings, denominators, coverage, cautions, and companion-file guide</w:t>
             </w:r>
           </w:p>
         </w:tc>
@@ -16311,7 +16316,7 @@
                 <w:color w:val="1F4D78"/>
                 <w:sz w:val="17"/>
               </w:rPr>
-              <w:t>pronunciation_result.json</w:t>
+              <w:t>pronunciation_report.docx</w:t>
             </w:r>
           </w:p>
         </w:tc>
@@ -16337,7 +16342,7 @@
                 <w:rFonts w:ascii="Calibri" w:hAnsi="Calibri"/>
                 <w:sz w:val="18"/>
               </w:rPr>
-              <w:t>Complete structured Stage 5 result, source contracts, configuration, candidates, warnings, and provenance</w:t>
+              <w:t>Narrative pronunciation findings, denominators, coverage, cautions, and companion-file guide</w:t>
             </w:r>
           </w:p>
         </w:tc>
@@ -16601,7 +16606,7 @@
                 <w:color w:val="1F4D78"/>
                 <w:sz w:val="17"/>
               </w:rPr>
-              <w:t>meter_result.json</w:t>
+              <w:t>meter_report.docx</w:t>
             </w:r>
           </w:p>
         </w:tc>
@@ -16627,7 +16632,7 @@
                 <w:rFonts w:ascii="Calibri" w:hAnsi="Calibri"/>
                 <w:sz w:val="18"/>
               </w:rPr>
-              <w:t>Complete structured Stage 6 configuration, line audit, fixed candidates, metrics, warnings, and provenance</w:t>
+              <w:t>Narrative meter/scansion findings, denominators, coverage, cautions, and companion-file guide</w:t>
             </w:r>
           </w:p>
         </w:tc>
@@ -16802,64 +16807,6 @@
                 <w:sz w:val="18"/>
               </w:rPr>
               <w:t>Ordered line-by-line rhythmic trajectory and recurrence evidence</w:t>
-            </w:r>
-          </w:p>
-        </w:tc>
-      </w:tr>
-      <w:tr>
-        <w:trPr>
-          <w:cantSplit w:val="true"/>
-        </w:trPr>
-        <w:tc>
-          <w:tcPr>
-            <w:tcW w:type="dxa" w:w="3600"/>
-            <w:vAlign w:val="center"/>
-            <w:tcMar>
-              <w:top w:w="80" w:type="dxa"/>
-              <w:bottom w:w="80" w:type="dxa"/>
-              <w:start w:w="120" w:type="dxa"/>
-              <w:end w:w="120" w:type="dxa"/>
-            </w:tcMar>
-          </w:tcPr>
-          <w:p>
-            <w:pPr>
-              <w:widowControl/>
-              <w:spacing w:before="0" w:after="0" w:line="252" w:lineRule="auto"/>
-            </w:pPr>
-            <w:r/>
-            <w:r>
-              <w:rPr>
-                <w:rFonts w:ascii="Consolas" w:hAnsi="Consolas"/>
-                <w:color w:val="1F4D78"/>
-                <w:sz w:val="17"/>
-              </w:rPr>
-              <w:t>meter_scansion_report.txt</w:t>
-            </w:r>
-          </w:p>
-        </w:tc>
-        <w:tc>
-          <w:tcPr>
-            <w:tcW w:type="dxa" w:w="5760"/>
-            <w:vAlign w:val="center"/>
-            <w:tcMar>
-              <w:top w:w="80" w:type="dxa"/>
-              <w:bottom w:w="80" w:type="dxa"/>
-              <w:start w:w="120" w:type="dxa"/>
-              <w:end w:w="120" w:type="dxa"/>
-            </w:tcMar>
-          </w:tcPr>
-          <w:p>
-            <w:pPr>
-              <w:widowControl/>
-              <w:spacing w:before="0" w:after="0" w:line="252" w:lineRule="auto"/>
-            </w:pPr>
-            <w:r/>
-            <w:r>
-              <w:rPr>
-                <w:rFonts w:ascii="Calibri" w:hAnsi="Calibri"/>
-                <w:sz w:val="18"/>
-              </w:rPr>
-              <w:t>Accessible plain-text candidate and performance-aware reading report</w:t>
             </w:r>
           </w:p>
         </w:tc>
@@ -17297,7 +17244,7 @@
                 <w:color w:val="1F4D78"/>
                 <w:sz w:val="17"/>
               </w:rPr>
-              <w:t>rhyme_result.json</w:t>
+              <w:t>rhyme_report.docx</w:t>
             </w:r>
           </w:p>
         </w:tc>
@@ -17323,7 +17270,7 @@
                 <w:rFonts w:ascii="Calibri" w:hAnsi="Calibri"/>
                 <w:sz w:val="18"/>
               </w:rPr>
-              <w:t>Complete structured Stage 7 configuration, summary, stanza/line/pair evidence, sound families, coverage, warnings, and provenance</w:t>
+              <w:t>Narrative rhyme/sound findings, denominators, coverage, cautions, and companion-file guide</w:t>
             </w:r>
           </w:p>
         </w:tc>
@@ -17645,7 +17592,7 @@
                 <w:color w:val="1F4D78"/>
                 <w:sz w:val="17"/>
               </w:rPr>
-              <w:t>lexical_style_result.json</w:t>
+              <w:t>lexical_style_report.docx</w:t>
             </w:r>
           </w:p>
         </w:tc>
@@ -17671,7 +17618,7 @@
                 <w:rFonts w:ascii="Calibri" w:hAnsi="Calibri"/>
                 <w:sz w:val="18"/>
               </w:rPr>
-              <w:t>Complete structured Stage 10 configuration, summaries, distribution, audit, coverage, warnings, and provenance</w:t>
+              <w:t>Narrative lexical-style findings, denominators, cautions, and companion-file guide</w:t>
             </w:r>
           </w:p>
         </w:tc>
@@ -18051,7 +17998,7 @@
                 <w:color w:val="1F4D78"/>
                 <w:sz w:val="17"/>
               </w:rPr>
-              <w:t>poetry_id_report.txt</w:t>
+              <w:t>poetry_id_report.docx</w:t>
             </w:r>
           </w:p>
         </w:tc>
@@ -18077,7 +18024,65 @@
                 <w:rFonts w:ascii="Calibri" w:hAnsi="Calibri"/>
                 <w:sz w:val="18"/>
               </w:rPr>
-              <w:t>Compact readable profile, VAD, confidence, narrative, and caution report</w:t>
+              <w:t>Readable candidate-profile, VAD, confidence, narrative, and caution report</w:t>
+            </w:r>
+          </w:p>
+        </w:tc>
+      </w:tr>
+      <w:tr>
+        <w:trPr>
+          <w:cantSplit w:val="true"/>
+        </w:trPr>
+        <w:tc>
+          <w:tcPr>
+            <w:tcW w:type="dxa" w:w="3600"/>
+            <w:vAlign w:val="center"/>
+            <w:tcMar>
+              <w:top w:w="80" w:type="dxa"/>
+              <w:bottom w:w="80" w:type="dxa"/>
+              <w:start w:w="120" w:type="dxa"/>
+              <w:end w:w="120" w:type="dxa"/>
+            </w:tcMar>
+          </w:tcPr>
+          <w:p>
+            <w:pPr>
+              <w:widowControl/>
+              <w:spacing w:before="0" w:after="0" w:line="252" w:lineRule="auto"/>
+            </w:pPr>
+            <w:r/>
+            <w:r>
+              <w:rPr>
+                <w:rFonts w:ascii="Consolas" w:hAnsi="Consolas"/>
+                <w:color w:val="1F4D78"/>
+                <w:sz w:val="17"/>
+              </w:rPr>
+              <w:t>*_manifest.csv</w:t>
+            </w:r>
+          </w:p>
+        </w:tc>
+        <w:tc>
+          <w:tcPr>
+            <w:tcW w:type="dxa" w:w="5760"/>
+            <w:vAlign w:val="center"/>
+            <w:tcMar>
+              <w:top w:w="80" w:type="dxa"/>
+              <w:bottom w:w="80" w:type="dxa"/>
+              <w:start w:w="120" w:type="dxa"/>
+              <w:end w:w="120" w:type="dxa"/>
+            </w:tcMar>
+          </w:tcPr>
+          <w:p>
+            <w:pPr>
+              <w:widowControl/>
+              <w:spacing w:before="0" w:after="0" w:line="252" w:lineRule="auto"/>
+            </w:pPr>
+            <w:r/>
+            <w:r>
+              <w:rPr>
+                <w:rFonts w:ascii="Calibri" w:hAnsi="Calibri"/>
+                <w:sz w:val="18"/>
+              </w:rPr>
+              <w:t>Exact optional-module configuration, provenance, resource identity, coverage records, and warnings</w:t>
             </w:r>
           </w:p>
         </w:tc>
@@ -18099,7 +18104,7 @@
           <w:rFonts w:ascii="Calibri" w:hAnsi="Calibri"/>
           <w:sz w:val="22"/>
         </w:rPr>
-        <w:t xml:space="preserve">CSV files use UTF-8 with a byte-order mark for compatibility with current Excel versions. The JSON files preserve complementary machine-readable records: </w:t>
+        <w:t xml:space="preserve">CSV files use UTF-8 with a byte-order mark for compatibility with current Excel versions. VerseVAD does not generate JSON, TXT, or XLSX analysis exports. The </w:t>
       </w:r>
       <w:r>
         <w:rPr>
@@ -18107,14 +18112,14 @@
           <w:color w:val="1F4D78"/>
           <w:sz w:val="19"/>
         </w:rPr>
-        <w:t>phase2_results.json</w:t>
-      </w:r>
-      <w:r>
-        <w:rPr>
-          <w:rFonts w:ascii="Calibri" w:hAnsi="Calibri"/>
-          <w:sz w:val="22"/>
-        </w:rPr>
-        <w:t xml:space="preserve"> contains the complete affective analysis, </w:t>
+        <w:t>processing_*.csv</w:t>
+      </w:r>
+      <w:r>
+        <w:rPr>
+          <w:rFonts w:ascii="Calibri" w:hAnsi="Calibri"/>
+          <w:sz w:val="22"/>
+        </w:rPr>
+        <w:t xml:space="preserve"> set preserves the complete shared processing representation, and </w:t>
       </w:r>
       <w:r>
         <w:rPr>
@@ -18122,134 +18127,14 @@
           <w:color w:val="1F4D78"/>
           <w:sz w:val="19"/>
         </w:rPr>
-        <w:t>poem_document.json</w:t>
-      </w:r>
-      <w:r>
-        <w:rPr>
-          <w:rFonts w:ascii="Calibri" w:hAnsi="Calibri"/>
-          <w:sz w:val="22"/>
-        </w:rPr>
-        <w:t xml:space="preserve"> contains its shared processing representation, </w:t>
-      </w:r>
-      <w:r>
-        <w:rPr>
-          <w:rFonts w:ascii="Consolas" w:hAnsi="Consolas"/>
-          <w:color w:val="1F4D78"/>
-          <w:sz w:val="19"/>
-        </w:rPr>
-        <w:t>concreteness_result.json</w:t>
-      </w:r>
-      <w:r>
-        <w:rPr>
-          <w:rFonts w:ascii="Calibri" w:hAnsi="Calibri"/>
-          <w:sz w:val="22"/>
-        </w:rPr>
-        <w:t xml:space="preserve"> contains the optional normative lexical concreteness result, </w:t>
-      </w:r>
-      <w:r>
-        <w:rPr>
-          <w:rFonts w:ascii="Consolas" w:hAnsi="Consolas"/>
-          <w:color w:val="1F4D78"/>
-          <w:sz w:val="19"/>
-        </w:rPr>
-        <w:t>frequency_result.json</w:t>
-      </w:r>
-      <w:r>
-        <w:rPr>
-          <w:rFonts w:ascii="Calibri" w:hAnsi="Calibri"/>
-          <w:sz w:val="22"/>
-        </w:rPr>
-        <w:t xml:space="preserve"> contains the optional SUBTLEX-US result, </w:t>
-      </w:r>
-      <w:r>
-        <w:rPr>
-          <w:rFonts w:ascii="Consolas" w:hAnsi="Consolas"/>
-          <w:color w:val="1F4D78"/>
-          <w:sz w:val="19"/>
-        </w:rPr>
-        <w:t>aoa_result.json</w:t>
-      </w:r>
-      <w:r>
-        <w:rPr>
-          <w:rFonts w:ascii="Calibri" w:hAnsi="Calibri"/>
-          <w:sz w:val="22"/>
-        </w:rPr>
-        <w:t xml:space="preserve"> contains the optional Kuperman result, </w:t>
-      </w:r>
-      <w:r>
-        <w:rPr>
-          <w:rFonts w:ascii="Consolas" w:hAnsi="Consolas"/>
-          <w:color w:val="1F4D78"/>
-          <w:sz w:val="19"/>
-        </w:rPr>
-        <w:t>pronunciation_result.json</w:t>
-      </w:r>
-      <w:r>
-        <w:rPr>
-          <w:rFonts w:ascii="Calibri" w:hAnsi="Calibri"/>
-          <w:sz w:val="22"/>
-        </w:rPr>
-        <w:t xml:space="preserve"> contains every Stage 5 candidate and decision, </w:t>
-      </w:r>
-      <w:r>
-        <w:rPr>
-          <w:rFonts w:ascii="Consolas" w:hAnsi="Consolas"/>
-          <w:color w:val="1F4D78"/>
-          <w:sz w:val="19"/>
-        </w:rPr>
-        <w:t>meter_result.json</w:t>
-      </w:r>
-      <w:r>
-        <w:rPr>
-          <w:rFonts w:ascii="Calibri" w:hAnsi="Calibri"/>
-          <w:sz w:val="22"/>
-        </w:rPr>
-        <w:t xml:space="preserve"> contains every fixed candidate and, when enabled, the nested performance-aware realization, </w:t>
-      </w:r>
-      <w:r>
-        <w:rPr>
-          <w:rFonts w:ascii="Consolas" w:hAnsi="Consolas"/>
-          <w:color w:val="1F4D78"/>
-          <w:sz w:val="19"/>
-        </w:rPr>
-        <w:t>rhyme_result.json</w:t>
-      </w:r>
-      <w:r>
-        <w:rPr>
-          <w:rFonts w:ascii="Calibri" w:hAnsi="Calibri"/>
-          <w:sz w:val="22"/>
-        </w:rPr>
-        <w:t xml:space="preserve"> contains every Stage 7 stanza, line, pair, sound-family, and method record, and </w:t>
-      </w:r>
-      <w:r>
-        <w:rPr>
-          <w:rFonts w:ascii="Consolas" w:hAnsi="Consolas"/>
-          <w:color w:val="1F4D78"/>
-          <w:sz w:val="19"/>
-        </w:rPr>
-        <w:t>lexical_style_result.json</w:t>
-      </w:r>
-      <w:r>
-        <w:rPr>
-          <w:rFonts w:ascii="Calibri" w:hAnsi="Calibri"/>
-          <w:sz w:val="22"/>
-        </w:rPr>
-        <w:t xml:space="preserve"> contains every narrowed Stage 10 configuration, diversity/length summary, structural count, and token decision. At the scholar's direction, PoetryID produces CSV and plain text only and has no JSON export. </w:t>
-      </w:r>
-      <w:r>
-        <w:rPr>
-          <w:rFonts w:ascii="Consolas" w:hAnsi="Consolas"/>
-          <w:color w:val="1F4D78"/>
-          <w:sz w:val="19"/>
-        </w:rPr>
-        <w:t>poem_document.json</w:t>
-      </w:r>
-      <w:r>
-        <w:rPr>
-          <w:rFonts w:ascii="Calibri" w:hAnsi="Calibri"/>
-          <w:sz w:val="22"/>
-        </w:rPr>
-        <w:t xml:space="preserve"> includes the original text, so protect it as research material. Optional module exports retain poem-specific provenance but do not copy any complete research source. The scholar summary is the easiest reading aid.</w:t>
+        <w:t>processing_source.csv</w:t>
+      </w:r>
+      <w:r>
+        <w:rPr>
+          <w:rFonts w:ascii="Calibri" w:hAnsi="Calibri"/>
+          <w:sz w:val="22"/>
+        </w:rPr>
+        <w:t xml:space="preserve"> includes the original text, so protect the full bundle as research material. Optional-module CSV exports retain poem-specific provenance without copying any complete licensed research source. Word reports provide a readable orientation; the CSV files remain the complete tabular evidence.</w:t>
       </w:r>
     </w:p>
     <w:p>
@@ -18261,7 +18146,7 @@
           <w:rFonts w:ascii="Calibri" w:hAnsi="Calibri"/>
           <w:sz w:val="22"/>
         </w:rPr>
-        <w:t>Corpus Excel workbook</w:t>
+        <w:t>Corpus CSV and Word bundle</w:t>
       </w:r>
     </w:p>
     <w:tbl>
@@ -18282,8 +18167,8 @@
         </w:tblBorders>
       </w:tblPr>
       <w:tblGrid>
-        <w:gridCol w:w="2700"/>
-        <w:gridCol w:w="6660"/>
+        <w:gridCol w:w="3600"/>
+        <w:gridCol w:w="5760"/>
       </w:tblGrid>
       <w:tr>
         <w:trPr>
@@ -18292,7 +18177,7 @@
         </w:trPr>
         <w:tc>
           <w:tcPr>
-            <w:tcW w:type="dxa" w:w="2700"/>
+            <w:tcW w:type="dxa" w:w="3600"/>
             <w:vAlign w:val="center"/>
             <w:tcMar>
               <w:top w:w="80" w:type="dxa"/>
@@ -18321,13 +18206,13 @@
                 <w:color w:val="193247"/>
                 <w:sz w:val="18"/>
               </w:rPr>
-              <w:t>Sheet</w:t>
+              <w:t>File</w:t>
             </w:r>
           </w:p>
         </w:tc>
         <w:tc>
           <w:tcPr>
-            <w:tcW w:type="dxa" w:w="6660"/>
+            <w:tcW w:type="dxa" w:w="5760"/>
             <w:vAlign w:val="center"/>
             <w:tcMar>
               <w:top w:w="80" w:type="dxa"/>
@@ -18367,7 +18252,34 @@
         </w:trPr>
         <w:tc>
           <w:tcPr>
-            <w:tcW w:type="dxa" w:w="2700"/>
+            <w:tcW w:type="dxa" w:w="3600"/>
+            <w:vAlign w:val="center"/>
+            <w:tcMar>
+              <w:top w:w="80" w:type="dxa"/>
+              <w:bottom w:w="80" w:type="dxa"/>
+              <w:start w:w="120" w:type="dxa"/>
+              <w:end w:w="120" w:type="dxa"/>
+            </w:tcMar>
+          </w:tcPr>
+          <w:p>
+            <w:pPr>
+              <w:widowControl/>
+              <w:spacing w:before="0" w:after="0" w:line="252" w:lineRule="auto"/>
+            </w:pPr>
+            <w:r/>
+            <w:r>
+              <w:rPr>
+                <w:rFonts w:ascii="Consolas" w:hAnsi="Consolas"/>
+                <w:color w:val="1F4D78"/>
+                <w:sz w:val="17"/>
+              </w:rPr>
+              <w:t>corpus_report.docx</w:t>
+            </w:r>
+          </w:p>
+        </w:tc>
+        <w:tc>
+          <w:tcPr>
+            <w:tcW w:type="dxa" w:w="5760"/>
             <w:vAlign w:val="center"/>
             <w:tcMar>
               <w:top w:w="80" w:type="dxa"/>
@@ -18387,13 +18299,60 @@
                 <w:rFonts w:ascii="Calibri" w:hAnsi="Calibri"/>
                 <w:sz w:val="18"/>
               </w:rPr>
-              <w:t>START HERE</w:t>
+              <w:t>Narrative collection overview, VAD profiles, denominators, and cautions</w:t>
+            </w:r>
+          </w:p>
+        </w:tc>
+      </w:tr>
+      <w:tr>
+        <w:trPr>
+          <w:cantSplit w:val="true"/>
+        </w:trPr>
+        <w:tc>
+          <w:tcPr>
+            <w:tcW w:type="dxa" w:w="3600"/>
+            <w:vAlign w:val="center"/>
+            <w:tcMar>
+              <w:top w:w="80" w:type="dxa"/>
+              <w:bottom w:w="80" w:type="dxa"/>
+              <w:start w:w="120" w:type="dxa"/>
+              <w:end w:w="120" w:type="dxa"/>
+            </w:tcMar>
+          </w:tcPr>
+          <w:p>
+            <w:pPr>
+              <w:widowControl/>
+              <w:spacing w:before="0" w:after="0" w:line="252" w:lineRule="auto"/>
+            </w:pPr>
+            <w:r/>
+            <w:r>
+              <w:rPr>
+                <w:rFonts w:ascii="Consolas" w:hAnsi="Consolas"/>
+                <w:color w:val="1F4D78"/>
+                <w:sz w:val="17"/>
+              </w:rPr>
+              <w:t>corpus_project.csv</w:t>
+            </w:r>
+            <w:r>
+              <w:rPr>
+                <w:rFonts w:ascii="Calibri" w:hAnsi="Calibri"/>
+                <w:sz w:val="18"/>
+              </w:rPr>
+              <w:t xml:space="preserve"> and </w:t>
+            </w:r>
+            <w:r>
+              <w:rPr>
+                <w:rFonts w:ascii="Consolas" w:hAnsi="Consolas"/>
+                <w:color w:val="1F4D78"/>
+                <w:sz w:val="17"/>
+              </w:rPr>
+              <w:t>corpus_works.csv</w:t>
             </w:r>
           </w:p>
         </w:tc>
         <w:tc>
           <w:tcPr>
-            <w:tcW w:type="dxa" w:w="6660"/>
+            <w:tcW w:type="dxa" w:w="5760"/>
             <w:vAlign w:val="center"/>
             <w:tcMar>
               <w:top w:w="80" w:type="dxa"/>
@@ -18413,7 +18372,7 @@
                 <w:rFonts w:ascii="Calibri" w:hAnsi="Calibri"/>
                 <w:sz w:val="18"/>
               </w:rPr>
-              <w:t>Reading order, weighting distinctions, and cautions</w:t>
+              <w:t>Project metadata plus work IDs, version IDs, paths, and hashes</w:t>
             </w:r>
           </w:p>
         </w:tc>
@@ -18424,7 +18383,49 @@
         </w:trPr>
         <w:tc>
           <w:tcPr>
-            <w:tcW w:type="dxa" w:w="2700"/>
+            <w:tcW w:type="dxa" w:w="3600"/>
+            <w:vAlign w:val="center"/>
+            <w:tcMar>
+              <w:top w:w="80" w:type="dxa"/>
+              <w:bottom w:w="80" w:type="dxa"/>
+              <w:start w:w="120" w:type="dxa"/>
+              <w:end w:w="120" w:type="dxa"/>
+            </w:tcMar>
+          </w:tcPr>
+          <w:p>
+            <w:pPr>
+              <w:widowControl/>
+              <w:spacing w:before="0" w:after="0" w:line="252" w:lineRule="auto"/>
+            </w:pPr>
+            <w:r/>
+            <w:r>
+              <w:rPr>
+                <w:rFonts w:ascii="Consolas" w:hAnsi="Consolas"/>
+                <w:color w:val="1F4D78"/>
+                <w:sz w:val="17"/>
+              </w:rPr>
+              <w:t>corpus_vad_metrics.csv</w:t>
+            </w:r>
+            <w:r>
+              <w:rPr>
+                <w:rFonts w:ascii="Calibri" w:hAnsi="Calibri"/>
+                <w:sz w:val="18"/>
+              </w:rPr>
+              <w:t xml:space="preserve"> and </w:t>
+            </w:r>
+            <w:r>
+              <w:rPr>
+                <w:rFonts w:ascii="Consolas" w:hAnsi="Consolas"/>
+                <w:color w:val="1F4D78"/>
+                <w:sz w:val="17"/>
+              </w:rPr>
+              <w:t>corpus_vad_profiles.csv</w:t>
+            </w:r>
+          </w:p>
+        </w:tc>
+        <w:tc>
+          <w:tcPr>
+            <w:tcW w:type="dxa" w:w="5760"/>
             <w:vAlign w:val="center"/>
             <w:tcMar>
               <w:top w:w="80" w:type="dxa"/>
@@ -18444,13 +18445,45 @@
                 <w:rFonts w:ascii="Calibri" w:hAnsi="Calibri"/>
                 <w:sz w:val="18"/>
               </w:rPr>
-              <w:t>Corpus Profiles</w:t>
+              <w:t>Work-level VAD records and token-/work-weighted collection profiles</w:t>
+            </w:r>
+          </w:p>
+        </w:tc>
+      </w:tr>
+      <w:tr>
+        <w:trPr>
+          <w:cantSplit w:val="true"/>
+        </w:trPr>
+        <w:tc>
+          <w:tcPr>
+            <w:tcW w:type="dxa" w:w="3600"/>
+            <w:vAlign w:val="center"/>
+            <w:tcMar>
+              <w:top w:w="80" w:type="dxa"/>
+              <w:bottom w:w="80" w:type="dxa"/>
+              <w:start w:w="120" w:type="dxa"/>
+              <w:end w:w="120" w:type="dxa"/>
+            </w:tcMar>
+          </w:tcPr>
+          <w:p>
+            <w:pPr>
+              <w:widowControl/>
+              <w:spacing w:before="0" w:after="0" w:line="252" w:lineRule="auto"/>
+            </w:pPr>
+            <w:r/>
+            <w:r>
+              <w:rPr>
+                <w:rFonts w:ascii="Consolas" w:hAnsi="Consolas"/>
+                <w:color w:val="1F4D78"/>
+                <w:sz w:val="17"/>
+              </w:rPr>
+              <w:t>corpus_part_of_speech.csv</w:t>
             </w:r>
           </w:p>
         </w:tc>
         <w:tc>
           <w:tcPr>
-            <w:tcW w:type="dxa" w:w="6660"/>
+            <w:tcW w:type="dxa" w:w="5760"/>
             <w:vAlign w:val="center"/>
             <w:tcMar>
               <w:top w:w="80" w:type="dxa"/>
@@ -18470,7 +18503,7 @@
                 <w:rFonts w:ascii="Calibri" w:hAnsi="Calibri"/>
                 <w:sz w:val="18"/>
               </w:rPr>
-              <w:t>Token-weighted and equal-work-weighted collection VAD profiles by analysis view</w:t>
+              <w:t>Broad and detailed combined/work-level POS evidence</w:t>
             </w:r>
           </w:p>
         </w:tc>
@@ -18481,7 +18514,34 @@
         </w:trPr>
         <w:tc>
           <w:tcPr>
-            <w:tcW w:type="dxa" w:w="2700"/>
+            <w:tcW w:type="dxa" w:w="3600"/>
+            <w:vAlign w:val="center"/>
+            <w:tcMar>
+              <w:top w:w="80" w:type="dxa"/>
+              <w:bottom w:w="80" w:type="dxa"/>
+              <w:start w:w="120" w:type="dxa"/>
+              <w:end w:w="120" w:type="dxa"/>
+            </w:tcMar>
+          </w:tcPr>
+          <w:p>
+            <w:pPr>
+              <w:widowControl/>
+              <w:spacing w:before="0" w:after="0" w:line="252" w:lineRule="auto"/>
+            </w:pPr>
+            <w:r/>
+            <w:r>
+              <w:rPr>
+                <w:rFonts w:ascii="Consolas" w:hAnsi="Consolas"/>
+                <w:color w:val="1F4D78"/>
+                <w:sz w:val="17"/>
+              </w:rPr>
+              <w:t>corpus_module_*.csv</w:t>
+            </w:r>
+          </w:p>
+        </w:tc>
+        <w:tc>
+          <w:tcPr>
+            <w:tcW w:type="dxa" w:w="5760"/>
             <w:vAlign w:val="center"/>
             <w:tcMar>
               <w:top w:w="80" w:type="dxa"/>
@@ -18501,13 +18561,18 @@
                 <w:rFonts w:ascii="Calibri" w:hAnsi="Calibri"/>
                 <w:sz w:val="18"/>
               </w:rPr>
-              <w:t>Work VAD</w:t>
+              <w:t>Additional-module results, metrics, aggregates, coverage, and warnings</w:t>
             </w:r>
           </w:p>
         </w:tc>
+      </w:tr>
+      <w:tr>
+        <w:trPr>
+          <w:cantSplit w:val="true"/>
+        </w:trPr>
         <w:tc>
           <w:tcPr>
-            <w:tcW w:type="dxa" w:w="6660"/>
+            <w:tcW w:type="dxa" w:w="3600"/>
             <w:vAlign w:val="center"/>
             <w:tcMar>
               <w:top w:w="80" w:type="dxa"/>
@@ -18524,233 +18589,17 @@
             <w:r/>
             <w:r>
               <w:rPr>
-                <w:rFonts w:ascii="Calibri" w:hAnsi="Calibri"/>
-                <w:sz w:val="18"/>
+                <w:rFonts w:ascii="Consolas" w:hAnsi="Consolas"/>
+                <w:color w:val="1F4D78"/>
+                <w:sz w:val="17"/>
               </w:rPr>
-              <w:t>Work-level means and population standard deviations, token/type weighting, source/normalized scale</w:t>
-            </w:r>
-          </w:p>
-        </w:tc>
-      </w:tr>
-      <w:tr>
-        <w:trPr>
-          <w:cantSplit w:val="true"/>
-        </w:trPr>
-        <w:tc>
-          <w:tcPr>
-            <w:tcW w:type="dxa" w:w="2700"/>
-            <w:vAlign w:val="center"/>
-            <w:tcMar>
-              <w:top w:w="80" w:type="dxa"/>
-              <w:bottom w:w="80" w:type="dxa"/>
-              <w:start w:w="120" w:type="dxa"/>
-              <w:end w:w="120" w:type="dxa"/>
-            </w:tcMar>
-          </w:tcPr>
-          <w:p>
-            <w:pPr>
-              <w:widowControl/>
-              <w:spacing w:before="0" w:after="0" w:line="252" w:lineRule="auto"/>
-            </w:pPr>
-            <w:r/>
-            <w:r>
-              <w:rPr>
-                <w:rFonts w:ascii="Calibri" w:hAnsi="Calibri"/>
-                <w:sz w:val="18"/>
-              </w:rPr>
-              <w:t>Cumulative Load</w:t>
+              <w:t>corpus_unmatched_qc.csv</w:t>
             </w:r>
           </w:p>
         </w:tc>
         <w:tc>
           <w:tcPr>
-            <w:tcW w:type="dxa" w:w="6660"/>
-            <w:vAlign w:val="center"/>
-            <w:tcMar>
-              <w:top w:w="80" w:type="dxa"/>
-              <w:bottom w:w="80" w:type="dxa"/>
-              <w:start w:w="120" w:type="dxa"/>
-              <w:end w:w="120" w:type="dxa"/>
-            </w:tcMar>
-          </w:tcPr>
-          <w:p>
-            <w:pPr>
-              <w:widowControl/>
-              <w:spacing w:before="0" w:after="0" w:line="252" w:lineRule="auto"/>
-            </w:pPr>
-            <w:r/>
-            <w:r>
-              <w:rPr>
-                <w:rFonts w:ascii="Calibri" w:hAnsi="Calibri"/>
-                <w:sz w:val="18"/>
-              </w:rPr>
-              <w:t>Length-sensitive totals by work and analysis view</w:t>
-            </w:r>
-          </w:p>
-        </w:tc>
-      </w:tr>
-      <w:tr>
-        <w:trPr>
-          <w:cantSplit w:val="true"/>
-        </w:trPr>
-        <w:tc>
-          <w:tcPr>
-            <w:tcW w:type="dxa" w:w="2700"/>
-            <w:vAlign w:val="center"/>
-            <w:tcMar>
-              <w:top w:w="80" w:type="dxa"/>
-              <w:bottom w:w="80" w:type="dxa"/>
-              <w:start w:w="120" w:type="dxa"/>
-              <w:end w:w="120" w:type="dxa"/>
-            </w:tcMar>
-          </w:tcPr>
-          <w:p>
-            <w:pPr>
-              <w:widowControl/>
-              <w:spacing w:before="0" w:after="0" w:line="252" w:lineRule="auto"/>
-            </w:pPr>
-            <w:r/>
-            <w:r>
-              <w:rPr>
-                <w:rFonts w:ascii="Calibri" w:hAnsi="Calibri"/>
-                <w:sz w:val="18"/>
-              </w:rPr>
-              <w:t>Coverage and Emotion</w:t>
-            </w:r>
-          </w:p>
-        </w:tc>
-        <w:tc>
-          <w:tcPr>
-            <w:tcW w:type="dxa" w:w="6660"/>
-            <w:vAlign w:val="center"/>
-            <w:tcMar>
-              <w:top w:w="80" w:type="dxa"/>
-              <w:bottom w:w="80" w:type="dxa"/>
-              <w:start w:w="120" w:type="dxa"/>
-              <w:end w:w="120" w:type="dxa"/>
-            </w:tcMar>
-          </w:tcPr>
-          <w:p>
-            <w:pPr>
-              <w:widowControl/>
-              <w:spacing w:before="0" w:after="0" w:line="252" w:lineRule="auto"/>
-            </w:pPr>
-            <w:r/>
-            <w:r>
-              <w:rPr>
-                <w:rFonts w:ascii="Calibri" w:hAnsi="Calibri"/>
-                <w:sz w:val="18"/>
-              </w:rPr>
-              <w:t xml:space="preserve">Coverage plus a </w:t>
-            </w:r>
-            <w:r>
-              <w:rPr>
-                <w:rFonts w:ascii="Consolas" w:hAnsi="Consolas"/>
-                <w:color w:val="1F4D78"/>
-                <w:sz w:val="17"/>
-              </w:rPr>
-              <w:t>Construct</w:t>
-            </w:r>
-            <w:r>
-              <w:rPr>
-                <w:rFonts w:ascii="Calibri" w:hAnsi="Calibri"/>
-                <w:sz w:val="18"/>
-              </w:rPr>
-              <w:t xml:space="preserve"> field separating emotion associations, sentiment associations, and supplied emotion-intensity metrics</w:t>
-            </w:r>
-          </w:p>
-        </w:tc>
-      </w:tr>
-      <w:tr>
-        <w:trPr>
-          <w:cantSplit w:val="true"/>
-        </w:trPr>
-        <w:tc>
-          <w:tcPr>
-            <w:tcW w:type="dxa" w:w="2700"/>
-            <w:vAlign w:val="center"/>
-            <w:tcMar>
-              <w:top w:w="80" w:type="dxa"/>
-              <w:bottom w:w="80" w:type="dxa"/>
-              <w:start w:w="120" w:type="dxa"/>
-              <w:end w:w="120" w:type="dxa"/>
-            </w:tcMar>
-          </w:tcPr>
-          <w:p>
-            <w:pPr>
-              <w:widowControl/>
-              <w:spacing w:before="0" w:after="0" w:line="252" w:lineRule="auto"/>
-            </w:pPr>
-            <w:r/>
-            <w:r>
-              <w:rPr>
-                <w:rFonts w:ascii="Calibri" w:hAnsi="Calibri"/>
-                <w:sz w:val="18"/>
-              </w:rPr>
-              <w:t>Part of Speech</w:t>
-            </w:r>
-          </w:p>
-        </w:tc>
-        <w:tc>
-          <w:tcPr>
-            <w:tcW w:type="dxa" w:w="6660"/>
-            <w:vAlign w:val="center"/>
-            <w:tcMar>
-              <w:top w:w="80" w:type="dxa"/>
-              <w:bottom w:w="80" w:type="dxa"/>
-              <w:start w:w="120" w:type="dxa"/>
-              <w:end w:w="120" w:type="dxa"/>
-            </w:tcMar>
-          </w:tcPr>
-          <w:p>
-            <w:pPr>
-              <w:widowControl/>
-              <w:spacing w:before="0" w:after="0" w:line="252" w:lineRule="auto"/>
-            </w:pPr>
-            <w:r/>
-            <w:r>
-              <w:rPr>
-                <w:rFonts w:ascii="Calibri" w:hAnsi="Calibri"/>
-                <w:sz w:val="18"/>
-              </w:rPr>
-              <w:t>Broad and detailed combined-project/work-level POS counts, lexical-token shares, unique types, examples, denominator, and model</w:t>
-            </w:r>
-          </w:p>
-        </w:tc>
-      </w:tr>
-      <w:tr>
-        <w:trPr>
-          <w:cantSplit w:val="true"/>
-        </w:trPr>
-        <w:tc>
-          <w:tcPr>
-            <w:tcW w:type="dxa" w:w="2700"/>
-            <w:vAlign w:val="center"/>
-            <w:tcMar>
-              <w:top w:w="80" w:type="dxa"/>
-              <w:bottom w:w="80" w:type="dxa"/>
-              <w:start w:w="120" w:type="dxa"/>
-              <w:end w:w="120" w:type="dxa"/>
-            </w:tcMar>
-          </w:tcPr>
-          <w:p>
-            <w:pPr>
-              <w:widowControl/>
-              <w:spacing w:before="0" w:after="0" w:line="252" w:lineRule="auto"/>
-            </w:pPr>
-            <w:r/>
-            <w:r>
-              <w:rPr>
-                <w:rFonts w:ascii="Calibri" w:hAnsi="Calibri"/>
-                <w:sz w:val="18"/>
-              </w:rPr>
-              <w:t>Unmatched QC</w:t>
-            </w:r>
-          </w:p>
-        </w:tc>
-        <w:tc>
-          <w:tcPr>
-            <w:tcW w:type="dxa" w:w="6660"/>
+            <w:tcW w:type="dxa" w:w="5760"/>
             <w:vAlign w:val="center"/>
             <w:tcMar>
               <w:top w:w="80" w:type="dxa"/>
@@ -18781,7 +18630,49 @@
         </w:trPr>
         <w:tc>
           <w:tcPr>
-            <w:tcW w:type="dxa" w:w="2700"/>
+            <w:tcW w:type="dxa" w:w="3600"/>
+            <w:vAlign w:val="center"/>
+            <w:tcMar>
+              <w:top w:w="80" w:type="dxa"/>
+              <w:bottom w:w="80" w:type="dxa"/>
+              <w:start w:w="120" w:type="dxa"/>
+              <w:end w:w="120" w:type="dxa"/>
+            </w:tcMar>
+          </w:tcPr>
+          <w:p>
+            <w:pPr>
+              <w:widowControl/>
+              <w:spacing w:before="0" w:after="0" w:line="252" w:lineRule="auto"/>
+            </w:pPr>
+            <w:r/>
+            <w:r>
+              <w:rPr>
+                <w:rFonts w:ascii="Consolas" w:hAnsi="Consolas"/>
+                <w:color w:val="1F4D78"/>
+                <w:sz w:val="17"/>
+              </w:rPr>
+              <w:t>corpus_review_decisions.csv</w:t>
+            </w:r>
+            <w:r>
+              <w:rPr>
+                <w:rFonts w:ascii="Calibri" w:hAnsi="Calibri"/>
+                <w:sz w:val="18"/>
+              </w:rPr>
+              <w:t xml:space="preserve"> and </w:t>
+            </w:r>
+            <w:r>
+              <w:rPr>
+                <w:rFonts w:ascii="Consolas" w:hAnsi="Consolas"/>
+                <w:color w:val="1F4D78"/>
+                <w:sz w:val="17"/>
+              </w:rPr>
+              <w:t>corpus_methodology.csv</w:t>
+            </w:r>
+          </w:p>
+        </w:tc>
+        <w:tc>
+          <w:tcPr>
+            <w:tcW w:type="dxa" w:w="5760"/>
             <w:vAlign w:val="center"/>
             <w:tcMar>
               <w:top w:w="80" w:type="dxa"/>
@@ -18801,147 +18692,7 @@
                 <w:rFonts w:ascii="Calibri" w:hAnsi="Calibri"/>
                 <w:sz w:val="18"/>
               </w:rPr>
-              <w:t>Review Decisions</w:t>
-            </w:r>
-          </w:p>
-        </w:tc>
-        <w:tc>
-          <w:tcPr>
-            <w:tcW w:type="dxa" w:w="6660"/>
-            <w:vAlign w:val="center"/>
-            <w:tcMar>
-              <w:top w:w="80" w:type="dxa"/>
-              <w:bottom w:w="80" w:type="dxa"/>
-              <w:start w:w="120" w:type="dxa"/>
-              <w:end w:w="120" w:type="dxa"/>
-            </w:tcMar>
-          </w:tcPr>
-          <w:p>
-            <w:pPr>
-              <w:widowControl/>
-              <w:spacing w:before="0" w:after="0" w:line="252" w:lineRule="auto"/>
-            </w:pPr>
-            <w:r/>
-            <w:r>
-              <w:rPr>
-                <w:rFonts w:ascii="Calibri" w:hAnsi="Calibri"/>
-                <w:sz w:val="18"/>
-              </w:rPr>
-              <w:t>Active decision revisions pinned to the exported scenario; present for reviewed runs</w:t>
-            </w:r>
-          </w:p>
-        </w:tc>
-      </w:tr>
-      <w:tr>
-        <w:trPr>
-          <w:cantSplit w:val="true"/>
-        </w:trPr>
-        <w:tc>
-          <w:tcPr>
-            <w:tcW w:type="dxa" w:w="2700"/>
-            <w:vAlign w:val="center"/>
-            <w:tcMar>
-              <w:top w:w="80" w:type="dxa"/>
-              <w:bottom w:w="80" w:type="dxa"/>
-              <w:start w:w="120" w:type="dxa"/>
-              <w:end w:w="120" w:type="dxa"/>
-            </w:tcMar>
-          </w:tcPr>
-          <w:p>
-            <w:pPr>
-              <w:widowControl/>
-              <w:spacing w:before="0" w:after="0" w:line="252" w:lineRule="auto"/>
-            </w:pPr>
-            <w:r/>
-            <w:r>
-              <w:rPr>
-                <w:rFonts w:ascii="Calibri" w:hAnsi="Calibri"/>
-                <w:sz w:val="18"/>
-              </w:rPr>
-              <w:t>Text Metadata</w:t>
-            </w:r>
-          </w:p>
-        </w:tc>
-        <w:tc>
-          <w:tcPr>
-            <w:tcW w:type="dxa" w:w="6660"/>
-            <w:vAlign w:val="center"/>
-            <w:tcMar>
-              <w:top w:w="80" w:type="dxa"/>
-              <w:bottom w:w="80" w:type="dxa"/>
-              <w:start w:w="120" w:type="dxa"/>
-              <w:end w:w="120" w:type="dxa"/>
-            </w:tcMar>
-          </w:tcPr>
-          <w:p>
-            <w:pPr>
-              <w:widowControl/>
-              <w:spacing w:before="0" w:after="0" w:line="252" w:lineRule="auto"/>
-            </w:pPr>
-            <w:r/>
-            <w:r>
-              <w:rPr>
-                <w:rFonts w:ascii="Calibri" w:hAnsi="Calibri"/>
-                <w:sz w:val="18"/>
-              </w:rPr>
-              <w:t>Work IDs, text-version IDs, metadata, paths, and hashes</w:t>
-            </w:r>
-          </w:p>
-        </w:tc>
-      </w:tr>
-      <w:tr>
-        <w:trPr>
-          <w:cantSplit w:val="true"/>
-        </w:trPr>
-        <w:tc>
-          <w:tcPr>
-            <w:tcW w:type="dxa" w:w="2700"/>
-            <w:vAlign w:val="center"/>
-            <w:tcMar>
-              <w:top w:w="80" w:type="dxa"/>
-              <w:bottom w:w="80" w:type="dxa"/>
-              <w:start w:w="120" w:type="dxa"/>
-              <w:end w:w="120" w:type="dxa"/>
-            </w:tcMar>
-          </w:tcPr>
-          <w:p>
-            <w:pPr>
-              <w:widowControl/>
-              <w:spacing w:before="0" w:after="0" w:line="252" w:lineRule="auto"/>
-            </w:pPr>
-            <w:r/>
-            <w:r>
-              <w:rPr>
-                <w:rFonts w:ascii="Calibri" w:hAnsi="Calibri"/>
-                <w:sz w:val="18"/>
-              </w:rPr>
-              <w:t>Methodology</w:t>
-            </w:r>
-          </w:p>
-        </w:tc>
-        <w:tc>
-          <w:tcPr>
-            <w:tcW w:type="dxa" w:w="6660"/>
-            <w:vAlign w:val="center"/>
-            <w:tcMar>
-              <w:top w:w="80" w:type="dxa"/>
-              <w:bottom w:w="80" w:type="dxa"/>
-              <w:start w:w="120" w:type="dxa"/>
-              <w:end w:w="120" w:type="dxa"/>
-            </w:tcMar>
-          </w:tcPr>
-          <w:p>
-            <w:pPr>
-              <w:widowControl/>
-              <w:spacing w:before="0" w:after="0" w:line="252" w:lineRule="auto"/>
-            </w:pPr>
-            <w:r/>
-            <w:r>
-              <w:rPr>
-                <w:rFonts w:ascii="Calibri" w:hAnsi="Calibri"/>
-                <w:sz w:val="18"/>
-              </w:rPr>
-              <w:t>Selected lexicons, phrase policy, stopword source/version/hash, protected terms, and custom changes</w:t>
+              <w:t>Active decision revisions and reproducibility settings</w:t>
             </w:r>
           </w:p>
         </w:tc>
@@ -18963,7 +18714,7 @@
           <w:rFonts w:ascii="Calibri" w:hAnsi="Calibri"/>
           <w:sz w:val="22"/>
         </w:rPr>
-        <w:t>Excel is a derived report, not the authoritative database. The workbook does not duplicate the complete literary texts.</w:t>
+        <w:t>The corpus bundle is a derived report, not the authoritative database. It does not duplicate the complete literary texts.</w:t>
       </w:r>
     </w:p>
     <w:p>
@@ -26892,7 +26643,7 @@
         <w:color w:val="66727C"/>
         <w:sz w:val="18"/>
       </w:rPr>
-      <w:t xml:space="preserve">  |  0.18.0.dev0</w:t>
+      <w:t xml:space="preserve">  |  1.0.0</w:t>
     </w:r>
   </w:p>
 </w:hdr>

</xml_diff>

<commit_message>
Added download/export functionality to Lexicon Explorer workspace
</commit_message>
<xml_diff>
--- a/docs/VerseVAD_User_Manual.docx
+++ b/docs/VerseVAD_User_Manual.docx
@@ -13473,6 +13473,52 @@
     </w:p>
     <w:p>
       <w:pPr>
+        <w:widowControl/>
+        <w:numPr>
+          <w:ilvl w:val="0"/>
+          <w:numId w:val="20"/>
+        </w:numPr>
+        <w:spacing w:before="0" w:after="80" w:line="300" w:lineRule="auto"/>
+        <w:ind w:left="540" w:hanging="271"/>
+      </w:pPr>
+      <w:r>
+        <w:rPr>
+          <w:rFonts w:ascii="Calibri" w:hAnsi="Calibri"/>
+          <w:sz w:val="22"/>
+        </w:rPr>
+        <w:t xml:space="preserve">Select </w:t>
+      </w:r>
+      <w:r>
+        <w:rPr>
+          <w:rFonts w:ascii="Calibri" w:hAnsi="Calibri"/>
+          <w:b/>
+          <w:sz w:val="22"/>
+        </w:rPr>
+        <w:t>Download printable Word report</w:t>
+      </w:r>
+      <w:r>
+        <w:rPr>
+          <w:rFonts w:ascii="Calibri" w:hAnsi="Calibri"/>
+          <w:sz w:val="22"/>
+        </w:rPr>
+        <w:t xml:space="preserve"> to save the complete current</w:t>
+      </w:r>
+    </w:p>
+    <w:p>
+      <w:pPr>
+        <w:widowControl/>
+        <w:spacing w:before="0" w:after="120" w:line="300" w:lineRule="auto"/>
+      </w:pPr>
+      <w:r>
+        <w:rPr>
+          <w:rFonts w:ascii="Calibri" w:hAnsi="Calibri"/>
+          <w:sz w:val="22"/>
+        </w:rPr>
+        <w:t xml:space="preserve">   lookup with its evidence, notices, comparisons, and provenance.</w:t>
+      </w:r>
+    </w:p>
+    <w:p>
+      <w:pPr>
         <w:pStyle w:val="Heading2"/>
       </w:pPr>
       <w:r>
@@ -13892,6 +13938,46 @@
           <w:sz w:val="22"/>
         </w:rPr>
         <w:t xml:space="preserve"> is lookup-only. It lets you inspect the mapped entry while preserving the distinction between queried and mapped forms. It does not change poem or corpus analysis.</w:t>
+      </w:r>
+    </w:p>
+    <w:p>
+      <w:pPr>
+        <w:pStyle w:val="Heading2"/>
+      </w:pPr>
+      <w:r>
+        <w:rPr>
+          <w:rFonts w:ascii="Calibri" w:hAnsi="Calibri"/>
+          <w:sz w:val="22"/>
+        </w:rPr>
+        <w:t>Printable Word report</w:t>
+      </w:r>
+    </w:p>
+    <w:p>
+      <w:pPr>
+        <w:widowControl/>
+        <w:spacing w:before="0" w:after="120" w:line="300" w:lineRule="auto"/>
+      </w:pPr>
+      <w:r>
+        <w:rPr>
+          <w:rFonts w:ascii="Calibri" w:hAnsi="Calibri"/>
+          <w:sz w:val="22"/>
+        </w:rPr>
+        <w:t xml:space="preserve">The Explorer can export the current lookup as a narrative </w:t>
+      </w:r>
+      <w:r>
+        <w:rPr>
+          <w:rFonts w:ascii="Consolas" w:hAnsi="Consolas"/>
+          <w:color w:val="1F4D78"/>
+          <w:sz w:val="19"/>
+        </w:rPr>
+        <w:t>.docx</w:t>
+      </w:r>
+      <w:r>
+        <w:rPr>
+          <w:rFonts w:ascii="Calibri" w:hAnsi="Calibri"/>
+          <w:sz w:val="22"/>
+        </w:rPr>
+        <w:t xml:space="preserve"> report. The report includes query processing, match methods, affective ratings and associations, original and normalized VAD, source uncertainty where available, derived component averages and cross-lexicon spread, concreteness, frequency, AoA, every pronunciation variant, missing-resource statuses, notices, suggestions, and source provenance. It is designed for reading and printing; poem and corpus CSV audit exports remain separate.</w:t>
       </w:r>
     </w:p>
     <w:p>

</xml_diff>

<commit_message>
Added cross-OS support for Mac
</commit_message>
<xml_diff>
--- a/docs/VerseVAD_User_Manual.docx
+++ b/docs/VerseVAD_User_Manual.docx
@@ -71,7 +71,7 @@
           <w:color w:val="66727C"/>
           <w:sz w:val="21"/>
         </w:rPr>
-        <w:t xml:space="preserve"> July 25, 2026</w:t>
+        <w:t xml:space="preserve"> July 26, 2026</w:t>
       </w:r>
       <w:r>
         <w:rPr>
@@ -1600,7 +1600,7 @@
           <w:rFonts w:ascii="Calibri" w:hAnsi="Calibri"/>
           <w:sz w:val="22"/>
         </w:rPr>
-        <w:t xml:space="preserve">Double-click </w:t>
+        <w:t xml:space="preserve">On Windows, double-click </w:t>
       </w:r>
       <w:r>
         <w:rPr>
@@ -1609,6 +1609,34 @@
           <w:sz w:val="19"/>
         </w:rPr>
         <w:t>setup_windows.bat</w:t>
+      </w:r>
+      <w:r>
+        <w:rPr>
+          <w:rFonts w:ascii="Calibri" w:hAnsi="Calibri"/>
+          <w:sz w:val="22"/>
+        </w:rPr>
+        <w:t>. On macOS, open Terminal in</w:t>
+      </w:r>
+    </w:p>
+    <w:p>
+      <w:pPr>
+        <w:widowControl/>
+        <w:spacing w:before="0" w:after="120" w:line="300" w:lineRule="auto"/>
+      </w:pPr>
+      <w:r>
+        <w:rPr>
+          <w:rFonts w:ascii="Calibri" w:hAnsi="Calibri"/>
+          <w:sz w:val="22"/>
+        </w:rPr>
+        <w:t xml:space="preserve">   the folder and run </w:t>
+      </w:r>
+      <w:r>
+        <w:rPr>
+          <w:rFonts w:ascii="Consolas" w:hAnsi="Consolas"/>
+          <w:color w:val="1F4D78"/>
+          <w:sz w:val="19"/>
+        </w:rPr>
+        <w:t>bash setup_macos.command</w:t>
       </w:r>
       <w:r>
         <w:rPr>
@@ -1633,7 +1661,20 @@
           <w:rFonts w:ascii="Calibri" w:hAnsi="Calibri"/>
           <w:sz w:val="22"/>
         </w:rPr>
-        <w:t>Allow the setup window to finish. The first setup can use the internet to obtain the pinned local runtime and packages.</w:t>
+        <w:t>Allow setup to finish. The first setup can use the internet to obtain the</w:t>
+      </w:r>
+    </w:p>
+    <w:p>
+      <w:pPr>
+        <w:widowControl/>
+        <w:spacing w:before="0" w:after="120" w:line="300" w:lineRule="auto"/>
+      </w:pPr>
+      <w:r>
+        <w:rPr>
+          <w:rFonts w:ascii="Calibri" w:hAnsi="Calibri"/>
+          <w:sz w:val="22"/>
+        </w:rPr>
+        <w:t xml:space="preserve">   pinned local runtime and packages.</w:t>
       </w:r>
     </w:p>
     <w:p>
@@ -1776,7 +1817,7 @@
           <w:rFonts w:ascii="Calibri" w:hAnsi="Calibri"/>
           <w:sz w:val="22"/>
         </w:rPr>
-        <w:t>Press a key if the setup window asks you to do so.</w:t>
+        <w:t>Close the setup window when it finishes.</w:t>
       </w:r>
     </w:p>
     <w:p>
@@ -1789,7 +1830,7 @@
           <w:rFonts w:ascii="Calibri" w:hAnsi="Calibri"/>
           <w:sz w:val="22"/>
         </w:rPr>
-        <w:t xml:space="preserve">Setup is project-local. It does not require administrator access or a system-wide Python installation. If the </w:t>
+        <w:t xml:space="preserve">Setup is project-local. It does not require administrator access or a system-wide Python installation. The macOS setup supports Apple silicon and Intel Macs running macOS 13 Ventura or newer without requiring Homebrew. If the </w:t>
       </w:r>
       <w:r>
         <w:rPr>
@@ -1804,7 +1845,7 @@
           <w:rFonts w:ascii="Calibri" w:hAnsi="Calibri"/>
           <w:sz w:val="22"/>
         </w:rPr>
-        <w:t xml:space="preserve"> folder is moved or renamed, rerun </w:t>
+        <w:t xml:space="preserve"> folder is moved or renamed, rerun the setup helper for the current operating system. Setup detects stale absolute virtual-environment paths and rebuilds only the disposable </w:t>
       </w:r>
       <w:r>
         <w:rPr>
@@ -1812,14 +1853,27 @@
           <w:color w:val="1F4D78"/>
           <w:sz w:val="19"/>
         </w:rPr>
-        <w:t>setup_windows.bat</w:t>
-      </w:r>
-      <w:r>
-        <w:rPr>
-          <w:rFonts w:ascii="Calibri" w:hAnsi="Calibri"/>
-          <w:sz w:val="22"/>
-        </w:rPr>
-        <w:t xml:space="preserve">. Setup detects stale absolute virtual-environment paths and rebuilds only the disposable </w:t>
+        <w:t>.venv</w:t>
+      </w:r>
+      <w:r>
+        <w:rPr>
+          <w:rFonts w:ascii="Calibri" w:hAnsi="Calibri"/>
+          <w:sz w:val="22"/>
+        </w:rPr>
+        <w:t>; research sources and project data are not removed.</w:t>
+      </w:r>
+    </w:p>
+    <w:p>
+      <w:pPr>
+        <w:widowControl/>
+        <w:spacing w:before="0" w:after="120" w:line="300" w:lineRule="auto"/>
+      </w:pPr>
+      <w:r>
+        <w:rPr>
+          <w:rFonts w:ascii="Calibri" w:hAnsi="Calibri"/>
+          <w:sz w:val="22"/>
+        </w:rPr>
+        <w:t xml:space="preserve">On macOS, setup also makes the three </w:t>
       </w:r>
       <w:r>
         <w:rPr>
@@ -1827,14 +1881,59 @@
           <w:color w:val="1F4D78"/>
           <w:sz w:val="19"/>
         </w:rPr>
-        <w:t>.venv</w:t>
-      </w:r>
-      <w:r>
-        <w:rPr>
-          <w:rFonts w:ascii="Calibri" w:hAnsi="Calibri"/>
-          <w:sz w:val="22"/>
-        </w:rPr>
-        <w:t>; research sources and project data are not removed.</w:t>
+        <w:t>.command</w:t>
+      </w:r>
+      <w:r>
+        <w:rPr>
+          <w:rFonts w:ascii="Calibri" w:hAnsi="Calibri"/>
+          <w:sz w:val="22"/>
+        </w:rPr>
+        <w:t xml:space="preserve"> helpers executable. If Terminal reports </w:t>
+      </w:r>
+      <w:r>
+        <w:rPr>
+          <w:rFonts w:ascii="Consolas" w:hAnsi="Consolas"/>
+          <w:color w:val="1F4D78"/>
+          <w:sz w:val="19"/>
+        </w:rPr>
+        <w:t>Permission denied</w:t>
+      </w:r>
+      <w:r>
+        <w:rPr>
+          <w:rFonts w:ascii="Calibri" w:hAnsi="Calibri"/>
+          <w:sz w:val="22"/>
+        </w:rPr>
+        <w:t xml:space="preserve">, run </w:t>
+      </w:r>
+      <w:r>
+        <w:rPr>
+          <w:rFonts w:ascii="Consolas" w:hAnsi="Consolas"/>
+          <w:color w:val="1F4D78"/>
+          <w:sz w:val="19"/>
+        </w:rPr>
+        <w:t>chmod u+x setup_macos.command start_versevad.command diagnose_macos.command</w:t>
+      </w:r>
+      <w:r>
+        <w:rPr>
+          <w:rFonts w:ascii="Calibri" w:hAnsi="Calibri"/>
+          <w:sz w:val="22"/>
+        </w:rPr>
+        <w:t xml:space="preserve"> from the VerseVAD folder. See </w:t>
+      </w:r>
+      <w:r>
+        <w:rPr>
+          <w:rFonts w:ascii="Consolas" w:hAnsi="Consolas"/>
+          <w:color w:val="1F4D78"/>
+          <w:sz w:val="19"/>
+        </w:rPr>
+        <w:t>docs/macos-installation.md</w:t>
+      </w:r>
+      <w:r>
+        <w:rPr>
+          <w:rFonts w:ascii="Calibri" w:hAnsi="Calibri"/>
+          <w:sz w:val="22"/>
+        </w:rPr>
+        <w:t xml:space="preserve"> for exact Finder/Terminal steps, Gatekeeper guidance, and browser troubleshooting.</w:t>
       </w:r>
     </w:p>
     <w:p>
@@ -1864,7 +1963,7 @@
           <w:rFonts w:ascii="Calibri" w:hAnsi="Calibri"/>
           <w:sz w:val="22"/>
         </w:rPr>
-        <w:t xml:space="preserve">Double-click </w:t>
+        <w:t xml:space="preserve">On Windows, double-click </w:t>
       </w:r>
       <w:r>
         <w:rPr>
@@ -1873,6 +1972,34 @@
           <w:sz w:val="19"/>
         </w:rPr>
         <w:t>start_versevad.bat</w:t>
+      </w:r>
+      <w:r>
+        <w:rPr>
+          <w:rFonts w:ascii="Calibri" w:hAnsi="Calibri"/>
+          <w:sz w:val="22"/>
+        </w:rPr>
+        <w:t>. On macOS, double-click</w:t>
+      </w:r>
+    </w:p>
+    <w:p>
+      <w:pPr>
+        <w:widowControl/>
+        <w:spacing w:before="0" w:after="120" w:line="300" w:lineRule="auto"/>
+      </w:pPr>
+      <w:r>
+        <w:rPr>
+          <w:rFonts w:ascii="Calibri" w:hAnsi="Calibri"/>
+          <w:sz w:val="22"/>
+        </w:rPr>
+        <w:t xml:space="preserve">   </w:t>
+      </w:r>
+      <w:r>
+        <w:rPr>
+          <w:rFonts w:ascii="Consolas" w:hAnsi="Consolas"/>
+          <w:color w:val="1F4D78"/>
+          <w:sz w:val="19"/>
+        </w:rPr>
+        <w:t>start_versevad.command</w:t>
       </w:r>
       <w:r>
         <w:rPr>
@@ -1930,7 +2057,20 @@
           <w:rFonts w:ascii="Calibri" w:hAnsi="Calibri"/>
           <w:sz w:val="22"/>
         </w:rPr>
-        <w:t>.</w:t>
+        <w:t>. Current Safari</w:t>
+      </w:r>
+    </w:p>
+    <w:p>
+      <w:pPr>
+        <w:widowControl/>
+        <w:spacing w:before="0" w:after="120" w:line="300" w:lineRule="auto"/>
+      </w:pPr>
+      <w:r>
+        <w:rPr>
+          <w:rFonts w:ascii="Calibri" w:hAnsi="Calibri"/>
+          <w:sz w:val="22"/>
+        </w:rPr>
+        <w:t xml:space="preserve">   and Chrome are supported; Streamlit's browser policy covers the two most    recent versions of each.</w:t>
       </w:r>
     </w:p>
     <w:p>
@@ -25301,7 +25441,7 @@
           <w:rFonts w:ascii="Calibri" w:hAnsi="Calibri"/>
           <w:sz w:val="22"/>
         </w:rPr>
-        <w:t xml:space="preserve"> in the sidebar. A healthy installation reports </w:t>
+        <w:t xml:space="preserve"> in the sidebar. A fully provisioned installation reports </w:t>
       </w:r>
       <w:r>
         <w:rPr>
@@ -25309,7 +25449,7 @@
           <w:color w:val="1F4D78"/>
           <w:sz w:val="19"/>
         </w:rPr>
-        <w:t>11/11 checks passed</w:t>
+        <w:t>12/12 checks passed</w:t>
       </w:r>
       <w:r>
         <w:rPr>
@@ -25331,32 +25471,7 @@
           <w:rFonts w:ascii="Calibri" w:hAnsi="Calibri"/>
           <w:sz w:val="22"/>
         </w:rPr>
-        <w:t>.</w:t>
-      </w:r>
-    </w:p>
-    <w:p>
-      <w:pPr>
-        <w:pStyle w:val="Heading2"/>
-      </w:pPr>
-      <w:r>
-        <w:rPr>
-          <w:rFonts w:ascii="Calibri" w:hAnsi="Calibri"/>
-          <w:sz w:val="22"/>
-        </w:rPr>
-        <w:t>Browser page shows old-code errors</w:t>
-      </w:r>
-    </w:p>
-    <w:p>
-      <w:pPr>
-        <w:widowControl/>
-        <w:spacing w:before="0" w:after="120" w:line="300" w:lineRule="auto"/>
-      </w:pPr>
-      <w:r>
-        <w:rPr>
-          <w:rFonts w:ascii="Calibri" w:hAnsi="Calibri"/>
-          <w:sz w:val="22"/>
-        </w:rPr>
-        <w:t xml:space="preserve">Close older VerseVAD launcher windows and browser tabs, then restart with </w:t>
+        <w:t xml:space="preserve"> on Windows or </w:t>
       </w:r>
       <w:r>
         <w:rPr>
@@ -25364,14 +25479,54 @@
           <w:color w:val="1F4D78"/>
           <w:sz w:val="19"/>
         </w:rPr>
-        <w:t>start_versevad.bat</w:t>
-      </w:r>
-      <w:r>
-        <w:rPr>
-          <w:rFonts w:ascii="Calibri" w:hAnsi="Calibri"/>
-          <w:sz w:val="22"/>
-        </w:rPr>
-        <w:t>. A forced browser refresh or fresh private/incognito tab can clear stale page state. The application also contains a runtime revision guard for known stale-module problems.</w:t>
+        <w:t>diagnose_macos.command</w:t>
+      </w:r>
+      <w:r>
+        <w:rPr>
+          <w:rFonts w:ascii="Calibri" w:hAnsi="Calibri"/>
+          <w:sz w:val="22"/>
+        </w:rPr>
+        <w:t xml:space="preserve"> on macOS.</w:t>
+      </w:r>
+    </w:p>
+    <w:p>
+      <w:pPr>
+        <w:pStyle w:val="Heading2"/>
+      </w:pPr>
+      <w:r>
+        <w:rPr>
+          <w:rFonts w:ascii="Calibri" w:hAnsi="Calibri"/>
+          <w:sz w:val="22"/>
+        </w:rPr>
+        <w:t>Browser page shows old-code errors</w:t>
+      </w:r>
+    </w:p>
+    <w:p>
+      <w:pPr>
+        <w:widowControl/>
+        <w:spacing w:before="0" w:after="120" w:line="300" w:lineRule="auto"/>
+      </w:pPr>
+      <w:r>
+        <w:rPr>
+          <w:rFonts w:ascii="Calibri" w:hAnsi="Calibri"/>
+          <w:sz w:val="22"/>
+        </w:rPr>
+        <w:t xml:space="preserve">Close older VerseVAD launcher windows and browser tabs, then restart with the launcher for the current operating system. A forced browser refresh or fresh private/incognito tab can clear stale page state. In Chrome on macOS, the hard refresh shortcut is Command-Shift-R. If no browser opens, manually visit </w:t>
+      </w:r>
+      <w:r>
+        <w:rPr>
+          <w:rFonts w:ascii="Consolas" w:hAnsi="Consolas"/>
+          <w:color w:val="1F4D78"/>
+          <w:sz w:val="19"/>
+        </w:rPr>
+        <w:t>http://127.0.0.1:8501</w:t>
+      </w:r>
+      <w:r>
+        <w:rPr>
+          <w:rFonts w:ascii="Calibri" w:hAnsi="Calibri"/>
+          <w:sz w:val="22"/>
+        </w:rPr>
+        <w:t xml:space="preserve"> in Safari or Chrome while the launcher remains open. The application also contains a runtime revision guard for known stale-module problems.</w:t>
       </w:r>
     </w:p>
     <w:p>

</xml_diff>

<commit_message>
Add corpus VAD dispersion reporting
</commit_message>
<xml_diff>
--- a/docs/VerseVAD_User_Manual.docx
+++ b/docs/VerseVAD_User_Manual.docx
@@ -1934,6 +1934,164 @@
           <w:sz w:val="22"/>
         </w:rPr>
         <w:t xml:space="preserve"> for exact Finder/Terminal steps, Gatekeeper guidance, and browser troubleshooting.</w:t>
+      </w:r>
+    </w:p>
+    <w:p>
+      <w:pPr>
+        <w:pStyle w:val="Heading2"/>
+      </w:pPr>
+      <w:r>
+        <w:rPr>
+          <w:rFonts w:ascii="Calibri" w:hAnsi="Calibri"/>
+          <w:sz w:val="22"/>
+        </w:rPr>
+        <w:t>Updating an existing installation</w:t>
+      </w:r>
+    </w:p>
+    <w:p>
+      <w:pPr>
+        <w:widowControl/>
+        <w:spacing w:before="0" w:after="120" w:line="300" w:lineRule="auto"/>
+      </w:pPr>
+      <w:r>
+        <w:rPr>
+          <w:rFonts w:ascii="Calibri" w:hAnsi="Calibri"/>
+          <w:sz w:val="22"/>
+        </w:rPr>
+        <w:t xml:space="preserve">A VerseVAD folder cloned with Git can be updated in place. Close VerseVAD, inspect tracked local changes, and use GitHub Desktop </w:t>
+      </w:r>
+      <w:r>
+        <w:rPr>
+          <w:rFonts w:ascii="Calibri" w:hAnsi="Calibri"/>
+          <w:b/>
+          <w:sz w:val="22"/>
+        </w:rPr>
+        <w:t>Fetch origin</w:t>
+      </w:r>
+      <w:r>
+        <w:rPr>
+          <w:rFonts w:ascii="Calibri" w:hAnsi="Calibri"/>
+          <w:sz w:val="22"/>
+        </w:rPr>
+        <w:t xml:space="preserve"> followed by </w:t>
+      </w:r>
+      <w:r>
+        <w:rPr>
+          <w:rFonts w:ascii="Calibri" w:hAnsi="Calibri"/>
+          <w:b/>
+          <w:sz w:val="22"/>
+        </w:rPr>
+        <w:t>Pull origin</w:t>
+      </w:r>
+      <w:r>
+        <w:rPr>
+          <w:rFonts w:ascii="Calibri" w:hAnsi="Calibri"/>
+          <w:sz w:val="22"/>
+        </w:rPr>
+        <w:t xml:space="preserve">, or run </w:t>
+      </w:r>
+      <w:r>
+        <w:rPr>
+          <w:rFonts w:ascii="Consolas" w:hAnsi="Consolas"/>
+          <w:color w:val="1F4D78"/>
+          <w:sz w:val="19"/>
+        </w:rPr>
+        <w:t>git fetch origin</w:t>
+      </w:r>
+      <w:r>
+        <w:rPr>
+          <w:rFonts w:ascii="Calibri" w:hAnsi="Calibri"/>
+          <w:sz w:val="22"/>
+        </w:rPr>
+        <w:t xml:space="preserve"> and </w:t>
+      </w:r>
+      <w:r>
+        <w:rPr>
+          <w:rFonts w:ascii="Consolas" w:hAnsi="Consolas"/>
+          <w:color w:val="1F4D78"/>
+          <w:sz w:val="19"/>
+        </w:rPr>
+        <w:t>git pull --ff-only origin main</w:t>
+      </w:r>
+      <w:r>
+        <w:rPr>
+          <w:rFonts w:ascii="Calibri" w:hAnsi="Calibri"/>
+          <w:sz w:val="22"/>
+        </w:rPr>
+        <w:t xml:space="preserve"> from the repository. Then rerun </w:t>
+      </w:r>
+      <w:r>
+        <w:rPr>
+          <w:rFonts w:ascii="Consolas" w:hAnsi="Consolas"/>
+          <w:color w:val="1F4D78"/>
+          <w:sz w:val="19"/>
+        </w:rPr>
+        <w:t>setup_windows.bat</w:t>
+      </w:r>
+      <w:r>
+        <w:rPr>
+          <w:rFonts w:ascii="Calibri" w:hAnsi="Calibri"/>
+          <w:sz w:val="22"/>
+        </w:rPr>
+        <w:t xml:space="preserve"> or </w:t>
+      </w:r>
+      <w:r>
+        <w:rPr>
+          <w:rFonts w:ascii="Consolas" w:hAnsi="Consolas"/>
+          <w:color w:val="1F4D78"/>
+          <w:sz w:val="19"/>
+        </w:rPr>
+        <w:t>bash setup_macos.command</w:t>
+      </w:r>
+      <w:r>
+        <w:rPr>
+          <w:rFonts w:ascii="Calibri" w:hAnsi="Calibri"/>
+          <w:sz w:val="22"/>
+        </w:rPr>
+        <w:t>. The setup helper synchronizes only the locked dependency changes that are needed. It preserves ignored lexicons, resources, projects, exports, backups, runtime downloads, caches, and a compatible environment.</w:t>
+      </w:r>
+    </w:p>
+    <w:p>
+      <w:pPr>
+        <w:widowControl/>
+        <w:spacing w:before="0" w:after="120" w:line="300" w:lineRule="auto"/>
+      </w:pPr>
+      <w:r>
+        <w:rPr>
+          <w:rFonts w:ascii="Calibri" w:hAnsi="Calibri"/>
+          <w:sz w:val="22"/>
+        </w:rPr>
+        <w:t xml:space="preserve">Do not delete the working folder or use Git clean or hard reset as an update method. A folder obtained with GitHub's </w:t>
+      </w:r>
+      <w:r>
+        <w:rPr>
+          <w:rFonts w:ascii="Calibri" w:hAnsi="Calibri"/>
+          <w:b/>
+          <w:sz w:val="22"/>
+        </w:rPr>
+        <w:t>Download ZIP</w:t>
+      </w:r>
+      <w:r>
+        <w:rPr>
+          <w:rFonts w:ascii="Calibri" w:hAnsi="Calibri"/>
+          <w:sz w:val="22"/>
+        </w:rPr>
+        <w:t xml:space="preserve"> has no Git history and cannot pull. Use </w:t>
+      </w:r>
+      <w:r>
+        <w:rPr>
+          <w:rFonts w:ascii="Consolas" w:hAnsi="Consolas"/>
+          <w:color w:val="1F4D78"/>
+          <w:sz w:val="19"/>
+        </w:rPr>
+        <w:t>docs/updating.md</w:t>
+      </w:r>
+      <w:r>
+        <w:rPr>
+          <w:rFonts w:ascii="Calibri" w:hAnsi="Calibri"/>
+          <w:sz w:val="22"/>
+        </w:rPr>
+        <w:t xml:space="preserve"> for exact Windows and macOS commands, a clone check, and the one-time safe migration from a ZIP folder to a real clone.</w:t>
       </w:r>
     </w:p>
     <w:p>
@@ -12468,6 +12626,125 @@
           <w:sz w:val="22"/>
         </w:rPr>
         <w:t>Neither is universally correct. Their difference can itself be important evidence.</w:t>
+      </w:r>
+    </w:p>
+    <w:p>
+      <w:pPr>
+        <w:widowControl/>
+        <w:spacing w:before="0" w:after="120" w:line="300" w:lineRule="auto"/>
+      </w:pPr>
+      <w:r>
+        <w:rPr>
+          <w:rFonts w:ascii="Calibri" w:hAnsi="Calibri"/>
+          <w:sz w:val="22"/>
+        </w:rPr>
+        <w:t>VerseVAD reports two different population standard deviations beside these means:</w:t>
+      </w:r>
+    </w:p>
+    <w:p>
+      <w:pPr>
+        <w:widowControl/>
+        <w:numPr>
+          <w:ilvl w:val="0"/>
+          <w:numId w:val="10"/>
+        </w:numPr>
+        <w:spacing w:before="0" w:after="80" w:line="300" w:lineRule="auto"/>
+        <w:ind w:left="540" w:hanging="271"/>
+      </w:pPr>
+      <w:r>
+        <w:rPr>
+          <w:rFonts w:ascii="Calibri" w:hAnsi="Calibri"/>
+          <w:b/>
+          <w:sz w:val="22"/>
+        </w:rPr>
+        <w:t>Pooled lexical-rating SD</w:t>
+      </w:r>
+      <w:r>
+        <w:rPr>
+          <w:rFonts w:ascii="Calibri" w:hAnsi="Calibri"/>
+          <w:sz w:val="22"/>
+        </w:rPr>
+        <w:t xml:space="preserve"> describes the spread of all included matched</w:t>
+      </w:r>
+    </w:p>
+    <w:p>
+      <w:pPr>
+        <w:widowControl/>
+        <w:spacing w:before="0" w:after="120" w:line="300" w:lineRule="auto"/>
+      </w:pPr>
+      <w:r>
+        <w:rPr>
+          <w:rFonts w:ascii="Calibri" w:hAnsi="Calibri"/>
+          <w:sz w:val="22"/>
+        </w:rPr>
+        <w:t xml:space="preserve">  token ratings around the token-weighted volume mean. It is reconstructed   from each poem's matched count, mean, and within-poem population SD. If any   required SD is unavailable or inconsistent, this corpus value remains   unavailable.</w:t>
+      </w:r>
+    </w:p>
+    <w:p>
+      <w:pPr>
+        <w:widowControl/>
+        <w:numPr>
+          <w:ilvl w:val="0"/>
+          <w:numId w:val="10"/>
+        </w:numPr>
+        <w:spacing w:before="0" w:after="80" w:line="300" w:lineRule="auto"/>
+        <w:ind w:left="540" w:hanging="271"/>
+      </w:pPr>
+      <w:r>
+        <w:rPr>
+          <w:rFonts w:ascii="Calibri" w:hAnsi="Calibri"/>
+          <w:b/>
+          <w:sz w:val="22"/>
+        </w:rPr>
+        <w:t>Across-poem mean SD</w:t>
+      </w:r>
+      <w:r>
+        <w:rPr>
+          <w:rFonts w:ascii="Calibri" w:hAnsi="Calibri"/>
+          <w:sz w:val="22"/>
+        </w:rPr>
+        <w:t xml:space="preserve"> describes the spread of poem-level token means around</w:t>
+      </w:r>
+    </w:p>
+    <w:p>
+      <w:pPr>
+        <w:widowControl/>
+        <w:spacing w:before="0" w:after="120" w:line="300" w:lineRule="auto"/>
+      </w:pPr>
+      <w:r>
+        <w:rPr>
+          <w:rFonts w:ascii="Calibri" w:hAnsi="Calibri"/>
+          <w:sz w:val="22"/>
+        </w:rPr>
+        <w:t xml:space="preserve">  the work-weighted volume mean. It answers how much the included poem means   vary, not how much individual word ratings vary inside each poem.</w:t>
+      </w:r>
+    </w:p>
+    <w:p>
+      <w:pPr>
+        <w:widowControl/>
+        <w:spacing w:before="0" w:after="120" w:line="300" w:lineRule="auto"/>
+      </w:pPr>
+      <w:r>
+        <w:rPr>
+          <w:rFonts w:ascii="Calibri" w:hAnsi="Calibri"/>
+          <w:sz w:val="22"/>
+        </w:rPr>
+        <w:t xml:space="preserve">The same table reports the poem-mean median, minimum, and maximum. </w:t>
+      </w:r>
+      <w:r>
+        <w:rPr>
+          <w:rFonts w:ascii="Calibri" w:hAnsi="Calibri"/>
+          <w:b/>
+          <w:sz w:val="22"/>
+        </w:rPr>
+        <w:t>Compare Individual Works</w:t>
+      </w:r>
+      <w:r>
+        <w:rPr>
+          <w:rFonts w:ascii="Calibri" w:hAnsi="Calibri"/>
+          <w:sz w:val="22"/>
+        </w:rPr>
+        <w:t xml:space="preserve"> places each poem's normalized valence, arousal, and dominance means beside its own within-poem population SD for the selected source, analysis view, and token/type weighting. None of these SDs is a confidence interval, source-rater uncertainty, or a declaration of the poem's emotion.</w:t>
       </w:r>
     </w:p>
     <w:p>
@@ -18525,7 +18802,7 @@
                 <w:rFonts w:ascii="Calibri" w:hAnsi="Calibri"/>
                 <w:sz w:val="18"/>
               </w:rPr>
-              <w:t>Narrative collection overview, VAD profiles, denominators, and cautions</w:t>
+              <w:t>Narrative collection overview, VAD means, pooled and across-poem dispersion, denominators, and cautions</w:t>
             </w:r>
           </w:p>
         </w:tc>
@@ -18671,7 +18948,7 @@
                 <w:rFonts w:ascii="Calibri" w:hAnsi="Calibri"/>
                 <w:sz w:val="18"/>
               </w:rPr>
-              <w:t>Work-level VAD records and token-/work-weighted collection profiles</w:t>
+              <w:t>Work-level VAD means/SDs and token-/work-weighted collection means with pooled and across-poem dispersion</w:t>
             </w:r>
           </w:p>
         </w:tc>
@@ -19482,6 +19759,255 @@
           <w:sz w:val="22"/>
         </w:rPr>
         <w:t>The type-weighted dispersion uses the analogous formula over distinct entries.</w:t>
+      </w:r>
+    </w:p>
+    <w:p>
+      <w:pPr>
+        <w:pStyle w:val="Heading2"/>
+      </w:pPr>
+      <w:r>
+        <w:rPr>
+          <w:rFonts w:ascii="Calibri" w:hAnsi="Calibri"/>
+          <w:sz w:val="22"/>
+        </w:rPr>
+        <w:t>Corpus VAD means and dispersion</w:t>
+      </w:r>
+    </w:p>
+    <w:p>
+      <w:pPr>
+        <w:widowControl/>
+        <w:spacing w:before="0" w:after="120" w:line="300" w:lineRule="auto"/>
+      </w:pPr>
+      <w:r>
+        <w:rPr>
+          <w:rFonts w:ascii="Calibri" w:hAnsi="Calibri"/>
+          <w:sz w:val="22"/>
+        </w:rPr>
+        <w:t xml:space="preserve">Let poem </w:t>
+      </w:r>
+      <w:r>
+        <w:rPr>
+          <w:rFonts w:ascii="Consolas" w:hAnsi="Consolas"/>
+          <w:color w:val="1F4D78"/>
+          <w:sz w:val="19"/>
+        </w:rPr>
+        <w:t>j</w:t>
+      </w:r>
+      <w:r>
+        <w:rPr>
+          <w:rFonts w:ascii="Calibri" w:hAnsi="Calibri"/>
+          <w:sz w:val="22"/>
+        </w:rPr>
+        <w:t xml:space="preserve"> contribute </w:t>
+      </w:r>
+      <w:r>
+        <w:rPr>
+          <w:rFonts w:ascii="Consolas" w:hAnsi="Consolas"/>
+          <w:color w:val="1F4D78"/>
+          <w:sz w:val="19"/>
+        </w:rPr>
+        <w:t>n_j</w:t>
+      </w:r>
+      <w:r>
+        <w:rPr>
+          <w:rFonts w:ascii="Calibri" w:hAnsi="Calibri"/>
+          <w:sz w:val="22"/>
+        </w:rPr>
+        <w:t xml:space="preserve"> included matched token observations, token mean </w:t>
+      </w:r>
+      <w:r>
+        <w:rPr>
+          <w:rFonts w:ascii="Consolas" w:hAnsi="Consolas"/>
+          <w:color w:val="1F4D78"/>
+          <w:sz w:val="19"/>
+        </w:rPr>
+        <w:t>m_j</w:t>
+      </w:r>
+      <w:r>
+        <w:rPr>
+          <w:rFonts w:ascii="Calibri" w:hAnsi="Calibri"/>
+          <w:sz w:val="22"/>
+        </w:rPr>
+        <w:t xml:space="preserve">, and within-poem population standard deviation </w:t>
+      </w:r>
+      <w:r>
+        <w:rPr>
+          <w:rFonts w:ascii="Consolas" w:hAnsi="Consolas"/>
+          <w:color w:val="1F4D78"/>
+          <w:sz w:val="19"/>
+        </w:rPr>
+        <w:t>s_j</w:t>
+      </w:r>
+      <w:r>
+        <w:rPr>
+          <w:rFonts w:ascii="Calibri" w:hAnsi="Calibri"/>
+          <w:sz w:val="22"/>
+        </w:rPr>
+        <w:t xml:space="preserve">. Let </w:t>
+      </w:r>
+      <w:r>
+        <w:rPr>
+          <w:rFonts w:ascii="Consolas" w:hAnsi="Consolas"/>
+          <w:color w:val="1F4D78"/>
+          <w:sz w:val="19"/>
+        </w:rPr>
+        <w:t>K</w:t>
+      </w:r>
+      <w:r>
+        <w:rPr>
+          <w:rFonts w:ascii="Calibri" w:hAnsi="Calibri"/>
+          <w:sz w:val="22"/>
+        </w:rPr>
+        <w:t xml:space="preserve"> be the number of included poems.</w:t>
+      </w:r>
+    </w:p>
+    <w:p>
+      <w:pPr>
+        <w:widowControl/>
+        <w:spacing w:before="0" w:after="120" w:line="300" w:lineRule="auto"/>
+      </w:pPr>
+      <w:r>
+        <w:rPr>
+          <w:rFonts w:ascii="Calibri" w:hAnsi="Calibri"/>
+          <w:b/>
+          <w:sz w:val="22"/>
+        </w:rPr>
+        <w:t>Token-weighted volume mean</w:t>
+      </w:r>
+    </w:p>
+    <w:p>
+      <w:pPr>
+        <w:pStyle w:val="Formula"/>
+      </w:pPr>
+      <w:r>
+        <w:rPr>
+          <w:rFonts w:ascii="Consolas" w:hAnsi="Consolas"/>
+          <w:color w:val="1F4D78"/>
+          <w:sz w:val="19"/>
+        </w:rPr>
+        <w:t>M_token = sum(n_j * m_j) / sum(n_j)</w:t>
+      </w:r>
+    </w:p>
+    <w:p>
+      <w:pPr>
+        <w:widowControl/>
+        <w:spacing w:before="0" w:after="120" w:line="300" w:lineRule="auto"/>
+      </w:pPr>
+      <w:r>
+        <w:rPr>
+          <w:rFonts w:ascii="Calibri" w:hAnsi="Calibri"/>
+          <w:b/>
+          <w:sz w:val="22"/>
+        </w:rPr>
+        <w:t>Pooled lexical-rating population standard deviation</w:t>
+      </w:r>
+    </w:p>
+    <w:p>
+      <w:pPr>
+        <w:pStyle w:val="Formula"/>
+      </w:pPr>
+      <w:r>
+        <w:rPr>
+          <w:rFonts w:ascii="Consolas" w:hAnsi="Consolas"/>
+          <w:color w:val="1F4D78"/>
+          <w:sz w:val="19"/>
+        </w:rPr>
+        <w:t>SD_pooled = sqrt(sum(n_j * (s_j^2 + (m_j - M_token)^2)) / sum(n_j))</w:t>
+      </w:r>
+    </w:p>
+    <w:p>
+      <w:pPr>
+        <w:widowControl/>
+        <w:spacing w:before="0" w:after="120" w:line="300" w:lineRule="auto"/>
+      </w:pPr>
+      <w:r>
+        <w:rPr>
+          <w:rFonts w:ascii="Calibri" w:hAnsi="Calibri"/>
+          <w:sz w:val="22"/>
+        </w:rPr>
+        <w:t xml:space="preserve">This reconstruction combines within-poem and between-poem rating variation. It is reported only when every included poem supplies a compatible </w:t>
+      </w:r>
+      <w:r>
+        <w:rPr>
+          <w:rFonts w:ascii="Consolas" w:hAnsi="Consolas"/>
+          <w:color w:val="1F4D78"/>
+          <w:sz w:val="19"/>
+        </w:rPr>
+        <w:t>s_j</w:t>
+      </w:r>
+      <w:r>
+        <w:rPr>
+          <w:rFonts w:ascii="Calibri" w:hAnsi="Calibri"/>
+          <w:sz w:val="22"/>
+        </w:rPr>
+        <w:t xml:space="preserve"> and count.</w:t>
+      </w:r>
+    </w:p>
+    <w:p>
+      <w:pPr>
+        <w:widowControl/>
+        <w:spacing w:before="0" w:after="120" w:line="300" w:lineRule="auto"/>
+      </w:pPr>
+      <w:r>
+        <w:rPr>
+          <w:rFonts w:ascii="Calibri" w:hAnsi="Calibri"/>
+          <w:b/>
+          <w:sz w:val="22"/>
+        </w:rPr>
+        <w:t>Work-weighted volume mean</w:t>
+      </w:r>
+    </w:p>
+    <w:p>
+      <w:pPr>
+        <w:pStyle w:val="Formula"/>
+      </w:pPr>
+      <w:r>
+        <w:rPr>
+          <w:rFonts w:ascii="Consolas" w:hAnsi="Consolas"/>
+          <w:color w:val="1F4D78"/>
+          <w:sz w:val="19"/>
+        </w:rPr>
+        <w:t>M_work = sum(m_j) / K</w:t>
+      </w:r>
+    </w:p>
+    <w:p>
+      <w:pPr>
+        <w:widowControl/>
+        <w:spacing w:before="0" w:after="120" w:line="300" w:lineRule="auto"/>
+      </w:pPr>
+      <w:r>
+        <w:rPr>
+          <w:rFonts w:ascii="Calibri" w:hAnsi="Calibri"/>
+          <w:b/>
+          <w:sz w:val="22"/>
+        </w:rPr>
+        <w:t>Across-poem mean population standard deviation</w:t>
+      </w:r>
+    </w:p>
+    <w:p>
+      <w:pPr>
+        <w:pStyle w:val="Formula"/>
+      </w:pPr>
+      <w:r>
+        <w:rPr>
+          <w:rFonts w:ascii="Consolas" w:hAnsi="Consolas"/>
+          <w:color w:val="1F4D78"/>
+          <w:sz w:val="19"/>
+        </w:rPr>
+        <w:t>SD_poem_means = sqrt(sum((m_j - M_work)^2) / K)</w:t>
+      </w:r>
+    </w:p>
+    <w:p>
+      <w:pPr>
+        <w:widowControl/>
+        <w:spacing w:before="0" w:after="120" w:line="300" w:lineRule="auto"/>
+      </w:pPr>
+      <w:r>
+        <w:rPr>
+          <w:rFonts w:ascii="Calibri" w:hAnsi="Calibri"/>
+          <w:sz w:val="22"/>
+        </w:rPr>
+        <w:t>The first SD describes matched lexical ratings pooled across the volume. The second describes variation among poem means. Neither estimates uncertainty in the original human ratings.</w:t>
       </w:r>
     </w:p>
     <w:p>

</xml_diff>

<commit_message>
Add PoetryID token-scope selector
</commit_message>
<xml_diff>
--- a/docs/VerseVAD_User_Manual.docx
+++ b/docs/VerseVAD_User_Manual.docx
@@ -11428,7 +11428,82 @@
           <w:rFonts w:ascii="Calibri" w:hAnsi="Calibri"/>
           <w:sz w:val="22"/>
         </w:rPr>
-        <w:t>Read one source/view/weighting combination at a time. The tab presents:</w:t>
+        <w:t xml:space="preserve">Both token scopes are selected by default. Use the separate </w:t>
+      </w:r>
+      <w:r>
+        <w:rPr>
+          <w:rFonts w:ascii="Calibri" w:hAnsi="Calibri"/>
+          <w:b/>
+          <w:sz w:val="22"/>
+        </w:rPr>
+        <w:t>PoetryID VAD source</w:t>
+      </w:r>
+      <w:r>
+        <w:rPr>
+          <w:rFonts w:ascii="Calibri" w:hAnsi="Calibri"/>
+          <w:sz w:val="22"/>
+        </w:rPr>
+        <w:t xml:space="preserve">, </w:t>
+      </w:r>
+      <w:r>
+        <w:rPr>
+          <w:rFonts w:ascii="Calibri" w:hAnsi="Calibri"/>
+          <w:b/>
+          <w:sz w:val="22"/>
+        </w:rPr>
+        <w:t>PoetryID token scope</w:t>
+      </w:r>
+      <w:r>
+        <w:rPr>
+          <w:rFonts w:ascii="Calibri" w:hAnsi="Calibri"/>
+          <w:sz w:val="22"/>
+        </w:rPr>
+        <w:t xml:space="preserve">, and </w:t>
+      </w:r>
+      <w:r>
+        <w:rPr>
+          <w:rFonts w:ascii="Calibri" w:hAnsi="Calibri"/>
+          <w:b/>
+          <w:sz w:val="22"/>
+        </w:rPr>
+        <w:t>PoetryID weighting</w:t>
+      </w:r>
+      <w:r>
+        <w:rPr>
+          <w:rFonts w:ascii="Calibri" w:hAnsi="Calibri"/>
+          <w:sz w:val="22"/>
+        </w:rPr>
+        <w:t xml:space="preserve"> selectors to read one combination at a time. </w:t>
+      </w:r>
+      <w:r>
+        <w:rPr>
+          <w:rFonts w:ascii="Calibri" w:hAnsi="Calibri"/>
+          <w:b/>
+          <w:sz w:val="22"/>
+        </w:rPr>
+        <w:t>All matched tokens (including stopwords)</w:t>
+      </w:r>
+      <w:r>
+        <w:rPr>
+          <w:rFonts w:ascii="Calibri" w:hAnsi="Calibri"/>
+          <w:sz w:val="22"/>
+        </w:rPr>
+        <w:t xml:space="preserve"> includes only tokens that matched the selected VAD lexicon; unmatched vocabulary stays missing. </w:t>
+      </w:r>
+      <w:r>
+        <w:rPr>
+          <w:rFonts w:ascii="Calibri" w:hAnsi="Calibri"/>
+          <w:b/>
+          <w:sz w:val="22"/>
+        </w:rPr>
+        <w:t>Stopwords excluded</w:t>
+      </w:r>
+      <w:r>
+        <w:rPr>
+          <w:rFonts w:ascii="Calibri" w:hAnsi="Calibri"/>
+          <w:sz w:val="22"/>
+        </w:rPr>
+        <w:t xml:space="preserve"> applies the pinned VerseVAD stopword policy. The tab presents:</w:t>
       </w:r>
     </w:p>
     <w:p>
@@ -12836,6 +12911,19 @@
           <w:sz w:val="22"/>
         </w:rPr>
         <w:t>PoetryID corpus views group only matching source, all-matched or stopword-excluded view, token/type weighting, module version, and configuration. They show profile prevalence, three map-count tables, continuous work-level VAD positions, a per-poem comparison of categorical and nearest-centroid results, and token/type sensitivity without declaring one corpus-wide identity. The comparison table keeps both profile names, their agreement, nearest and categorical centroid distances, rule-based confidence, and continuous VAD coordinates together for each work.</w:t>
+      </w:r>
+    </w:p>
+    <w:p>
+      <w:pPr>
+        <w:widowControl/>
+        <w:spacing w:before="0" w:after="120" w:line="300" w:lineRule="auto"/>
+      </w:pPr>
+      <w:r>
+        <w:rPr>
+          <w:rFonts w:ascii="Calibri" w:hAnsi="Calibri"/>
+          <w:sz w:val="22"/>
+        </w:rPr>
+        <w:t>Both PoetryID token scopes are selected by default in new batch settings. They remain separate in stored results, comparisons, and exports.</w:t>
       </w:r>
     </w:p>
     <w:p>

</xml_diff>

<commit_message>
Preserve active sections across reruns
</commit_message>
<xml_diff>
--- a/docs/VerseVAD_User_Manual.docx
+++ b/docs/VerseVAD_User_Manual.docx
@@ -579,6 +579,49 @@
           <w:sz w:val="22"/>
         </w:rPr>
         <w:t>, which includes plain-language definitions, formulas, worked examples, and reporting templates.</w:t>
+      </w:r>
+    </w:p>
+    <w:p>
+      <w:pPr>
+        <w:widowControl/>
+        <w:spacing w:before="0" w:after="120" w:line="300" w:lineRule="auto"/>
+      </w:pPr>
+      <w:r>
+        <w:rPr>
+          <w:rFonts w:ascii="Calibri" w:hAnsi="Calibri"/>
+          <w:sz w:val="22"/>
+        </w:rPr>
+        <w:t xml:space="preserve">The report-family and Project / Corpus section controls remember the selected section during Streamlit refreshes. Changing a lexicon, token/type weighting, all-matched/stopword-excluded view, or another display control no longer sends the interface back to the first section. </w:t>
+      </w:r>
+      <w:r>
+        <w:rPr>
+          <w:rFonts w:ascii="Calibri" w:hAnsi="Calibri"/>
+          <w:b/>
+          <w:sz w:val="22"/>
+        </w:rPr>
+        <w:t>Prepare downloads</w:t>
+      </w:r>
+      <w:r>
+        <w:rPr>
+          <w:rFonts w:ascii="Calibri" w:hAnsi="Calibri"/>
+          <w:sz w:val="22"/>
+        </w:rPr>
+        <w:t xml:space="preserve"> keeps </w:t>
+      </w:r>
+      <w:r>
+        <w:rPr>
+          <w:rFonts w:ascii="Calibri" w:hAnsi="Calibri"/>
+          <w:b/>
+          <w:sz w:val="22"/>
+        </w:rPr>
+        <w:t>Export &amp; Help</w:t>
+      </w:r>
+      <w:r>
+        <w:rPr>
+          <w:rFonts w:ascii="Calibri" w:hAnsi="Calibri"/>
+          <w:sz w:val="22"/>
+        </w:rPr>
+        <w:t xml:space="preserve"> selected. Content added during a refresh may shift the precise position slightly within a long section, but the active section remains stable.</w:t>
       </w:r>
     </w:p>
     <w:p>
@@ -11833,7 +11876,22 @@
           <w:rFonts w:ascii="Calibri" w:hAnsi="Calibri"/>
           <w:sz w:val="22"/>
         </w:rPr>
-        <w:t>Single-text results are temporary, so download anything you need before closing the application.</w:t>
+        <w:t xml:space="preserve">Single-text results are temporary, so download anything you need before closing the application. Preparing downloads leaves </w:t>
+      </w:r>
+      <w:r>
+        <w:rPr>
+          <w:rFonts w:ascii="Calibri" w:hAnsi="Calibri"/>
+          <w:b/>
+          <w:sz w:val="22"/>
+        </w:rPr>
+        <w:t>Export &amp; Help</w:t>
+      </w:r>
+      <w:r>
+        <w:rPr>
+          <w:rFonts w:ascii="Calibri" w:hAnsi="Calibri"/>
+          <w:sz w:val="22"/>
+        </w:rPr>
+        <w:t xml:space="preserve"> selected during the refresh.</w:t>
       </w:r>
     </w:p>
     <w:p>

</xml_diff>

<commit_message>
Refine report navigation and collapsed sections
</commit_message>
<xml_diff>
--- a/docs/VerseVAD_User_Manual.docx
+++ b/docs/VerseVAD_User_Manual.docx
@@ -622,6 +622,34 @@
           <w:sz w:val="22"/>
         </w:rPr>
         <w:t xml:space="preserve"> selected. Content added during a refresh may shift the precise position slightly within a long section, but the active section remains stable.</w:t>
+      </w:r>
+    </w:p>
+    <w:p>
+      <w:pPr>
+        <w:widowControl/>
+        <w:spacing w:before="0" w:after="120" w:line="300" w:lineRule="auto"/>
+      </w:pPr>
+      <w:r>
+        <w:rPr>
+          <w:rFonts w:ascii="Calibri" w:hAnsi="Calibri"/>
+          <w:sz w:val="22"/>
+        </w:rPr>
+        <w:t xml:space="preserve">The one-text </w:t>
+      </w:r>
+      <w:r>
+        <w:rPr>
+          <w:rFonts w:ascii="Calibri" w:hAnsi="Calibri"/>
+          <w:b/>
+          <w:sz w:val="22"/>
+        </w:rPr>
+        <w:t>Report section</w:t>
+      </w:r>
+      <w:r>
+        <w:rPr>
+          <w:rFonts w:ascii="Calibri" w:hAnsi="Calibri"/>
+          <w:sz w:val="22"/>
+        </w:rPr>
+        <w:t xml:space="preserve"> control is a dropdown. All large vertical sections begin collapsed and can be opened independently, so multiple sections may remain expanded. Streamlit's arrow at the top edge of the left sidebar hides or restores the sidebar; the main workspace automatically uses the freed width or resizes when the sidebar returns. This behavior is shared by supported Windows and macOS browsers.</w:t>
       </w:r>
     </w:p>
     <w:p>
@@ -10727,7 +10755,35 @@
           <w:rFonts w:ascii="Calibri" w:hAnsi="Calibri"/>
           <w:sz w:val="22"/>
         </w:rPr>
-        <w:t>token- and type-weighted values for each analysis view;</w:t>
+        <w:t xml:space="preserve">a separate </w:t>
+      </w:r>
+      <w:r>
+        <w:rPr>
+          <w:rFonts w:ascii="Calibri" w:hAnsi="Calibri"/>
+          <w:b/>
+          <w:sz w:val="22"/>
+        </w:rPr>
+        <w:t>Dispersion of Matched Ratings</w:t>
+      </w:r>
+      <w:r>
+        <w:rPr>
+          <w:rFonts w:ascii="Calibri" w:hAnsi="Calibri"/>
+          <w:sz w:val="22"/>
+        </w:rPr>
+        <w:t xml:space="preserve"> section immediately after those</w:t>
+      </w:r>
+    </w:p>
+    <w:p>
+      <w:pPr>
+        <w:widowControl/>
+        <w:spacing w:before="0" w:after="120" w:line="300" w:lineRule="auto"/>
+      </w:pPr>
+      <w:r>
+        <w:rPr>
+          <w:rFonts w:ascii="Calibri" w:hAnsi="Calibri"/>
+          <w:sz w:val="22"/>
+        </w:rPr>
+        <w:t xml:space="preserve">  definitions, reporting population standard deviations among matched ratings;</w:t>
       </w:r>
     </w:p>
     <w:p>
@@ -10745,7 +10801,7 @@
           <w:rFonts w:ascii="Calibri" w:hAnsi="Calibri"/>
           <w:sz w:val="22"/>
         </w:rPr>
-        <w:t>plain-language midpoint interpretations;</w:t>
+        <w:t>token- and type-weighted values for each analysis view;</w:t>
       </w:r>
     </w:p>
     <w:p>
@@ -10763,7 +10819,7 @@
           <w:rFonts w:ascii="Calibri" w:hAnsi="Calibri"/>
           <w:sz w:val="22"/>
         </w:rPr>
-        <w:t>population dispersion;</w:t>
+        <w:t>plain-language midpoint interpretations;</w:t>
       </w:r>
     </w:p>
     <w:p>

</xml_diff>

<commit_message>
Freeze table headers and identifying columns
</commit_message>
<xml_diff>
--- a/docs/VerseVAD_User_Manual.docx
+++ b/docs/VerseVAD_User_Manual.docx
@@ -650,6 +650,19 @@
           <w:sz w:val="22"/>
         </w:rPr>
         <w:t xml:space="preserve"> control is a dropdown. All large vertical sections begin collapsed and can be opened independently, so multiple sections may remain expanded. Streamlit's arrow at the top edge of the left sidebar hides or restores the sidebar; the main workspace automatically uses the freed width or resizes when the sidebar returns. This behavior is shared by supported Windows and macOS browsers.</w:t>
+      </w:r>
+    </w:p>
+    <w:p>
+      <w:pPr>
+        <w:widowControl/>
+        <w:spacing w:before="0" w:after="120" w:line="300" w:lineRule="auto"/>
+      </w:pPr>
+      <w:r>
+        <w:rPr>
+          <w:rFonts w:ascii="Calibri" w:hAnsi="Calibri"/>
+          <w:sz w:val="22"/>
+        </w:rPr>
+        <w:t>All interactive results tables keep their header row visible during vertical scrolling and pin the leftmost data column during horizontal scrolling. The pinned column is the table's first identifying field, such as Work, Lexicon, Line, Dimension, or Surface. This presentation aid does not change sorting, formatting, calculations, or exported data.</w:t>
       </w:r>
     </w:p>
     <w:p>

</xml_diff>

<commit_message>
Add structural count means and dispersion
</commit_message>
<xml_diff>
--- a/docs/VerseVAD_User_Manual.docx
+++ b/docs/VerseVAD_User_Manual.docx
@@ -9339,7 +9339,7 @@
           <w:rFonts w:ascii="Calibri" w:hAnsi="Calibri"/>
           <w:sz w:val="22"/>
         </w:rPr>
-        <w:t>one lexical-token count row for every preserved physical line, including</w:t>
+        <w:t>average words per nonblank physical line, average words per stanza, and</w:t>
       </w:r>
     </w:p>
     <w:p>
@@ -9352,7 +9352,7 @@
           <w:rFonts w:ascii="Calibri" w:hAnsi="Calibri"/>
           <w:sz w:val="22"/>
         </w:rPr>
-        <w:t xml:space="preserve">  blank separators with zero; and</w:t>
+        <w:t xml:space="preserve">  average nonblank physical lines per stanza, each with its population   standard deviation;</w:t>
       </w:r>
     </w:p>
     <w:p>
@@ -9370,7 +9370,7 @@
           <w:rFonts w:ascii="Calibri" w:hAnsi="Calibri"/>
           <w:sz w:val="22"/>
         </w:rPr>
-        <w:t>lexical-token and nonblank-line counts for every stanza.</w:t>
+        <w:t>one lexical-token count row for every preserved physical line, including</w:t>
       </w:r>
     </w:p>
     <w:p>
@@ -9383,108 +9383,7 @@
           <w:rFonts w:ascii="Calibri" w:hAnsi="Calibri"/>
           <w:sz w:val="22"/>
         </w:rPr>
-        <w:t>Defaults are MATTR window 50, HD-D sample 42, and MTLD threshold 0.72. MATTR and HD-D remain missing when the text is shorter than their configured denominator. Undefined MTLD remains missing rather than becoming infinity or zero.</w:t>
-      </w:r>
-    </w:p>
-    <w:p>
-      <w:pPr>
-        <w:widowControl/>
-        <w:spacing w:before="0" w:after="120" w:line="300" w:lineRule="auto"/>
-      </w:pPr>
-      <w:r>
-        <w:rPr>
-          <w:rFonts w:ascii="Calibri" w:hAnsi="Calibri"/>
-          <w:sz w:val="22"/>
-        </w:rPr>
-        <w:t>Safe wording is: “Using a 50-token MATTR window, the normalized observed surface forms produced MATTR = [value].” Do not treat lexical diversity or word length as proof of literary quality, vocabulary knowledge, intelligence, education, comprehension, or reader ability.</w:t>
-      </w:r>
-    </w:p>
-    <w:p>
-      <w:pPr>
-        <w:pStyle w:val="Heading2"/>
-      </w:pPr>
-      <w:r>
-        <w:rPr>
-          <w:rFonts w:ascii="Calibri" w:hAnsi="Calibri"/>
-          <w:sz w:val="22"/>
-        </w:rPr>
-        <w:t>Eight emotion associations</w:t>
-      </w:r>
-    </w:p>
-    <w:p>
-      <w:pPr>
-        <w:widowControl/>
-        <w:spacing w:before="0" w:after="120" w:line="300" w:lineRule="auto"/>
-      </w:pPr>
-      <w:r>
-        <w:rPr>
-          <w:rFonts w:ascii="Calibri" w:hAnsi="Calibri"/>
-          <w:sz w:val="22"/>
-        </w:rPr>
-        <w:t>NRC Emotion values are binary, multi-label associations. VerseVAD reports the eight emotions—anger, anticipation, disgust, fear, joy, sadness, surprise, and trust—in their own section. An entry can be associated with several categories, so percentages do not need to total 100 percent. Read the labeled denominator.</w:t>
-      </w:r>
-    </w:p>
-    <w:p>
-      <w:pPr>
-        <w:widowControl/>
-        <w:spacing w:before="0" w:after="120" w:line="300" w:lineRule="auto"/>
-      </w:pPr>
-      <w:r>
-        <w:rPr>
-          <w:rFonts w:ascii="Calibri" w:hAnsi="Calibri"/>
-          <w:sz w:val="22"/>
-        </w:rPr>
-        <w:t>“Fear-associated vocabulary” is appropriate wording. “The poem is afraid” is not.</w:t>
-      </w:r>
-    </w:p>
-    <w:p>
-      <w:pPr>
-        <w:pStyle w:val="Heading2"/>
-      </w:pPr>
-      <w:r>
-        <w:rPr>
-          <w:rFonts w:ascii="Calibri" w:hAnsi="Calibri"/>
-          <w:sz w:val="22"/>
-        </w:rPr>
-        <w:t>Positive and negative sentiment associations</w:t>
-      </w:r>
-    </w:p>
-    <w:p>
-      <w:pPr>
-        <w:widowControl/>
-        <w:spacing w:before="0" w:after="120" w:line="300" w:lineRule="auto"/>
-      </w:pPr>
-      <w:r>
-        <w:rPr>
-          <w:rFonts w:ascii="Calibri" w:hAnsi="Calibri"/>
-          <w:sz w:val="22"/>
-        </w:rPr>
-        <w:t>Positive and negative are broad sentiment labels in NRC Emotion. VerseVAD analyzes them with the same documented occurrence-counting logic but reports them separately from the eight emotions. They are not endpoints of the VAD valence scale, and their rates need not sum to 100 percent.</w:t>
-      </w:r>
-    </w:p>
-    <w:p>
-      <w:pPr>
-        <w:pStyle w:val="Heading2"/>
-      </w:pPr>
-      <w:r>
-        <w:rPr>
-          <w:rFonts w:ascii="Calibri" w:hAnsi="Calibri"/>
-          <w:sz w:val="22"/>
-        </w:rPr>
-        <w:t>Emotion intensity</w:t>
-      </w:r>
-    </w:p>
-    <w:p>
-      <w:pPr>
-        <w:widowControl/>
-        <w:spacing w:before="0" w:after="120" w:line="300" w:lineRule="auto"/>
-      </w:pPr>
-      <w:r>
-        <w:rPr>
-          <w:rFonts w:ascii="Calibri" w:hAnsi="Calibri"/>
-          <w:sz w:val="22"/>
-        </w:rPr>
-        <w:t>NRC Emotion Intensity supplies numeric values only for particular word-emotion pairs. VerseVAD keeps:</w:t>
+        <w:t xml:space="preserve">  blank separators with zero; and</w:t>
       </w:r>
     </w:p>
     <w:p>
@@ -9502,7 +9401,121 @@
           <w:rFonts w:ascii="Calibri" w:hAnsi="Calibri"/>
           <w:sz w:val="22"/>
         </w:rPr>
-        <w:t>prevalence of matched pairs;</w:t>
+        <w:t>lexical-token and nonblank-line counts for every stanza.</w:t>
+      </w:r>
+    </w:p>
+    <w:p>
+      <w:pPr>
+        <w:widowControl/>
+        <w:spacing w:before="0" w:after="120" w:line="300" w:lineRule="auto"/>
+      </w:pPr>
+      <w:r>
+        <w:rPr>
+          <w:rFonts w:ascii="Calibri" w:hAnsi="Calibri"/>
+          <w:sz w:val="22"/>
+        </w:rPr>
+        <w:t>Defaults are MATTR window 50, HD-D sample 42, and MTLD threshold 0.72. MATTR and HD-D remain missing when the text is shorter than their configured denominator. Undefined MTLD remains missing rather than becoming infinity or zero.</w:t>
+      </w:r>
+    </w:p>
+    <w:p>
+      <w:pPr>
+        <w:widowControl/>
+        <w:spacing w:before="0" w:after="120" w:line="300" w:lineRule="auto"/>
+      </w:pPr>
+      <w:r>
+        <w:rPr>
+          <w:rFonts w:ascii="Calibri" w:hAnsi="Calibri"/>
+          <w:sz w:val="22"/>
+        </w:rPr>
+        <w:t>Safe wording is: “Using a 50-token MATTR window, the normalized observed surface forms produced MATTR = [value].” Do not treat lexical diversity or word length as proof of literary quality, vocabulary knowledge, intelligence, education, comprehension, or reader ability.</w:t>
+      </w:r>
+    </w:p>
+    <w:p>
+      <w:pPr>
+        <w:pStyle w:val="Heading2"/>
+      </w:pPr>
+      <w:r>
+        <w:rPr>
+          <w:rFonts w:ascii="Calibri" w:hAnsi="Calibri"/>
+          <w:sz w:val="22"/>
+        </w:rPr>
+        <w:t>Eight emotion associations</w:t>
+      </w:r>
+    </w:p>
+    <w:p>
+      <w:pPr>
+        <w:widowControl/>
+        <w:spacing w:before="0" w:after="120" w:line="300" w:lineRule="auto"/>
+      </w:pPr>
+      <w:r>
+        <w:rPr>
+          <w:rFonts w:ascii="Calibri" w:hAnsi="Calibri"/>
+          <w:sz w:val="22"/>
+        </w:rPr>
+        <w:t>NRC Emotion values are binary, multi-label associations. VerseVAD reports the eight emotions—anger, anticipation, disgust, fear, joy, sadness, surprise, and trust—in their own section. An entry can be associated with several categories, so percentages do not need to total 100 percent. Read the labeled denominator.</w:t>
+      </w:r>
+    </w:p>
+    <w:p>
+      <w:pPr>
+        <w:widowControl/>
+        <w:spacing w:before="0" w:after="120" w:line="300" w:lineRule="auto"/>
+      </w:pPr>
+      <w:r>
+        <w:rPr>
+          <w:rFonts w:ascii="Calibri" w:hAnsi="Calibri"/>
+          <w:sz w:val="22"/>
+        </w:rPr>
+        <w:t>“Fear-associated vocabulary” is appropriate wording. “The poem is afraid” is not.</w:t>
+      </w:r>
+    </w:p>
+    <w:p>
+      <w:pPr>
+        <w:pStyle w:val="Heading2"/>
+      </w:pPr>
+      <w:r>
+        <w:rPr>
+          <w:rFonts w:ascii="Calibri" w:hAnsi="Calibri"/>
+          <w:sz w:val="22"/>
+        </w:rPr>
+        <w:t>Positive and negative sentiment associations</w:t>
+      </w:r>
+    </w:p>
+    <w:p>
+      <w:pPr>
+        <w:widowControl/>
+        <w:spacing w:before="0" w:after="120" w:line="300" w:lineRule="auto"/>
+      </w:pPr>
+      <w:r>
+        <w:rPr>
+          <w:rFonts w:ascii="Calibri" w:hAnsi="Calibri"/>
+          <w:sz w:val="22"/>
+        </w:rPr>
+        <w:t>Positive and negative are broad sentiment labels in NRC Emotion. VerseVAD analyzes them with the same documented occurrence-counting logic but reports them separately from the eight emotions. They are not endpoints of the VAD valence scale, and their rates need not sum to 100 percent.</w:t>
+      </w:r>
+    </w:p>
+    <w:p>
+      <w:pPr>
+        <w:pStyle w:val="Heading2"/>
+      </w:pPr>
+      <w:r>
+        <w:rPr>
+          <w:rFonts w:ascii="Calibri" w:hAnsi="Calibri"/>
+          <w:sz w:val="22"/>
+        </w:rPr>
+        <w:t>Emotion intensity</w:t>
+      </w:r>
+    </w:p>
+    <w:p>
+      <w:pPr>
+        <w:widowControl/>
+        <w:spacing w:before="0" w:after="120" w:line="300" w:lineRule="auto"/>
+      </w:pPr>
+      <w:r>
+        <w:rPr>
+          <w:rFonts w:ascii="Calibri" w:hAnsi="Calibri"/>
+          <w:sz w:val="22"/>
+        </w:rPr>
+        <w:t>NRC Emotion Intensity supplies numeric values only for particular word-emotion pairs. VerseVAD keeps:</w:t>
       </w:r>
     </w:p>
     <w:p>
@@ -9520,7 +9533,7 @@
           <w:rFonts w:ascii="Calibri" w:hAnsi="Calibri"/>
           <w:sz w:val="22"/>
         </w:rPr>
-        <w:t>token-weighted mean intensity among supplied pairs;</w:t>
+        <w:t>prevalence of matched pairs;</w:t>
       </w:r>
     </w:p>
     <w:p>
@@ -9538,395 +9551,7 @@
           <w:rFonts w:ascii="Calibri" w:hAnsi="Calibri"/>
           <w:sz w:val="22"/>
         </w:rPr>
-        <w:t>type-weighted mean intensity among supplied pairs.</w:t>
-      </w:r>
-    </w:p>
-    <w:p>
-      <w:pPr>
-        <w:widowControl/>
-        <w:spacing w:before="0" w:after="120" w:line="300" w:lineRule="auto"/>
-      </w:pPr>
-      <w:r>
-        <w:rPr>
-          <w:rFonts w:ascii="Calibri" w:hAnsi="Calibri"/>
-          <w:sz w:val="22"/>
-        </w:rPr>
-        <w:t>An absent word-emotion pair is missing, not an intensity of zero.</w:t>
-      </w:r>
-    </w:p>
-    <w:p>
-      <w:pPr>
-        <w:pStyle w:val="Heading1"/>
-      </w:pPr>
-      <w:r>
-        <w:rPr>
-          <w:rFonts w:ascii="Calibri" w:hAnsi="Calibri"/>
-          <w:sz w:val="22"/>
-        </w:rPr>
-        <w:t>8. Single Poem and Other Text Workspaces</w:t>
-      </w:r>
-    </w:p>
-    <w:p>
-      <w:pPr>
-        <w:pStyle w:val="Heading2"/>
-      </w:pPr>
-      <w:r>
-        <w:rPr>
-          <w:rFonts w:ascii="Calibri" w:hAnsi="Calibri"/>
-          <w:sz w:val="22"/>
-        </w:rPr>
-        <w:t>Add a poem</w:t>
-      </w:r>
-    </w:p>
-    <w:p>
-      <w:pPr>
-        <w:widowControl/>
-        <w:spacing w:before="0" w:after="120" w:line="300" w:lineRule="auto"/>
-      </w:pPr>
-      <w:r>
-        <w:rPr>
-          <w:rFonts w:ascii="Calibri" w:hAnsi="Calibri"/>
-          <w:sz w:val="22"/>
-        </w:rPr>
-        <w:t xml:space="preserve">Paste text or upload one UTF-8 </w:t>
-      </w:r>
-      <w:r>
-        <w:rPr>
-          <w:rFonts w:ascii="Consolas" w:hAnsi="Consolas"/>
-          <w:color w:val="1F4D78"/>
-          <w:sz w:val="19"/>
-        </w:rPr>
-        <w:t>.txt</w:t>
-      </w:r>
-      <w:r>
-        <w:rPr>
-          <w:rFonts w:ascii="Calibri" w:hAnsi="Calibri"/>
-          <w:sz w:val="22"/>
-        </w:rPr>
-        <w:t xml:space="preserve"> file up to 5 MB. Enter a title or working label. Optional author, date/year, and source/edition notes are available under bibliographic metadata. The live word, physical-line, and text-block counts are orientation only; the actual analysis uses the shared linguistic tokenizer. </w:t>
-      </w:r>
-      <w:r>
-        <w:rPr>
-          <w:rFonts w:ascii="Calibri" w:hAnsi="Calibri"/>
-          <w:b/>
-          <w:sz w:val="22"/>
-        </w:rPr>
-        <w:t>Clear text</w:t>
-      </w:r>
-      <w:r>
-        <w:rPr>
-          <w:rFonts w:ascii="Calibri" w:hAnsi="Calibri"/>
-          <w:sz w:val="22"/>
-        </w:rPr>
-        <w:t xml:space="preserve"> requires confirmation. The optional workspace name labels the temporary session but does not create a persistent corpus project.</w:t>
-      </w:r>
-    </w:p>
-    <w:p>
-      <w:pPr>
-        <w:widowControl/>
-        <w:spacing w:before="0" w:after="120" w:line="300" w:lineRule="auto"/>
-      </w:pPr>
-      <w:r>
-        <w:rPr>
-          <w:rFonts w:ascii="Calibri" w:hAnsi="Calibri"/>
-          <w:b/>
-          <w:sz w:val="22"/>
-        </w:rPr>
-        <w:t>Other Text</w:t>
-      </w:r>
-      <w:r>
-        <w:rPr>
-          <w:rFonts w:ascii="Calibri" w:hAnsi="Calibri"/>
-          <w:sz w:val="22"/>
-        </w:rPr>
-        <w:t xml:space="preserve"> reuses this interface and the same analysis engines with </w:t>
-      </w:r>
-      <w:r>
-        <w:rPr>
-          <w:rFonts w:ascii="Calibri" w:hAnsi="Calibri"/>
-          <w:b/>
-          <w:sz w:val="22"/>
-        </w:rPr>
-        <w:t>Analyze Text</w:t>
-      </w:r>
-      <w:r>
-        <w:rPr>
-          <w:rFonts w:ascii="Calibri" w:hAnsi="Calibri"/>
-          <w:sz w:val="22"/>
-        </w:rPr>
-        <w:t xml:space="preserve"> terminology. Pronunciation, meter, and rhyme remain available, but meter and rhyme are visibly marked experimental for non-lineated prose.</w:t>
-      </w:r>
-    </w:p>
-    <w:p>
-      <w:pPr>
-        <w:pStyle w:val="Heading2"/>
-      </w:pPr>
-      <w:r>
-        <w:rPr>
-          <w:rFonts w:ascii="Calibri" w:hAnsi="Calibri"/>
-          <w:sz w:val="22"/>
-        </w:rPr>
-        <w:t>Choose evidence</w:t>
-      </w:r>
-    </w:p>
-    <w:p>
-      <w:pPr>
-        <w:widowControl/>
-        <w:spacing w:before="0" w:after="120" w:line="300" w:lineRule="auto"/>
-      </w:pPr>
-      <w:r>
-        <w:rPr>
-          <w:rFonts w:ascii="Calibri" w:hAnsi="Calibri"/>
-          <w:sz w:val="22"/>
-        </w:rPr>
-        <w:t xml:space="preserve">Select one or more affective lexicons and/or enable the optional normative lexical concreteness, SUBTLEX-US frequency, Kuperman Age of Acquisition, CMUdict pronunciation/prosody-foundation, candidate-meter, rhyme/sound, Lexical Style, or PoetryID modules. The controls are grouped as </w:t>
-      </w:r>
-      <w:r>
-        <w:rPr>
-          <w:rFonts w:ascii="Calibri" w:hAnsi="Calibri"/>
-          <w:b/>
-          <w:sz w:val="22"/>
-        </w:rPr>
-        <w:t>Core Analysis</w:t>
-      </w:r>
-      <w:r>
-        <w:rPr>
-          <w:rFonts w:ascii="Calibri" w:hAnsi="Calibri"/>
-          <w:sz w:val="22"/>
-        </w:rPr>
-        <w:t xml:space="preserve">, </w:t>
-      </w:r>
-      <w:r>
-        <w:rPr>
-          <w:rFonts w:ascii="Calibri" w:hAnsi="Calibri"/>
-          <w:b/>
-          <w:sz w:val="22"/>
-        </w:rPr>
-        <w:t>Lexical Character</w:t>
-      </w:r>
-      <w:r>
-        <w:rPr>
-          <w:rFonts w:ascii="Calibri" w:hAnsi="Calibri"/>
-          <w:sz w:val="22"/>
-        </w:rPr>
-        <w:t xml:space="preserve">, </w:t>
-      </w:r>
-      <w:r>
-        <w:rPr>
-          <w:rFonts w:ascii="Calibri" w:hAnsi="Calibri"/>
-          <w:b/>
-          <w:sz w:val="22"/>
-        </w:rPr>
-        <w:t>Structural and Lexical Measures</w:t>
-      </w:r>
-      <w:r>
-        <w:rPr>
-          <w:rFonts w:ascii="Calibri" w:hAnsi="Calibri"/>
-          <w:sz w:val="22"/>
-        </w:rPr>
-        <w:t xml:space="preserve">, </w:t>
-      </w:r>
-      <w:r>
-        <w:rPr>
-          <w:rFonts w:ascii="Calibri" w:hAnsi="Calibri"/>
-          <w:b/>
-          <w:sz w:val="22"/>
-        </w:rPr>
-        <w:t>PoetryID</w:t>
-      </w:r>
-      <w:r>
-        <w:rPr>
-          <w:rFonts w:ascii="Calibri" w:hAnsi="Calibri"/>
-          <w:sz w:val="22"/>
-        </w:rPr>
-        <w:t xml:space="preserve">, and </w:t>
-      </w:r>
-      <w:r>
-        <w:rPr>
-          <w:rFonts w:ascii="Calibri" w:hAnsi="Calibri"/>
-          <w:b/>
-          <w:sz w:val="22"/>
-        </w:rPr>
-        <w:t>Sound and Form</w:t>
-      </w:r>
-      <w:r>
-        <w:rPr>
-          <w:rFonts w:ascii="Calibri" w:hAnsi="Calibri"/>
-          <w:sz w:val="22"/>
-        </w:rPr>
-        <w:t>.</w:t>
-      </w:r>
-    </w:p>
-    <w:p>
-      <w:pPr>
-        <w:widowControl/>
-        <w:spacing w:before="0" w:after="120" w:line="300" w:lineRule="auto"/>
-      </w:pPr>
-      <w:r>
-        <w:rPr>
-          <w:rFonts w:ascii="Calibri" w:hAnsi="Calibri"/>
-          <w:sz w:val="22"/>
-        </w:rPr>
-        <w:t xml:space="preserve">The optional </w:t>
-      </w:r>
-      <w:r>
-        <w:rPr>
-          <w:rFonts w:ascii="Calibri" w:hAnsi="Calibri"/>
-          <w:b/>
-          <w:sz w:val="22"/>
-        </w:rPr>
-        <w:t>Essential</w:t>
-      </w:r>
-      <w:r>
-        <w:rPr>
-          <w:rFonts w:ascii="Calibri" w:hAnsi="Calibri"/>
-          <w:sz w:val="22"/>
-        </w:rPr>
-        <w:t xml:space="preserve">, </w:t>
-      </w:r>
-      <w:r>
-        <w:rPr>
-          <w:rFonts w:ascii="Calibri" w:hAnsi="Calibri"/>
-          <w:b/>
-          <w:sz w:val="22"/>
-        </w:rPr>
-        <w:t>Literary</w:t>
-      </w:r>
-      <w:r>
-        <w:rPr>
-          <w:rFonts w:ascii="Calibri" w:hAnsi="Calibri"/>
-          <w:sz w:val="22"/>
-        </w:rPr>
-        <w:t xml:space="preserve">, </w:t>
-      </w:r>
-      <w:r>
-        <w:rPr>
-          <w:rFonts w:ascii="Calibri" w:hAnsi="Calibri"/>
-          <w:b/>
-          <w:sz w:val="22"/>
-        </w:rPr>
-        <w:t>Sound and Form</w:t>
-      </w:r>
-      <w:r>
-        <w:rPr>
-          <w:rFonts w:ascii="Calibri" w:hAnsi="Calibri"/>
-          <w:sz w:val="22"/>
-        </w:rPr>
-        <w:t xml:space="preserve">, and </w:t>
-      </w:r>
-      <w:r>
-        <w:rPr>
-          <w:rFonts w:ascii="Calibri" w:hAnsi="Calibri"/>
-          <w:b/>
-          <w:sz w:val="22"/>
-        </w:rPr>
-        <w:t>Complete</w:t>
-      </w:r>
-      <w:r>
-        <w:rPr>
-          <w:rFonts w:ascii="Calibri" w:hAnsi="Calibri"/>
-          <w:sz w:val="22"/>
-        </w:rPr>
-        <w:t xml:space="preserve"> presets change module selections only after </w:t>
-      </w:r>
-      <w:r>
-        <w:rPr>
-          <w:rFonts w:ascii="Calibri" w:hAnsi="Calibri"/>
-          <w:b/>
-          <w:sz w:val="22"/>
-        </w:rPr>
-        <w:t>Apply preset</w:t>
-      </w:r>
-      <w:r>
-        <w:rPr>
-          <w:rFonts w:ascii="Calibri" w:hAnsi="Calibri"/>
-          <w:sz w:val="22"/>
-        </w:rPr>
-        <w:t xml:space="preserve"> is clicked. </w:t>
-      </w:r>
-      <w:r>
-        <w:rPr>
-          <w:rFonts w:ascii="Calibri" w:hAnsi="Calibri"/>
-          <w:b/>
-          <w:sz w:val="22"/>
-        </w:rPr>
-        <w:t>Custom</w:t>
-      </w:r>
-      <w:r>
-        <w:rPr>
-          <w:rFonts w:ascii="Calibri" w:hAnsi="Calibri"/>
-          <w:sz w:val="22"/>
-        </w:rPr>
-        <w:t xml:space="preserve"> retains the current manual selection. Presets never overwrite advanced thresholds, filtering, phrase policy, stopwords, pronunciation overrides, or other methodology.</w:t>
-      </w:r>
-    </w:p>
-    <w:p>
-      <w:pPr>
-        <w:widowControl/>
-        <w:spacing w:before="0" w:after="120" w:line="300" w:lineRule="auto"/>
-      </w:pPr>
-      <w:r>
-        <w:rPr>
-          <w:rFonts w:ascii="Calibri" w:hAnsi="Calibri"/>
-          <w:sz w:val="22"/>
-        </w:rPr>
-        <w:t>VAD, categorical association, intensity, concreteness, corpus-relative frequency, retrospective lexical AoA, dictionary pronunciation/lexical stress, configured meter fit, rhyme/sound evidence, lexical diversity/word counts, and PoetryID candidate profiles answer different questions and remain separate. PoetryID requires an enabled VAD source and reuses its completed result; selecting meter or rhyme automatically runs its pronunciation dependency.</w:t>
-      </w:r>
-    </w:p>
-    <w:p>
-      <w:pPr>
-        <w:widowControl/>
-        <w:spacing w:before="0" w:after="120" w:line="300" w:lineRule="auto"/>
-      </w:pPr>
-      <w:r>
-        <w:rPr>
-          <w:rFonts w:ascii="Calibri" w:hAnsi="Calibri"/>
-          <w:sz w:val="22"/>
-        </w:rPr>
-        <w:t xml:space="preserve">The same eight optional modules are also available in </w:t>
-      </w:r>
-      <w:r>
-        <w:rPr>
-          <w:rFonts w:ascii="Calibri" w:hAnsi="Calibri"/>
-          <w:b/>
-          <w:sz w:val="22"/>
-        </w:rPr>
-        <w:t>Project / Corpus</w:t>
-      </w:r>
-      <w:r>
-        <w:rPr>
-          <w:rFonts w:ascii="Calibri" w:hAnsi="Calibri"/>
-          <w:sz w:val="22"/>
-        </w:rPr>
-        <w:t>. Single Poem and Other Text results remain temporary unless downloaded; corpus runs persist the same module result envelopes, configurations, coverage, warnings, provenance, and audit artifacts against exact text versions.</w:t>
-      </w:r>
-    </w:p>
-    <w:p>
-      <w:pPr>
-        <w:widowControl/>
-        <w:spacing w:before="0" w:after="120" w:line="300" w:lineRule="auto"/>
-      </w:pPr>
-      <w:r>
-        <w:rPr>
-          <w:rFonts w:ascii="Calibri" w:hAnsi="Calibri"/>
-          <w:sz w:val="22"/>
-        </w:rPr>
-        <w:t xml:space="preserve">Under </w:t>
-      </w:r>
-      <w:r>
-        <w:rPr>
-          <w:rFonts w:ascii="Calibri" w:hAnsi="Calibri"/>
-          <w:b/>
-          <w:sz w:val="22"/>
-        </w:rPr>
-        <w:t>Analysis configuration and methodology</w:t>
-      </w:r>
-      <w:r>
-        <w:rPr>
-          <w:rFonts w:ascii="Calibri" w:hAnsi="Calibri"/>
-          <w:sz w:val="22"/>
-        </w:rPr>
-        <w:t>, choose:</w:t>
+        <w:t>token-weighted mean intensity among supplied pairs;</w:t>
       </w:r>
     </w:p>
     <w:p>
@@ -9944,7 +9569,395 @@
           <w:rFonts w:ascii="Calibri" w:hAnsi="Calibri"/>
           <w:sz w:val="22"/>
         </w:rPr>
-        <w:t>phrase policy;</w:t>
+        <w:t>type-weighted mean intensity among supplied pairs.</w:t>
+      </w:r>
+    </w:p>
+    <w:p>
+      <w:pPr>
+        <w:widowControl/>
+        <w:spacing w:before="0" w:after="120" w:line="300" w:lineRule="auto"/>
+      </w:pPr>
+      <w:r>
+        <w:rPr>
+          <w:rFonts w:ascii="Calibri" w:hAnsi="Calibri"/>
+          <w:sz w:val="22"/>
+        </w:rPr>
+        <w:t>An absent word-emotion pair is missing, not an intensity of zero.</w:t>
+      </w:r>
+    </w:p>
+    <w:p>
+      <w:pPr>
+        <w:pStyle w:val="Heading1"/>
+      </w:pPr>
+      <w:r>
+        <w:rPr>
+          <w:rFonts w:ascii="Calibri" w:hAnsi="Calibri"/>
+          <w:sz w:val="22"/>
+        </w:rPr>
+        <w:t>8. Single Poem and Other Text Workspaces</w:t>
+      </w:r>
+    </w:p>
+    <w:p>
+      <w:pPr>
+        <w:pStyle w:val="Heading2"/>
+      </w:pPr>
+      <w:r>
+        <w:rPr>
+          <w:rFonts w:ascii="Calibri" w:hAnsi="Calibri"/>
+          <w:sz w:val="22"/>
+        </w:rPr>
+        <w:t>Add a poem</w:t>
+      </w:r>
+    </w:p>
+    <w:p>
+      <w:pPr>
+        <w:widowControl/>
+        <w:spacing w:before="0" w:after="120" w:line="300" w:lineRule="auto"/>
+      </w:pPr>
+      <w:r>
+        <w:rPr>
+          <w:rFonts w:ascii="Calibri" w:hAnsi="Calibri"/>
+          <w:sz w:val="22"/>
+        </w:rPr>
+        <w:t xml:space="preserve">Paste text or upload one UTF-8 </w:t>
+      </w:r>
+      <w:r>
+        <w:rPr>
+          <w:rFonts w:ascii="Consolas" w:hAnsi="Consolas"/>
+          <w:color w:val="1F4D78"/>
+          <w:sz w:val="19"/>
+        </w:rPr>
+        <w:t>.txt</w:t>
+      </w:r>
+      <w:r>
+        <w:rPr>
+          <w:rFonts w:ascii="Calibri" w:hAnsi="Calibri"/>
+          <w:sz w:val="22"/>
+        </w:rPr>
+        <w:t xml:space="preserve"> file up to 5 MB. Enter a title or working label. Optional author, date/year, and source/edition notes are available under bibliographic metadata. The live word, physical-line, and text-block counts are orientation only; the actual analysis uses the shared linguistic tokenizer. </w:t>
+      </w:r>
+      <w:r>
+        <w:rPr>
+          <w:rFonts w:ascii="Calibri" w:hAnsi="Calibri"/>
+          <w:b/>
+          <w:sz w:val="22"/>
+        </w:rPr>
+        <w:t>Clear text</w:t>
+      </w:r>
+      <w:r>
+        <w:rPr>
+          <w:rFonts w:ascii="Calibri" w:hAnsi="Calibri"/>
+          <w:sz w:val="22"/>
+        </w:rPr>
+        <w:t xml:space="preserve"> requires confirmation. The optional workspace name labels the temporary session but does not create a persistent corpus project.</w:t>
+      </w:r>
+    </w:p>
+    <w:p>
+      <w:pPr>
+        <w:widowControl/>
+        <w:spacing w:before="0" w:after="120" w:line="300" w:lineRule="auto"/>
+      </w:pPr>
+      <w:r>
+        <w:rPr>
+          <w:rFonts w:ascii="Calibri" w:hAnsi="Calibri"/>
+          <w:b/>
+          <w:sz w:val="22"/>
+        </w:rPr>
+        <w:t>Other Text</w:t>
+      </w:r>
+      <w:r>
+        <w:rPr>
+          <w:rFonts w:ascii="Calibri" w:hAnsi="Calibri"/>
+          <w:sz w:val="22"/>
+        </w:rPr>
+        <w:t xml:space="preserve"> reuses this interface and the same analysis engines with </w:t>
+      </w:r>
+      <w:r>
+        <w:rPr>
+          <w:rFonts w:ascii="Calibri" w:hAnsi="Calibri"/>
+          <w:b/>
+          <w:sz w:val="22"/>
+        </w:rPr>
+        <w:t>Analyze Text</w:t>
+      </w:r>
+      <w:r>
+        <w:rPr>
+          <w:rFonts w:ascii="Calibri" w:hAnsi="Calibri"/>
+          <w:sz w:val="22"/>
+        </w:rPr>
+        <w:t xml:space="preserve"> terminology. Pronunciation, meter, and rhyme remain available, but meter and rhyme are visibly marked experimental for non-lineated prose.</w:t>
+      </w:r>
+    </w:p>
+    <w:p>
+      <w:pPr>
+        <w:pStyle w:val="Heading2"/>
+      </w:pPr>
+      <w:r>
+        <w:rPr>
+          <w:rFonts w:ascii="Calibri" w:hAnsi="Calibri"/>
+          <w:sz w:val="22"/>
+        </w:rPr>
+        <w:t>Choose evidence</w:t>
+      </w:r>
+    </w:p>
+    <w:p>
+      <w:pPr>
+        <w:widowControl/>
+        <w:spacing w:before="0" w:after="120" w:line="300" w:lineRule="auto"/>
+      </w:pPr>
+      <w:r>
+        <w:rPr>
+          <w:rFonts w:ascii="Calibri" w:hAnsi="Calibri"/>
+          <w:sz w:val="22"/>
+        </w:rPr>
+        <w:t xml:space="preserve">Select one or more affective lexicons and/or enable the optional normative lexical concreteness, SUBTLEX-US frequency, Kuperman Age of Acquisition, CMUdict pronunciation/prosody-foundation, candidate-meter, rhyme/sound, Lexical Style, or PoetryID modules. The controls are grouped as </w:t>
+      </w:r>
+      <w:r>
+        <w:rPr>
+          <w:rFonts w:ascii="Calibri" w:hAnsi="Calibri"/>
+          <w:b/>
+          <w:sz w:val="22"/>
+        </w:rPr>
+        <w:t>Core Analysis</w:t>
+      </w:r>
+      <w:r>
+        <w:rPr>
+          <w:rFonts w:ascii="Calibri" w:hAnsi="Calibri"/>
+          <w:sz w:val="22"/>
+        </w:rPr>
+        <w:t xml:space="preserve">, </w:t>
+      </w:r>
+      <w:r>
+        <w:rPr>
+          <w:rFonts w:ascii="Calibri" w:hAnsi="Calibri"/>
+          <w:b/>
+          <w:sz w:val="22"/>
+        </w:rPr>
+        <w:t>Lexical Character</w:t>
+      </w:r>
+      <w:r>
+        <w:rPr>
+          <w:rFonts w:ascii="Calibri" w:hAnsi="Calibri"/>
+          <w:sz w:val="22"/>
+        </w:rPr>
+        <w:t xml:space="preserve">, </w:t>
+      </w:r>
+      <w:r>
+        <w:rPr>
+          <w:rFonts w:ascii="Calibri" w:hAnsi="Calibri"/>
+          <w:b/>
+          <w:sz w:val="22"/>
+        </w:rPr>
+        <w:t>Structural and Lexical Measures</w:t>
+      </w:r>
+      <w:r>
+        <w:rPr>
+          <w:rFonts w:ascii="Calibri" w:hAnsi="Calibri"/>
+          <w:sz w:val="22"/>
+        </w:rPr>
+        <w:t xml:space="preserve">, </w:t>
+      </w:r>
+      <w:r>
+        <w:rPr>
+          <w:rFonts w:ascii="Calibri" w:hAnsi="Calibri"/>
+          <w:b/>
+          <w:sz w:val="22"/>
+        </w:rPr>
+        <w:t>PoetryID</w:t>
+      </w:r>
+      <w:r>
+        <w:rPr>
+          <w:rFonts w:ascii="Calibri" w:hAnsi="Calibri"/>
+          <w:sz w:val="22"/>
+        </w:rPr>
+        <w:t xml:space="preserve">, and </w:t>
+      </w:r>
+      <w:r>
+        <w:rPr>
+          <w:rFonts w:ascii="Calibri" w:hAnsi="Calibri"/>
+          <w:b/>
+          <w:sz w:val="22"/>
+        </w:rPr>
+        <w:t>Sound and Form</w:t>
+      </w:r>
+      <w:r>
+        <w:rPr>
+          <w:rFonts w:ascii="Calibri" w:hAnsi="Calibri"/>
+          <w:sz w:val="22"/>
+        </w:rPr>
+        <w:t>.</w:t>
+      </w:r>
+    </w:p>
+    <w:p>
+      <w:pPr>
+        <w:widowControl/>
+        <w:spacing w:before="0" w:after="120" w:line="300" w:lineRule="auto"/>
+      </w:pPr>
+      <w:r>
+        <w:rPr>
+          <w:rFonts w:ascii="Calibri" w:hAnsi="Calibri"/>
+          <w:sz w:val="22"/>
+        </w:rPr>
+        <w:t xml:space="preserve">The optional </w:t>
+      </w:r>
+      <w:r>
+        <w:rPr>
+          <w:rFonts w:ascii="Calibri" w:hAnsi="Calibri"/>
+          <w:b/>
+          <w:sz w:val="22"/>
+        </w:rPr>
+        <w:t>Essential</w:t>
+      </w:r>
+      <w:r>
+        <w:rPr>
+          <w:rFonts w:ascii="Calibri" w:hAnsi="Calibri"/>
+          <w:sz w:val="22"/>
+        </w:rPr>
+        <w:t xml:space="preserve">, </w:t>
+      </w:r>
+      <w:r>
+        <w:rPr>
+          <w:rFonts w:ascii="Calibri" w:hAnsi="Calibri"/>
+          <w:b/>
+          <w:sz w:val="22"/>
+        </w:rPr>
+        <w:t>Literary</w:t>
+      </w:r>
+      <w:r>
+        <w:rPr>
+          <w:rFonts w:ascii="Calibri" w:hAnsi="Calibri"/>
+          <w:sz w:val="22"/>
+        </w:rPr>
+        <w:t xml:space="preserve">, </w:t>
+      </w:r>
+      <w:r>
+        <w:rPr>
+          <w:rFonts w:ascii="Calibri" w:hAnsi="Calibri"/>
+          <w:b/>
+          <w:sz w:val="22"/>
+        </w:rPr>
+        <w:t>Sound and Form</w:t>
+      </w:r>
+      <w:r>
+        <w:rPr>
+          <w:rFonts w:ascii="Calibri" w:hAnsi="Calibri"/>
+          <w:sz w:val="22"/>
+        </w:rPr>
+        <w:t xml:space="preserve">, and </w:t>
+      </w:r>
+      <w:r>
+        <w:rPr>
+          <w:rFonts w:ascii="Calibri" w:hAnsi="Calibri"/>
+          <w:b/>
+          <w:sz w:val="22"/>
+        </w:rPr>
+        <w:t>Complete</w:t>
+      </w:r>
+      <w:r>
+        <w:rPr>
+          <w:rFonts w:ascii="Calibri" w:hAnsi="Calibri"/>
+          <w:sz w:val="22"/>
+        </w:rPr>
+        <w:t xml:space="preserve"> presets change module selections only after </w:t>
+      </w:r>
+      <w:r>
+        <w:rPr>
+          <w:rFonts w:ascii="Calibri" w:hAnsi="Calibri"/>
+          <w:b/>
+          <w:sz w:val="22"/>
+        </w:rPr>
+        <w:t>Apply preset</w:t>
+      </w:r>
+      <w:r>
+        <w:rPr>
+          <w:rFonts w:ascii="Calibri" w:hAnsi="Calibri"/>
+          <w:sz w:val="22"/>
+        </w:rPr>
+        <w:t xml:space="preserve"> is clicked. </w:t>
+      </w:r>
+      <w:r>
+        <w:rPr>
+          <w:rFonts w:ascii="Calibri" w:hAnsi="Calibri"/>
+          <w:b/>
+          <w:sz w:val="22"/>
+        </w:rPr>
+        <w:t>Custom</w:t>
+      </w:r>
+      <w:r>
+        <w:rPr>
+          <w:rFonts w:ascii="Calibri" w:hAnsi="Calibri"/>
+          <w:sz w:val="22"/>
+        </w:rPr>
+        <w:t xml:space="preserve"> retains the current manual selection. Presets never overwrite advanced thresholds, filtering, phrase policy, stopwords, pronunciation overrides, or other methodology.</w:t>
+      </w:r>
+    </w:p>
+    <w:p>
+      <w:pPr>
+        <w:widowControl/>
+        <w:spacing w:before="0" w:after="120" w:line="300" w:lineRule="auto"/>
+      </w:pPr>
+      <w:r>
+        <w:rPr>
+          <w:rFonts w:ascii="Calibri" w:hAnsi="Calibri"/>
+          <w:sz w:val="22"/>
+        </w:rPr>
+        <w:t>VAD, categorical association, intensity, concreteness, corpus-relative frequency, retrospective lexical AoA, dictionary pronunciation/lexical stress, configured meter fit, rhyme/sound evidence, lexical diversity/word counts, and PoetryID candidate profiles answer different questions and remain separate. PoetryID requires an enabled VAD source and reuses its completed result; selecting meter or rhyme automatically runs its pronunciation dependency.</w:t>
+      </w:r>
+    </w:p>
+    <w:p>
+      <w:pPr>
+        <w:widowControl/>
+        <w:spacing w:before="0" w:after="120" w:line="300" w:lineRule="auto"/>
+      </w:pPr>
+      <w:r>
+        <w:rPr>
+          <w:rFonts w:ascii="Calibri" w:hAnsi="Calibri"/>
+          <w:sz w:val="22"/>
+        </w:rPr>
+        <w:t xml:space="preserve">The same eight optional modules are also available in </w:t>
+      </w:r>
+      <w:r>
+        <w:rPr>
+          <w:rFonts w:ascii="Calibri" w:hAnsi="Calibri"/>
+          <w:b/>
+          <w:sz w:val="22"/>
+        </w:rPr>
+        <w:t>Project / Corpus</w:t>
+      </w:r>
+      <w:r>
+        <w:rPr>
+          <w:rFonts w:ascii="Calibri" w:hAnsi="Calibri"/>
+          <w:sz w:val="22"/>
+        </w:rPr>
+        <w:t>. Single Poem and Other Text results remain temporary unless downloaded; corpus runs persist the same module result envelopes, configurations, coverage, warnings, provenance, and audit artifacts against exact text versions.</w:t>
+      </w:r>
+    </w:p>
+    <w:p>
+      <w:pPr>
+        <w:widowControl/>
+        <w:spacing w:before="0" w:after="120" w:line="300" w:lineRule="auto"/>
+      </w:pPr>
+      <w:r>
+        <w:rPr>
+          <w:rFonts w:ascii="Calibri" w:hAnsi="Calibri"/>
+          <w:sz w:val="22"/>
+        </w:rPr>
+        <w:t xml:space="preserve">Under </w:t>
+      </w:r>
+      <w:r>
+        <w:rPr>
+          <w:rFonts w:ascii="Calibri" w:hAnsi="Calibri"/>
+          <w:b/>
+          <w:sz w:val="22"/>
+        </w:rPr>
+        <w:t>Analysis configuration and methodology</w:t>
+      </w:r>
+      <w:r>
+        <w:rPr>
+          <w:rFonts w:ascii="Calibri" w:hAnsi="Calibri"/>
+          <w:sz w:val="22"/>
+        </w:rPr>
+        <w:t>, choose:</w:t>
       </w:r>
     </w:p>
     <w:p>
@@ -9962,7 +9975,7 @@
           <w:rFonts w:ascii="Calibri" w:hAnsi="Calibri"/>
           <w:sz w:val="22"/>
         </w:rPr>
-        <w:t>minimum matched observations for sparse-result warnings;</w:t>
+        <w:t>phrase policy;</w:t>
       </w:r>
     </w:p>
     <w:p>
@@ -9980,7 +9993,7 @@
           <w:rFonts w:ascii="Calibri" w:hAnsi="Calibri"/>
           <w:sz w:val="22"/>
         </w:rPr>
-        <w:t>whether to display all-matched results;</w:t>
+        <w:t>minimum matched observations for sparse-result warnings;</w:t>
       </w:r>
     </w:p>
     <w:p>
@@ -9998,7 +10011,7 @@
           <w:rFonts w:ascii="Calibri" w:hAnsi="Calibri"/>
           <w:sz w:val="22"/>
         </w:rPr>
-        <w:t>whether to display stopword-excluded results;</w:t>
+        <w:t>whether to display all-matched results;</w:t>
       </w:r>
     </w:p>
     <w:p>
@@ -10016,7 +10029,7 @@
           <w:rFonts w:ascii="Calibri" w:hAnsi="Calibri"/>
           <w:sz w:val="22"/>
         </w:rPr>
-        <w:t>concreteness lower and upper orientation thresholds;</w:t>
+        <w:t>whether to display stopword-excluded results;</w:t>
       </w:r>
     </w:p>
     <w:p>
@@ -10034,7 +10047,7 @@
           <w:rFonts w:ascii="Calibri" w:hAnsi="Calibri"/>
           <w:sz w:val="22"/>
         </w:rPr>
-        <w:t>whether concreteness excludes model-tagged proper nouns;</w:t>
+        <w:t>concreteness lower and upper orientation thresholds;</w:t>
       </w:r>
     </w:p>
     <w:p>
@@ -10052,7 +10065,7 @@
           <w:rFonts w:ascii="Calibri" w:hAnsi="Calibri"/>
           <w:sz w:val="22"/>
         </w:rPr>
-        <w:t>whether source-supplied concreteness phrases are activated; and</w:t>
+        <w:t>whether concreteness excludes model-tagged proper nouns;</w:t>
       </w:r>
     </w:p>
     <w:p>
@@ -10070,7 +10083,7 @@
           <w:rFonts w:ascii="Calibri" w:hAnsi="Calibri"/>
           <w:sz w:val="22"/>
         </w:rPr>
-        <w:t>the concreteness low-coverage caution threshold;</w:t>
+        <w:t>whether source-supplied concreteness phrases are activated; and</w:t>
       </w:r>
     </w:p>
     <w:p>
@@ -10088,7 +10101,7 @@
           <w:rFonts w:ascii="Calibri" w:hAnsi="Calibri"/>
           <w:sz w:val="22"/>
         </w:rPr>
-        <w:t>the four frequency orientation thresholds;</w:t>
+        <w:t>the concreteness low-coverage caution threshold;</w:t>
       </w:r>
     </w:p>
     <w:p>
@@ -10106,7 +10119,7 @@
           <w:rFonts w:ascii="Calibri" w:hAnsi="Calibri"/>
           <w:sz w:val="22"/>
         </w:rPr>
-        <w:t>whether frequency excludes model-tagged proper nouns;</w:t>
+        <w:t>the four frequency orientation thresholds;</w:t>
       </w:r>
     </w:p>
     <w:p>
@@ -10124,7 +10137,7 @@
           <w:rFonts w:ascii="Calibri" w:hAnsi="Calibri"/>
           <w:sz w:val="22"/>
         </w:rPr>
-        <w:t>whether frequency permits lemma fallback;</w:t>
+        <w:t>whether frequency excludes model-tagged proper nouns;</w:t>
       </w:r>
     </w:p>
     <w:p>
@@ -10142,7 +10155,7 @@
           <w:rFonts w:ascii="Calibri" w:hAnsi="Calibri"/>
           <w:sz w:val="22"/>
         </w:rPr>
-        <w:t>the frequency low-coverage caution threshold; and</w:t>
+        <w:t>whether frequency permits lemma fallback;</w:t>
       </w:r>
     </w:p>
     <w:p>
@@ -10160,22 +10173,7 @@
           <w:rFonts w:ascii="Calibri" w:hAnsi="Calibri"/>
           <w:sz w:val="22"/>
         </w:rPr>
-        <w:t xml:space="preserve">whether frequency uses the non-default </w:t>
-      </w:r>
-      <w:r>
-        <w:rPr>
-          <w:rFonts w:ascii="Calibri" w:hAnsi="Calibri"/>
-          <w:b/>
-          <w:sz w:val="22"/>
-        </w:rPr>
-        <w:t>Content words only</w:t>
-      </w:r>
-      <w:r>
-        <w:rPr>
-          <w:rFonts w:ascii="Calibri" w:hAnsi="Calibri"/>
-          <w:sz w:val="22"/>
-        </w:rPr>
-        <w:t xml:space="preserve"> scope;</w:t>
+        <w:t>the frequency low-coverage caution threshold; and</w:t>
       </w:r>
     </w:p>
     <w:p>
@@ -10193,7 +10191,22 @@
           <w:rFonts w:ascii="Calibri" w:hAnsi="Calibri"/>
           <w:sz w:val="22"/>
         </w:rPr>
-        <w:t>AoA early and later orientation thresholds;</w:t>
+        <w:t xml:space="preserve">whether frequency uses the non-default </w:t>
+      </w:r>
+      <w:r>
+        <w:rPr>
+          <w:rFonts w:ascii="Calibri" w:hAnsi="Calibri"/>
+          <w:b/>
+          <w:sz w:val="22"/>
+        </w:rPr>
+        <w:t>Content words only</w:t>
+      </w:r>
+      <w:r>
+        <w:rPr>
+          <w:rFonts w:ascii="Calibri" w:hAnsi="Calibri"/>
+          <w:sz w:val="22"/>
+        </w:rPr>
+        <w:t xml:space="preserve"> scope;</w:t>
       </w:r>
     </w:p>
     <w:p>
@@ -10211,7 +10224,7 @@
           <w:rFonts w:ascii="Calibri" w:hAnsi="Calibri"/>
           <w:sz w:val="22"/>
         </w:rPr>
-        <w:t>whether AoA excludes model-tagged proper nouns;</w:t>
+        <w:t>AoA early and later orientation thresholds;</w:t>
       </w:r>
     </w:p>
     <w:p>
@@ -10229,7 +10242,7 @@
           <w:rFonts w:ascii="Calibri" w:hAnsi="Calibri"/>
           <w:sz w:val="22"/>
         </w:rPr>
-        <w:t>whether AoA permits lemma fallback;</w:t>
+        <w:t>whether AoA excludes model-tagged proper nouns;</w:t>
       </w:r>
     </w:p>
     <w:p>
@@ -10247,7 +10260,7 @@
           <w:rFonts w:ascii="Calibri" w:hAnsi="Calibri"/>
           <w:sz w:val="22"/>
         </w:rPr>
-        <w:t>the AoA low-coverage caution threshold; and</w:t>
+        <w:t>whether AoA permits lemma fallback;</w:t>
       </w:r>
     </w:p>
     <w:p>
@@ -10265,22 +10278,7 @@
           <w:rFonts w:ascii="Calibri" w:hAnsi="Calibri"/>
           <w:sz w:val="22"/>
         </w:rPr>
-        <w:t xml:space="preserve">whether AoA uses the non-default contextual </w:t>
-      </w:r>
-      <w:r>
-        <w:rPr>
-          <w:rFonts w:ascii="Calibri" w:hAnsi="Calibri"/>
-          <w:b/>
-          <w:sz w:val="22"/>
-        </w:rPr>
-        <w:t>Content words only</w:t>
-      </w:r>
-      <w:r>
-        <w:rPr>
-          <w:rFonts w:ascii="Calibri" w:hAnsi="Calibri"/>
-          <w:sz w:val="22"/>
-        </w:rPr>
-        <w:t xml:space="preserve"> scope;</w:t>
+        <w:t>the AoA low-coverage caution threshold; and</w:t>
       </w:r>
     </w:p>
     <w:p>
@@ -10298,7 +10296,22 @@
           <w:rFonts w:ascii="Calibri" w:hAnsi="Calibri"/>
           <w:sz w:val="22"/>
         </w:rPr>
-        <w:t>the MATTR overlapping-window size;</w:t>
+        <w:t xml:space="preserve">whether AoA uses the non-default contextual </w:t>
+      </w:r>
+      <w:r>
+        <w:rPr>
+          <w:rFonts w:ascii="Calibri" w:hAnsi="Calibri"/>
+          <w:b/>
+          <w:sz w:val="22"/>
+        </w:rPr>
+        <w:t>Content words only</w:t>
+      </w:r>
+      <w:r>
+        <w:rPr>
+          <w:rFonts w:ascii="Calibri" w:hAnsi="Calibri"/>
+          <w:sz w:val="22"/>
+        </w:rPr>
+        <w:t xml:space="preserve"> scope;</w:t>
       </w:r>
     </w:p>
     <w:p>
@@ -10316,7 +10329,7 @@
           <w:rFonts w:ascii="Calibri" w:hAnsi="Calibri"/>
           <w:sz w:val="22"/>
         </w:rPr>
-        <w:t>the HD-D without-replacement sample size;</w:t>
+        <w:t>the MATTR overlapping-window size;</w:t>
       </w:r>
     </w:p>
     <w:p>
@@ -10334,7 +10347,7 @@
           <w:rFonts w:ascii="Calibri" w:hAnsi="Calibri"/>
           <w:sz w:val="22"/>
         </w:rPr>
-        <w:t>the MTLD TTR threshold;</w:t>
+        <w:t>the HD-D without-replacement sample size;</w:t>
       </w:r>
     </w:p>
     <w:p>
@@ -10352,7 +10365,7 @@
           <w:rFonts w:ascii="Calibri" w:hAnsi="Calibri"/>
           <w:sz w:val="22"/>
         </w:rPr>
-        <w:t>the lexical-diversity short-text caution threshold;</w:t>
+        <w:t>the MTLD TTR threshold;</w:t>
       </w:r>
     </w:p>
     <w:p>
@@ -10370,7 +10383,7 @@
           <w:rFonts w:ascii="Calibri" w:hAnsi="Calibri"/>
           <w:sz w:val="22"/>
         </w:rPr>
-        <w:t>PoetryID VAD sources, token/type weightings, and analysis views;</w:t>
+        <w:t>the lexical-diversity short-text caution threshold;</w:t>
       </w:r>
     </w:p>
     <w:p>
@@ -10388,7 +10401,7 @@
           <w:rFonts w:ascii="Calibri" w:hAnsi="Calibri"/>
           <w:sz w:val="22"/>
         </w:rPr>
-        <w:t>default or custom-fixed PoetryID VAD thresholds;</w:t>
+        <w:t>PoetryID VAD sources, token/type weightings, and analysis views;</w:t>
       </w:r>
     </w:p>
     <w:p>
@@ -10406,7 +10419,7 @@
           <w:rFonts w:ascii="Calibri" w:hAnsi="Calibri"/>
           <w:sz w:val="22"/>
         </w:rPr>
-        <w:t>PoetryID minimum VAD observations and token/type coverage; and</w:t>
+        <w:t>default or custom-fixed PoetryID VAD thresholds;</w:t>
       </w:r>
     </w:p>
     <w:p>
@@ -10424,7 +10437,7 @@
           <w:rFonts w:ascii="Calibri" w:hAnsi="Calibri"/>
           <w:sz w:val="22"/>
         </w:rPr>
-        <w:t>optional secondary PoetryID concreteness, frequency, and AoA character;</w:t>
+        <w:t>PoetryID minimum VAD observations and token/type coverage; and</w:t>
       </w:r>
     </w:p>
     <w:p>
@@ -10442,22 +10455,7 @@
           <w:rFonts w:ascii="Calibri" w:hAnsi="Calibri"/>
           <w:sz w:val="22"/>
         </w:rPr>
-        <w:t xml:space="preserve">poem-specific </w:t>
-      </w:r>
-      <w:r>
-        <w:rPr>
-          <w:rFonts w:ascii="Consolas" w:hAnsi="Consolas"/>
-          <w:color w:val="1F4D78"/>
-          <w:sz w:val="19"/>
-        </w:rPr>
-        <w:t>word = ARPAbet phones | note</w:t>
-      </w:r>
-      <w:r>
-        <w:rPr>
-          <w:rFonts w:ascii="Calibri" w:hAnsi="Calibri"/>
-          <w:sz w:val="22"/>
-        </w:rPr>
-        <w:t xml:space="preserve"> pronunciation overrides;</w:t>
+        <w:t>optional secondary PoetryID concreteness, frequency, and AoA character;</w:t>
       </w:r>
     </w:p>
     <w:p>
@@ -10475,7 +10473,22 @@
           <w:rFonts w:ascii="Calibri" w:hAnsi="Calibri"/>
           <w:sz w:val="22"/>
         </w:rPr>
-        <w:t>the pronunciation resolved-token coverage caution threshold;</w:t>
+        <w:t xml:space="preserve">poem-specific </w:t>
+      </w:r>
+      <w:r>
+        <w:rPr>
+          <w:rFonts w:ascii="Consolas" w:hAnsi="Consolas"/>
+          <w:color w:val="1F4D78"/>
+          <w:sz w:val="19"/>
+        </w:rPr>
+        <w:t>word = ARPAbet phones | note</w:t>
+      </w:r>
+      <w:r>
+        <w:rPr>
+          <w:rFonts w:ascii="Calibri" w:hAnsi="Calibri"/>
+          <w:sz w:val="22"/>
+        </w:rPr>
+        <w:t xml:space="preserve"> pronunciation overrides;</w:t>
       </w:r>
     </w:p>
     <w:p>
@@ -10493,7 +10506,7 @@
           <w:rFonts w:ascii="Calibri" w:hAnsi="Calibri"/>
           <w:sz w:val="22"/>
         </w:rPr>
-        <w:t>minimum complete pronunciation lines; and</w:t>
+        <w:t>the pronunciation resolved-token coverage caution threshold;</w:t>
       </w:r>
     </w:p>
     <w:p>
@@ -10511,7 +10524,7 @@
           <w:rFonts w:ascii="Calibri" w:hAnsi="Calibri"/>
           <w:sz w:val="22"/>
         </w:rPr>
-        <w:t>minimum resolved pronunciation tokens for sparse-result warnings;</w:t>
+        <w:t>minimum complete pronunciation lines; and</w:t>
       </w:r>
     </w:p>
     <w:p>
@@ -10529,7 +10542,7 @@
           <w:rFonts w:ascii="Calibri" w:hAnsi="Calibri"/>
           <w:sz w:val="22"/>
         </w:rPr>
-        <w:t>the meter line-fit threshold;</w:t>
+        <w:t>minimum resolved pronunciation tokens for sparse-result warnings;</w:t>
       </w:r>
     </w:p>
     <w:p>
@@ -10547,7 +10560,7 @@
           <w:rFonts w:ascii="Calibri" w:hAnsi="Calibri"/>
           <w:sz w:val="22"/>
         </w:rPr>
-        <w:t>the poem candidate-fit threshold;</w:t>
+        <w:t>the meter line-fit threshold;</w:t>
       </w:r>
     </w:p>
     <w:p>
@@ -10565,7 +10578,7 @@
           <w:rFonts w:ascii="Calibri" w:hAnsi="Calibri"/>
           <w:sz w:val="22"/>
         </w:rPr>
-        <w:t>the candidate-margin threshold; and</w:t>
+        <w:t>the poem candidate-fit threshold;</w:t>
       </w:r>
     </w:p>
     <w:p>
@@ -10583,138 +10596,7 @@
           <w:rFonts w:ascii="Calibri" w:hAnsi="Calibri"/>
           <w:sz w:val="22"/>
         </w:rPr>
-        <w:t>the maximum retained stress paths evaluated per line.</w:t>
-      </w:r>
-    </w:p>
-    <w:p>
-      <w:pPr>
-        <w:widowControl/>
-        <w:spacing w:before="0" w:after="120" w:line="300" w:lineRule="auto"/>
-      </w:pPr>
-      <w:r>
-        <w:rPr>
-          <w:rFonts w:ascii="Calibri" w:hAnsi="Calibri"/>
-          <w:sz w:val="22"/>
-        </w:rPr>
-        <w:t xml:space="preserve">Under </w:t>
-      </w:r>
-      <w:r>
-        <w:rPr>
-          <w:rFonts w:ascii="Calibri" w:hAnsi="Calibri"/>
-          <w:b/>
-          <w:sz w:val="22"/>
-        </w:rPr>
-        <w:t>Stopword settings</w:t>
-      </w:r>
-      <w:r>
-        <w:rPr>
-          <w:rFonts w:ascii="Calibri" w:hAnsi="Calibri"/>
-          <w:sz w:val="22"/>
-        </w:rPr>
-        <w:t>, inspect or change the secondary-view policy. The all-matched result is always preserved even when only one view is displayed.</w:t>
-      </w:r>
-    </w:p>
-    <w:p>
-      <w:pPr>
-        <w:pStyle w:val="Heading2"/>
-      </w:pPr>
-      <w:r>
-        <w:rPr>
-          <w:rFonts w:ascii="Calibri" w:hAnsi="Calibri"/>
-          <w:sz w:val="22"/>
-        </w:rPr>
-        <w:t>Overview report family</w:t>
-      </w:r>
-    </w:p>
-    <w:p>
-      <w:pPr>
-        <w:widowControl/>
-        <w:spacing w:before="0" w:after="120" w:line="300" w:lineRule="auto"/>
-      </w:pPr>
-      <w:r>
-        <w:rPr>
-          <w:rFonts w:ascii="Calibri" w:hAnsi="Calibri"/>
-          <w:sz w:val="22"/>
-        </w:rPr>
-        <w:t>Read coverage before means. The Overview begins with a grouped at-a-glance summary for affective evidence, lexical character, sound/form, and structure. It then shows ordinary and content-focused coverage, matched counts, active methodology, excluded stopword counts, interpretive framing, and warnings.</w:t>
-      </w:r>
-    </w:p>
-    <w:p>
-      <w:pPr>
-        <w:pStyle w:val="Heading2"/>
-      </w:pPr>
-      <w:r>
-        <w:rPr>
-          <w:rFonts w:ascii="Calibri" w:hAnsi="Calibri"/>
-          <w:sz w:val="22"/>
-        </w:rPr>
-        <w:t>Structure report family: Language Profile section</w:t>
-      </w:r>
-    </w:p>
-    <w:p>
-      <w:pPr>
-        <w:widowControl/>
-        <w:spacing w:before="0" w:after="120" w:line="300" w:lineRule="auto"/>
-      </w:pPr>
-      <w:r>
-        <w:rPr>
-          <w:rFonts w:ascii="Calibri" w:hAnsi="Calibri"/>
-          <w:sz w:val="22"/>
-        </w:rPr>
-        <w:t xml:space="preserve">The </w:t>
-      </w:r>
-      <w:r>
-        <w:rPr>
-          <w:rFonts w:ascii="Calibri" w:hAnsi="Calibri"/>
-          <w:b/>
-          <w:sz w:val="22"/>
-        </w:rPr>
-        <w:t>Shared Processing Record</w:t>
-      </w:r>
-      <w:r>
-        <w:rPr>
-          <w:rFonts w:ascii="Calibri" w:hAnsi="Calibri"/>
-          <w:sz w:val="22"/>
-        </w:rPr>
-        <w:t xml:space="preserve"> first reports stanzas, physical lines, model sentences, total and lexical tokens, recipe/configuration IDs, model pipeline, dependency coverage, named-entity status, and processing cautions. It is the common local representation used by every selected lexicon.</w:t>
-      </w:r>
-    </w:p>
-    <w:p>
-      <w:pPr>
-        <w:widowControl/>
-        <w:spacing w:before="0" w:after="120" w:line="300" w:lineRule="auto"/>
-      </w:pPr>
-      <w:r>
-        <w:rPr>
-          <w:rFonts w:ascii="Calibri" w:hAnsi="Calibri"/>
-          <w:sz w:val="22"/>
-        </w:rPr>
-        <w:t>The tab then reports part-of-speech counts and relative shares for all eligible lexical tokens, independently of lexicon coverage. It also shows unique normalized types and example forms. The denominator is displayed, and a caution explains that the labels are model-generated.</w:t>
-      </w:r>
-    </w:p>
-    <w:p>
-      <w:pPr>
-        <w:pStyle w:val="Heading2"/>
-      </w:pPr>
-      <w:r>
-        <w:rPr>
-          <w:rFonts w:ascii="Calibri" w:hAnsi="Calibri"/>
-          <w:sz w:val="22"/>
-        </w:rPr>
-        <w:t>Affective Evidence: VAD section</w:t>
-      </w:r>
-    </w:p>
-    <w:p>
-      <w:pPr>
-        <w:widowControl/>
-        <w:spacing w:before="0" w:after="120" w:line="300" w:lineRule="auto"/>
-      </w:pPr>
-      <w:r>
-        <w:rPr>
-          <w:rFonts w:ascii="Calibri" w:hAnsi="Calibri"/>
-          <w:sz w:val="22"/>
-        </w:rPr>
-        <w:t>This tab contains:</w:t>
+        <w:t>the candidate-margin threshold; and</w:t>
       </w:r>
     </w:p>
     <w:p>
@@ -10732,7 +10614,138 @@
           <w:rFonts w:ascii="Calibri" w:hAnsi="Calibri"/>
           <w:sz w:val="22"/>
         </w:rPr>
-        <w:t>parallel normalized VAD charts;</w:t>
+        <w:t>the maximum retained stress paths evaluated per line.</w:t>
+      </w:r>
+    </w:p>
+    <w:p>
+      <w:pPr>
+        <w:widowControl/>
+        <w:spacing w:before="0" w:after="120" w:line="300" w:lineRule="auto"/>
+      </w:pPr>
+      <w:r>
+        <w:rPr>
+          <w:rFonts w:ascii="Calibri" w:hAnsi="Calibri"/>
+          <w:sz w:val="22"/>
+        </w:rPr>
+        <w:t xml:space="preserve">Under </w:t>
+      </w:r>
+      <w:r>
+        <w:rPr>
+          <w:rFonts w:ascii="Calibri" w:hAnsi="Calibri"/>
+          <w:b/>
+          <w:sz w:val="22"/>
+        </w:rPr>
+        <w:t>Stopword settings</w:t>
+      </w:r>
+      <w:r>
+        <w:rPr>
+          <w:rFonts w:ascii="Calibri" w:hAnsi="Calibri"/>
+          <w:sz w:val="22"/>
+        </w:rPr>
+        <w:t>, inspect or change the secondary-view policy. The all-matched result is always preserved even when only one view is displayed.</w:t>
+      </w:r>
+    </w:p>
+    <w:p>
+      <w:pPr>
+        <w:pStyle w:val="Heading2"/>
+      </w:pPr>
+      <w:r>
+        <w:rPr>
+          <w:rFonts w:ascii="Calibri" w:hAnsi="Calibri"/>
+          <w:sz w:val="22"/>
+        </w:rPr>
+        <w:t>Overview report family</w:t>
+      </w:r>
+    </w:p>
+    <w:p>
+      <w:pPr>
+        <w:widowControl/>
+        <w:spacing w:before="0" w:after="120" w:line="300" w:lineRule="auto"/>
+      </w:pPr>
+      <w:r>
+        <w:rPr>
+          <w:rFonts w:ascii="Calibri" w:hAnsi="Calibri"/>
+          <w:sz w:val="22"/>
+        </w:rPr>
+        <w:t>Read coverage before means. The Overview begins with a grouped at-a-glance summary for affective evidence, lexical character, sound/form, and structure. It then shows ordinary and content-focused coverage, matched counts, active methodology, excluded stopword counts, interpretive framing, and warnings.</w:t>
+      </w:r>
+    </w:p>
+    <w:p>
+      <w:pPr>
+        <w:pStyle w:val="Heading2"/>
+      </w:pPr>
+      <w:r>
+        <w:rPr>
+          <w:rFonts w:ascii="Calibri" w:hAnsi="Calibri"/>
+          <w:sz w:val="22"/>
+        </w:rPr>
+        <w:t>Structure report family: Language Profile section</w:t>
+      </w:r>
+    </w:p>
+    <w:p>
+      <w:pPr>
+        <w:widowControl/>
+        <w:spacing w:before="0" w:after="120" w:line="300" w:lineRule="auto"/>
+      </w:pPr>
+      <w:r>
+        <w:rPr>
+          <w:rFonts w:ascii="Calibri" w:hAnsi="Calibri"/>
+          <w:sz w:val="22"/>
+        </w:rPr>
+        <w:t xml:space="preserve">The </w:t>
+      </w:r>
+      <w:r>
+        <w:rPr>
+          <w:rFonts w:ascii="Calibri" w:hAnsi="Calibri"/>
+          <w:b/>
+          <w:sz w:val="22"/>
+        </w:rPr>
+        <w:t>Shared Processing Record</w:t>
+      </w:r>
+      <w:r>
+        <w:rPr>
+          <w:rFonts w:ascii="Calibri" w:hAnsi="Calibri"/>
+          <w:sz w:val="22"/>
+        </w:rPr>
+        <w:t xml:space="preserve"> first reports stanzas, physical lines, model sentences, total and lexical tokens, recipe/configuration IDs, model pipeline, dependency coverage, named-entity status, and processing cautions. It is the common local representation used by every selected lexicon.</w:t>
+      </w:r>
+    </w:p>
+    <w:p>
+      <w:pPr>
+        <w:widowControl/>
+        <w:spacing w:before="0" w:after="120" w:line="300" w:lineRule="auto"/>
+      </w:pPr>
+      <w:r>
+        <w:rPr>
+          <w:rFonts w:ascii="Calibri" w:hAnsi="Calibri"/>
+          <w:sz w:val="22"/>
+        </w:rPr>
+        <w:t>The tab then reports part-of-speech counts and relative shares for all eligible lexical tokens, independently of lexicon coverage. It also shows unique normalized types and example forms. The denominator is displayed, and a caution explains that the labels are model-generated.</w:t>
+      </w:r>
+    </w:p>
+    <w:p>
+      <w:pPr>
+        <w:pStyle w:val="Heading2"/>
+      </w:pPr>
+      <w:r>
+        <w:rPr>
+          <w:rFonts w:ascii="Calibri" w:hAnsi="Calibri"/>
+          <w:sz w:val="22"/>
+        </w:rPr>
+        <w:t>Affective Evidence: VAD section</w:t>
+      </w:r>
+    </w:p>
+    <w:p>
+      <w:pPr>
+        <w:widowControl/>
+        <w:spacing w:before="0" w:after="120" w:line="300" w:lineRule="auto"/>
+      </w:pPr>
+      <w:r>
+        <w:rPr>
+          <w:rFonts w:ascii="Calibri" w:hAnsi="Calibri"/>
+          <w:sz w:val="22"/>
+        </w:rPr>
+        <w:t>This tab contains:</w:t>
       </w:r>
     </w:p>
     <w:p>
@@ -10750,7 +10763,7 @@
           <w:rFonts w:ascii="Calibri" w:hAnsi="Calibri"/>
           <w:sz w:val="22"/>
         </w:rPr>
-        <w:t>definitions of valence, arousal, and dominance;</w:t>
+        <w:t>parallel normalized VAD charts;</w:t>
       </w:r>
     </w:p>
     <w:p>
@@ -10768,35 +10781,7 @@
           <w:rFonts w:ascii="Calibri" w:hAnsi="Calibri"/>
           <w:sz w:val="22"/>
         </w:rPr>
-        <w:t xml:space="preserve">a separate </w:t>
-      </w:r>
-      <w:r>
-        <w:rPr>
-          <w:rFonts w:ascii="Calibri" w:hAnsi="Calibri"/>
-          <w:b/>
-          <w:sz w:val="22"/>
-        </w:rPr>
-        <w:t>Dispersion of Matched Ratings</w:t>
-      </w:r>
-      <w:r>
-        <w:rPr>
-          <w:rFonts w:ascii="Calibri" w:hAnsi="Calibri"/>
-          <w:sz w:val="22"/>
-        </w:rPr>
-        <w:t xml:space="preserve"> section immediately after those</w:t>
-      </w:r>
-    </w:p>
-    <w:p>
-      <w:pPr>
-        <w:widowControl/>
-        <w:spacing w:before="0" w:after="120" w:line="300" w:lineRule="auto"/>
-      </w:pPr>
-      <w:r>
-        <w:rPr>
-          <w:rFonts w:ascii="Calibri" w:hAnsi="Calibri"/>
-          <w:sz w:val="22"/>
-        </w:rPr>
-        <w:t xml:space="preserve">  definitions, reporting population standard deviations among matched ratings;</w:t>
+        <w:t>definitions of valence, arousal, and dominance;</w:t>
       </w:r>
     </w:p>
     <w:p>
@@ -10814,7 +10799,35 @@
           <w:rFonts w:ascii="Calibri" w:hAnsi="Calibri"/>
           <w:sz w:val="22"/>
         </w:rPr>
-        <w:t>token- and type-weighted values for each analysis view;</w:t>
+        <w:t xml:space="preserve">a separate </w:t>
+      </w:r>
+      <w:r>
+        <w:rPr>
+          <w:rFonts w:ascii="Calibri" w:hAnsi="Calibri"/>
+          <w:b/>
+          <w:sz w:val="22"/>
+        </w:rPr>
+        <w:t>Dispersion of Matched Ratings</w:t>
+      </w:r>
+      <w:r>
+        <w:rPr>
+          <w:rFonts w:ascii="Calibri" w:hAnsi="Calibri"/>
+          <w:sz w:val="22"/>
+        </w:rPr>
+        <w:t xml:space="preserve"> section immediately after those</w:t>
+      </w:r>
+    </w:p>
+    <w:p>
+      <w:pPr>
+        <w:widowControl/>
+        <w:spacing w:before="0" w:after="120" w:line="300" w:lineRule="auto"/>
+      </w:pPr>
+      <w:r>
+        <w:rPr>
+          <w:rFonts w:ascii="Calibri" w:hAnsi="Calibri"/>
+          <w:sz w:val="22"/>
+        </w:rPr>
+        <w:t xml:space="preserve">  definitions, reporting population standard deviations among matched ratings;</w:t>
       </w:r>
     </w:p>
     <w:p>
@@ -10832,7 +10845,7 @@
           <w:rFonts w:ascii="Calibri" w:hAnsi="Calibri"/>
           <w:sz w:val="22"/>
         </w:rPr>
-        <w:t>plain-language midpoint interpretations;</w:t>
+        <w:t>token- and type-weighted values for each analysis view;</w:t>
       </w:r>
     </w:p>
     <w:p>
@@ -10850,7 +10863,7 @@
           <w:rFonts w:ascii="Calibri" w:hAnsi="Calibri"/>
           <w:sz w:val="22"/>
         </w:rPr>
-        <w:t>stopword-sensitivity differences;</w:t>
+        <w:t>plain-language midpoint interpretations;</w:t>
       </w:r>
     </w:p>
     <w:p>
@@ -10868,7 +10881,7 @@
           <w:rFonts w:ascii="Calibri" w:hAnsi="Calibri"/>
           <w:sz w:val="22"/>
         </w:rPr>
-        <w:t>cumulative normalized totals;</w:t>
+        <w:t>stopword-sensitivity differences;</w:t>
       </w:r>
     </w:p>
     <w:p>
@@ -10886,7 +10899,7 @@
           <w:rFonts w:ascii="Calibri" w:hAnsi="Calibri"/>
           <w:sz w:val="22"/>
         </w:rPr>
-        <w:t>top midpoint-centered contributors;</w:t>
+        <w:t>cumulative normalized totals;</w:t>
       </w:r>
     </w:p>
     <w:p>
@@ -10904,6 +10917,24 @@
           <w:rFonts w:ascii="Calibri" w:hAnsi="Calibri"/>
           <w:sz w:val="22"/>
         </w:rPr>
+        <w:t>top midpoint-centered contributors;</w:t>
+      </w:r>
+    </w:p>
+    <w:p>
+      <w:pPr>
+        <w:widowControl/>
+        <w:numPr>
+          <w:ilvl w:val="0"/>
+          <w:numId w:val="10"/>
+        </w:numPr>
+        <w:spacing w:before="0" w:after="80" w:line="300" w:lineRule="auto"/>
+        <w:ind w:left="540" w:hanging="271"/>
+      </w:pPr>
+      <w:r>
+        <w:rPr>
+          <w:rFonts w:ascii="Calibri" w:hAnsi="Calibri"/>
+          <w:sz w:val="22"/>
+        </w:rPr>
         <w:t>original source scales and normalization formulas.</w:t>
       </w:r>
     </w:p>
@@ -11462,6 +11493,127 @@
           <w:sz w:val="22"/>
         </w:rPr>
         <w:t xml:space="preserve"> is enabled. It reports token/type totals, MATTR, HD-D, MTLD, alphabetic-character word-length statistics and distribution, and detailed word counts for each physical line and stanza.</w:t>
+      </w:r>
+    </w:p>
+    <w:p>
+      <w:pPr>
+        <w:widowControl/>
+        <w:spacing w:before="0" w:after="120" w:line="300" w:lineRule="auto"/>
+      </w:pPr>
+      <w:r>
+        <w:rPr>
+          <w:rFonts w:ascii="Calibri" w:hAnsi="Calibri"/>
+          <w:sz w:val="22"/>
+        </w:rPr>
+        <w:t xml:space="preserve">The </w:t>
+      </w:r>
+      <w:r>
+        <w:rPr>
+          <w:rFonts w:ascii="Calibri" w:hAnsi="Calibri"/>
+          <w:b/>
+          <w:sz w:val="22"/>
+        </w:rPr>
+        <w:t>Structural Count Summary</w:t>
+      </w:r>
+      <w:r>
+        <w:rPr>
+          <w:rFonts w:ascii="Calibri" w:hAnsi="Calibri"/>
+          <w:sz w:val="22"/>
+        </w:rPr>
+        <w:t xml:space="preserve"> shows:</w:t>
+      </w:r>
+    </w:p>
+    <w:p>
+      <w:pPr>
+        <w:widowControl/>
+        <w:numPr>
+          <w:ilvl w:val="0"/>
+          <w:numId w:val="10"/>
+        </w:numPr>
+        <w:spacing w:before="0" w:after="80" w:line="300" w:lineRule="auto"/>
+        <w:ind w:left="540" w:hanging="271"/>
+      </w:pPr>
+      <w:r>
+        <w:rPr>
+          <w:rFonts w:ascii="Calibri" w:hAnsi="Calibri"/>
+          <w:sz w:val="22"/>
+        </w:rPr>
+        <w:t>average words per nonblank physical line and its population standard</w:t>
+      </w:r>
+    </w:p>
+    <w:p>
+      <w:pPr>
+        <w:widowControl/>
+        <w:spacing w:before="0" w:after="120" w:line="300" w:lineRule="auto"/>
+      </w:pPr>
+      <w:r>
+        <w:rPr>
+          <w:rFonts w:ascii="Calibri" w:hAnsi="Calibri"/>
+          <w:sz w:val="22"/>
+        </w:rPr>
+        <w:t xml:space="preserve">  deviation;</w:t>
+      </w:r>
+    </w:p>
+    <w:p>
+      <w:pPr>
+        <w:widowControl/>
+        <w:numPr>
+          <w:ilvl w:val="0"/>
+          <w:numId w:val="10"/>
+        </w:numPr>
+        <w:spacing w:before="0" w:after="80" w:line="300" w:lineRule="auto"/>
+        <w:ind w:left="540" w:hanging="271"/>
+      </w:pPr>
+      <w:r>
+        <w:rPr>
+          <w:rFonts w:ascii="Calibri" w:hAnsi="Calibri"/>
+          <w:sz w:val="22"/>
+        </w:rPr>
+        <w:t>average words per stanza and its population standard deviation; and</w:t>
+      </w:r>
+    </w:p>
+    <w:p>
+      <w:pPr>
+        <w:widowControl/>
+        <w:numPr>
+          <w:ilvl w:val="0"/>
+          <w:numId w:val="10"/>
+        </w:numPr>
+        <w:spacing w:before="0" w:after="80" w:line="300" w:lineRule="auto"/>
+        <w:ind w:left="540" w:hanging="271"/>
+      </w:pPr>
+      <w:r>
+        <w:rPr>
+          <w:rFonts w:ascii="Calibri" w:hAnsi="Calibri"/>
+          <w:sz w:val="22"/>
+        </w:rPr>
+        <w:t>average nonblank physical lines per stanza and its population standard</w:t>
+      </w:r>
+    </w:p>
+    <w:p>
+      <w:pPr>
+        <w:widowControl/>
+        <w:spacing w:before="0" w:after="120" w:line="300" w:lineRule="auto"/>
+      </w:pPr>
+      <w:r>
+        <w:rPr>
+          <w:rFonts w:ascii="Calibri" w:hAnsi="Calibri"/>
+          <w:sz w:val="22"/>
+        </w:rPr>
+        <w:t xml:space="preserve">  deviation.</w:t>
+      </w:r>
+    </w:p>
+    <w:p>
+      <w:pPr>
+        <w:widowControl/>
+        <w:spacing w:before="0" w:after="120" w:line="300" w:lineRule="auto"/>
+      </w:pPr>
+      <w:r>
+        <w:rPr>
+          <w:rFonts w:ascii="Calibri" w:hAnsi="Calibri"/>
+          <w:sz w:val="22"/>
+        </w:rPr>
+        <w:t>The standard deviations describe dispersion across all corresponding units in the poem, so VerseVAD uses population rather than sample standard deviation. Blank stanza-separator lines remain visible in the detailed line table but do not enter the words-per-line or lines-per-stanza denominators.</w:t>
       </w:r>
     </w:p>
     <w:p>

</xml_diff>

<commit_message>
Implemented and updated inherited form analysis
</commit_message>
<xml_diff>
--- a/docs/VerseVAD_User_Manual.docx
+++ b/docs/VerseVAD_User_Manual.docx
@@ -9192,7 +9192,33 @@
           <w:rFonts w:ascii="Calibri" w:hAnsi="Calibri"/>
           <w:sz w:val="22"/>
         </w:rPr>
-        <w:t xml:space="preserve"> compares the poem with ten versioned, source-backed profiles:</w:t>
+        <w:t xml:space="preserve"> compares the poem with registry version 2.0's 169 source-documented profiles. Fifty-eight profiles are automatically assessable, 27 are partially assessable, and 84 retain defining requirements for manual scholarly confirmation. A manual profile remains selectable and keeps its requirement visible and unscored, but it cannot become an automatic suggestion.</w:t>
+      </w:r>
+    </w:p>
+    <w:p>
+      <w:pPr>
+        <w:widowControl/>
+        <w:spacing w:before="0" w:after="120" w:line="300" w:lineRule="auto"/>
+      </w:pPr>
+      <w:r>
+        <w:rPr>
+          <w:rFonts w:ascii="Calibri" w:hAnsi="Calibri"/>
+          <w:sz w:val="22"/>
+        </w:rPr>
+        <w:t>It automatically reuses the shared poem document, pronunciation, meter, and graded-rhyme results. It does not retokenize, reload CMUdict, or perform an independent scansion. New form-specific detectors compare ordered refrains, sestina end-word rotation and envoi, pantoum interstanza repetition, terza-rima rhyme chains, limerick long/short lines, and ghazal radif/qafia evidence.</w:t>
+      </w:r>
+    </w:p>
+    <w:p>
+      <w:pPr>
+        <w:widowControl/>
+        <w:spacing w:before="0" w:after="120" w:line="300" w:lineRule="auto"/>
+      </w:pPr>
+      <w:r>
+        <w:rPr>
+          <w:rFonts w:ascii="Calibri" w:hAnsi="Calibri"/>
+          <w:sz w:val="22"/>
+        </w:rPr>
+        <w:t>Read four distinctions carefully:</w:t>
       </w:r>
     </w:p>
     <w:p>
@@ -9208,9 +9234,17 @@
       <w:r>
         <w:rPr>
           <w:rFonts w:ascii="Calibri" w:hAnsi="Calibri"/>
-          <w:sz w:val="22"/>
-        </w:rPr>
-        <w:t>Elizabethan / Shakespearean, Petrarchan / Italian, and Spenserian sonnets;</w:t>
+          <w:b/>
+          <w:sz w:val="22"/>
+        </w:rPr>
+        <w:t>candidate</w:t>
+      </w:r>
+      <w:r>
+        <w:rPr>
+          <w:rFonts w:ascii="Calibri" w:hAnsi="Calibri"/>
+          <w:sz w:val="22"/>
+        </w:rPr>
+        <w:t xml:space="preserve"> is the highest-ranked eligible profile;</w:t>
       </w:r>
     </w:p>
     <w:p>
@@ -9226,9 +9260,17 @@
       <w:r>
         <w:rPr>
           <w:rFonts w:ascii="Calibri" w:hAnsi="Calibri"/>
-          <w:sz w:val="22"/>
-        </w:rPr>
-        <w:t>villanelle;</w:t>
+          <w:b/>
+          <w:sz w:val="22"/>
+        </w:rPr>
+        <w:t>consistency</w:t>
+      </w:r>
+      <w:r>
+        <w:rPr>
+          <w:rFonts w:ascii="Calibri" w:hAnsi="Calibri"/>
+          <w:sz w:val="22"/>
+        </w:rPr>
+        <w:t xml:space="preserve"> is weighted agreement with available profile rules;</w:t>
       </w:r>
     </w:p>
     <w:p>
@@ -9244,9 +9286,17 @@
       <w:r>
         <w:rPr>
           <w:rFonts w:ascii="Calibri" w:hAnsi="Calibri"/>
-          <w:sz w:val="22"/>
-        </w:rPr>
-        <w:t>sestina;</w:t>
+          <w:b/>
+          <w:sz w:val="22"/>
+        </w:rPr>
+        <w:t>evidence coverage</w:t>
+      </w:r>
+      <w:r>
+        <w:rPr>
+          <w:rFonts w:ascii="Calibri" w:hAnsi="Calibri"/>
+          <w:sz w:val="22"/>
+        </w:rPr>
+        <w:t xml:space="preserve"> is how much possible weighted evidence could be tested;</w:t>
       </w:r>
     </w:p>
     <w:p>
@@ -9262,9 +9312,176 @@
       <w:r>
         <w:rPr>
           <w:rFonts w:ascii="Calibri" w:hAnsi="Calibri"/>
-          <w:sz w:val="22"/>
-        </w:rPr>
-        <w:t>limerick;</w:t>
+          <w:b/>
+          <w:sz w:val="22"/>
+        </w:rPr>
+        <w:t>confidence</w:t>
+      </w:r>
+      <w:r>
+        <w:rPr>
+          <w:rFonts w:ascii="Calibri" w:hAnsi="Calibri"/>
+          <w:sz w:val="22"/>
+        </w:rPr>
+        <w:t xml:space="preserve"> also considers required features and separation from the</w:t>
+      </w:r>
+    </w:p>
+    <w:p>
+      <w:pPr>
+        <w:widowControl/>
+        <w:spacing w:before="0" w:after="120" w:line="300" w:lineRule="auto"/>
+      </w:pPr>
+      <w:r>
+        <w:rPr>
+          <w:rFonts w:ascii="Calibri" w:hAnsi="Calibri"/>
+          <w:sz w:val="22"/>
+        </w:rPr>
+        <w:t xml:space="preserve">  nearest alternative.</w:t>
+      </w:r>
+    </w:p>
+    <w:p>
+      <w:pPr>
+        <w:widowControl/>
+        <w:spacing w:before="0" w:after="120" w:line="300" w:lineRule="auto"/>
+      </w:pPr>
+      <w:r>
+        <w:rPr>
+          <w:rFonts w:ascii="Calibri" w:hAnsi="Calibri"/>
+          <w:sz w:val="22"/>
+        </w:rPr>
+        <w:t>Confidence is low, moderate, or high and is not a probability. Missing pronunciation, meter, rhyme, or syllable evidence has no feature score and lowers coverage; it is never converted to mismatch.</w:t>
+      </w:r>
+    </w:p>
+    <w:p>
+      <w:pPr>
+        <w:widowControl/>
+        <w:spacing w:before="0" w:after="120" w:line="300" w:lineRule="auto"/>
+      </w:pPr>
+      <w:r>
+        <w:rPr>
+          <w:rFonts w:ascii="Calibri" w:hAnsi="Calibri"/>
+          <w:sz w:val="22"/>
+        </w:rPr>
+        <w:t>Classifications are Strict, Strongly conforming, Modified, Form-derived, Suggestive resemblance, and No inherited-form match. A candidate must pass the consistency, total-coverage, required-feature-coverage, and contradiction rules before VerseVAD calls it a potential match.</w:t>
+      </w:r>
+    </w:p>
+    <w:p>
+      <w:pPr>
+        <w:widowControl/>
+        <w:spacing w:before="0" w:after="120" w:line="300" w:lineRule="auto"/>
+      </w:pPr>
+      <w:r>
+        <w:rPr>
+          <w:rFonts w:ascii="Calibri" w:hAnsi="Calibri"/>
+          <w:sz w:val="22"/>
+        </w:rPr>
+        <w:t>Hover over the classification metric or read the visible information box for the traditional definition plus the poem's strongest agreements and departures. The ranking table and candidate-evidence selector retain every profile, expected and detected value, role, weight, feature score, coverage, and source module. The sources and limitations expander links to the definition sources.</w:t>
+      </w:r>
+    </w:p>
+    <w:p>
+      <w:pPr>
+        <w:widowControl/>
+        <w:spacing w:before="0" w:after="120" w:line="300" w:lineRule="auto"/>
+      </w:pPr>
+      <w:r>
+        <w:rPr>
+          <w:rFonts w:ascii="Calibri" w:hAnsi="Calibri"/>
+          <w:sz w:val="22"/>
+        </w:rPr>
+        <w:t xml:space="preserve">The haiku profile is deliberately narrow. It tests an English-language 5–7–5 structural convention; it does not treat English syllables as Japanese </w:t>
+      </w:r>
+      <w:r>
+        <w:rPr>
+          <w:rFonts w:ascii="Calibri" w:hAnsi="Calibri"/>
+          <w:i/>
+          <w:sz w:val="22"/>
+        </w:rPr>
+        <w:t>on</w:t>
+      </w:r>
+      <w:r>
+        <w:rPr>
+          <w:rFonts w:ascii="Calibri" w:hAnsi="Calibri"/>
+          <w:sz w:val="22"/>
+        </w:rPr>
+        <w:t xml:space="preserve"> or claim to detect kigo, kireji, juxtaposition, or haiku identity. Ghazal semantic autonomy and optional maqta are not guessed. Sonnet volta evidence is not guessed.</w:t>
+      </w:r>
+    </w:p>
+    <w:p>
+      <w:pPr>
+        <w:widowControl/>
+        <w:spacing w:before="0" w:after="120" w:line="300" w:lineRule="auto"/>
+      </w:pPr>
+      <w:r>
+        <w:rPr>
+          <w:rFonts w:ascii="Calibri" w:hAnsi="Calibri"/>
+          <w:sz w:val="22"/>
+        </w:rPr>
+        <w:t>Safe wording is: “VerseVAD reports a modified Elizabethan-sonnet potential match with 78% consistency across 86% of the profile's weighted evidence.” Do not write: “VerseVAD proved that the poem is an Elizabethan sonnet.”</w:t>
+      </w:r>
+    </w:p>
+    <w:p>
+      <w:pPr>
+        <w:pStyle w:val="Heading2"/>
+      </w:pPr>
+      <w:r>
+        <w:rPr>
+          <w:rFonts w:ascii="Calibri" w:hAnsi="Calibri"/>
+          <w:sz w:val="22"/>
+        </w:rPr>
+        <w:t>Lexical diversity, word length, and structural word counts</w:t>
+      </w:r>
+    </w:p>
+    <w:p>
+      <w:pPr>
+        <w:widowControl/>
+        <w:spacing w:before="0" w:after="120" w:line="300" w:lineRule="auto"/>
+      </w:pPr>
+      <w:r>
+        <w:rPr>
+          <w:rFonts w:ascii="Calibri" w:hAnsi="Calibri"/>
+          <w:sz w:val="22"/>
+        </w:rPr>
+        <w:t xml:space="preserve">The optional </w:t>
+      </w:r>
+      <w:r>
+        <w:rPr>
+          <w:rFonts w:ascii="Calibri" w:hAnsi="Calibri"/>
+          <w:b/>
+          <w:sz w:val="22"/>
+        </w:rPr>
+        <w:t>Lexical Style</w:t>
+      </w:r>
+      <w:r>
+        <w:rPr>
+          <w:rFonts w:ascii="Calibri" w:hAnsi="Calibri"/>
+          <w:sz w:val="22"/>
+        </w:rPr>
+        <w:t xml:space="preserve"> module uses the shared poetry-preserving processing record and requires no external dataset. The broader planned visible-structure and syntax/lineation modules were skipped at the scholar's direction.</w:t>
+      </w:r>
+    </w:p>
+    <w:p>
+      <w:pPr>
+        <w:widowControl/>
+        <w:spacing w:before="0" w:after="120" w:line="300" w:lineRule="auto"/>
+      </w:pPr>
+      <w:r>
+        <w:rPr>
+          <w:rFonts w:ascii="Calibri" w:hAnsi="Calibri"/>
+          <w:sz w:val="22"/>
+        </w:rPr>
+        <w:t>One counted word is one shared-preprocessing lexical token. Punctuation and numeric tokens are excluded. This word unit may differ from an editor's orthographic convention for a contraction or hyphenated expression, so the token audit preserves exact surfaces, offsets, and inclusion reasons.</w:t>
+      </w:r>
+    </w:p>
+    <w:p>
+      <w:pPr>
+        <w:widowControl/>
+        <w:spacing w:before="0" w:after="120" w:line="300" w:lineRule="auto"/>
+      </w:pPr>
+      <w:r>
+        <w:rPr>
+          <w:rFonts w:ascii="Calibri" w:hAnsi="Calibri"/>
+          <w:sz w:val="22"/>
+        </w:rPr>
+        <w:t>Lexical diversity uses normalized observed surface forms. Lemmas remain separate audit evidence and never silently replace the forms present in the poem. The module reports:</w:t>
       </w:r>
     </w:p>
     <w:p>
@@ -9282,7 +9499,7 @@
           <w:rFonts w:ascii="Calibri" w:hAnsi="Calibri"/>
           <w:sz w:val="22"/>
         </w:rPr>
-        <w:t>English-language 5–7–5 haiku profile;</w:t>
+        <w:t>descriptive lexical-token, normalized surface-type, and plain TTR values;</w:t>
       </w:r>
     </w:p>
     <w:p>
@@ -9300,7 +9517,7 @@
           <w:rFonts w:ascii="Calibri" w:hAnsi="Calibri"/>
           <w:sz w:val="22"/>
         </w:rPr>
-        <w:t>pantoum;</w:t>
+        <w:t>MATTR across every overlapping configured token window;</w:t>
       </w:r>
     </w:p>
     <w:p>
@@ -9318,7 +9535,20 @@
           <w:rFonts w:ascii="Calibri" w:hAnsi="Calibri"/>
           <w:sz w:val="22"/>
         </w:rPr>
-        <w:t>terza rima; and</w:t>
+        <w:t>HD-D as the expected distinct-type proportion in a configured</w:t>
+      </w:r>
+    </w:p>
+    <w:p>
+      <w:pPr>
+        <w:widowControl/>
+        <w:spacing w:before="0" w:after="120" w:line="300" w:lineRule="auto"/>
+      </w:pPr>
+      <w:r>
+        <w:rPr>
+          <w:rFonts w:ascii="Calibri" w:hAnsi="Calibri"/>
+          <w:sz w:val="22"/>
+        </w:rPr>
+        <w:t xml:space="preserve">  without-replacement sample;</w:t>
       </w:r>
     </w:p>
     <w:p>
@@ -9336,33 +9566,7 @@
           <w:rFonts w:ascii="Calibri" w:hAnsi="Calibri"/>
           <w:sz w:val="22"/>
         </w:rPr>
-        <w:t>ghazal.</w:t>
-      </w:r>
-    </w:p>
-    <w:p>
-      <w:pPr>
-        <w:widowControl/>
-        <w:spacing w:before="0" w:after="120" w:line="300" w:lineRule="auto"/>
-      </w:pPr>
-      <w:r>
-        <w:rPr>
-          <w:rFonts w:ascii="Calibri" w:hAnsi="Calibri"/>
-          <w:sz w:val="22"/>
-        </w:rPr>
-        <w:t>It automatically reuses the shared poem document, pronunciation, meter, and graded-rhyme results. It does not retokenize, reload CMUdict, or perform an independent scansion. New form-specific detectors compare ordered refrains, sestina end-word rotation and envoi, pantoum interstanza repetition, terza-rima rhyme chains, limerick long/short lines, and ghazal radif/qafia evidence.</w:t>
-      </w:r>
-    </w:p>
-    <w:p>
-      <w:pPr>
-        <w:widowControl/>
-        <w:spacing w:before="0" w:after="120" w:line="300" w:lineRule="auto"/>
-      </w:pPr>
-      <w:r>
-        <w:rPr>
-          <w:rFonts w:ascii="Calibri" w:hAnsi="Calibri"/>
-          <w:sz w:val="22"/>
-        </w:rPr>
-        <w:t>Read four distinctions carefully:</w:t>
+        <w:t>forward/reverse and mean MTLD at a configured TTR threshold;</w:t>
       </w:r>
     </w:p>
     <w:p>
@@ -9378,17 +9582,9 @@
       <w:r>
         <w:rPr>
           <w:rFonts w:ascii="Calibri" w:hAnsi="Calibri"/>
-          <w:b/>
-          <w:sz w:val="22"/>
-        </w:rPr>
-        <w:t>candidate</w:t>
-      </w:r>
-      <w:r>
-        <w:rPr>
-          <w:rFonts w:ascii="Calibri" w:hAnsi="Calibri"/>
-          <w:sz w:val="22"/>
-        </w:rPr>
-        <w:t xml:space="preserve"> is the highest-ranked eligible profile;</w:t>
+          <w:sz w:val="22"/>
+        </w:rPr>
+        <w:t>Unicode alphabetic-character word-length statistics and distribution;</w:t>
       </w:r>
     </w:p>
     <w:p>
@@ -9404,17 +9600,22 @@
       <w:r>
         <w:rPr>
           <w:rFonts w:ascii="Calibri" w:hAnsi="Calibri"/>
-          <w:b/>
-          <w:sz w:val="22"/>
-        </w:rPr>
-        <w:t>consistency</w:t>
-      </w:r>
-      <w:r>
-        <w:rPr>
-          <w:rFonts w:ascii="Calibri" w:hAnsi="Calibri"/>
-          <w:sz w:val="22"/>
-        </w:rPr>
-        <w:t xml:space="preserve"> is weighted agreement with available profile rules;</w:t>
+          <w:sz w:val="22"/>
+        </w:rPr>
+        <w:t>average words per nonblank physical line, average words per stanza, and</w:t>
+      </w:r>
+    </w:p>
+    <w:p>
+      <w:pPr>
+        <w:widowControl/>
+        <w:spacing w:before="0" w:after="120" w:line="300" w:lineRule="auto"/>
+      </w:pPr>
+      <w:r>
+        <w:rPr>
+          <w:rFonts w:ascii="Calibri" w:hAnsi="Calibri"/>
+          <w:sz w:val="22"/>
+        </w:rPr>
+        <w:t xml:space="preserve">  average nonblank physical lines per stanza, each with its population   standard deviation;</w:t>
       </w:r>
     </w:p>
     <w:p>
@@ -9430,17 +9631,22 @@
       <w:r>
         <w:rPr>
           <w:rFonts w:ascii="Calibri" w:hAnsi="Calibri"/>
-          <w:b/>
-          <w:sz w:val="22"/>
-        </w:rPr>
-        <w:t>evidence coverage</w:t>
-      </w:r>
-      <w:r>
-        <w:rPr>
-          <w:rFonts w:ascii="Calibri" w:hAnsi="Calibri"/>
-          <w:sz w:val="22"/>
-        </w:rPr>
-        <w:t xml:space="preserve"> is how much possible weighted evidence could be tested;</w:t>
+          <w:sz w:val="22"/>
+        </w:rPr>
+        <w:t>one lexical-token count row for every preserved physical line, including</w:t>
+      </w:r>
+    </w:p>
+    <w:p>
+      <w:pPr>
+        <w:widowControl/>
+        <w:spacing w:before="0" w:after="120" w:line="300" w:lineRule="auto"/>
+      </w:pPr>
+      <w:r>
+        <w:rPr>
+          <w:rFonts w:ascii="Calibri" w:hAnsi="Calibri"/>
+          <w:sz w:val="22"/>
+        </w:rPr>
+        <w:t xml:space="preserve">  blank separators with zero; and</w:t>
       </w:r>
     </w:p>
     <w:p>
@@ -9456,17 +9662,9 @@
       <w:r>
         <w:rPr>
           <w:rFonts w:ascii="Calibri" w:hAnsi="Calibri"/>
-          <w:b/>
-          <w:sz w:val="22"/>
-        </w:rPr>
-        <w:t>confidence</w:t>
-      </w:r>
-      <w:r>
-        <w:rPr>
-          <w:rFonts w:ascii="Calibri" w:hAnsi="Calibri"/>
-          <w:sz w:val="22"/>
-        </w:rPr>
-        <w:t xml:space="preserve"> also considers required features and separation from the</w:t>
+          <w:sz w:val="22"/>
+        </w:rPr>
+        <w:t>lexical-token and nonblank-line counts for every stanza.</w:t>
       </w:r>
     </w:p>
     <w:p>
@@ -9479,7 +9677,7 @@
           <w:rFonts w:ascii="Calibri" w:hAnsi="Calibri"/>
           <w:sz w:val="22"/>
         </w:rPr>
-        <w:t xml:space="preserve">  nearest alternative.</w:t>
+        <w:t>Defaults are MATTR window 50, HD-D sample 42, and MTLD threshold 0.72. MATTR and HD-D remain missing when the text is shorter than their configured denominator. Undefined MTLD remains missing rather than becoming infinity or zero.</w:t>
       </w:r>
     </w:p>
     <w:p>
@@ -9492,7 +9690,19 @@
           <w:rFonts w:ascii="Calibri" w:hAnsi="Calibri"/>
           <w:sz w:val="22"/>
         </w:rPr>
-        <w:t>Confidence is low, moderate, or high and is not a probability. Missing pronunciation, meter, rhyme, or syllable evidence has no feature score and lowers coverage; it is never converted to mismatch.</w:t>
+        <w:t>Safe wording is: “Using a 50-token MATTR window, the normalized observed surface forms produced MATTR = [value].” Do not treat lexical diversity or word length as proof of literary quality, vocabulary knowledge, intelligence, education, comprehension, or reader ability.</w:t>
+      </w:r>
+    </w:p>
+    <w:p>
+      <w:pPr>
+        <w:pStyle w:val="Heading2"/>
+      </w:pPr>
+      <w:r>
+        <w:rPr>
+          <w:rFonts w:ascii="Calibri" w:hAnsi="Calibri"/>
+          <w:sz w:val="22"/>
+        </w:rPr>
+        <w:t>Eight emotion associations</w:t>
       </w:r>
     </w:p>
     <w:p>
@@ -9505,7 +9715,7 @@
           <w:rFonts w:ascii="Calibri" w:hAnsi="Calibri"/>
           <w:sz w:val="22"/>
         </w:rPr>
-        <w:t>Classifications are Strict, Strongly conforming, Modified, Form-derived, Suggestive resemblance, and No inherited-form match. A candidate must pass the consistency, total-coverage, required-feature-coverage, and contradiction rules before VerseVAD calls it a potential match.</w:t>
+        <w:t>NRC Emotion values are binary, multi-label associations. VerseVAD reports the eight emotions—anger, anticipation, disgust, fear, joy, sadness, surprise, and trust—in their own section. An entry can be associated with several categories, so percentages do not need to total 100 percent. Read the labeled denominator.</w:t>
       </w:r>
     </w:p>
     <w:p>
@@ -9518,7 +9728,19 @@
           <w:rFonts w:ascii="Calibri" w:hAnsi="Calibri"/>
           <w:sz w:val="22"/>
         </w:rPr>
-        <w:t>Hover over the classification metric or read the visible information box for the traditional definition plus the poem's strongest agreements and departures. The ranking table and candidate-evidence selector retain every profile, expected and detected value, role, weight, feature score, coverage, and source module. The sources and limitations expander links to the definition sources.</w:t>
+        <w:t>“Fear-associated vocabulary” is appropriate wording. “The poem is afraid” is not.</w:t>
+      </w:r>
+    </w:p>
+    <w:p>
+      <w:pPr>
+        <w:pStyle w:val="Heading2"/>
+      </w:pPr>
+      <w:r>
+        <w:rPr>
+          <w:rFonts w:ascii="Calibri" w:hAnsi="Calibri"/>
+          <w:sz w:val="22"/>
+        </w:rPr>
+        <w:t>Positive and negative sentiment associations</w:t>
       </w:r>
     </w:p>
     <w:p>
@@ -9531,22 +9753,19 @@
           <w:rFonts w:ascii="Calibri" w:hAnsi="Calibri"/>
           <w:sz w:val="22"/>
         </w:rPr>
-        <w:t xml:space="preserve">The haiku profile is deliberately narrow. It tests an English-language 5–7–5 structural convention; it does not treat English syllables as Japanese </w:t>
-      </w:r>
-      <w:r>
-        <w:rPr>
-          <w:rFonts w:ascii="Calibri" w:hAnsi="Calibri"/>
-          <w:i/>
-          <w:sz w:val="22"/>
-        </w:rPr>
-        <w:t>on</w:t>
-      </w:r>
-      <w:r>
-        <w:rPr>
-          <w:rFonts w:ascii="Calibri" w:hAnsi="Calibri"/>
-          <w:sz w:val="22"/>
-        </w:rPr>
-        <w:t xml:space="preserve"> or claim to detect kigo, kireji, juxtaposition, or haiku identity. Ghazal semantic autonomy and optional maqta are not guessed. Sonnet volta evidence is not guessed.</w:t>
+        <w:t>Positive and negative are broad sentiment labels in NRC Emotion. VerseVAD analyzes them with the same documented occurrence-counting logic but reports them separately from the eight emotions. They are not endpoints of the VAD valence scale, and their rates need not sum to 100 percent.</w:t>
+      </w:r>
+    </w:p>
+    <w:p>
+      <w:pPr>
+        <w:pStyle w:val="Heading2"/>
+      </w:pPr>
+      <w:r>
+        <w:rPr>
+          <w:rFonts w:ascii="Calibri" w:hAnsi="Calibri"/>
+          <w:sz w:val="22"/>
+        </w:rPr>
+        <w:t>Emotion intensity</w:t>
       </w:r>
     </w:p>
     <w:p>
@@ -9559,73 +9778,7 @@
           <w:rFonts w:ascii="Calibri" w:hAnsi="Calibri"/>
           <w:sz w:val="22"/>
         </w:rPr>
-        <w:t>Safe wording is: “VerseVAD reports a modified Elizabethan-sonnet potential match with 78% consistency across 86% of the profile's weighted evidence.” Do not write: “VerseVAD proved that the poem is an Elizabethan sonnet.”</w:t>
-      </w:r>
-    </w:p>
-    <w:p>
-      <w:pPr>
-        <w:pStyle w:val="Heading2"/>
-      </w:pPr>
-      <w:r>
-        <w:rPr>
-          <w:rFonts w:ascii="Calibri" w:hAnsi="Calibri"/>
-          <w:sz w:val="22"/>
-        </w:rPr>
-        <w:t>Lexical diversity, word length, and structural word counts</w:t>
-      </w:r>
-    </w:p>
-    <w:p>
-      <w:pPr>
-        <w:widowControl/>
-        <w:spacing w:before="0" w:after="120" w:line="300" w:lineRule="auto"/>
-      </w:pPr>
-      <w:r>
-        <w:rPr>
-          <w:rFonts w:ascii="Calibri" w:hAnsi="Calibri"/>
-          <w:sz w:val="22"/>
-        </w:rPr>
-        <w:t xml:space="preserve">The optional </w:t>
-      </w:r>
-      <w:r>
-        <w:rPr>
-          <w:rFonts w:ascii="Calibri" w:hAnsi="Calibri"/>
-          <w:b/>
-          <w:sz w:val="22"/>
-        </w:rPr>
-        <w:t>Lexical Style</w:t>
-      </w:r>
-      <w:r>
-        <w:rPr>
-          <w:rFonts w:ascii="Calibri" w:hAnsi="Calibri"/>
-          <w:sz w:val="22"/>
-        </w:rPr>
-        <w:t xml:space="preserve"> module uses the shared poetry-preserving processing record and requires no external dataset. The broader planned visible-structure and syntax/lineation modules were skipped at the scholar's direction.</w:t>
-      </w:r>
-    </w:p>
-    <w:p>
-      <w:pPr>
-        <w:widowControl/>
-        <w:spacing w:before="0" w:after="120" w:line="300" w:lineRule="auto"/>
-      </w:pPr>
-      <w:r>
-        <w:rPr>
-          <w:rFonts w:ascii="Calibri" w:hAnsi="Calibri"/>
-          <w:sz w:val="22"/>
-        </w:rPr>
-        <w:t>One counted word is one shared-preprocessing lexical token. Punctuation and numeric tokens are excluded. This word unit may differ from an editor's orthographic convention for a contraction or hyphenated expression, so the token audit preserves exact surfaces, offsets, and inclusion reasons.</w:t>
-      </w:r>
-    </w:p>
-    <w:p>
-      <w:pPr>
-        <w:widowControl/>
-        <w:spacing w:before="0" w:after="120" w:line="300" w:lineRule="auto"/>
-      </w:pPr>
-      <w:r>
-        <w:rPr>
-          <w:rFonts w:ascii="Calibri" w:hAnsi="Calibri"/>
-          <w:sz w:val="22"/>
-        </w:rPr>
-        <w:t>Lexical diversity uses normalized observed surface forms. Lemmas remain separate audit evidence and never silently replace the forms present in the poem. The module reports:</w:t>
+        <w:t>NRC Emotion Intensity supplies numeric values only for particular word-emotion pairs. VerseVAD keeps:</w:t>
       </w:r>
     </w:p>
     <w:p>
@@ -9643,7 +9796,7 @@
           <w:rFonts w:ascii="Calibri" w:hAnsi="Calibri"/>
           <w:sz w:val="22"/>
         </w:rPr>
-        <w:t>descriptive lexical-token, normalized surface-type, and plain TTR values;</w:t>
+        <w:t>prevalence of matched pairs;</w:t>
       </w:r>
     </w:p>
     <w:p>
@@ -9661,7 +9814,7 @@
           <w:rFonts w:ascii="Calibri" w:hAnsi="Calibri"/>
           <w:sz w:val="22"/>
         </w:rPr>
-        <w:t>MATTR across every overlapping configured token window;</w:t>
+        <w:t>token-weighted mean intensity among supplied pairs;</w:t>
       </w:r>
     </w:p>
     <w:p>
@@ -9679,7 +9832,7 @@
           <w:rFonts w:ascii="Calibri" w:hAnsi="Calibri"/>
           <w:sz w:val="22"/>
         </w:rPr>
-        <w:t>HD-D as the expected distinct-type proportion in a configured</w:t>
+        <w:t>type-weighted mean intensity among supplied pairs.</w:t>
       </w:r>
     </w:p>
     <w:p>
@@ -9692,7 +9845,382 @@
           <w:rFonts w:ascii="Calibri" w:hAnsi="Calibri"/>
           <w:sz w:val="22"/>
         </w:rPr>
-        <w:t xml:space="preserve">  without-replacement sample;</w:t>
+        <w:t>An absent word-emotion pair is missing, not an intensity of zero.</w:t>
+      </w:r>
+    </w:p>
+    <w:p>
+      <w:pPr>
+        <w:pStyle w:val="Heading1"/>
+      </w:pPr>
+      <w:r>
+        <w:rPr>
+          <w:rFonts w:ascii="Calibri" w:hAnsi="Calibri"/>
+          <w:sz w:val="22"/>
+        </w:rPr>
+        <w:t>8. Single Poem and Other Text Workspaces</w:t>
+      </w:r>
+    </w:p>
+    <w:p>
+      <w:pPr>
+        <w:pStyle w:val="Heading2"/>
+      </w:pPr>
+      <w:r>
+        <w:rPr>
+          <w:rFonts w:ascii="Calibri" w:hAnsi="Calibri"/>
+          <w:sz w:val="22"/>
+        </w:rPr>
+        <w:t>Add a poem</w:t>
+      </w:r>
+    </w:p>
+    <w:p>
+      <w:pPr>
+        <w:widowControl/>
+        <w:spacing w:before="0" w:after="120" w:line="300" w:lineRule="auto"/>
+      </w:pPr>
+      <w:r>
+        <w:rPr>
+          <w:rFonts w:ascii="Calibri" w:hAnsi="Calibri"/>
+          <w:sz w:val="22"/>
+        </w:rPr>
+        <w:t xml:space="preserve">Paste text or upload one UTF-8 </w:t>
+      </w:r>
+      <w:r>
+        <w:rPr>
+          <w:rFonts w:ascii="Consolas" w:hAnsi="Consolas"/>
+          <w:color w:val="1F4D78"/>
+          <w:sz w:val="19"/>
+        </w:rPr>
+        <w:t>.txt</w:t>
+      </w:r>
+      <w:r>
+        <w:rPr>
+          <w:rFonts w:ascii="Calibri" w:hAnsi="Calibri"/>
+          <w:sz w:val="22"/>
+        </w:rPr>
+        <w:t xml:space="preserve"> file up to 5 MB. Enter a title or working label. Optional author, date/year, and source/edition notes are available under bibliographic metadata. The live word, physical-line, and text-block counts are orientation only; the actual analysis uses the shared linguistic tokenizer. </w:t>
+      </w:r>
+      <w:r>
+        <w:rPr>
+          <w:rFonts w:ascii="Calibri" w:hAnsi="Calibri"/>
+          <w:b/>
+          <w:sz w:val="22"/>
+        </w:rPr>
+        <w:t>Clear text</w:t>
+      </w:r>
+      <w:r>
+        <w:rPr>
+          <w:rFonts w:ascii="Calibri" w:hAnsi="Calibri"/>
+          <w:sz w:val="22"/>
+        </w:rPr>
+        <w:t xml:space="preserve"> requires confirmation. The optional workspace name labels the temporary session but does not create a persistent corpus project.</w:t>
+      </w:r>
+    </w:p>
+    <w:p>
+      <w:pPr>
+        <w:widowControl/>
+        <w:spacing w:before="0" w:after="120" w:line="300" w:lineRule="auto"/>
+      </w:pPr>
+      <w:r>
+        <w:rPr>
+          <w:rFonts w:ascii="Calibri" w:hAnsi="Calibri"/>
+          <w:b/>
+          <w:sz w:val="22"/>
+        </w:rPr>
+        <w:t>Other Text</w:t>
+      </w:r>
+      <w:r>
+        <w:rPr>
+          <w:rFonts w:ascii="Calibri" w:hAnsi="Calibri"/>
+          <w:sz w:val="22"/>
+        </w:rPr>
+        <w:t xml:space="preserve"> reuses this interface and the same analysis engines with </w:t>
+      </w:r>
+      <w:r>
+        <w:rPr>
+          <w:rFonts w:ascii="Calibri" w:hAnsi="Calibri"/>
+          <w:b/>
+          <w:sz w:val="22"/>
+        </w:rPr>
+        <w:t>Analyze Text</w:t>
+      </w:r>
+      <w:r>
+        <w:rPr>
+          <w:rFonts w:ascii="Calibri" w:hAnsi="Calibri"/>
+          <w:sz w:val="22"/>
+        </w:rPr>
+        <w:t xml:space="preserve"> terminology. Pronunciation, meter, and rhyme remain available, but meter and rhyme are visibly marked experimental for non-lineated prose.</w:t>
+      </w:r>
+    </w:p>
+    <w:p>
+      <w:pPr>
+        <w:pStyle w:val="Heading2"/>
+      </w:pPr>
+      <w:r>
+        <w:rPr>
+          <w:rFonts w:ascii="Calibri" w:hAnsi="Calibri"/>
+          <w:sz w:val="22"/>
+        </w:rPr>
+        <w:t>Choose evidence</w:t>
+      </w:r>
+    </w:p>
+    <w:p>
+      <w:pPr>
+        <w:widowControl/>
+        <w:spacing w:before="0" w:after="120" w:line="300" w:lineRule="auto"/>
+      </w:pPr>
+      <w:r>
+        <w:rPr>
+          <w:rFonts w:ascii="Calibri" w:hAnsi="Calibri"/>
+          <w:sz w:val="22"/>
+        </w:rPr>
+        <w:t xml:space="preserve">Select one or more affective lexicons and/or enable the optional normative lexical concreteness, SUBTLEX-US frequency, Kuperman Age of Acquisition, CMUdict pronunciation/prosody-foundation, candidate-meter, rhyme/sound, Lexical Style, PoetryID, or Inherited Form Analysis modules. The controls are grouped as </w:t>
+      </w:r>
+      <w:r>
+        <w:rPr>
+          <w:rFonts w:ascii="Calibri" w:hAnsi="Calibri"/>
+          <w:b/>
+          <w:sz w:val="22"/>
+        </w:rPr>
+        <w:t>Core Analysis</w:t>
+      </w:r>
+      <w:r>
+        <w:rPr>
+          <w:rFonts w:ascii="Calibri" w:hAnsi="Calibri"/>
+          <w:sz w:val="22"/>
+        </w:rPr>
+        <w:t xml:space="preserve">, </w:t>
+      </w:r>
+      <w:r>
+        <w:rPr>
+          <w:rFonts w:ascii="Calibri" w:hAnsi="Calibri"/>
+          <w:b/>
+          <w:sz w:val="22"/>
+        </w:rPr>
+        <w:t>Lexical Character</w:t>
+      </w:r>
+      <w:r>
+        <w:rPr>
+          <w:rFonts w:ascii="Calibri" w:hAnsi="Calibri"/>
+          <w:sz w:val="22"/>
+        </w:rPr>
+        <w:t xml:space="preserve">, </w:t>
+      </w:r>
+      <w:r>
+        <w:rPr>
+          <w:rFonts w:ascii="Calibri" w:hAnsi="Calibri"/>
+          <w:b/>
+          <w:sz w:val="22"/>
+        </w:rPr>
+        <w:t>Structural and Lexical Measures</w:t>
+      </w:r>
+      <w:r>
+        <w:rPr>
+          <w:rFonts w:ascii="Calibri" w:hAnsi="Calibri"/>
+          <w:sz w:val="22"/>
+        </w:rPr>
+        <w:t xml:space="preserve">, </w:t>
+      </w:r>
+      <w:r>
+        <w:rPr>
+          <w:rFonts w:ascii="Calibri" w:hAnsi="Calibri"/>
+          <w:b/>
+          <w:sz w:val="22"/>
+        </w:rPr>
+        <w:t>PoetryID</w:t>
+      </w:r>
+      <w:r>
+        <w:rPr>
+          <w:rFonts w:ascii="Calibri" w:hAnsi="Calibri"/>
+          <w:sz w:val="22"/>
+        </w:rPr>
+        <w:t xml:space="preserve">, and </w:t>
+      </w:r>
+      <w:r>
+        <w:rPr>
+          <w:rFonts w:ascii="Calibri" w:hAnsi="Calibri"/>
+          <w:b/>
+          <w:sz w:val="22"/>
+        </w:rPr>
+        <w:t>Sound and Form</w:t>
+      </w:r>
+      <w:r>
+        <w:rPr>
+          <w:rFonts w:ascii="Calibri" w:hAnsi="Calibri"/>
+          <w:sz w:val="22"/>
+        </w:rPr>
+        <w:t>.</w:t>
+      </w:r>
+    </w:p>
+    <w:p>
+      <w:pPr>
+        <w:widowControl/>
+        <w:spacing w:before="0" w:after="120" w:line="300" w:lineRule="auto"/>
+      </w:pPr>
+      <w:r>
+        <w:rPr>
+          <w:rFonts w:ascii="Calibri" w:hAnsi="Calibri"/>
+          <w:sz w:val="22"/>
+        </w:rPr>
+        <w:t xml:space="preserve">The optional </w:t>
+      </w:r>
+      <w:r>
+        <w:rPr>
+          <w:rFonts w:ascii="Calibri" w:hAnsi="Calibri"/>
+          <w:b/>
+          <w:sz w:val="22"/>
+        </w:rPr>
+        <w:t>Essential</w:t>
+      </w:r>
+      <w:r>
+        <w:rPr>
+          <w:rFonts w:ascii="Calibri" w:hAnsi="Calibri"/>
+          <w:sz w:val="22"/>
+        </w:rPr>
+        <w:t xml:space="preserve">, </w:t>
+      </w:r>
+      <w:r>
+        <w:rPr>
+          <w:rFonts w:ascii="Calibri" w:hAnsi="Calibri"/>
+          <w:b/>
+          <w:sz w:val="22"/>
+        </w:rPr>
+        <w:t>Literary</w:t>
+      </w:r>
+      <w:r>
+        <w:rPr>
+          <w:rFonts w:ascii="Calibri" w:hAnsi="Calibri"/>
+          <w:sz w:val="22"/>
+        </w:rPr>
+        <w:t xml:space="preserve">, </w:t>
+      </w:r>
+      <w:r>
+        <w:rPr>
+          <w:rFonts w:ascii="Calibri" w:hAnsi="Calibri"/>
+          <w:b/>
+          <w:sz w:val="22"/>
+        </w:rPr>
+        <w:t>Sound and Form</w:t>
+      </w:r>
+      <w:r>
+        <w:rPr>
+          <w:rFonts w:ascii="Calibri" w:hAnsi="Calibri"/>
+          <w:sz w:val="22"/>
+        </w:rPr>
+        <w:t xml:space="preserve">, and </w:t>
+      </w:r>
+      <w:r>
+        <w:rPr>
+          <w:rFonts w:ascii="Calibri" w:hAnsi="Calibri"/>
+          <w:b/>
+          <w:sz w:val="22"/>
+        </w:rPr>
+        <w:t>Complete</w:t>
+      </w:r>
+      <w:r>
+        <w:rPr>
+          <w:rFonts w:ascii="Calibri" w:hAnsi="Calibri"/>
+          <w:sz w:val="22"/>
+        </w:rPr>
+        <w:t xml:space="preserve"> presets change module selections only after </w:t>
+      </w:r>
+      <w:r>
+        <w:rPr>
+          <w:rFonts w:ascii="Calibri" w:hAnsi="Calibri"/>
+          <w:b/>
+          <w:sz w:val="22"/>
+        </w:rPr>
+        <w:t>Apply preset</w:t>
+      </w:r>
+      <w:r>
+        <w:rPr>
+          <w:rFonts w:ascii="Calibri" w:hAnsi="Calibri"/>
+          <w:sz w:val="22"/>
+        </w:rPr>
+        <w:t xml:space="preserve"> is clicked. </w:t>
+      </w:r>
+      <w:r>
+        <w:rPr>
+          <w:rFonts w:ascii="Calibri" w:hAnsi="Calibri"/>
+          <w:b/>
+          <w:sz w:val="22"/>
+        </w:rPr>
+        <w:t>Custom</w:t>
+      </w:r>
+      <w:r>
+        <w:rPr>
+          <w:rFonts w:ascii="Calibri" w:hAnsi="Calibri"/>
+          <w:sz w:val="22"/>
+        </w:rPr>
+        <w:t xml:space="preserve"> retains the current manual selection. Presets never overwrite advanced thresholds, filtering, phrase policy, stopwords, pronunciation overrides, or other methodology.</w:t>
+      </w:r>
+    </w:p>
+    <w:p>
+      <w:pPr>
+        <w:widowControl/>
+        <w:spacing w:before="0" w:after="120" w:line="300" w:lineRule="auto"/>
+      </w:pPr>
+      <w:r>
+        <w:rPr>
+          <w:rFonts w:ascii="Calibri" w:hAnsi="Calibri"/>
+          <w:sz w:val="22"/>
+        </w:rPr>
+        <w:t>VAD, categorical association, intensity, concreteness, corpus-relative frequency, retrospective lexical AoA, dictionary pronunciation/lexical stress, configured meter fit, rhyme/sound evidence, lexical diversity/word counts, and PoetryID candidate profiles, and inherited-form resemblance answer different questions and remain separate. PoetryID requires an enabled VAD source and reuses its completed result; selecting meter or rhyme automatically runs its pronunciation dependency. Inherited Form Analysis automatically reuses pronunciation, meter, and graded rhyme evidence without independently rescanning the poem.</w:t>
+      </w:r>
+    </w:p>
+    <w:p>
+      <w:pPr>
+        <w:widowControl/>
+        <w:spacing w:before="0" w:after="120" w:line="300" w:lineRule="auto"/>
+      </w:pPr>
+      <w:r>
+        <w:rPr>
+          <w:rFonts w:ascii="Calibri" w:hAnsi="Calibri"/>
+          <w:sz w:val="22"/>
+        </w:rPr>
+        <w:t xml:space="preserve">The same nine optional modules are also available in </w:t>
+      </w:r>
+      <w:r>
+        <w:rPr>
+          <w:rFonts w:ascii="Calibri" w:hAnsi="Calibri"/>
+          <w:b/>
+          <w:sz w:val="22"/>
+        </w:rPr>
+        <w:t>Project / Corpus</w:t>
+      </w:r>
+      <w:r>
+        <w:rPr>
+          <w:rFonts w:ascii="Calibri" w:hAnsi="Calibri"/>
+          <w:sz w:val="22"/>
+        </w:rPr>
+        <w:t>. Single Poem and Other Text results remain temporary unless downloaded; corpus runs persist the same module result envelopes, configurations, coverage, warnings, provenance, and audit artifacts against exact text versions.</w:t>
+      </w:r>
+    </w:p>
+    <w:p>
+      <w:pPr>
+        <w:widowControl/>
+        <w:spacing w:before="0" w:after="120" w:line="300" w:lineRule="auto"/>
+      </w:pPr>
+      <w:r>
+        <w:rPr>
+          <w:rFonts w:ascii="Calibri" w:hAnsi="Calibri"/>
+          <w:sz w:val="22"/>
+        </w:rPr>
+        <w:t xml:space="preserve">Under </w:t>
+      </w:r>
+      <w:r>
+        <w:rPr>
+          <w:rFonts w:ascii="Calibri" w:hAnsi="Calibri"/>
+          <w:b/>
+          <w:sz w:val="22"/>
+        </w:rPr>
+        <w:t>Analysis configuration and methodology</w:t>
+      </w:r>
+      <w:r>
+        <w:rPr>
+          <w:rFonts w:ascii="Calibri" w:hAnsi="Calibri"/>
+          <w:sz w:val="22"/>
+        </w:rPr>
+        <w:t>, choose:</w:t>
       </w:r>
     </w:p>
     <w:p>
@@ -9710,7 +10238,7 @@
           <w:rFonts w:ascii="Calibri" w:hAnsi="Calibri"/>
           <w:sz w:val="22"/>
         </w:rPr>
-        <w:t>forward/reverse and mean MTLD at a configured TTR threshold;</w:t>
+        <w:t>phrase policy;</w:t>
       </w:r>
     </w:p>
     <w:p>
@@ -9728,7 +10256,7 @@
           <w:rFonts w:ascii="Calibri" w:hAnsi="Calibri"/>
           <w:sz w:val="22"/>
         </w:rPr>
-        <w:t>Unicode alphabetic-character word-length statistics and distribution;</w:t>
+        <w:t>minimum matched observations for sparse-result warnings;</w:t>
       </w:r>
     </w:p>
     <w:p>
@@ -9746,20 +10274,7 @@
           <w:rFonts w:ascii="Calibri" w:hAnsi="Calibri"/>
           <w:sz w:val="22"/>
         </w:rPr>
-        <w:t>average words per nonblank physical line, average words per stanza, and</w:t>
-      </w:r>
-    </w:p>
-    <w:p>
-      <w:pPr>
-        <w:widowControl/>
-        <w:spacing w:before="0" w:after="120" w:line="300" w:lineRule="auto"/>
-      </w:pPr>
-      <w:r>
-        <w:rPr>
-          <w:rFonts w:ascii="Calibri" w:hAnsi="Calibri"/>
-          <w:sz w:val="22"/>
-        </w:rPr>
-        <w:t xml:space="preserve">  average nonblank physical lines per stanza, each with its population   standard deviation;</w:t>
+        <w:t>whether to display all-matched results;</w:t>
       </w:r>
     </w:p>
     <w:p>
@@ -9777,20 +10292,7 @@
           <w:rFonts w:ascii="Calibri" w:hAnsi="Calibri"/>
           <w:sz w:val="22"/>
         </w:rPr>
-        <w:t>one lexical-token count row for every preserved physical line, including</w:t>
-      </w:r>
-    </w:p>
-    <w:p>
-      <w:pPr>
-        <w:widowControl/>
-        <w:spacing w:before="0" w:after="120" w:line="300" w:lineRule="auto"/>
-      </w:pPr>
-      <w:r>
-        <w:rPr>
-          <w:rFonts w:ascii="Calibri" w:hAnsi="Calibri"/>
-          <w:sz w:val="22"/>
-        </w:rPr>
-        <w:t xml:space="preserve">  blank separators with zero; and</w:t>
+        <w:t>whether to display stopword-excluded results;</w:t>
       </w:r>
     </w:p>
     <w:p>
@@ -9808,121 +10310,7 @@
           <w:rFonts w:ascii="Calibri" w:hAnsi="Calibri"/>
           <w:sz w:val="22"/>
         </w:rPr>
-        <w:t>lexical-token and nonblank-line counts for every stanza.</w:t>
-      </w:r>
-    </w:p>
-    <w:p>
-      <w:pPr>
-        <w:widowControl/>
-        <w:spacing w:before="0" w:after="120" w:line="300" w:lineRule="auto"/>
-      </w:pPr>
-      <w:r>
-        <w:rPr>
-          <w:rFonts w:ascii="Calibri" w:hAnsi="Calibri"/>
-          <w:sz w:val="22"/>
-        </w:rPr>
-        <w:t>Defaults are MATTR window 50, HD-D sample 42, and MTLD threshold 0.72. MATTR and HD-D remain missing when the text is shorter than their configured denominator. Undefined MTLD remains missing rather than becoming infinity or zero.</w:t>
-      </w:r>
-    </w:p>
-    <w:p>
-      <w:pPr>
-        <w:widowControl/>
-        <w:spacing w:before="0" w:after="120" w:line="300" w:lineRule="auto"/>
-      </w:pPr>
-      <w:r>
-        <w:rPr>
-          <w:rFonts w:ascii="Calibri" w:hAnsi="Calibri"/>
-          <w:sz w:val="22"/>
-        </w:rPr>
-        <w:t>Safe wording is: “Using a 50-token MATTR window, the normalized observed surface forms produced MATTR = [value].” Do not treat lexical diversity or word length as proof of literary quality, vocabulary knowledge, intelligence, education, comprehension, or reader ability.</w:t>
-      </w:r>
-    </w:p>
-    <w:p>
-      <w:pPr>
-        <w:pStyle w:val="Heading2"/>
-      </w:pPr>
-      <w:r>
-        <w:rPr>
-          <w:rFonts w:ascii="Calibri" w:hAnsi="Calibri"/>
-          <w:sz w:val="22"/>
-        </w:rPr>
-        <w:t>Eight emotion associations</w:t>
-      </w:r>
-    </w:p>
-    <w:p>
-      <w:pPr>
-        <w:widowControl/>
-        <w:spacing w:before="0" w:after="120" w:line="300" w:lineRule="auto"/>
-      </w:pPr>
-      <w:r>
-        <w:rPr>
-          <w:rFonts w:ascii="Calibri" w:hAnsi="Calibri"/>
-          <w:sz w:val="22"/>
-        </w:rPr>
-        <w:t>NRC Emotion values are binary, multi-label associations. VerseVAD reports the eight emotions—anger, anticipation, disgust, fear, joy, sadness, surprise, and trust—in their own section. An entry can be associated with several categories, so percentages do not need to total 100 percent. Read the labeled denominator.</w:t>
-      </w:r>
-    </w:p>
-    <w:p>
-      <w:pPr>
-        <w:widowControl/>
-        <w:spacing w:before="0" w:after="120" w:line="300" w:lineRule="auto"/>
-      </w:pPr>
-      <w:r>
-        <w:rPr>
-          <w:rFonts w:ascii="Calibri" w:hAnsi="Calibri"/>
-          <w:sz w:val="22"/>
-        </w:rPr>
-        <w:t>“Fear-associated vocabulary” is appropriate wording. “The poem is afraid” is not.</w:t>
-      </w:r>
-    </w:p>
-    <w:p>
-      <w:pPr>
-        <w:pStyle w:val="Heading2"/>
-      </w:pPr>
-      <w:r>
-        <w:rPr>
-          <w:rFonts w:ascii="Calibri" w:hAnsi="Calibri"/>
-          <w:sz w:val="22"/>
-        </w:rPr>
-        <w:t>Positive and negative sentiment associations</w:t>
-      </w:r>
-    </w:p>
-    <w:p>
-      <w:pPr>
-        <w:widowControl/>
-        <w:spacing w:before="0" w:after="120" w:line="300" w:lineRule="auto"/>
-      </w:pPr>
-      <w:r>
-        <w:rPr>
-          <w:rFonts w:ascii="Calibri" w:hAnsi="Calibri"/>
-          <w:sz w:val="22"/>
-        </w:rPr>
-        <w:t>Positive and negative are broad sentiment labels in NRC Emotion. VerseVAD analyzes them with the same documented occurrence-counting logic but reports them separately from the eight emotions. They are not endpoints of the VAD valence scale, and their rates need not sum to 100 percent.</w:t>
-      </w:r>
-    </w:p>
-    <w:p>
-      <w:pPr>
-        <w:pStyle w:val="Heading2"/>
-      </w:pPr>
-      <w:r>
-        <w:rPr>
-          <w:rFonts w:ascii="Calibri" w:hAnsi="Calibri"/>
-          <w:sz w:val="22"/>
-        </w:rPr>
-        <w:t>Emotion intensity</w:t>
-      </w:r>
-    </w:p>
-    <w:p>
-      <w:pPr>
-        <w:widowControl/>
-        <w:spacing w:before="0" w:after="120" w:line="300" w:lineRule="auto"/>
-      </w:pPr>
-      <w:r>
-        <w:rPr>
-          <w:rFonts w:ascii="Calibri" w:hAnsi="Calibri"/>
-          <w:sz w:val="22"/>
-        </w:rPr>
-        <w:t>NRC Emotion Intensity supplies numeric values only for particular word-emotion pairs. VerseVAD keeps:</w:t>
+        <w:t>concreteness lower and upper orientation thresholds;</w:t>
       </w:r>
     </w:p>
     <w:p>
@@ -9940,7 +10328,7 @@
           <w:rFonts w:ascii="Calibri" w:hAnsi="Calibri"/>
           <w:sz w:val="22"/>
         </w:rPr>
-        <w:t>prevalence of matched pairs;</w:t>
+        <w:t>whether concreteness excludes model-tagged proper nouns;</w:t>
       </w:r>
     </w:p>
     <w:p>
@@ -9958,7 +10346,7 @@
           <w:rFonts w:ascii="Calibri" w:hAnsi="Calibri"/>
           <w:sz w:val="22"/>
         </w:rPr>
-        <w:t>token-weighted mean intensity among supplied pairs;</w:t>
+        <w:t>whether source-supplied concreteness phrases are activated; and</w:t>
       </w:r>
     </w:p>
     <w:p>
@@ -9976,395 +10364,7 @@
           <w:rFonts w:ascii="Calibri" w:hAnsi="Calibri"/>
           <w:sz w:val="22"/>
         </w:rPr>
-        <w:t>type-weighted mean intensity among supplied pairs.</w:t>
-      </w:r>
-    </w:p>
-    <w:p>
-      <w:pPr>
-        <w:widowControl/>
-        <w:spacing w:before="0" w:after="120" w:line="300" w:lineRule="auto"/>
-      </w:pPr>
-      <w:r>
-        <w:rPr>
-          <w:rFonts w:ascii="Calibri" w:hAnsi="Calibri"/>
-          <w:sz w:val="22"/>
-        </w:rPr>
-        <w:t>An absent word-emotion pair is missing, not an intensity of zero.</w:t>
-      </w:r>
-    </w:p>
-    <w:p>
-      <w:pPr>
-        <w:pStyle w:val="Heading1"/>
-      </w:pPr>
-      <w:r>
-        <w:rPr>
-          <w:rFonts w:ascii="Calibri" w:hAnsi="Calibri"/>
-          <w:sz w:val="22"/>
-        </w:rPr>
-        <w:t>8. Single Poem and Other Text Workspaces</w:t>
-      </w:r>
-    </w:p>
-    <w:p>
-      <w:pPr>
-        <w:pStyle w:val="Heading2"/>
-      </w:pPr>
-      <w:r>
-        <w:rPr>
-          <w:rFonts w:ascii="Calibri" w:hAnsi="Calibri"/>
-          <w:sz w:val="22"/>
-        </w:rPr>
-        <w:t>Add a poem</w:t>
-      </w:r>
-    </w:p>
-    <w:p>
-      <w:pPr>
-        <w:widowControl/>
-        <w:spacing w:before="0" w:after="120" w:line="300" w:lineRule="auto"/>
-      </w:pPr>
-      <w:r>
-        <w:rPr>
-          <w:rFonts w:ascii="Calibri" w:hAnsi="Calibri"/>
-          <w:sz w:val="22"/>
-        </w:rPr>
-        <w:t xml:space="preserve">Paste text or upload one UTF-8 </w:t>
-      </w:r>
-      <w:r>
-        <w:rPr>
-          <w:rFonts w:ascii="Consolas" w:hAnsi="Consolas"/>
-          <w:color w:val="1F4D78"/>
-          <w:sz w:val="19"/>
-        </w:rPr>
-        <w:t>.txt</w:t>
-      </w:r>
-      <w:r>
-        <w:rPr>
-          <w:rFonts w:ascii="Calibri" w:hAnsi="Calibri"/>
-          <w:sz w:val="22"/>
-        </w:rPr>
-        <w:t xml:space="preserve"> file up to 5 MB. Enter a title or working label. Optional author, date/year, and source/edition notes are available under bibliographic metadata. The live word, physical-line, and text-block counts are orientation only; the actual analysis uses the shared linguistic tokenizer. </w:t>
-      </w:r>
-      <w:r>
-        <w:rPr>
-          <w:rFonts w:ascii="Calibri" w:hAnsi="Calibri"/>
-          <w:b/>
-          <w:sz w:val="22"/>
-        </w:rPr>
-        <w:t>Clear text</w:t>
-      </w:r>
-      <w:r>
-        <w:rPr>
-          <w:rFonts w:ascii="Calibri" w:hAnsi="Calibri"/>
-          <w:sz w:val="22"/>
-        </w:rPr>
-        <w:t xml:space="preserve"> requires confirmation. The optional workspace name labels the temporary session but does not create a persistent corpus project.</w:t>
-      </w:r>
-    </w:p>
-    <w:p>
-      <w:pPr>
-        <w:widowControl/>
-        <w:spacing w:before="0" w:after="120" w:line="300" w:lineRule="auto"/>
-      </w:pPr>
-      <w:r>
-        <w:rPr>
-          <w:rFonts w:ascii="Calibri" w:hAnsi="Calibri"/>
-          <w:b/>
-          <w:sz w:val="22"/>
-        </w:rPr>
-        <w:t>Other Text</w:t>
-      </w:r>
-      <w:r>
-        <w:rPr>
-          <w:rFonts w:ascii="Calibri" w:hAnsi="Calibri"/>
-          <w:sz w:val="22"/>
-        </w:rPr>
-        <w:t xml:space="preserve"> reuses this interface and the same analysis engines with </w:t>
-      </w:r>
-      <w:r>
-        <w:rPr>
-          <w:rFonts w:ascii="Calibri" w:hAnsi="Calibri"/>
-          <w:b/>
-          <w:sz w:val="22"/>
-        </w:rPr>
-        <w:t>Analyze Text</w:t>
-      </w:r>
-      <w:r>
-        <w:rPr>
-          <w:rFonts w:ascii="Calibri" w:hAnsi="Calibri"/>
-          <w:sz w:val="22"/>
-        </w:rPr>
-        <w:t xml:space="preserve"> terminology. Pronunciation, meter, and rhyme remain available, but meter and rhyme are visibly marked experimental for non-lineated prose.</w:t>
-      </w:r>
-    </w:p>
-    <w:p>
-      <w:pPr>
-        <w:pStyle w:val="Heading2"/>
-      </w:pPr>
-      <w:r>
-        <w:rPr>
-          <w:rFonts w:ascii="Calibri" w:hAnsi="Calibri"/>
-          <w:sz w:val="22"/>
-        </w:rPr>
-        <w:t>Choose evidence</w:t>
-      </w:r>
-    </w:p>
-    <w:p>
-      <w:pPr>
-        <w:widowControl/>
-        <w:spacing w:before="0" w:after="120" w:line="300" w:lineRule="auto"/>
-      </w:pPr>
-      <w:r>
-        <w:rPr>
-          <w:rFonts w:ascii="Calibri" w:hAnsi="Calibri"/>
-          <w:sz w:val="22"/>
-        </w:rPr>
-        <w:t xml:space="preserve">Select one or more affective lexicons and/or enable the optional normative lexical concreteness, SUBTLEX-US frequency, Kuperman Age of Acquisition, CMUdict pronunciation/prosody-foundation, candidate-meter, rhyme/sound, Lexical Style, PoetryID, or Inherited Form Analysis modules. The controls are grouped as </w:t>
-      </w:r>
-      <w:r>
-        <w:rPr>
-          <w:rFonts w:ascii="Calibri" w:hAnsi="Calibri"/>
-          <w:b/>
-          <w:sz w:val="22"/>
-        </w:rPr>
-        <w:t>Core Analysis</w:t>
-      </w:r>
-      <w:r>
-        <w:rPr>
-          <w:rFonts w:ascii="Calibri" w:hAnsi="Calibri"/>
-          <w:sz w:val="22"/>
-        </w:rPr>
-        <w:t xml:space="preserve">, </w:t>
-      </w:r>
-      <w:r>
-        <w:rPr>
-          <w:rFonts w:ascii="Calibri" w:hAnsi="Calibri"/>
-          <w:b/>
-          <w:sz w:val="22"/>
-        </w:rPr>
-        <w:t>Lexical Character</w:t>
-      </w:r>
-      <w:r>
-        <w:rPr>
-          <w:rFonts w:ascii="Calibri" w:hAnsi="Calibri"/>
-          <w:sz w:val="22"/>
-        </w:rPr>
-        <w:t xml:space="preserve">, </w:t>
-      </w:r>
-      <w:r>
-        <w:rPr>
-          <w:rFonts w:ascii="Calibri" w:hAnsi="Calibri"/>
-          <w:b/>
-          <w:sz w:val="22"/>
-        </w:rPr>
-        <w:t>Structural and Lexical Measures</w:t>
-      </w:r>
-      <w:r>
-        <w:rPr>
-          <w:rFonts w:ascii="Calibri" w:hAnsi="Calibri"/>
-          <w:sz w:val="22"/>
-        </w:rPr>
-        <w:t xml:space="preserve">, </w:t>
-      </w:r>
-      <w:r>
-        <w:rPr>
-          <w:rFonts w:ascii="Calibri" w:hAnsi="Calibri"/>
-          <w:b/>
-          <w:sz w:val="22"/>
-        </w:rPr>
-        <w:t>PoetryID</w:t>
-      </w:r>
-      <w:r>
-        <w:rPr>
-          <w:rFonts w:ascii="Calibri" w:hAnsi="Calibri"/>
-          <w:sz w:val="22"/>
-        </w:rPr>
-        <w:t xml:space="preserve">, and </w:t>
-      </w:r>
-      <w:r>
-        <w:rPr>
-          <w:rFonts w:ascii="Calibri" w:hAnsi="Calibri"/>
-          <w:b/>
-          <w:sz w:val="22"/>
-        </w:rPr>
-        <w:t>Sound and Form</w:t>
-      </w:r>
-      <w:r>
-        <w:rPr>
-          <w:rFonts w:ascii="Calibri" w:hAnsi="Calibri"/>
-          <w:sz w:val="22"/>
-        </w:rPr>
-        <w:t>.</w:t>
-      </w:r>
-    </w:p>
-    <w:p>
-      <w:pPr>
-        <w:widowControl/>
-        <w:spacing w:before="0" w:after="120" w:line="300" w:lineRule="auto"/>
-      </w:pPr>
-      <w:r>
-        <w:rPr>
-          <w:rFonts w:ascii="Calibri" w:hAnsi="Calibri"/>
-          <w:sz w:val="22"/>
-        </w:rPr>
-        <w:t xml:space="preserve">The optional </w:t>
-      </w:r>
-      <w:r>
-        <w:rPr>
-          <w:rFonts w:ascii="Calibri" w:hAnsi="Calibri"/>
-          <w:b/>
-          <w:sz w:val="22"/>
-        </w:rPr>
-        <w:t>Essential</w:t>
-      </w:r>
-      <w:r>
-        <w:rPr>
-          <w:rFonts w:ascii="Calibri" w:hAnsi="Calibri"/>
-          <w:sz w:val="22"/>
-        </w:rPr>
-        <w:t xml:space="preserve">, </w:t>
-      </w:r>
-      <w:r>
-        <w:rPr>
-          <w:rFonts w:ascii="Calibri" w:hAnsi="Calibri"/>
-          <w:b/>
-          <w:sz w:val="22"/>
-        </w:rPr>
-        <w:t>Literary</w:t>
-      </w:r>
-      <w:r>
-        <w:rPr>
-          <w:rFonts w:ascii="Calibri" w:hAnsi="Calibri"/>
-          <w:sz w:val="22"/>
-        </w:rPr>
-        <w:t xml:space="preserve">, </w:t>
-      </w:r>
-      <w:r>
-        <w:rPr>
-          <w:rFonts w:ascii="Calibri" w:hAnsi="Calibri"/>
-          <w:b/>
-          <w:sz w:val="22"/>
-        </w:rPr>
-        <w:t>Sound and Form</w:t>
-      </w:r>
-      <w:r>
-        <w:rPr>
-          <w:rFonts w:ascii="Calibri" w:hAnsi="Calibri"/>
-          <w:sz w:val="22"/>
-        </w:rPr>
-        <w:t xml:space="preserve">, and </w:t>
-      </w:r>
-      <w:r>
-        <w:rPr>
-          <w:rFonts w:ascii="Calibri" w:hAnsi="Calibri"/>
-          <w:b/>
-          <w:sz w:val="22"/>
-        </w:rPr>
-        <w:t>Complete</w:t>
-      </w:r>
-      <w:r>
-        <w:rPr>
-          <w:rFonts w:ascii="Calibri" w:hAnsi="Calibri"/>
-          <w:sz w:val="22"/>
-        </w:rPr>
-        <w:t xml:space="preserve"> presets change module selections only after </w:t>
-      </w:r>
-      <w:r>
-        <w:rPr>
-          <w:rFonts w:ascii="Calibri" w:hAnsi="Calibri"/>
-          <w:b/>
-          <w:sz w:val="22"/>
-        </w:rPr>
-        <w:t>Apply preset</w:t>
-      </w:r>
-      <w:r>
-        <w:rPr>
-          <w:rFonts w:ascii="Calibri" w:hAnsi="Calibri"/>
-          <w:sz w:val="22"/>
-        </w:rPr>
-        <w:t xml:space="preserve"> is clicked. </w:t>
-      </w:r>
-      <w:r>
-        <w:rPr>
-          <w:rFonts w:ascii="Calibri" w:hAnsi="Calibri"/>
-          <w:b/>
-          <w:sz w:val="22"/>
-        </w:rPr>
-        <w:t>Custom</w:t>
-      </w:r>
-      <w:r>
-        <w:rPr>
-          <w:rFonts w:ascii="Calibri" w:hAnsi="Calibri"/>
-          <w:sz w:val="22"/>
-        </w:rPr>
-        <w:t xml:space="preserve"> retains the current manual selection. Presets never overwrite advanced thresholds, filtering, phrase policy, stopwords, pronunciation overrides, or other methodology.</w:t>
-      </w:r>
-    </w:p>
-    <w:p>
-      <w:pPr>
-        <w:widowControl/>
-        <w:spacing w:before="0" w:after="120" w:line="300" w:lineRule="auto"/>
-      </w:pPr>
-      <w:r>
-        <w:rPr>
-          <w:rFonts w:ascii="Calibri" w:hAnsi="Calibri"/>
-          <w:sz w:val="22"/>
-        </w:rPr>
-        <w:t>VAD, categorical association, intensity, concreteness, corpus-relative frequency, retrospective lexical AoA, dictionary pronunciation/lexical stress, configured meter fit, rhyme/sound evidence, lexical diversity/word counts, and PoetryID candidate profiles, and inherited-form resemblance answer different questions and remain separate. PoetryID requires an enabled VAD source and reuses its completed result; selecting meter or rhyme automatically runs its pronunciation dependency. Inherited Form Analysis automatically reuses pronunciation, meter, and graded rhyme evidence without independently rescanning the poem.</w:t>
-      </w:r>
-    </w:p>
-    <w:p>
-      <w:pPr>
-        <w:widowControl/>
-        <w:spacing w:before="0" w:after="120" w:line="300" w:lineRule="auto"/>
-      </w:pPr>
-      <w:r>
-        <w:rPr>
-          <w:rFonts w:ascii="Calibri" w:hAnsi="Calibri"/>
-          <w:sz w:val="22"/>
-        </w:rPr>
-        <w:t xml:space="preserve">The same nine optional modules are also available in </w:t>
-      </w:r>
-      <w:r>
-        <w:rPr>
-          <w:rFonts w:ascii="Calibri" w:hAnsi="Calibri"/>
-          <w:b/>
-          <w:sz w:val="22"/>
-        </w:rPr>
-        <w:t>Project / Corpus</w:t>
-      </w:r>
-      <w:r>
-        <w:rPr>
-          <w:rFonts w:ascii="Calibri" w:hAnsi="Calibri"/>
-          <w:sz w:val="22"/>
-        </w:rPr>
-        <w:t>. Single Poem and Other Text results remain temporary unless downloaded; corpus runs persist the same module result envelopes, configurations, coverage, warnings, provenance, and audit artifacts against exact text versions.</w:t>
-      </w:r>
-    </w:p>
-    <w:p>
-      <w:pPr>
-        <w:widowControl/>
-        <w:spacing w:before="0" w:after="120" w:line="300" w:lineRule="auto"/>
-      </w:pPr>
-      <w:r>
-        <w:rPr>
-          <w:rFonts w:ascii="Calibri" w:hAnsi="Calibri"/>
-          <w:sz w:val="22"/>
-        </w:rPr>
-        <w:t xml:space="preserve">Under </w:t>
-      </w:r>
-      <w:r>
-        <w:rPr>
-          <w:rFonts w:ascii="Calibri" w:hAnsi="Calibri"/>
-          <w:b/>
-          <w:sz w:val="22"/>
-        </w:rPr>
-        <w:t>Analysis configuration and methodology</w:t>
-      </w:r>
-      <w:r>
-        <w:rPr>
-          <w:rFonts w:ascii="Calibri" w:hAnsi="Calibri"/>
-          <w:sz w:val="22"/>
-        </w:rPr>
-        <w:t>, choose:</w:t>
+        <w:t>the concreteness low-coverage caution threshold;</w:t>
       </w:r>
     </w:p>
     <w:p>
@@ -10382,7 +10382,7 @@
           <w:rFonts w:ascii="Calibri" w:hAnsi="Calibri"/>
           <w:sz w:val="22"/>
         </w:rPr>
-        <w:t>phrase policy;</w:t>
+        <w:t>the four frequency orientation thresholds;</w:t>
       </w:r>
     </w:p>
     <w:p>
@@ -10400,7 +10400,7 @@
           <w:rFonts w:ascii="Calibri" w:hAnsi="Calibri"/>
           <w:sz w:val="22"/>
         </w:rPr>
-        <w:t>minimum matched observations for sparse-result warnings;</w:t>
+        <w:t>whether frequency excludes model-tagged proper nouns;</w:t>
       </w:r>
     </w:p>
     <w:p>
@@ -10418,7 +10418,7 @@
           <w:rFonts w:ascii="Calibri" w:hAnsi="Calibri"/>
           <w:sz w:val="22"/>
         </w:rPr>
-        <w:t>whether to display all-matched results;</w:t>
+        <w:t>whether frequency permits lemma fallback;</w:t>
       </w:r>
     </w:p>
     <w:p>
@@ -10436,7 +10436,7 @@
           <w:rFonts w:ascii="Calibri" w:hAnsi="Calibri"/>
           <w:sz w:val="22"/>
         </w:rPr>
-        <w:t>whether to display stopword-excluded results;</w:t>
+        <w:t>the frequency low-coverage caution threshold; and</w:t>
       </w:r>
     </w:p>
     <w:p>
@@ -10454,7 +10454,22 @@
           <w:rFonts w:ascii="Calibri" w:hAnsi="Calibri"/>
           <w:sz w:val="22"/>
         </w:rPr>
-        <w:t>concreteness lower and upper orientation thresholds;</w:t>
+        <w:t xml:space="preserve">whether frequency uses the non-default </w:t>
+      </w:r>
+      <w:r>
+        <w:rPr>
+          <w:rFonts w:ascii="Calibri" w:hAnsi="Calibri"/>
+          <w:b/>
+          <w:sz w:val="22"/>
+        </w:rPr>
+        <w:t>Content words only</w:t>
+      </w:r>
+      <w:r>
+        <w:rPr>
+          <w:rFonts w:ascii="Calibri" w:hAnsi="Calibri"/>
+          <w:sz w:val="22"/>
+        </w:rPr>
+        <w:t xml:space="preserve"> scope;</w:t>
       </w:r>
     </w:p>
     <w:p>
@@ -10472,7 +10487,7 @@
           <w:rFonts w:ascii="Calibri" w:hAnsi="Calibri"/>
           <w:sz w:val="22"/>
         </w:rPr>
-        <w:t>whether concreteness excludes model-tagged proper nouns;</w:t>
+        <w:t>AoA early and later orientation thresholds;</w:t>
       </w:r>
     </w:p>
     <w:p>
@@ -10490,7 +10505,7 @@
           <w:rFonts w:ascii="Calibri" w:hAnsi="Calibri"/>
           <w:sz w:val="22"/>
         </w:rPr>
-        <w:t>whether source-supplied concreteness phrases are activated; and</w:t>
+        <w:t>whether AoA excludes model-tagged proper nouns;</w:t>
       </w:r>
     </w:p>
     <w:p>
@@ -10508,7 +10523,7 @@
           <w:rFonts w:ascii="Calibri" w:hAnsi="Calibri"/>
           <w:sz w:val="22"/>
         </w:rPr>
-        <w:t>the concreteness low-coverage caution threshold;</w:t>
+        <w:t>whether AoA permits lemma fallback;</w:t>
       </w:r>
     </w:p>
     <w:p>
@@ -10526,7 +10541,7 @@
           <w:rFonts w:ascii="Calibri" w:hAnsi="Calibri"/>
           <w:sz w:val="22"/>
         </w:rPr>
-        <w:t>the four frequency orientation thresholds;</w:t>
+        <w:t>the AoA low-coverage caution threshold; and</w:t>
       </w:r>
     </w:p>
     <w:p>
@@ -10544,7 +10559,22 @@
           <w:rFonts w:ascii="Calibri" w:hAnsi="Calibri"/>
           <w:sz w:val="22"/>
         </w:rPr>
-        <w:t>whether frequency excludes model-tagged proper nouns;</w:t>
+        <w:t xml:space="preserve">whether AoA uses the non-default contextual </w:t>
+      </w:r>
+      <w:r>
+        <w:rPr>
+          <w:rFonts w:ascii="Calibri" w:hAnsi="Calibri"/>
+          <w:b/>
+          <w:sz w:val="22"/>
+        </w:rPr>
+        <w:t>Content words only</w:t>
+      </w:r>
+      <w:r>
+        <w:rPr>
+          <w:rFonts w:ascii="Calibri" w:hAnsi="Calibri"/>
+          <w:sz w:val="22"/>
+        </w:rPr>
+        <w:t xml:space="preserve"> scope;</w:t>
       </w:r>
     </w:p>
     <w:p>
@@ -10562,7 +10592,7 @@
           <w:rFonts w:ascii="Calibri" w:hAnsi="Calibri"/>
           <w:sz w:val="22"/>
         </w:rPr>
-        <w:t>whether frequency permits lemma fallback;</w:t>
+        <w:t>the MATTR overlapping-window size;</w:t>
       </w:r>
     </w:p>
     <w:p>
@@ -10580,7 +10610,7 @@
           <w:rFonts w:ascii="Calibri" w:hAnsi="Calibri"/>
           <w:sz w:val="22"/>
         </w:rPr>
-        <w:t>the frequency low-coverage caution threshold; and</w:t>
+        <w:t>the HD-D without-replacement sample size;</w:t>
       </w:r>
     </w:p>
     <w:p>
@@ -10598,22 +10628,7 @@
           <w:rFonts w:ascii="Calibri" w:hAnsi="Calibri"/>
           <w:sz w:val="22"/>
         </w:rPr>
-        <w:t xml:space="preserve">whether frequency uses the non-default </w:t>
-      </w:r>
-      <w:r>
-        <w:rPr>
-          <w:rFonts w:ascii="Calibri" w:hAnsi="Calibri"/>
-          <w:b/>
-          <w:sz w:val="22"/>
-        </w:rPr>
-        <w:t>Content words only</w:t>
-      </w:r>
-      <w:r>
-        <w:rPr>
-          <w:rFonts w:ascii="Calibri" w:hAnsi="Calibri"/>
-          <w:sz w:val="22"/>
-        </w:rPr>
-        <w:t xml:space="preserve"> scope;</w:t>
+        <w:t>the MTLD TTR threshold;</w:t>
       </w:r>
     </w:p>
     <w:p>
@@ -10631,7 +10646,7 @@
           <w:rFonts w:ascii="Calibri" w:hAnsi="Calibri"/>
           <w:sz w:val="22"/>
         </w:rPr>
-        <w:t>AoA early and later orientation thresholds;</w:t>
+        <w:t>the lexical-diversity short-text caution threshold;</w:t>
       </w:r>
     </w:p>
     <w:p>
@@ -10649,7 +10664,7 @@
           <w:rFonts w:ascii="Calibri" w:hAnsi="Calibri"/>
           <w:sz w:val="22"/>
         </w:rPr>
-        <w:t>whether AoA excludes model-tagged proper nouns;</w:t>
+        <w:t>PoetryID VAD sources, token/type weightings, and analysis views;</w:t>
       </w:r>
     </w:p>
     <w:p>
@@ -10667,7 +10682,7 @@
           <w:rFonts w:ascii="Calibri" w:hAnsi="Calibri"/>
           <w:sz w:val="22"/>
         </w:rPr>
-        <w:t>whether AoA permits lemma fallback;</w:t>
+        <w:t>default or custom-fixed PoetryID VAD thresholds;</w:t>
       </w:r>
     </w:p>
     <w:p>
@@ -10685,7 +10700,7 @@
           <w:rFonts w:ascii="Calibri" w:hAnsi="Calibri"/>
           <w:sz w:val="22"/>
         </w:rPr>
-        <w:t>the AoA low-coverage caution threshold; and</w:t>
+        <w:t>PoetryID minimum VAD observations and token/type coverage; and</w:t>
       </w:r>
     </w:p>
     <w:p>
@@ -10703,22 +10718,7 @@
           <w:rFonts w:ascii="Calibri" w:hAnsi="Calibri"/>
           <w:sz w:val="22"/>
         </w:rPr>
-        <w:t xml:space="preserve">whether AoA uses the non-default contextual </w:t>
-      </w:r>
-      <w:r>
-        <w:rPr>
-          <w:rFonts w:ascii="Calibri" w:hAnsi="Calibri"/>
-          <w:b/>
-          <w:sz w:val="22"/>
-        </w:rPr>
-        <w:t>Content words only</w:t>
-      </w:r>
-      <w:r>
-        <w:rPr>
-          <w:rFonts w:ascii="Calibri" w:hAnsi="Calibri"/>
-          <w:sz w:val="22"/>
-        </w:rPr>
-        <w:t xml:space="preserve"> scope;</w:t>
+        <w:t>optional secondary PoetryID concreteness, frequency, and AoA character;</w:t>
       </w:r>
     </w:p>
     <w:p>
@@ -10736,7 +10736,22 @@
           <w:rFonts w:ascii="Calibri" w:hAnsi="Calibri"/>
           <w:sz w:val="22"/>
         </w:rPr>
-        <w:t>the MATTR overlapping-window size;</w:t>
+        <w:t xml:space="preserve">poem-specific </w:t>
+      </w:r>
+      <w:r>
+        <w:rPr>
+          <w:rFonts w:ascii="Consolas" w:hAnsi="Consolas"/>
+          <w:color w:val="1F4D78"/>
+          <w:sz w:val="19"/>
+        </w:rPr>
+        <w:t>word = ARPAbet phones | note</w:t>
+      </w:r>
+      <w:r>
+        <w:rPr>
+          <w:rFonts w:ascii="Calibri" w:hAnsi="Calibri"/>
+          <w:sz w:val="22"/>
+        </w:rPr>
+        <w:t xml:space="preserve"> pronunciation overrides;</w:t>
       </w:r>
     </w:p>
     <w:p>
@@ -10754,7 +10769,7 @@
           <w:rFonts w:ascii="Calibri" w:hAnsi="Calibri"/>
           <w:sz w:val="22"/>
         </w:rPr>
-        <w:t>the HD-D without-replacement sample size;</w:t>
+        <w:t>the pronunciation resolved-token coverage caution threshold;</w:t>
       </w:r>
     </w:p>
     <w:p>
@@ -10772,7 +10787,7 @@
           <w:rFonts w:ascii="Calibri" w:hAnsi="Calibri"/>
           <w:sz w:val="22"/>
         </w:rPr>
-        <w:t>the MTLD TTR threshold;</w:t>
+        <w:t>minimum complete pronunciation lines; and</w:t>
       </w:r>
     </w:p>
     <w:p>
@@ -10790,7 +10805,7 @@
           <w:rFonts w:ascii="Calibri" w:hAnsi="Calibri"/>
           <w:sz w:val="22"/>
         </w:rPr>
-        <w:t>the lexical-diversity short-text caution threshold;</w:t>
+        <w:t>minimum resolved pronunciation tokens for sparse-result warnings;</w:t>
       </w:r>
     </w:p>
     <w:p>
@@ -10808,7 +10823,7 @@
           <w:rFonts w:ascii="Calibri" w:hAnsi="Calibri"/>
           <w:sz w:val="22"/>
         </w:rPr>
-        <w:t>PoetryID VAD sources, token/type weightings, and analysis views;</w:t>
+        <w:t>the meter line-fit threshold;</w:t>
       </w:r>
     </w:p>
     <w:p>
@@ -10826,7 +10841,7 @@
           <w:rFonts w:ascii="Calibri" w:hAnsi="Calibri"/>
           <w:sz w:val="22"/>
         </w:rPr>
-        <w:t>default or custom-fixed PoetryID VAD thresholds;</w:t>
+        <w:t>the poem candidate-fit threshold;</w:t>
       </w:r>
     </w:p>
     <w:p>
@@ -10844,7 +10859,7 @@
           <w:rFonts w:ascii="Calibri" w:hAnsi="Calibri"/>
           <w:sz w:val="22"/>
         </w:rPr>
-        <w:t>PoetryID minimum VAD observations and token/type coverage; and</w:t>
+        <w:t>the candidate-margin threshold; and</w:t>
       </w:r>
     </w:p>
     <w:p>
@@ -10862,7 +10877,138 @@
           <w:rFonts w:ascii="Calibri" w:hAnsi="Calibri"/>
           <w:sz w:val="22"/>
         </w:rPr>
-        <w:t>optional secondary PoetryID concreteness, frequency, and AoA character;</w:t>
+        <w:t>the maximum retained stress paths evaluated per line.</w:t>
+      </w:r>
+    </w:p>
+    <w:p>
+      <w:pPr>
+        <w:widowControl/>
+        <w:spacing w:before="0" w:after="120" w:line="300" w:lineRule="auto"/>
+      </w:pPr>
+      <w:r>
+        <w:rPr>
+          <w:rFonts w:ascii="Calibri" w:hAnsi="Calibri"/>
+          <w:sz w:val="22"/>
+        </w:rPr>
+        <w:t xml:space="preserve">Under </w:t>
+      </w:r>
+      <w:r>
+        <w:rPr>
+          <w:rFonts w:ascii="Calibri" w:hAnsi="Calibri"/>
+          <w:b/>
+          <w:sz w:val="22"/>
+        </w:rPr>
+        <w:t>Stopword settings</w:t>
+      </w:r>
+      <w:r>
+        <w:rPr>
+          <w:rFonts w:ascii="Calibri" w:hAnsi="Calibri"/>
+          <w:sz w:val="22"/>
+        </w:rPr>
+        <w:t>, inspect or change the secondary-view policy. The all-matched result is always preserved even when only one view is displayed.</w:t>
+      </w:r>
+    </w:p>
+    <w:p>
+      <w:pPr>
+        <w:pStyle w:val="Heading2"/>
+      </w:pPr>
+      <w:r>
+        <w:rPr>
+          <w:rFonts w:ascii="Calibri" w:hAnsi="Calibri"/>
+          <w:sz w:val="22"/>
+        </w:rPr>
+        <w:t>Overview report family</w:t>
+      </w:r>
+    </w:p>
+    <w:p>
+      <w:pPr>
+        <w:widowControl/>
+        <w:spacing w:before="0" w:after="120" w:line="300" w:lineRule="auto"/>
+      </w:pPr>
+      <w:r>
+        <w:rPr>
+          <w:rFonts w:ascii="Calibri" w:hAnsi="Calibri"/>
+          <w:sz w:val="22"/>
+        </w:rPr>
+        <w:t>Read coverage before means. The Overview begins with a grouped at-a-glance summary for affective evidence, lexical character, sound/form, and structure. It then shows ordinary and content-focused coverage, matched counts, active methodology, excluded stopword counts, interpretive framing, and warnings.</w:t>
+      </w:r>
+    </w:p>
+    <w:p>
+      <w:pPr>
+        <w:pStyle w:val="Heading2"/>
+      </w:pPr>
+      <w:r>
+        <w:rPr>
+          <w:rFonts w:ascii="Calibri" w:hAnsi="Calibri"/>
+          <w:sz w:val="22"/>
+        </w:rPr>
+        <w:t>Structure report family: Language Profile section</w:t>
+      </w:r>
+    </w:p>
+    <w:p>
+      <w:pPr>
+        <w:widowControl/>
+        <w:spacing w:before="0" w:after="120" w:line="300" w:lineRule="auto"/>
+      </w:pPr>
+      <w:r>
+        <w:rPr>
+          <w:rFonts w:ascii="Calibri" w:hAnsi="Calibri"/>
+          <w:sz w:val="22"/>
+        </w:rPr>
+        <w:t xml:space="preserve">The </w:t>
+      </w:r>
+      <w:r>
+        <w:rPr>
+          <w:rFonts w:ascii="Calibri" w:hAnsi="Calibri"/>
+          <w:b/>
+          <w:sz w:val="22"/>
+        </w:rPr>
+        <w:t>Shared Processing Record</w:t>
+      </w:r>
+      <w:r>
+        <w:rPr>
+          <w:rFonts w:ascii="Calibri" w:hAnsi="Calibri"/>
+          <w:sz w:val="22"/>
+        </w:rPr>
+        <w:t xml:space="preserve"> first reports stanzas, physical lines, model sentences, total and lexical tokens, recipe/configuration IDs, model pipeline, dependency coverage, named-entity status, and processing cautions. It is the common local representation used by every selected lexicon.</w:t>
+      </w:r>
+    </w:p>
+    <w:p>
+      <w:pPr>
+        <w:widowControl/>
+        <w:spacing w:before="0" w:after="120" w:line="300" w:lineRule="auto"/>
+      </w:pPr>
+      <w:r>
+        <w:rPr>
+          <w:rFonts w:ascii="Calibri" w:hAnsi="Calibri"/>
+          <w:sz w:val="22"/>
+        </w:rPr>
+        <w:t>The tab then reports part-of-speech counts and relative shares for all eligible lexical tokens, independently of lexicon coverage. It also shows unique normalized types and example forms. The denominator is displayed, and a caution explains that the labels are model-generated.</w:t>
+      </w:r>
+    </w:p>
+    <w:p>
+      <w:pPr>
+        <w:pStyle w:val="Heading2"/>
+      </w:pPr>
+      <w:r>
+        <w:rPr>
+          <w:rFonts w:ascii="Calibri" w:hAnsi="Calibri"/>
+          <w:sz w:val="22"/>
+        </w:rPr>
+        <w:t>Affective Evidence: VAD section</w:t>
+      </w:r>
+    </w:p>
+    <w:p>
+      <w:pPr>
+        <w:widowControl/>
+        <w:spacing w:before="0" w:after="120" w:line="300" w:lineRule="auto"/>
+      </w:pPr>
+      <w:r>
+        <w:rPr>
+          <w:rFonts w:ascii="Calibri" w:hAnsi="Calibri"/>
+          <w:sz w:val="22"/>
+        </w:rPr>
+        <w:t>This tab contains:</w:t>
       </w:r>
     </w:p>
     <w:p>
@@ -10880,22 +11026,7 @@
           <w:rFonts w:ascii="Calibri" w:hAnsi="Calibri"/>
           <w:sz w:val="22"/>
         </w:rPr>
-        <w:t xml:space="preserve">poem-specific </w:t>
-      </w:r>
-      <w:r>
-        <w:rPr>
-          <w:rFonts w:ascii="Consolas" w:hAnsi="Consolas"/>
-          <w:color w:val="1F4D78"/>
-          <w:sz w:val="19"/>
-        </w:rPr>
-        <w:t>word = ARPAbet phones | note</w:t>
-      </w:r>
-      <w:r>
-        <w:rPr>
-          <w:rFonts w:ascii="Calibri" w:hAnsi="Calibri"/>
-          <w:sz w:val="22"/>
-        </w:rPr>
-        <w:t xml:space="preserve"> pronunciation overrides;</w:t>
+        <w:t>parallel normalized VAD charts;</w:t>
       </w:r>
     </w:p>
     <w:p>
@@ -10913,7 +11044,7 @@
           <w:rFonts w:ascii="Calibri" w:hAnsi="Calibri"/>
           <w:sz w:val="22"/>
         </w:rPr>
-        <w:t>the pronunciation resolved-token coverage caution threshold;</w:t>
+        <w:t>definitions of valence, arousal, and dominance;</w:t>
       </w:r>
     </w:p>
     <w:p>
@@ -10931,7 +11062,35 @@
           <w:rFonts w:ascii="Calibri" w:hAnsi="Calibri"/>
           <w:sz w:val="22"/>
         </w:rPr>
-        <w:t>minimum complete pronunciation lines; and</w:t>
+        <w:t xml:space="preserve">a separate </w:t>
+      </w:r>
+      <w:r>
+        <w:rPr>
+          <w:rFonts w:ascii="Calibri" w:hAnsi="Calibri"/>
+          <w:b/>
+          <w:sz w:val="22"/>
+        </w:rPr>
+        <w:t>Dispersion of Matched Ratings</w:t>
+      </w:r>
+      <w:r>
+        <w:rPr>
+          <w:rFonts w:ascii="Calibri" w:hAnsi="Calibri"/>
+          <w:sz w:val="22"/>
+        </w:rPr>
+        <w:t xml:space="preserve"> section immediately after those</w:t>
+      </w:r>
+    </w:p>
+    <w:p>
+      <w:pPr>
+        <w:widowControl/>
+        <w:spacing w:before="0" w:after="120" w:line="300" w:lineRule="auto"/>
+      </w:pPr>
+      <w:r>
+        <w:rPr>
+          <w:rFonts w:ascii="Calibri" w:hAnsi="Calibri"/>
+          <w:sz w:val="22"/>
+        </w:rPr>
+        <w:t xml:space="preserve">  definitions, reporting population standard deviations among matched ratings;</w:t>
       </w:r>
     </w:p>
     <w:p>
@@ -10949,7 +11108,7 @@
           <w:rFonts w:ascii="Calibri" w:hAnsi="Calibri"/>
           <w:sz w:val="22"/>
         </w:rPr>
-        <w:t>minimum resolved pronunciation tokens for sparse-result warnings;</w:t>
+        <w:t>token- and type-weighted values for each analysis view;</w:t>
       </w:r>
     </w:p>
     <w:p>
@@ -10967,7 +11126,7 @@
           <w:rFonts w:ascii="Calibri" w:hAnsi="Calibri"/>
           <w:sz w:val="22"/>
         </w:rPr>
-        <w:t>the meter line-fit threshold;</w:t>
+        <w:t>plain-language midpoint interpretations;</w:t>
       </w:r>
     </w:p>
     <w:p>
@@ -10985,7 +11144,7 @@
           <w:rFonts w:ascii="Calibri" w:hAnsi="Calibri"/>
           <w:sz w:val="22"/>
         </w:rPr>
-        <w:t>the poem candidate-fit threshold;</w:t>
+        <w:t>stopword-sensitivity differences;</w:t>
       </w:r>
     </w:p>
     <w:p>
@@ -11003,7 +11162,7 @@
           <w:rFonts w:ascii="Calibri" w:hAnsi="Calibri"/>
           <w:sz w:val="22"/>
         </w:rPr>
-        <w:t>the candidate-margin threshold; and</w:t>
+        <w:t>cumulative normalized totals;</w:t>
       </w:r>
     </w:p>
     <w:p>
@@ -11021,138 +11180,7 @@
           <w:rFonts w:ascii="Calibri" w:hAnsi="Calibri"/>
           <w:sz w:val="22"/>
         </w:rPr>
-        <w:t>the maximum retained stress paths evaluated per line.</w:t>
-      </w:r>
-    </w:p>
-    <w:p>
-      <w:pPr>
-        <w:widowControl/>
-        <w:spacing w:before="0" w:after="120" w:line="300" w:lineRule="auto"/>
-      </w:pPr>
-      <w:r>
-        <w:rPr>
-          <w:rFonts w:ascii="Calibri" w:hAnsi="Calibri"/>
-          <w:sz w:val="22"/>
-        </w:rPr>
-        <w:t xml:space="preserve">Under </w:t>
-      </w:r>
-      <w:r>
-        <w:rPr>
-          <w:rFonts w:ascii="Calibri" w:hAnsi="Calibri"/>
-          <w:b/>
-          <w:sz w:val="22"/>
-        </w:rPr>
-        <w:t>Stopword settings</w:t>
-      </w:r>
-      <w:r>
-        <w:rPr>
-          <w:rFonts w:ascii="Calibri" w:hAnsi="Calibri"/>
-          <w:sz w:val="22"/>
-        </w:rPr>
-        <w:t>, inspect or change the secondary-view policy. The all-matched result is always preserved even when only one view is displayed.</w:t>
-      </w:r>
-    </w:p>
-    <w:p>
-      <w:pPr>
-        <w:pStyle w:val="Heading2"/>
-      </w:pPr>
-      <w:r>
-        <w:rPr>
-          <w:rFonts w:ascii="Calibri" w:hAnsi="Calibri"/>
-          <w:sz w:val="22"/>
-        </w:rPr>
-        <w:t>Overview report family</w:t>
-      </w:r>
-    </w:p>
-    <w:p>
-      <w:pPr>
-        <w:widowControl/>
-        <w:spacing w:before="0" w:after="120" w:line="300" w:lineRule="auto"/>
-      </w:pPr>
-      <w:r>
-        <w:rPr>
-          <w:rFonts w:ascii="Calibri" w:hAnsi="Calibri"/>
-          <w:sz w:val="22"/>
-        </w:rPr>
-        <w:t>Read coverage before means. The Overview begins with a grouped at-a-glance summary for affective evidence, lexical character, sound/form, and structure. It then shows ordinary and content-focused coverage, matched counts, active methodology, excluded stopword counts, interpretive framing, and warnings.</w:t>
-      </w:r>
-    </w:p>
-    <w:p>
-      <w:pPr>
-        <w:pStyle w:val="Heading2"/>
-      </w:pPr>
-      <w:r>
-        <w:rPr>
-          <w:rFonts w:ascii="Calibri" w:hAnsi="Calibri"/>
-          <w:sz w:val="22"/>
-        </w:rPr>
-        <w:t>Structure report family: Language Profile section</w:t>
-      </w:r>
-    </w:p>
-    <w:p>
-      <w:pPr>
-        <w:widowControl/>
-        <w:spacing w:before="0" w:after="120" w:line="300" w:lineRule="auto"/>
-      </w:pPr>
-      <w:r>
-        <w:rPr>
-          <w:rFonts w:ascii="Calibri" w:hAnsi="Calibri"/>
-          <w:sz w:val="22"/>
-        </w:rPr>
-        <w:t xml:space="preserve">The </w:t>
-      </w:r>
-      <w:r>
-        <w:rPr>
-          <w:rFonts w:ascii="Calibri" w:hAnsi="Calibri"/>
-          <w:b/>
-          <w:sz w:val="22"/>
-        </w:rPr>
-        <w:t>Shared Processing Record</w:t>
-      </w:r>
-      <w:r>
-        <w:rPr>
-          <w:rFonts w:ascii="Calibri" w:hAnsi="Calibri"/>
-          <w:sz w:val="22"/>
-        </w:rPr>
-        <w:t xml:space="preserve"> first reports stanzas, physical lines, model sentences, total and lexical tokens, recipe/configuration IDs, model pipeline, dependency coverage, named-entity status, and processing cautions. It is the common local representation used by every selected lexicon.</w:t>
-      </w:r>
-    </w:p>
-    <w:p>
-      <w:pPr>
-        <w:widowControl/>
-        <w:spacing w:before="0" w:after="120" w:line="300" w:lineRule="auto"/>
-      </w:pPr>
-      <w:r>
-        <w:rPr>
-          <w:rFonts w:ascii="Calibri" w:hAnsi="Calibri"/>
-          <w:sz w:val="22"/>
-        </w:rPr>
-        <w:t>The tab then reports part-of-speech counts and relative shares for all eligible lexical tokens, independently of lexicon coverage. It also shows unique normalized types and example forms. The denominator is displayed, and a caution explains that the labels are model-generated.</w:t>
-      </w:r>
-    </w:p>
-    <w:p>
-      <w:pPr>
-        <w:pStyle w:val="Heading2"/>
-      </w:pPr>
-      <w:r>
-        <w:rPr>
-          <w:rFonts w:ascii="Calibri" w:hAnsi="Calibri"/>
-          <w:sz w:val="22"/>
-        </w:rPr>
-        <w:t>Affective Evidence: VAD section</w:t>
-      </w:r>
-    </w:p>
-    <w:p>
-      <w:pPr>
-        <w:widowControl/>
-        <w:spacing w:before="0" w:after="120" w:line="300" w:lineRule="auto"/>
-      </w:pPr>
-      <w:r>
-        <w:rPr>
-          <w:rFonts w:ascii="Calibri" w:hAnsi="Calibri"/>
-          <w:sz w:val="22"/>
-        </w:rPr>
-        <w:t>This tab contains:</w:t>
+        <w:t>top midpoint-centered contributors;</w:t>
       </w:r>
     </w:p>
     <w:p>
@@ -11170,178 +11198,6 @@
           <w:rFonts w:ascii="Calibri" w:hAnsi="Calibri"/>
           <w:sz w:val="22"/>
         </w:rPr>
-        <w:t>parallel normalized VAD charts;</w:t>
-      </w:r>
-    </w:p>
-    <w:p>
-      <w:pPr>
-        <w:widowControl/>
-        <w:numPr>
-          <w:ilvl w:val="0"/>
-          <w:numId w:val="10"/>
-        </w:numPr>
-        <w:spacing w:before="0" w:after="80" w:line="300" w:lineRule="auto"/>
-        <w:ind w:left="540" w:hanging="271"/>
-      </w:pPr>
-      <w:r>
-        <w:rPr>
-          <w:rFonts w:ascii="Calibri" w:hAnsi="Calibri"/>
-          <w:sz w:val="22"/>
-        </w:rPr>
-        <w:t>definitions of valence, arousal, and dominance;</w:t>
-      </w:r>
-    </w:p>
-    <w:p>
-      <w:pPr>
-        <w:widowControl/>
-        <w:numPr>
-          <w:ilvl w:val="0"/>
-          <w:numId w:val="10"/>
-        </w:numPr>
-        <w:spacing w:before="0" w:after="80" w:line="300" w:lineRule="auto"/>
-        <w:ind w:left="540" w:hanging="271"/>
-      </w:pPr>
-      <w:r>
-        <w:rPr>
-          <w:rFonts w:ascii="Calibri" w:hAnsi="Calibri"/>
-          <w:sz w:val="22"/>
-        </w:rPr>
-        <w:t xml:space="preserve">a separate </w:t>
-      </w:r>
-      <w:r>
-        <w:rPr>
-          <w:rFonts w:ascii="Calibri" w:hAnsi="Calibri"/>
-          <w:b/>
-          <w:sz w:val="22"/>
-        </w:rPr>
-        <w:t>Dispersion of Matched Ratings</w:t>
-      </w:r>
-      <w:r>
-        <w:rPr>
-          <w:rFonts w:ascii="Calibri" w:hAnsi="Calibri"/>
-          <w:sz w:val="22"/>
-        </w:rPr>
-        <w:t xml:space="preserve"> section immediately after those</w:t>
-      </w:r>
-    </w:p>
-    <w:p>
-      <w:pPr>
-        <w:widowControl/>
-        <w:spacing w:before="0" w:after="120" w:line="300" w:lineRule="auto"/>
-      </w:pPr>
-      <w:r>
-        <w:rPr>
-          <w:rFonts w:ascii="Calibri" w:hAnsi="Calibri"/>
-          <w:sz w:val="22"/>
-        </w:rPr>
-        <w:t xml:space="preserve">  definitions, reporting population standard deviations among matched ratings;</w:t>
-      </w:r>
-    </w:p>
-    <w:p>
-      <w:pPr>
-        <w:widowControl/>
-        <w:numPr>
-          <w:ilvl w:val="0"/>
-          <w:numId w:val="10"/>
-        </w:numPr>
-        <w:spacing w:before="0" w:after="80" w:line="300" w:lineRule="auto"/>
-        <w:ind w:left="540" w:hanging="271"/>
-      </w:pPr>
-      <w:r>
-        <w:rPr>
-          <w:rFonts w:ascii="Calibri" w:hAnsi="Calibri"/>
-          <w:sz w:val="22"/>
-        </w:rPr>
-        <w:t>token- and type-weighted values for each analysis view;</w:t>
-      </w:r>
-    </w:p>
-    <w:p>
-      <w:pPr>
-        <w:widowControl/>
-        <w:numPr>
-          <w:ilvl w:val="0"/>
-          <w:numId w:val="10"/>
-        </w:numPr>
-        <w:spacing w:before="0" w:after="80" w:line="300" w:lineRule="auto"/>
-        <w:ind w:left="540" w:hanging="271"/>
-      </w:pPr>
-      <w:r>
-        <w:rPr>
-          <w:rFonts w:ascii="Calibri" w:hAnsi="Calibri"/>
-          <w:sz w:val="22"/>
-        </w:rPr>
-        <w:t>plain-language midpoint interpretations;</w:t>
-      </w:r>
-    </w:p>
-    <w:p>
-      <w:pPr>
-        <w:widowControl/>
-        <w:numPr>
-          <w:ilvl w:val="0"/>
-          <w:numId w:val="10"/>
-        </w:numPr>
-        <w:spacing w:before="0" w:after="80" w:line="300" w:lineRule="auto"/>
-        <w:ind w:left="540" w:hanging="271"/>
-      </w:pPr>
-      <w:r>
-        <w:rPr>
-          <w:rFonts w:ascii="Calibri" w:hAnsi="Calibri"/>
-          <w:sz w:val="22"/>
-        </w:rPr>
-        <w:t>stopword-sensitivity differences;</w:t>
-      </w:r>
-    </w:p>
-    <w:p>
-      <w:pPr>
-        <w:widowControl/>
-        <w:numPr>
-          <w:ilvl w:val="0"/>
-          <w:numId w:val="10"/>
-        </w:numPr>
-        <w:spacing w:before="0" w:after="80" w:line="300" w:lineRule="auto"/>
-        <w:ind w:left="540" w:hanging="271"/>
-      </w:pPr>
-      <w:r>
-        <w:rPr>
-          <w:rFonts w:ascii="Calibri" w:hAnsi="Calibri"/>
-          <w:sz w:val="22"/>
-        </w:rPr>
-        <w:t>cumulative normalized totals;</w:t>
-      </w:r>
-    </w:p>
-    <w:p>
-      <w:pPr>
-        <w:widowControl/>
-        <w:numPr>
-          <w:ilvl w:val="0"/>
-          <w:numId w:val="10"/>
-        </w:numPr>
-        <w:spacing w:before="0" w:after="80" w:line="300" w:lineRule="auto"/>
-        <w:ind w:left="540" w:hanging="271"/>
-      </w:pPr>
-      <w:r>
-        <w:rPr>
-          <w:rFonts w:ascii="Calibri" w:hAnsi="Calibri"/>
-          <w:sz w:val="22"/>
-        </w:rPr>
-        <w:t>top midpoint-centered contributors;</w:t>
-      </w:r>
-    </w:p>
-    <w:p>
-      <w:pPr>
-        <w:widowControl/>
-        <w:numPr>
-          <w:ilvl w:val="0"/>
-          <w:numId w:val="10"/>
-        </w:numPr>
-        <w:spacing w:before="0" w:after="80" w:line="300" w:lineRule="auto"/>
-        <w:ind w:left="540" w:hanging="271"/>
-      </w:pPr>
-      <w:r>
-        <w:rPr>
-          <w:rFonts w:ascii="Calibri" w:hAnsi="Calibri"/>
-          <w:sz w:val="22"/>
-        </w:rPr>
         <w:t>original source scales and normalization formulas.</w:t>
       </w:r>
     </w:p>
@@ -11899,7 +11755,7 @@
           <w:rFonts w:ascii="Calibri" w:hAnsi="Calibri"/>
           <w:sz w:val="22"/>
         </w:rPr>
-        <w:t xml:space="preserve"> is enabled. It reuses the poem's preserved line and stanza structure plus the existing pronunciation, meter, and rhyme results; it does not rescan those layers independently. The initial registry ranks ten documented profiles: Elizabethan/Shakespearean sonnet, Petrarchan sonnet, Spenserian sonnet, villanelle, sestina, limerick, English-language 5-7-5 haiku profile, pantoum, terza rima, and ghazal.</w:t>
+        <w:t xml:space="preserve"> is enabled. It reuses the poem's preserved line and stanza structure plus the existing pronunciation, meter, and rhyme results; it does not rescan those layers independently. Registry version 2.0 ranks 169 source-documented automatic, partial, and manual profiles.</w:t>
       </w:r>
     </w:p>
     <w:p>
@@ -12060,7 +11916,22 @@
           <w:rFonts w:ascii="Calibri" w:hAnsi="Calibri"/>
           <w:sz w:val="22"/>
         </w:rPr>
-        <w:t xml:space="preserve">. The full ranking table keeps all ten candidates visible, and the candidate-evidence selector exposes each feature's role, weight, score, coverage, observed evidence, and explanation. The sources and limitations panel documents the profile definitions and boundary decisions. If the evidence is insufficient or conflicting, VerseVAD reports </w:t>
+        <w:t xml:space="preserve">. A no-match result displays only the ten nearest profiles. </w:t>
+      </w:r>
+      <w:r>
+        <w:rPr>
+          <w:rFonts w:ascii="Calibri" w:hAnsi="Calibri"/>
+          <w:b/>
+          <w:sz w:val="22"/>
+        </w:rPr>
+        <w:t>All Inherited Forms</w:t>
+      </w:r>
+      <w:r>
+        <w:rPr>
+          <w:rFonts w:ascii="Calibri" w:hAnsi="Calibri"/>
+          <w:sz w:val="22"/>
+        </w:rPr>
+        <w:t xml:space="preserve"> keeps every registry entry selectable, including obviously distant and manual-confirmation forms, and exposes each feature's role, weight, score, coverage, observed evidence, and explanation. The sources and limitations panel documents the profile definitions and boundary decisions. If the evidence is insufficient or conflicting, VerseVAD reports </w:t>
       </w:r>
       <w:r>
         <w:rPr>
@@ -18892,7 +18763,7 @@
                 <w:rFonts w:ascii="Calibri" w:hAnsi="Calibri"/>
                 <w:sz w:val="18"/>
               </w:rPr>
-              <w:t>All ten ranked profiles with definitions, scores, coverage, contradictions, margins, and suggestion status</w:t>
+              <w:t>All 169 ranked profiles with definitions, assessment modes, scores, coverage, contradictions, margins, and suggestion status</w:t>
             </w:r>
           </w:p>
         </w:tc>
@@ -29017,7 +28888,7 @@
           <w:rFonts w:ascii="Calibri" w:hAnsi="Calibri"/>
           <w:sz w:val="22"/>
         </w:rPr>
-        <w:t>Stage 15 inherited-form analysis compares ten encoded, source-documented</w:t>
+        <w:t>Registry version 2.0 compares 169 encoded, source-documented profiles. This</w:t>
       </w:r>
     </w:p>
     <w:p>
@@ -29030,7 +28901,7 @@
           <w:rFonts w:ascii="Calibri" w:hAnsi="Calibri"/>
           <w:sz w:val="22"/>
         </w:rPr>
-        <w:t xml:space="preserve">  profiles rather than every named, historical, regional, or contemporary   poetic form.</w:t>
+        <w:t xml:space="preserve">  broad registry still does not claim a universal, closed taxonomy of every   named, historical, regional, community, or contemporary poetic practice.</w:t>
       </w:r>
     </w:p>
     <w:p>

</xml_diff>

<commit_message>
Minor appearance tweaks, overhaul of pronunciation reconciliation and audio capabilities
</commit_message>
<xml_diff>
--- a/docs/VerseVAD_User_Manual.docx
+++ b/docs/VerseVAD_User_Manual.docx
@@ -71,7 +71,7 @@
           <w:color w:val="66727C"/>
           <w:sz w:val="21"/>
         </w:rPr>
-        <w:t xml:space="preserve"> July 26, 2026</w:t>
+        <w:t xml:space="preserve"> July 27, 2026</w:t>
       </w:r>
       <w:r>
         <w:rPr>
@@ -7944,7 +7944,7 @@
           <w:color w:val="1F4D78"/>
           <w:sz w:val="19"/>
         </w:rPr>
-        <w:t>permit = P ER0 M IH1 T | noun reading in this line</w:t>
+        <w:t>permit = P ER0 M IH1 T | verb reading in this line</w:t>
       </w:r>
     </w:p>
     <w:p>
@@ -9912,7 +9912,7 @@
           <w:rFonts w:ascii="Calibri" w:hAnsi="Calibri"/>
           <w:sz w:val="22"/>
         </w:rPr>
-        <w:t xml:space="preserve"> requires confirmation. The optional workspace name labels the temporary session but does not create a persistent corpus project.</w:t>
+        <w:t xml:space="preserve"> requires confirmation. The optional workspace name is blank by default, is not required, and labels the temporary session if supplied; it does not create a persistent corpus project.</w:t>
       </w:r>
     </w:p>
     <w:p>
@@ -11503,14 +11503,130 @@
           <w:b/>
           <w:sz w:val="22"/>
         </w:rPr>
-        <w:t>Words needing attention</w:t>
-      </w:r>
-      <w:r>
-        <w:rPr>
-          <w:rFonts w:ascii="Calibri" w:hAnsi="Calibri"/>
-          <w:sz w:val="22"/>
-        </w:rPr>
-        <w:t xml:space="preserve"> to find out-of-dictionary and materially ambiguous forms. Add an override only when you can document the intended reading. Removing an override and analyzing again reverses it.</w:t>
+        <w:t>Words Needing Attention</w:t>
+      </w:r>
+      <w:r>
+        <w:rPr>
+          <w:rFonts w:ascii="Calibri" w:hAnsi="Calibri"/>
+          <w:sz w:val="22"/>
+        </w:rPr>
+        <w:t xml:space="preserve"> to find out-of-dictionary and materially ambiguous forms. For an ambiguous dictionary entry, select a retained CMUdict candidate, use its </w:t>
+      </w:r>
+      <w:r>
+        <w:rPr>
+          <w:rFonts w:ascii="Calibri" w:hAnsi="Calibri"/>
+          <w:b/>
+          <w:sz w:val="22"/>
+        </w:rPr>
+        <w:t>Hear</w:t>
+      </w:r>
+      <w:r>
+        <w:rPr>
+          <w:rFonts w:ascii="Calibri" w:hAnsi="Calibri"/>
+          <w:sz w:val="22"/>
+        </w:rPr>
+        <w:t xml:space="preserve"> speaker control when useful, and choose </w:t>
+      </w:r>
+      <w:r>
+        <w:rPr>
+          <w:rFonts w:ascii="Calibri" w:hAnsi="Calibri"/>
+          <w:b/>
+          <w:sz w:val="22"/>
+        </w:rPr>
+        <w:t>Apply Approved Pronunciations and Reanalyze</w:t>
+      </w:r>
+      <w:r>
+        <w:rPr>
+          <w:rFonts w:ascii="Calibri" w:hAnsi="Calibri"/>
+          <w:sz w:val="22"/>
+        </w:rPr>
+        <w:t>. The selection is copied into the editable session override field and dependent meter, rhyme/sound, and inherited-form evidence is recomputed.</w:t>
+      </w:r>
+    </w:p>
+    <w:p>
+      <w:pPr>
+        <w:widowControl/>
+        <w:spacing w:before="0" w:after="120" w:line="300" w:lineRule="auto"/>
+      </w:pPr>
+      <w:r>
+        <w:rPr>
+          <w:rFonts w:ascii="Calibri" w:hAnsi="Calibri"/>
+          <w:sz w:val="22"/>
+        </w:rPr>
+        <w:t xml:space="preserve">An out-of-dictionary word remains visibly </w:t>
+      </w:r>
+      <w:r>
+        <w:rPr>
+          <w:rFonts w:ascii="Calibri" w:hAnsi="Calibri"/>
+          <w:b/>
+          <w:sz w:val="22"/>
+        </w:rPr>
+        <w:t>unmatched</w:t>
+      </w:r>
+      <w:r>
+        <w:rPr>
+          <w:rFonts w:ascii="Calibri" w:hAnsi="Calibri"/>
+          <w:sz w:val="22"/>
+        </w:rPr>
+        <w:t xml:space="preserve">. VerseVAD displays a local eSpeak NG 1.52.0 US-English G2P candidate as </w:t>
+      </w:r>
+      <w:r>
+        <w:rPr>
+          <w:rFonts w:ascii="Calibri" w:hAnsi="Calibri"/>
+          <w:b/>
+          <w:sz w:val="22"/>
+        </w:rPr>
+        <w:t>provisional—not confirmed</w:t>
+      </w:r>
+      <w:r>
+        <w:rPr>
+          <w:rFonts w:ascii="Calibri" w:hAnsi="Calibri"/>
+          <w:sz w:val="22"/>
+        </w:rPr>
+        <w:t xml:space="preserve">. </w:t>
+      </w:r>
+      <w:r>
+        <w:rPr>
+          <w:rFonts w:ascii="Calibri" w:hAnsi="Calibri"/>
+          <w:b/>
+          <w:sz w:val="22"/>
+        </w:rPr>
+        <w:t>Leave explicitly unresolved</w:t>
+      </w:r>
+      <w:r>
+        <w:rPr>
+          <w:rFonts w:ascii="Calibri" w:hAnsi="Calibri"/>
+          <w:sz w:val="22"/>
+        </w:rPr>
+        <w:t xml:space="preserve"> is the default and keeps pronunciation-dependent evidence missing. You may instead approve the prediction or edit its ARPAbet directly, choose </w:t>
+      </w:r>
+      <w:r>
+        <w:rPr>
+          <w:rFonts w:ascii="Calibri" w:hAnsi="Calibri"/>
+          <w:b/>
+          <w:sz w:val="22"/>
+        </w:rPr>
+        <w:t>Approve or edit for this session</w:t>
+      </w:r>
+      <w:r>
+        <w:rPr>
+          <w:rFonts w:ascii="Calibri" w:hAnsi="Calibri"/>
+          <w:sz w:val="22"/>
+        </w:rPr>
+        <w:t>, and apply it. Only this explicit action creates a source-labeled session override and recomputes dependent evidence. Removing the override and analyzing again reverses it.</w:t>
+      </w:r>
+    </w:p>
+    <w:p>
+      <w:pPr>
+        <w:widowControl/>
+        <w:spacing w:before="0" w:after="120" w:line="300" w:lineRule="auto"/>
+      </w:pPr>
+      <w:r>
+        <w:rPr>
+          <w:rFonts w:ascii="Calibri" w:hAnsi="Calibri"/>
+          <w:sz w:val="22"/>
+        </w:rPr>
+        <w:t>The speaker controls synthesize the exact displayed ARPAbet sequence locally with bundled eSpeak NG. The robotic preview is an orientation aid, not a human recording, dialect authority, or context-sensitive performance.</w:t>
       </w:r>
     </w:p>
     <w:p>
@@ -15083,6 +15199,34 @@
           <w:sz w:val="22"/>
         </w:rPr>
         <w:t>The Explorer also checks installed concreteness, SUBTLEX-US, Kuperman AoA, and CMUdict resources. It reports source-supplied concreteness fields; Zipf, frequency, contextual diversity, and source POS fields; AoA ratings and response evidence; and every exact CMUdict pronunciation candidate with ARPAbet phones, syllable count, and lexical-stress digits.</w:t>
+      </w:r>
+    </w:p>
+    <w:p>
+      <w:pPr>
+        <w:widowControl/>
+        <w:spacing w:before="0" w:after="120" w:line="300" w:lineRule="auto"/>
+      </w:pPr>
+      <w:r>
+        <w:rPr>
+          <w:rFonts w:ascii="Calibri" w:hAnsi="Calibri"/>
+          <w:sz w:val="22"/>
+        </w:rPr>
+        <w:t xml:space="preserve">Every displayed CMUdict candidate includes a </w:t>
+      </w:r>
+      <w:r>
+        <w:rPr>
+          <w:rFonts w:ascii="Calibri" w:hAnsi="Calibri"/>
+          <w:b/>
+          <w:sz w:val="22"/>
+        </w:rPr>
+        <w:t>Hear</w:t>
+      </w:r>
+      <w:r>
+        <w:rPr>
+          <w:rFonts w:ascii="Calibri" w:hAnsi="Calibri"/>
+          <w:sz w:val="22"/>
+        </w:rPr>
+        <w:t xml:space="preserve"> speaker control. It synthesizes that exact ARPAbet sequence locally with eSpeak NG; no query or audio is sent to a service. The preview is not a recording or an additional source of pronunciation evidence.</w:t>
       </w:r>
     </w:p>
     <w:p>
@@ -28578,7 +28722,7 @@
           <w:rFonts w:ascii="Calibri" w:hAnsi="Calibri"/>
           <w:sz w:val="22"/>
         </w:rPr>
-        <w:t>Stage 5 includes no grapheme-to-phoneme prediction or hidden pronunciation</w:t>
+        <w:t>Stage 5 may show a local, review-only G2P candidate for an unmatched form,</w:t>
       </w:r>
     </w:p>
     <w:p>
@@ -28591,7 +28735,7 @@
           <w:rFonts w:ascii="Calibri" w:hAnsi="Calibri"/>
           <w:sz w:val="22"/>
         </w:rPr>
-        <w:t xml:space="preserve">  selection. Its own tab does not classify meter or rhyme.</w:t>
+        <w:t xml:space="preserve">  but never applies it through hidden pronunciation selection. The word stays   unmatched until explicit approval; its own tab does not classify meter or   rhyme.</w:t>
       </w:r>
     </w:p>
     <w:p>

</xml_diff>

<commit_message>
Add sentiment readability and trajectory analysis
</commit_message>
<xml_diff>
--- a/docs/VerseVAD_User_Manual.docx
+++ b/docs/VerseVAD_User_Manual.docx
@@ -134,7 +134,7 @@
           <w:color w:val="193247"/>
           <w:sz w:val="22"/>
         </w:rPr>
-        <w:t>, optional dictionary-based pronunciation evidence, transparent candidate-meter comparisons, phonological patterns, lexical-style counts, PoetryID candidate lexical-affective neighborhoods, and inherited-form resemblance. Concreteness, corpus-relative frequency, retrospective Age of Acquisition, pronunciation/lexical stress, meter fit, rhyme/sound evidence, lexical diversity, word length, structural word counts, PoetryID, and inherited-form consistency remain separately documented constructs. VerseVAD does not determine the emotion of a poem, speaker, author, or reader, diagnose cognition, establish definitive meter, performed rhythm, or genre identity, or replace contextual close reading.</w:t>
+        <w:t>, offline rule-based polarity, prose-oriented readability formulas, optional dictionary-based pronunciation evidence, transparent candidate-meter comparisons, phonological patterns, lexical-style counts, PoetryID candidate lexical-affective neighborhoods, and inherited-form resemblance. VADER polarity, readability, concreteness, corpus-relative frequency, retrospective Age of Acquisition, pronunciation/lexical stress, meter fit, rhyme/sound evidence, lexical diversity, word length, structural word counts, PoetryID, and inherited-form consistency remain separately documented constructs. VerseVAD does not determine the emotion of a poem, speaker, author, or reader, diagnose cognition, establish definitive meter, performed rhythm, or genre identity, or replace contextual close reading.</w:t>
       </w:r>
     </w:p>
     <w:p>
@@ -771,7 +771,20 @@
           <w:rFonts w:ascii="Calibri" w:hAnsi="Calibri"/>
           <w:sz w:val="22"/>
         </w:rPr>
-        <w:t>token- and type-weighted summaries;</w:t>
+        <w:t>offline VADER positive/neutral/negative polarity proportions, compound score,</w:t>
+      </w:r>
+    </w:p>
+    <w:p>
+      <w:pPr>
+        <w:widowControl/>
+        <w:spacing w:before="0" w:after="120" w:line="300" w:lineRule="auto"/>
+      </w:pPr>
+      <w:r>
+        <w:rPr>
+          <w:rFonts w:ascii="Calibri" w:hAnsi="Calibri"/>
+          <w:sz w:val="22"/>
+        </w:rPr>
+        <w:t xml:space="preserve">  and sentence-level evidence with visible domain cautions;</w:t>
       </w:r>
     </w:p>
     <w:p>
@@ -789,7 +802,20 @@
           <w:rFonts w:ascii="Calibri" w:hAnsi="Calibri"/>
           <w:sz w:val="22"/>
         </w:rPr>
-        <w:t>part-of-speech counts and relative shares over all eligible lexical tokens;</w:t>
+        <w:t>line-level valence, arousal, dominance, and optional normalized-concreteness</w:t>
+      </w:r>
+    </w:p>
+    <w:p>
+      <w:pPr>
+        <w:widowControl/>
+        <w:spacing w:before="0" w:after="120" w:line="300" w:lineRule="auto"/>
+      </w:pPr>
+      <w:r>
+        <w:rPr>
+          <w:rFonts w:ascii="Calibri" w:hAnsi="Calibri"/>
+          <w:sz w:val="22"/>
+        </w:rPr>
+        <w:t xml:space="preserve">  trajectories for one explicitly selected VAD source;</w:t>
       </w:r>
     </w:p>
     <w:p>
@@ -807,7 +833,20 @@
           <w:rFonts w:ascii="Calibri" w:hAnsi="Calibri"/>
           <w:sz w:val="22"/>
         </w:rPr>
-        <w:t>all-matched and stopword-excluded VAD views;</w:t>
+        <w:t>resource-free Flesch Reading Ease, Flesch-Kincaid Grade, Gunning Fog,</w:t>
+      </w:r>
+    </w:p>
+    <w:p>
+      <w:pPr>
+        <w:widowControl/>
+        <w:spacing w:before="0" w:after="120" w:line="300" w:lineRule="auto"/>
+      </w:pPr>
+      <w:r>
+        <w:rPr>
+          <w:rFonts w:ascii="Calibri" w:hAnsi="Calibri"/>
+          <w:sz w:val="22"/>
+        </w:rPr>
+        <w:t xml:space="preserve">  Automated Readability Index, Coleman-Liau, and sentence-qualified SMOG   evidence with auditable syllable methods;</w:t>
       </w:r>
     </w:p>
     <w:p>
@@ -825,7 +864,7 @@
           <w:rFonts w:ascii="Calibri" w:hAnsi="Calibri"/>
           <w:sz w:val="22"/>
         </w:rPr>
-        <w:t>coverage and unmatched vocabulary;</w:t>
+        <w:t>token- and type-weighted summaries;</w:t>
       </w:r>
     </w:p>
     <w:p>
@@ -843,7 +882,7 @@
           <w:rFonts w:ascii="Calibri" w:hAnsi="Calibri"/>
           <w:sz w:val="22"/>
         </w:rPr>
-        <w:t>cumulative, length-sensitive normative lexical totals;</w:t>
+        <w:t>part-of-speech counts and relative shares over all eligible lexical tokens;</w:t>
       </w:r>
     </w:p>
     <w:p>
@@ -861,7 +900,7 @@
           <w:rFonts w:ascii="Calibri" w:hAnsi="Calibri"/>
           <w:sz w:val="22"/>
         </w:rPr>
-        <w:t>the largest midpoint-centered lexical contributors;</w:t>
+        <w:t>all-matched and stopword-excluded VAD views;</w:t>
       </w:r>
     </w:p>
     <w:p>
@@ -879,7 +918,7 @@
           <w:rFonts w:ascii="Calibri" w:hAnsi="Calibri"/>
           <w:sz w:val="22"/>
         </w:rPr>
-        <w:t>work-level and collection-level corpus comparisons;</w:t>
+        <w:t>coverage and unmatched vocabulary;</w:t>
       </w:r>
     </w:p>
     <w:p>
@@ -897,7 +936,7 @@
           <w:rFonts w:ascii="Calibri" w:hAnsi="Calibri"/>
           <w:sz w:val="22"/>
         </w:rPr>
-        <w:t>named, versioned review scenarios for flags, exclusions, and approved mappings;</w:t>
+        <w:t>cumulative, length-sensitive normative lexical totals;</w:t>
       </w:r>
     </w:p>
     <w:p>
@@ -915,7 +954,7 @@
           <w:rFonts w:ascii="Calibri" w:hAnsi="Calibri"/>
           <w:sz w:val="22"/>
         </w:rPr>
-        <w:t>source provenance and uncertainty fields in Lexicon Explorer;</w:t>
+        <w:t>the largest midpoint-centered lexical contributors;</w:t>
       </w:r>
     </w:p>
     <w:p>
@@ -933,20 +972,7 @@
           <w:rFonts w:ascii="Calibri" w:hAnsi="Calibri"/>
           <w:sz w:val="22"/>
         </w:rPr>
-        <w:t>optional normative lexical concreteness statistics, coverage, structural</w:t>
-      </w:r>
-    </w:p>
-    <w:p>
-      <w:pPr>
-        <w:widowControl/>
-        <w:spacing w:before="0" w:after="120" w:line="300" w:lineRule="auto"/>
-      </w:pPr>
-      <w:r>
-        <w:rPr>
-          <w:rFonts w:ascii="Calibri" w:hAnsi="Calibri"/>
-          <w:sz w:val="22"/>
-        </w:rPr>
-        <w:t xml:space="preserve">  summaries, term rankings, and token audit from a local research workbook; and</w:t>
+        <w:t>work-level and collection-level corpus comparisons;</w:t>
       </w:r>
     </w:p>
     <w:p>
@@ -964,20 +990,7 @@
           <w:rFonts w:ascii="Calibri" w:hAnsi="Calibri"/>
           <w:sz w:val="22"/>
         </w:rPr>
-        <w:t>optional SUBTLEX-US Zipf frequency statistics, coverage, rarity bands,</w:t>
-      </w:r>
-    </w:p>
-    <w:p>
-      <w:pPr>
-        <w:widowControl/>
-        <w:spacing w:before="0" w:after="120" w:line="300" w:lineRule="auto"/>
-      </w:pPr>
-      <w:r>
-        <w:rPr>
-          <w:rFonts w:ascii="Calibri" w:hAnsi="Calibri"/>
-          <w:sz w:val="22"/>
-        </w:rPr>
-        <w:t xml:space="preserve">  structural summaries, term rankings, and token audit; and</w:t>
+        <w:t>named, versioned review scenarios for flags, exclusions, and approved mappings;</w:t>
       </w:r>
     </w:p>
     <w:p>
@@ -995,20 +1008,7 @@
           <w:rFonts w:ascii="Calibri" w:hAnsi="Calibri"/>
           <w:sz w:val="22"/>
         </w:rPr>
-        <w:t>optional Kuperman retrospective Age of Acquisition statistics, coverage,</w:t>
-      </w:r>
-    </w:p>
-    <w:p>
-      <w:pPr>
-        <w:widowControl/>
-        <w:spacing w:before="0" w:after="120" w:line="300" w:lineRule="auto"/>
-      </w:pPr>
-      <w:r>
-        <w:rPr>
-          <w:rFonts w:ascii="Calibri" w:hAnsi="Calibri"/>
-          <w:sz w:val="22"/>
-        </w:rPr>
-        <w:t xml:space="preserve">  source-response evidence, configurable orientation bands, structural   summaries, descriptive cross-module relationships, term rankings, and token   audit; and</w:t>
+        <w:t>source provenance and uncertainty fields in Lexicon Explorer;</w:t>
       </w:r>
     </w:p>
     <w:p>
@@ -1026,7 +1026,7 @@
           <w:rFonts w:ascii="Calibri" w:hAnsi="Calibri"/>
           <w:sz w:val="22"/>
         </w:rPr>
-        <w:t>optional exact observed-form CMUdict pronunciation candidates, resolved</w:t>
+        <w:t>optional normative lexical concreteness statistics, coverage, structural</w:t>
       </w:r>
     </w:p>
     <w:p>
@@ -1039,7 +1039,7 @@
           <w:rFonts w:ascii="Calibri" w:hAnsi="Calibri"/>
           <w:sz w:val="22"/>
         </w:rPr>
-        <w:t xml:space="preserve">  syllables, complete-line totals, lexical-stress sequences, coverage,   ambiguity evidence, poem-specific scholar overrides, and token/type/line   audits; and</w:t>
+        <w:t xml:space="preserve">  summaries, term rankings, and token audit from a local research workbook; and</w:t>
       </w:r>
     </w:p>
     <w:p>
@@ -1057,7 +1057,7 @@
           <w:rFonts w:ascii="Calibri" w:hAnsi="Calibri"/>
           <w:sz w:val="22"/>
         </w:rPr>
-        <w:t>optional candidate-meter alignment against five recurring stress patterns</w:t>
+        <w:t>optional SUBTLEX-US Zipf frequency statistics, coverage, rarity bands,</w:t>
       </w:r>
     </w:p>
     <w:p>
@@ -1070,7 +1070,7 @@
           <w:rFonts w:ascii="Calibri" w:hAnsi="Calibri"/>
           <w:sz w:val="22"/>
         </w:rPr>
-        <w:t xml:space="preserve">  from monometer through octameter, line fit, deviations, alternatives,   coverage, and a complete alignment audit, plus an optional separate   performance-aware realization layer with contextual prominence, phrasing,   substitutions, stanza recurrence, alternate readings, and scholar   revisions; and</w:t>
+        <w:t xml:space="preserve">  structural summaries, term rankings, and token audit; and</w:t>
       </w:r>
     </w:p>
     <w:p>
@@ -1088,7 +1088,7 @@
           <w:rFonts w:ascii="Calibri" w:hAnsi="Calibri"/>
           <w:sz w:val="22"/>
         </w:rPr>
-        <w:t>optional exact end-rhyme schemes, perfect/identical and</w:t>
+        <w:t>optional Kuperman retrospective Age of Acquisition statistics, coverage,</w:t>
       </w:r>
     </w:p>
     <w:p>
@@ -1101,7 +1101,7 @@
           <w:rFonts w:ascii="Calibri" w:hAnsi="Calibri"/>
           <w:sz w:val="22"/>
         </w:rPr>
-        <w:t xml:space="preserve">  masculine/feminine/multisyllabic evidence, graded slant and eye rhyme,   internal rhyme, refrains, phonemic alliteration, assonance, consonance,   line-ending coverage, and complete line/pair audit evidence; and</w:t>
+        <w:t xml:space="preserve">  source-response evidence, configurable orientation bands, structural   summaries, descriptive cross-module relationships, term rankings, and token   audit; and</w:t>
       </w:r>
     </w:p>
     <w:p>
@@ -1119,7 +1119,7 @@
           <w:rFonts w:ascii="Calibri" w:hAnsi="Calibri"/>
           <w:sz w:val="22"/>
         </w:rPr>
-        <w:t>optional surface-form lexical diversity, alphabetic word length, and</w:t>
+        <w:t>optional exact observed-form CMUdict pronunciation candidates, resolved</w:t>
       </w:r>
     </w:p>
     <w:p>
@@ -1132,236 +1132,7 @@
           <w:rFonts w:ascii="Calibri" w:hAnsi="Calibri"/>
           <w:sz w:val="22"/>
         </w:rPr>
-        <w:t xml:space="preserve">  physical-line and stanza word-count evidence with complete token and   structural audits.</w:t>
-      </w:r>
-    </w:p>
-    <w:p>
-      <w:pPr>
-        <w:pStyle w:val="Heading2"/>
-      </w:pPr>
-      <w:r>
-        <w:rPr>
-          <w:rFonts w:ascii="Calibri" w:hAnsi="Calibri"/>
-          <w:sz w:val="22"/>
-        </w:rPr>
-        <w:t>What VerseVAD does not do</w:t>
-      </w:r>
-    </w:p>
-    <w:p>
-      <w:pPr>
-        <w:widowControl/>
-        <w:spacing w:before="0" w:after="120" w:line="300" w:lineRule="auto"/>
-      </w:pPr>
-      <w:r>
-        <w:rPr>
-          <w:rFonts w:ascii="Calibri" w:hAnsi="Calibri"/>
-          <w:sz w:val="22"/>
-        </w:rPr>
-        <w:t>VerseVAD does not infer an author's intention, diagnose a speaker, identify a poem's true emotion, or measure an individual reader's response. It does not resolve irony, metaphor, polysemy, historical sense, narrative distance, quotation, or negation compositionally. It provides inspectable lexical evidence for a scholar to interpret in context.</w:t>
-      </w:r>
-    </w:p>
-    <w:p>
-      <w:pPr>
-        <w:pStyle w:val="Heading2"/>
-      </w:pPr>
-      <w:r>
-        <w:rPr>
-          <w:rFonts w:ascii="Calibri" w:hAnsi="Calibri"/>
-          <w:sz w:val="22"/>
-        </w:rPr>
-        <w:t>Privacy and offline use</w:t>
-      </w:r>
-    </w:p>
-    <w:p>
-      <w:pPr>
-        <w:widowControl/>
-        <w:spacing w:before="0" w:after="120" w:line="300" w:lineRule="auto"/>
-      </w:pPr>
-      <w:r>
-        <w:rPr>
-          <w:rFonts w:ascii="Calibri" w:hAnsi="Calibri"/>
-          <w:sz w:val="22"/>
-        </w:rPr>
-        <w:t xml:space="preserve">Ordinary use runs locally on this computer at </w:t>
-      </w:r>
-      <w:r>
-        <w:rPr>
-          <w:rFonts w:ascii="Consolas" w:hAnsi="Consolas"/>
-          <w:color w:val="1F4D78"/>
-          <w:sz w:val="19"/>
-        </w:rPr>
-        <w:t>http://127.0.0.1:8501</w:t>
-      </w:r>
-      <w:r>
-        <w:rPr>
-          <w:rFonts w:ascii="Calibri" w:hAnsi="Calibri"/>
-          <w:sz w:val="22"/>
-        </w:rPr>
-        <w:t>. VerseVAD does not send literary texts, lexicons, projects, or results to ChatGPT, OpenAI, or another external service. Once the local environment is installed, ordinary analysis does not require a ChatGPT subscription.</w:t>
-      </w:r>
-    </w:p>
-    <w:p>
-      <w:pPr>
-        <w:widowControl/>
-        <w:spacing w:before="0" w:after="120" w:line="300" w:lineRule="auto"/>
-      </w:pPr>
-      <w:r>
-        <w:rPr>
-          <w:rFonts w:ascii="Calibri" w:hAnsi="Calibri"/>
-          <w:sz w:val="22"/>
-        </w:rPr>
-        <w:t xml:space="preserve">The supplied lexicons remain under </w:t>
-      </w:r>
-      <w:r>
-        <w:rPr>
-          <w:rFonts w:ascii="Consolas" w:hAnsi="Consolas"/>
-          <w:color w:val="1F4D78"/>
-          <w:sz w:val="19"/>
-        </w:rPr>
-        <w:t>source_lexicons/</w:t>
-      </w:r>
-      <w:r>
-        <w:rPr>
-          <w:rFonts w:ascii="Calibri" w:hAnsi="Calibri"/>
-          <w:sz w:val="22"/>
-        </w:rPr>
-        <w:t xml:space="preserve"> and must not be renamed, edited, merged, or redistributed. VerseVAD reads them in place, records SHA-256 checksums, and stores derived project data separately.</w:t>
-      </w:r>
-    </w:p>
-    <w:p>
-      <w:pPr>
-        <w:widowControl/>
-        <w:spacing w:before="0" w:after="120" w:line="300" w:lineRule="auto"/>
-      </w:pPr>
-      <w:r>
-        <w:rPr>
-          <w:rFonts w:ascii="Calibri" w:hAnsi="Calibri"/>
-          <w:sz w:val="22"/>
-        </w:rPr>
-        <w:t xml:space="preserve">Optional research resources under </w:t>
-      </w:r>
-      <w:r>
-        <w:rPr>
-          <w:rFonts w:ascii="Consolas" w:hAnsi="Consolas"/>
-          <w:color w:val="1F4D78"/>
-          <w:sz w:val="19"/>
-        </w:rPr>
-        <w:t>resources/</w:t>
-      </w:r>
-      <w:r>
-        <w:rPr>
-          <w:rFonts w:ascii="Calibri" w:hAnsi="Calibri"/>
-          <w:sz w:val="22"/>
-        </w:rPr>
-        <w:t xml:space="preserve"> are also local and excluded from source control. The Stage 2 concreteness workbook and paper, Stage 3 SUBTLEX-US workbook, Stage 4 Kuperman Age of Acquisition workbook and paper, and Stage 5 pinned CMUdict files must retain their exact paths and checksums. VerseVAD reads analysis sources in place and does not copy any complete research source into an export.</w:t>
-      </w:r>
-    </w:p>
-    <w:p>
-      <w:pPr>
-        <w:pStyle w:val="Heading2"/>
-      </w:pPr>
-      <w:r>
-        <w:rPr>
-          <w:rFonts w:ascii="Calibri" w:hAnsi="Calibri"/>
-          <w:sz w:val="22"/>
-        </w:rPr>
-        <w:t>Software and research-source licensing</w:t>
-      </w:r>
-    </w:p>
-    <w:p>
-      <w:pPr>
-        <w:widowControl/>
-        <w:spacing w:before="0" w:after="120" w:line="300" w:lineRule="auto"/>
-      </w:pPr>
-      <w:r>
-        <w:rPr>
-          <w:rFonts w:ascii="Calibri" w:hAnsi="Calibri"/>
-          <w:sz w:val="22"/>
-        </w:rPr>
-        <w:t xml:space="preserve">VerseVAD code and documentation are free and open-source software under </w:t>
-      </w:r>
-      <w:r>
-        <w:rPr>
-          <w:rFonts w:ascii="Consolas" w:hAnsi="Consolas"/>
-          <w:color w:val="1F4D78"/>
-          <w:sz w:val="19"/>
-        </w:rPr>
-        <w:t>GPL-3.0-only</w:t>
-      </w:r>
-      <w:r>
-        <w:rPr>
-          <w:rFonts w:ascii="Calibri" w:hAnsi="Calibri"/>
-          <w:sz w:val="22"/>
-        </w:rPr>
-        <w:t xml:space="preserve">. The GPL permits educational, research, personal, and commercial use of VerseVAD, subject to its source-distribution and copyleft conditions. VerseVAD is supplied without warranty; the full terms are in </w:t>
-      </w:r>
-      <w:r>
-        <w:rPr>
-          <w:rFonts w:ascii="Consolas" w:hAnsi="Consolas"/>
-          <w:color w:val="1F4D78"/>
-          <w:sz w:val="19"/>
-        </w:rPr>
-        <w:t>LICENSE</w:t>
-      </w:r>
-      <w:r>
-        <w:rPr>
-          <w:rFonts w:ascii="Calibri" w:hAnsi="Calibri"/>
-          <w:sz w:val="22"/>
-        </w:rPr>
-        <w:t>.</w:t>
-      </w:r>
-    </w:p>
-    <w:p>
-      <w:pPr>
-        <w:widowControl/>
-        <w:spacing w:before="0" w:after="120" w:line="300" w:lineRule="auto"/>
-      </w:pPr>
-      <w:r>
-        <w:rPr>
-          <w:rFonts w:ascii="Calibri" w:hAnsi="Calibri"/>
-          <w:sz w:val="22"/>
-        </w:rPr>
-        <w:t>The GPL does not relicense the lexicons, workbooks, papers, language model, or literary texts used with VerseVAD. A public VerseVAD checkout contains no research datasets. Users must obtain each source from its creator or publisher, follow its current terms, and must not assume that a permission applying to the software also applies to the data.</w:t>
-      </w:r>
-    </w:p>
-    <w:p>
-      <w:pPr>
-        <w:pStyle w:val="Heading2"/>
-      </w:pPr>
-      <w:r>
-        <w:rPr>
-          <w:rFonts w:ascii="Calibri" w:hAnsi="Calibri"/>
-          <w:sz w:val="22"/>
-        </w:rPr>
-        <w:t>Installing separately downloaded research resources</w:t>
-      </w:r>
-    </w:p>
-    <w:p>
-      <w:pPr>
-        <w:widowControl/>
-        <w:spacing w:before="0" w:after="120" w:line="300" w:lineRule="auto"/>
-      </w:pPr>
-      <w:r>
-        <w:rPr>
-          <w:rFonts w:ascii="Calibri" w:hAnsi="Calibri"/>
-          <w:sz w:val="22"/>
-        </w:rPr>
-        <w:t xml:space="preserve">The tracked </w:t>
-      </w:r>
-      <w:r>
-        <w:rPr>
-          <w:rFonts w:ascii="Consolas" w:hAnsi="Consolas"/>
-          <w:color w:val="1F4D78"/>
-          <w:sz w:val="19"/>
-        </w:rPr>
-        <w:t>docs/resource-installation.md</w:t>
-      </w:r>
-      <w:r>
-        <w:rPr>
-          <w:rFonts w:ascii="Calibri" w:hAnsi="Calibri"/>
-          <w:sz w:val="22"/>
-        </w:rPr>
-        <w:t xml:space="preserve"> guide is the source of truth for official download pages, exact destinations, supported SHA-256 values, and source-specific cautions. The principal official pages are:</w:t>
+        <w:t xml:space="preserve">  syllables, complete-line totals, lexical-stress sequences, coverage,   ambiguity evidence, poem-specific scholar overrides, and token/type/line   audits; and</w:t>
       </w:r>
     </w:p>
     <w:p>
@@ -1379,7 +1150,7 @@
           <w:rFonts w:ascii="Calibri" w:hAnsi="Calibri"/>
           <w:sz w:val="22"/>
         </w:rPr>
-        <w:t>Warriner VAD, concreteness, and Kuperman AoA: the relevant *Behavior</w:t>
+        <w:t>optional candidate-meter alignment against five recurring stress patterns</w:t>
       </w:r>
     </w:p>
     <w:p>
@@ -1392,7 +1163,7 @@
           <w:rFonts w:ascii="Calibri" w:hAnsi="Calibri"/>
           <w:sz w:val="22"/>
         </w:rPr>
-        <w:t xml:space="preserve">  Research Methods* article and supplementary-material pages;</w:t>
+        <w:t xml:space="preserve">  from monometer through octameter, line fit, deviations, alternatives,   coverage, and a complete alignment audit, plus an optional separate   performance-aware realization layer with contextual prominence, phrasing,   substitutions, stanza recurrence, alternate readings, and scholar   revisions; and</w:t>
       </w:r>
     </w:p>
     <w:p>
@@ -1410,22 +1181,20 @@
           <w:rFonts w:ascii="Calibri" w:hAnsi="Calibri"/>
           <w:sz w:val="22"/>
         </w:rPr>
-        <w:t xml:space="preserve">NRC VAD: </w:t>
-      </w:r>
-      <w:r>
-        <w:rPr>
-          <w:rFonts w:ascii="Consolas" w:hAnsi="Consolas"/>
-          <w:color w:val="1F4D78"/>
-          <w:sz w:val="19"/>
-        </w:rPr>
-        <w:t>https://saifmohammad.com/WebPages/nrc-vad.html</w:t>
-      </w:r>
-      <w:r>
-        <w:rPr>
-          <w:rFonts w:ascii="Calibri" w:hAnsi="Calibri"/>
-          <w:sz w:val="22"/>
-        </w:rPr>
-        <w:t>;</w:t>
+        <w:t>optional exact end-rhyme schemes, perfect/identical and</w:t>
+      </w:r>
+    </w:p>
+    <w:p>
+      <w:pPr>
+        <w:widowControl/>
+        <w:spacing w:before="0" w:after="120" w:line="300" w:lineRule="auto"/>
+      </w:pPr>
+      <w:r>
+        <w:rPr>
+          <w:rFonts w:ascii="Calibri" w:hAnsi="Calibri"/>
+          <w:sz w:val="22"/>
+        </w:rPr>
+        <w:t xml:space="preserve">  masculine/feminine/multisyllabic evidence, graded slant and eye rhyme,   internal rhyme, refrains, phonemic alliteration, assonance, consonance,   line-ending coverage, and complete line/pair audit evidence; and</w:t>
       </w:r>
     </w:p>
     <w:p>
@@ -1443,7 +1212,7 @@
           <w:rFonts w:ascii="Calibri" w:hAnsi="Calibri"/>
           <w:sz w:val="22"/>
         </w:rPr>
-        <w:t>NRC Emotion:</w:t>
+        <w:t>optional surface-form lexical diversity, alphabetic word length, and</w:t>
       </w:r>
     </w:p>
     <w:p>
@@ -1456,7 +1225,57 @@
           <w:rFonts w:ascii="Calibri" w:hAnsi="Calibri"/>
           <w:sz w:val="22"/>
         </w:rPr>
-        <w:t xml:space="preserve">  </w:t>
+        <w:t xml:space="preserve">  physical-line and stanza word-count evidence with complete token and   structural audits.</w:t>
+      </w:r>
+    </w:p>
+    <w:p>
+      <w:pPr>
+        <w:pStyle w:val="Heading2"/>
+      </w:pPr>
+      <w:r>
+        <w:rPr>
+          <w:rFonts w:ascii="Calibri" w:hAnsi="Calibri"/>
+          <w:sz w:val="22"/>
+        </w:rPr>
+        <w:t>What VerseVAD does not do</w:t>
+      </w:r>
+    </w:p>
+    <w:p>
+      <w:pPr>
+        <w:widowControl/>
+        <w:spacing w:before="0" w:after="120" w:line="300" w:lineRule="auto"/>
+      </w:pPr>
+      <w:r>
+        <w:rPr>
+          <w:rFonts w:ascii="Calibri" w:hAnsi="Calibri"/>
+          <w:sz w:val="22"/>
+        </w:rPr>
+        <w:t>VerseVAD does not infer an author's intention, diagnose a speaker, identify a poem's true emotion, or measure an individual reader's response. It does not resolve irony, metaphor, polysemy, historical sense, narrative distance, quotation, or negation compositionally. It provides inspectable lexical evidence for a scholar to interpret in context.</w:t>
+      </w:r>
+    </w:p>
+    <w:p>
+      <w:pPr>
+        <w:pStyle w:val="Heading2"/>
+      </w:pPr>
+      <w:r>
+        <w:rPr>
+          <w:rFonts w:ascii="Calibri" w:hAnsi="Calibri"/>
+          <w:sz w:val="22"/>
+        </w:rPr>
+        <w:t>Privacy and offline use</w:t>
+      </w:r>
+    </w:p>
+    <w:p>
+      <w:pPr>
+        <w:widowControl/>
+        <w:spacing w:before="0" w:after="120" w:line="300" w:lineRule="auto"/>
+      </w:pPr>
+      <w:r>
+        <w:rPr>
+          <w:rFonts w:ascii="Calibri" w:hAnsi="Calibri"/>
+          <w:sz w:val="22"/>
+        </w:rPr>
+        <w:t xml:space="preserve">Ordinary use runs locally on this computer at </w:t>
       </w:r>
       <w:r>
         <w:rPr>
@@ -1464,14 +1283,178 @@
           <w:color w:val="1F4D78"/>
           <w:sz w:val="19"/>
         </w:rPr>
-        <w:t>https://saifmohammad.com/WebPages/NRC-Emotion-Lexicon.htm</w:t>
-      </w:r>
-      <w:r>
-        <w:rPr>
-          <w:rFonts w:ascii="Calibri" w:hAnsi="Calibri"/>
-          <w:sz w:val="22"/>
-        </w:rPr>
-        <w:t>;</w:t>
+        <w:t>http://127.0.0.1:8501</w:t>
+      </w:r>
+      <w:r>
+        <w:rPr>
+          <w:rFonts w:ascii="Calibri" w:hAnsi="Calibri"/>
+          <w:sz w:val="22"/>
+        </w:rPr>
+        <w:t>. VerseVAD does not send literary texts, lexicons, projects, or results to an external generative-AI or hosted text-analysis service. Once the local environment is installed, ordinary analysis does not require a third-party subscription.</w:t>
+      </w:r>
+    </w:p>
+    <w:p>
+      <w:pPr>
+        <w:widowControl/>
+        <w:spacing w:before="0" w:after="120" w:line="300" w:lineRule="auto"/>
+      </w:pPr>
+      <w:r>
+        <w:rPr>
+          <w:rFonts w:ascii="Calibri" w:hAnsi="Calibri"/>
+          <w:sz w:val="22"/>
+        </w:rPr>
+        <w:t xml:space="preserve">The supplied lexicons remain under </w:t>
+      </w:r>
+      <w:r>
+        <w:rPr>
+          <w:rFonts w:ascii="Consolas" w:hAnsi="Consolas"/>
+          <w:color w:val="1F4D78"/>
+          <w:sz w:val="19"/>
+        </w:rPr>
+        <w:t>source_lexicons/</w:t>
+      </w:r>
+      <w:r>
+        <w:rPr>
+          <w:rFonts w:ascii="Calibri" w:hAnsi="Calibri"/>
+          <w:sz w:val="22"/>
+        </w:rPr>
+        <w:t xml:space="preserve"> and must not be renamed, edited, merged, or redistributed. VerseVAD reads them in place, records SHA-256 checksums, and stores derived project data separately.</w:t>
+      </w:r>
+    </w:p>
+    <w:p>
+      <w:pPr>
+        <w:widowControl/>
+        <w:spacing w:before="0" w:after="120" w:line="300" w:lineRule="auto"/>
+      </w:pPr>
+      <w:r>
+        <w:rPr>
+          <w:rFonts w:ascii="Calibri" w:hAnsi="Calibri"/>
+          <w:sz w:val="22"/>
+        </w:rPr>
+        <w:t xml:space="preserve">Optional research resources under </w:t>
+      </w:r>
+      <w:r>
+        <w:rPr>
+          <w:rFonts w:ascii="Consolas" w:hAnsi="Consolas"/>
+          <w:color w:val="1F4D78"/>
+          <w:sz w:val="19"/>
+        </w:rPr>
+        <w:t>resources/</w:t>
+      </w:r>
+      <w:r>
+        <w:rPr>
+          <w:rFonts w:ascii="Calibri" w:hAnsi="Calibri"/>
+          <w:sz w:val="22"/>
+        </w:rPr>
+        <w:t xml:space="preserve"> are also local and excluded from source control. The Stage 2 concreteness workbook and paper, Stage 3 SUBTLEX-US workbook, Stage 4 Kuperman Age of Acquisition workbook and paper, and Stage 5 pinned CMUdict files must retain their exact paths and checksums. VerseVAD reads analysis sources in place and does not copy any complete research source into an export.</w:t>
+      </w:r>
+    </w:p>
+    <w:p>
+      <w:pPr>
+        <w:pStyle w:val="Heading2"/>
+      </w:pPr>
+      <w:r>
+        <w:rPr>
+          <w:rFonts w:ascii="Calibri" w:hAnsi="Calibri"/>
+          <w:sz w:val="22"/>
+        </w:rPr>
+        <w:t>Software and research-source licensing</w:t>
+      </w:r>
+    </w:p>
+    <w:p>
+      <w:pPr>
+        <w:widowControl/>
+        <w:spacing w:before="0" w:after="120" w:line="300" w:lineRule="auto"/>
+      </w:pPr>
+      <w:r>
+        <w:rPr>
+          <w:rFonts w:ascii="Calibri" w:hAnsi="Calibri"/>
+          <w:sz w:val="22"/>
+        </w:rPr>
+        <w:t xml:space="preserve">VerseVAD code and documentation are free and open-source software under </w:t>
+      </w:r>
+      <w:r>
+        <w:rPr>
+          <w:rFonts w:ascii="Consolas" w:hAnsi="Consolas"/>
+          <w:color w:val="1F4D78"/>
+          <w:sz w:val="19"/>
+        </w:rPr>
+        <w:t>GPL-3.0-only</w:t>
+      </w:r>
+      <w:r>
+        <w:rPr>
+          <w:rFonts w:ascii="Calibri" w:hAnsi="Calibri"/>
+          <w:sz w:val="22"/>
+        </w:rPr>
+        <w:t xml:space="preserve">. The GPL permits educational, research, personal, and commercial use of VerseVAD, subject to its source-distribution and copyleft conditions. VerseVAD is supplied without warranty; the full terms are in </w:t>
+      </w:r>
+      <w:r>
+        <w:rPr>
+          <w:rFonts w:ascii="Consolas" w:hAnsi="Consolas"/>
+          <w:color w:val="1F4D78"/>
+          <w:sz w:val="19"/>
+        </w:rPr>
+        <w:t>LICENSE</w:t>
+      </w:r>
+      <w:r>
+        <w:rPr>
+          <w:rFonts w:ascii="Calibri" w:hAnsi="Calibri"/>
+          <w:sz w:val="22"/>
+        </w:rPr>
+        <w:t>.</w:t>
+      </w:r>
+    </w:p>
+    <w:p>
+      <w:pPr>
+        <w:widowControl/>
+        <w:spacing w:before="0" w:after="120" w:line="300" w:lineRule="auto"/>
+      </w:pPr>
+      <w:r>
+        <w:rPr>
+          <w:rFonts w:ascii="Calibri" w:hAnsi="Calibri"/>
+          <w:sz w:val="22"/>
+        </w:rPr>
+        <w:t>The GPL does not relicense the lexicons, workbooks, papers, language model, or literary texts used with VerseVAD. A public VerseVAD checkout contains no research datasets. Users must obtain each source from its creator or publisher, follow its current terms, and must not assume that a permission applying to the software also applies to the data.</w:t>
+      </w:r>
+    </w:p>
+    <w:p>
+      <w:pPr>
+        <w:pStyle w:val="Heading2"/>
+      </w:pPr>
+      <w:r>
+        <w:rPr>
+          <w:rFonts w:ascii="Calibri" w:hAnsi="Calibri"/>
+          <w:sz w:val="22"/>
+        </w:rPr>
+        <w:t>Installing separately downloaded research resources</w:t>
+      </w:r>
+    </w:p>
+    <w:p>
+      <w:pPr>
+        <w:widowControl/>
+        <w:spacing w:before="0" w:after="120" w:line="300" w:lineRule="auto"/>
+      </w:pPr>
+      <w:r>
+        <w:rPr>
+          <w:rFonts w:ascii="Calibri" w:hAnsi="Calibri"/>
+          <w:sz w:val="22"/>
+        </w:rPr>
+        <w:t xml:space="preserve">The tracked </w:t>
+      </w:r>
+      <w:r>
+        <w:rPr>
+          <w:rFonts w:ascii="Consolas" w:hAnsi="Consolas"/>
+          <w:color w:val="1F4D78"/>
+          <w:sz w:val="19"/>
+        </w:rPr>
+        <w:t>docs/resource-installation.md</w:t>
+      </w:r>
+      <w:r>
+        <w:rPr>
+          <w:rFonts w:ascii="Calibri" w:hAnsi="Calibri"/>
+          <w:sz w:val="22"/>
+        </w:rPr>
+        <w:t xml:space="preserve"> guide is the source of truth for official download pages, exact destinations, supported SHA-256 values, and source-specific cautions. The principal official pages are:</w:t>
       </w:r>
     </w:p>
     <w:p>
@@ -1489,7 +1472,7 @@
           <w:rFonts w:ascii="Calibri" w:hAnsi="Calibri"/>
           <w:sz w:val="22"/>
         </w:rPr>
-        <w:t>NRC Affect Intensity:</w:t>
+        <w:t>Warriner VAD, concreteness, and Kuperman AoA: the relevant *Behavior</w:t>
       </w:r>
     </w:p>
     <w:p>
@@ -1502,22 +1485,7 @@
           <w:rFonts w:ascii="Calibri" w:hAnsi="Calibri"/>
           <w:sz w:val="22"/>
         </w:rPr>
-        <w:t xml:space="preserve">  </w:t>
-      </w:r>
-      <w:r>
-        <w:rPr>
-          <w:rFonts w:ascii="Consolas" w:hAnsi="Consolas"/>
-          <w:color w:val="1F4D78"/>
-          <w:sz w:val="19"/>
-        </w:rPr>
-        <w:t>https://www.saifmohammad.com/WebPages/AffectIntensity.htm</w:t>
-      </w:r>
-      <w:r>
-        <w:rPr>
-          <w:rFonts w:ascii="Calibri" w:hAnsi="Calibri"/>
-          <w:sz w:val="22"/>
-        </w:rPr>
-        <w:t>;</w:t>
+        <w:t xml:space="preserve">  Research Methods* article and supplementary-material pages;</w:t>
       </w:r>
     </w:p>
     <w:p>
@@ -1535,20 +1503,7 @@
           <w:rFonts w:ascii="Calibri" w:hAnsi="Calibri"/>
           <w:sz w:val="22"/>
         </w:rPr>
-        <w:t>SUBTLEX-US:</w:t>
-      </w:r>
-    </w:p>
-    <w:p>
-      <w:pPr>
-        <w:widowControl/>
-        <w:spacing w:before="0" w:after="120" w:line="300" w:lineRule="auto"/>
-      </w:pPr>
-      <w:r>
-        <w:rPr>
-          <w:rFonts w:ascii="Calibri" w:hAnsi="Calibri"/>
-          <w:sz w:val="22"/>
-        </w:rPr>
-        <w:t xml:space="preserve">  </w:t>
+        <w:t xml:space="preserve">NRC VAD: </w:t>
       </w:r>
       <w:r>
         <w:rPr>
@@ -1556,14 +1511,14 @@
           <w:color w:val="1F4D78"/>
           <w:sz w:val="19"/>
         </w:rPr>
-        <w:t>https://www.ugent.be/pp/experimentele-psychologie/en/research/documents/subtlexus</w:t>
-      </w:r>
-      <w:r>
-        <w:rPr>
-          <w:rFonts w:ascii="Calibri" w:hAnsi="Calibri"/>
-          <w:sz w:val="22"/>
-        </w:rPr>
-        <w:t>;   and</w:t>
+        <w:t>https://saifmohammad.com/WebPages/nrc-vad.html</w:t>
+      </w:r>
+      <w:r>
+        <w:rPr>
+          <w:rFonts w:ascii="Calibri" w:hAnsi="Calibri"/>
+          <w:sz w:val="22"/>
+        </w:rPr>
+        <w:t>;</w:t>
       </w:r>
     </w:p>
     <w:p>
@@ -1581,6 +1536,144 @@
           <w:rFonts w:ascii="Calibri" w:hAnsi="Calibri"/>
           <w:sz w:val="22"/>
         </w:rPr>
+        <w:t>NRC Emotion:</w:t>
+      </w:r>
+    </w:p>
+    <w:p>
+      <w:pPr>
+        <w:widowControl/>
+        <w:spacing w:before="0" w:after="120" w:line="300" w:lineRule="auto"/>
+      </w:pPr>
+      <w:r>
+        <w:rPr>
+          <w:rFonts w:ascii="Calibri" w:hAnsi="Calibri"/>
+          <w:sz w:val="22"/>
+        </w:rPr>
+        <w:t xml:space="preserve">  </w:t>
+      </w:r>
+      <w:r>
+        <w:rPr>
+          <w:rFonts w:ascii="Consolas" w:hAnsi="Consolas"/>
+          <w:color w:val="1F4D78"/>
+          <w:sz w:val="19"/>
+        </w:rPr>
+        <w:t>https://saifmohammad.com/WebPages/NRC-Emotion-Lexicon.htm</w:t>
+      </w:r>
+      <w:r>
+        <w:rPr>
+          <w:rFonts w:ascii="Calibri" w:hAnsi="Calibri"/>
+          <w:sz w:val="22"/>
+        </w:rPr>
+        <w:t>;</w:t>
+      </w:r>
+    </w:p>
+    <w:p>
+      <w:pPr>
+        <w:widowControl/>
+        <w:numPr>
+          <w:ilvl w:val="0"/>
+          <w:numId w:val="10"/>
+        </w:numPr>
+        <w:spacing w:before="0" w:after="80" w:line="300" w:lineRule="auto"/>
+        <w:ind w:left="540" w:hanging="271"/>
+      </w:pPr>
+      <w:r>
+        <w:rPr>
+          <w:rFonts w:ascii="Calibri" w:hAnsi="Calibri"/>
+          <w:sz w:val="22"/>
+        </w:rPr>
+        <w:t>NRC Affect Intensity:</w:t>
+      </w:r>
+    </w:p>
+    <w:p>
+      <w:pPr>
+        <w:widowControl/>
+        <w:spacing w:before="0" w:after="120" w:line="300" w:lineRule="auto"/>
+      </w:pPr>
+      <w:r>
+        <w:rPr>
+          <w:rFonts w:ascii="Calibri" w:hAnsi="Calibri"/>
+          <w:sz w:val="22"/>
+        </w:rPr>
+        <w:t xml:space="preserve">  </w:t>
+      </w:r>
+      <w:r>
+        <w:rPr>
+          <w:rFonts w:ascii="Consolas" w:hAnsi="Consolas"/>
+          <w:color w:val="1F4D78"/>
+          <w:sz w:val="19"/>
+        </w:rPr>
+        <w:t>https://www.saifmohammad.com/WebPages/AffectIntensity.htm</w:t>
+      </w:r>
+      <w:r>
+        <w:rPr>
+          <w:rFonts w:ascii="Calibri" w:hAnsi="Calibri"/>
+          <w:sz w:val="22"/>
+        </w:rPr>
+        <w:t>;</w:t>
+      </w:r>
+    </w:p>
+    <w:p>
+      <w:pPr>
+        <w:widowControl/>
+        <w:numPr>
+          <w:ilvl w:val="0"/>
+          <w:numId w:val="10"/>
+        </w:numPr>
+        <w:spacing w:before="0" w:after="80" w:line="300" w:lineRule="auto"/>
+        <w:ind w:left="540" w:hanging="271"/>
+      </w:pPr>
+      <w:r>
+        <w:rPr>
+          <w:rFonts w:ascii="Calibri" w:hAnsi="Calibri"/>
+          <w:sz w:val="22"/>
+        </w:rPr>
+        <w:t>SUBTLEX-US:</w:t>
+      </w:r>
+    </w:p>
+    <w:p>
+      <w:pPr>
+        <w:widowControl/>
+        <w:spacing w:before="0" w:after="120" w:line="300" w:lineRule="auto"/>
+      </w:pPr>
+      <w:r>
+        <w:rPr>
+          <w:rFonts w:ascii="Calibri" w:hAnsi="Calibri"/>
+          <w:sz w:val="22"/>
+        </w:rPr>
+        <w:t xml:space="preserve">  </w:t>
+      </w:r>
+      <w:r>
+        <w:rPr>
+          <w:rFonts w:ascii="Consolas" w:hAnsi="Consolas"/>
+          <w:color w:val="1F4D78"/>
+          <w:sz w:val="19"/>
+        </w:rPr>
+        <w:t>https://www.ugent.be/pp/experimentele-psychologie/en/research/documents/subtlexus</w:t>
+      </w:r>
+      <w:r>
+        <w:rPr>
+          <w:rFonts w:ascii="Calibri" w:hAnsi="Calibri"/>
+          <w:sz w:val="22"/>
+        </w:rPr>
+        <w:t>;   and</w:t>
+      </w:r>
+    </w:p>
+    <w:p>
+      <w:pPr>
+        <w:widowControl/>
+        <w:numPr>
+          <w:ilvl w:val="0"/>
+          <w:numId w:val="10"/>
+        </w:numPr>
+        <w:spacing w:before="0" w:after="80" w:line="300" w:lineRule="auto"/>
+        <w:ind w:left="540" w:hanging="271"/>
+      </w:pPr>
+      <w:r>
+        <w:rPr>
+          <w:rFonts w:ascii="Calibri" w:hAnsi="Calibri"/>
+          <w:sz w:val="22"/>
+        </w:rPr>
         <w:t xml:space="preserve">CMUdict: </w:t>
       </w:r>
       <w:r>
@@ -2764,7 +2857,7 @@
           <w:b/>
           <w:sz w:val="22"/>
         </w:rPr>
-        <w:t>Choose Evidence</w:t>
+        <w:t>Additional Optional Models</w:t>
       </w:r>
       <w:r>
         <w:rPr>
@@ -11210,7 +11303,7 @@
           <w:rFonts w:ascii="Calibri" w:hAnsi="Calibri"/>
           <w:sz w:val="22"/>
         </w:rPr>
-        <w:t>Affective Evidence: Emotion Association and Intensity section</w:t>
+        <w:t>Affective Evidence: Emotion Association, Intensity, and Sentiment section</w:t>
       </w:r>
     </w:p>
     <w:p>
@@ -11223,7 +11316,7 @@
           <w:rFonts w:ascii="Calibri" w:hAnsi="Calibri"/>
           <w:sz w:val="22"/>
         </w:rPr>
-        <w:t>The eight emotion associations, positive/negative sentiment associations, and numeric emotion intensities appear in three separate sections. Do not compare their values as though they were alternate VAD scales.</w:t>
+        <w:t>The eight emotion associations, positive/negative NRC sentiment associations, numeric emotion intensities, and VADER rule-based polarity appear as separate constructs. VADER reports raw positive/neutral/negative proportions and a rule-adjusted compound score. Its conventional threshold label is not a declaration of the poem's emotion, and its social-media design can misread poetic ambiguity, irony, persona, quotation, and historical usage. Do not compare these values as though they were alternate VAD scales.</w:t>
       </w:r>
     </w:p>
     <w:p>
@@ -11235,7 +11328,7 @@
           <w:rFonts w:ascii="Calibri" w:hAnsi="Calibri"/>
           <w:sz w:val="22"/>
         </w:rPr>
-        <w:t>Lexical Character: Concreteness section</w:t>
+        <w:t>Affective Evidence: Lexical Trajectory section</w:t>
       </w:r>
     </w:p>
     <w:p>
@@ -11248,58 +11341,7 @@
           <w:rFonts w:ascii="Calibri" w:hAnsi="Calibri"/>
           <w:sz w:val="22"/>
         </w:rPr>
-        <w:t>This tab appears as the dedicated home for the optional result. It shows overall 1-5 source-scale statistics, token/type coverage, configured bands, warnings, line and stanza patterns, model-assigned POS groups, represented term extremes, a token audit, and source/configuration provenance. Exact surface, exact phrase, lemma, documented fallback, unmatched, and ineligible rows stay distinct.</w:t>
-      </w:r>
-    </w:p>
-    <w:p>
-      <w:pPr>
-        <w:widowControl/>
-        <w:spacing w:before="0" w:after="120" w:line="300" w:lineRule="auto"/>
-      </w:pPr>
-      <w:r>
-        <w:rPr>
-          <w:rFonts w:ascii="Calibri" w:hAnsi="Calibri"/>
-          <w:sz w:val="22"/>
-        </w:rPr>
-        <w:t>The source workbook is read-only. If it is missing, changed, malformed, or unsupported, the checkbox is unavailable and VerseVAD presents a plain-language status instead of partially activating the module.</w:t>
-      </w:r>
-    </w:p>
-    <w:p>
-      <w:pPr>
-        <w:pStyle w:val="Heading2"/>
-      </w:pPr>
-      <w:r>
-        <w:rPr>
-          <w:rFonts w:ascii="Calibri" w:hAnsi="Calibri"/>
-          <w:sz w:val="22"/>
-        </w:rPr>
-        <w:t>Lexical Character: Frequency &amp; Rarity section</w:t>
-      </w:r>
-    </w:p>
-    <w:p>
-      <w:pPr>
-        <w:widowControl/>
-        <w:spacing w:before="0" w:after="120" w:line="300" w:lineRule="auto"/>
-      </w:pPr>
-      <w:r>
-        <w:rPr>
-          <w:rFonts w:ascii="Calibri" w:hAnsi="Calibri"/>
-          <w:sz w:val="22"/>
-        </w:rPr>
-        <w:t>This tab appears when the optional SUBTLEX-US module is enabled. It emphasizes the token-weighted median Zipf value and shows the mean, IQR, token/type coverage, configured bands, warnings, line and stanza patterns, model-assigned POS groups, lowest/highest represented terms, rare tail, complete token audit, and source/configuration provenance.</w:t>
-      </w:r>
-    </w:p>
-    <w:p>
-      <w:pPr>
-        <w:widowControl/>
-        <w:spacing w:before="0" w:after="120" w:line="300" w:lineRule="auto"/>
-      </w:pPr>
-      <w:r>
-        <w:rPr>
-          <w:rFonts w:ascii="Calibri" w:hAnsi="Calibri"/>
-          <w:sz w:val="22"/>
-        </w:rPr>
-        <w:t xml:space="preserve">The page identifies whether the default all-lexical-token scope or the non-default </w:t>
+        <w:t xml:space="preserve">This default-collapsed section plots token-weighted mean normalized valence, arousal, and dominance by preserved physical line for one selected VAD source. When Concreteness was enabled, it adds a fourth line using </w:t>
       </w:r>
       <w:r>
         <w:rPr>
@@ -11307,14 +11349,90 @@
           <w:color w:val="1F4D78"/>
           <w:sz w:val="19"/>
         </w:rPr>
-        <w:t>NOUN</w:t>
-      </w:r>
-      <w:r>
-        <w:rPr>
-          <w:rFonts w:ascii="Calibri" w:hAnsi="Calibri"/>
-          <w:sz w:val="22"/>
-        </w:rPr>
-        <w:t>/</w:t>
+        <w:t>(rating - 1) / 4</w:t>
+      </w:r>
+      <w:r>
+        <w:rPr>
+          <w:rFonts w:ascii="Calibri" w:hAnsi="Calibri"/>
+          <w:sz w:val="22"/>
+        </w:rPr>
+        <w:t xml:space="preserve"> for overlay display while retaining the original 1-5 mean in the table and export. Multiple VAD lexicons remain separate in the source dropdown. Changing the source or token scope retains Affective Evidence. Missing line evidence remains a gap rather than zero.</w:t>
+      </w:r>
+    </w:p>
+    <w:p>
+      <w:pPr>
+        <w:pStyle w:val="Heading2"/>
+      </w:pPr>
+      <w:r>
+        <w:rPr>
+          <w:rFonts w:ascii="Calibri" w:hAnsi="Calibri"/>
+          <w:sz w:val="22"/>
+        </w:rPr>
+        <w:t>Lexical Character: Concreteness section</w:t>
+      </w:r>
+    </w:p>
+    <w:p>
+      <w:pPr>
+        <w:widowControl/>
+        <w:spacing w:before="0" w:after="120" w:line="300" w:lineRule="auto"/>
+      </w:pPr>
+      <w:r>
+        <w:rPr>
+          <w:rFonts w:ascii="Calibri" w:hAnsi="Calibri"/>
+          <w:sz w:val="22"/>
+        </w:rPr>
+        <w:t>This tab appears as the dedicated home for the optional result. It shows overall 1-5 source-scale statistics, token/type coverage, configured bands, warnings, line and stanza patterns, model-assigned POS groups, represented term extremes, a token audit, and source/configuration provenance. Exact surface, exact phrase, lemma, documented fallback, unmatched, and ineligible rows stay distinct.</w:t>
+      </w:r>
+    </w:p>
+    <w:p>
+      <w:pPr>
+        <w:widowControl/>
+        <w:spacing w:before="0" w:after="120" w:line="300" w:lineRule="auto"/>
+      </w:pPr>
+      <w:r>
+        <w:rPr>
+          <w:rFonts w:ascii="Calibri" w:hAnsi="Calibri"/>
+          <w:sz w:val="22"/>
+        </w:rPr>
+        <w:t>The source workbook is read-only. If it is missing, changed, malformed, or unsupported, the checkbox is unavailable and VerseVAD presents a plain-language status instead of partially activating the module.</w:t>
+      </w:r>
+    </w:p>
+    <w:p>
+      <w:pPr>
+        <w:pStyle w:val="Heading2"/>
+      </w:pPr>
+      <w:r>
+        <w:rPr>
+          <w:rFonts w:ascii="Calibri" w:hAnsi="Calibri"/>
+          <w:sz w:val="22"/>
+        </w:rPr>
+        <w:t>Lexical Character: Frequency &amp; Rarity section</w:t>
+      </w:r>
+    </w:p>
+    <w:p>
+      <w:pPr>
+        <w:widowControl/>
+        <w:spacing w:before="0" w:after="120" w:line="300" w:lineRule="auto"/>
+      </w:pPr>
+      <w:r>
+        <w:rPr>
+          <w:rFonts w:ascii="Calibri" w:hAnsi="Calibri"/>
+          <w:sz w:val="22"/>
+        </w:rPr>
+        <w:t>This tab appears when the optional SUBTLEX-US module is enabled. It emphasizes the token-weighted median Zipf value and shows the mean, IQR, token/type coverage, configured bands, warnings, line and stanza patterns, model-assigned POS groups, lowest/highest represented terms, rare tail, complete token audit, and source/configuration provenance.</w:t>
+      </w:r>
+    </w:p>
+    <w:p>
+      <w:pPr>
+        <w:widowControl/>
+        <w:spacing w:before="0" w:after="120" w:line="300" w:lineRule="auto"/>
+      </w:pPr>
+      <w:r>
+        <w:rPr>
+          <w:rFonts w:ascii="Calibri" w:hAnsi="Calibri"/>
+          <w:sz w:val="22"/>
+        </w:rPr>
+        <w:t xml:space="preserve">The page identifies whether the default all-lexical-token scope or the non-default </w:t>
       </w:r>
       <w:r>
         <w:rPr>
@@ -11322,7 +11440,7 @@
           <w:color w:val="1F4D78"/>
           <w:sz w:val="19"/>
         </w:rPr>
-        <w:t>VERB</w:t>
+        <w:t>NOUN</w:t>
       </w:r>
       <w:r>
         <w:rPr>
@@ -11337,7 +11455,7 @@
           <w:color w:val="1F4D78"/>
           <w:sz w:val="19"/>
         </w:rPr>
-        <w:t>ADJ</w:t>
+        <w:t>VERB</w:t>
       </w:r>
       <w:r>
         <w:rPr>
@@ -11352,6 +11470,21 @@
           <w:color w:val="1F4D78"/>
           <w:sz w:val="19"/>
         </w:rPr>
+        <w:t>ADJ</w:t>
+      </w:r>
+      <w:r>
+        <w:rPr>
+          <w:rFonts w:ascii="Calibri" w:hAnsi="Calibri"/>
+          <w:sz w:val="22"/>
+        </w:rPr>
+        <w:t>/</w:t>
+      </w:r>
+      <w:r>
+        <w:rPr>
+          <w:rFonts w:ascii="Consolas" w:hAnsi="Consolas"/>
+          <w:color w:val="1F4D78"/>
+          <w:sz w:val="19"/>
+        </w:rPr>
         <w:t>ADV</w:t>
       </w:r>
       <w:r>
@@ -11371,7 +11504,7 @@
           <w:rFonts w:ascii="Calibri" w:hAnsi="Calibri"/>
           <w:sz w:val="22"/>
         </w:rPr>
-        <w:t>Lexical Character: Age of Acquisition section</w:t>
+        <w:t>Lexical Character: Acquisition and Readability section</w:t>
       </w:r>
     </w:p>
     <w:p>
@@ -11384,7 +11517,20 @@
           <w:rFonts w:ascii="Calibri" w:hAnsi="Calibri"/>
           <w:sz w:val="22"/>
         </w:rPr>
-        <w:t>This tab appears when the optional Kuperman module is enabled. It shows source-age mean, median, dispersion, range, token/type coverage, configured early/middle/later bands, source-response evidence, warnings, line and stanza patterns, model-assigned POS groups, earliest/latest represented terms, complete token audit, and source/configuration provenance. When corresponding modules are enabled, it also shows descriptive type-level relationships with Frequency and Concreteness.</w:t>
+        <w:t>The always-available readability subsection reports Flesch Reading Ease, Flesch-Kincaid Grade, Gunning Fog, Automated Readability Index, Coleman-Liau, and SMOG with the exact word, sentence, syllable, character, and pronunciation- coverage denominators. SMOG remains missing below 30 model-segmented sentences. Contractions and hyphenated expressions count as one orthographic word. Out-of-dictionary syllables use a clearly labeled heuristic until the user approves or edits a session pronunciation override. These prose-oriented formulas do not measure literary quality, reader ability, actual comprehension, or a required grade.</w:t>
+      </w:r>
+    </w:p>
+    <w:p>
+      <w:pPr>
+        <w:widowControl/>
+        <w:spacing w:before="0" w:after="120" w:line="300" w:lineRule="auto"/>
+      </w:pPr>
+      <w:r>
+        <w:rPr>
+          <w:rFonts w:ascii="Calibri" w:hAnsi="Calibri"/>
+          <w:sz w:val="22"/>
+        </w:rPr>
+        <w:t>The normative AoA subsection appears when the optional Kuperman module is enabled. It shows source-age mean, median, dispersion, range, token/type coverage, configured early/middle/later bands, source-response evidence, warnings, line and stanza patterns, model-assigned POS groups, earliest/latest represented terms, complete token audit, and source/configuration provenance. When corresponding modules are enabled, it also shows descriptive type-level relationships with Frequency and Concreteness.</w:t>
       </w:r>
     </w:p>
     <w:p>
@@ -15304,6 +15450,44 @@
           <w:rFonts w:ascii="Calibri" w:hAnsi="Calibri"/>
           <w:sz w:val="22"/>
         </w:rPr>
+        <w:t>Rule-based sentiment and readability evidence</w:t>
+      </w:r>
+    </w:p>
+    <w:p>
+      <w:pPr>
+        <w:widowControl/>
+        <w:spacing w:before="0" w:after="120" w:line="300" w:lineRule="auto"/>
+      </w:pPr>
+      <w:r>
+        <w:rPr>
+          <w:rFonts w:ascii="Calibri" w:hAnsi="Calibri"/>
+          <w:sz w:val="22"/>
+        </w:rPr>
+        <w:t>The Explorer calculates VADER positive, neutral, and negative proportions and compound score for the exact entered string. It also reports applicable word-level readability evidence: word and alphabetic-character counts, estimated syllables, polysyllabic status, pronunciation coverage, and the method used for each syllable estimate. These are local derived values rather than additional published lexicon ratings.</w:t>
+      </w:r>
+    </w:p>
+    <w:p>
+      <w:pPr>
+        <w:widowControl/>
+        <w:spacing w:before="0" w:after="120" w:line="300" w:lineRule="auto"/>
+      </w:pPr>
+      <w:r>
+        <w:rPr>
+          <w:rFonts w:ascii="Calibri" w:hAnsi="Calibri"/>
+          <w:sz w:val="22"/>
+        </w:rPr>
+        <w:t>Document-level Flesch Reading Ease, grade, Fog, ARI, Coleman-Liau, and SMOG values are intentionally not reported for an isolated lookup. Use a complete poem or Other Text analysis for those formulas.</w:t>
+      </w:r>
+    </w:p>
+    <w:p>
+      <w:pPr>
+        <w:pStyle w:val="Heading2"/>
+      </w:pPr>
+      <w:r>
+        <w:rPr>
+          <w:rFonts w:ascii="Calibri" w:hAnsi="Calibri"/>
+          <w:sz w:val="22"/>
+        </w:rPr>
         <w:t>Phrase and component behavior</w:t>
       </w:r>
     </w:p>
@@ -15412,7 +15596,7 @@
           <w:rFonts w:ascii="Calibri" w:hAnsi="Calibri"/>
           <w:sz w:val="22"/>
         </w:rPr>
-        <w:t xml:space="preserve"> report. The report includes query processing, match methods, affective ratings and associations, original and normalized VAD, source uncertainty where available, derived component averages and cross-lexicon spread, concreteness, frequency, AoA, every pronunciation variant, missing-resource statuses, notices, suggestions, and source provenance. It is designed for reading and printing; poem and corpus CSV audit exports remain separate.</w:t>
+        <w:t xml:space="preserve"> report. The report includes query processing, match methods, affective ratings and associations, original and normalized VAD, source uncertainty where available, derived component averages and cross-lexicon spread, concreteness, frequency, AoA, every pronunciation variant, local VADER and word-level readability evidence, missing-resource statuses, notices, suggestions, and source provenance. It is designed for reading and printing; poem and corpus CSV audit exports remain separate.</w:t>
       </w:r>
     </w:p>
     <w:p>
@@ -16356,6 +16540,412 @@
                 <w:sz w:val="18"/>
               </w:rPr>
               <w:t>Exact original text, poetic/model structure, shared tokens and annotations, orthographic spans, processing configuration/provenance, coverage, and warnings</w:t>
+            </w:r>
+          </w:p>
+        </w:tc>
+      </w:tr>
+      <w:tr>
+        <w:trPr>
+          <w:cantSplit w:val="true"/>
+        </w:trPr>
+        <w:tc>
+          <w:tcPr>
+            <w:tcW w:type="dxa" w:w="3600"/>
+            <w:vAlign w:val="center"/>
+            <w:tcMar>
+              <w:top w:w="80" w:type="dxa"/>
+              <w:bottom w:w="80" w:type="dxa"/>
+              <w:start w:w="120" w:type="dxa"/>
+              <w:end w:w="120" w:type="dxa"/>
+            </w:tcMar>
+          </w:tcPr>
+          <w:p>
+            <w:pPr>
+              <w:widowControl/>
+              <w:spacing w:before="0" w:after="0" w:line="252" w:lineRule="auto"/>
+            </w:pPr>
+            <w:r/>
+            <w:r>
+              <w:rPr>
+                <w:rFonts w:ascii="Consolas" w:hAnsi="Consolas"/>
+                <w:color w:val="1F4D78"/>
+                <w:sz w:val="17"/>
+              </w:rPr>
+              <w:t>vader_sentiment_summary.csv</w:t>
+            </w:r>
+          </w:p>
+        </w:tc>
+        <w:tc>
+          <w:tcPr>
+            <w:tcW w:type="dxa" w:w="5760"/>
+            <w:vAlign w:val="center"/>
+            <w:tcMar>
+              <w:top w:w="80" w:type="dxa"/>
+              <w:bottom w:w="80" w:type="dxa"/>
+              <w:start w:w="120" w:type="dxa"/>
+              <w:end w:w="120" w:type="dxa"/>
+            </w:tcMar>
+          </w:tcPr>
+          <w:p>
+            <w:pPr>
+              <w:widowControl/>
+              <w:spacing w:before="0" w:after="0" w:line="252" w:lineRule="auto"/>
+            </w:pPr>
+            <w:r/>
+            <w:r>
+              <w:rPr>
+                <w:rFonts w:ascii="Calibri" w:hAnsi="Calibri"/>
+                <w:sz w:val="18"/>
+              </w:rPr>
+              <w:t>Document positive/neutral/negative proportions, compound score, thresholds, package version, and citation</w:t>
+            </w:r>
+          </w:p>
+        </w:tc>
+      </w:tr>
+      <w:tr>
+        <w:trPr>
+          <w:cantSplit w:val="true"/>
+        </w:trPr>
+        <w:tc>
+          <w:tcPr>
+            <w:tcW w:type="dxa" w:w="3600"/>
+            <w:vAlign w:val="center"/>
+            <w:tcMar>
+              <w:top w:w="80" w:type="dxa"/>
+              <w:bottom w:w="80" w:type="dxa"/>
+              <w:start w:w="120" w:type="dxa"/>
+              <w:end w:w="120" w:type="dxa"/>
+            </w:tcMar>
+          </w:tcPr>
+          <w:p>
+            <w:pPr>
+              <w:widowControl/>
+              <w:spacing w:before="0" w:after="0" w:line="252" w:lineRule="auto"/>
+            </w:pPr>
+            <w:r/>
+            <w:r>
+              <w:rPr>
+                <w:rFonts w:ascii="Consolas" w:hAnsi="Consolas"/>
+                <w:color w:val="1F4D78"/>
+                <w:sz w:val="17"/>
+              </w:rPr>
+              <w:t>vader_sentiment_sentences.csv</w:t>
+            </w:r>
+          </w:p>
+        </w:tc>
+        <w:tc>
+          <w:tcPr>
+            <w:tcW w:type="dxa" w:w="5760"/>
+            <w:vAlign w:val="center"/>
+            <w:tcMar>
+              <w:top w:w="80" w:type="dxa"/>
+              <w:bottom w:w="80" w:type="dxa"/>
+              <w:start w:w="120" w:type="dxa"/>
+              <w:end w:w="120" w:type="dxa"/>
+            </w:tcMar>
+          </w:tcPr>
+          <w:p>
+            <w:pPr>
+              <w:widowControl/>
+              <w:spacing w:before="0" w:after="0" w:line="252" w:lineRule="auto"/>
+            </w:pPr>
+            <w:r/>
+            <w:r>
+              <w:rPr>
+                <w:rFonts w:ascii="Calibri" w:hAnsi="Calibri"/>
+                <w:sz w:val="18"/>
+              </w:rPr>
+              <w:t>Model-sentence polarity proportions, compound scores, labels, line numbers, and text</w:t>
+            </w:r>
+          </w:p>
+        </w:tc>
+      </w:tr>
+      <w:tr>
+        <w:trPr>
+          <w:cantSplit w:val="true"/>
+        </w:trPr>
+        <w:tc>
+          <w:tcPr>
+            <w:tcW w:type="dxa" w:w="3600"/>
+            <w:vAlign w:val="center"/>
+            <w:tcMar>
+              <w:top w:w="80" w:type="dxa"/>
+              <w:bottom w:w="80" w:type="dxa"/>
+              <w:start w:w="120" w:type="dxa"/>
+              <w:end w:w="120" w:type="dxa"/>
+            </w:tcMar>
+          </w:tcPr>
+          <w:p>
+            <w:pPr>
+              <w:widowControl/>
+              <w:spacing w:before="0" w:after="0" w:line="252" w:lineRule="auto"/>
+            </w:pPr>
+            <w:r/>
+            <w:r>
+              <w:rPr>
+                <w:rFonts w:ascii="Consolas" w:hAnsi="Consolas"/>
+                <w:color w:val="1F4D78"/>
+                <w:sz w:val="17"/>
+              </w:rPr>
+              <w:t>vader_sentiment_report.docx</w:t>
+            </w:r>
+          </w:p>
+        </w:tc>
+        <w:tc>
+          <w:tcPr>
+            <w:tcW w:type="dxa" w:w="5760"/>
+            <w:vAlign w:val="center"/>
+            <w:tcMar>
+              <w:top w:w="80" w:type="dxa"/>
+              <w:bottom w:w="80" w:type="dxa"/>
+              <w:start w:w="120" w:type="dxa"/>
+              <w:end w:w="120" w:type="dxa"/>
+            </w:tcMar>
+          </w:tcPr>
+          <w:p>
+            <w:pPr>
+              <w:widowControl/>
+              <w:spacing w:before="0" w:after="0" w:line="252" w:lineRule="auto"/>
+            </w:pPr>
+            <w:r/>
+            <w:r>
+              <w:rPr>
+                <w:rFonts w:ascii="Calibri" w:hAnsi="Calibri"/>
+                <w:sz w:val="18"/>
+              </w:rPr>
+              <w:t>Narrative VADER findings, method, denominators, domain cautions, and companion-file guide</w:t>
+            </w:r>
+          </w:p>
+        </w:tc>
+      </w:tr>
+      <w:tr>
+        <w:trPr>
+          <w:cantSplit w:val="true"/>
+        </w:trPr>
+        <w:tc>
+          <w:tcPr>
+            <w:tcW w:type="dxa" w:w="3600"/>
+            <w:vAlign w:val="center"/>
+            <w:tcMar>
+              <w:top w:w="80" w:type="dxa"/>
+              <w:bottom w:w="80" w:type="dxa"/>
+              <w:start w:w="120" w:type="dxa"/>
+              <w:end w:w="120" w:type="dxa"/>
+            </w:tcMar>
+          </w:tcPr>
+          <w:p>
+            <w:pPr>
+              <w:widowControl/>
+              <w:spacing w:before="0" w:after="0" w:line="252" w:lineRule="auto"/>
+            </w:pPr>
+            <w:r/>
+            <w:r>
+              <w:rPr>
+                <w:rFonts w:ascii="Consolas" w:hAnsi="Consolas"/>
+                <w:color w:val="1F4D78"/>
+                <w:sz w:val="17"/>
+              </w:rPr>
+              <w:t>readability_summary.csv</w:t>
+            </w:r>
+          </w:p>
+        </w:tc>
+        <w:tc>
+          <w:tcPr>
+            <w:tcW w:type="dxa" w:w="5760"/>
+            <w:vAlign w:val="center"/>
+            <w:tcMar>
+              <w:top w:w="80" w:type="dxa"/>
+              <w:bottom w:w="80" w:type="dxa"/>
+              <w:start w:w="120" w:type="dxa"/>
+              <w:end w:w="120" w:type="dxa"/>
+            </w:tcMar>
+          </w:tcPr>
+          <w:p>
+            <w:pPr>
+              <w:widowControl/>
+              <w:spacing w:before="0" w:after="0" w:line="252" w:lineRule="auto"/>
+            </w:pPr>
+            <w:r/>
+            <w:r>
+              <w:rPr>
+                <w:rFonts w:ascii="Calibri" w:hAnsi="Calibri"/>
+                <w:sz w:val="18"/>
+              </w:rPr>
+              <w:t>Formula scores plus word, sentence, syllable, character, polysyllable, and pronunciation-method counts</w:t>
+            </w:r>
+          </w:p>
+        </w:tc>
+      </w:tr>
+      <w:tr>
+        <w:trPr>
+          <w:cantSplit w:val="true"/>
+        </w:trPr>
+        <w:tc>
+          <w:tcPr>
+            <w:tcW w:type="dxa" w:w="3600"/>
+            <w:vAlign w:val="center"/>
+            <w:tcMar>
+              <w:top w:w="80" w:type="dxa"/>
+              <w:bottom w:w="80" w:type="dxa"/>
+              <w:start w:w="120" w:type="dxa"/>
+              <w:end w:w="120" w:type="dxa"/>
+            </w:tcMar>
+          </w:tcPr>
+          <w:p>
+            <w:pPr>
+              <w:widowControl/>
+              <w:spacing w:before="0" w:after="0" w:line="252" w:lineRule="auto"/>
+            </w:pPr>
+            <w:r/>
+            <w:r>
+              <w:rPr>
+                <w:rFonts w:ascii="Consolas" w:hAnsi="Consolas"/>
+                <w:color w:val="1F4D78"/>
+                <w:sz w:val="17"/>
+              </w:rPr>
+              <w:t>readability_word_audit.csv</w:t>
+            </w:r>
+          </w:p>
+        </w:tc>
+        <w:tc>
+          <w:tcPr>
+            <w:tcW w:type="dxa" w:w="5760"/>
+            <w:vAlign w:val="center"/>
+            <w:tcMar>
+              <w:top w:w="80" w:type="dxa"/>
+              <w:bottom w:w="80" w:type="dxa"/>
+              <w:start w:w="120" w:type="dxa"/>
+              <w:end w:w="120" w:type="dxa"/>
+            </w:tcMar>
+          </w:tcPr>
+          <w:p>
+            <w:pPr>
+              <w:widowControl/>
+              <w:spacing w:before="0" w:after="0" w:line="252" w:lineRule="auto"/>
+            </w:pPr>
+            <w:r/>
+            <w:r>
+              <w:rPr>
+                <w:rFonts w:ascii="Calibri" w:hAnsi="Calibri"/>
+                <w:sz w:val="18"/>
+              </w:rPr>
+              <w:t>Every readability word's line, characters, syllables, dictionary/override/heuristic method, and polysyllable status</w:t>
+            </w:r>
+          </w:p>
+        </w:tc>
+      </w:tr>
+      <w:tr>
+        <w:trPr>
+          <w:cantSplit w:val="true"/>
+        </w:trPr>
+        <w:tc>
+          <w:tcPr>
+            <w:tcW w:type="dxa" w:w="3600"/>
+            <w:vAlign w:val="center"/>
+            <w:tcMar>
+              <w:top w:w="80" w:type="dxa"/>
+              <w:bottom w:w="80" w:type="dxa"/>
+              <w:start w:w="120" w:type="dxa"/>
+              <w:end w:w="120" w:type="dxa"/>
+            </w:tcMar>
+          </w:tcPr>
+          <w:p>
+            <w:pPr>
+              <w:widowControl/>
+              <w:spacing w:before="0" w:after="0" w:line="252" w:lineRule="auto"/>
+            </w:pPr>
+            <w:r/>
+            <w:r>
+              <w:rPr>
+                <w:rFonts w:ascii="Consolas" w:hAnsi="Consolas"/>
+                <w:color w:val="1F4D78"/>
+                <w:sz w:val="17"/>
+              </w:rPr>
+              <w:t>readability_report.docx</w:t>
+            </w:r>
+          </w:p>
+        </w:tc>
+        <w:tc>
+          <w:tcPr>
+            <w:tcW w:type="dxa" w:w="5760"/>
+            <w:vAlign w:val="center"/>
+            <w:tcMar>
+              <w:top w:w="80" w:type="dxa"/>
+              <w:bottom w:w="80" w:type="dxa"/>
+              <w:start w:w="120" w:type="dxa"/>
+              <w:end w:w="120" w:type="dxa"/>
+            </w:tcMar>
+          </w:tcPr>
+          <w:p>
+            <w:pPr>
+              <w:widowControl/>
+              <w:spacing w:before="0" w:after="0" w:line="252" w:lineRule="auto"/>
+            </w:pPr>
+            <w:r/>
+            <w:r>
+              <w:rPr>
+                <w:rFonts w:ascii="Calibri" w:hAnsi="Calibri"/>
+                <w:sz w:val="18"/>
+              </w:rPr>
+              <w:t>Narrative readability findings, denominators, prose-domain cautions, and companion-file guide</w:t>
+            </w:r>
+          </w:p>
+        </w:tc>
+      </w:tr>
+      <w:tr>
+        <w:trPr>
+          <w:cantSplit w:val="true"/>
+        </w:trPr>
+        <w:tc>
+          <w:tcPr>
+            <w:tcW w:type="dxa" w:w="3600"/>
+            <w:vAlign w:val="center"/>
+            <w:tcMar>
+              <w:top w:w="80" w:type="dxa"/>
+              <w:bottom w:w="80" w:type="dxa"/>
+              <w:start w:w="120" w:type="dxa"/>
+              <w:end w:w="120" w:type="dxa"/>
+            </w:tcMar>
+          </w:tcPr>
+          <w:p>
+            <w:pPr>
+              <w:widowControl/>
+              <w:spacing w:before="0" w:after="0" w:line="252" w:lineRule="auto"/>
+            </w:pPr>
+            <w:r/>
+            <w:r>
+              <w:rPr>
+                <w:rFonts w:ascii="Consolas" w:hAnsi="Consolas"/>
+                <w:color w:val="1F4D78"/>
+                <w:sz w:val="17"/>
+              </w:rPr>
+              <w:t>lexical_trajectory.csv</w:t>
+            </w:r>
+          </w:p>
+        </w:tc>
+        <w:tc>
+          <w:tcPr>
+            <w:tcW w:type="dxa" w:w="5760"/>
+            <w:vAlign w:val="center"/>
+            <w:tcMar>
+              <w:top w:w="80" w:type="dxa"/>
+              <w:bottom w:w="80" w:type="dxa"/>
+              <w:start w:w="120" w:type="dxa"/>
+              <w:end w:w="120" w:type="dxa"/>
+            </w:tcMar>
+          </w:tcPr>
+          <w:p>
+            <w:pPr>
+              <w:widowControl/>
+              <w:spacing w:before="0" w:after="0" w:line="252" w:lineRule="auto"/>
+            </w:pPr>
+            <w:r/>
+            <w:r>
+              <w:rPr>
+                <w:rFonts w:ascii="Calibri" w:hAnsi="Calibri"/>
+                <w:sz w:val="18"/>
+              </w:rPr>
+              <w:t>Every VAD source and token scope by physical line, with VAD means, normalized/source-scale concreteness means, and match counts</w:t>
             </w:r>
           </w:p>
         </w:tc>

</xml_diff>

<commit_message>
Add persistent color themes
</commit_message>
<xml_diff>
--- a/docs/VerseVAD_User_Manual.docx
+++ b/docs/VerseVAD_User_Manual.docx
@@ -71,7 +71,7 @@
           <w:color w:val="66727C"/>
           <w:sz w:val="21"/>
         </w:rPr>
-        <w:t xml:space="preserve"> July 27, 2026</w:t>
+        <w:t xml:space="preserve"> July 28, 2026</w:t>
       </w:r>
       <w:r>
         <w:rPr>
@@ -649,7 +649,7 @@
           <w:rFonts w:ascii="Calibri" w:hAnsi="Calibri"/>
           <w:sz w:val="22"/>
         </w:rPr>
-        <w:t xml:space="preserve"> control is a dropdown. All large vertical sections begin collapsed and can be opened independently, so multiple sections may remain expanded. Streamlit's arrow at the top edge of the left sidebar hides or restores the sidebar; the main workspace automatically uses the freed width or resizes when the sidebar returns. This behavior is shared by supported Windows and macOS browsers.</w:t>
+        <w:t xml:space="preserve"> control is a dropdown. All large vertical sections begin collapsed and can be opened independently, so multiple sections may remain expanded. Each expanded report section ends with a compact centered upward-arrow control that closes the section immediately in the browser without rerunning the analysis page. The Additional Optional Models and Analysis Configuration panels use the same icon control; hovering or focusing it identifies the section it will collapse. Streamlit's arrow at the top edge of the left sidebar hides or restores the sidebar; the main workspace automatically uses the freed width or resizes when the sidebar returns. This behavior is shared by supported Windows and macOS browsers.</w:t>
       </w:r>
     </w:p>
     <w:p>
@@ -2546,10 +2546,17 @@
       <w:r>
         <w:rPr>
           <w:rFonts w:ascii="Calibri" w:hAnsi="Calibri"/>
+          <w:sz w:val="22"/>
+        </w:rPr>
+        <w:t xml:space="preserve">a circular appearance menu for </w:t>
+      </w:r>
+      <w:r>
+        <w:rPr>
+          <w:rFonts w:ascii="Calibri" w:hAnsi="Calibri"/>
           <w:b/>
           <w:sz w:val="22"/>
         </w:rPr>
-        <w:t>Light</w:t>
+        <w:t>Classic</w:t>
       </w:r>
       <w:r>
         <w:rPr>
@@ -2571,6 +2578,51 @@
           <w:rFonts w:ascii="Calibri" w:hAnsi="Calibri"/>
           <w:sz w:val="22"/>
         </w:rPr>
+        <w:t xml:space="preserve">, </w:t>
+      </w:r>
+      <w:r>
+        <w:rPr>
+          <w:rFonts w:ascii="Calibri" w:hAnsi="Calibri"/>
+          <w:b/>
+          <w:sz w:val="22"/>
+        </w:rPr>
+        <w:t>Lavender</w:t>
+      </w:r>
+      <w:r>
+        <w:rPr>
+          <w:rFonts w:ascii="Calibri" w:hAnsi="Calibri"/>
+          <w:sz w:val="22"/>
+        </w:rPr>
+        <w:t xml:space="preserve">, </w:t>
+      </w:r>
+      <w:r>
+        <w:rPr>
+          <w:rFonts w:ascii="Calibri" w:hAnsi="Calibri"/>
+          <w:b/>
+          <w:sz w:val="22"/>
+        </w:rPr>
+        <w:t>Ocean</w:t>
+      </w:r>
+      <w:r>
+        <w:rPr>
+          <w:rFonts w:ascii="Calibri" w:hAnsi="Calibri"/>
+          <w:sz w:val="22"/>
+        </w:rPr>
+        <w:t xml:space="preserve">, </w:t>
+      </w:r>
+      <w:r>
+        <w:rPr>
+          <w:rFonts w:ascii="Calibri" w:hAnsi="Calibri"/>
+          <w:b/>
+          <w:sz w:val="22"/>
+        </w:rPr>
+        <w:t>Crimson</w:t>
+      </w:r>
+      <w:r>
+        <w:rPr>
+          <w:rFonts w:ascii="Calibri" w:hAnsi="Calibri"/>
+          <w:sz w:val="22"/>
+        </w:rPr>
         <w:t xml:space="preserve">, and </w:t>
       </w:r>
       <w:r>
@@ -2579,14 +2631,14 @@
           <w:b/>
           <w:sz w:val="22"/>
         </w:rPr>
-        <w:t>System</w:t>
-      </w:r>
-      <w:r>
-        <w:rPr>
-          <w:rFonts w:ascii="Calibri" w:hAnsi="Calibri"/>
-          <w:sz w:val="22"/>
-        </w:rPr>
-        <w:t xml:space="preserve"> appearance;</w:t>
+        <w:t>Forest</w:t>
+      </w:r>
+      <w:r>
+        <w:rPr>
+          <w:rFonts w:ascii="Calibri" w:hAnsi="Calibri"/>
+          <w:sz w:val="22"/>
+        </w:rPr>
+        <w:t>;</w:t>
       </w:r>
     </w:p>
     <w:p>
@@ -2604,7 +2656,7 @@
           <w:rFonts w:ascii="Calibri" w:hAnsi="Calibri"/>
           <w:sz w:val="22"/>
         </w:rPr>
-        <w:t>settings and help access.</w:t>
+        <w:t>circular gear and question-mark controls for settings and help.</w:t>
       </w:r>
     </w:p>
     <w:p>
@@ -2617,7 +2669,7 @@
           <w:rFonts w:ascii="Calibri" w:hAnsi="Calibri"/>
           <w:sz w:val="22"/>
         </w:rPr>
-        <w:t>System appearance follows the browser or operating-system preference. The selection is stored as an application-level local preference, not in a project or analysis configuration. Appearance does not change calculations, result IDs, project data, or exports. Publication-oriented charts remain light.</w:t>
+        <w:t>The selected theme persists across closing and reopening VerseVAD. Legacy Light and System choices migrate safely to Classic. The selection is stored as an application-level local preference, not in a project or analysis configuration. Appearance does not change calculations, result IDs, project data, or exports. Publication-oriented charts remain light.</w:t>
       </w:r>
     </w:p>
     <w:p>
@@ -11321,6 +11373,34 @@
     </w:p>
     <w:p>
       <w:pPr>
+        <w:widowControl/>
+        <w:spacing w:before="0" w:after="120" w:line="300" w:lineRule="auto"/>
+      </w:pPr>
+      <w:r>
+        <w:rPr>
+          <w:rFonts w:ascii="Calibri" w:hAnsi="Calibri"/>
+          <w:sz w:val="22"/>
+        </w:rPr>
+        <w:t xml:space="preserve">The interface directly displays a fixed-height </w:t>
+      </w:r>
+      <w:r>
+        <w:rPr>
+          <w:rFonts w:ascii="Calibri" w:hAnsi="Calibri"/>
+          <w:b/>
+          <w:sz w:val="22"/>
+        </w:rPr>
+        <w:t>Sentence-Level VADER Scores</w:t>
+      </w:r>
+      <w:r>
+        <w:rPr>
+          <w:rFonts w:ascii="Calibri" w:hAnsi="Calibri"/>
+          <w:sz w:val="22"/>
+        </w:rPr>
+        <w:t xml:space="preserve"> table containing each model-segmented sentence's source lines, text, positive/neutral/negative proportions, compound score, and threshold label. VADER scores the complete preserved text directly for the document compound; the sentence compounds are diagnostics and are not averaged into that value.</w:t>
+      </w:r>
+    </w:p>
+    <w:p>
+      <w:pPr>
         <w:pStyle w:val="Heading2"/>
       </w:pPr>
       <w:r>
@@ -12976,6 +13056,117 @@
           <w:sz w:val="22"/>
         </w:rPr>
         <w:t xml:space="preserve"> unless an alternate database path is configured.</w:t>
+      </w:r>
+    </w:p>
+    <w:p>
+      <w:pPr>
+        <w:pStyle w:val="Heading3"/>
+      </w:pPr>
+      <w:r>
+        <w:rPr>
+          <w:rFonts w:ascii="Calibri" w:hAnsi="Calibri"/>
+          <w:sz w:val="22"/>
+        </w:rPr>
+        <w:t>Personal Corpus</w:t>
+      </w:r>
+    </w:p>
+    <w:p>
+      <w:pPr>
+        <w:widowControl/>
+        <w:spacing w:before="0" w:after="120" w:line="300" w:lineRule="auto"/>
+      </w:pPr>
+      <w:r>
+        <w:rPr>
+          <w:rFonts w:ascii="Calibri" w:hAnsi="Calibri"/>
+          <w:sz w:val="22"/>
+        </w:rPr>
+        <w:t xml:space="preserve">The downloadable local application also provides </w:t>
+      </w:r>
+      <w:r>
+        <w:rPr>
+          <w:rFonts w:ascii="Calibri" w:hAnsi="Calibri"/>
+          <w:b/>
+          <w:sz w:val="22"/>
+        </w:rPr>
+        <w:t>Personal Corpus</w:t>
+      </w:r>
+      <w:r>
+        <w:rPr>
+          <w:rFonts w:ascii="Calibri" w:hAnsi="Calibri"/>
+          <w:sz w:val="22"/>
+        </w:rPr>
+        <w:t xml:space="preserve"> from the collapsible sidebar. It is intentionally absent from the prominent workspace selector and from hosted-cloud deployment mode. </w:t>
+      </w:r>
+      <w:r>
+        <w:rPr>
+          <w:rFonts w:ascii="Calibri" w:hAnsi="Calibri"/>
+          <w:b/>
+          <w:sz w:val="22"/>
+        </w:rPr>
+        <w:t>Home</w:t>
+      </w:r>
+      <w:r>
+        <w:rPr>
+          <w:rFonts w:ascii="Calibri" w:hAnsi="Calibri"/>
+          <w:sz w:val="22"/>
+        </w:rPr>
+        <w:t xml:space="preserve"> in the sidebar or the circular house icon in the Personal Corpus header returns to Single Poem.</w:t>
+      </w:r>
+    </w:p>
+    <w:p>
+      <w:pPr>
+        <w:widowControl/>
+        <w:spacing w:before="0" w:after="120" w:line="300" w:lineRule="auto"/>
+      </w:pPr>
+      <w:r>
+        <w:rPr>
+          <w:rFonts w:ascii="Calibri" w:hAnsi="Calibri"/>
+          <w:sz w:val="22"/>
+        </w:rPr>
+        <w:t xml:space="preserve">Personal Corpus reuses the same versioned repository, analysis engines, charts, review scenarios, VerseMap model, and CSV/Word exports as Project / Corpus, but stores its library separately in </w:t>
+      </w:r>
+      <w:r>
+        <w:rPr>
+          <w:rFonts w:ascii="Consolas" w:hAnsi="Consolas"/>
+          <w:color w:val="1F4D78"/>
+          <w:sz w:val="19"/>
+        </w:rPr>
+        <w:t>projects/personal_corpus.sqlite3</w:t>
+      </w:r>
+      <w:r>
+        <w:rPr>
+          <w:rFonts w:ascii="Calibri" w:hAnsi="Calibri"/>
+          <w:sz w:val="22"/>
+        </w:rPr>
+        <w:t>. The database, poems, and outputs are ignored by Git and never appear in the main project selector.</w:t>
+      </w:r>
+    </w:p>
+    <w:p>
+      <w:pPr>
+        <w:widowControl/>
+        <w:spacing w:before="0" w:after="120" w:line="300" w:lineRule="auto"/>
+      </w:pPr>
+      <w:r>
+        <w:rPr>
+          <w:rFonts w:ascii="Calibri" w:hAnsi="Calibri"/>
+          <w:sz w:val="22"/>
+        </w:rPr>
+        <w:t xml:space="preserve">Under </w:t>
+      </w:r>
+      <w:r>
+        <w:rPr>
+          <w:rFonts w:ascii="Calibri" w:hAnsi="Calibri"/>
+          <w:b/>
+          <w:sz w:val="22"/>
+        </w:rPr>
+        <w:t>Poems &amp; Metadata</w:t>
+      </w:r>
+      <w:r>
+        <w:rPr>
+          <w:rFonts w:ascii="Calibri" w:hAnsi="Calibri"/>
+          <w:sz w:val="22"/>
+        </w:rPr>
+        <w:t>, add one file, several files, a folder, or pasted text. Text and metadata edits preserve a new version. Deleting a poem requires typing its exact title and removes only that poem's local versions and results. The stateful Report Section dropdown includes poem-specific results and whole-corpus summaries. Affective poem detail retains token/type and all-token/stopword-excluded selectors. VerseMap is always locked to Standard Profile 1.0 for both personal and reference poems.</w:t>
       </w:r>
     </w:p>
     <w:p>

</xml_diff>

<commit_message>
Complete research workspace architecture stage 1
</commit_message>
<xml_diff>
--- a/docs/VerseVAD_User_Manual.docx
+++ b/docs/VerseVAD_User_Manual.docx
@@ -71,7 +71,7 @@
           <w:color w:val="66727C"/>
           <w:sz w:val="21"/>
         </w:rPr>
-        <w:t xml:space="preserve"> July 28, 2026</w:t>
+        <w:t xml:space="preserve"> July 29, 2026</w:t>
       </w:r>
       <w:r>
         <w:rPr>
@@ -2436,7 +2436,7 @@
           <w:rFonts w:ascii="Calibri" w:hAnsi="Calibri"/>
           <w:sz w:val="22"/>
         </w:rPr>
-        <w:t>The shared application header contains:</w:t>
+        <w:t>The shared application header groups workspaces under:</w:t>
       </w:r>
     </w:p>
     <w:p>
@@ -2455,7 +2455,14 @@
           <w:b/>
           <w:sz w:val="22"/>
         </w:rPr>
-        <w:t>Single Poem</w:t>
+        <w:t>Analyze</w:t>
+      </w:r>
+      <w:r>
+        <w:rPr>
+          <w:rFonts w:ascii="Calibri" w:hAnsi="Calibri"/>
+          <w:sz w:val="22"/>
+        </w:rPr>
+        <w:t>: Single Poem, Compare Poems, Other Text, and Lexicon Explorer;</w:t>
       </w:r>
     </w:p>
     <w:p>
@@ -2474,7 +2481,27 @@
           <w:b/>
           <w:sz w:val="22"/>
         </w:rPr>
-        <w:t>Project / Corpus</w:t>
+        <w:t>Collections</w:t>
+      </w:r>
+      <w:r>
+        <w:rPr>
+          <w:rFonts w:ascii="Calibri" w:hAnsi="Calibri"/>
+          <w:sz w:val="22"/>
+        </w:rPr>
+        <w:t>: Personal Corpus, Saved Projects, Reference Corpora, and</w:t>
+      </w:r>
+    </w:p>
+    <w:p>
+      <w:pPr>
+        <w:widowControl/>
+        <w:spacing w:before="0" w:after="120" w:line="300" w:lineRule="auto"/>
+      </w:pPr>
+      <w:r>
+        <w:rPr>
+          <w:rFonts w:ascii="Calibri" w:hAnsi="Calibri"/>
+          <w:sz w:val="22"/>
+        </w:rPr>
+        <w:t xml:space="preserve">  Analysis Library;</w:t>
       </w:r>
     </w:p>
     <w:p>
@@ -2493,7 +2520,14 @@
           <w:b/>
           <w:sz w:val="22"/>
         </w:rPr>
-        <w:t>Other Text</w:t>
+        <w:t>Explore</w:t>
+      </w:r>
+      <w:r>
+        <w:rPr>
+          <w:rFonts w:ascii="Calibri" w:hAnsi="Calibri"/>
+          <w:sz w:val="22"/>
+        </w:rPr>
+        <w:t>: VerseMap, Lexicon Explorer, Form Library, and Corpus Browser;</w:t>
       </w:r>
     </w:p>
     <w:p>
@@ -2512,7 +2546,14 @@
           <w:b/>
           <w:sz w:val="22"/>
         </w:rPr>
-        <w:t>Lexicon Explorer</w:t>
+        <w:t>Learn</w:t>
+      </w:r>
+      <w:r>
+        <w:rPr>
+          <w:rFonts w:ascii="Calibri" w:hAnsi="Calibri"/>
+          <w:sz w:val="22"/>
+        </w:rPr>
+        <w:t>: Documentation and Methodology;</w:t>
       </w:r>
     </w:p>
     <w:p>
@@ -2657,6 +2698,137 @@
           <w:sz w:val="22"/>
         </w:rPr>
         <w:t>circular gear and question-mark controls for settings and help.</w:t>
+      </w:r>
+    </w:p>
+    <w:p>
+      <w:pPr>
+        <w:widowControl/>
+        <w:spacing w:before="0" w:after="120" w:line="300" w:lineRule="auto"/>
+      </w:pPr>
+      <w:r>
+        <w:rPr>
+          <w:rFonts w:ascii="Calibri" w:hAnsi="Calibri"/>
+          <w:sz w:val="22"/>
+        </w:rPr>
+        <w:t>Personal Corpus appears only in the downloadable local edition. Routes whose later implementation is not yet complete are visibly marked as planned rather than displaying substitute results. The contextual sidebar keeps the current object, analysis profile, settings, comparison resources, research-notes location, analysis-management location, and export guidance together.</w:t>
+      </w:r>
+    </w:p>
+    <w:p>
+      <w:pPr>
+        <w:widowControl/>
+        <w:spacing w:before="0" w:after="120" w:line="300" w:lineRule="auto"/>
+      </w:pPr>
+      <w:r>
+        <w:rPr>
+          <w:rFonts w:ascii="Calibri" w:hAnsi="Calibri"/>
+          <w:sz w:val="22"/>
+        </w:rPr>
+        <w:t xml:space="preserve">Built-in analysis profiles are </w:t>
+      </w:r>
+      <w:r>
+        <w:rPr>
+          <w:rFonts w:ascii="Calibri" w:hAnsi="Calibri"/>
+          <w:b/>
+          <w:sz w:val="22"/>
+        </w:rPr>
+        <w:t>Full Poetic Analysis</w:t>
+      </w:r>
+      <w:r>
+        <w:rPr>
+          <w:rFonts w:ascii="Calibri" w:hAnsi="Calibri"/>
+          <w:sz w:val="22"/>
+        </w:rPr>
+        <w:t xml:space="preserve">, </w:t>
+      </w:r>
+      <w:r>
+        <w:rPr>
+          <w:rFonts w:ascii="Calibri" w:hAnsi="Calibri"/>
+          <w:b/>
+          <w:sz w:val="22"/>
+        </w:rPr>
+        <w:t>Computational Close Reading</w:t>
+      </w:r>
+      <w:r>
+        <w:rPr>
+          <w:rFonts w:ascii="Calibri" w:hAnsi="Calibri"/>
+          <w:sz w:val="22"/>
+        </w:rPr>
+        <w:t xml:space="preserve">, </w:t>
+      </w:r>
+      <w:r>
+        <w:rPr>
+          <w:rFonts w:ascii="Calibri" w:hAnsi="Calibri"/>
+          <w:b/>
+          <w:sz w:val="22"/>
+        </w:rPr>
+        <w:t>Affect and Emotion</w:t>
+      </w:r>
+      <w:r>
+        <w:rPr>
+          <w:rFonts w:ascii="Calibri" w:hAnsi="Calibri"/>
+          <w:sz w:val="22"/>
+        </w:rPr>
+        <w:t xml:space="preserve">, </w:t>
+      </w:r>
+      <w:r>
+        <w:rPr>
+          <w:rFonts w:ascii="Calibri" w:hAnsi="Calibri"/>
+          <w:b/>
+          <w:sz w:val="22"/>
+        </w:rPr>
+        <w:t>Sound and Prosody</w:t>
+      </w:r>
+      <w:r>
+        <w:rPr>
+          <w:rFonts w:ascii="Calibri" w:hAnsi="Calibri"/>
+          <w:sz w:val="22"/>
+        </w:rPr>
+        <w:t xml:space="preserve">, </w:t>
+      </w:r>
+      <w:r>
+        <w:rPr>
+          <w:rFonts w:ascii="Calibri" w:hAnsi="Calibri"/>
+          <w:b/>
+          <w:sz w:val="22"/>
+        </w:rPr>
+        <w:t>Formal Analysis</w:t>
+      </w:r>
+      <w:r>
+        <w:rPr>
+          <w:rFonts w:ascii="Calibri" w:hAnsi="Calibri"/>
+          <w:sz w:val="22"/>
+        </w:rPr>
+        <w:t xml:space="preserve">, and </w:t>
+      </w:r>
+      <w:r>
+        <w:rPr>
+          <w:rFonts w:ascii="Calibri" w:hAnsi="Calibri"/>
+          <w:b/>
+          <w:sz w:val="22"/>
+        </w:rPr>
+        <w:t>Teaching/Introductory</w:t>
+      </w:r>
+      <w:r>
+        <w:rPr>
+          <w:rFonts w:ascii="Calibri" w:hAnsi="Calibri"/>
+          <w:sz w:val="22"/>
+        </w:rPr>
+        <w:t xml:space="preserve">. Select </w:t>
+      </w:r>
+      <w:r>
+        <w:rPr>
+          <w:rFonts w:ascii="Calibri" w:hAnsi="Calibri"/>
+          <w:b/>
+          <w:sz w:val="22"/>
+        </w:rPr>
+        <w:t>Apply / Restore</w:t>
+      </w:r>
+      <w:r>
+        <w:rPr>
+          <w:rFonts w:ascii="Calibri" w:hAnsi="Calibri"/>
+          <w:sz w:val="22"/>
+        </w:rPr>
+        <w:t xml:space="preserve"> to establish a profile's defaults, then continue customizing if needed. Local custom profiles store configuration only in ignored private application data; they never retain poem text, metadata, pronunciation overrides, results, or exports. Hosted custom profiles last for the browser session.</w:t>
       </w:r>
     </w:p>
     <w:p>
@@ -12985,7 +13157,7 @@
           <w:rFonts w:ascii="Calibri" w:hAnsi="Calibri"/>
           <w:sz w:val="22"/>
         </w:rPr>
-        <w:t>9. Project / Corpus Workspace</w:t>
+        <w:t>9. Saved Projects Workspace</w:t>
       </w:r>
     </w:p>
     <w:p>
@@ -13018,7 +13190,7 @@
           <w:b/>
           <w:sz w:val="22"/>
         </w:rPr>
-        <w:t>Project / Corpus</w:t>
+        <w:t>Collections → Saved Projects</w:t>
       </w:r>
       <w:r>
         <w:rPr>
@@ -13040,7 +13212,7 @@
           <w:rFonts w:ascii="Calibri" w:hAnsi="Calibri"/>
           <w:sz w:val="22"/>
         </w:rPr>
-        <w:t xml:space="preserve">, and enter a title. Description and researcher fields are optional. Projects persist locally in </w:t>
+        <w:t xml:space="preserve">, and enter a title. Description and researcher fields are optional. This is the workspace formerly labeled Project / Corpus. Projects persist locally in </w:t>
       </w:r>
       <w:r>
         <w:rPr>
@@ -13088,29 +13260,14 @@
           <w:b/>
           <w:sz w:val="22"/>
         </w:rPr>
-        <w:t>Personal Corpus</w:t>
-      </w:r>
-      <w:r>
-        <w:rPr>
-          <w:rFonts w:ascii="Calibri" w:hAnsi="Calibri"/>
-          <w:sz w:val="22"/>
-        </w:rPr>
-        <w:t xml:space="preserve"> from the collapsible sidebar. It is intentionally absent from the prominent workspace selector and from hosted-cloud deployment mode. </w:t>
-      </w:r>
-      <w:r>
-        <w:rPr>
-          <w:rFonts w:ascii="Calibri" w:hAnsi="Calibri"/>
-          <w:b/>
-          <w:sz w:val="22"/>
-        </w:rPr>
-        <w:t>Home</w:t>
-      </w:r>
-      <w:r>
-        <w:rPr>
-          <w:rFonts w:ascii="Calibri" w:hAnsi="Calibri"/>
-          <w:sz w:val="22"/>
-        </w:rPr>
-        <w:t xml:space="preserve"> in the sidebar or the circular house icon in the Personal Corpus header returns to Single Poem.</w:t>
+        <w:t>Collections → Personal Corpus</w:t>
+      </w:r>
+      <w:r>
+        <w:rPr>
+          <w:rFonts w:ascii="Calibri" w:hAnsi="Calibri"/>
+          <w:sz w:val="22"/>
+        </w:rPr>
+        <w:t>. It is intentionally absent from hosted-cloud deployment mode.</w:t>
       </w:r>
     </w:p>
     <w:p>
@@ -13123,7 +13280,7 @@
           <w:rFonts w:ascii="Calibri" w:hAnsi="Calibri"/>
           <w:sz w:val="22"/>
         </w:rPr>
-        <w:t xml:space="preserve">Personal Corpus reuses the same versioned repository, analysis engines, charts, review scenarios, VerseMap model, and CSV/Word exports as Project / Corpus, but stores its library separately in </w:t>
+        <w:t xml:space="preserve">Personal Corpus reuses the same versioned repository, analysis engines, charts, review scenarios, VerseMap model, and CSV/Word exports as Saved Projects, but stores its library separately in </w:t>
       </w:r>
       <w:r>
         <w:rPr>

</xml_diff>

<commit_message>
Add analysis library and research notes
</commit_message>
<xml_diff>
--- a/docs/VerseVAD_User_Manual.docx
+++ b/docs/VerseVAD_User_Manual.docx
@@ -2710,7 +2710,7 @@
           <w:rFonts w:ascii="Calibri" w:hAnsi="Calibri"/>
           <w:sz w:val="22"/>
         </w:rPr>
-        <w:t>Personal Corpus appears only in the downloadable local edition. Routes whose later implementation is not yet complete are visibly marked as planned rather than displaying substitute results. The contextual sidebar keeps the current object, analysis profile, settings, comparison resources, research-notes location, analysis-management location, and export guidance together.</w:t>
+        <w:t>Personal Corpus appears only in the downloadable local edition. Routes whose later implementation is not yet complete are visibly marked as planned rather than displaying substitute results. The contextual sidebar keeps the current object, analysis profile, settings, comparison resources, working research-notes notebook, analysis-management controls, and export guidance together.</w:t>
       </w:r>
     </w:p>
     <w:p>
@@ -2841,6 +2841,19 @@
           <w:rFonts w:ascii="Calibri" w:hAnsi="Calibri"/>
           <w:sz w:val="22"/>
         </w:rPr>
+        <w:t>The top navigation is an opaque fixed bar. Its four labels are larger and more widely spaced when the window permits, then tighten responsively on smaller windows. Hovering briefly opens a section menu; it closes after the pointer leaves both the section label and dropdown. Click and keyboard navigation remain available.</w:t>
+      </w:r>
+    </w:p>
+    <w:p>
+      <w:pPr>
+        <w:widowControl/>
+        <w:spacing w:before="0" w:after="120" w:line="300" w:lineRule="auto"/>
+      </w:pPr>
+      <w:r>
+        <w:rPr>
+          <w:rFonts w:ascii="Calibri" w:hAnsi="Calibri"/>
+          <w:sz w:val="22"/>
+        </w:rPr>
         <w:t>The selected theme persists across closing and reopening VerseVAD. Legacy Light and System choices migrate safely to Classic. The selection is stored as an application-level local preference, not in a project or analysis configuration. Appearance does not change calculations, result IDs, project data, or exports. Publication-oriented charts remain light.</w:t>
       </w:r>
     </w:p>
@@ -2853,6 +2866,237 @@
           <w:rFonts w:ascii="Calibri" w:hAnsi="Calibri"/>
           <w:sz w:val="22"/>
         </w:rPr>
+        <w:t>Analysis Library, drafts, and research notes</w:t>
+      </w:r>
+    </w:p>
+    <w:p>
+      <w:pPr>
+        <w:widowControl/>
+        <w:spacing w:before="0" w:after="120" w:line="300" w:lineRule="auto"/>
+      </w:pPr>
+      <w:r>
+        <w:rPr>
+          <w:rFonts w:ascii="Calibri" w:hAnsi="Calibri"/>
+          <w:sz w:val="22"/>
+        </w:rPr>
+        <w:t xml:space="preserve">Entering text in Single Poem, Other Text, or Compare Poems creates a recoverable private draft after the value is applied. Open </w:t>
+      </w:r>
+      <w:r>
+        <w:rPr>
+          <w:rFonts w:ascii="Calibri" w:hAnsi="Calibri"/>
+          <w:b/>
+          <w:sz w:val="22"/>
+        </w:rPr>
+        <w:t>Collections → Analysis Library → Draft Analyses</w:t>
+      </w:r>
+      <w:r>
+        <w:rPr>
+          <w:rFonts w:ascii="Calibri" w:hAnsi="Calibri"/>
+          <w:sz w:val="22"/>
+        </w:rPr>
+        <w:t xml:space="preserve"> to recover it. Unchanged interface reruns do not create duplicate draft revisions.</w:t>
+      </w:r>
+    </w:p>
+    <w:p>
+      <w:pPr>
+        <w:widowControl/>
+        <w:spacing w:before="0" w:after="120" w:line="300" w:lineRule="auto"/>
+      </w:pPr>
+      <w:r>
+        <w:rPr>
+          <w:rFonts w:ascii="Calibri" w:hAnsi="Calibri"/>
+          <w:sz w:val="22"/>
+        </w:rPr>
+        <w:t xml:space="preserve">After completing an analysis, open </w:t>
+      </w:r>
+      <w:r>
+        <w:rPr>
+          <w:rFonts w:ascii="Calibri" w:hAnsi="Calibri"/>
+          <w:b/>
+          <w:sz w:val="22"/>
+        </w:rPr>
+        <w:t>Analysis Management</w:t>
+      </w:r>
+      <w:r>
+        <w:rPr>
+          <w:rFonts w:ascii="Calibri" w:hAnsi="Calibri"/>
+          <w:sz w:val="22"/>
+        </w:rPr>
+        <w:t xml:space="preserve"> in the sidebar. Choose </w:t>
+      </w:r>
+      <w:r>
+        <w:rPr>
+          <w:rFonts w:ascii="Calibri" w:hAnsi="Calibri"/>
+          <w:b/>
+          <w:sz w:val="22"/>
+        </w:rPr>
+        <w:t>Full analysis and source text</w:t>
+      </w:r>
+      <w:r>
+        <w:rPr>
+          <w:rFonts w:ascii="Calibri" w:hAnsi="Calibri"/>
+          <w:sz w:val="22"/>
+        </w:rPr>
+        <w:t xml:space="preserve"> to retain an exactly restorable historical result. Choose </w:t>
+      </w:r>
+      <w:r>
+        <w:rPr>
+          <w:rFonts w:ascii="Calibri" w:hAnsi="Calibri"/>
+          <w:b/>
+          <w:sz w:val="22"/>
+        </w:rPr>
+        <w:t>Results only — do not retain source text</w:t>
+      </w:r>
+      <w:r>
+        <w:rPr>
+          <w:rFonts w:ascii="Calibri" w:hAnsi="Calibri"/>
+          <w:sz w:val="22"/>
+        </w:rPr>
+        <w:t xml:space="preserve"> to keep only a summary CSV and narrative Word report; this privacy mode cannot reopen the original text. </w:t>
+      </w:r>
+      <w:r>
+        <w:rPr>
+          <w:rFonts w:ascii="Calibri" w:hAnsi="Calibri"/>
+          <w:b/>
+          <w:sz w:val="22"/>
+        </w:rPr>
+        <w:t>Save analysis</w:t>
+      </w:r>
+      <w:r>
+        <w:rPr>
+          <w:rFonts w:ascii="Calibri" w:hAnsi="Calibri"/>
+          <w:sz w:val="22"/>
+        </w:rPr>
+        <w:t xml:space="preserve"> appends an immutable revision, while </w:t>
+      </w:r>
+      <w:r>
+        <w:rPr>
+          <w:rFonts w:ascii="Calibri" w:hAnsi="Calibri"/>
+          <w:b/>
+          <w:sz w:val="22"/>
+        </w:rPr>
+        <w:t>Save as new</w:t>
+      </w:r>
+      <w:r>
+        <w:rPr>
+          <w:rFonts w:ascii="Calibri" w:hAnsi="Calibri"/>
+          <w:sz w:val="22"/>
+        </w:rPr>
+        <w:t xml:space="preserve"> creates a separate library item. An optional project identifier records an association without moving project data.</w:t>
+      </w:r>
+    </w:p>
+    <w:p>
+      <w:pPr>
+        <w:widowControl/>
+        <w:spacing w:before="0" w:after="120" w:line="300" w:lineRule="auto"/>
+      </w:pPr>
+      <w:r>
+        <w:rPr>
+          <w:rFonts w:ascii="Calibri" w:hAnsi="Calibri"/>
+          <w:sz w:val="22"/>
+        </w:rPr>
+        <w:t>Opening a full save does not silently recalculate it. VerseVAD displays the version that created the result and offers continued historical viewing or preparation for an explicit current-version reanalysis.</w:t>
+      </w:r>
+    </w:p>
+    <w:p>
+      <w:pPr>
+        <w:widowControl/>
+        <w:spacing w:before="0" w:after="120" w:line="300" w:lineRule="auto"/>
+      </w:pPr>
+      <w:r>
+        <w:rPr>
+          <w:rFonts w:ascii="Calibri" w:hAnsi="Calibri"/>
+          <w:b/>
+          <w:sz w:val="22"/>
+        </w:rPr>
+        <w:t>Research Notes</w:t>
+      </w:r>
+      <w:r>
+        <w:rPr>
+          <w:rFonts w:ascii="Calibri" w:hAnsi="Calibri"/>
+          <w:sz w:val="22"/>
+        </w:rPr>
+        <w:t xml:space="preserve"> attach to the active analysis, draft, comparison, collection, or Lexicon Explorer lookup. They can also be anchored to a report section, metric, chart, passage or line, word or phrase, rhyme, or form candidate. Notes retain titles, bodies, tags, and dates. The Analysis Library Notebook retrieves and edits them after changing workspaces.</w:t>
+      </w:r>
+    </w:p>
+    <w:p>
+      <w:pPr>
+        <w:widowControl/>
+        <w:spacing w:before="0" w:after="120" w:line="300" w:lineRule="auto"/>
+      </w:pPr>
+      <w:r>
+        <w:rPr>
+          <w:rFonts w:ascii="Calibri" w:hAnsi="Calibri"/>
+          <w:sz w:val="22"/>
+        </w:rPr>
+        <w:t xml:space="preserve">Notes are excluded from every export by default. The export controls can include all notes, analysis-level notes, or selected notes, with a separate choice for IDs, dates, tags, and anchors. Selected notes enter the Word appendix; full audit downloads also receive </w:t>
+      </w:r>
+      <w:r>
+        <w:rPr>
+          <w:rFonts w:ascii="Consolas" w:hAnsi="Consolas"/>
+          <w:color w:val="1F4D78"/>
+          <w:sz w:val="19"/>
+        </w:rPr>
+        <w:t>research_notes.csv</w:t>
+      </w:r>
+      <w:r>
+        <w:rPr>
+          <w:rFonts w:ascii="Calibri" w:hAnsi="Calibri"/>
+          <w:sz w:val="22"/>
+        </w:rPr>
+        <w:t xml:space="preserve"> and </w:t>
+      </w:r>
+      <w:r>
+        <w:rPr>
+          <w:rFonts w:ascii="Consolas" w:hAnsi="Consolas"/>
+          <w:color w:val="1F4D78"/>
+          <w:sz w:val="19"/>
+        </w:rPr>
+        <w:t>research_notes.md</w:t>
+      </w:r>
+      <w:r>
+        <w:rPr>
+          <w:rFonts w:ascii="Calibri" w:hAnsi="Calibri"/>
+          <w:sz w:val="22"/>
+        </w:rPr>
+        <w:t>.</w:t>
+      </w:r>
+    </w:p>
+    <w:p>
+      <w:pPr>
+        <w:widowControl/>
+        <w:spacing w:before="0" w:after="120" w:line="300" w:lineRule="auto"/>
+      </w:pPr>
+      <w:r>
+        <w:rPr>
+          <w:rFonts w:ascii="Calibri" w:hAnsi="Calibri"/>
+          <w:sz w:val="22"/>
+        </w:rPr>
+        <w:t>Local Analysis Library data stay in ignored private SQLite storage and are not uploaded to GitHub. The hosted edition uses temporary session-only storage; download important reports before that hosted session ends.</w:t>
+      </w:r>
+    </w:p>
+    <w:p>
+      <w:pPr>
+        <w:widowControl/>
+        <w:spacing w:before="0" w:after="120" w:line="300" w:lineRule="auto"/>
+      </w:pPr>
+      <w:r>
+        <w:rPr>
+          <w:rFonts w:ascii="Calibri" w:hAnsi="Calibri"/>
+          <w:sz w:val="22"/>
+        </w:rPr>
+        <w:t>The Clear Text menu asks whether to keep a recoverable draft, save the completed analysis first, or discard only the unsaved draft.</w:t>
+      </w:r>
+    </w:p>
+    <w:p>
+      <w:pPr>
+        <w:pStyle w:val="Heading2"/>
+      </w:pPr>
+      <w:r>
+        <w:rPr>
+          <w:rFonts w:ascii="Calibri" w:hAnsi="Calibri"/>
+          <w:sz w:val="22"/>
+        </w:rPr>
         <w:t>Stop VerseVAD</w:t>
       </w:r>
     </w:p>
@@ -2866,7 +3110,7 @@
           <w:rFonts w:ascii="Calibri" w:hAnsi="Calibri"/>
           <w:sz w:val="22"/>
         </w:rPr>
-        <w:t>Close the browser tab, then close the visible launcher window. One-poem results exist only in the current application session unless downloaded. Corpus projects persist in the local SQLite database.</w:t>
+        <w:t>Close the browser tab, then close the visible launcher window. Unsaved one-poem results end with the current application session. Saved analyses and corpus projects persist in their ignored local SQLite databases. Hosted Analysis Library items remain session-only.</w:t>
       </w:r>
     </w:p>
     <w:p>
@@ -3370,7 +3614,20 @@
           <w:rFonts w:ascii="Calibri" w:hAnsi="Calibri"/>
           <w:sz w:val="22"/>
         </w:rPr>
-        <w:t>, save the readable summary or full audit bundle.</w:t>
+        <w:t>, save the readable summary or full audit bundle. Notes</w:t>
+      </w:r>
+    </w:p>
+    <w:p>
+      <w:pPr>
+        <w:widowControl/>
+        <w:spacing w:before="0" w:after="120" w:line="300" w:lineRule="auto"/>
+      </w:pPr>
+      <w:r>
+        <w:rPr>
+          <w:rFonts w:ascii="Calibri" w:hAnsi="Calibri"/>
+          <w:sz w:val="22"/>
+        </w:rPr>
+        <w:t xml:space="preserve">    remain excluded unless you explicitly select them.</w:t>
       </w:r>
     </w:p>
     <w:p>

</xml_diff>

<commit_message>
Complete final research workspaces
</commit_message>
<xml_diff>
--- a/docs/VerseVAD_User_Manual.docx
+++ b/docs/VerseVAD_User_Manual.docx
@@ -71,7 +71,7 @@
           <w:color w:val="66727C"/>
           <w:sz w:val="21"/>
         </w:rPr>
-        <w:t xml:space="preserve"> July 29, 2026</w:t>
+        <w:t xml:space="preserve"> July 30, 2026</w:t>
       </w:r>
       <w:r>
         <w:rPr>
@@ -2710,7 +2710,7 @@
           <w:rFonts w:ascii="Calibri" w:hAnsi="Calibri"/>
           <w:sz w:val="22"/>
         </w:rPr>
-        <w:t>Personal Corpus appears only in the downloadable local edition. Routes whose later implementation is not yet complete are visibly marked as planned rather than displaying substitute results. The contextual sidebar keeps the current object, analysis profile, settings, comparison resources, working research-notes notebook, analysis-management controls, and export guidance together.</w:t>
+        <w:t>Personal Corpus appears only in the downloadable local edition. Every listed route is implemented. The contextual sidebar keeps the current object, analysis profile, settings, comparison resources, working research-notes notebook, analysis-management controls, and export guidance together. Workspaces where analytical controls do not apply show an About panel, relevant Quick Navigation links, and data/privacy guidance instead of a blank sidebar.</w:t>
       </w:r>
     </w:p>
     <w:p>
@@ -2866,6 +2866,162 @@
           <w:rFonts w:ascii="Calibri" w:hAnsi="Calibri"/>
           <w:sz w:val="22"/>
         </w:rPr>
+        <w:t>Reference corpora and research workspaces</w:t>
+      </w:r>
+    </w:p>
+    <w:p>
+      <w:pPr>
+        <w:widowControl/>
+        <w:spacing w:before="0" w:after="120" w:line="300" w:lineRule="auto"/>
+      </w:pPr>
+      <w:r>
+        <w:rPr>
+          <w:rFonts w:ascii="Calibri" w:hAnsi="Calibri"/>
+          <w:b/>
+          <w:sz w:val="22"/>
+        </w:rPr>
+        <w:t>Collections → Reference Corpora</w:t>
+      </w:r>
+      <w:r>
+        <w:rPr>
+          <w:rFonts w:ascii="Calibri" w:hAnsi="Calibri"/>
+          <w:sz w:val="22"/>
+        </w:rPr>
+        <w:t xml:space="preserve"> inventories all corpora visible to the installation. The bundled VerseMap corpus is read-only. The downloadable local edition can create private corpora from nonempty UTF-8 </w:t>
+      </w:r>
+      <w:r>
+        <w:rPr>
+          <w:rFonts w:ascii="Consolas" w:hAnsi="Consolas"/>
+          <w:color w:val="1F4D78"/>
+          <w:sz w:val="19"/>
+        </w:rPr>
+        <w:t>.txt</w:t>
+      </w:r>
+      <w:r>
+        <w:rPr>
+          <w:rFonts w:ascii="Calibri" w:hAnsi="Calibri"/>
+          <w:sz w:val="22"/>
+        </w:rPr>
+        <w:t xml:space="preserve"> files, validate them, add or replace poems, build or refresh their fixed Standard Profile 1.0 indexes, and remove them after exact-name confirmation. Their source and generated files live under Git-ignored </w:t>
+      </w:r>
+      <w:r>
+        <w:rPr>
+          <w:rFonts w:ascii="Consolas" w:hAnsi="Consolas"/>
+          <w:color w:val="1F4D78"/>
+          <w:sz w:val="19"/>
+        </w:rPr>
+        <w:t>projects/reference_corpora/</w:t>
+      </w:r>
+      <w:r>
+        <w:rPr>
+          <w:rFonts w:ascii="Calibri" w:hAnsi="Calibri"/>
+          <w:sz w:val="22"/>
+        </w:rPr>
+        <w:t>; VerseVAD does not upload them.</w:t>
+      </w:r>
+    </w:p>
+    <w:p>
+      <w:pPr>
+        <w:widowControl/>
+        <w:spacing w:before="0" w:after="120" w:line="300" w:lineRule="auto"/>
+      </w:pPr>
+      <w:r>
+        <w:rPr>
+          <w:rFonts w:ascii="Calibri" w:hAnsi="Calibri"/>
+          <w:b/>
+          <w:sz w:val="22"/>
+        </w:rPr>
+        <w:t>Explore → VerseMap</w:t>
+      </w:r>
+      <w:r>
+        <w:rPr>
+          <w:rFonts w:ascii="Calibri" w:hAnsi="Calibri"/>
+          <w:sz w:val="22"/>
+        </w:rPr>
+        <w:t xml:space="preserve"> is a standalone one-poem comparison workspace. Supply a title, author, and text, choose any indexed corpus, and run the fixed, sound-free VerseMap Standard Profile 1.0. The map, nearest poems, poet centroids, shared evidence, coverage, release, and model identity use the same auditable services as embedded VerseMap. Interactive Single Poem weighting or module settings cannot silently change this comparison profile. Standalone VerseMap results support recoverable drafts, research notes, historical saves, Word reports, and full audit bundles.</w:t>
+      </w:r>
+    </w:p>
+    <w:p>
+      <w:pPr>
+        <w:widowControl/>
+        <w:spacing w:before="0" w:after="120" w:line="300" w:lineRule="auto"/>
+      </w:pPr>
+      <w:r>
+        <w:rPr>
+          <w:rFonts w:ascii="Calibri" w:hAnsi="Calibri"/>
+          <w:b/>
+          <w:sz w:val="22"/>
+        </w:rPr>
+        <w:t>Explore → Corpus Browser</w:t>
+      </w:r>
+      <w:r>
+        <w:rPr>
+          <w:rFonts w:ascii="Calibri" w:hAnsi="Calibri"/>
+          <w:sz w:val="22"/>
+        </w:rPr>
+        <w:t xml:space="preserve"> reads corpus inventory, metadata, coverage, feature distributions, and individual poem profiles without editing source files. </w:t>
+      </w:r>
+      <w:r>
+        <w:rPr>
+          <w:rFonts w:ascii="Calibri" w:hAnsi="Calibri"/>
+          <w:b/>
+          <w:sz w:val="22"/>
+        </w:rPr>
+        <w:t>Explore → Form Library</w:t>
+      </w:r>
+      <w:r>
+        <w:rPr>
+          <w:rFonts w:ascii="Calibri" w:hAnsi="Calibri"/>
+          <w:sz w:val="22"/>
+        </w:rPr>
+        <w:t xml:space="preserve"> provides the definitions, requirements, weights, sources, and limitations for all inherited-form profiles without requiring a poem analysis.</w:t>
+      </w:r>
+    </w:p>
+    <w:p>
+      <w:pPr>
+        <w:widowControl/>
+        <w:spacing w:before="0" w:after="120" w:line="300" w:lineRule="auto"/>
+      </w:pPr>
+      <w:r>
+        <w:rPr>
+          <w:rFonts w:ascii="Calibri" w:hAnsi="Calibri"/>
+          <w:b/>
+          <w:sz w:val="22"/>
+        </w:rPr>
+        <w:t>Learn → Documentation</w:t>
+      </w:r>
+      <w:r>
+        <w:rPr>
+          <w:rFonts w:ascii="Calibri" w:hAnsi="Calibri"/>
+          <w:sz w:val="22"/>
+        </w:rPr>
+        <w:t xml:space="preserve"> presents selected packaged guides and offers the complete Word manual. </w:t>
+      </w:r>
+      <w:r>
+        <w:rPr>
+          <w:rFonts w:ascii="Calibri" w:hAnsi="Calibri"/>
+          <w:b/>
+          <w:sz w:val="22"/>
+        </w:rPr>
+        <w:t>Learn → Methodology</w:t>
+      </w:r>
+      <w:r>
+        <w:rPr>
+          <w:rFonts w:ascii="Calibri" w:hAnsi="Calibri"/>
+          <w:sz w:val="22"/>
+        </w:rPr>
+        <w:t xml:space="preserve"> provides a searchable reader for calculation rules, interpretation guidance, provenance, known limitations, and validation documentation.</w:t>
+      </w:r>
+    </w:p>
+    <w:p>
+      <w:pPr>
+        <w:pStyle w:val="Heading2"/>
+      </w:pPr>
+      <w:r>
+        <w:rPr>
+          <w:rFonts w:ascii="Calibri" w:hAnsi="Calibri"/>
+          <w:sz w:val="22"/>
+        </w:rPr>
         <w:t>Analysis Library, drafts, and research notes</w:t>
       </w:r>
     </w:p>
@@ -2879,7 +3035,7 @@
           <w:rFonts w:ascii="Calibri" w:hAnsi="Calibri"/>
           <w:sz w:val="22"/>
         </w:rPr>
-        <w:t xml:space="preserve">Entering text in Single Poem, Other Text, or Compare Poems creates a recoverable private draft after the value is applied. Open </w:t>
+        <w:t xml:space="preserve">Entering text in Single Poem, Other Text, or Compare Poems, or running standalone VerseMap, creates a recoverable private draft after the value is applied. Open </w:t>
       </w:r>
       <w:r>
         <w:rPr>

</xml_diff>

<commit_message>
Streamline corpus reports and repair poem comparison
</commit_message>
<xml_diff>
--- a/docs/VerseVAD_User_Manual.docx
+++ b/docs/VerseVAD_User_Manual.docx
@@ -2938,7 +2938,7 @@
           <w:rFonts w:ascii="Calibri" w:hAnsi="Calibri"/>
           <w:sz w:val="22"/>
         </w:rPr>
-        <w:t xml:space="preserve"> is a standalone one-poem comparison workspace. Supply a title, author, and text, choose any indexed corpus, and run the fixed, sound-free VerseMap Standard Profile 1.0. The map, nearest poems, poet centroids, shared evidence, coverage, release, and model identity use the same auditable services as embedded VerseMap. Interactive Single Poem weighting or module settings cannot silently change this comparison profile. Standalone VerseMap results support recoverable drafts, research notes, historical saves, Word reports, and full audit bundles.</w:t>
+        <w:t xml:space="preserve"> is a standalone one-poem comparison workspace. Supply a title, author, and text, choose any indexed corpus, and run the fixed, sound-free VerseMap Standard Profile 1.0. The map, nearest poems, poet centroids, shared evidence, coverage, release, and model identity use the same auditable services as embedded VerseMap. Interactive Single Poem weighting or module settings cannot silently change this comparison profile. Standalone VerseMap results support research notes, explicit historical saves, Word reports, and full audit bundles.</w:t>
       </w:r>
     </w:p>
     <w:p>
@@ -2959,7 +2959,7 @@
           <w:rFonts w:ascii="Calibri" w:hAnsi="Calibri"/>
           <w:sz w:val="22"/>
         </w:rPr>
-        <w:t xml:space="preserve"> reads corpus inventory, metadata, coverage, feature distributions, and individual poem profiles without editing source files. </w:t>
+        <w:t xml:space="preserve"> reads corpus inventory, metadata, a poem-and-poet VerseMap, Standard Profile means and dispersion, sortable poem metrics, corpus-relative characteristicity and distinctiveness, feature distributions, and individual poem profiles without editing source files. Choose </w:t>
       </w:r>
       <w:r>
         <w:rPr>
@@ -2967,6 +2967,21 @@
           <w:b/>
           <w:sz w:val="22"/>
         </w:rPr>
+        <w:t>Whole Corpus</w:t>
+      </w:r>
+      <w:r>
+        <w:rPr>
+          <w:rFonts w:ascii="Calibri" w:hAnsi="Calibri"/>
+          <w:sz w:val="22"/>
+        </w:rPr>
+        <w:t xml:space="preserve"> or a specific poem before choosing a report section. On-screen whole-corpus tables show one metric family at a time; CSV downloads retain the complete Standard Profile matrix. </w:t>
+      </w:r>
+      <w:r>
+        <w:rPr>
+          <w:rFonts w:ascii="Calibri" w:hAnsi="Calibri"/>
+          <w:b/>
+          <w:sz w:val="22"/>
+        </w:rPr>
         <w:t>Explore → Form Library</w:t>
       </w:r>
       <w:r>
@@ -3022,7 +3037,7 @@
           <w:rFonts w:ascii="Calibri" w:hAnsi="Calibri"/>
           <w:sz w:val="22"/>
         </w:rPr>
-        <w:t>Analysis Library, drafts, and research notes</w:t>
+        <w:t>Analysis Library and research notes</w:t>
       </w:r>
     </w:p>
     <w:p>
@@ -3035,7 +3050,20 @@
           <w:rFonts w:ascii="Calibri" w:hAnsi="Calibri"/>
           <w:sz w:val="22"/>
         </w:rPr>
-        <w:t xml:space="preserve">Entering text in Single Poem, Other Text, or Compare Poems, or running standalone VerseMap, creates a recoverable private draft after the value is applied. Open </w:t>
+        <w:t>VerseVAD does not autosave drafts. Unsaved text and results remain only in the current application session.</w:t>
+      </w:r>
+    </w:p>
+    <w:p>
+      <w:pPr>
+        <w:widowControl/>
+        <w:spacing w:before="0" w:after="120" w:line="300" w:lineRule="auto"/>
+      </w:pPr>
+      <w:r>
+        <w:rPr>
+          <w:rFonts w:ascii="Calibri" w:hAnsi="Calibri"/>
+          <w:sz w:val="22"/>
+        </w:rPr>
+        <w:t xml:space="preserve">After completing an analysis, open </w:t>
       </w:r>
       <w:r>
         <w:rPr>
@@ -3043,14 +3071,74 @@
           <w:b/>
           <w:sz w:val="22"/>
         </w:rPr>
-        <w:t>Collections → Analysis Library → Draft Analyses</w:t>
-      </w:r>
-      <w:r>
-        <w:rPr>
-          <w:rFonts w:ascii="Calibri" w:hAnsi="Calibri"/>
-          <w:sz w:val="22"/>
-        </w:rPr>
-        <w:t xml:space="preserve"> to recover it. Unchanged interface reruns do not create duplicate draft revisions.</w:t>
+        <w:t>Analysis Management</w:t>
+      </w:r>
+      <w:r>
+        <w:rPr>
+          <w:rFonts w:ascii="Calibri" w:hAnsi="Calibri"/>
+          <w:sz w:val="22"/>
+        </w:rPr>
+        <w:t xml:space="preserve"> in the sidebar. Enter a required saved-analysis title. Choose </w:t>
+      </w:r>
+      <w:r>
+        <w:rPr>
+          <w:rFonts w:ascii="Calibri" w:hAnsi="Calibri"/>
+          <w:b/>
+          <w:sz w:val="22"/>
+        </w:rPr>
+        <w:t>Full analysis and source text</w:t>
+      </w:r>
+      <w:r>
+        <w:rPr>
+          <w:rFonts w:ascii="Calibri" w:hAnsi="Calibri"/>
+          <w:sz w:val="22"/>
+        </w:rPr>
+        <w:t xml:space="preserve"> to retain an exactly restorable historical result. Choose </w:t>
+      </w:r>
+      <w:r>
+        <w:rPr>
+          <w:rFonts w:ascii="Calibri" w:hAnsi="Calibri"/>
+          <w:b/>
+          <w:sz w:val="22"/>
+        </w:rPr>
+        <w:t>Results only — do not retain source text</w:t>
+      </w:r>
+      <w:r>
+        <w:rPr>
+          <w:rFonts w:ascii="Calibri" w:hAnsi="Calibri"/>
+          <w:sz w:val="22"/>
+        </w:rPr>
+        <w:t xml:space="preserve"> to keep only a summary CSV and narrative Word report; this privacy mode cannot reopen the original text. </w:t>
+      </w:r>
+      <w:r>
+        <w:rPr>
+          <w:rFonts w:ascii="Calibri" w:hAnsi="Calibri"/>
+          <w:b/>
+          <w:sz w:val="22"/>
+        </w:rPr>
+        <w:t>Save analysis</w:t>
+      </w:r>
+      <w:r>
+        <w:rPr>
+          <w:rFonts w:ascii="Calibri" w:hAnsi="Calibri"/>
+          <w:sz w:val="22"/>
+        </w:rPr>
+        <w:t xml:space="preserve"> appends an immutable revision, while </w:t>
+      </w:r>
+      <w:r>
+        <w:rPr>
+          <w:rFonts w:ascii="Calibri" w:hAnsi="Calibri"/>
+          <w:b/>
+          <w:sz w:val="22"/>
+        </w:rPr>
+        <w:t>Save as new</w:t>
+      </w:r>
+      <w:r>
+        <w:rPr>
+          <w:rFonts w:ascii="Calibri" w:hAnsi="Calibri"/>
+          <w:sz w:val="22"/>
+        </w:rPr>
+        <w:t xml:space="preserve"> creates a separate library item. An optional project identifier records an association without moving project data.</w:t>
       </w:r>
     </w:p>
     <w:p>
@@ -3063,108 +3151,20 @@
           <w:rFonts w:ascii="Calibri" w:hAnsi="Calibri"/>
           <w:sz w:val="22"/>
         </w:rPr>
-        <w:t xml:space="preserve">After completing an analysis, open </w:t>
-      </w:r>
+        <w:t>Opening a full save does not silently recalculate it. VerseVAD displays the version that created the result and offers continued historical viewing or preparation for an explicit current-version reanalysis.</w:t>
+      </w:r>
+    </w:p>
+    <w:p>
+      <w:pPr>
+        <w:widowControl/>
+        <w:spacing w:before="0" w:after="120" w:line="300" w:lineRule="auto"/>
+      </w:pPr>
       <w:r>
         <w:rPr>
           <w:rFonts w:ascii="Calibri" w:hAnsi="Calibri"/>
           <w:b/>
           <w:sz w:val="22"/>
         </w:rPr>
-        <w:t>Analysis Management</w:t>
-      </w:r>
-      <w:r>
-        <w:rPr>
-          <w:rFonts w:ascii="Calibri" w:hAnsi="Calibri"/>
-          <w:sz w:val="22"/>
-        </w:rPr>
-        <w:t xml:space="preserve"> in the sidebar. Choose </w:t>
-      </w:r>
-      <w:r>
-        <w:rPr>
-          <w:rFonts w:ascii="Calibri" w:hAnsi="Calibri"/>
-          <w:b/>
-          <w:sz w:val="22"/>
-        </w:rPr>
-        <w:t>Full analysis and source text</w:t>
-      </w:r>
-      <w:r>
-        <w:rPr>
-          <w:rFonts w:ascii="Calibri" w:hAnsi="Calibri"/>
-          <w:sz w:val="22"/>
-        </w:rPr>
-        <w:t xml:space="preserve"> to retain an exactly restorable historical result. Choose </w:t>
-      </w:r>
-      <w:r>
-        <w:rPr>
-          <w:rFonts w:ascii="Calibri" w:hAnsi="Calibri"/>
-          <w:b/>
-          <w:sz w:val="22"/>
-        </w:rPr>
-        <w:t>Results only — do not retain source text</w:t>
-      </w:r>
-      <w:r>
-        <w:rPr>
-          <w:rFonts w:ascii="Calibri" w:hAnsi="Calibri"/>
-          <w:sz w:val="22"/>
-        </w:rPr>
-        <w:t xml:space="preserve"> to keep only a summary CSV and narrative Word report; this privacy mode cannot reopen the original text. </w:t>
-      </w:r>
-      <w:r>
-        <w:rPr>
-          <w:rFonts w:ascii="Calibri" w:hAnsi="Calibri"/>
-          <w:b/>
-          <w:sz w:val="22"/>
-        </w:rPr>
-        <w:t>Save analysis</w:t>
-      </w:r>
-      <w:r>
-        <w:rPr>
-          <w:rFonts w:ascii="Calibri" w:hAnsi="Calibri"/>
-          <w:sz w:val="22"/>
-        </w:rPr>
-        <w:t xml:space="preserve"> appends an immutable revision, while </w:t>
-      </w:r>
-      <w:r>
-        <w:rPr>
-          <w:rFonts w:ascii="Calibri" w:hAnsi="Calibri"/>
-          <w:b/>
-          <w:sz w:val="22"/>
-        </w:rPr>
-        <w:t>Save as new</w:t>
-      </w:r>
-      <w:r>
-        <w:rPr>
-          <w:rFonts w:ascii="Calibri" w:hAnsi="Calibri"/>
-          <w:sz w:val="22"/>
-        </w:rPr>
-        <w:t xml:space="preserve"> creates a separate library item. An optional project identifier records an association without moving project data.</w:t>
-      </w:r>
-    </w:p>
-    <w:p>
-      <w:pPr>
-        <w:widowControl/>
-        <w:spacing w:before="0" w:after="120" w:line="300" w:lineRule="auto"/>
-      </w:pPr>
-      <w:r>
-        <w:rPr>
-          <w:rFonts w:ascii="Calibri" w:hAnsi="Calibri"/>
-          <w:sz w:val="22"/>
-        </w:rPr>
-        <w:t>Opening a full save does not silently recalculate it. VerseVAD displays the version that created the result and offers continued historical viewing or preparation for an explicit current-version reanalysis.</w:t>
-      </w:r>
-    </w:p>
-    <w:p>
-      <w:pPr>
-        <w:widowControl/>
-        <w:spacing w:before="0" w:after="120" w:line="300" w:lineRule="auto"/>
-      </w:pPr>
-      <w:r>
-        <w:rPr>
-          <w:rFonts w:ascii="Calibri" w:hAnsi="Calibri"/>
-          <w:b/>
-          <w:sz w:val="22"/>
-        </w:rPr>
         <w:t>Research Notes</w:t>
       </w:r>
       <w:r>
@@ -3172,7 +3172,7 @@
           <w:rFonts w:ascii="Calibri" w:hAnsi="Calibri"/>
           <w:sz w:val="22"/>
         </w:rPr>
-        <w:t xml:space="preserve"> attach to the active analysis, draft, comparison, collection, or Lexicon Explorer lookup. They can also be anchored to a report section, metric, chart, passage or line, word or phrase, rhyme, or form candidate. Notes retain titles, bodies, tags, and dates. The Analysis Library Notebook retrieves and edits them after changing workspaces.</w:t>
+        <w:t xml:space="preserve"> attach to the active saved analysis, comparison, collection, or Lexicon Explorer lookup. They can also be anchored to a report section, metric, chart, passage or line, word or phrase, rhyme, or form candidate. Notes retain titles, bodies, tags, and dates. The Analysis Library Notebook retrieves and edits them after changing workspaces.</w:t>
       </w:r>
     </w:p>
     <w:p>
@@ -3241,7 +3241,7 @@
           <w:rFonts w:ascii="Calibri" w:hAnsi="Calibri"/>
           <w:sz w:val="22"/>
         </w:rPr>
-        <w:t>The Clear Text menu asks whether to keep a recoverable draft, save the completed analysis first, or discard only the unsaved draft.</w:t>
+        <w:t>Clear Text discards the current unsaved context. Save the completed analysis explicitly before clearing if it should remain in the Analysis Library.</w:t>
       </w:r>
     </w:p>
     <w:p>
@@ -13736,7 +13736,67 @@
           <w:rFonts w:ascii="Calibri" w:hAnsi="Calibri"/>
           <w:sz w:val="22"/>
         </w:rPr>
-        <w:t>, add one file, several files, a folder, or pasted text. Text and metadata edits preserve a new version. Deleting a poem requires typing its exact title and removes only that poem's local versions and results. The stateful Report Section dropdown includes poem-specific results and whole-corpus summaries. Affective poem detail retains token/type and all-token/stopword-excluded selectors. VerseMap is always locked to Standard Profile 1.0 for both personal and reference poems.</w:t>
+        <w:t xml:space="preserve">, add one file, several files, a folder, or pasted text. Text and metadata edits preserve a new version. Deleting a poem requires typing its exact title and removes only that poem's local versions and results. The stateful Report Section dropdown includes </w:t>
+      </w:r>
+      <w:r>
+        <w:rPr>
+          <w:rFonts w:ascii="Calibri" w:hAnsi="Calibri"/>
+          <w:b/>
+          <w:sz w:val="22"/>
+        </w:rPr>
+        <w:t>Corpus Analysis</w:t>
+      </w:r>
+      <w:r>
+        <w:rPr>
+          <w:rFonts w:ascii="Calibri" w:hAnsi="Calibri"/>
+          <w:sz w:val="22"/>
+        </w:rPr>
+        <w:t xml:space="preserve">. After a batch completes, its nested </w:t>
+      </w:r>
+      <w:r>
+        <w:rPr>
+          <w:rFonts w:ascii="Calibri" w:hAnsi="Calibri"/>
+          <w:b/>
+          <w:sz w:val="22"/>
+        </w:rPr>
+        <w:t>Result Scope</w:t>
+      </w:r>
+      <w:r>
+        <w:rPr>
+          <w:rFonts w:ascii="Calibri" w:hAnsi="Calibri"/>
+          <w:sz w:val="22"/>
+        </w:rPr>
+        <w:t xml:space="preserve"> selector switches between </w:t>
+      </w:r>
+      <w:r>
+        <w:rPr>
+          <w:rFonts w:ascii="Calibri" w:hAnsi="Calibri"/>
+          <w:b/>
+          <w:sz w:val="22"/>
+        </w:rPr>
+        <w:t>Whole Corpus</w:t>
+      </w:r>
+      <w:r>
+        <w:rPr>
+          <w:rFonts w:ascii="Calibri" w:hAnsi="Calibri"/>
+          <w:sz w:val="22"/>
+        </w:rPr>
+        <w:t xml:space="preserve"> and individual poems, while its </w:t>
+      </w:r>
+      <w:r>
+        <w:rPr>
+          <w:rFonts w:ascii="Calibri" w:hAnsi="Calibri"/>
+          <w:b/>
+          <w:sz w:val="22"/>
+        </w:rPr>
+        <w:t>Analysis Report</w:t>
+      </w:r>
+      <w:r>
+        <w:rPr>
+          <w:rFonts w:ascii="Calibri" w:hAnsi="Calibri"/>
+          <w:sz w:val="22"/>
+        </w:rPr>
+        <w:t xml:space="preserve"> selector exposes the same familiar analytical families used elsewhere. The front end presents concise document or compatible collection summaries; complete work, line, stanza, token, denominator, and warning records remain in exports. Affective results retain token/type and all-token/stopword-excluded selectors. VerseMap is always locked to Standard Profile 1.0 for both personal and reference poems.</w:t>
       </w:r>
     </w:p>
     <w:p>
@@ -14393,7 +14453,7 @@
           <w:rFonts w:ascii="Calibri" w:hAnsi="Calibri"/>
           <w:sz w:val="22"/>
         </w:rPr>
-        <w:t>Filter and compare</w:t>
+        <w:t>Inspect and compare completed results</w:t>
       </w:r>
     </w:p>
     <w:p>
@@ -14406,7 +14466,52 @@
           <w:rFonts w:ascii="Calibri" w:hAnsi="Calibri"/>
           <w:sz w:val="22"/>
         </w:rPr>
-        <w:t>Filter the completed batch by collection, author, or genre. Select one or both analysis views. Compare work-level token- or type-weighted means without mixing those weightings silently.</w:t>
+        <w:t xml:space="preserve">Choose </w:t>
+      </w:r>
+      <w:r>
+        <w:rPr>
+          <w:rFonts w:ascii="Calibri" w:hAnsi="Calibri"/>
+          <w:b/>
+          <w:sz w:val="22"/>
+        </w:rPr>
+        <w:t>Whole Corpus</w:t>
+      </w:r>
+      <w:r>
+        <w:rPr>
+          <w:rFonts w:ascii="Calibri" w:hAnsi="Calibri"/>
+          <w:sz w:val="22"/>
+        </w:rPr>
+        <w:t xml:space="preserve"> or a specific poem under </w:t>
+      </w:r>
+      <w:r>
+        <w:rPr>
+          <w:rFonts w:ascii="Calibri" w:hAnsi="Calibri"/>
+          <w:b/>
+          <w:sz w:val="22"/>
+        </w:rPr>
+        <w:t>Result Scope</w:t>
+      </w:r>
+      <w:r>
+        <w:rPr>
+          <w:rFonts w:ascii="Calibri" w:hAnsi="Calibri"/>
+          <w:sz w:val="22"/>
+        </w:rPr>
+        <w:t xml:space="preserve">, then choose an available </w:t>
+      </w:r>
+      <w:r>
+        <w:rPr>
+          <w:rFonts w:ascii="Calibri" w:hAnsi="Calibri"/>
+          <w:b/>
+          <w:sz w:val="22"/>
+        </w:rPr>
+        <w:t>Analysis Report</w:t>
+      </w:r>
+      <w:r>
+        <w:rPr>
+          <w:rFonts w:ascii="Calibri" w:hAnsi="Calibri"/>
+          <w:sz w:val="22"/>
+        </w:rPr>
+        <w:t>. Whole Corpus presents compatible collection summaries and poem comparisons; an individual poem presents document-level tables and charts. Affective Evidence separately controls lexicon, token scope, and token/type weighting. Complete low-level evidence stays in the CSV, Word, and module-audit exports rather than filling the front-end report.</w:t>
       </w:r>
     </w:p>
     <w:p>

</xml_diff>

<commit_message>
Prepare VerseVAD 1.0.0 public release
</commit_message>
<xml_diff>
--- a/docs/VerseVAD_User_Manual.docx
+++ b/docs/VerseVAD_User_Manual.docx
@@ -1346,7 +1346,7 @@
           <w:rFonts w:ascii="Calibri" w:hAnsi="Calibri"/>
           <w:sz w:val="22"/>
         </w:rPr>
-        <w:t xml:space="preserve"> are also local and excluded from source control. The Stage 2 concreteness workbook and paper, Stage 3 SUBTLEX-US workbook, Stage 4 Kuperman Age of Acquisition workbook and paper, and Stage 5 pinned CMUdict files must retain their exact paths and checksums. VerseVAD reads analysis sources in place and does not copy any complete research source into an export.</w:t>
+        <w:t xml:space="preserve"> are also local and excluded from source control. The concreteness workbook and paper, SUBTLEX-US workbook, Kuperman Age of Acquisition workbook and paper, and pinned CMUdict files must retain their exact paths and checksums. VerseVAD reads analysis sources in place and does not copy any complete research source into an export.</w:t>
       </w:r>
     </w:p>
     <w:p>
@@ -2135,7 +2135,22 @@
           <w:rFonts w:ascii="Calibri" w:hAnsi="Calibri"/>
           <w:sz w:val="22"/>
         </w:rPr>
-        <w:t xml:space="preserve">A VerseVAD folder cloned with Git can be updated in place. Close VerseVAD, inspect tracked local changes, and use GitHub Desktop </w:t>
+        <w:t xml:space="preserve">A VerseVAD folder cloned from </w:t>
+      </w:r>
+      <w:r>
+        <w:rPr>
+          <w:rFonts w:ascii="Consolas" w:hAnsi="Consolas"/>
+          <w:color w:val="1F4D78"/>
+          <w:sz w:val="19"/>
+        </w:rPr>
+        <w:t>https://github.com/VerseVAD/VerseVAD</w:t>
+      </w:r>
+      <w:r>
+        <w:rPr>
+          <w:rFonts w:ascii="Calibri" w:hAnsi="Calibri"/>
+          <w:sz w:val="22"/>
+        </w:rPr>
+        <w:t xml:space="preserve"> can be updated in place. Close VerseVAD, inspect tracked local changes, and use GitHub Desktop </w:t>
       </w:r>
       <w:r>
         <w:rPr>
@@ -5232,7 +5247,7 @@
           <w:rFonts w:ascii="Calibri" w:hAnsi="Calibri"/>
           <w:sz w:val="22"/>
         </w:rPr>
-        <w:t xml:space="preserve">The Stage 5 one-poem module reads official CMUdict files pinned at repository commit </w:t>
+        <w:t xml:space="preserve">The pronunciation module reads official CMUdict files pinned at repository commit </w:t>
       </w:r>
       <w:r>
         <w:rPr>
@@ -8740,7 +8755,7 @@
           <w:rFonts w:ascii="Calibri" w:hAnsi="Calibri"/>
           <w:sz w:val="22"/>
         </w:rPr>
-        <w:t xml:space="preserve"> automatically uses the retained Stage 5 pronunciation evidence. No affective lexicon is required. It compares five recurring base patterns:</w:t>
+        <w:t xml:space="preserve"> automatically uses the retained pronunciation pronunciation evidence. No affective lexicon is required. It compares five recurring base patterns:</w:t>
       </w:r>
     </w:p>
     <w:tbl>
@@ -9198,7 +9213,7 @@
           <w:rFonts w:ascii="Calibri" w:hAnsi="Calibri"/>
           <w:sz w:val="22"/>
         </w:rPr>
-        <w:t xml:space="preserve"> is the validated default and preserves the Stage 6 result exactly. Two non-default choices add an independent performance-aware realization or display candidate and performance-aware readings together. The second layer does not rewrite the dictionary lexical stress or replace the fixed candidate audit.</w:t>
+        <w:t xml:space="preserve"> is the validated default and preserves the fixed-candidate result exactly. Two non-default choices add an independent performance-aware realization or display candidate and performance-aware readings together. The second layer does not rewrite the dictionary lexical stress or replace the fixed candidate audit.</w:t>
       </w:r>
     </w:p>
     <w:p>
@@ -9589,7 +9604,7 @@
           <w:rFonts w:ascii="Calibri" w:hAnsi="Calibri"/>
           <w:sz w:val="22"/>
         </w:rPr>
-        <w:t xml:space="preserve"> automatically uses the retained Stage 5 pronunciation evidence. No affective lexicon is required. CMUdict supplies phones and lexical stress; VerseVAD derives the rhyme and recurring-sound classifications.</w:t>
+        <w:t xml:space="preserve"> automatically uses the retained pronunciation pronunciation evidence. No affective lexicon is required. CMUdict supplies phones and lexical stress; VerseVAD derives the rhyme and recurring-sound classifications.</w:t>
       </w:r>
     </w:p>
     <w:p>
@@ -9869,7 +9884,7 @@
           <w:rFonts w:ascii="Calibri" w:hAnsi="Calibri"/>
           <w:sz w:val="22"/>
         </w:rPr>
-        <w:t>. It is a configurable heuristic, not a probability. Materially different dictionary alternatives remain unresolved unless a documented Stage 5 scholar override applies.</w:t>
+        <w:t>. It is a configurable heuristic, not a probability. Materially different dictionary alternatives remain unresolved unless a documented scholar pronunciation override applies.</w:t>
       </w:r>
     </w:p>
     <w:p>
@@ -12495,7 +12510,7 @@
           <w:rFonts w:ascii="Calibri" w:hAnsi="Calibri"/>
           <w:sz w:val="22"/>
         </w:rPr>
-        <w:t xml:space="preserve"> are lexical-stress digits, not metrical beats. The Stage 5 tab does not report candidate meter or rhyme.</w:t>
+        <w:t xml:space="preserve"> are lexical-stress digits, not metrical beats. The pronunciation tab does not report candidate meter or rhyme.</w:t>
       </w:r>
     </w:p>
     <w:p>
@@ -12548,7 +12563,7 @@
           <w:rFonts w:ascii="Calibri" w:hAnsi="Calibri"/>
           <w:sz w:val="22"/>
         </w:rPr>
-        <w:t>Do not mistake a metrically preferred stress path for a change to the Stage 5 pronunciation result.</w:t>
+        <w:t>Do not mistake a metrically preferred stress path for a change to the dictionary pronunciation result.</w:t>
       </w:r>
     </w:p>
     <w:p>
@@ -12642,7 +12657,7 @@
           <w:rFonts w:ascii="Calibri" w:hAnsi="Calibri"/>
           <w:sz w:val="22"/>
         </w:rPr>
-        <w:t xml:space="preserve"> and reduces coverage. It receives no neutral value or fabricated rhyme label. Add a Stage 5 override only when you can document the intended pronunciation.</w:t>
+        <w:t xml:space="preserve"> and reduces coverage. It receives no neutral value or fabricated rhyme label. Add a pronunciation override only when you can document the intended pronunciation.</w:t>
       </w:r>
     </w:p>
     <w:p>
@@ -14995,7 +15010,7 @@
           <w:rFonts w:ascii="Calibri" w:hAnsi="Calibri"/>
           <w:sz w:val="22"/>
         </w:rPr>
-        <w:t xml:space="preserve">Phase 5 lets you test explicit scholarly decisions without rewriting an earlier result. Start with an unreviewed baseline, then open </w:t>
+        <w:t xml:space="preserve">Review scenarios let you test explicit scholarly decisions without rewriting an earlier result. Start with an unreviewed baseline, then open </w:t>
       </w:r>
       <w:r>
         <w:rPr>
@@ -30178,7 +30193,7 @@
           <w:rFonts w:ascii="Calibri" w:hAnsi="Calibri"/>
           <w:sz w:val="22"/>
         </w:rPr>
-        <w:t>Stage 5 may show a local, review-only G2P candidate for an unmatched form,</w:t>
+        <w:t>Pronunciation review may show a local, review-only G2P candidate for an unmatched form,</w:t>
       </w:r>
     </w:p>
     <w:p>
@@ -30240,7 +30255,7 @@
           <w:rFonts w:ascii="Calibri" w:hAnsi="Calibri"/>
           <w:sz w:val="22"/>
         </w:rPr>
-        <w:t>Stage 6 meter starts from dictionary lexical stress; contextual promotion,</w:t>
+        <w:t>Candidate meter starts from dictionary lexical stress; contextual promotion,</w:t>
       </w:r>
     </w:p>
     <w:p>
@@ -30302,7 +30317,7 @@
           <w:rFonts w:ascii="Calibri" w:hAnsi="Calibri"/>
           <w:sz w:val="22"/>
         </w:rPr>
-        <w:t>Stage 14 performance-aware scores, style compatibility, promotion/demotion,</w:t>
+        <w:t>Performance-aware scores, style compatibility, promotion/demotion,</w:t>
       </w:r>
     </w:p>
     <w:p>
@@ -30395,7 +30410,7 @@
           <w:rFonts w:ascii="Calibri" w:hAnsi="Calibri"/>
           <w:sz w:val="22"/>
         </w:rPr>
-        <w:t>Stage 7 starts from North American dictionary phones and spelling; dialect,</w:t>
+        <w:t>Rhyme and recurring-sound evidence starts from North American dictionary phones and spelling; dialect,</w:t>
       </w:r>
     </w:p>
     <w:p>
@@ -30650,7 +30665,7 @@
           <w:rFonts w:ascii="Calibri" w:hAnsi="Calibri"/>
           <w:sz w:val="22"/>
         </w:rPr>
-        <w:t>Every analysis should retain the active lexicon or optional research resource, source checksum, adapter version, software version, preprocessing recipe and configuration ID, phrase policy, stopword policy, scenario, and inclusion decisions. Completed corpus runs remain linked to preserved text versions. A concreteness result additionally retains its orientation thresholds, proper-name and phrase policies, low-coverage threshold, source-row matches, and exact workbook checksum. A frequency result retains its Zipf-band thresholds, proper-name policy, exact-before-lemma rule, optional content-word scope, low-coverage threshold, source-row matches, and exact SUBTLEX-US workbook checksum. An AoA result retains early/later thresholds, proper-name policy, exact-before-lemma rule, optional contextual content-word scope, coverage and source-response cautions, source-row matches, optional relationship methods, and the exact official erratum-supplement checksum. A pronunciation result retains every dictionary candidate, three exact source checksums, package and adapter versions, exact observed-form policy, thresholds, scholar overrides and notes, configuration identity, missingness, and physical-line completeness. A meter result retains the linked pronunciation configuration, every penalty and threshold, all fixed candidates, candidate-specific stress paths, line coverage, alignment operations, deviations, fit, confidence explanation, and dependency resource hashes. Performance-aware meter additionally retains analysis mode, declared profile/version, interpretation depth, bounded candidate/alternative limits, visible-elision policy, component weights/scores, syllable-level adjustments, alternates, stanza/poem recurrence, trajectory, organization, and separately preserved scholar revisions. A Stage 7 result retains the linked pronunciation configuration, exact resource hashes, rhyme/sound thresholds and weights, line-ending coverage, stanza/line/pair evidence, sound families, warnings, and immutable result/configuration identities.</w:t>
+        <w:t>Every analysis should retain the active lexicon or optional research resource, source checksum, adapter version, software version, preprocessing recipe and configuration ID, phrase policy, stopword policy, scenario, and inclusion decisions. Completed corpus runs remain linked to preserved text versions. A concreteness result additionally retains its orientation thresholds, proper-name and phrase policies, low-coverage threshold, source-row matches, and exact workbook checksum. A frequency result retains its Zipf-band thresholds, proper-name policy, exact-before-lemma rule, optional content-word scope, low-coverage threshold, source-row matches, and exact SUBTLEX-US workbook checksum. An AoA result retains early/later thresholds, proper-name policy, exact-before-lemma rule, optional contextual content-word scope, coverage and source-response cautions, source-row matches, optional relationship methods, and the exact official erratum-supplement checksum. A pronunciation result retains every dictionary candidate, three exact source checksums, package and adapter versions, exact observed-form policy, thresholds, scholar overrides and notes, configuration identity, missingness, and physical-line completeness. A meter result retains the linked pronunciation configuration, every penalty and threshold, all fixed candidates, candidate-specific stress paths, line coverage, alignment operations, deviations, fit, confidence explanation, and dependency resource hashes. Performance-aware meter additionally retains analysis mode, declared profile/version, interpretation depth, bounded candidate/alternative limits, visible-elision policy, component weights/scores, syllable-level adjustments, alternates, stanza/poem recurrence, trajectory, organization, and separately preserved scholar revisions. A rhyme and recurring-sound result retains the linked pronunciation configuration, exact resource hashes, rhyme/sound thresholds and weights, line-ending coverage, stanza/line/pair evidence, sound families, warnings, and immutable result/configuration identities.</w:t>
       </w:r>
     </w:p>
     <w:p>
@@ -30663,7 +30678,7 @@
           <w:rFonts w:ascii="Calibri" w:hAnsi="Calibri"/>
           <w:sz w:val="22"/>
         </w:rPr>
-        <w:t>A Stage 15 result retains the exact profile registry and version, rule weights and roles, active thresholds, dependent pronunciation/meter/rhyme provenance, candidate ranking, feature-level evidence and coverage, contradictions, alternatives, confidence explanation, sources, limitations, configuration identity, and warnings.</w:t>
+        <w:t>An inherited-form result retains the exact profile registry and version, rule weights and roles, active thresholds, dependent pronunciation/meter/rhyme provenance, candidate ranking, feature-level evidence and coverage, contradictions, alternatives, confidence explanation, sources, limitations, configuration identity, and warnings.</w:t>
       </w:r>
     </w:p>
     <w:p>

</xml_diff>

<commit_message>
Version VV-PRE content-word profile
</commit_message>
<xml_diff>
--- a/docs/VerseVAD_User_Manual.docx
+++ b/docs/VerseVAD_User_Manual.docx
@@ -71,7 +71,7 @@
           <w:color w:val="66727C"/>
           <w:sz w:val="21"/>
         </w:rPr>
-        <w:t xml:space="preserve"> July 30, 2026</w:t>
+        <w:t xml:space="preserve"> July 31, 2026</w:t>
       </w:r>
       <w:r>
         <w:rPr>
@@ -12198,6 +12198,150 @@
           <w:sz w:val="22"/>
         </w:rPr>
         <w:t>The always-available readability subsection reports Flesch Reading Ease, Flesch-Kincaid Grade, Gunning Fog, Automated Readability Index, Coleman-Liau, and SMOG with the exact word, sentence, syllable, character, and pronunciation- coverage denominators. SMOG remains missing below 30 model-segmented sentences. Contractions and hyphenated expressions count as one orthographic word. Out-of-dictionary syllables use a clearly labeled heuristic until the user approves or edits a session pronunciation override. These prose-oriented formulas do not measure literary quality, reader ability, actual comprehension, or a required grade.</w:t>
+      </w:r>
+    </w:p>
+    <w:p>
+      <w:pPr>
+        <w:widowControl/>
+        <w:spacing w:before="0" w:after="120" w:line="300" w:lineRule="auto"/>
+      </w:pPr>
+      <w:r>
+        <w:rPr>
+          <w:rFonts w:ascii="Calibri" w:hAnsi="Calibri"/>
+          <w:sz w:val="22"/>
+        </w:rPr>
+        <w:t xml:space="preserve">The subsection also reports </w:t>
+      </w:r>
+      <w:r>
+        <w:rPr>
+          <w:rFonts w:ascii="Calibri" w:hAnsi="Calibri"/>
+          <w:b/>
+          <w:sz w:val="22"/>
+        </w:rPr>
+        <w:t>VerseVAD Poetic Reading Ease (Experimental)</w:t>
+      </w:r>
+      <w:r>
+        <w:rPr>
+          <w:rFonts w:ascii="Calibri" w:hAnsi="Calibri"/>
+          <w:sz w:val="22"/>
+        </w:rPr>
+        <w:t xml:space="preserve"> (</w:t>
+      </w:r>
+      <w:r>
+        <w:rPr>
+          <w:rFonts w:ascii="Calibri" w:hAnsi="Calibri"/>
+          <w:b/>
+          <w:sz w:val="22"/>
+        </w:rPr>
+        <w:t>VV-PRE</w:t>
+      </w:r>
+      <w:r>
+        <w:rPr>
+          <w:rFonts w:ascii="Calibri" w:hAnsi="Calibri"/>
+          <w:sz w:val="22"/>
+        </w:rPr>
+        <w:t xml:space="preserve">) when Frequency &amp; Rarity, normative AoA, Structural &amp; Lexical Measures, and readability syllable evidence all supply their required values. VV-PRE uses no sentence-length term. Its versioned </w:t>
+      </w:r>
+      <w:r>
+        <w:rPr>
+          <w:rFonts w:ascii="Consolas" w:hAnsi="Consolas"/>
+          <w:color w:val="1F4D78"/>
+          <w:sz w:val="19"/>
+        </w:rPr>
+        <w:t>vv-pre-content-word-profile-1.0</w:t>
+      </w:r>
+      <w:r>
+        <w:rPr>
+          <w:rFonts w:ascii="Calibri" w:hAnsi="Calibri"/>
+          <w:sz w:val="22"/>
+        </w:rPr>
+        <w:t xml:space="preserve"> retains repeated content-word occurrences (</w:t>
+      </w:r>
+      <w:r>
+        <w:rPr>
+          <w:rFonts w:ascii="Consolas" w:hAnsi="Consolas"/>
+          <w:color w:val="1F4D78"/>
+          <w:sz w:val="19"/>
+        </w:rPr>
+        <w:t>NOUN</w:t>
+      </w:r>
+      <w:r>
+        <w:rPr>
+          <w:rFonts w:ascii="Calibri" w:hAnsi="Calibri"/>
+          <w:sz w:val="22"/>
+        </w:rPr>
+        <w:t xml:space="preserve">, </w:t>
+      </w:r>
+      <w:r>
+        <w:rPr>
+          <w:rFonts w:ascii="Consolas" w:hAnsi="Consolas"/>
+          <w:color w:val="1F4D78"/>
+          <w:sz w:val="19"/>
+        </w:rPr>
+        <w:t>VERB</w:t>
+      </w:r>
+      <w:r>
+        <w:rPr>
+          <w:rFonts w:ascii="Calibri" w:hAnsi="Calibri"/>
+          <w:sz w:val="22"/>
+        </w:rPr>
+        <w:t xml:space="preserve">, </w:t>
+      </w:r>
+      <w:r>
+        <w:rPr>
+          <w:rFonts w:ascii="Consolas" w:hAnsi="Consolas"/>
+          <w:color w:val="1F4D78"/>
+          <w:sz w:val="19"/>
+        </w:rPr>
+        <w:t>ADJ</w:t>
+      </w:r>
+      <w:r>
+        <w:rPr>
+          <w:rFonts w:ascii="Calibri" w:hAnsi="Calibri"/>
+          <w:sz w:val="22"/>
+        </w:rPr>
+        <w:t xml:space="preserve">, and </w:t>
+      </w:r>
+      <w:r>
+        <w:rPr>
+          <w:rFonts w:ascii="Consolas" w:hAnsi="Consolas"/>
+          <w:color w:val="1F4D78"/>
+          <w:sz w:val="19"/>
+        </w:rPr>
+        <w:t>ADV</w:t>
+      </w:r>
+      <w:r>
+        <w:rPr>
+          <w:rFonts w:ascii="Calibri" w:hAnsi="Calibri"/>
+          <w:sz w:val="22"/>
+        </w:rPr>
+        <w:t>) for SUBTLEX frequency, normative AoA, and estimated syllables per word. Mean words per nonblank line counts all lexical words. It positively weights four clamped 0-100 ease components: 30% frequency, 25% AoA, 30% line accessibility, and 15% word complexity. This fixed scoring scope is independent of the optional display settings in the Frequency and AoA reports.</w:t>
+      </w:r>
+    </w:p>
+    <w:p>
+      <w:pPr>
+        <w:widowControl/>
+        <w:spacing w:before="0" w:after="120" w:line="300" w:lineRule="auto"/>
+      </w:pPr>
+      <w:r>
+        <w:rPr>
+          <w:rFonts w:ascii="Calibri" w:hAnsi="Calibri"/>
+          <w:sz w:val="22"/>
+        </w:rPr>
+        <w:t>The profile ID, raw values, component scopes, component scores, anchors, weights, source-result identities, eligible counts, match counts, and coverage remain visible and exportable. Missing inputs are not reweighted; the final score stays unavailable. Bands are 85-100 Highly Accessible, 70-84 Accessible, 55-69 Moderately Demanding, 40-54 Demanding, and 0-39 Highly Demanding. VV-PRE estimates surface-level lexical processing and presentation, not thematic, symbolic, interpretive, or literary complexity.</w:t>
+      </w:r>
+    </w:p>
+    <w:p>
+      <w:pPr>
+        <w:widowControl/>
+        <w:spacing w:before="0" w:after="120" w:line="300" w:lineRule="auto"/>
+      </w:pPr>
+      <w:r>
+        <w:rPr>
+          <w:rFonts w:ascii="Calibri" w:hAnsi="Calibri"/>
+          <w:sz w:val="22"/>
+        </w:rPr>
+        <w:t>The interface and exports report Evidence Confidence separately from the score. High requires at least 90% coverage for all components and 20 matched Frequency and AoA token occurrences. Moderate requires 75% coverage and 10 matches. Otherwise the designation is Limited. It qualifies evidence sufficiency without penalizing or inflating the score and is not a statistical confidence interval.</w:t>
       </w:r>
     </w:p>
     <w:p>

</xml_diff>

<commit_message>
Refine comparison and corpus reports
</commit_message>
<xml_diff>
--- a/docs/VerseVAD_User_Manual.docx
+++ b/docs/VerseVAD_User_Manual.docx
@@ -71,7 +71,7 @@
           <w:color w:val="66727C"/>
           <w:sz w:val="21"/>
         </w:rPr>
-        <w:t xml:space="preserve"> July 31, 2026</w:t>
+        <w:t xml:space="preserve"> August 1, 2026</w:t>
       </w:r>
       <w:r>
         <w:rPr>
@@ -2870,6 +2870,110 @@
           <w:sz w:val="22"/>
         </w:rPr>
         <w:t>The selected theme persists across closing and reopening VerseVAD. Legacy Light and System choices migrate safely to Classic. The selection is stored as an application-level local preference, not in a project or analysis configuration. Appearance does not change calculations, result IDs, project data, or exports. Publication-oriented charts remain light.</w:t>
+      </w:r>
+    </w:p>
+    <w:p>
+      <w:pPr>
+        <w:pStyle w:val="Heading3"/>
+      </w:pPr>
+      <w:r>
+        <w:rPr>
+          <w:rFonts w:ascii="Calibri" w:hAnsi="Calibri"/>
+          <w:sz w:val="22"/>
+        </w:rPr>
+        <w:t>Compare Poems</w:t>
+      </w:r>
+    </w:p>
+    <w:p>
+      <w:pPr>
+        <w:widowControl/>
+        <w:spacing w:before="0" w:after="120" w:line="300" w:lineRule="auto"/>
+      </w:pPr>
+      <w:r>
+        <w:rPr>
+          <w:rFonts w:ascii="Calibri" w:hAnsi="Calibri"/>
+          <w:sz w:val="22"/>
+        </w:rPr>
+        <w:t xml:space="preserve">Compare Poems accepts two through ten poems and applies one shared analysis profile to every work. The default-collapsed </w:t>
+      </w:r>
+      <w:r>
+        <w:rPr>
+          <w:rFonts w:ascii="Calibri" w:hAnsi="Calibri"/>
+          <w:b/>
+          <w:sz w:val="22"/>
+        </w:rPr>
+        <w:t>Shared Configuration and Methodology</w:t>
+      </w:r>
+      <w:r>
+        <w:rPr>
+          <w:rFonts w:ascii="Calibri" w:hAnsi="Calibri"/>
+          <w:sz w:val="22"/>
+        </w:rPr>
+        <w:t xml:space="preserve"> section exposes the same major phrase, evidence, lexical, PoetryID, pronunciation, meter, and phonological choices used by Single Poem. Each analytical report then presents one real metric at a time in a fitted side-by-side point chart. Tables are separated into reader-facing metric families rather than combining VAD means, cumulative loads, dispersion, and unrelated scales.</w:t>
+      </w:r>
+    </w:p>
+    <w:p>
+      <w:pPr>
+        <w:widowControl/>
+        <w:spacing w:before="0" w:after="120" w:line="300" w:lineRule="auto"/>
+      </w:pPr>
+      <w:r>
+        <w:rPr>
+          <w:rFonts w:ascii="Calibri" w:hAnsi="Calibri"/>
+          <w:b/>
+          <w:sz w:val="22"/>
+        </w:rPr>
+        <w:t>Range (Max − Min)</w:t>
+      </w:r>
+      <w:r>
+        <w:rPr>
+          <w:rFonts w:ascii="Calibri" w:hAnsi="Calibri"/>
+          <w:sz w:val="22"/>
+        </w:rPr>
+        <w:t xml:space="preserve"> is the maximum available poem value minus the minimum; it is a descriptive span rather than a significance test. Standard-deviation rows in </w:t>
+      </w:r>
+      <w:r>
+        <w:rPr>
+          <w:rFonts w:ascii="Calibri" w:hAnsi="Calibri"/>
+          <w:b/>
+          <w:sz w:val="22"/>
+        </w:rPr>
+        <w:t>Within-Poem Dispersion</w:t>
+      </w:r>
+      <w:r>
+        <w:rPr>
+          <w:rFonts w:ascii="Calibri" w:hAnsi="Calibri"/>
+          <w:sz w:val="22"/>
+        </w:rPr>
+        <w:t xml:space="preserve"> describe variation among matched observations inside each poem. The concise report does not add a second cross-poem SD column. Complete values, denominators, coverage, legacy audit summaries, and precision remain available in the comparison-set exports.</w:t>
+      </w:r>
+    </w:p>
+    <w:p>
+      <w:pPr>
+        <w:widowControl/>
+        <w:spacing w:before="0" w:after="120" w:line="300" w:lineRule="auto"/>
+      </w:pPr>
+      <w:r>
+        <w:rPr>
+          <w:rFonts w:ascii="Calibri" w:hAnsi="Calibri"/>
+          <w:sz w:val="22"/>
+        </w:rPr>
+        <w:t xml:space="preserve">Saved Projects and Personal Corpus use the same progressive-disclosure rule: choose </w:t>
+      </w:r>
+      <w:r>
+        <w:rPr>
+          <w:rFonts w:ascii="Calibri" w:hAnsi="Calibri"/>
+          <w:b/>
+          <w:sz w:val="22"/>
+        </w:rPr>
+        <w:t>Whole Corpus</w:t>
+      </w:r>
+      <w:r>
+        <w:rPr>
+          <w:rFonts w:ascii="Calibri" w:hAnsi="Calibri"/>
+          <w:sz w:val="22"/>
+        </w:rPr>
+        <w:t xml:space="preserve"> or one poem, choose a report and module, then choose one metric family. Full work-, line-, stanza-, token-, configuration-, and warning records remain in the corpus exports.</w:t>
       </w:r>
     </w:p>
     <w:p>

</xml_diff>

<commit_message>
Refine multi-poem comparison dashboard
</commit_message>
<xml_diff>
--- a/docs/VerseVAD_User_Manual.docx
+++ b/docs/VerseVAD_User_Manual.docx
@@ -2920,9 +2920,65 @@
       <w:r>
         <w:rPr>
           <w:rFonts w:ascii="Calibri" w:hAnsi="Calibri"/>
+          <w:sz w:val="22"/>
+        </w:rPr>
+        <w:t xml:space="preserve">Within each analytical panel, headline means or composite scores appear first, cumulative lexical loads next, and within-poem dispersion last. The PoetryID dashboard shows only </w:t>
+      </w:r>
+      <w:r>
+        <w:rPr>
+          <w:rFonts w:ascii="Calibri" w:hAnsi="Calibri"/>
           <w:b/>
           <w:sz w:val="22"/>
         </w:rPr>
+        <w:t>Category Fit Archetype</w:t>
+      </w:r>
+      <w:r>
+        <w:rPr>
+          <w:rFonts w:ascii="Calibri" w:hAnsi="Calibri"/>
+          <w:sz w:val="22"/>
+        </w:rPr>
+        <w:t xml:space="preserve"> and </w:t>
+      </w:r>
+      <w:r>
+        <w:rPr>
+          <w:rFonts w:ascii="Calibri" w:hAnsi="Calibri"/>
+          <w:b/>
+          <w:sz w:val="22"/>
+        </w:rPr>
+        <w:t>Nearest Centroid Archetype</w:t>
+      </w:r>
+      <w:r>
+        <w:rPr>
+          <w:rFonts w:ascii="Calibri" w:hAnsi="Calibri"/>
+          <w:sz w:val="22"/>
+        </w:rPr>
+        <w:t xml:space="preserve"> for the active shared scope, weighting, and identified VAD source; the full alternate-source evidence remains in the statistical export. The affective report also includes NRC emotion and positive/negative associations, emotion-intensity means and dispersion, and VADER when their sources are enabled.</w:t>
+      </w:r>
+    </w:p>
+    <w:p>
+      <w:pPr>
+        <w:widowControl/>
+        <w:spacing w:before="0" w:after="120" w:line="300" w:lineRule="auto"/>
+      </w:pPr>
+      <w:r>
+        <w:rPr>
+          <w:rFonts w:ascii="Calibri" w:hAnsi="Calibri"/>
+          <w:sz w:val="22"/>
+        </w:rPr>
+        <w:t>Sound-enabled comparisons include a pronunciation-review table and a shared ARPAbet override editor. One shared override applies to the same spelling in every compared poem; use Single Poem when the same word requires different poem-specific readings. VerseMap can use the built-in index or an indexed local user corpus. Its visual dashboard is limited to the joint PCA plot, PCA Components 1 and 2, nearest reference poem, and nearest poet centroid; complete profile dimensions and provenance remain in export.</w:t>
+      </w:r>
+    </w:p>
+    <w:p>
+      <w:pPr>
+        <w:widowControl/>
+        <w:spacing w:before="0" w:after="120" w:line="300" w:lineRule="auto"/>
+      </w:pPr>
+      <w:r>
+        <w:rPr>
+          <w:rFonts w:ascii="Calibri" w:hAnsi="Calibri"/>
+          <w:b/>
+          <w:sz w:val="22"/>
+        </w:rPr>
         <w:t>Range (Max − Min)</w:t>
       </w:r>
       <w:r>
@@ -2946,6 +3002,27 @@
           <w:sz w:val="22"/>
         </w:rPr>
         <w:t xml:space="preserve"> describe variation among matched observations inside each poem. The concise report does not add a second cross-poem SD column. Complete values, denominators, coverage, legacy audit summaries, and precision remain available in the comparison-set exports.</w:t>
+      </w:r>
+    </w:p>
+    <w:p>
+      <w:pPr>
+        <w:widowControl/>
+        <w:spacing w:before="0" w:after="120" w:line="300" w:lineRule="auto"/>
+      </w:pPr>
+      <w:r>
+        <w:rPr>
+          <w:rFonts w:ascii="Calibri" w:hAnsi="Calibri"/>
+          <w:b/>
+          <w:sz w:val="22"/>
+        </w:rPr>
+        <w:t>Evidence &amp; Diagnostics</w:t>
+      </w:r>
+      <w:r>
+        <w:rPr>
+          <w:rFonts w:ascii="Calibri" w:hAnsi="Calibri"/>
+          <w:sz w:val="22"/>
+        </w:rPr>
+        <w:t xml:space="preserve"> is the audit layer for these displayed results. It uses each metric label to expose coverage, denominator, and methodological cautions rather than presenting a second copy of the score dashboard.</w:t>
       </w:r>
     </w:p>
     <w:p>

</xml_diff>

<commit_message>
Align analysis defaults and polish report controls
</commit_message>
<xml_diff>
--- a/docs/VerseVAD_User_Manual.docx
+++ b/docs/VerseVAD_User_Manual.docx
@@ -5961,7 +5961,7 @@
           <w:rFonts w:ascii="Calibri" w:hAnsi="Calibri"/>
           <w:sz w:val="22"/>
         </w:rPr>
-        <w:t>The optional concreteness module has its own recorded sequence over the same tokens: longest exact source-supplied two-word expression within one physical line, exact normalized surface, lemma, then a documented conservative apostrophe or possessive fallback. Model-tagged proper nouns are excluded by default. Unmatched and ineligible tokens retain missing ratings.</w:t>
+        <w:t>The optional concreteness module has its own recorded sequence over the same tokens: longest exact source-supplied two-word expression within one physical line, exact normalized surface, lemma, then a documented conservative apostrophe or possessive fallback. Model-tagged proper nouns are included by default and can be excluded through an explicit recorded setting. Unmatched and ineligible tokens retain missing ratings.</w:t>
       </w:r>
     </w:p>
     <w:p>
@@ -5974,7 +5974,7 @@
           <w:rFonts w:ascii="Calibri" w:hAnsi="Calibri"/>
           <w:sz w:val="22"/>
         </w:rPr>
-        <w:t>The optional frequency module likewise uses exact normalized observed word form before an enabled lemma fallback, followed only by documented conservative apostrophe or possessive fallbacks. This order preserves SUBTLEX-US word-form evidence. Model-tagged proper nouns are excluded by default, and unmatched or ineligible tokens retain missing Zipf values.</w:t>
+        <w:t>The optional frequency module likewise uses exact normalized observed word form before an enabled lemma fallback, followed only by documented conservative apostrophe or possessive fallbacks. This order preserves SUBTLEX-US word-form evidence. Model-tagged proper nouns are included by default and can be explicitly excluded; unmatched or ineligible tokens retain missing Zipf values.</w:t>
       </w:r>
     </w:p>
     <w:p>
@@ -6017,7 +6017,7 @@
           <w:rFonts w:ascii="Calibri" w:hAnsi="Calibri"/>
           <w:sz w:val="22"/>
         </w:rPr>
-        <w:t xml:space="preserve"> but does not enter numeric summaries. Model-tagged proper nouns are excluded by default. Unmatched, ineligible, and source-unrated tokens retain missing ages rather than zero.</w:t>
+        <w:t xml:space="preserve"> but does not enter numeric summaries. Model-tagged proper nouns are included by default and can be explicitly excluded. Unmatched, ineligible, and source-unrated tokens retain missing ages rather than zero.</w:t>
       </w:r>
     </w:p>
     <w:p>
@@ -8082,7 +8082,7 @@
           <w:rFonts w:ascii="Calibri" w:hAnsi="Calibri"/>
           <w:sz w:val="22"/>
         </w:rPr>
-        <w:t xml:space="preserve">The default scope considers all lexical tokens except model-tagged proper nouns. </w:t>
+        <w:t xml:space="preserve">The default scope includes model-tagged proper nouns with other lexical tokens; a separate recorded option can exclude them. </w:t>
       </w:r>
       <w:r>
         <w:rPr>
@@ -8247,7 +8247,7 @@
           <w:rFonts w:ascii="Calibri" w:hAnsi="Calibri"/>
           <w:sz w:val="22"/>
         </w:rPr>
-        <w:t xml:space="preserve">), punctuation, and all other tags. This differs from the broad Language Profile, which groups </w:t>
+        <w:t xml:space="preserve">), </w:t>
       </w:r>
       <w:r>
         <w:rPr>
@@ -8255,14 +8255,14 @@
           <w:color w:val="1F4D78"/>
           <w:sz w:val="19"/>
         </w:rPr>
-        <w:t>VERB</w:t>
-      </w:r>
-      <w:r>
-        <w:rPr>
-          <w:rFonts w:ascii="Calibri" w:hAnsi="Calibri"/>
-          <w:sz w:val="22"/>
-        </w:rPr>
-        <w:t xml:space="preserve"> and </w:t>
+        <w:t>PROPN</w:t>
+      </w:r>
+      <w:r>
+        <w:rPr>
+          <w:rFonts w:ascii="Calibri" w:hAnsi="Calibri"/>
+          <w:sz w:val="22"/>
+        </w:rPr>
+        <w:t xml:space="preserve">, punctuation, and all other tags. This differs from the broad Language Profile, which groups </w:t>
       </w:r>
       <w:r>
         <w:rPr>
@@ -8270,6 +8270,21 @@
           <w:color w:val="1F4D78"/>
           <w:sz w:val="19"/>
         </w:rPr>
+        <w:t>VERB</w:t>
+      </w:r>
+      <w:r>
+        <w:rPr>
+          <w:rFonts w:ascii="Calibri" w:hAnsi="Calibri"/>
+          <w:sz w:val="22"/>
+        </w:rPr>
+        <w:t xml:space="preserve"> and </w:t>
+      </w:r>
+      <w:r>
+        <w:rPr>
+          <w:rFonts w:ascii="Consolas" w:hAnsi="Consolas"/>
+          <w:color w:val="1F4D78"/>
+          <w:sz w:val="19"/>
+        </w:rPr>
         <w:t>AUX</w:t>
       </w:r>
       <w:r>
@@ -8371,7 +8386,7 @@
           <w:rFonts w:ascii="Calibri" w:hAnsi="Calibri"/>
           <w:sz w:val="22"/>
         </w:rPr>
-        <w:t xml:space="preserve">The default scope considers all lexical tokens except model-tagged proper nouns. </w:t>
+        <w:t xml:space="preserve">The default scope includes model-tagged proper nouns with other lexical tokens; a separate recorded option can exclude them. </w:t>
       </w:r>
       <w:r>
         <w:rPr>
@@ -9387,6 +9402,21 @@
           <w:b/>
           <w:sz w:val="22"/>
         </w:rPr>
+        <w:t>Compare candidate and performance-aware readings</w:t>
+      </w:r>
+      <w:r>
+        <w:rPr>
+          <w:rFonts w:ascii="Calibri" w:hAnsi="Calibri"/>
+          <w:sz w:val="22"/>
+        </w:rPr>
+        <w:t xml:space="preserve"> is the built-in-profile default. It preserves the validated fixed-candidate result exactly while also displaying the independent performance-aware realization. </w:t>
+      </w:r>
+      <w:r>
+        <w:rPr>
+          <w:rFonts w:ascii="Calibri" w:hAnsi="Calibri"/>
+          <w:b/>
+          <w:sz w:val="22"/>
+        </w:rPr>
         <w:t>Candidate meter only</w:t>
       </w:r>
       <w:r>
@@ -9394,7 +9424,22 @@
           <w:rFonts w:ascii="Calibri" w:hAnsi="Calibri"/>
           <w:sz w:val="22"/>
         </w:rPr>
-        <w:t xml:space="preserve"> is the validated default and preserves the fixed-candidate result exactly. Two non-default choices add an independent performance-aware realization or display candidate and performance-aware readings together. The second layer does not rewrite the dictionary lexical stress or replace the fixed candidate audit.</w:t>
+        <w:t xml:space="preserve"> and </w:t>
+      </w:r>
+      <w:r>
+        <w:rPr>
+          <w:rFonts w:ascii="Calibri" w:hAnsi="Calibri"/>
+          <w:b/>
+          <w:sz w:val="22"/>
+        </w:rPr>
+        <w:t>Performance-aware realization</w:t>
+      </w:r>
+      <w:r>
+        <w:rPr>
+          <w:rFonts w:ascii="Calibri" w:hAnsi="Calibri"/>
+          <w:sz w:val="22"/>
+        </w:rPr>
+        <w:t xml:space="preserve"> remain explicit alternatives. The second layer does not rewrite the dictionary lexical stress or replace the fixed candidate audit.</w:t>
       </w:r>
     </w:p>
     <w:p>
@@ -9704,7 +9749,52 @@
           <w:rFonts w:ascii="Calibri" w:hAnsi="Calibri"/>
           <w:sz w:val="22"/>
         </w:rPr>
-        <w:t>The scholar explicitly selects one broad versioned profile: General English Verse, Traditional Accentual-Syllabic Verse, Romantic / Victorian Verse, Modernist Verse, Contemporary Formal Verse, Free Verse / Cadential, or Custom visible weights. VerseVAD never infers a period, movement, tradition, author, or performance from the text. Summary, Standard, and Detailed control presentation depth rather than analytical truth.</w:t>
+        <w:t xml:space="preserve">Built-in analysis profiles select </w:t>
+      </w:r>
+      <w:r>
+        <w:rPr>
+          <w:rFonts w:ascii="Calibri" w:hAnsi="Calibri"/>
+          <w:b/>
+          <w:sz w:val="22"/>
+        </w:rPr>
+        <w:t>Compare candidate and performance-aware readings</w:t>
+      </w:r>
+      <w:r>
+        <w:rPr>
+          <w:rFonts w:ascii="Calibri" w:hAnsi="Calibri"/>
+          <w:sz w:val="22"/>
+        </w:rPr>
+        <w:t xml:space="preserve">. The scholar may restore </w:t>
+      </w:r>
+      <w:r>
+        <w:rPr>
+          <w:rFonts w:ascii="Calibri" w:hAnsi="Calibri"/>
+          <w:b/>
+          <w:sz w:val="22"/>
+        </w:rPr>
+        <w:t>Candidate meter only</w:t>
+      </w:r>
+      <w:r>
+        <w:rPr>
+          <w:rFonts w:ascii="Calibri" w:hAnsi="Calibri"/>
+          <w:sz w:val="22"/>
+        </w:rPr>
+        <w:t xml:space="preserve"> or </w:t>
+      </w:r>
+      <w:r>
+        <w:rPr>
+          <w:rFonts w:ascii="Calibri" w:hAnsi="Calibri"/>
+          <w:b/>
+          <w:sz w:val="22"/>
+        </w:rPr>
+        <w:t>Performance-aware realization</w:t>
+      </w:r>
+      <w:r>
+        <w:rPr>
+          <w:rFonts w:ascii="Calibri" w:hAnsi="Calibri"/>
+          <w:sz w:val="22"/>
+        </w:rPr>
+        <w:t>, then explicitly selects one broad versioned profile: General English Verse, Traditional Accentual-Syllabic Verse, Romantic / Victorian Verse, Modernist Verse, Contemporary Formal Verse, Free Verse / Cadential, or Custom visible weights. VerseVAD never infers a period, movement, tradition, author, or performance from the text. Summary, Standard, and Detailed control presentation depth rather than analytical truth.</w:t>
       </w:r>
     </w:p>
     <w:p>
@@ -10528,20 +10618,7 @@
           <w:rFonts w:ascii="Calibri" w:hAnsi="Calibri"/>
           <w:sz w:val="22"/>
         </w:rPr>
-        <w:t>average words per nonblank physical line, average words per stanza, and</w:t>
-      </w:r>
-    </w:p>
-    <w:p>
-      <w:pPr>
-        <w:widowControl/>
-        <w:spacing w:before="0" w:after="120" w:line="300" w:lineRule="auto"/>
-      </w:pPr>
-      <w:r>
-        <w:rPr>
-          <w:rFonts w:ascii="Calibri" w:hAnsi="Calibri"/>
-          <w:sz w:val="22"/>
-        </w:rPr>
-        <w:t xml:space="preserve">  average nonblank physical lines per stanza, each with its population   standard deviation;</w:t>
+        <w:t>the total number of nonblank physical lines;</w:t>
       </w:r>
     </w:p>
     <w:p>
@@ -10559,7 +10636,7 @@
           <w:rFonts w:ascii="Calibri" w:hAnsi="Calibri"/>
           <w:sz w:val="22"/>
         </w:rPr>
-        <w:t>one lexical-token count row for every preserved physical line, including</w:t>
+        <w:t>average words per nonblank physical line, average words per stanza, and</w:t>
       </w:r>
     </w:p>
     <w:p>
@@ -10572,7 +10649,7 @@
           <w:rFonts w:ascii="Calibri" w:hAnsi="Calibri"/>
           <w:sz w:val="22"/>
         </w:rPr>
-        <w:t xml:space="preserve">  blank separators with zero; and</w:t>
+        <w:t xml:space="preserve">  average nonblank physical lines per stanza, each with its population   standard deviation;</w:t>
       </w:r>
     </w:p>
     <w:p>
@@ -10590,7 +10667,7 @@
           <w:rFonts w:ascii="Calibri" w:hAnsi="Calibri"/>
           <w:sz w:val="22"/>
         </w:rPr>
-        <w:t>lexical-token and nonblank-line counts for every stanza.</w:t>
+        <w:t>one lexical-token count row for every preserved physical line, including</w:t>
       </w:r>
     </w:p>
     <w:p>
@@ -10603,108 +10680,7 @@
           <w:rFonts w:ascii="Calibri" w:hAnsi="Calibri"/>
           <w:sz w:val="22"/>
         </w:rPr>
-        <w:t>Defaults are MATTR window 50, HD-D sample 42, and MTLD threshold 0.72. MATTR and HD-D remain missing when the text is shorter than their configured denominator. Undefined MTLD remains missing rather than becoming infinity or zero.</w:t>
-      </w:r>
-    </w:p>
-    <w:p>
-      <w:pPr>
-        <w:widowControl/>
-        <w:spacing w:before="0" w:after="120" w:line="300" w:lineRule="auto"/>
-      </w:pPr>
-      <w:r>
-        <w:rPr>
-          <w:rFonts w:ascii="Calibri" w:hAnsi="Calibri"/>
-          <w:sz w:val="22"/>
-        </w:rPr>
-        <w:t>Safe wording is: “Using a 50-token MATTR window, the normalized observed surface forms produced MATTR = [value].” Do not treat lexical diversity or word length as proof of literary quality, vocabulary knowledge, intelligence, education, comprehension, or reader ability.</w:t>
-      </w:r>
-    </w:p>
-    <w:p>
-      <w:pPr>
-        <w:pStyle w:val="Heading2"/>
-      </w:pPr>
-      <w:r>
-        <w:rPr>
-          <w:rFonts w:ascii="Calibri" w:hAnsi="Calibri"/>
-          <w:sz w:val="22"/>
-        </w:rPr>
-        <w:t>Eight emotion associations</w:t>
-      </w:r>
-    </w:p>
-    <w:p>
-      <w:pPr>
-        <w:widowControl/>
-        <w:spacing w:before="0" w:after="120" w:line="300" w:lineRule="auto"/>
-      </w:pPr>
-      <w:r>
-        <w:rPr>
-          <w:rFonts w:ascii="Calibri" w:hAnsi="Calibri"/>
-          <w:sz w:val="22"/>
-        </w:rPr>
-        <w:t>NRC Emotion values are binary, multi-label associations. VerseVAD reports the eight emotions—anger, anticipation, disgust, fear, joy, sadness, surprise, and trust—in their own section. An entry can be associated with several categories, so percentages do not need to total 100 percent. Read the labeled denominator.</w:t>
-      </w:r>
-    </w:p>
-    <w:p>
-      <w:pPr>
-        <w:widowControl/>
-        <w:spacing w:before="0" w:after="120" w:line="300" w:lineRule="auto"/>
-      </w:pPr>
-      <w:r>
-        <w:rPr>
-          <w:rFonts w:ascii="Calibri" w:hAnsi="Calibri"/>
-          <w:sz w:val="22"/>
-        </w:rPr>
-        <w:t>“Fear-associated vocabulary” is appropriate wording. “The poem is afraid” is not.</w:t>
-      </w:r>
-    </w:p>
-    <w:p>
-      <w:pPr>
-        <w:pStyle w:val="Heading2"/>
-      </w:pPr>
-      <w:r>
-        <w:rPr>
-          <w:rFonts w:ascii="Calibri" w:hAnsi="Calibri"/>
-          <w:sz w:val="22"/>
-        </w:rPr>
-        <w:t>Positive and negative sentiment associations</w:t>
-      </w:r>
-    </w:p>
-    <w:p>
-      <w:pPr>
-        <w:widowControl/>
-        <w:spacing w:before="0" w:after="120" w:line="300" w:lineRule="auto"/>
-      </w:pPr>
-      <w:r>
-        <w:rPr>
-          <w:rFonts w:ascii="Calibri" w:hAnsi="Calibri"/>
-          <w:sz w:val="22"/>
-        </w:rPr>
-        <w:t>Positive and negative are broad sentiment labels in NRC Emotion. VerseVAD analyzes them with the same documented occurrence-counting logic but reports them separately from the eight emotions. They are not endpoints of the VAD valence scale, and their rates need not sum to 100 percent.</w:t>
-      </w:r>
-    </w:p>
-    <w:p>
-      <w:pPr>
-        <w:pStyle w:val="Heading2"/>
-      </w:pPr>
-      <w:r>
-        <w:rPr>
-          <w:rFonts w:ascii="Calibri" w:hAnsi="Calibri"/>
-          <w:sz w:val="22"/>
-        </w:rPr>
-        <w:t>Emotion intensity</w:t>
-      </w:r>
-    </w:p>
-    <w:p>
-      <w:pPr>
-        <w:widowControl/>
-        <w:spacing w:before="0" w:after="120" w:line="300" w:lineRule="auto"/>
-      </w:pPr>
-      <w:r>
-        <w:rPr>
-          <w:rFonts w:ascii="Calibri" w:hAnsi="Calibri"/>
-          <w:sz w:val="22"/>
-        </w:rPr>
-        <w:t>NRC Emotion Intensity supplies numeric values only for particular word-emotion pairs. VerseVAD keeps:</w:t>
+        <w:t xml:space="preserve">  blank separators with zero; and</w:t>
       </w:r>
     </w:p>
     <w:p>
@@ -10722,7 +10698,121 @@
           <w:rFonts w:ascii="Calibri" w:hAnsi="Calibri"/>
           <w:sz w:val="22"/>
         </w:rPr>
-        <w:t>prevalence of matched pairs;</w:t>
+        <w:t>lexical-token and nonblank-line counts for every stanza.</w:t>
+      </w:r>
+    </w:p>
+    <w:p>
+      <w:pPr>
+        <w:widowControl/>
+        <w:spacing w:before="0" w:after="120" w:line="300" w:lineRule="auto"/>
+      </w:pPr>
+      <w:r>
+        <w:rPr>
+          <w:rFonts w:ascii="Calibri" w:hAnsi="Calibri"/>
+          <w:sz w:val="22"/>
+        </w:rPr>
+        <w:t>Defaults are MATTR window 50, HD-D sample 42, and MTLD threshold 0.72. MATTR and HD-D remain missing when the text is shorter than their configured denominator. Undefined MTLD remains missing rather than becoming infinity or zero.</w:t>
+      </w:r>
+    </w:p>
+    <w:p>
+      <w:pPr>
+        <w:widowControl/>
+        <w:spacing w:before="0" w:after="120" w:line="300" w:lineRule="auto"/>
+      </w:pPr>
+      <w:r>
+        <w:rPr>
+          <w:rFonts w:ascii="Calibri" w:hAnsi="Calibri"/>
+          <w:sz w:val="22"/>
+        </w:rPr>
+        <w:t>Safe wording is: “Using a 50-token MATTR window, the normalized observed surface forms produced MATTR = [value].” Do not treat lexical diversity or word length as proof of literary quality, vocabulary knowledge, intelligence, education, comprehension, or reader ability.</w:t>
+      </w:r>
+    </w:p>
+    <w:p>
+      <w:pPr>
+        <w:pStyle w:val="Heading2"/>
+      </w:pPr>
+      <w:r>
+        <w:rPr>
+          <w:rFonts w:ascii="Calibri" w:hAnsi="Calibri"/>
+          <w:sz w:val="22"/>
+        </w:rPr>
+        <w:t>Eight emotion associations</w:t>
+      </w:r>
+    </w:p>
+    <w:p>
+      <w:pPr>
+        <w:widowControl/>
+        <w:spacing w:before="0" w:after="120" w:line="300" w:lineRule="auto"/>
+      </w:pPr>
+      <w:r>
+        <w:rPr>
+          <w:rFonts w:ascii="Calibri" w:hAnsi="Calibri"/>
+          <w:sz w:val="22"/>
+        </w:rPr>
+        <w:t>NRC Emotion values are binary, multi-label associations. VerseVAD reports the eight emotions—anger, anticipation, disgust, fear, joy, sadness, surprise, and trust—in their own section. An entry can be associated with several categories, so percentages do not need to total 100 percent. Read the labeled denominator.</w:t>
+      </w:r>
+    </w:p>
+    <w:p>
+      <w:pPr>
+        <w:widowControl/>
+        <w:spacing w:before="0" w:after="120" w:line="300" w:lineRule="auto"/>
+      </w:pPr>
+      <w:r>
+        <w:rPr>
+          <w:rFonts w:ascii="Calibri" w:hAnsi="Calibri"/>
+          <w:sz w:val="22"/>
+        </w:rPr>
+        <w:t>“Fear-associated vocabulary” is appropriate wording. “The poem is afraid” is not.</w:t>
+      </w:r>
+    </w:p>
+    <w:p>
+      <w:pPr>
+        <w:pStyle w:val="Heading2"/>
+      </w:pPr>
+      <w:r>
+        <w:rPr>
+          <w:rFonts w:ascii="Calibri" w:hAnsi="Calibri"/>
+          <w:sz w:val="22"/>
+        </w:rPr>
+        <w:t>Positive and negative sentiment associations</w:t>
+      </w:r>
+    </w:p>
+    <w:p>
+      <w:pPr>
+        <w:widowControl/>
+        <w:spacing w:before="0" w:after="120" w:line="300" w:lineRule="auto"/>
+      </w:pPr>
+      <w:r>
+        <w:rPr>
+          <w:rFonts w:ascii="Calibri" w:hAnsi="Calibri"/>
+          <w:sz w:val="22"/>
+        </w:rPr>
+        <w:t>Positive and negative are broad sentiment labels in NRC Emotion. VerseVAD analyzes them with the same documented occurrence-counting logic but reports them separately from the eight emotions. They are not endpoints of the VAD valence scale, and their rates need not sum to 100 percent.</w:t>
+      </w:r>
+    </w:p>
+    <w:p>
+      <w:pPr>
+        <w:pStyle w:val="Heading2"/>
+      </w:pPr>
+      <w:r>
+        <w:rPr>
+          <w:rFonts w:ascii="Calibri" w:hAnsi="Calibri"/>
+          <w:sz w:val="22"/>
+        </w:rPr>
+        <w:t>Emotion intensity</w:t>
+      </w:r>
+    </w:p>
+    <w:p>
+      <w:pPr>
+        <w:widowControl/>
+        <w:spacing w:before="0" w:after="120" w:line="300" w:lineRule="auto"/>
+      </w:pPr>
+      <w:r>
+        <w:rPr>
+          <w:rFonts w:ascii="Calibri" w:hAnsi="Calibri"/>
+          <w:sz w:val="22"/>
+        </w:rPr>
+        <w:t>NRC Emotion Intensity supplies numeric values only for particular word-emotion pairs. VerseVAD keeps:</w:t>
       </w:r>
     </w:p>
     <w:p>
@@ -10740,7 +10830,7 @@
           <w:rFonts w:ascii="Calibri" w:hAnsi="Calibri"/>
           <w:sz w:val="22"/>
         </w:rPr>
-        <w:t>token-weighted mean intensity among supplied pairs;</w:t>
+        <w:t>prevalence of matched pairs;</w:t>
       </w:r>
     </w:p>
     <w:p>
@@ -10758,395 +10848,7 @@
           <w:rFonts w:ascii="Calibri" w:hAnsi="Calibri"/>
           <w:sz w:val="22"/>
         </w:rPr>
-        <w:t>type-weighted mean intensity among supplied pairs.</w:t>
-      </w:r>
-    </w:p>
-    <w:p>
-      <w:pPr>
-        <w:widowControl/>
-        <w:spacing w:before="0" w:after="120" w:line="300" w:lineRule="auto"/>
-      </w:pPr>
-      <w:r>
-        <w:rPr>
-          <w:rFonts w:ascii="Calibri" w:hAnsi="Calibri"/>
-          <w:sz w:val="22"/>
-        </w:rPr>
-        <w:t>An absent word-emotion pair is missing, not an intensity of zero.</w:t>
-      </w:r>
-    </w:p>
-    <w:p>
-      <w:pPr>
-        <w:pStyle w:val="Heading1"/>
-      </w:pPr>
-      <w:r>
-        <w:rPr>
-          <w:rFonts w:ascii="Calibri" w:hAnsi="Calibri"/>
-          <w:sz w:val="22"/>
-        </w:rPr>
-        <w:t>8. Single Poem and Other Text Workspaces</w:t>
-      </w:r>
-    </w:p>
-    <w:p>
-      <w:pPr>
-        <w:pStyle w:val="Heading2"/>
-      </w:pPr>
-      <w:r>
-        <w:rPr>
-          <w:rFonts w:ascii="Calibri" w:hAnsi="Calibri"/>
-          <w:sz w:val="22"/>
-        </w:rPr>
-        <w:t>Add a poem</w:t>
-      </w:r>
-    </w:p>
-    <w:p>
-      <w:pPr>
-        <w:widowControl/>
-        <w:spacing w:before="0" w:after="120" w:line="300" w:lineRule="auto"/>
-      </w:pPr>
-      <w:r>
-        <w:rPr>
-          <w:rFonts w:ascii="Calibri" w:hAnsi="Calibri"/>
-          <w:sz w:val="22"/>
-        </w:rPr>
-        <w:t xml:space="preserve">Paste text or upload one UTF-8 </w:t>
-      </w:r>
-      <w:r>
-        <w:rPr>
-          <w:rFonts w:ascii="Consolas" w:hAnsi="Consolas"/>
-          <w:color w:val="1F4D78"/>
-          <w:sz w:val="19"/>
-        </w:rPr>
-        <w:t>.txt</w:t>
-      </w:r>
-      <w:r>
-        <w:rPr>
-          <w:rFonts w:ascii="Calibri" w:hAnsi="Calibri"/>
-          <w:sz w:val="22"/>
-        </w:rPr>
-        <w:t xml:space="preserve"> file up to 5 MB. Enter a title or working label. Optional author, date/year, and source/edition notes are available under bibliographic metadata. The live word, physical-line, and text-block counts are orientation only; the actual analysis uses the shared linguistic tokenizer. </w:t>
-      </w:r>
-      <w:r>
-        <w:rPr>
-          <w:rFonts w:ascii="Calibri" w:hAnsi="Calibri"/>
-          <w:b/>
-          <w:sz w:val="22"/>
-        </w:rPr>
-        <w:t>Clear text</w:t>
-      </w:r>
-      <w:r>
-        <w:rPr>
-          <w:rFonts w:ascii="Calibri" w:hAnsi="Calibri"/>
-          <w:sz w:val="22"/>
-        </w:rPr>
-        <w:t xml:space="preserve"> requires confirmation. The optional workspace name is blank by default, is not required, and labels the temporary session if supplied; it does not create a persistent corpus project.</w:t>
-      </w:r>
-    </w:p>
-    <w:p>
-      <w:pPr>
-        <w:widowControl/>
-        <w:spacing w:before="0" w:after="120" w:line="300" w:lineRule="auto"/>
-      </w:pPr>
-      <w:r>
-        <w:rPr>
-          <w:rFonts w:ascii="Calibri" w:hAnsi="Calibri"/>
-          <w:b/>
-          <w:sz w:val="22"/>
-        </w:rPr>
-        <w:t>Other Text</w:t>
-      </w:r>
-      <w:r>
-        <w:rPr>
-          <w:rFonts w:ascii="Calibri" w:hAnsi="Calibri"/>
-          <w:sz w:val="22"/>
-        </w:rPr>
-        <w:t xml:space="preserve"> reuses this interface and the same analysis engines with </w:t>
-      </w:r>
-      <w:r>
-        <w:rPr>
-          <w:rFonts w:ascii="Calibri" w:hAnsi="Calibri"/>
-          <w:b/>
-          <w:sz w:val="22"/>
-        </w:rPr>
-        <w:t>Analyze Text</w:t>
-      </w:r>
-      <w:r>
-        <w:rPr>
-          <w:rFonts w:ascii="Calibri" w:hAnsi="Calibri"/>
-          <w:sz w:val="22"/>
-        </w:rPr>
-        <w:t xml:space="preserve"> terminology. Pronunciation, meter, and rhyme remain available, but meter and rhyme are visibly marked experimental for non-lineated prose.</w:t>
-      </w:r>
-    </w:p>
-    <w:p>
-      <w:pPr>
-        <w:pStyle w:val="Heading2"/>
-      </w:pPr>
-      <w:r>
-        <w:rPr>
-          <w:rFonts w:ascii="Calibri" w:hAnsi="Calibri"/>
-          <w:sz w:val="22"/>
-        </w:rPr>
-        <w:t>Choose evidence</w:t>
-      </w:r>
-    </w:p>
-    <w:p>
-      <w:pPr>
-        <w:widowControl/>
-        <w:spacing w:before="0" w:after="120" w:line="300" w:lineRule="auto"/>
-      </w:pPr>
-      <w:r>
-        <w:rPr>
-          <w:rFonts w:ascii="Calibri" w:hAnsi="Calibri"/>
-          <w:sz w:val="22"/>
-        </w:rPr>
-        <w:t xml:space="preserve">Select one or more affective lexicons and/or enable the optional normative lexical concreteness, SUBTLEX-US frequency, Kuperman Age of Acquisition, CMUdict pronunciation/prosody-foundation, candidate-meter, rhyme/sound, Lexical Style, PoetryID, or Inherited Form Analysis modules. The controls are grouped as </w:t>
-      </w:r>
-      <w:r>
-        <w:rPr>
-          <w:rFonts w:ascii="Calibri" w:hAnsi="Calibri"/>
-          <w:b/>
-          <w:sz w:val="22"/>
-        </w:rPr>
-        <w:t>Core Analysis</w:t>
-      </w:r>
-      <w:r>
-        <w:rPr>
-          <w:rFonts w:ascii="Calibri" w:hAnsi="Calibri"/>
-          <w:sz w:val="22"/>
-        </w:rPr>
-        <w:t xml:space="preserve">, </w:t>
-      </w:r>
-      <w:r>
-        <w:rPr>
-          <w:rFonts w:ascii="Calibri" w:hAnsi="Calibri"/>
-          <w:b/>
-          <w:sz w:val="22"/>
-        </w:rPr>
-        <w:t>Lexical Character</w:t>
-      </w:r>
-      <w:r>
-        <w:rPr>
-          <w:rFonts w:ascii="Calibri" w:hAnsi="Calibri"/>
-          <w:sz w:val="22"/>
-        </w:rPr>
-        <w:t xml:space="preserve">, </w:t>
-      </w:r>
-      <w:r>
-        <w:rPr>
-          <w:rFonts w:ascii="Calibri" w:hAnsi="Calibri"/>
-          <w:b/>
-          <w:sz w:val="22"/>
-        </w:rPr>
-        <w:t>Structural and Lexical Measures</w:t>
-      </w:r>
-      <w:r>
-        <w:rPr>
-          <w:rFonts w:ascii="Calibri" w:hAnsi="Calibri"/>
-          <w:sz w:val="22"/>
-        </w:rPr>
-        <w:t xml:space="preserve">, </w:t>
-      </w:r>
-      <w:r>
-        <w:rPr>
-          <w:rFonts w:ascii="Calibri" w:hAnsi="Calibri"/>
-          <w:b/>
-          <w:sz w:val="22"/>
-        </w:rPr>
-        <w:t>PoetryID</w:t>
-      </w:r>
-      <w:r>
-        <w:rPr>
-          <w:rFonts w:ascii="Calibri" w:hAnsi="Calibri"/>
-          <w:sz w:val="22"/>
-        </w:rPr>
-        <w:t xml:space="preserve">, and </w:t>
-      </w:r>
-      <w:r>
-        <w:rPr>
-          <w:rFonts w:ascii="Calibri" w:hAnsi="Calibri"/>
-          <w:b/>
-          <w:sz w:val="22"/>
-        </w:rPr>
-        <w:t>Sound and Form</w:t>
-      </w:r>
-      <w:r>
-        <w:rPr>
-          <w:rFonts w:ascii="Calibri" w:hAnsi="Calibri"/>
-          <w:sz w:val="22"/>
-        </w:rPr>
-        <w:t>.</w:t>
-      </w:r>
-    </w:p>
-    <w:p>
-      <w:pPr>
-        <w:widowControl/>
-        <w:spacing w:before="0" w:after="120" w:line="300" w:lineRule="auto"/>
-      </w:pPr>
-      <w:r>
-        <w:rPr>
-          <w:rFonts w:ascii="Calibri" w:hAnsi="Calibri"/>
-          <w:sz w:val="22"/>
-        </w:rPr>
-        <w:t xml:space="preserve">The optional </w:t>
-      </w:r>
-      <w:r>
-        <w:rPr>
-          <w:rFonts w:ascii="Calibri" w:hAnsi="Calibri"/>
-          <w:b/>
-          <w:sz w:val="22"/>
-        </w:rPr>
-        <w:t>Essential</w:t>
-      </w:r>
-      <w:r>
-        <w:rPr>
-          <w:rFonts w:ascii="Calibri" w:hAnsi="Calibri"/>
-          <w:sz w:val="22"/>
-        </w:rPr>
-        <w:t xml:space="preserve">, </w:t>
-      </w:r>
-      <w:r>
-        <w:rPr>
-          <w:rFonts w:ascii="Calibri" w:hAnsi="Calibri"/>
-          <w:b/>
-          <w:sz w:val="22"/>
-        </w:rPr>
-        <w:t>Literary</w:t>
-      </w:r>
-      <w:r>
-        <w:rPr>
-          <w:rFonts w:ascii="Calibri" w:hAnsi="Calibri"/>
-          <w:sz w:val="22"/>
-        </w:rPr>
-        <w:t xml:space="preserve">, </w:t>
-      </w:r>
-      <w:r>
-        <w:rPr>
-          <w:rFonts w:ascii="Calibri" w:hAnsi="Calibri"/>
-          <w:b/>
-          <w:sz w:val="22"/>
-        </w:rPr>
-        <w:t>Sound and Form</w:t>
-      </w:r>
-      <w:r>
-        <w:rPr>
-          <w:rFonts w:ascii="Calibri" w:hAnsi="Calibri"/>
-          <w:sz w:val="22"/>
-        </w:rPr>
-        <w:t xml:space="preserve">, and </w:t>
-      </w:r>
-      <w:r>
-        <w:rPr>
-          <w:rFonts w:ascii="Calibri" w:hAnsi="Calibri"/>
-          <w:b/>
-          <w:sz w:val="22"/>
-        </w:rPr>
-        <w:t>Complete</w:t>
-      </w:r>
-      <w:r>
-        <w:rPr>
-          <w:rFonts w:ascii="Calibri" w:hAnsi="Calibri"/>
-          <w:sz w:val="22"/>
-        </w:rPr>
-        <w:t xml:space="preserve"> presets change module selections only after </w:t>
-      </w:r>
-      <w:r>
-        <w:rPr>
-          <w:rFonts w:ascii="Calibri" w:hAnsi="Calibri"/>
-          <w:b/>
-          <w:sz w:val="22"/>
-        </w:rPr>
-        <w:t>Apply preset</w:t>
-      </w:r>
-      <w:r>
-        <w:rPr>
-          <w:rFonts w:ascii="Calibri" w:hAnsi="Calibri"/>
-          <w:sz w:val="22"/>
-        </w:rPr>
-        <w:t xml:space="preserve"> is clicked. </w:t>
-      </w:r>
-      <w:r>
-        <w:rPr>
-          <w:rFonts w:ascii="Calibri" w:hAnsi="Calibri"/>
-          <w:b/>
-          <w:sz w:val="22"/>
-        </w:rPr>
-        <w:t>Custom</w:t>
-      </w:r>
-      <w:r>
-        <w:rPr>
-          <w:rFonts w:ascii="Calibri" w:hAnsi="Calibri"/>
-          <w:sz w:val="22"/>
-        </w:rPr>
-        <w:t xml:space="preserve"> retains the current manual selection. Presets never overwrite advanced thresholds, filtering, phrase policy, stopwords, pronunciation overrides, or other methodology.</w:t>
-      </w:r>
-    </w:p>
-    <w:p>
-      <w:pPr>
-        <w:widowControl/>
-        <w:spacing w:before="0" w:after="120" w:line="300" w:lineRule="auto"/>
-      </w:pPr>
-      <w:r>
-        <w:rPr>
-          <w:rFonts w:ascii="Calibri" w:hAnsi="Calibri"/>
-          <w:sz w:val="22"/>
-        </w:rPr>
-        <w:t>VAD, categorical association, intensity, concreteness, corpus-relative frequency, retrospective lexical AoA, dictionary pronunciation/lexical stress, configured meter fit, rhyme/sound evidence, lexical diversity/word counts, and PoetryID candidate profiles, and inherited-form resemblance answer different questions and remain separate. PoetryID requires an enabled VAD source and reuses its completed result; selecting meter or rhyme automatically runs its pronunciation dependency. Inherited Form Analysis automatically reuses pronunciation, meter, and graded rhyme evidence without independently rescanning the poem.</w:t>
-      </w:r>
-    </w:p>
-    <w:p>
-      <w:pPr>
-        <w:widowControl/>
-        <w:spacing w:before="0" w:after="120" w:line="300" w:lineRule="auto"/>
-      </w:pPr>
-      <w:r>
-        <w:rPr>
-          <w:rFonts w:ascii="Calibri" w:hAnsi="Calibri"/>
-          <w:sz w:val="22"/>
-        </w:rPr>
-        <w:t xml:space="preserve">The same nine optional modules are also available in </w:t>
-      </w:r>
-      <w:r>
-        <w:rPr>
-          <w:rFonts w:ascii="Calibri" w:hAnsi="Calibri"/>
-          <w:b/>
-          <w:sz w:val="22"/>
-        </w:rPr>
-        <w:t>Project / Corpus</w:t>
-      </w:r>
-      <w:r>
-        <w:rPr>
-          <w:rFonts w:ascii="Calibri" w:hAnsi="Calibri"/>
-          <w:sz w:val="22"/>
-        </w:rPr>
-        <w:t>. Single Poem and Other Text results remain temporary unless downloaded; corpus runs persist the same module result envelopes, configurations, coverage, warnings, provenance, and audit artifacts against exact text versions.</w:t>
-      </w:r>
-    </w:p>
-    <w:p>
-      <w:pPr>
-        <w:widowControl/>
-        <w:spacing w:before="0" w:after="120" w:line="300" w:lineRule="auto"/>
-      </w:pPr>
-      <w:r>
-        <w:rPr>
-          <w:rFonts w:ascii="Calibri" w:hAnsi="Calibri"/>
-          <w:sz w:val="22"/>
-        </w:rPr>
-        <w:t xml:space="preserve">Under </w:t>
-      </w:r>
-      <w:r>
-        <w:rPr>
-          <w:rFonts w:ascii="Calibri" w:hAnsi="Calibri"/>
-          <w:b/>
-          <w:sz w:val="22"/>
-        </w:rPr>
-        <w:t>Analysis configuration and methodology</w:t>
-      </w:r>
-      <w:r>
-        <w:rPr>
-          <w:rFonts w:ascii="Calibri" w:hAnsi="Calibri"/>
-          <w:sz w:val="22"/>
-        </w:rPr>
-        <w:t>, choose:</w:t>
+        <w:t>token-weighted mean intensity among supplied pairs;</w:t>
       </w:r>
     </w:p>
     <w:p>
@@ -11164,7 +10866,395 @@
           <w:rFonts w:ascii="Calibri" w:hAnsi="Calibri"/>
           <w:sz w:val="22"/>
         </w:rPr>
-        <w:t>phrase policy;</w:t>
+        <w:t>type-weighted mean intensity among supplied pairs.</w:t>
+      </w:r>
+    </w:p>
+    <w:p>
+      <w:pPr>
+        <w:widowControl/>
+        <w:spacing w:before="0" w:after="120" w:line="300" w:lineRule="auto"/>
+      </w:pPr>
+      <w:r>
+        <w:rPr>
+          <w:rFonts w:ascii="Calibri" w:hAnsi="Calibri"/>
+          <w:sz w:val="22"/>
+        </w:rPr>
+        <w:t>An absent word-emotion pair is missing, not an intensity of zero.</w:t>
+      </w:r>
+    </w:p>
+    <w:p>
+      <w:pPr>
+        <w:pStyle w:val="Heading1"/>
+      </w:pPr>
+      <w:r>
+        <w:rPr>
+          <w:rFonts w:ascii="Calibri" w:hAnsi="Calibri"/>
+          <w:sz w:val="22"/>
+        </w:rPr>
+        <w:t>8. Single Poem and Other Text Workspaces</w:t>
+      </w:r>
+    </w:p>
+    <w:p>
+      <w:pPr>
+        <w:pStyle w:val="Heading2"/>
+      </w:pPr>
+      <w:r>
+        <w:rPr>
+          <w:rFonts w:ascii="Calibri" w:hAnsi="Calibri"/>
+          <w:sz w:val="22"/>
+        </w:rPr>
+        <w:t>Add a poem</w:t>
+      </w:r>
+    </w:p>
+    <w:p>
+      <w:pPr>
+        <w:widowControl/>
+        <w:spacing w:before="0" w:after="120" w:line="300" w:lineRule="auto"/>
+      </w:pPr>
+      <w:r>
+        <w:rPr>
+          <w:rFonts w:ascii="Calibri" w:hAnsi="Calibri"/>
+          <w:sz w:val="22"/>
+        </w:rPr>
+        <w:t xml:space="preserve">Paste text or upload one UTF-8 </w:t>
+      </w:r>
+      <w:r>
+        <w:rPr>
+          <w:rFonts w:ascii="Consolas" w:hAnsi="Consolas"/>
+          <w:color w:val="1F4D78"/>
+          <w:sz w:val="19"/>
+        </w:rPr>
+        <w:t>.txt</w:t>
+      </w:r>
+      <w:r>
+        <w:rPr>
+          <w:rFonts w:ascii="Calibri" w:hAnsi="Calibri"/>
+          <w:sz w:val="22"/>
+        </w:rPr>
+        <w:t xml:space="preserve"> file up to 5 MB. Enter a title or working label. Optional author, date/year, and source/edition notes are available under bibliographic metadata. The live word, physical-line, and text-block counts are orientation only; the actual analysis uses the shared linguistic tokenizer. </w:t>
+      </w:r>
+      <w:r>
+        <w:rPr>
+          <w:rFonts w:ascii="Calibri" w:hAnsi="Calibri"/>
+          <w:b/>
+          <w:sz w:val="22"/>
+        </w:rPr>
+        <w:t>Clear text</w:t>
+      </w:r>
+      <w:r>
+        <w:rPr>
+          <w:rFonts w:ascii="Calibri" w:hAnsi="Calibri"/>
+          <w:sz w:val="22"/>
+        </w:rPr>
+        <w:t xml:space="preserve"> requires confirmation. The optional workspace name is blank by default, is not required, and labels the temporary session if supplied; it does not create a persistent corpus project.</w:t>
+      </w:r>
+    </w:p>
+    <w:p>
+      <w:pPr>
+        <w:widowControl/>
+        <w:spacing w:before="0" w:after="120" w:line="300" w:lineRule="auto"/>
+      </w:pPr>
+      <w:r>
+        <w:rPr>
+          <w:rFonts w:ascii="Calibri" w:hAnsi="Calibri"/>
+          <w:b/>
+          <w:sz w:val="22"/>
+        </w:rPr>
+        <w:t>Other Text</w:t>
+      </w:r>
+      <w:r>
+        <w:rPr>
+          <w:rFonts w:ascii="Calibri" w:hAnsi="Calibri"/>
+          <w:sz w:val="22"/>
+        </w:rPr>
+        <w:t xml:space="preserve"> reuses this interface and the same analysis engines with </w:t>
+      </w:r>
+      <w:r>
+        <w:rPr>
+          <w:rFonts w:ascii="Calibri" w:hAnsi="Calibri"/>
+          <w:b/>
+          <w:sz w:val="22"/>
+        </w:rPr>
+        <w:t>Analyze Text</w:t>
+      </w:r>
+      <w:r>
+        <w:rPr>
+          <w:rFonts w:ascii="Calibri" w:hAnsi="Calibri"/>
+          <w:sz w:val="22"/>
+        </w:rPr>
+        <w:t xml:space="preserve"> terminology. Pronunciation, meter, and rhyme remain available, but meter and rhyme are visibly marked experimental for non-lineated prose.</w:t>
+      </w:r>
+    </w:p>
+    <w:p>
+      <w:pPr>
+        <w:pStyle w:val="Heading2"/>
+      </w:pPr>
+      <w:r>
+        <w:rPr>
+          <w:rFonts w:ascii="Calibri" w:hAnsi="Calibri"/>
+          <w:sz w:val="22"/>
+        </w:rPr>
+        <w:t>Choose evidence</w:t>
+      </w:r>
+    </w:p>
+    <w:p>
+      <w:pPr>
+        <w:widowControl/>
+        <w:spacing w:before="0" w:after="120" w:line="300" w:lineRule="auto"/>
+      </w:pPr>
+      <w:r>
+        <w:rPr>
+          <w:rFonts w:ascii="Calibri" w:hAnsi="Calibri"/>
+          <w:sz w:val="22"/>
+        </w:rPr>
+        <w:t xml:space="preserve">Select one or more affective lexicons and/or enable the optional normative lexical concreteness, SUBTLEX-US frequency, Kuperman Age of Acquisition, CMUdict pronunciation/prosody-foundation, candidate-meter, rhyme/sound, Lexical Style, PoetryID, or Inherited Form Analysis modules. The controls are grouped as </w:t>
+      </w:r>
+      <w:r>
+        <w:rPr>
+          <w:rFonts w:ascii="Calibri" w:hAnsi="Calibri"/>
+          <w:b/>
+          <w:sz w:val="22"/>
+        </w:rPr>
+        <w:t>Core Analysis</w:t>
+      </w:r>
+      <w:r>
+        <w:rPr>
+          <w:rFonts w:ascii="Calibri" w:hAnsi="Calibri"/>
+          <w:sz w:val="22"/>
+        </w:rPr>
+        <w:t xml:space="preserve">, </w:t>
+      </w:r>
+      <w:r>
+        <w:rPr>
+          <w:rFonts w:ascii="Calibri" w:hAnsi="Calibri"/>
+          <w:b/>
+          <w:sz w:val="22"/>
+        </w:rPr>
+        <w:t>Lexical Character</w:t>
+      </w:r>
+      <w:r>
+        <w:rPr>
+          <w:rFonts w:ascii="Calibri" w:hAnsi="Calibri"/>
+          <w:sz w:val="22"/>
+        </w:rPr>
+        <w:t xml:space="preserve">, </w:t>
+      </w:r>
+      <w:r>
+        <w:rPr>
+          <w:rFonts w:ascii="Calibri" w:hAnsi="Calibri"/>
+          <w:b/>
+          <w:sz w:val="22"/>
+        </w:rPr>
+        <w:t>Structural and Lexical Measures</w:t>
+      </w:r>
+      <w:r>
+        <w:rPr>
+          <w:rFonts w:ascii="Calibri" w:hAnsi="Calibri"/>
+          <w:sz w:val="22"/>
+        </w:rPr>
+        <w:t xml:space="preserve">, </w:t>
+      </w:r>
+      <w:r>
+        <w:rPr>
+          <w:rFonts w:ascii="Calibri" w:hAnsi="Calibri"/>
+          <w:b/>
+          <w:sz w:val="22"/>
+        </w:rPr>
+        <w:t>PoetryID</w:t>
+      </w:r>
+      <w:r>
+        <w:rPr>
+          <w:rFonts w:ascii="Calibri" w:hAnsi="Calibri"/>
+          <w:sz w:val="22"/>
+        </w:rPr>
+        <w:t xml:space="preserve">, and </w:t>
+      </w:r>
+      <w:r>
+        <w:rPr>
+          <w:rFonts w:ascii="Calibri" w:hAnsi="Calibri"/>
+          <w:b/>
+          <w:sz w:val="22"/>
+        </w:rPr>
+        <w:t>Sound and Form</w:t>
+      </w:r>
+      <w:r>
+        <w:rPr>
+          <w:rFonts w:ascii="Calibri" w:hAnsi="Calibri"/>
+          <w:sz w:val="22"/>
+        </w:rPr>
+        <w:t>.</w:t>
+      </w:r>
+    </w:p>
+    <w:p>
+      <w:pPr>
+        <w:widowControl/>
+        <w:spacing w:before="0" w:after="120" w:line="300" w:lineRule="auto"/>
+      </w:pPr>
+      <w:r>
+        <w:rPr>
+          <w:rFonts w:ascii="Calibri" w:hAnsi="Calibri"/>
+          <w:sz w:val="22"/>
+        </w:rPr>
+        <w:t xml:space="preserve">The optional </w:t>
+      </w:r>
+      <w:r>
+        <w:rPr>
+          <w:rFonts w:ascii="Calibri" w:hAnsi="Calibri"/>
+          <w:b/>
+          <w:sz w:val="22"/>
+        </w:rPr>
+        <w:t>Essential</w:t>
+      </w:r>
+      <w:r>
+        <w:rPr>
+          <w:rFonts w:ascii="Calibri" w:hAnsi="Calibri"/>
+          <w:sz w:val="22"/>
+        </w:rPr>
+        <w:t xml:space="preserve">, </w:t>
+      </w:r>
+      <w:r>
+        <w:rPr>
+          <w:rFonts w:ascii="Calibri" w:hAnsi="Calibri"/>
+          <w:b/>
+          <w:sz w:val="22"/>
+        </w:rPr>
+        <w:t>Literary</w:t>
+      </w:r>
+      <w:r>
+        <w:rPr>
+          <w:rFonts w:ascii="Calibri" w:hAnsi="Calibri"/>
+          <w:sz w:val="22"/>
+        </w:rPr>
+        <w:t xml:space="preserve">, </w:t>
+      </w:r>
+      <w:r>
+        <w:rPr>
+          <w:rFonts w:ascii="Calibri" w:hAnsi="Calibri"/>
+          <w:b/>
+          <w:sz w:val="22"/>
+        </w:rPr>
+        <w:t>Sound and Form</w:t>
+      </w:r>
+      <w:r>
+        <w:rPr>
+          <w:rFonts w:ascii="Calibri" w:hAnsi="Calibri"/>
+          <w:sz w:val="22"/>
+        </w:rPr>
+        <w:t xml:space="preserve">, and </w:t>
+      </w:r>
+      <w:r>
+        <w:rPr>
+          <w:rFonts w:ascii="Calibri" w:hAnsi="Calibri"/>
+          <w:b/>
+          <w:sz w:val="22"/>
+        </w:rPr>
+        <w:t>Complete</w:t>
+      </w:r>
+      <w:r>
+        <w:rPr>
+          <w:rFonts w:ascii="Calibri" w:hAnsi="Calibri"/>
+          <w:sz w:val="22"/>
+        </w:rPr>
+        <w:t xml:space="preserve"> presets change module selections only after </w:t>
+      </w:r>
+      <w:r>
+        <w:rPr>
+          <w:rFonts w:ascii="Calibri" w:hAnsi="Calibri"/>
+          <w:b/>
+          <w:sz w:val="22"/>
+        </w:rPr>
+        <w:t>Apply preset</w:t>
+      </w:r>
+      <w:r>
+        <w:rPr>
+          <w:rFonts w:ascii="Calibri" w:hAnsi="Calibri"/>
+          <w:sz w:val="22"/>
+        </w:rPr>
+        <w:t xml:space="preserve"> is clicked. </w:t>
+      </w:r>
+      <w:r>
+        <w:rPr>
+          <w:rFonts w:ascii="Calibri" w:hAnsi="Calibri"/>
+          <w:b/>
+          <w:sz w:val="22"/>
+        </w:rPr>
+        <w:t>Custom</w:t>
+      </w:r>
+      <w:r>
+        <w:rPr>
+          <w:rFonts w:ascii="Calibri" w:hAnsi="Calibri"/>
+          <w:sz w:val="22"/>
+        </w:rPr>
+        <w:t xml:space="preserve"> retains the current manual selection. Presets never overwrite advanced thresholds, filtering, phrase policy, stopwords, pronunciation overrides, or other methodology.</w:t>
+      </w:r>
+    </w:p>
+    <w:p>
+      <w:pPr>
+        <w:widowControl/>
+        <w:spacing w:before="0" w:after="120" w:line="300" w:lineRule="auto"/>
+      </w:pPr>
+      <w:r>
+        <w:rPr>
+          <w:rFonts w:ascii="Calibri" w:hAnsi="Calibri"/>
+          <w:sz w:val="22"/>
+        </w:rPr>
+        <w:t>VAD, categorical association, intensity, concreteness, corpus-relative frequency, retrospective lexical AoA, dictionary pronunciation/lexical stress, configured meter fit, rhyme/sound evidence, lexical diversity/word counts, and PoetryID candidate profiles, and inherited-form resemblance answer different questions and remain separate. PoetryID requires an enabled VAD source and reuses its completed result; selecting meter or rhyme automatically runs its pronunciation dependency. Inherited Form Analysis automatically reuses pronunciation, meter, and graded rhyme evidence without independently rescanning the poem.</w:t>
+      </w:r>
+    </w:p>
+    <w:p>
+      <w:pPr>
+        <w:widowControl/>
+        <w:spacing w:before="0" w:after="120" w:line="300" w:lineRule="auto"/>
+      </w:pPr>
+      <w:r>
+        <w:rPr>
+          <w:rFonts w:ascii="Calibri" w:hAnsi="Calibri"/>
+          <w:sz w:val="22"/>
+        </w:rPr>
+        <w:t xml:space="preserve">The same nine optional modules are also available in </w:t>
+      </w:r>
+      <w:r>
+        <w:rPr>
+          <w:rFonts w:ascii="Calibri" w:hAnsi="Calibri"/>
+          <w:b/>
+          <w:sz w:val="22"/>
+        </w:rPr>
+        <w:t>Project / Corpus</w:t>
+      </w:r>
+      <w:r>
+        <w:rPr>
+          <w:rFonts w:ascii="Calibri" w:hAnsi="Calibri"/>
+          <w:sz w:val="22"/>
+        </w:rPr>
+        <w:t>. Single Poem and Other Text results remain temporary unless downloaded; corpus runs persist the same module result envelopes, configurations, coverage, warnings, provenance, and audit artifacts against exact text versions.</w:t>
+      </w:r>
+    </w:p>
+    <w:p>
+      <w:pPr>
+        <w:widowControl/>
+        <w:spacing w:before="0" w:after="120" w:line="300" w:lineRule="auto"/>
+      </w:pPr>
+      <w:r>
+        <w:rPr>
+          <w:rFonts w:ascii="Calibri" w:hAnsi="Calibri"/>
+          <w:sz w:val="22"/>
+        </w:rPr>
+        <w:t xml:space="preserve">Under </w:t>
+      </w:r>
+      <w:r>
+        <w:rPr>
+          <w:rFonts w:ascii="Calibri" w:hAnsi="Calibri"/>
+          <w:b/>
+          <w:sz w:val="22"/>
+        </w:rPr>
+        <w:t>Analysis configuration and methodology</w:t>
+      </w:r>
+      <w:r>
+        <w:rPr>
+          <w:rFonts w:ascii="Calibri" w:hAnsi="Calibri"/>
+          <w:sz w:val="22"/>
+        </w:rPr>
+        <w:t>, choose:</w:t>
       </w:r>
     </w:p>
     <w:p>
@@ -11182,7 +11272,7 @@
           <w:rFonts w:ascii="Calibri" w:hAnsi="Calibri"/>
           <w:sz w:val="22"/>
         </w:rPr>
-        <w:t>minimum matched observations for sparse-result warnings;</w:t>
+        <w:t>phrase policy;</w:t>
       </w:r>
     </w:p>
     <w:p>
@@ -11200,7 +11290,7 @@
           <w:rFonts w:ascii="Calibri" w:hAnsi="Calibri"/>
           <w:sz w:val="22"/>
         </w:rPr>
-        <w:t>whether to display all-matched results;</w:t>
+        <w:t>minimum matched observations for sparse-result warnings;</w:t>
       </w:r>
     </w:p>
     <w:p>
@@ -11218,7 +11308,7 @@
           <w:rFonts w:ascii="Calibri" w:hAnsi="Calibri"/>
           <w:sz w:val="22"/>
         </w:rPr>
-        <w:t>whether to display stopword-excluded results;</w:t>
+        <w:t>whether to display all-matched results;</w:t>
       </w:r>
     </w:p>
     <w:p>
@@ -11236,7 +11326,7 @@
           <w:rFonts w:ascii="Calibri" w:hAnsi="Calibri"/>
           <w:sz w:val="22"/>
         </w:rPr>
-        <w:t>concreteness lower and upper orientation thresholds;</w:t>
+        <w:t>whether to display stopword-excluded results;</w:t>
       </w:r>
     </w:p>
     <w:p>
@@ -11254,7 +11344,7 @@
           <w:rFonts w:ascii="Calibri" w:hAnsi="Calibri"/>
           <w:sz w:val="22"/>
         </w:rPr>
-        <w:t>whether concreteness excludes model-tagged proper nouns;</w:t>
+        <w:t>concreteness lower and upper orientation thresholds;</w:t>
       </w:r>
     </w:p>
     <w:p>
@@ -11272,7 +11362,7 @@
           <w:rFonts w:ascii="Calibri" w:hAnsi="Calibri"/>
           <w:sz w:val="22"/>
         </w:rPr>
-        <w:t>whether source-supplied concreteness phrases are activated; and</w:t>
+        <w:t>whether concreteness excludes model-tagged proper nouns;</w:t>
       </w:r>
     </w:p>
     <w:p>
@@ -11290,7 +11380,7 @@
           <w:rFonts w:ascii="Calibri" w:hAnsi="Calibri"/>
           <w:sz w:val="22"/>
         </w:rPr>
-        <w:t>the concreteness low-coverage caution threshold;</w:t>
+        <w:t>whether source-supplied concreteness phrases are activated; and</w:t>
       </w:r>
     </w:p>
     <w:p>
@@ -11308,7 +11398,7 @@
           <w:rFonts w:ascii="Calibri" w:hAnsi="Calibri"/>
           <w:sz w:val="22"/>
         </w:rPr>
-        <w:t>the four frequency orientation thresholds;</w:t>
+        <w:t>the concreteness low-coverage caution threshold;</w:t>
       </w:r>
     </w:p>
     <w:p>
@@ -11326,7 +11416,7 @@
           <w:rFonts w:ascii="Calibri" w:hAnsi="Calibri"/>
           <w:sz w:val="22"/>
         </w:rPr>
-        <w:t>whether frequency excludes model-tagged proper nouns;</w:t>
+        <w:t>the four frequency orientation thresholds;</w:t>
       </w:r>
     </w:p>
     <w:p>
@@ -11344,7 +11434,7 @@
           <w:rFonts w:ascii="Calibri" w:hAnsi="Calibri"/>
           <w:sz w:val="22"/>
         </w:rPr>
-        <w:t>whether frequency permits lemma fallback;</w:t>
+        <w:t>whether frequency excludes model-tagged proper nouns;</w:t>
       </w:r>
     </w:p>
     <w:p>
@@ -11362,7 +11452,7 @@
           <w:rFonts w:ascii="Calibri" w:hAnsi="Calibri"/>
           <w:sz w:val="22"/>
         </w:rPr>
-        <w:t>the frequency low-coverage caution threshold; and</w:t>
+        <w:t>whether frequency permits lemma fallback;</w:t>
       </w:r>
     </w:p>
     <w:p>
@@ -11380,22 +11470,7 @@
           <w:rFonts w:ascii="Calibri" w:hAnsi="Calibri"/>
           <w:sz w:val="22"/>
         </w:rPr>
-        <w:t xml:space="preserve">whether frequency uses the non-default </w:t>
-      </w:r>
-      <w:r>
-        <w:rPr>
-          <w:rFonts w:ascii="Calibri" w:hAnsi="Calibri"/>
-          <w:b/>
-          <w:sz w:val="22"/>
-        </w:rPr>
-        <w:t>Content words only</w:t>
-      </w:r>
-      <w:r>
-        <w:rPr>
-          <w:rFonts w:ascii="Calibri" w:hAnsi="Calibri"/>
-          <w:sz w:val="22"/>
-        </w:rPr>
-        <w:t xml:space="preserve"> scope;</w:t>
+        <w:t>the frequency low-coverage caution threshold; and</w:t>
       </w:r>
     </w:p>
     <w:p>
@@ -11413,7 +11488,22 @@
           <w:rFonts w:ascii="Calibri" w:hAnsi="Calibri"/>
           <w:sz w:val="22"/>
         </w:rPr>
-        <w:t>AoA early and later orientation thresholds;</w:t>
+        <w:t xml:space="preserve">whether frequency uses the non-default </w:t>
+      </w:r>
+      <w:r>
+        <w:rPr>
+          <w:rFonts w:ascii="Calibri" w:hAnsi="Calibri"/>
+          <w:b/>
+          <w:sz w:val="22"/>
+        </w:rPr>
+        <w:t>Content words only</w:t>
+      </w:r>
+      <w:r>
+        <w:rPr>
+          <w:rFonts w:ascii="Calibri" w:hAnsi="Calibri"/>
+          <w:sz w:val="22"/>
+        </w:rPr>
+        <w:t xml:space="preserve"> scope;</w:t>
       </w:r>
     </w:p>
     <w:p>
@@ -11431,7 +11521,7 @@
           <w:rFonts w:ascii="Calibri" w:hAnsi="Calibri"/>
           <w:sz w:val="22"/>
         </w:rPr>
-        <w:t>whether AoA excludes model-tagged proper nouns;</w:t>
+        <w:t>AoA early and later orientation thresholds;</w:t>
       </w:r>
     </w:p>
     <w:p>
@@ -11449,7 +11539,7 @@
           <w:rFonts w:ascii="Calibri" w:hAnsi="Calibri"/>
           <w:sz w:val="22"/>
         </w:rPr>
-        <w:t>whether AoA permits lemma fallback;</w:t>
+        <w:t>whether AoA excludes model-tagged proper nouns;</w:t>
       </w:r>
     </w:p>
     <w:p>
@@ -11467,7 +11557,7 @@
           <w:rFonts w:ascii="Calibri" w:hAnsi="Calibri"/>
           <w:sz w:val="22"/>
         </w:rPr>
-        <w:t>the AoA low-coverage caution threshold; and</w:t>
+        <w:t>whether AoA permits lemma fallback;</w:t>
       </w:r>
     </w:p>
     <w:p>
@@ -11485,22 +11575,7 @@
           <w:rFonts w:ascii="Calibri" w:hAnsi="Calibri"/>
           <w:sz w:val="22"/>
         </w:rPr>
-        <w:t xml:space="preserve">whether AoA uses the non-default contextual </w:t>
-      </w:r>
-      <w:r>
-        <w:rPr>
-          <w:rFonts w:ascii="Calibri" w:hAnsi="Calibri"/>
-          <w:b/>
-          <w:sz w:val="22"/>
-        </w:rPr>
-        <w:t>Content words only</w:t>
-      </w:r>
-      <w:r>
-        <w:rPr>
-          <w:rFonts w:ascii="Calibri" w:hAnsi="Calibri"/>
-          <w:sz w:val="22"/>
-        </w:rPr>
-        <w:t xml:space="preserve"> scope;</w:t>
+        <w:t>the AoA low-coverage caution threshold; and</w:t>
       </w:r>
     </w:p>
     <w:p>
@@ -11518,7 +11593,22 @@
           <w:rFonts w:ascii="Calibri" w:hAnsi="Calibri"/>
           <w:sz w:val="22"/>
         </w:rPr>
-        <w:t>the MATTR overlapping-window size;</w:t>
+        <w:t xml:space="preserve">whether AoA uses the non-default contextual </w:t>
+      </w:r>
+      <w:r>
+        <w:rPr>
+          <w:rFonts w:ascii="Calibri" w:hAnsi="Calibri"/>
+          <w:b/>
+          <w:sz w:val="22"/>
+        </w:rPr>
+        <w:t>Content words only</w:t>
+      </w:r>
+      <w:r>
+        <w:rPr>
+          <w:rFonts w:ascii="Calibri" w:hAnsi="Calibri"/>
+          <w:sz w:val="22"/>
+        </w:rPr>
+        <w:t xml:space="preserve"> scope;</w:t>
       </w:r>
     </w:p>
     <w:p>
@@ -11536,7 +11626,7 @@
           <w:rFonts w:ascii="Calibri" w:hAnsi="Calibri"/>
           <w:sz w:val="22"/>
         </w:rPr>
-        <w:t>the HD-D without-replacement sample size;</w:t>
+        <w:t>the MATTR overlapping-window size;</w:t>
       </w:r>
     </w:p>
     <w:p>
@@ -11554,7 +11644,7 @@
           <w:rFonts w:ascii="Calibri" w:hAnsi="Calibri"/>
           <w:sz w:val="22"/>
         </w:rPr>
-        <w:t>the MTLD TTR threshold;</w:t>
+        <w:t>the HD-D without-replacement sample size;</w:t>
       </w:r>
     </w:p>
     <w:p>
@@ -11572,7 +11662,7 @@
           <w:rFonts w:ascii="Calibri" w:hAnsi="Calibri"/>
           <w:sz w:val="22"/>
         </w:rPr>
-        <w:t>the lexical-diversity short-text caution threshold;</w:t>
+        <w:t>the MTLD TTR threshold;</w:t>
       </w:r>
     </w:p>
     <w:p>
@@ -11590,7 +11680,7 @@
           <w:rFonts w:ascii="Calibri" w:hAnsi="Calibri"/>
           <w:sz w:val="22"/>
         </w:rPr>
-        <w:t>PoetryID VAD sources, token/type weightings, and analysis views;</w:t>
+        <w:t>the lexical-diversity short-text caution threshold;</w:t>
       </w:r>
     </w:p>
     <w:p>
@@ -11608,7 +11698,7 @@
           <w:rFonts w:ascii="Calibri" w:hAnsi="Calibri"/>
           <w:sz w:val="22"/>
         </w:rPr>
-        <w:t>default or custom-fixed PoetryID VAD thresholds;</w:t>
+        <w:t>PoetryID VAD sources, token/type weightings, and analysis views;</w:t>
       </w:r>
     </w:p>
     <w:p>
@@ -11626,7 +11716,7 @@
           <w:rFonts w:ascii="Calibri" w:hAnsi="Calibri"/>
           <w:sz w:val="22"/>
         </w:rPr>
-        <w:t>PoetryID minimum VAD observations and token/type coverage; and</w:t>
+        <w:t>default or custom-fixed PoetryID VAD thresholds;</w:t>
       </w:r>
     </w:p>
     <w:p>
@@ -11644,7 +11734,7 @@
           <w:rFonts w:ascii="Calibri" w:hAnsi="Calibri"/>
           <w:sz w:val="22"/>
         </w:rPr>
-        <w:t>optional secondary PoetryID concreteness, frequency, and AoA character;</w:t>
+        <w:t>PoetryID minimum VAD observations and token/type coverage; and</w:t>
       </w:r>
     </w:p>
     <w:p>
@@ -11662,22 +11752,7 @@
           <w:rFonts w:ascii="Calibri" w:hAnsi="Calibri"/>
           <w:sz w:val="22"/>
         </w:rPr>
-        <w:t xml:space="preserve">poem-specific </w:t>
-      </w:r>
-      <w:r>
-        <w:rPr>
-          <w:rFonts w:ascii="Consolas" w:hAnsi="Consolas"/>
-          <w:color w:val="1F4D78"/>
-          <w:sz w:val="19"/>
-        </w:rPr>
-        <w:t>word = ARPAbet phones | note</w:t>
-      </w:r>
-      <w:r>
-        <w:rPr>
-          <w:rFonts w:ascii="Calibri" w:hAnsi="Calibri"/>
-          <w:sz w:val="22"/>
-        </w:rPr>
-        <w:t xml:space="preserve"> pronunciation overrides;</w:t>
+        <w:t>optional secondary PoetryID concreteness, frequency, and AoA character;</w:t>
       </w:r>
     </w:p>
     <w:p>
@@ -11695,7 +11770,22 @@
           <w:rFonts w:ascii="Calibri" w:hAnsi="Calibri"/>
           <w:sz w:val="22"/>
         </w:rPr>
-        <w:t>the pronunciation resolved-token coverage caution threshold;</w:t>
+        <w:t xml:space="preserve">poem-specific </w:t>
+      </w:r>
+      <w:r>
+        <w:rPr>
+          <w:rFonts w:ascii="Consolas" w:hAnsi="Consolas"/>
+          <w:color w:val="1F4D78"/>
+          <w:sz w:val="19"/>
+        </w:rPr>
+        <w:t>word = ARPAbet phones | note</w:t>
+      </w:r>
+      <w:r>
+        <w:rPr>
+          <w:rFonts w:ascii="Calibri" w:hAnsi="Calibri"/>
+          <w:sz w:val="22"/>
+        </w:rPr>
+        <w:t xml:space="preserve"> pronunciation overrides;</w:t>
       </w:r>
     </w:p>
     <w:p>
@@ -11713,7 +11803,7 @@
           <w:rFonts w:ascii="Calibri" w:hAnsi="Calibri"/>
           <w:sz w:val="22"/>
         </w:rPr>
-        <w:t>minimum complete pronunciation lines; and</w:t>
+        <w:t>the pronunciation resolved-token coverage caution threshold;</w:t>
       </w:r>
     </w:p>
     <w:p>
@@ -11731,7 +11821,7 @@
           <w:rFonts w:ascii="Calibri" w:hAnsi="Calibri"/>
           <w:sz w:val="22"/>
         </w:rPr>
-        <w:t>minimum resolved pronunciation tokens for sparse-result warnings;</w:t>
+        <w:t>minimum complete pronunciation lines; and</w:t>
       </w:r>
     </w:p>
     <w:p>
@@ -11749,7 +11839,7 @@
           <w:rFonts w:ascii="Calibri" w:hAnsi="Calibri"/>
           <w:sz w:val="22"/>
         </w:rPr>
-        <w:t>the meter line-fit threshold;</w:t>
+        <w:t>minimum resolved pronunciation tokens for sparse-result warnings;</w:t>
       </w:r>
     </w:p>
     <w:p>
@@ -11767,7 +11857,7 @@
           <w:rFonts w:ascii="Calibri" w:hAnsi="Calibri"/>
           <w:sz w:val="22"/>
         </w:rPr>
-        <w:t>the poem candidate-fit threshold;</w:t>
+        <w:t>the meter line-fit threshold;</w:t>
       </w:r>
     </w:p>
     <w:p>
@@ -11785,7 +11875,7 @@
           <w:rFonts w:ascii="Calibri" w:hAnsi="Calibri"/>
           <w:sz w:val="22"/>
         </w:rPr>
-        <w:t>the candidate-margin threshold; and</w:t>
+        <w:t>the poem candidate-fit threshold;</w:t>
       </w:r>
     </w:p>
     <w:p>
@@ -11803,138 +11893,7 @@
           <w:rFonts w:ascii="Calibri" w:hAnsi="Calibri"/>
           <w:sz w:val="22"/>
         </w:rPr>
-        <w:t>the maximum retained stress paths evaluated per line.</w:t>
-      </w:r>
-    </w:p>
-    <w:p>
-      <w:pPr>
-        <w:widowControl/>
-        <w:spacing w:before="0" w:after="120" w:line="300" w:lineRule="auto"/>
-      </w:pPr>
-      <w:r>
-        <w:rPr>
-          <w:rFonts w:ascii="Calibri" w:hAnsi="Calibri"/>
-          <w:sz w:val="22"/>
-        </w:rPr>
-        <w:t xml:space="preserve">Under </w:t>
-      </w:r>
-      <w:r>
-        <w:rPr>
-          <w:rFonts w:ascii="Calibri" w:hAnsi="Calibri"/>
-          <w:b/>
-          <w:sz w:val="22"/>
-        </w:rPr>
-        <w:t>Stopword settings</w:t>
-      </w:r>
-      <w:r>
-        <w:rPr>
-          <w:rFonts w:ascii="Calibri" w:hAnsi="Calibri"/>
-          <w:sz w:val="22"/>
-        </w:rPr>
-        <w:t>, inspect or change the secondary-view policy. The all-matched result is always preserved even when only one view is displayed.</w:t>
-      </w:r>
-    </w:p>
-    <w:p>
-      <w:pPr>
-        <w:pStyle w:val="Heading2"/>
-      </w:pPr>
-      <w:r>
-        <w:rPr>
-          <w:rFonts w:ascii="Calibri" w:hAnsi="Calibri"/>
-          <w:sz w:val="22"/>
-        </w:rPr>
-        <w:t>Overview report family</w:t>
-      </w:r>
-    </w:p>
-    <w:p>
-      <w:pPr>
-        <w:widowControl/>
-        <w:spacing w:before="0" w:after="120" w:line="300" w:lineRule="auto"/>
-      </w:pPr>
-      <w:r>
-        <w:rPr>
-          <w:rFonts w:ascii="Calibri" w:hAnsi="Calibri"/>
-          <w:sz w:val="22"/>
-        </w:rPr>
-        <w:t>Read coverage before means. The Overview begins with a grouped at-a-glance summary for affective evidence, lexical character, sound/form, and structure. It then shows ordinary and content-focused coverage, matched counts, active methodology, excluded stopword counts, interpretive framing, and warnings.</w:t>
-      </w:r>
-    </w:p>
-    <w:p>
-      <w:pPr>
-        <w:pStyle w:val="Heading2"/>
-      </w:pPr>
-      <w:r>
-        <w:rPr>
-          <w:rFonts w:ascii="Calibri" w:hAnsi="Calibri"/>
-          <w:sz w:val="22"/>
-        </w:rPr>
-        <w:t>Structure report family: Language Profile section</w:t>
-      </w:r>
-    </w:p>
-    <w:p>
-      <w:pPr>
-        <w:widowControl/>
-        <w:spacing w:before="0" w:after="120" w:line="300" w:lineRule="auto"/>
-      </w:pPr>
-      <w:r>
-        <w:rPr>
-          <w:rFonts w:ascii="Calibri" w:hAnsi="Calibri"/>
-          <w:sz w:val="22"/>
-        </w:rPr>
-        <w:t xml:space="preserve">The </w:t>
-      </w:r>
-      <w:r>
-        <w:rPr>
-          <w:rFonts w:ascii="Calibri" w:hAnsi="Calibri"/>
-          <w:b/>
-          <w:sz w:val="22"/>
-        </w:rPr>
-        <w:t>Shared Processing Record</w:t>
-      </w:r>
-      <w:r>
-        <w:rPr>
-          <w:rFonts w:ascii="Calibri" w:hAnsi="Calibri"/>
-          <w:sz w:val="22"/>
-        </w:rPr>
-        <w:t xml:space="preserve"> first reports stanzas, physical lines, model sentences, total and lexical tokens, recipe/configuration IDs, model pipeline, dependency coverage, named-entity status, and processing cautions. It is the common local representation used by every selected lexicon.</w:t>
-      </w:r>
-    </w:p>
-    <w:p>
-      <w:pPr>
-        <w:widowControl/>
-        <w:spacing w:before="0" w:after="120" w:line="300" w:lineRule="auto"/>
-      </w:pPr>
-      <w:r>
-        <w:rPr>
-          <w:rFonts w:ascii="Calibri" w:hAnsi="Calibri"/>
-          <w:sz w:val="22"/>
-        </w:rPr>
-        <w:t>The tab then reports part-of-speech counts and relative shares for all eligible lexical tokens, independently of lexicon coverage. It also shows unique normalized types and example forms. The denominator is displayed, and a caution explains that the labels are model-generated.</w:t>
-      </w:r>
-    </w:p>
-    <w:p>
-      <w:pPr>
-        <w:pStyle w:val="Heading2"/>
-      </w:pPr>
-      <w:r>
-        <w:rPr>
-          <w:rFonts w:ascii="Calibri" w:hAnsi="Calibri"/>
-          <w:sz w:val="22"/>
-        </w:rPr>
-        <w:t>Affective Evidence: VAD section</w:t>
-      </w:r>
-    </w:p>
-    <w:p>
-      <w:pPr>
-        <w:widowControl/>
-        <w:spacing w:before="0" w:after="120" w:line="300" w:lineRule="auto"/>
-      </w:pPr>
-      <w:r>
-        <w:rPr>
-          <w:rFonts w:ascii="Calibri" w:hAnsi="Calibri"/>
-          <w:sz w:val="22"/>
-        </w:rPr>
-        <w:t>This tab contains:</w:t>
+        <w:t>the candidate-margin threshold; and</w:t>
       </w:r>
     </w:p>
     <w:p>
@@ -11952,7 +11911,138 @@
           <w:rFonts w:ascii="Calibri" w:hAnsi="Calibri"/>
           <w:sz w:val="22"/>
         </w:rPr>
-        <w:t>parallel normalized VAD charts;</w:t>
+        <w:t>the maximum retained stress paths evaluated per line.</w:t>
+      </w:r>
+    </w:p>
+    <w:p>
+      <w:pPr>
+        <w:widowControl/>
+        <w:spacing w:before="0" w:after="120" w:line="300" w:lineRule="auto"/>
+      </w:pPr>
+      <w:r>
+        <w:rPr>
+          <w:rFonts w:ascii="Calibri" w:hAnsi="Calibri"/>
+          <w:sz w:val="22"/>
+        </w:rPr>
+        <w:t xml:space="preserve">Under </w:t>
+      </w:r>
+      <w:r>
+        <w:rPr>
+          <w:rFonts w:ascii="Calibri" w:hAnsi="Calibri"/>
+          <w:b/>
+          <w:sz w:val="22"/>
+        </w:rPr>
+        <w:t>Stopword settings</w:t>
+      </w:r>
+      <w:r>
+        <w:rPr>
+          <w:rFonts w:ascii="Calibri" w:hAnsi="Calibri"/>
+          <w:sz w:val="22"/>
+        </w:rPr>
+        <w:t>, inspect or change the secondary-view policy. The all-matched result is always preserved even when only one view is displayed.</w:t>
+      </w:r>
+    </w:p>
+    <w:p>
+      <w:pPr>
+        <w:pStyle w:val="Heading2"/>
+      </w:pPr>
+      <w:r>
+        <w:rPr>
+          <w:rFonts w:ascii="Calibri" w:hAnsi="Calibri"/>
+          <w:sz w:val="22"/>
+        </w:rPr>
+        <w:t>Overview report family</w:t>
+      </w:r>
+    </w:p>
+    <w:p>
+      <w:pPr>
+        <w:widowControl/>
+        <w:spacing w:before="0" w:after="120" w:line="300" w:lineRule="auto"/>
+      </w:pPr>
+      <w:r>
+        <w:rPr>
+          <w:rFonts w:ascii="Calibri" w:hAnsi="Calibri"/>
+          <w:sz w:val="22"/>
+        </w:rPr>
+        <w:t>Read coverage before means. The Overview begins with a grouped at-a-glance summary for affective evidence, lexical character, sound/form, and structure. It then shows ordinary and content-focused coverage, matched counts, active methodology, excluded stopword counts, interpretive framing, and warnings.</w:t>
+      </w:r>
+    </w:p>
+    <w:p>
+      <w:pPr>
+        <w:pStyle w:val="Heading2"/>
+      </w:pPr>
+      <w:r>
+        <w:rPr>
+          <w:rFonts w:ascii="Calibri" w:hAnsi="Calibri"/>
+          <w:sz w:val="22"/>
+        </w:rPr>
+        <w:t>Structure report family: Language Profile section</w:t>
+      </w:r>
+    </w:p>
+    <w:p>
+      <w:pPr>
+        <w:widowControl/>
+        <w:spacing w:before="0" w:after="120" w:line="300" w:lineRule="auto"/>
+      </w:pPr>
+      <w:r>
+        <w:rPr>
+          <w:rFonts w:ascii="Calibri" w:hAnsi="Calibri"/>
+          <w:sz w:val="22"/>
+        </w:rPr>
+        <w:t xml:space="preserve">The </w:t>
+      </w:r>
+      <w:r>
+        <w:rPr>
+          <w:rFonts w:ascii="Calibri" w:hAnsi="Calibri"/>
+          <w:b/>
+          <w:sz w:val="22"/>
+        </w:rPr>
+        <w:t>Shared Processing Record</w:t>
+      </w:r>
+      <w:r>
+        <w:rPr>
+          <w:rFonts w:ascii="Calibri" w:hAnsi="Calibri"/>
+          <w:sz w:val="22"/>
+        </w:rPr>
+        <w:t xml:space="preserve"> first reports stanzas, physical lines, model sentences, total and lexical tokens, recipe/configuration IDs, model pipeline, dependency coverage, named-entity status, and processing cautions. It is the common local representation used by every selected lexicon.</w:t>
+      </w:r>
+    </w:p>
+    <w:p>
+      <w:pPr>
+        <w:widowControl/>
+        <w:spacing w:before="0" w:after="120" w:line="300" w:lineRule="auto"/>
+      </w:pPr>
+      <w:r>
+        <w:rPr>
+          <w:rFonts w:ascii="Calibri" w:hAnsi="Calibri"/>
+          <w:sz w:val="22"/>
+        </w:rPr>
+        <w:t>The tab then reports part-of-speech counts and relative shares for all eligible lexical tokens, independently of lexicon coverage. It also shows unique normalized types and example forms. The denominator is displayed, and a caution explains that the labels are model-generated.</w:t>
+      </w:r>
+    </w:p>
+    <w:p>
+      <w:pPr>
+        <w:pStyle w:val="Heading2"/>
+      </w:pPr>
+      <w:r>
+        <w:rPr>
+          <w:rFonts w:ascii="Calibri" w:hAnsi="Calibri"/>
+          <w:sz w:val="22"/>
+        </w:rPr>
+        <w:t>Affective Evidence: VAD section</w:t>
+      </w:r>
+    </w:p>
+    <w:p>
+      <w:pPr>
+        <w:widowControl/>
+        <w:spacing w:before="0" w:after="120" w:line="300" w:lineRule="auto"/>
+      </w:pPr>
+      <w:r>
+        <w:rPr>
+          <w:rFonts w:ascii="Calibri" w:hAnsi="Calibri"/>
+          <w:sz w:val="22"/>
+        </w:rPr>
+        <w:t>This tab contains:</w:t>
       </w:r>
     </w:p>
     <w:p>
@@ -11970,7 +12060,7 @@
           <w:rFonts w:ascii="Calibri" w:hAnsi="Calibri"/>
           <w:sz w:val="22"/>
         </w:rPr>
-        <w:t>definitions of valence, arousal, and dominance;</w:t>
+        <w:t>parallel normalized VAD charts;</w:t>
       </w:r>
     </w:p>
     <w:p>
@@ -11988,35 +12078,7 @@
           <w:rFonts w:ascii="Calibri" w:hAnsi="Calibri"/>
           <w:sz w:val="22"/>
         </w:rPr>
-        <w:t xml:space="preserve">a separate </w:t>
-      </w:r>
-      <w:r>
-        <w:rPr>
-          <w:rFonts w:ascii="Calibri" w:hAnsi="Calibri"/>
-          <w:b/>
-          <w:sz w:val="22"/>
-        </w:rPr>
-        <w:t>Dispersion of Matched Ratings</w:t>
-      </w:r>
-      <w:r>
-        <w:rPr>
-          <w:rFonts w:ascii="Calibri" w:hAnsi="Calibri"/>
-          <w:sz w:val="22"/>
-        </w:rPr>
-        <w:t xml:space="preserve"> section immediately after those</w:t>
-      </w:r>
-    </w:p>
-    <w:p>
-      <w:pPr>
-        <w:widowControl/>
-        <w:spacing w:before="0" w:after="120" w:line="300" w:lineRule="auto"/>
-      </w:pPr>
-      <w:r>
-        <w:rPr>
-          <w:rFonts w:ascii="Calibri" w:hAnsi="Calibri"/>
-          <w:sz w:val="22"/>
-        </w:rPr>
-        <w:t xml:space="preserve">  definitions, reporting population standard deviations among matched ratings;</w:t>
+        <w:t>definitions of valence, arousal, and dominance;</w:t>
       </w:r>
     </w:p>
     <w:p>
@@ -12034,7 +12096,35 @@
           <w:rFonts w:ascii="Calibri" w:hAnsi="Calibri"/>
           <w:sz w:val="22"/>
         </w:rPr>
-        <w:t>token- and type-weighted values for each analysis view;</w:t>
+        <w:t xml:space="preserve">a separate </w:t>
+      </w:r>
+      <w:r>
+        <w:rPr>
+          <w:rFonts w:ascii="Calibri" w:hAnsi="Calibri"/>
+          <w:b/>
+          <w:sz w:val="22"/>
+        </w:rPr>
+        <w:t>Dispersion of Matched Ratings</w:t>
+      </w:r>
+      <w:r>
+        <w:rPr>
+          <w:rFonts w:ascii="Calibri" w:hAnsi="Calibri"/>
+          <w:sz w:val="22"/>
+        </w:rPr>
+        <w:t xml:space="preserve"> section immediately after those</w:t>
+      </w:r>
+    </w:p>
+    <w:p>
+      <w:pPr>
+        <w:widowControl/>
+        <w:spacing w:before="0" w:after="120" w:line="300" w:lineRule="auto"/>
+      </w:pPr>
+      <w:r>
+        <w:rPr>
+          <w:rFonts w:ascii="Calibri" w:hAnsi="Calibri"/>
+          <w:sz w:val="22"/>
+        </w:rPr>
+        <w:t xml:space="preserve">  definitions, reporting population standard deviations among matched ratings;</w:t>
       </w:r>
     </w:p>
     <w:p>
@@ -12052,7 +12142,7 @@
           <w:rFonts w:ascii="Calibri" w:hAnsi="Calibri"/>
           <w:sz w:val="22"/>
         </w:rPr>
-        <w:t>plain-language midpoint interpretations;</w:t>
+        <w:t>token- and type-weighted values for each analysis view;</w:t>
       </w:r>
     </w:p>
     <w:p>
@@ -12070,7 +12160,7 @@
           <w:rFonts w:ascii="Calibri" w:hAnsi="Calibri"/>
           <w:sz w:val="22"/>
         </w:rPr>
-        <w:t>stopword-sensitivity differences;</w:t>
+        <w:t>plain-language midpoint interpretations;</w:t>
       </w:r>
     </w:p>
     <w:p>
@@ -12088,7 +12178,7 @@
           <w:rFonts w:ascii="Calibri" w:hAnsi="Calibri"/>
           <w:sz w:val="22"/>
         </w:rPr>
-        <w:t>cumulative normalized totals;</w:t>
+        <w:t>stopword-sensitivity differences;</w:t>
       </w:r>
     </w:p>
     <w:p>
@@ -12106,7 +12196,7 @@
           <w:rFonts w:ascii="Calibri" w:hAnsi="Calibri"/>
           <w:sz w:val="22"/>
         </w:rPr>
-        <w:t>top midpoint-centered contributors;</w:t>
+        <w:t>cumulative normalized totals;</w:t>
       </w:r>
     </w:p>
     <w:p>
@@ -12124,6 +12214,24 @@
           <w:rFonts w:ascii="Calibri" w:hAnsi="Calibri"/>
           <w:sz w:val="22"/>
         </w:rPr>
+        <w:t>top midpoint-centered contributors;</w:t>
+      </w:r>
+    </w:p>
+    <w:p>
+      <w:pPr>
+        <w:widowControl/>
+        <w:numPr>
+          <w:ilvl w:val="0"/>
+          <w:numId w:val="10"/>
+        </w:numPr>
+        <w:spacing w:before="0" w:after="80" w:line="300" w:lineRule="auto"/>
+        <w:ind w:left="540" w:hanging="271"/>
+      </w:pPr>
+      <w:r>
+        <w:rPr>
+          <w:rFonts w:ascii="Calibri" w:hAnsi="Calibri"/>
+          <w:sz w:val="22"/>
+        </w:rPr>
         <w:t>original source scales and normalization formulas.</w:t>
       </w:r>
     </w:p>
@@ -13282,6 +13390,24 @@
           <w:sz w:val="22"/>
         </w:rPr>
         <w:t xml:space="preserve"> shows:</w:t>
+      </w:r>
+    </w:p>
+    <w:p>
+      <w:pPr>
+        <w:widowControl/>
+        <w:numPr>
+          <w:ilvl w:val="0"/>
+          <w:numId w:val="10"/>
+        </w:numPr>
+        <w:spacing w:before="0" w:after="80" w:line="300" w:lineRule="auto"/>
+        <w:ind w:left="540" w:hanging="271"/>
+      </w:pPr>
+      <w:r>
+        <w:rPr>
+          <w:rFonts w:ascii="Calibri" w:hAnsi="Calibri"/>
+          <w:sz w:val="22"/>
+        </w:rPr>
+        <w:t>total nonblank physical lines;</w:t>
       </w:r>
     </w:p>
     <w:p>

</xml_diff>

<commit_message>
Refine corpus diagnostics and shared analysis profiles
</commit_message>
<xml_diff>
--- a/docs/VerseVAD_User_Manual.docx
+++ b/docs/VerseVAD_User_Manual.docx
@@ -71,7 +71,7 @@
           <w:color w:val="66727C"/>
           <w:sz w:val="21"/>
         </w:rPr>
-        <w:t xml:space="preserve"> August 1, 2026</w:t>
+        <w:t xml:space="preserve"> August 2, 2026</w:t>
       </w:r>
       <w:r>
         <w:rPr>
@@ -2869,7 +2869,7 @@
           <w:rFonts w:ascii="Calibri" w:hAnsi="Calibri"/>
           <w:sz w:val="22"/>
         </w:rPr>
-        <w:t>The selected theme persists across closing and reopening VerseVAD. Legacy Light and System choices migrate safely to Classic. The selection is stored as an application-level local preference, not in a project or analysis configuration. Appearance does not change calculations, result IDs, project data, or exports. Publication-oriented charts remain light.</w:t>
+        <w:t>The selected theme persists across closing and reopening VerseVAD. Legacy Light and System choices migrate safely to Classic. The selection is stored as an application-level local preference, not in a project or analysis configuration. In the hosted edition, an appearance-only browser cookie keeps the selection across refreshes; clearing site cookies returns it to Classic. Appearance does not change calculations, result IDs, project data, or exports. Publication-oriented charts remain light.</w:t>
       </w:r>
     </w:p>
     <w:p>
@@ -3347,7 +3347,7 @@
           <w:rFonts w:ascii="Calibri" w:hAnsi="Calibri"/>
           <w:sz w:val="22"/>
         </w:rPr>
-        <w:t>Opening a full save does not silently recalculate it. VerseVAD displays the version that created the result and offers continued historical viewing or preparation for an explicit current-version reanalysis.</w:t>
+        <w:t>Opening a full save does not silently recalculate it. VerseVAD displays the version that created the result and offers continued historical viewing or preparation for an explicit current-version reanalysis. Continuing changes no saved or active result data. Preparing reanalysis clears only the active computed output while retaining its restored text, metadata, and settings; the immutable library revision remains available.</w:t>
       </w:r>
     </w:p>
     <w:p>
@@ -7745,6 +7745,46 @@
           <w:rFonts w:ascii="Calibri" w:hAnsi="Calibri"/>
           <w:sz w:val="22"/>
         </w:rPr>
+        <w:t>Average deviation from poem mean</w:t>
+      </w:r>
+    </w:p>
+    <w:p>
+      <w:pPr>
+        <w:widowControl/>
+        <w:spacing w:before="0" w:after="120" w:line="300" w:lineRule="auto"/>
+      </w:pPr>
+      <w:r>
+        <w:rPr>
+          <w:rFonts w:ascii="Calibri" w:hAnsi="Calibri"/>
+          <w:sz w:val="22"/>
+        </w:rPr>
+        <w:t xml:space="preserve">For valence, arousal, and dominance, </w:t>
+      </w:r>
+      <w:r>
+        <w:rPr>
+          <w:rFonts w:ascii="Calibri" w:hAnsi="Calibri"/>
+          <w:b/>
+          <w:sz w:val="22"/>
+        </w:rPr>
+        <w:t>Average Deviation from Poem Mean</w:t>
+      </w:r>
+      <w:r>
+        <w:rPr>
+          <w:rFonts w:ascii="Calibri" w:hAnsi="Calibri"/>
+          <w:sz w:val="22"/>
+        </w:rPr>
+        <w:t xml:space="preserve"> is the mean absolute deviation (MAD) of the included matched ratings around the poem's own mean. It weights departures linearly and describes their typical absolute size. Population standard deviation squares departures and therefore responds more strongly to unusually distant ratings. Both measures are length-neutral and order-insensitive; neither identifies when a shift occurs.</w:t>
+      </w:r>
+    </w:p>
+    <w:p>
+      <w:pPr>
+        <w:pStyle w:val="Heading2"/>
+      </w:pPr>
+      <w:r>
+        <w:rPr>
+          <w:rFonts w:ascii="Calibri" w:hAnsi="Calibri"/>
+          <w:sz w:val="22"/>
+        </w:rPr>
         <w:t>Stopword sensitivity</w:t>
       </w:r>
     </w:p>
@@ -7913,6 +7953,50 @@
           <w:sz w:val="22"/>
         </w:rPr>
         <w:t>These quantities summarize encountered matched lexical ratings. They are not direct measurements of cognitive load or affective impact on a reader.</w:t>
+      </w:r>
+    </w:p>
+    <w:p>
+      <w:pPr>
+        <w:widowControl/>
+        <w:spacing w:before="0" w:after="120" w:line="300" w:lineRule="auto"/>
+      </w:pPr>
+      <w:r>
+        <w:rPr>
+          <w:rFonts w:ascii="Calibri" w:hAnsi="Calibri"/>
+          <w:sz w:val="22"/>
+        </w:rPr>
+        <w:t>VerseVAD also reports above-, below-, net-, and absolute-midpoint deviation per matched observation. The per-100 values are those same rates multiplied by</w:t>
+      </w:r>
+    </w:p>
+    <w:p>
+      <w:pPr>
+        <w:widowControl/>
+        <w:numPr>
+          <w:ilvl w:val="0"/>
+          <w:numId w:val="16"/>
+        </w:numPr>
+        <w:spacing w:before="0" w:after="80" w:line="300" w:lineRule="auto"/>
+        <w:ind w:left="540" w:hanging="271"/>
+      </w:pPr>
+      <w:r>
+        <w:rPr>
+          <w:rFonts w:ascii="Calibri" w:hAnsi="Calibri"/>
+          <w:sz w:val="22"/>
+        </w:rPr>
+        <w:t>Use a normalized rate rather than a raw cumulative total when comparing</w:t>
+      </w:r>
+    </w:p>
+    <w:p>
+      <w:pPr>
+        <w:widowControl/>
+        <w:spacing w:before="0" w:after="120" w:line="300" w:lineRule="auto"/>
+      </w:pPr>
+      <w:r>
+        <w:rPr>
+          <w:rFonts w:ascii="Calibri" w:hAnsi="Calibri"/>
+          <w:sz w:val="22"/>
+        </w:rPr>
+        <w:t>texts of substantially different lengths, while keeping source, scope, weighting, and matching policy constant.</w:t>
       </w:r>
     </w:p>
     <w:p>
@@ -14295,7 +14379,7 @@
         <w:widowControl/>
         <w:numPr>
           <w:ilvl w:val="0"/>
-          <w:numId w:val="16"/>
+          <w:numId w:val="17"/>
         </w:numPr>
         <w:spacing w:before="0" w:after="80" w:line="300" w:lineRule="auto"/>
         <w:ind w:left="540" w:hanging="271"/>
@@ -14328,7 +14412,7 @@
         <w:widowControl/>
         <w:numPr>
           <w:ilvl w:val="0"/>
-          <w:numId w:val="16"/>
+          <w:numId w:val="17"/>
         </w:numPr>
         <w:spacing w:before="0" w:after="80" w:line="300" w:lineRule="auto"/>
         <w:ind w:left="540" w:hanging="271"/>
@@ -14361,7 +14445,7 @@
         <w:widowControl/>
         <w:numPr>
           <w:ilvl w:val="0"/>
-          <w:numId w:val="16"/>
+          <w:numId w:val="17"/>
         </w:numPr>
         <w:spacing w:before="0" w:after="80" w:line="300" w:lineRule="auto"/>
         <w:ind w:left="540" w:hanging="271"/>
@@ -14379,7 +14463,7 @@
         <w:widowControl/>
         <w:numPr>
           <w:ilvl w:val="0"/>
-          <w:numId w:val="16"/>
+          <w:numId w:val="17"/>
         </w:numPr>
         <w:spacing w:before="0" w:after="80" w:line="300" w:lineRule="auto"/>
         <w:ind w:left="540" w:hanging="271"/>
@@ -14644,7 +14728,7 @@
         <w:widowControl/>
         <w:numPr>
           <w:ilvl w:val="0"/>
-          <w:numId w:val="17"/>
+          <w:numId w:val="18"/>
         </w:numPr>
         <w:spacing w:before="0" w:after="80" w:line="300" w:lineRule="auto"/>
         <w:ind w:left="540" w:hanging="271"/>
@@ -14662,7 +14746,7 @@
         <w:widowControl/>
         <w:numPr>
           <w:ilvl w:val="0"/>
-          <w:numId w:val="17"/>
+          <w:numId w:val="18"/>
         </w:numPr>
         <w:spacing w:before="0" w:after="80" w:line="300" w:lineRule="auto"/>
         <w:ind w:left="540" w:hanging="271"/>
@@ -14708,7 +14792,7 @@
         <w:widowControl/>
         <w:numPr>
           <w:ilvl w:val="0"/>
-          <w:numId w:val="17"/>
+          <w:numId w:val="18"/>
         </w:numPr>
         <w:spacing w:before="0" w:after="80" w:line="300" w:lineRule="auto"/>
         <w:ind w:left="540" w:hanging="271"/>
@@ -14741,7 +14825,7 @@
         <w:widowControl/>
         <w:numPr>
           <w:ilvl w:val="0"/>
-          <w:numId w:val="17"/>
+          <w:numId w:val="18"/>
         </w:numPr>
         <w:spacing w:before="0" w:after="80" w:line="300" w:lineRule="auto"/>
         <w:ind w:left="540" w:hanging="271"/>
@@ -14759,7 +14843,7 @@
         <w:widowControl/>
         <w:numPr>
           <w:ilvl w:val="0"/>
-          <w:numId w:val="17"/>
+          <w:numId w:val="18"/>
         </w:numPr>
         <w:spacing w:before="0" w:after="80" w:line="300" w:lineRule="auto"/>
         <w:ind w:left="540" w:hanging="271"/>
@@ -14805,7 +14889,7 @@
         <w:widowControl/>
         <w:numPr>
           <w:ilvl w:val="0"/>
-          <w:numId w:val="17"/>
+          <w:numId w:val="18"/>
         </w:numPr>
         <w:spacing w:before="0" w:after="80" w:line="300" w:lineRule="auto"/>
         <w:ind w:left="540" w:hanging="271"/>
@@ -14823,7 +14907,7 @@
         <w:widowControl/>
         <w:numPr>
           <w:ilvl w:val="0"/>
-          <w:numId w:val="17"/>
+          <w:numId w:val="18"/>
         </w:numPr>
         <w:spacing w:before="0" w:after="80" w:line="300" w:lineRule="auto"/>
         <w:ind w:left="540" w:hanging="271"/>
@@ -14856,7 +14940,7 @@
         <w:widowControl/>
         <w:numPr>
           <w:ilvl w:val="0"/>
-          <w:numId w:val="17"/>
+          <w:numId w:val="18"/>
         </w:numPr>
         <w:spacing w:before="0" w:after="80" w:line="300" w:lineRule="auto"/>
         <w:ind w:left="540" w:hanging="271"/>
@@ -15732,7 +15816,7 @@
         <w:widowControl/>
         <w:numPr>
           <w:ilvl w:val="0"/>
-          <w:numId w:val="18"/>
+          <w:numId w:val="19"/>
         </w:numPr>
         <w:spacing w:before="0" w:after="80" w:line="300" w:lineRule="auto"/>
         <w:ind w:left="540" w:hanging="271"/>
@@ -15743,358 +15827,6 @@
           <w:sz w:val="22"/>
         </w:rPr>
         <w:t>Run and retain an unreviewed baseline.</w:t>
-      </w:r>
-    </w:p>
-    <w:p>
-      <w:pPr>
-        <w:widowControl/>
-        <w:numPr>
-          <w:ilvl w:val="0"/>
-          <w:numId w:val="18"/>
-        </w:numPr>
-        <w:spacing w:before="0" w:after="80" w:line="300" w:lineRule="auto"/>
-        <w:ind w:left="540" w:hanging="271"/>
-      </w:pPr>
-      <w:r>
-        <w:rPr>
-          <w:rFonts w:ascii="Calibri" w:hAnsi="Calibri"/>
-          <w:sz w:val="22"/>
-        </w:rPr>
-        <w:t>Create a clearly named scenario.</w:t>
-      </w:r>
-    </w:p>
-    <w:p>
-      <w:pPr>
-        <w:widowControl/>
-        <w:numPr>
-          <w:ilvl w:val="0"/>
-          <w:numId w:val="18"/>
-        </w:numPr>
-        <w:spacing w:before="0" w:after="80" w:line="300" w:lineRule="auto"/>
-        <w:ind w:left="540" w:hanging="271"/>
-      </w:pPr>
-      <w:r>
-        <w:rPr>
-          <w:rFonts w:ascii="Calibri" w:hAnsi="Calibri"/>
-          <w:sz w:val="22"/>
-        </w:rPr>
-        <w:t>Inspect one candidate's text context, lexicon, match method, and risk label.</w:t>
-      </w:r>
-    </w:p>
-    <w:p>
-      <w:pPr>
-        <w:widowControl/>
-        <w:numPr>
-          <w:ilvl w:val="0"/>
-          <w:numId w:val="18"/>
-        </w:numPr>
-        <w:spacing w:before="0" w:after="80" w:line="300" w:lineRule="auto"/>
-        <w:ind w:left="540" w:hanging="271"/>
-      </w:pPr>
-      <w:r>
-        <w:rPr>
-          <w:rFonts w:ascii="Calibri" w:hAnsi="Calibri"/>
-          <w:sz w:val="22"/>
-        </w:rPr>
-        <w:t>Choose flag, exclude, or map.</w:t>
-      </w:r>
-    </w:p>
-    <w:p>
-      <w:pPr>
-        <w:widowControl/>
-        <w:numPr>
-          <w:ilvl w:val="0"/>
-          <w:numId w:val="18"/>
-        </w:numPr>
-        <w:spacing w:before="0" w:after="80" w:line="300" w:lineRule="auto"/>
-        <w:ind w:left="540" w:hanging="271"/>
-      </w:pPr>
-      <w:r>
-        <w:rPr>
-          <w:rFonts w:ascii="Calibri" w:hAnsi="Calibri"/>
-          <w:sz w:val="22"/>
-        </w:rPr>
-        <w:t>Select the narrowest scope that fits the evidence.</w:t>
-      </w:r>
-    </w:p>
-    <w:p>
-      <w:pPr>
-        <w:widowControl/>
-        <w:numPr>
-          <w:ilvl w:val="0"/>
-          <w:numId w:val="18"/>
-        </w:numPr>
-        <w:spacing w:before="0" w:after="80" w:line="300" w:lineRule="auto"/>
-        <w:ind w:left="540" w:hanging="271"/>
-      </w:pPr>
-      <w:r>
-        <w:rPr>
-          <w:rFonts w:ascii="Calibri" w:hAnsi="Calibri"/>
-          <w:sz w:val="22"/>
-        </w:rPr>
-        <w:t>Write a rationale another scholar could evaluate.</w:t>
-      </w:r>
-    </w:p>
-    <w:p>
-      <w:pPr>
-        <w:widowControl/>
-        <w:numPr>
-          <w:ilvl w:val="0"/>
-          <w:numId w:val="18"/>
-        </w:numPr>
-        <w:spacing w:before="0" w:after="80" w:line="300" w:lineRule="auto"/>
-        <w:ind w:left="540" w:hanging="271"/>
-      </w:pPr>
-      <w:r>
-        <w:rPr>
-          <w:rFonts w:ascii="Calibri" w:hAnsi="Calibri"/>
-          <w:sz w:val="22"/>
-        </w:rPr>
-        <w:t xml:space="preserve">Return to </w:t>
-      </w:r>
-      <w:r>
-        <w:rPr>
-          <w:rFonts w:ascii="Calibri" w:hAnsi="Calibri"/>
-          <w:b/>
-          <w:sz w:val="22"/>
-        </w:rPr>
-        <w:t>Analyze &amp; Compare</w:t>
-      </w:r>
-      <w:r>
-        <w:rPr>
-          <w:rFonts w:ascii="Calibri" w:hAnsi="Calibri"/>
-          <w:sz w:val="22"/>
-        </w:rPr>
-        <w:t>, select that scenario version, and rerun.</w:t>
-      </w:r>
-    </w:p>
-    <w:p>
-      <w:pPr>
-        <w:widowControl/>
-        <w:numPr>
-          <w:ilvl w:val="0"/>
-          <w:numId w:val="18"/>
-        </w:numPr>
-        <w:spacing w:before="0" w:after="80" w:line="300" w:lineRule="auto"/>
-        <w:ind w:left="540" w:hanging="271"/>
-      </w:pPr>
-      <w:r>
-        <w:rPr>
-          <w:rFonts w:ascii="Calibri" w:hAnsi="Calibri"/>
-          <w:sz w:val="22"/>
-        </w:rPr>
-        <w:t xml:space="preserve">Compare the reviewed batch with the baseline under </w:t>
-      </w:r>
-      <w:r>
-        <w:rPr>
-          <w:rFonts w:ascii="Calibri" w:hAnsi="Calibri"/>
-          <w:b/>
-          <w:sz w:val="22"/>
-        </w:rPr>
-        <w:t>Compare Two Immutable Analysis Batches</w:t>
-      </w:r>
-      <w:r>
-        <w:rPr>
-          <w:rFonts w:ascii="Calibri" w:hAnsi="Calibri"/>
-          <w:sz w:val="22"/>
-        </w:rPr>
-        <w:t>.</w:t>
-      </w:r>
-    </w:p>
-    <w:p>
-      <w:pPr>
-        <w:widowControl/>
-        <w:numPr>
-          <w:ilvl w:val="0"/>
-          <w:numId w:val="18"/>
-        </w:numPr>
-        <w:spacing w:before="0" w:after="80" w:line="300" w:lineRule="auto"/>
-        <w:ind w:left="540" w:hanging="271"/>
-      </w:pPr>
-      <w:r>
-        <w:rPr>
-          <w:rFonts w:ascii="Calibri" w:hAnsi="Calibri"/>
-          <w:sz w:val="22"/>
-        </w:rPr>
-        <w:t>Inspect coverage changes, VAD deltas, match evidence, and unmatched vocabulary.</w:t>
-      </w:r>
-    </w:p>
-    <w:p>
-      <w:pPr>
-        <w:widowControl/>
-        <w:numPr>
-          <w:ilvl w:val="0"/>
-          <w:numId w:val="18"/>
-        </w:numPr>
-        <w:spacing w:before="0" w:after="80" w:line="300" w:lineRule="auto"/>
-        <w:ind w:left="540" w:hanging="271"/>
-      </w:pPr>
-      <w:r>
-        <w:rPr>
-          <w:rFonts w:ascii="Calibri" w:hAnsi="Calibri"/>
-          <w:sz w:val="22"/>
-        </w:rPr>
-        <w:t xml:space="preserve">Export the workbook and preserve its methodology and </w:t>
-      </w:r>
-      <w:r>
-        <w:rPr>
-          <w:rFonts w:ascii="Calibri" w:hAnsi="Calibri"/>
-          <w:b/>
-          <w:sz w:val="22"/>
-        </w:rPr>
-        <w:t>Review Decisions</w:t>
-      </w:r>
-      <w:r>
-        <w:rPr>
-          <w:rFonts w:ascii="Calibri" w:hAnsi="Calibri"/>
-          <w:sz w:val="22"/>
-        </w:rPr>
-        <w:t xml:space="preserve"> sheet.</w:t>
-      </w:r>
-    </w:p>
-    <w:p>
-      <w:pPr>
-        <w:widowControl/>
-        <w:spacing w:before="0" w:after="120" w:line="300" w:lineRule="auto"/>
-      </w:pPr>
-      <w:r>
-        <w:rPr>
-          <w:rFonts w:ascii="Calibri" w:hAnsi="Calibri"/>
-          <w:sz w:val="22"/>
-        </w:rPr>
-        <w:t>Conflicting same-scope mappings are rejected. A mapping target must exist as an exact entry in the selected installed lexicon. A proposed mapping in the older unmatched-note form remains documentation only; it does not change a calculation unless converted into an active scenario decision.</w:t>
-      </w:r>
-    </w:p>
-    <w:p>
-      <w:pPr>
-        <w:pStyle w:val="Heading2"/>
-      </w:pPr>
-      <w:r>
-        <w:rPr>
-          <w:rFonts w:ascii="Calibri" w:hAnsi="Calibri"/>
-          <w:sz w:val="22"/>
-        </w:rPr>
-        <w:t>Unmatched quality-control notes</w:t>
-      </w:r>
-    </w:p>
-    <w:p>
-      <w:pPr>
-        <w:widowControl/>
-        <w:spacing w:before="0" w:after="120" w:line="300" w:lineRule="auto"/>
-      </w:pPr>
-      <w:r>
-        <w:rPr>
-          <w:rFonts w:ascii="Calibri" w:hAnsi="Calibri"/>
-          <w:sz w:val="22"/>
-        </w:rPr>
-        <w:t xml:space="preserve">The legacy unmatched-quality-control panel remains available beneath </w:t>
-      </w:r>
-      <w:r>
-        <w:rPr>
-          <w:rFonts w:ascii="Calibri" w:hAnsi="Calibri"/>
-          <w:b/>
-          <w:sz w:val="22"/>
-        </w:rPr>
-        <w:t>Review &amp; Scenarios</w:t>
-      </w:r>
-      <w:r>
-        <w:rPr>
-          <w:rFonts w:ascii="Calibri" w:hAnsi="Calibri"/>
-          <w:sz w:val="22"/>
-        </w:rPr>
-        <w:t>. It stores status, research note, and possible mapping text locally. These notes support research bookkeeping but do not alter completed or future analyses by themselves.</w:t>
-      </w:r>
-    </w:p>
-    <w:p>
-      <w:pPr>
-        <w:pStyle w:val="Heading2"/>
-      </w:pPr>
-      <w:r>
-        <w:rPr>
-          <w:rFonts w:ascii="Calibri" w:hAnsi="Calibri"/>
-          <w:sz w:val="22"/>
-        </w:rPr>
-        <w:t>Compare immutable batches</w:t>
-      </w:r>
-    </w:p>
-    <w:p>
-      <w:pPr>
-        <w:widowControl/>
-        <w:spacing w:before="0" w:after="120" w:line="300" w:lineRule="auto"/>
-      </w:pPr>
-      <w:r>
-        <w:rPr>
-          <w:rFonts w:ascii="Calibri" w:hAnsi="Calibri"/>
-          <w:sz w:val="22"/>
-        </w:rPr>
-        <w:t xml:space="preserve">Under </w:t>
-      </w:r>
-      <w:r>
-        <w:rPr>
-          <w:rFonts w:ascii="Calibri" w:hAnsi="Calibri"/>
-          <w:b/>
-          <w:sz w:val="22"/>
-        </w:rPr>
-        <w:t>Analyze &amp; Compare</w:t>
-      </w:r>
-      <w:r>
-        <w:rPr>
-          <w:rFonts w:ascii="Calibri" w:hAnsi="Calibri"/>
-          <w:sz w:val="22"/>
-        </w:rPr>
-        <w:t>, choose two completed batches to see like-for-like coverage and VAD deltas. Because each batch remains tied to its exact text versions, lexicons, recipe, stopword policy, software version, scenario version, and decision revisions, this comparison can show how an explicit review scenario changed the result without erasing the baseline.</w:t>
-      </w:r>
-    </w:p>
-    <w:p>
-      <w:pPr>
-        <w:pStyle w:val="Heading2"/>
-      </w:pPr>
-      <w:r>
-        <w:rPr>
-          <w:rFonts w:ascii="Calibri" w:hAnsi="Calibri"/>
-          <w:sz w:val="22"/>
-        </w:rPr>
-        <w:t>Export</w:t>
-      </w:r>
-    </w:p>
-    <w:p>
-      <w:pPr>
-        <w:widowControl/>
-        <w:spacing w:before="0" w:after="120" w:line="300" w:lineRule="auto"/>
-      </w:pPr>
-      <w:r>
-        <w:rPr>
-          <w:rFonts w:ascii="Calibri" w:hAnsi="Calibri"/>
-          <w:sz w:val="22"/>
-        </w:rPr>
-        <w:t xml:space="preserve">After a complete batch, download the corpus CSV and Word bundle. It includes both collection weighting views, both stopword views, work-level data, cumulative totals, coverage, separately labeled emotion/sentiment/intensity constructs, unmatched notes, text/version provenance, review decisions when applicable, the recorded methodology, and </w:t>
-      </w:r>
-      <w:r>
-        <w:rPr>
-          <w:rFonts w:ascii="Consolas" w:hAnsi="Consolas"/>
-          <w:color w:val="1F4D78"/>
-          <w:sz w:val="19"/>
-        </w:rPr>
-        <w:t>corpus_report.docx</w:t>
-      </w:r>
-      <w:r>
-        <w:rPr>
-          <w:rFonts w:ascii="Calibri" w:hAnsi="Calibri"/>
-          <w:sz w:val="22"/>
-        </w:rPr>
-        <w:t>. Optional-module results, structure, coverage, provenance, and warnings remain in separately named CSV tables.</w:t>
-      </w:r>
-    </w:p>
-    <w:p>
-      <w:pPr>
-        <w:pStyle w:val="Heading2"/>
-      </w:pPr>
-      <w:r>
-        <w:rPr>
-          <w:rFonts w:ascii="Calibri" w:hAnsi="Calibri"/>
-          <w:sz w:val="22"/>
-        </w:rPr>
-        <w:t>Delete a project</w:t>
       </w:r>
     </w:p>
     <w:p>
@@ -16112,7 +15844,7 @@
           <w:rFonts w:ascii="Calibri" w:hAnsi="Calibri"/>
           <w:sz w:val="22"/>
         </w:rPr>
-        <w:t>Select the project.</w:t>
+        <w:t>Create a clearly named scenario.</w:t>
       </w:r>
     </w:p>
     <w:p>
@@ -16130,22 +15862,7 @@
           <w:rFonts w:ascii="Calibri" w:hAnsi="Calibri"/>
           <w:sz w:val="22"/>
         </w:rPr>
-        <w:t xml:space="preserve">Open </w:t>
-      </w:r>
-      <w:r>
-        <w:rPr>
-          <w:rFonts w:ascii="Calibri" w:hAnsi="Calibri"/>
-          <w:b/>
-          <w:sz w:val="22"/>
-        </w:rPr>
-        <w:t>Project Settings</w:t>
-      </w:r>
-      <w:r>
-        <w:rPr>
-          <w:rFonts w:ascii="Calibri" w:hAnsi="Calibri"/>
-          <w:sz w:val="22"/>
-        </w:rPr>
-        <w:t>.</w:t>
+        <w:t>Inspect one candidate's text context, lexicon, match method, and risk label.</w:t>
       </w:r>
     </w:p>
     <w:p>
@@ -16163,7 +15880,7 @@
           <w:rFonts w:ascii="Calibri" w:hAnsi="Calibri"/>
           <w:sz w:val="22"/>
         </w:rPr>
-        <w:t>Read the permanent-deletion warning.</w:t>
+        <w:t>Choose flag, exclude, or map.</w:t>
       </w:r>
     </w:p>
     <w:p>
@@ -16181,7 +15898,7 @@
           <w:rFonts w:ascii="Calibri" w:hAnsi="Calibri"/>
           <w:sz w:val="22"/>
         </w:rPr>
-        <w:t>Type the project title exactly, including capitalization.</w:t>
+        <w:t>Select the narrowest scope that fits the evidence.</w:t>
       </w:r>
     </w:p>
     <w:p>
@@ -16199,7 +15916,25 @@
           <w:rFonts w:ascii="Calibri" w:hAnsi="Calibri"/>
           <w:sz w:val="22"/>
         </w:rPr>
-        <w:t xml:space="preserve">Click </w:t>
+        <w:t>Write a rationale another scholar could evaluate.</w:t>
+      </w:r>
+    </w:p>
+    <w:p>
+      <w:pPr>
+        <w:widowControl/>
+        <w:numPr>
+          <w:ilvl w:val="0"/>
+          <w:numId w:val="19"/>
+        </w:numPr>
+        <w:spacing w:before="0" w:after="80" w:line="300" w:lineRule="auto"/>
+        <w:ind w:left="540" w:hanging="271"/>
+      </w:pPr>
+      <w:r>
+        <w:rPr>
+          <w:rFonts w:ascii="Calibri" w:hAnsi="Calibri"/>
+          <w:sz w:val="22"/>
+        </w:rPr>
+        <w:t xml:space="preserve">Return to </w:t>
       </w:r>
       <w:r>
         <w:rPr>
@@ -16207,7 +15942,40 @@
           <w:b/>
           <w:sz w:val="22"/>
         </w:rPr>
-        <w:t>Delete this project</w:t>
+        <w:t>Analyze &amp; Compare</w:t>
+      </w:r>
+      <w:r>
+        <w:rPr>
+          <w:rFonts w:ascii="Calibri" w:hAnsi="Calibri"/>
+          <w:sz w:val="22"/>
+        </w:rPr>
+        <w:t>, select that scenario version, and rerun.</w:t>
+      </w:r>
+    </w:p>
+    <w:p>
+      <w:pPr>
+        <w:widowControl/>
+        <w:numPr>
+          <w:ilvl w:val="0"/>
+          <w:numId w:val="19"/>
+        </w:numPr>
+        <w:spacing w:before="0" w:after="80" w:line="300" w:lineRule="auto"/>
+        <w:ind w:left="540" w:hanging="271"/>
+      </w:pPr>
+      <w:r>
+        <w:rPr>
+          <w:rFonts w:ascii="Calibri" w:hAnsi="Calibri"/>
+          <w:sz w:val="22"/>
+        </w:rPr>
+        <w:t xml:space="preserve">Compare the reviewed batch with the baseline under </w:t>
+      </w:r>
+      <w:r>
+        <w:rPr>
+          <w:rFonts w:ascii="Calibri" w:hAnsi="Calibri"/>
+          <w:b/>
+          <w:sz w:val="22"/>
+        </w:rPr>
+        <w:t>Compare Two Immutable Analysis Batches</w:t>
       </w:r>
       <w:r>
         <w:rPr>
@@ -16220,6 +15988,57 @@
     <w:p>
       <w:pPr>
         <w:widowControl/>
+        <w:numPr>
+          <w:ilvl w:val="0"/>
+          <w:numId w:val="19"/>
+        </w:numPr>
+        <w:spacing w:before="0" w:after="80" w:line="300" w:lineRule="auto"/>
+        <w:ind w:left="540" w:hanging="271"/>
+      </w:pPr>
+      <w:r>
+        <w:rPr>
+          <w:rFonts w:ascii="Calibri" w:hAnsi="Calibri"/>
+          <w:sz w:val="22"/>
+        </w:rPr>
+        <w:t>Inspect coverage changes, VAD deltas, match evidence, and unmatched vocabulary.</w:t>
+      </w:r>
+    </w:p>
+    <w:p>
+      <w:pPr>
+        <w:widowControl/>
+        <w:numPr>
+          <w:ilvl w:val="0"/>
+          <w:numId w:val="19"/>
+        </w:numPr>
+        <w:spacing w:before="0" w:after="80" w:line="300" w:lineRule="auto"/>
+        <w:ind w:left="540" w:hanging="271"/>
+      </w:pPr>
+      <w:r>
+        <w:rPr>
+          <w:rFonts w:ascii="Calibri" w:hAnsi="Calibri"/>
+          <w:sz w:val="22"/>
+        </w:rPr>
+        <w:t xml:space="preserve">Export the workbook and preserve its methodology and </w:t>
+      </w:r>
+      <w:r>
+        <w:rPr>
+          <w:rFonts w:ascii="Calibri" w:hAnsi="Calibri"/>
+          <w:b/>
+          <w:sz w:val="22"/>
+        </w:rPr>
+        <w:t>Review Decisions</w:t>
+      </w:r>
+      <w:r>
+        <w:rPr>
+          <w:rFonts w:ascii="Calibri" w:hAnsi="Calibri"/>
+          <w:sz w:val="22"/>
+        </w:rPr>
+        <w:t xml:space="preserve"> sheet.</w:t>
+      </w:r>
+    </w:p>
+    <w:p>
+      <w:pPr>
+        <w:widowControl/>
         <w:spacing w:before="0" w:after="120" w:line="300" w:lineRule="auto"/>
       </w:pPr>
       <w:r>
@@ -16227,19 +16046,7 @@
           <w:rFonts w:ascii="Calibri" w:hAnsi="Calibri"/>
           <w:sz w:val="22"/>
         </w:rPr>
-        <w:t>The button remains unavailable until the title matches exactly. Deletion removes only that project's local works, versions, batches, analyses, metrics, and notes. It does not affect other projects or source lexicons. This deletion is permanent unless you have a separate backup.</w:t>
-      </w:r>
-    </w:p>
-    <w:p>
-      <w:pPr>
-        <w:pStyle w:val="Heading1"/>
-      </w:pPr>
-      <w:r>
-        <w:rPr>
-          <w:rFonts w:ascii="Calibri" w:hAnsi="Calibri"/>
-          <w:sz w:val="22"/>
-        </w:rPr>
-        <w:t>10. Lexicon Explorer</w:t>
+        <w:t>Conflicting same-scope mappings are rejected. A mapping target must exist as an exact entry in the selected installed lexicon. A proposed mapping in the older unmatched-note form remains documentation only; it does not change a calculation unless converted into an active scenario decision.</w:t>
       </w:r>
     </w:p>
     <w:p>
@@ -16251,7 +16058,127 @@
           <w:rFonts w:ascii="Calibri" w:hAnsi="Calibri"/>
           <w:sz w:val="22"/>
         </w:rPr>
-        <w:t>Basic lookup</w:t>
+        <w:t>Unmatched quality-control notes</w:t>
+      </w:r>
+    </w:p>
+    <w:p>
+      <w:pPr>
+        <w:widowControl/>
+        <w:spacing w:before="0" w:after="120" w:line="300" w:lineRule="auto"/>
+      </w:pPr>
+      <w:r>
+        <w:rPr>
+          <w:rFonts w:ascii="Calibri" w:hAnsi="Calibri"/>
+          <w:sz w:val="22"/>
+        </w:rPr>
+        <w:t xml:space="preserve">The legacy unmatched-quality-control panel remains available beneath </w:t>
+      </w:r>
+      <w:r>
+        <w:rPr>
+          <w:rFonts w:ascii="Calibri" w:hAnsi="Calibri"/>
+          <w:b/>
+          <w:sz w:val="22"/>
+        </w:rPr>
+        <w:t>Review &amp; Scenarios</w:t>
+      </w:r>
+      <w:r>
+        <w:rPr>
+          <w:rFonts w:ascii="Calibri" w:hAnsi="Calibri"/>
+          <w:sz w:val="22"/>
+        </w:rPr>
+        <w:t>. It stores status, research note, and possible mapping text locally. These notes support research bookkeeping but do not alter completed or future analyses by themselves.</w:t>
+      </w:r>
+    </w:p>
+    <w:p>
+      <w:pPr>
+        <w:pStyle w:val="Heading2"/>
+      </w:pPr>
+      <w:r>
+        <w:rPr>
+          <w:rFonts w:ascii="Calibri" w:hAnsi="Calibri"/>
+          <w:sz w:val="22"/>
+        </w:rPr>
+        <w:t>Compare immutable batches</w:t>
+      </w:r>
+    </w:p>
+    <w:p>
+      <w:pPr>
+        <w:widowControl/>
+        <w:spacing w:before="0" w:after="120" w:line="300" w:lineRule="auto"/>
+      </w:pPr>
+      <w:r>
+        <w:rPr>
+          <w:rFonts w:ascii="Calibri" w:hAnsi="Calibri"/>
+          <w:sz w:val="22"/>
+        </w:rPr>
+        <w:t xml:space="preserve">Under </w:t>
+      </w:r>
+      <w:r>
+        <w:rPr>
+          <w:rFonts w:ascii="Calibri" w:hAnsi="Calibri"/>
+          <w:b/>
+          <w:sz w:val="22"/>
+        </w:rPr>
+        <w:t>Analyze &amp; Compare</w:t>
+      </w:r>
+      <w:r>
+        <w:rPr>
+          <w:rFonts w:ascii="Calibri" w:hAnsi="Calibri"/>
+          <w:sz w:val="22"/>
+        </w:rPr>
+        <w:t>, choose two completed batches to see like-for-like coverage and VAD deltas. Because each batch remains tied to its exact text versions, lexicons, recipe, stopword policy, software version, scenario version, and decision revisions, this comparison can show how an explicit review scenario changed the result without erasing the baseline.</w:t>
+      </w:r>
+    </w:p>
+    <w:p>
+      <w:pPr>
+        <w:pStyle w:val="Heading2"/>
+      </w:pPr>
+      <w:r>
+        <w:rPr>
+          <w:rFonts w:ascii="Calibri" w:hAnsi="Calibri"/>
+          <w:sz w:val="22"/>
+        </w:rPr>
+        <w:t>Export</w:t>
+      </w:r>
+    </w:p>
+    <w:p>
+      <w:pPr>
+        <w:widowControl/>
+        <w:spacing w:before="0" w:after="120" w:line="300" w:lineRule="auto"/>
+      </w:pPr>
+      <w:r>
+        <w:rPr>
+          <w:rFonts w:ascii="Calibri" w:hAnsi="Calibri"/>
+          <w:sz w:val="22"/>
+        </w:rPr>
+        <w:t xml:space="preserve">After a complete batch, download the corpus CSV and Word bundle. It includes both collection weighting views, both stopword views, work-level data, cumulative totals, coverage, separately labeled emotion/sentiment/intensity constructs, unmatched notes, text/version provenance, review decisions when applicable, the recorded methodology, and </w:t>
+      </w:r>
+      <w:r>
+        <w:rPr>
+          <w:rFonts w:ascii="Consolas" w:hAnsi="Consolas"/>
+          <w:color w:val="1F4D78"/>
+          <w:sz w:val="19"/>
+        </w:rPr>
+        <w:t>corpus_report.docx</w:t>
+      </w:r>
+      <w:r>
+        <w:rPr>
+          <w:rFonts w:ascii="Calibri" w:hAnsi="Calibri"/>
+          <w:sz w:val="22"/>
+        </w:rPr>
+        <w:t>. Optional-module results, structure, coverage, provenance, and warnings remain in separately named CSV tables.</w:t>
+      </w:r>
+    </w:p>
+    <w:p>
+      <w:pPr>
+        <w:pStyle w:val="Heading2"/>
+      </w:pPr>
+      <w:r>
+        <w:rPr>
+          <w:rFonts w:ascii="Calibri" w:hAnsi="Calibri"/>
+          <w:sz w:val="22"/>
+        </w:rPr>
+        <w:t>Delete a project</w:t>
       </w:r>
     </w:p>
     <w:p>
@@ -16269,22 +16196,7 @@
           <w:rFonts w:ascii="Calibri" w:hAnsi="Calibri"/>
           <w:sz w:val="22"/>
         </w:rPr>
-        <w:t xml:space="preserve">Open </w:t>
-      </w:r>
-      <w:r>
-        <w:rPr>
-          <w:rFonts w:ascii="Calibri" w:hAnsi="Calibri"/>
-          <w:b/>
-          <w:sz w:val="22"/>
-        </w:rPr>
-        <w:t>Lexicon Explorer</w:t>
-      </w:r>
-      <w:r>
-        <w:rPr>
-          <w:rFonts w:ascii="Calibri" w:hAnsi="Calibri"/>
-          <w:sz w:val="22"/>
-        </w:rPr>
-        <w:t>.</w:t>
+        <w:t>Select the project.</w:t>
       </w:r>
     </w:p>
     <w:p>
@@ -16302,7 +16214,22 @@
           <w:rFonts w:ascii="Calibri" w:hAnsi="Calibri"/>
           <w:sz w:val="22"/>
         </w:rPr>
-        <w:t>Enter one word or phrase.</w:t>
+        <w:t xml:space="preserve">Open </w:t>
+      </w:r>
+      <w:r>
+        <w:rPr>
+          <w:rFonts w:ascii="Calibri" w:hAnsi="Calibri"/>
+          <w:b/>
+          <w:sz w:val="22"/>
+        </w:rPr>
+        <w:t>Project Settings</w:t>
+      </w:r>
+      <w:r>
+        <w:rPr>
+          <w:rFonts w:ascii="Calibri" w:hAnsi="Calibri"/>
+          <w:sz w:val="22"/>
+        </w:rPr>
+        <w:t>.</w:t>
       </w:r>
     </w:p>
     <w:p>
@@ -16320,7 +16247,7 @@
           <w:rFonts w:ascii="Calibri" w:hAnsi="Calibri"/>
           <w:sz w:val="22"/>
         </w:rPr>
-        <w:t>Optionally enter a user-supplied mapping.</w:t>
+        <w:t>Read the permanent-deletion warning.</w:t>
       </w:r>
     </w:p>
     <w:p>
@@ -16338,22 +16265,7 @@
           <w:rFonts w:ascii="Calibri" w:hAnsi="Calibri"/>
           <w:sz w:val="22"/>
         </w:rPr>
-        <w:t xml:space="preserve">Click </w:t>
-      </w:r>
-      <w:r>
-        <w:rPr>
-          <w:rFonts w:ascii="Calibri" w:hAnsi="Calibri"/>
-          <w:b/>
-          <w:sz w:val="22"/>
-        </w:rPr>
-        <w:t>Search installed lexicons</w:t>
-      </w:r>
-      <w:r>
-        <w:rPr>
-          <w:rFonts w:ascii="Calibri" w:hAnsi="Calibri"/>
-          <w:sz w:val="22"/>
-        </w:rPr>
-        <w:t>.</w:t>
+        <w:t>Type the project title exactly, including capitalization.</w:t>
       </w:r>
     </w:p>
     <w:p>
@@ -16362,6 +16274,178 @@
         <w:numPr>
           <w:ilvl w:val="0"/>
           <w:numId w:val="20"/>
+        </w:numPr>
+        <w:spacing w:before="0" w:after="80" w:line="300" w:lineRule="auto"/>
+        <w:ind w:left="540" w:hanging="271"/>
+      </w:pPr>
+      <w:r>
+        <w:rPr>
+          <w:rFonts w:ascii="Calibri" w:hAnsi="Calibri"/>
+          <w:sz w:val="22"/>
+        </w:rPr>
+        <w:t xml:space="preserve">Click </w:t>
+      </w:r>
+      <w:r>
+        <w:rPr>
+          <w:rFonts w:ascii="Calibri" w:hAnsi="Calibri"/>
+          <w:b/>
+          <w:sz w:val="22"/>
+        </w:rPr>
+        <w:t>Delete this project</w:t>
+      </w:r>
+      <w:r>
+        <w:rPr>
+          <w:rFonts w:ascii="Calibri" w:hAnsi="Calibri"/>
+          <w:sz w:val="22"/>
+        </w:rPr>
+        <w:t>.</w:t>
+      </w:r>
+    </w:p>
+    <w:p>
+      <w:pPr>
+        <w:widowControl/>
+        <w:spacing w:before="0" w:after="120" w:line="300" w:lineRule="auto"/>
+      </w:pPr>
+      <w:r>
+        <w:rPr>
+          <w:rFonts w:ascii="Calibri" w:hAnsi="Calibri"/>
+          <w:sz w:val="22"/>
+        </w:rPr>
+        <w:t>The button remains unavailable until the title matches exactly. Deletion removes only that project's local works, versions, batches, analyses, metrics, and notes. It does not affect other projects or source lexicons. This deletion is permanent unless you have a separate backup.</w:t>
+      </w:r>
+    </w:p>
+    <w:p>
+      <w:pPr>
+        <w:pStyle w:val="Heading1"/>
+      </w:pPr>
+      <w:r>
+        <w:rPr>
+          <w:rFonts w:ascii="Calibri" w:hAnsi="Calibri"/>
+          <w:sz w:val="22"/>
+        </w:rPr>
+        <w:t>10. Lexicon Explorer</w:t>
+      </w:r>
+    </w:p>
+    <w:p>
+      <w:pPr>
+        <w:pStyle w:val="Heading2"/>
+      </w:pPr>
+      <w:r>
+        <w:rPr>
+          <w:rFonts w:ascii="Calibri" w:hAnsi="Calibri"/>
+          <w:sz w:val="22"/>
+        </w:rPr>
+        <w:t>Basic lookup</w:t>
+      </w:r>
+    </w:p>
+    <w:p>
+      <w:pPr>
+        <w:widowControl/>
+        <w:numPr>
+          <w:ilvl w:val="0"/>
+          <w:numId w:val="21"/>
+        </w:numPr>
+        <w:spacing w:before="0" w:after="80" w:line="300" w:lineRule="auto"/>
+        <w:ind w:left="540" w:hanging="271"/>
+      </w:pPr>
+      <w:r>
+        <w:rPr>
+          <w:rFonts w:ascii="Calibri" w:hAnsi="Calibri"/>
+          <w:sz w:val="22"/>
+        </w:rPr>
+        <w:t xml:space="preserve">Open </w:t>
+      </w:r>
+      <w:r>
+        <w:rPr>
+          <w:rFonts w:ascii="Calibri" w:hAnsi="Calibri"/>
+          <w:b/>
+          <w:sz w:val="22"/>
+        </w:rPr>
+        <w:t>Lexicon Explorer</w:t>
+      </w:r>
+      <w:r>
+        <w:rPr>
+          <w:rFonts w:ascii="Calibri" w:hAnsi="Calibri"/>
+          <w:sz w:val="22"/>
+        </w:rPr>
+        <w:t>.</w:t>
+      </w:r>
+    </w:p>
+    <w:p>
+      <w:pPr>
+        <w:widowControl/>
+        <w:numPr>
+          <w:ilvl w:val="0"/>
+          <w:numId w:val="21"/>
+        </w:numPr>
+        <w:spacing w:before="0" w:after="80" w:line="300" w:lineRule="auto"/>
+        <w:ind w:left="540" w:hanging="271"/>
+      </w:pPr>
+      <w:r>
+        <w:rPr>
+          <w:rFonts w:ascii="Calibri" w:hAnsi="Calibri"/>
+          <w:sz w:val="22"/>
+        </w:rPr>
+        <w:t>Enter one word or phrase.</w:t>
+      </w:r>
+    </w:p>
+    <w:p>
+      <w:pPr>
+        <w:widowControl/>
+        <w:numPr>
+          <w:ilvl w:val="0"/>
+          <w:numId w:val="21"/>
+        </w:numPr>
+        <w:spacing w:before="0" w:after="80" w:line="300" w:lineRule="auto"/>
+        <w:ind w:left="540" w:hanging="271"/>
+      </w:pPr>
+      <w:r>
+        <w:rPr>
+          <w:rFonts w:ascii="Calibri" w:hAnsi="Calibri"/>
+          <w:sz w:val="22"/>
+        </w:rPr>
+        <w:t>Optionally enter a user-supplied mapping.</w:t>
+      </w:r>
+    </w:p>
+    <w:p>
+      <w:pPr>
+        <w:widowControl/>
+        <w:numPr>
+          <w:ilvl w:val="0"/>
+          <w:numId w:val="21"/>
+        </w:numPr>
+        <w:spacing w:before="0" w:after="80" w:line="300" w:lineRule="auto"/>
+        <w:ind w:left="540" w:hanging="271"/>
+      </w:pPr>
+      <w:r>
+        <w:rPr>
+          <w:rFonts w:ascii="Calibri" w:hAnsi="Calibri"/>
+          <w:sz w:val="22"/>
+        </w:rPr>
+        <w:t xml:space="preserve">Click </w:t>
+      </w:r>
+      <w:r>
+        <w:rPr>
+          <w:rFonts w:ascii="Calibri" w:hAnsi="Calibri"/>
+          <w:b/>
+          <w:sz w:val="22"/>
+        </w:rPr>
+        <w:t>Search installed lexicons</w:t>
+      </w:r>
+      <w:r>
+        <w:rPr>
+          <w:rFonts w:ascii="Calibri" w:hAnsi="Calibri"/>
+          <w:sz w:val="22"/>
+        </w:rPr>
+        <w:t>.</w:t>
+      </w:r>
+    </w:p>
+    <w:p>
+      <w:pPr>
+        <w:widowControl/>
+        <w:numPr>
+          <w:ilvl w:val="0"/>
+          <w:numId w:val="21"/>
         </w:numPr>
         <w:spacing w:before="0" w:after="80" w:line="300" w:lineRule="auto"/>
         <w:ind w:left="540" w:hanging="271"/>
@@ -31709,6 +31793,21 @@
       </w:pPr>
     </w:lvl>
   </w:abstractNum>
+  <w:abstractNum w:abstractNumId="20">
+    <w:multiLevelType w:val="singleLevel"/>
+    <w:lvl w:ilvl="0">
+      <w:start w:val="1"/>
+      <w:numFmt w:val="decimal"/>
+      <w:lvlText w:val="%1."/>
+      <w:lvlJc w:val="left"/>
+      <w:pPr>
+        <w:tabs>
+          <w:tab w:val="num" w:pos="540"/>
+        </w:tabs>
+        <w:ind w:left="540" w:hanging="270"/>
+      </w:pPr>
+    </w:lvl>
+  </w:abstractNum>
   <w:num w:numId="1">
     <w:abstractNumId w:val="8"/>
   </w:num>
@@ -31795,6 +31894,12 @@
   </w:num>
   <w:num w:numId="20">
     <w:abstractNumId w:val="19"/>
+    <w:lvlOverride w:ilvl="0">
+      <w:startOverride w:val="1"/>
+    </w:lvlOverride>
+  </w:num>
+  <w:num w:numId="21">
+    <w:abstractNumId w:val="20"/>
     <w:lvlOverride w:ilvl="0">
       <w:startOverride w:val="1"/>
     </w:lvlOverride>

</xml_diff>

<commit_message>
Unify reporting semantics and audit exports
</commit_message>
<xml_diff>
--- a/docs/VerseVAD_User_Manual.docx
+++ b/docs/VerseVAD_User_Manual.docx
@@ -59,7 +59,7 @@
           <w:color w:val="66727C"/>
           <w:sz w:val="21"/>
         </w:rPr>
-        <w:t xml:space="preserve"> August 7, 2026</w:t>
+        <w:t xml:space="preserve"> August 10, 2026</w:t>
       </w:r>
     </w:p>
     <w:p>
@@ -982,6 +982,55 @@
     </w:p>
     <w:p>
       <w:pPr>
+        <w:widowControl/>
+        <w:spacing w:before="0" w:after="80" w:line="264" w:lineRule="auto"/>
+        <w:jc w:val="center"/>
+      </w:pPr>
+      <w:r>
+        <w:rPr>
+          <w:rFonts w:ascii="Calibri" w:hAnsi="Calibri"/>
+          <w:color w:val="66727C"/>
+          <w:sz w:val="21"/>
+        </w:rPr>
+        <w:t xml:space="preserve">Compact orientation displays, including </w:t>
+      </w:r>
+      <w:r>
+        <w:rPr>
+          <w:rFonts w:ascii="Calibri" w:hAnsi="Calibri"/>
+          <w:b/>
+          <w:color w:val="66727C"/>
+          <w:sz w:val="21"/>
+        </w:rPr>
+        <w:t>Report at a Glance</w:t>
+      </w:r>
+      <w:r>
+        <w:rPr>
+          <w:rFonts w:ascii="Calibri" w:hAnsi="Calibri"/>
+          <w:color w:val="66727C"/>
+          <w:sz w:val="21"/>
+        </w:rPr>
+        <w:t xml:space="preserve">, always use the ordinary </w:t>
+      </w:r>
+      <w:r>
+        <w:rPr>
+          <w:rFonts w:ascii="Calibri" w:hAnsi="Calibri"/>
+          <w:b/>
+          <w:color w:val="66727C"/>
+          <w:sz w:val="21"/>
+        </w:rPr>
+        <w:t>Stopword-excluded · Token-weighted</w:t>
+      </w:r>
+      <w:r>
+        <w:rPr>
+          <w:rFonts w:ascii="Calibri" w:hAnsi="Calibri"/>
+          <w:color w:val="66727C"/>
+          <w:sz w:val="21"/>
+        </w:rPr>
+        <w:t xml:space="preserve"> profile so their headline values remain stable and directly comparable. Detailed result tables show every enabled scope/weighting combination and label each row's profile explicitly.</w:t>
+      </w:r>
+    </w:p>
+    <w:p>
+      <w:pPr>
         <w:pStyle w:val="Heading3"/>
       </w:pPr>
       <w:r>
@@ -3311,14 +3360,14 @@
           <w:b/>
           <w:sz w:val="22"/>
         </w:rPr>
-        <w:t>Cumulative lexical load:</w:t>
+        <w:t>Method-defined cumulative load:</w:t>
       </w:r>
       <w:r>
         <w:rPr>
           <w:rFonts w:ascii="Calibri" w:hAnsi="Calibri"/>
           <w:sz w:val="22"/>
         </w:rPr>
-        <w:t xml:space="preserve"> sum of included values; token weighting retains</w:t>
+        <w:t xml:space="preserve"> reported only for compatible continuous</w:t>
       </w:r>
     </w:p>
     <w:p>
@@ -3333,7 +3382,7 @@
           <w:color w:val="66727C"/>
           <w:sz w:val="21"/>
         </w:rPr>
-        <w:t xml:space="preserve">  length and repetition.</w:t>
+        <w:t xml:space="preserve">  families. VAD uses midpoint-relative loads; emotion intensity and   sensorimotor dimensions retain their documented source-scale sums. Generic   cumulative AoA, Zipf, concreteness, association, and word-length loads are   not reported.</w:t>
       </w:r>
     </w:p>
     <w:p>
@@ -3490,7 +3539,7 @@
           <w:color w:val="66727C"/>
           <w:sz w:val="21"/>
         </w:rPr>
-        <w:t xml:space="preserve">Research ZIPs include clean CSV tables, narrative Word reports where available, </w:t>
+        <w:t xml:space="preserve">Complete Audit ZIPs use numbered domain folders and include clean CSV tables, narrative Word reports where available, </w:t>
       </w:r>
       <w:r>
         <w:rPr>
@@ -3498,7 +3547,7 @@
           <w:color w:val="66727C"/>
           <w:sz w:val="21"/>
         </w:rPr>
-        <w:t>REPRODUCIBILITY_README.txt</w:t>
+        <w:t>08_REPRODUCIBILITY/REPRODUCIBILITY_README.txt</w:t>
       </w:r>
       <w:r>
         <w:rPr>
@@ -3514,7 +3563,7 @@
           <w:color w:val="66727C"/>
           <w:sz w:val="21"/>
         </w:rPr>
-        <w:t>FILE_INVENTORY.txt</w:t>
+        <w:t>08_REPRODUCIBILITY/FILE_INVENTORY.csv</w:t>
       </w:r>
       <w:r>
         <w:rPr>

</xml_diff>

<commit_message>
Standardize analysis exports with schema v3
</commit_message>
<xml_diff>
--- a/docs/VerseVAD_User_Manual.docx
+++ b/docs/VerseVAD_User_Manual.docx
@@ -59,7 +59,7 @@
           <w:color w:val="66727C"/>
           <w:sz w:val="21"/>
         </w:rPr>
-        <w:t xml:space="preserve"> August 10, 2026</w:t>
+        <w:t xml:space="preserve"> August 13, 2026</w:t>
       </w:r>
     </w:p>
     <w:p>
@@ -1031,6 +1031,72 @@
     </w:p>
     <w:p>
       <w:pPr>
+        <w:widowControl/>
+        <w:spacing w:before="0" w:after="80" w:line="264" w:lineRule="auto"/>
+        <w:jc w:val="center"/>
+      </w:pPr>
+      <w:r>
+        <w:rPr>
+          <w:rFonts w:ascii="Calibri" w:hAnsi="Calibri"/>
+          <w:color w:val="66727C"/>
+          <w:sz w:val="21"/>
+        </w:rPr>
+        <w:t xml:space="preserve">Five report areas also offer </w:t>
+      </w:r>
+      <w:r>
+        <w:rPr>
+          <w:rFonts w:ascii="Calibri" w:hAnsi="Calibri"/>
+          <w:b/>
+          <w:color w:val="66727C"/>
+          <w:sz w:val="21"/>
+        </w:rPr>
+        <w:t>Content Words Only (Scope Override)</w:t>
+      </w:r>
+      <w:r>
+        <w:rPr>
+          <w:rFonts w:ascii="Calibri" w:hAnsi="Calibri"/>
+          <w:color w:val="66727C"/>
+          <w:sz w:val="21"/>
+        </w:rPr>
+        <w:t xml:space="preserve">: Emotional Association and Intensity, Concreteness, Sensorimotor Imagery and Embodiment, Frequency and Rarity, and Age of Acquisition. This optional checkbox changes only that module's visible report rows to content-word scope; it does not change the global selector or any other module. The module inherits every globally selected token/type weighting. </w:t>
+      </w:r>
+      <w:r>
+        <w:rPr>
+          <w:rFonts w:ascii="Calibri" w:hAnsi="Calibri"/>
+          <w:b/>
+          <w:color w:val="66727C"/>
+          <w:sz w:val="21"/>
+        </w:rPr>
+        <w:t>Export Current View</w:t>
+      </w:r>
+      <w:r>
+        <w:rPr>
+          <w:rFonts w:ascii="Calibri" w:hAnsi="Calibri"/>
+          <w:color w:val="66727C"/>
+          <w:sz w:val="21"/>
+        </w:rPr>
+        <w:t xml:space="preserve"> applies and records the exception for the displayed report area. </w:t>
+      </w:r>
+      <w:r>
+        <w:rPr>
+          <w:rFonts w:ascii="Calibri" w:hAnsi="Calibri"/>
+          <w:b/>
+          <w:color w:val="66727C"/>
+          <w:sz w:val="21"/>
+        </w:rPr>
+        <w:t>Export Complete Audit</w:t>
+      </w:r>
+      <w:r>
+        <w:rPr>
+          <w:rFonts w:ascii="Calibri" w:hAnsi="Calibri"/>
+          <w:color w:val="66727C"/>
+          <w:sz w:val="21"/>
+        </w:rPr>
+        <w:t xml:space="preserve"> remains an all-six-profile audit and does not use the exception.</w:t>
+      </w:r>
+    </w:p>
+    <w:p>
+      <w:pPr>
         <w:pStyle w:val="Heading3"/>
       </w:pPr>
       <w:r>
@@ -3500,7 +3566,7 @@
           <w:color w:val="66727C"/>
           <w:sz w:val="21"/>
         </w:rPr>
-        <w:t xml:space="preserve"> includes only the selected lexical profile combinations and the fixed-profile results present in the chosen report section. It is the compact option for a focused analysis.</w:t>
+        <w:t xml:space="preserve"> is an exact projection of the selected report section, resources, lexical scope, weighting, applicable corpus aggregation, and visible work(s). It is the compact option for a focused analysis.</w:t>
       </w:r>
     </w:p>
     <w:p>
@@ -3539,7 +3605,7 @@
           <w:color w:val="66727C"/>
           <w:sz w:val="21"/>
         </w:rPr>
-        <w:t xml:space="preserve">Complete Audit ZIPs use numbered domain folders and include clean CSV tables, narrative Word reports where available, </w:t>
+        <w:t xml:space="preserve">All analytical packages use the same progressive-disclosure structure: </w:t>
       </w:r>
       <w:r>
         <w:rPr>
@@ -3547,7 +3613,7 @@
           <w:color w:val="66727C"/>
           <w:sz w:val="21"/>
         </w:rPr>
-        <w:t>08_REPRODUCIBILITY/REPRODUCIBILITY_README.txt</w:t>
+        <w:t>00_READ_ME</w:t>
       </w:r>
       <w:r>
         <w:rPr>
@@ -3555,7 +3621,7 @@
           <w:color w:val="66727C"/>
           <w:sz w:val="21"/>
         </w:rPr>
-        <w:t xml:space="preserve">, and </w:t>
+        <w:t xml:space="preserve">, </w:t>
       </w:r>
       <w:r>
         <w:rPr>
@@ -3563,7 +3629,7 @@
           <w:color w:val="66727C"/>
           <w:sz w:val="21"/>
         </w:rPr>
-        <w:t>08_REPRODUCIBILITY/FILE_INVENTORY.csv</w:t>
+        <w:t>01_REPORTS</w:t>
       </w:r>
       <w:r>
         <w:rPr>
@@ -3571,7 +3637,103 @@
           <w:color w:val="66727C"/>
           <w:sz w:val="21"/>
         </w:rPr>
-        <w:t>. CSV values retain available precision even though the interface rounds most numbers to three decimal places. JSON is not required.</w:t>
+        <w:t xml:space="preserve">, </w:t>
+      </w:r>
+      <w:r>
+        <w:rPr>
+          <w:rFonts w:ascii="Consolas" w:hAnsi="Consolas"/>
+          <w:color w:val="66727C"/>
+          <w:sz w:val="21"/>
+        </w:rPr>
+        <w:t>02_METRIC_TABLES</w:t>
+      </w:r>
+      <w:r>
+        <w:rPr>
+          <w:rFonts w:ascii="Calibri" w:hAnsi="Calibri"/>
+          <w:color w:val="66727C"/>
+          <w:sz w:val="21"/>
+        </w:rPr>
+        <w:t xml:space="preserve">, </w:t>
+      </w:r>
+      <w:r>
+        <w:rPr>
+          <w:rFonts w:ascii="Consolas" w:hAnsi="Consolas"/>
+          <w:color w:val="66727C"/>
+          <w:sz w:val="21"/>
+        </w:rPr>
+        <w:t>03_MASTER_DATA</w:t>
+      </w:r>
+      <w:r>
+        <w:rPr>
+          <w:rFonts w:ascii="Calibri" w:hAnsi="Calibri"/>
+          <w:color w:val="66727C"/>
+          <w:sz w:val="21"/>
+        </w:rPr>
+        <w:t xml:space="preserve">, </w:t>
+      </w:r>
+      <w:r>
+        <w:rPr>
+          <w:rFonts w:ascii="Consolas" w:hAnsi="Consolas"/>
+          <w:color w:val="66727C"/>
+          <w:sz w:val="21"/>
+        </w:rPr>
+        <w:t>04_AUDIT</w:t>
+      </w:r>
+      <w:r>
+        <w:rPr>
+          <w:rFonts w:ascii="Calibri" w:hAnsi="Calibri"/>
+          <w:color w:val="66727C"/>
+          <w:sz w:val="21"/>
+        </w:rPr>
+        <w:t xml:space="preserve">, and </w:t>
+      </w:r>
+      <w:r>
+        <w:rPr>
+          <w:rFonts w:ascii="Consolas" w:hAnsi="Consolas"/>
+          <w:color w:val="66727C"/>
+          <w:sz w:val="21"/>
+        </w:rPr>
+        <w:t>05_REPRODUCIBILITY</w:t>
+      </w:r>
+      <w:r>
+        <w:rPr>
+          <w:rFonts w:ascii="Calibri" w:hAnsi="Calibri"/>
+          <w:color w:val="66727C"/>
+          <w:sz w:val="21"/>
+        </w:rPr>
+        <w:t xml:space="preserve">. The authoritative machine table is </w:t>
+      </w:r>
+      <w:r>
+        <w:rPr>
+          <w:rFonts w:ascii="Consolas" w:hAnsi="Consolas"/>
+          <w:color w:val="66727C"/>
+          <w:sz w:val="21"/>
+        </w:rPr>
+        <w:t>03_MASTER_DATA/Master_Metrics.csv</w:t>
+      </w:r>
+      <w:r>
+        <w:rPr>
+          <w:rFonts w:ascii="Calibri" w:hAnsi="Calibri"/>
+          <w:color w:val="66727C"/>
+          <w:sz w:val="21"/>
+        </w:rPr>
+        <w:t xml:space="preserve"> (export schema 3.0); focused tables and Word reports are human-facing projections of those retained results. The reproducibility folder includes </w:t>
+      </w:r>
+      <w:r>
+        <w:rPr>
+          <w:rFonts w:ascii="Consolas" w:hAnsi="Consolas"/>
+          <w:color w:val="66727C"/>
+          <w:sz w:val="21"/>
+        </w:rPr>
+        <w:t>FILE_INVENTORY.csv</w:t>
+      </w:r>
+      <w:r>
+        <w:rPr>
+          <w:rFonts w:ascii="Calibri" w:hAnsi="Calibri"/>
+          <w:color w:val="66727C"/>
+          <w:sz w:val="21"/>
+        </w:rPr>
+        <w:t xml:space="preserve"> so every packaged file is discoverable. CSV values retain available precision even though the interface rounds most numbers to three decimal places. JSON is not required.</w:t>
       </w:r>
     </w:p>
     <w:p>

</xml_diff>